<commit_message>
docs(course-paper): finalize DOCX export layout
</commit_message>
<xml_diff>
--- a/outputs/course_paper_hse_final.docx
+++ b/outputs/course_paper_hse_final.docx
@@ -2,56 +2,6 @@
 <file path=word/document.xml><?xml version="1.0" encoding="utf-8"?>
 <w:document xmlns:w="http://schemas.openxmlformats.org/wordprocessingml/2006/main" xmlns:m="http://schemas.openxmlformats.org/officeDocument/2006/math" xmlns:r="http://schemas.openxmlformats.org/officeDocument/2006/relationships" xmlns:o="urn:schemas-microsoft-com:office:office" xmlns:v="urn:schemas-microsoft-com:vml" xmlns:w10="urn:schemas-microsoft-com:office:word" xmlns:a="http://schemas.openxmlformats.org/drawingml/2006/main" xmlns:pic="http://schemas.openxmlformats.org/drawingml/2006/picture" xmlns:wp="http://schemas.openxmlformats.org/drawingml/2006/wordprocessingDrawing">
   <w:body>
-    <w:p>
-      <w:pPr>
-        <w:pStyle w:val="Title"/>
-      </w:pPr>
-      <w:r>
-        <w:t xml:space="preserve">Методы искусственного интеллекта для распознавания и анализа исторических текстов на арабско-тюркской графике</w:t>
-      </w:r>
-    </w:p>
-    <w:p>
-      <w:pPr>
-        <w:pStyle w:val="Author"/>
-      </w:pPr>
-      <w:r>
-        <w:t xml:space="preserve">Исламов Радмир Рашитович</w:t>
-      </w:r>
-    </w:p>
-    <w:p>
-      <w:pPr>
-        <w:pStyle w:val="Date"/>
-      </w:pPr>
-      <w:r>
-        <w:t xml:space="preserve">2026</w:t>
-      </w:r>
-    </w:p>
-    <w:sdt>
-      <w:sdtPr>
-        <w:docPartObj>
-          <w:docPartGallery w:val="Table of Contents"/>
-          <w:docPartUnique/>
-        </w:docPartObj>
-      </w:sdtPr>
-      <w:sdtContent>
-        <w:p>
-          <w:pPr>
-            <w:pStyle w:val="TOCHeading"/>
-          </w:pPr>
-          <w:r>
-            <w:t xml:space="preserve">Table of Contents</w:t>
-          </w:r>
-        </w:p>
-        <w:p>
-          <w:r>
-            <w:fldChar w:fldCharType="begin" w:dirty="true"/>
-            <w:instrText xml:space="preserve">TOC \o "1-3" \h \z \u</w:instrText>
-            <w:fldChar w:fldCharType="separate"/>
-            <w:fldChar w:fldCharType="end"/>
-          </w:r>
-        </w:p>
-      </w:sdtContent>
-    </w:sdt>
     <w:p>
       <w:pPr>
         <w:pStyle w:val="FirstParagraph"/>
@@ -105,27 +55,21 @@
         <w:pStyle w:val="BodyText"/>
       </w:pPr>
     </w:p>
-    <w:bookmarkStart w:id="9" w:name="Xa09a03de929e7d412e714ca7284d164c9c9b0f1"/>
-    <w:p>
-      <w:pPr>
-        <w:pStyle w:val="Heading1"/>
+    <w:p>
+      <w:pPr>
+        <w:pStyle w:val="BodyText"/>
       </w:pPr>
       <w:r>
         <w:rPr>
-          <w:rStyle w:val="SectionNumber"/>
+          <w:b/>
+          <w:bCs/>
         </w:rPr>
-        <w:t xml:space="preserve">1</w:t>
-      </w:r>
-      <w:r>
-        <w:tab/>
-      </w:r>
-      <w:r>
         <w:t xml:space="preserve">Методы искусственного интеллекта для распознавания и анализа исторических текстов на арабско-тюркской графике</w:t>
       </w:r>
     </w:p>
     <w:p>
       <w:pPr>
-        <w:pStyle w:val="FirstParagraph"/>
+        <w:pStyle w:val="BodyText"/>
       </w:pPr>
       <w:r>
         <w:rPr>
@@ -157,7 +101,6 @@
         <w:pStyle w:val="BodyText"/>
       </w:pPr>
     </w:p>
-    <w:bookmarkEnd w:id="9"/>
     <w:p>
       <w:pPr>
         <w:pStyle w:val="BodyText"/>
@@ -245,181 +188,154 @@
         <w:t xml:space="preserve">Москва, 2026</w:t>
       </w:r>
     </w:p>
-    <w:bookmarkStart w:id="10" w:name="аннотация"/>
+    <w:bookmarkStart w:id="9" w:name="содержание"/>
+    <w:p>
+      <w:pPr>
+        <w:pStyle w:val="Heading1"/>
+      </w:pPr>
+      <w:r>
+        <w:t xml:space="preserve">Содержание</w:t>
+      </w:r>
+    </w:p>
+    <w:bookmarkEnd w:id="9"/>
+    <w:bookmarkStart w:id="67" w:name="аннотация"/>
+    <w:p>
+      <w:pPr>
+        <w:pStyle w:val="Heading1"/>
+      </w:pPr>
+      <w:r>
+        <w:t xml:space="preserve">Аннотация</w:t>
+      </w:r>
+    </w:p>
+    <w:p>
+      <w:pPr>
+        <w:pStyle w:val="FirstParagraph"/>
+      </w:pPr>
+      <w:r>
+        <w:t xml:space="preserve">В работе рассматривается задача автоматической обработки исторических тюркских текстов, записанных арабской графикой. Такие материалы представляют значительную историко-культурную и лингвистическую ценность, однако их машинная обработка затруднена из-за особенностей старой орфографии, вариативности написания, низкого качества источников, ограниченного количества размеченных данных и слабой представленности подобных корпусов в современных OCR- и NLP-ресурсах.</w:t>
+      </w:r>
+    </w:p>
+    <w:p>
+      <w:pPr>
+        <w:pStyle w:val="BodyText"/>
+      </w:pPr>
+      <w:r>
+        <w:t xml:space="preserve">В качестве пилотного этапа разработан воспроизводимый пайплайн для посткоррекции OCR-подобных ошибок в арабографичном тюркском тексте. Корпус построен на основе османско-тюркского текста в арабской графике. На его основе сформирован синтетический набор данных: чистые строки искажаются контролируемым генератором OCR-подобного шума, после чего строятся train/valid/test-разбиения без утечки исходных строк между выборками.</w:t>
+      </w:r>
+    </w:p>
+    <w:p>
+      <w:pPr>
+        <w:pStyle w:val="BodyText"/>
+      </w:pPr>
+      <w:r>
+        <w:t xml:space="preserve">В экспериментальной части сравниваются identity baseline, простой rule-based normalizer и нейросетевая модель ByT5-small. Итоговая модель ByT5-small с длиной последовательности 512 превосходит identity baseline по CER и WER. Дополнительно проведён анализ ошибок на уровне отдельных тестовых примеров, показывающий, что модель улучшает большинство строк, но не является равномерно безопасной и требует дальнейшей валидации.</w:t>
+      </w:r>
+    </w:p>
+    <w:p>
+      <w:pPr>
+        <w:pStyle w:val="BodyText"/>
+      </w:pPr>
+      <w:r>
+        <w:t xml:space="preserve">Работа рассматривается как пилотный этап для дальнейшего расширения корпуса, подключения реальных OCR/HTR-выходов и построения более полного бенчмарка для исторических тюркских текстов в арабской графике.</w:t>
+      </w:r>
+    </w:p>
+    <w:bookmarkStart w:id="10" w:name="введение"/>
     <w:p>
       <w:pPr>
         <w:pStyle w:val="Heading2"/>
       </w:pPr>
       <w:r>
-        <w:rPr>
-          <w:rStyle w:val="SectionNumber"/>
-        </w:rPr>
-        <w:t xml:space="preserve">1.1</w:t>
-      </w:r>
-      <w:r>
-        <w:tab/>
-      </w:r>
-      <w:r>
-        <w:t xml:space="preserve">Аннотация</w:t>
-      </w:r>
-    </w:p>
-    <w:p>
-      <w:pPr>
-        <w:pStyle w:val="FirstParagraph"/>
-      </w:pPr>
-      <w:r>
-        <w:t xml:space="preserve">В работе рассматривается задача автоматической обработки исторических тюркских текстов, записанных арабской графикой. Такие материалы представляют значительную историко-культурную и лингвистическую ценность, однако их машинная обработка затруднена из-за особенностей старой орфографии, вариативности написания, низкого качества источников, ограниченного количества размеченных данных и слабой представленности подобных корпусов в современных OCR- и NLP-ресурсах.</w:t>
-      </w:r>
-    </w:p>
-    <w:p>
-      <w:pPr>
-        <w:pStyle w:val="BodyText"/>
-      </w:pPr>
-      <w:r>
-        <w:t xml:space="preserve">В качестве пилотного этапа разработан воспроизводимый пайплайн для посткоррекции OCR-подобных ошибок в арабографичном тюркском тексте. Корпус построен на основе османско-тюркского текста в арабской графике. На его основе сформирован синтетический набор данных: чистые строки искажаются контролируемым генератором OCR-подобного шума, после чего строятся train/valid/test-разбиения без утечки исходных строк между выборками.</w:t>
-      </w:r>
-    </w:p>
-    <w:p>
-      <w:pPr>
-        <w:pStyle w:val="BodyText"/>
-      </w:pPr>
-      <w:r>
-        <w:t xml:space="preserve">В экспериментальной части сравниваются identity baseline, простой rule-based normalizer и нейросетевая модель ByT5-small. Итоговая модель ByT5-small с длиной последовательности 512 превосходит identity baseline по CER и WER. Дополнительно проведён анализ ошибок на уровне отдельных тестовых примеров, показывающий, что модель улучшает большинство строк, но не является равномерно безопасной и требует дальнейшей валидации.</w:t>
-      </w:r>
-    </w:p>
-    <w:p>
-      <w:pPr>
-        <w:pStyle w:val="BodyText"/>
-      </w:pPr>
-      <w:r>
-        <w:t xml:space="preserve">Работа рассматривается как пилотный этап для дальнейшего расширения корпуса, подключения реальных OCR/HTR-выходов и построения более полного бенчмарка для исторических тюркских текстов в арабской графике.</w:t>
+        <w:t xml:space="preserve">1. Введение</w:t>
+      </w:r>
+    </w:p>
+    <w:p>
+      <w:pPr>
+        <w:pStyle w:val="FirstParagraph"/>
+      </w:pPr>
+      <w:r>
+        <w:t xml:space="preserve">Исторические тексты на арабографичной тюркской письменности представляют собой важный источник для изучения истории, культуры, религии, права, быта и интеллектуальной традиции тюркских народов. К таким материалам могут относиться османские, татарские, башкирские, крымскотатарские и другие тюркские тексты, записанные арабской графикой до перехода соответствующих письменных традиций на латиницу или кириллицу.</w:t>
+      </w:r>
+    </w:p>
+    <w:p>
+      <w:pPr>
+        <w:pStyle w:val="BodyText"/>
+      </w:pPr>
+      <w:r>
+        <w:t xml:space="preserve">Несмотря на историческую значимость таких источников, их автоматическая обработка остаётся сложной задачей. Современные инструменты оптического распознавания текста и обработки естественного языка обычно лучше развиты для массовых современных языков и стандартных письменностей. Для исторических арабографичных тюркских материалов ситуация иная: доступных размеченных корпусов мало, орфография нестабильна, качество сканов и печатных источников может быть неоднородным, а готовые модели часто не учитывают специфику старой письменной традиции.</w:t>
+      </w:r>
+    </w:p>
+    <w:p>
+      <w:pPr>
+        <w:pStyle w:val="BodyText"/>
+      </w:pPr>
+      <w:r>
+        <w:t xml:space="preserve">В результате исследователь, работающий с такими документами, сталкивается не только с задачей распознавания символов, но и с более широкой проблемой восстановления и нормализации текста. Даже если OCR-система выдаёт частично читаемый результат, в нём остаются ошибки: пропуски, замены похожих букв, неправильные пробелы, смешение графем и искажение слов. Такие ошибки затрудняют дальнейший поиск, индексирование, извлечение сущностей и историко-лингвистический анализ.</w:t>
+      </w:r>
+    </w:p>
+    <w:p>
+      <w:pPr>
+        <w:pStyle w:val="BodyText"/>
+      </w:pPr>
+      <w:r>
+        <w:t xml:space="preserve">В данной работе рассматривается один из первых технических шагов в этом направлении — посткоррекция OCR-подобных ошибок для исторического тюркского текста в арабской графике. Вместо попытки сразу построить полную систему распознавания и анализа документов работа фокусируется на воспроизводимом пилотном пайплайне: сбор небольшого корпуса, генерация контролируемых OCR-подобных искажений, обучение модели исправления текста и анализ качества результата.</w:t>
       </w:r>
     </w:p>
     <w:bookmarkEnd w:id="10"/>
-    <w:bookmarkStart w:id="11" w:name="введение"/>
+    <w:bookmarkStart w:id="11" w:name="актуальность"/>
     <w:p>
       <w:pPr>
         <w:pStyle w:val="Heading2"/>
       </w:pPr>
       <w:r>
-        <w:rPr>
-          <w:rStyle w:val="SectionNumber"/>
-        </w:rPr>
-        <w:t xml:space="preserve">1.2</w:t>
-      </w:r>
-      <w:r>
-        <w:tab/>
-      </w:r>
-      <w:r>
-        <w:t xml:space="preserve">1. Введение</w:t>
-      </w:r>
-    </w:p>
-    <w:p>
-      <w:pPr>
-        <w:pStyle w:val="FirstParagraph"/>
-      </w:pPr>
-      <w:r>
-        <w:t xml:space="preserve">Исторические тексты на арабографичной тюркской письменности представляют собой важный источник для изучения истории, культуры, религии, права, быта и интеллектуальной традиции тюркских народов. К таким материалам могут относиться османские, татарские, башкирские, крымскотатарские и другие тюркские тексты, записанные арабской графикой до перехода соответствующих письменных традиций на латиницу или кириллицу.</w:t>
-      </w:r>
-    </w:p>
-    <w:p>
-      <w:pPr>
-        <w:pStyle w:val="BodyText"/>
-      </w:pPr>
-      <w:r>
-        <w:t xml:space="preserve">Несмотря на историческую значимость таких источников, их автоматическая обработка остаётся сложной задачей. Современные инструменты оптического распознавания текста и обработки естественного языка обычно лучше развиты для массовых современных языков и стандартных письменностей. Для исторических арабографичных тюркских материалов ситуация иная: доступных размеченных корпусов мало, орфография нестабильна, качество сканов и печатных источников может быть неоднородным, а готовые модели часто не учитывают специфику старой письменной традиции.</w:t>
-      </w:r>
-    </w:p>
-    <w:p>
-      <w:pPr>
-        <w:pStyle w:val="BodyText"/>
-      </w:pPr>
-      <w:r>
-        <w:t xml:space="preserve">В результате исследователь, работающий с такими документами, сталкивается не только с задачей распознавания символов, но и с более широкой проблемой восстановления и нормализации текста. Даже если OCR-система выдаёт частично читаемый результат, в нём остаются ошибки: пропуски, замены похожих букв, неправильные пробелы, смешение графем и искажение слов. Такие ошибки затрудняют дальнейший поиск, индексирование, извлечение сущностей и историко-лингвистический анализ.</w:t>
-      </w:r>
-    </w:p>
-    <w:p>
-      <w:pPr>
-        <w:pStyle w:val="BodyText"/>
-      </w:pPr>
-      <w:r>
-        <w:t xml:space="preserve">В данной работе рассматривается один из первых технических шагов в этом направлении — посткоррекция OCR-подобных ошибок для исторического тюркского текста в арабской графике. Вместо попытки сразу построить полную систему распознавания и анализа документов работа фокусируется на воспроизводимом пилотном пайплайне: сбор небольшого корпуса, генерация контролируемых OCR-подобных искажений, обучение модели исправления текста и анализ качества результата.</w:t>
+        <w:t xml:space="preserve">1.1 Актуальность</w:t>
+      </w:r>
+    </w:p>
+    <w:p>
+      <w:pPr>
+        <w:pStyle w:val="FirstParagraph"/>
+      </w:pPr>
+      <w:r>
+        <w:t xml:space="preserve">Актуальность темы определяется несколькими обстоятельствами.</w:t>
+      </w:r>
+    </w:p>
+    <w:p>
+      <w:pPr>
+        <w:pStyle w:val="BodyText"/>
+      </w:pPr>
+      <w:r>
+        <w:t xml:space="preserve">Во-первых, исторические тюркские тексты в арабской графике остаются недостаточно представленными в цифровых корпусах и инструментах автоматической обработки. Это ограничивает возможности поиска, анализа и повторного использования источников в исторических, филологических и культурологических исследованиях.</w:t>
+      </w:r>
+    </w:p>
+    <w:p>
+      <w:pPr>
+        <w:pStyle w:val="BodyText"/>
+      </w:pPr>
+      <w:r>
+        <w:t xml:space="preserve">Во-вторых, низкоресурсный характер задачи делает прямое применение стандартных OCR- и NLP-подходов недостаточным. Модели, хорошо работающие на современных языках и стандартных корпусах, могут давать нестабильные результаты на исторических текстах с вариативной орфографией и нетипичными графическими формами.</w:t>
+      </w:r>
+    </w:p>
+    <w:p>
+      <w:pPr>
+        <w:pStyle w:val="BodyText"/>
+      </w:pPr>
+      <w:r>
+        <w:t xml:space="preserve">В-третьих, посткоррекция OCR-ошибок является практически важным промежуточным этапом. Даже небольшое улучшение качества распознанного текста может повысить пригодность корпуса для поиска, разметки, извлечения именованных сущностей и последующего анализа.</w:t>
+      </w:r>
+    </w:p>
+    <w:p>
+      <w:pPr>
+        <w:pStyle w:val="BodyText"/>
+      </w:pPr>
+      <w:r>
+        <w:t xml:space="preserve">В-четвёртых, создание воспроизводимого пилотного бенчмарка важно не только для конкретной курсовой работы, но и для дальнейшего дипломного и публикационного проекта. Такой benchmark позволяет формализовать задачу, фиксировать метрики и постепенно расширять экспериментальную базу.</w:t>
       </w:r>
     </w:p>
     <w:bookmarkEnd w:id="11"/>
-    <w:bookmarkStart w:id="12" w:name="актуальность"/>
+    <w:bookmarkStart w:id="12" w:name="постановка-проблемы"/>
     <w:p>
       <w:pPr>
         <w:pStyle w:val="Heading2"/>
       </w:pPr>
-      <w:r>
-        <w:rPr>
-          <w:rStyle w:val="SectionNumber"/>
-        </w:rPr>
-        <w:t xml:space="preserve">1.3</w:t>
-      </w:r>
-      <w:r>
-        <w:tab/>
-      </w:r>
-      <w:r>
-        <w:t xml:space="preserve">1.1 Актуальность</w:t>
-      </w:r>
-    </w:p>
-    <w:p>
-      <w:pPr>
-        <w:pStyle w:val="FirstParagraph"/>
-      </w:pPr>
-      <w:r>
-        <w:t xml:space="preserve">Актуальность темы определяется несколькими обстоятельствами.</w:t>
-      </w:r>
-    </w:p>
-    <w:p>
-      <w:pPr>
-        <w:pStyle w:val="BodyText"/>
-      </w:pPr>
-      <w:r>
-        <w:t xml:space="preserve">Во-первых, исторические тюркские тексты в арабской графике остаются недостаточно представленными в цифровых корпусах и инструментах автоматической обработки. Это ограничивает возможности поиска, анализа и повторного использования источников в исторических, филологических и культурологических исследованиях.</w:t>
-      </w:r>
-    </w:p>
-    <w:p>
-      <w:pPr>
-        <w:pStyle w:val="BodyText"/>
-      </w:pPr>
-      <w:r>
-        <w:t xml:space="preserve">Во-вторых, низкоресурсный характер задачи делает прямое применение стандартных OCR- и NLP-подходов недостаточным. Модели, хорошо работающие на современных языках и стандартных корпусах, могут давать нестабильные результаты на исторических текстах с вариативной орфографией и нетипичными графическими формами.</w:t>
-      </w:r>
-    </w:p>
-    <w:p>
-      <w:pPr>
-        <w:pStyle w:val="BodyText"/>
-      </w:pPr>
-      <w:r>
-        <w:t xml:space="preserve">В-третьих, посткоррекция OCR-ошибок является практически важным промежуточным этапом. Даже небольшое улучшение качества распознанного текста может повысить пригодность корпуса для поиска, разметки, извлечения именованных сущностей и последующего анализа.</w:t>
-      </w:r>
-    </w:p>
-    <w:p>
-      <w:pPr>
-        <w:pStyle w:val="BodyText"/>
-      </w:pPr>
-      <w:r>
-        <w:t xml:space="preserve">В-четвёртых, создание воспроизводимого пилотного бенчмарка важно не только для конкретной курсовой работы, но и для дальнейшего дипломного и публикационного проекта. Такой benchmark позволяет формализовать задачу, фиксировать метрики и постепенно расширять экспериментальную базу.</w:t>
-      </w:r>
-    </w:p>
-    <w:bookmarkEnd w:id="12"/>
-    <w:bookmarkStart w:id="13" w:name="постановка-проблемы"/>
-    <w:p>
-      <w:pPr>
-        <w:pStyle w:val="Heading2"/>
-      </w:pPr>
-      <w:r>
-        <w:rPr>
-          <w:rStyle w:val="SectionNumber"/>
-        </w:rPr>
-        <w:t xml:space="preserve">1.4</w:t>
-      </w:r>
-      <w:r>
-        <w:tab/>
-      </w:r>
       <w:r>
         <w:t xml:space="preserve">1.2 Постановка проблемы</w:t>
       </w:r>
@@ -532,48 +448,30 @@
         <w:t xml:space="preserve">В рамках данной работы проблема сужается до пилотной постановки: можно ли с помощью нейросетевой sequence-to-sequence модели улучшить синтетически искажённый арабографичный тюркский текст по сравнению с простыми baseline-подходами.</w:t>
       </w:r>
     </w:p>
+    <w:bookmarkEnd w:id="12"/>
+    <w:bookmarkStart w:id="13" w:name="цель-работы"/>
+    <w:p>
+      <w:pPr>
+        <w:pStyle w:val="Heading2"/>
+      </w:pPr>
+      <w:r>
+        <w:t xml:space="preserve">1.3 Цель работы</w:t>
+      </w:r>
+    </w:p>
+    <w:p>
+      <w:pPr>
+        <w:pStyle w:val="FirstParagraph"/>
+      </w:pPr>
+      <w:r>
+        <w:t xml:space="preserve">Цель работы — разработать и оценить пилотный пайплайн на основе методов искусственного интеллекта для посткоррекции OCR-подобных ошибок в исторических тюркских текстах, записанных арабской графикой.</w:t>
+      </w:r>
+    </w:p>
     <w:bookmarkEnd w:id="13"/>
-    <w:bookmarkStart w:id="14" w:name="цель-работы"/>
+    <w:bookmarkStart w:id="14" w:name="задачи-работы"/>
     <w:p>
       <w:pPr>
         <w:pStyle w:val="Heading2"/>
       </w:pPr>
-      <w:r>
-        <w:rPr>
-          <w:rStyle w:val="SectionNumber"/>
-        </w:rPr>
-        <w:t xml:space="preserve">1.5</w:t>
-      </w:r>
-      <w:r>
-        <w:tab/>
-      </w:r>
-      <w:r>
-        <w:t xml:space="preserve">1.3 Цель работы</w:t>
-      </w:r>
-    </w:p>
-    <w:p>
-      <w:pPr>
-        <w:pStyle w:val="FirstParagraph"/>
-      </w:pPr>
-      <w:r>
-        <w:t xml:space="preserve">Цель работы — разработать и оценить пилотный пайплайн на основе методов искусственного интеллекта для посткоррекции OCR-подобных ошибок в исторических тюркских текстах, записанных арабской графикой.</w:t>
-      </w:r>
-    </w:p>
-    <w:bookmarkEnd w:id="14"/>
-    <w:bookmarkStart w:id="15" w:name="задачи-работы"/>
-    <w:p>
-      <w:pPr>
-        <w:pStyle w:val="Heading2"/>
-      </w:pPr>
-      <w:r>
-        <w:rPr>
-          <w:rStyle w:val="SectionNumber"/>
-        </w:rPr>
-        <w:t xml:space="preserve">1.6</w:t>
-      </w:r>
-      <w:r>
-        <w:tab/>
-      </w:r>
       <w:r>
         <w:t xml:space="preserve">1.4 Задачи работы</w:t>
       </w:r>
@@ -694,56 +592,38 @@
         <w:t xml:space="preserve">Сформулировать ограничения пилотного эксперимента и направления дальнейшей работы.</w:t>
       </w:r>
     </w:p>
+    <w:bookmarkEnd w:id="14"/>
+    <w:bookmarkStart w:id="15" w:name="объект-и-предмет-исследования"/>
+    <w:p>
+      <w:pPr>
+        <w:pStyle w:val="Heading2"/>
+      </w:pPr>
+      <w:r>
+        <w:t xml:space="preserve">1.5 Объект и предмет исследования</w:t>
+      </w:r>
+    </w:p>
+    <w:p>
+      <w:pPr>
+        <w:pStyle w:val="FirstParagraph"/>
+      </w:pPr>
+      <w:r>
+        <w:t xml:space="preserve">Объект исследования — исторические тюркские тексты, записанные арабской графикой.</w:t>
+      </w:r>
+    </w:p>
+    <w:p>
+      <w:pPr>
+        <w:pStyle w:val="BodyText"/>
+      </w:pPr>
+      <w:r>
+        <w:t xml:space="preserve">Предмет исследования — методы автоматической посткоррекции OCR-подобных ошибок в арабографичных тюркских текстах с использованием rule-based и нейросетевых подходов.</w:t>
+      </w:r>
+    </w:p>
     <w:bookmarkEnd w:id="15"/>
-    <w:bookmarkStart w:id="16" w:name="объект-и-предмет-исследования"/>
+    <w:bookmarkStart w:id="16" w:name="исследовательские-вопросы"/>
     <w:p>
       <w:pPr>
         <w:pStyle w:val="Heading2"/>
       </w:pPr>
-      <w:r>
-        <w:rPr>
-          <w:rStyle w:val="SectionNumber"/>
-        </w:rPr>
-        <w:t xml:space="preserve">1.7</w:t>
-      </w:r>
-      <w:r>
-        <w:tab/>
-      </w:r>
-      <w:r>
-        <w:t xml:space="preserve">1.5 Объект и предмет исследования</w:t>
-      </w:r>
-    </w:p>
-    <w:p>
-      <w:pPr>
-        <w:pStyle w:val="FirstParagraph"/>
-      </w:pPr>
-      <w:r>
-        <w:t xml:space="preserve">Объект исследования — исторические тюркские тексты, записанные арабской графикой.</w:t>
-      </w:r>
-    </w:p>
-    <w:p>
-      <w:pPr>
-        <w:pStyle w:val="BodyText"/>
-      </w:pPr>
-      <w:r>
-        <w:t xml:space="preserve">Предмет исследования — методы автоматической посткоррекции OCR-подобных ошибок в арабографичных тюркских текстах с использованием rule-based и нейросетевых подходов.</w:t>
-      </w:r>
-    </w:p>
-    <w:bookmarkEnd w:id="16"/>
-    <w:bookmarkStart w:id="17" w:name="исследовательские-вопросы"/>
-    <w:p>
-      <w:pPr>
-        <w:pStyle w:val="Heading2"/>
-      </w:pPr>
-      <w:r>
-        <w:rPr>
-          <w:rStyle w:val="SectionNumber"/>
-        </w:rPr>
-        <w:t xml:space="preserve">1.8</w:t>
-      </w:r>
-      <w:r>
-        <w:tab/>
-      </w:r>
       <w:r>
         <w:t xml:space="preserve">1.6 Исследовательские вопросы</w:t>
       </w:r>
@@ -804,472 +684,355 @@
         <w:t xml:space="preserve">Улучшает ли модель большинство тестовых примеров или только среднее значение метрики за счёт отдельных удачных случаев?</w:t>
       </w:r>
     </w:p>
+    <w:bookmarkEnd w:id="16"/>
+    <w:bookmarkStart w:id="17" w:name="гипотезы"/>
+    <w:p>
+      <w:pPr>
+        <w:pStyle w:val="Heading2"/>
+      </w:pPr>
+      <w:r>
+        <w:t xml:space="preserve">1.7 Гипотезы</w:t>
+      </w:r>
+    </w:p>
+    <w:p>
+      <w:pPr>
+        <w:pStyle w:val="FirstParagraph"/>
+      </w:pPr>
+      <w:r>
+        <w:t xml:space="preserve">В работе проверяются следующие гипотезы.</w:t>
+      </w:r>
+    </w:p>
+    <w:p>
+      <w:pPr>
+        <w:pStyle w:val="BodyText"/>
+      </w:pPr>
+      <w:r>
+        <w:t xml:space="preserve">Гипотеза 1. Простая rule-based нормализация может ухудшать качество арабографичного тюркского текста, поскольку способна искажать значимые орфографические особенности.</w:t>
+      </w:r>
+    </w:p>
+    <w:p>
+      <w:pPr>
+        <w:pStyle w:val="BodyText"/>
+      </w:pPr>
+      <w:r>
+        <w:t xml:space="preserve">Гипотеза 2. Byte-level sequence-to-sequence модель ByT5-small способна улучшить качество OCR post-correction по сравнению с identity baseline.</w:t>
+      </w:r>
+    </w:p>
+    <w:p>
+      <w:pPr>
+        <w:pStyle w:val="BodyText"/>
+      </w:pPr>
+      <w:r>
+        <w:t xml:space="preserve">Гипотеза 3. Увеличение длины последовательности с 256 до 512 важно для арабографичного текста, поскольку ByT5 работает на уровне байтов, а один видимый символ арабской графики может занимать несколько байтов.</w:t>
+      </w:r>
+    </w:p>
     <w:bookmarkEnd w:id="17"/>
-    <w:bookmarkStart w:id="18" w:name="гипотезы"/>
+    <w:bookmarkStart w:id="18" w:name="практическая-значимость"/>
     <w:p>
       <w:pPr>
         <w:pStyle w:val="Heading2"/>
       </w:pPr>
       <w:r>
-        <w:rPr>
-          <w:rStyle w:val="SectionNumber"/>
-        </w:rPr>
-        <w:t xml:space="preserve">1.9</w:t>
-      </w:r>
-      <w:r>
-        <w:tab/>
-      </w:r>
-      <w:r>
-        <w:t xml:space="preserve">1.7 Гипотезы</w:t>
-      </w:r>
-    </w:p>
-    <w:p>
-      <w:pPr>
-        <w:pStyle w:val="FirstParagraph"/>
-      </w:pPr>
-      <w:r>
-        <w:t xml:space="preserve">В работе проверяются следующие гипотезы.</w:t>
-      </w:r>
-    </w:p>
-    <w:p>
-      <w:pPr>
-        <w:pStyle w:val="BodyText"/>
-      </w:pPr>
-      <w:r>
-        <w:t xml:space="preserve">Гипотеза 1. Простая rule-based нормализация может ухудшать качество арабографичного тюркского текста, поскольку способна искажать значимые орфографические особенности.</w:t>
-      </w:r>
-    </w:p>
-    <w:p>
-      <w:pPr>
-        <w:pStyle w:val="BodyText"/>
-      </w:pPr>
-      <w:r>
-        <w:t xml:space="preserve">Гипотеза 2. Byte-level sequence-to-sequence модель ByT5-small способна улучшить качество OCR post-correction по сравнению с identity baseline.</w:t>
-      </w:r>
-    </w:p>
-    <w:p>
-      <w:pPr>
-        <w:pStyle w:val="BodyText"/>
-      </w:pPr>
-      <w:r>
-        <w:t xml:space="preserve">Гипотеза 3. Увеличение длины последовательности с 256 до 512 важно для арабографичного текста, поскольку ByT5 работает на уровне байтов, а один видимый символ арабской графики может занимать несколько байтов.</w:t>
+        <w:t xml:space="preserve">1.8 Практическая значимость</w:t>
+      </w:r>
+    </w:p>
+    <w:p>
+      <w:pPr>
+        <w:pStyle w:val="FirstParagraph"/>
+      </w:pPr>
+      <w:r>
+        <w:t xml:space="preserve">Практическая значимость работы заключается в создании воспроизводимого пилотного пайплайна для обработки исторических арабографичных тюркских текстов. Разработанный подход может быть использован как основа для дальнейшего расширения корпуса, подключения реальных OCR/HTR-результатов и построения более крупного benchmark.</w:t>
+      </w:r>
+    </w:p>
+    <w:p>
+      <w:pPr>
+        <w:pStyle w:val="BodyText"/>
+      </w:pPr>
+      <w:r>
+        <w:t xml:space="preserve">Кроме того, результаты работы могут быть полезны для задач цифровой гуманитаристики: поиска по историческим текстам, подготовки корпусов, последующего извлечения именованных сущностей, анализа исторических документов и построения более сложных систем обработки архивных материалов.</w:t>
       </w:r>
     </w:p>
     <w:bookmarkEnd w:id="18"/>
-    <w:bookmarkStart w:id="19" w:name="практическая-значимость"/>
+    <w:bookmarkStart w:id="19" w:name="структура-работы"/>
     <w:p>
       <w:pPr>
         <w:pStyle w:val="Heading2"/>
       </w:pPr>
       <w:r>
-        <w:rPr>
-          <w:rStyle w:val="SectionNumber"/>
-        </w:rPr>
-        <w:t xml:space="preserve">1.10</w:t>
-      </w:r>
-      <w:r>
-        <w:tab/>
-      </w:r>
-      <w:r>
-        <w:t xml:space="preserve">1.8 Практическая значимость</w:t>
-      </w:r>
-    </w:p>
-    <w:p>
-      <w:pPr>
-        <w:pStyle w:val="FirstParagraph"/>
-      </w:pPr>
-      <w:r>
-        <w:t xml:space="preserve">Практическая значимость работы заключается в создании воспроизводимого пилотного пайплайна для обработки исторических арабографичных тюркских текстов. Разработанный подход может быть использован как основа для дальнейшего расширения корпуса, подключения реальных OCR/HTR-результатов и построения более крупного benchmark.</w:t>
-      </w:r>
-    </w:p>
-    <w:p>
-      <w:pPr>
-        <w:pStyle w:val="BodyText"/>
-      </w:pPr>
-      <w:r>
-        <w:t xml:space="preserve">Кроме того, результаты работы могут быть полезны для задач цифровой гуманитаристики: поиска по историческим текстам, подготовки корпусов, последующего извлечения именованных сущностей, анализа исторических документов и построения более сложных систем обработки архивных материалов.</w:t>
+        <w:t xml:space="preserve">1.9 Структура работы</w:t>
+      </w:r>
+    </w:p>
+    <w:p>
+      <w:pPr>
+        <w:pStyle w:val="FirstParagraph"/>
+      </w:pPr>
+      <w:r>
+        <w:t xml:space="preserve">Работа состоит из нескольких частей. В первой части формулируются актуальность, проблема, цель и задачи исследования. Во второй части рассматриваются особенности OCR и посткоррекции для исторических документов и арабографичных текстов. В третьей части описываются корпус и процесс построения синтетического набора данных. В четвёртой части представлена методология экспериментов, включая baseline-подходы и модель ByT5-small. В пятой части приводятся результаты и анализ ошибок. В заключении формулируются ограничения и направления дальнейшей работы.</w:t>
       </w:r>
     </w:p>
     <w:bookmarkEnd w:id="19"/>
-    <w:bookmarkStart w:id="20" w:name="структура-работы"/>
+    <w:bookmarkStart w:id="27" w:name="X0ceba565ddc4689162e5800a39ee266fa2dc29a"/>
     <w:p>
       <w:pPr>
         <w:pStyle w:val="Heading2"/>
       </w:pPr>
       <w:r>
-        <w:rPr>
-          <w:rStyle w:val="SectionNumber"/>
-        </w:rPr>
-        <w:t xml:space="preserve">1.11</w:t>
-      </w:r>
-      <w:r>
-        <w:tab/>
-      </w:r>
-      <w:r>
-        <w:t xml:space="preserve">1.9 Структура работы</w:t>
-      </w:r>
-    </w:p>
-    <w:p>
-      <w:pPr>
-        <w:pStyle w:val="FirstParagraph"/>
-      </w:pPr>
-      <w:r>
-        <w:t xml:space="preserve">Работа состоит из нескольких частей. В первой части формулируются актуальность, проблема, цель и задачи исследования. Во второй части рассматриваются особенности OCR и посткоррекции для исторических документов и арабографичных текстов. В третьей части описываются корпус и процесс построения синтетического набора данных. В четвёртой части представлена методология экспериментов, включая baseline-подходы и модель ByT5-small. В пятой части приводятся результаты и анализ ошибок. В заключении формулируются ограничения и направления дальнейшей работы.</w:t>
+        <w:t xml:space="preserve">2. Обзор предметной области и связанных работ</w:t>
+      </w:r>
+    </w:p>
+    <w:bookmarkStart w:id="20" w:name="X679db47d81c99eb1d359e7ecbdd9091b3199270"/>
+    <w:p>
+      <w:pPr>
+        <w:pStyle w:val="Heading3"/>
+      </w:pPr>
+      <w:r>
+        <w:t xml:space="preserve">2.1 Автоматическое распознавание исторических документов</w:t>
+      </w:r>
+    </w:p>
+    <w:p>
+      <w:pPr>
+        <w:pStyle w:val="FirstParagraph"/>
+      </w:pPr>
+      <w:r>
+        <w:t xml:space="preserve">OCR исторических документов отличается от распознавания современных печатных текстов не одной отдельной трудностью, а сочетанием факторов: нестабильной типографикой, повреждениями носителя, неоднородным качеством сканов, сложной вёрсткой и вариативной орфографией. В работах по историческому OCR workflow подчёркивается, что качество результата зависит не только от модели распознавания, но и от подготовки изображений, разметки, ground truth и последующей проверки текста (Reul et al., 2019; Springmann et al., 2018).</w:t>
+      </w:r>
+    </w:p>
+    <w:p>
+      <w:pPr>
+        <w:pStyle w:val="BodyText"/>
+      </w:pPr>
+      <w:r>
+        <w:t xml:space="preserve">Для печатных документов обычно используется термин OCR — optical character recognition. Для рукописных материалов чаще применяется термин HTR — handwritten text recognition. В обоих случаях задача не сводится к классификации отдельных символов: система должна учитывать строку, слово, контекст и особенности конкретной письменной традиции.</w:t>
+      </w:r>
+    </w:p>
+    <w:p>
+      <w:pPr>
+        <w:pStyle w:val="BodyText"/>
+      </w:pPr>
+      <w:r>
+        <w:t xml:space="preserve">В данной работе не строится OCR/HTR-система по изображениям. Исследуется следующий этап обработки — посткоррекция уже полученного текстового вывода. Такое ограничение делает постановку уже, но чище: можно отдельно проверить, насколько модель исправления ошибок способна восстанавливать арабографичный тюркский текст после OCR-подобных искажений.</w:t>
       </w:r>
     </w:p>
     <w:bookmarkEnd w:id="20"/>
-    <w:bookmarkStart w:id="28" w:name="X0ceba565ddc4689162e5800a39ee266fa2dc29a"/>
+    <w:bookmarkStart w:id="21" w:name="Xa02a7bb48ad7549a4f67e48911e7568815c5168"/>
+    <w:p>
+      <w:pPr>
+        <w:pStyle w:val="Heading3"/>
+      </w:pPr>
+      <w:r>
+        <w:t xml:space="preserve">2.2 Особенности арабографичных исторических текстов</w:t>
+      </w:r>
+    </w:p>
+    <w:p>
+      <w:pPr>
+        <w:pStyle w:val="FirstParagraph"/>
+      </w:pPr>
+      <w:r>
+        <w:t xml:space="preserve">Arabic-script OCR обычно рассматривается как отдельный класс задач: буквы меняют форму в зависимости от позиции в слове, письмо является связным, а различия между рядом символов задаются точками и небольшими графическими элементами. В обзорах по Arabic OCR эти свойства выделяются как одна из причин, по которым прямой перенос OCR-подходов с латинской графики оказывается недостаточным (Kasem et al., 2023). Для печатных и многошрифтовых арабографичных материалов дополнительно важны вариативность шрифтов, наложение элементов и близость начертаний (Osman et al., 2020).</w:t>
+      </w:r>
+    </w:p>
+    <w:p>
+      <w:pPr>
+        <w:pStyle w:val="BodyText"/>
+      </w:pPr>
+      <w:r>
+        <w:t xml:space="preserve">В исторических тюркских текстах арабская графика усложняется ещё сильнее: в одном материале могут сосуществовать арабские, персидские и тюркские орфографические практики. Для тюркских языков арабское письмо адаптировалось под звуки, которые не всегда имели прямые соответствия в классической арабской письменности. Поэтому один и тот же символ может быть одновременно технической единицей OCR и носителем историко-орфографической информации.</w:t>
+      </w:r>
+    </w:p>
+    <w:p>
+      <w:pPr>
+        <w:pStyle w:val="BodyText"/>
+      </w:pPr>
+      <w:r>
+        <w:t xml:space="preserve">Из этого следует важное ограничение: простая унификация символов не является заведомо безопасной предварительной процедурой. Она может убрать технический шум, но может и стереть значимые различия. Поэтому в данной работе rule-based normalizer рассматривается не как заведомо правильная предобработка, а как отдельный baseline, качество которого проверяется экспериментально.</w:t>
+      </w:r>
+    </w:p>
+    <w:bookmarkEnd w:id="21"/>
+    <w:bookmarkStart w:id="22" w:name="X69a43e90e5ebd7e3113e444e7e5f2f644869f5a"/>
+    <w:p>
+      <w:pPr>
+        <w:pStyle w:val="Heading3"/>
+      </w:pPr>
+      <w:r>
+        <w:t xml:space="preserve">2.3 Тюркские тексты в арабской графике как низкоресурсный материал</w:t>
+      </w:r>
+    </w:p>
+    <w:p>
+      <w:pPr>
+        <w:pStyle w:val="FirstParagraph"/>
+      </w:pPr>
+      <w:r>
+        <w:t xml:space="preserve">Тюркские языки в разные исторические периоды использовали разные письменности, включая арабскую графику. Для османско-тюркских материалов это особенно заметно: после перехода турецкого языка на латиницу значительная часть печатного наследия осталась в письменной форме, которая трудна для массового поиска и автоматической обработки. На эту проблему указывают работы по автоматической транскрипции османско-турецких периодических изданий и цифровизации non-Latin script archives (Kirmizialtin &amp; Wrisley, 2020).</w:t>
+      </w:r>
+    </w:p>
+    <w:p>
+      <w:pPr>
+        <w:pStyle w:val="BodyText"/>
+      </w:pPr>
+      <w:r>
+        <w:t xml:space="preserve">С точки зрения NLP такие материалы остаются низкоресурсными: для них меньше размеченных корпусов, стандартных бенчмарк-наборов, готовых моделей и инструментов, чем для современных массовых языков. Современные работы по Historical Turkish NLP отдельно подчёркивают необходимость создавать базовые ресурсы: корпуса, модели, разметку и инструменты для последующего анализа исторических текстов (Özateş et al., 2025).</w:t>
+      </w:r>
+    </w:p>
+    <w:p>
+      <w:pPr>
+        <w:pStyle w:val="BodyText"/>
+      </w:pPr>
+      <w:r>
+        <w:t xml:space="preserve">В данной работе эта проблема сужается до одного технически проверяемого шага: построения воспроизводимого бенчмарка посткоррекции. Даже небольшой корпус полезен, если он явно фиксирует источник данных, процедуру разбиения, тип ошибок, метрики и ограничения. Такой протокол можно расширять новыми источниками и использовать как часть более крупной системы обработки исторических арабографичных тюркских документов.</w:t>
+      </w:r>
+    </w:p>
+    <w:bookmarkEnd w:id="22"/>
+    <w:bookmarkStart w:id="23" w:name="посткоррекция-ocr-ошибок"/>
+    <w:p>
+      <w:pPr>
+        <w:pStyle w:val="Heading3"/>
+      </w:pPr>
+      <w:r>
+        <w:t xml:space="preserve">2.4 Посткоррекция OCR-ошибок</w:t>
+      </w:r>
+    </w:p>
+    <w:p>
+      <w:pPr>
+        <w:pStyle w:val="FirstParagraph"/>
+      </w:pPr>
+      <w:r>
+        <w:t xml:space="preserve">Посткоррекция OCR-ошибок — это задача преобразования ошибочного OCR-вывода в более корректный текст. На уровне строки она естественно формулируется как sequence-to-sequence задача: модель получает зашумлённый текст и должна восстановить чистый текст. Такой подход используется в работах по post-OCR correction, включая character-level и neural sequence-to-sequence модели (Ramirez-Orta et al., 2021; Hämäläinen &amp; Hengchen, 2019).</w:t>
+      </w:r>
+    </w:p>
+    <w:p>
+      <w:pPr>
+        <w:pStyle w:val="BodyText"/>
+      </w:pPr>
+      <w:r>
+        <w:t xml:space="preserve">Ошибки OCR обычно включают замены похожих символов, удаления и вставки, неправильное разбиение на слова, искажение окончаний и локальные перестановки. Для исторических текстов к этому добавляются нестабильная орфография и несовпадение современных языковых норм с историческим написанием. Поэтому посткоррекция пересекается не только с исправлением OCR-шума, но и с задачей нормализации написаний; в литературе эти две задачи иногда рассматриваются совместно, но их нельзя полностью отождествлять (Duong et al., 2020).</w:t>
+      </w:r>
+    </w:p>
+    <w:p>
+      <w:pPr>
+        <w:pStyle w:val="BodyText"/>
+      </w:pPr>
+      <w:r>
+        <w:t xml:space="preserve">Для исторических арабографичных тюркских текстов посткоррекция важна как промежуточный слой между распознаванием и дальнейшим анализом. Даже частично ошибочный OCR-вывод после исправления становится полезнее для поиска, индексации, извлечения именованных сущностей, анализа топонимов, сопоставления записей и построения исторических баз данных. Поэтому в данной работе post-correction рассматривается не как косметическая правка текста, а как отдельный компонент будущего pipeline для обработки архивных материалов.</w:t>
+      </w:r>
+    </w:p>
+    <w:bookmarkEnd w:id="23"/>
+    <w:bookmarkStart w:id="24" w:name="синтетические-ocr-ошибки"/>
+    <w:p>
+      <w:pPr>
+        <w:pStyle w:val="Heading3"/>
+      </w:pPr>
+      <w:r>
+        <w:t xml:space="preserve">2.5 Синтетические OCR-ошибки</w:t>
+      </w:r>
+    </w:p>
+    <w:p>
+      <w:pPr>
+        <w:pStyle w:val="FirstParagraph"/>
+      </w:pPr>
+      <w:r>
+        <w:t xml:space="preserve">В идеальном случае модель посткоррекции обучается на парах реального OCR/HTR-вывода и вручную проверенного правильного текста. Для низкоресурсных исторических материалов такие пары часто отсутствуют или существуют в малом объёме. Поэтому в пилотных экспериментах используется синтетический шум: чистый текст намеренно искажается контролируемым генератором ошибок. Близкий подход применяется в работах по OCR error correction для исторических текстов, где искусственно подготовленные или task-specific данные помогают обучать модель при дефиците размеченных примеров (Suissa et al., 2023).</w:t>
+      </w:r>
+    </w:p>
+    <w:p>
+      <w:pPr>
+        <w:pStyle w:val="BodyText"/>
+      </w:pPr>
+      <w:r>
+        <w:t xml:space="preserve">Преимущество синтетической постановки состоит в контроле: известен исходный чистый текст, типы искажений, процедура генерации, random seed и разбиение на train/valid/test. Это позволяет проверить не всю OCR-систему целиком, а более узкий вопрос: способна ли модель post-correction восстанавливать арабографичный тюркский текст после OCR-подобных ошибок.</w:t>
+      </w:r>
+    </w:p>
+    <w:p>
+      <w:pPr>
+        <w:pStyle w:val="BodyText"/>
+      </w:pPr>
+      <w:r>
+        <w:t xml:space="preserve">Такой эксперимент нельзя считать заменой проверки на реальных OCR/HTR-выходах. Реальные ошибки зависят от качества изображения, шрифта, сегментации, модели распознавания и состояния документа. Поэтому результаты на синтетическом датасете в данной работе интерпретируются как пилотная проверка pipeline, а не как итоговая оценка качества на архивных сканах.</w:t>
+      </w:r>
+    </w:p>
+    <w:bookmarkEnd w:id="24"/>
+    <w:bookmarkStart w:id="25" w:name="byte-level-модели-и-byt5"/>
+    <w:p>
+      <w:pPr>
+        <w:pStyle w:val="Heading3"/>
+      </w:pPr>
+      <w:r>
+        <w:t xml:space="preserve">2.6 Byte-level модели и ByT5</w:t>
+      </w:r>
+    </w:p>
+    <w:p>
+      <w:pPr>
+        <w:pStyle w:val="FirstParagraph"/>
+      </w:pPr>
+      <w:r>
+        <w:t xml:space="preserve">Нейросетевые модели post-correction обычно опираются на sequence-to-sequence постановку: входная последовательность с ошибками преобразуется в целевую последовательность без ошибок. Современная основа таких моделей связана с Transformer-архитектурой (Vaswani et al., 2017) и text-to-text подходом, в котором разные задачи формулируются как преобразование текста в текст (Raffel et al., 2019).</w:t>
+      </w:r>
+    </w:p>
+    <w:p>
+      <w:pPr>
+        <w:pStyle w:val="BodyText"/>
+      </w:pPr>
+      <w:r>
+        <w:t xml:space="preserve">В данной работе используется ByT5-small. ByT5 относится к byte-level sequence-to-sequence моделям: она работает на уровне байтов, а не заранее заданных слов или подслов (Xue et al., 2021). Это важно для низкоресурсного исторического материала, где обычный subword-токенизатор может плохо представлять редкие графемы, нестандартные написания, смешение письменных традиций и OCR-шум.</w:t>
+      </w:r>
+    </w:p>
+    <w:p>
+      <w:pPr>
+        <w:pStyle w:val="BodyText"/>
+      </w:pPr>
+      <w:r>
+        <w:t xml:space="preserve">Byte-level представление имеет практическое следствие: длина последовательности в токенах не равна длине строки в видимых символах. Один символ арабской графики может занимать несколько байтов. Поэтому слишком короткое ограничение длины может обрезать часть контекста. В данной работе финальной конфигурацией выбрана длина 512; результаты показывают, что для арабографичных строк этот параметр является важным и должен явно контролироваться в эксперименте.</w:t>
+      </w:r>
+    </w:p>
+    <w:bookmarkEnd w:id="25"/>
+    <w:bookmarkStart w:id="26" w:name="выводы-по-обзору"/>
+    <w:p>
+      <w:pPr>
+        <w:pStyle w:val="Heading3"/>
+      </w:pPr>
+      <w:r>
+        <w:t xml:space="preserve">2.7 Выводы по обзору</w:t>
+      </w:r>
+    </w:p>
+    <w:p>
+      <w:pPr>
+        <w:pStyle w:val="FirstParagraph"/>
+      </w:pPr>
+      <w:r>
+        <w:t xml:space="preserve">Обзор показывает, что задача не сводится к обычному применению готовой OCR-системы. Исторический OCR зависит от качества источника, ground truth и workflow; арабская графика добавляет позиционные формы, связное письмо и близкие начертания; тюркский исторический материал остаётся низкоресурсным и плохо покрытым готовыми NLP-инструментами.</w:t>
+      </w:r>
+    </w:p>
+    <w:p>
+      <w:pPr>
+        <w:pStyle w:val="BodyText"/>
+      </w:pPr>
+      <w:r>
+        <w:t xml:space="preserve">Поэтому в данной работе выбрана узкая, но проверяемая постановка: не полный OCR/HTR по изображениям, а post-correction уже полученного текстового вывода. Такой выбор позволяет построить воспроизводимый benchmark, сравнить identity baseline, rule-based normalizer и ByT5-small, а затем оценить результат по CER, WER и анализу ошибок.</w:t>
+      </w:r>
+    </w:p>
+    <w:p>
+      <w:pPr>
+        <w:pStyle w:val="BodyText"/>
+      </w:pPr>
+      <w:r>
+        <w:t xml:space="preserve">Синтетический шум в этой постановке используется как пилотный инструмент, а не как замена реальному OCR/HTR. Полученный экспериментальный контур можно расширять: добавлять новые источники, реальные OCR-выходы, ручную валидацию, дополнительные модели и последующие задачи анализа исторических текстов.</w:t>
+      </w:r>
+    </w:p>
+    <w:bookmarkEnd w:id="26"/>
+    <w:bookmarkEnd w:id="27"/>
+    <w:bookmarkStart w:id="37" w:name="данные-и-построение-корпуса"/>
     <w:p>
       <w:pPr>
         <w:pStyle w:val="Heading2"/>
       </w:pPr>
       <w:r>
-        <w:rPr>
-          <w:rStyle w:val="SectionNumber"/>
-        </w:rPr>
-        <w:t xml:space="preserve">1.12</w:t>
-      </w:r>
-      <w:r>
-        <w:tab/>
-      </w:r>
-      <w:r>
-        <w:t xml:space="preserve">2. Обзор предметной области и связанных работ</w:t>
-      </w:r>
-    </w:p>
-    <w:bookmarkStart w:id="21" w:name="X679db47d81c99eb1d359e7ecbdd9091b3199270"/>
+        <w:t xml:space="preserve">3. Данные и построение корпуса</w:t>
+      </w:r>
+    </w:p>
+    <w:bookmarkStart w:id="28" w:name="общая-постановка"/>
     <w:p>
       <w:pPr>
         <w:pStyle w:val="Heading3"/>
       </w:pPr>
-      <w:r>
-        <w:rPr>
-          <w:rStyle w:val="SectionNumber"/>
-        </w:rPr>
-        <w:t xml:space="preserve">1.12.1</w:t>
-      </w:r>
-      <w:r>
-        <w:tab/>
-      </w:r>
-      <w:r>
-        <w:t xml:space="preserve">2.1 Автоматическое распознавание исторических документов</w:t>
-      </w:r>
-    </w:p>
-    <w:p>
-      <w:pPr>
-        <w:pStyle w:val="FirstParagraph"/>
-      </w:pPr>
-      <w:r>
-        <w:t xml:space="preserve">OCR исторических документов отличается от распознавания современных печатных текстов не одной отдельной трудностью, а сочетанием факторов: нестабильной типографикой, повреждениями носителя, неоднородным качеством сканов, сложной вёрсткой и вариативной орфографией. В работах по историческому OCR workflow подчёркивается, что качество результата зависит не только от модели распознавания, но и от подготовки изображений, разметки, ground truth и последующей проверки текста (Reul et al., 2019; Springmann et al., 2018).</w:t>
-      </w:r>
-    </w:p>
-    <w:p>
-      <w:pPr>
-        <w:pStyle w:val="BodyText"/>
-      </w:pPr>
-      <w:r>
-        <w:t xml:space="preserve">Для печатных документов обычно используется термин OCR — optical character recognition. Для рукописных материалов чаще применяется термин HTR — handwritten text recognition. В обоих случаях задача не сводится к классификации отдельных символов: система должна учитывать строку, слово, контекст и особенности конкретной письменной традиции.</w:t>
-      </w:r>
-    </w:p>
-    <w:p>
-      <w:pPr>
-        <w:pStyle w:val="BodyText"/>
-      </w:pPr>
-      <w:r>
-        <w:t xml:space="preserve">В данной работе не строится OCR/HTR-система по изображениям. Исследуется следующий этап обработки — посткоррекция уже полученного текстового вывода. Такое ограничение делает постановку уже, но чище: можно отдельно проверить, насколько модель исправления ошибок способна восстанавливать арабографичный тюркский текст после OCR-подобных искажений.</w:t>
-      </w:r>
-    </w:p>
-    <w:bookmarkEnd w:id="21"/>
-    <w:bookmarkStart w:id="22" w:name="Xa02a7bb48ad7549a4f67e48911e7568815c5168"/>
-    <w:p>
-      <w:pPr>
-        <w:pStyle w:val="Heading3"/>
-      </w:pPr>
-      <w:r>
-        <w:rPr>
-          <w:rStyle w:val="SectionNumber"/>
-        </w:rPr>
-        <w:t xml:space="preserve">1.12.2</w:t>
-      </w:r>
-      <w:r>
-        <w:tab/>
-      </w:r>
-      <w:r>
-        <w:t xml:space="preserve">2.2 Особенности арабографичных исторических текстов</w:t>
-      </w:r>
-    </w:p>
-    <w:p>
-      <w:pPr>
-        <w:pStyle w:val="FirstParagraph"/>
-      </w:pPr>
-      <w:r>
-        <w:t xml:space="preserve">Arabic-script OCR обычно рассматривается как отдельный класс задач: буквы меняют форму в зависимости от позиции в слове, письмо является связным, а различия между рядом символов задаются точками и небольшими графическими элементами. В обзорах по Arabic OCR эти свойства выделяются как одна из причин, по которым прямой перенос OCR-подходов с латинской графики оказывается недостаточным (Kasem et al., 2023). Для печатных и многошрифтовых арабографичных материалов дополнительно важны вариативность шрифтов, наложение элементов и близость начертаний (Osman et al., 2020).</w:t>
-      </w:r>
-    </w:p>
-    <w:p>
-      <w:pPr>
-        <w:pStyle w:val="BodyText"/>
-      </w:pPr>
-      <w:r>
-        <w:t xml:space="preserve">В исторических тюркских текстах арабская графика усложняется ещё сильнее: в одном материале могут сосуществовать арабские, персидские и тюркские орфографические практики. Для тюркских языков арабское письмо адаптировалось под звуки, которые не всегда имели прямые соответствия в классической арабской письменности. Поэтому один и тот же символ может быть одновременно технической единицей OCR и носителем историко-орфографической информации.</w:t>
-      </w:r>
-    </w:p>
-    <w:p>
-      <w:pPr>
-        <w:pStyle w:val="BodyText"/>
-      </w:pPr>
-      <w:r>
-        <w:t xml:space="preserve">Из этого следует важное ограничение: простая унификация символов не является заведомо безопасной предварительной процедурой. Она может убрать технический шум, но может и стереть значимые различия. Поэтому в данной работе rule-based normalizer рассматривается не как заведомо правильная предобработка, а как отдельный baseline, качество которого проверяется экспериментально.</w:t>
-      </w:r>
-    </w:p>
-    <w:bookmarkEnd w:id="22"/>
-    <w:bookmarkStart w:id="23" w:name="X69a43e90e5ebd7e3113e444e7e5f2f644869f5a"/>
-    <w:p>
-      <w:pPr>
-        <w:pStyle w:val="Heading3"/>
-      </w:pPr>
-      <w:r>
-        <w:rPr>
-          <w:rStyle w:val="SectionNumber"/>
-        </w:rPr>
-        <w:t xml:space="preserve">1.12.3</w:t>
-      </w:r>
-      <w:r>
-        <w:tab/>
-      </w:r>
-      <w:r>
-        <w:t xml:space="preserve">2.3 Тюркские тексты в арабской графике как низкоресурсный материал</w:t>
-      </w:r>
-    </w:p>
-    <w:p>
-      <w:pPr>
-        <w:pStyle w:val="FirstParagraph"/>
-      </w:pPr>
-      <w:r>
-        <w:t xml:space="preserve">Тюркские языки в разные исторические периоды использовали разные письменности, включая арабскую графику. Для османско-тюркских материалов это особенно заметно: после перехода турецкого языка на латиницу значительная часть печатного наследия осталась в письменной форме, которая трудна для массового поиска и автоматической обработки. На эту проблему указывают работы по автоматической транскрипции османско-турецких периодических изданий и цифровизации non-Latin script archives (Kirmizialtin &amp; Wrisley, 2020).</w:t>
-      </w:r>
-    </w:p>
-    <w:p>
-      <w:pPr>
-        <w:pStyle w:val="BodyText"/>
-      </w:pPr>
-      <w:r>
-        <w:t xml:space="preserve">С точки зрения NLP такие материалы остаются низкоресурсными: для них меньше размеченных корпусов, стандартных бенчмарк-наборов, готовых моделей и инструментов, чем для современных массовых языков. Современные работы по Historical Turkish NLP отдельно подчёркивают необходимость создавать базовые ресурсы: корпуса, модели, разметку и инструменты для последующего анализа исторических текстов (Özateş et al., 2025).</w:t>
-      </w:r>
-    </w:p>
-    <w:p>
-      <w:pPr>
-        <w:pStyle w:val="BodyText"/>
-      </w:pPr>
-      <w:r>
-        <w:t xml:space="preserve">В данной работе эта проблема сужается до одного технически проверяемого шага: построения воспроизводимого бенчмарка посткоррекции. Даже небольшой корпус полезен, если он явно фиксирует источник данных, процедуру разбиения, тип ошибок, метрики и ограничения. Такой протокол можно расширять новыми источниками и использовать как часть более крупной системы обработки исторических арабографичных тюркских документов.</w:t>
-      </w:r>
-    </w:p>
-    <w:bookmarkEnd w:id="23"/>
-    <w:bookmarkStart w:id="24" w:name="посткоррекция-ocr-ошибок"/>
-    <w:p>
-      <w:pPr>
-        <w:pStyle w:val="Heading3"/>
-      </w:pPr>
-      <w:r>
-        <w:rPr>
-          <w:rStyle w:val="SectionNumber"/>
-        </w:rPr>
-        <w:t xml:space="preserve">1.12.4</w:t>
-      </w:r>
-      <w:r>
-        <w:tab/>
-      </w:r>
-      <w:r>
-        <w:t xml:space="preserve">2.4 Посткоррекция OCR-ошибок</w:t>
-      </w:r>
-    </w:p>
-    <w:p>
-      <w:pPr>
-        <w:pStyle w:val="FirstParagraph"/>
-      </w:pPr>
-      <w:r>
-        <w:t xml:space="preserve">Посткоррекция OCR-ошибок — это задача преобразования ошибочного OCR-вывода в более корректный текст. На уровне строки она естественно формулируется как sequence-to-sequence задача: модель получает зашумлённый текст и должна восстановить чистый текст. Такой подход используется в работах по post-OCR correction, включая character-level и neural sequence-to-sequence модели (Ramirez-Orta et al., 2021; Hämäläinen &amp; Hengchen, 2019).</w:t>
-      </w:r>
-    </w:p>
-    <w:p>
-      <w:pPr>
-        <w:pStyle w:val="BodyText"/>
-      </w:pPr>
-      <w:r>
-        <w:t xml:space="preserve">Ошибки OCR обычно включают замены похожих символов, удаления и вставки, неправильное разбиение на слова, искажение окончаний и локальные перестановки. Для исторических текстов к этому добавляются нестабильная орфография и несовпадение современных языковых норм с историческим написанием. Поэтому посткоррекция пересекается не только с исправлением OCR-шума, но и с задачей нормализации написаний; в литературе эти две задачи иногда рассматриваются совместно, но их нельзя полностью отождествлять (Duong et al., 2020).</w:t>
-      </w:r>
-    </w:p>
-    <w:p>
-      <w:pPr>
-        <w:pStyle w:val="BodyText"/>
-      </w:pPr>
-      <w:r>
-        <w:t xml:space="preserve">Для исторических арабографичных тюркских текстов посткоррекция важна как промежуточный слой между распознаванием и дальнейшим анализом. Даже частично ошибочный OCR-вывод после исправления становится полезнее для поиска, индексации, извлечения именованных сущностей, анализа топонимов, сопоставления записей и построения исторических баз данных. Поэтому в данной работе post-correction рассматривается не как косметическая правка текста, а как отдельный компонент будущего pipeline для обработки архивных материалов.</w:t>
-      </w:r>
-    </w:p>
-    <w:bookmarkEnd w:id="24"/>
-    <w:bookmarkStart w:id="25" w:name="синтетические-ocr-ошибки"/>
-    <w:p>
-      <w:pPr>
-        <w:pStyle w:val="Heading3"/>
-      </w:pPr>
-      <w:r>
-        <w:rPr>
-          <w:rStyle w:val="SectionNumber"/>
-        </w:rPr>
-        <w:t xml:space="preserve">1.12.5</w:t>
-      </w:r>
-      <w:r>
-        <w:tab/>
-      </w:r>
-      <w:r>
-        <w:t xml:space="preserve">2.5 Синтетические OCR-ошибки</w:t>
-      </w:r>
-    </w:p>
-    <w:p>
-      <w:pPr>
-        <w:pStyle w:val="FirstParagraph"/>
-      </w:pPr>
-      <w:r>
-        <w:t xml:space="preserve">В идеальном случае модель посткоррекции обучается на парах реального OCR/HTR-вывода и вручную проверенного правильного текста. Для низкоресурсных исторических материалов такие пары часто отсутствуют или существуют в малом объёме. Поэтому в пилотных экспериментах используется синтетический шум: чистый текст намеренно искажается контролируемым генератором ошибок. Близкий подход применяется в работах по OCR error correction для исторических текстов, где искусственно подготовленные или task-specific данные помогают обучать модель при дефиците размеченных примеров (Suissa et al., 2023).</w:t>
-      </w:r>
-    </w:p>
-    <w:p>
-      <w:pPr>
-        <w:pStyle w:val="BodyText"/>
-      </w:pPr>
-      <w:r>
-        <w:t xml:space="preserve">Преимущество синтетической постановки состоит в контроле: известен исходный чистый текст, типы искажений, процедура генерации, random seed и разбиение на train/valid/test. Это позволяет проверить не всю OCR-систему целиком, а более узкий вопрос: способна ли модель post-correction восстанавливать арабографичный тюркский текст после OCR-подобных ошибок.</w:t>
-      </w:r>
-    </w:p>
-    <w:p>
-      <w:pPr>
-        <w:pStyle w:val="BodyText"/>
-      </w:pPr>
-      <w:r>
-        <w:t xml:space="preserve">Такой эксперимент нельзя считать заменой проверки на реальных OCR/HTR-выходах. Реальные ошибки зависят от качества изображения, шрифта, сегментации, модели распознавания и состояния документа. Поэтому результаты на синтетическом датасете в данной работе интерпретируются как пилотная проверка pipeline, а не как итоговая оценка качества на архивных сканах.</w:t>
-      </w:r>
-    </w:p>
-    <w:bookmarkEnd w:id="25"/>
-    <w:bookmarkStart w:id="26" w:name="byte-level-модели-и-byt5"/>
-    <w:p>
-      <w:pPr>
-        <w:pStyle w:val="Heading3"/>
-      </w:pPr>
-      <w:r>
-        <w:rPr>
-          <w:rStyle w:val="SectionNumber"/>
-        </w:rPr>
-        <w:t xml:space="preserve">1.12.6</w:t>
-      </w:r>
-      <w:r>
-        <w:tab/>
-      </w:r>
-      <w:r>
-        <w:t xml:space="preserve">2.6 Byte-level модели и ByT5</w:t>
-      </w:r>
-    </w:p>
-    <w:p>
-      <w:pPr>
-        <w:pStyle w:val="FirstParagraph"/>
-      </w:pPr>
-      <w:r>
-        <w:t xml:space="preserve">Нейросетевые модели post-correction обычно опираются на sequence-to-sequence постановку: входная последовательность с ошибками преобразуется в целевую последовательность без ошибок. Современная основа таких моделей связана с Transformer-архитектурой (Vaswani et al., 2017) и text-to-text подходом, в котором разные задачи формулируются как преобразование текста в текст (Raffel et al., 2019).</w:t>
-      </w:r>
-    </w:p>
-    <w:p>
-      <w:pPr>
-        <w:pStyle w:val="BodyText"/>
-      </w:pPr>
-      <w:r>
-        <w:t xml:space="preserve">В данной работе используется ByT5-small. ByT5 относится к byte-level sequence-to-sequence моделям: она работает на уровне байтов, а не заранее заданных слов или подслов (Xue et al., 2021). Это важно для низкоресурсного исторического материала, где обычный subword-токенизатор может плохо представлять редкие графемы, нестандартные написания, смешение письменных традиций и OCR-шум.</w:t>
-      </w:r>
-    </w:p>
-    <w:p>
-      <w:pPr>
-        <w:pStyle w:val="BodyText"/>
-      </w:pPr>
-      <w:r>
-        <w:t xml:space="preserve">Byte-level представление имеет практическое следствие: длина последовательности в токенах не равна длине строки в видимых символах. Один символ арабской графики может занимать несколько байтов. Поэтому слишком короткое ограничение длины может обрезать часть контекста. В данной работе финальной конфигурацией выбрана длина 512; результаты показывают, что для арабографичных строк этот параметр является важным и должен явно контролироваться в эксперименте.</w:t>
-      </w:r>
-    </w:p>
-    <w:bookmarkEnd w:id="26"/>
-    <w:bookmarkStart w:id="27" w:name="выводы-по-обзору"/>
-    <w:p>
-      <w:pPr>
-        <w:pStyle w:val="Heading3"/>
-      </w:pPr>
-      <w:r>
-        <w:rPr>
-          <w:rStyle w:val="SectionNumber"/>
-        </w:rPr>
-        <w:t xml:space="preserve">1.12.7</w:t>
-      </w:r>
-      <w:r>
-        <w:tab/>
-      </w:r>
-      <w:r>
-        <w:t xml:space="preserve">2.7 Выводы по обзору</w:t>
-      </w:r>
-    </w:p>
-    <w:p>
-      <w:pPr>
-        <w:pStyle w:val="FirstParagraph"/>
-      </w:pPr>
-      <w:r>
-        <w:t xml:space="preserve">Обзор показывает, что задача не сводится к обычному применению готовой OCR-системы. Исторический OCR зависит от качества источника, ground truth и workflow; арабская графика добавляет позиционные формы, связное письмо и близкие начертания; тюркский исторический материал остаётся низкоресурсным и плохо покрытым готовыми NLP-инструментами.</w:t>
-      </w:r>
-    </w:p>
-    <w:p>
-      <w:pPr>
-        <w:pStyle w:val="BodyText"/>
-      </w:pPr>
-      <w:r>
-        <w:t xml:space="preserve">Поэтому в данной работе выбрана узкая, но проверяемая постановка: не полный OCR/HTR по изображениям, а post-correction уже полученного текстового вывода. Такой выбор позволяет построить воспроизводимый benchmark, сравнить identity baseline, rule-based normalizer и ByT5-small, а затем оценить результат по CER, WER и анализу ошибок.</w:t>
-      </w:r>
-    </w:p>
-    <w:p>
-      <w:pPr>
-        <w:pStyle w:val="BodyText"/>
-      </w:pPr>
-      <w:r>
-        <w:t xml:space="preserve">Синтетический шум в этой постановке используется как пилотный инструмент, а не как замена реальному OCR/HTR. Полученный экспериментальный контур можно расширять: добавлять новые источники, реальные OCR-выходы, ручную валидацию, дополнительные модели и последующие задачи анализа исторических текстов.</w:t>
-      </w:r>
-    </w:p>
-    <w:bookmarkEnd w:id="27"/>
-    <w:bookmarkEnd w:id="28"/>
-    <w:bookmarkStart w:id="38" w:name="данные-и-построение-корпуса"/>
-    <w:p>
-      <w:pPr>
-        <w:pStyle w:val="Heading2"/>
-      </w:pPr>
-      <w:r>
-        <w:rPr>
-          <w:rStyle w:val="SectionNumber"/>
-        </w:rPr>
-        <w:t xml:space="preserve">1.13</w:t>
-      </w:r>
-      <w:r>
-        <w:tab/>
-      </w:r>
-      <w:r>
-        <w:t xml:space="preserve">3. Данные и построение корпуса</w:t>
-      </w:r>
-    </w:p>
-    <w:bookmarkStart w:id="29" w:name="общая-постановка"/>
-    <w:p>
-      <w:pPr>
-        <w:pStyle w:val="Heading3"/>
-      </w:pPr>
-      <w:r>
-        <w:rPr>
-          <w:rStyle w:val="SectionNumber"/>
-        </w:rPr>
-        <w:t xml:space="preserve">1.13.1</w:t>
-      </w:r>
-      <w:r>
-        <w:tab/>
-      </w:r>
       <w:r>
         <w:t xml:space="preserve">3.1 Общая постановка</w:t>
       </w:r>
@@ -1310,21 +1073,12 @@
         <w:t xml:space="preserve">Важно, что эта постановка сознательно отделяет задачу посткоррекции от задачи распознавания изображения. В эксперименте не оценивается качество сегментации страниц или OCR/HTR-модели; оценивается только способность метода исправлять уже полученный текстовый вывод.</w:t>
       </w:r>
     </w:p>
-    <w:bookmarkEnd w:id="29"/>
-    <w:bookmarkStart w:id="30" w:name="источник-данных"/>
+    <w:bookmarkEnd w:id="28"/>
+    <w:bookmarkStart w:id="29" w:name="источник-данных"/>
     <w:p>
       <w:pPr>
         <w:pStyle w:val="Heading3"/>
       </w:pPr>
-      <w:r>
-        <w:rPr>
-          <w:rStyle w:val="SectionNumber"/>
-        </w:rPr>
-        <w:t xml:space="preserve">1.13.2</w:t>
-      </w:r>
-      <w:r>
-        <w:tab/>
-      </w:r>
       <w:r>
         <w:t xml:space="preserve">3.2 Источник данных</w:t>
       </w:r>
@@ -1437,21 +1191,12 @@
         <w:t xml:space="preserve">. Поэтому текущий корпус лучше соответствует теме курсовой, чем более ранний технический прототип на персидском или общеарабографичном материале.</w:t>
       </w:r>
     </w:p>
-    <w:bookmarkEnd w:id="30"/>
-    <w:bookmarkStart w:id="31" w:name="сбор-и-предварительная-подготовка"/>
+    <w:bookmarkEnd w:id="29"/>
+    <w:bookmarkStart w:id="30" w:name="сбор-и-предварительная-подготовка"/>
     <w:p>
       <w:pPr>
         <w:pStyle w:val="Heading3"/>
       </w:pPr>
-      <w:r>
-        <w:rPr>
-          <w:rStyle w:val="SectionNumber"/>
-        </w:rPr>
-        <w:t xml:space="preserve">1.13.3</w:t>
-      </w:r>
-      <w:r>
-        <w:tab/>
-      </w:r>
       <w:r>
         <w:t xml:space="preserve">3.3 Сбор и предварительная подготовка</w:t>
       </w:r>
@@ -1492,21 +1237,12 @@
         <w:t xml:space="preserve">Поэтому нормализация вынесена в отдельный baseline. Корпус хранится в максимально щадящем виде, а rule-based normalizer оценивается экспериментально наравне с identity baseline и нейросетевой моделью.</w:t>
       </w:r>
     </w:p>
-    <w:bookmarkEnd w:id="31"/>
-    <w:bookmarkStart w:id="32" w:name="синтетические-ocr-подобные-искажения"/>
+    <w:bookmarkEnd w:id="30"/>
+    <w:bookmarkStart w:id="31" w:name="синтетические-ocr-подобные-искажения"/>
     <w:p>
       <w:pPr>
         <w:pStyle w:val="Heading3"/>
       </w:pPr>
-      <w:r>
-        <w:rPr>
-          <w:rStyle w:val="SectionNumber"/>
-        </w:rPr>
-        <w:t xml:space="preserve">1.13.4</w:t>
-      </w:r>
-      <w:r>
-        <w:tab/>
-      </w:r>
       <w:r>
         <w:t xml:space="preserve">3.4 Синтетические OCR-подобные искажения</w:t>
       </w:r>
@@ -1571,21 +1307,12 @@
         <w:t xml:space="preserve">.</w:t>
       </w:r>
     </w:p>
-    <w:bookmarkEnd w:id="32"/>
-    <w:bookmarkStart w:id="33" w:name="структура-датасета"/>
+    <w:bookmarkEnd w:id="31"/>
+    <w:bookmarkStart w:id="32" w:name="структура-датасета"/>
     <w:p>
       <w:pPr>
         <w:pStyle w:val="Heading3"/>
       </w:pPr>
-      <w:r>
-        <w:rPr>
-          <w:rStyle w:val="SectionNumber"/>
-        </w:rPr>
-        <w:t xml:space="preserve">1.13.5</w:t>
-      </w:r>
-      <w:r>
-        <w:tab/>
-      </w:r>
       <w:r>
         <w:t xml:space="preserve">3.5 Структура датасета</w:t>
       </w:r>
@@ -1785,21 +1512,12 @@
         <w:t xml:space="preserve">.</w:t>
       </w:r>
     </w:p>
-    <w:bookmarkEnd w:id="33"/>
-    <w:bookmarkStart w:id="34" w:name="разбиение-на-train-valid-и-test"/>
+    <w:bookmarkEnd w:id="32"/>
+    <w:bookmarkStart w:id="33" w:name="разбиение-на-train-valid-и-test"/>
     <w:p>
       <w:pPr>
         <w:pStyle w:val="Heading3"/>
       </w:pPr>
-      <w:r>
-        <w:rPr>
-          <w:rStyle w:val="SectionNumber"/>
-        </w:rPr>
-        <w:t xml:space="preserve">1.13.6</w:t>
-      </w:r>
-      <w:r>
-        <w:tab/>
-      </w:r>
       <w:r>
         <w:t xml:space="preserve">3.6 Разбиение на train, valid и test</w:t>
       </w:r>
@@ -1991,21 +1709,12 @@
         <w:t xml:space="preserve">Такой размер достаточен для пилотной проверки pipeline посткоррекции: он мал для финального бенчмарка, но позволяет сравнить baseline-подходы и нейросетевую модель в воспроизводимых условиях.</w:t>
       </w:r>
     </w:p>
-    <w:bookmarkEnd w:id="34"/>
-    <w:bookmarkStart w:id="35" w:name="контроль-утечки-данных"/>
+    <w:bookmarkEnd w:id="33"/>
+    <w:bookmarkStart w:id="34" w:name="контроль-утечки-данных"/>
     <w:p>
       <w:pPr>
         <w:pStyle w:val="Heading3"/>
       </w:pPr>
-      <w:r>
-        <w:rPr>
-          <w:rStyle w:val="SectionNumber"/>
-        </w:rPr>
-        <w:t xml:space="preserve">1.13.7</w:t>
-      </w:r>
-      <w:r>
-        <w:tab/>
-      </w:r>
       <w:r>
         <w:t xml:space="preserve">3.7 Контроль утечки данных</w:t>
       </w:r>
@@ -2156,142 +1865,106 @@
         <w:t xml:space="preserve">Таким образом, тестовая выборка не содержит исходных строк, которые встречались в обучении или валидации. Это делает оценку более строгой: модель проверяется на новых исходных строках, а не на новых зашумлённых вариациях уже знакомых строк.</w:t>
       </w:r>
     </w:p>
+    <w:bookmarkEnd w:id="34"/>
+    <w:bookmarkStart w:id="35" w:name="ограничения-корпуса"/>
+    <w:p>
+      <w:pPr>
+        <w:pStyle w:val="Heading3"/>
+      </w:pPr>
+      <w:r>
+        <w:t xml:space="preserve">3.8 Ограничения корпуса</w:t>
+      </w:r>
+    </w:p>
+    <w:p>
+      <w:pPr>
+        <w:pStyle w:val="FirstParagraph"/>
+      </w:pPr>
+      <w:r>
+        <w:t xml:space="preserve">Построенный корпус следует рассматривать как пилотный. Его ограничения влияют не на воспроизводимость эксперимента, а на масштаб выводов, которые можно делать по результатам.</w:t>
+      </w:r>
+    </w:p>
+    <w:p>
+      <w:pPr>
+        <w:pStyle w:val="BodyText"/>
+      </w:pPr>
+      <w:r>
+        <w:t xml:space="preserve">Первое ограничение — объём: используется 400 чистых текстовых блоков. Этого достаточно, чтобы проверить pipeline, сравнить baseline-подходы и провести первый нейросетевой эксперимент. Однако такого объёма недостаточно, чтобы утверждать устойчивость метода на всём классе исторических арабографичных тюркских текстов.</w:t>
+      </w:r>
+    </w:p>
+    <w:p>
+      <w:pPr>
+        <w:pStyle w:val="BodyText"/>
+      </w:pPr>
+      <w:r>
+        <w:t xml:space="preserve">Второе ограничение — один основной источник. Это снижает жанровое, временное и орфографическое разнообразие корпуса. Результаты показывают поведение модели на выбранном материале, но не доказывают переносимость на старотатарские, башкирские, крымскотатарские или другие арабографичные тюркские источники.</w:t>
+      </w:r>
+    </w:p>
+    <w:p>
+      <w:pPr>
+        <w:pStyle w:val="BodyText"/>
+      </w:pPr>
+      <w:r>
+        <w:t xml:space="preserve">Третье ограничение — синтетическая природа ошибок. Noise generator создаёт OCR-подобные искажения, но реальные ошибки зависят от шрифта, качества скана, сегментации, модели распознавания и состояния документа. Поэтому текущий датасет проверяет pipeline посткоррекции в контролируемой постановке, но не заменяет оценку на реальных OCR/HTR-выходах.</w:t>
+      </w:r>
+    </w:p>
+    <w:p>
+      <w:pPr>
+        <w:pStyle w:val="BodyText"/>
+      </w:pPr>
+      <w:r>
+        <w:t xml:space="preserve">Четвёртое ограничение — отсутствие ручной лингвистической валидации исправлений. Метрики CER и WER показывают формальную близость к эталону, но не всегда отражают историко-орфографическую допустимость исправления. Для следующего этапа нужен небольшой вручную проверенный subset с качественным анализом ошибок.</w:t>
+      </w:r>
+    </w:p>
     <w:bookmarkEnd w:id="35"/>
-    <w:bookmarkStart w:id="36" w:name="ограничения-корпуса"/>
+    <w:bookmarkStart w:id="36" w:name="выводы-по-разделу"/>
     <w:p>
       <w:pPr>
         <w:pStyle w:val="Heading3"/>
       </w:pPr>
       <w:r>
-        <w:rPr>
-          <w:rStyle w:val="SectionNumber"/>
-        </w:rPr>
-        <w:t xml:space="preserve">1.13.8</w:t>
-      </w:r>
-      <w:r>
-        <w:tab/>
-      </w:r>
-      <w:r>
-        <w:t xml:space="preserve">3.8 Ограничения корпуса</w:t>
-      </w:r>
-    </w:p>
-    <w:p>
-      <w:pPr>
-        <w:pStyle w:val="FirstParagraph"/>
-      </w:pPr>
-      <w:r>
-        <w:t xml:space="preserve">Построенный корпус следует рассматривать как пилотный. Его ограничения влияют не на воспроизводимость эксперимента, а на масштаб выводов, которые можно делать по результатам.</w:t>
-      </w:r>
-    </w:p>
-    <w:p>
-      <w:pPr>
-        <w:pStyle w:val="BodyText"/>
-      </w:pPr>
-      <w:r>
-        <w:t xml:space="preserve">Первое ограничение — объём: используется 400 чистых текстовых блоков. Этого достаточно, чтобы проверить pipeline, сравнить baseline-подходы и провести первый нейросетевой эксперимент. Однако такого объёма недостаточно, чтобы утверждать устойчивость метода на всём классе исторических арабографичных тюркских текстов.</w:t>
-      </w:r>
-    </w:p>
-    <w:p>
-      <w:pPr>
-        <w:pStyle w:val="BodyText"/>
-      </w:pPr>
-      <w:r>
-        <w:t xml:space="preserve">Второе ограничение — один основной источник. Это снижает жанровое, временное и орфографическое разнообразие корпуса. Результаты показывают поведение модели на выбранном материале, но не доказывают переносимость на старотатарские, башкирские, крымскотатарские или другие арабографичные тюркские источники.</w:t>
-      </w:r>
-    </w:p>
-    <w:p>
-      <w:pPr>
-        <w:pStyle w:val="BodyText"/>
-      </w:pPr>
-      <w:r>
-        <w:t xml:space="preserve">Третье ограничение — синтетическая природа ошибок. Noise generator создаёт OCR-подобные искажения, но реальные ошибки зависят от шрифта, качества скана, сегментации, модели распознавания и состояния документа. Поэтому текущий датасет проверяет pipeline посткоррекции в контролируемой постановке, но не заменяет оценку на реальных OCR/HTR-выходах.</w:t>
-      </w:r>
-    </w:p>
-    <w:p>
-      <w:pPr>
-        <w:pStyle w:val="BodyText"/>
-      </w:pPr>
-      <w:r>
-        <w:t xml:space="preserve">Четвёртое ограничение — отсутствие ручной лингвистической валидации исправлений. Метрики CER и WER показывают формальную близость к эталону, но не всегда отражают историко-орфографическую допустимость исправления. Для следующего этапа нужен небольшой вручную проверенный subset с качественным анализом ошибок.</w:t>
+        <w:t xml:space="preserve">3.9 Выводы по разделу</w:t>
+      </w:r>
+    </w:p>
+    <w:p>
+      <w:pPr>
+        <w:pStyle w:val="FirstParagraph"/>
+      </w:pPr>
+      <w:r>
+        <w:t xml:space="preserve">В рамках работы был создан небольшой, но воспроизводимый корпус для задачи OCR post-correction исторического тюркского текста в арабской графике. На основе 400 чистых текстовых блоков был построен синтетический датасет с train/valid/test-разбиением без утечки исходных строк между выборками.</w:t>
+      </w:r>
+    </w:p>
+    <w:p>
+      <w:pPr>
+        <w:pStyle w:val="BodyText"/>
+      </w:pPr>
+      <w:r>
+        <w:t xml:space="preserve">Корпус не претендует на полноту и не заменяет benchmark на реальных OCR/HTR-выходах. Его роль на данном этапе уже иная: создать контролируемую экспериментальную основу, на которой можно сравнить identity baseline, rule-based normalizer и нейросетевую модель ByT5-small в одинаковых условиях.</w:t>
+      </w:r>
+    </w:p>
+    <w:p>
+      <w:pPr>
+        <w:pStyle w:val="BodyText"/>
+      </w:pPr>
+      <w:r>
+        <w:t xml:space="preserve">В дальнейшем этот корпус можно расширить за счёт новых источников, реальных OCR/HTR-выходов, ручной лингвистической валидации и более разнообразных исторических арабографичных тюркских материалов.</w:t>
       </w:r>
     </w:p>
     <w:bookmarkEnd w:id="36"/>
-    <w:bookmarkStart w:id="37" w:name="выводы-по-разделу"/>
+    <w:bookmarkEnd w:id="37"/>
+    <w:bookmarkStart w:id="47" w:name="методология-эксперимента"/>
+    <w:p>
+      <w:pPr>
+        <w:pStyle w:val="Heading2"/>
+      </w:pPr>
+      <w:r>
+        <w:t xml:space="preserve">4. Методология эксперимента</w:t>
+      </w:r>
+    </w:p>
+    <w:bookmarkStart w:id="38" w:name="общая-схема-эксперимента"/>
     <w:p>
       <w:pPr>
         <w:pStyle w:val="Heading3"/>
       </w:pPr>
-      <w:r>
-        <w:rPr>
-          <w:rStyle w:val="SectionNumber"/>
-        </w:rPr>
-        <w:t xml:space="preserve">1.13.9</w:t>
-      </w:r>
-      <w:r>
-        <w:tab/>
-      </w:r>
-      <w:r>
-        <w:t xml:space="preserve">3.9 Выводы по разделу</w:t>
-      </w:r>
-    </w:p>
-    <w:p>
-      <w:pPr>
-        <w:pStyle w:val="FirstParagraph"/>
-      </w:pPr>
-      <w:r>
-        <w:t xml:space="preserve">В рамках работы был создан небольшой, но воспроизводимый корпус для задачи OCR post-correction исторического тюркского текста в арабской графике. На основе 400 чистых текстовых блоков был построен синтетический датасет с train/valid/test-разбиением без утечки исходных строк между выборками.</w:t>
-      </w:r>
-    </w:p>
-    <w:p>
-      <w:pPr>
-        <w:pStyle w:val="BodyText"/>
-      </w:pPr>
-      <w:r>
-        <w:t xml:space="preserve">Корпус не претендует на полноту и не заменяет benchmark на реальных OCR/HTR-выходах. Его роль на данном этапе уже иная: создать контролируемую экспериментальную основу, на которой можно сравнить identity baseline, rule-based normalizer и нейросетевую модель ByT5-small в одинаковых условиях.</w:t>
-      </w:r>
-    </w:p>
-    <w:p>
-      <w:pPr>
-        <w:pStyle w:val="BodyText"/>
-      </w:pPr>
-      <w:r>
-        <w:t xml:space="preserve">В дальнейшем этот корпус можно расширить за счёт новых источников, реальных OCR/HTR-выходов, ручной лингвистической валидации и более разнообразных исторических арабографичных тюркских материалов.</w:t>
-      </w:r>
-    </w:p>
-    <w:bookmarkEnd w:id="37"/>
-    <w:bookmarkEnd w:id="38"/>
-    <w:bookmarkStart w:id="48" w:name="методология-эксперимента"/>
-    <w:p>
-      <w:pPr>
-        <w:pStyle w:val="Heading2"/>
-      </w:pPr>
-      <w:r>
-        <w:rPr>
-          <w:rStyle w:val="SectionNumber"/>
-        </w:rPr>
-        <w:t xml:space="preserve">1.14</w:t>
-      </w:r>
-      <w:r>
-        <w:tab/>
-      </w:r>
-      <w:r>
-        <w:t xml:space="preserve">4. Методология эксперимента</w:t>
-      </w:r>
-    </w:p>
-    <w:bookmarkStart w:id="39" w:name="общая-схема-эксперимента"/>
-    <w:p>
-      <w:pPr>
-        <w:pStyle w:val="Heading3"/>
-      </w:pPr>
-      <w:r>
-        <w:rPr>
-          <w:rStyle w:val="SectionNumber"/>
-        </w:rPr>
-        <w:t xml:space="preserve">1.14.1</w:t>
-      </w:r>
-      <w:r>
-        <w:tab/>
-      </w:r>
       <w:r>
         <w:t xml:space="preserve">4.1 Общая схема эксперимента</w:t>
       </w:r>
@@ -2344,64 +2017,46 @@
         <w:t xml:space="preserve">Главный вопрос эксперимента — улучшает ли нейросетевая post-correction модель качество текста по сравнению с неизменённым зашумлённым вводом. Дополнительный вопрос — помогает ли простая rule-based нормализация именно для исторического арабографичного тюркского материала или, наоборот, ухудшает текст.</w:t>
       </w:r>
     </w:p>
+    <w:bookmarkEnd w:id="38"/>
+    <w:bookmarkStart w:id="39" w:name="baseline-подходы"/>
+    <w:p>
+      <w:pPr>
+        <w:pStyle w:val="Heading3"/>
+      </w:pPr>
+      <w:r>
+        <w:t xml:space="preserve">4.2 Baseline-подходы</w:t>
+      </w:r>
+    </w:p>
+    <w:p>
+      <w:pPr>
+        <w:pStyle w:val="FirstParagraph"/>
+      </w:pPr>
+      <w:r>
+        <w:t xml:space="preserve">В эксперименте используются два baseline-подхода. Первый — identity baseline: он возвращает входную зашумлённую строку без изменений. Его роль состоит в том, чтобы зафиксировать исходный уровень качества данных. Любой метод post-correction должен превосходить этот уровень; иначе он не исправляет текст, а добавляет новые ошибки.</w:t>
+      </w:r>
+    </w:p>
+    <w:p>
+      <w:pPr>
+        <w:pStyle w:val="BodyText"/>
+      </w:pPr>
+      <w:r>
+        <w:t xml:space="preserve">Второй baseline — rule-based normalizer. Он применяет набор простых символьных правил к арабографичному тексту. Этот baseline нужен не как ожидаемо сильный метод, а как проверка важной гипотезы: можно ли улучшить качество простыми правилами нормализации без обучения модели.</w:t>
+      </w:r>
+    </w:p>
+    <w:p>
+      <w:pPr>
+        <w:pStyle w:val="BodyText"/>
+      </w:pPr>
+      <w:r>
+        <w:t xml:space="preserve">Для исторического арабографичного тюркского материала такая проверка особенно важна. Нормализация может убрать часть технического шума, но может и стереть исторически значимые орфографические различия. Поэтому rule-based normalizer в работе не считается обязательной предобработкой, а оценивается как самостоятельный baseline.</w:t>
+      </w:r>
+    </w:p>
     <w:bookmarkEnd w:id="39"/>
-    <w:bookmarkStart w:id="40" w:name="baseline-подходы"/>
+    <w:bookmarkStart w:id="40" w:name="нейросетевая-модель-byt5-small"/>
     <w:p>
       <w:pPr>
         <w:pStyle w:val="Heading3"/>
       </w:pPr>
-      <w:r>
-        <w:rPr>
-          <w:rStyle w:val="SectionNumber"/>
-        </w:rPr>
-        <w:t xml:space="preserve">1.14.2</w:t>
-      </w:r>
-      <w:r>
-        <w:tab/>
-      </w:r>
-      <w:r>
-        <w:t xml:space="preserve">4.2 Baseline-подходы</w:t>
-      </w:r>
-    </w:p>
-    <w:p>
-      <w:pPr>
-        <w:pStyle w:val="FirstParagraph"/>
-      </w:pPr>
-      <w:r>
-        <w:t xml:space="preserve">В эксперименте используются два baseline-подхода. Первый — identity baseline: он возвращает входную зашумлённую строку без изменений. Его роль состоит в том, чтобы зафиксировать исходный уровень качества данных. Любой метод post-correction должен превосходить этот уровень; иначе он не исправляет текст, а добавляет новые ошибки.</w:t>
-      </w:r>
-    </w:p>
-    <w:p>
-      <w:pPr>
-        <w:pStyle w:val="BodyText"/>
-      </w:pPr>
-      <w:r>
-        <w:t xml:space="preserve">Второй baseline — rule-based normalizer. Он применяет набор простых символьных правил к арабографичному тексту. Этот baseline нужен не как ожидаемо сильный метод, а как проверка важной гипотезы: можно ли улучшить качество простыми правилами нормализации без обучения модели.</w:t>
-      </w:r>
-    </w:p>
-    <w:p>
-      <w:pPr>
-        <w:pStyle w:val="BodyText"/>
-      </w:pPr>
-      <w:r>
-        <w:t xml:space="preserve">Для исторического арабографичного тюркского материала такая проверка особенно важна. Нормализация может убрать часть технического шума, но может и стереть исторически значимые орфографические различия. Поэтому rule-based normalizer в работе не считается обязательной предобработкой, а оценивается как самостоятельный baseline.</w:t>
-      </w:r>
-    </w:p>
-    <w:bookmarkEnd w:id="40"/>
-    <w:bookmarkStart w:id="41" w:name="нейросетевая-модель-byt5-small"/>
-    <w:p>
-      <w:pPr>
-        <w:pStyle w:val="Heading3"/>
-      </w:pPr>
-      <w:r>
-        <w:rPr>
-          <w:rStyle w:val="SectionNumber"/>
-        </w:rPr>
-        <w:t xml:space="preserve">1.14.3</w:t>
-      </w:r>
-      <w:r>
-        <w:tab/>
-      </w:r>
       <w:r>
         <w:t xml:space="preserve">4.3 Нейросетевая модель ByT5-small</w:t>
       </w:r>
@@ -2442,21 +2097,12 @@
         <w:t xml:space="preserve">Практическое следствие byte-level подхода состоит в том, что длина последовательности в токенах может быстро расти: один видимый символ арабской графики занимает несколько байтов. Поэтому в эксперименте отдельно контролируется максимальная длина входной и целевой последовательности.</w:t>
       </w:r>
     </w:p>
-    <w:bookmarkEnd w:id="41"/>
-    <w:bookmarkStart w:id="42" w:name="проверенные-конфигурации"/>
+    <w:bookmarkEnd w:id="40"/>
+    <w:bookmarkStart w:id="41" w:name="проверенные-конфигурации"/>
     <w:p>
       <w:pPr>
         <w:pStyle w:val="Heading3"/>
       </w:pPr>
-      <w:r>
-        <w:rPr>
-          <w:rStyle w:val="SectionNumber"/>
-        </w:rPr>
-        <w:t xml:space="preserve">1.14.4</w:t>
-      </w:r>
-      <w:r>
-        <w:tab/>
-      </w:r>
       <w:r>
         <w:t xml:space="preserve">4.4 Проверенные конфигурации</w:t>
       </w:r>
@@ -2648,21 +2294,12 @@
         <w:t xml:space="preserve">Для итогового анализа выбрана конфигурация 512. Она уменьшает риск обрезания строк и используется как основная нейросетевая конфигурация в сравнении с identity baseline и rule-based normalizer. Вывод о преимуществе 512 в данной работе относится к пилотному датасету и должен быть дополнительно проверен на более широком корпусе.</w:t>
       </w:r>
     </w:p>
-    <w:bookmarkEnd w:id="42"/>
-    <w:bookmarkStart w:id="43" w:name="метрики-качества"/>
+    <w:bookmarkEnd w:id="41"/>
+    <w:bookmarkStart w:id="42" w:name="метрики-качества"/>
     <w:p>
       <w:pPr>
         <w:pStyle w:val="Heading3"/>
       </w:pPr>
-      <w:r>
-        <w:rPr>
-          <w:rStyle w:val="SectionNumber"/>
-        </w:rPr>
-        <w:t xml:space="preserve">1.14.5</w:t>
-      </w:r>
-      <w:r>
-        <w:tab/>
-      </w:r>
       <w:r>
         <w:t xml:space="preserve">4.5 Метрики качества</w:t>
       </w:r>
@@ -2714,21 +2351,12 @@
         <w:t xml:space="preserve">ExactMatch показывает долю строк, полностью совпавших с эталоном. Для длинных исторических строк эта метрика очень строгая: один неверный символ уже делает пример несовпадающим. Поэтому ExactMatch используется как дополнительный индикатор, а основные выводы строятся по CER, WER и анализу ошибок.</w:t>
       </w:r>
     </w:p>
-    <w:bookmarkEnd w:id="43"/>
-    <w:bookmarkStart w:id="44" w:name="процедура-оценки"/>
+    <w:bookmarkEnd w:id="42"/>
+    <w:bookmarkStart w:id="43" w:name="процедура-оценки"/>
     <w:p>
       <w:pPr>
         <w:pStyle w:val="Heading3"/>
       </w:pPr>
-      <w:r>
-        <w:rPr>
-          <w:rStyle w:val="SectionNumber"/>
-        </w:rPr>
-        <w:t xml:space="preserve">1.14.6</w:t>
-      </w:r>
-      <w:r>
-        <w:tab/>
-      </w:r>
       <w:r>
         <w:t xml:space="preserve">4.6 Процедура оценки</w:t>
       </w:r>
@@ -2805,21 +2433,12 @@
         <w:t xml:space="preserve">В одинаковых условиях сравниваются три варианта: identity baseline, rule-based normalizer и ByT5-small. Это позволяет отделить эффект нейросетевой post-correction модели от простого сохранения зашумлённого ввода и от ручных правил нормализации.</w:t>
       </w:r>
     </w:p>
-    <w:bookmarkEnd w:id="44"/>
-    <w:bookmarkStart w:id="45" w:name="анализ-ошибок"/>
+    <w:bookmarkEnd w:id="43"/>
+    <w:bookmarkStart w:id="44" w:name="анализ-ошибок"/>
     <w:p>
       <w:pPr>
         <w:pStyle w:val="Heading3"/>
       </w:pPr>
-      <w:r>
-        <w:rPr>
-          <w:rStyle w:val="SectionNumber"/>
-        </w:rPr>
-        <w:t xml:space="preserve">1.14.7</w:t>
-      </w:r>
-      <w:r>
-        <w:tab/>
-      </w:r>
       <w:r>
         <w:t xml:space="preserve">4.7 Анализ ошибок</w:t>
       </w:r>
@@ -2872,64 +2491,46 @@
         <w:t xml:space="preserve">.</w:t>
       </w:r>
     </w:p>
+    <w:bookmarkEnd w:id="44"/>
+    <w:bookmarkStart w:id="45" w:name="воспроизводимость"/>
+    <w:p>
+      <w:pPr>
+        <w:pStyle w:val="Heading3"/>
+      </w:pPr>
+      <w:r>
+        <w:t xml:space="preserve">4.8 Воспроизводимость</w:t>
+      </w:r>
+    </w:p>
+    <w:p>
+      <w:pPr>
+        <w:pStyle w:val="FirstParagraph"/>
+      </w:pPr>
+      <w:r>
+        <w:t xml:space="preserve">Основные компоненты эксперимента сохранены в репозитории: скрипты сбора данных, генерации датасета, baseline-оценки, обучения и применения ByT5-small, вычисления метрик и анализа ошибок. Это делает эксперимент проверяемым: можно повторить построение датасета, пересчитать метрики и отдельно изучить предсказания модели.</w:t>
+      </w:r>
+    </w:p>
+    <w:p>
+      <w:pPr>
+        <w:pStyle w:val="BodyText"/>
+      </w:pPr>
+      <w:r>
+        <w:t xml:space="preserve">В репозитории также сохранены датасет, итоговые метрики, prediction-файлы и CSV-файлы анализа ошибок. При этом модельные веса не хранятся в git, чтобы не перегружать репозиторий тяжёлыми артефактами обучения. Для дальнейшей работы веса можно хранить отдельно: например, как release artifact или во внешнем model registry.</w:t>
+      </w:r>
+    </w:p>
+    <w:p>
+      <w:pPr>
+        <w:pStyle w:val="BodyText"/>
+      </w:pPr>
+      <w:r>
+        <w:t xml:space="preserve">Воспроизводимость текущего эксперимента не означает полноту бенчмарка. Она означает, что все ключевые решения пилотного протокола явно зафиксированы: источник, генератор шума, split, baseline-подходы, модель, метрики и error analysis.</w:t>
+      </w:r>
+    </w:p>
     <w:bookmarkEnd w:id="45"/>
-    <w:bookmarkStart w:id="46" w:name="воспроизводимость"/>
+    <w:bookmarkStart w:id="46" w:name="выводы-по-разделу-1"/>
     <w:p>
       <w:pPr>
         <w:pStyle w:val="Heading3"/>
       </w:pPr>
-      <w:r>
-        <w:rPr>
-          <w:rStyle w:val="SectionNumber"/>
-        </w:rPr>
-        <w:t xml:space="preserve">1.14.8</w:t>
-      </w:r>
-      <w:r>
-        <w:tab/>
-      </w:r>
-      <w:r>
-        <w:t xml:space="preserve">4.8 Воспроизводимость</w:t>
-      </w:r>
-    </w:p>
-    <w:p>
-      <w:pPr>
-        <w:pStyle w:val="FirstParagraph"/>
-      </w:pPr>
-      <w:r>
-        <w:t xml:space="preserve">Основные компоненты эксперимента сохранены в репозитории: скрипты сбора данных, генерации датасета, baseline-оценки, обучения и применения ByT5-small, вычисления метрик и анализа ошибок. Это делает эксперимент проверяемым: можно повторить построение датасета, пересчитать метрики и отдельно изучить предсказания модели.</w:t>
-      </w:r>
-    </w:p>
-    <w:p>
-      <w:pPr>
-        <w:pStyle w:val="BodyText"/>
-      </w:pPr>
-      <w:r>
-        <w:t xml:space="preserve">В репозитории также сохранены датасет, итоговые метрики, prediction-файлы и CSV-файлы анализа ошибок. При этом модельные веса не хранятся в git, чтобы не перегружать репозиторий тяжёлыми артефактами обучения. Для дальнейшей работы веса можно хранить отдельно: например, как release artifact или во внешнем model registry.</w:t>
-      </w:r>
-    </w:p>
-    <w:p>
-      <w:pPr>
-        <w:pStyle w:val="BodyText"/>
-      </w:pPr>
-      <w:r>
-        <w:t xml:space="preserve">Воспроизводимость текущего эксперимента не означает полноту бенчмарка. Она означает, что все ключевые решения пилотного протокола явно зафиксированы: источник, генератор шума, split, baseline-подходы, модель, метрики и error analysis.</w:t>
-      </w:r>
-    </w:p>
-    <w:bookmarkEnd w:id="46"/>
-    <w:bookmarkStart w:id="47" w:name="выводы-по-разделу-1"/>
-    <w:p>
-      <w:pPr>
-        <w:pStyle w:val="Heading3"/>
-      </w:pPr>
-      <w:r>
-        <w:rPr>
-          <w:rStyle w:val="SectionNumber"/>
-        </w:rPr>
-        <w:t xml:space="preserve">1.14.9</w:t>
-      </w:r>
-      <w:r>
-        <w:tab/>
-      </w:r>
       <w:r>
         <w:t xml:space="preserve">4.9 Выводы по разделу</w:t>
       </w:r>
@@ -2973,83 +2574,56 @@
         <w:t xml:space="preserve">Эта методология задаёт основу для раздела 5, где сравниваются baseline-подходы, финальная конфигурация ByT5-small и результаты анализа ошибок.</w:t>
       </w:r>
     </w:p>
+    <w:bookmarkEnd w:id="46"/>
     <w:bookmarkEnd w:id="47"/>
+    <w:bookmarkStart w:id="58" w:name="результаты-экспериментов-и-анализ-ошибок"/>
+    <w:p>
+      <w:pPr>
+        <w:pStyle w:val="Heading2"/>
+      </w:pPr>
+      <w:r>
+        <w:t xml:space="preserve">5. Результаты экспериментов и анализ ошибок</w:t>
+      </w:r>
+    </w:p>
+    <w:bookmarkStart w:id="48" w:name="общая-логика-оценки"/>
+    <w:p>
+      <w:pPr>
+        <w:pStyle w:val="Heading3"/>
+      </w:pPr>
+      <w:r>
+        <w:t xml:space="preserve">5.1 Общая логика оценки</w:t>
+      </w:r>
+    </w:p>
+    <w:p>
+      <w:pPr>
+        <w:pStyle w:val="FirstParagraph"/>
+      </w:pPr>
+      <w:r>
+        <w:t xml:space="preserve">В разделе результатов сравниваются три подхода: identity baseline, rule-based normalizer и ByT5-small 512. Все они оцениваются на одной test set из 800 зашумлённых вариантов, построенных из 40 уникальных исходных строк, которые не пересекаются с обучающей и валидационной выборками.</w:t>
+      </w:r>
+    </w:p>
+    <w:p>
+      <w:pPr>
+        <w:pStyle w:val="BodyText"/>
+      </w:pPr>
+      <w:r>
+        <w:t xml:space="preserve">Интерпретация строится в два слоя. Сначала сравниваются агрегированные метрики CER, WER и ExactMatch. Затем отдельно рассматривается анализ ошибок: сколько примеров улучшилось, осталось без изменений или стало хуже после применения ByT5-small. Такой порядок нужен, чтобы не ограничиваться средними значениями и проверить устойчивость улучшения на уровне отдельных строк.</w:t>
+      </w:r>
+    </w:p>
+    <w:p>
+      <w:pPr>
+        <w:pStyle w:val="BodyText"/>
+      </w:pPr>
+      <w:r>
+        <w:t xml:space="preserve">В этом разделе важно не только то, что ByT5-small показывает лучшие итоговые метрики. Не менее важны два отрицательных или ограничивающих результата: rule-based normalizer ухудшает качество относительно identity baseline, а улучшение ByT5 по CER остаётся умеренным и требует осторожной интерпретации.</w:t>
+      </w:r>
+    </w:p>
     <w:bookmarkEnd w:id="48"/>
-    <w:bookmarkStart w:id="59" w:name="результаты-экспериментов-и-анализ-ошибок"/>
-    <w:p>
-      <w:pPr>
-        <w:pStyle w:val="Heading2"/>
-      </w:pPr>
-      <w:r>
-        <w:rPr>
-          <w:rStyle w:val="SectionNumber"/>
-        </w:rPr>
-        <w:t xml:space="preserve">1.15</w:t>
-      </w:r>
-      <w:r>
-        <w:tab/>
-      </w:r>
-      <w:r>
-        <w:t xml:space="preserve">5. Результаты экспериментов и анализ ошибок</w:t>
-      </w:r>
-    </w:p>
-    <w:bookmarkStart w:id="49" w:name="общая-логика-оценки"/>
+    <w:bookmarkStart w:id="49" w:name="итоговые-метрики"/>
     <w:p>
       <w:pPr>
         <w:pStyle w:val="Heading3"/>
       </w:pPr>
-      <w:r>
-        <w:rPr>
-          <w:rStyle w:val="SectionNumber"/>
-        </w:rPr>
-        <w:t xml:space="preserve">1.15.1</w:t>
-      </w:r>
-      <w:r>
-        <w:tab/>
-      </w:r>
-      <w:r>
-        <w:t xml:space="preserve">5.1 Общая логика оценки</w:t>
-      </w:r>
-    </w:p>
-    <w:p>
-      <w:pPr>
-        <w:pStyle w:val="FirstParagraph"/>
-      </w:pPr>
-      <w:r>
-        <w:t xml:space="preserve">В разделе результатов сравниваются три подхода: identity baseline, rule-based normalizer и ByT5-small 512. Все они оцениваются на одной test set из 800 зашумлённых вариантов, построенных из 40 уникальных исходных строк, которые не пересекаются с обучающей и валидационной выборками.</w:t>
-      </w:r>
-    </w:p>
-    <w:p>
-      <w:pPr>
-        <w:pStyle w:val="BodyText"/>
-      </w:pPr>
-      <w:r>
-        <w:t xml:space="preserve">Интерпретация строится в два слоя. Сначала сравниваются агрегированные метрики CER, WER и ExactMatch. Затем отдельно рассматривается анализ ошибок: сколько примеров улучшилось, осталось без изменений или стало хуже после применения ByT5-small. Такой порядок нужен, чтобы не ограничиваться средними значениями и проверить устойчивость улучшения на уровне отдельных строк.</w:t>
-      </w:r>
-    </w:p>
-    <w:p>
-      <w:pPr>
-        <w:pStyle w:val="BodyText"/>
-      </w:pPr>
-      <w:r>
-        <w:t xml:space="preserve">В этом разделе важно не только то, что ByT5-small показывает лучшие итоговые метрики. Не менее важны два отрицательных или ограничивающих результата: rule-based normalizer ухудшает качество относительно identity baseline, а улучшение ByT5 по CER остаётся умеренным и требует осторожной интерпретации.</w:t>
-      </w:r>
-    </w:p>
-    <w:bookmarkEnd w:id="49"/>
-    <w:bookmarkStart w:id="50" w:name="итоговые-метрики"/>
-    <w:p>
-      <w:pPr>
-        <w:pStyle w:val="Heading3"/>
-      </w:pPr>
-      <w:r>
-        <w:rPr>
-          <w:rStyle w:val="SectionNumber"/>
-        </w:rPr>
-        <w:t xml:space="preserve">1.15.2</w:t>
-      </w:r>
-      <w:r>
-        <w:tab/>
-      </w:r>
       <w:r>
         <w:t xml:space="preserve">5.2 Итоговые метрики</w:t>
       </w:r>
@@ -3347,21 +2921,12 @@
         <w:t xml:space="preserve">ExactMatch остаётся низким у всех методов. Это ожидаемо для длинных строк и строгого посимвольного сравнения: даже одна ошибка делает строку несовпадающей с эталоном. Поэтому ExactMatch используется как дополнительный индикатор, а основные выводы строятся по CER, WER и анализу ошибок.</w:t>
       </w:r>
     </w:p>
-    <w:bookmarkEnd w:id="50"/>
-    <w:bookmarkStart w:id="51" w:name="сравнение-с-identity-baseline"/>
+    <w:bookmarkEnd w:id="49"/>
+    <w:bookmarkStart w:id="50" w:name="сравнение-с-identity-baseline"/>
     <w:p>
       <w:pPr>
         <w:pStyle w:val="Heading3"/>
       </w:pPr>
-      <w:r>
-        <w:rPr>
-          <w:rStyle w:val="SectionNumber"/>
-        </w:rPr>
-        <w:t xml:space="preserve">1.15.3</w:t>
-      </w:r>
-      <w:r>
-        <w:tab/>
-      </w:r>
       <w:r>
         <w:t xml:space="preserve">5.3 Сравнение с identity baseline</w:t>
       </w:r>
@@ -3434,21 +2999,12 @@
         <w:t xml:space="preserve">Такой результат согласуется с основной гипотезой пилота: byte-level sequence-to-sequence модель может быть полезна для post-correction арабографичного тюркского текста. Однако улучшение по CER остаётся достаточно небольшим, поэтому вывод следует считать не финальным доказательством качества модели, а подтверждением работоспособности выбранного направления.</w:t>
       </w:r>
     </w:p>
-    <w:bookmarkEnd w:id="51"/>
-    <w:bookmarkStart w:id="52" w:name="rule-based-normalizer"/>
+    <w:bookmarkEnd w:id="50"/>
+    <w:bookmarkStart w:id="51" w:name="rule-based-normalizer"/>
     <w:p>
       <w:pPr>
         <w:pStyle w:val="Heading3"/>
       </w:pPr>
-      <w:r>
-        <w:rPr>
-          <w:rStyle w:val="SectionNumber"/>
-        </w:rPr>
-        <w:t xml:space="preserve">1.15.4</w:t>
-      </w:r>
-      <w:r>
-        <w:tab/>
-      </w:r>
       <w:r>
         <w:t xml:space="preserve">5.4 Rule-based normalizer</w:t>
       </w:r>
@@ -3521,64 +3077,46 @@
         <w:t xml:space="preserve">Следовательно, rule-based normalization нельзя использовать как автоматический предварительный шаг без отдельной проверки. В рамках данного эксперимента первая гипотеза получает предварительное подтверждение: naive rule-based normalization ухудшает качество текста относительно identity baseline.</w:t>
       </w:r>
     </w:p>
+    <w:bookmarkEnd w:id="51"/>
+    <w:bookmarkStart w:id="52" w:name="значение-длины-последовательности"/>
+    <w:p>
+      <w:pPr>
+        <w:pStyle w:val="Heading3"/>
+      </w:pPr>
+      <w:r>
+        <w:t xml:space="preserve">5.5 Значение длины последовательности</w:t>
+      </w:r>
+    </w:p>
+    <w:p>
+      <w:pPr>
+        <w:pStyle w:val="FirstParagraph"/>
+      </w:pPr>
+      <w:r>
+        <w:t xml:space="preserve">Результаты пилота показывают чувствительность ByT5-small к максимальной длине входной и целевой последовательности. Это связано с byte-level представлением: длина строки в токенах может быть заметно больше, чем число видимых символов, особенно для арабской графики.</w:t>
+      </w:r>
+    </w:p>
+    <w:p>
+      <w:pPr>
+        <w:pStyle w:val="BodyText"/>
+      </w:pPr>
+      <w:r>
+        <w:t xml:space="preserve">Конфигурация 256 использовалась как первый рабочий запуск, но для части строк такое ограничение может быть слишком жёстким. Конфигурация 512 снижает риск обрезания контекста и поэтому выбрана как основная для итогового анализа.</w:t>
+      </w:r>
+    </w:p>
+    <w:p>
+      <w:pPr>
+        <w:pStyle w:val="BodyText"/>
+      </w:pPr>
+      <w:r>
+        <w:t xml:space="preserve">Этот результат следует интерпретировать осторожно. Он показывает, что max length является важным экспериментальным параметром в данной постановке, но не доказывает универсального преимущества длины 512 для всех арабографичных тюркских корпусов. Для более сильного вывода нужны дополнительные запуски на более широком наборе источников и длин строк.</w:t>
+      </w:r>
+    </w:p>
     <w:bookmarkEnd w:id="52"/>
-    <w:bookmarkStart w:id="53" w:name="значение-длины-последовательности"/>
+    <w:bookmarkStart w:id="53" w:name="X57a2c7e56d371be566bce3ca95d65080761e96c"/>
     <w:p>
       <w:pPr>
         <w:pStyle w:val="Heading3"/>
       </w:pPr>
-      <w:r>
-        <w:rPr>
-          <w:rStyle w:val="SectionNumber"/>
-        </w:rPr>
-        <w:t xml:space="preserve">1.15.5</w:t>
-      </w:r>
-      <w:r>
-        <w:tab/>
-      </w:r>
-      <w:r>
-        <w:t xml:space="preserve">5.5 Значение длины последовательности</w:t>
-      </w:r>
-    </w:p>
-    <w:p>
-      <w:pPr>
-        <w:pStyle w:val="FirstParagraph"/>
-      </w:pPr>
-      <w:r>
-        <w:t xml:space="preserve">Результаты пилота показывают чувствительность ByT5-small к максимальной длине входной и целевой последовательности. Это связано с byte-level представлением: длина строки в токенах может быть заметно больше, чем число видимых символов, особенно для арабской графики.</w:t>
-      </w:r>
-    </w:p>
-    <w:p>
-      <w:pPr>
-        <w:pStyle w:val="BodyText"/>
-      </w:pPr>
-      <w:r>
-        <w:t xml:space="preserve">Конфигурация 256 использовалась как первый рабочий запуск, но для части строк такое ограничение может быть слишком жёстким. Конфигурация 512 снижает риск обрезания контекста и поэтому выбрана как основная для итогового анализа.</w:t>
-      </w:r>
-    </w:p>
-    <w:p>
-      <w:pPr>
-        <w:pStyle w:val="BodyText"/>
-      </w:pPr>
-      <w:r>
-        <w:t xml:space="preserve">Этот результат следует интерпретировать осторожно. Он показывает, что max length является важным экспериментальным параметром в данной постановке, но не доказывает универсального преимущества длины 512 для всех арабографичных тюркских корпусов. Для более сильного вывода нужны дополнительные запуски на более широком наборе источников и длин строк.</w:t>
-      </w:r>
-    </w:p>
-    <w:bookmarkEnd w:id="53"/>
-    <w:bookmarkStart w:id="54" w:name="X57a2c7e56d371be566bce3ca95d65080761e96c"/>
-    <w:p>
-      <w:pPr>
-        <w:pStyle w:val="Heading3"/>
-      </w:pPr>
-      <w:r>
-        <w:rPr>
-          <w:rStyle w:val="SectionNumber"/>
-        </w:rPr>
-        <w:t xml:space="preserve">1.15.6</w:t>
-      </w:r>
-      <w:r>
-        <w:tab/>
-      </w:r>
       <w:r>
         <w:t xml:space="preserve">5.6 Анализ ошибок на уровне отдельных примеров</w:t>
       </w:r>
@@ -3835,21 +3373,12 @@
         <w:t xml:space="preserve">Качественный просмотр лучших и худших примеров показывает два разных режима поведения модели. В удачных случаях ByT5-small исправляет локальные OCR-подобные искажения, восстанавливает пропущенные или заменённые графемы и делает разбиение слов ближе к эталону. В худших случаях модель может не просто не исправить строку, а начать порождать повторяющиеся фрагменты, существенно удлиняя prediction. Это особенно важно для практического применения: модель улучшает большинство строк, но без фильтрации, анализа худших случаев или ручной проверки её нельзя считать безопасным автоматическим корректором.</w:t>
       </w:r>
     </w:p>
-    <w:bookmarkEnd w:id="54"/>
-    <w:bookmarkStart w:id="55" w:name="среднее-улучшение-по-примерам"/>
+    <w:bookmarkEnd w:id="53"/>
+    <w:bookmarkStart w:id="54" w:name="среднее-улучшение-по-примерам"/>
     <w:p>
       <w:pPr>
         <w:pStyle w:val="Heading3"/>
       </w:pPr>
-      <w:r>
-        <w:rPr>
-          <w:rStyle w:val="SectionNumber"/>
-        </w:rPr>
-        <w:t xml:space="preserve">1.15.7</w:t>
-      </w:r>
-      <w:r>
-        <w:tab/>
-      </w:r>
       <w:r>
         <w:t xml:space="preserve">5.7 Среднее улучшение по примерам</w:t>
       </w:r>
@@ -3902,212 +3431,158 @@
         <w:t xml:space="preserve">Среднее улучшение полезно как количественное резюме, но его недостаточно для окончательной оценки качества. Поэтому оно рассматривается вместе с распределением improved/unchanged/worse и качественным анализом лучших и худших примеров.</w:t>
       </w:r>
     </w:p>
+    <w:bookmarkEnd w:id="54"/>
+    <w:bookmarkStart w:id="55" w:name="интерпретация-результатов"/>
+    <w:p>
+      <w:pPr>
+        <w:pStyle w:val="Heading3"/>
+      </w:pPr>
+      <w:r>
+        <w:t xml:space="preserve">5.8 Интерпретация результатов</w:t>
+      </w:r>
+    </w:p>
+    <w:p>
+      <w:pPr>
+        <w:pStyle w:val="FirstParagraph"/>
+      </w:pPr>
+      <w:r>
+        <w:t xml:space="preserve">Полученные результаты дают три основных вывода. Первый вывод — отрицательный, но методологически важный: rule-based normalizer ухудшает качество относительно identity baseline. Это означает, что для исторического арабографичного тюркского текста простая символьная нормализация не является заведомо безопасной предобработкой.</w:t>
+      </w:r>
+    </w:p>
+    <w:p>
+      <w:pPr>
+        <w:pStyle w:val="BodyText"/>
+      </w:pPr>
+      <w:r>
+        <w:t xml:space="preserve">Второй вывод — положительный: ByT5-small 512 улучшает качество относительно identity baseline. Улучшение по CER умеренное, но улучшение по WER заметное, а анализ отдельных примеров показывает, что модель улучшает большинство тестовых строк. Следовательно, byte-level sequence-to-sequence подход является работоспособным направлением для пилотной посткоррекции.</w:t>
+      </w:r>
+    </w:p>
+    <w:p>
+      <w:pPr>
+        <w:pStyle w:val="BodyText"/>
+      </w:pPr>
+      <w:r>
+        <w:t xml:space="preserve">Третий вывод касается настройки модели: max length является важным параметром для byte-level обработки арабографичного текста. Конфигурация 512 в текущем эксперименте выглядит более устойчивой, чем более короткая конфигурация, но этот результат следует считать практическим сигналом, а не универсальным правилом.</w:t>
+      </w:r>
+    </w:p>
+    <w:p>
+      <w:pPr>
+        <w:pStyle w:val="BodyText"/>
+      </w:pPr>
+      <w:r>
+        <w:t xml:space="preserve">Наконец, низкий ExactMatch не противоречит положительным результатам по CER и WER. Для длинных исторических строк полное совпадение слишком строго: одна небольшая ошибка уже делает строку несовпадающей. Поэтому основные выводы в работе опираются на CER, WER и анализ improved/unchanged/worse.</w:t>
+      </w:r>
+    </w:p>
     <w:bookmarkEnd w:id="55"/>
-    <w:bookmarkStart w:id="56" w:name="интерпретация-результатов"/>
+    <w:bookmarkStart w:id="56" w:name="ограничения-интерпретации"/>
     <w:p>
       <w:pPr>
         <w:pStyle w:val="Heading3"/>
       </w:pPr>
       <w:r>
-        <w:rPr>
-          <w:rStyle w:val="SectionNumber"/>
-        </w:rPr>
-        <w:t xml:space="preserve">1.15.8</w:t>
-      </w:r>
-      <w:r>
-        <w:tab/>
-      </w:r>
-      <w:r>
-        <w:t xml:space="preserve">5.8 Интерпретация результатов</w:t>
-      </w:r>
-    </w:p>
-    <w:p>
-      <w:pPr>
-        <w:pStyle w:val="FirstParagraph"/>
-      </w:pPr>
-      <w:r>
-        <w:t xml:space="preserve">Полученные результаты дают три основных вывода. Первый вывод — отрицательный, но методологически важный: rule-based normalizer ухудшает качество относительно identity baseline. Это означает, что для исторического арабографичного тюркского текста простая символьная нормализация не является заведомо безопасной предобработкой.</w:t>
-      </w:r>
-    </w:p>
-    <w:p>
-      <w:pPr>
-        <w:pStyle w:val="BodyText"/>
-      </w:pPr>
-      <w:r>
-        <w:t xml:space="preserve">Второй вывод — положительный: ByT5-small 512 улучшает качество относительно identity baseline. Улучшение по CER умеренное, но улучшение по WER заметное, а анализ отдельных примеров показывает, что модель улучшает большинство тестовых строк. Следовательно, byte-level sequence-to-sequence подход является работоспособным направлением для пилотной посткоррекции.</w:t>
-      </w:r>
-    </w:p>
-    <w:p>
-      <w:pPr>
-        <w:pStyle w:val="BodyText"/>
-      </w:pPr>
-      <w:r>
-        <w:t xml:space="preserve">Третий вывод касается настройки модели: max length является важным параметром для byte-level обработки арабографичного текста. Конфигурация 512 в текущем эксперименте выглядит более устойчивой, чем более короткая конфигурация, но этот результат следует считать практическим сигналом, а не универсальным правилом.</w:t>
-      </w:r>
-    </w:p>
-    <w:p>
-      <w:pPr>
-        <w:pStyle w:val="BodyText"/>
-      </w:pPr>
-      <w:r>
-        <w:t xml:space="preserve">Наконец, низкий ExactMatch не противоречит положительным результатам по CER и WER. Для длинных исторических строк полное совпадение слишком строго: одна небольшая ошибка уже делает строку несовпадающей. Поэтому основные выводы в работе опираются на CER, WER и анализ improved/unchanged/worse.</w:t>
+        <w:t xml:space="preserve">5.9 Ограничения интерпретации</w:t>
+      </w:r>
+    </w:p>
+    <w:p>
+      <w:pPr>
+        <w:pStyle w:val="FirstParagraph"/>
+      </w:pPr>
+      <w:r>
+        <w:t xml:space="preserve">Результаты раздела 5 следует понимать как пилотные. Они показывают, что выбранный pipeline работает на текущем корпусе и синтетическом шуме, но не доказывают качество модели на реальных OCR/HTR-выходах.</w:t>
+      </w:r>
+    </w:p>
+    <w:p>
+      <w:pPr>
+        <w:pStyle w:val="BodyText"/>
+      </w:pPr>
+      <w:r>
+        <w:t xml:space="preserve">Главные ограничения интерпретации связаны с данными: корпус мал, основан на одном источнике, а ошибки сгенерированы искусственно. Поэтому значения CER и WER нельзя напрямую переносить на другие жанры, периоды, шрифты, сканы или OCR-системы без дополнительной проверки.</w:t>
+      </w:r>
+    </w:p>
+    <w:p>
+      <w:pPr>
+        <w:pStyle w:val="BodyText"/>
+      </w:pPr>
+      <w:r>
+        <w:t xml:space="preserve">Отдельное ограничение связано с метриками. CER и WER измеряют формальную близость к эталону, но не полностью отражают историко-лингвистическую допустимость исправления. Для дальнейшей работы нужен вручную проверенный subset, где ошибки модели будут оцениваться не только автоматически, но и экспертно.</w:t>
       </w:r>
     </w:p>
     <w:bookmarkEnd w:id="56"/>
-    <w:bookmarkStart w:id="57" w:name="ограничения-интерпретации"/>
+    <w:bookmarkStart w:id="57" w:name="выводы-по-разделу-2"/>
     <w:p>
       <w:pPr>
         <w:pStyle w:val="Heading3"/>
       </w:pPr>
       <w:r>
-        <w:rPr>
-          <w:rStyle w:val="SectionNumber"/>
-        </w:rPr>
-        <w:t xml:space="preserve">1.15.9</w:t>
-      </w:r>
-      <w:r>
-        <w:tab/>
-      </w:r>
-      <w:r>
-        <w:t xml:space="preserve">5.9 Ограничения интерпретации</w:t>
-      </w:r>
-    </w:p>
-    <w:p>
-      <w:pPr>
-        <w:pStyle w:val="FirstParagraph"/>
-      </w:pPr>
-      <w:r>
-        <w:t xml:space="preserve">Результаты раздела 5 следует понимать как пилотные. Они показывают, что выбранный pipeline работает на текущем корпусе и синтетическом шуме, но не доказывают качество модели на реальных OCR/HTR-выходах.</w:t>
-      </w:r>
-    </w:p>
-    <w:p>
-      <w:pPr>
-        <w:pStyle w:val="BodyText"/>
-      </w:pPr>
-      <w:r>
-        <w:t xml:space="preserve">Главные ограничения интерпретации связаны с данными: корпус мал, основан на одном источнике, а ошибки сгенерированы искусственно. Поэтому значения CER и WER нельзя напрямую переносить на другие жанры, периоды, шрифты, сканы или OCR-системы без дополнительной проверки.</w:t>
-      </w:r>
-    </w:p>
-    <w:p>
-      <w:pPr>
-        <w:pStyle w:val="BodyText"/>
-      </w:pPr>
-      <w:r>
-        <w:t xml:space="preserve">Отдельное ограничение связано с метриками. CER и WER измеряют формальную близость к эталону, но не полностью отражают историко-лингвистическую допустимость исправления. Для дальнейшей работы нужен вручную проверенный subset, где ошибки модели будут оцениваться не только автоматически, но и экспертно.</w:t>
+        <w:t xml:space="preserve">5.10 Выводы по разделу</w:t>
+      </w:r>
+    </w:p>
+    <w:p>
+      <w:pPr>
+        <w:pStyle w:val="FirstParagraph"/>
+      </w:pPr>
+      <w:r>
+        <w:t xml:space="preserve">Раздел результатов показывает, что поставленная пилотная задача имеет смысл: ByT5-small 512 превосходит identity baseline, улучшает большинство тестовых примеров и особенно заметно снижает WER. Это предварительно показывает применимость byte-level neural post-correction как первого шага для обработки исторических арабографичных тюркских текстов.</w:t>
+      </w:r>
+    </w:p>
+    <w:p>
+      <w:pPr>
+        <w:pStyle w:val="BodyText"/>
+      </w:pPr>
+      <w:r>
+        <w:t xml:space="preserve">Одновременно результаты задают границы этого вывода. Rule-based normalizer ухудшает качество, ExactMatch остаётся низким, а часть примеров после ByT5 становится хуже. Значит, модель нельзя рассматривать как готовый автоматический корректор без анализа ошибок и ручной проверки.</w:t>
+      </w:r>
+    </w:p>
+    <w:p>
+      <w:pPr>
+        <w:pStyle w:val="BodyText"/>
+      </w:pPr>
+      <w:r>
+        <w:t xml:space="preserve">Таким образом, эксперимент показывает жизнеспособность направления, но следующий этап должен быть строже: больше источников, реальные OCR/HTR-выходы, ручная валидация и более детальный анализ типов ошибок. Эти ограничения и направления развития рассматриваются в следующем разделе.</w:t>
       </w:r>
     </w:p>
     <w:bookmarkEnd w:id="57"/>
-    <w:bookmarkStart w:id="58" w:name="выводы-по-разделу-2"/>
+    <w:bookmarkEnd w:id="58"/>
+    <w:bookmarkStart w:id="65" w:name="Xe8e02886c60b8939714d6e867e04f7997a20272"/>
+    <w:p>
+      <w:pPr>
+        <w:pStyle w:val="Heading2"/>
+      </w:pPr>
+      <w:r>
+        <w:t xml:space="preserve">6. Ограничения и направления дальнейшей работы</w:t>
+      </w:r>
+    </w:p>
+    <w:bookmarkStart w:id="59" w:name="ограничения-корпуса-1"/>
     <w:p>
       <w:pPr>
         <w:pStyle w:val="Heading3"/>
       </w:pPr>
       <w:r>
-        <w:rPr>
-          <w:rStyle w:val="SectionNumber"/>
-        </w:rPr>
-        <w:t xml:space="preserve">1.15.10</w:t>
-      </w:r>
-      <w:r>
-        <w:tab/>
-      </w:r>
-      <w:r>
-        <w:t xml:space="preserve">5.10 Выводы по разделу</w:t>
-      </w:r>
-    </w:p>
-    <w:p>
-      <w:pPr>
-        <w:pStyle w:val="FirstParagraph"/>
-      </w:pPr>
-      <w:r>
-        <w:t xml:space="preserve">Раздел результатов показывает, что поставленная пилотная задача имеет смысл: ByT5-small 512 превосходит identity baseline, улучшает большинство тестовых примеров и особенно заметно снижает WER. Это предварительно показывает применимость byte-level neural post-correction как первого шага для обработки исторических арабографичных тюркских текстов.</w:t>
-      </w:r>
-    </w:p>
-    <w:p>
-      <w:pPr>
-        <w:pStyle w:val="BodyText"/>
-      </w:pPr>
-      <w:r>
-        <w:t xml:space="preserve">Одновременно результаты задают границы этого вывода. Rule-based normalizer ухудшает качество, ExactMatch остаётся низким, а часть примеров после ByT5 становится хуже. Значит, модель нельзя рассматривать как готовый автоматический корректор без анализа ошибок и ручной проверки.</w:t>
-      </w:r>
-    </w:p>
-    <w:p>
-      <w:pPr>
-        <w:pStyle w:val="BodyText"/>
-      </w:pPr>
-      <w:r>
-        <w:t xml:space="preserve">Таким образом, эксперимент показывает жизнеспособность направления, но следующий этап должен быть строже: больше источников, реальные OCR/HTR-выходы, ручная валидация и более детальный анализ типов ошибок. Эти ограничения и направления развития рассматриваются в следующем разделе.</w:t>
-      </w:r>
-    </w:p>
-    <w:bookmarkEnd w:id="58"/>
+        <w:t xml:space="preserve">6.1 Ограничения корпуса</w:t>
+      </w:r>
+    </w:p>
+    <w:p>
+      <w:pPr>
+        <w:pStyle w:val="FirstParagraph"/>
+      </w:pPr>
+      <w:r>
+        <w:t xml:space="preserve">Первое ограничение связано с масштабом и составом корпуса. В текущей версии используется 400 чистых текстовых блоков из одного основного источника. Этого достаточно для проверки pipeline посткоррекции, но недостаточно для вывода о качестве метода на всём классе исторических арабографичных тюркских текстов.</w:t>
+      </w:r>
+    </w:p>
+    <w:p>
+      <w:pPr>
+        <w:pStyle w:val="BodyText"/>
+      </w:pPr>
+      <w:r>
+        <w:t xml:space="preserve">Один источник ограничивает жанровое, временное и орфографическое разнообразие материала. Тексты разных регионов, периодов и письменных традиций могут отличаться по графике, лексике, нормам записи и качеству исходного документа. Поэтому дальнейшая работа должна проверять модель не только на текущем османско-тюркском источнике, но и на других арабографичных тюркских материалах.</w:t>
+      </w:r>
+    </w:p>
     <w:bookmarkEnd w:id="59"/>
-    <w:bookmarkStart w:id="66" w:name="Xe8e02886c60b8939714d6e867e04f7997a20272"/>
-    <w:p>
-      <w:pPr>
-        <w:pStyle w:val="Heading2"/>
-      </w:pPr>
-      <w:r>
-        <w:rPr>
-          <w:rStyle w:val="SectionNumber"/>
-        </w:rPr>
-        <w:t xml:space="preserve">1.16</w:t>
-      </w:r>
-      <w:r>
-        <w:tab/>
-      </w:r>
-      <w:r>
-        <w:t xml:space="preserve">6. Ограничения и направления дальнейшей работы</w:t>
-      </w:r>
-    </w:p>
-    <w:bookmarkStart w:id="60" w:name="ограничения-корпуса-1"/>
+    <w:bookmarkStart w:id="60" w:name="ограничения-синтетического-шума"/>
     <w:p>
       <w:pPr>
         <w:pStyle w:val="Heading3"/>
       </w:pPr>
-      <w:r>
-        <w:rPr>
-          <w:rStyle w:val="SectionNumber"/>
-        </w:rPr>
-        <w:t xml:space="preserve">1.16.1</w:t>
-      </w:r>
-      <w:r>
-        <w:tab/>
-      </w:r>
-      <w:r>
-        <w:t xml:space="preserve">6.1 Ограничения корпуса</w:t>
-      </w:r>
-    </w:p>
-    <w:p>
-      <w:pPr>
-        <w:pStyle w:val="FirstParagraph"/>
-      </w:pPr>
-      <w:r>
-        <w:t xml:space="preserve">Первое ограничение связано с масштабом и составом корпуса. В текущей версии используется 400 чистых текстовых блоков из одного основного источника. Этого достаточно для проверки pipeline посткоррекции, но недостаточно для вывода о качестве метода на всём классе исторических арабографичных тюркских текстов.</w:t>
-      </w:r>
-    </w:p>
-    <w:p>
-      <w:pPr>
-        <w:pStyle w:val="BodyText"/>
-      </w:pPr>
-      <w:r>
-        <w:t xml:space="preserve">Один источник ограничивает жанровое, временное и орфографическое разнообразие материала. Тексты разных регионов, периодов и письменных традиций могут отличаться по графике, лексике, нормам записи и качеству исходного документа. Поэтому дальнейшая работа должна проверять модель не только на текущем османско-тюркском источнике, но и на других арабографичных тюркских материалах.</w:t>
-      </w:r>
-    </w:p>
-    <w:bookmarkEnd w:id="60"/>
-    <w:bookmarkStart w:id="61" w:name="ограничения-синтетического-шума"/>
-    <w:p>
-      <w:pPr>
-        <w:pStyle w:val="Heading3"/>
-      </w:pPr>
-      <w:r>
-        <w:rPr>
-          <w:rStyle w:val="SectionNumber"/>
-        </w:rPr>
-        <w:t xml:space="preserve">1.16.2</w:t>
-      </w:r>
-      <w:r>
-        <w:tab/>
-      </w:r>
       <w:r>
         <w:t xml:space="preserve">6.2 Ограничения синтетического шума</w:t>
       </w:r>
@@ -4140,178 +3615,133 @@
         <w:t xml:space="preserve">Однако реальные OCR/HTR-ошибки зависят от качества изображения, шрифта, сегментации страницы, модели распознавания и состояния документа. Синтетический шум может приближать часть таких ошибок, но не гарантирует полного совпадения с практическим сценарием. Поэтому следующий этап должен включать реальные OCR/HTR-выходы и ручную проверку соответствующих чистых текстов.</w:t>
       </w:r>
     </w:p>
+    <w:bookmarkEnd w:id="60"/>
+    <w:bookmarkStart w:id="61" w:name="ограничения-автоматических-метрик"/>
+    <w:p>
+      <w:pPr>
+        <w:pStyle w:val="Heading3"/>
+      </w:pPr>
+      <w:r>
+        <w:t xml:space="preserve">6.3 Ограничения автоматических метрик</w:t>
+      </w:r>
+    </w:p>
+    <w:p>
+      <w:pPr>
+        <w:pStyle w:val="FirstParagraph"/>
+      </w:pPr>
+      <w:r>
+        <w:t xml:space="preserve">Третье ограничение связано с оценкой качества. CER, WER и ExactMatch позволяют формально сравнивать методы, но они не полностью описывают качество исправления исторического текста. Для таких материалов важно не только совпадение с эталоном, но и сохранение исторически значимых орфографических вариантов.</w:t>
+      </w:r>
+    </w:p>
+    <w:p>
+      <w:pPr>
+        <w:pStyle w:val="BodyText"/>
+      </w:pPr>
+      <w:r>
+        <w:t xml:space="preserve">Модель может уменьшить edit distance, но внести лингвистически сомнительное исправление. Возможна и обратная ситуация: небольшое отличие от эталона может быть допустимым вариантом исторической записи. Поэтому автоматические метрики нужно дополнять ручной экспертной оценкой. В будущей версии работы стоит выделить небольшой manually validated subset и анализировать ошибки не только количественно, но и лингвистически.</w:t>
+      </w:r>
+    </w:p>
     <w:bookmarkEnd w:id="61"/>
-    <w:bookmarkStart w:id="62" w:name="ограничения-автоматических-метрик"/>
+    <w:bookmarkStart w:id="62" w:name="направления-расширения-корпуса"/>
     <w:p>
       <w:pPr>
         <w:pStyle w:val="Heading3"/>
       </w:pPr>
       <w:r>
-        <w:rPr>
-          <w:rStyle w:val="SectionNumber"/>
-        </w:rPr>
-        <w:t xml:space="preserve">1.16.3</w:t>
-      </w:r>
-      <w:r>
-        <w:tab/>
-      </w:r>
-      <w:r>
-        <w:t xml:space="preserve">6.3 Ограничения автоматических метрик</w:t>
-      </w:r>
-    </w:p>
-    <w:p>
-      <w:pPr>
-        <w:pStyle w:val="FirstParagraph"/>
-      </w:pPr>
-      <w:r>
-        <w:t xml:space="preserve">Третье ограничение связано с оценкой качества. CER, WER и ExactMatch позволяют формально сравнивать методы, но они не полностью описывают качество исправления исторического текста. Для таких материалов важно не только совпадение с эталоном, но и сохранение исторически значимых орфографических вариантов.</w:t>
-      </w:r>
-    </w:p>
-    <w:p>
-      <w:pPr>
-        <w:pStyle w:val="BodyText"/>
-      </w:pPr>
-      <w:r>
-        <w:t xml:space="preserve">Модель может уменьшить edit distance, но внести лингвистически сомнительное исправление. Возможна и обратная ситуация: небольшое отличие от эталона может быть допустимым вариантом исторической записи. Поэтому автоматические метрики нужно дополнять ручной экспертной оценкой. В будущей версии работы стоит выделить небольшой manually validated subset и анализировать ошибки не только количественно, но и лингвистически.</w:t>
+        <w:t xml:space="preserve">6.4 Направления расширения корпуса</w:t>
+      </w:r>
+    </w:p>
+    <w:p>
+      <w:pPr>
+        <w:pStyle w:val="FirstParagraph"/>
+      </w:pPr>
+      <w:r>
+        <w:t xml:space="preserve">Первое направление дальнейшей работы — расширение корпуса. Нужно добавить тексты разных периодов, жанров и региональных традиций арабографичной тюркской письменности. Это позволит проверить, сохраняется ли качество post-correction за пределами одного османско-тюркского источника.</w:t>
+      </w:r>
+    </w:p>
+    <w:p>
+      <w:pPr>
+        <w:pStyle w:val="BodyText"/>
+      </w:pPr>
+      <w:r>
+        <w:t xml:space="preserve">Особенно важно перейти от чистых текстовых блоков к связке «изображение → OCR/HTR-вывод → чистый текст». Такая структура позволит оценивать модель не только на синтетическом шуме, но и на ошибках реальных систем распознавания. Для этого потребуется небольшой, но качественно проверенный набор строк или страниц с ручной валидацией.</w:t>
       </w:r>
     </w:p>
     <w:bookmarkEnd w:id="62"/>
-    <w:bookmarkStart w:id="63" w:name="направления-расширения-корпуса"/>
+    <w:bookmarkStart w:id="63" w:name="развитие-модельной-части"/>
     <w:p>
       <w:pPr>
         <w:pStyle w:val="Heading3"/>
       </w:pPr>
       <w:r>
-        <w:rPr>
-          <w:rStyle w:val="SectionNumber"/>
-        </w:rPr>
-        <w:t xml:space="preserve">1.16.4</w:t>
-      </w:r>
-      <w:r>
-        <w:tab/>
-      </w:r>
-      <w:r>
-        <w:t xml:space="preserve">6.4 Направления расширения корпуса</w:t>
-      </w:r>
-    </w:p>
-    <w:p>
-      <w:pPr>
-        <w:pStyle w:val="FirstParagraph"/>
-      </w:pPr>
-      <w:r>
-        <w:t xml:space="preserve">Первое направление дальнейшей работы — расширение корпуса. Нужно добавить тексты разных периодов, жанров и региональных традиций арабографичной тюркской письменности. Это позволит проверить, сохраняется ли качество post-correction за пределами одного османско-тюркского источника.</w:t>
-      </w:r>
-    </w:p>
-    <w:p>
-      <w:pPr>
-        <w:pStyle w:val="BodyText"/>
-      </w:pPr>
-      <w:r>
-        <w:t xml:space="preserve">Особенно важно перейти от чистых текстовых блоков к связке «изображение → OCR/HTR-вывод → чистый текст». Такая структура позволит оценивать модель не только на синтетическом шуме, но и на ошибках реальных систем распознавания. Для этого потребуется небольшой, но качественно проверенный набор строк или страниц с ручной валидацией.</w:t>
+        <w:t xml:space="preserve">6.5 Развитие модельной части</w:t>
+      </w:r>
+    </w:p>
+    <w:p>
+      <w:pPr>
+        <w:pStyle w:val="FirstParagraph"/>
+      </w:pPr>
+      <w:r>
+        <w:t xml:space="preserve">Вторая линия развития связана с моделями и параметрами обучения. Текущая работа использует ByT5-small как основной нейросетевой baseline. В дальнейшем стоит сравнить более крупные варианты ByT5, другие sequence-to-sequence модели и специализированные OCR post-correction подходы.</w:t>
+      </w:r>
+    </w:p>
+    <w:p>
+      <w:pPr>
+        <w:pStyle w:val="BodyText"/>
+      </w:pPr>
+      <w:r>
+        <w:t xml:space="preserve">Отдельно стоит проверять и LLM-based post-correction подходы. Современные работы показывают, что для исторических документов такие методы требуют осторожной оценки и не дают гарантированного выигрыша без учёта корпуса, типа ошибок и процедуры валидации (Kanerva et al., 2025).</w:t>
+      </w:r>
+    </w:p>
+    <w:p>
+      <w:pPr>
+        <w:pStyle w:val="BodyText"/>
+      </w:pPr>
+      <w:r>
+        <w:t xml:space="preserve">Также нужно исследовать чувствительность результата к числу эпох, размеру обучающей выборки, максимальной длине последовательности и составу синтетического шума. Это поможет отделить эффект архитектуры от эффекта параметров эксперимента и понять, какие настройки действительно важны для арабографичного тюркского материала.</w:t>
       </w:r>
     </w:p>
     <w:bookmarkEnd w:id="63"/>
-    <w:bookmarkStart w:id="64" w:name="развитие-модельной-части"/>
+    <w:bookmarkStart w:id="64" w:name="Xe0f4525a4655057f90c3dc6525f7d54178a77a1"/>
     <w:p>
       <w:pPr>
         <w:pStyle w:val="Heading3"/>
       </w:pPr>
       <w:r>
-        <w:rPr>
-          <w:rStyle w:val="SectionNumber"/>
-        </w:rPr>
-        <w:t xml:space="preserve">1.16.5</w:t>
-      </w:r>
-      <w:r>
-        <w:tab/>
-      </w:r>
-      <w:r>
-        <w:t xml:space="preserve">6.5 Развитие модельной части</w:t>
-      </w:r>
-    </w:p>
-    <w:p>
-      <w:pPr>
-        <w:pStyle w:val="FirstParagraph"/>
-      </w:pPr>
-      <w:r>
-        <w:t xml:space="preserve">Вторая линия развития связана с моделями и параметрами обучения. Текущая работа использует ByT5-small как основной нейросетевой baseline. В дальнейшем стоит сравнить более крупные варианты ByT5, другие sequence-to-sequence модели и специализированные OCR post-correction подходы.</w:t>
-      </w:r>
-    </w:p>
-    <w:p>
-      <w:pPr>
-        <w:pStyle w:val="BodyText"/>
-      </w:pPr>
-      <w:r>
-        <w:t xml:space="preserve">Отдельно стоит проверять и LLM-based post-correction подходы. Современные работы показывают, что для исторических документов такие методы требуют осторожной оценки и не дают гарантированного выигрыша без учёта корпуса, типа ошибок и процедуры валидации (Kanerva et al., 2025).</w:t>
-      </w:r>
-    </w:p>
-    <w:p>
-      <w:pPr>
-        <w:pStyle w:val="BodyText"/>
-      </w:pPr>
-      <w:r>
-        <w:t xml:space="preserve">Также нужно исследовать чувствительность результата к числу эпох, размеру обучающей выборки, максимальной длине последовательности и составу синтетического шума. Это поможет отделить эффект архитектуры от эффекта параметров эксперимента и понять, какие настройки действительно важны для арабографичного тюркского материала.</w:t>
+        <w:t xml:space="preserve">6.6 Переход к более широкой системе анализа текстов</w:t>
+      </w:r>
+    </w:p>
+    <w:p>
+      <w:pPr>
+        <w:pStyle w:val="FirstParagraph"/>
+      </w:pPr>
+      <w:r>
+        <w:t xml:space="preserve">Посткоррекция является промежуточным этапом, а не конечной целью. После улучшения OCR/HTR-вывода можно переходить к задачам поиска, нормализации вариантов написания, извлечения именованных сущностей, сопоставления исторических записей и построения графов связей.</w:t>
+      </w:r>
+    </w:p>
+    <w:p>
+      <w:pPr>
+        <w:pStyle w:val="BodyText"/>
+      </w:pPr>
+      <w:r>
+        <w:t xml:space="preserve">В контексте будущей выпускной работы этот пилот может стать техническим основанием для системы анализа исторических арабографичных тюркских материалов. Более крупная система может включать OCR/HTR, post-correction, NER, record linkage, извлечение дат и топонимов, а также построение связей между людьми, местами и документами.</w:t>
+      </w:r>
+    </w:p>
+    <w:p>
+      <w:pPr>
+        <w:pStyle w:val="BodyText"/>
+      </w:pPr>
+      <w:r>
+        <w:t xml:space="preserve">Таким образом, текущая работа закрывает не всю задачу цифровой обработки исторических источников, а один необходимый слой будущего pipeline: повышение качества текстового вывода перед последующим историко-лингвистическим анализом.</w:t>
       </w:r>
     </w:p>
     <w:bookmarkEnd w:id="64"/>
-    <w:bookmarkStart w:id="65" w:name="Xe0f4525a4655057f90c3dc6525f7d54178a77a1"/>
-    <w:p>
-      <w:pPr>
-        <w:pStyle w:val="Heading3"/>
-      </w:pPr>
-      <w:r>
-        <w:rPr>
-          <w:rStyle w:val="SectionNumber"/>
-        </w:rPr>
-        <w:t xml:space="preserve">1.16.6</w:t>
-      </w:r>
-      <w:r>
-        <w:tab/>
-      </w:r>
-      <w:r>
-        <w:t xml:space="preserve">6.6 Переход к более широкой системе анализа текстов</w:t>
-      </w:r>
-    </w:p>
-    <w:p>
-      <w:pPr>
-        <w:pStyle w:val="FirstParagraph"/>
-      </w:pPr>
-      <w:r>
-        <w:t xml:space="preserve">Посткоррекция является промежуточным этапом, а не конечной целью. После улучшения OCR/HTR-вывода можно переходить к задачам поиска, нормализации вариантов написания, извлечения именованных сущностей, сопоставления исторических записей и построения графов связей.</w:t>
-      </w:r>
-    </w:p>
-    <w:p>
-      <w:pPr>
-        <w:pStyle w:val="BodyText"/>
-      </w:pPr>
-      <w:r>
-        <w:t xml:space="preserve">В контексте будущей выпускной работы этот пилот может стать техническим основанием для системы анализа исторических арабографичных тюркских материалов. Более крупная система может включать OCR/HTR, post-correction, NER, record linkage, извлечение дат и топонимов, а также построение связей между людьми, местами и документами.</w:t>
-      </w:r>
-    </w:p>
-    <w:p>
-      <w:pPr>
-        <w:pStyle w:val="BodyText"/>
-      </w:pPr>
-      <w:r>
-        <w:t xml:space="preserve">Таким образом, текущая работа закрывает не всю задачу цифровой обработки исторических источников, а один необходимый слой будущего pipeline: повышение качества текстового вывода перед последующим историко-лингвистическим анализом.</w:t>
-      </w:r>
-    </w:p>
     <w:bookmarkEnd w:id="65"/>
-    <w:bookmarkEnd w:id="66"/>
-    <w:bookmarkStart w:id="67" w:name="заключение"/>
+    <w:bookmarkStart w:id="66" w:name="заключение"/>
     <w:p>
       <w:pPr>
         <w:pStyle w:val="Heading2"/>
       </w:pPr>
-      <w:r>
-        <w:rPr>
-          <w:rStyle w:val="SectionNumber"/>
-        </w:rPr>
-        <w:t xml:space="preserve">1.17</w:t>
-      </w:r>
-      <w:r>
-        <w:tab/>
-      </w:r>
       <w:r>
         <w:t xml:space="preserve">7. Заключение</w:t>
       </w:r>
@@ -4368,21 +3798,13 @@
         <w:t xml:space="preserve">Тем не менее работа создаёт техническую основу для дальнейшего исследования. Полученный pipeline можно расширять в сторону полноценной системы обработки исторических документов: от OCR/HTR и post-correction к поиску, извлечению именованных сущностей, сопоставлению исторических записей и построению графов связей между людьми, местами и документами.</w:t>
       </w:r>
     </w:p>
+    <w:bookmarkEnd w:id="66"/>
     <w:bookmarkEnd w:id="67"/>
     <w:bookmarkStart w:id="68" w:name="список-литературы"/>
     <w:p>
       <w:pPr>
         <w:pStyle w:val="Heading1"/>
       </w:pPr>
-      <w:r>
-        <w:rPr>
-          <w:rStyle w:val="SectionNumber"/>
-        </w:rPr>
-        <w:t xml:space="preserve">2</w:t>
-      </w:r>
-      <w:r>
-        <w:tab/>
-      </w:r>
       <w:r>
         <w:t xml:space="preserve">Список литературы</w:t>
       </w:r>
@@ -4956,7 +4378,7 @@
         <w:rFonts w:asciiTheme="minorHAnsi" w:cstheme="minorBidi" w:eastAsiaTheme="minorHAnsi" w:hAnsiTheme="minorHAnsi"/>
         <w:sz w:val="24"/>
         <w:szCs w:val="24"/>
-        <w:lang w:bidi="ar-SA" w:eastAsia="en-US" w:val="ru-RU"/>
+        <w:lang w:bidi="ar-SA" w:eastAsia="en-US" w:val="en-US"/>
       </w:rPr>
     </w:rPrDefault>
     <w:pPrDefault>

</xml_diff>

<commit_message>
docs(course-paper): fix DOCX page breaks
</commit_message>
<xml_diff>
--- a/outputs/course_paper_hse_final.docx
+++ b/outputs/course_paper_hse_final.docx
@@ -2,56 +2,6 @@
 <file path=word/document.xml><?xml version="1.0" encoding="utf-8"?>
 <w:document xmlns:w="http://schemas.openxmlformats.org/wordprocessingml/2006/main" xmlns:m="http://schemas.openxmlformats.org/officeDocument/2006/math" xmlns:r="http://schemas.openxmlformats.org/officeDocument/2006/relationships" xmlns:o="urn:schemas-microsoft-com:office:office" xmlns:v="urn:schemas-microsoft-com:vml" xmlns:w10="urn:schemas-microsoft-com:office:word" xmlns:a="http://schemas.openxmlformats.org/drawingml/2006/main" xmlns:pic="http://schemas.openxmlformats.org/drawingml/2006/picture" xmlns:wp="http://schemas.openxmlformats.org/drawingml/2006/wordprocessingDrawing">
   <w:body>
-    <w:p>
-      <w:pPr>
-        <w:pStyle w:val="Title"/>
-      </w:pPr>
-      <w:r>
-        <w:t xml:space="preserve">Методы искусственного интеллекта для распознавания и анализа исторических текстов на арабско-тюркской графике</w:t>
-      </w:r>
-    </w:p>
-    <w:p>
-      <w:pPr>
-        <w:pStyle w:val="Author"/>
-      </w:pPr>
-      <w:r>
-        <w:t xml:space="preserve">Исламов Радмир Рашитович</w:t>
-      </w:r>
-    </w:p>
-    <w:p>
-      <w:pPr>
-        <w:pStyle w:val="Date"/>
-      </w:pPr>
-      <w:r>
-        <w:t xml:space="preserve">2026</w:t>
-      </w:r>
-    </w:p>
-    <w:sdt>
-      <w:sdtPr>
-        <w:docPartObj>
-          <w:docPartGallery w:val="Table of Contents"/>
-          <w:docPartUnique/>
-        </w:docPartObj>
-      </w:sdtPr>
-      <w:sdtContent>
-        <w:p>
-          <w:pPr>
-            <w:pStyle w:val="TOCHeading"/>
-          </w:pPr>
-          <w:r>
-            <w:t xml:space="preserve">Table of Contents</w:t>
-          </w:r>
-        </w:p>
-        <w:p>
-          <w:r>
-            <w:fldChar w:fldCharType="begin" w:dirty="true"/>
-            <w:instrText xml:space="preserve">TOC \o "1-3" \h \z \u</w:instrText>
-            <w:fldChar w:fldCharType="separate"/>
-            <w:fldChar w:fldCharType="end"/>
-          </w:r>
-        </w:p>
-      </w:sdtContent>
-    </w:sdt>
     <w:p>
       <w:pPr>
         <w:pStyle w:val="FirstParagraph"/>
@@ -105,18 +55,21 @@
         <w:pStyle w:val="BodyText"/>
       </w:pPr>
     </w:p>
-    <w:bookmarkStart w:id="9" w:name="Xa09a03de929e7d412e714ca7284d164c9c9b0f1"/>
-    <w:p>
-      <w:pPr>
-        <w:pStyle w:val="Heading1"/>
-      </w:pPr>
-      <w:r>
+    <w:p>
+      <w:pPr>
+        <w:pStyle w:val="BodyText"/>
+      </w:pPr>
+      <w:r>
+        <w:rPr>
+          <w:b/>
+          <w:bCs/>
+        </w:rPr>
         <w:t xml:space="preserve">Методы искусственного интеллекта для распознавания и анализа исторических текстов на арабско-тюркской графике</w:t>
       </w:r>
     </w:p>
     <w:p>
       <w:pPr>
-        <w:pStyle w:val="FirstParagraph"/>
+        <w:pStyle w:val="BodyText"/>
       </w:pPr>
       <w:r>
         <w:rPr>
@@ -148,7 +101,6 @@
         <w:pStyle w:val="BodyText"/>
       </w:pPr>
     </w:p>
-    <w:bookmarkEnd w:id="9"/>
     <w:p>
       <w:pPr>
         <w:pStyle w:val="BodyText"/>
@@ -236,13 +188,74 @@
         <w:t xml:space="preserve">Москва, 2026</w:t>
       </w:r>
     </w:p>
-    <w:bookmarkStart w:id="10" w:name="аннотация"/>
+    <w:p>
+      <w:r>
+        <w:br w:type="page"/>
+      </w:r>
+    </w:p>
+    <w:bookmarkStart w:id="9" w:name="содержание"/>
+    <w:p>
+      <w:pPr>
+        <w:pStyle w:val="Heading1"/>
+      </w:pPr>
+      <w:r>
+        <w:t xml:space="preserve">Содержание</w:t>
+      </w:r>
+    </w:p>
+    <w:p>
+      <w:r>
+        <w:br w:type="page"/>
+      </w:r>
+    </w:p>
+    <w:bookmarkEnd w:id="9"/>
+    <w:bookmarkStart w:id="74" w:name="аннотация"/>
+    <w:p>
+      <w:pPr>
+        <w:pStyle w:val="Heading1"/>
+      </w:pPr>
+      <w:r>
+        <w:t xml:space="preserve">Аннотация</w:t>
+      </w:r>
+    </w:p>
+    <w:p>
+      <w:pPr>
+        <w:pStyle w:val="FirstParagraph"/>
+      </w:pPr>
+      <w:r>
+        <w:t xml:space="preserve">В работе рассматривается задача автоматической обработки исторических тюркских текстов, записанных арабской графикой. Такие материалы представляют значительную историко-культурную и лингвистическую ценность, однако их машинная обработка затруднена из-за особенностей старой орфографии, вариативности написания, низкого качества источников, ограниченного количества размеченных данных и слабой представленности подобных корпусов в современных OCR- и NLP-ресурсах.</w:t>
+      </w:r>
+    </w:p>
+    <w:p>
+      <w:pPr>
+        <w:pStyle w:val="BodyText"/>
+      </w:pPr>
+      <w:r>
+        <w:t xml:space="preserve">В качестве пилотного этапа разработан воспроизводимый пайплайн для посткоррекции OCR-подобных ошибок в арабографичном тюркском тексте. Корпус построен на основе османско-тюркского текста в арабской графике. На его основе сформирован синтетический набор данных: чистые строки искажаются контролируемым генератором OCR-подобного шума, после чего строятся train/valid/test-разбиения без утечки исходных строк между выборками.</w:t>
+      </w:r>
+    </w:p>
+    <w:p>
+      <w:pPr>
+        <w:pStyle w:val="BodyText"/>
+      </w:pPr>
+      <w:r>
+        <w:t xml:space="preserve">В экспериментальной части сравниваются identity baseline, простой rule-based normalizer, train-derived character-confusion baseline и нейросетевая модель ByT5-small. Итоговая модель ByT5-small с длиной последовательности 512 показывает лучший результат среди рассмотренных методов на данном синтетическом benchmark. При этом улучшение по CER остаётся умеренным, а заметное снижение WER требует осторожной интерпретации, поскольку synthetic noise включает ошибки пробелов и границ слов. Дополнительно проведён анализ ошибок на уровне отдельных тестовых примеров, показывающий, что модель улучшает большинство строк, но не является равномерно безопасной и требует дальнейшей валидации.</w:t>
+      </w:r>
+    </w:p>
+    <w:p>
+      <w:pPr>
+        <w:pStyle w:val="BodyText"/>
+      </w:pPr>
+      <w:r>
+        <w:t xml:space="preserve">Работа рассматривается как пилотный этап для дальнейшего расширения корпуса, подключения реальных OCR/HTR-выходов и построения более полного бенчмарка для исторических тюркских текстов в арабской графике.</w:t>
+      </w:r>
+    </w:p>
+    <w:bookmarkStart w:id="10" w:name="введение"/>
     <w:p>
       <w:pPr>
         <w:pStyle w:val="Heading2"/>
       </w:pPr>
       <w:r>
-        <w:t xml:space="preserve">Аннотация</w:t>
+        <w:t xml:space="preserve">1. Введение</w:t>
       </w:r>
     </w:p>
     <w:p>
@@ -250,41 +263,41 @@
         <w:pStyle w:val="FirstParagraph"/>
       </w:pPr>
       <w:r>
-        <w:t xml:space="preserve">В работе рассматривается задача автоматической обработки исторических тюркских текстов, записанных арабской графикой. Такие материалы представляют значительную историко-культурную и лингвистическую ценность, однако их машинная обработка затруднена из-за особенностей старой орфографии, вариативности написания, низкого качества источников, ограниченного количества размеченных данных и слабой представленности подобных корпусов в современных OCR- и NLP-ресурсах.</w:t>
-      </w:r>
-    </w:p>
-    <w:p>
-      <w:pPr>
-        <w:pStyle w:val="BodyText"/>
-      </w:pPr>
-      <w:r>
-        <w:t xml:space="preserve">В качестве пилотного этапа разработан воспроизводимый пайплайн для посткоррекции OCR-подобных ошибок в арабографичном тюркском тексте. Корпус построен на основе османско-тюркского текста в арабской графике. На его основе сформирован синтетический набор данных: чистые строки искажаются контролируемым генератором OCR-подобного шума, после чего строятся train/valid/test-разбиения без утечки исходных строк между выборками.</w:t>
-      </w:r>
-    </w:p>
-    <w:p>
-      <w:pPr>
-        <w:pStyle w:val="BodyText"/>
-      </w:pPr>
-      <w:r>
-        <w:t xml:space="preserve">В экспериментальной части сравниваются identity baseline, простой rule-based normalizer, train-derived character-confusion baseline и нейросетевая модель ByT5-small. Итоговая модель ByT5-small с длиной последовательности 512 показывает лучший результат среди рассмотренных методов на данном синтетическом benchmark. При этом улучшение по CER остаётся умеренным, а заметное снижение WER требует осторожной интерпретации, поскольку synthetic noise включает ошибки пробелов и границ слов. Дополнительно проведён анализ ошибок на уровне отдельных тестовых примеров, показывающий, что модель улучшает большинство строк, но не является равномерно безопасной и требует дальнейшей валидации.</w:t>
-      </w:r>
-    </w:p>
-    <w:p>
-      <w:pPr>
-        <w:pStyle w:val="BodyText"/>
-      </w:pPr>
-      <w:r>
-        <w:t xml:space="preserve">Работа рассматривается как пилотный этап для дальнейшего расширения корпуса, подключения реальных OCR/HTR-выходов и построения более полного бенчмарка для исторических тюркских текстов в арабской графике.</w:t>
+        <w:t xml:space="preserve">Исторические тексты на арабографичной тюркской письменности представляют собой важный источник для изучения истории, культуры, религии, права, быта и интеллектуальной традиции тюркских народов. К таким материалам могут относиться османские, татарские, башкирские, крымскотатарские и другие тюркские тексты, записанные арабской графикой до перехода соответствующих письменных традиций на латиницу или кириллицу.</w:t>
+      </w:r>
+    </w:p>
+    <w:p>
+      <w:pPr>
+        <w:pStyle w:val="BodyText"/>
+      </w:pPr>
+      <w:r>
+        <w:t xml:space="preserve">Несмотря на историческую значимость таких источников, их автоматическая обработка остаётся сложной задачей. Современные инструменты оптического распознавания текста и обработки естественного языка обычно лучше развиты для массовых современных языков и стандартных письменностей. Для исторических арабографичных тюркских материалов ситуация иная: доступных размеченных корпусов мало, орфография нестабильна, качество сканов и печатных источников может быть неоднородным, а готовые модели часто не учитывают специфику старой письменной традиции.</w:t>
+      </w:r>
+    </w:p>
+    <w:p>
+      <w:pPr>
+        <w:pStyle w:val="BodyText"/>
+      </w:pPr>
+      <w:r>
+        <w:t xml:space="preserve">В результате исследователь, работающий с такими документами, сталкивается не только с задачей распознавания символов, но и с более широкой проблемой восстановления и нормализации текста. Даже если OCR-система выдаёт частично читаемый результат, в нём остаются ошибки: пропуски, замены похожих букв, неправильные пробелы, смешение графем и искажение слов. Такие ошибки затрудняют дальнейший поиск, индексирование, извлечение сущностей и историко-лингвистический анализ.</w:t>
+      </w:r>
+    </w:p>
+    <w:p>
+      <w:pPr>
+        <w:pStyle w:val="BodyText"/>
+      </w:pPr>
+      <w:r>
+        <w:t xml:space="preserve">В данной работе рассматривается один из первых технических шагов в этом направлении — посткоррекция OCR-подобных ошибок для исторического тюркского текста в арабской графике. Вместо попытки сразу построить полную систему распознавания и анализа документов работа фокусируется на воспроизводимом пилотном пайплайне: сбор небольшого корпуса, генерация контролируемых OCR-подобных искажений, обучение модели исправления текста и анализ качества результата.</w:t>
       </w:r>
     </w:p>
     <w:bookmarkEnd w:id="10"/>
-    <w:bookmarkStart w:id="11" w:name="введение"/>
+    <w:bookmarkStart w:id="11" w:name="актуальность"/>
     <w:p>
       <w:pPr>
         <w:pStyle w:val="Heading2"/>
       </w:pPr>
       <w:r>
-        <w:t xml:space="preserve">1. Введение</w:t>
+        <w:t xml:space="preserve">1.1 Актуальность</w:t>
       </w:r>
     </w:p>
     <w:p>
@@ -292,85 +305,43 @@
         <w:pStyle w:val="FirstParagraph"/>
       </w:pPr>
       <w:r>
-        <w:t xml:space="preserve">Исторические тексты на арабографичной тюркской письменности представляют собой важный источник для изучения истории, культуры, религии, права, быта и интеллектуальной традиции тюркских народов. К таким материалам могут относиться османские, татарские, башкирские, крымскотатарские и другие тюркские тексты, записанные арабской графикой до перехода соответствующих письменных традиций на латиницу или кириллицу.</w:t>
-      </w:r>
-    </w:p>
-    <w:p>
-      <w:pPr>
-        <w:pStyle w:val="BodyText"/>
-      </w:pPr>
-      <w:r>
-        <w:t xml:space="preserve">Несмотря на историческую значимость таких источников, их автоматическая обработка остаётся сложной задачей. Современные инструменты оптического распознавания текста и обработки естественного языка обычно лучше развиты для массовых современных языков и стандартных письменностей. Для исторических арабографичных тюркских материалов ситуация иная: доступных размеченных корпусов мало, орфография нестабильна, качество сканов и печатных источников может быть неоднородным, а готовые модели часто не учитывают специфику старой письменной традиции.</w:t>
-      </w:r>
-    </w:p>
-    <w:p>
-      <w:pPr>
-        <w:pStyle w:val="BodyText"/>
-      </w:pPr>
-      <w:r>
-        <w:t xml:space="preserve">В результате исследователь, работающий с такими документами, сталкивается не только с задачей распознавания символов, но и с более широкой проблемой восстановления и нормализации текста. Даже если OCR-система выдаёт частично читаемый результат, в нём остаются ошибки: пропуски, замены похожих букв, неправильные пробелы, смешение графем и искажение слов. Такие ошибки затрудняют дальнейший поиск, индексирование, извлечение сущностей и историко-лингвистический анализ.</w:t>
-      </w:r>
-    </w:p>
-    <w:p>
-      <w:pPr>
-        <w:pStyle w:val="BodyText"/>
-      </w:pPr>
-      <w:r>
-        <w:t xml:space="preserve">В данной работе рассматривается один из первых технических шагов в этом направлении — посткоррекция OCR-подобных ошибок для исторического тюркского текста в арабской графике. Вместо попытки сразу построить полную систему распознавания и анализа документов работа фокусируется на воспроизводимом пилотном пайплайне: сбор небольшого корпуса, генерация контролируемых OCR-подобных искажений, обучение модели исправления текста и анализ качества результата.</w:t>
+        <w:t xml:space="preserve">Актуальность темы определяется несколькими обстоятельствами.</w:t>
+      </w:r>
+    </w:p>
+    <w:p>
+      <w:pPr>
+        <w:pStyle w:val="BodyText"/>
+      </w:pPr>
+      <w:r>
+        <w:t xml:space="preserve">Во-первых, исторические тюркские тексты в арабской графике остаются недостаточно представленными в цифровых корпусах и инструментах автоматической обработки. Это ограничивает возможности поиска, анализа и повторного использования источников в исторических, филологических и культурологических исследованиях.</w:t>
+      </w:r>
+    </w:p>
+    <w:p>
+      <w:pPr>
+        <w:pStyle w:val="BodyText"/>
+      </w:pPr>
+      <w:r>
+        <w:t xml:space="preserve">Во-вторых, низкоресурсный характер задачи делает прямое применение стандартных OCR- и NLP-подходов недостаточным. Модели, хорошо работающие на современных языках и стандартных корпусах, могут давать нестабильные результаты на исторических текстах с вариативной орфографией и нетипичными графическими формами.</w:t>
+      </w:r>
+    </w:p>
+    <w:p>
+      <w:pPr>
+        <w:pStyle w:val="BodyText"/>
+      </w:pPr>
+      <w:r>
+        <w:t xml:space="preserve">В-третьих, посткоррекция OCR-ошибок является практически важным промежуточным этапом. Даже небольшое улучшение качества распознанного текста может повысить пригодность корпуса для поиска, разметки, извлечения именованных сущностей и последующего анализа.</w:t>
+      </w:r>
+    </w:p>
+    <w:p>
+      <w:pPr>
+        <w:pStyle w:val="BodyText"/>
+      </w:pPr>
+      <w:r>
+        <w:t xml:space="preserve">В-четвёртых, создание воспроизводимого пилотного бенчмарка важно не только для конкретной курсовой работы, но и для дальнейшего дипломного и публикационного проекта. Такой benchmark позволяет формализовать задачу, фиксировать метрики и постепенно расширять экспериментальную базу.</w:t>
       </w:r>
     </w:p>
     <w:bookmarkEnd w:id="11"/>
-    <w:bookmarkStart w:id="12" w:name="актуальность"/>
-    <w:p>
-      <w:pPr>
-        <w:pStyle w:val="Heading2"/>
-      </w:pPr>
-      <w:r>
-        <w:t xml:space="preserve">1.1 Актуальность</w:t>
-      </w:r>
-    </w:p>
-    <w:p>
-      <w:pPr>
-        <w:pStyle w:val="FirstParagraph"/>
-      </w:pPr>
-      <w:r>
-        <w:t xml:space="preserve">Актуальность темы определяется несколькими обстоятельствами.</w:t>
-      </w:r>
-    </w:p>
-    <w:p>
-      <w:pPr>
-        <w:pStyle w:val="BodyText"/>
-      </w:pPr>
-      <w:r>
-        <w:t xml:space="preserve">Во-первых, исторические тюркские тексты в арабской графике остаются недостаточно представленными в цифровых корпусах и инструментах автоматической обработки. Это ограничивает возможности поиска, анализа и повторного использования источников в исторических, филологических и культурологических исследованиях.</w:t>
-      </w:r>
-    </w:p>
-    <w:p>
-      <w:pPr>
-        <w:pStyle w:val="BodyText"/>
-      </w:pPr>
-      <w:r>
-        <w:t xml:space="preserve">Во-вторых, низкоресурсный характер задачи делает прямое применение стандартных OCR- и NLP-подходов недостаточным. Модели, хорошо работающие на современных языках и стандартных корпусах, могут давать нестабильные результаты на исторических текстах с вариативной орфографией и нетипичными графическими формами.</w:t>
-      </w:r>
-    </w:p>
-    <w:p>
-      <w:pPr>
-        <w:pStyle w:val="BodyText"/>
-      </w:pPr>
-      <w:r>
-        <w:t xml:space="preserve">В-третьих, посткоррекция OCR-ошибок является практически важным промежуточным этапом. Даже небольшое улучшение качества распознанного текста может повысить пригодность корпуса для поиска, разметки, извлечения именованных сущностей и последующего анализа.</w:t>
-      </w:r>
-    </w:p>
-    <w:p>
-      <w:pPr>
-        <w:pStyle w:val="BodyText"/>
-      </w:pPr>
-      <w:r>
-        <w:t xml:space="preserve">В-четвёртых, создание воспроизводимого пилотного бенчмарка важно не только для конкретной курсовой работы, но и для дальнейшего дипломного и публикационного проекта. Такой benchmark позволяет формализовать задачу, фиксировать метрики и постепенно расширять экспериментальную базу.</w:t>
-      </w:r>
-    </w:p>
-    <w:bookmarkEnd w:id="12"/>
-    <w:bookmarkStart w:id="13" w:name="постановка-проблемы"/>
+    <w:bookmarkStart w:id="12" w:name="постановка-проблемы"/>
     <w:p>
       <w:pPr>
         <w:pStyle w:val="Heading2"/>
@@ -487,26 +458,26 @@
         <w:t xml:space="preserve">В рамках данной работы проблема сужается до пилотной постановки: можно ли с помощью нейросетевой sequence-to-sequence модели улучшить синтетически искажённый арабографичный тюркский текст по сравнению с простыми baseline-подходами.</w:t>
       </w:r>
     </w:p>
+    <w:bookmarkEnd w:id="12"/>
+    <w:bookmarkStart w:id="13" w:name="цель-работы"/>
+    <w:p>
+      <w:pPr>
+        <w:pStyle w:val="Heading2"/>
+      </w:pPr>
+      <w:r>
+        <w:t xml:space="preserve">1.3 Цель работы</w:t>
+      </w:r>
+    </w:p>
+    <w:p>
+      <w:pPr>
+        <w:pStyle w:val="FirstParagraph"/>
+      </w:pPr>
+      <w:r>
+        <w:t xml:space="preserve">Цель работы — разработать и оценить пилотный пайплайн на основе методов искусственного интеллекта для посткоррекции OCR-подобных ошибок в исторических тюркских текстах, записанных арабской графикой.</w:t>
+      </w:r>
+    </w:p>
     <w:bookmarkEnd w:id="13"/>
-    <w:bookmarkStart w:id="14" w:name="цель-работы"/>
-    <w:p>
-      <w:pPr>
-        <w:pStyle w:val="Heading2"/>
-      </w:pPr>
-      <w:r>
-        <w:t xml:space="preserve">1.3 Цель работы</w:t>
-      </w:r>
-    </w:p>
-    <w:p>
-      <w:pPr>
-        <w:pStyle w:val="FirstParagraph"/>
-      </w:pPr>
-      <w:r>
-        <w:t xml:space="preserve">Цель работы — разработать и оценить пилотный пайплайн на основе методов искусственного интеллекта для посткоррекции OCR-подобных ошибок в исторических тюркских текстах, записанных арабской графикой.</w:t>
-      </w:r>
-    </w:p>
-    <w:bookmarkEnd w:id="14"/>
-    <w:bookmarkStart w:id="15" w:name="задачи-работы"/>
+    <w:bookmarkStart w:id="14" w:name="задачи-работы"/>
     <w:p>
       <w:pPr>
         <w:pStyle w:val="Heading2"/>
@@ -643,34 +614,34 @@
         <w:t xml:space="preserve">Сформулировать ограничения пилотного эксперимента и направления дальнейшей работы.</w:t>
       </w:r>
     </w:p>
+    <w:bookmarkEnd w:id="14"/>
+    <w:bookmarkStart w:id="15" w:name="объект-и-предмет-исследования"/>
+    <w:p>
+      <w:pPr>
+        <w:pStyle w:val="Heading2"/>
+      </w:pPr>
+      <w:r>
+        <w:t xml:space="preserve">1.5 Объект и предмет исследования</w:t>
+      </w:r>
+    </w:p>
+    <w:p>
+      <w:pPr>
+        <w:pStyle w:val="FirstParagraph"/>
+      </w:pPr>
+      <w:r>
+        <w:t xml:space="preserve">Объект исследования — исторические тюркские тексты, записанные арабской графикой.</w:t>
+      </w:r>
+    </w:p>
+    <w:p>
+      <w:pPr>
+        <w:pStyle w:val="BodyText"/>
+      </w:pPr>
+      <w:r>
+        <w:t xml:space="preserve">Предмет исследования — методы автоматической посткоррекции OCR-подобных ошибок в арабографичных тюркских текстах с использованием rule-based и нейросетевых подходов.</w:t>
+      </w:r>
+    </w:p>
     <w:bookmarkEnd w:id="15"/>
-    <w:bookmarkStart w:id="16" w:name="объект-и-предмет-исследования"/>
-    <w:p>
-      <w:pPr>
-        <w:pStyle w:val="Heading2"/>
-      </w:pPr>
-      <w:r>
-        <w:t xml:space="preserve">1.5 Объект и предмет исследования</w:t>
-      </w:r>
-    </w:p>
-    <w:p>
-      <w:pPr>
-        <w:pStyle w:val="FirstParagraph"/>
-      </w:pPr>
-      <w:r>
-        <w:t xml:space="preserve">Объект исследования — исторические тюркские тексты, записанные арабской графикой.</w:t>
-      </w:r>
-    </w:p>
-    <w:p>
-      <w:pPr>
-        <w:pStyle w:val="BodyText"/>
-      </w:pPr>
-      <w:r>
-        <w:t xml:space="preserve">Предмет исследования — методы автоматической посткоррекции OCR-подобных ошибок в арабографичных тюркских текстах с использованием rule-based и нейросетевых подходов.</w:t>
-      </w:r>
-    </w:p>
-    <w:bookmarkEnd w:id="16"/>
-    <w:bookmarkStart w:id="17" w:name="исследовательские-вопросы"/>
+    <w:bookmarkStart w:id="16" w:name="исследовательские-вопросы"/>
     <w:p>
       <w:pPr>
         <w:pStyle w:val="Heading2"/>
@@ -759,14 +730,56 @@
         <w:t xml:space="preserve">Не связано ли заметное снижение WER преимущественно с исправлением синтетических ошибок пробелов и границ слов?</w:t>
       </w:r>
     </w:p>
+    <w:bookmarkEnd w:id="16"/>
+    <w:bookmarkStart w:id="17" w:name="гипотезы"/>
+    <w:p>
+      <w:pPr>
+        <w:pStyle w:val="Heading2"/>
+      </w:pPr>
+      <w:r>
+        <w:t xml:space="preserve">1.7 Гипотезы</w:t>
+      </w:r>
+    </w:p>
+    <w:p>
+      <w:pPr>
+        <w:pStyle w:val="FirstParagraph"/>
+      </w:pPr>
+      <w:r>
+        <w:t xml:space="preserve">В работе проверяются следующие гипотезы.</w:t>
+      </w:r>
+    </w:p>
+    <w:p>
+      <w:pPr>
+        <w:pStyle w:val="BodyText"/>
+      </w:pPr>
+      <w:r>
+        <w:t xml:space="preserve">Гипотеза 1. Простая rule-based нормализация может ухудшать качество арабографичного тюркского текста, поскольку способна искажать значимые орфографические особенности.</w:t>
+      </w:r>
+    </w:p>
+    <w:p>
+      <w:pPr>
+        <w:pStyle w:val="BodyText"/>
+      </w:pPr>
+      <w:r>
+        <w:t xml:space="preserve">Гипотеза 2. Byte-level sequence-to-sequence модель ByT5-small способна улучшить качество OCR post-correction по сравнению с identity baseline.</w:t>
+      </w:r>
+    </w:p>
+    <w:p>
+      <w:pPr>
+        <w:pStyle w:val="BodyText"/>
+      </w:pPr>
+      <w:r>
+        <w:t xml:space="preserve">Гипотеза 3. Увеличение длины последовательности с 256 до 512 важно для арабографичного текста, поскольку ByT5 работает на уровне байтов, а один видимый символ арабской графики может занимать несколько байтов.</w:t>
+      </w:r>
+    </w:p>
     <w:bookmarkEnd w:id="17"/>
-    <w:bookmarkStart w:id="18" w:name="гипотезы"/>
+    <w:bookmarkStart w:id="18" w:name="практическая-значимость"/>
     <w:p>
       <w:pPr>
         <w:pStyle w:val="Heading2"/>
       </w:pPr>
       <w:r>
-        <w:t xml:space="preserve">1.7 Гипотезы</w:t>
+        <w:t xml:space="preserve">1.8 Практическая значимость</w:t>
       </w:r>
     </w:p>
     <w:p>
@@ -774,41 +787,25 @@
         <w:pStyle w:val="FirstParagraph"/>
       </w:pPr>
       <w:r>
-        <w:t xml:space="preserve">В работе проверяются следующие гипотезы.</w:t>
-      </w:r>
-    </w:p>
-    <w:p>
-      <w:pPr>
-        <w:pStyle w:val="BodyText"/>
-      </w:pPr>
-      <w:r>
-        <w:t xml:space="preserve">Гипотеза 1. Простая rule-based нормализация может ухудшать качество арабографичного тюркского текста, поскольку способна искажать значимые орфографические особенности.</w:t>
-      </w:r>
-    </w:p>
-    <w:p>
-      <w:pPr>
-        <w:pStyle w:val="BodyText"/>
-      </w:pPr>
-      <w:r>
-        <w:t xml:space="preserve">Гипотеза 2. Byte-level sequence-to-sequence модель ByT5-small способна улучшить качество OCR post-correction по сравнению с identity baseline.</w:t>
-      </w:r>
-    </w:p>
-    <w:p>
-      <w:pPr>
-        <w:pStyle w:val="BodyText"/>
-      </w:pPr>
-      <w:r>
-        <w:t xml:space="preserve">Гипотеза 3. Увеличение длины последовательности с 256 до 512 важно для арабографичного текста, поскольку ByT5 работает на уровне байтов, а один видимый символ арабской графики может занимать несколько байтов.</w:t>
+        <w:t xml:space="preserve">Практическая значимость работы заключается в создании воспроизводимого пилотного пайплайна для обработки исторических арабографичных тюркских текстов. Разработанный подход может быть использован как основа для дальнейшего расширения корпуса, подключения реальных OCR/HTR-результатов и построения более крупного benchmark.</w:t>
+      </w:r>
+    </w:p>
+    <w:p>
+      <w:pPr>
+        <w:pStyle w:val="BodyText"/>
+      </w:pPr>
+      <w:r>
+        <w:t xml:space="preserve">Кроме того, результаты работы могут быть полезны для задач цифровой гуманитаристики: поиска по историческим текстам, подготовки корпусов, последующего извлечения именованных сущностей, анализа исторических документов и построения более сложных систем обработки архивных материалов.</w:t>
       </w:r>
     </w:p>
     <w:bookmarkEnd w:id="18"/>
-    <w:bookmarkStart w:id="19" w:name="практическая-значимость"/>
+    <w:bookmarkStart w:id="19" w:name="структура-работы"/>
     <w:p>
       <w:pPr>
         <w:pStyle w:val="Heading2"/>
       </w:pPr>
       <w:r>
-        <w:t xml:space="preserve">1.8 Практическая значимость</w:t>
+        <w:t xml:space="preserve">1.9 Структура работы</w:t>
       </w:r>
     </w:p>
     <w:p>
@@ -816,25 +813,26 @@
         <w:pStyle w:val="FirstParagraph"/>
       </w:pPr>
       <w:r>
-        <w:t xml:space="preserve">Практическая значимость работы заключается в создании воспроизводимого пилотного пайплайна для обработки исторических арабографичных тюркских текстов. Разработанный подход может быть использован как основа для дальнейшего расширения корпуса, подключения реальных OCR/HTR-результатов и построения более крупного benchmark.</w:t>
-      </w:r>
-    </w:p>
-    <w:p>
-      <w:pPr>
-        <w:pStyle w:val="BodyText"/>
-      </w:pPr>
-      <w:r>
-        <w:t xml:space="preserve">Кроме того, результаты работы могут быть полезны для задач цифровой гуманитаристики: поиска по историческим текстам, подготовки корпусов, последующего извлечения именованных сущностей, анализа исторических документов и построения более сложных систем обработки архивных материалов.</w:t>
+        <w:t xml:space="preserve">Работа состоит из нескольких частей. В первой части формулируются актуальность, проблема, цель и задачи исследования. Во второй части рассматриваются особенности OCR и посткоррекции для исторических документов и арабографичных текстов. В третьей части описываются корпус и процесс построения синтетического набора данных. В четвёртой части представлена методология экспериментов, включая baseline-подходы, train-derived character-confusion baseline и модель ByT5-small. В пятой части приводятся результаты и анализ ошибок. В заключении формулируются ограничения и направления дальнейшей работы.</w:t>
       </w:r>
     </w:p>
     <w:bookmarkEnd w:id="19"/>
-    <w:bookmarkStart w:id="20" w:name="структура-работы"/>
+    <w:bookmarkStart w:id="27" w:name="X0ceba565ddc4689162e5800a39ee266fa2dc29a"/>
     <w:p>
       <w:pPr>
         <w:pStyle w:val="Heading2"/>
       </w:pPr>
       <w:r>
-        <w:t xml:space="preserve">1.9 Структура работы</w:t>
+        <w:t xml:space="preserve">2. Обзор предметной области и связанных работ</w:t>
+      </w:r>
+    </w:p>
+    <w:bookmarkStart w:id="20" w:name="X679db47d81c99eb1d359e7ecbdd9091b3199270"/>
+    <w:p>
+      <w:pPr>
+        <w:pStyle w:val="Heading3"/>
+      </w:pPr>
+      <w:r>
+        <w:t xml:space="preserve">2.1 Автоматическое распознавание исторических документов</w:t>
       </w:r>
     </w:p>
     <w:p>
@@ -842,268 +840,241 @@
         <w:pStyle w:val="FirstParagraph"/>
       </w:pPr>
       <w:r>
-        <w:t xml:space="preserve">Работа состоит из нескольких частей. В первой части формулируются актуальность, проблема, цель и задачи исследования. Во второй части рассматриваются особенности OCR и посткоррекции для исторических документов и арабографичных текстов. В третьей части описываются корпус и процесс построения синтетического набора данных. В четвёртой части представлена методология экспериментов, включая baseline-подходы, train-derived character-confusion baseline и модель ByT5-small. В пятой части приводятся результаты и анализ ошибок. В заключении формулируются ограничения и направления дальнейшей работы.</w:t>
+        <w:t xml:space="preserve">OCR исторических документов отличается от распознавания современных печатных текстов не одной отдельной трудностью, а сочетанием факторов: нестабильной типографикой, повреждениями носителя, неоднородным качеством сканов, сложной вёрсткой и вариативной орфографией. В работах по историческому OCR workflow подчёркивается, что качество результата зависит не только от модели распознавания, но и от подготовки изображений, разметки, ground truth и последующей проверки текста (Reul et al., 2019; Springmann et al., 2018).</w:t>
+      </w:r>
+    </w:p>
+    <w:p>
+      <w:pPr>
+        <w:pStyle w:val="BodyText"/>
+      </w:pPr>
+      <w:r>
+        <w:t xml:space="preserve">Для печатных документов обычно используется термин OCR — optical character recognition. Для рукописных материалов чаще применяется термин HTR — handwritten text recognition. В обоих случаях задача не сводится к классификации отдельных символов: система должна учитывать строку, слово, контекст и особенности конкретной письменной традиции.</w:t>
+      </w:r>
+    </w:p>
+    <w:p>
+      <w:pPr>
+        <w:pStyle w:val="BodyText"/>
+      </w:pPr>
+      <w:r>
+        <w:t xml:space="preserve">В данной работе не строится OCR/HTR-система по изображениям. Исследуется следующий этап обработки — посткоррекция уже полученного текстового вывода. Такое ограничение делает постановку уже, но чище: можно отдельно проверить, насколько модель исправления ошибок способна восстанавливать арабографичный тюркский текст после OCR-подобных искажений.</w:t>
       </w:r>
     </w:p>
     <w:bookmarkEnd w:id="20"/>
-    <w:bookmarkStart w:id="28" w:name="X0ceba565ddc4689162e5800a39ee266fa2dc29a"/>
+    <w:bookmarkStart w:id="21" w:name="Xa02a7bb48ad7549a4f67e48911e7568815c5168"/>
+    <w:p>
+      <w:pPr>
+        <w:pStyle w:val="Heading3"/>
+      </w:pPr>
+      <w:r>
+        <w:t xml:space="preserve">2.2 Особенности арабографичных исторических текстов</w:t>
+      </w:r>
+    </w:p>
+    <w:p>
+      <w:pPr>
+        <w:pStyle w:val="FirstParagraph"/>
+      </w:pPr>
+      <w:r>
+        <w:t xml:space="preserve">Arabic-script OCR обычно рассматривается как отдельный класс задач: буквы меняют форму в зависимости от позиции в слове, письмо является связным, а различия между рядом символов задаются точками и небольшими графическими элементами. В обзорах по Arabic OCR эти свойства выделяются как одна из причин, по которым прямой перенос OCR-подходов с латинской графики оказывается недостаточным (Kasem et al., 2023). Для печатных и многошрифтовых арабографичных материалов дополнительно важны вариативность шрифтов, наложение элементов и близость начертаний (Osman et al., 2020).</w:t>
+      </w:r>
+    </w:p>
+    <w:p>
+      <w:pPr>
+        <w:pStyle w:val="BodyText"/>
+      </w:pPr>
+      <w:r>
+        <w:t xml:space="preserve">В исторических тюркских текстах арабская графика усложняется ещё сильнее: в одном материале могут сосуществовать арабские, персидские и тюркские орфографические практики. Для тюркских языков арабское письмо адаптировалось под звуки, которые не всегда имели прямые соответствия в классической арабской письменности. Поэтому один и тот же символ может быть одновременно технической единицей OCR и носителем историко-орфографической информации.</w:t>
+      </w:r>
+    </w:p>
+    <w:p>
+      <w:pPr>
+        <w:pStyle w:val="BodyText"/>
+      </w:pPr>
+      <w:r>
+        <w:t xml:space="preserve">Из этого следует важное ограничение: простая унификация символов не является заведомо безопасной предварительной процедурой. Она может убрать технический шум, но может и стереть значимые различия. Поэтому в данной работе rule-based normalizer рассматривается не как заведомо правильная предобработка, а как отдельный baseline, качество которого проверяется экспериментально.</w:t>
+      </w:r>
+    </w:p>
+    <w:bookmarkEnd w:id="21"/>
+    <w:bookmarkStart w:id="22" w:name="X69a43e90e5ebd7e3113e444e7e5f2f644869f5a"/>
+    <w:p>
+      <w:pPr>
+        <w:pStyle w:val="Heading3"/>
+      </w:pPr>
+      <w:r>
+        <w:t xml:space="preserve">2.3 Тюркские тексты в арабской графике как низкоресурсный материал</w:t>
+      </w:r>
+    </w:p>
+    <w:p>
+      <w:pPr>
+        <w:pStyle w:val="FirstParagraph"/>
+      </w:pPr>
+      <w:r>
+        <w:t xml:space="preserve">Тюркские языки в разные исторические периоды использовали разные письменности, включая арабскую графику. Для османско-тюркских материалов это особенно заметно: после перехода турецкого языка на латиницу значительная часть печатного наследия осталась в письменной форме, которая трудна для массового поиска и автоматической обработки. На эту проблему указывают работы по автоматической транскрипции османско-турецких периодических изданий и цифровизации non-Latin script archives (Kirmizialtin &amp; Wrisley, 2020).</w:t>
+      </w:r>
+    </w:p>
+    <w:p>
+      <w:pPr>
+        <w:pStyle w:val="BodyText"/>
+      </w:pPr>
+      <w:r>
+        <w:t xml:space="preserve">С точки зрения NLP такие материалы остаются низкоресурсными: для них меньше размеченных корпусов, стандартных бенчмарк-наборов, готовых моделей и инструментов, чем для современных массовых языков. Современные работы по Historical Turkish NLP отдельно подчёркивают необходимость создавать базовые ресурсы: корпуса, модели, разметку и инструменты для последующего анализа исторических текстов (Özateş et al., 2025).</w:t>
+      </w:r>
+    </w:p>
+    <w:p>
+      <w:pPr>
+        <w:pStyle w:val="BodyText"/>
+      </w:pPr>
+      <w:r>
+        <w:t xml:space="preserve">В данной работе эта проблема сужается до одного технически проверяемого шага: построения воспроизводимого бенчмарка посткоррекции. Даже небольшой корпус полезен, если он явно фиксирует источник данных, процедуру разбиения, тип ошибок, метрики и ограничения. Такой протокол можно расширять новыми источниками и использовать как часть более крупной системы обработки исторических арабографичных тюркских документов.</w:t>
+      </w:r>
+    </w:p>
+    <w:bookmarkEnd w:id="22"/>
+    <w:bookmarkStart w:id="23" w:name="посткоррекция-ocr-ошибок"/>
+    <w:p>
+      <w:pPr>
+        <w:pStyle w:val="Heading3"/>
+      </w:pPr>
+      <w:r>
+        <w:t xml:space="preserve">2.4 Посткоррекция OCR-ошибок</w:t>
+      </w:r>
+    </w:p>
+    <w:p>
+      <w:pPr>
+        <w:pStyle w:val="FirstParagraph"/>
+      </w:pPr>
+      <w:r>
+        <w:t xml:space="preserve">Посткоррекция OCR-ошибок — это задача преобразования ошибочного OCR-вывода в более корректный текст. На уровне строки она естественно формулируется как sequence-to-sequence задача: модель получает зашумлённый текст и должна восстановить чистый текст. Такой подход используется в работах по post-OCR correction, включая character-level и neural sequence-to-sequence модели (Ramirez-Orta et al., 2021; Hämäläinen &amp; Hengchen, 2019).</w:t>
+      </w:r>
+    </w:p>
+    <w:p>
+      <w:pPr>
+        <w:pStyle w:val="BodyText"/>
+      </w:pPr>
+      <w:r>
+        <w:t xml:space="preserve">Ошибки OCR обычно включают замены похожих символов, удаления и вставки, неправильное разбиение на слова, искажение окончаний и локальные перестановки. Для исторических текстов к этому добавляются нестабильная орфография и несовпадение современных языковых норм с историческим написанием. Поэтому посткоррекция пересекается не только с исправлением OCR-шума, но и с задачей нормализации написаний; в литературе эти две задачи иногда рассматриваются совместно, но их нельзя полностью отождествлять (Duong et al., 2020).</w:t>
+      </w:r>
+    </w:p>
+    <w:p>
+      <w:pPr>
+        <w:pStyle w:val="BodyText"/>
+      </w:pPr>
+      <w:r>
+        <w:t xml:space="preserve">Для исторических арабографичных тюркских текстов посткоррекция важна как промежуточный слой между распознаванием и дальнейшим анализом. Даже частично ошибочный OCR-вывод после исправления становится полезнее для поиска, индексации, извлечения именованных сущностей, анализа топонимов, сопоставления записей и построения исторических баз данных. Поэтому в данной работе post-correction рассматривается не как косметическая правка текста, а как отдельный компонент будущего pipeline для обработки архивных материалов.</w:t>
+      </w:r>
+    </w:p>
+    <w:bookmarkEnd w:id="23"/>
+    <w:bookmarkStart w:id="24" w:name="синтетические-ocr-ошибки"/>
+    <w:p>
+      <w:pPr>
+        <w:pStyle w:val="Heading3"/>
+      </w:pPr>
+      <w:r>
+        <w:t xml:space="preserve">2.5 Синтетические OCR-ошибки</w:t>
+      </w:r>
+    </w:p>
+    <w:p>
+      <w:pPr>
+        <w:pStyle w:val="FirstParagraph"/>
+      </w:pPr>
+      <w:r>
+        <w:t xml:space="preserve">В идеальном случае модель посткоррекции обучается на парах реального OCR/HTR-вывода и вручную проверенного правильного текста. Для низкоресурсных исторических материалов такие пары часто отсутствуют или существуют в малом объёме. Поэтому в пилотных экспериментах используется синтетический шум: чистый текст намеренно искажается контролируемым генератором ошибок. Близкий подход применяется в работах по OCR error correction для исторических текстов, где искусственно подготовленные или task-specific данные помогают обучать модель при дефиците размеченных примеров (Suissa et al., 2023).</w:t>
+      </w:r>
+    </w:p>
+    <w:p>
+      <w:pPr>
+        <w:pStyle w:val="BodyText"/>
+      </w:pPr>
+      <w:r>
+        <w:t xml:space="preserve">Преимущество синтетической постановки состоит в контроле: известен исходный чистый текст, типы искажений, процедура генерации, random seed и разбиение на train/valid/test. Это позволяет проверить не всю OCR-систему целиком, а более узкий вопрос: способна ли модель post-correction восстанавливать арабографичный тюркский текст после OCR-подобных ошибок.</w:t>
+      </w:r>
+    </w:p>
+    <w:p>
+      <w:pPr>
+        <w:pStyle w:val="BodyText"/>
+      </w:pPr>
+      <w:r>
+        <w:t xml:space="preserve">Такой эксперимент нельзя считать заменой проверки на реальных OCR/HTR-выходах. Реальные ошибки зависят от качества изображения, шрифта, сегментации, модели распознавания и состояния документа. Поэтому результаты на синтетическом датасете в данной работе интерпретируются как пилотная проверка pipeline, а не как итоговая оценка качества на архивных сканах.</w:t>
+      </w:r>
+    </w:p>
+    <w:bookmarkEnd w:id="24"/>
+    <w:bookmarkStart w:id="25" w:name="byte-level-модели-и-byt5"/>
+    <w:p>
+      <w:pPr>
+        <w:pStyle w:val="Heading3"/>
+      </w:pPr>
+      <w:r>
+        <w:t xml:space="preserve">2.6 Byte-level модели и ByT5</w:t>
+      </w:r>
+    </w:p>
+    <w:p>
+      <w:pPr>
+        <w:pStyle w:val="FirstParagraph"/>
+      </w:pPr>
+      <w:r>
+        <w:t xml:space="preserve">Нейросетевые модели post-correction обычно опираются на sequence-to-sequence постановку: входная последовательность с ошибками преобразуется в целевую последовательность без ошибок. Современная основа таких моделей связана с Transformer-архитектурой (Vaswani et al., 2017) и text-to-text подходом, в котором разные задачи формулируются как преобразование текста в текст (Raffel et al., 2019).</w:t>
+      </w:r>
+    </w:p>
+    <w:p>
+      <w:pPr>
+        <w:pStyle w:val="BodyText"/>
+      </w:pPr>
+      <w:r>
+        <w:t xml:space="preserve">В данной работе используется ByT5-small. ByT5 относится к byte-level sequence-to-sequence моделям: она работает на уровне байтов, а не заранее заданных слов или подслов (Xue et al., 2021). Это важно для низкоресурсного исторического материала, где обычный subword-токенизатор может плохо представлять редкие графемы, нестандартные написания, смешение письменных традиций и OCR-шум.</w:t>
+      </w:r>
+    </w:p>
+    <w:p>
+      <w:pPr>
+        <w:pStyle w:val="BodyText"/>
+      </w:pPr>
+      <w:r>
+        <w:t xml:space="preserve">Byte-level представление имеет практическое следствие: длина последовательности в токенах не равна длине строки в видимых символах. Один символ арабской графики может занимать несколько байтов. Поэтому слишком короткое ограничение длины может обрезать часть контекста. В данной работе финальной конфигурацией выбрана длина 512; результаты показывают, что для арабографичных строк этот параметр является важным и должен явно контролироваться в эксперименте.</w:t>
+      </w:r>
+    </w:p>
+    <w:bookmarkEnd w:id="25"/>
+    <w:bookmarkStart w:id="26" w:name="выводы-по-обзору"/>
+    <w:p>
+      <w:pPr>
+        <w:pStyle w:val="Heading3"/>
+      </w:pPr>
+      <w:r>
+        <w:t xml:space="preserve">2.7 Выводы по обзору</w:t>
+      </w:r>
+    </w:p>
+    <w:p>
+      <w:pPr>
+        <w:pStyle w:val="FirstParagraph"/>
+      </w:pPr>
+      <w:r>
+        <w:t xml:space="preserve">Обзор показывает, что задача не сводится к обычному применению готовой OCR-системы. Исторический OCR зависит от качества источника, ground truth и workflow; арабская графика добавляет позиционные формы, связное письмо и близкие начертания; тюркский исторический материал остаётся низкоресурсным и плохо покрытым готовыми NLP-инструментами.</w:t>
+      </w:r>
+    </w:p>
+    <w:p>
+      <w:pPr>
+        <w:pStyle w:val="BodyText"/>
+      </w:pPr>
+      <w:r>
+        <w:t xml:space="preserve">Поэтому в данной работе выбрана узкая, но проверяемая постановка: не полный OCR/HTR по изображениям, а post-correction уже полученного текстового вывода. Такой выбор позволяет построить воспроизводимый benchmark, сравнить identity baseline, rule-based normalizer, train-derived character-confusion baseline и ByT5-small, а затем оценить результат по CER, WER и анализу ошибок.</w:t>
+      </w:r>
+    </w:p>
+    <w:p>
+      <w:pPr>
+        <w:pStyle w:val="BodyText"/>
+      </w:pPr>
+      <w:r>
+        <w:t xml:space="preserve">Синтетический шум в этой постановке используется как пилотный инструмент, а не как замена реальному OCR/HTR. Полученный экспериментальный контур можно расширять: добавлять новые источники, реальные OCR-выходы, ручную валидацию, дополнительные модели и последующие задачи анализа исторических текстов.</w:t>
+      </w:r>
+    </w:p>
+    <w:bookmarkEnd w:id="26"/>
+    <w:bookmarkEnd w:id="27"/>
+    <w:bookmarkStart w:id="41" w:name="данные-и-построение-корпуса"/>
     <w:p>
       <w:pPr>
         <w:pStyle w:val="Heading2"/>
       </w:pPr>
       <w:r>
-        <w:t xml:space="preserve">2. Обзор предметной области и связанных работ</w:t>
-      </w:r>
-    </w:p>
-    <w:bookmarkStart w:id="21" w:name="X679db47d81c99eb1d359e7ecbdd9091b3199270"/>
-    <w:p>
-      <w:pPr>
-        <w:pStyle w:val="Heading3"/>
-      </w:pPr>
-      <w:r>
-        <w:t xml:space="preserve">2.1 Автоматическое распознавание исторических документов</w:t>
-      </w:r>
-    </w:p>
-    <w:p>
-      <w:pPr>
-        <w:pStyle w:val="FirstParagraph"/>
-      </w:pPr>
-      <w:r>
-        <w:t xml:space="preserve">OCR исторических документов отличается от распознавания современных печатных текстов не одной отдельной трудностью, а сочетанием факторов: нестабильной типографикой, повреждениями носителя, неоднородным качеством сканов, сложной вёрсткой и вариативной орфографией. В работах по историческому OCR workflow подчёркивается, что качество результата зависит не только от модели распознавания, но и от подготовки изображений, разметки, ground truth и последующей проверки текста (Reul et al., 2019; Springmann et al., 2018).</w:t>
-      </w:r>
-    </w:p>
-    <w:p>
-      <w:pPr>
-        <w:pStyle w:val="BodyText"/>
-      </w:pPr>
-      <w:r>
-        <w:t xml:space="preserve">Для печатных документов обычно используется термин OCR — optical character recognition. Для рукописных материалов чаще применяется термин HTR — handwritten text recognition. В обоих случаях задача не сводится к классификации отдельных символов: система должна учитывать строку, слово, контекст и особенности конкретной письменной традиции.</w:t>
-      </w:r>
-    </w:p>
-    <w:p>
-      <w:pPr>
-        <w:pStyle w:val="BodyText"/>
-      </w:pPr>
-      <w:r>
-        <w:t xml:space="preserve">В данной работе не строится OCR/HTR-система по изображениям. Исследуется следующий этап обработки — посткоррекция уже полученного текстового вывода. Такое ограничение делает постановку уже, но чище: можно отдельно проверить, насколько модель исправления ошибок способна восстанавливать арабографичный тюркский текст после OCR-подобных искажений.</w:t>
-      </w:r>
-    </w:p>
-    <w:bookmarkEnd w:id="21"/>
-    <w:bookmarkStart w:id="22" w:name="Xa02a7bb48ad7549a4f67e48911e7568815c5168"/>
-    <w:p>
-      <w:pPr>
-        <w:pStyle w:val="Heading3"/>
-      </w:pPr>
-      <w:r>
-        <w:t xml:space="preserve">2.2 Особенности арабографичных исторических текстов</w:t>
-      </w:r>
-    </w:p>
-    <w:p>
-      <w:pPr>
-        <w:pStyle w:val="FirstParagraph"/>
-      </w:pPr>
-      <w:r>
-        <w:t xml:space="preserve">Arabic-script OCR обычно рассматривается как отдельный класс задач: буквы меняют форму в зависимости от позиции в слове, письмо является связным, а различия между рядом символов задаются точками и небольшими графическими элементами. В обзорах по Arabic OCR эти свойства выделяются как одна из причин, по которым прямой перенос OCR-подходов с латинской графики оказывается недостаточным (Kasem et al., 2023). Для печатных и многошрифтовых арабографичных материалов дополнительно важны вариативность шрифтов, наложение элементов и близость начертаний (Osman et al., 2020).</w:t>
-      </w:r>
-    </w:p>
-    <w:p>
-      <w:pPr>
-        <w:pStyle w:val="BodyText"/>
-      </w:pPr>
-      <w:r>
-        <w:t xml:space="preserve">В исторических тюркских текстах арабская графика усложняется ещё сильнее: в одном материале могут сосуществовать арабские, персидские и тюркские орфографические практики. Для тюркских языков арабское письмо адаптировалось под звуки, которые не всегда имели прямые соответствия в классической арабской письменности. Поэтому один и тот же символ может быть одновременно технической единицей OCR и носителем историко-орфографической информации.</w:t>
-      </w:r>
-    </w:p>
-    <w:p>
-      <w:pPr>
-        <w:pStyle w:val="BodyText"/>
-      </w:pPr>
-      <w:r>
-        <w:t xml:space="preserve">Из этого следует важное ограничение: простая унификация символов не является заведомо безопасной предварительной процедурой. Она может убрать технический шум, но может и стереть значимые различия. Поэтому в данной работе rule-based normalizer рассматривается не как заведомо правильная предобработка, а как отдельный baseline, качество которого проверяется экспериментально.</w:t>
-      </w:r>
-    </w:p>
-    <w:bookmarkEnd w:id="22"/>
-    <w:bookmarkStart w:id="23" w:name="X69a43e90e5ebd7e3113e444e7e5f2f644869f5a"/>
-    <w:p>
-      <w:pPr>
-        <w:pStyle w:val="Heading3"/>
-      </w:pPr>
-      <w:r>
-        <w:t xml:space="preserve">2.3 Тюркские тексты в арабской графике как низкоресурсный материал</w:t>
-      </w:r>
-    </w:p>
-    <w:p>
-      <w:pPr>
-        <w:pStyle w:val="FirstParagraph"/>
-      </w:pPr>
-      <w:r>
-        <w:t xml:space="preserve">Тюркские языки в разные исторические периоды использовали разные письменности, включая арабскую графику. Для османско-тюркских материалов это особенно заметно: после перехода турецкого языка на латиницу значительная часть печатного наследия осталась в письменной форме, которая трудна для массового поиска и автоматической обработки. На эту проблему указывают работы по автоматической транскрипции османско-турецких периодических изданий и цифровизации non-Latin script archives (Kirmizialtin &amp; Wrisley, 2020).</w:t>
-      </w:r>
-    </w:p>
-    <w:p>
-      <w:pPr>
-        <w:pStyle w:val="BodyText"/>
-      </w:pPr>
-      <w:r>
-        <w:t xml:space="preserve">С точки зрения NLP такие материалы остаются низкоресурсными: для них меньше размеченных корпусов, стандартных бенчмарк-наборов, готовых моделей и инструментов, чем для современных массовых языков. Современные работы по Historical Turkish NLP отдельно подчёркивают необходимость создавать базовые ресурсы: корпуса, модели, разметку и инструменты для последующего анализа исторических текстов (Özateş et al., 2025).</w:t>
-      </w:r>
-    </w:p>
-    <w:p>
-      <w:pPr>
-        <w:pStyle w:val="BodyText"/>
-      </w:pPr>
-      <w:r>
-        <w:t xml:space="preserve">В данной работе эта проблема сужается до одного технически проверяемого шага: построения воспроизводимого бенчмарка посткоррекции. Даже небольшой корпус полезен, если он явно фиксирует источник данных, процедуру разбиения, тип ошибок, метрики и ограничения. Такой протокол можно расширять новыми источниками и использовать как часть более крупной системы обработки исторических арабографичных тюркских документов.</w:t>
-      </w:r>
-    </w:p>
-    <w:bookmarkEnd w:id="23"/>
-    <w:bookmarkStart w:id="24" w:name="посткоррекция-ocr-ошибок"/>
-    <w:p>
-      <w:pPr>
-        <w:pStyle w:val="Heading3"/>
-      </w:pPr>
-      <w:r>
-        <w:t xml:space="preserve">2.4 Посткоррекция OCR-ошибок</w:t>
-      </w:r>
-    </w:p>
-    <w:p>
-      <w:pPr>
-        <w:pStyle w:val="FirstParagraph"/>
-      </w:pPr>
-      <w:r>
-        <w:t xml:space="preserve">Посткоррекция OCR-ошибок — это задача преобразования ошибочного OCR-вывода в более корректный текст. На уровне строки она естественно формулируется как sequence-to-sequence задача: модель получает зашумлённый текст и должна восстановить чистый текст. Такой подход используется в работах по post-OCR correction, включая character-level и neural sequence-to-sequence модели (Ramirez-Orta et al., 2021; Hämäläinen &amp; Hengchen, 2019).</w:t>
-      </w:r>
-    </w:p>
-    <w:p>
-      <w:pPr>
-        <w:pStyle w:val="BodyText"/>
-      </w:pPr>
-      <w:r>
-        <w:t xml:space="preserve">Ошибки OCR обычно включают замены похожих символов, удаления и вставки, неправильное разбиение на слова, искажение окончаний и локальные перестановки. Для исторических текстов к этому добавляются нестабильная орфография и несовпадение современных языковых норм с историческим написанием. Поэтому посткоррекция пересекается не только с исправлением OCR-шума, но и с задачей нормализации написаний; в литературе эти две задачи иногда рассматриваются совместно, но их нельзя полностью отождествлять (Duong et al., 2020).</w:t>
-      </w:r>
-    </w:p>
-    <w:p>
-      <w:pPr>
-        <w:pStyle w:val="BodyText"/>
-      </w:pPr>
-      <w:r>
-        <w:t xml:space="preserve">Для исторических арабографичных тюркских текстов посткоррекция важна как промежуточный слой между распознаванием и дальнейшим анализом. Даже частично ошибочный OCR-вывод после исправления становится полезнее для поиска, индексации, извлечения именованных сущностей, анализа топонимов, сопоставления записей и построения исторических баз данных. Поэтому в данной работе post-correction рассматривается не как косметическая правка текста, а как отдельный компонент будущего pipeline для обработки архивных материалов.</w:t>
-      </w:r>
-    </w:p>
-    <w:bookmarkEnd w:id="24"/>
-    <w:bookmarkStart w:id="25" w:name="синтетические-ocr-ошибки"/>
-    <w:p>
-      <w:pPr>
-        <w:pStyle w:val="Heading3"/>
-      </w:pPr>
-      <w:r>
-        <w:t xml:space="preserve">2.5 Синтетические OCR-ошибки</w:t>
-      </w:r>
-    </w:p>
-    <w:p>
-      <w:pPr>
-        <w:pStyle w:val="FirstParagraph"/>
-      </w:pPr>
-      <w:r>
-        <w:t xml:space="preserve">В идеальном случае модель посткоррекции обучается на парах реального OCR/HTR-вывода и вручную проверенного правильного текста. Для низкоресурсных исторических материалов такие пары часто отсутствуют или существуют в малом объёме. Поэтому в пилотных экспериментах используется синтетический шум: чистый текст намеренно искажается контролируемым генератором ошибок. Близкий подход применяется в работах по OCR error correction для исторических текстов, где искусственно подготовленные или task-specific данные помогают обучать модель при дефиците размеченных примеров (Suissa et al., 2023).</w:t>
-      </w:r>
-    </w:p>
-    <w:p>
-      <w:pPr>
-        <w:pStyle w:val="BodyText"/>
-      </w:pPr>
-      <w:r>
-        <w:t xml:space="preserve">Преимущество синтетической постановки состоит в контроле: известен исходный чистый текст, типы искажений, процедура генерации, random seed и разбиение на train/valid/test. Это позволяет проверить не всю OCR-систему целиком, а более узкий вопрос: способна ли модель post-correction восстанавливать арабографичный тюркский текст после OCR-подобных ошибок.</w:t>
-      </w:r>
-    </w:p>
-    <w:p>
-      <w:pPr>
-        <w:pStyle w:val="BodyText"/>
-      </w:pPr>
-      <w:r>
-        <w:t xml:space="preserve">Такой эксперимент нельзя считать заменой проверки на реальных OCR/HTR-выходах. Реальные ошибки зависят от качества изображения, шрифта, сегментации, модели распознавания и состояния документа. Поэтому результаты на синтетическом датасете в данной работе интерпретируются как пилотная проверка pipeline, а не как итоговая оценка качества на архивных сканах.</w:t>
-      </w:r>
-    </w:p>
-    <w:bookmarkEnd w:id="25"/>
-    <w:bookmarkStart w:id="26" w:name="byte-level-модели-и-byt5"/>
-    <w:p>
-      <w:pPr>
-        <w:pStyle w:val="Heading3"/>
-      </w:pPr>
-      <w:r>
-        <w:t xml:space="preserve">2.6 Byte-level модели и ByT5</w:t>
-      </w:r>
-    </w:p>
-    <w:p>
-      <w:pPr>
-        <w:pStyle w:val="FirstParagraph"/>
-      </w:pPr>
-      <w:r>
-        <w:t xml:space="preserve">Нейросетевые модели post-correction обычно опираются на sequence-to-sequence постановку: входная последовательность с ошибками преобразуется в целевую последовательность без ошибок. Современная основа таких моделей связана с Transformer-архитектурой (Vaswani et al., 2017) и text-to-text подходом, в котором разные задачи формулируются как преобразование текста в текст (Raffel et al., 2019).</w:t>
-      </w:r>
-    </w:p>
-    <w:p>
-      <w:pPr>
-        <w:pStyle w:val="BodyText"/>
-      </w:pPr>
-      <w:r>
-        <w:t xml:space="preserve">В данной работе используется ByT5-small. ByT5 относится к byte-level sequence-to-sequence моделям: она работает на уровне байтов, а не заранее заданных слов или подслов (Xue et al., 2021). Это важно для низкоресурсного исторического материала, где обычный subword-токенизатор может плохо представлять редкие графемы, нестандартные написания, смешение письменных традиций и OCR-шум.</w:t>
-      </w:r>
-    </w:p>
-    <w:p>
-      <w:pPr>
-        <w:pStyle w:val="BodyText"/>
-      </w:pPr>
-      <w:r>
-        <w:t xml:space="preserve">Byte-level представление имеет практическое следствие: длина последовательности в токенах не равна длине строки в видимых символах. Один символ арабской графики может занимать несколько байтов. Поэтому слишком короткое ограничение длины может обрезать часть контекста. В данной работе финальной конфигурацией выбрана длина 512; результаты показывают, что для арабографичных строк этот параметр является важным и должен явно контролироваться в эксперименте.</w:t>
-      </w:r>
-    </w:p>
-    <w:bookmarkEnd w:id="26"/>
-    <w:bookmarkStart w:id="27" w:name="выводы-по-обзору"/>
-    <w:p>
-      <w:pPr>
-        <w:pStyle w:val="Heading3"/>
-      </w:pPr>
-      <w:r>
-        <w:t xml:space="preserve">2.7 Выводы по обзору</w:t>
-      </w:r>
-    </w:p>
-    <w:p>
-      <w:pPr>
-        <w:pStyle w:val="FirstParagraph"/>
-      </w:pPr>
-      <w:r>
-        <w:t xml:space="preserve">Обзор показывает, что задача не сводится к обычному применению готовой OCR-системы. Исторический OCR зависит от качества источника, ground truth и workflow; арабская графика добавляет позиционные формы, связное письмо и близкие начертания; тюркский исторический материал остаётся низкоресурсным и плохо покрытым готовыми NLP-инструментами.</w:t>
-      </w:r>
-    </w:p>
-    <w:p>
-      <w:pPr>
-        <w:pStyle w:val="BodyText"/>
-      </w:pPr>
-      <w:r>
-        <w:t xml:space="preserve">Поэтому в данной работе выбрана узкая, но проверяемая постановка: не полный OCR/HTR по изображениям, а post-correction уже полученного текстового вывода. Такой выбор позволяет построить воспроизводимый benchmark, сравнить identity baseline, rule-based normalizer, train-derived character-confusion baseline и ByT5-small, а затем оценить результат по CER, WER и анализу ошибок.</w:t>
-      </w:r>
-    </w:p>
-    <w:p>
-      <w:pPr>
-        <w:pStyle w:val="BodyText"/>
-      </w:pPr>
-      <w:r>
-        <w:t xml:space="preserve">Синтетический шум в этой постановке используется как пилотный инструмент, а не как замена реальному OCR/HTR. Полученный экспериментальный контур можно расширять: добавлять новые источники, реальные OCR-выходы, ручную валидацию, дополнительные модели и последующие задачи анализа исторических текстов.</w:t>
-      </w:r>
-    </w:p>
-    <w:bookmarkEnd w:id="27"/>
-    <w:bookmarkEnd w:id="28"/>
-    <w:bookmarkStart w:id="42" w:name="данные-и-построение-корпуса"/>
-    <w:p>
-      <w:pPr>
-        <w:pStyle w:val="Heading2"/>
-      </w:pPr>
-      <w:r>
         <w:t xml:space="preserve">3. Данные и построение корпуса</w:t>
       </w:r>
     </w:p>
-    <w:bookmarkStart w:id="29" w:name="общая-постановка"/>
+    <w:bookmarkStart w:id="28" w:name="общая-постановка"/>
     <w:p>
       <w:pPr>
         <w:pStyle w:val="Heading3"/>
@@ -1148,8 +1119,8 @@
         <w:t xml:space="preserve">Важно, что эта постановка сознательно отделяет задачу посткоррекции от задачи распознавания изображения. В эксперименте не оценивается качество сегментации страниц или OCR/HTR-модели; оценивается только способность метода исправлять уже полученный текстовый вывод.</w:t>
       </w:r>
     </w:p>
-    <w:bookmarkEnd w:id="29"/>
-    <w:bookmarkStart w:id="30" w:name="источник-данных"/>
+    <w:bookmarkEnd w:id="28"/>
+    <w:bookmarkStart w:id="29" w:name="источник-данных"/>
     <w:p>
       <w:pPr>
         <w:pStyle w:val="Heading3"/>
@@ -1266,8 +1237,8 @@
         <w:t xml:space="preserve">. Поэтому текущий корпус лучше соответствует теме курсовой, чем более ранний технический прототип на персидском или общеарабографичном материале.</w:t>
       </w:r>
     </w:p>
-    <w:bookmarkEnd w:id="30"/>
-    <w:bookmarkStart w:id="31" w:name="сбор-и-предварительная-подготовка"/>
+    <w:bookmarkEnd w:id="29"/>
+    <w:bookmarkStart w:id="30" w:name="сбор-и-предварительная-подготовка"/>
     <w:p>
       <w:pPr>
         <w:pStyle w:val="Heading3"/>
@@ -1312,8 +1283,8 @@
         <w:t xml:space="preserve">Поэтому нормализация вынесена в отдельный baseline. Корпус хранится в максимально щадящем виде, а rule-based normalizer оценивается экспериментально наравне с identity baseline и нейросетевой моделью.</w:t>
       </w:r>
     </w:p>
-    <w:bookmarkEnd w:id="31"/>
-    <w:bookmarkStart w:id="32" w:name="синтетические-ocr-подобные-искажения"/>
+    <w:bookmarkEnd w:id="30"/>
+    <w:bookmarkStart w:id="31" w:name="синтетические-ocr-подобные-искажения"/>
     <w:p>
       <w:pPr>
         <w:pStyle w:val="Heading3"/>
@@ -1382,8 +1353,8 @@
         <w:t xml:space="preserve">.</w:t>
       </w:r>
     </w:p>
-    <w:bookmarkEnd w:id="32"/>
-    <w:bookmarkStart w:id="33" w:name="типы-синтетических-искажений"/>
+    <w:bookmarkEnd w:id="31"/>
+    <w:bookmarkStart w:id="32" w:name="типы-синтетических-искажений"/>
     <w:p>
       <w:pPr>
         <w:pStyle w:val="Heading3"/>
@@ -1646,8 +1617,8 @@
         <w:t xml:space="preserve">Особенно важно, что ошибки пробелов влияют на WER сильнее, чем на CER. Поэтому заметное снижение WER у модели не следует автоматически трактовать как доказательство такого же качества на реальном OCR. В текущей постановке это прежде всего показывает способность модели исправлять controlled word-boundary distortions в синтетическом benchmark.</w:t>
       </w:r>
     </w:p>
-    <w:bookmarkEnd w:id="33"/>
-    <w:bookmarkStart w:id="34" w:name="Xe2e6ef423b4b11ea7446063a790a29ab69053e4"/>
+    <w:bookmarkEnd w:id="32"/>
+    <w:bookmarkStart w:id="33" w:name="Xe2e6ef423b4b11ea7446063a790a29ab69053e4"/>
     <w:p>
       <w:pPr>
         <w:pStyle w:val="Heading3"/>
@@ -1886,8 +1857,8 @@
         <w:t xml:space="preserve">Эти значения показывают, что шум не является только набором замен символов: почти половина noisy-строк короче clean-строк, примерно треть длиннее, а среднее изменение числа слов положительно. Это согласуется с наличием вставок, удалений и ошибок пробелов. Одновременно такая статистика подчёркивает ограничение эксперимента: генератор задаёт искусственное распределение ошибок, которое может отличаться от реальных OCR/HTR-выходов.</w:t>
       </w:r>
     </w:p>
-    <w:bookmarkEnd w:id="34"/>
-    <w:bookmarkStart w:id="35" w:name="примеры-synthetic-noisy-clean-пар"/>
+    <w:bookmarkEnd w:id="33"/>
+    <w:bookmarkStart w:id="34" w:name="примеры-synthetic-noisy-clean-пар"/>
     <w:p>
       <w:pPr>
         <w:pStyle w:val="Heading3"/>
@@ -2180,34 +2151,34 @@
         <w:t xml:space="preserve">. Важно, что эти примеры выглядят как OCR-подобные text-level искажения, но не доказывают соответствие реальному OCR. Для внешней валидности нужен отдельный real-OCR/HTR subset с ручной проверкой clean reference.</w:t>
       </w:r>
     </w:p>
+    <w:bookmarkEnd w:id="34"/>
+    <w:bookmarkStart w:id="35" w:name="X7e06f5a39b62b44484932cacc3041bc92985dff"/>
+    <w:p>
+      <w:pPr>
+        <w:pStyle w:val="Heading3"/>
+      </w:pPr>
+      <w:r>
+        <w:t xml:space="preserve">3.4.4 Ограничения релевантности synthetic noise</w:t>
+      </w:r>
+    </w:p>
+    <w:p>
+      <w:pPr>
+        <w:pStyle w:val="FirstParagraph"/>
+      </w:pPr>
+      <w:r>
+        <w:t xml:space="preserve">Главное ограничение синтетической постановки состоит в том, что генератор шума не основан на эмпирической матрице ошибок конкретной OCR/HTR-системы. Он моделирует правдоподобные классы text-level искажений, но не воспроизводит реальные page-level и image-level факторы: качество скана, шрифт, лигатуры, layout, line segmentation, смешение колонок, повреждения страницы и ошибки порядка чтения.</w:t>
+      </w:r>
+    </w:p>
+    <w:p>
+      <w:pPr>
+        <w:pStyle w:val="BodyText"/>
+      </w:pPr>
+      <w:r>
+        <w:t xml:space="preserve">Поэтому результаты на synthetic benchmark следует интерпретировать как controlled pilot study. Они показывают, что pipeline воспроизводим, baseline-и сравнимы, а ByT5-small способен улучшать строки при заданном распределении шума. Однако synthetic improvement не является доказательством практической эффективности на реальных архивных сканах. Следующий обязательный этап — real-OCR/HTR sanity check на небольшом наборе строк с ручным эталоном.</w:t>
+      </w:r>
+    </w:p>
     <w:bookmarkEnd w:id="35"/>
-    <w:bookmarkStart w:id="36" w:name="X7e06f5a39b62b44484932cacc3041bc92985dff"/>
-    <w:p>
-      <w:pPr>
-        <w:pStyle w:val="Heading3"/>
-      </w:pPr>
-      <w:r>
-        <w:t xml:space="preserve">3.4.4 Ограничения релевантности synthetic noise</w:t>
-      </w:r>
-    </w:p>
-    <w:p>
-      <w:pPr>
-        <w:pStyle w:val="FirstParagraph"/>
-      </w:pPr>
-      <w:r>
-        <w:t xml:space="preserve">Главное ограничение синтетической постановки состоит в том, что генератор шума не основан на эмпирической матрице ошибок конкретной OCR/HTR-системы. Он моделирует правдоподобные классы text-level искажений, но не воспроизводит реальные page-level и image-level факторы: качество скана, шрифт, лигатуры, layout, line segmentation, смешение колонок, повреждения страницы и ошибки порядка чтения.</w:t>
-      </w:r>
-    </w:p>
-    <w:p>
-      <w:pPr>
-        <w:pStyle w:val="BodyText"/>
-      </w:pPr>
-      <w:r>
-        <w:t xml:space="preserve">Поэтому результаты на synthetic benchmark следует интерпретировать как controlled pilot study. Они показывают, что pipeline воспроизводим, baseline-и сравнимы, а ByT5-small способен улучшать строки при заданном распределении шума. Однако synthetic improvement не является доказательством практической эффективности на реальных архивных сканах. Следующий обязательный этап — real-OCR/HTR sanity check на небольшом наборе строк с ручным эталоном.</w:t>
-      </w:r>
-    </w:p>
-    <w:bookmarkEnd w:id="36"/>
-    <w:bookmarkStart w:id="37" w:name="структура-датасета"/>
+    <w:bookmarkStart w:id="36" w:name="структура-датасета"/>
     <w:p>
       <w:pPr>
         <w:pStyle w:val="Heading3"/>
@@ -2411,8 +2382,8 @@
         <w:t xml:space="preserve">.</w:t>
       </w:r>
     </w:p>
-    <w:bookmarkEnd w:id="37"/>
-    <w:bookmarkStart w:id="38" w:name="разбиение-на-train-valid-и-test"/>
+    <w:bookmarkEnd w:id="36"/>
+    <w:bookmarkStart w:id="37" w:name="разбиение-на-train-valid-и-test"/>
     <w:p>
       <w:pPr>
         <w:pStyle w:val="Heading3"/>
@@ -2608,8 +2579,8 @@
         <w:t xml:space="preserve">Такой размер достаточен для пилотной проверки pipeline посткоррекции: он мал для финального бенчмарка, но позволяет сравнить baseline-подходы и нейросетевую модель в воспроизводимых условиях.</w:t>
       </w:r>
     </w:p>
-    <w:bookmarkEnd w:id="38"/>
-    <w:bookmarkStart w:id="39" w:name="контроль-утечки-данных"/>
+    <w:bookmarkEnd w:id="37"/>
+    <w:bookmarkStart w:id="38" w:name="контроль-утечки-данных"/>
     <w:p>
       <w:pPr>
         <w:pStyle w:val="Heading3"/>
@@ -2764,14 +2735,64 @@
         <w:t xml:space="preserve">Таким образом, тестовая выборка не содержит исходных строк, которые встречались в обучении или валидации. Это делает оценку более строгой: модель проверяется на новых исходных строках, а не на новых зашумлённых вариациях уже знакомых строк.</w:t>
       </w:r>
     </w:p>
+    <w:bookmarkEnd w:id="38"/>
+    <w:bookmarkStart w:id="39" w:name="ограничения-корпуса"/>
+    <w:p>
+      <w:pPr>
+        <w:pStyle w:val="Heading3"/>
+      </w:pPr>
+      <w:r>
+        <w:t xml:space="preserve">3.8 Ограничения корпуса</w:t>
+      </w:r>
+    </w:p>
+    <w:p>
+      <w:pPr>
+        <w:pStyle w:val="FirstParagraph"/>
+      </w:pPr>
+      <w:r>
+        <w:t xml:space="preserve">Построенный корпус следует рассматривать как пилотный. Его ограничения влияют не на воспроизводимость эксперимента, а на масштаб выводов, которые можно делать по результатам.</w:t>
+      </w:r>
+    </w:p>
+    <w:p>
+      <w:pPr>
+        <w:pStyle w:val="BodyText"/>
+      </w:pPr>
+      <w:r>
+        <w:t xml:space="preserve">Первое ограничение — объём: используется 400 чистых текстовых блоков. Этого достаточно, чтобы проверить pipeline, сравнить baseline-подходы и провести первый нейросетевой эксперимент. Однако такого объёма недостаточно, чтобы утверждать устойчивость метода на всём классе исторических арабографичных тюркских текстов.</w:t>
+      </w:r>
+    </w:p>
+    <w:p>
+      <w:pPr>
+        <w:pStyle w:val="BodyText"/>
+      </w:pPr>
+      <w:r>
+        <w:t xml:space="preserve">Второе ограничение — один основной источник. Это снижает жанровое, временное и орфографическое разнообразие корпуса. Результаты показывают поведение модели на выбранном материале, но не доказывают переносимость на старотатарские, башкирские, крымскотатарские или другие арабографичные тюркские источники.</w:t>
+      </w:r>
+    </w:p>
+    <w:p>
+      <w:pPr>
+        <w:pStyle w:val="BodyText"/>
+      </w:pPr>
+      <w:r>
+        <w:t xml:space="preserve">Третье ограничение — синтетическая природа ошибок. Noise generator создаёт OCR-подобные искажения, но реальные ошибки зависят от шрифта, качества скана, сегментации, модели распознавания и состояния документа. Поэтому текущий датасет проверяет pipeline посткоррекции в контролируемой постановке, но не заменяет оценку на реальных OCR/HTR-выходах.</w:t>
+      </w:r>
+    </w:p>
+    <w:p>
+      <w:pPr>
+        <w:pStyle w:val="BodyText"/>
+      </w:pPr>
+      <w:r>
+        <w:t xml:space="preserve">Четвёртое ограничение — отсутствие ручной лингвистической валидации исправлений. Метрики CER и WER показывают формальную близость к эталону, но не всегда отражают историко-орфографическую допустимость исправления. Для следующего этапа нужен небольшой вручную проверенный subset с качественным анализом ошибок.</w:t>
+      </w:r>
+    </w:p>
     <w:bookmarkEnd w:id="39"/>
-    <w:bookmarkStart w:id="40" w:name="ограничения-корпуса"/>
+    <w:bookmarkStart w:id="40" w:name="выводы-по-разделу"/>
     <w:p>
       <w:pPr>
         <w:pStyle w:val="Heading3"/>
       </w:pPr>
       <w:r>
-        <w:t xml:space="preserve">3.8 Ограничения корпуса</w:t>
+        <w:t xml:space="preserve">3.9 Выводы по разделу</w:t>
       </w:r>
     </w:p>
     <w:p>
@@ -2779,78 +2800,28 @@
         <w:pStyle w:val="FirstParagraph"/>
       </w:pPr>
       <w:r>
-        <w:t xml:space="preserve">Построенный корпус следует рассматривать как пилотный. Его ограничения влияют не на воспроизводимость эксперимента, а на масштаб выводов, которые можно делать по результатам.</w:t>
-      </w:r>
-    </w:p>
-    <w:p>
-      <w:pPr>
-        <w:pStyle w:val="BodyText"/>
-      </w:pPr>
-      <w:r>
-        <w:t xml:space="preserve">Первое ограничение — объём: используется 400 чистых текстовых блоков. Этого достаточно, чтобы проверить pipeline, сравнить baseline-подходы и провести первый нейросетевой эксперимент. Однако такого объёма недостаточно, чтобы утверждать устойчивость метода на всём классе исторических арабографичных тюркских текстов.</w:t>
-      </w:r>
-    </w:p>
-    <w:p>
-      <w:pPr>
-        <w:pStyle w:val="BodyText"/>
-      </w:pPr>
-      <w:r>
-        <w:t xml:space="preserve">Второе ограничение — один основной источник. Это снижает жанровое, временное и орфографическое разнообразие корпуса. Результаты показывают поведение модели на выбранном материале, но не доказывают переносимость на старотатарские, башкирские, крымскотатарские или другие арабографичные тюркские источники.</w:t>
-      </w:r>
-    </w:p>
-    <w:p>
-      <w:pPr>
-        <w:pStyle w:val="BodyText"/>
-      </w:pPr>
-      <w:r>
-        <w:t xml:space="preserve">Третье ограничение — синтетическая природа ошибок. Noise generator создаёт OCR-подобные искажения, но реальные ошибки зависят от шрифта, качества скана, сегментации, модели распознавания и состояния документа. Поэтому текущий датасет проверяет pipeline посткоррекции в контролируемой постановке, но не заменяет оценку на реальных OCR/HTR-выходах.</w:t>
-      </w:r>
-    </w:p>
-    <w:p>
-      <w:pPr>
-        <w:pStyle w:val="BodyText"/>
-      </w:pPr>
-      <w:r>
-        <w:t xml:space="preserve">Четвёртое ограничение — отсутствие ручной лингвистической валидации исправлений. Метрики CER и WER показывают формальную близость к эталону, но не всегда отражают историко-орфографическую допустимость исправления. Для следующего этапа нужен небольшой вручную проверенный subset с качественным анализом ошибок.</w:t>
+        <w:t xml:space="preserve">В рамках работы был создан небольшой, но воспроизводимый корпус для задачи OCR post-correction исторического тюркского текста в арабской графике. На основе 400 чистых текстовых блоков был построен синтетический датасет с train/valid/test-разбиением без утечки исходных строк между выборками.</w:t>
+      </w:r>
+    </w:p>
+    <w:p>
+      <w:pPr>
+        <w:pStyle w:val="BodyText"/>
+      </w:pPr>
+      <w:r>
+        <w:t xml:space="preserve">Корпус не претендует на полноту и не заменяет benchmark на реальных OCR/HTR-выходах. Его роль на данном этапе уже иная: создать контролируемую экспериментальную основу, на которой можно сравнить identity baseline, rule-based normalizer, train-derived character-confusion baseline и нейросетевую модель ByT5-small в одинаковых условиях.</w:t>
+      </w:r>
+    </w:p>
+    <w:p>
+      <w:pPr>
+        <w:pStyle w:val="BodyText"/>
+      </w:pPr>
+      <w:r>
+        <w:t xml:space="preserve">В дальнейшем этот корпус можно расширить за счёт новых источников, реальных OCR/HTR-выходов, ручной лингвистической валидации и более разнообразных исторических арабографичных тюркских материалов.</w:t>
       </w:r>
     </w:p>
     <w:bookmarkEnd w:id="40"/>
-    <w:bookmarkStart w:id="41" w:name="выводы-по-разделу"/>
-    <w:p>
-      <w:pPr>
-        <w:pStyle w:val="Heading3"/>
-      </w:pPr>
-      <w:r>
-        <w:t xml:space="preserve">3.9 Выводы по разделу</w:t>
-      </w:r>
-    </w:p>
-    <w:p>
-      <w:pPr>
-        <w:pStyle w:val="FirstParagraph"/>
-      </w:pPr>
-      <w:r>
-        <w:t xml:space="preserve">В рамках работы был создан небольшой, но воспроизводимый корпус для задачи OCR post-correction исторического тюркского текста в арабской графике. На основе 400 чистых текстовых блоков был построен синтетический датасет с train/valid/test-разбиением без утечки исходных строк между выборками.</w:t>
-      </w:r>
-    </w:p>
-    <w:p>
-      <w:pPr>
-        <w:pStyle w:val="BodyText"/>
-      </w:pPr>
-      <w:r>
-        <w:t xml:space="preserve">Корпус не претендует на полноту и не заменяет benchmark на реальных OCR/HTR-выходах. Его роль на данном этапе уже иная: создать контролируемую экспериментальную основу, на которой можно сравнить identity baseline, rule-based normalizer, train-derived character-confusion baseline и нейросетевую модель ByT5-small в одинаковых условиях.</w:t>
-      </w:r>
-    </w:p>
-    <w:p>
-      <w:pPr>
-        <w:pStyle w:val="BodyText"/>
-      </w:pPr>
-      <w:r>
-        <w:t xml:space="preserve">В дальнейшем этот корпус можно расширить за счёт новых источников, реальных OCR/HTR-выходов, ручной лингвистической валидации и более разнообразных исторических арабографичных тюркских материалов.</w:t>
-      </w:r>
-    </w:p>
     <w:bookmarkEnd w:id="41"/>
-    <w:bookmarkEnd w:id="42"/>
-    <w:bookmarkStart w:id="53" w:name="методология-эксперимента"/>
+    <w:bookmarkStart w:id="52" w:name="методология-эксперимента"/>
     <w:p>
       <w:pPr>
         <w:pStyle w:val="Heading2"/>
@@ -2859,7 +2830,7 @@
         <w:t xml:space="preserve">4. Методология эксперимента</w:t>
       </w:r>
     </w:p>
-    <w:bookmarkStart w:id="43" w:name="общая-схема-эксперимента"/>
+    <w:bookmarkStart w:id="42" w:name="общая-схема-эксперимента"/>
     <w:p>
       <w:pPr>
         <w:pStyle w:val="Heading3"/>
@@ -2916,14 +2887,56 @@
         <w:t xml:space="preserve">Главный вопрос эксперимента — улучшает ли нейросетевая post-correction модель качество текста по сравнению с неизменённым зашумлённым вводом. Дополнительный вопрос — помогает ли простая rule-based нормализация именно для исторического арабографичного тюркского материала или, наоборот, ухудшает текст.</w:t>
       </w:r>
     </w:p>
+    <w:bookmarkEnd w:id="42"/>
+    <w:bookmarkStart w:id="43" w:name="baseline-подходы"/>
+    <w:p>
+      <w:pPr>
+        <w:pStyle w:val="Heading3"/>
+      </w:pPr>
+      <w:r>
+        <w:t xml:space="preserve">4.2 Baseline-подходы</w:t>
+      </w:r>
+    </w:p>
+    <w:p>
+      <w:pPr>
+        <w:pStyle w:val="FirstParagraph"/>
+      </w:pPr>
+      <w:r>
+        <w:t xml:space="preserve">В эксперименте используются три baseline-подхода. Первый — identity baseline: он возвращает входную зашумлённую строку без изменений. Его роль состоит в том, чтобы зафиксировать исходный уровень качества данных. Любой метод post-correction должен превосходить этот уровень; иначе он не исправляет текст, а добавляет новые ошибки.</w:t>
+      </w:r>
+    </w:p>
+    <w:p>
+      <w:pPr>
+        <w:pStyle w:val="BodyText"/>
+      </w:pPr>
+      <w:r>
+        <w:t xml:space="preserve">Второй baseline — rule-based normalizer. Он применяет набор простых символьных правил к арабографичному тексту. Этот baseline нужен не как ожидаемо сильный метод, а как проверка важной гипотезы: можно ли улучшить качество простыми правилами нормализации без обучения модели.</w:t>
+      </w:r>
+    </w:p>
+    <w:p>
+      <w:pPr>
+        <w:pStyle w:val="BodyText"/>
+      </w:pPr>
+      <w:r>
+        <w:t xml:space="preserve">Для исторического арабографичного тюркского материала такая проверка особенно важна. Нормализация может убрать часть технического шума, но может и стереть исторически значимые орфографические различия. Поэтому rule-based normalizer в работе не считается обязательной предобработкой, а оценивается как самостоятельный baseline.</w:t>
+      </w:r>
+    </w:p>
+    <w:p>
+      <w:pPr>
+        <w:pStyle w:val="BodyText"/>
+      </w:pPr>
+      <w:r>
+        <w:t xml:space="preserve">Третий baseline — train-derived character-confusion baseline. Он строится по обучающим noisy-clean парам: noisy- и clean-строки выравниваются с помощью Levenshtein alignment, после чего оцениваются частотные соответствия между зашумлёнными и чистыми символами. Замена принимается только при достаточной поддержке и доминировании целевого символа. Такой baseline является data-driven, но non-neural: он может исправлять устойчивые локальные символьные путаницы, однако не умеет восстанавливать пропущенные символы из контекста и не моделирует дальние зависимости в строке.</w:t>
+      </w:r>
+    </w:p>
     <w:bookmarkEnd w:id="43"/>
-    <w:bookmarkStart w:id="44" w:name="baseline-подходы"/>
+    <w:bookmarkStart w:id="44" w:name="X9ed5a8e4fde00fe5095624626c608a88e2ee9c9"/>
     <w:p>
       <w:pPr>
         <w:pStyle w:val="Heading3"/>
       </w:pPr>
       <w:r>
-        <w:t xml:space="preserve">4.2 Baseline-подходы</w:t>
+        <w:t xml:space="preserve">4.3 Train-derived character-confusion baseline</w:t>
       </w:r>
     </w:p>
     <w:p>
@@ -2931,61 +2944,19 @@
         <w:pStyle w:val="FirstParagraph"/>
       </w:pPr>
       <w:r>
-        <w:t xml:space="preserve">В эксперименте используются три baseline-подхода. Первый — identity baseline: он возвращает входную зашумлённую строку без изменений. Его роль состоит в том, чтобы зафиксировать исходный уровень качества данных. Любой метод post-correction должен превосходить этот уровень; иначе он не исправляет текст, а добавляет новые ошибки.</w:t>
-      </w:r>
-    </w:p>
-    <w:p>
-      <w:pPr>
-        <w:pStyle w:val="BodyText"/>
-      </w:pPr>
-      <w:r>
-        <w:t xml:space="preserve">Второй baseline — rule-based normalizer. Он применяет набор простых символьных правил к арабографичному тексту. Этот baseline нужен не как ожидаемо сильный метод, а как проверка важной гипотезы: можно ли улучшить качество простыми правилами нормализации без обучения модели.</w:t>
-      </w:r>
-    </w:p>
-    <w:p>
-      <w:pPr>
-        <w:pStyle w:val="BodyText"/>
-      </w:pPr>
-      <w:r>
-        <w:t xml:space="preserve">Для исторического арабографичного тюркского материала такая проверка особенно важна. Нормализация может убрать часть технического шума, но может и стереть исторически значимые орфографические различия. Поэтому rule-based normalizer в работе не считается обязательной предобработкой, а оценивается как самостоятельный baseline.</w:t>
-      </w:r>
-    </w:p>
-    <w:p>
-      <w:pPr>
-        <w:pStyle w:val="BodyText"/>
-      </w:pPr>
-      <w:r>
-        <w:t xml:space="preserve">Третий baseline — train-derived character-confusion baseline. Он строится по обучающим noisy-clean парам: noisy- и clean-строки выравниваются с помощью Levenshtein alignment, после чего оцениваются частотные соответствия между зашумлёнными и чистыми символами. Замена принимается только при достаточной поддержке и доминировании целевого символа. Такой baseline является data-driven, но non-neural: он может исправлять устойчивые локальные символьные путаницы, однако не умеет восстанавливать пропущенные символы из контекста и не моделирует дальние зависимости в строке.</w:t>
+        <w:t xml:space="preserve">Train-derived character-confusion baseline занимает промежуточное положение между ручной rule-based нормализацией и нейросетевой sequence-to-sequence моделью. В отличие от rule-based normalizer, он не задаёт все замены вручную, а извлекает наиболее устойчивые noisy-character → clean-character соответствия из обучающей выборки. В отличие от ByT5-small, он не использует контекст строки и не генерирует последовательность заново.</w:t>
+      </w:r>
+    </w:p>
+    <w:p>
+      <w:pPr>
+        <w:pStyle w:val="BodyText"/>
+      </w:pPr>
+      <w:r>
+        <w:t xml:space="preserve">Его диагностическая роль состоит в проверке вопроса: достаточно ли простых корпусно-выведенных символьных соответствий для решения benchmark, или нужен контекстный sequence-to-sequence подход. Если такой baseline приблизился бы к ByT5, это означало бы, что задача в основном сводится к локальным заменам символов. Если же ByT5 заметно превосходит его, это указывает на важность контекста, восстановления структуры слов и более сложного моделирования строки.</w:t>
       </w:r>
     </w:p>
     <w:bookmarkEnd w:id="44"/>
-    <w:bookmarkStart w:id="45" w:name="X9ed5a8e4fde00fe5095624626c608a88e2ee9c9"/>
-    <w:p>
-      <w:pPr>
-        <w:pStyle w:val="Heading3"/>
-      </w:pPr>
-      <w:r>
-        <w:t xml:space="preserve">4.3 Train-derived character-confusion baseline</w:t>
-      </w:r>
-    </w:p>
-    <w:p>
-      <w:pPr>
-        <w:pStyle w:val="FirstParagraph"/>
-      </w:pPr>
-      <w:r>
-        <w:t xml:space="preserve">Train-derived character-confusion baseline занимает промежуточное положение между ручной rule-based нормализацией и нейросетевой sequence-to-sequence моделью. В отличие от rule-based normalizer, он не задаёт все замены вручную, а извлекает наиболее устойчивые noisy-character → clean-character соответствия из обучающей выборки. В отличие от ByT5-small, он не использует контекст строки и не генерирует последовательность заново.</w:t>
-      </w:r>
-    </w:p>
-    <w:p>
-      <w:pPr>
-        <w:pStyle w:val="BodyText"/>
-      </w:pPr>
-      <w:r>
-        <w:t xml:space="preserve">Его диагностическая роль состоит в проверке вопроса: достаточно ли простых корпусно-выведенных символьных соответствий для решения benchmark, или нужен контекстный sequence-to-sequence подход. Если такой baseline приблизился бы к ByT5, это означало бы, что задача в основном сводится к локальным заменам символов. Если же ByT5 заметно превосходит его, это указывает на важность контекста, восстановления структуры слов и более сложного моделирования строки.</w:t>
-      </w:r>
-    </w:p>
-    <w:bookmarkEnd w:id="45"/>
-    <w:bookmarkStart w:id="46" w:name="нейросетевая-модель-byt5-small"/>
+    <w:bookmarkStart w:id="45" w:name="нейросетевая-модель-byt5-small"/>
     <w:p>
       <w:pPr>
         <w:pStyle w:val="Heading3"/>
@@ -3030,8 +3001,8 @@
         <w:t xml:space="preserve">Практическое следствие byte-level подхода состоит в том, что длина последовательности в токенах может быстро расти: один видимый символ арабской графики занимает несколько байтов. Поэтому в эксперименте отдельно контролируется максимальная длина входной и целевой последовательности.</w:t>
       </w:r>
     </w:p>
-    <w:bookmarkEnd w:id="46"/>
-    <w:bookmarkStart w:id="47" w:name="проверенные-конфигурации"/>
+    <w:bookmarkEnd w:id="45"/>
+    <w:bookmarkStart w:id="46" w:name="проверенные-конфигурации"/>
     <w:p>
       <w:pPr>
         <w:pStyle w:val="Heading3"/>
@@ -3227,8 +3198,8 @@
         <w:t xml:space="preserve">Для итогового анализа выбрана конфигурация 512. Она уменьшает риск обрезания строк и используется как основная нейросетевая конфигурация в сравнении с identity baseline, rule-based normalizer и train-derived character-confusion baseline. Вывод о преимуществе 512 в данной работе относится к пилотному датасету и должен быть дополнительно проверен на более широком корпусе.</w:t>
       </w:r>
     </w:p>
-    <w:bookmarkEnd w:id="47"/>
-    <w:bookmarkStart w:id="48" w:name="метрики-качества"/>
+    <w:bookmarkEnd w:id="46"/>
+    <w:bookmarkStart w:id="47" w:name="метрики-качества"/>
     <w:p>
       <w:pPr>
         <w:pStyle w:val="Heading3"/>
@@ -3284,8 +3255,8 @@
         <w:t xml:space="preserve">ExactMatch показывает долю строк, полностью совпавших с эталоном. Для длинных исторических строк эта метрика очень строгая: один неверный символ уже делает пример несовпадающим. Поэтому ExactMatch используется как дополнительный индикатор, а основные выводы строятся по CER, WER и анализу ошибок.</w:t>
       </w:r>
     </w:p>
-    <w:bookmarkEnd w:id="48"/>
-    <w:bookmarkStart w:id="49" w:name="процедура-оценки"/>
+    <w:bookmarkEnd w:id="47"/>
+    <w:bookmarkStart w:id="48" w:name="процедура-оценки"/>
     <w:p>
       <w:pPr>
         <w:pStyle w:val="Heading3"/>
@@ -3366,8 +3337,8 @@
         <w:t xml:space="preserve">В одинаковых условиях сравниваются четыре варианта: identity baseline, rule-based normalizer, train-derived character-confusion baseline и ByT5-small. Это позволяет отделить эффект нейросетевой post-correction модели от простого сохранения зашумлённого ввода, ручных правил нормализации и простого data-driven символьного baseline.</w:t>
       </w:r>
     </w:p>
-    <w:bookmarkEnd w:id="49"/>
-    <w:bookmarkStart w:id="50" w:name="анализ-ошибок"/>
+    <w:bookmarkEnd w:id="48"/>
+    <w:bookmarkStart w:id="49" w:name="анализ-ошибок"/>
     <w:p>
       <w:pPr>
         <w:pStyle w:val="Heading3"/>
@@ -3424,42 +3395,42 @@
         <w:t xml:space="preserve">.</w:t>
       </w:r>
     </w:p>
+    <w:bookmarkEnd w:id="49"/>
+    <w:bookmarkStart w:id="50" w:name="воспроизводимость"/>
+    <w:p>
+      <w:pPr>
+        <w:pStyle w:val="Heading3"/>
+      </w:pPr>
+      <w:r>
+        <w:t xml:space="preserve">4.9 Воспроизводимость</w:t>
+      </w:r>
+    </w:p>
+    <w:p>
+      <w:pPr>
+        <w:pStyle w:val="FirstParagraph"/>
+      </w:pPr>
+      <w:r>
+        <w:t xml:space="preserve">Основные компоненты эксперимента сохранены в репозитории: скрипты сбора данных, генерации датасета, baseline-оценки, обучения и применения ByT5-small, вычисления метрик и анализа ошибок. Это делает эксперимент проверяемым: можно повторить построение датасета, пересчитать метрики и отдельно изучить предсказания модели.</w:t>
+      </w:r>
+    </w:p>
+    <w:p>
+      <w:pPr>
+        <w:pStyle w:val="BodyText"/>
+      </w:pPr>
+      <w:r>
+        <w:t xml:space="preserve">В репозитории также сохранены датасет, итоговые метрики, prediction-файлы и CSV-файлы анализа ошибок. При этом модельные веса не хранятся в git, чтобы не перегружать репозиторий тяжёлыми артефактами обучения. Для дальнейшей работы веса можно хранить отдельно: например, как release artifact или во внешнем model registry.</w:t>
+      </w:r>
+    </w:p>
+    <w:p>
+      <w:pPr>
+        <w:pStyle w:val="BodyText"/>
+      </w:pPr>
+      <w:r>
+        <w:t xml:space="preserve">Воспроизводимость текущего эксперимента не означает полноту бенчмарка. Она означает, что все ключевые решения пилотного протокола явно зафиксированы: источник, генератор шума, split, baseline-подходы, модель, метрики и error analysis.</w:t>
+      </w:r>
+    </w:p>
     <w:bookmarkEnd w:id="50"/>
-    <w:bookmarkStart w:id="51" w:name="воспроизводимость"/>
-    <w:p>
-      <w:pPr>
-        <w:pStyle w:val="Heading3"/>
-      </w:pPr>
-      <w:r>
-        <w:t xml:space="preserve">4.9 Воспроизводимость</w:t>
-      </w:r>
-    </w:p>
-    <w:p>
-      <w:pPr>
-        <w:pStyle w:val="FirstParagraph"/>
-      </w:pPr>
-      <w:r>
-        <w:t xml:space="preserve">Основные компоненты эксперимента сохранены в репозитории: скрипты сбора данных, генерации датасета, baseline-оценки, обучения и применения ByT5-small, вычисления метрик и анализа ошибок. Это делает эксперимент проверяемым: можно повторить построение датасета, пересчитать метрики и отдельно изучить предсказания модели.</w:t>
-      </w:r>
-    </w:p>
-    <w:p>
-      <w:pPr>
-        <w:pStyle w:val="BodyText"/>
-      </w:pPr>
-      <w:r>
-        <w:t xml:space="preserve">В репозитории также сохранены датасет, итоговые метрики, prediction-файлы и CSV-файлы анализа ошибок. При этом модельные веса не хранятся в git, чтобы не перегружать репозиторий тяжёлыми артефактами обучения. Для дальнейшей работы веса можно хранить отдельно: например, как release artifact или во внешнем model registry.</w:t>
-      </w:r>
-    </w:p>
-    <w:p>
-      <w:pPr>
-        <w:pStyle w:val="BodyText"/>
-      </w:pPr>
-      <w:r>
-        <w:t xml:space="preserve">Воспроизводимость текущего эксперимента не означает полноту бенчмарка. Она означает, что все ключевые решения пилотного протокола явно зафиксированы: источник, генератор шума, split, baseline-подходы, модель, метрики и error analysis.</w:t>
-      </w:r>
-    </w:p>
-    <w:bookmarkEnd w:id="51"/>
-    <w:bookmarkStart w:id="52" w:name="выводы-по-разделу-1"/>
+    <w:bookmarkStart w:id="51" w:name="выводы-по-разделу-1"/>
     <w:p>
       <w:pPr>
         <w:pStyle w:val="Heading3"/>
@@ -3507,52 +3478,52 @@
         <w:t xml:space="preserve">Эта методология задаёт основу для раздела 5, где сравниваются baseline-подходы, train-derived character-confusion baseline, финальная конфигурация ByT5-small и результаты анализа ошибок.</w:t>
       </w:r>
     </w:p>
+    <w:bookmarkEnd w:id="51"/>
     <w:bookmarkEnd w:id="52"/>
+    <w:bookmarkStart w:id="65" w:name="результаты-экспериментов-и-анализ-ошибок"/>
+    <w:p>
+      <w:pPr>
+        <w:pStyle w:val="Heading2"/>
+      </w:pPr>
+      <w:r>
+        <w:t xml:space="preserve">5. Результаты экспериментов и анализ ошибок</w:t>
+      </w:r>
+    </w:p>
+    <w:bookmarkStart w:id="53" w:name="общая-логика-оценки"/>
+    <w:p>
+      <w:pPr>
+        <w:pStyle w:val="Heading3"/>
+      </w:pPr>
+      <w:r>
+        <w:t xml:space="preserve">5.1 Общая логика оценки</w:t>
+      </w:r>
+    </w:p>
+    <w:p>
+      <w:pPr>
+        <w:pStyle w:val="FirstParagraph"/>
+      </w:pPr>
+      <w:r>
+        <w:t xml:space="preserve">В разделе результатов сравниваются четыре подхода: identity baseline, rule-based normalizer, train-derived character-confusion baseline и ByT5-small 512. Все они оцениваются на одной test set из 800 зашумлённых вариантов, построенных из 40 уникальных исходных строк, которые не пересекаются с обучающей и валидационной выборками.</w:t>
+      </w:r>
+    </w:p>
+    <w:p>
+      <w:pPr>
+        <w:pStyle w:val="BodyText"/>
+      </w:pPr>
+      <w:r>
+        <w:t xml:space="preserve">Интерпретация строится в два слоя. Сначала сравниваются агрегированные метрики CER, WER и ExactMatch. Затем отдельно рассматривается анализ ошибок: сколько примеров улучшилось, осталось без изменений или стало хуже после применения ByT5-small. Такой порядок нужен, чтобы не ограничиваться средними значениями и проверить устойчивость улучшения на уровне отдельных строк.</w:t>
+      </w:r>
+    </w:p>
+    <w:p>
+      <w:pPr>
+        <w:pStyle w:val="BodyText"/>
+      </w:pPr>
+      <w:r>
+        <w:t xml:space="preserve">В этом разделе важно не только то, что ByT5-small показывает лучшие итоговые метрики среди рассмотренных методов. Не менее важны ограничивающие результаты: rule-based normalizer ухудшает качество относительно identity baseline, train-derived character-confusion baseline даёт лишь умеренное улучшение CER, а заметное снижение WER у ByT5 требует осторожной интерпретации из-за синтетических ошибок пробелов и границ слов.</w:t>
+      </w:r>
+    </w:p>
     <w:bookmarkEnd w:id="53"/>
-    <w:bookmarkStart w:id="66" w:name="результаты-экспериментов-и-анализ-ошибок"/>
-    <w:p>
-      <w:pPr>
-        <w:pStyle w:val="Heading2"/>
-      </w:pPr>
-      <w:r>
-        <w:t xml:space="preserve">5. Результаты экспериментов и анализ ошибок</w:t>
-      </w:r>
-    </w:p>
-    <w:bookmarkStart w:id="54" w:name="общая-логика-оценки"/>
-    <w:p>
-      <w:pPr>
-        <w:pStyle w:val="Heading3"/>
-      </w:pPr>
-      <w:r>
-        <w:t xml:space="preserve">5.1 Общая логика оценки</w:t>
-      </w:r>
-    </w:p>
-    <w:p>
-      <w:pPr>
-        <w:pStyle w:val="FirstParagraph"/>
-      </w:pPr>
-      <w:r>
-        <w:t xml:space="preserve">В разделе результатов сравниваются четыре подхода: identity baseline, rule-based normalizer, train-derived character-confusion baseline и ByT5-small 512. Все они оцениваются на одной test set из 800 зашумлённых вариантов, построенных из 40 уникальных исходных строк, которые не пересекаются с обучающей и валидационной выборками.</w:t>
-      </w:r>
-    </w:p>
-    <w:p>
-      <w:pPr>
-        <w:pStyle w:val="BodyText"/>
-      </w:pPr>
-      <w:r>
-        <w:t xml:space="preserve">Интерпретация строится в два слоя. Сначала сравниваются агрегированные метрики CER, WER и ExactMatch. Затем отдельно рассматривается анализ ошибок: сколько примеров улучшилось, осталось без изменений или стало хуже после применения ByT5-small. Такой порядок нужен, чтобы не ограничиваться средними значениями и проверить устойчивость улучшения на уровне отдельных строк.</w:t>
-      </w:r>
-    </w:p>
-    <w:p>
-      <w:pPr>
-        <w:pStyle w:val="BodyText"/>
-      </w:pPr>
-      <w:r>
-        <w:t xml:space="preserve">В этом разделе важно не только то, что ByT5-small показывает лучшие итоговые метрики среди рассмотренных методов. Не менее важны ограничивающие результаты: rule-based normalizer ухудшает качество относительно identity baseline, train-derived character-confusion baseline даёт лишь умеренное улучшение CER, а заметное снижение WER у ByT5 требует осторожной интерпретации из-за синтетических ошибок пробелов и границ слов.</w:t>
-      </w:r>
-    </w:p>
-    <w:bookmarkEnd w:id="54"/>
-    <w:bookmarkStart w:id="55" w:name="итоговые-метрики"/>
+    <w:bookmarkStart w:id="54" w:name="итоговые-метрики"/>
     <w:p>
       <w:pPr>
         <w:pStyle w:val="Heading3"/>
@@ -3924,8 +3895,8 @@
         <w:t xml:space="preserve">ExactMatch остаётся низким у всех методов. Это ожидаемо для длинных строк и строгого посимвольного сравнения: даже одна ошибка делает строку несовпадающей с эталоном. Поэтому ExactMatch используется как дополнительный индикатор, а основные выводы строятся по CER, WER и анализу ошибок.</w:t>
       </w:r>
     </w:p>
-    <w:bookmarkEnd w:id="55"/>
-    <w:bookmarkStart w:id="56" w:name="сравнение-с-identity-baseline"/>
+    <w:bookmarkEnd w:id="54"/>
+    <w:bookmarkStart w:id="55" w:name="сравнение-с-identity-baseline"/>
     <w:p>
       <w:pPr>
         <w:pStyle w:val="Heading3"/>
@@ -4002,8 +3973,8 @@
         <w:t xml:space="preserve">Такой результат согласуется с основной гипотезой пилота: byte-level sequence-to-sequence модель может быть полезна для post-correction арабографичного тюркского текста. Однако улучшение по CER остаётся достаточно небольшим, поэтому вывод следует считать не финальным доказательством качества модели, а подтверждением работоспособности выбранного направления в controlled synthetic setting.</w:t>
       </w:r>
     </w:p>
-    <w:bookmarkEnd w:id="56"/>
-    <w:bookmarkStart w:id="57" w:name="rule-based-normalizer"/>
+    <w:bookmarkEnd w:id="55"/>
+    <w:bookmarkStart w:id="56" w:name="rule-based-normalizer"/>
     <w:p>
       <w:pPr>
         <w:pStyle w:val="Heading3"/>
@@ -4080,8 +4051,8 @@
         <w:t xml:space="preserve">Следовательно, rule-based normalization нельзя использовать как автоматический предварительный шаг без отдельной проверки. В рамках данного эксперимента первая гипотеза получает предварительное подтверждение: naive rule-based normalization ухудшает качество текста относительно identity baseline.</w:t>
       </w:r>
     </w:p>
-    <w:bookmarkEnd w:id="57"/>
-    <w:bookmarkStart w:id="58" w:name="X3cc67115ed6e691c31a87b68b1f212ad315ce11"/>
+    <w:bookmarkEnd w:id="56"/>
+    <w:bookmarkStart w:id="57" w:name="X3cc67115ed6e691c31a87b68b1f212ad315ce11"/>
     <w:p>
       <w:pPr>
         <w:pStyle w:val="Heading3"/>
@@ -4150,14 +4121,56 @@
         <w:t xml:space="preserve">Такой результат важен для интерпретации. Простые train-derived character confusions действительно исправляют часть локальных символьных ошибок, но почти не улучшают word-level качество. Это означает, что большая часть преимущества ByT5-small связана не только с локальными заменами символов, но и с контекстным восстановлением структуры строки, включая границы слов.</w:t>
       </w:r>
     </w:p>
+    <w:bookmarkEnd w:id="57"/>
+    <w:bookmarkStart w:id="58" w:name="интерпретация-сильного-снижения-wer"/>
+    <w:p>
+      <w:pPr>
+        <w:pStyle w:val="Heading3"/>
+      </w:pPr>
+      <w:r>
+        <w:t xml:space="preserve">5.6 Интерпретация сильного снижения WER</w:t>
+      </w:r>
+    </w:p>
+    <w:p>
+      <w:pPr>
+        <w:pStyle w:val="FirstParagraph"/>
+      </w:pPr>
+      <w:r>
+        <w:t xml:space="preserve">Наиболее заметный выигрыш ByT5-small наблюдается по WER: 0.519006 → 0.368540. В относительном выражении это выглядит как крупное улучшение. Однако этот результат нельзя интерпретировать как доказательство аналогичного выигрыша на реальных OCR/HTR-выходах.</w:t>
+      </w:r>
+    </w:p>
+    <w:p>
+      <w:pPr>
+        <w:pStyle w:val="BodyText"/>
+      </w:pPr>
+      <w:r>
+        <w:t xml:space="preserve">Причина состоит в том, что текущий synthetic noise включает вставку и удаление пробелов. WER вычисляется на уровне слов, поэтому он особенно чувствителен к ошибкам границ слов: одна вставка или потеря пробела может изменить токенизацию всей строки и резко увеличить word-level error. Если модель восстанавливает часть таких synthetic word-boundary distortions, WER может снижаться существенно сильнее, чем CER.</w:t>
+      </w:r>
+    </w:p>
+    <w:p>
+      <w:pPr>
+        <w:pStyle w:val="BodyText"/>
+      </w:pPr>
+      <w:r>
+        <w:t xml:space="preserve">Именно поэтому CER и WER в данной работе интерпретируются совместно. По CER улучшение ByT5-small является умеренным: 0.086005 → 0.079913. По WER улучшение заметнее, но оно может частично отражать специфику синтетического генератора шума. Следовательно, результат показывает работоспособность модели в controlled synthetic benchmark, но не доказывает такого же эффекта на реальных архивных сканах или реальном OCR/HTR output.</w:t>
+      </w:r>
+    </w:p>
+    <w:p>
+      <w:pPr>
+        <w:pStyle w:val="BodyText"/>
+      </w:pPr>
+      <w:r>
+        <w:t xml:space="preserve">Поскольку benchmark построен в рамках данной работы, прямого опубликованного результата на точно таком же датасете нет. Поэтому утверждение о лучшем результате ограничено данной экспериментальной постановкой: ByT5-small 512 показывает лучший CER и WER среди рассмотренных методов на предложенном benchmark. Работа не заявляет global state of the art для OCR post-correction в целом.</w:t>
+      </w:r>
+    </w:p>
     <w:bookmarkEnd w:id="58"/>
-    <w:bookmarkStart w:id="59" w:name="интерпретация-сильного-снижения-wer"/>
+    <w:bookmarkStart w:id="59" w:name="значение-длины-последовательности"/>
     <w:p>
       <w:pPr>
         <w:pStyle w:val="Heading3"/>
       </w:pPr>
       <w:r>
-        <w:t xml:space="preserve">5.6 Интерпретация сильного снижения WER</w:t>
+        <w:t xml:space="preserve">5.7 Значение длины последовательности</w:t>
       </w:r>
     </w:p>
     <w:p>
@@ -4165,69 +4178,27 @@
         <w:pStyle w:val="FirstParagraph"/>
       </w:pPr>
       <w:r>
-        <w:t xml:space="preserve">Наиболее заметный выигрыш ByT5-small наблюдается по WER: 0.519006 → 0.368540. В относительном выражении это выглядит как крупное улучшение. Однако этот результат нельзя интерпретировать как доказательство аналогичного выигрыша на реальных OCR/HTR-выходах.</w:t>
-      </w:r>
-    </w:p>
-    <w:p>
-      <w:pPr>
-        <w:pStyle w:val="BodyText"/>
-      </w:pPr>
-      <w:r>
-        <w:t xml:space="preserve">Причина состоит в том, что текущий synthetic noise включает вставку и удаление пробелов. WER вычисляется на уровне слов, поэтому он особенно чувствителен к ошибкам границ слов: одна вставка или потеря пробела может изменить токенизацию всей строки и резко увеличить word-level error. Если модель восстанавливает часть таких synthetic word-boundary distortions, WER может снижаться существенно сильнее, чем CER.</w:t>
-      </w:r>
-    </w:p>
-    <w:p>
-      <w:pPr>
-        <w:pStyle w:val="BodyText"/>
-      </w:pPr>
-      <w:r>
-        <w:t xml:space="preserve">Именно поэтому CER и WER в данной работе интерпретируются совместно. По CER улучшение ByT5-small является умеренным: 0.086005 → 0.079913. По WER улучшение заметнее, но оно может частично отражать специфику синтетического генератора шума. Следовательно, результат показывает работоспособность модели в controlled synthetic benchmark, но не доказывает такого же эффекта на реальных архивных сканах или реальном OCR/HTR output.</w:t>
-      </w:r>
-    </w:p>
-    <w:p>
-      <w:pPr>
-        <w:pStyle w:val="BodyText"/>
-      </w:pPr>
-      <w:r>
-        <w:t xml:space="preserve">Поскольку benchmark построен в рамках данной работы, прямого опубликованного результата на точно таком же датасете нет. Поэтому утверждение о лучшем результате ограничено данной экспериментальной постановкой: ByT5-small 512 показывает лучший CER и WER среди рассмотренных методов на предложенном benchmark. Работа не заявляет global state of the art для OCR post-correction в целом.</w:t>
+        <w:t xml:space="preserve">Результаты пилота показывают чувствительность ByT5-small к максимальной длине входной и целевой последовательности. Это связано с byte-level представлением: длина строки в токенах может быть заметно больше, чем число видимых символов, особенно для арабской графики.</w:t>
+      </w:r>
+    </w:p>
+    <w:p>
+      <w:pPr>
+        <w:pStyle w:val="BodyText"/>
+      </w:pPr>
+      <w:r>
+        <w:t xml:space="preserve">Конфигурация 256 использовалась как первый рабочий запуск, но для части строк такое ограничение может быть слишком жёстким. Конфигурация 512 снижает риск обрезания контекста и поэтому выбрана как основная для итогового анализа.</w:t>
+      </w:r>
+    </w:p>
+    <w:p>
+      <w:pPr>
+        <w:pStyle w:val="BodyText"/>
+      </w:pPr>
+      <w:r>
+        <w:t xml:space="preserve">Этот результат следует интерпретировать осторожно. Он показывает, что max length является важным экспериментальным параметром в данной постановке, но не доказывает универсального преимущества длины 512 для всех арабографичных тюркских корпусов. Для более сильного вывода нужны дополнительные запуски на более широком наборе источников и длин строк.</w:t>
       </w:r>
     </w:p>
     <w:bookmarkEnd w:id="59"/>
-    <w:bookmarkStart w:id="60" w:name="значение-длины-последовательности"/>
-    <w:p>
-      <w:pPr>
-        <w:pStyle w:val="Heading3"/>
-      </w:pPr>
-      <w:r>
-        <w:t xml:space="preserve">5.7 Значение длины последовательности</w:t>
-      </w:r>
-    </w:p>
-    <w:p>
-      <w:pPr>
-        <w:pStyle w:val="FirstParagraph"/>
-      </w:pPr>
-      <w:r>
-        <w:t xml:space="preserve">Результаты пилота показывают чувствительность ByT5-small к максимальной длине входной и целевой последовательности. Это связано с byte-level представлением: длина строки в токенах может быть заметно больше, чем число видимых символов, особенно для арабской графики.</w:t>
-      </w:r>
-    </w:p>
-    <w:p>
-      <w:pPr>
-        <w:pStyle w:val="BodyText"/>
-      </w:pPr>
-      <w:r>
-        <w:t xml:space="preserve">Конфигурация 256 использовалась как первый рабочий запуск, но для части строк такое ограничение может быть слишком жёстким. Конфигурация 512 снижает риск обрезания контекста и поэтому выбрана как основная для итогового анализа.</w:t>
-      </w:r>
-    </w:p>
-    <w:p>
-      <w:pPr>
-        <w:pStyle w:val="BodyText"/>
-      </w:pPr>
-      <w:r>
-        <w:t xml:space="preserve">Этот результат следует интерпретировать осторожно. Он показывает, что max length является важным экспериментальным параметром в данной постановке, но не доказывает универсального преимущества длины 512 для всех арабографичных тюркских корпусов. Для более сильного вывода нужны дополнительные запуски на более широком наборе источников и длин строк.</w:t>
-      </w:r>
-    </w:p>
-    <w:bookmarkEnd w:id="60"/>
-    <w:bookmarkStart w:id="61" w:name="X57a2c7e56d371be566bce3ca95d65080761e96c"/>
+    <w:bookmarkStart w:id="60" w:name="X57a2c7e56d371be566bce3ca95d65080761e96c"/>
     <w:p>
       <w:pPr>
         <w:pStyle w:val="Heading3"/>
@@ -4488,8 +4459,8 @@
         <w:t xml:space="preserve">Качественный просмотр лучших и худших примеров показывает два разных режима поведения модели. В удачных случаях ByT5-small исправляет локальные OCR-подобные искажения, восстанавливает пропущенные или заменённые графемы и делает разбиение слов ближе к эталону. В худших случаях модель может не просто не исправить строку, а начать порождать повторяющиеся фрагменты, существенно удлиняя prediction. Это особенно важно для практического применения: модель улучшает большинство строк, но без фильтрации, анализа худших случаев или ручной проверки её нельзя считать безопасным автоматическим корректором.</w:t>
       </w:r>
     </w:p>
-    <w:bookmarkEnd w:id="61"/>
-    <w:bookmarkStart w:id="62" w:name="среднее-улучшение-по-примерам"/>
+    <w:bookmarkEnd w:id="60"/>
+    <w:bookmarkStart w:id="61" w:name="среднее-улучшение-по-примерам"/>
     <w:p>
       <w:pPr>
         <w:pStyle w:val="Heading3"/>
@@ -4546,14 +4517,56 @@
         <w:t xml:space="preserve">Среднее улучшение полезно как количественное резюме, но его недостаточно для окончательной оценки качества. Поэтому оно рассматривается вместе с распределением improved/unchanged/worse и качественным анализом лучших и худших примеров.</w:t>
       </w:r>
     </w:p>
+    <w:bookmarkEnd w:id="61"/>
+    <w:bookmarkStart w:id="62" w:name="интерпретация-результатов"/>
+    <w:p>
+      <w:pPr>
+        <w:pStyle w:val="Heading3"/>
+      </w:pPr>
+      <w:r>
+        <w:t xml:space="preserve">5.10 Интерпретация результатов</w:t>
+      </w:r>
+    </w:p>
+    <w:p>
+      <w:pPr>
+        <w:pStyle w:val="FirstParagraph"/>
+      </w:pPr>
+      <w:r>
+        <w:t xml:space="preserve">Полученные результаты дают три основных вывода. Первый вывод — отрицательный, но методологически важный: rule-based normalizer ухудшает качество относительно identity baseline. Это означает, что для исторического арабографичного тюркского текста простая символьная нормализация не является заведомо безопасной предобработкой.</w:t>
+      </w:r>
+    </w:p>
+    <w:p>
+      <w:pPr>
+        <w:pStyle w:val="BodyText"/>
+      </w:pPr>
+      <w:r>
+        <w:t xml:space="preserve">Второй вывод — положительный: ByT5-small 512 улучшает качество относительно identity baseline и показывает лучший результат среди четырёх рассмотренных методов. Улучшение по CER умеренное, но улучшение по WER заметное, а анализ отдельных примеров показывает, что модель улучшает большинство тестовых строк. При этом сильное снижение WER требует осторожной интерпретации, поскольку часть эффекта может быть связана с исправлением синтетических ошибок пробелов и границ слов. Следовательно, byte-level sequence-to-sequence подход является работоспособным направлением для пилотной посткоррекции, но не финальным доказательством качества на реальных OCR/HTR-выходах.</w:t>
+      </w:r>
+    </w:p>
+    <w:p>
+      <w:pPr>
+        <w:pStyle w:val="BodyText"/>
+      </w:pPr>
+      <w:r>
+        <w:t xml:space="preserve">Третий вывод касается настройки модели: max length является важным параметром для byte-level обработки арабографичного текста. Конфигурация 512 в текущем эксперименте выглядит более устойчивой, чем более короткая конфигурация, но этот результат следует считать практическим сигналом, а не универсальным правилом.</w:t>
+      </w:r>
+    </w:p>
+    <w:p>
+      <w:pPr>
+        <w:pStyle w:val="BodyText"/>
+      </w:pPr>
+      <w:r>
+        <w:t xml:space="preserve">Наконец, низкий ExactMatch не противоречит положительным результатам по CER и WER. Для длинных исторических строк полное совпадение слишком строго: одна небольшая ошибка уже делает строку несовпадающей. Поэтому основные выводы в работе опираются на CER, WER и анализ improved/unchanged/worse.</w:t>
+      </w:r>
+    </w:p>
     <w:bookmarkEnd w:id="62"/>
-    <w:bookmarkStart w:id="63" w:name="интерпретация-результатов"/>
+    <w:bookmarkStart w:id="63" w:name="ограничения-интерпретации"/>
     <w:p>
       <w:pPr>
         <w:pStyle w:val="Heading3"/>
       </w:pPr>
       <w:r>
-        <w:t xml:space="preserve">5.10 Интерпретация результатов</w:t>
+        <w:t xml:space="preserve">5.11 Ограничения интерпретации</w:t>
       </w:r>
     </w:p>
     <w:p>
@@ -4561,41 +4574,33 @@
         <w:pStyle w:val="FirstParagraph"/>
       </w:pPr>
       <w:r>
-        <w:t xml:space="preserve">Полученные результаты дают три основных вывода. Первый вывод — отрицательный, но методологически важный: rule-based normalizer ухудшает качество относительно identity baseline. Это означает, что для исторического арабографичного тюркского текста простая символьная нормализация не является заведомо безопасной предобработкой.</w:t>
-      </w:r>
-    </w:p>
-    <w:p>
-      <w:pPr>
-        <w:pStyle w:val="BodyText"/>
-      </w:pPr>
-      <w:r>
-        <w:t xml:space="preserve">Второй вывод — положительный: ByT5-small 512 улучшает качество относительно identity baseline и показывает лучший результат среди четырёх рассмотренных методов. Улучшение по CER умеренное, но улучшение по WER заметное, а анализ отдельных примеров показывает, что модель улучшает большинство тестовых строк. При этом сильное снижение WER требует осторожной интерпретации, поскольку часть эффекта может быть связана с исправлением синтетических ошибок пробелов и границ слов. Следовательно, byte-level sequence-to-sequence подход является работоспособным направлением для пилотной посткоррекции, но не финальным доказательством качества на реальных OCR/HTR-выходах.</w:t>
-      </w:r>
-    </w:p>
-    <w:p>
-      <w:pPr>
-        <w:pStyle w:val="BodyText"/>
-      </w:pPr>
-      <w:r>
-        <w:t xml:space="preserve">Третий вывод касается настройки модели: max length является важным параметром для byte-level обработки арабографичного текста. Конфигурация 512 в текущем эксперименте выглядит более устойчивой, чем более короткая конфигурация, но этот результат следует считать практическим сигналом, а не универсальным правилом.</w:t>
-      </w:r>
-    </w:p>
-    <w:p>
-      <w:pPr>
-        <w:pStyle w:val="BodyText"/>
-      </w:pPr>
-      <w:r>
-        <w:t xml:space="preserve">Наконец, низкий ExactMatch не противоречит положительным результатам по CER и WER. Для длинных исторических строк полное совпадение слишком строго: одна небольшая ошибка уже делает строку несовпадающей. Поэтому основные выводы в работе опираются на CER, WER и анализ improved/unchanged/worse.</w:t>
+        <w:t xml:space="preserve">Результаты раздела 5 следует понимать как пилотные. Они показывают, что выбранный pipeline работает на текущем корпусе и синтетическом шуме, но не доказывают качество модели на реальных OCR/HTR-выходах.</w:t>
+      </w:r>
+    </w:p>
+    <w:p>
+      <w:pPr>
+        <w:pStyle w:val="BodyText"/>
+      </w:pPr>
+      <w:r>
+        <w:t xml:space="preserve">Главные ограничения интерпретации связаны с данными: корпус мал, основан на одном источнике, а ошибки сгенерированы искусственно. Поэтому значения CER и WER нельзя напрямую переносить на другие жанры, периоды, шрифты, сканы или OCR-системы без дополнительной проверки.</w:t>
+      </w:r>
+    </w:p>
+    <w:p>
+      <w:pPr>
+        <w:pStyle w:val="BodyText"/>
+      </w:pPr>
+      <w:r>
+        <w:t xml:space="preserve">Отдельное ограничение связано с метриками. CER и WER измеряют формальную близость к эталону, но не полностью отражают историко-лингвистическую допустимость исправления. Для дальнейшей работы нужен вручную проверенный subset, где ошибки модели будут оцениваться не только автоматически, но и экспертно.</w:t>
       </w:r>
     </w:p>
     <w:bookmarkEnd w:id="63"/>
-    <w:bookmarkStart w:id="64" w:name="ограничения-интерпретации"/>
+    <w:bookmarkStart w:id="64" w:name="выводы-по-разделу-2"/>
     <w:p>
       <w:pPr>
         <w:pStyle w:val="Heading3"/>
       </w:pPr>
       <w:r>
-        <w:t xml:space="preserve">5.11 Ограничения интерпретации</w:t>
+        <w:t xml:space="preserve">5.12 Выводы по разделу</w:t>
       </w:r>
     </w:p>
     <w:p>
@@ -4603,33 +4608,43 @@
         <w:pStyle w:val="FirstParagraph"/>
       </w:pPr>
       <w:r>
-        <w:t xml:space="preserve">Результаты раздела 5 следует понимать как пилотные. Они показывают, что выбранный pipeline работает на текущем корпусе и синтетическом шуме, но не доказывают качество модели на реальных OCR/HTR-выходах.</w:t>
-      </w:r>
-    </w:p>
-    <w:p>
-      <w:pPr>
-        <w:pStyle w:val="BodyText"/>
-      </w:pPr>
-      <w:r>
-        <w:t xml:space="preserve">Главные ограничения интерпретации связаны с данными: корпус мал, основан на одном источнике, а ошибки сгенерированы искусственно. Поэтому значения CER и WER нельзя напрямую переносить на другие жанры, периоды, шрифты, сканы или OCR-системы без дополнительной проверки.</w:t>
-      </w:r>
-    </w:p>
-    <w:p>
-      <w:pPr>
-        <w:pStyle w:val="BodyText"/>
-      </w:pPr>
-      <w:r>
-        <w:t xml:space="preserve">Отдельное ограничение связано с метриками. CER и WER измеряют формальную близость к эталону, но не полностью отражают историко-лингвистическую допустимость исправления. Для дальнейшей работы нужен вручную проверенный subset, где ошибки модели будут оцениваться не только автоматически, но и экспертно.</w:t>
+        <w:t xml:space="preserve">Раздел результатов показывает, что поставленная пилотная задача имеет смысл: ByT5-small 512 превосходит identity baseline, rule-based normalizer и train-derived char-confusion baseline, улучшает большинство тестовых примеров и особенно заметно снижает WER. Это предварительно показывает применимость byte-level neural post-correction как первого шага для обработки исторических арабографичных тюркских текстов, но только в рамках controlled synthetic benchmark.</w:t>
+      </w:r>
+    </w:p>
+    <w:p>
+      <w:pPr>
+        <w:pStyle w:val="BodyText"/>
+      </w:pPr>
+      <w:r>
+        <w:t xml:space="preserve">Одновременно результаты задают границы этого вывода. Rule-based normalizer ухудшает качество, ExactMatch остаётся низким, а часть примеров после ByT5 становится хуже. Значит, модель нельзя рассматривать как готовый автоматический корректор без анализа ошибок и ручной проверки.</w:t>
+      </w:r>
+    </w:p>
+    <w:p>
+      <w:pPr>
+        <w:pStyle w:val="BodyText"/>
+      </w:pPr>
+      <w:r>
+        <w:t xml:space="preserve">Таким образом, эксперимент показывает жизнеспособность направления, но следующий этап должен быть строже: больше источников, реальные OCR/HTR-выходы, ручная валидация и более детальный анализ типов ошибок. Эти ограничения и направления развития рассматриваются в следующем разделе.</w:t>
       </w:r>
     </w:p>
     <w:bookmarkEnd w:id="64"/>
-    <w:bookmarkStart w:id="65" w:name="выводы-по-разделу-2"/>
+    <w:bookmarkEnd w:id="65"/>
+    <w:bookmarkStart w:id="72" w:name="Xe8e02886c60b8939714d6e867e04f7997a20272"/>
+    <w:p>
+      <w:pPr>
+        <w:pStyle w:val="Heading2"/>
+      </w:pPr>
+      <w:r>
+        <w:t xml:space="preserve">6. Ограничения и направления дальнейшей работы</w:t>
+      </w:r>
+    </w:p>
+    <w:bookmarkStart w:id="66" w:name="ограничения-корпуса-1"/>
     <w:p>
       <w:pPr>
         <w:pStyle w:val="Heading3"/>
       </w:pPr>
       <w:r>
-        <w:t xml:space="preserve">5.12 Выводы по разделу</w:t>
+        <w:t xml:space="preserve">6.1 Ограничения корпуса</w:t>
       </w:r>
     </w:p>
     <w:p>
@@ -4637,63 +4652,19 @@
         <w:pStyle w:val="FirstParagraph"/>
       </w:pPr>
       <w:r>
-        <w:t xml:space="preserve">Раздел результатов показывает, что поставленная пилотная задача имеет смысл: ByT5-small 512 превосходит identity baseline, rule-based normalizer и train-derived char-confusion baseline, улучшает большинство тестовых примеров и особенно заметно снижает WER. Это предварительно показывает применимость byte-level neural post-correction как первого шага для обработки исторических арабографичных тюркских текстов, но только в рамках controlled synthetic benchmark.</w:t>
-      </w:r>
-    </w:p>
-    <w:p>
-      <w:pPr>
-        <w:pStyle w:val="BodyText"/>
-      </w:pPr>
-      <w:r>
-        <w:t xml:space="preserve">Одновременно результаты задают границы этого вывода. Rule-based normalizer ухудшает качество, ExactMatch остаётся низким, а часть примеров после ByT5 становится хуже. Значит, модель нельзя рассматривать как готовый автоматический корректор без анализа ошибок и ручной проверки.</w:t>
-      </w:r>
-    </w:p>
-    <w:p>
-      <w:pPr>
-        <w:pStyle w:val="BodyText"/>
-      </w:pPr>
-      <w:r>
-        <w:t xml:space="preserve">Таким образом, эксперимент показывает жизнеспособность направления, но следующий этап должен быть строже: больше источников, реальные OCR/HTR-выходы, ручная валидация и более детальный анализ типов ошибок. Эти ограничения и направления развития рассматриваются в следующем разделе.</w:t>
-      </w:r>
-    </w:p>
-    <w:bookmarkEnd w:id="65"/>
+        <w:t xml:space="preserve">Первое ограничение связано с масштабом и составом корпуса. В текущей версии используется 400 чистых текстовых блоков из одного основного источника. Этого достаточно для проверки pipeline посткоррекции, но недостаточно для вывода о качестве метода на всём классе исторических арабографичных тюркских текстов.</w:t>
+      </w:r>
+    </w:p>
+    <w:p>
+      <w:pPr>
+        <w:pStyle w:val="BodyText"/>
+      </w:pPr>
+      <w:r>
+        <w:t xml:space="preserve">Один источник ограничивает жанровое, временное и орфографическое разнообразие материала. Тексты разных регионов, периодов и письменных традиций могут отличаться по графике, лексике, нормам записи и качеству исходного документа. Поэтому дальнейшая работа должна проверять модель не только на текущем османско-тюркском источнике, но и на других арабографичных тюркских материалах.</w:t>
+      </w:r>
+    </w:p>
     <w:bookmarkEnd w:id="66"/>
-    <w:bookmarkStart w:id="73" w:name="Xe8e02886c60b8939714d6e867e04f7997a20272"/>
-    <w:p>
-      <w:pPr>
-        <w:pStyle w:val="Heading2"/>
-      </w:pPr>
-      <w:r>
-        <w:t xml:space="preserve">6. Ограничения и направления дальнейшей работы</w:t>
-      </w:r>
-    </w:p>
-    <w:bookmarkStart w:id="67" w:name="ограничения-корпуса-1"/>
-    <w:p>
-      <w:pPr>
-        <w:pStyle w:val="Heading3"/>
-      </w:pPr>
-      <w:r>
-        <w:t xml:space="preserve">6.1 Ограничения корпуса</w:t>
-      </w:r>
-    </w:p>
-    <w:p>
-      <w:pPr>
-        <w:pStyle w:val="FirstParagraph"/>
-      </w:pPr>
-      <w:r>
-        <w:t xml:space="preserve">Первое ограничение связано с масштабом и составом корпуса. В текущей версии используется 400 чистых текстовых блоков из одного основного источника. Этого достаточно для проверки pipeline посткоррекции, но недостаточно для вывода о качестве метода на всём классе исторических арабографичных тюркских текстов.</w:t>
-      </w:r>
-    </w:p>
-    <w:p>
-      <w:pPr>
-        <w:pStyle w:val="BodyText"/>
-      </w:pPr>
-      <w:r>
-        <w:t xml:space="preserve">Один источник ограничивает жанровое, временное и орфографическое разнообразие материала. Тексты разных регионов, периодов и письменных традиций могут отличаться по графике, лексике, нормам записи и качеству исходного документа. Поэтому дальнейшая работа должна проверять модель не только на текущем османско-тюркском источнике, но и на других арабографичных тюркских материалах.</w:t>
-      </w:r>
-    </w:p>
-    <w:bookmarkEnd w:id="67"/>
-    <w:bookmarkStart w:id="68" w:name="ограничения-синтетического-шума"/>
+    <w:bookmarkStart w:id="67" w:name="ограничения-синтетического-шума"/>
     <w:p>
       <w:pPr>
         <w:pStyle w:val="Heading3"/>
@@ -4730,14 +4701,40 @@
         <w:t xml:space="preserve">Однако реальные OCR/HTR-ошибки зависят от качества изображения, шрифта, сегментации страницы, модели распознавания и состояния документа. Синтетический шум может приближать часть таких ошибок, но не гарантирует полного совпадения с практическим сценарием. Поэтому следующий этап должен включать реальные OCR/HTR-выходы и ручную проверку соответствующих чистых текстов.</w:t>
       </w:r>
     </w:p>
+    <w:bookmarkEnd w:id="67"/>
+    <w:bookmarkStart w:id="68" w:name="ограничения-автоматических-метрик"/>
+    <w:p>
+      <w:pPr>
+        <w:pStyle w:val="Heading3"/>
+      </w:pPr>
+      <w:r>
+        <w:t xml:space="preserve">6.3 Ограничения автоматических метрик</w:t>
+      </w:r>
+    </w:p>
+    <w:p>
+      <w:pPr>
+        <w:pStyle w:val="FirstParagraph"/>
+      </w:pPr>
+      <w:r>
+        <w:t xml:space="preserve">Третье ограничение связано с оценкой качества. CER, WER и ExactMatch позволяют формально сравнивать методы, но они не полностью описывают качество исправления исторического текста. Для таких материалов важно не только совпадение с эталоном, но и сохранение исторически значимых орфографических вариантов.</w:t>
+      </w:r>
+    </w:p>
+    <w:p>
+      <w:pPr>
+        <w:pStyle w:val="BodyText"/>
+      </w:pPr>
+      <w:r>
+        <w:t xml:space="preserve">Модель может уменьшить edit distance, но внести лингвистически сомнительное исправление. Возможна и обратная ситуация: небольшое отличие от эталона может быть допустимым вариантом исторической записи. Поэтому автоматические метрики нужно дополнять ручной экспертной оценкой. В будущей версии работы стоит выделить небольшой manually validated subset и анализировать ошибки не только количественно, но и лингвистически.</w:t>
+      </w:r>
+    </w:p>
     <w:bookmarkEnd w:id="68"/>
-    <w:bookmarkStart w:id="69" w:name="ограничения-автоматических-метрик"/>
+    <w:bookmarkStart w:id="69" w:name="направления-расширения-корпуса"/>
     <w:p>
       <w:pPr>
         <w:pStyle w:val="Heading3"/>
       </w:pPr>
       <w:r>
-        <w:t xml:space="preserve">6.3 Ограничения автоматических метрик</w:t>
+        <w:t xml:space="preserve">6.4 Направления расширения корпуса</w:t>
       </w:r>
     </w:p>
     <w:p>
@@ -4745,25 +4742,25 @@
         <w:pStyle w:val="FirstParagraph"/>
       </w:pPr>
       <w:r>
-        <w:t xml:space="preserve">Третье ограничение связано с оценкой качества. CER, WER и ExactMatch позволяют формально сравнивать методы, но они не полностью описывают качество исправления исторического текста. Для таких материалов важно не только совпадение с эталоном, но и сохранение исторически значимых орфографических вариантов.</w:t>
-      </w:r>
-    </w:p>
-    <w:p>
-      <w:pPr>
-        <w:pStyle w:val="BodyText"/>
-      </w:pPr>
-      <w:r>
-        <w:t xml:space="preserve">Модель может уменьшить edit distance, но внести лингвистически сомнительное исправление. Возможна и обратная ситуация: небольшое отличие от эталона может быть допустимым вариантом исторической записи. Поэтому автоматические метрики нужно дополнять ручной экспертной оценкой. В будущей версии работы стоит выделить небольшой manually validated subset и анализировать ошибки не только количественно, но и лингвистически.</w:t>
+        <w:t xml:space="preserve">Первое направление дальнейшей работы — расширение корпуса. Нужно добавить тексты разных периодов, жанров и региональных традиций арабографичной тюркской письменности. Это позволит проверить, сохраняется ли качество post-correction за пределами одного османско-тюркского источника.</w:t>
+      </w:r>
+    </w:p>
+    <w:p>
+      <w:pPr>
+        <w:pStyle w:val="BodyText"/>
+      </w:pPr>
+      <w:r>
+        <w:t xml:space="preserve">Особенно важно перейти от чистых текстовых блоков к связке «изображение → OCR/HTR-вывод → чистый текст». Такая структура позволит оценивать модель не только на синтетическом шуме, но и на ошибках реальных систем распознавания. Для этого потребуется небольшой, но качественно проверенный набор строк или страниц с ручной валидацией.</w:t>
       </w:r>
     </w:p>
     <w:bookmarkEnd w:id="69"/>
-    <w:bookmarkStart w:id="70" w:name="направления-расширения-корпуса"/>
+    <w:bookmarkStart w:id="70" w:name="развитие-модельной-части"/>
     <w:p>
       <w:pPr>
         <w:pStyle w:val="Heading3"/>
       </w:pPr>
       <w:r>
-        <w:t xml:space="preserve">6.4 Направления расширения корпуса</w:t>
+        <w:t xml:space="preserve">6.5 Развитие модельной части</w:t>
       </w:r>
     </w:p>
     <w:p>
@@ -4771,25 +4768,33 @@
         <w:pStyle w:val="FirstParagraph"/>
       </w:pPr>
       <w:r>
-        <w:t xml:space="preserve">Первое направление дальнейшей работы — расширение корпуса. Нужно добавить тексты разных периодов, жанров и региональных традиций арабографичной тюркской письменности. Это позволит проверить, сохраняется ли качество post-correction за пределами одного османско-тюркского источника.</w:t>
-      </w:r>
-    </w:p>
-    <w:p>
-      <w:pPr>
-        <w:pStyle w:val="BodyText"/>
-      </w:pPr>
-      <w:r>
-        <w:t xml:space="preserve">Особенно важно перейти от чистых текстовых блоков к связке «изображение → OCR/HTR-вывод → чистый текст». Такая структура позволит оценивать модель не только на синтетическом шуме, но и на ошибках реальных систем распознавания. Для этого потребуется небольшой, но качественно проверенный набор строк или страниц с ручной валидацией.</w:t>
+        <w:t xml:space="preserve">Вторая линия развития связана с моделями и параметрами обучения. Текущая работа использует ByT5-small как основной нейросетевой baseline. В дальнейшем стоит сравнить более крупные варианты ByT5, другие sequence-to-sequence модели и специализированные OCR post-correction подходы.</w:t>
+      </w:r>
+    </w:p>
+    <w:p>
+      <w:pPr>
+        <w:pStyle w:val="BodyText"/>
+      </w:pPr>
+      <w:r>
+        <w:t xml:space="preserve">Отдельно стоит проверять и LLM-based post-correction подходы. Современные работы показывают, что для исторических документов такие методы требуют осторожной оценки и не дают гарантированного выигрыша без учёта корпуса, типа ошибок и процедуры валидации (Kanerva et al., 2025).</w:t>
+      </w:r>
+    </w:p>
+    <w:p>
+      <w:pPr>
+        <w:pStyle w:val="BodyText"/>
+      </w:pPr>
+      <w:r>
+        <w:t xml:space="preserve">Также нужно исследовать чувствительность результата к числу эпох, размеру обучающей выборки, максимальной длине последовательности и составу синтетического шума. Это поможет отделить эффект архитектуры от эффекта параметров эксперимента и понять, какие настройки действительно важны для арабографичного тюркского материала.</w:t>
       </w:r>
     </w:p>
     <w:bookmarkEnd w:id="70"/>
-    <w:bookmarkStart w:id="71" w:name="развитие-модельной-части"/>
+    <w:bookmarkStart w:id="71" w:name="Xe0f4525a4655057f90c3dc6525f7d54178a77a1"/>
     <w:p>
       <w:pPr>
         <w:pStyle w:val="Heading3"/>
       </w:pPr>
       <w:r>
-        <w:t xml:space="preserve">6.5 Развитие модельной части</w:t>
+        <w:t xml:space="preserve">6.6 Переход к более широкой системе анализа текстов</w:t>
       </w:r>
     </w:p>
     <w:p>
@@ -4797,62 +4802,28 @@
         <w:pStyle w:val="FirstParagraph"/>
       </w:pPr>
       <w:r>
-        <w:t xml:space="preserve">Вторая линия развития связана с моделями и параметрами обучения. Текущая работа использует ByT5-small как основной нейросетевой baseline. В дальнейшем стоит сравнить более крупные варианты ByT5, другие sequence-to-sequence модели и специализированные OCR post-correction подходы.</w:t>
-      </w:r>
-    </w:p>
-    <w:p>
-      <w:pPr>
-        <w:pStyle w:val="BodyText"/>
-      </w:pPr>
-      <w:r>
-        <w:t xml:space="preserve">Отдельно стоит проверять и LLM-based post-correction подходы. Современные работы показывают, что для исторических документов такие методы требуют осторожной оценки и не дают гарантированного выигрыша без учёта корпуса, типа ошибок и процедуры валидации (Kanerva et al., 2025).</w:t>
-      </w:r>
-    </w:p>
-    <w:p>
-      <w:pPr>
-        <w:pStyle w:val="BodyText"/>
-      </w:pPr>
-      <w:r>
-        <w:t xml:space="preserve">Также нужно исследовать чувствительность результата к числу эпох, размеру обучающей выборки, максимальной длине последовательности и составу синтетического шума. Это поможет отделить эффект архитектуры от эффекта параметров эксперимента и понять, какие настройки действительно важны для арабографичного тюркского материала.</w:t>
+        <w:t xml:space="preserve">Посткоррекция является промежуточным этапом, а не конечной целью. После улучшения OCR/HTR-вывода можно переходить к задачам поиска, нормализации вариантов написания, извлечения именованных сущностей, сопоставления исторических записей и построения графов связей.</w:t>
+      </w:r>
+    </w:p>
+    <w:p>
+      <w:pPr>
+        <w:pStyle w:val="BodyText"/>
+      </w:pPr>
+      <w:r>
+        <w:t xml:space="preserve">В контексте будущей выпускной работы этот пилот может стать техническим основанием для системы анализа исторических арабографичных тюркских материалов. Более крупная система может включать OCR/HTR, post-correction, NER, record linkage, извлечение дат и топонимов, а также построение связей между людьми, местами и документами.</w:t>
+      </w:r>
+    </w:p>
+    <w:p>
+      <w:pPr>
+        <w:pStyle w:val="BodyText"/>
+      </w:pPr>
+      <w:r>
+        <w:t xml:space="preserve">Таким образом, текущая работа закрывает не всю задачу цифровой обработки исторических источников, а один необходимый слой будущего pipeline: повышение качества текстового вывода перед последующим историко-лингвистическим анализом.</w:t>
       </w:r>
     </w:p>
     <w:bookmarkEnd w:id="71"/>
-    <w:bookmarkStart w:id="72" w:name="Xe0f4525a4655057f90c3dc6525f7d54178a77a1"/>
-    <w:p>
-      <w:pPr>
-        <w:pStyle w:val="Heading3"/>
-      </w:pPr>
-      <w:r>
-        <w:t xml:space="preserve">6.6 Переход к более широкой системе анализа текстов</w:t>
-      </w:r>
-    </w:p>
-    <w:p>
-      <w:pPr>
-        <w:pStyle w:val="FirstParagraph"/>
-      </w:pPr>
-      <w:r>
-        <w:t xml:space="preserve">Посткоррекция является промежуточным этапом, а не конечной целью. После улучшения OCR/HTR-вывода можно переходить к задачам поиска, нормализации вариантов написания, извлечения именованных сущностей, сопоставления исторических записей и построения графов связей.</w:t>
-      </w:r>
-    </w:p>
-    <w:p>
-      <w:pPr>
-        <w:pStyle w:val="BodyText"/>
-      </w:pPr>
-      <w:r>
-        <w:t xml:space="preserve">В контексте будущей выпускной работы этот пилот может стать техническим основанием для системы анализа исторических арабографичных тюркских материалов. Более крупная система может включать OCR/HTR, post-correction, NER, record linkage, извлечение дат и топонимов, а также построение связей между людьми, местами и документами.</w:t>
-      </w:r>
-    </w:p>
-    <w:p>
-      <w:pPr>
-        <w:pStyle w:val="BodyText"/>
-      </w:pPr>
-      <w:r>
-        <w:t xml:space="preserve">Таким образом, текущая работа закрывает не всю задачу цифровой обработки исторических источников, а один необходимый слой будущего pipeline: повышение качества текстового вывода перед последующим историко-лингвистическим анализом.</w:t>
-      </w:r>
-    </w:p>
     <w:bookmarkEnd w:id="72"/>
-    <w:bookmarkEnd w:id="73"/>
-    <w:bookmarkStart w:id="74" w:name="заключение"/>
+    <w:bookmarkStart w:id="73" w:name="заключение"/>
     <w:p>
       <w:pPr>
         <w:pStyle w:val="Heading2"/>
@@ -4913,6 +4884,12 @@
         <w:t xml:space="preserve">Тем не менее работа создаёт техническую основу для дальнейшего исследования. Полученный pipeline можно расширять в сторону полноценной системы обработки исторических документов: от OCR/HTR и post-correction к поиску, извлечению именованных сущностей, сопоставлению исторических записей и построению графов связей между людьми, местами и документами.</w:t>
       </w:r>
     </w:p>
+    <w:p>
+      <w:r>
+        <w:br w:type="page"/>
+      </w:r>
+    </w:p>
+    <w:bookmarkEnd w:id="73"/>
     <w:bookmarkEnd w:id="74"/>
     <w:bookmarkStart w:id="75" w:name="список-литературы"/>
     <w:p>
@@ -5495,7 +5472,7 @@
         <w:rFonts w:asciiTheme="minorHAnsi" w:cstheme="minorBidi" w:eastAsiaTheme="minorHAnsi" w:hAnsiTheme="minorHAnsi"/>
         <w:sz w:val="24"/>
         <w:szCs w:val="24"/>
-        <w:lang w:bidi="ar-SA" w:eastAsia="en-US" w:val="ru-RU"/>
+        <w:lang w:bidi="ar-SA" w:eastAsia="en-US" w:val="en-US"/>
       </w:rPr>
     </w:rPrDefault>
     <w:pPrDefault>

</xml_diff>

<commit_message>
docs: rebuild course paper DOCX after alignment update
</commit_message>
<xml_diff>
--- a/outputs/course_paper_hse_final.docx
+++ b/outputs/course_paper_hse_final.docx
@@ -3225,7 +3225,7 @@
         <w:pStyle w:val="FirstParagraph"/>
       </w:pPr>
       <w:r>
-        <w:t xml:space="preserve">Для оценки качества используются три метрики: CER, WER, NoSpaceCER и ExactMatch. Они измеряют разные уровни близости предсказания к эталонной строке и поэтому рассматриваются совместно.</w:t>
+        <w:t xml:space="preserve">Для оценки качества используются четыре основных индикатора: CER, WER, NoSpaceCER и ExactMatch. Они измеряют разные уровни близости предсказания к эталонной строке и поэтому рассматриваются совместно.</w:t>
       </w:r>
     </w:p>
     <w:p>
@@ -3264,7 +3264,7 @@
         <w:pStyle w:val="a0"/>
       </w:pPr>
       <w:r>
-        <w:t xml:space="preserve">ExactMatch показывает долю строк, полностью совпавших с эталоном. Для длинных исторических строк эта метрика очень строгая: один неверный символ уже делает пример несовпадающим. Поэтому ExactMatch используется как дополнительный индикатор, а основные выводы строятся по CER, WER и анализу ошибок.</w:t>
+        <w:t xml:space="preserve">ExactMatch показывает долю строк, полностью совпавших с эталоном. Для длинных исторических строк эта метрика очень строгая: один неверный символ уже делает пример несовпадающим. Поэтому ExactMatch используется как дополнительный строгий индикатор, а основные выводы строятся по CER, WER, NoSpaceCER и анализу ошибок.</w:t>
       </w:r>
     </w:p>
     <w:bookmarkEnd w:id="47"/>
@@ -3904,7 +3904,7 @@
         <w:pStyle w:val="a0"/>
       </w:pPr>
       <w:r>
-        <w:t xml:space="preserve">ExactMatch остаётся низким у всех методов. Это ожидаемо для длинных строк и строгого посимвольного сравнения: даже одна ошибка делает строку несовпадающей с эталоном. Поэтому ExactMatch используется как дополнительный индикатор, а основные выводы строятся по CER, WER и анализу ошибок.</w:t>
+        <w:t xml:space="preserve">ExactMatch остаётся низким у всех методов. Это ожидаемо для длинных строк и строгого посимвольного сравнения: даже одна ошибка делает строку несовпадающей с эталоном. Поэтому ExactMatch используется как дополнительный строгий индикатор, а основные выводы строятся по CER, WER, NoSpaceCER и анализу ошибок.</w:t>
       </w:r>
     </w:p>
     <w:bookmarkEnd w:id="54"/>

</xml_diff>

<commit_message>
docs: rebuild course paper docx
</commit_message>
<xml_diff>
--- a/outputs/course_paper_hse_final.docx
+++ b/outputs/course_paper_hse_final.docx
@@ -2,6 +2,40 @@
 <file path=word/document.xml><?xml version="1.0" encoding="utf-8"?>
 <w:document xmlns:w="http://schemas.openxmlformats.org/wordprocessingml/2006/main" xmlns:m="http://schemas.openxmlformats.org/officeDocument/2006/math" xmlns:r="http://schemas.openxmlformats.org/officeDocument/2006/relationships" xmlns:o="urn:schemas-microsoft-com:office:office" xmlns:v="urn:schemas-microsoft-com:vml" xmlns:w10="urn:schemas-microsoft-com:office:word" xmlns:a="http://schemas.openxmlformats.org/drawingml/2006/main" xmlns:pic="http://schemas.openxmlformats.org/drawingml/2006/picture" xmlns:wp="http://schemas.openxmlformats.org/drawingml/2006/wordprocessingDrawing">
   <w:body>
+    <w:p>
+      <w:pPr>
+        <w:pStyle w:val="Title"/>
+      </w:pPr>
+      <w:r>
+        <w:t xml:space="preserve">OCR post-correction for low-resource Arabic-script Turkic historical texts</w:t>
+      </w:r>
+    </w:p>
+    <w:sdt>
+      <w:sdtPr>
+        <w:docPartObj>
+          <w:docPartGallery w:val="Table of Contents"/>
+          <w:docPartUnique/>
+        </w:docPartObj>
+      </w:sdtPr>
+      <w:sdtContent>
+        <w:p>
+          <w:pPr>
+            <w:pStyle w:val="TOCHeading"/>
+          </w:pPr>
+          <w:r>
+            <w:t xml:space="preserve">Table of Contents</w:t>
+          </w:r>
+        </w:p>
+        <w:p>
+          <w:r>
+            <w:fldChar w:fldCharType="begin" w:dirty="true"/>
+            <w:instrText xml:space="preserve">TOC \o "1-3" \h \z \u</w:instrText>
+            <w:fldChar w:fldCharType="separate"/>
+            <w:fldChar w:fldCharType="end"/>
+          </w:r>
+        </w:p>
+      </w:sdtContent>
+    </w:sdt>
     <w:p>
       <w:pPr>
         <w:pStyle w:val="FirstParagraph"/>
@@ -52,12 +86,12 @@
     </w:p>
     <w:p>
       <w:pPr>
-        <w:pStyle w:val="a0"/>
-      </w:pPr>
-    </w:p>
-    <w:p>
-      <w:pPr>
-        <w:pStyle w:val="a0"/>
+        <w:pStyle w:val="BodyText"/>
+      </w:pPr>
+    </w:p>
+    <w:p>
+      <w:pPr>
+        <w:pStyle w:val="BodyText"/>
       </w:pPr>
       <w:r>
         <w:rPr>
@@ -69,7 +103,7 @@
     </w:p>
     <w:p>
       <w:pPr>
-        <w:pStyle w:val="a0"/>
+        <w:pStyle w:val="BodyText"/>
       </w:pPr>
       <w:r>
         <w:rPr>
@@ -81,12 +115,12 @@
     </w:p>
     <w:p>
       <w:pPr>
-        <w:pStyle w:val="a0"/>
-      </w:pPr>
-    </w:p>
-    <w:p>
-      <w:pPr>
-        <w:pStyle w:val="a0"/>
+        <w:pStyle w:val="BodyText"/>
+      </w:pPr>
+    </w:p>
+    <w:p>
+      <w:pPr>
+        <w:pStyle w:val="BodyText"/>
       </w:pPr>
       <w:r>
         <w:rPr>
@@ -98,12 +132,12 @@
     </w:p>
     <w:p>
       <w:pPr>
-        <w:pStyle w:val="a0"/>
-      </w:pPr>
-    </w:p>
-    <w:p>
-      <w:pPr>
-        <w:pStyle w:val="a0"/>
+        <w:pStyle w:val="BodyText"/>
+      </w:pPr>
+    </w:p>
+    <w:p>
+      <w:pPr>
+        <w:pStyle w:val="BodyText"/>
       </w:pPr>
       <w:r>
         <w:rPr>
@@ -127,7 +161,7 @@
     </w:p>
     <w:p>
       <w:pPr>
-        <w:pStyle w:val="a0"/>
+        <w:pStyle w:val="BodyText"/>
       </w:pPr>
       <w:r>
         <w:rPr>
@@ -177,12 +211,12 @@
     </w:p>
     <w:p>
       <w:pPr>
-        <w:pStyle w:val="a0"/>
-      </w:pPr>
-    </w:p>
-    <w:p>
-      <w:pPr>
-        <w:pStyle w:val="a0"/>
+        <w:pStyle w:val="BodyText"/>
+      </w:pPr>
+    </w:p>
+    <w:p>
+      <w:pPr>
+        <w:pStyle w:val="BodyText"/>
       </w:pPr>
       <w:r>
         <w:t xml:space="preserve">Москва, 2026</w:t>
@@ -196,7 +230,7 @@
     <w:bookmarkStart w:id="9" w:name="содержание"/>
     <w:p>
       <w:pPr>
-        <w:pStyle w:val="1"/>
+        <w:pStyle w:val="Heading1"/>
       </w:pPr>
       <w:r>
         <w:t xml:space="preserve">Содержание</w:t>
@@ -211,7 +245,7 @@
     <w:bookmarkStart w:id="75" w:name="аннотация"/>
     <w:p>
       <w:pPr>
-        <w:pStyle w:val="1"/>
+        <w:pStyle w:val="Heading1"/>
       </w:pPr>
       <w:r>
         <w:t xml:space="preserve">Аннотация</w:t>
@@ -227,7 +261,7 @@
     </w:p>
     <w:p>
       <w:pPr>
-        <w:pStyle w:val="a0"/>
+        <w:pStyle w:val="BodyText"/>
       </w:pPr>
       <w:r>
         <w:t xml:space="preserve">В качестве пилотного этапа разработан воспроизводимый пайплайн для посткоррекции OCR-подобных ошибок в арабографичном тюркском тексте. Корпус построен на основе османско-тюркского текста в арабской графике. На его основе сформирован синтетический набор данных: чистые строки искажаются контролируемым генератором OCR-подобного шума, после чего строятся train/valid/test-разбиения без утечки исходных строк между выборками.</w:t>
@@ -235,7 +269,7 @@
     </w:p>
     <w:p>
       <w:pPr>
-        <w:pStyle w:val="a0"/>
+        <w:pStyle w:val="BodyText"/>
       </w:pPr>
       <w:r>
         <w:t xml:space="preserve">В экспериментальной части сравниваются identity baseline, простой rule-based normalizer, train-derived character-confusion baseline и нейросетевая модель ByT5-small. Итоговая модель ByT5-small с длиной последовательности 512 показывает лучший результат среди рассмотренных методов на данном синтетическом benchmark. При этом улучшение по CER остаётся умеренным, а заметное снижение WER требует осторожной интерпретации, поскольку synthetic noise включает ошибки пробелов и границ слов. Дополнительно проведён анализ ошибок на уровне отдельных тестовых примеров, показывающий, что модель улучшает большинство строк, но не является равномерно безопасной и требует дальнейшей валидации.</w:t>
@@ -243,16 +277,16 @@
     </w:p>
     <w:p>
       <w:pPr>
-        <w:pStyle w:val="a0"/>
-      </w:pPr>
-      <w:r>
-        <w:t xml:space="preserve">Работа рассматривается как пилотный этап для дальнейшего расширения корпуса и построения более полного бенчмарка для исторических тюркских текстов в арабской графике. Дополнительно проведён небольшой real-OCR sanity check на выходе Tesseract, который показывает частичный, но ограниченный перенос synthetic-trained ByT5 на реальные OCR-ошибки.</w:t>
+        <w:pStyle w:val="BodyText"/>
+      </w:pPr>
+      <w:r>
+        <w:t xml:space="preserve">Работа рассматривается как пилотный этап для дальнейшего расширения корпуса и построения более полного бенчмарка для исторических тюркских текстов в арабской графике. Отдельная проверка на реальном OCR-выводе Tesseract для османско-турецкого печатного источника показала заметный разрыв между синтетическим шумом и настоящими OCR-ошибками: модель, обученная на synthetic noise, немного снижает WER, но ухудшает CER на полном page-level наборе. Поэтому главный практический вывод работы состоит не в готовности модели к автоматическому применению, а в необходимости real-domain adaptation: выравнивания реальных OCR/reference-фрагментов, обучения на настоящих ошибках и консервативной фильтрации предсказаний.</w:t>
       </w:r>
     </w:p>
     <w:bookmarkStart w:id="10" w:name="введение"/>
     <w:p>
       <w:pPr>
-        <w:pStyle w:val="2"/>
+        <w:pStyle w:val="Heading2"/>
       </w:pPr>
       <w:r>
         <w:t xml:space="preserve">1. Введение</w:t>
@@ -268,7 +302,7 @@
     </w:p>
     <w:p>
       <w:pPr>
-        <w:pStyle w:val="a0"/>
+        <w:pStyle w:val="BodyText"/>
       </w:pPr>
       <w:r>
         <w:t xml:space="preserve">Несмотря на историческую значимость таких источников, их автоматическая обработка остаётся сложной задачей. Современные инструменты оптического распознавания текста и обработки естественного языка обычно лучше развиты для массовых современных языков и стандартных письменностей. Для исторических арабографичных тюркских материалов ситуация иная: доступных размеченных корпусов мало, орфография нестабильна, качество сканов и печатных источников может быть неоднородным, а готовые модели часто не учитывают специфику старой письменной традиции.</w:t>
@@ -276,7 +310,7 @@
     </w:p>
     <w:p>
       <w:pPr>
-        <w:pStyle w:val="a0"/>
+        <w:pStyle w:val="BodyText"/>
       </w:pPr>
       <w:r>
         <w:t xml:space="preserve">В результате исследователь, работающий с такими документами, сталкивается не только с задачей распознавания символов, но и с более широкой проблемой восстановления и нормализации текста. Даже если OCR-система выдаёт частично читаемый результат, в нём остаются ошибки: пропуски, замены похожих букв, неправильные пробелы, смешение графем и искажение слов. Такие ошибки затрудняют дальнейший поиск, индексирование, извлечение сущностей и историко-лингвистический анализ.</w:t>
@@ -284,7 +318,7 @@
     </w:p>
     <w:p>
       <w:pPr>
-        <w:pStyle w:val="a0"/>
+        <w:pStyle w:val="BodyText"/>
       </w:pPr>
       <w:r>
         <w:t xml:space="preserve">В данной работе рассматривается один из первых технических шагов в этом направлении — посткоррекция OCR-подобных ошибок для исторического тюркского текста в арабской графике. Вместо попытки сразу построить полную систему распознавания и анализа документов работа фокусируется на воспроизводимом пилотном пайплайне: сбор небольшого корпуса, генерация контролируемых OCR-подобных искажений, обучение модели исправления текста и анализ качества результата.</w:t>
@@ -294,7 +328,7 @@
     <w:bookmarkStart w:id="11" w:name="актуальность"/>
     <w:p>
       <w:pPr>
-        <w:pStyle w:val="2"/>
+        <w:pStyle w:val="Heading2"/>
       </w:pPr>
       <w:r>
         <w:t xml:space="preserve">1.1 Актуальность</w:t>
@@ -310,7 +344,7 @@
     </w:p>
     <w:p>
       <w:pPr>
-        <w:pStyle w:val="a0"/>
+        <w:pStyle w:val="BodyText"/>
       </w:pPr>
       <w:r>
         <w:t xml:space="preserve">Во-первых, исторические тюркские тексты в арабской графике остаются недостаточно представленными в цифровых корпусах и инструментах автоматической обработки. Это ограничивает возможности поиска, анализа и повторного использования источников в исторических, филологических и культурологических исследованиях.</w:t>
@@ -318,7 +352,7 @@
     </w:p>
     <w:p>
       <w:pPr>
-        <w:pStyle w:val="a0"/>
+        <w:pStyle w:val="BodyText"/>
       </w:pPr>
       <w:r>
         <w:t xml:space="preserve">Во-вторых, низкоресурсный характер задачи делает прямое применение стандартных OCR- и NLP-подходов недостаточным. Модели, хорошо работающие на современных языках и стандартных корпусах, могут давать нестабильные результаты на исторических текстах с вариативной орфографией и нетипичными графическими формами.</w:t>
@@ -326,7 +360,7 @@
     </w:p>
     <w:p>
       <w:pPr>
-        <w:pStyle w:val="a0"/>
+        <w:pStyle w:val="BodyText"/>
       </w:pPr>
       <w:r>
         <w:t xml:space="preserve">В-третьих, посткоррекция OCR-ошибок является практически важным промежуточным этапом. Даже небольшое улучшение качества распознанного текста может повысить пригодность корпуса для поиска, разметки, извлечения именованных сущностей и последующего анализа.</w:t>
@@ -334,7 +368,7 @@
     </w:p>
     <w:p>
       <w:pPr>
-        <w:pStyle w:val="a0"/>
+        <w:pStyle w:val="BodyText"/>
       </w:pPr>
       <w:r>
         <w:t xml:space="preserve">В-четвёртых, создание воспроизводимого пилотного бенчмарка важно не только для конкретной курсовой работы, но и для дальнейшего дипломного и публикационного проекта. Такой benchmark позволяет формализовать задачу, фиксировать метрики и постепенно расширять экспериментальную базу.</w:t>
@@ -344,7 +378,7 @@
     <w:bookmarkStart w:id="12" w:name="постановка-проблемы"/>
     <w:p>
       <w:pPr>
-        <w:pStyle w:val="2"/>
+        <w:pStyle w:val="Heading2"/>
       </w:pPr>
       <w:r>
         <w:t xml:space="preserve">1.2 Постановка проблемы</w:t>
@@ -360,7 +394,7 @@
     </w:p>
     <w:p>
       <w:pPr>
-        <w:pStyle w:val="a0"/>
+        <w:pStyle w:val="BodyText"/>
       </w:pPr>
       <w:r>
         <w:t xml:space="preserve">Эта проблема включает несколько частных трудностей:</w:t>
@@ -455,14 +489,14 @@
         <w:pStyle w:val="FirstParagraph"/>
       </w:pPr>
       <w:r>
-        <w:t xml:space="preserve">В рамках данной работы проблема сужается до пилотной постановки: можно ли с помощью нейросетевой sequence-to-sequence модели улучшить синтетически искажённый арабографичный тюркский текст по сравнению с простыми baseline-подходами, а также наблюдается ли хотя бы частичный перенос такой модели на небольшой real-OCR subset.</w:t>
+        <w:t xml:space="preserve">В рамках данной работы проблема сужается до пилотной постановки: можно ли с помощью нейросетевой sequence-to-sequence модели улучшить синтетически искажённый арабографичный тюркский текст по сравнению с простыми baseline-подходами, и насколько такой результат переносится на page-level real-OCR benchmark, собранный по османско-турецкому печатному источнику в арабской графике.</w:t>
       </w:r>
     </w:p>
     <w:bookmarkEnd w:id="12"/>
     <w:bookmarkStart w:id="13" w:name="цель-работы"/>
     <w:p>
       <w:pPr>
-        <w:pStyle w:val="2"/>
+        <w:pStyle w:val="Heading2"/>
       </w:pPr>
       <w:r>
         <w:t xml:space="preserve">1.3 Цель работы</w:t>
@@ -480,7 +514,7 @@
     <w:bookmarkStart w:id="14" w:name="задачи-работы"/>
     <w:p>
       <w:pPr>
-        <w:pStyle w:val="2"/>
+        <w:pStyle w:val="Heading2"/>
       </w:pPr>
       <w:r>
         <w:t xml:space="preserve">1.4 Задачи работы</w:t>
@@ -611,7 +645,7 @@
         </w:numPr>
       </w:pPr>
       <w:r>
-        <w:t xml:space="preserve">Провести небольшой sanity check на real-OCR output и оценить synthetic-to-real transfer.</w:t>
+        <w:t xml:space="preserve">Провести page-level sanity check на реальном OCR-выводе Tesseract и оценить synthetic-to-real transfer.</w:t>
       </w:r>
     </w:p>
     <w:p>
@@ -630,7 +664,7 @@
     <w:bookmarkStart w:id="15" w:name="объект-и-предмет-исследования"/>
     <w:p>
       <w:pPr>
-        <w:pStyle w:val="2"/>
+        <w:pStyle w:val="Heading2"/>
       </w:pPr>
       <w:r>
         <w:t xml:space="preserve">1.5 Объект и предмет исследования</w:t>
@@ -646,7 +680,7 @@
     </w:p>
     <w:p>
       <w:pPr>
-        <w:pStyle w:val="a0"/>
+        <w:pStyle w:val="BodyText"/>
       </w:pPr>
       <w:r>
         <w:t xml:space="preserve">Предмет исследования — методы автоматической посткоррекции OCR-подобных ошибок в арабографичных тюркских текстах с использованием rule-based и нейросетевых подходов.</w:t>
@@ -656,7 +690,7 @@
     <w:bookmarkStart w:id="16" w:name="исследовательские-вопросы"/>
     <w:p>
       <w:pPr>
-        <w:pStyle w:val="2"/>
+        <w:pStyle w:val="Heading2"/>
       </w:pPr>
       <w:r>
         <w:t xml:space="preserve">1.6 Исследовательские вопросы</w:t>
@@ -742,11 +776,23 @@
         <w:t xml:space="preserve">Не связано ли заметное снижение WER преимущественно с исправлением синтетических ошибок пробелов и границ слов?</w:t>
       </w:r>
     </w:p>
+    <w:p>
+      <w:pPr>
+        <w:pStyle w:val="Compact"/>
+        <w:numPr>
+          <w:ilvl w:val="0"/>
+          <w:numId w:val="1003"/>
+        </w:numPr>
+      </w:pPr>
+      <w:r>
+        <w:t xml:space="preserve">Сохраняется ли выигрыш synthetic-trained модели на реальном OCR-выводе Tesseract для page-level османско-турецкого источника?</w:t>
+      </w:r>
+    </w:p>
     <w:bookmarkEnd w:id="16"/>
     <w:bookmarkStart w:id="17" w:name="гипотезы"/>
     <w:p>
       <w:pPr>
-        <w:pStyle w:val="2"/>
+        <w:pStyle w:val="Heading2"/>
       </w:pPr>
       <w:r>
         <w:t xml:space="preserve">1.7 Гипотезы</w:t>
@@ -762,7 +808,7 @@
     </w:p>
     <w:p>
       <w:pPr>
-        <w:pStyle w:val="a0"/>
+        <w:pStyle w:val="BodyText"/>
       </w:pPr>
       <w:r>
         <w:t xml:space="preserve">Гипотеза 1. Простая rule-based нормализация может ухудшать качество арабографичного тюркского текста, поскольку способна искажать значимые орфографические особенности.</w:t>
@@ -770,7 +816,7 @@
     </w:p>
     <w:p>
       <w:pPr>
-        <w:pStyle w:val="a0"/>
+        <w:pStyle w:val="BodyText"/>
       </w:pPr>
       <w:r>
         <w:t xml:space="preserve">Гипотеза 2. Byte-level sequence-to-sequence модель ByT5-small способна улучшить качество OCR post-correction по сравнению с identity baseline.</w:t>
@@ -778,17 +824,25 @@
     </w:p>
     <w:p>
       <w:pPr>
-        <w:pStyle w:val="a0"/>
+        <w:pStyle w:val="BodyText"/>
       </w:pPr>
       <w:r>
         <w:t xml:space="preserve">Гипотеза 3. Увеличение длины последовательности с 256 до 512 важно для арабографичного текста, поскольку ByT5 работает на уровне байтов, а один видимый символ арабской графики может занимать несколько байтов.</w:t>
+      </w:r>
+    </w:p>
+    <w:p>
+      <w:pPr>
+        <w:pStyle w:val="BodyText"/>
+      </w:pPr>
+      <w:r>
+        <w:t xml:space="preserve">Гипотеза 4. Модель, обученная только на синтетических OCR-подобных ошибках, не будет полностью переноситься на реальный page-level OCR без дополнительной адаптации на настоящих OCR/reference-парах.</w:t>
       </w:r>
     </w:p>
     <w:bookmarkEnd w:id="17"/>
     <w:bookmarkStart w:id="18" w:name="практическая-значимость"/>
     <w:p>
       <w:pPr>
-        <w:pStyle w:val="2"/>
+        <w:pStyle w:val="Heading2"/>
       </w:pPr>
       <w:r>
         <w:t xml:space="preserve">1.8 Практическая значимость</w:t>
@@ -804,7 +858,7 @@
     </w:p>
     <w:p>
       <w:pPr>
-        <w:pStyle w:val="a0"/>
+        <w:pStyle w:val="BodyText"/>
       </w:pPr>
       <w:r>
         <w:t xml:space="preserve">Кроме того, результаты работы могут быть полезны для задач цифровой гуманитаристики: поиска по историческим текстам, подготовки корпусов, последующего извлечения именованных сущностей, анализа исторических документов и построения более сложных систем обработки архивных материалов.</w:t>
@@ -814,7 +868,7 @@
     <w:bookmarkStart w:id="19" w:name="структура-работы"/>
     <w:p>
       <w:pPr>
-        <w:pStyle w:val="2"/>
+        <w:pStyle w:val="Heading2"/>
       </w:pPr>
       <w:r>
         <w:t xml:space="preserve">1.9 Структура работы</w:t>
@@ -832,7 +886,7 @@
     <w:bookmarkStart w:id="27" w:name="X0ceba565ddc4689162e5800a39ee266fa2dc29a"/>
     <w:p>
       <w:pPr>
-        <w:pStyle w:val="2"/>
+        <w:pStyle w:val="Heading2"/>
       </w:pPr>
       <w:r>
         <w:t xml:space="preserve">2. Обзор предметной области и связанных работ</w:t>
@@ -841,7 +895,7 @@
     <w:bookmarkStart w:id="20" w:name="X679db47d81c99eb1d359e7ecbdd9091b3199270"/>
     <w:p>
       <w:pPr>
-        <w:pStyle w:val="3"/>
+        <w:pStyle w:val="Heading3"/>
       </w:pPr>
       <w:r>
         <w:t xml:space="preserve">2.1 Автоматическое распознавание исторических документов</w:t>
@@ -857,7 +911,7 @@
     </w:p>
     <w:p>
       <w:pPr>
-        <w:pStyle w:val="a0"/>
+        <w:pStyle w:val="BodyText"/>
       </w:pPr>
       <w:r>
         <w:t xml:space="preserve">Для печатных документов обычно используется термин OCR — optical character recognition. Для рукописных материалов чаще применяется термин HTR — handwritten text recognition. В обоих случаях задача не сводится к классификации отдельных символов: система должна учитывать строку, слово, контекст и особенности конкретной письменной традиции.</w:t>
@@ -865,7 +919,7 @@
     </w:p>
     <w:p>
       <w:pPr>
-        <w:pStyle w:val="a0"/>
+        <w:pStyle w:val="BodyText"/>
       </w:pPr>
       <w:r>
         <w:t xml:space="preserve">В данной работе не строится OCR/HTR-система по изображениям. Исследуется следующий этап обработки — посткоррекция уже полученного текстового вывода. Такое ограничение делает постановку уже, но чище: можно отдельно проверить, насколько модель исправления ошибок способна восстанавливать арабографичный тюркский текст после OCR-подобных искажений.</w:t>
@@ -875,7 +929,7 @@
     <w:bookmarkStart w:id="21" w:name="Xa02a7bb48ad7549a4f67e48911e7568815c5168"/>
     <w:p>
       <w:pPr>
-        <w:pStyle w:val="3"/>
+        <w:pStyle w:val="Heading3"/>
       </w:pPr>
       <w:r>
         <w:t xml:space="preserve">2.2 Особенности арабографичных исторических текстов</w:t>
@@ -891,7 +945,7 @@
     </w:p>
     <w:p>
       <w:pPr>
-        <w:pStyle w:val="a0"/>
+        <w:pStyle w:val="BodyText"/>
       </w:pPr>
       <w:r>
         <w:t xml:space="preserve">В исторических тюркских текстах арабская графика усложняется ещё сильнее: в одном материале могут сосуществовать арабские, персидские и тюркские орфографические практики. Для тюркских языков арабское письмо адаптировалось под звуки, которые не всегда имели прямые соответствия в классической арабской письменности. Поэтому один и тот же символ может быть одновременно технической единицей OCR и носителем историко-орфографической информации.</w:t>
@@ -899,7 +953,7 @@
     </w:p>
     <w:p>
       <w:pPr>
-        <w:pStyle w:val="a0"/>
+        <w:pStyle w:val="BodyText"/>
       </w:pPr>
       <w:r>
         <w:t xml:space="preserve">Из этого следует важное ограничение: простая унификация символов не является заведомо безопасной предварительной процедурой. Она может убрать технический шум, но может и стереть значимые различия. Поэтому в данной работе rule-based normalizer рассматривается не как заведомо правильная предобработка, а как отдельный baseline, качество которого проверяется экспериментально.</w:t>
@@ -909,7 +963,7 @@
     <w:bookmarkStart w:id="22" w:name="X69a43e90e5ebd7e3113e444e7e5f2f644869f5a"/>
     <w:p>
       <w:pPr>
-        <w:pStyle w:val="3"/>
+        <w:pStyle w:val="Heading3"/>
       </w:pPr>
       <w:r>
         <w:t xml:space="preserve">2.3 Тюркские тексты в арабской графике как низкоресурсный материал</w:t>
@@ -925,7 +979,7 @@
     </w:p>
     <w:p>
       <w:pPr>
-        <w:pStyle w:val="a0"/>
+        <w:pStyle w:val="BodyText"/>
       </w:pPr>
       <w:r>
         <w:t xml:space="preserve">С точки зрения NLP такие материалы остаются низкоресурсными: для них меньше размеченных корпусов, стандартных бенчмарк-наборов, готовых моделей и инструментов, чем для современных массовых языков. Современные работы по Historical Turkish NLP отдельно подчёркивают необходимость создавать базовые ресурсы: корпуса, модели, разметку и инструменты для последующего анализа исторических текстов (Özateş et al., 2025).</w:t>
@@ -933,7 +987,7 @@
     </w:p>
     <w:p>
       <w:pPr>
-        <w:pStyle w:val="a0"/>
+        <w:pStyle w:val="BodyText"/>
       </w:pPr>
       <w:r>
         <w:t xml:space="preserve">В данной работе эта проблема сужается до одного технически проверяемого шага: построения воспроизводимого бенчмарка посткоррекции. Даже небольшой корпус полезен, если он явно фиксирует источник данных, процедуру разбиения, тип ошибок, метрики и ограничения. Такой протокол можно расширять новыми источниками и использовать как часть более крупной системы обработки исторических арабографичных тюркских документов.</w:t>
@@ -943,7 +997,7 @@
     <w:bookmarkStart w:id="23" w:name="посткоррекция-ocr-ошибок"/>
     <w:p>
       <w:pPr>
-        <w:pStyle w:val="3"/>
+        <w:pStyle w:val="Heading3"/>
       </w:pPr>
       <w:r>
         <w:t xml:space="preserve">2.4 Посткоррекция OCR-ошибок</w:t>
@@ -959,7 +1013,7 @@
     </w:p>
     <w:p>
       <w:pPr>
-        <w:pStyle w:val="a0"/>
+        <w:pStyle w:val="BodyText"/>
       </w:pPr>
       <w:r>
         <w:t xml:space="preserve">Ошибки OCR обычно включают замены похожих символов, удаления и вставки, неправильное разбиение на слова, искажение окончаний и локальные перестановки. Для исторических текстов к этому добавляются нестабильная орфография и несовпадение современных языковых норм с историческим написанием. Поэтому посткоррекция пересекается не только с исправлением OCR-шума, но и с задачей нормализации написаний; в литературе эти две задачи иногда рассматриваются совместно, но их нельзя полностью отождествлять (Duong et al., 2020).</w:t>
@@ -967,7 +1021,7 @@
     </w:p>
     <w:p>
       <w:pPr>
-        <w:pStyle w:val="a0"/>
+        <w:pStyle w:val="BodyText"/>
       </w:pPr>
       <w:r>
         <w:t xml:space="preserve">Для исторических арабографичных тюркских текстов посткоррекция важна как промежуточный слой между распознаванием и дальнейшим анализом. Даже частично ошибочный OCR-вывод после исправления становится полезнее для поиска, индексации, извлечения именованных сущностей, анализа топонимов, сопоставления записей и построения исторических баз данных. Поэтому в данной работе post-correction рассматривается не как косметическая правка текста, а как отдельный компонент будущего pipeline для обработки архивных материалов.</w:t>
@@ -977,7 +1031,7 @@
     <w:bookmarkStart w:id="24" w:name="синтетические-ocr-ошибки"/>
     <w:p>
       <w:pPr>
-        <w:pStyle w:val="3"/>
+        <w:pStyle w:val="Heading3"/>
       </w:pPr>
       <w:r>
         <w:t xml:space="preserve">2.5 Синтетические OCR-ошибки</w:t>
@@ -993,7 +1047,7 @@
     </w:p>
     <w:p>
       <w:pPr>
-        <w:pStyle w:val="a0"/>
+        <w:pStyle w:val="BodyText"/>
       </w:pPr>
       <w:r>
         <w:t xml:space="preserve">Преимущество синтетической постановки состоит в контроле: известен исходный чистый текст, типы искажений, процедура генерации, random seed и разбиение на train/valid/test. Это позволяет проверить не всю OCR-систему целиком, а более узкий вопрос: способна ли модель post-correction восстанавливать арабографичный тюркский текст после OCR-подобных ошибок.</w:t>
@@ -1001,7 +1055,7 @@
     </w:p>
     <w:p>
       <w:pPr>
-        <w:pStyle w:val="a0"/>
+        <w:pStyle w:val="BodyText"/>
       </w:pPr>
       <w:r>
         <w:t xml:space="preserve">Такой эксперимент нельзя считать заменой проверки на реальных OCR/HTR-выходах. Реальные ошибки зависят от качества изображения, шрифта, сегментации, модели распознавания и состояния документа. Поэтому результаты на синтетическом датасете в данной работе интерпретируются как пилотная проверка pipeline, а не как итоговая оценка качества на архивных сканах.</w:t>
@@ -1011,7 +1065,7 @@
     <w:bookmarkStart w:id="25" w:name="byte-level-модели-и-byt5"/>
     <w:p>
       <w:pPr>
-        <w:pStyle w:val="3"/>
+        <w:pStyle w:val="Heading3"/>
       </w:pPr>
       <w:r>
         <w:t xml:space="preserve">2.6 Byte-level модели и ByT5</w:t>
@@ -1027,7 +1081,7 @@
     </w:p>
     <w:p>
       <w:pPr>
-        <w:pStyle w:val="a0"/>
+        <w:pStyle w:val="BodyText"/>
       </w:pPr>
       <w:r>
         <w:t xml:space="preserve">В данной работе используется ByT5-small. ByT5 относится к byte-level sequence-to-sequence моделям: она работает на уровне байтов, а не заранее заданных слов или подслов (Xue et al., 2021). Это важно для низкоресурсного исторического материала, где обычный subword-токенизатор может плохо представлять редкие графемы, нестандартные написания, смешение письменных традиций и OCR-шум.</w:t>
@@ -1035,7 +1089,7 @@
     </w:p>
     <w:p>
       <w:pPr>
-        <w:pStyle w:val="a0"/>
+        <w:pStyle w:val="BodyText"/>
       </w:pPr>
       <w:r>
         <w:t xml:space="preserve">Byte-level представление имеет практическое следствие: длина последовательности в токенах не равна длине строки в видимых символах. Один символ арабской графики может занимать несколько байтов. Поэтому слишком короткое ограничение длины может обрезать часть контекста. В данной работе финальной конфигурацией выбрана длина 512; результаты показывают, что для арабографичных строк этот параметр является важным и должен явно контролироваться в эксперименте.</w:t>
@@ -1045,7 +1099,7 @@
     <w:bookmarkStart w:id="26" w:name="выводы-по-обзору"/>
     <w:p>
       <w:pPr>
-        <w:pStyle w:val="3"/>
+        <w:pStyle w:val="Heading3"/>
       </w:pPr>
       <w:r>
         <w:t xml:space="preserve">2.7 Выводы по обзору</w:t>
@@ -1061,7 +1115,7 @@
     </w:p>
     <w:p>
       <w:pPr>
-        <w:pStyle w:val="a0"/>
+        <w:pStyle w:val="BodyText"/>
       </w:pPr>
       <w:r>
         <w:t xml:space="preserve">Поэтому в данной работе выбрана узкая, но проверяемая постановка: не полный OCR/HTR по изображениям, а post-correction уже полученного текстового вывода. Такой выбор позволяет построить воспроизводимый benchmark, сравнить identity baseline, rule-based normalizer, train-derived character-confusion baseline и ByT5-small, а затем оценить результат по CER, WER и анализу ошибок.</w:t>
@@ -1069,7 +1123,7 @@
     </w:p>
     <w:p>
       <w:pPr>
-        <w:pStyle w:val="a0"/>
+        <w:pStyle w:val="BodyText"/>
       </w:pPr>
       <w:r>
         <w:t xml:space="preserve">Синтетический шум в этой постановке используется как пилотный инструмент, а не как замена реальному OCR/HTR. Полученный экспериментальный контур можно расширять: добавлять новые источники, реальные OCR-выходы, ручную валидацию, дополнительные модели и последующие задачи анализа исторических текстов.</w:t>
@@ -1080,7 +1134,7 @@
     <w:bookmarkStart w:id="41" w:name="данные-и-построение-корпуса"/>
     <w:p>
       <w:pPr>
-        <w:pStyle w:val="2"/>
+        <w:pStyle w:val="Heading2"/>
       </w:pPr>
       <w:r>
         <w:t xml:space="preserve">3. Данные и построение корпуса</w:t>
@@ -1089,7 +1143,7 @@
     <w:bookmarkStart w:id="28" w:name="общая-постановка"/>
     <w:p>
       <w:pPr>
-        <w:pStyle w:val="3"/>
+        <w:pStyle w:val="Heading3"/>
       </w:pPr>
       <w:r>
         <w:t xml:space="preserve">3.1 Общая постановка</w:t>
@@ -1105,7 +1159,7 @@
     </w:p>
     <w:p>
       <w:pPr>
-        <w:pStyle w:val="a0"/>
+        <w:pStyle w:val="BodyText"/>
       </w:pPr>
       <w:r>
         <w:t xml:space="preserve">В работе используется постановка</w:t>
@@ -1125,7 +1179,7 @@
     </w:p>
     <w:p>
       <w:pPr>
-        <w:pStyle w:val="a0"/>
+        <w:pStyle w:val="BodyText"/>
       </w:pPr>
       <w:r>
         <w:t xml:space="preserve">Важно, что эта постановка сознательно отделяет задачу посткоррекции от задачи распознавания изображения. В эксперименте не оценивается качество сегментации страниц или OCR/HTR-модели; оценивается только способность метода исправлять уже полученный текстовый вывод.</w:t>
@@ -1135,7 +1189,7 @@
     <w:bookmarkStart w:id="29" w:name="источник-данных"/>
     <w:p>
       <w:pPr>
-        <w:pStyle w:val="3"/>
+        <w:pStyle w:val="Heading3"/>
       </w:pPr>
       <w:r>
         <w:t xml:space="preserve">3.2 Источник данных</w:t>
@@ -1151,7 +1205,7 @@
     </w:p>
     <w:p>
       <w:pPr>
-        <w:pStyle w:val="a0"/>
+        <w:pStyle w:val="BodyText"/>
       </w:pPr>
       <w:r>
         <w:t xml:space="preserve">Сырой текст сохранён в</w:t>
@@ -1183,7 +1237,7 @@
     </w:p>
     <w:p>
       <w:pPr>
-        <w:pStyle w:val="a0"/>
+        <w:pStyle w:val="BodyText"/>
       </w:pPr>
       <w:r>
         <w:t xml:space="preserve">Источник выбран не как случайный арабографичный текст, а как материал, близкий к теме работы: он относится к историческим тюркским текстам, записанным арабской графикой. В нём встречаются характерные формы, например</w:t>
@@ -1253,7 +1307,7 @@
     <w:bookmarkStart w:id="30" w:name="сбор-и-предварительная-подготовка"/>
     <w:p>
       <w:pPr>
-        <w:pStyle w:val="3"/>
+        <w:pStyle w:val="Heading3"/>
       </w:pPr>
       <w:r>
         <w:t xml:space="preserve">3.3 Сбор и предварительная подготовка</w:t>
@@ -1281,7 +1335,7 @@
     </w:p>
     <w:p>
       <w:pPr>
-        <w:pStyle w:val="a0"/>
+        <w:pStyle w:val="BodyText"/>
       </w:pPr>
       <w:r>
         <w:t xml:space="preserve">На этапе предварительной подготовки не применяется агрессивная нормализация. Для исторического арабографичного материала это принципиально: часть графической и орфографической вариативности может быть содержательно значимой. Если заранее привести все формы к единому виду, то эксперимент перестанет проверять восстановление исторического текста и начнёт проверять качество выбранных правил нормализации.</w:t>
@@ -1289,7 +1343,7 @@
     </w:p>
     <w:p>
       <w:pPr>
-        <w:pStyle w:val="a0"/>
+        <w:pStyle w:val="BodyText"/>
       </w:pPr>
       <w:r>
         <w:t xml:space="preserve">Поэтому нормализация вынесена в отдельный baseline. Корпус хранится в максимально щадящем виде, а rule-based normalizer оценивается экспериментально наравне с identity baseline и нейросетевой моделью.</w:t>
@@ -1299,7 +1353,7 @@
     <w:bookmarkStart w:id="31" w:name="синтетические-ocr-подобные-искажения"/>
     <w:p>
       <w:pPr>
-        <w:pStyle w:val="3"/>
+        <w:pStyle w:val="Heading3"/>
       </w:pPr>
       <w:r>
         <w:t xml:space="preserve">3.4 Синтетические OCR-подобные искажения</w:t>
@@ -1327,7 +1381,7 @@
     </w:p>
     <w:p>
       <w:pPr>
-        <w:pStyle w:val="a0"/>
+        <w:pStyle w:val="BodyText"/>
       </w:pPr>
       <w:r>
         <w:t xml:space="preserve">Генератор имитирует несколько типов OCR-подобного шума: замены похожих графем, удаления, вставки, локальные искажения внутри слова и ошибки, влияющие как на character-level, так и на word-level качество. Такой набор ошибок не претендует на полное моделирование реального OCR, но позволяет проверить устойчивость post-correction методов в одинаковых условиях.</w:t>
@@ -1335,7 +1389,7 @@
     </w:p>
     <w:p>
       <w:pPr>
-        <w:pStyle w:val="a0"/>
+        <w:pStyle w:val="BodyText"/>
       </w:pPr>
       <w:r>
         <w:t xml:space="preserve">Генерация датасета выполняется модулем</w:t>
@@ -1369,7 +1423,7 @@
     <w:bookmarkStart w:id="32" w:name="типы-синтетических-искажений"/>
     <w:p>
       <w:pPr>
-        <w:pStyle w:val="3"/>
+        <w:pStyle w:val="Heading3"/>
       </w:pPr>
       <w:r>
         <w:t xml:space="preserve">3.4.1 Типы синтетических искажений</w:t>
@@ -1623,7 +1677,7 @@
     </w:tbl>
     <w:p>
       <w:pPr>
-        <w:pStyle w:val="a0"/>
+        <w:pStyle w:val="BodyText"/>
       </w:pPr>
       <w:r>
         <w:t xml:space="preserve">Особенно важно, что ошибки пробелов влияют на WER сильнее, чем на CER. Поэтому заметное снижение WER у модели не следует автоматически трактовать как доказательство такого же качества на реальном OCR. В текущей постановке это прежде всего показывает способность модели исправлять controlled word-boundary distortions в синтетическом benchmark.</w:t>
@@ -1633,7 +1687,7 @@
     <w:bookmarkStart w:id="33" w:name="Xe2e6ef423b4b11ea7446063a790a29ab69053e4"/>
     <w:p>
       <w:pPr>
-        <w:pStyle w:val="3"/>
+        <w:pStyle w:val="Heading3"/>
       </w:pPr>
       <w:r>
         <w:t xml:space="preserve">3.4.2 Количественная характеристика синтетического шума</w:t>
@@ -1863,7 +1917,7 @@
     </w:tbl>
     <w:p>
       <w:pPr>
-        <w:pStyle w:val="a0"/>
+        <w:pStyle w:val="BodyText"/>
       </w:pPr>
       <w:r>
         <w:t xml:space="preserve">Эти значения показывают, что шум не является только набором замен символов: почти половина noisy-строк короче clean-строк, примерно треть длиннее, а среднее изменение числа слов положительно. Это согласуется с наличием вставок, удалений и ошибок пробелов. Одновременно такая статистика подчёркивает ограничение эксперимента: генератор задаёт искусственное распределение ошибок, которое может отличаться от реальных OCR/HTR-выходов.</w:t>
@@ -1873,7 +1927,7 @@
     <w:bookmarkStart w:id="34" w:name="примеры-synthetic-noisy-clean-пар"/>
     <w:p>
       <w:pPr>
-        <w:pStyle w:val="3"/>
+        <w:pStyle w:val="Heading3"/>
       </w:pPr>
       <w:r>
         <w:t xml:space="preserve">3.4.3 Примеры synthetic noisy-clean пар</w:t>
@@ -2145,7 +2199,7 @@
     </w:tbl>
     <w:p>
       <w:pPr>
-        <w:pStyle w:val="a0"/>
+        <w:pStyle w:val="BodyText"/>
       </w:pPr>
       <w:r>
         <w:t xml:space="preserve">Полные noisy-clean примеры сохранены в репозитории в</w:t>
@@ -2167,7 +2221,7 @@
     <w:bookmarkStart w:id="35" w:name="X7e06f5a39b62b44484932cacc3041bc92985dff"/>
     <w:p>
       <w:pPr>
-        <w:pStyle w:val="3"/>
+        <w:pStyle w:val="Heading3"/>
       </w:pPr>
       <w:r>
         <w:t xml:space="preserve">3.4.4 Ограничения релевантности synthetic noise</w:t>
@@ -2183,17 +2237,17 @@
     </w:p>
     <w:p>
       <w:pPr>
-        <w:pStyle w:val="a0"/>
-      </w:pPr>
-      <w:r>
-        <w:t xml:space="preserve">Поэтому результаты на synthetic benchmark следует интерпретировать как controlled pilot study. Они показывают, что pipeline воспроизводим, baseline-и сравнимы, а ByT5-small способен улучшать строки при заданном распределении шума. Однако synthetic improvement не является доказательством практической эффективности на реальных архивных сканах. Следующий обязательный этап — real-OCR/HTR sanity check на небольшом наборе строк с ручным эталоном.</w:t>
+        <w:pStyle w:val="BodyText"/>
+      </w:pPr>
+      <w:r>
+        <w:t xml:space="preserve">Поэтому результаты на synthetic benchmark следует интерпретировать как controlled pilot study. Они показывают, что pipeline воспроизводим, baseline-и сравнимы, а ByT5-small способен улучшать строки при заданном распределении шума. Однако synthetic improvement не является доказательством практической эффективности на реальных архивных сканах. Добавленный page-level real-OCR benchmark как раз показывает это ограничение: без адаптации на настоящих OCR-ошибках модель начинает чаще портить символы, чем исправлять их.</w:t>
       </w:r>
     </w:p>
     <w:bookmarkEnd w:id="35"/>
     <w:bookmarkStart w:id="36" w:name="структура-датасета"/>
     <w:p>
       <w:pPr>
-        <w:pStyle w:val="3"/>
+        <w:pStyle w:val="Heading3"/>
       </w:pPr>
       <w:r>
         <w:t xml:space="preserve">3.5 Структура датасета</w:t>
@@ -2317,7 +2371,7 @@
     </w:p>
     <w:p>
       <w:pPr>
-        <w:pStyle w:val="a0"/>
+        <w:pStyle w:val="BodyText"/>
       </w:pPr>
       <w:r>
         <w:t xml:space="preserve">Такая структура важна для контроля эксперимента. Она позволяет увеличить число обучающих примеров за счёт нескольких зашумлённых вариантов, но при этом сохранить связь каждого примера с исходной строкой. Благодаря этому можно корректно проверять пересечения между train, valid и test не только по строкам датасета, но и по исходным строкам.</w:t>
@@ -2325,7 +2379,7 @@
     </w:p>
     <w:p>
       <w:pPr>
-        <w:pStyle w:val="a0"/>
+        <w:pStyle w:val="BodyText"/>
       </w:pPr>
       <w:r>
         <w:t xml:space="preserve">Файлы разбиения сохранены в</w:t>
@@ -2398,7 +2452,7 @@
     <w:bookmarkStart w:id="37" w:name="разбиение-на-train-valid-и-test"/>
     <w:p>
       <w:pPr>
-        <w:pStyle w:val="3"/>
+        <w:pStyle w:val="Heading3"/>
       </w:pPr>
       <w:r>
         <w:t xml:space="preserve">3.6 Разбиение на train, valid и test</w:t>
@@ -2577,7 +2631,7 @@
     </w:tbl>
     <w:p>
       <w:pPr>
-        <w:pStyle w:val="a0"/>
+        <w:pStyle w:val="BodyText"/>
       </w:pPr>
       <w:r>
         <w:t xml:space="preserve">Исходный корпус содержит 400 уникальных исходных строк. Из них 320 строк используются для обучения, 40 — для валидации и 40 — для тестирования. Для каждой исходной строки создаётся несколько зашумлённых вариантов, поэтому итоговое число строк после генерации увеличивается до 6400 в train и до 800 в valid/test.</w:t>
@@ -2585,7 +2639,7 @@
     </w:p>
     <w:p>
       <w:pPr>
-        <w:pStyle w:val="a0"/>
+        <w:pStyle w:val="BodyText"/>
       </w:pPr>
       <w:r>
         <w:t xml:space="preserve">Такой размер достаточен для пилотной проверки pipeline посткоррекции: он мал для финального бенчмарка, но позволяет сравнить baseline-подходы и нейросетевую модель в воспроизводимых условиях.</w:t>
@@ -2595,7 +2649,7 @@
     <w:bookmarkStart w:id="38" w:name="контроль-утечки-данных"/>
     <w:p>
       <w:pPr>
-        <w:pStyle w:val="3"/>
+        <w:pStyle w:val="Heading3"/>
       </w:pPr>
       <w:r>
         <w:t xml:space="preserve">3.7 Контроль утечки данных</w:t>
@@ -2611,7 +2665,7 @@
     </w:p>
     <w:p>
       <w:pPr>
-        <w:pStyle w:val="a0"/>
+        <w:pStyle w:val="BodyText"/>
       </w:pPr>
       <w:r>
         <w:t xml:space="preserve">Чтобы избежать такой утечки, разбиение выполняется не на уровне отдельных зашумлённых примеров, а на уровне исходных строк. Все зашумлённые варианты одной исходной строки попадают только в одну часть датасета: train, valid или test.</w:t>
@@ -2619,7 +2673,7 @@
     </w:p>
     <w:p>
       <w:pPr>
-        <w:pStyle w:val="a0"/>
+        <w:pStyle w:val="BodyText"/>
       </w:pPr>
       <w:r>
         <w:t xml:space="preserve">Проверка пересечений показала:</w:t>
@@ -2741,7 +2795,7 @@
     </w:tbl>
     <w:p>
       <w:pPr>
-        <w:pStyle w:val="a0"/>
+        <w:pStyle w:val="BodyText"/>
       </w:pPr>
       <w:r>
         <w:t xml:space="preserve">Таким образом, тестовая выборка не содержит исходных строк, которые встречались в обучении или валидации. Это делает оценку более строгой: модель проверяется на новых исходных строках, а не на новых зашумлённых вариациях уже знакомых строк.</w:t>
@@ -2751,7 +2805,7 @@
     <w:bookmarkStart w:id="39" w:name="ограничения-корпуса"/>
     <w:p>
       <w:pPr>
-        <w:pStyle w:val="3"/>
+        <w:pStyle w:val="Heading3"/>
       </w:pPr>
       <w:r>
         <w:t xml:space="preserve">3.8 Ограничения корпуса</w:t>
@@ -2767,7 +2821,7 @@
     </w:p>
     <w:p>
       <w:pPr>
-        <w:pStyle w:val="a0"/>
+        <w:pStyle w:val="BodyText"/>
       </w:pPr>
       <w:r>
         <w:t xml:space="preserve">Первое ограничение — объём: используется 400 чистых текстовых блоков. Этого достаточно, чтобы проверить pipeline, сравнить baseline-подходы и провести первый нейросетевой эксперимент. Однако такого объёма недостаточно, чтобы утверждать устойчивость метода на всём классе исторических арабографичных тюркских текстов.</w:t>
@@ -2775,7 +2829,7 @@
     </w:p>
     <w:p>
       <w:pPr>
-        <w:pStyle w:val="a0"/>
+        <w:pStyle w:val="BodyText"/>
       </w:pPr>
       <w:r>
         <w:t xml:space="preserve">Второе ограничение — один основной источник. Это снижает жанровое, временное и орфографическое разнообразие корпуса. Результаты показывают поведение модели на выбранном материале, но не доказывают переносимость на старотатарские, башкирские, крымскотатарские или другие арабографичные тюркские источники.</w:t>
@@ -2783,7 +2837,7 @@
     </w:p>
     <w:p>
       <w:pPr>
-        <w:pStyle w:val="a0"/>
+        <w:pStyle w:val="BodyText"/>
       </w:pPr>
       <w:r>
         <w:t xml:space="preserve">Третье ограничение — синтетическая природа ошибок. Noise generator создаёт OCR-подобные искажения, но реальные ошибки зависят от шрифта, качества скана, сегментации, модели распознавания и состояния документа. Поэтому текущий датасет проверяет pipeline посткоррекции в контролируемой постановке, но не заменяет оценку на реальных OCR/HTR-выходах.</w:t>
@@ -2791,7 +2845,7 @@
     </w:p>
     <w:p>
       <w:pPr>
-        <w:pStyle w:val="a0"/>
+        <w:pStyle w:val="BodyText"/>
       </w:pPr>
       <w:r>
         <w:t xml:space="preserve">Четвёртое ограничение — отсутствие ручной лингвистической валидации исправлений. Метрики CER и WER показывают формальную близость к эталону, но не всегда отражают историко-орфографическую допустимость исправления. Для следующего этапа нужен небольшой вручную проверенный subset с качественным анализом ошибок.</w:t>
@@ -2801,7 +2855,7 @@
     <w:bookmarkStart w:id="40" w:name="выводы-по-разделу"/>
     <w:p>
       <w:pPr>
-        <w:pStyle w:val="3"/>
+        <w:pStyle w:val="Heading3"/>
       </w:pPr>
       <w:r>
         <w:t xml:space="preserve">3.9 Выводы по разделу</w:t>
@@ -2817,7 +2871,7 @@
     </w:p>
     <w:p>
       <w:pPr>
-        <w:pStyle w:val="a0"/>
+        <w:pStyle w:val="BodyText"/>
       </w:pPr>
       <w:r>
         <w:t xml:space="preserve">Корпус не претендует на полноту и не заменяет benchmark на реальных OCR/HTR-выходах. Его роль на данном этапе уже иная: создать контролируемую экспериментальную основу, на которой можно сравнить identity baseline, rule-based normalizer, train-derived character-confusion baseline и нейросетевую модель ByT5-small в одинаковых условиях.</w:t>
@@ -2825,7 +2879,7 @@
     </w:p>
     <w:p>
       <w:pPr>
-        <w:pStyle w:val="a0"/>
+        <w:pStyle w:val="BodyText"/>
       </w:pPr>
       <w:r>
         <w:t xml:space="preserve">В дальнейшем этот корпус можно расширить за счёт новых источников, реальных OCR/HTR-выходов, ручной лингвистической валидации и более разнообразных исторических арабографичных тюркских материалов.</w:t>
@@ -2836,7 +2890,7 @@
     <w:bookmarkStart w:id="52" w:name="методология-эксперимента"/>
     <w:p>
       <w:pPr>
-        <w:pStyle w:val="2"/>
+        <w:pStyle w:val="Heading2"/>
       </w:pPr>
       <w:r>
         <w:t xml:space="preserve">4. Методология эксперимента</w:t>
@@ -2845,7 +2899,7 @@
     <w:bookmarkStart w:id="42" w:name="общая-схема-эксперимента"/>
     <w:p>
       <w:pPr>
-        <w:pStyle w:val="3"/>
+        <w:pStyle w:val="Heading3"/>
       </w:pPr>
       <w:r>
         <w:t xml:space="preserve">4.1 Общая схема эксперимента</w:t>
@@ -2885,7 +2939,7 @@
     </w:p>
     <w:p>
       <w:pPr>
-        <w:pStyle w:val="a0"/>
+        <w:pStyle w:val="BodyText"/>
       </w:pPr>
       <w:r>
         <w:t xml:space="preserve">Процедура эксперимента состоит из нескольких шагов: сначала оцениваются baseline-подходы, затем строится data-driven train-derived character-confusion baseline, после этого обучается и применяется ByT5-small. Далее предсказания всех методов сравниваются с эталонной строкой по CER, WER, NoSpaceCER и ExactMatch, а затем проводится анализ ошибок на уровне отдельных примеров.</w:t>
@@ -2893,7 +2947,7 @@
     </w:p>
     <w:p>
       <w:pPr>
-        <w:pStyle w:val="a0"/>
+        <w:pStyle w:val="BodyText"/>
       </w:pPr>
       <w:r>
         <w:t xml:space="preserve">Главный вопрос эксперимента — улучшает ли нейросетевая post-correction модель качество текста по сравнению с неизменённым зашумлённым вводом. Дополнительный вопрос — помогает ли простая rule-based нормализация именно для исторического арабографичного тюркского материала или, наоборот, ухудшает текст.</w:t>
@@ -2903,7 +2957,7 @@
     <w:bookmarkStart w:id="43" w:name="baseline-подходы"/>
     <w:p>
       <w:pPr>
-        <w:pStyle w:val="3"/>
+        <w:pStyle w:val="Heading3"/>
       </w:pPr>
       <w:r>
         <w:t xml:space="preserve">4.2 Baseline-подходы</w:t>
@@ -2919,7 +2973,7 @@
     </w:p>
     <w:p>
       <w:pPr>
-        <w:pStyle w:val="a0"/>
+        <w:pStyle w:val="BodyText"/>
       </w:pPr>
       <w:r>
         <w:t xml:space="preserve">Второй baseline — rule-based normalizer. Он применяет набор простых символьных правил к арабографичному тексту. Этот baseline нужен не как ожидаемо сильный метод, а как проверка важной гипотезы: можно ли улучшить качество простыми правилами нормализации без обучения модели.</w:t>
@@ -2927,7 +2981,7 @@
     </w:p>
     <w:p>
       <w:pPr>
-        <w:pStyle w:val="a0"/>
+        <w:pStyle w:val="BodyText"/>
       </w:pPr>
       <w:r>
         <w:t xml:space="preserve">Для исторического арабографичного тюркского материала такая проверка особенно важна. Нормализация может убрать часть технического шума, но может и стереть исторически значимые орфографические различия. Поэтому rule-based normalizer в работе не считается обязательной предобработкой, а оценивается как самостоятельный baseline.</w:t>
@@ -2935,7 +2989,7 @@
     </w:p>
     <w:p>
       <w:pPr>
-        <w:pStyle w:val="a0"/>
+        <w:pStyle w:val="BodyText"/>
       </w:pPr>
       <w:r>
         <w:t xml:space="preserve">Третий baseline — train-derived character-confusion baseline. Он строится по обучающим noisy-clean парам: noisy- и clean-строки выравниваются с помощью Levenshtein alignment, после чего оцениваются частотные соответствия между зашумлёнными и чистыми символами. Замена принимается только при достаточной поддержке и доминировании целевого символа. Такой baseline является data-driven, но non-neural: он может исправлять устойчивые локальные символьные путаницы, однако не умеет восстанавливать пропущенные символы из контекста и не моделирует дальние зависимости в строке.</w:t>
@@ -2945,7 +2999,7 @@
     <w:bookmarkStart w:id="44" w:name="X9ed5a8e4fde00fe5095624626c608a88e2ee9c9"/>
     <w:p>
       <w:pPr>
-        <w:pStyle w:val="3"/>
+        <w:pStyle w:val="Heading3"/>
       </w:pPr>
       <w:r>
         <w:t xml:space="preserve">4.3 Train-derived character-confusion baseline</w:t>
@@ -2961,7 +3015,7 @@
     </w:p>
     <w:p>
       <w:pPr>
-        <w:pStyle w:val="a0"/>
+        <w:pStyle w:val="BodyText"/>
       </w:pPr>
       <w:r>
         <w:t xml:space="preserve">Его диагностическая роль состоит в проверке вопроса: достаточно ли простых корпусно-выведенных символьных соответствий для решения benchmark, или нужен контекстный sequence-to-sequence подход. Если такой baseline приблизился бы к ByT5, это означало бы, что задача в основном сводится к локальным заменам символов. Если же ByT5 заметно превосходит его, это указывает на важность контекста, восстановления структуры слов и более сложного моделирования строки.</w:t>
@@ -2971,7 +3025,7 @@
     <w:bookmarkStart w:id="45" w:name="нейросетевая-модель-byt5-small"/>
     <w:p>
       <w:pPr>
-        <w:pStyle w:val="3"/>
+        <w:pStyle w:val="Heading3"/>
       </w:pPr>
       <w:r>
         <w:t xml:space="preserve">4.4 Нейросетевая модель ByT5-small</w:t>
@@ -2999,7 +3053,7 @@
     </w:p>
     <w:p>
       <w:pPr>
-        <w:pStyle w:val="a0"/>
+        <w:pStyle w:val="BodyText"/>
       </w:pPr>
       <w:r>
         <w:t xml:space="preserve">Выбор ByT5 связан с byte-level представлением. В отличие от моделей с заранее заданной subword-токенизацией, ByT5 работает на уровне байтов и поэтому лучше подходит для шумного, низкоресурсного и нестандартного исторического текста. Для арабографичных тюркских материалов это важно из-за редких графем, вариативного написания и смешения письменных традиций.</w:t>
@@ -3007,7 +3061,7 @@
     </w:p>
     <w:p>
       <w:pPr>
-        <w:pStyle w:val="a0"/>
+        <w:pStyle w:val="BodyText"/>
       </w:pPr>
       <w:r>
         <w:t xml:space="preserve">Практическое следствие byte-level подхода состоит в том, что длина последовательности в токенах может быстро расти: один видимый символ арабской графики занимает несколько байтов. Поэтому в эксперименте отдельно контролируется максимальная длина входной и целевой последовательности.</w:t>
@@ -3017,7 +3071,7 @@
     <w:bookmarkStart w:id="46" w:name="проверенные-конфигурации"/>
     <w:p>
       <w:pPr>
-        <w:pStyle w:val="3"/>
+        <w:pStyle w:val="Heading3"/>
       </w:pPr>
       <w:r>
         <w:t xml:space="preserve">4.5 Проверенные конфигурации</w:t>
@@ -3196,7 +3250,7 @@
     </w:tbl>
     <w:p>
       <w:pPr>
-        <w:pStyle w:val="a0"/>
+        <w:pStyle w:val="BodyText"/>
       </w:pPr>
       <w:r>
         <w:t xml:space="preserve">Конфигурация 256 использовалась как первый рабочий запуск и показала чувствительность задачи к ограничению длины. Для byte-level модели это ожидаемо: арабографичная строка может занимать больше токенов, чем кажется по числу видимых символов.</w:t>
@@ -3204,7 +3258,7 @@
     </w:p>
     <w:p>
       <w:pPr>
-        <w:pStyle w:val="a0"/>
+        <w:pStyle w:val="BodyText"/>
       </w:pPr>
       <w:r>
         <w:t xml:space="preserve">Для итогового анализа выбрана конфигурация 512. Она уменьшает риск обрезания строк и используется как основная нейросетевая конфигурация в сравнении с identity baseline, rule-based normalizer и train-derived character-confusion baseline. Вывод о преимуществе 512 в данной работе относится к пилотному датасету и должен быть дополнительно проверен на более широком корпусе.</w:t>
@@ -3214,7 +3268,7 @@
     <w:bookmarkStart w:id="47" w:name="метрики-качества"/>
     <w:p>
       <w:pPr>
-        <w:pStyle w:val="3"/>
+        <w:pStyle w:val="Heading3"/>
       </w:pPr>
       <w:r>
         <w:t xml:space="preserve">4.6 Метрики качества</w:t>
@@ -3230,7 +3284,7 @@
     </w:p>
     <w:p>
       <w:pPr>
-        <w:pStyle w:val="a0"/>
+        <w:pStyle w:val="BodyText"/>
       </w:pPr>
       <w:r>
         <w:t xml:space="preserve">CER, или Character Error Rate, измеряет нормированное расстояние редактирования между предсказанием и эталоном</w:t>
@@ -3253,7 +3307,7 @@
     </w:p>
     <w:p>
       <w:pPr>
-        <w:pStyle w:val="a0"/>
+        <w:pStyle w:val="BodyText"/>
       </w:pPr>
       <w:r>
         <w:t xml:space="preserve">WER, или Word Error Rate, измеряет ошибку на уровне слов. Она полезна для оценки практической пригодности текста: даже небольшая символьная ошибка может разрушить слово и ухудшить поиск, индексацию или последующую NLP-обработку.</w:t>
@@ -3261,7 +3315,7 @@
     </w:p>
     <w:p>
       <w:pPr>
-        <w:pStyle w:val="a0"/>
+        <w:pStyle w:val="BodyText"/>
       </w:pPr>
       <w:r>
         <w:t xml:space="preserve">ExactMatch показывает долю строк, полностью совпавших с эталоном. Для длинных исторических строк эта метрика очень строгая: один неверный символ уже делает пример несовпадающим. Поэтому ExactMatch используется как дополнительный строгий индикатор, а основные выводы строятся по CER, WER, NoSpaceCER и анализу ошибок.</w:t>
@@ -3271,7 +3325,7 @@
     <w:bookmarkStart w:id="48" w:name="процедура-оценки"/>
     <w:p>
       <w:pPr>
-        <w:pStyle w:val="3"/>
+        <w:pStyle w:val="Heading3"/>
       </w:pPr>
       <w:r>
         <w:t xml:space="preserve">4.7 Процедура оценки</w:t>
@@ -3287,7 +3341,7 @@
     </w:p>
     <w:p>
       <w:pPr>
-        <w:pStyle w:val="a0"/>
+        <w:pStyle w:val="BodyText"/>
       </w:pPr>
       <w:r>
         <w:t xml:space="preserve">Для каждого метода сохраняется CSV-файл с колонками</w:t>
@@ -3343,7 +3397,7 @@
     </w:p>
     <w:p>
       <w:pPr>
-        <w:pStyle w:val="a0"/>
+        <w:pStyle w:val="BodyText"/>
       </w:pPr>
       <w:r>
         <w:t xml:space="preserve">В одинаковых условиях сравниваются четыре варианта: identity baseline, rule-based normalizer, train-derived character-confusion baseline и ByT5-small. Это позволяет отделить эффект нейросетевой post-correction модели от простого сохранения зашумлённого ввода, ручных правил нормализации и простого data-driven символьного baseline.</w:t>
@@ -3353,7 +3407,7 @@
     <w:bookmarkStart w:id="49" w:name="анализ-ошибок"/>
     <w:p>
       <w:pPr>
-        <w:pStyle w:val="3"/>
+        <w:pStyle w:val="Heading3"/>
       </w:pPr>
       <w:r>
         <w:t xml:space="preserve">4.8 Анализ ошибок</w:t>
@@ -3381,7 +3435,7 @@
     </w:p>
     <w:p>
       <w:pPr>
-        <w:pStyle w:val="a0"/>
+        <w:pStyle w:val="BodyText"/>
       </w:pPr>
       <w:r>
         <w:t xml:space="preserve">Для этого вычисляются CER и WER до и после post-correction, а затем фиксируется изменение качества: пример мог улучшиться, остаться без изменений или ухудшиться. Такой анализ важен, потому что среднее значение CER или WER может расти за счёт небольшого числа удачных случаев и скрывать ухудшения на отдельных строках.</w:t>
@@ -3389,7 +3443,7 @@
     </w:p>
     <w:p>
       <w:pPr>
-        <w:pStyle w:val="a0"/>
+        <w:pStyle w:val="BodyText"/>
       </w:pPr>
       <w:r>
         <w:t xml:space="preserve">Дополнительно выделяются лучшие и худшие примеры. Они нужны для качественной интерпретации: по ним можно понять, какие типы ошибок модель исправляет уверенно, а где она добавляет новые искажения или чрезмерно нормализует историческое написание. Анализ ошибок выполняется скриптом</w:t>
@@ -3411,7 +3465,7 @@
     <w:bookmarkStart w:id="50" w:name="воспроизводимость"/>
     <w:p>
       <w:pPr>
-        <w:pStyle w:val="3"/>
+        <w:pStyle w:val="Heading3"/>
       </w:pPr>
       <w:r>
         <w:t xml:space="preserve">4.9 Воспроизводимость</w:t>
@@ -3427,7 +3481,7 @@
     </w:p>
     <w:p>
       <w:pPr>
-        <w:pStyle w:val="a0"/>
+        <w:pStyle w:val="BodyText"/>
       </w:pPr>
       <w:r>
         <w:t xml:space="preserve">В репозитории также сохранены датасет, итоговые метрики, prediction-файлы и CSV-файлы анализа ошибок. При этом модельные веса не хранятся в git, чтобы не перегружать репозиторий тяжёлыми артефактами обучения. Для дальнейшей работы веса можно хранить отдельно: например, как release artifact или во внешнем model registry.</w:t>
@@ -3435,7 +3489,7 @@
     </w:p>
     <w:p>
       <w:pPr>
-        <w:pStyle w:val="a0"/>
+        <w:pStyle w:val="BodyText"/>
       </w:pPr>
       <w:r>
         <w:t xml:space="preserve">Воспроизводимость текущего эксперимента не означает полноту бенчмарка. Она означает, что все ключевые решения пилотного протокола явно зафиксированы: источник, генератор шума, split, baseline-подходы, модель, метрики и error analysis.</w:t>
@@ -3445,7 +3499,7 @@
     <w:bookmarkStart w:id="51" w:name="выводы-по-разделу-1"/>
     <w:p>
       <w:pPr>
-        <w:pStyle w:val="3"/>
+        <w:pStyle w:val="Heading3"/>
       </w:pPr>
       <w:r>
         <w:t xml:space="preserve">4.10 Выводы по разделу</w:t>
@@ -3476,7 +3530,7 @@
     </w:p>
     <w:p>
       <w:pPr>
-        <w:pStyle w:val="a0"/>
+        <w:pStyle w:val="BodyText"/>
       </w:pPr>
       <w:r>
         <w:t xml:space="preserve">Сильная сторона выбранной методологии — прозрачность: каждый метод оценивается на одной test set, по одним метрикам и с сохранением prediction-файлов. Ограничение — пилотный характер данных: синтетические ошибки и один источник не позволяют считать результаты финальной оценкой для всех исторических арабографичных тюркских текстов.</w:t>
@@ -3484,7 +3538,7 @@
     </w:p>
     <w:p>
       <w:pPr>
-        <w:pStyle w:val="a0"/>
+        <w:pStyle w:val="BodyText"/>
       </w:pPr>
       <w:r>
         <w:t xml:space="preserve">Эта методология задаёт основу для раздела 5, где сравниваются baseline-подходы, train-derived character-confusion baseline, финальная конфигурация ByT5-small и результаты анализа ошибок.</w:t>
@@ -3495,7 +3549,7 @@
     <w:bookmarkStart w:id="66" w:name="результаты-экспериментов-и-анализ-ошибок"/>
     <w:p>
       <w:pPr>
-        <w:pStyle w:val="2"/>
+        <w:pStyle w:val="Heading2"/>
       </w:pPr>
       <w:r>
         <w:t xml:space="preserve">5. Результаты экспериментов и анализ ошибок</w:t>
@@ -3504,7 +3558,7 @@
     <w:bookmarkStart w:id="53" w:name="общая-логика-оценки"/>
     <w:p>
       <w:pPr>
-        <w:pStyle w:val="3"/>
+        <w:pStyle w:val="Heading3"/>
       </w:pPr>
       <w:r>
         <w:t xml:space="preserve">5.1 Общая логика оценки</w:t>
@@ -3520,7 +3574,7 @@
     </w:p>
     <w:p>
       <w:pPr>
-        <w:pStyle w:val="a0"/>
+        <w:pStyle w:val="BodyText"/>
       </w:pPr>
       <w:r>
         <w:t xml:space="preserve">Интерпретация строится в два слоя. Сначала сравниваются агрегированные метрики CER, WER, NoSpaceCER и ExactMatch. Затем отдельно рассматривается анализ ошибок: сколько примеров улучшилось, осталось без изменений или стало хуже после применения ByT5-small. Такой порядок нужен, чтобы не ограничиваться средними значениями и проверить устойчивость улучшения на уровне отдельных строк.</w:t>
@@ -3528,7 +3582,7 @@
     </w:p>
     <w:p>
       <w:pPr>
-        <w:pStyle w:val="a0"/>
+        <w:pStyle w:val="BodyText"/>
       </w:pPr>
       <w:r>
         <w:t xml:space="preserve">В этом разделе важно не только то, что ByT5-small показывает лучшие итоговые метрики среди рассмотренных методов. Не менее важны ограничивающие результаты: rule-based normalizer ухудшает качество относительно identity baseline, train-derived character-confusion baseline даёт лишь умеренное улучшение CER, а заметное снижение WER у ByT5 требует осторожной интерпретации из-за синтетических ошибок пробелов и границ слов.</w:t>
@@ -3538,7 +3592,7 @@
     <w:bookmarkStart w:id="54" w:name="итоговые-метрики"/>
     <w:p>
       <w:pPr>
-        <w:pStyle w:val="3"/>
+        <w:pStyle w:val="Heading3"/>
       </w:pPr>
       <w:r>
         <w:t xml:space="preserve">5.2 Итоговые метрики</w:t>
@@ -3877,7 +3931,7 @@
     </w:tbl>
     <w:p>
       <w:pPr>
-        <w:pStyle w:val="a0"/>
+        <w:pStyle w:val="BodyText"/>
       </w:pPr>
       <w:r>
         <w:t xml:space="preserve">Лучший результат среди проверенных методов показывает ByT5-small 512. По сравнению с identity baseline CER снижается с 0.086005 до 0.079913, а WER — с 0.519006 до 0.368540. Это означает, что улучшение на уровне символов есть, но оно умеренное; основной выигрыш заметнее на уровне слов.</w:t>
@@ -3885,7 +3939,7 @@
     </w:p>
     <w:p>
       <w:pPr>
-        <w:pStyle w:val="a0"/>
+        <w:pStyle w:val="BodyText"/>
       </w:pPr>
       <w:r>
         <w:t xml:space="preserve">Rule-based normalizer, напротив, ухудшает обе основные метрики: CER растёт до 0.151932, а WER — до 0.684408. Этот результат показывает, что простая символьная нормализация не является заведомо безопасной предобработкой для исторического арабографичного тюркского материала.</w:t>
@@ -3893,7 +3947,7 @@
     </w:p>
     <w:p>
       <w:pPr>
-        <w:pStyle w:val="a0"/>
+        <w:pStyle w:val="BodyText"/>
       </w:pPr>
       <w:r>
         <w:t xml:space="preserve">Train-derived char-confusion baseline оказывается сильнее identity baseline по CER: 0.086005 → 0.082520. Однако по WER он почти не закрывает разрыв: 0.519006 → 0.506189. Это показывает, что простые корпусно-выведенные символьные соответствия помогают частично исправлять локальные графемные ошибки, но недостаточны для восстановления word-level структуры строки.</w:t>
@@ -3901,7 +3955,7 @@
     </w:p>
     <w:p>
       <w:pPr>
-        <w:pStyle w:val="a0"/>
+        <w:pStyle w:val="BodyText"/>
       </w:pPr>
       <w:r>
         <w:t xml:space="preserve">ExactMatch остаётся низким у всех методов. Это ожидаемо для длинных строк и строгого посимвольного сравнения: даже одна ошибка делает строку несовпадающей с эталоном. Поэтому ExactMatch используется как дополнительный строгий индикатор, а основные выводы строятся по CER, WER, NoSpaceCER и анализу ошибок.</w:t>
@@ -3911,7 +3965,7 @@
     <w:bookmarkStart w:id="55" w:name="сравнение-с-identity-baseline"/>
     <w:p>
       <w:pPr>
-        <w:pStyle w:val="3"/>
+        <w:pStyle w:val="Heading3"/>
       </w:pPr>
       <w:r>
         <w:t xml:space="preserve">5.3 Сравнение с identity baseline</w:t>
@@ -3927,7 +3981,7 @@
     </w:p>
     <w:p>
       <w:pPr>
-        <w:pStyle w:val="a0"/>
+        <w:pStyle w:val="BodyText"/>
       </w:pPr>
       <w:r>
         <w:t xml:space="preserve">ByT5-small 512 превосходит identity baseline по всем трём метрикам:</w:t>
@@ -3979,7 +4033,7 @@
     </w:p>
     <w:p>
       <w:pPr>
-        <w:pStyle w:val="a0"/>
+        <w:pStyle w:val="BodyText"/>
       </w:pPr>
       <w:r>
         <w:t xml:space="preserve">Такой результат согласуется с основной гипотезой пилота: byte-level sequence-to-sequence модель может быть полезна для post-correction арабографичного тюркского текста. Однако улучшение по CER остаётся достаточно небольшим, поэтому вывод следует считать не финальным доказательством качества модели, а подтверждением работоспособности выбранного направления в controlled synthetic setting.</w:t>
@@ -3989,7 +4043,7 @@
     <w:bookmarkStart w:id="56" w:name="rule-based-normalizer"/>
     <w:p>
       <w:pPr>
-        <w:pStyle w:val="3"/>
+        <w:pStyle w:val="Heading3"/>
       </w:pPr>
       <w:r>
         <w:t xml:space="preserve">5.4 Rule-based normalizer</w:t>
@@ -4005,7 +4059,7 @@
     </w:p>
     <w:p>
       <w:pPr>
-        <w:pStyle w:val="a0"/>
+        <w:pStyle w:val="BodyText"/>
       </w:pPr>
       <w:r>
         <w:t xml:space="preserve">По сравнению с identity baseline normalizer ухудшает все метрики:</w:t>
@@ -4057,7 +4111,7 @@
     </w:p>
     <w:p>
       <w:pPr>
-        <w:pStyle w:val="a0"/>
+        <w:pStyle w:val="BodyText"/>
       </w:pPr>
       <w:r>
         <w:t xml:space="preserve">Следовательно, rule-based normalization нельзя использовать как автоматический предварительный шаг без отдельной проверки. В рамках данного эксперимента первая гипотеза получает предварительное подтверждение: naive rule-based normalization ухудшает качество текста относительно identity baseline.</w:t>
@@ -4067,7 +4121,7 @@
     <w:bookmarkStart w:id="57" w:name="X3cc67115ed6e691c31a87b68b1f212ad315ce11"/>
     <w:p>
       <w:pPr>
-        <w:pStyle w:val="3"/>
+        <w:pStyle w:val="Heading3"/>
       </w:pPr>
       <w:r>
         <w:t xml:space="preserve">5.5 Train-derived character-confusion baseline</w:t>
@@ -4083,7 +4137,7 @@
     </w:p>
     <w:p>
       <w:pPr>
-        <w:pStyle w:val="a0"/>
+        <w:pStyle w:val="BodyText"/>
       </w:pPr>
       <w:r>
         <w:t xml:space="preserve">По сравнению с identity baseline этот baseline немного снижает CER:</w:t>
@@ -4137,7 +4191,7 @@
     <w:bookmarkStart w:id="58" w:name="интерпретация-сильного-снижения-wer"/>
     <w:p>
       <w:pPr>
-        <w:pStyle w:val="3"/>
+        <w:pStyle w:val="Heading3"/>
       </w:pPr>
       <w:r>
         <w:t xml:space="preserve">5.6 Интерпретация сильного снижения WER</w:t>
@@ -4153,7 +4207,7 @@
     </w:p>
     <w:p>
       <w:pPr>
-        <w:pStyle w:val="a0"/>
+        <w:pStyle w:val="BodyText"/>
       </w:pPr>
       <w:r>
         <w:t xml:space="preserve">Причина состоит в том, что текущий synthetic noise включает вставку и удаление пробелов. WER вычисляется на уровне слов, поэтому он особенно чувствителен к ошибкам границ слов: одна вставка или потеря пробела может изменить токенизацию всей строки и резко увеличить word-level error. Если модель восстанавливает часть таких synthetic word-boundary distortions, WER может снижаться существенно сильнее, чем CER.</w:t>
@@ -4161,7 +4215,7 @@
     </w:p>
     <w:p>
       <w:pPr>
-        <w:pStyle w:val="a0"/>
+        <w:pStyle w:val="BodyText"/>
       </w:pPr>
       <w:r>
         <w:t xml:space="preserve">Именно поэтому CER и WER в данной работе интерпретируются совместно. По CER улучшение ByT5-small является умеренным: 0.086005 → 0.079913. По WER улучшение заметнее, но оно может частично отражать специфику синтетического генератора шума. Следовательно, результат показывает работоспособность модели в controlled synthetic benchmark, но не доказывает такого же эффекта на реальных архивных сканах или реальном OCR/HTR output.</w:t>
@@ -4169,7 +4223,7 @@
     </w:p>
     <w:p>
       <w:pPr>
-        <w:pStyle w:val="a0"/>
+        <w:pStyle w:val="BodyText"/>
       </w:pPr>
       <w:r>
         <w:t xml:space="preserve">Поскольку benchmark построен в рамках данной работы, прямого опубликованного результата на точно таком же датасете нет. Поэтому утверждение о лучшем результате ограничено данной экспериментальной постановкой: ByT5-small 512 показывает лучший CER и WER среди рассмотренных методов на предложенном benchmark. Работа не заявляет global state of the art для OCR post-correction в целом.</w:t>
@@ -4179,7 +4233,7 @@
     <w:bookmarkStart w:id="59" w:name="значение-длины-последовательности"/>
     <w:p>
       <w:pPr>
-        <w:pStyle w:val="3"/>
+        <w:pStyle w:val="Heading3"/>
       </w:pPr>
       <w:r>
         <w:t xml:space="preserve">5.7 Значение длины последовательности</w:t>
@@ -4195,7 +4249,7 @@
     </w:p>
     <w:p>
       <w:pPr>
-        <w:pStyle w:val="a0"/>
+        <w:pStyle w:val="BodyText"/>
       </w:pPr>
       <w:r>
         <w:t xml:space="preserve">Конфигурация 256 использовалась как первый рабочий запуск, но для части строк такое ограничение может быть слишком жёстким. Конфигурация 512 снижает риск обрезания контекста и поэтому выбрана как основная для итогового анализа.</w:t>
@@ -4203,7 +4257,7 @@
     </w:p>
     <w:p>
       <w:pPr>
-        <w:pStyle w:val="a0"/>
+        <w:pStyle w:val="BodyText"/>
       </w:pPr>
       <w:r>
         <w:t xml:space="preserve">Этот результат следует интерпретировать осторожно. Он показывает, что max length является важным экспериментальным параметром в данной постановке, но не доказывает универсального преимущества длины 512 для всех арабографичных тюркских корпусов. Для более сильного вывода нужны дополнительные запуски на более широком наборе источников и длин строк.</w:t>
@@ -4213,7 +4267,7 @@
     <w:bookmarkStart w:id="60" w:name="X57a2c7e56d371be566bce3ca95d65080761e96c"/>
     <w:p>
       <w:pPr>
-        <w:pStyle w:val="3"/>
+        <w:pStyle w:val="Heading3"/>
       </w:pPr>
       <w:r>
         <w:t xml:space="preserve">5.8 Анализ ошибок на уровне отдельных примеров</w:t>
@@ -4241,7 +4295,7 @@
     </w:p>
     <w:p>
       <w:pPr>
-        <w:pStyle w:val="a0"/>
+        <w:pStyle w:val="BodyText"/>
       </w:pPr>
       <w:r>
         <w:t xml:space="preserve">Результаты анализа представлены в таблице.</w:t>
@@ -4449,7 +4503,7 @@
     </w:tbl>
     <w:p>
       <w:pPr>
-        <w:pStyle w:val="a0"/>
+        <w:pStyle w:val="BodyText"/>
       </w:pPr>
       <w:r>
         <w:t xml:space="preserve">По CER модель улучшила 682 из 800 тестовых примеров, оставила без изменений 60 и ухудшила 58. По WER улучшение наблюдается в 677 примерах, отсутствие изменений — в 63, ухудшение — в 60.</w:t>
@@ -4457,7 +4511,7 @@
     </w:p>
     <w:p>
       <w:pPr>
-        <w:pStyle w:val="a0"/>
+        <w:pStyle w:val="BodyText"/>
       </w:pPr>
       <w:r>
         <w:t xml:space="preserve">Это важный результат: улучшение агрегированных метрик не сводится к нескольким удачным строкам. ByT5-small 512 улучшает большинство тестовых примеров как на character-level, так и на word-level. При этом наличие 58–60 ухудшенных примеров показывает, что модель не является равномерно безопасной: она может добавлять новые ошибки и требует качественного анализа худших случаев.</w:t>
@@ -4465,7 +4519,7 @@
     </w:p>
     <w:p>
       <w:pPr>
-        <w:pStyle w:val="a0"/>
+        <w:pStyle w:val="BodyText"/>
       </w:pPr>
       <w:r>
         <w:t xml:space="preserve">Качественный просмотр лучших и худших примеров показывает два разных режима поведения модели. В удачных случаях ByT5-small исправляет локальные OCR-подобные искажения, восстанавливает пропущенные или заменённые графемы и делает разбиение слов ближе к эталону. В худших случаях модель может не просто не исправить строку, а начать порождать повторяющиеся фрагменты, существенно удлиняя prediction. Это особенно важно для практического применения: модель улучшает большинство строк, но без фильтрации, анализа худших случаев или ручной проверки её нельзя считать безопасным автоматическим корректором.</w:t>
@@ -4475,7 +4529,7 @@
     <w:bookmarkStart w:id="61" w:name="среднее-улучшение-по-примерам"/>
     <w:p>
       <w:pPr>
-        <w:pStyle w:val="3"/>
+        <w:pStyle w:val="Heading3"/>
       </w:pPr>
       <w:r>
         <w:t xml:space="preserve">5.9 Среднее улучшение по примерам</w:t>
@@ -4523,7 +4577,7 @@
     </w:p>
     <w:p>
       <w:pPr>
-        <w:pStyle w:val="a0"/>
+        <w:pStyle w:val="BodyText"/>
       </w:pPr>
       <w:r>
         <w:t xml:space="preserve">Среднее улучшение полезно как количественное резюме, но его недостаточно для окончательной оценки качества. Поэтому оно рассматривается вместе с распределением improved/unchanged/worse и качественным анализом лучших и худших примеров.</w:t>
@@ -4533,7 +4587,7 @@
     <w:bookmarkStart w:id="62" w:name="интерпретация-результатов"/>
     <w:p>
       <w:pPr>
-        <w:pStyle w:val="3"/>
+        <w:pStyle w:val="Heading3"/>
       </w:pPr>
       <w:r>
         <w:t xml:space="preserve">5.10 Интерпретация результатов</w:t>
@@ -4549,7 +4603,7 @@
     </w:p>
     <w:p>
       <w:pPr>
-        <w:pStyle w:val="a0"/>
+        <w:pStyle w:val="BodyText"/>
       </w:pPr>
       <w:r>
         <w:t xml:space="preserve">Второй вывод — положительный: ByT5-small 512 улучшает качество относительно identity baseline и показывает лучший результат среди четырёх рассмотренных методов. Улучшение по CER умеренное, но улучшение по WER заметное, а анализ отдельных примеров показывает, что модель улучшает большинство тестовых строк. При этом сильное снижение WER требует осторожной интерпретации, поскольку часть эффекта может быть связана с исправлением синтетических ошибок пробелов и границ слов. Следовательно, byte-level sequence-to-sequence подход является работоспособным направлением для пилотной посткоррекции, но не финальным доказательством качества на реальных OCR/HTR-выходах.</w:t>
@@ -4557,7 +4611,7 @@
     </w:p>
     <w:p>
       <w:pPr>
-        <w:pStyle w:val="a0"/>
+        <w:pStyle w:val="BodyText"/>
       </w:pPr>
       <w:r>
         <w:t xml:space="preserve">Третий вывод касается настройки модели: max length является важным параметром для byte-level обработки арабографичного текста. Конфигурация 512 в текущем эксперименте выглядит более устойчивой, чем более короткая конфигурация, но этот результат следует считать практическим сигналом, а не универсальным правилом.</w:t>
@@ -4565,7 +4619,7 @@
     </w:p>
     <w:p>
       <w:pPr>
-        <w:pStyle w:val="a0"/>
+        <w:pStyle w:val="BodyText"/>
       </w:pPr>
       <w:r>
         <w:t xml:space="preserve">Наконец, низкий ExactMatch не противоречит положительным результатам по CER и WER. Для длинных исторических строк полное совпадение слишком строго: одна небольшая ошибка уже делает строку несовпадающей. Поэтому основные выводы в работе опираются на CER, WER и анализ improved/unchanged/worse.</w:t>
@@ -4575,7 +4629,7 @@
     <w:bookmarkStart w:id="63" w:name="ограничения-интерпретации"/>
     <w:p>
       <w:pPr>
-        <w:pStyle w:val="3"/>
+        <w:pStyle w:val="Heading3"/>
       </w:pPr>
       <w:r>
         <w:t xml:space="preserve">5.11 Ограничения интерпретации</w:t>
@@ -4591,7 +4645,7 @@
     </w:p>
     <w:p>
       <w:pPr>
-        <w:pStyle w:val="a0"/>
+        <w:pStyle w:val="BodyText"/>
       </w:pPr>
       <w:r>
         <w:t xml:space="preserve">Главные ограничения интерпретации связаны с данными: корпус мал, основан на одном источнике, а ошибки сгенерированы искусственно. Поэтому значения CER и WER нельзя напрямую переносить на другие жанры, периоды, шрифты, сканы или OCR-системы без дополнительной проверки.</w:t>
@@ -4599,20 +4653,20 @@
     </w:p>
     <w:p>
       <w:pPr>
-        <w:pStyle w:val="a0"/>
+        <w:pStyle w:val="BodyText"/>
       </w:pPr>
       <w:r>
         <w:t xml:space="preserve">Отдельное ограничение связано с метриками. CER и WER измеряют формальную близость к эталону, но не полностью отражают историко-лингвистическую допустимость исправления. Для дальнейшей работы нужен вручную проверенный subset, где ошибки модели будут оцениваться не только автоматически, но и экспертно.</w:t>
       </w:r>
     </w:p>
     <w:bookmarkEnd w:id="63"/>
-    <w:bookmarkStart w:id="64" w:name="проверка-переноса-на-real-ocr-subset"/>
-    <w:p>
-      <w:pPr>
-        <w:pStyle w:val="3"/>
-      </w:pPr>
-      <w:r>
-        <w:t xml:space="preserve">5.12 Проверка переноса на real-OCR subset</w:t>
+    <w:bookmarkStart w:id="64" w:name="X8453319e135c2b3f15a944d42597c28ff8c6fe3"/>
+    <w:p>
+      <w:pPr>
+        <w:pStyle w:val="Heading3"/>
+      </w:pPr>
+      <w:r>
+        <w:t xml:space="preserve">5.12 Проверка переноса на page-level real-OCR benchmark</w:t>
       </w:r>
     </w:p>
     <w:p>
@@ -4620,27 +4674,67 @@
         <w:pStyle w:val="FirstParagraph"/>
       </w:pPr>
       <w:r>
-        <w:t xml:space="preserve">После основной оценки на synthetic benchmark был проведён дополнительный real-OCR sanity check. Его цель состояла не в том, чтобы объявить модель готовой OCR-системой, а в том, чтобы проверить, переносится ли модель, обученная только на синтетическом шуме, на реальные ошибки OCR.</w:t>
-      </w:r>
-    </w:p>
-    <w:p>
-      <w:pPr>
-        <w:pStyle w:val="a0"/>
-      </w:pPr>
-      <w:r>
-        <w:t xml:space="preserve">Для этого был собран небольшой набор из 90 line-level примеров из 8 страниц арабографичного тюркского исторического текста. В качестве open-source OCR baseline использовался Arabic-only Tesseract в конфигурации</w:t>
-      </w:r>
-      <w:r>
-        <w:t xml:space="preserve"> </w:t>
-      </w:r>
-      <w:r>
-        <w:rPr>
-          <w:rStyle w:val="VerbatimChar"/>
-        </w:rPr>
-        <w:t xml:space="preserve">tesseract_ara_psm6</w:t>
-      </w:r>
-      <w:r>
-        <w:t xml:space="preserve">. В такой постановке Tesseract нужен не как источник эталонного текста, а как генератор реального OCR-output: именно этот ошибочный OCR-текст затем подаётся на вход post-correction модели, а clean reference используется только для расчёта CER, WER и NoSpaceCER.</w:t>
+        <w:t xml:space="preserve">После основной оценки на synthetic benchmark была проведена отдельная проверка на реальном OCR-выводе. Она нужна для того, чтобы не смешивать два разных результата: качество модели на контролируемом синтетическом шуме и её поведение на настоящем OCR, где ошибки появляются из-за скана, шрифта, сегментации страницы и работы конкретной OCR-системы.</w:t>
+      </w:r>
+    </w:p>
+    <w:p>
+      <w:pPr>
+        <w:pStyle w:val="BodyText"/>
+      </w:pPr>
+      <w:r>
+        <w:t xml:space="preserve">Для проверки использован османско-турецкий печатный источник в арабской графике. Этот материал рассматривается как связанный арабографичный тюркский test case. Он не является старотатарским или старобашкирским датасетом: татарские и башкирские источники остаются целевой мотивацией и направлением дальнейшего расширения, а текущий real-OCR benchmark нужен для первичной проверки synthetic-to-real transfer.</w:t>
+      </w:r>
+    </w:p>
+    <w:p>
+      <w:pPr>
+        <w:pStyle w:val="BodyText"/>
+      </w:pPr>
+      <w:r>
+        <w:t xml:space="preserve">Локальный набор содержит 72 страницы. Для оценки были оставлены 68 страниц, где есть непустой OCR-вывод и достаточно длинная page-level транскрипция. В отфильтрованной части содержится 90 457 символов clean/reference text и 81 593 символа OCR text. Сырые PDF, изображения страниц, OCR-выводы, gold text и predictions в репозитории не распространяются; в Git сохранены только скрипты и агрегированные таблицы.</w:t>
+      </w:r>
+    </w:p>
+    <w:p>
+      <w:pPr>
+        <w:pStyle w:val="BodyText"/>
+      </w:pPr>
+      <w:r>
+        <w:t xml:space="preserve">В эксперименте сравнивались три варианта:</w:t>
+      </w:r>
+    </w:p>
+    <w:p>
+      <w:pPr>
+        <w:pStyle w:val="Compact"/>
+        <w:numPr>
+          <w:ilvl w:val="0"/>
+          <w:numId w:val="1008"/>
+        </w:numPr>
+      </w:pPr>
+      <w:r>
+        <w:t xml:space="preserve">raw Tesseract OCR как исходный уровень;</w:t>
+      </w:r>
+    </w:p>
+    <w:p>
+      <w:pPr>
+        <w:pStyle w:val="Compact"/>
+        <w:numPr>
+          <w:ilvl w:val="0"/>
+          <w:numId w:val="1008"/>
+        </w:numPr>
+      </w:pPr>
+      <w:r>
+        <w:t xml:space="preserve">ByT5-small, обученная на синтетическом шуме и применённая к page-level OCR через разбиение на чанки;</w:t>
+      </w:r>
+    </w:p>
+    <w:p>
+      <w:pPr>
+        <w:pStyle w:val="Compact"/>
+        <w:numPr>
+          <w:ilvl w:val="0"/>
+          <w:numId w:val="1008"/>
+        </w:numPr>
+      </w:pPr>
+      <w:r>
+        <w:t xml:space="preserve">strict guarded ByT5, где предсказание отбрасывается, если оно слишком сильно меняет длину или слишком далеко уходит от исходного OCR.</w:t>
       </w:r>
     </w:p>
     <w:tbl>
@@ -4651,11 +4745,13 @@
         <w:tblLook w:firstRow="1" w:lastRow="0" w:firstColumn="0" w:lastColumn="0" w:noHBand="0" w:noVBand="0" w:val="0020"/>
       </w:tblPr>
       <w:tblGrid>
-        <w:gridCol w:w="1250"/>
-        <w:gridCol w:w="1667"/>
-        <w:gridCol w:w="1667"/>
-        <w:gridCol w:w="1667"/>
-        <w:gridCol w:w="1667"/>
+        <w:gridCol w:w="880"/>
+        <w:gridCol w:w="1173"/>
+        <w:gridCol w:w="1173"/>
+        <w:gridCol w:w="1173"/>
+        <w:gridCol w:w="1173"/>
+        <w:gridCol w:w="1173"/>
+        <w:gridCol w:w="1173"/>
       </w:tblGrid>
       <w:tr>
         <w:trPr>
@@ -4668,43 +4764,7 @@
               <w:pStyle w:val="Compact"/>
             </w:pPr>
             <w:r>
-              <w:t xml:space="preserve">Method</w:t>
-            </w:r>
-          </w:p>
-        </w:tc>
-        <w:tc>
-          <w:tcPr/>
-          <w:p>
-            <w:pPr>
-              <w:pStyle w:val="Compact"/>
-              <w:jc w:val="right"/>
-            </w:pPr>
-            <w:r>
-              <w:t xml:space="preserve">CER</w:t>
-            </w:r>
-          </w:p>
-        </w:tc>
-        <w:tc>
-          <w:tcPr/>
-          <w:p>
-            <w:pPr>
-              <w:pStyle w:val="Compact"/>
-              <w:jc w:val="right"/>
-            </w:pPr>
-            <w:r>
-              <w:t xml:space="preserve">WER</w:t>
-            </w:r>
-          </w:p>
-        </w:tc>
-        <w:tc>
-          <w:tcPr/>
-          <w:p>
-            <w:pPr>
-              <w:pStyle w:val="Compact"/>
-              <w:jc w:val="right"/>
-            </w:pPr>
-            <w:r>
-              <w:t xml:space="preserve">NoSpaceCER</w:t>
+              <w:t xml:space="preserve">System</w:t>
             </w:r>
           </w:p>
         </w:tc>
@@ -4717,6 +4777,66 @@
             </w:pPr>
             <w:r>
               <w:t xml:space="preserve">N</w:t>
+            </w:r>
+          </w:p>
+        </w:tc>
+        <w:tc>
+          <w:tcPr/>
+          <w:p>
+            <w:pPr>
+              <w:pStyle w:val="Compact"/>
+              <w:jc w:val="right"/>
+            </w:pPr>
+            <w:r>
+              <w:t xml:space="preserve">Mean CER</w:t>
+            </w:r>
+          </w:p>
+        </w:tc>
+        <w:tc>
+          <w:tcPr/>
+          <w:p>
+            <w:pPr>
+              <w:pStyle w:val="Compact"/>
+              <w:jc w:val="right"/>
+            </w:pPr>
+            <w:r>
+              <w:t xml:space="preserve">Median CER</w:t>
+            </w:r>
+          </w:p>
+        </w:tc>
+        <w:tc>
+          <w:tcPr/>
+          <w:p>
+            <w:pPr>
+              <w:pStyle w:val="Compact"/>
+              <w:jc w:val="right"/>
+            </w:pPr>
+            <w:r>
+              <w:t xml:space="preserve">Mean WER</w:t>
+            </w:r>
+          </w:p>
+        </w:tc>
+        <w:tc>
+          <w:tcPr/>
+          <w:p>
+            <w:pPr>
+              <w:pStyle w:val="Compact"/>
+              <w:jc w:val="right"/>
+            </w:pPr>
+            <w:r>
+              <w:t xml:space="preserve">Median WER</w:t>
+            </w:r>
+          </w:p>
+        </w:tc>
+        <w:tc>
+          <w:tcPr/>
+          <w:p>
+            <w:pPr>
+              <w:pStyle w:val="Compact"/>
+              <w:jc w:val="right"/>
+            </w:pPr>
+            <w:r>
+              <w:t xml:space="preserve">Mean NoSpaceCER</w:t>
             </w:r>
           </w:p>
         </w:tc>
@@ -4729,64 +4849,79 @@
               <w:pStyle w:val="Compact"/>
             </w:pPr>
             <w:r>
-              <w:t xml:space="preserve">Real OCR identity (</w:t>
-            </w:r>
-            <w:r>
-              <w:rPr>
-                <w:rStyle w:val="VerbatimChar"/>
-              </w:rPr>
-              <w:t xml:space="preserve">tesseract_ara_psm6</w:t>
-            </w:r>
-            <w:r>
-              <w:t xml:space="preserve">)</w:t>
-            </w:r>
-          </w:p>
-        </w:tc>
-        <w:tc>
-          <w:tcPr/>
-          <w:p>
-            <w:pPr>
-              <w:pStyle w:val="Compact"/>
-              <w:jc w:val="right"/>
-            </w:pPr>
-            <w:r>
-              <w:t xml:space="preserve">0.4508</w:t>
-            </w:r>
-          </w:p>
-        </w:tc>
-        <w:tc>
-          <w:tcPr/>
-          <w:p>
-            <w:pPr>
-              <w:pStyle w:val="Compact"/>
-              <w:jc w:val="right"/>
-            </w:pPr>
-            <w:r>
-              <w:t xml:space="preserve">1.0888</w:t>
-            </w:r>
-          </w:p>
-        </w:tc>
-        <w:tc>
-          <w:tcPr/>
-          <w:p>
-            <w:pPr>
-              <w:pStyle w:val="Compact"/>
-              <w:jc w:val="right"/>
-            </w:pPr>
-            <w:r>
-              <w:t xml:space="preserve">0.4468</w:t>
-            </w:r>
-          </w:p>
-        </w:tc>
-        <w:tc>
-          <w:tcPr/>
-          <w:p>
-            <w:pPr>
-              <w:pStyle w:val="Compact"/>
-              <w:jc w:val="right"/>
-            </w:pPr>
-            <w:r>
-              <w:t xml:space="preserve">90</w:t>
+              <w:t xml:space="preserve">raw Tesseract</w:t>
+            </w:r>
+          </w:p>
+        </w:tc>
+        <w:tc>
+          <w:tcPr/>
+          <w:p>
+            <w:pPr>
+              <w:pStyle w:val="Compact"/>
+              <w:jc w:val="right"/>
+            </w:pPr>
+            <w:r>
+              <w:t xml:space="preserve">68</w:t>
+            </w:r>
+          </w:p>
+        </w:tc>
+        <w:tc>
+          <w:tcPr/>
+          <w:p>
+            <w:pPr>
+              <w:pStyle w:val="Compact"/>
+              <w:jc w:val="right"/>
+            </w:pPr>
+            <w:r>
+              <w:t xml:space="preserve">0.3539</w:t>
+            </w:r>
+          </w:p>
+        </w:tc>
+        <w:tc>
+          <w:tcPr/>
+          <w:p>
+            <w:pPr>
+              <w:pStyle w:val="Compact"/>
+              <w:jc w:val="right"/>
+            </w:pPr>
+            <w:r>
+              <w:t xml:space="preserve">0.2983</w:t>
+            </w:r>
+          </w:p>
+        </w:tc>
+        <w:tc>
+          <w:tcPr/>
+          <w:p>
+            <w:pPr>
+              <w:pStyle w:val="Compact"/>
+              <w:jc w:val="right"/>
+            </w:pPr>
+            <w:r>
+              <w:t xml:space="preserve">0.9238</w:t>
+            </w:r>
+          </w:p>
+        </w:tc>
+        <w:tc>
+          <w:tcPr/>
+          <w:p>
+            <w:pPr>
+              <w:pStyle w:val="Compact"/>
+              <w:jc w:val="right"/>
+            </w:pPr>
+            <w:r>
+              <w:t xml:space="preserve">0.8943</w:t>
+            </w:r>
+          </w:p>
+        </w:tc>
+        <w:tc>
+          <w:tcPr/>
+          <w:p>
+            <w:pPr>
+              <w:pStyle w:val="Compact"/>
+              <w:jc w:val="right"/>
+            </w:pPr>
+            <w:r>
+              <w:t xml:space="preserve">0.3421</w:t>
             </w:r>
           </w:p>
         </w:tc>
@@ -4799,55 +4934,79 @@
               <w:pStyle w:val="Compact"/>
             </w:pPr>
             <w:r>
-              <w:t xml:space="preserve">Synthetic-trained ByT5 on real OCR</w:t>
-            </w:r>
-          </w:p>
-        </w:tc>
-        <w:tc>
-          <w:tcPr/>
-          <w:p>
-            <w:pPr>
-              <w:pStyle w:val="Compact"/>
-              <w:jc w:val="right"/>
-            </w:pPr>
-            <w:r>
-              <w:t xml:space="preserve">0.4361</w:t>
-            </w:r>
-          </w:p>
-        </w:tc>
-        <w:tc>
-          <w:tcPr/>
-          <w:p>
-            <w:pPr>
-              <w:pStyle w:val="Compact"/>
-              <w:jc w:val="right"/>
-            </w:pPr>
-            <w:r>
-              <w:t xml:space="preserve">0.9660</w:t>
-            </w:r>
-          </w:p>
-        </w:tc>
-        <w:tc>
-          <w:tcPr/>
-          <w:p>
-            <w:pPr>
-              <w:pStyle w:val="Compact"/>
-              <w:jc w:val="right"/>
-            </w:pPr>
-            <w:r>
-              <w:t xml:space="preserve">0.4454</w:t>
-            </w:r>
-          </w:p>
-        </w:tc>
-        <w:tc>
-          <w:tcPr/>
-          <w:p>
-            <w:pPr>
-              <w:pStyle w:val="Compact"/>
-              <w:jc w:val="right"/>
-            </w:pPr>
-            <w:r>
-              <w:t xml:space="preserve">90</w:t>
+              <w:t xml:space="preserve">ByT5 chunked</w:t>
+            </w:r>
+          </w:p>
+        </w:tc>
+        <w:tc>
+          <w:tcPr/>
+          <w:p>
+            <w:pPr>
+              <w:pStyle w:val="Compact"/>
+              <w:jc w:val="right"/>
+            </w:pPr>
+            <w:r>
+              <w:t xml:space="preserve">68</w:t>
+            </w:r>
+          </w:p>
+        </w:tc>
+        <w:tc>
+          <w:tcPr/>
+          <w:p>
+            <w:pPr>
+              <w:pStyle w:val="Compact"/>
+              <w:jc w:val="right"/>
+            </w:pPr>
+            <w:r>
+              <w:t xml:space="preserve">0.4564</w:t>
+            </w:r>
+          </w:p>
+        </w:tc>
+        <w:tc>
+          <w:tcPr/>
+          <w:p>
+            <w:pPr>
+              <w:pStyle w:val="Compact"/>
+              <w:jc w:val="right"/>
+            </w:pPr>
+            <w:r>
+              <w:t xml:space="preserve">0.4206</w:t>
+            </w:r>
+          </w:p>
+        </w:tc>
+        <w:tc>
+          <w:tcPr/>
+          <w:p>
+            <w:pPr>
+              <w:pStyle w:val="Compact"/>
+              <w:jc w:val="right"/>
+            </w:pPr>
+            <w:r>
+              <w:t xml:space="preserve">0.8919</w:t>
+            </w:r>
+          </w:p>
+        </w:tc>
+        <w:tc>
+          <w:tcPr/>
+          <w:p>
+            <w:pPr>
+              <w:pStyle w:val="Compact"/>
+              <w:jc w:val="right"/>
+            </w:pPr>
+            <w:r>
+              <w:t xml:space="preserve">0.8579</w:t>
+            </w:r>
+          </w:p>
+        </w:tc>
+        <w:tc>
+          <w:tcPr/>
+          <w:p>
+            <w:pPr>
+              <w:pStyle w:val="Compact"/>
+              <w:jc w:val="right"/>
+            </w:pPr>
+            <w:r>
+              <w:t xml:space="preserve">0.4658</w:t>
             </w:r>
           </w:p>
         </w:tc>
@@ -4860,55 +5019,79 @@
               <w:pStyle w:val="Compact"/>
             </w:pPr>
             <w:r>
-              <w:t xml:space="preserve">Synthetic-trained ByT5 + conservative fallback</w:t>
-            </w:r>
-          </w:p>
-        </w:tc>
-        <w:tc>
-          <w:tcPr/>
-          <w:p>
-            <w:pPr>
-              <w:pStyle w:val="Compact"/>
-              <w:jc w:val="right"/>
-            </w:pPr>
-            <w:r>
-              <w:t xml:space="preserve">0.4361</w:t>
-            </w:r>
-          </w:p>
-        </w:tc>
-        <w:tc>
-          <w:tcPr/>
-          <w:p>
-            <w:pPr>
-              <w:pStyle w:val="Compact"/>
-              <w:jc w:val="right"/>
-            </w:pPr>
-            <w:r>
-              <w:t xml:space="preserve">0.9660</w:t>
-            </w:r>
-          </w:p>
-        </w:tc>
-        <w:tc>
-          <w:tcPr/>
-          <w:p>
-            <w:pPr>
-              <w:pStyle w:val="Compact"/>
-              <w:jc w:val="right"/>
-            </w:pPr>
-            <w:r>
-              <w:t xml:space="preserve">0.4454</w:t>
-            </w:r>
-          </w:p>
-        </w:tc>
-        <w:tc>
-          <w:tcPr/>
-          <w:p>
-            <w:pPr>
-              <w:pStyle w:val="Compact"/>
-              <w:jc w:val="right"/>
-            </w:pPr>
-            <w:r>
-              <w:t xml:space="preserve">90</w:t>
+              <w:t xml:space="preserve">strict guarded ByT5</w:t>
+            </w:r>
+          </w:p>
+        </w:tc>
+        <w:tc>
+          <w:tcPr/>
+          <w:p>
+            <w:pPr>
+              <w:pStyle w:val="Compact"/>
+              <w:jc w:val="right"/>
+            </w:pPr>
+            <w:r>
+              <w:t xml:space="preserve">68</w:t>
+            </w:r>
+          </w:p>
+        </w:tc>
+        <w:tc>
+          <w:tcPr/>
+          <w:p>
+            <w:pPr>
+              <w:pStyle w:val="Compact"/>
+              <w:jc w:val="right"/>
+            </w:pPr>
+            <w:r>
+              <w:t xml:space="preserve">0.3828</w:t>
+            </w:r>
+          </w:p>
+        </w:tc>
+        <w:tc>
+          <w:tcPr/>
+          <w:p>
+            <w:pPr>
+              <w:pStyle w:val="Compact"/>
+              <w:jc w:val="right"/>
+            </w:pPr>
+            <w:r>
+              <w:t xml:space="preserve">0.3442</w:t>
+            </w:r>
+          </w:p>
+        </w:tc>
+        <w:tc>
+          <w:tcPr/>
+          <w:p>
+            <w:pPr>
+              <w:pStyle w:val="Compact"/>
+              <w:jc w:val="right"/>
+            </w:pPr>
+            <w:r>
+              <w:t xml:space="preserve">0.9039</w:t>
+            </w:r>
+          </w:p>
+        </w:tc>
+        <w:tc>
+          <w:tcPr/>
+          <w:p>
+            <w:pPr>
+              <w:pStyle w:val="Compact"/>
+              <w:jc w:val="right"/>
+            </w:pPr>
+            <w:r>
+              <w:t xml:space="preserve">0.8605</w:t>
+            </w:r>
+          </w:p>
+        </w:tc>
+        <w:tc>
+          <w:tcPr/>
+          <w:p>
+            <w:pPr>
+              <w:pStyle w:val="Compact"/>
+              <w:jc w:val="right"/>
+            </w:pPr>
+            <w:r>
+              <w:t xml:space="preserve">0.3830</w:t>
             </w:r>
           </w:p>
         </w:tc>
@@ -4916,18 +5099,18 @@
     </w:tbl>
     <w:p>
       <w:pPr>
-        <w:pStyle w:val="a0"/>
-      </w:pPr>
-      <w:r>
-        <w:t xml:space="preserve">На real-OCR subset ByT5 снижает CER с 0.4508 до 0.4361 и WER с 1.0888 до 0.9660. Относительное улучшение по WER выражено сильнее, чем по CER, а NoSpaceCER почти не меняется. Это означает, что модель частично переносится на реальные OCR-выходы, но пока не решает задачу устойчивой посимвольной коррекции реального OCR.</w:t>
-      </w:r>
-    </w:p>
-    <w:p>
-      <w:pPr>
-        <w:pStyle w:val="a0"/>
-      </w:pPr>
-      <w:r>
-        <w:t xml:space="preserve">Дополнительно был проведён line-level анализ CER:</w:t>
+        <w:pStyle w:val="BodyText"/>
+      </w:pPr>
+      <w:r>
+        <w:t xml:space="preserve">По среднему CER исходный Tesseract оказался лучше, чем оба варианта посткоррекции. ByT5 снижает WER с 0.9238 до 0.8919, но одновременно ухудшает CER с 0.3539 до 0.4564 и NoSpaceCER с 0.3421 до 0.4658. Для OCR-задачи на арабской графике это важное различие: word-level метрика может улучшаться за счёт пробелов и границ слов, но если character-level ошибка растёт, модель нельзя считать практически надёжной.</w:t>
+      </w:r>
+    </w:p>
+    <w:p>
+      <w:pPr>
+        <w:pStyle w:val="BodyText"/>
+      </w:pPr>
+      <w:r>
+        <w:t xml:space="preserve">Page-level разбор подтверждает эту картину.</w:t>
       </w:r>
     </w:p>
     <w:tbl>
@@ -4937,8 +5120,10 @@
         <w:tblLook w:firstRow="1" w:lastRow="0" w:firstColumn="0" w:lastColumn="0" w:noHBand="0" w:noVBand="0" w:val="0020"/>
       </w:tblPr>
       <w:tblGrid>
-        <w:gridCol w:w="3960"/>
-        <w:gridCol w:w="3960"/>
+        <w:gridCol w:w="1980"/>
+        <w:gridCol w:w="1980"/>
+        <w:gridCol w:w="1980"/>
+        <w:gridCol w:w="1980"/>
       </w:tblGrid>
       <w:tr>
         <w:trPr>
@@ -4951,19 +5136,43 @@
               <w:pStyle w:val="Compact"/>
             </w:pPr>
             <w:r>
-              <w:t xml:space="preserve">Category</w:t>
-            </w:r>
-          </w:p>
-        </w:tc>
-        <w:tc>
-          <w:tcPr/>
-          <w:p>
-            <w:pPr>
-              <w:pStyle w:val="Compact"/>
-              <w:jc w:val="right"/>
-            </w:pPr>
-            <w:r>
-              <w:t xml:space="preserve">Count</w:t>
+              <w:t xml:space="preserve">System</w:t>
+            </w:r>
+          </w:p>
+        </w:tc>
+        <w:tc>
+          <w:tcPr/>
+          <w:p>
+            <w:pPr>
+              <w:pStyle w:val="Compact"/>
+              <w:jc w:val="right"/>
+            </w:pPr>
+            <w:r>
+              <w:t xml:space="preserve">Improved</w:t>
+            </w:r>
+          </w:p>
+        </w:tc>
+        <w:tc>
+          <w:tcPr/>
+          <w:p>
+            <w:pPr>
+              <w:pStyle w:val="Compact"/>
+              <w:jc w:val="right"/>
+            </w:pPr>
+            <w:r>
+              <w:t xml:space="preserve">Same</w:t>
+            </w:r>
+          </w:p>
+        </w:tc>
+        <w:tc>
+          <w:tcPr/>
+          <w:p>
+            <w:pPr>
+              <w:pStyle w:val="Compact"/>
+              <w:jc w:val="right"/>
+            </w:pPr>
+            <w:r>
+              <w:t xml:space="preserve">Worse</w:t>
             </w:r>
           </w:p>
         </w:tc>
@@ -4976,19 +5185,43 @@
               <w:pStyle w:val="Compact"/>
             </w:pPr>
             <w:r>
-              <w:t xml:space="preserve">CER improved</w:t>
-            </w:r>
-          </w:p>
-        </w:tc>
-        <w:tc>
-          <w:tcPr/>
-          <w:p>
-            <w:pPr>
-              <w:pStyle w:val="Compact"/>
-              <w:jc w:val="right"/>
-            </w:pPr>
-            <w:r>
-              <w:t xml:space="preserve">40</w:t>
+              <w:t xml:space="preserve">ByT5 chunked</w:t>
+            </w:r>
+          </w:p>
+        </w:tc>
+        <w:tc>
+          <w:tcPr/>
+          <w:p>
+            <w:pPr>
+              <w:pStyle w:val="Compact"/>
+              <w:jc w:val="right"/>
+            </w:pPr>
+            <w:r>
+              <w:t xml:space="preserve">6</w:t>
+            </w:r>
+          </w:p>
+        </w:tc>
+        <w:tc>
+          <w:tcPr/>
+          <w:p>
+            <w:pPr>
+              <w:pStyle w:val="Compact"/>
+              <w:jc w:val="right"/>
+            </w:pPr>
+            <w:r>
+              <w:t xml:space="preserve">0</w:t>
+            </w:r>
+          </w:p>
+        </w:tc>
+        <w:tc>
+          <w:tcPr/>
+          <w:p>
+            <w:pPr>
+              <w:pStyle w:val="Compact"/>
+              <w:jc w:val="right"/>
+            </w:pPr>
+            <w:r>
+              <w:t xml:space="preserve">62</w:t>
             </w:r>
           </w:p>
         </w:tc>
@@ -5001,7 +5234,7 @@
               <w:pStyle w:val="Compact"/>
             </w:pPr>
             <w:r>
-              <w:t xml:space="preserve">CER unchanged</w:t>
+              <w:t xml:space="preserve">strict guarded ByT5</w:t>
             </w:r>
           </w:p>
         </w:tc>
@@ -5017,53 +5250,27 @@
             </w:r>
           </w:p>
         </w:tc>
-      </w:tr>
-      <w:tr>
-        <w:tc>
-          <w:tcPr/>
-          <w:p>
-            <w:pPr>
-              <w:pStyle w:val="Compact"/>
-            </w:pPr>
-            <w:r>
-              <w:t xml:space="preserve">CER worsened</w:t>
-            </w:r>
-          </w:p>
-        </w:tc>
-        <w:tc>
-          <w:tcPr/>
-          <w:p>
-            <w:pPr>
-              <w:pStyle w:val="Compact"/>
-              <w:jc w:val="right"/>
-            </w:pPr>
-            <w:r>
-              <w:t xml:space="preserve">17</w:t>
-            </w:r>
-          </w:p>
-        </w:tc>
-      </w:tr>
-      <w:tr>
-        <w:tc>
-          <w:tcPr/>
-          <w:p>
-            <w:pPr>
-              <w:pStyle w:val="Compact"/>
-            </w:pPr>
-            <w:r>
-              <w:t xml:space="preserve">Total</w:t>
-            </w:r>
-          </w:p>
-        </w:tc>
-        <w:tc>
-          <w:tcPr/>
-          <w:p>
-            <w:pPr>
-              <w:pStyle w:val="Compact"/>
-              <w:jc w:val="right"/>
-            </w:pPr>
-            <w:r>
-              <w:t xml:space="preserve">90</w:t>
+        <w:tc>
+          <w:tcPr/>
+          <w:p>
+            <w:pPr>
+              <w:pStyle w:val="Compact"/>
+              <w:jc w:val="right"/>
+            </w:pPr>
+            <w:r>
+              <w:t xml:space="preserve">3</w:t>
+            </w:r>
+          </w:p>
+        </w:tc>
+        <w:tc>
+          <w:tcPr/>
+          <w:p>
+            <w:pPr>
+              <w:pStyle w:val="Compact"/>
+              <w:jc w:val="right"/>
+            </w:pPr>
+            <w:r>
+              <w:t xml:space="preserve">32</w:t>
             </w:r>
           </w:p>
         </w:tc>
@@ -5071,33 +5278,25 @@
     </w:tbl>
     <w:p>
       <w:pPr>
-        <w:pStyle w:val="a0"/>
-      </w:pPr>
-      <w:r>
-        <w:t xml:space="preserve">Эти значения показывают, что модель улучшает больше строк, чем ухудшает, однако поведение остаётся нестабильным. На части строк модель делает полезные локальные исправления, но на других строках она либо оставляет OCR-output без изменений, либо вносит новые ошибки. Поэтому real-OCR experiment следует интерпретировать как sanity-level transfer check, а не как полноценный benchmark.</w:t>
-      </w:r>
-    </w:p>
-    <w:p>
-      <w:pPr>
-        <w:pStyle w:val="a0"/>
-      </w:pPr>
-      <w:r>
-        <w:t xml:space="preserve">Качественный анализ подтверждает этот вывод. В удачных случаях модель убирает лишние пробелы, частично восстанавливает структуру строки и делает OCR-output ближе к эталону. В нейтральных случаях она оставляет строку без изменений, что безопасно, но не исправляет реальные character-level ошибки. В худших случаях модель меняет строку локально, но не исправляет ключевые ошибки распознавания и может ухудшить CER.</w:t>
-      </w:r>
-    </w:p>
-    <w:p>
-      <w:pPr>
-        <w:pStyle w:val="a0"/>
-      </w:pPr>
-      <w:r>
-        <w:t xml:space="preserve">Главный вывод real-OCR проверки состоит в следующем: synthetic-trained ByT5 является полезным начальным baseline для post-correction, но для реальных исторических сканов недостаточно только generic synthetic noise. Для более сильного результата нужен manually verified real benchmark, line-level alignment, line crops, сравнение OCR engines и synthetic noise, построенный на реальных OCR-confusions.</w:t>
+        <w:pStyle w:val="BodyText"/>
+      </w:pPr>
+      <w:r>
+        <w:t xml:space="preserve">Без строгой фильтрации модель улучшает только 6 страниц из 68 и ухудшает 62 страницы. Strict guard резко уменьшает число плохих случаев и даёт 33 улучшенные страницы, но средний CER всё равно остаётся хуже, чем у raw OCR. Значит, fallback помогает как защитный механизм, но не заменяет обучение на реальных ошибках.</w:t>
+      </w:r>
+    </w:p>
+    <w:p>
+      <w:pPr>
+        <w:pStyle w:val="BodyText"/>
+      </w:pPr>
+      <w:r>
+        <w:t xml:space="preserve">Главный вывод этой проверки: результат на synthetic benchmark не переносится напрямую на полный real-OCR scenario. Модель выучила распределение искусственного шума, но настоящий Tesseract OCR для османско-турецкой арабской графики имеет другую структуру ошибок. Для следующего этапа нужны выровненные OCR/reference chunks, page-level split без утечки, обучение на настоящих OCR-ошибках и более аккуратная проверка на held-out pages.</w:t>
       </w:r>
     </w:p>
     <w:bookmarkEnd w:id="64"/>
     <w:bookmarkStart w:id="65" w:name="выводы-по-разделу-2"/>
     <w:p>
       <w:pPr>
-        <w:pStyle w:val="3"/>
+        <w:pStyle w:val="Heading3"/>
       </w:pPr>
       <w:r>
         <w:t xml:space="preserve">5.13 Выводы по разделу</w:t>
@@ -5108,23 +5307,23 @@
         <w:pStyle w:val="FirstParagraph"/>
       </w:pPr>
       <w:r>
-        <w:t xml:space="preserve">Раздел результатов показывает, что поставленная пилотная задача имеет смысл: ByT5-small 512 превосходит identity baseline, rule-based normalizer и train-derived char-confusion baseline, улучшает большинство тестовых примеров и особенно заметно снижает WER. Это предварительно показывает применимость byte-level neural post-correction как первого шага для обработки исторических арабографичных тюркских текстов, но только в рамках controlled synthetic benchmark.</w:t>
-      </w:r>
-    </w:p>
-    <w:p>
-      <w:pPr>
-        <w:pStyle w:val="a0"/>
-      </w:pPr>
-      <w:r>
-        <w:t xml:space="preserve">Одновременно результаты задают границы этого вывода. Rule-based normalizer ухудшает качество, ExactMatch остаётся низким, а часть примеров после ByT5 становится хуже. Значит, модель нельзя рассматривать как готовый автоматический корректор без анализа ошибок и ручной проверки.</w:t>
-      </w:r>
-    </w:p>
-    <w:p>
-      <w:pPr>
-        <w:pStyle w:val="a0"/>
-      </w:pPr>
-      <w:r>
-        <w:t xml:space="preserve">Таким образом, эксперимент показывает жизнеспособность направления, но следующий этап должен быть строже: больше источников, реальные OCR/HTR-выходы, ручная валидация и более детальный анализ типов ошибок. Эти ограничения и направления развития рассматриваются в следующем разделе.</w:t>
+        <w:t xml:space="preserve">Раздел результатов показывает две разные картины. В контролируемой synthetic-постановке ByT5-small 512 превосходит identity baseline, rule-based normalizer и train-derived char-confusion baseline. Она улучшает большинство тестовых примеров и особенно заметно снижает WER. Этот результат подтверждает, что byte-level neural post-correction подходит как рабочий пилотный подход для арабографичного тюркского текста при заданном распределении шума.</w:t>
+      </w:r>
+    </w:p>
+    <w:p>
+      <w:pPr>
+        <w:pStyle w:val="BodyText"/>
+      </w:pPr>
+      <w:r>
+        <w:t xml:space="preserve">Но real-OCR проверка ограничивает этот вывод. На page-level OCR османско-турецкого источника synthetic-trained ByT5 уже не превосходит raw Tesseract по CER. Напротив, без строгой фильтрации она ухудшает большинство страниц. Консервативный fallback снижает риск, но не даёт среднего выигрыша над raw OCR.</w:t>
+      </w:r>
+    </w:p>
+    <w:p>
+      <w:pPr>
+        <w:pStyle w:val="BodyText"/>
+      </w:pPr>
+      <w:r>
+        <w:t xml:space="preserve">Итог раздела поэтому двойной. С одной стороны, pipeline, метрики и обучение модели работают в воспроизводимой synthetic-среде. С другой стороны, практический переход к настоящим историческим сканам требует отдельной real-domain адаптации. Это не косметическое улучшение будущей работы, а методологическое условие: без настоящих OCR/reference-пар нельзя честно утверждать, что модель решает реальную задачу посткоррекции.</w:t>
       </w:r>
     </w:p>
     <w:bookmarkEnd w:id="65"/>
@@ -5132,7 +5331,7 @@
     <w:bookmarkStart w:id="73" w:name="Xe8e02886c60b8939714d6e867e04f7997a20272"/>
     <w:p>
       <w:pPr>
-        <w:pStyle w:val="2"/>
+        <w:pStyle w:val="Heading2"/>
       </w:pPr>
       <w:r>
         <w:t xml:space="preserve">6. Ограничения и направления дальнейшей работы</w:t>
@@ -5141,7 +5340,7 @@
     <w:bookmarkStart w:id="67" w:name="ограничения-корпуса-1"/>
     <w:p>
       <w:pPr>
-        <w:pStyle w:val="3"/>
+        <w:pStyle w:val="Heading3"/>
       </w:pPr>
       <w:r>
         <w:t xml:space="preserve">6.1 Ограничения корпуса</w:t>
@@ -5157,7 +5356,7 @@
     </w:p>
     <w:p>
       <w:pPr>
-        <w:pStyle w:val="a0"/>
+        <w:pStyle w:val="BodyText"/>
       </w:pPr>
       <w:r>
         <w:t xml:space="preserve">Один источник ограничивает жанровое, временное и орфографическое разнообразие материала. Тексты разных регионов, периодов и письменных традиций могут отличаться по графике, лексике, нормам записи и качеству исходного документа. Поэтому дальнейшая работа должна проверять модель не только на текущем османско-тюркском источнике, но и на других арабографичных тюркских материалах.</w:t>
@@ -5167,7 +5366,7 @@
     <w:bookmarkStart w:id="68" w:name="ограничения-синтетического-шума"/>
     <w:p>
       <w:pPr>
-        <w:pStyle w:val="3"/>
+        <w:pStyle w:val="Heading3"/>
       </w:pPr>
       <w:r>
         <w:t xml:space="preserve">6.2 Ограничения синтетического шума</w:t>
@@ -5195,17 +5394,17 @@
     </w:p>
     <w:p>
       <w:pPr>
-        <w:pStyle w:val="a0"/>
-      </w:pPr>
-      <w:r>
-        <w:t xml:space="preserve">Однако реальные OCR/HTR-ошибки зависят от качества изображения, шрифта, сегментации страницы, модели распознавания и состояния документа. Синтетический шум может приближать часть таких ошибок, но не гарантирует полного совпадения с практическим сценарием. В рамках данной работы был добавлен небольшой real-OCR sanity check на выходе Tesseract. Он показал частичный перенос модели на реальные OCR-ошибки, но также подтвердил необходимость более чистого line-level benchmark, ручной проверки соответствия строк и real-error-aware synthetic noise.</w:t>
+        <w:pStyle w:val="BodyText"/>
+      </w:pPr>
+      <w:r>
+        <w:t xml:space="preserve">Однако реальные OCR/HTR-ошибки зависят от качества изображения, шрифта, сегментации страницы, модели распознавания и состояния документа. Синтетический шум может приближать часть таких ошибок, но не гарантирует совпадения с практическим сценарием. Page-level проверка на османско-турецком источнике это подтвердила: synthetic-trained ByT5 немного снизила WER, но ухудшила CER и NoSpaceCER. Поэтому следующий этап должен строиться вокруг real-domain adaptation, а не вокруг усложнения одного только synthetic noise generator.</w:t>
       </w:r>
     </w:p>
     <w:bookmarkEnd w:id="68"/>
     <w:bookmarkStart w:id="69" w:name="ограничения-автоматических-метрик"/>
     <w:p>
       <w:pPr>
-        <w:pStyle w:val="3"/>
+        <w:pStyle w:val="Heading3"/>
       </w:pPr>
       <w:r>
         <w:t xml:space="preserve">6.3 Ограничения автоматических метрик</w:t>
@@ -5221,7 +5420,7 @@
     </w:p>
     <w:p>
       <w:pPr>
-        <w:pStyle w:val="a0"/>
+        <w:pStyle w:val="BodyText"/>
       </w:pPr>
       <w:r>
         <w:t xml:space="preserve">Модель может уменьшить edit distance, но внести лингвистически сомнительное исправление. Возможна и обратная ситуация: небольшое отличие от эталона может быть допустимым вариантом исторической записи. Поэтому автоматические метрики нужно дополнять ручной экспертной оценкой. В будущей версии работы стоит выделить небольшой manually validated subset и анализировать ошибки не только количественно, но и лингвистически.</w:t>
@@ -5231,7 +5430,7 @@
     <w:bookmarkStart w:id="70" w:name="направления-расширения-корпуса"/>
     <w:p>
       <w:pPr>
-        <w:pStyle w:val="3"/>
+        <w:pStyle w:val="Heading3"/>
       </w:pPr>
       <w:r>
         <w:t xml:space="preserve">6.4 Направления расширения корпуса</w:t>
@@ -5247,17 +5446,17 @@
     </w:p>
     <w:p>
       <w:pPr>
-        <w:pStyle w:val="a0"/>
-      </w:pPr>
-      <w:r>
-        <w:t xml:space="preserve">Особенно важно перейти от чистых текстовых блоков к связке «изображение → OCR/HTR-вывод → чистый текст». Такая структура позволит оценивать модель не только на синтетическом шуме, но и на ошибках реальных систем распознавания. Для этого потребуется небольшой, но качественно проверенный набор строк или страниц с ручной валидацией.</w:t>
+        <w:pStyle w:val="BodyText"/>
+      </w:pPr>
+      <w:r>
+        <w:t xml:space="preserve">Особенно важно перейти от чистых текстовых блоков к связке «изображение → OCR/HTR-вывод → чистый текст». В текущей работе уже сделан первый page-level sanity benchmark на османско-турецком источнике, но для обучения модели этого недостаточно: нужны выровненные OCR/reference-фрагменты, желательно на уровне строк или коротких чанков, и разбиение по страницам без утечки между train, validation и test.</w:t>
       </w:r>
     </w:p>
     <w:bookmarkEnd w:id="70"/>
     <w:bookmarkStart w:id="71" w:name="развитие-модельной-части"/>
     <w:p>
       <w:pPr>
-        <w:pStyle w:val="3"/>
+        <w:pStyle w:val="Heading3"/>
       </w:pPr>
       <w:r>
         <w:t xml:space="preserve">6.5 Развитие модельной части</w:t>
@@ -5273,7 +5472,7 @@
     </w:p>
     <w:p>
       <w:pPr>
-        <w:pStyle w:val="a0"/>
+        <w:pStyle w:val="BodyText"/>
       </w:pPr>
       <w:r>
         <w:t xml:space="preserve">Отдельно стоит проверять и LLM-based post-correction подходы. Современные работы показывают, что для исторических документов такие методы требуют осторожной оценки и не дают гарантированного выигрыша без учёта корпуса, типа ошибок и процедуры валидации (Kanerva et al., 2025).</w:t>
@@ -5281,7 +5480,7 @@
     </w:p>
     <w:p>
       <w:pPr>
-        <w:pStyle w:val="a0"/>
+        <w:pStyle w:val="BodyText"/>
       </w:pPr>
       <w:r>
         <w:t xml:space="preserve">Также нужно исследовать чувствительность результата к числу эпох, размеру обучающей выборки, максимальной длине последовательности и составу синтетического шума. Это поможет отделить эффект архитектуры от эффекта параметров эксперимента и понять, какие настройки действительно важны для арабографичного тюркского материала.</w:t>
@@ -5291,7 +5490,7 @@
     <w:bookmarkStart w:id="72" w:name="Xe0f4525a4655057f90c3dc6525f7d54178a77a1"/>
     <w:p>
       <w:pPr>
-        <w:pStyle w:val="3"/>
+        <w:pStyle w:val="Heading3"/>
       </w:pPr>
       <w:r>
         <w:t xml:space="preserve">6.6 Переход к более широкой системе анализа текстов</w:t>
@@ -5307,7 +5506,7 @@
     </w:p>
     <w:p>
       <w:pPr>
-        <w:pStyle w:val="a0"/>
+        <w:pStyle w:val="BodyText"/>
       </w:pPr>
       <w:r>
         <w:t xml:space="preserve">В контексте будущей выпускной работы этот пилот может стать техническим основанием для системы анализа исторических арабографичных тюркских материалов. Более крупная система может включать OCR/HTR, post-correction, NER, record linkage, извлечение дат и топонимов, а также построение связей между людьми, местами и документами.</w:t>
@@ -5315,7 +5514,7 @@
     </w:p>
     <w:p>
       <w:pPr>
-        <w:pStyle w:val="a0"/>
+        <w:pStyle w:val="BodyText"/>
       </w:pPr>
       <w:r>
         <w:t xml:space="preserve">Таким образом, текущая работа закрывает не всю задачу цифровой обработки исторических источников, а один необходимый слой будущего pipeline: повышение качества текстового вывода перед последующим историко-лингвистическим анализом.</w:t>
@@ -5326,7 +5525,7 @@
     <w:bookmarkStart w:id="74" w:name="заключение"/>
     <w:p>
       <w:pPr>
-        <w:pStyle w:val="2"/>
+        <w:pStyle w:val="Heading2"/>
       </w:pPr>
       <w:r>
         <w:t xml:space="preserve">7. Заключение</w:t>
@@ -5354,15 +5553,15 @@
     </w:p>
     <w:p>
       <w:pPr>
-        <w:pStyle w:val="a0"/>
-      </w:pPr>
-      <w:r>
-        <w:t xml:space="preserve">Главный результат эксперимента состоит в том, что ByT5-small 512 улучшает качество относительно identity baseline по CER и WER, превосходит train-derived char-confusion baseline и даёт положительный эффект на большинстве тестовых примеров. При этом улучшение неоднородно: WER снижается заметнее, чем CER, ExactMatch остаётся низким, а часть строк после post-correction ухудшается. Сильное снижение WER следует трактовать осторожно, поскольку synthetic noise включает ошибки пробелов и границ слов. Поэтому модель показывает перспективность подхода в контролируемой синтетической постановке, но не является готовым автоматическим корректором без анализа ошибок, ручной проверки и оценки на real OCR/HTR-выходах.</w:t>
-      </w:r>
-    </w:p>
-    <w:p>
-      <w:pPr>
-        <w:pStyle w:val="a0"/>
+        <w:pStyle w:val="BodyText"/>
+      </w:pPr>
+      <w:r>
+        <w:t xml:space="preserve">Главный результат эксперимента состоит в том, что ByT5-small 512 улучшает качество относительно identity baseline в controlled synthetic benchmark, превосходит train-derived char-confusion baseline и даёт положительный эффект на большинстве тестовых строк. При этом эффект неоднороден: WER снижается заметнее, чем CER, ExactMatch остаётся низким, а часть строк после post-correction ухудшается. Поэтому результат показывает работоспособность подхода в синтетической постановке, но не доказывает готовность модели к автоматической правке настоящего OCR.</w:t>
+      </w:r>
+    </w:p>
+    <w:p>
+      <w:pPr>
+        <w:pStyle w:val="BodyText"/>
       </w:pPr>
       <w:r>
         <w:t xml:space="preserve">Отдельно показано, что простая rule-based нормализация не является надёжным решением для исторического арабографичного тюркского материала. В проведённом эксперименте normalizer ухудшил качество относительно identity baseline. Это важный отрицательный результат: историческую орфографию нельзя механически унифицировать без проверки влияния на качество текста.</w:t>
@@ -5370,18 +5569,18 @@
     </w:p>
     <w:p>
       <w:pPr>
-        <w:pStyle w:val="a0"/>
-      </w:pPr>
-      <w:r>
-        <w:t xml:space="preserve">Полученные результаты имеют пилотный характер. Корпус мал, основан на ограниченном числе источников, а основной benchmark использует синтетические ошибки. Дополнительный real-OCR sanity check показывает частичный перенос ByT5 на выход Tesseract, но NoSpaceCER почти не меняется, а часть строк ухудшается. Поэтому выводы нельзя напрямую переносить на широкий класс исторических арабографичных тюркских документов. Для следующего этапа нужны дополнительные источники, line crops, более чистый manually validated subset, сравнение OCR engines и более детальный лингвистический анализ исправлений.</w:t>
-      </w:r>
-    </w:p>
-    <w:p>
-      <w:pPr>
-        <w:pStyle w:val="a0"/>
-      </w:pPr>
-      <w:r>
-        <w:t xml:space="preserve">Тем не менее работа создаёт техническую основу для дальнейшего исследования. Полученный pipeline можно расширять в сторону полноценной системы обработки исторических документов: от line crops, OCR/HTR и post-correction к поиску, извлечению именованных сущностей, сопоставлению исторических записей и построению графов связей между людьми, местами и документами. Наиболее важный следующий шаг — перейти от sanity-level real-OCR subset к verified real benchmark с построчным соответствием image/OCR/reference.</w:t>
+        <w:pStyle w:val="BodyText"/>
+      </w:pPr>
+      <w:r>
+        <w:t xml:space="preserve">Полученные результаты имеют пилотный характер. Корпус мал и основан на ограниченном числе источников, а основной benchmark использует синтетические ошибки. Дополнительный page-level real-OCR benchmark на османско-турецком источнике показал смешанный и в целом отрицательный перенос: ByT5 немного снижает WER, но ухудшает CER; strict guard уменьшает ущерб, но не превосходит raw Tesseract по среднему CER. Поэтому выводы нельзя напрямую переносить на широкий класс исторических арабографичных тюркских документов.</w:t>
+      </w:r>
+    </w:p>
+    <w:p>
+      <w:pPr>
+        <w:pStyle w:val="BodyText"/>
+      </w:pPr>
+      <w:r>
+        <w:t xml:space="preserve">Тем не менее работа создаёт техническую основу для дальнейшего исследования. Полученный pipeline можно расширять в сторону полноценной системы обработки исторических документов: от line crops, OCR/HTR и post-correction к поиску, извлечению именованных сущностей, сопоставлению исторических записей и построению графов связей. Ближайший следующий шаг — сделать verified real benchmark с выровненными OCR/reference chunks и дообучить модель на настоящих OCR-ошибках.</w:t>
       </w:r>
     </w:p>
     <w:p>
@@ -5394,7 +5593,7 @@
     <w:bookmarkStart w:id="76" w:name="список-литературы"/>
     <w:p>
       <w:pPr>
-        <w:pStyle w:val="1"/>
+        <w:pStyle w:val="Heading1"/>
       </w:pPr>
       <w:r>
         <w:t xml:space="preserve">Список литературы</w:t>
@@ -5404,7 +5603,7 @@
       <w:pPr>
         <w:numPr>
           <w:ilvl w:val="0"/>
-          <w:numId w:val="1008"/>
+          <w:numId w:val="1009"/>
         </w:numPr>
       </w:pPr>
       <w:r>
@@ -5415,7 +5614,7 @@
       <w:pPr>
         <w:numPr>
           <w:ilvl w:val="0"/>
-          <w:numId w:val="1008"/>
+          <w:numId w:val="1009"/>
         </w:numPr>
       </w:pPr>
       <w:r>
@@ -5426,7 +5625,7 @@
       <w:pPr>
         <w:numPr>
           <w:ilvl w:val="0"/>
-          <w:numId w:val="1008"/>
+          <w:numId w:val="1009"/>
         </w:numPr>
       </w:pPr>
       <w:r>
@@ -5437,7 +5636,7 @@
       <w:pPr>
         <w:numPr>
           <w:ilvl w:val="0"/>
-          <w:numId w:val="1008"/>
+          <w:numId w:val="1009"/>
         </w:numPr>
       </w:pPr>
       <w:r>
@@ -5448,7 +5647,7 @@
       <w:pPr>
         <w:numPr>
           <w:ilvl w:val="0"/>
-          <w:numId w:val="1008"/>
+          <w:numId w:val="1009"/>
         </w:numPr>
       </w:pPr>
       <w:r>
@@ -5459,7 +5658,7 @@
       <w:pPr>
         <w:numPr>
           <w:ilvl w:val="0"/>
-          <w:numId w:val="1008"/>
+          <w:numId w:val="1009"/>
         </w:numPr>
       </w:pPr>
       <w:r>
@@ -5470,7 +5669,7 @@
       <w:pPr>
         <w:numPr>
           <w:ilvl w:val="0"/>
-          <w:numId w:val="1008"/>
+          <w:numId w:val="1009"/>
         </w:numPr>
       </w:pPr>
       <w:r>
@@ -5481,7 +5680,7 @@
       <w:pPr>
         <w:numPr>
           <w:ilvl w:val="0"/>
-          <w:numId w:val="1008"/>
+          <w:numId w:val="1009"/>
         </w:numPr>
       </w:pPr>
       <w:r>
@@ -5492,7 +5691,7 @@
       <w:pPr>
         <w:numPr>
           <w:ilvl w:val="0"/>
-          <w:numId w:val="1008"/>
+          <w:numId w:val="1009"/>
         </w:numPr>
       </w:pPr>
       <w:r>
@@ -5503,7 +5702,7 @@
       <w:pPr>
         <w:numPr>
           <w:ilvl w:val="0"/>
-          <w:numId w:val="1008"/>
+          <w:numId w:val="1009"/>
         </w:numPr>
       </w:pPr>
       <w:r>
@@ -5514,7 +5713,7 @@
       <w:pPr>
         <w:numPr>
           <w:ilvl w:val="0"/>
-          <w:numId w:val="1008"/>
+          <w:numId w:val="1009"/>
         </w:numPr>
       </w:pPr>
       <w:r>
@@ -5525,7 +5724,7 @@
       <w:pPr>
         <w:numPr>
           <w:ilvl w:val="0"/>
-          <w:numId w:val="1008"/>
+          <w:numId w:val="1009"/>
         </w:numPr>
       </w:pPr>
       <w:r>
@@ -5536,7 +5735,7 @@
       <w:pPr>
         <w:numPr>
           <w:ilvl w:val="0"/>
-          <w:numId w:val="1008"/>
+          <w:numId w:val="1009"/>
         </w:numPr>
       </w:pPr>
       <w:r>
@@ -5547,7 +5746,7 @@
       <w:pPr>
         <w:numPr>
           <w:ilvl w:val="0"/>
-          <w:numId w:val="1008"/>
+          <w:numId w:val="1009"/>
         </w:numPr>
       </w:pPr>
       <w:r>
@@ -5559,9 +5758,6 @@
       <w:footnotePr>
         <w:numRestart w:val="eachSect"/>
       </w:footnotePr>
-      <w:pgSz w:h="15840" w:w="12240"/>
-      <w:pgMar w:bottom="1134" w:footer="720" w:gutter="0" w:header="720" w:left="1701" w:right="850" w:top="1134"/>
-      <w:cols w:space="720"/>
     </w:sectPr>
   </w:body>
 </w:document>
@@ -5591,274 +5787,7 @@
 </file>
 
 <file path=word/numbering.xml><?xml version="1.0" encoding="utf-8"?>
-<w:numbering xmlns:aink="http://schemas.microsoft.com/office/drawing/2016/ink" xmlns:am3d="http://schemas.microsoft.com/office/drawing/2017/model3d" xmlns:cx="http://schemas.microsoft.com/office/drawing/2014/chartex" xmlns:cx1="http://schemas.microsoft.com/office/drawing/2015/9/8/chartex" xmlns:cx2="http://schemas.microsoft.com/office/drawing/2015/10/21/chartex" xmlns:cx3="http://schemas.microsoft.com/office/drawing/2016/5/9/chartex" xmlns:cx4="http://schemas.microsoft.com/office/drawing/2016/5/10/chartex" xmlns:cx5="http://schemas.microsoft.com/office/drawing/2016/5/11/chartex" xmlns:cx6="http://schemas.microsoft.com/office/drawing/2016/5/12/chartex" xmlns:cx7="http://schemas.microsoft.com/office/drawing/2016/5/13/chartex" xmlns:cx8="http://schemas.microsoft.com/office/drawing/2016/5/14/chartex" xmlns:m="http://schemas.openxmlformats.org/officeDocument/2006/math" xmlns:mc="http://schemas.openxmlformats.org/markup-compatibility/2006" xmlns:o="urn:schemas-microsoft-com:office:office" xmlns:oel="http://schemas.microsoft.com/office/2019/extlst" xmlns:r="http://schemas.openxmlformats.org/officeDocument/2006/relationships" xmlns:v="urn:schemas-microsoft-com:vml" xmlns:w="http://schemas.openxmlformats.org/wordprocessingml/2006/main" xmlns:w10="urn:schemas-microsoft-com:office:word" xmlns:w14="http://schemas.microsoft.com/office/word/2010/wordml" xmlns:w15="http://schemas.microsoft.com/office/word/2012/wordml" xmlns:w16="http://schemas.microsoft.com/office/word/2018/wordml" xmlns:w16cex="http://schemas.microsoft.com/office/word/2018/wordml/cex" xmlns:w16cid="http://schemas.microsoft.com/office/word/2016/wordml/cid" xmlns:w16du="http://schemas.microsoft.com/office/word/2023/wordml/word16du" xmlns:w16sdtdh="http://schemas.microsoft.com/office/word/2020/wordml/sdtdatahash" xmlns:w16sdtfl="http://schemas.microsoft.com/office/word/2024/wordml/sdtformatlock" xmlns:w16se="http://schemas.microsoft.com/office/word/2015/wordml/symex" xmlns:wne="http://schemas.microsoft.com/office/word/2006/wordml" xmlns:wp="http://schemas.openxmlformats.org/drawingml/2006/wordprocessingDrawing" xmlns:wp14="http://schemas.microsoft.com/office/word/2010/wordprocessingDrawing" xmlns:wpc="http://schemas.microsoft.com/office/word/2010/wordprocessingCanvas" xmlns:wpg="http://schemas.microsoft.com/office/word/2010/wordprocessingGroup" xmlns:wpi="http://schemas.microsoft.com/office/word/2010/wordprocessingInk" xmlns:wps="http://schemas.microsoft.com/office/word/2010/wordprocessingShape" mc:Ignorable="w14 w15 w16se w16cid w16 w16cex w16sdtdh w16sdtfl w16du wp14">
-  <w:abstractNum w15:restartNumberingAfterBreak="0" w:abstractNumId="0">
-    <w:nsid w:val="0000A990"/>
-    <w:multiLevelType w:val="multilevel"/>
-    <w:tmpl w:val="3D569216"/>
-    <w:lvl w:ilvl="0">
-      <w:numFmt w:val="bullet"/>
-      <w:lvlText w:val=" "/>
-      <w:lvlJc w:val="left"/>
-      <w:pPr>
-        <w:ind w:hanging="360" w:left="720"/>
-      </w:pPr>
-    </w:lvl>
-    <w:lvl w:ilvl="1">
-      <w:numFmt w:val="bullet"/>
-      <w:lvlText w:val=" "/>
-      <w:lvlJc w:val="left"/>
-      <w:pPr>
-        <w:ind w:hanging="360" w:left="1440"/>
-      </w:pPr>
-    </w:lvl>
-    <w:lvl w:ilvl="2">
-      <w:numFmt w:val="bullet"/>
-      <w:lvlText w:val=" "/>
-      <w:lvlJc w:val="left"/>
-      <w:pPr>
-        <w:ind w:hanging="360" w:left="2160"/>
-      </w:pPr>
-    </w:lvl>
-    <w:lvl w:ilvl="3">
-      <w:numFmt w:val="bullet"/>
-      <w:lvlText w:val=" "/>
-      <w:lvlJc w:val="left"/>
-      <w:pPr>
-        <w:ind w:hanging="360" w:left="2880"/>
-      </w:pPr>
-    </w:lvl>
-    <w:lvl w:ilvl="4">
-      <w:numFmt w:val="bullet"/>
-      <w:lvlText w:val=" "/>
-      <w:lvlJc w:val="left"/>
-      <w:pPr>
-        <w:ind w:hanging="360" w:left="3600"/>
-      </w:pPr>
-    </w:lvl>
-    <w:lvl w:ilvl="5">
-      <w:numFmt w:val="bullet"/>
-      <w:lvlText w:val=" "/>
-      <w:lvlJc w:val="left"/>
-      <w:pPr>
-        <w:ind w:hanging="360" w:left="4320"/>
-      </w:pPr>
-    </w:lvl>
-    <w:lvl w:ilvl="6">
-      <w:numFmt w:val="bullet"/>
-      <w:lvlText w:val=" "/>
-      <w:lvlJc w:val="left"/>
-      <w:pPr>
-        <w:ind w:hanging="360" w:left="5040"/>
-      </w:pPr>
-    </w:lvl>
-    <w:lvl w:ilvl="7">
-      <w:numFmt w:val="bullet"/>
-      <w:lvlText w:val=" "/>
-      <w:lvlJc w:val="left"/>
-      <w:pPr>
-        <w:ind w:hanging="360" w:left="5760"/>
-      </w:pPr>
-    </w:lvl>
-    <w:lvl w:ilvl="8">
-      <w:numFmt w:val="bullet"/>
-      <w:lvlText w:val=" "/>
-      <w:lvlJc w:val="left"/>
-      <w:pPr>
-        <w:ind w:hanging="360" w:left="6480"/>
-      </w:pPr>
-    </w:lvl>
-  </w:abstractNum>
-  <w:abstractNum w15:restartNumberingAfterBreak="0" w:abstractNumId="1">
-    <w:nsid w:val="0000A991"/>
-    <w:multiLevelType w:val="multilevel"/>
-    <w:tmpl w:val="DFCE9448"/>
-    <w:lvl w:ilvl="0">
-      <w:numFmt w:val="bullet"/>
-      <w:lvlText w:val=""/>
-      <w:lvlJc w:val="left"/>
-      <w:pPr>
-        <w:ind w:hanging="360" w:left="720"/>
-      </w:pPr>
-      <w:rPr>
-        <w:rFonts w:ascii="Symbol" w:cs="Symbol" w:hAnsi="Symbol" w:hint="default"/>
-      </w:rPr>
-    </w:lvl>
-    <w:lvl w:ilvl="1">
-      <w:numFmt w:val="bullet"/>
-      <w:lvlText w:val="o"/>
-      <w:lvlJc w:val="left"/>
-      <w:pPr>
-        <w:ind w:hanging="360" w:left="1440"/>
-      </w:pPr>
-      <w:rPr>
-        <w:rFonts w:ascii="Courier New" w:cs="Courier New" w:hAnsi="Courier New" w:hint="default"/>
-      </w:rPr>
-    </w:lvl>
-    <w:lvl w:ilvl="2">
-      <w:numFmt w:val="bullet"/>
-      <w:lvlText w:val=""/>
-      <w:lvlJc w:val="left"/>
-      <w:pPr>
-        <w:ind w:hanging="360" w:left="2160"/>
-      </w:pPr>
-      <w:rPr>
-        <w:rFonts w:ascii="Wingdings" w:cs="Wingdings" w:hAnsi="Wingdings" w:hint="default"/>
-      </w:rPr>
-    </w:lvl>
-    <w:lvl w:ilvl="3">
-      <w:numFmt w:val="bullet"/>
-      <w:lvlText w:val=""/>
-      <w:lvlJc w:val="left"/>
-      <w:pPr>
-        <w:ind w:hanging="360" w:left="2880"/>
-      </w:pPr>
-      <w:rPr>
-        <w:rFonts w:ascii="Symbol" w:cs="Symbol" w:hAnsi="Symbol" w:hint="default"/>
-      </w:rPr>
-    </w:lvl>
-    <w:lvl w:ilvl="4">
-      <w:numFmt w:val="bullet"/>
-      <w:lvlText w:val="o"/>
-      <w:lvlJc w:val="left"/>
-      <w:pPr>
-        <w:ind w:hanging="360" w:left="3600"/>
-      </w:pPr>
-      <w:rPr>
-        <w:rFonts w:ascii="Courier New" w:cs="Courier New" w:hAnsi="Courier New" w:hint="default"/>
-      </w:rPr>
-    </w:lvl>
-    <w:lvl w:ilvl="5">
-      <w:numFmt w:val="bullet"/>
-      <w:lvlText w:val=""/>
-      <w:lvlJc w:val="left"/>
-      <w:pPr>
-        <w:ind w:hanging="360" w:left="4320"/>
-      </w:pPr>
-      <w:rPr>
-        <w:rFonts w:ascii="Wingdings" w:cs="Wingdings" w:hAnsi="Wingdings" w:hint="default"/>
-      </w:rPr>
-    </w:lvl>
-    <w:lvl w:ilvl="6">
-      <w:numFmt w:val="bullet"/>
-      <w:lvlText w:val=""/>
-      <w:lvlJc w:val="left"/>
-      <w:pPr>
-        <w:ind w:hanging="360" w:left="5040"/>
-      </w:pPr>
-      <w:rPr>
-        <w:rFonts w:ascii="Symbol" w:cs="Symbol" w:hAnsi="Symbol" w:hint="default"/>
-      </w:rPr>
-    </w:lvl>
-    <w:lvl w:ilvl="7">
-      <w:numFmt w:val="bullet"/>
-      <w:lvlText w:val="o"/>
-      <w:lvlJc w:val="left"/>
-      <w:pPr>
-        <w:ind w:hanging="360" w:left="5760"/>
-      </w:pPr>
-      <w:rPr>
-        <w:rFonts w:ascii="Courier New" w:cs="Courier New" w:hAnsi="Courier New" w:hint="default"/>
-      </w:rPr>
-    </w:lvl>
-    <w:lvl w:ilvl="8">
-      <w:numFmt w:val="bullet"/>
-      <w:lvlText w:val=""/>
-      <w:lvlJc w:val="left"/>
-      <w:pPr>
-        <w:ind w:hanging="360" w:left="6480"/>
-      </w:pPr>
-      <w:rPr>
-        <w:rFonts w:ascii="Wingdings" w:cs="Wingdings" w:hAnsi="Wingdings" w:hint="default"/>
-      </w:rPr>
-    </w:lvl>
-  </w:abstractNum>
-  <w:abstractNum w15:restartNumberingAfterBreak="0" w:abstractNumId="2">
-    <w:nsid w:val="00A99411"/>
-    <w:multiLevelType w:val="multilevel"/>
-    <w:tmpl w:val="1FE86510"/>
-    <w:lvl w:ilvl="0">
-      <w:start w:val="1"/>
-      <w:numFmt w:val="decimal"/>
-      <w:lvlText w:val="%1."/>
-      <w:lvlJc w:val="left"/>
-      <w:pPr>
-        <w:ind w:hanging="360" w:left="720"/>
-      </w:pPr>
-    </w:lvl>
-    <w:lvl w:ilvl="1">
-      <w:start w:val="1"/>
-      <w:numFmt w:val="decimal"/>
-      <w:lvlText w:val="%2."/>
-      <w:lvlJc w:val="left"/>
-      <w:pPr>
-        <w:ind w:hanging="360" w:left="1440"/>
-      </w:pPr>
-    </w:lvl>
-    <w:lvl w:ilvl="2">
-      <w:start w:val="1"/>
-      <w:numFmt w:val="decimal"/>
-      <w:lvlText w:val="%3."/>
-      <w:lvlJc w:val="left"/>
-      <w:pPr>
-        <w:ind w:hanging="360" w:left="2160"/>
-      </w:pPr>
-    </w:lvl>
-    <w:lvl w:ilvl="3">
-      <w:start w:val="1"/>
-      <w:numFmt w:val="decimal"/>
-      <w:lvlText w:val="%4."/>
-      <w:lvlJc w:val="left"/>
-      <w:pPr>
-        <w:ind w:hanging="360" w:left="2880"/>
-      </w:pPr>
-    </w:lvl>
-    <w:lvl w:ilvl="4">
-      <w:start w:val="1"/>
-      <w:numFmt w:val="decimal"/>
-      <w:lvlText w:val="%5."/>
-      <w:lvlJc w:val="left"/>
-      <w:pPr>
-        <w:ind w:hanging="360" w:left="3600"/>
-      </w:pPr>
-    </w:lvl>
-    <w:lvl w:ilvl="5">
-      <w:start w:val="1"/>
-      <w:numFmt w:val="decimal"/>
-      <w:lvlText w:val="%6."/>
-      <w:lvlJc w:val="left"/>
-      <w:pPr>
-        <w:ind w:hanging="360" w:left="4320"/>
-      </w:pPr>
-    </w:lvl>
-    <w:lvl w:ilvl="6">
-      <w:start w:val="1"/>
-      <w:numFmt w:val="decimal"/>
-      <w:lvlText w:val="%7."/>
-      <w:lvlJc w:val="left"/>
-      <w:pPr>
-        <w:ind w:hanging="360" w:left="5040"/>
-      </w:pPr>
-    </w:lvl>
-    <w:lvl w:ilvl="7">
-      <w:start w:val="1"/>
-      <w:numFmt w:val="decimal"/>
-      <w:lvlText w:val="%8."/>
-      <w:lvlJc w:val="left"/>
-      <w:pPr>
-        <w:ind w:hanging="360" w:left="5760"/>
-      </w:pPr>
-    </w:lvl>
-    <w:lvl w:ilvl="8">
-      <w:start w:val="1"/>
-      <w:numFmt w:val="decimal"/>
-      <w:lvlText w:val="%9."/>
-      <w:lvlJc w:val="left"/>
-      <w:pPr>
-        <w:ind w:hanging="360" w:left="6480"/>
-      </w:pPr>
-    </w:lvl>
-  </w:abstractNum>
+<w:numbering xmlns:w="http://schemas.openxmlformats.org/wordprocessingml/2006/main">
   <w:abstractNum w:abstractNumId="990">
     <w:nsid w:val="0000A990"/>
     <w:multiLevelType w:val="multilevel"/>
@@ -6123,114 +6052,6 @@
       </w:pPr>
     </w:lvl>
   </w:abstractNum>
-  <w:num w16cid:durableId="2014599508" w:numId="1">
-    <w:abstractNumId w:val="0"/>
-  </w:num>
-  <w:num w16cid:durableId="1800302629" w:numId="2">
-    <w:abstractNumId w:val="1"/>
-  </w:num>
-  <w:num w16cid:durableId="1557155845" w:numId="3">
-    <w:abstractNumId w:val="2"/>
-    <w:lvlOverride w:ilvl="0">
-      <w:startOverride w:val="1"/>
-    </w:lvlOverride>
-    <w:lvlOverride w:ilvl="1">
-      <w:startOverride w:val="1"/>
-    </w:lvlOverride>
-    <w:lvlOverride w:ilvl="2">
-      <w:startOverride w:val="1"/>
-    </w:lvlOverride>
-    <w:lvlOverride w:ilvl="3">
-      <w:startOverride w:val="1"/>
-    </w:lvlOverride>
-    <w:lvlOverride w:ilvl="4">
-      <w:startOverride w:val="1"/>
-    </w:lvlOverride>
-    <w:lvlOverride w:ilvl="5">
-      <w:startOverride w:val="1"/>
-    </w:lvlOverride>
-    <w:lvlOverride w:ilvl="6">
-      <w:startOverride w:val="1"/>
-    </w:lvlOverride>
-    <w:lvlOverride w:ilvl="7">
-      <w:startOverride w:val="1"/>
-    </w:lvlOverride>
-    <w:lvlOverride w:ilvl="8">
-      <w:startOverride w:val="1"/>
-    </w:lvlOverride>
-  </w:num>
-  <w:num w16cid:durableId="900287049" w:numId="4">
-    <w:abstractNumId w:val="2"/>
-    <w:lvlOverride w:ilvl="0">
-      <w:startOverride w:val="1"/>
-    </w:lvlOverride>
-    <w:lvlOverride w:ilvl="1">
-      <w:startOverride w:val="1"/>
-    </w:lvlOverride>
-    <w:lvlOverride w:ilvl="2">
-      <w:startOverride w:val="1"/>
-    </w:lvlOverride>
-    <w:lvlOverride w:ilvl="3">
-      <w:startOverride w:val="1"/>
-    </w:lvlOverride>
-    <w:lvlOverride w:ilvl="4">
-      <w:startOverride w:val="1"/>
-    </w:lvlOverride>
-    <w:lvlOverride w:ilvl="5">
-      <w:startOverride w:val="1"/>
-    </w:lvlOverride>
-    <w:lvlOverride w:ilvl="6">
-      <w:startOverride w:val="1"/>
-    </w:lvlOverride>
-    <w:lvlOverride w:ilvl="7">
-      <w:startOverride w:val="1"/>
-    </w:lvlOverride>
-    <w:lvlOverride w:ilvl="8">
-      <w:startOverride w:val="1"/>
-    </w:lvlOverride>
-  </w:num>
-  <w:num w16cid:durableId="821773242" w:numId="5">
-    <w:abstractNumId w:val="1"/>
-  </w:num>
-  <w:num w16cid:durableId="900756064" w:numId="6">
-    <w:abstractNumId w:val="1"/>
-  </w:num>
-  <w:num w16cid:durableId="1582255530" w:numId="7">
-    <w:abstractNumId w:val="1"/>
-  </w:num>
-  <w:num w16cid:durableId="566647025" w:numId="8">
-    <w:abstractNumId w:val="1"/>
-  </w:num>
-  <w:num w16cid:durableId="387002044" w:numId="9">
-    <w:abstractNumId w:val="2"/>
-    <w:lvlOverride w:ilvl="0">
-      <w:startOverride w:val="1"/>
-    </w:lvlOverride>
-    <w:lvlOverride w:ilvl="1">
-      <w:startOverride w:val="1"/>
-    </w:lvlOverride>
-    <w:lvlOverride w:ilvl="2">
-      <w:startOverride w:val="1"/>
-    </w:lvlOverride>
-    <w:lvlOverride w:ilvl="3">
-      <w:startOverride w:val="1"/>
-    </w:lvlOverride>
-    <w:lvlOverride w:ilvl="4">
-      <w:startOverride w:val="1"/>
-    </w:lvlOverride>
-    <w:lvlOverride w:ilvl="5">
-      <w:startOverride w:val="1"/>
-    </w:lvlOverride>
-    <w:lvlOverride w:ilvl="6">
-      <w:startOverride w:val="1"/>
-    </w:lvlOverride>
-    <w:lvlOverride w:ilvl="7">
-      <w:startOverride w:val="1"/>
-    </w:lvlOverride>
-    <w:lvlOverride w:ilvl="8">
-      <w:startOverride w:val="1"/>
-    </w:lvlOverride>
-  </w:num>
   <w:num w:numId="1000">
     <w:abstractNumId w:val="990"/>
   </w:num>
@@ -6310,6 +6131,9 @@
     <w:abstractNumId w:val="991"/>
   </w:num>
   <w:num w:numId="1008">
+    <w:abstractNumId w:val="991"/>
+  </w:num>
+  <w:num w:numId="1009">
     <w:abstractNumId w:val="99411"/>
     <w:lvlOverride w:ilvl="0">
       <w:startOverride w:val="1"/>
@@ -6343,7 +6167,7 @@
 </file>
 
 <file path=word/styles.xml><?xml version="1.0" encoding="utf-8"?>
-<w:styles xmlns:mc="http://schemas.openxmlformats.org/markup-compatibility/2006" xmlns:r="http://schemas.openxmlformats.org/officeDocument/2006/relationships" xmlns:w="http://schemas.openxmlformats.org/wordprocessingml/2006/main" xmlns:w14="http://schemas.microsoft.com/office/word/2010/wordml" xmlns:w15="http://schemas.microsoft.com/office/word/2012/wordml" xmlns:w16="http://schemas.microsoft.com/office/word/2018/wordml" xmlns:w16cex="http://schemas.microsoft.com/office/word/2018/wordml/cex" xmlns:w16cid="http://schemas.microsoft.com/office/word/2016/wordml/cid" xmlns:w16du="http://schemas.microsoft.com/office/word/2023/wordml/word16du" xmlns:w16sdtdh="http://schemas.microsoft.com/office/word/2020/wordml/sdtdatahash" xmlns:w16sdtfl="http://schemas.microsoft.com/office/word/2024/wordml/sdtformatlock" xmlns:w16se="http://schemas.microsoft.com/office/word/2015/wordml/symex" mc:Ignorable="w14 w15 w16se w16cid w16 w16cex w16sdtdh w16sdtfl w16du">
+<w:styles xmlns:r="http://schemas.openxmlformats.org/officeDocument/2006/relationships" xmlns:w="http://schemas.openxmlformats.org/wordprocessingml/2006/main">
   <w:docDefaults>
     <w:rPrDefault>
       <w:rPr>
@@ -6359,263 +6183,172 @@
       </w:pPr>
     </w:pPrDefault>
   </w:docDefaults>
-  <w:latentStyles w:count="376" w:defLockedState="0" w:defQFormat="0" w:defSemiHidden="0" w:defUIPriority="0" w:defUnhideWhenUsed="0">
-    <w:lsdException w:name="toc 1" w:uiPriority="39"/>
-    <w:lsdException w:name="toc 2" w:uiPriority="39"/>
-    <w:lsdException w:name="toc 3" w:uiPriority="39"/>
-    <w:lsdException w:name="Hyperlink" w:uiPriority="99"/>
-    <w:lsdException w:name="Normal Table" w:semiHidden="1" w:unhideWhenUsed="1"/>
-    <w:lsdException w:name="Table Simple 1" w:semiHidden="1" w:unhideWhenUsed="1"/>
-    <w:lsdException w:name="Table Simple 2" w:semiHidden="1" w:unhideWhenUsed="1"/>
-    <w:lsdException w:name="Table Simple 3" w:semiHidden="1" w:unhideWhenUsed="1"/>
-    <w:lsdException w:name="Table Classic 1" w:semiHidden="1" w:unhideWhenUsed="1"/>
-    <w:lsdException w:name="Table Classic 2" w:semiHidden="1" w:unhideWhenUsed="1"/>
-    <w:lsdException w:name="Table Classic 3" w:semiHidden="1" w:unhideWhenUsed="1"/>
-    <w:lsdException w:name="Table Classic 4" w:semiHidden="1" w:unhideWhenUsed="1"/>
-    <w:lsdException w:name="Table Colorful 1" w:semiHidden="1" w:unhideWhenUsed="1"/>
-    <w:lsdException w:name="Table Colorful 2" w:semiHidden="1" w:unhideWhenUsed="1"/>
-    <w:lsdException w:name="Table Colorful 3" w:semiHidden="1" w:unhideWhenUsed="1"/>
-    <w:lsdException w:name="Table Columns 1" w:semiHidden="1" w:unhideWhenUsed="1"/>
-    <w:lsdException w:name="Table Columns 2" w:semiHidden="1" w:unhideWhenUsed="1"/>
-    <w:lsdException w:name="Table Columns 3" w:semiHidden="1" w:unhideWhenUsed="1"/>
-    <w:lsdException w:name="Table Columns 4" w:semiHidden="1" w:unhideWhenUsed="1"/>
-    <w:lsdException w:name="Table Columns 5" w:semiHidden="1" w:unhideWhenUsed="1"/>
-    <w:lsdException w:name="Table Grid 1" w:semiHidden="1" w:unhideWhenUsed="1"/>
-    <w:lsdException w:name="Table Grid 2" w:semiHidden="1" w:unhideWhenUsed="1"/>
-    <w:lsdException w:name="Table Grid 3" w:semiHidden="1" w:unhideWhenUsed="1"/>
-    <w:lsdException w:name="Table Grid 4" w:semiHidden="1" w:unhideWhenUsed="1"/>
-    <w:lsdException w:name="Table Grid 5" w:semiHidden="1" w:unhideWhenUsed="1"/>
-    <w:lsdException w:name="Table Grid 6" w:semiHidden="1" w:unhideWhenUsed="1"/>
-    <w:lsdException w:name="Table Grid 7" w:semiHidden="1" w:unhideWhenUsed="1"/>
-    <w:lsdException w:name="Table Grid 8" w:semiHidden="1" w:unhideWhenUsed="1"/>
-    <w:lsdException w:name="Table List 1" w:semiHidden="1" w:unhideWhenUsed="1"/>
-    <w:lsdException w:name="Table List 2" w:semiHidden="1" w:unhideWhenUsed="1"/>
-    <w:lsdException w:name="Table List 3" w:semiHidden="1" w:unhideWhenUsed="1"/>
-    <w:lsdException w:name="Table List 4" w:semiHidden="1" w:unhideWhenUsed="1"/>
-    <w:lsdException w:name="Table List 5" w:semiHidden="1" w:unhideWhenUsed="1"/>
-    <w:lsdException w:name="Table List 6" w:semiHidden="1" w:unhideWhenUsed="1"/>
-    <w:lsdException w:name="Table List 7" w:semiHidden="1" w:unhideWhenUsed="1"/>
-    <w:lsdException w:name="Table List 8" w:semiHidden="1" w:unhideWhenUsed="1"/>
-    <w:lsdException w:name="Table 3D effects 1" w:semiHidden="1" w:unhideWhenUsed="1"/>
-    <w:lsdException w:name="Table 3D effects 2" w:semiHidden="1" w:unhideWhenUsed="1"/>
-    <w:lsdException w:name="Table 3D effects 3" w:semiHidden="1" w:unhideWhenUsed="1"/>
-    <w:lsdException w:name="Table Contemporary" w:semiHidden="1" w:unhideWhenUsed="1"/>
-    <w:lsdException w:name="Table Elegant" w:semiHidden="1" w:unhideWhenUsed="1"/>
-    <w:lsdException w:name="Table Professional" w:semiHidden="1" w:unhideWhenUsed="1"/>
-    <w:lsdException w:name="Table Subtle 1" w:semiHidden="1" w:unhideWhenUsed="1"/>
-    <w:lsdException w:name="Table Subtle 2" w:semiHidden="1" w:unhideWhenUsed="1"/>
-    <w:lsdException w:name="Table Web 1" w:semiHidden="1" w:unhideWhenUsed="1"/>
-    <w:lsdException w:name="Table Web 2" w:semiHidden="1" w:unhideWhenUsed="1"/>
-    <w:lsdException w:name="Table Web 3" w:semiHidden="1" w:unhideWhenUsed="1"/>
-    <w:lsdException w:name="Table Theme" w:semiHidden="1" w:unhideWhenUsed="1"/>
-    <w:lsdException w:name="Light Shading"/>
-    <w:lsdException w:name="Light List"/>
-    <w:lsdException w:name="Light Grid"/>
-    <w:lsdException w:name="Medium Shading 1"/>
-    <w:lsdException w:name="Medium Shading 2"/>
-    <w:lsdException w:name="Medium List 1"/>
-    <w:lsdException w:name="Medium List 2"/>
-    <w:lsdException w:name="Medium Grid 1"/>
-    <w:lsdException w:name="Medium Grid 2"/>
-    <w:lsdException w:name="Medium Grid 3"/>
-    <w:lsdException w:name="Dark List"/>
-    <w:lsdException w:name="Colorful Shading"/>
-    <w:lsdException w:name="Colorful List"/>
-    <w:lsdException w:name="Colorful Grid"/>
-    <w:lsdException w:name="Light Shading Accent 1"/>
-    <w:lsdException w:name="Light List Accent 1"/>
-    <w:lsdException w:name="Light Grid Accent 1"/>
-    <w:lsdException w:name="Medium Shading 1 Accent 1"/>
-    <w:lsdException w:name="Medium Shading 2 Accent 1"/>
-    <w:lsdException w:name="Medium List 1 Accent 1"/>
-    <w:lsdException w:name="Medium List 2 Accent 1"/>
-    <w:lsdException w:name="Medium Grid 1 Accent 1"/>
-    <w:lsdException w:name="Medium Grid 2 Accent 1"/>
-    <w:lsdException w:name="Medium Grid 3 Accent 1"/>
-    <w:lsdException w:name="Dark List Accent 1"/>
-    <w:lsdException w:name="Colorful Shading Accent 1"/>
-    <w:lsdException w:name="Colorful List Accent 1"/>
-    <w:lsdException w:name="Colorful Grid Accent 1"/>
-    <w:lsdException w:name="Light Shading Accent 2"/>
-    <w:lsdException w:name="Light List Accent 2"/>
-    <w:lsdException w:name="Light Grid Accent 2"/>
-    <w:lsdException w:name="Medium Shading 1 Accent 2"/>
-    <w:lsdException w:name="Medium Shading 2 Accent 2"/>
-    <w:lsdException w:name="Medium List 1 Accent 2"/>
-    <w:lsdException w:name="Medium List 2 Accent 2"/>
-    <w:lsdException w:name="Medium Grid 1 Accent 2"/>
-    <w:lsdException w:name="Medium Grid 2 Accent 2"/>
-    <w:lsdException w:name="Medium Grid 3 Accent 2"/>
-    <w:lsdException w:name="Dark List Accent 2"/>
-    <w:lsdException w:name="Colorful Shading Accent 2"/>
-    <w:lsdException w:name="Colorful List Accent 2"/>
-    <w:lsdException w:name="Colorful Grid Accent 2"/>
-    <w:lsdException w:name="Light Shading Accent 3"/>
-    <w:lsdException w:name="Light List Accent 3"/>
-    <w:lsdException w:name="Light Grid Accent 3"/>
-    <w:lsdException w:name="Medium Shading 1 Accent 3"/>
-    <w:lsdException w:name="Medium Shading 2 Accent 3"/>
-    <w:lsdException w:name="Medium List 1 Accent 3"/>
-    <w:lsdException w:name="Medium List 2 Accent 3"/>
-    <w:lsdException w:name="Medium Grid 1 Accent 3"/>
-    <w:lsdException w:name="Medium Grid 2 Accent 3"/>
-    <w:lsdException w:name="Medium Grid 3 Accent 3"/>
-    <w:lsdException w:name="Dark List Accent 3"/>
-    <w:lsdException w:name="Colorful Shading Accent 3"/>
-    <w:lsdException w:name="Colorful List Accent 3"/>
-    <w:lsdException w:name="Colorful Grid Accent 3"/>
-    <w:lsdException w:name="Light Shading Accent 4"/>
-    <w:lsdException w:name="Light List Accent 4"/>
-    <w:lsdException w:name="Light Grid Accent 4"/>
-    <w:lsdException w:name="Medium Shading 1 Accent 4"/>
-    <w:lsdException w:name="Medium Shading 2 Accent 4"/>
-    <w:lsdException w:name="Medium List 1 Accent 4"/>
-    <w:lsdException w:name="Medium List 2 Accent 4"/>
-    <w:lsdException w:name="Medium Grid 1 Accent 4"/>
-    <w:lsdException w:name="Medium Grid 2 Accent 4"/>
-    <w:lsdException w:name="Medium Grid 3 Accent 4"/>
-    <w:lsdException w:name="Dark List Accent 4"/>
-    <w:lsdException w:name="Colorful Shading Accent 4"/>
-    <w:lsdException w:name="Colorful List Accent 4"/>
-    <w:lsdException w:name="Colorful Grid Accent 4"/>
-    <w:lsdException w:name="Light Shading Accent 5"/>
-    <w:lsdException w:name="Light List Accent 5"/>
-    <w:lsdException w:name="Light Grid Accent 5"/>
-    <w:lsdException w:name="Medium Shading 1 Accent 5"/>
-    <w:lsdException w:name="Medium Shading 2 Accent 5"/>
-    <w:lsdException w:name="Medium List 1 Accent 5"/>
-    <w:lsdException w:name="Medium List 2 Accent 5"/>
-    <w:lsdException w:name="Medium Grid 1 Accent 5"/>
-    <w:lsdException w:name="Medium Grid 2 Accent 5"/>
-    <w:lsdException w:name="Medium Grid 3 Accent 5"/>
-    <w:lsdException w:name="Dark List Accent 5"/>
-    <w:lsdException w:name="Colorful Shading Accent 5"/>
-    <w:lsdException w:name="Colorful List Accent 5"/>
-    <w:lsdException w:name="Colorful Grid Accent 5"/>
-    <w:lsdException w:name="Light Shading Accent 6"/>
-    <w:lsdException w:name="Light List Accent 6"/>
-    <w:lsdException w:name="Light Grid Accent 6"/>
-    <w:lsdException w:name="Medium Shading 1 Accent 6"/>
-    <w:lsdException w:name="Medium Shading 2 Accent 6"/>
-    <w:lsdException w:name="Medium List 1 Accent 6"/>
-    <w:lsdException w:name="Medium List 2 Accent 6"/>
-    <w:lsdException w:name="Medium Grid 1 Accent 6"/>
-    <w:lsdException w:name="Medium Grid 2 Accent 6"/>
-    <w:lsdException w:name="Medium Grid 3 Accent 6"/>
-    <w:lsdException w:name="Dark List Accent 6"/>
-    <w:lsdException w:name="Colorful Shading Accent 6"/>
-    <w:lsdException w:name="Colorful List Accent 6"/>
-    <w:lsdException w:name="Colorful Grid Accent 6"/>
-    <w:lsdException w:name="Grid Table 4" w:uiPriority="49"/>
-    <w:lsdException w:name="Grid Table 5 Dark" w:uiPriority="50"/>
-    <w:lsdException w:name="Grid Table 6 Colorful" w:uiPriority="51"/>
-    <w:lsdException w:name="Grid Table 7 Colorful" w:uiPriority="52"/>
-    <w:lsdException w:name="Grid Table 1 Light Accent 1" w:uiPriority="46"/>
-    <w:lsdException w:name="Grid Table 2 Accent 1" w:uiPriority="47"/>
-    <w:lsdException w:name="Grid Table 3 Accent 1" w:uiPriority="48"/>
-    <w:lsdException w:name="Grid Table 4 Accent 1" w:uiPriority="49"/>
-    <w:lsdException w:name="Grid Table 5 Dark Accent 1" w:uiPriority="50"/>
-    <w:lsdException w:name="Grid Table 6 Colorful Accent 1" w:uiPriority="51"/>
-    <w:lsdException w:name="Grid Table 7 Colorful Accent 1" w:uiPriority="52"/>
-    <w:lsdException w:name="Grid Table 1 Light Accent 2" w:uiPriority="46"/>
-    <w:lsdException w:name="Grid Table 2 Accent 2" w:uiPriority="47"/>
-    <w:lsdException w:name="Grid Table 3 Accent 2" w:uiPriority="48"/>
-    <w:lsdException w:name="Grid Table 4 Accent 2" w:uiPriority="49"/>
-    <w:lsdException w:name="Grid Table 5 Dark Accent 2" w:uiPriority="50"/>
-    <w:lsdException w:name="Grid Table 6 Colorful Accent 2" w:uiPriority="51"/>
-    <w:lsdException w:name="Grid Table 7 Colorful Accent 2" w:uiPriority="52"/>
-    <w:lsdException w:name="Grid Table 1 Light Accent 3" w:uiPriority="46"/>
-    <w:lsdException w:name="Grid Table 2 Accent 3" w:uiPriority="47"/>
-    <w:lsdException w:name="Grid Table 3 Accent 3" w:uiPriority="48"/>
-    <w:lsdException w:name="Grid Table 4 Accent 3" w:uiPriority="49"/>
-    <w:lsdException w:name="Grid Table 5 Dark Accent 3" w:uiPriority="50"/>
-    <w:lsdException w:name="Grid Table 6 Colorful Accent 3" w:uiPriority="51"/>
-    <w:lsdException w:name="Grid Table 7 Colorful Accent 3" w:uiPriority="52"/>
-    <w:lsdException w:name="Grid Table 1 Light Accent 4" w:uiPriority="46"/>
-    <w:lsdException w:name="Grid Table 2 Accent 4" w:uiPriority="47"/>
-    <w:lsdException w:name="Grid Table 3 Accent 4" w:uiPriority="48"/>
-    <w:lsdException w:name="Grid Table 4 Accent 4" w:uiPriority="49"/>
-    <w:lsdException w:name="Grid Table 5 Dark Accent 4" w:uiPriority="50"/>
-    <w:lsdException w:name="Grid Table 6 Colorful Accent 4" w:uiPriority="51"/>
-    <w:lsdException w:name="Grid Table 7 Colorful Accent 4" w:uiPriority="52"/>
-    <w:lsdException w:name="Grid Table 1 Light Accent 5" w:uiPriority="46"/>
-    <w:lsdException w:name="Grid Table 2 Accent 5" w:uiPriority="47"/>
-    <w:lsdException w:name="Grid Table 3 Accent 5" w:uiPriority="48"/>
-    <w:lsdException w:name="Grid Table 4 Accent 5" w:uiPriority="49"/>
-    <w:lsdException w:name="Grid Table 5 Dark Accent 5" w:uiPriority="50"/>
-    <w:lsdException w:name="Grid Table 6 Colorful Accent 5" w:uiPriority="51"/>
-    <w:lsdException w:name="Grid Table 7 Colorful Accent 5" w:uiPriority="52"/>
-    <w:lsdException w:name="Grid Table 1 Light Accent 6" w:uiPriority="46"/>
-    <w:lsdException w:name="Grid Table 2 Accent 6" w:uiPriority="47"/>
-    <w:lsdException w:name="Grid Table 3 Accent 6" w:uiPriority="48"/>
-    <w:lsdException w:name="Grid Table 4 Accent 6" w:uiPriority="49"/>
-    <w:lsdException w:name="Grid Table 5 Dark Accent 6" w:uiPriority="50"/>
-    <w:lsdException w:name="Grid Table 6 Colorful Accent 6" w:uiPriority="51"/>
-    <w:lsdException w:name="Grid Table 7 Colorful Accent 6" w:uiPriority="52"/>
-    <w:lsdException w:name="List Table 1 Light" w:uiPriority="46"/>
-    <w:lsdException w:name="List Table 2" w:uiPriority="47"/>
-    <w:lsdException w:name="List Table 3" w:uiPriority="48"/>
-    <w:lsdException w:name="List Table 4" w:uiPriority="49"/>
-    <w:lsdException w:name="List Table 5 Dark" w:uiPriority="50"/>
-    <w:lsdException w:name="List Table 6 Colorful" w:uiPriority="51"/>
-    <w:lsdException w:name="List Table 7 Colorful" w:uiPriority="52"/>
-    <w:lsdException w:name="List Table 1 Light Accent 1" w:uiPriority="46"/>
-    <w:lsdException w:name="List Table 2 Accent 1" w:uiPriority="47"/>
-    <w:lsdException w:name="List Table 3 Accent 1" w:uiPriority="48"/>
-    <w:lsdException w:name="List Table 4 Accent 1" w:uiPriority="49"/>
-    <w:lsdException w:name="List Table 5 Dark Accent 1" w:uiPriority="50"/>
-    <w:lsdException w:name="List Table 6 Colorful Accent 1" w:uiPriority="51"/>
-    <w:lsdException w:name="List Table 7 Colorful Accent 1" w:uiPriority="52"/>
-    <w:lsdException w:name="List Table 1 Light Accent 2" w:uiPriority="46"/>
-    <w:lsdException w:name="List Table 2 Accent 2" w:uiPriority="47"/>
-    <w:lsdException w:name="List Table 3 Accent 2" w:uiPriority="48"/>
-    <w:lsdException w:name="List Table 4 Accent 2" w:uiPriority="49"/>
-    <w:lsdException w:name="List Table 5 Dark Accent 2" w:uiPriority="50"/>
-    <w:lsdException w:name="List Table 6 Colorful Accent 2" w:uiPriority="51"/>
-    <w:lsdException w:name="List Table 7 Colorful Accent 2" w:uiPriority="52"/>
-    <w:lsdException w:name="List Table 1 Light Accent 3" w:uiPriority="46"/>
-    <w:lsdException w:name="List Table 2 Accent 3" w:uiPriority="47"/>
-    <w:lsdException w:name="List Table 3 Accent 3" w:uiPriority="48"/>
-    <w:lsdException w:name="List Table 4 Accent 3" w:uiPriority="49"/>
-    <w:lsdException w:name="List Table 5 Dark Accent 3" w:uiPriority="50"/>
-    <w:lsdException w:name="List Table 6 Colorful Accent 3" w:uiPriority="51"/>
-    <w:lsdException w:name="List Table 7 Colorful Accent 3" w:uiPriority="52"/>
-    <w:lsdException w:name="List Table 1 Light Accent 4" w:uiPriority="46"/>
-    <w:lsdException w:name="List Table 2 Accent 4" w:uiPriority="47"/>
-    <w:lsdException w:name="List Table 3 Accent 4" w:uiPriority="48"/>
-    <w:lsdException w:name="List Table 4 Accent 4" w:uiPriority="49"/>
-    <w:lsdException w:name="List Table 5 Dark Accent 4" w:uiPriority="50"/>
-    <w:lsdException w:name="List Table 6 Colorful Accent 4" w:uiPriority="51"/>
-    <w:lsdException w:name="List Table 7 Colorful Accent 4" w:uiPriority="52"/>
-    <w:lsdException w:name="List Table 1 Light Accent 5" w:uiPriority="46"/>
-    <w:lsdException w:name="List Table 2 Accent 5" w:uiPriority="47"/>
-    <w:lsdException w:name="List Table 3 Accent 5" w:uiPriority="48"/>
-    <w:lsdException w:name="List Table 4 Accent 5" w:uiPriority="49"/>
-    <w:lsdException w:name="List Table 5 Dark Accent 5" w:uiPriority="50"/>
-    <w:lsdException w:name="List Table 6 Colorful Accent 5" w:uiPriority="51"/>
-    <w:lsdException w:name="List Table 7 Colorful Accent 5" w:uiPriority="52"/>
-    <w:lsdException w:name="List Table 1 Light Accent 6" w:uiPriority="46"/>
-    <w:lsdException w:name="List Table 2 Accent 6" w:uiPriority="47"/>
-    <w:lsdException w:name="List Table 3 Accent 6" w:uiPriority="48"/>
-    <w:lsdException w:name="List Table 4 Accent 6" w:uiPriority="49"/>
-    <w:lsdException w:name="List Table 5 Dark Accent 6" w:uiPriority="50"/>
-    <w:lsdException w:name="List Table 6 Colorful Accent 6" w:uiPriority="51"/>
-    <w:lsdException w:name="List Table 7 Colorful Accent 6" w:uiPriority="52"/>
-    <w:lsdException w:name="Mention" w:semiHidden="1" w:uiPriority="99" w:unhideWhenUsed="1"/>
-    <w:lsdException w:name="Smart Hyperlink" w:semiHidden="1" w:uiPriority="99" w:unhideWhenUsed="1"/>
-    <w:lsdException w:name="Hashtag" w:semiHidden="1" w:uiPriority="99" w:unhideWhenUsed="1"/>
-    <w:lsdException w:name="Unresolved Mention" w:semiHidden="1" w:uiPriority="99" w:unhideWhenUsed="1"/>
-    <w:lsdException w:name="Smart Link" w:semiHidden="1" w:uiPriority="99" w:unhideWhenUsed="1"/>
-  </w:latentStyles>
-  <w:style w:default="1" w:styleId="a" w:type="paragraph">
+  <w:latentStyles w:count="276" w:defLockedState="0" w:defQFormat="0" w:defSemiHidden="0" w:defUIPriority="0" w:defUnhideWhenUsed="0"/>
+  <w:style w:default="1" w:styleId="Normal" w:type="paragraph">
     <w:name w:val="Normal"/>
     <w:qFormat/>
   </w:style>
-  <w:style w:styleId="1" w:type="paragraph">
+  <w:style w:styleId="BodyText" w:type="paragraph">
+    <w:name w:val="Body Text"/>
+    <w:basedOn w:val="Normal"/>
+    <w:link w:val="BodyTextChar"/>
+    <w:qFormat/>
+    <w:pPr>
+      <w:spacing w:after="180" w:before="180"/>
+    </w:pPr>
+  </w:style>
+  <w:style w:customStyle="1" w:styleId="FirstParagraph" w:type="paragraph">
+    <w:name w:val="First Paragraph"/>
+    <w:basedOn w:val="BodyText"/>
+    <w:next w:val="BodyText"/>
+    <w:qFormat/>
+  </w:style>
+  <w:style w:customStyle="1" w:styleId="Compact" w:type="paragraph">
+    <w:name w:val="Compact"/>
+    <w:basedOn w:val="BodyText"/>
+    <w:qFormat/>
+    <w:pPr>
+      <w:spacing w:after="36" w:before="36"/>
+    </w:pPr>
+  </w:style>
+  <w:style w:styleId="Title" w:type="paragraph">
+    <w:name w:val="Title"/>
+    <w:basedOn w:val="Normal"/>
+    <w:next w:val="BodyText"/>
+    <w:link w:val="TitleChar"/>
+    <w:uiPriority w:val="10"/>
+    <w:qFormat/>
+    <w:rsid w:val="00A10FD9"/>
+    <w:pPr>
+      <w:spacing w:after="80" w:line="240" w:lineRule="auto"/>
+      <w:contextualSpacing/>
+      <w:jc w:val="center"/>
+    </w:pPr>
+    <w:rPr>
+      <w:rFonts w:asciiTheme="majorHAnsi" w:cstheme="majorBidi" w:eastAsiaTheme="majorEastAsia" w:hAnsiTheme="majorHAnsi"/>
+      <w:sz w:val="56"/>
+      <w:szCs w:val="56"/>
+    </w:rPr>
+  </w:style>
+  <w:style w:customStyle="1" w:styleId="TitleChar" w:type="character">
+    <w:name w:val="Title Char"/>
+    <w:basedOn w:val="DefaultParagraphFont"/>
+    <w:link w:val="Title"/>
+    <w:uiPriority w:val="10"/>
+    <w:rsid w:val="00A10FD9"/>
+    <w:rPr>
+      <w:rFonts w:asciiTheme="majorHAnsi" w:cstheme="majorBidi" w:eastAsiaTheme="majorEastAsia" w:hAnsiTheme="majorHAnsi"/>
+      <w:sz w:val="56"/>
+      <w:szCs w:val="56"/>
+    </w:rPr>
+  </w:style>
+  <w:style w:styleId="Subtitle" w:type="paragraph">
+    <w:name w:val="Subtitle"/>
+    <w:basedOn w:val="Title"/>
+    <w:next w:val="BodyText"/>
+    <w:link w:val="SubtitleChar"/>
+    <w:uiPriority w:val="11"/>
+    <w:qFormat/>
+    <w:rsid w:val="00A10FD9"/>
+    <w:pPr>
+      <w:numPr>
+        <w:ilvl w:val="1"/>
+      </w:numPr>
+    </w:pPr>
+    <w:rPr>
+      <w:rFonts w:cstheme="majorBidi" w:eastAsiaTheme="majorEastAsia"/>
+      <w:spacing w:val="15"/>
+      <w:sz w:val="28"/>
+      <w:szCs w:val="28"/>
+    </w:rPr>
+  </w:style>
+  <w:style w:customStyle="1" w:styleId="SubtitleChar" w:type="character">
+    <w:name w:val="Subtitle Char"/>
+    <w:basedOn w:val="DefaultParagraphFont"/>
+    <w:link w:val="Subtitle"/>
+    <w:uiPriority w:val="11"/>
+    <w:rsid w:val="00A10FD9"/>
+    <w:rPr>
+      <w:rFonts w:cstheme="majorBidi" w:eastAsiaTheme="majorEastAsia"/>
+      <w:color w:themeColor="text1" w:themeTint="A6" w:val="595959"/>
+      <w:spacing w:val="15"/>
+      <w:sz w:val="28"/>
+      <w:szCs w:val="28"/>
+    </w:rPr>
+  </w:style>
+  <w:style w:customStyle="1" w:styleId="Author" w:type="paragraph">
+    <w:name w:val="Author"/>
+    <w:basedOn w:val="Title"/>
+    <w:next w:val="BodyText"/>
+    <w:qFormat/>
+    <w:pPr>
+      <w:keepNext/>
+      <w:keepLines/>
+    </w:pPr>
+    <w:rPr>
+      <w:sz w:val="24"/>
+      <w:szCs w:val="24"/>
+    </w:rPr>
+  </w:style>
+  <w:style w:styleId="Date" w:type="paragraph">
+    <w:name w:val="Date"/>
+    <w:basedOn w:val="Title"/>
+    <w:next w:val="BodyText"/>
+    <w:qFormat/>
+    <w:pPr>
+      <w:keepNext/>
+      <w:keepLines/>
+    </w:pPr>
+    <w:rPr>
+      <w:sz w:val="24"/>
+      <w:szCs w:val="24"/>
+    </w:rPr>
+  </w:style>
+  <w:style w:customStyle="1" w:styleId="AbstractTitle" w:type="paragraph">
+    <w:name w:val="Abstract Title"/>
+    <w:basedOn w:val="Normal"/>
+    <w:next w:val="Abstract"/>
+    <w:qFormat/>
+    <w:pPr>
+      <w:keepNext/>
+      <w:keepLines/>
+      <w:spacing w:after="0" w:before="300"/>
+      <w:jc w:val="center"/>
+    </w:pPr>
+    <w:rPr>
+      <w:b/>
+      <w:sz w:val="20"/>
+      <w:szCs w:val="20"/>
+    </w:rPr>
+  </w:style>
+  <w:style w:customStyle="1" w:styleId="Abstract" w:type="paragraph">
+    <w:name w:val="Abstract"/>
+    <w:basedOn w:val="Normal"/>
+    <w:next w:val="BodyText"/>
+    <w:qFormat/>
+    <w:pPr>
+      <w:keepNext/>
+      <w:keepLines/>
+      <w:spacing w:after="300" w:before="100"/>
+    </w:pPr>
+    <w:rPr>
+      <w:sz w:val="20"/>
+      <w:szCs w:val="20"/>
+    </w:rPr>
+  </w:style>
+  <w:style w:styleId="Bibliography" w:type="paragraph">
+    <w:name w:val="Bibliography"/>
+    <w:basedOn w:val="Normal"/>
+    <w:next w:val="Bibliography"/>
+    <w:qFormat/>
+    <w:pPr/>
+    <w:rPr/>
+  </w:style>
+  <w:style w:styleId="Heading1" w:type="paragraph">
     <w:name w:val="heading 1"/>
-    <w:basedOn w:val="a"/>
-    <w:next w:val="a0"/>
-    <w:link w:val="10"/>
+    <w:basedOn w:val="Normal"/>
+    <w:next w:val="BodyText"/>
+    <w:link w:val="Heading1Char"/>
     <w:uiPriority w:val="9"/>
     <w:qFormat/>
     <w:rsid w:val="00A10FD9"/>
@@ -6632,11 +6365,11 @@
       <w:szCs w:val="40"/>
     </w:rPr>
   </w:style>
-  <w:style w:styleId="2" w:type="paragraph">
+  <w:style w:styleId="Heading2" w:type="paragraph">
     <w:name w:val="heading 2"/>
-    <w:basedOn w:val="a"/>
-    <w:next w:val="a0"/>
-    <w:link w:val="20"/>
+    <w:basedOn w:val="Normal"/>
+    <w:next w:val="BodyText"/>
+    <w:link w:val="Heading2Char"/>
     <w:uiPriority w:val="9"/>
     <w:semiHidden/>
     <w:unhideWhenUsed/>
@@ -6655,11 +6388,11 @@
       <w:szCs w:val="32"/>
     </w:rPr>
   </w:style>
-  <w:style w:styleId="3" w:type="paragraph">
+  <w:style w:styleId="Heading3" w:type="paragraph">
     <w:name w:val="heading 3"/>
-    <w:basedOn w:val="a"/>
-    <w:next w:val="a0"/>
-    <w:link w:val="30"/>
+    <w:basedOn w:val="Normal"/>
+    <w:next w:val="BodyText"/>
+    <w:link w:val="Heading3Char"/>
     <w:uiPriority w:val="9"/>
     <w:semiHidden/>
     <w:unhideWhenUsed/>
@@ -6678,11 +6411,11 @@
       <w:szCs w:val="28"/>
     </w:rPr>
   </w:style>
-  <w:style w:styleId="4" w:type="paragraph">
+  <w:style w:styleId="Heading4" w:type="paragraph">
     <w:name w:val="heading 4"/>
-    <w:basedOn w:val="a"/>
-    <w:next w:val="a0"/>
-    <w:link w:val="40"/>
+    <w:basedOn w:val="Normal"/>
+    <w:next w:val="BodyText"/>
+    <w:link w:val="Heading4Char"/>
     <w:uiPriority w:val="9"/>
     <w:semiHidden/>
     <w:unhideWhenUsed/>
@@ -6701,11 +6434,11 @@
       <w:color w:themeColor="accent1" w:themeShade="BF" w:val="0F4761"/>
     </w:rPr>
   </w:style>
-  <w:style w:styleId="5" w:type="paragraph">
+  <w:style w:styleId="Heading5" w:type="paragraph">
     <w:name w:val="heading 5"/>
-    <w:basedOn w:val="a"/>
-    <w:next w:val="a0"/>
-    <w:link w:val="50"/>
+    <w:basedOn w:val="Normal"/>
+    <w:next w:val="BodyText"/>
+    <w:link w:val="Heading5Char"/>
     <w:uiPriority w:val="9"/>
     <w:semiHidden/>
     <w:unhideWhenUsed/>
@@ -6722,11 +6455,11 @@
       <w:color w:themeColor="accent1" w:themeShade="BF" w:val="0F4761"/>
     </w:rPr>
   </w:style>
-  <w:style w:styleId="6" w:type="paragraph">
+  <w:style w:styleId="Heading6" w:type="paragraph">
     <w:name w:val="heading 6"/>
-    <w:basedOn w:val="a"/>
-    <w:next w:val="a0"/>
-    <w:link w:val="60"/>
+    <w:basedOn w:val="Normal"/>
+    <w:next w:val="BodyText"/>
+    <w:link w:val="Heading6Char"/>
     <w:uiPriority w:val="9"/>
     <w:semiHidden/>
     <w:unhideWhenUsed/>
@@ -6745,11 +6478,11 @@
       <w:color w:themeColor="text1" w:themeTint="A6" w:val="595959"/>
     </w:rPr>
   </w:style>
-  <w:style w:styleId="7" w:type="paragraph">
+  <w:style w:styleId="Heading7" w:type="paragraph">
     <w:name w:val="heading 7"/>
-    <w:basedOn w:val="a"/>
-    <w:next w:val="a0"/>
-    <w:link w:val="70"/>
+    <w:basedOn w:val="Normal"/>
+    <w:next w:val="BodyText"/>
+    <w:link w:val="Heading7Char"/>
     <w:uiPriority w:val="9"/>
     <w:semiHidden/>
     <w:unhideWhenUsed/>
@@ -6766,11 +6499,11 @@
       <w:color w:themeColor="text1" w:themeTint="A6" w:val="595959"/>
     </w:rPr>
   </w:style>
-  <w:style w:styleId="8" w:type="paragraph">
+  <w:style w:styleId="Heading8" w:type="paragraph">
     <w:name w:val="heading 8"/>
-    <w:basedOn w:val="a"/>
-    <w:next w:val="a0"/>
-    <w:link w:val="80"/>
+    <w:basedOn w:val="Normal"/>
+    <w:next w:val="BodyText"/>
+    <w:link w:val="Heading8Char"/>
     <w:uiPriority w:val="9"/>
     <w:semiHidden/>
     <w:unhideWhenUsed/>
@@ -6789,11 +6522,11 @@
       <w:color w:themeColor="text1" w:themeTint="D8" w:val="272727"/>
     </w:rPr>
   </w:style>
-  <w:style w:styleId="9" w:type="paragraph">
+  <w:style w:styleId="Heading9" w:type="paragraph">
     <w:name w:val="heading 9"/>
-    <w:basedOn w:val="a"/>
-    <w:next w:val="a0"/>
-    <w:link w:val="90"/>
+    <w:basedOn w:val="Normal"/>
+    <w:next w:val="BodyText"/>
+    <w:link w:val="Heading9Char"/>
     <w:uiPriority w:val="9"/>
     <w:semiHidden/>
     <w:unhideWhenUsed/>
@@ -6810,188 +6543,10 @@
       <w:color w:themeColor="text1" w:themeTint="D8" w:val="272727"/>
     </w:rPr>
   </w:style>
-  <w:style w:default="1" w:styleId="a1" w:type="character">
-    <w:name w:val="Default Paragraph Font"/>
-    <w:uiPriority w:val="1"/>
-    <w:semiHidden/>
-    <w:unhideWhenUsed/>
-  </w:style>
-  <w:style w:default="1" w:styleId="a2" w:type="table">
-    <w:name w:val="Normal Table"/>
-    <w:uiPriority w:val="99"/>
-    <w:semiHidden/>
-    <w:unhideWhenUsed/>
-    <w:tblPr>
-      <w:tblInd w:type="dxa" w:w="0"/>
-      <w:tblCellMar>
-        <w:top w:type="dxa" w:w="0"/>
-        <w:left w:type="dxa" w:w="108"/>
-        <w:bottom w:type="dxa" w:w="0"/>
-        <w:right w:type="dxa" w:w="108"/>
-      </w:tblCellMar>
-    </w:tblPr>
-  </w:style>
-  <w:style w:default="1" w:styleId="a3" w:type="numbering">
-    <w:name w:val="No List"/>
-    <w:uiPriority w:val="99"/>
-    <w:semiHidden/>
-    <w:unhideWhenUsed/>
-  </w:style>
-  <w:style w:styleId="a0" w:type="paragraph">
-    <w:name w:val="Body Text"/>
-    <w:basedOn w:val="a"/>
-    <w:qFormat/>
-    <w:pPr>
-      <w:spacing w:after="180" w:before="180"/>
-    </w:pPr>
-  </w:style>
-  <w:style w:customStyle="1" w:styleId="FirstParagraph" w:type="paragraph">
-    <w:name w:val="First Paragraph"/>
-    <w:basedOn w:val="a0"/>
-    <w:next w:val="a0"/>
-    <w:qFormat/>
-  </w:style>
-  <w:style w:customStyle="1" w:styleId="Compact" w:type="paragraph">
-    <w:name w:val="Compact"/>
-    <w:basedOn w:val="a0"/>
-    <w:qFormat/>
-    <w:pPr>
-      <w:spacing w:after="36" w:before="36"/>
-    </w:pPr>
-  </w:style>
-  <w:style w:styleId="a4" w:type="paragraph">
-    <w:name w:val="Title"/>
-    <w:basedOn w:val="a"/>
-    <w:next w:val="a0"/>
-    <w:link w:val="a5"/>
-    <w:uiPriority w:val="10"/>
-    <w:qFormat/>
-    <w:rsid w:val="00A10FD9"/>
-    <w:pPr>
-      <w:spacing w:after="80"/>
-      <w:contextualSpacing/>
-      <w:jc w:val="center"/>
-    </w:pPr>
-    <w:rPr>
-      <w:rFonts w:asciiTheme="majorHAnsi" w:cstheme="majorBidi" w:eastAsiaTheme="majorEastAsia" w:hAnsiTheme="majorHAnsi"/>
-      <w:sz w:val="56"/>
-      <w:szCs w:val="56"/>
-    </w:rPr>
-  </w:style>
-  <w:style w:customStyle="1" w:styleId="a5" w:type="character">
-    <w:name w:val="Заголовок Знак"/>
-    <w:basedOn w:val="a1"/>
-    <w:link w:val="a4"/>
-    <w:uiPriority w:val="10"/>
-    <w:rsid w:val="00A10FD9"/>
-    <w:rPr>
-      <w:rFonts w:asciiTheme="majorHAnsi" w:cstheme="majorBidi" w:eastAsiaTheme="majorEastAsia" w:hAnsiTheme="majorHAnsi"/>
-      <w:sz w:val="56"/>
-      <w:szCs w:val="56"/>
-    </w:rPr>
-  </w:style>
-  <w:style w:styleId="a6" w:type="paragraph">
-    <w:name w:val="Subtitle"/>
-    <w:basedOn w:val="a4"/>
-    <w:next w:val="a0"/>
-    <w:link w:val="a7"/>
-    <w:uiPriority w:val="11"/>
-    <w:qFormat/>
-    <w:rsid w:val="00A10FD9"/>
-    <w:pPr>
-      <w:numPr>
-        <w:ilvl w:val="1"/>
-      </w:numPr>
-    </w:pPr>
-    <w:rPr>
-      <w:spacing w:val="15"/>
-      <w:sz w:val="28"/>
-      <w:szCs w:val="28"/>
-    </w:rPr>
-  </w:style>
-  <w:style w:customStyle="1" w:styleId="a7" w:type="character">
-    <w:name w:val="Подзаголовок Знак"/>
-    <w:basedOn w:val="a1"/>
-    <w:link w:val="a6"/>
-    <w:uiPriority w:val="11"/>
-    <w:rsid w:val="00A10FD9"/>
-    <w:rPr>
-      <w:rFonts w:cstheme="majorBidi" w:eastAsiaTheme="majorEastAsia"/>
-      <w:color w:themeColor="text1" w:themeTint="A6" w:val="595959"/>
-      <w:spacing w:val="15"/>
-      <w:sz w:val="28"/>
-      <w:szCs w:val="28"/>
-    </w:rPr>
-  </w:style>
-  <w:style w:customStyle="1" w:styleId="Author" w:type="paragraph">
-    <w:name w:val="Author"/>
-    <w:basedOn w:val="a4"/>
-    <w:next w:val="a0"/>
-    <w:qFormat/>
-    <w:pPr>
-      <w:keepNext/>
-      <w:keepLines/>
-    </w:pPr>
-    <w:rPr>
-      <w:sz w:val="24"/>
-      <w:szCs w:val="24"/>
-    </w:rPr>
-  </w:style>
-  <w:style w:styleId="a8" w:type="paragraph">
-    <w:name w:val="Date"/>
-    <w:basedOn w:val="a4"/>
-    <w:next w:val="a0"/>
-    <w:qFormat/>
-    <w:pPr>
-      <w:keepNext/>
-      <w:keepLines/>
-    </w:pPr>
-    <w:rPr>
-      <w:sz w:val="24"/>
-      <w:szCs w:val="24"/>
-    </w:rPr>
-  </w:style>
-  <w:style w:customStyle="1" w:styleId="AbstractTitle" w:type="paragraph">
-    <w:name w:val="Abstract Title"/>
-    <w:basedOn w:val="a"/>
-    <w:next w:val="Abstract"/>
-    <w:qFormat/>
-    <w:pPr>
-      <w:keepNext/>
-      <w:keepLines/>
-      <w:spacing w:after="0" w:before="300"/>
-      <w:jc w:val="center"/>
-    </w:pPr>
-    <w:rPr>
-      <w:b/>
-      <w:sz w:val="20"/>
-      <w:szCs w:val="20"/>
-    </w:rPr>
-  </w:style>
-  <w:style w:customStyle="1" w:styleId="Abstract" w:type="paragraph">
-    <w:name w:val="Abstract"/>
-    <w:basedOn w:val="a"/>
-    <w:next w:val="a0"/>
-    <w:qFormat/>
-    <w:pPr>
-      <w:keepNext/>
-      <w:keepLines/>
-      <w:spacing w:after="300" w:before="100"/>
-    </w:pPr>
-    <w:rPr>
-      <w:sz w:val="20"/>
-      <w:szCs w:val="20"/>
-    </w:rPr>
-  </w:style>
-  <w:style w:styleId="a9" w:type="paragraph">
-    <w:name w:val="Bibliography"/>
-    <w:basedOn w:val="a"/>
-    <w:qFormat/>
-  </w:style>
-  <w:style w:customStyle="1" w:styleId="10" w:type="character">
-    <w:name w:val="Заголовок 1 Знак"/>
-    <w:basedOn w:val="a1"/>
-    <w:link w:val="1"/>
+  <w:style w:customStyle="1" w:styleId="Heading1Char" w:type="character">
+    <w:name w:val="Heading 1 Char"/>
+    <w:basedOn w:val="DefaultParagraphFont"/>
+    <w:link w:val="Heading1"/>
     <w:uiPriority w:val="9"/>
     <w:rsid w:val="00A10FD9"/>
     <w:rPr>
@@ -7001,10 +6556,10 @@
       <w:szCs w:val="40"/>
     </w:rPr>
   </w:style>
-  <w:style w:customStyle="1" w:styleId="20" w:type="character">
-    <w:name w:val="Заголовок 2 Знак"/>
-    <w:basedOn w:val="a1"/>
-    <w:link w:val="2"/>
+  <w:style w:customStyle="1" w:styleId="Heading2Char" w:type="character">
+    <w:name w:val="Heading 2 Char"/>
+    <w:basedOn w:val="DefaultParagraphFont"/>
+    <w:link w:val="Heading2"/>
     <w:uiPriority w:val="9"/>
     <w:semiHidden/>
     <w:rsid w:val="00A10FD9"/>
@@ -7015,10 +6570,10 @@
       <w:szCs w:val="32"/>
     </w:rPr>
   </w:style>
-  <w:style w:customStyle="1" w:styleId="30" w:type="character">
-    <w:name w:val="Заголовок 3 Знак"/>
-    <w:basedOn w:val="a1"/>
-    <w:link w:val="3"/>
+  <w:style w:customStyle="1" w:styleId="Heading3Char" w:type="character">
+    <w:name w:val="Heading 3 Char"/>
+    <w:basedOn w:val="DefaultParagraphFont"/>
+    <w:link w:val="Heading3"/>
     <w:uiPriority w:val="9"/>
     <w:semiHidden/>
     <w:rsid w:val="00A10FD9"/>
@@ -7029,10 +6584,10 @@
       <w:szCs w:val="28"/>
     </w:rPr>
   </w:style>
-  <w:style w:customStyle="1" w:styleId="40" w:type="character">
-    <w:name w:val="Заголовок 4 Знак"/>
-    <w:basedOn w:val="a1"/>
-    <w:link w:val="4"/>
+  <w:style w:customStyle="1" w:styleId="Heading4Char" w:type="character">
+    <w:name w:val="Heading 4 Char"/>
+    <w:basedOn w:val="DefaultParagraphFont"/>
+    <w:link w:val="Heading4"/>
     <w:uiPriority w:val="9"/>
     <w:semiHidden/>
     <w:rsid w:val="00A10FD9"/>
@@ -7043,10 +6598,10 @@
       <w:color w:themeColor="accent1" w:themeShade="BF" w:val="0F4761"/>
     </w:rPr>
   </w:style>
-  <w:style w:customStyle="1" w:styleId="50" w:type="character">
-    <w:name w:val="Заголовок 5 Знак"/>
-    <w:basedOn w:val="a1"/>
-    <w:link w:val="5"/>
+  <w:style w:customStyle="1" w:styleId="Heading5Char" w:type="character">
+    <w:name w:val="Heading 5 Char"/>
+    <w:basedOn w:val="DefaultParagraphFont"/>
+    <w:link w:val="Heading5"/>
     <w:uiPriority w:val="9"/>
     <w:semiHidden/>
     <w:rsid w:val="00A10FD9"/>
@@ -7055,10 +6610,10 @@
       <w:color w:themeColor="accent1" w:themeShade="BF" w:val="0F4761"/>
     </w:rPr>
   </w:style>
-  <w:style w:customStyle="1" w:styleId="60" w:type="character">
-    <w:name w:val="Заголовок 6 Знак"/>
-    <w:basedOn w:val="a1"/>
-    <w:link w:val="6"/>
+  <w:style w:customStyle="1" w:styleId="Heading6Char" w:type="character">
+    <w:name w:val="Heading 6 Char"/>
+    <w:basedOn w:val="DefaultParagraphFont"/>
+    <w:link w:val="Heading6"/>
     <w:uiPriority w:val="9"/>
     <w:semiHidden/>
     <w:rsid w:val="00A10FD9"/>
@@ -7069,10 +6624,10 @@
       <w:color w:themeColor="text1" w:themeTint="A6" w:val="595959"/>
     </w:rPr>
   </w:style>
-  <w:style w:customStyle="1" w:styleId="70" w:type="character">
-    <w:name w:val="Заголовок 7 Знак"/>
-    <w:basedOn w:val="a1"/>
-    <w:link w:val="7"/>
+  <w:style w:customStyle="1" w:styleId="Heading7Char" w:type="character">
+    <w:name w:val="Heading 7 Char"/>
+    <w:basedOn w:val="DefaultParagraphFont"/>
+    <w:link w:val="Heading7"/>
     <w:uiPriority w:val="9"/>
     <w:semiHidden/>
     <w:rsid w:val="00A10FD9"/>
@@ -7081,10 +6636,10 @@
       <w:color w:themeColor="text1" w:themeTint="A6" w:val="595959"/>
     </w:rPr>
   </w:style>
-  <w:style w:customStyle="1" w:styleId="80" w:type="character">
-    <w:name w:val="Заголовок 8 Знак"/>
-    <w:basedOn w:val="a1"/>
-    <w:link w:val="8"/>
+  <w:style w:customStyle="1" w:styleId="Heading8Char" w:type="character">
+    <w:name w:val="Heading 8 Char"/>
+    <w:basedOn w:val="DefaultParagraphFont"/>
+    <w:link w:val="Heading8"/>
     <w:uiPriority w:val="9"/>
     <w:semiHidden/>
     <w:rsid w:val="00A10FD9"/>
@@ -7095,10 +6650,10 @@
       <w:color w:themeColor="text1" w:themeTint="D8" w:val="272727"/>
     </w:rPr>
   </w:style>
-  <w:style w:customStyle="1" w:styleId="90" w:type="character">
-    <w:name w:val="Заголовок 9 Знак"/>
-    <w:basedOn w:val="a1"/>
-    <w:link w:val="9"/>
+  <w:style w:customStyle="1" w:styleId="Heading9Char" w:type="character">
+    <w:name w:val="Heading 9 Char"/>
+    <w:basedOn w:val="DefaultParagraphFont"/>
+    <w:link w:val="Heading9"/>
     <w:uiPriority w:val="9"/>
     <w:semiHidden/>
     <w:rsid w:val="00A10FD9"/>
@@ -7107,39 +6662,46 @@
       <w:color w:themeColor="text1" w:themeTint="D8" w:val="272727"/>
     </w:rPr>
   </w:style>
-  <w:style w:styleId="aa" w:type="paragraph">
+  <w:style w:styleId="BlockText" w:type="paragraph">
     <w:name w:val="Block Text"/>
-    <w:basedOn w:val="a0"/>
-    <w:next w:val="a0"/>
+    <w:basedOn w:val="BodyText"/>
+    <w:next w:val="BodyText"/>
     <w:uiPriority w:val="9"/>
     <w:unhideWhenUsed/>
     <w:qFormat/>
     <w:pPr>
       <w:spacing w:after="100" w:before="100"/>
-      <w:ind w:left="480" w:right="480"/>
+      <w:ind w:firstLine="0" w:left="480" w:right="480"/>
     </w:pPr>
   </w:style>
-  <w:style w:styleId="ab" w:type="paragraph">
-    <w:name w:val="footnote text"/>
-    <w:basedOn w:val="a"/>
+  <w:style w:styleId="FootnoteText" w:type="paragraph">
+    <w:name w:val="Footnote Text"/>
+    <w:basedOn w:val="Normal"/>
+    <w:next w:val="FootnoteText"/>
     <w:uiPriority w:val="9"/>
     <w:unhideWhenUsed/>
     <w:qFormat/>
   </w:style>
-  <w:style w:customStyle="1" w:styleId="FootnoteBlockText" w:type="paragraph">
+  <w:style w:styleId="FootnoteBlockText" w:type="paragraph">
     <w:name w:val="Footnote Block Text"/>
-    <w:basedOn w:val="ab"/>
-    <w:next w:val="ab"/>
+    <w:basedOn w:val="FootnoteText"/>
+    <w:next w:val="FootnoteText"/>
     <w:uiPriority w:val="9"/>
     <w:unhideWhenUsed/>
     <w:qFormat/>
     <w:pPr>
       <w:spacing w:after="100" w:before="100"/>
-      <w:ind w:left="480" w:right="480"/>
+      <w:ind w:firstLine="0" w:left="480" w:right="480"/>
     </w:pPr>
   </w:style>
-  <w:style w:customStyle="1" w:styleId="Table" w:type="table">
+  <w:style w:default="1" w:styleId="DefaultParagraphFont" w:type="character">
+    <w:name w:val="Default Paragraph Font"/>
+    <w:semiHidden/>
+    <w:unhideWhenUsed/>
+  </w:style>
+  <w:style w:default="1" w:styleId="Table" w:type="table">
     <w:name w:val="Table"/>
+    <w:basedOn w:val="TableNormal"/>
     <w:semiHidden/>
     <w:unhideWhenUsed/>
     <w:qFormat/>
@@ -7155,13 +6717,14 @@
     <w:tblStylePr w:type="firstRow">
       <w:tblPr>
         <w:jc w:val="left"/>
+        <w:tblInd w:type="dxa" w:w="0"/>
       </w:tblPr>
       <w:trPr>
         <w:jc w:val="left"/>
       </w:trPr>
       <w:tcPr>
         <w:tcBorders>
-          <w:bottom w:color="auto" w:space="0" w:sz="0" w:val="single"/>
+          <w:bottom w:val="single"/>
         </w:tcBorders>
         <w:vAlign w:val="bottom"/>
       </w:tcPr>
@@ -7169,7 +6732,7 @@
   </w:style>
   <w:style w:customStyle="1" w:styleId="DefinitionTerm" w:type="paragraph">
     <w:name w:val="Definition Term"/>
-    <w:basedOn w:val="a"/>
+    <w:basedOn w:val="Normal"/>
     <w:next w:val="Definition"/>
     <w:pPr>
       <w:keepNext/>
@@ -7182,14 +6745,14 @@
   </w:style>
   <w:style w:customStyle="1" w:styleId="Definition" w:type="paragraph">
     <w:name w:val="Definition"/>
-    <w:basedOn w:val="a"/>
-  </w:style>
-  <w:style w:styleId="ac" w:type="paragraph">
-    <w:name w:val="caption"/>
-    <w:basedOn w:val="a"/>
-    <w:link w:val="ad"/>
+    <w:basedOn w:val="Normal"/>
+  </w:style>
+  <w:style w:styleId="Caption" w:type="paragraph">
+    <w:name w:val="Caption"/>
+    <w:basedOn w:val="Normal"/>
+    <w:link w:val="BodyTextChar"/>
     <w:pPr>
-      <w:spacing w:after="120"/>
+      <w:spacing w:after="120" w:before="0"/>
     </w:pPr>
     <w:rPr>
       <w:i/>
@@ -7197,18 +6760,18 @@
   </w:style>
   <w:style w:customStyle="1" w:styleId="TableCaption" w:type="paragraph">
     <w:name w:val="Table Caption"/>
-    <w:basedOn w:val="ac"/>
+    <w:basedOn w:val="Caption"/>
     <w:pPr>
       <w:keepNext/>
     </w:pPr>
   </w:style>
   <w:style w:customStyle="1" w:styleId="ImageCaption" w:type="paragraph">
     <w:name w:val="Image Caption"/>
-    <w:basedOn w:val="ac"/>
+    <w:basedOn w:val="Caption"/>
   </w:style>
   <w:style w:customStyle="1" w:styleId="Figure" w:type="paragraph">
     <w:name w:val="Figure"/>
-    <w:basedOn w:val="a"/>
+    <w:basedOn w:val="Normal"/>
   </w:style>
   <w:style w:customStyle="1" w:styleId="CaptionedFigure" w:type="paragraph">
     <w:name w:val="Captioned Figure"/>
@@ -7217,15 +6780,14 @@
       <w:keepNext/>
     </w:pPr>
   </w:style>
-  <w:style w:customStyle="1" w:styleId="ad" w:type="character">
-    <w:name w:val="Название объекта Знак"/>
-    <w:basedOn w:val="a1"/>
-    <w:link w:val="ac"/>
+  <w:style w:customStyle="1" w:styleId="BodyTextChar" w:type="character">
+    <w:name w:val="Body Text Char"/>
+    <w:basedOn w:val="DefaultParagraphFont"/>
+    <w:link w:val="BodyText"/>
   </w:style>
   <w:style w:customStyle="1" w:styleId="VerbatimChar" w:type="character">
     <w:name w:val="Verbatim Char"/>
-    <w:basedOn w:val="ad"/>
-    <w:link w:val="SourceCode"/>
+    <w:basedOn w:val="BodyTextChar"/>
     <w:rPr>
       <w:rFonts w:ascii="Consolas" w:hAnsi="Consolas"/>
       <w:sz w:val="22"/>
@@ -7233,27 +6795,26 @@
   </w:style>
   <w:style w:customStyle="1" w:styleId="SectionNumber" w:type="character">
     <w:name w:val="Section Number"/>
-    <w:basedOn w:val="ad"/>
-  </w:style>
-  <w:style w:styleId="ae" w:type="character">
-    <w:name w:val="footnote reference"/>
-    <w:basedOn w:val="ad"/>
+    <w:basedOn w:val="BodyTextChar"/>
+  </w:style>
+  <w:style w:styleId="FootnoteReference" w:type="character">
+    <w:name w:val="Footnote Reference"/>
+    <w:basedOn w:val="BodyTextChar"/>
     <w:rPr>
       <w:vertAlign w:val="superscript"/>
     </w:rPr>
   </w:style>
-  <w:style w:styleId="af" w:type="character">
+  <w:style w:styleId="Hyperlink" w:type="character">
     <w:name w:val="Hyperlink"/>
-    <w:basedOn w:val="ad"/>
-    <w:uiPriority w:val="99"/>
+    <w:basedOn w:val="BodyTextChar"/>
     <w:rPr>
-      <w:color w:themeColor="accent1" w:val="156082"/>
+      <w:color w:themeColor="accent1" w:val="4F81BD"/>
     </w:rPr>
   </w:style>
-  <w:style w:styleId="af0" w:type="paragraph">
+  <w:style w:styleId="TOCHeading" w:type="paragraph">
     <w:name w:val="TOC Heading"/>
-    <w:basedOn w:val="1"/>
-    <w:next w:val="a0"/>
+    <w:basedOn w:val="Heading1"/>
+    <w:next w:val="BodyText"/>
     <w:uiPriority w:val="39"/>
     <w:unhideWhenUsed/>
     <w:qFormat/>
@@ -7261,340 +6822,246 @@
       <w:spacing w:before="240" w:line="259" w:lineRule="auto"/>
       <w:outlineLvl w:val="9"/>
     </w:pPr>
-  </w:style>
-  <w:style w:customStyle="1" w:styleId="SourceCode" w:type="paragraph">
+    <w:rPr>
+      <w:rFonts w:asciiTheme="majorHAnsi" w:cstheme="majorBidi" w:eastAsiaTheme="majorEastAsia" w:hAnsiTheme="majorHAnsi"/>
+      <w:b w:val="0"/>
+      <w:bCs w:val="0"/>
+      <w:color w:themeColor="accent1" w:themeShade="BF" w:val="365F91"/>
+    </w:rPr>
+  </w:style>
+  <w:style w:type="paragraph" w:customStyle="1" w:styleId="SourceCode">
     <w:name w:val="Source Code"/>
-    <w:basedOn w:val="a"/>
+    <w:basedOn w:val="Normal"/>
     <w:link w:val="VerbatimChar"/>
     <w:pPr>
-      <w:wordWrap w:val="0"/>
+      <w:wordWrap w:val="off"/>
     </w:pPr>
   </w:style>
-  <w:style w:customStyle="1" w:styleId="KeywordTok" w:type="character">
+  <w:style w:type="character" w:customStyle="1" w:styleId="KeywordTok">
     <w:name w:val="KeywordTok"/>
     <w:basedOn w:val="VerbatimChar"/>
     <w:rPr>
-      <w:rFonts w:ascii="Consolas" w:hAnsi="Consolas"/>
       <w:b/>
       <w:color w:val="007020"/>
-      <w:sz w:val="22"/>
     </w:rPr>
   </w:style>
-  <w:style w:customStyle="1" w:styleId="DataTypeTok" w:type="character">
+  <w:style w:type="character" w:customStyle="1" w:styleId="DataTypeTok">
     <w:name w:val="DataTypeTok"/>
     <w:basedOn w:val="VerbatimChar"/>
     <w:rPr>
-      <w:rFonts w:ascii="Consolas" w:hAnsi="Consolas"/>
       <w:color w:val="902000"/>
-      <w:sz w:val="22"/>
     </w:rPr>
   </w:style>
-  <w:style w:customStyle="1" w:styleId="DecValTok" w:type="character">
+  <w:style w:type="character" w:customStyle="1" w:styleId="DecValTok">
     <w:name w:val="DecValTok"/>
     <w:basedOn w:val="VerbatimChar"/>
     <w:rPr>
-      <w:rFonts w:ascii="Consolas" w:hAnsi="Consolas"/>
-      <w:color w:val="40A070"/>
-      <w:sz w:val="22"/>
+      <w:color w:val="40a070"/>
     </w:rPr>
   </w:style>
-  <w:style w:customStyle="1" w:styleId="BaseNTok" w:type="character">
+  <w:style w:type="character" w:customStyle="1" w:styleId="BaseNTok">
     <w:name w:val="BaseNTok"/>
     <w:basedOn w:val="VerbatimChar"/>
     <w:rPr>
-      <w:rFonts w:ascii="Consolas" w:hAnsi="Consolas"/>
-      <w:color w:val="40A070"/>
-      <w:sz w:val="22"/>
+      <w:color w:val="40a070"/>
     </w:rPr>
   </w:style>
-  <w:style w:customStyle="1" w:styleId="FloatTok" w:type="character">
+  <w:style w:type="character" w:customStyle="1" w:styleId="FloatTok">
     <w:name w:val="FloatTok"/>
     <w:basedOn w:val="VerbatimChar"/>
     <w:rPr>
-      <w:rFonts w:ascii="Consolas" w:hAnsi="Consolas"/>
-      <w:color w:val="40A070"/>
-      <w:sz w:val="22"/>
+      <w:color w:val="40a070"/>
     </w:rPr>
   </w:style>
-  <w:style w:customStyle="1" w:styleId="ConstantTok" w:type="character">
+  <w:style w:type="character" w:customStyle="1" w:styleId="ConstantTok">
     <w:name w:val="ConstantTok"/>
     <w:basedOn w:val="VerbatimChar"/>
     <w:rPr>
-      <w:rFonts w:ascii="Consolas" w:hAnsi="Consolas"/>
       <w:color w:val="880000"/>
-      <w:sz w:val="22"/>
     </w:rPr>
   </w:style>
-  <w:style w:customStyle="1" w:styleId="CharTok" w:type="character">
+  <w:style w:type="character" w:customStyle="1" w:styleId="CharTok">
     <w:name w:val="CharTok"/>
     <w:basedOn w:val="VerbatimChar"/>
     <w:rPr>
-      <w:rFonts w:ascii="Consolas" w:hAnsi="Consolas"/>
-      <w:color w:val="4070A0"/>
-      <w:sz w:val="22"/>
+      <w:color w:val="4070a0"/>
     </w:rPr>
   </w:style>
-  <w:style w:customStyle="1" w:styleId="SpecialCharTok" w:type="character">
+  <w:style w:type="character" w:customStyle="1" w:styleId="SpecialCharTok">
     <w:name w:val="SpecialCharTok"/>
     <w:basedOn w:val="VerbatimChar"/>
     <w:rPr>
-      <w:rFonts w:ascii="Consolas" w:hAnsi="Consolas"/>
-      <w:color w:val="4070A0"/>
-      <w:sz w:val="22"/>
+      <w:color w:val="4070a0"/>
     </w:rPr>
   </w:style>
-  <w:style w:customStyle="1" w:styleId="StringTok" w:type="character">
+  <w:style w:type="character" w:customStyle="1" w:styleId="StringTok">
     <w:name w:val="StringTok"/>
     <w:basedOn w:val="VerbatimChar"/>
     <w:rPr>
-      <w:rFonts w:ascii="Consolas" w:hAnsi="Consolas"/>
-      <w:color w:val="4070A0"/>
-      <w:sz w:val="22"/>
+      <w:color w:val="4070a0"/>
     </w:rPr>
   </w:style>
-  <w:style w:customStyle="1" w:styleId="VerbatimStringTok" w:type="character">
+  <w:style w:type="character" w:customStyle="1" w:styleId="VerbatimStringTok">
     <w:name w:val="VerbatimStringTok"/>
     <w:basedOn w:val="VerbatimChar"/>
     <w:rPr>
-      <w:rFonts w:ascii="Consolas" w:hAnsi="Consolas"/>
-      <w:color w:val="4070A0"/>
-      <w:sz w:val="22"/>
+      <w:color w:val="4070a0"/>
     </w:rPr>
   </w:style>
-  <w:style w:customStyle="1" w:styleId="SpecialStringTok" w:type="character">
+  <w:style w:type="character" w:customStyle="1" w:styleId="SpecialStringTok">
     <w:name w:val="SpecialStringTok"/>
     <w:basedOn w:val="VerbatimChar"/>
     <w:rPr>
-      <w:rFonts w:ascii="Consolas" w:hAnsi="Consolas"/>
-      <w:color w:val="BB6688"/>
-      <w:sz w:val="22"/>
+      <w:color w:val="bb6688"/>
     </w:rPr>
   </w:style>
-  <w:style w:customStyle="1" w:styleId="ImportTok" w:type="character">
+  <w:style w:type="character" w:customStyle="1" w:styleId="ImportTok">
     <w:name w:val="ImportTok"/>
     <w:basedOn w:val="VerbatimChar"/>
     <w:rPr>
-      <w:rFonts w:ascii="Consolas" w:hAnsi="Consolas"/>
       <w:b/>
       <w:color w:val="008000"/>
-      <w:sz w:val="22"/>
     </w:rPr>
   </w:style>
-  <w:style w:customStyle="1" w:styleId="CommentTok" w:type="character">
+  <w:style w:type="character" w:customStyle="1" w:styleId="CommentTok">
     <w:name w:val="CommentTok"/>
     <w:basedOn w:val="VerbatimChar"/>
     <w:rPr>
-      <w:rFonts w:ascii="Consolas" w:hAnsi="Consolas"/>
       <w:i/>
-      <w:color w:val="60A0B0"/>
-      <w:sz w:val="22"/>
+      <w:color w:val="60a0b0"/>
     </w:rPr>
   </w:style>
-  <w:style w:customStyle="1" w:styleId="DocumentationTok" w:type="character">
+  <w:style w:type="character" w:customStyle="1" w:styleId="DocumentationTok">
     <w:name w:val="DocumentationTok"/>
     <w:basedOn w:val="VerbatimChar"/>
     <w:rPr>
-      <w:rFonts w:ascii="Consolas" w:hAnsi="Consolas"/>
       <w:i/>
-      <w:color w:val="BA2121"/>
-      <w:sz w:val="22"/>
+      <w:color w:val="ba2121"/>
     </w:rPr>
   </w:style>
-  <w:style w:customStyle="1" w:styleId="AnnotationTok" w:type="character">
+  <w:style w:type="character" w:customStyle="1" w:styleId="AnnotationTok">
     <w:name w:val="AnnotationTok"/>
     <w:basedOn w:val="VerbatimChar"/>
     <w:rPr>
-      <w:rFonts w:ascii="Consolas" w:hAnsi="Consolas"/>
       <w:b/>
       <w:i/>
-      <w:color w:val="60A0B0"/>
-      <w:sz w:val="22"/>
+      <w:color w:val="60a0b0"/>
     </w:rPr>
   </w:style>
-  <w:style w:customStyle="1" w:styleId="CommentVarTok" w:type="character">
+  <w:style w:type="character" w:customStyle="1" w:styleId="CommentVarTok">
     <w:name w:val="CommentVarTok"/>
     <w:basedOn w:val="VerbatimChar"/>
     <w:rPr>
-      <w:rFonts w:ascii="Consolas" w:hAnsi="Consolas"/>
       <w:b/>
       <w:i/>
-      <w:color w:val="60A0B0"/>
-      <w:sz w:val="22"/>
+      <w:color w:val="60a0b0"/>
     </w:rPr>
   </w:style>
-  <w:style w:customStyle="1" w:styleId="OtherTok" w:type="character">
+  <w:style w:type="character" w:customStyle="1" w:styleId="OtherTok">
     <w:name w:val="OtherTok"/>
     <w:basedOn w:val="VerbatimChar"/>
     <w:rPr>
-      <w:rFonts w:ascii="Consolas" w:hAnsi="Consolas"/>
       <w:color w:val="007020"/>
-      <w:sz w:val="22"/>
     </w:rPr>
   </w:style>
-  <w:style w:customStyle="1" w:styleId="FunctionTok" w:type="character">
+  <w:style w:type="character" w:customStyle="1" w:styleId="FunctionTok">
     <w:name w:val="FunctionTok"/>
     <w:basedOn w:val="VerbatimChar"/>
     <w:rPr>
-      <w:rFonts w:ascii="Consolas" w:hAnsi="Consolas"/>
-      <w:color w:val="06287E"/>
-      <w:sz w:val="22"/>
+      <w:color w:val="06287e"/>
     </w:rPr>
   </w:style>
-  <w:style w:customStyle="1" w:styleId="VariableTok" w:type="character">
+  <w:style w:type="character" w:customStyle="1" w:styleId="VariableTok">
     <w:name w:val="VariableTok"/>
     <w:basedOn w:val="VerbatimChar"/>
     <w:rPr>
-      <w:rFonts w:ascii="Consolas" w:hAnsi="Consolas"/>
-      <w:color w:val="19177C"/>
-      <w:sz w:val="22"/>
+      <w:color w:val="19177c"/>
     </w:rPr>
   </w:style>
-  <w:style w:customStyle="1" w:styleId="ControlFlowTok" w:type="character">
+  <w:style w:type="character" w:customStyle="1" w:styleId="ControlFlowTok">
     <w:name w:val="ControlFlowTok"/>
     <w:basedOn w:val="VerbatimChar"/>
     <w:rPr>
-      <w:rFonts w:ascii="Consolas" w:hAnsi="Consolas"/>
       <w:b/>
       <w:color w:val="007020"/>
-      <w:sz w:val="22"/>
     </w:rPr>
   </w:style>
-  <w:style w:customStyle="1" w:styleId="OperatorTok" w:type="character">
+  <w:style w:type="character" w:customStyle="1" w:styleId="OperatorTok">
     <w:name w:val="OperatorTok"/>
     <w:basedOn w:val="VerbatimChar"/>
     <w:rPr>
-      <w:rFonts w:ascii="Consolas" w:hAnsi="Consolas"/>
       <w:color w:val="666666"/>
-      <w:sz w:val="22"/>
     </w:rPr>
   </w:style>
-  <w:style w:customStyle="1" w:styleId="BuiltInTok" w:type="character">
+  <w:style w:type="character" w:customStyle="1" w:styleId="BuiltInTok">
     <w:name w:val="BuiltInTok"/>
     <w:basedOn w:val="VerbatimChar"/>
     <w:rPr>
-      <w:rFonts w:ascii="Consolas" w:hAnsi="Consolas"/>
       <w:color w:val="008000"/>
-      <w:sz w:val="22"/>
     </w:rPr>
   </w:style>
-  <w:style w:customStyle="1" w:styleId="ExtensionTok" w:type="character">
+  <w:style w:type="character" w:customStyle="1" w:styleId="ExtensionTok">
     <w:name w:val="ExtensionTok"/>
     <w:basedOn w:val="VerbatimChar"/>
-    <w:rPr>
-      <w:rFonts w:ascii="Consolas" w:hAnsi="Consolas"/>
-      <w:sz w:val="22"/>
-    </w:rPr>
-  </w:style>
-  <w:style w:customStyle="1" w:styleId="PreprocessorTok" w:type="character">
+    <w:rPr/>
+  </w:style>
+  <w:style w:type="character" w:customStyle="1" w:styleId="PreprocessorTok">
     <w:name w:val="PreprocessorTok"/>
     <w:basedOn w:val="VerbatimChar"/>
     <w:rPr>
-      <w:rFonts w:ascii="Consolas" w:hAnsi="Consolas"/>
-      <w:color w:val="BC7A00"/>
-      <w:sz w:val="22"/>
+      <w:color w:val="bc7a00"/>
     </w:rPr>
   </w:style>
-  <w:style w:customStyle="1" w:styleId="AttributeTok" w:type="character">
+  <w:style w:type="character" w:customStyle="1" w:styleId="AttributeTok">
     <w:name w:val="AttributeTok"/>
     <w:basedOn w:val="VerbatimChar"/>
     <w:rPr>
-      <w:rFonts w:ascii="Consolas" w:hAnsi="Consolas"/>
-      <w:color w:val="7D9029"/>
-      <w:sz w:val="22"/>
+      <w:color w:val="7d9029"/>
     </w:rPr>
   </w:style>
-  <w:style w:customStyle="1" w:styleId="RegionMarkerTok" w:type="character">
+  <w:style w:type="character" w:customStyle="1" w:styleId="RegionMarkerTok">
     <w:name w:val="RegionMarkerTok"/>
     <w:basedOn w:val="VerbatimChar"/>
-    <w:rPr>
-      <w:rFonts w:ascii="Consolas" w:hAnsi="Consolas"/>
-      <w:sz w:val="22"/>
-    </w:rPr>
-  </w:style>
-  <w:style w:customStyle="1" w:styleId="InformationTok" w:type="character">
+    <w:rPr/>
+  </w:style>
+  <w:style w:type="character" w:customStyle="1" w:styleId="InformationTok">
     <w:name w:val="InformationTok"/>
     <w:basedOn w:val="VerbatimChar"/>
     <w:rPr>
-      <w:rFonts w:ascii="Consolas" w:hAnsi="Consolas"/>
       <w:b/>
       <w:i/>
-      <w:color w:val="60A0B0"/>
-      <w:sz w:val="22"/>
+      <w:color w:val="60a0b0"/>
     </w:rPr>
   </w:style>
-  <w:style w:customStyle="1" w:styleId="WarningTok" w:type="character">
+  <w:style w:type="character" w:customStyle="1" w:styleId="WarningTok">
     <w:name w:val="WarningTok"/>
     <w:basedOn w:val="VerbatimChar"/>
     <w:rPr>
-      <w:rFonts w:ascii="Consolas" w:hAnsi="Consolas"/>
       <w:b/>
       <w:i/>
-      <w:color w:val="60A0B0"/>
-      <w:sz w:val="22"/>
+      <w:color w:val="60a0b0"/>
     </w:rPr>
   </w:style>
-  <w:style w:customStyle="1" w:styleId="AlertTok" w:type="character">
+  <w:style w:type="character" w:customStyle="1" w:styleId="AlertTok">
     <w:name w:val="AlertTok"/>
     <w:basedOn w:val="VerbatimChar"/>
     <w:rPr>
-      <w:rFonts w:ascii="Consolas" w:hAnsi="Consolas"/>
       <w:b/>
-      <w:color w:val="FF0000"/>
-      <w:sz w:val="22"/>
+      <w:color w:val="ff0000"/>
     </w:rPr>
   </w:style>
-  <w:style w:customStyle="1" w:styleId="ErrorTok" w:type="character">
+  <w:style w:type="character" w:customStyle="1" w:styleId="ErrorTok">
     <w:name w:val="ErrorTok"/>
     <w:basedOn w:val="VerbatimChar"/>
     <w:rPr>
-      <w:rFonts w:ascii="Consolas" w:hAnsi="Consolas"/>
       <w:b/>
-      <w:color w:val="FF0000"/>
-      <w:sz w:val="22"/>
+      <w:color w:val="ff0000"/>
     </w:rPr>
   </w:style>
-  <w:style w:customStyle="1" w:styleId="NormalTok" w:type="character">
+  <w:style w:type="character" w:customStyle="1" w:styleId="NormalTok">
     <w:name w:val="NormalTok"/>
     <w:basedOn w:val="VerbatimChar"/>
-    <w:rPr>
-      <w:rFonts w:ascii="Consolas" w:hAnsi="Consolas"/>
-      <w:sz w:val="22"/>
-    </w:rPr>
-  </w:style>
-  <w:style w:styleId="11" w:type="paragraph">
-    <w:name w:val="toc 1"/>
-    <w:basedOn w:val="a"/>
-    <w:next w:val="a"/>
-    <w:autoRedefine/>
-    <w:uiPriority w:val="39"/>
-    <w:rsid w:val="0066756B"/>
-    <w:pPr>
-      <w:spacing w:after="100"/>
-    </w:pPr>
-  </w:style>
-  <w:style w:styleId="21" w:type="paragraph">
-    <w:name w:val="toc 2"/>
-    <w:basedOn w:val="a"/>
-    <w:next w:val="a"/>
-    <w:autoRedefine/>
-    <w:uiPriority w:val="39"/>
-    <w:rsid w:val="0066756B"/>
-    <w:pPr>
-      <w:spacing w:after="100"/>
-      <w:ind w:left="240"/>
-    </w:pPr>
-  </w:style>
-  <w:style w:styleId="31" w:type="paragraph">
-    <w:name w:val="toc 3"/>
-    <w:basedOn w:val="a"/>
-    <w:next w:val="a"/>
-    <w:autoRedefine/>
-    <w:uiPriority w:val="39"/>
-    <w:rsid w:val="0066756B"/>
-    <w:pPr>
-      <w:spacing w:after="100"/>
-      <w:ind w:left="480"/>
-    </w:pPr>
+    <w:rPr/>
   </w:style>
 </w:styles>
 </file>

</xml_diff>

<commit_message>
docs: rebuild final course paper docx
</commit_message>
<xml_diff>
--- a/outputs/course_paper_hse_final.docx
+++ b/outputs/course_paper_hse_final.docx
@@ -2,40 +2,6 @@
 <file path=word/document.xml><?xml version="1.0" encoding="utf-8"?>
 <w:document xmlns:w="http://schemas.openxmlformats.org/wordprocessingml/2006/main" xmlns:m="http://schemas.openxmlformats.org/officeDocument/2006/math" xmlns:r="http://schemas.openxmlformats.org/officeDocument/2006/relationships" xmlns:o="urn:schemas-microsoft-com:office:office" xmlns:v="urn:schemas-microsoft-com:vml" xmlns:w10="urn:schemas-microsoft-com:office:word" xmlns:a="http://schemas.openxmlformats.org/drawingml/2006/main" xmlns:pic="http://schemas.openxmlformats.org/drawingml/2006/picture" xmlns:wp="http://schemas.openxmlformats.org/drawingml/2006/wordprocessingDrawing">
   <w:body>
-    <w:p>
-      <w:pPr>
-        <w:pStyle w:val="Title"/>
-      </w:pPr>
-      <w:r>
-        <w:t xml:space="preserve">OCR post-correction for low-resource Arabic-script Turkic historical texts</w:t>
-      </w:r>
-    </w:p>
-    <w:sdt>
-      <w:sdtPr>
-        <w:docPartObj>
-          <w:docPartGallery w:val="Table of Contents"/>
-          <w:docPartUnique/>
-        </w:docPartObj>
-      </w:sdtPr>
-      <w:sdtContent>
-        <w:p>
-          <w:pPr>
-            <w:pStyle w:val="TOCHeading"/>
-          </w:pPr>
-          <w:r>
-            <w:t xml:space="preserve">Table of Contents</w:t>
-          </w:r>
-        </w:p>
-        <w:p>
-          <w:r>
-            <w:fldChar w:fldCharType="begin" w:dirty="true"/>
-            <w:instrText xml:space="preserve">TOC \o "1-3" \h \z \u</w:instrText>
-            <w:fldChar w:fldCharType="separate"/>
-            <w:fldChar w:fldCharType="end"/>
-          </w:r>
-        </w:p>
-      </w:sdtContent>
-    </w:sdt>
     <w:p>
       <w:pPr>
         <w:pStyle w:val="FirstParagraph"/>
@@ -256,31 +222,43 @@
         <w:pStyle w:val="FirstParagraph"/>
       </w:pPr>
       <w:r>
-        <w:t xml:space="preserve">В работе рассматривается задача автоматической обработки исторических тюркских текстов, записанных арабской графикой. Такие материалы представляют значительную историко-культурную и лингвистическую ценность, однако их машинная обработка затруднена из-за особенностей старой орфографии, вариативности написания, низкого качества источников, ограниченного количества размеченных данных и слабой представленности подобных корпусов в современных OCR- и NLP-ресурсах.</w:t>
-      </w:r>
-    </w:p>
-    <w:p>
-      <w:pPr>
-        <w:pStyle w:val="BodyText"/>
-      </w:pPr>
-      <w:r>
-        <w:t xml:space="preserve">В качестве пилотного этапа разработан воспроизводимый пайплайн для посткоррекции OCR-подобных ошибок в арабографичном тюркском тексте. Корпус построен на основе османско-тюркского текста в арабской графике. На его основе сформирован синтетический набор данных: чистые строки искажаются контролируемым генератором OCR-подобного шума, после чего строятся train/valid/test-разбиения без утечки исходных строк между выборками.</w:t>
-      </w:r>
-    </w:p>
-    <w:p>
-      <w:pPr>
-        <w:pStyle w:val="BodyText"/>
-      </w:pPr>
-      <w:r>
-        <w:t xml:space="preserve">В экспериментальной части сравниваются identity baseline, простой rule-based normalizer, train-derived character-confusion baseline и нейросетевая модель ByT5-small. Итоговая модель ByT5-small с длиной последовательности 512 показывает лучший результат среди рассмотренных методов на данном синтетическом benchmark. При этом улучшение по CER остаётся умеренным, а заметное снижение WER требует осторожной интерпретации, поскольку synthetic noise включает ошибки пробелов и границ слов. Дополнительно проведён анализ ошибок на уровне отдельных тестовых примеров, показывающий, что модель улучшает большинство строк, но не является равномерно безопасной и требует дальнейшей валидации.</w:t>
-      </w:r>
-    </w:p>
-    <w:p>
-      <w:pPr>
-        <w:pStyle w:val="BodyText"/>
-      </w:pPr>
-      <w:r>
-        <w:t xml:space="preserve">Работа рассматривается как пилотный этап для дальнейшего расширения корпуса и построения более полного бенчмарка для исторических тюркских текстов в арабской графике. Отдельная проверка на реальном OCR-выводе Tesseract для османско-турецкого печатного источника показала заметный разрыв между синтетическим шумом и настоящими OCR-ошибками: модель, обученная на synthetic noise, немного снижает WER, но ухудшает CER на полном page-level наборе. Поэтому главный практический вывод работы состоит не в готовности модели к автоматическому применению, а в необходимости real-domain adaptation: выравнивания реальных OCR/reference-фрагментов, обучения на настоящих ошибках и консервативной фильтрации предсказаний.</w:t>
+        <w:t xml:space="preserve">Работа посвящена посткоррекции OCR-ошибок в исторических тюркских текстах, записанных арабской графикой. В отличие от полной OCR/HTR-задачи, здесь рассматривается более узкий этап: уже полученный текстовый вывод нужно приблизить к проверенному clean reference. Такая постановка выбрана как пилотный шаг для будущей обработки старотатарских, старобашкирских и других арабографичных тюркских источников, где часто не хватает готовых размеченных корпусов и устойчивых OCR-инструментов.</w:t>
+      </w:r>
+    </w:p>
+    <w:p>
+      <w:pPr>
+        <w:pStyle w:val="BodyText"/>
+      </w:pPr>
+      <w:r>
+        <w:t xml:space="preserve">В эксперименте построен воспроизводимый benchmark</w:t>
+      </w:r>
+      <w:r>
+        <w:t xml:space="preserve"> </w:t>
+      </w:r>
+      <w:r>
+        <w:rPr>
+          <w:rStyle w:val="VerbatimChar"/>
+        </w:rPr>
+        <w:t xml:space="preserve">noisy text → clean text</w:t>
+      </w:r>
+      <w:r>
+        <w:t xml:space="preserve">. Исходный корпус основан на османско-тюркском тексте в арабской графике; этот материал используется как связанный арабографичный тюркский test case, а не как старотатарский или старобашкирский датасет. На основе clean строк генерируются OCR-подобные искажения, после чего сравниваются identity baseline, rule-based normalizer, train-derived character-confusion baseline и ByT5-small.</w:t>
+      </w:r>
+    </w:p>
+    <w:p>
+      <w:pPr>
+        <w:pStyle w:val="BodyText"/>
+      </w:pPr>
+      <w:r>
+        <w:t xml:space="preserve">На синтетическом benchmark ByT5-small с длиной последовательности 512 показывает лучший результат среди рассмотренных методов. При этом улучшение требует осторожной интерпретации: снижение WER заметнее, чем снижение CER, а часть выигрыша связана с исправлением пробелов и границ слов. Отдельный анализ худших примеров показывает, что модель иногда не исправляет строку, а порождает лишние фрагменты, поэтому её нельзя считать безопасным автоматическим корректором без фильтрации.</w:t>
+      </w:r>
+    </w:p>
+    <w:p>
+      <w:pPr>
+        <w:pStyle w:val="BodyText"/>
+      </w:pPr>
+      <w:r>
+        <w:t xml:space="preserve">Для проверки переноса был собран page-level real-OCR benchmark на османско-турецком печатном источнике, распознанном Tesseract. Этот эксперимент изменил основной вывод: модель, обученная только на synthetic noise, немного снижает WER, но ухудшает CER и NoSpaceCER относительно raw Tesseract. Следовательно, главный результат работы состоит не в готовой OCR-системе, а в воспроизводимом baseline и фиксации synthetic-to-real gap. Для практического применения необходимы выровненные OCR/reference chunks, обучение на настоящих OCR-ошибках и консервативная проверка предсказаний.</w:t>
       </w:r>
     </w:p>
     <w:bookmarkStart w:id="10" w:name="введение"/>
@@ -297,31 +275,70 @@
         <w:pStyle w:val="FirstParagraph"/>
       </w:pPr>
       <w:r>
-        <w:t xml:space="preserve">Исторические тексты на арабографичной тюркской письменности представляют собой важный источник для изучения истории, культуры, религии, права, быта и интеллектуальной традиции тюркских народов. К таким материалам могут относиться османские, татарские, башкирские, крымскотатарские и другие тюркские тексты, записанные арабской графикой до перехода соответствующих письменных традиций на латиницу или кириллицу.</w:t>
-      </w:r>
-    </w:p>
-    <w:p>
-      <w:pPr>
-        <w:pStyle w:val="BodyText"/>
-      </w:pPr>
-      <w:r>
-        <w:t xml:space="preserve">Несмотря на историческую значимость таких источников, их автоматическая обработка остаётся сложной задачей. Современные инструменты оптического распознавания текста и обработки естественного языка обычно лучше развиты для массовых современных языков и стандартных письменностей. Для исторических арабографичных тюркских материалов ситуация иная: доступных размеченных корпусов мало, орфография нестабильна, качество сканов и печатных источников может быть неоднородным, а готовые модели часто не учитывают специфику старой письменной традиции.</w:t>
-      </w:r>
-    </w:p>
-    <w:p>
-      <w:pPr>
-        <w:pStyle w:val="BodyText"/>
-      </w:pPr>
-      <w:r>
-        <w:t xml:space="preserve">В результате исследователь, работающий с такими документами, сталкивается не только с задачей распознавания символов, но и с более широкой проблемой восстановления и нормализации текста. Даже если OCR-система выдаёт частично читаемый результат, в нём остаются ошибки: пропуски, замены похожих букв, неправильные пробелы, смешение графем и искажение слов. Такие ошибки затрудняют дальнейший поиск, индексирование, извлечение сущностей и историко-лингвистический анализ.</w:t>
-      </w:r>
-    </w:p>
-    <w:p>
-      <w:pPr>
-        <w:pStyle w:val="BodyText"/>
-      </w:pPr>
-      <w:r>
-        <w:t xml:space="preserve">В данной работе рассматривается один из первых технических шагов в этом направлении — посткоррекция OCR-подобных ошибок для исторического тюркского текста в арабской графике. Вместо попытки сразу построить полную систему распознавания и анализа документов работа фокусируется на воспроизводимом пилотном пайплайне: сбор небольшого корпуса, генерация контролируемых OCR-подобных искажений, обучение модели исправления текста и анализ качества результата.</w:t>
+        <w:t xml:space="preserve">Исторические тюркские тексты в арабской графике важны для изучения истории, культуры, религии, права, повседневности и интеллектуальной традиции тюркских народов. К таким материалам относятся османские, татарские, башкирские, крымскотатарские и другие источники, созданные до перехода соответствующих письменных традиций на латиницу или кириллицу.</w:t>
+      </w:r>
+    </w:p>
+    <w:p>
+      <w:pPr>
+        <w:pStyle w:val="BodyText"/>
+      </w:pPr>
+      <w:r>
+        <w:t xml:space="preserve">С точки зрения автоматической обработки это неудобный материал. Он находится между несколькими зонами сложности: историческая орфография отличается от современной нормы, арабская графика плохо переносится на стандартные OCR-сценарии, а размеченных корпусов значительно меньше, чем для современных массовых языков. Даже когда скан доступен, исследователь часто получает не готовый текстовый корпус, а изображение или OCR-вывод с большим числом ошибок.</w:t>
+      </w:r>
+    </w:p>
+    <w:p>
+      <w:pPr>
+        <w:pStyle w:val="BodyText"/>
+      </w:pPr>
+      <w:r>
+        <w:t xml:space="preserve">В работе не ставится задача сразу решить всю проблему распознавания исторических документов. Полный pipeline должен включать поиск источника, обработку изображения, разметку строк, OCR/HTR, посткоррекцию, проверку текста и дальнейший анализ. Здесь выбран один более узкий слой — post-correction уже полученного текстового вывода. Такой слой удобен для пилотного исследования: можно явно задать вход</w:t>
+      </w:r>
+      <w:r>
+        <w:t xml:space="preserve"> </w:t>
+      </w:r>
+      <w:r>
+        <w:rPr>
+          <w:rStyle w:val="VerbatimChar"/>
+        </w:rPr>
+        <w:t xml:space="preserve">noisy/OCR</w:t>
+      </w:r>
+      <w:r>
+        <w:t xml:space="preserve">, эталон</w:t>
+      </w:r>
+      <w:r>
+        <w:t xml:space="preserve"> </w:t>
+      </w:r>
+      <w:r>
+        <w:rPr>
+          <w:rStyle w:val="VerbatimChar"/>
+        </w:rPr>
+        <w:t xml:space="preserve">clean</w:t>
+      </w:r>
+      <w:r>
+        <w:t xml:space="preserve">, метрики качества и сравнимые baseline-подходы.</w:t>
+      </w:r>
+    </w:p>
+    <w:p>
+      <w:pPr>
+        <w:pStyle w:val="BodyText"/>
+      </w:pPr>
+      <w:r>
+        <w:t xml:space="preserve">Работа также проверяет важное ограничение synthetic-подхода. Если реальных пар</w:t>
+      </w:r>
+      <w:r>
+        <w:t xml:space="preserve"> </w:t>
+      </w:r>
+      <w:r>
+        <w:rPr>
+          <w:rStyle w:val="VerbatimChar"/>
+        </w:rPr>
+        <w:t xml:space="preserve">OCR output → clean reference</w:t>
+      </w:r>
+      <w:r>
+        <w:t xml:space="preserve"> </w:t>
+      </w:r>
+      <w:r>
+        <w:t xml:space="preserve">мало, естественно начать с синтетического шума. Но синтетический benchmark сам по себе не доказывает, что модель будет работать на настоящем OCR. Поэтому в работе есть два уровня оценки: controlled synthetic benchmark и отдельная page-level real-OCR проверка на османско-турецком печатном источнике.</w:t>
       </w:r>
     </w:p>
     <w:bookmarkEnd w:id="10"/>
@@ -339,39 +356,23 @@
         <w:pStyle w:val="FirstParagraph"/>
       </w:pPr>
       <w:r>
-        <w:t xml:space="preserve">Актуальность темы определяется несколькими обстоятельствами.</w:t>
-      </w:r>
-    </w:p>
-    <w:p>
-      <w:pPr>
-        <w:pStyle w:val="BodyText"/>
-      </w:pPr>
-      <w:r>
-        <w:t xml:space="preserve">Во-первых, исторические тюркские тексты в арабской графике остаются недостаточно представленными в цифровых корпусах и инструментах автоматической обработки. Это ограничивает возможности поиска, анализа и повторного использования источников в исторических, филологических и культурологических исследованиях.</w:t>
-      </w:r>
-    </w:p>
-    <w:p>
-      <w:pPr>
-        <w:pStyle w:val="BodyText"/>
-      </w:pPr>
-      <w:r>
-        <w:t xml:space="preserve">Во-вторых, низкоресурсный характер задачи делает прямое применение стандартных OCR- и NLP-подходов недостаточным. Модели, хорошо работающие на современных языках и стандартных корпусах, могут давать нестабильные результаты на исторических текстах с вариативной орфографией и нетипичными графическими формами.</w:t>
-      </w:r>
-    </w:p>
-    <w:p>
-      <w:pPr>
-        <w:pStyle w:val="BodyText"/>
-      </w:pPr>
-      <w:r>
-        <w:t xml:space="preserve">В-третьих, посткоррекция OCR-ошибок является практически важным промежуточным этапом. Даже небольшое улучшение качества распознанного текста может повысить пригодность корпуса для поиска, разметки, извлечения именованных сущностей и последующего анализа.</w:t>
-      </w:r>
-    </w:p>
-    <w:p>
-      <w:pPr>
-        <w:pStyle w:val="BodyText"/>
-      </w:pPr>
-      <w:r>
-        <w:t xml:space="preserve">В-четвёртых, создание воспроизводимого пилотного бенчмарка важно не только для конкретной курсовой работы, но и для дальнейшего дипломного и публикационного проекта. Такой benchmark позволяет формализовать задачу, фиксировать метрики и постепенно расширять экспериментальную базу.</w:t>
+        <w:t xml:space="preserve">Актуальность работы связана не только с самой задачей OCR, но и с тем, что без машинно-читаемого текста исторические источники плохо включаются в современные исследовательские pipeline. По ним сложнее искать, строить корпуса, извлекать имена и топонимы, сопоставлять записи и проверять историко-лингвистические гипотезы.</w:t>
+      </w:r>
+    </w:p>
+    <w:p>
+      <w:pPr>
+        <w:pStyle w:val="BodyText"/>
+      </w:pPr>
+      <w:r>
+        <w:t xml:space="preserve">Для арабографичных тюркских материалов эта проблема особенно заметна. Во-первых, такие тексты слабо представлены в готовых OCR- и NLP-ресурсах. Во-вторых, стандартные модели, обученные на современных языках и более регулярной орфографии, не обязательно справляются с историческим письмом. В-третьих, даже частично распознанный текст часто требует отдельного слоя исправления: похожие графемы, пропуски, лишние символы и ошибки пробелов мешают downstream анализу.</w:t>
+      </w:r>
+    </w:p>
+    <w:p>
+      <w:pPr>
+        <w:pStyle w:val="BodyText"/>
+      </w:pPr>
+      <w:r>
+        <w:t xml:space="preserve">Отдельная причина актуальности — нехватка воспроизводимых benchmark. Для низкоресурсного исторического материала недостаточно просто показать один удачный пример исправления. Нужно фиксировать источник данных, процедуру генерации или получения OCR, train/test split, метрики и худшие случаи. Именно поэтому в работе акцент сделан на воспроизводимом pipeline, а не только на итоговом числе CER или WER.</w:t>
       </w:r>
     </w:p>
     <w:bookmarkEnd w:id="11"/>
@@ -389,15 +390,71 @@
         <w:pStyle w:val="FirstParagraph"/>
       </w:pPr>
       <w:r>
-        <w:t xml:space="preserve">Основная проблема состоит в том, что для исторических тюркских текстов, записанных арабской графикой, отсутствует достаточно развитая и воспроизводимая инфраструктура для автоматической посткоррекции OCR-ошибок.</w:t>
-      </w:r>
-    </w:p>
-    <w:p>
-      <w:pPr>
-        <w:pStyle w:val="BodyText"/>
-      </w:pPr>
-      <w:r>
-        <w:t xml:space="preserve">Эта проблема включает несколько частных трудностей:</w:t>
+        <w:t xml:space="preserve">Основная проблема состоит в том, что для исторических тюркских текстов в арабской графике пока не хватает небольших, но воспроизводимых экспериментальных контуров для проверки OCR post-correction. Без такого контура трудно понять, что именно улучшает модель: реальные ошибки распознавания, синтетический шум, пробелы, локальные замены графем или только отдельные удачные примеры.</w:t>
+      </w:r>
+    </w:p>
+    <w:p>
+      <w:pPr>
+        <w:pStyle w:val="BodyText"/>
+      </w:pPr>
+      <w:r>
+        <w:t xml:space="preserve">В этой работе проблема сужается до проверяемой пилотной постановки. Нужно построить пары</w:t>
+      </w:r>
+      <w:r>
+        <w:t xml:space="preserve"> </w:t>
+      </w:r>
+      <w:r>
+        <w:rPr>
+          <w:rStyle w:val="VerbatimChar"/>
+        </w:rPr>
+        <w:t xml:space="preserve">noisy/OCR → clean</w:t>
+      </w:r>
+      <w:r>
+        <w:t xml:space="preserve">, обучить и сравнить несколько методов посткоррекции, а затем проверить, переносится ли результат с synthetic benchmark на page-level real-OCR benchmark. Важное ограничение формулируется заранее: османско-турецкий real-OCR источник используется как связанный арабографичный тюркский test case, но не подаётся как старотатарский или старобашкирский датасет.</w:t>
+      </w:r>
+    </w:p>
+    <w:p>
+      <w:pPr>
+        <w:pStyle w:val="BodyText"/>
+      </w:pPr>
+      <w:r>
+        <w:t xml:space="preserve">Такое сужение делает работу технически контролируемой. Оно позволяет отдельно проверить baselines, ByT5-small, CER/WER/NoSpaceCER, влияние длины последовательности и различие между synthetic и real OCR. При этом оно не снимает более крупную задачу: для практической системы всё равно понадобятся реальные OCR/reference chunks, ручная валидация и расширение корпуса на целевые татарские и башкирские источники.</w:t>
+      </w:r>
+    </w:p>
+    <w:bookmarkEnd w:id="12"/>
+    <w:bookmarkStart w:id="13" w:name="цель-работы"/>
+    <w:p>
+      <w:pPr>
+        <w:pStyle w:val="Heading2"/>
+      </w:pPr>
+      <w:r>
+        <w:t xml:space="preserve">1.3 Цель работы</w:t>
+      </w:r>
+    </w:p>
+    <w:p>
+      <w:pPr>
+        <w:pStyle w:val="FirstParagraph"/>
+      </w:pPr>
+      <w:r>
+        <w:t xml:space="preserve">Цель работы — разработать и оценить пилотный пайплайн на основе методов искусственного интеллекта для посткоррекции OCR-подобных ошибок в исторических тюркских текстах, записанных арабской графикой.</w:t>
+      </w:r>
+    </w:p>
+    <w:bookmarkEnd w:id="13"/>
+    <w:bookmarkStart w:id="14" w:name="задачи-работы"/>
+    <w:p>
+      <w:pPr>
+        <w:pStyle w:val="Heading2"/>
+      </w:pPr>
+      <w:r>
+        <w:t xml:space="preserve">1.4 Задачи работы</w:t>
+      </w:r>
+    </w:p>
+    <w:p>
+      <w:pPr>
+        <w:pStyle w:val="FirstParagraph"/>
+      </w:pPr>
+      <w:r>
+        <w:t xml:space="preserve">Для достижения цели необходимо решить следующие задачи:</w:t>
       </w:r>
     </w:p>
     <w:p>
@@ -409,7 +466,7 @@
         </w:numPr>
       </w:pPr>
       <w:r>
-        <w:t xml:space="preserve">ограниченность доступных размеченных данных;</w:t>
+        <w:t xml:space="preserve">Описать проблему автоматической обработки исторических арабографичных тюркских текстов.</w:t>
       </w:r>
     </w:p>
     <w:p>
@@ -421,7 +478,7 @@
         </w:numPr>
       </w:pPr>
       <w:r>
-        <w:t xml:space="preserve">вариативность исторической орфографии;</w:t>
+        <w:t xml:space="preserve">Подобрать и собрать небольшой корпус тюркского текста в арабской графике.</w:t>
       </w:r>
     </w:p>
     <w:p>
@@ -433,7 +490,7 @@
         </w:numPr>
       </w:pPr>
       <w:r>
-        <w:t xml:space="preserve">неоднозначность арабографичной записи;</w:t>
+        <w:t xml:space="preserve">Построить синтетический набор данных для задачи OCR post-correction.</w:t>
       </w:r>
     </w:p>
     <w:p>
@@ -445,7 +502,7 @@
         </w:numPr>
       </w:pPr>
       <w:r>
-        <w:t xml:space="preserve">наличие похожих по форме символов;</w:t>
+        <w:t xml:space="preserve">Выполнить разбиение данных на train/valid/test без утечки исходных строк между выборками.</w:t>
       </w:r>
     </w:p>
     <w:p>
@@ -457,7 +514,7 @@
         </w:numPr>
       </w:pPr>
       <w:r>
-        <w:t xml:space="preserve">ошибки сегментации слов и пробелов;</w:t>
+        <w:t xml:space="preserve">Реализовать и оценить baseline-подходы: identity baseline, rule-based normalizer и train-derived character-confusion baseline.</w:t>
       </w:r>
     </w:p>
     <w:p>
@@ -469,7 +526,7 @@
         </w:numPr>
       </w:pPr>
       <w:r>
-        <w:t xml:space="preserve">отсутствие специализированных бенчмарк-наборов;</w:t>
+        <w:t xml:space="preserve">Обучить нейросетевую модель ByT5-small для исправления OCR-подобных ошибок.</w:t>
       </w:r>
     </w:p>
     <w:p>
@@ -481,7 +538,65 @@
         </w:numPr>
       </w:pPr>
       <w:r>
-        <w:t xml:space="preserve">сложность оценки качества без ручной экспертной проверки.</w:t>
+        <w:t xml:space="preserve">Оценить качество моделей с помощью CER, WER, NoSpaceCER и ExactMatch.</w:t>
+      </w:r>
+    </w:p>
+    <w:p>
+      <w:pPr>
+        <w:pStyle w:val="Compact"/>
+        <w:numPr>
+          <w:ilvl w:val="0"/>
+          <w:numId w:val="1001"/>
+        </w:numPr>
+      </w:pPr>
+      <w:r>
+        <w:t xml:space="preserve">Провести анализ ошибок на уровне отдельных тестовых примеров.</w:t>
+      </w:r>
+    </w:p>
+    <w:p>
+      <w:pPr>
+        <w:pStyle w:val="Compact"/>
+        <w:numPr>
+          <w:ilvl w:val="0"/>
+          <w:numId w:val="1001"/>
+        </w:numPr>
+      </w:pPr>
+      <w:r>
+        <w:t xml:space="preserve">Отдельно интерпретировать сильное снижение WER с учётом синтетических ошибок пробелов и границ слов.</w:t>
+      </w:r>
+    </w:p>
+    <w:p>
+      <w:pPr>
+        <w:pStyle w:val="Compact"/>
+        <w:numPr>
+          <w:ilvl w:val="0"/>
+          <w:numId w:val="1001"/>
+        </w:numPr>
+      </w:pPr>
+      <w:r>
+        <w:t xml:space="preserve">Провести page-level sanity check на реальном OCR-выводе Tesseract и оценить synthetic-to-real transfer.</w:t>
+      </w:r>
+    </w:p>
+    <w:p>
+      <w:pPr>
+        <w:pStyle w:val="Compact"/>
+        <w:numPr>
+          <w:ilvl w:val="0"/>
+          <w:numId w:val="1001"/>
+        </w:numPr>
+      </w:pPr>
+      <w:r>
+        <w:t xml:space="preserve">Сформулировать ограничения пилотного эксперимента и направления дальнейшей работы.</w:t>
+      </w:r>
+    </w:p>
+    <w:bookmarkEnd w:id="14"/>
+    <w:bookmarkStart w:id="15" w:name="объект-и-предмет-исследования"/>
+    <w:p>
+      <w:pPr>
+        <w:pStyle w:val="Heading2"/>
+      </w:pPr>
+      <w:r>
+        <w:t xml:space="preserve">1.5 Объект и предмет исследования</w:t>
       </w:r>
     </w:p>
     <w:p>
@@ -489,17 +604,25 @@
         <w:pStyle w:val="FirstParagraph"/>
       </w:pPr>
       <w:r>
-        <w:t xml:space="preserve">В рамках данной работы проблема сужается до пилотной постановки: можно ли с помощью нейросетевой sequence-to-sequence модели улучшить синтетически искажённый арабографичный тюркский текст по сравнению с простыми baseline-подходами, и насколько такой результат переносится на page-level real-OCR benchmark, собранный по османско-турецкому печатному источнику в арабской графике.</w:t>
-      </w:r>
-    </w:p>
-    <w:bookmarkEnd w:id="12"/>
-    <w:bookmarkStart w:id="13" w:name="цель-работы"/>
+        <w:t xml:space="preserve">Объект исследования — исторические тюркские тексты, записанные арабской графикой.</w:t>
+      </w:r>
+    </w:p>
+    <w:p>
+      <w:pPr>
+        <w:pStyle w:val="BodyText"/>
+      </w:pPr>
+      <w:r>
+        <w:t xml:space="preserve">Предмет исследования — методы автоматической посткоррекции OCR-подобных ошибок в арабографичных тюркских текстах с использованием rule-based и нейросетевых подходов.</w:t>
+      </w:r>
+    </w:p>
+    <w:bookmarkEnd w:id="15"/>
+    <w:bookmarkStart w:id="16" w:name="исследовательские-вопросы"/>
     <w:p>
       <w:pPr>
         <w:pStyle w:val="Heading2"/>
       </w:pPr>
       <w:r>
-        <w:t xml:space="preserve">1.3 Цель работы</w:t>
+        <w:t xml:space="preserve">1.6 Исследовательские вопросы</w:t>
       </w:r>
     </w:p>
     <w:p>
@@ -507,25 +630,7 @@
         <w:pStyle w:val="FirstParagraph"/>
       </w:pPr>
       <w:r>
-        <w:t xml:space="preserve">Цель работы — разработать и оценить пилотный пайплайн на основе методов искусственного интеллекта для посткоррекции OCR-подобных ошибок в исторических тюркских текстах, записанных арабской графикой.</w:t>
-      </w:r>
-    </w:p>
-    <w:bookmarkEnd w:id="13"/>
-    <w:bookmarkStart w:id="14" w:name="задачи-работы"/>
-    <w:p>
-      <w:pPr>
-        <w:pStyle w:val="Heading2"/>
-      </w:pPr>
-      <w:r>
-        <w:t xml:space="preserve">1.4 Задачи работы</w:t>
-      </w:r>
-    </w:p>
-    <w:p>
-      <w:pPr>
-        <w:pStyle w:val="FirstParagraph"/>
-      </w:pPr>
-      <w:r>
-        <w:t xml:space="preserve">Для достижения цели необходимо решить следующие задачи:</w:t>
+        <w:t xml:space="preserve">В работе рассматриваются следующие исследовательские вопросы:</w:t>
       </w:r>
     </w:p>
     <w:p>
@@ -537,7 +642,7 @@
         </w:numPr>
       </w:pPr>
       <w:r>
-        <w:t xml:space="preserve">Описать проблему автоматической обработки исторических арабографичных тюркских текстов.</w:t>
+        <w:t xml:space="preserve">Улучшает ли нейросетевая посткоррекция качество синтетически искажённого арабографичного тюркского текста по сравнению с identity baseline?</w:t>
       </w:r>
     </w:p>
     <w:p>
@@ -549,7 +654,7 @@
         </w:numPr>
       </w:pPr>
       <w:r>
-        <w:t xml:space="preserve">Подобрать и собрать небольшой корпус тюркского текста в арабской графике.</w:t>
+        <w:t xml:space="preserve">Достаточна ли простая rule-based нормализация для такого материала?</w:t>
       </w:r>
     </w:p>
     <w:p>
@@ -561,7 +666,7 @@
         </w:numPr>
       </w:pPr>
       <w:r>
-        <w:t xml:space="preserve">Построить синтетический набор данных для задачи OCR post-correction.</w:t>
+        <w:t xml:space="preserve">Насколько сильным оказывается data-driven non-neural baseline, построенный на train-derived character confusions?</w:t>
       </w:r>
     </w:p>
     <w:p>
@@ -573,7 +678,7 @@
         </w:numPr>
       </w:pPr>
       <w:r>
-        <w:t xml:space="preserve">Выполнить разбиение данных на train/valid/test без утечки исходных строк между выборками.</w:t>
+        <w:t xml:space="preserve">Насколько важна длина последовательности для byte-level модели ByT5 при работе с арабской графикой?</w:t>
       </w:r>
     </w:p>
     <w:p>
@@ -585,7 +690,7 @@
         </w:numPr>
       </w:pPr>
       <w:r>
-        <w:t xml:space="preserve">Реализовать и оценить baseline-подходы: identity baseline, rule-based normalizer и train-derived character-confusion baseline.</w:t>
+        <w:t xml:space="preserve">Улучшает ли модель большинство тестовых примеров или только среднее значение метрики за счёт отдельных удачных случаев?</w:t>
       </w:r>
     </w:p>
     <w:p>
@@ -597,7 +702,7 @@
         </w:numPr>
       </w:pPr>
       <w:r>
-        <w:t xml:space="preserve">Обучить нейросетевую модель ByT5-small для исправления OCR-подобных ошибок.</w:t>
+        <w:t xml:space="preserve">Не связано ли заметное снижение WER преимущественно с исправлением синтетических ошибок пробелов и границ слов?</w:t>
       </w:r>
     </w:p>
     <w:p>
@@ -609,182 +714,6 @@
         </w:numPr>
       </w:pPr>
       <w:r>
-        <w:t xml:space="preserve">Оценить качество моделей с помощью CER, WER, NoSpaceCER и ExactMatch.</w:t>
-      </w:r>
-    </w:p>
-    <w:p>
-      <w:pPr>
-        <w:pStyle w:val="Compact"/>
-        <w:numPr>
-          <w:ilvl w:val="0"/>
-          <w:numId w:val="1002"/>
-        </w:numPr>
-      </w:pPr>
-      <w:r>
-        <w:t xml:space="preserve">Провести анализ ошибок на уровне отдельных тестовых примеров.</w:t>
-      </w:r>
-    </w:p>
-    <w:p>
-      <w:pPr>
-        <w:pStyle w:val="Compact"/>
-        <w:numPr>
-          <w:ilvl w:val="0"/>
-          <w:numId w:val="1002"/>
-        </w:numPr>
-      </w:pPr>
-      <w:r>
-        <w:t xml:space="preserve">Отдельно интерпретировать сильное снижение WER с учётом синтетических ошибок пробелов и границ слов.</w:t>
-      </w:r>
-    </w:p>
-    <w:p>
-      <w:pPr>
-        <w:pStyle w:val="Compact"/>
-        <w:numPr>
-          <w:ilvl w:val="0"/>
-          <w:numId w:val="1002"/>
-        </w:numPr>
-      </w:pPr>
-      <w:r>
-        <w:t xml:space="preserve">Провести page-level sanity check на реальном OCR-выводе Tesseract и оценить synthetic-to-real transfer.</w:t>
-      </w:r>
-    </w:p>
-    <w:p>
-      <w:pPr>
-        <w:pStyle w:val="Compact"/>
-        <w:numPr>
-          <w:ilvl w:val="0"/>
-          <w:numId w:val="1002"/>
-        </w:numPr>
-      </w:pPr>
-      <w:r>
-        <w:t xml:space="preserve">Сформулировать ограничения пилотного эксперимента и направления дальнейшей работы.</w:t>
-      </w:r>
-    </w:p>
-    <w:bookmarkEnd w:id="14"/>
-    <w:bookmarkStart w:id="15" w:name="объект-и-предмет-исследования"/>
-    <w:p>
-      <w:pPr>
-        <w:pStyle w:val="Heading2"/>
-      </w:pPr>
-      <w:r>
-        <w:t xml:space="preserve">1.5 Объект и предмет исследования</w:t>
-      </w:r>
-    </w:p>
-    <w:p>
-      <w:pPr>
-        <w:pStyle w:val="FirstParagraph"/>
-      </w:pPr>
-      <w:r>
-        <w:t xml:space="preserve">Объект исследования — исторические тюркские тексты, записанные арабской графикой.</w:t>
-      </w:r>
-    </w:p>
-    <w:p>
-      <w:pPr>
-        <w:pStyle w:val="BodyText"/>
-      </w:pPr>
-      <w:r>
-        <w:t xml:space="preserve">Предмет исследования — методы автоматической посткоррекции OCR-подобных ошибок в арабографичных тюркских текстах с использованием rule-based и нейросетевых подходов.</w:t>
-      </w:r>
-    </w:p>
-    <w:bookmarkEnd w:id="15"/>
-    <w:bookmarkStart w:id="16" w:name="исследовательские-вопросы"/>
-    <w:p>
-      <w:pPr>
-        <w:pStyle w:val="Heading2"/>
-      </w:pPr>
-      <w:r>
-        <w:t xml:space="preserve">1.6 Исследовательские вопросы</w:t>
-      </w:r>
-    </w:p>
-    <w:p>
-      <w:pPr>
-        <w:pStyle w:val="FirstParagraph"/>
-      </w:pPr>
-      <w:r>
-        <w:t xml:space="preserve">В работе рассматриваются следующие исследовательские вопросы:</w:t>
-      </w:r>
-    </w:p>
-    <w:p>
-      <w:pPr>
-        <w:pStyle w:val="Compact"/>
-        <w:numPr>
-          <w:ilvl w:val="0"/>
-          <w:numId w:val="1003"/>
-        </w:numPr>
-      </w:pPr>
-      <w:r>
-        <w:t xml:space="preserve">Улучшает ли нейросетевая посткоррекция качество синтетически искажённого арабографичного тюркского текста по сравнению с identity baseline?</w:t>
-      </w:r>
-    </w:p>
-    <w:p>
-      <w:pPr>
-        <w:pStyle w:val="Compact"/>
-        <w:numPr>
-          <w:ilvl w:val="0"/>
-          <w:numId w:val="1003"/>
-        </w:numPr>
-      </w:pPr>
-      <w:r>
-        <w:t xml:space="preserve">Достаточна ли простая rule-based нормализация для такого материала?</w:t>
-      </w:r>
-    </w:p>
-    <w:p>
-      <w:pPr>
-        <w:pStyle w:val="Compact"/>
-        <w:numPr>
-          <w:ilvl w:val="0"/>
-          <w:numId w:val="1003"/>
-        </w:numPr>
-      </w:pPr>
-      <w:r>
-        <w:t xml:space="preserve">Насколько сильным оказывается data-driven non-neural baseline, построенный на train-derived character confusions?</w:t>
-      </w:r>
-    </w:p>
-    <w:p>
-      <w:pPr>
-        <w:pStyle w:val="Compact"/>
-        <w:numPr>
-          <w:ilvl w:val="0"/>
-          <w:numId w:val="1003"/>
-        </w:numPr>
-      </w:pPr>
-      <w:r>
-        <w:t xml:space="preserve">Насколько важна длина последовательности для byte-level модели ByT5 при работе с арабской графикой?</w:t>
-      </w:r>
-    </w:p>
-    <w:p>
-      <w:pPr>
-        <w:pStyle w:val="Compact"/>
-        <w:numPr>
-          <w:ilvl w:val="0"/>
-          <w:numId w:val="1003"/>
-        </w:numPr>
-      </w:pPr>
-      <w:r>
-        <w:t xml:space="preserve">Улучшает ли модель большинство тестовых примеров или только среднее значение метрики за счёт отдельных удачных случаев?</w:t>
-      </w:r>
-    </w:p>
-    <w:p>
-      <w:pPr>
-        <w:pStyle w:val="Compact"/>
-        <w:numPr>
-          <w:ilvl w:val="0"/>
-          <w:numId w:val="1003"/>
-        </w:numPr>
-      </w:pPr>
-      <w:r>
-        <w:t xml:space="preserve">Не связано ли заметное снижение WER преимущественно с исправлением синтетических ошибок пробелов и границ слов?</w:t>
-      </w:r>
-    </w:p>
-    <w:p>
-      <w:pPr>
-        <w:pStyle w:val="Compact"/>
-        <w:numPr>
-          <w:ilvl w:val="0"/>
-          <w:numId w:val="1003"/>
-        </w:numPr>
-      </w:pPr>
-      <w:r>
         <w:t xml:space="preserve">Сохраняется ли выигрыш synthetic-trained модели на реальном OCR-выводе Tesseract для page-level османско-турецкого источника?</w:t>
       </w:r>
     </w:p>
@@ -892,13 +821,13 @@
         <w:t xml:space="preserve">2. Обзор предметной области и связанных работ</w:t>
       </w:r>
     </w:p>
-    <w:bookmarkStart w:id="20" w:name="X679db47d81c99eb1d359e7ecbdd9091b3199270"/>
+    <w:bookmarkStart w:id="20" w:name="X1e11fd8938c5ad9ae65a1d741ecc34776353196"/>
     <w:p>
       <w:pPr>
         <w:pStyle w:val="Heading3"/>
       </w:pPr>
       <w:r>
-        <w:t xml:space="preserve">2.1 Автоматическое распознавание исторических документов</w:t>
+        <w:t xml:space="preserve">2.1 OCR исторических документов как воспроизводимый workflow</w:t>
       </w:r>
     </w:p>
     <w:p>
@@ -906,33 +835,33 @@
         <w:pStyle w:val="FirstParagraph"/>
       </w:pPr>
       <w:r>
-        <w:t xml:space="preserve">OCR исторических документов отличается от распознавания современных печатных текстов не одной отдельной трудностью, а сочетанием факторов: нестабильной типографикой, повреждениями носителя, неоднородным качеством сканов, сложной вёрсткой и вариативной орфографией. В работах по историческому OCR workflow подчёркивается, что качество результата зависит не только от модели распознавания, но и от подготовки изображений, разметки, ground truth и последующей проверки текста (Reul et al., 2019; Springmann et al., 2018).</w:t>
-      </w:r>
-    </w:p>
-    <w:p>
-      <w:pPr>
-        <w:pStyle w:val="BodyText"/>
-      </w:pPr>
-      <w:r>
-        <w:t xml:space="preserve">Для печатных документов обычно используется термин OCR — optical character recognition. Для рукописных материалов чаще применяется термин HTR — handwritten text recognition. В обоих случаях задача не сводится к классификации отдельных символов: система должна учитывать строку, слово, контекст и особенности конкретной письменной традиции.</w:t>
-      </w:r>
-    </w:p>
-    <w:p>
-      <w:pPr>
-        <w:pStyle w:val="BodyText"/>
-      </w:pPr>
-      <w:r>
-        <w:t xml:space="preserve">В данной работе не строится OCR/HTR-система по изображениям. Исследуется следующий этап обработки — посткоррекция уже полученного текстового вывода. Такое ограничение делает постановку уже, но чище: можно отдельно проверить, насколько модель исправления ошибок способна восстанавливать арабографичный тюркский текст после OCR-подобных искажений.</w:t>
+        <w:t xml:space="preserve">OCR исторических документов отличается от распознавания современных печатных текстов не одной отдельной трудностью, а сочетанием факторов: качеством скана, типографикой, состоянием страницы, разметкой строк, layout и исторической вариативностью письма. Поэтому в работах по historical OCR задача обычно рассматривается не только как запуск модели распознавания, а как воспроизводимый workflow: подготовка изображения, сегментация, создание ground truth, обучение или настройка OCR/HTR, постобработка и ручная валидация.</w:t>
+      </w:r>
+    </w:p>
+    <w:p>
+      <w:pPr>
+        <w:pStyle w:val="BodyText"/>
+      </w:pPr>
+      <w:r>
+        <w:t xml:space="preserve">Такой взгляд важен для данной работы, потому что рассматриваемая модель не заменяет OCR-систему целиком. Она работает на следующем уровне pipeline — после того как OCR уже выдал текст. В этом смысле постановка ближе к post-OCR correction, чем к end-to-end OCR/HTR. Работы по OCR4all показывают, что для исторических печатных источников важна именно связка инструментов, а не отдельная модель распознавания (Reul et al., 2019). Работы по ground truth для исторического OCR отдельно подчёркивают, что качество оценки зависит от корректного соответствия между изображением, строкой и эталонной транскрипцией (Springmann et al., 2018).</w:t>
+      </w:r>
+    </w:p>
+    <w:p>
+      <w:pPr>
+        <w:pStyle w:val="BodyText"/>
+      </w:pPr>
+      <w:r>
+        <w:t xml:space="preserve">Современные OCR-модели также всё чаще строятся на transformer-based подходах. Например, TrOCR использует предобученные image- и text-transformer компоненты и показывает, что сама OCR-модель может выигрывать от pretraining и fine-tuning на размеченных данных (Li et al., 2021). Однако это направление относится к распознаванию изображения, тогда как настоящая работа сознательно ограничена текстовой посткоррекцией. Такое ограничение делает эксперимент уже, но позволяет отдельно проверить вопрос: может ли модель исправлять уже полученный OCR-output, не смешивая этот результат с качеством segmentation или image recognition.</w:t>
       </w:r>
     </w:p>
     <w:bookmarkEnd w:id="20"/>
-    <w:bookmarkStart w:id="21" w:name="Xa02a7bb48ad7549a4f67e48911e7568815c5168"/>
+    <w:bookmarkStart w:id="21" w:name="специфика-арабографичного-ocr"/>
     <w:p>
       <w:pPr>
         <w:pStyle w:val="Heading3"/>
       </w:pPr>
       <w:r>
-        <w:t xml:space="preserve">2.2 Особенности арабографичных исторических текстов</w:t>
+        <w:t xml:space="preserve">2.2 Специфика арабографичного OCR</w:t>
       </w:r>
     </w:p>
     <w:p>
@@ -940,7 +869,15 @@
         <w:pStyle w:val="FirstParagraph"/>
       </w:pPr>
       <w:r>
-        <w:t xml:space="preserve">Arabic-script OCR обычно рассматривается как отдельный класс задач: буквы меняют форму в зависимости от позиции в слове, письмо является связным, а различия между рядом символов задаются точками и небольшими графическими элементами. В обзорах по Arabic OCR эти свойства выделяются как одна из причин, по которым прямой перенос OCR-подходов с латинской графики оказывается недостаточным (Kasem et al., 2023). Для печатных и многошрифтовых арабографичных материалов дополнительно важны вариативность шрифтов, наложение элементов и близость начертаний (Osman et al., 2020).</w:t>
+        <w:t xml:space="preserve">Arabic-script OCR обычно рассматривается как отдельный класс задач. Буквы меняют форму в зависимости от позиции в слове, письмо является связным, а различия между рядом символов могут задаваться небольшими графическими элементами, например точками. В обзорах по Arabic OCR эти свойства выделяются как одна из причин, по которым прямой перенос подходов, хорошо работающих для латинской графики, оказывается недостаточным (Kasem et al., 2023). Для печатных арабографичных материалов дополнительно важны многошрифтовость, близость начертаний и нестабильность качества сканов (Osman et al., 2020).</w:t>
+      </w:r>
+    </w:p>
+    <w:p>
+      <w:pPr>
+        <w:pStyle w:val="BodyText"/>
+      </w:pPr>
+      <w:r>
+        <w:t xml:space="preserve">Для данной работы это означает, что ошибка OCR не сводится к случайной замене символа на символ. В арабской графике похожие графемы могут отличаться небольшими деталями, а ошибка сегментации или порядка чтения может резко ухудшать последующую посткоррекцию. Поэтому synthetic noise generator может быть полезен как контролируемая постановка, но он не обязан совпадать с реальными ошибками Tesseract или другой OCR/HTR-системы.</w:t>
       </w:r>
     </w:p>
     <w:p>
@@ -956,17 +893,17 @@
         <w:pStyle w:val="BodyText"/>
       </w:pPr>
       <w:r>
-        <w:t xml:space="preserve">Из этого следует важное ограничение: простая унификация символов не является заведомо безопасной предварительной процедурой. Она может убрать технический шум, но может и стереть значимые различия. Поэтому в данной работе rule-based normalizer рассматривается не как заведомо правильная предобработка, а как отдельный baseline, качество которого проверяется экспериментально.</w:t>
+        <w:t xml:space="preserve">Именно здесь возникает связь между synthetic benchmark и real-OCR проверкой. В синтетической постановке можно контролировать типы искажений и train/test split. В реальном OCR появляются дополнительные факторы: layout, шрифт, качество изображения, строковая сегментация, направление письма и особенности конкретного OCR engine. Поэтому результаты на synthetic benchmark нужно проверять отдельно на настоящем OCR-output, а не переносить автоматически.</w:t>
       </w:r>
     </w:p>
     <w:bookmarkEnd w:id="21"/>
-    <w:bookmarkStart w:id="22" w:name="X69a43e90e5ebd7e3113e444e7e5f2f644869f5a"/>
+    <w:bookmarkStart w:id="22" w:name="X870e54edfb9df569aa2599064af567ed17246c1"/>
     <w:p>
       <w:pPr>
         <w:pStyle w:val="Heading3"/>
       </w:pPr>
       <w:r>
-        <w:t xml:space="preserve">2.3 Тюркские тексты в арабской графике как низкоресурсный материал</w:t>
+        <w:t xml:space="preserve">2.3 Тюркские тексты в арабской графике и османско-турецкий материал</w:t>
       </w:r>
     </w:p>
     <w:p>
@@ -974,33 +911,33 @@
         <w:pStyle w:val="FirstParagraph"/>
       </w:pPr>
       <w:r>
-        <w:t xml:space="preserve">Тюркские языки в разные исторические периоды использовали разные письменности, включая арабскую графику. Для османско-тюркских материалов это особенно заметно: после перехода турецкого языка на латиницу значительная часть печатного наследия осталась в письменной форме, которая трудна для массового поиска и автоматической обработки. На эту проблему указывают работы по автоматической транскрипции османско-турецких периодических изданий и цифровизации non-Latin script archives (Kirmizialtin &amp; Wrisley, 2020).</w:t>
-      </w:r>
-    </w:p>
-    <w:p>
-      <w:pPr>
-        <w:pStyle w:val="BodyText"/>
-      </w:pPr>
-      <w:r>
-        <w:t xml:space="preserve">С точки зрения NLP такие материалы остаются низкоресурсными: для них меньше размеченных корпусов, стандартных бенчмарк-наборов, готовых моделей и инструментов, чем для современных массовых языков. Современные работы по Historical Turkish NLP отдельно подчёркивают необходимость создавать базовые ресурсы: корпуса, модели, разметку и инструменты для последующего анализа исторических текстов (Özateş et al., 2025).</w:t>
-      </w:r>
-    </w:p>
-    <w:p>
-      <w:pPr>
-        <w:pStyle w:val="BodyText"/>
-      </w:pPr>
-      <w:r>
-        <w:t xml:space="preserve">В данной работе эта проблема сужается до одного технически проверяемого шага: построения воспроизводимого бенчмарка посткоррекции. Даже небольшой корпус полезен, если он явно фиксирует источник данных, процедуру разбиения, тип ошибок, метрики и ограничения. Такой протокол можно расширять новыми источниками и использовать как часть более крупной системы обработки исторических арабографичных тюркских документов.</w:t>
+        <w:t xml:space="preserve">Тюркские языки в разные исторические периоды использовали разные письменности, включая арабскую графику. Для османско-тюркских материалов эта проблема особенно заметна: после перехода турецкого языка на латиницу значительная часть печатного наследия осталась в форме, трудной для массового поиска и автоматической обработки. Работы по автоматической транскрипции османско-турецких периодических изданий показывают, что non-Latin script archives требуют отдельной инфраструктуры, подготовки данных и проверки качества распознавания (Kirmizialtin &amp; Wrisley, 2020).</w:t>
+      </w:r>
+    </w:p>
+    <w:p>
+      <w:pPr>
+        <w:pStyle w:val="BodyText"/>
+      </w:pPr>
+      <w:r>
+        <w:t xml:space="preserve">В данной работе османско-турецкий источник используется как связанный арабографичный тюркский test case. Это важно формулировать аккуратно. Текущий real-OCR benchmark не является старотатарским или старобашкирским датасетом. Старотатарские и старобашкирские источники остаются целевой мотивацией дальнейшего исследования, а османско-турецкий материал используется потому, что для него удалось сопоставить сканы страниц и постраничный текстовый reference.</w:t>
+      </w:r>
+    </w:p>
+    <w:p>
+      <w:pPr>
+        <w:pStyle w:val="BodyText"/>
+      </w:pPr>
+      <w:r>
+        <w:t xml:space="preserve">С точки зрения NLP такие материалы относятся к низкоресурсным историческим данным. Для них меньше размеченных корпусов, стандартных бенчмарков, готовых моделей и инструментов, чем для современных массовых языков. Современные работы по Historical Turkish NLP отдельно подчёркивают необходимость создавать базовые ресурсы: корпуса, модели, разметку и инструменты для последующего анализа исторических текстов (Özateş et al., 2025). Настоящая работа занимает в этой цепочке узкое место: она не строит полный корпус Historical Turkish NLP, а проверяет воспроизводимый pipeline для post-correction.</w:t>
       </w:r>
     </w:p>
     <w:bookmarkEnd w:id="22"/>
-    <w:bookmarkStart w:id="23" w:name="посткоррекция-ocr-ошибок"/>
+    <w:bookmarkStart w:id="23" w:name="X5119707d5b2fc17c5036a9d6f06fdef8e5da786"/>
     <w:p>
       <w:pPr>
         <w:pStyle w:val="Heading3"/>
       </w:pPr>
       <w:r>
-        <w:t xml:space="preserve">2.4 Посткоррекция OCR-ошибок</w:t>
+        <w:t xml:space="preserve">2.4 Post-OCR correction как задача noisy-to-clean преобразования</w:t>
       </w:r>
     </w:p>
     <w:p>
@@ -1008,33 +945,49 @@
         <w:pStyle w:val="FirstParagraph"/>
       </w:pPr>
       <w:r>
-        <w:t xml:space="preserve">Посткоррекция OCR-ошибок — это задача преобразования ошибочного OCR-вывода в более корректный текст. На уровне строки она естественно формулируется как sequence-to-sequence задача: модель получает зашумлённый текст и должна восстановить чистый текст. Такой подход используется в работах по post-OCR correction, включая character-level и neural sequence-to-sequence модели (Ramirez-Orta et al., 2021; Hämäläinen &amp; Hengchen, 2019).</w:t>
-      </w:r>
-    </w:p>
-    <w:p>
-      <w:pPr>
-        <w:pStyle w:val="BodyText"/>
-      </w:pPr>
-      <w:r>
-        <w:t xml:space="preserve">Ошибки OCR обычно включают замены похожих символов, удаления и вставки, неправильное разбиение на слова, искажение окончаний и локальные перестановки. Для исторических текстов к этому добавляются нестабильная орфография и несовпадение современных языковых норм с историческим написанием. Поэтому посткоррекция пересекается не только с исправлением OCR-шума, но и с задачей нормализации написаний; в литературе эти две задачи иногда рассматриваются совместно, но их нельзя полностью отождествлять (Duong et al., 2020).</w:t>
-      </w:r>
-    </w:p>
-    <w:p>
-      <w:pPr>
-        <w:pStyle w:val="BodyText"/>
-      </w:pPr>
-      <w:r>
-        <w:t xml:space="preserve">Для исторических арабографичных тюркских текстов посткоррекция важна как промежуточный слой между распознаванием и дальнейшим анализом. Даже частично ошибочный OCR-вывод после исправления становится полезнее для поиска, индексации, извлечения именованных сущностей, анализа топонимов, сопоставления записей и построения исторических баз данных. Поэтому в данной работе post-correction рассматривается не как косметическая правка текста, а как отдельный компонент будущего pipeline для обработки архивных материалов.</w:t>
+        <w:t xml:space="preserve">Post-OCR correction — это задача преобразования ошибочного OCR-вывода в более корректный текст. На уровне строки или короткого фрагмента она естественно формулируется как sequence-to-sequence задача: модель получает noisy/OCR text и должна восстановить clean text. Такой подход используется в работах по neural post-OCR correction, включая NMT-based методы и character-level sequence-to-sequence модели (Hämäläinen &amp; Hengchen, 2019; Ramirez-Orta et al., 2021).</w:t>
+      </w:r>
+    </w:p>
+    <w:p>
+      <w:pPr>
+        <w:pStyle w:val="BodyText"/>
+      </w:pPr>
+      <w:r>
+        <w:t xml:space="preserve">При этом post-correction нельзя полностью отождествлять с нормализацией исторического написания. OCR correction исправляет технические ошибки распознавания, а spelling normalization может менять варианты написания в сторону некоторой нормы. В литературе эти задачи иногда рассматриваются рядом, но для исторического материала их важно разводить, чтобы не стереть значимые орфографические особенности (Duong et al., 2020).</w:t>
+      </w:r>
+    </w:p>
+    <w:p>
+      <w:pPr>
+        <w:pStyle w:val="BodyText"/>
+      </w:pPr>
+      <w:r>
+        <w:t xml:space="preserve">Для исторических корпусов особенно важна character-level оценка. Ошибки OCR появляются из-за похожих графем, нестабильных шрифтов, качества скана, старой орфографии и сегментации слов. Lyu et al. (2021) отдельно связывают post-hoc correction исторических корпусов с character-level ошибками, word segmentation и исторической вариативностью языка. Это близко к метрикам настоящей работы: CER и NoSpaceCER здесь важнее, чем один только WER, потому что word-level улучшение может возникать из-за исправления пробелов, не гарантируя лучшего распознавания символов.</w:t>
+      </w:r>
+    </w:p>
+    <w:p>
+      <w:pPr>
+        <w:pStyle w:val="BodyText"/>
+      </w:pPr>
+      <w:r>
+        <w:t xml:space="preserve">Для низкоресурсных языков post-correction дополнительно ограничивается нехваткой вручную проверенных OCR/reference пар. Rijhwani et al. (2021) показывают, что neural post-correction для less-well-resourced and endangered languages зависит от scarce curated correction data, а self-training и lexically-aware decoding могут помочь использовать неразмеченные изображения и распознанные тексты. Это напрямую связано с дальнейшей частью данной работы: обучение только на synthetic noise даёт контролируемый baseline, но следующий шаг требует real-domain adaptation на настоящих OCR/reference chunks.</w:t>
+      </w:r>
+    </w:p>
+    <w:p>
+      <w:pPr>
+        <w:pStyle w:val="BodyText"/>
+      </w:pPr>
+      <w:r>
+        <w:t xml:space="preserve">Отдельная современная линия исследований — использование больших языковых моделей для OCR correction. Kanerva et al. (2025) показывают, что LLM-based post-correction для historical documents не даёт универсального бесплатного выигрыша: эффект зависит от языка, данных и постановки. Этот вывод важен для интерпретации настоящего эксперимента. Отрицательный или смешанный перенос synthetic-trained модели на real OCR не является неожиданным провалом, а отражает известную проблему post-OCR correction: качество коррекции зависит от домена, языка, структуры ошибок и объёма реальных размеченных OCR/reference пар.</w:t>
       </w:r>
     </w:p>
     <w:bookmarkEnd w:id="23"/>
-    <w:bookmarkStart w:id="24" w:name="синтетические-ocr-ошибки"/>
+    <w:bookmarkStart w:id="24" w:name="X19a1771a43b71d67d563fcb9147403fa3d6dc85"/>
     <w:p>
       <w:pPr>
         <w:pStyle w:val="Heading3"/>
       </w:pPr>
       <w:r>
-        <w:t xml:space="preserve">2.5 Синтетические OCR-ошибки</w:t>
+        <w:t xml:space="preserve">2.5 Синтетические данные для post-OCR correction</w:t>
       </w:r>
     </w:p>
     <w:p>
@@ -1042,33 +995,41 @@
         <w:pStyle w:val="FirstParagraph"/>
       </w:pPr>
       <w:r>
-        <w:t xml:space="preserve">В идеальном случае модель посткоррекции обучается на парах реального OCR/HTR-вывода и вручную проверенного правильного текста. Для низкоресурсных исторических материалов такие пары часто отсутствуют или существуют в малом объёме. Поэтому в пилотных экспериментах используется синтетический шум: чистый текст намеренно искажается контролируемым генератором ошибок. Близкий подход применяется в работах по OCR error correction для исторических текстов, где искусственно подготовленные или task-specific данные помогают обучать модель при дефиците размеченных примеров (Suissa et al., 2023).</w:t>
-      </w:r>
-    </w:p>
-    <w:p>
-      <w:pPr>
-        <w:pStyle w:val="BodyText"/>
-      </w:pPr>
-      <w:r>
-        <w:t xml:space="preserve">Преимущество синтетической постановки состоит в контроле: известен исходный чистый текст, типы искажений, процедура генерации, random seed и разбиение на train/valid/test. Это позволяет проверить не всю OCR-систему целиком, а более узкий вопрос: способна ли модель post-correction восстанавливать арабографичный тюркский текст после OCR-подобных ошибок.</w:t>
-      </w:r>
-    </w:p>
-    <w:p>
-      <w:pPr>
-        <w:pStyle w:val="BodyText"/>
-      </w:pPr>
-      <w:r>
-        <w:t xml:space="preserve">Такой эксперимент нельзя считать заменой проверки на реальных OCR/HTR-выходах. Реальные ошибки зависят от качества изображения, шрифта, сегментации, модели распознавания и состояния документа. Поэтому результаты на синтетическом датасете в данной работе интерпретируются как пилотная проверка pipeline, а не как итоговая оценка качества на архивных сканах.</w:t>
+        <w:t xml:space="preserve">В идеальном случае модель посткоррекции обучается на парах реального OCR/HTR-вывода и вручную проверенного правильного текста. Для низкоресурсных исторических материалов такие пары часто отсутствуют или существуют в малом объёме. Поэтому в пилотных экспериментах используется synthetic data: clean text намеренно искажается, чтобы получить пары noisy → clean. Такой подход не заменяет real benchmark, но позволяет получить контролируемый первый baseline.</w:t>
+      </w:r>
+    </w:p>
+    <w:p>
+      <w:pPr>
+        <w:pStyle w:val="BodyText"/>
+      </w:pPr>
+      <w:r>
+        <w:t xml:space="preserve">Работы по historical Hebrew OCR correction показывают, что task-specific/artificial data может быть полезным для обучения OCR error correction при дефиците размеченных исторических данных (Suissa et al., 2023). Naiman et al. (2023) используют large synthetic data для post-correction исторических научных статей и показывают, что synthetic ground truth/OCR pairs могут улучшать CER и WER. Это подтверждает саму идею синтетического benchmark как разумного пилотного этапа.</w:t>
+      </w:r>
+    </w:p>
+    <w:p>
+      <w:pPr>
+        <w:pStyle w:val="BodyText"/>
+      </w:pPr>
+      <w:r>
+        <w:t xml:space="preserve">Однако современные работы также показывают, что способ генерации synthetic data имеет значение. Guan and Greene (2024) сравнивают объём данных, augmentation и методы synthetic data generation для post-OCR correction; отдельно рассматривается glyph similarity и low-resource setting. RoundTripOCR также показывает, что для low-resource post-OCR correction можно строить synthetic parallel data и трактовать исправление OCR как translation-like noisy-to-clean mapping (Kashid &amp; Bhattacharyya, 2024).</w:t>
+      </w:r>
+    </w:p>
+    <w:p>
+      <w:pPr>
+        <w:pStyle w:val="BodyText"/>
+      </w:pPr>
+      <w:r>
+        <w:t xml:space="preserve">Эти работы помогают точнее сформулировать ограничение текущего эксперимента. Проблема не в том, что synthetic data “неправильны” сами по себе. Проблема в том, что synthetic noise должен быть связан с реальным распределением OCR-ошибок. В настоящей работе synthetic benchmark показывает работоспособность pipeline и модели ByT5-small в контролируемой постановке, но page-level real-OCR проверка показывает synthetic-to-real gap. Поэтому следующий этап должен двигаться не только к увеличению synthetic dataset, но и к real-error-aware или glyph-aware генерации шума, основанной на настоящих OCR/reference выравниваниях.</w:t>
       </w:r>
     </w:p>
     <w:bookmarkEnd w:id="24"/>
-    <w:bookmarkStart w:id="25" w:name="byte-level-модели-и-byt5"/>
+    <w:bookmarkStart w:id="25" w:name="byte-level-модели-и-выбор-byt5"/>
     <w:p>
       <w:pPr>
         <w:pStyle w:val="Heading3"/>
       </w:pPr>
       <w:r>
-        <w:t xml:space="preserve">2.6 Byte-level модели и ByT5</w:t>
+        <w:t xml:space="preserve">2.6 Byte-level модели и выбор ByT5</w:t>
       </w:r>
     </w:p>
     <w:p>
@@ -1076,33 +1037,33 @@
         <w:pStyle w:val="FirstParagraph"/>
       </w:pPr>
       <w:r>
-        <w:t xml:space="preserve">Нейросетевые модели post-correction обычно опираются на sequence-to-sequence постановку: входная последовательность с ошибками преобразуется в целевую последовательность без ошибок. Современная основа таких моделей связана с Transformer-архитектурой (Vaswani et al., 2017) и text-to-text подходом, в котором разные задачи формулируются как преобразование текста в текст (Raffel et al., 2019).</w:t>
-      </w:r>
-    </w:p>
-    <w:p>
-      <w:pPr>
-        <w:pStyle w:val="BodyText"/>
-      </w:pPr>
-      <w:r>
-        <w:t xml:space="preserve">В данной работе используется ByT5-small. ByT5 относится к byte-level sequence-to-sequence моделям: она работает на уровне байтов, а не заранее заданных слов или подслов (Xue et al., 2021). Это важно для низкоресурсного исторического материала, где обычный subword-токенизатор может плохо представлять редкие графемы, нестандартные написания, смешение письменных традиций и OCR-шум.</w:t>
-      </w:r>
-    </w:p>
-    <w:p>
-      <w:pPr>
-        <w:pStyle w:val="BodyText"/>
-      </w:pPr>
-      <w:r>
-        <w:t xml:space="preserve">Byte-level представление имеет практическое следствие: длина последовательности в токенах не равна длине строки в видимых символах. Один символ арабской графики может занимать несколько байтов. Поэтому слишком короткое ограничение длины может обрезать часть контекста. В данной работе финальной конфигурацией выбрана длина 512; результаты показывают, что для арабографичных строк этот параметр является важным и должен явно контролироваться в эксперименте.</w:t>
+        <w:t xml:space="preserve">В работе используется ByT5-small. ByT5 относится к byte-level sequence-to-sequence моделям: она работает на уровне байтов, а не заранее заданных слов или subword units (Xue et al., 2021). Для низкоресурсного исторического материала это важно, потому что обычный subword tokenizer может плохо покрывать редкие графемы, нестандартные написания, смешение письменных традиций и OCR-шум.</w:t>
+      </w:r>
+    </w:p>
+    <w:p>
+      <w:pPr>
+        <w:pStyle w:val="BodyText"/>
+      </w:pPr>
+      <w:r>
+        <w:t xml:space="preserve">Выбор ByT5 также связан с постановкой noisy-to-clean. Архитектура text-to-text transformer позволяет формулировать post-correction как преобразование одной последовательности в другую, что наследует общую логику T5 (Raffel et al., 2019) и transformer-based sequence modeling (Vaswani et al., 2017). При этом byte-level представление особенно удобно для арабографичных текстов, где видимые символы и их Unicode-представление могут быть нестабильны, а ошибки часто проявляются на уровне отдельных графем.</w:t>
+      </w:r>
+    </w:p>
+    <w:p>
+      <w:pPr>
+        <w:pStyle w:val="BodyText"/>
+      </w:pPr>
+      <w:r>
+        <w:t xml:space="preserve">Тем не менее byte-level модель не решает проблему доменного переноса автоматически. Если модель обучена только на synthetic noise, она учится распределению ошибок этого генератора. Реальный OCR-output может иметь другую структуру: пропуски, layout artifacts, ошибки чтения строк, необычные пробелы, неверные формы букв или последовательные искажения. Поэтому ByT5 в данной работе рассматривается как сильный и воспроизводимый baseline для post-correction, но не как готовое универсальное решение.</w:t>
       </w:r>
     </w:p>
     <w:bookmarkEnd w:id="25"/>
-    <w:bookmarkStart w:id="26" w:name="выводы-по-обзору"/>
+    <w:bookmarkStart w:id="26" w:name="X4e2987dd6a0ff1eb2f6c8914cca3c5fd2dc83ae"/>
     <w:p>
       <w:pPr>
         <w:pStyle w:val="Heading3"/>
       </w:pPr>
       <w:r>
-        <w:t xml:space="preserve">2.7 Выводы по обзору</w:t>
+        <w:t xml:space="preserve">2.7 Позиция данной работы относительно существующих исследований</w:t>
       </w:r>
     </w:p>
     <w:p>
@@ -1110,23 +1071,23 @@
         <w:pStyle w:val="FirstParagraph"/>
       </w:pPr>
       <w:r>
-        <w:t xml:space="preserve">Обзор показывает, что задача не сводится к обычному применению готовой OCR-системы. Исторический OCR зависит от качества источника, ground truth и workflow; арабская графика добавляет позиционные формы, связное письмо и близкие начертания; тюркский исторический материал остаётся низкоресурсным и плохо покрытым готовыми NLP-инструментами.</w:t>
-      </w:r>
-    </w:p>
-    <w:p>
-      <w:pPr>
-        <w:pStyle w:val="BodyText"/>
-      </w:pPr>
-      <w:r>
-        <w:t xml:space="preserve">Поэтому в данной работе выбрана узкая, но проверяемая постановка: не полный OCR/HTR по изображениям, а post-correction уже полученного текстового вывода. Такой выбор позволяет построить воспроизводимый benchmark, сравнить identity baseline, rule-based normalizer, train-derived character-confusion baseline и ByT5-small, а затем оценить результат по CER, WER и анализу ошибок.</w:t>
-      </w:r>
-    </w:p>
-    <w:p>
-      <w:pPr>
-        <w:pStyle w:val="BodyText"/>
-      </w:pPr>
-      <w:r>
-        <w:t xml:space="preserve">Синтетический шум в этой постановке используется как пилотный инструмент, а не как замена реальному OCR/HTR. Полученный экспериментальный контур можно расширять: добавлять новые источники, реальные OCR-выходы, ручную валидацию, дополнительные модели и последующие задачи анализа исторических текстов.</w:t>
+        <w:t xml:space="preserve">Существующие работы показывают несколько важных фактов. Во-первых, historical OCR требует workflow, ground truth и ручной проверки, а не только запуска модели распознавания. Во-вторых, Arabic-script OCR имеет собственные графические и layout-трудности. В-третьих, post-OCR correction естественно формулируется как noisy-to-clean sequence transformation. В-четвёртых, synthetic data является полезным инструментом для low-resource setups, но его нужно проверять на real OCR.</w:t>
+      </w:r>
+    </w:p>
+    <w:p>
+      <w:pPr>
+        <w:pStyle w:val="BodyText"/>
+      </w:pPr>
+      <w:r>
+        <w:t xml:space="preserve">Настоящая работа находится на пересечении этих направлений. Она не претендует на создание новой OCR/HTR-системы и не заявляет state of the art для historical OCR. Её вклад более узкий: воспроизводимый pilot benchmark для Arabic-script Turkic post-correction, сравнение простых baseline-подходов и ByT5-small, анализ synthetic benchmark и отдельная проверка synthetic-to-real transfer на page-level OCR османско-турецкого источника.</w:t>
+      </w:r>
+    </w:p>
+    <w:p>
+      <w:pPr>
+        <w:pStyle w:val="BodyText"/>
+      </w:pPr>
+      <w:r>
+        <w:t xml:space="preserve">Главная исследовательская ценность такого дизайна состоит в том, что он не скрывает отрицательный результат. На synthetic benchmark модель показывает улучшение относительно baseline, но на real-OCR benchmark перенос оказывается нестабильным. Это делает работу полезной как подготовительный этап для магистерского исследования: следующий шаг должен включать verified real OCR/reference chunks, page-level split без утечки и обучение на настоящих OCR-ошибках.</w:t>
       </w:r>
     </w:p>
     <w:bookmarkEnd w:id="26"/>
@@ -3992,11 +3953,77 @@
         <w:pStyle w:val="Compact"/>
         <w:numPr>
           <w:ilvl w:val="0"/>
-          <w:numId w:val="1004"/>
+          <w:numId w:val="1003"/>
         </w:numPr>
       </w:pPr>
       <w:r>
         <w:t xml:space="preserve">CER: 0.086005 → 0.079913;</w:t>
+      </w:r>
+    </w:p>
+    <w:p>
+      <w:pPr>
+        <w:pStyle w:val="Compact"/>
+        <w:numPr>
+          <w:ilvl w:val="0"/>
+          <w:numId w:val="1003"/>
+        </w:numPr>
+      </w:pPr>
+      <w:r>
+        <w:t xml:space="preserve">WER: 0.519006 → 0.368540;</w:t>
+      </w:r>
+    </w:p>
+    <w:p>
+      <w:pPr>
+        <w:pStyle w:val="Compact"/>
+        <w:numPr>
+          <w:ilvl w:val="0"/>
+          <w:numId w:val="1003"/>
+        </w:numPr>
+      </w:pPr>
+      <w:r>
+        <w:t xml:space="preserve">ExactMatch: 0.001250 → 0.003750.</w:t>
+      </w:r>
+    </w:p>
+    <w:p>
+      <w:pPr>
+        <w:pStyle w:val="FirstParagraph"/>
+      </w:pPr>
+      <w:r>
+        <w:t xml:space="preserve">Абсолютное снижение CER составляет 0.006092. Это умеренное улучшение: модель действительно приближает предсказания к эталонной строке на уровне символов, но не решает задачу полностью. Заметнее выглядит снижение WER: разница составляет 0.150466, то есть модель заметно чаще восстанавливает структуру слов или делает строку ближе к эталону на word-level.</w:t>
+      </w:r>
+    </w:p>
+    <w:p>
+      <w:pPr>
+        <w:pStyle w:val="BodyText"/>
+      </w:pPr>
+      <w:r>
+        <w:t xml:space="preserve">Такой результат согласуется с основной гипотезой пилота: byte-level sequence-to-sequence модель может быть полезна для post-correction арабографичного тюркского текста. Однако улучшение по CER остаётся достаточно небольшим, поэтому вывод следует считать не финальным доказательством качества модели, а подтверждением работоспособности выбранного направления в controlled synthetic setting.</w:t>
+      </w:r>
+    </w:p>
+    <w:bookmarkEnd w:id="55"/>
+    <w:bookmarkStart w:id="56" w:name="rule-based-normalizer"/>
+    <w:p>
+      <w:pPr>
+        <w:pStyle w:val="Heading3"/>
+      </w:pPr>
+      <w:r>
+        <w:t xml:space="preserve">5.4 Rule-based normalizer</w:t>
+      </w:r>
+    </w:p>
+    <w:p>
+      <w:pPr>
+        <w:pStyle w:val="FirstParagraph"/>
+      </w:pPr>
+      <w:r>
+        <w:t xml:space="preserve">Rule-based normalizer выступает отрицательным контрольным сравнением. Он показывает, что простая символьная нормализация не обязательно улучшает исторический арабографичный текст и может быть хуже, чем отсутствие исправления.</w:t>
+      </w:r>
+    </w:p>
+    <w:p>
+      <w:pPr>
+        <w:pStyle w:val="BodyText"/>
+      </w:pPr>
+      <w:r>
+        <w:t xml:space="preserve">По сравнению с identity baseline normalizer ухудшает все метрики:</w:t>
       </w:r>
     </w:p>
     <w:p>
@@ -4008,7 +4035,7 @@
         </w:numPr>
       </w:pPr>
       <w:r>
-        <w:t xml:space="preserve">WER: 0.519006 → 0.368540;</w:t>
+        <w:t xml:space="preserve">CER: 0.086005 → 0.151932;</w:t>
       </w:r>
     </w:p>
     <w:p>
@@ -4020,7 +4047,19 @@
         </w:numPr>
       </w:pPr>
       <w:r>
-        <w:t xml:space="preserve">ExactMatch: 0.001250 → 0.003750.</w:t>
+        <w:t xml:space="preserve">WER: 0.519006 → 0.684408;</w:t>
+      </w:r>
+    </w:p>
+    <w:p>
+      <w:pPr>
+        <w:pStyle w:val="Compact"/>
+        <w:numPr>
+          <w:ilvl w:val="0"/>
+          <w:numId w:val="1004"/>
+        </w:numPr>
+      </w:pPr>
+      <w:r>
+        <w:t xml:space="preserve">ExactMatch: 0.001250 → 0.000000.</w:t>
       </w:r>
     </w:p>
     <w:p>
@@ -4028,25 +4067,25 @@
         <w:pStyle w:val="FirstParagraph"/>
       </w:pPr>
       <w:r>
-        <w:t xml:space="preserve">Абсолютное снижение CER составляет 0.006092. Это умеренное улучшение: модель действительно приближает предсказания к эталонной строке на уровне символов, но не решает задачу полностью. Заметнее выглядит снижение WER: разница составляет 0.150466, то есть модель заметно чаще восстанавливает структуру слов или делает строку ближе к эталону на word-level.</w:t>
-      </w:r>
-    </w:p>
-    <w:p>
-      <w:pPr>
-        <w:pStyle w:val="BodyText"/>
-      </w:pPr>
-      <w:r>
-        <w:t xml:space="preserve">Такой результат согласуется с основной гипотезой пилота: byte-level sequence-to-sequence модель может быть полезна для post-correction арабографичного тюркского текста. Однако улучшение по CER остаётся достаточно небольшим, поэтому вывод следует считать не финальным доказательством качества модели, а подтверждением работоспособности выбранного направления в controlled synthetic setting.</w:t>
-      </w:r>
-    </w:p>
-    <w:bookmarkEnd w:id="55"/>
-    <w:bookmarkStart w:id="56" w:name="rule-based-normalizer"/>
+        <w:t xml:space="preserve">Это означает, что выбранные правила добавляют больше ошибок, чем исправляют. Для исторического тюркского материала в арабской графике такой результат ожидаемо важен: графическая унификация может удалить технический шум, но одновременно стереть значимые орфографические различия или заменить допустимую историческую форму на неподходящую.</w:t>
+      </w:r>
+    </w:p>
+    <w:p>
+      <w:pPr>
+        <w:pStyle w:val="BodyText"/>
+      </w:pPr>
+      <w:r>
+        <w:t xml:space="preserve">Следовательно, rule-based normalization нельзя использовать как автоматический предварительный шаг без отдельной проверки. В рамках данного эксперимента первая гипотеза получает предварительное подтверждение: naive rule-based normalization ухудшает качество текста относительно identity baseline.</w:t>
+      </w:r>
+    </w:p>
+    <w:bookmarkEnd w:id="56"/>
+    <w:bookmarkStart w:id="57" w:name="X3cc67115ed6e691c31a87b68b1f212ad315ce11"/>
     <w:p>
       <w:pPr>
         <w:pStyle w:val="Heading3"/>
       </w:pPr>
       <w:r>
-        <w:t xml:space="preserve">5.4 Rule-based normalizer</w:t>
+        <w:t xml:space="preserve">5.5 Train-derived character-confusion baseline</w:t>
       </w:r>
     </w:p>
     <w:p>
@@ -4054,15 +4093,15 @@
         <w:pStyle w:val="FirstParagraph"/>
       </w:pPr>
       <w:r>
-        <w:t xml:space="preserve">Rule-based normalizer выступает отрицательным контрольным сравнением. Он показывает, что простая символьная нормализация не обязательно улучшает исторический арабографичный текст и может быть хуже, чем отсутствие исправления.</w:t>
-      </w:r>
-    </w:p>
-    <w:p>
-      <w:pPr>
-        <w:pStyle w:val="BodyText"/>
-      </w:pPr>
-      <w:r>
-        <w:t xml:space="preserve">По сравнению с identity baseline normalizer ухудшает все метрики:</w:t>
+        <w:t xml:space="preserve">Train-derived char-confusion baseline выступает дополнительным data-driven non-neural сравнением. Он показывает, можно ли заметно улучшить качество за счёт устойчивых символьных соответствий, извлечённых из обучающих noisy-clean пар, без нейросетевого моделирования контекста.</w:t>
+      </w:r>
+    </w:p>
+    <w:p>
+      <w:pPr>
+        <w:pStyle w:val="BodyText"/>
+      </w:pPr>
+      <w:r>
+        <w:t xml:space="preserve">По сравнению с identity baseline этот baseline немного снижает CER:</w:t>
       </w:r>
     </w:p>
     <w:p>
@@ -4074,7 +4113,7 @@
         </w:numPr>
       </w:pPr>
       <w:r>
-        <w:t xml:space="preserve">CER: 0.086005 → 0.151932;</w:t>
+        <w:t xml:space="preserve">CER: 0.086005 → 0.082520;</w:t>
       </w:r>
     </w:p>
     <w:p>
@@ -4086,7 +4125,7 @@
         </w:numPr>
       </w:pPr>
       <w:r>
-        <w:t xml:space="preserve">WER: 0.519006 → 0.684408;</w:t>
+        <w:t xml:space="preserve">WER: 0.519006 → 0.506189;</w:t>
       </w:r>
     </w:p>
     <w:p>
@@ -4095,84 +4134,6 @@
         <w:numPr>
           <w:ilvl w:val="0"/>
           <w:numId w:val="1005"/>
-        </w:numPr>
-      </w:pPr>
-      <w:r>
-        <w:t xml:space="preserve">ExactMatch: 0.001250 → 0.000000.</w:t>
-      </w:r>
-    </w:p>
-    <w:p>
-      <w:pPr>
-        <w:pStyle w:val="FirstParagraph"/>
-      </w:pPr>
-      <w:r>
-        <w:t xml:space="preserve">Это означает, что выбранные правила добавляют больше ошибок, чем исправляют. Для исторического тюркского материала в арабской графике такой результат ожидаемо важен: графическая унификация может удалить технический шум, но одновременно стереть значимые орфографические различия или заменить допустимую историческую форму на неподходящую.</w:t>
-      </w:r>
-    </w:p>
-    <w:p>
-      <w:pPr>
-        <w:pStyle w:val="BodyText"/>
-      </w:pPr>
-      <w:r>
-        <w:t xml:space="preserve">Следовательно, rule-based normalization нельзя использовать как автоматический предварительный шаг без отдельной проверки. В рамках данного эксперимента первая гипотеза получает предварительное подтверждение: naive rule-based normalization ухудшает качество текста относительно identity baseline.</w:t>
-      </w:r>
-    </w:p>
-    <w:bookmarkEnd w:id="56"/>
-    <w:bookmarkStart w:id="57" w:name="X3cc67115ed6e691c31a87b68b1f212ad315ce11"/>
-    <w:p>
-      <w:pPr>
-        <w:pStyle w:val="Heading3"/>
-      </w:pPr>
-      <w:r>
-        <w:t xml:space="preserve">5.5 Train-derived character-confusion baseline</w:t>
-      </w:r>
-    </w:p>
-    <w:p>
-      <w:pPr>
-        <w:pStyle w:val="FirstParagraph"/>
-      </w:pPr>
-      <w:r>
-        <w:t xml:space="preserve">Train-derived char-confusion baseline выступает дополнительным data-driven non-neural сравнением. Он показывает, можно ли заметно улучшить качество за счёт устойчивых символьных соответствий, извлечённых из обучающих noisy-clean пар, без нейросетевого моделирования контекста.</w:t>
-      </w:r>
-    </w:p>
-    <w:p>
-      <w:pPr>
-        <w:pStyle w:val="BodyText"/>
-      </w:pPr>
-      <w:r>
-        <w:t xml:space="preserve">По сравнению с identity baseline этот baseline немного снижает CER:</w:t>
-      </w:r>
-    </w:p>
-    <w:p>
-      <w:pPr>
-        <w:pStyle w:val="Compact"/>
-        <w:numPr>
-          <w:ilvl w:val="0"/>
-          <w:numId w:val="1006"/>
-        </w:numPr>
-      </w:pPr>
-      <w:r>
-        <w:t xml:space="preserve">CER: 0.086005 → 0.082520;</w:t>
-      </w:r>
-    </w:p>
-    <w:p>
-      <w:pPr>
-        <w:pStyle w:val="Compact"/>
-        <w:numPr>
-          <w:ilvl w:val="0"/>
-          <w:numId w:val="1006"/>
-        </w:numPr>
-      </w:pPr>
-      <w:r>
-        <w:t xml:space="preserve">WER: 0.519006 → 0.506189;</w:t>
-      </w:r>
-    </w:p>
-    <w:p>
-      <w:pPr>
-        <w:pStyle w:val="Compact"/>
-        <w:numPr>
-          <w:ilvl w:val="0"/>
-          <w:numId w:val="1006"/>
         </w:numPr>
       </w:pPr>
       <w:r>
@@ -4548,11 +4509,157 @@
         <w:pStyle w:val="Compact"/>
         <w:numPr>
           <w:ilvl w:val="0"/>
-          <w:numId w:val="1007"/>
+          <w:numId w:val="1006"/>
         </w:numPr>
       </w:pPr>
       <w:r>
         <w:t xml:space="preserve">CER improvement: 0.006092;</w:t>
+      </w:r>
+    </w:p>
+    <w:p>
+      <w:pPr>
+        <w:pStyle w:val="Compact"/>
+        <w:numPr>
+          <w:ilvl w:val="0"/>
+          <w:numId w:val="1006"/>
+        </w:numPr>
+      </w:pPr>
+      <w:r>
+        <w:t xml:space="preserve">WER improvement: 0.150467.</w:t>
+      </w:r>
+    </w:p>
+    <w:p>
+      <w:pPr>
+        <w:pStyle w:val="FirstParagraph"/>
+      </w:pPr>
+      <w:r>
+        <w:t xml:space="preserve">Эти значения согласуются с итоговыми агрегированными метриками: средний выигрыш по CER остаётся умеренным, а по WER — заметно более выраженным. Иными словами, модель чаще приносит практическую пользу на уровне слов, чем полностью исправляет строку на уровне каждого символа.</w:t>
+      </w:r>
+    </w:p>
+    <w:p>
+      <w:pPr>
+        <w:pStyle w:val="BodyText"/>
+      </w:pPr>
+      <w:r>
+        <w:t xml:space="preserve">Среднее улучшение полезно как количественное резюме, но его недостаточно для окончательной оценки качества. Поэтому оно рассматривается вместе с распределением improved/unchanged/worse и качественным анализом лучших и худших примеров.</w:t>
+      </w:r>
+    </w:p>
+    <w:bookmarkEnd w:id="61"/>
+    <w:bookmarkStart w:id="62" w:name="интерпретация-результатов"/>
+    <w:p>
+      <w:pPr>
+        <w:pStyle w:val="Heading3"/>
+      </w:pPr>
+      <w:r>
+        <w:t xml:space="preserve">5.10 Интерпретация результатов</w:t>
+      </w:r>
+    </w:p>
+    <w:p>
+      <w:pPr>
+        <w:pStyle w:val="FirstParagraph"/>
+      </w:pPr>
+      <w:r>
+        <w:t xml:space="preserve">Полученные результаты дают три основных вывода. Первый вывод — отрицательный, но методологически важный: rule-based normalizer ухудшает качество относительно identity baseline. Это означает, что для исторического арабографичного тюркского текста простая символьная нормализация не является заведомо безопасной предобработкой.</w:t>
+      </w:r>
+    </w:p>
+    <w:p>
+      <w:pPr>
+        <w:pStyle w:val="BodyText"/>
+      </w:pPr>
+      <w:r>
+        <w:t xml:space="preserve">Второй вывод — положительный: ByT5-small 512 улучшает качество относительно identity baseline и показывает лучший результат среди четырёх рассмотренных методов. Улучшение по CER умеренное, но улучшение по WER заметное, а анализ отдельных примеров показывает, что модель улучшает большинство тестовых строк. При этом сильное снижение WER требует осторожной интерпретации, поскольку часть эффекта может быть связана с исправлением синтетических ошибок пробелов и границ слов. Следовательно, byte-level sequence-to-sequence подход является работоспособным направлением для пилотной посткоррекции, но не финальным доказательством качества на реальных OCR/HTR-выходах.</w:t>
+      </w:r>
+    </w:p>
+    <w:p>
+      <w:pPr>
+        <w:pStyle w:val="BodyText"/>
+      </w:pPr>
+      <w:r>
+        <w:t xml:space="preserve">Третий вывод касается настройки модели: max length является важным параметром для byte-level обработки арабографичного текста. Конфигурация 512 в текущем эксперименте выглядит более устойчивой, чем более короткая конфигурация, но этот результат следует считать практическим сигналом, а не универсальным правилом.</w:t>
+      </w:r>
+    </w:p>
+    <w:p>
+      <w:pPr>
+        <w:pStyle w:val="BodyText"/>
+      </w:pPr>
+      <w:r>
+        <w:t xml:space="preserve">Наконец, низкий ExactMatch не противоречит положительным результатам по CER и WER. Для длинных исторических строк полное совпадение слишком строго: одна небольшая ошибка уже делает строку несовпадающей. Поэтому основные выводы в работе опираются на CER, WER и анализ improved/unchanged/worse.</w:t>
+      </w:r>
+    </w:p>
+    <w:bookmarkEnd w:id="62"/>
+    <w:bookmarkStart w:id="63" w:name="ограничения-интерпретации"/>
+    <w:p>
+      <w:pPr>
+        <w:pStyle w:val="Heading3"/>
+      </w:pPr>
+      <w:r>
+        <w:t xml:space="preserve">5.11 Ограничения интерпретации</w:t>
+      </w:r>
+    </w:p>
+    <w:p>
+      <w:pPr>
+        <w:pStyle w:val="FirstParagraph"/>
+      </w:pPr>
+      <w:r>
+        <w:t xml:space="preserve">Результаты раздела 5 следует понимать как пилотные. Они показывают, что выбранный pipeline работает на текущем корпусе и синтетическом шуме, но не доказывают качество модели на реальных OCR/HTR-выходах.</w:t>
+      </w:r>
+    </w:p>
+    <w:p>
+      <w:pPr>
+        <w:pStyle w:val="BodyText"/>
+      </w:pPr>
+      <w:r>
+        <w:t xml:space="preserve">Главные ограничения интерпретации связаны с данными: корпус мал, основан на одном источнике, а ошибки сгенерированы искусственно. Поэтому значения CER и WER нельзя напрямую переносить на другие жанры, периоды, шрифты, сканы или OCR-системы без дополнительной проверки.</w:t>
+      </w:r>
+    </w:p>
+    <w:p>
+      <w:pPr>
+        <w:pStyle w:val="BodyText"/>
+      </w:pPr>
+      <w:r>
+        <w:t xml:space="preserve">Отдельное ограничение связано с метриками. CER и WER измеряют формальную близость к эталону, но не полностью отражают историко-лингвистическую допустимость исправления. Для дальнейшей работы нужен вручную проверенный subset, где ошибки модели будут оцениваться не только автоматически, но и экспертно.</w:t>
+      </w:r>
+    </w:p>
+    <w:bookmarkEnd w:id="63"/>
+    <w:bookmarkStart w:id="64" w:name="X8453319e135c2b3f15a944d42597c28ff8c6fe3"/>
+    <w:p>
+      <w:pPr>
+        <w:pStyle w:val="Heading3"/>
+      </w:pPr>
+      <w:r>
+        <w:t xml:space="preserve">5.12 Проверка переноса на page-level real-OCR benchmark</w:t>
+      </w:r>
+    </w:p>
+    <w:p>
+      <w:pPr>
+        <w:pStyle w:val="FirstParagraph"/>
+      </w:pPr>
+      <w:r>
+        <w:t xml:space="preserve">После основной оценки на synthetic benchmark была проведена отдельная проверка на реальном OCR-выводе. Она нужна для того, чтобы не смешивать два разных результата: качество модели на контролируемом синтетическом шуме и её поведение на настоящем OCR, где ошибки появляются из-за скана, шрифта, сегментации страницы и работы конкретной OCR-системы.</w:t>
+      </w:r>
+    </w:p>
+    <w:p>
+      <w:pPr>
+        <w:pStyle w:val="BodyText"/>
+      </w:pPr>
+      <w:r>
+        <w:t xml:space="preserve">Для проверки использован османско-турецкий печатный источник в арабской графике. Этот материал рассматривается как связанный арабографичный тюркский test case. Он не является старотатарским или старобашкирским датасетом: татарские и башкирские источники остаются целевой мотивацией и направлением дальнейшего расширения, а текущий real-OCR benchmark нужен для первичной проверки synthetic-to-real transfer.</w:t>
+      </w:r>
+    </w:p>
+    <w:p>
+      <w:pPr>
+        <w:pStyle w:val="BodyText"/>
+      </w:pPr>
+      <w:r>
+        <w:t xml:space="preserve">Локальный набор содержит 72 страницы. Для оценки были оставлены 68 страниц, где есть непустой OCR-вывод и достаточно длинная page-level транскрипция. В отфильтрованной части содержится 90 457 символов clean/reference text и 81 593 символа OCR text. Сырые PDF, изображения страниц, OCR-выводы, gold text и predictions в репозитории не распространяются; в Git сохранены только скрипты и агрегированные таблицы.</w:t>
+      </w:r>
+    </w:p>
+    <w:p>
+      <w:pPr>
+        <w:pStyle w:val="BodyText"/>
+      </w:pPr>
+      <w:r>
+        <w:t xml:space="preserve">В эксперименте сравнивались три варианта:</w:t>
       </w:r>
     </w:p>
     <w:p>
@@ -4564,141 +4671,7 @@
         </w:numPr>
       </w:pPr>
       <w:r>
-        <w:t xml:space="preserve">WER improvement: 0.150467.</w:t>
-      </w:r>
-    </w:p>
-    <w:p>
-      <w:pPr>
-        <w:pStyle w:val="FirstParagraph"/>
-      </w:pPr>
-      <w:r>
-        <w:t xml:space="preserve">Эти значения согласуются с итоговыми агрегированными метриками: средний выигрыш по CER остаётся умеренным, а по WER — заметно более выраженным. Иными словами, модель чаще приносит практическую пользу на уровне слов, чем полностью исправляет строку на уровне каждого символа.</w:t>
-      </w:r>
-    </w:p>
-    <w:p>
-      <w:pPr>
-        <w:pStyle w:val="BodyText"/>
-      </w:pPr>
-      <w:r>
-        <w:t xml:space="preserve">Среднее улучшение полезно как количественное резюме, но его недостаточно для окончательной оценки качества. Поэтому оно рассматривается вместе с распределением improved/unchanged/worse и качественным анализом лучших и худших примеров.</w:t>
-      </w:r>
-    </w:p>
-    <w:bookmarkEnd w:id="61"/>
-    <w:bookmarkStart w:id="62" w:name="интерпретация-результатов"/>
-    <w:p>
-      <w:pPr>
-        <w:pStyle w:val="Heading3"/>
-      </w:pPr>
-      <w:r>
-        <w:t xml:space="preserve">5.10 Интерпретация результатов</w:t>
-      </w:r>
-    </w:p>
-    <w:p>
-      <w:pPr>
-        <w:pStyle w:val="FirstParagraph"/>
-      </w:pPr>
-      <w:r>
-        <w:t xml:space="preserve">Полученные результаты дают три основных вывода. Первый вывод — отрицательный, но методологически важный: rule-based normalizer ухудшает качество относительно identity baseline. Это означает, что для исторического арабографичного тюркского текста простая символьная нормализация не является заведомо безопасной предобработкой.</w:t>
-      </w:r>
-    </w:p>
-    <w:p>
-      <w:pPr>
-        <w:pStyle w:val="BodyText"/>
-      </w:pPr>
-      <w:r>
-        <w:t xml:space="preserve">Второй вывод — положительный: ByT5-small 512 улучшает качество относительно identity baseline и показывает лучший результат среди четырёх рассмотренных методов. Улучшение по CER умеренное, но улучшение по WER заметное, а анализ отдельных примеров показывает, что модель улучшает большинство тестовых строк. При этом сильное снижение WER требует осторожной интерпретации, поскольку часть эффекта может быть связана с исправлением синтетических ошибок пробелов и границ слов. Следовательно, byte-level sequence-to-sequence подход является работоспособным направлением для пилотной посткоррекции, но не финальным доказательством качества на реальных OCR/HTR-выходах.</w:t>
-      </w:r>
-    </w:p>
-    <w:p>
-      <w:pPr>
-        <w:pStyle w:val="BodyText"/>
-      </w:pPr>
-      <w:r>
-        <w:t xml:space="preserve">Третий вывод касается настройки модели: max length является важным параметром для byte-level обработки арабографичного текста. Конфигурация 512 в текущем эксперименте выглядит более устойчивой, чем более короткая конфигурация, но этот результат следует считать практическим сигналом, а не универсальным правилом.</w:t>
-      </w:r>
-    </w:p>
-    <w:p>
-      <w:pPr>
-        <w:pStyle w:val="BodyText"/>
-      </w:pPr>
-      <w:r>
-        <w:t xml:space="preserve">Наконец, низкий ExactMatch не противоречит положительным результатам по CER и WER. Для длинных исторических строк полное совпадение слишком строго: одна небольшая ошибка уже делает строку несовпадающей. Поэтому основные выводы в работе опираются на CER, WER и анализ improved/unchanged/worse.</w:t>
-      </w:r>
-    </w:p>
-    <w:bookmarkEnd w:id="62"/>
-    <w:bookmarkStart w:id="63" w:name="ограничения-интерпретации"/>
-    <w:p>
-      <w:pPr>
-        <w:pStyle w:val="Heading3"/>
-      </w:pPr>
-      <w:r>
-        <w:t xml:space="preserve">5.11 Ограничения интерпретации</w:t>
-      </w:r>
-    </w:p>
-    <w:p>
-      <w:pPr>
-        <w:pStyle w:val="FirstParagraph"/>
-      </w:pPr>
-      <w:r>
-        <w:t xml:space="preserve">Результаты раздела 5 следует понимать как пилотные. Они показывают, что выбранный pipeline работает на текущем корпусе и синтетическом шуме, но не доказывают качество модели на реальных OCR/HTR-выходах.</w:t>
-      </w:r>
-    </w:p>
-    <w:p>
-      <w:pPr>
-        <w:pStyle w:val="BodyText"/>
-      </w:pPr>
-      <w:r>
-        <w:t xml:space="preserve">Главные ограничения интерпретации связаны с данными: корпус мал, основан на одном источнике, а ошибки сгенерированы искусственно. Поэтому значения CER и WER нельзя напрямую переносить на другие жанры, периоды, шрифты, сканы или OCR-системы без дополнительной проверки.</w:t>
-      </w:r>
-    </w:p>
-    <w:p>
-      <w:pPr>
-        <w:pStyle w:val="BodyText"/>
-      </w:pPr>
-      <w:r>
-        <w:t xml:space="preserve">Отдельное ограничение связано с метриками. CER и WER измеряют формальную близость к эталону, но не полностью отражают историко-лингвистическую допустимость исправления. Для дальнейшей работы нужен вручную проверенный subset, где ошибки модели будут оцениваться не только автоматически, но и экспертно.</w:t>
-      </w:r>
-    </w:p>
-    <w:bookmarkEnd w:id="63"/>
-    <w:bookmarkStart w:id="64" w:name="X8453319e135c2b3f15a944d42597c28ff8c6fe3"/>
-    <w:p>
-      <w:pPr>
-        <w:pStyle w:val="Heading3"/>
-      </w:pPr>
-      <w:r>
-        <w:t xml:space="preserve">5.12 Проверка переноса на page-level real-OCR benchmark</w:t>
-      </w:r>
-    </w:p>
-    <w:p>
-      <w:pPr>
-        <w:pStyle w:val="FirstParagraph"/>
-      </w:pPr>
-      <w:r>
-        <w:t xml:space="preserve">После основной оценки на synthetic benchmark была проведена отдельная проверка на реальном OCR-выводе. Она нужна для того, чтобы не смешивать два разных результата: качество модели на контролируемом синтетическом шуме и её поведение на настоящем OCR, где ошибки появляются из-за скана, шрифта, сегментации страницы и работы конкретной OCR-системы.</w:t>
-      </w:r>
-    </w:p>
-    <w:p>
-      <w:pPr>
-        <w:pStyle w:val="BodyText"/>
-      </w:pPr>
-      <w:r>
-        <w:t xml:space="preserve">Для проверки использован османско-турецкий печатный источник в арабской графике. Этот материал рассматривается как связанный арабографичный тюркский test case. Он не является старотатарским или старобашкирским датасетом: татарские и башкирские источники остаются целевой мотивацией и направлением дальнейшего расширения, а текущий real-OCR benchmark нужен для первичной проверки synthetic-to-real transfer.</w:t>
-      </w:r>
-    </w:p>
-    <w:p>
-      <w:pPr>
-        <w:pStyle w:val="BodyText"/>
-      </w:pPr>
-      <w:r>
-        <w:t xml:space="preserve">Локальный набор содержит 72 страницы. Для оценки были оставлены 68 страниц, где есть непустой OCR-вывод и достаточно длинная page-level транскрипция. В отфильтрованной части содержится 90 457 символов clean/reference text и 81 593 символа OCR text. Сырые PDF, изображения страниц, OCR-выводы, gold text и predictions в репозитории не распространяются; в Git сохранены только скрипты и агрегированные таблицы.</w:t>
-      </w:r>
-    </w:p>
-    <w:p>
-      <w:pPr>
-        <w:pStyle w:val="BodyText"/>
-      </w:pPr>
-      <w:r>
-        <w:t xml:space="preserve">В эксперименте сравнивались три варианта:</w:t>
+        <w:t xml:space="preserve">raw Tesseract OCR как исходный уровень;</w:t>
       </w:r>
     </w:p>
     <w:p>
@@ -4706,11 +4679,11 @@
         <w:pStyle w:val="Compact"/>
         <w:numPr>
           <w:ilvl w:val="0"/>
-          <w:numId w:val="1008"/>
+          <w:numId w:val="1007"/>
         </w:numPr>
       </w:pPr>
       <w:r>
-        <w:t xml:space="preserve">raw Tesseract OCR как исходный уровень;</w:t>
+        <w:t xml:space="preserve">ByT5-small, обученная на синтетическом шуме и применённая к page-level OCR через разбиение на чанки;</w:t>
       </w:r>
     </w:p>
     <w:p>
@@ -4718,19 +4691,7 @@
         <w:pStyle w:val="Compact"/>
         <w:numPr>
           <w:ilvl w:val="0"/>
-          <w:numId w:val="1008"/>
-        </w:numPr>
-      </w:pPr>
-      <w:r>
-        <w:t xml:space="preserve">ByT5-small, обученная на синтетическом шуме и применённая к page-level OCR через разбиение на чанки;</w:t>
-      </w:r>
-    </w:p>
-    <w:p>
-      <w:pPr>
-        <w:pStyle w:val="Compact"/>
-        <w:numPr>
-          <w:ilvl w:val="0"/>
-          <w:numId w:val="1008"/>
+          <w:numId w:val="1007"/>
         </w:numPr>
       </w:pPr>
       <w:r>
@@ -5351,15 +5312,23 @@
         <w:pStyle w:val="FirstParagraph"/>
       </w:pPr>
       <w:r>
-        <w:t xml:space="preserve">Первое ограничение связано с масштабом и составом корпуса. В текущей версии используется 400 чистых текстовых блоков из одного основного источника. Этого достаточно для проверки pipeline посткоррекции, но недостаточно для вывода о качестве метода на всём классе исторических арабографичных тюркских текстов.</w:t>
-      </w:r>
-    </w:p>
-    <w:p>
-      <w:pPr>
-        <w:pStyle w:val="BodyText"/>
-      </w:pPr>
-      <w:r>
-        <w:t xml:space="preserve">Один источник ограничивает жанровое, временное и орфографическое разнообразие материала. Тексты разных регионов, периодов и письменных традиций могут отличаться по графике, лексике, нормам записи и качеству исходного документа. Поэтому дальнейшая работа должна проверять модель не только на текущем османско-тюркском источнике, но и на других арабографичных тюркских материалах.</w:t>
+        <w:t xml:space="preserve">Главное ограничение корпуса — его масштаб и состав. В текущей версии используется небольшой набор clean text blocks, полученный из одного основного арабографичного тюркского источника. Этого достаточно для проверки pipeline и первичного сравнения baseline-подходов, но недостаточно для вывода о качестве метода на всём классе исторических тюркских текстов в арабской графике.</w:t>
+      </w:r>
+    </w:p>
+    <w:p>
+      <w:pPr>
+        <w:pStyle w:val="BodyText"/>
+      </w:pPr>
+      <w:r>
+        <w:t xml:space="preserve">Один источник ограничивает жанровое, временное и орфографическое разнообразие материала. Тексты разных регионов и периодов могут отличаться по графике, лексике, нормам записи, качеству печати и состоянию сканов. Поэтому текущий корпус нужно рассматривать как pilot dataset, а не как представительный корпус для всей письменной традиции.</w:t>
+      </w:r>
+    </w:p>
+    <w:p>
+      <w:pPr>
+        <w:pStyle w:val="BodyText"/>
+      </w:pPr>
+      <w:r>
+        <w:t xml:space="preserve">Отдельное ограничение связано с тем, что старотатарские и старобашкирские материалы пока остаются мотивацией и будущей целью, а не основным real benchmark. Текущий real-OCR sanity benchmark построен на османско-турецком печатном источнике, который подходит как связанный арабографичный тюркский test case, но не заменяет проверку на целевых татарских и башкирских источниках.</w:t>
       </w:r>
     </w:p>
     <w:bookmarkEnd w:id="67"/>
@@ -5377,7 +5346,23 @@
         <w:pStyle w:val="FirstParagraph"/>
       </w:pPr>
       <w:r>
-        <w:t xml:space="preserve">Второе ограничение связано с природой ошибок. В текущем эксперименте исходные строки искажаются синтетическим noise generator, а не получаются из реального OCR/HTR-вывода. Такой подход удобен для пилотного этапа: он позволяет быстро получить пары</w:t>
+        <w:t xml:space="preserve">В synthetic benchmark clean строки искажаются controlled noise generator. Такая постановка удобна для первого эксперимента: известен clean reference, можно воспроизвести train/validation/test split и сравнить методы по одинаковым метрикам. Но synthetic noise остаётся приближением, а не настоящим OCR-output.</w:t>
+      </w:r>
+    </w:p>
+    <w:p>
+      <w:pPr>
+        <w:pStyle w:val="BodyText"/>
+      </w:pPr>
+      <w:r>
+        <w:t xml:space="preserve">Реальные OCR-ошибки зависят от качества изображения, шрифта, сегментации страницы, направления письма, настроек OCR engine и состояния документа. Page-level проверка на османско-турецком источнике показала это напрямую: модель, обученная только на synthetic noise, улучшает synthetic benchmark, но не переносится надёжно на raw Tesseract OCR. Она немного снижает WER, но ухудшает CER и NoSpaceCER относительно исходного OCR.</w:t>
+      </w:r>
+    </w:p>
+    <w:p>
+      <w:pPr>
+        <w:pStyle w:val="BodyText"/>
+      </w:pPr>
+      <w:r>
+        <w:t xml:space="preserve">Поэтому дальнейшая работа не должна ограничиваться усложнением synthetic generator. Более важный следующий шаг — построить real-error-aware dataset: выровненные пары</w:t>
       </w:r>
       <w:r>
         <w:t xml:space="preserve"> </w:t>
@@ -5386,18 +5371,13 @@
         <w:rPr>
           <w:rStyle w:val="VerbatimChar"/>
         </w:rPr>
-        <w:t xml:space="preserve">noisy → clean</w:t>
-      </w:r>
-      <w:r>
-        <w:t xml:space="preserve">, контролировать типы ошибок и воспроизводить датасет.</w:t>
-      </w:r>
-    </w:p>
-    <w:p>
-      <w:pPr>
-        <w:pStyle w:val="BodyText"/>
-      </w:pPr>
-      <w:r>
-        <w:t xml:space="preserve">Однако реальные OCR/HTR-ошибки зависят от качества изображения, шрифта, сегментации страницы, модели распознавания и состояния документа. Синтетический шум может приближать часть таких ошибок, но не гарантирует совпадения с практическим сценарием. Page-level проверка на османско-турецком источнике это подтвердила: synthetic-trained ByT5 немного снизила WER, но ухудшила CER и NoSpaceCER. Поэтому следующий этап должен строиться вокруг real-domain adaptation, а не вокруг усложнения одного только synthetic noise generator.</w:t>
+        <w:t xml:space="preserve">OCR output → clean reference</w:t>
+      </w:r>
+      <w:r>
+        <w:t xml:space="preserve"> </w:t>
+      </w:r>
+      <w:r>
+        <w:t xml:space="preserve">на уровне строк или коротких chunks. Уже после этого можно делать более реалистичную генерацию шума, основанную на настоящих character confusions и layout artifacts.</w:t>
       </w:r>
     </w:p>
     <w:bookmarkEnd w:id="68"/>
@@ -5415,25 +5395,33 @@
         <w:pStyle w:val="FirstParagraph"/>
       </w:pPr>
       <w:r>
-        <w:t xml:space="preserve">Третье ограничение связано с оценкой качества. CER, WER, NoSpaceCER и ExactMatch позволяют формально сравнивать методы, но они не полностью описывают качество исправления исторического текста. Для таких материалов важно не только совпадение с эталоном, но и сохранение исторически значимых орфографических вариантов.</w:t>
-      </w:r>
-    </w:p>
-    <w:p>
-      <w:pPr>
-        <w:pStyle w:val="BodyText"/>
-      </w:pPr>
-      <w:r>
-        <w:t xml:space="preserve">Модель может уменьшить edit distance, но внести лингвистически сомнительное исправление. Возможна и обратная ситуация: небольшое отличие от эталона может быть допустимым вариантом исторической записи. Поэтому автоматические метрики нужно дополнять ручной экспертной оценкой. В будущей версии работы стоит выделить небольшой manually validated subset и анализировать ошибки не только количественно, но и лингвистически.</w:t>
+        <w:t xml:space="preserve">CER, WER, NoSpaceCER и ExactMatch позволяют формально сравнивать методы, но они не полностью описывают качество исправления исторического текста. Для исторических арабографичных материалов важно не только совпадение с reference, но и сохранение значимых орфографических вариантов. Механическое улучшение edit distance не всегда означает филологически корректное исправление.</w:t>
+      </w:r>
+    </w:p>
+    <w:p>
+      <w:pPr>
+        <w:pStyle w:val="BodyText"/>
+      </w:pPr>
+      <w:r>
+        <w:t xml:space="preserve">Особенно осторожно нужно интерпретировать WER. В synthetic benchmark заметная часть выигрыша связана с исправлением пробелов и границ слов. Это полезно для поиска и последующей обработки, но не доказывает, что модель лучше распознаёт графемы. Поэтому в работе отдельно используется NoSpaceCER: он снижает влияние пробелов и помогает увидеть, насколько модель улучшает именно символный состав текста.</w:t>
+      </w:r>
+    </w:p>
+    <w:p>
+      <w:pPr>
+        <w:pStyle w:val="BodyText"/>
+      </w:pPr>
+      <w:r>
+        <w:t xml:space="preserve">Для следующей версии benchmark нужна ручная экспертная проверка небольшого subset. Такой subset должен фиксировать не только “правильно/неправильно”, но и тип ошибки: графема, пробел, пропуск, лишняя вставка, нормализация исторического написания, hallucination-like generation. Это позволит связать количественные метрики с реальным качеством текста.</w:t>
       </w:r>
     </w:p>
     <w:bookmarkEnd w:id="69"/>
-    <w:bookmarkStart w:id="70" w:name="направления-расширения-корпуса"/>
+    <w:bookmarkStart w:id="70" w:name="расширение-корпуса-и-real-ocr-benchmark"/>
     <w:p>
       <w:pPr>
         <w:pStyle w:val="Heading3"/>
       </w:pPr>
       <w:r>
-        <w:t xml:space="preserve">6.4 Направления расширения корпуса</w:t>
+        <w:t xml:space="preserve">6.4 Расширение корпуса и real-OCR benchmark</w:t>
       </w:r>
     </w:p>
     <w:p>
@@ -5441,15 +5429,35 @@
         <w:pStyle w:val="FirstParagraph"/>
       </w:pPr>
       <w:r>
-        <w:t xml:space="preserve">Первое направление дальнейшей работы — расширение корпуса. Нужно добавить тексты разных периодов, жанров и региональных традиций арабографичной тюркской письменности. Это позволит проверить, сохраняется ли качество post-correction за пределами одного османско-тюркского источника.</w:t>
-      </w:r>
-    </w:p>
-    <w:p>
-      <w:pPr>
-        <w:pStyle w:val="BodyText"/>
-      </w:pPr>
-      <w:r>
-        <w:t xml:space="preserve">Особенно важно перейти от чистых текстовых блоков к связке «изображение → OCR/HTR-вывод → чистый текст». В текущей работе уже сделан первый page-level sanity benchmark на османско-турецком источнике, но для обучения модели этого недостаточно: нужны выровненные OCR/reference-фрагменты, желательно на уровне строк или коротких чанков, и разбиение по страницам без утечки между train, validation и test.</w:t>
+        <w:t xml:space="preserve">Первое направление дальнейшей работы — расширение данных. Для будущей магистерской версии проекта нужно добавить несколько источников разных типов: османско-турецкие печатные тексты, старотатарские и старобашкирские материалы, а также, по возможности, страницы с разным качеством скана и разной типографикой.</w:t>
+      </w:r>
+    </w:p>
+    <w:p>
+      <w:pPr>
+        <w:pStyle w:val="BodyText"/>
+      </w:pPr>
+      <w:r>
+        <w:t xml:space="preserve">Ключевое изменение должно состоять в переходе от clean text blocks к связке</w:t>
+      </w:r>
+      <w:r>
+        <w:t xml:space="preserve"> </w:t>
+      </w:r>
+      <w:r>
+        <w:rPr>
+          <w:rStyle w:val="VerbatimChar"/>
+        </w:rPr>
+        <w:t xml:space="preserve">image → OCR/HTR output → clean reference</w:t>
+      </w:r>
+      <w:r>
+        <w:t xml:space="preserve">. Текущий page-level real-OCR benchmark полезен как sanity check, но он слишком груб для обучения модели. Нужны выровненные строки или короткие chunks, чтобы модель видела реальные ошибки OCR, а не только искусственно сгенерированные искажения.</w:t>
+      </w:r>
+    </w:p>
+    <w:p>
+      <w:pPr>
+        <w:pStyle w:val="BodyText"/>
+      </w:pPr>
+      <w:r>
+        <w:t xml:space="preserve">Разбиение данных должно выполняться по страницам или источникам, а не случайно по строкам. Это важно для предотвращения утечки: строки с одной и той же страницы или близкого контекста не должны одновременно попадать в train и test. Для маленьких исторических корпусов такая утечка может сильно завышать качество модели.</w:t>
       </w:r>
     </w:p>
     <w:bookmarkEnd w:id="70"/>
@@ -5467,33 +5475,33 @@
         <w:pStyle w:val="FirstParagraph"/>
       </w:pPr>
       <w:r>
-        <w:t xml:space="preserve">Вторая линия развития связана с моделями и параметрами обучения. Текущая работа использует ByT5-small как основной нейросетевой baseline. В дальнейшем стоит сравнить более крупные варианты ByT5, другие sequence-to-sequence модели и специализированные OCR post-correction подходы.</w:t>
-      </w:r>
-    </w:p>
-    <w:p>
-      <w:pPr>
-        <w:pStyle w:val="BodyText"/>
-      </w:pPr>
-      <w:r>
-        <w:t xml:space="preserve">Отдельно стоит проверять и LLM-based post-correction подходы. Современные работы показывают, что для исторических документов такие методы требуют осторожной оценки и не дают гарантированного выигрыша без учёта корпуса, типа ошибок и процедуры валидации (Kanerva et al., 2025).</w:t>
-      </w:r>
-    </w:p>
-    <w:p>
-      <w:pPr>
-        <w:pStyle w:val="BodyText"/>
-      </w:pPr>
-      <w:r>
-        <w:t xml:space="preserve">Также нужно исследовать чувствительность результата к числу эпох, размеру обучающей выборки, максимальной длине последовательности и составу синтетического шума. Это поможет отделить эффект архитектуры от эффекта параметров эксперимента и понять, какие настройки действительно важны для арабографичного тюркского материала.</w:t>
+        <w:t xml:space="preserve">В текущей работе ByT5-small используется как основной neural baseline, а не как финальное решение. Для следующего этапа нужно сравнить несколько направлений: более крупные варианты ByT5, специализированные OCR post-correction модели, character-level seq2seq baselines и методы с консервативным fallback.</w:t>
+      </w:r>
+    </w:p>
+    <w:p>
+      <w:pPr>
+        <w:pStyle w:val="BodyText"/>
+      </w:pPr>
+      <w:r>
+        <w:t xml:space="preserve">Real-OCR результат показывает, что модель должна не только уметь исправлять ошибки, но и понимать, когда лучше оставить исходный OCR без изменений. Поэтому важна отдельная confidence/fallback логика: например, threshold по edit distance, language-model score, изменению длины, доле новых символов или согласованию с train-derived confusion statistics.</w:t>
+      </w:r>
+    </w:p>
+    <w:p>
+      <w:pPr>
+        <w:pStyle w:val="BodyText"/>
+      </w:pPr>
+      <w:r>
+        <w:t xml:space="preserve">LLM-based post-correction также стоит проверять, но не как простой “волшебный” replacement. Современные работы по historical OCR correction показывают, что большие языковые модели могут давать полезные исправления, но эффект зависит от языка, корпуса, prompt setup и процедуры валидации. Для исторического материала особенно опасны fluent but wrong corrections: текст может выглядеть правдоподобно, но отходить от источника.</w:t>
       </w:r>
     </w:p>
     <w:bookmarkEnd w:id="71"/>
-    <w:bookmarkStart w:id="72" w:name="Xe0f4525a4655057f90c3dc6525f7d54178a77a1"/>
+    <w:bookmarkStart w:id="72" w:name="Xd2b3f4092cbe1759952889362a88c4fd5e58c1d"/>
     <w:p>
       <w:pPr>
         <w:pStyle w:val="Heading3"/>
       </w:pPr>
       <w:r>
-        <w:t xml:space="preserve">6.6 Переход к более широкой системе анализа текстов</w:t>
+        <w:t xml:space="preserve">6.6 Переход к системе анализа исторических текстов</w:t>
       </w:r>
     </w:p>
     <w:p>
@@ -5501,23 +5509,23 @@
         <w:pStyle w:val="FirstParagraph"/>
       </w:pPr>
       <w:r>
-        <w:t xml:space="preserve">Посткоррекция является промежуточным этапом, а не конечной целью. После улучшения OCR/HTR-вывода можно переходить к задачам поиска, нормализации вариантов написания, извлечения именованных сущностей, сопоставления исторических записей и построения графов связей.</w:t>
-      </w:r>
-    </w:p>
-    <w:p>
-      <w:pPr>
-        <w:pStyle w:val="BodyText"/>
-      </w:pPr>
-      <w:r>
-        <w:t xml:space="preserve">В контексте будущей выпускной работы этот пилот может стать техническим основанием для системы анализа исторических арабографичных тюркских материалов. Более крупная система может включать OCR/HTR, post-correction, NER, record linkage, извлечение дат и топонимов, а также построение связей между людьми, местами и документами.</w:t>
-      </w:r>
-    </w:p>
-    <w:p>
-      <w:pPr>
-        <w:pStyle w:val="BodyText"/>
-      </w:pPr>
-      <w:r>
-        <w:t xml:space="preserve">Таким образом, текущая работа закрывает не всю задачу цифровой обработки исторических источников, а один необходимый слой будущего pipeline: повышение качества текстового вывода перед последующим историко-лингвистическим анализом.</w:t>
+        <w:t xml:space="preserve">Post-correction является промежуточным этапом. После получения более надёжного OCR/HTR-output можно переходить к задачам поиска, нормализации вариантов написания, извлечения именованных сущностей, сопоставления исторических записей и построения графов связей.</w:t>
+      </w:r>
+    </w:p>
+    <w:p>
+      <w:pPr>
+        <w:pStyle w:val="BodyText"/>
+      </w:pPr>
+      <w:r>
+        <w:t xml:space="preserve">В контексте будущей магистерской работы этот пилот может стать техническим основанием для более широкой системы анализа арабографичных тюркских источников. Такая система может включать line cropping, OCR/HTR, post-correction, NER, record linkage, извлечение дат и топонимов, а также построение связей между людьми, местами и документами.</w:t>
+      </w:r>
+    </w:p>
+    <w:p>
+      <w:pPr>
+        <w:pStyle w:val="BodyText"/>
+      </w:pPr>
+      <w:r>
+        <w:t xml:space="preserve">Практическая ценность текущей работы состоит в том, что она заранее фиксирует слабое место будущего pipeline. До построения NER или графа связей нужно понять, насколько можно доверять тексту после OCR. Если post-correction ухудшает часть страниц, downstream модели будут работать на искажённой основе. Поэтому real-OCR validation должна быть не последним декоративным этапом, а центральной частью разработки.</w:t>
       </w:r>
     </w:p>
     <w:bookmarkEnd w:id="72"/>
@@ -5536,7 +5544,7 @@
         <w:pStyle w:val="FirstParagraph"/>
       </w:pPr>
       <w:r>
-        <w:t xml:space="preserve">В работе был разработан и проверен воспроизводимый пилотный pipeline для OCR post-correction исторических тюркских текстов, записанных арабской графикой. В рамках эксперимента был собран небольшой корпус из 400 чистых текстовых блоков, построен синтетический датасет</w:t>
+        <w:t xml:space="preserve">В работе построен и проверен воспроизводимый pilot pipeline для OCR post-correction исторических тюркских текстов в арабской графике. Экспериментальная постановка была сознательно ограничена: вместо полной OCR/HTR-системы рассматривался этап</w:t>
       </w:r>
       <w:r>
         <w:t xml:space="preserve"> </w:t>
@@ -5545,42 +5553,50 @@
         <w:rPr>
           <w:rStyle w:val="VerbatimChar"/>
         </w:rPr>
-        <w:t xml:space="preserve">noisy → clean</w:t>
-      </w:r>
-      <w:r>
-        <w:t xml:space="preserve">, выполнено train/valid/test-разбиение без утечки исходных строк и реализовано сравнение identity baseline, rule-based normalizer, train-derived character-confusion baseline и ByT5-small.</w:t>
-      </w:r>
-    </w:p>
-    <w:p>
-      <w:pPr>
-        <w:pStyle w:val="BodyText"/>
-      </w:pPr>
-      <w:r>
-        <w:t xml:space="preserve">Главный результат эксперимента состоит в том, что ByT5-small 512 улучшает качество относительно identity baseline в controlled synthetic benchmark, превосходит train-derived char-confusion baseline и даёт положительный эффект на большинстве тестовых строк. При этом эффект неоднороден: WER снижается заметнее, чем CER, ExactMatch остаётся низким, а часть строк после post-correction ухудшается. Поэтому результат показывает работоспособность подхода в синтетической постановке, но не доказывает готовность модели к автоматической правке настоящего OCR.</w:t>
-      </w:r>
-    </w:p>
-    <w:p>
-      <w:pPr>
-        <w:pStyle w:val="BodyText"/>
-      </w:pPr>
-      <w:r>
-        <w:t xml:space="preserve">Отдельно показано, что простая rule-based нормализация не является надёжным решением для исторического арабографичного тюркского материала. В проведённом эксперименте normalizer ухудшил качество относительно identity baseline. Это важный отрицательный результат: историческую орфографию нельзя механически унифицировать без проверки влияния на качество текста.</w:t>
-      </w:r>
-    </w:p>
-    <w:p>
-      <w:pPr>
-        <w:pStyle w:val="BodyText"/>
-      </w:pPr>
-      <w:r>
-        <w:t xml:space="preserve">Полученные результаты имеют пилотный характер. Корпус мал и основан на ограниченном числе источников, а основной benchmark использует синтетические ошибки. Дополнительный page-level real-OCR benchmark на османско-турецком источнике показал смешанный и в целом отрицательный перенос: ByT5 немного снижает WER, но ухудшает CER; strict guard уменьшает ущерб, но не превосходит raw Tesseract по среднему CER. Поэтому выводы нельзя напрямую переносить на широкий класс исторических арабографичных тюркских документов.</w:t>
-      </w:r>
-    </w:p>
-    <w:p>
-      <w:pPr>
-        <w:pStyle w:val="BodyText"/>
-      </w:pPr>
-      <w:r>
-        <w:t xml:space="preserve">Тем не менее работа создаёт техническую основу для дальнейшего исследования. Полученный pipeline можно расширять в сторону полноценной системы обработки исторических документов: от line crops, OCR/HTR и post-correction к поиску, извлечению именованных сущностей, сопоставлению исторических записей и построению графов связей. Ближайший следующий шаг — сделать verified real benchmark с выровненными OCR/reference chunks и дообучить модель на настоящих OCR-ошибках.</w:t>
+        <w:t xml:space="preserve">noisy/OCR text → clean text</w:t>
+      </w:r>
+      <w:r>
+        <w:t xml:space="preserve">. Это позволило отдельно проверить post-correction как компонент будущего pipeline.</w:t>
+      </w:r>
+    </w:p>
+    <w:p>
+      <w:pPr>
+        <w:pStyle w:val="BodyText"/>
+      </w:pPr>
+      <w:r>
+        <w:t xml:space="preserve">На synthetic benchmark модель ByT5-small с максимальной длиной 512 показала лучший результат среди рассмотренных методов. Она превзошла identity baseline, rule-based normalizer и train-derived character-confusion baseline. При этом результат оказался неоднородным: WER снизился заметнее, чем CER, ExactMatch остался низким, а часть строк после post-correction ухудшилась. Поэтому synthetic benchmark подтвердил работоспособность подхода в контролируемой постановке, но не доказал готовность модели к автоматической правке реального OCR.</w:t>
+      </w:r>
+    </w:p>
+    <w:p>
+      <w:pPr>
+        <w:pStyle w:val="BodyText"/>
+      </w:pPr>
+      <w:r>
+        <w:t xml:space="preserve">Отдельно показано, что простая rule-based нормализация не является безопасной заменой нейросетевой посткоррекции. В проведённом эксперименте normalizer ухудшил качество относительно identity baseline. Это важный отрицательный результат: для исторической арабографичной письменности нельзя механически унифицировать символы и варианты написания без проверки влияния на эталонный текст.</w:t>
+      </w:r>
+    </w:p>
+    <w:p>
+      <w:pPr>
+        <w:pStyle w:val="BodyText"/>
+      </w:pPr>
+      <w:r>
+        <w:t xml:space="preserve">Главный итог работы связан с real-OCR проверкой. Page-level benchmark на османско-турецком печатном источнике показал synthetic-to-real gap: модель, обученная только на synthetic noise, немного снижает WER, но ухудшает CER и NoSpaceCER относительно raw Tesseract. Strict guarded variant уменьшает ущерб и даёт больше улучшенных страниц, но всё равно не превосходит raw OCR по среднему CER. Значит, отрицательный real-OCR результат является не провалом, а полезным исследовательским выводом: synthetic-only обучение недостаточно для практической посткоррекции исторических сканов.</w:t>
+      </w:r>
+    </w:p>
+    <w:p>
+      <w:pPr>
+        <w:pStyle w:val="BodyText"/>
+      </w:pPr>
+      <w:r>
+        <w:t xml:space="preserve">Полученный pipeline можно использовать как основу для следующего этапа. Ближайшее развитие должно включать verified real OCR/reference chunks, разбиение по страницам без утечки, обучение на настоящих OCR-ошибках и консервативную фильтрацию предсказаний. После этого посткоррекция сможет стать частью более широкой системы обработки исторических арабографичных тюркских источников: от OCR/HTR и correction к поиску, NER, record linkage и построению графов связей.</w:t>
+      </w:r>
+    </w:p>
+    <w:p>
+      <w:pPr>
+        <w:pStyle w:val="BodyText"/>
+      </w:pPr>
+      <w:r>
+        <w:t xml:space="preserve">Практический результат работы — не готовая универсальная OCR-система, а воспроизводимый baseline, набор метрик, документация ограничений и ясная дорожная карта перехода от synthetic benchmark к real-domain adaptation. Для курсового проекта это достаточный и честный результат; для магистерской работы это отправная точка более крупного исследования.</w:t>
       </w:r>
     </w:p>
     <w:p>
@@ -5603,7 +5619,7 @@
       <w:pPr>
         <w:numPr>
           <w:ilvl w:val="0"/>
-          <w:numId w:val="1009"/>
+          <w:numId w:val="1008"/>
         </w:numPr>
       </w:pPr>
       <w:r>
@@ -5614,7 +5630,7 @@
       <w:pPr>
         <w:numPr>
           <w:ilvl w:val="0"/>
-          <w:numId w:val="1009"/>
+          <w:numId w:val="1008"/>
         </w:numPr>
       </w:pPr>
       <w:r>
@@ -5625,7 +5641,7 @@
       <w:pPr>
         <w:numPr>
           <w:ilvl w:val="0"/>
-          <w:numId w:val="1009"/>
+          <w:numId w:val="1008"/>
         </w:numPr>
       </w:pPr>
       <w:r>
@@ -5636,7 +5652,7 @@
       <w:pPr>
         <w:numPr>
           <w:ilvl w:val="0"/>
-          <w:numId w:val="1009"/>
+          <w:numId w:val="1008"/>
         </w:numPr>
       </w:pPr>
       <w:r>
@@ -5647,7 +5663,7 @@
       <w:pPr>
         <w:numPr>
           <w:ilvl w:val="0"/>
-          <w:numId w:val="1009"/>
+          <w:numId w:val="1008"/>
         </w:numPr>
       </w:pPr>
       <w:r>
@@ -5658,7 +5674,7 @@
       <w:pPr>
         <w:numPr>
           <w:ilvl w:val="0"/>
-          <w:numId w:val="1009"/>
+          <w:numId w:val="1008"/>
         </w:numPr>
       </w:pPr>
       <w:r>
@@ -5669,7 +5685,7 @@
       <w:pPr>
         <w:numPr>
           <w:ilvl w:val="0"/>
-          <w:numId w:val="1009"/>
+          <w:numId w:val="1008"/>
         </w:numPr>
       </w:pPr>
       <w:r>
@@ -5680,7 +5696,7 @@
       <w:pPr>
         <w:numPr>
           <w:ilvl w:val="0"/>
-          <w:numId w:val="1009"/>
+          <w:numId w:val="1008"/>
         </w:numPr>
       </w:pPr>
       <w:r>
@@ -5691,7 +5707,7 @@
       <w:pPr>
         <w:numPr>
           <w:ilvl w:val="0"/>
-          <w:numId w:val="1009"/>
+          <w:numId w:val="1008"/>
         </w:numPr>
       </w:pPr>
       <w:r>
@@ -5702,7 +5718,7 @@
       <w:pPr>
         <w:numPr>
           <w:ilvl w:val="0"/>
-          <w:numId w:val="1009"/>
+          <w:numId w:val="1008"/>
         </w:numPr>
       </w:pPr>
       <w:r>
@@ -5713,7 +5729,7 @@
       <w:pPr>
         <w:numPr>
           <w:ilvl w:val="0"/>
-          <w:numId w:val="1009"/>
+          <w:numId w:val="1008"/>
         </w:numPr>
       </w:pPr>
       <w:r>
@@ -5724,7 +5740,7 @@
       <w:pPr>
         <w:numPr>
           <w:ilvl w:val="0"/>
-          <w:numId w:val="1009"/>
+          <w:numId w:val="1008"/>
         </w:numPr>
       </w:pPr>
       <w:r>
@@ -5735,7 +5751,7 @@
       <w:pPr>
         <w:numPr>
           <w:ilvl w:val="0"/>
-          <w:numId w:val="1009"/>
+          <w:numId w:val="1008"/>
         </w:numPr>
       </w:pPr>
       <w:r>
@@ -5746,11 +5762,77 @@
       <w:pPr>
         <w:numPr>
           <w:ilvl w:val="0"/>
-          <w:numId w:val="1009"/>
+          <w:numId w:val="1008"/>
         </w:numPr>
       </w:pPr>
       <w:r>
         <w:t xml:space="preserve">Özateş Ş. B., Tıraş T. E., Adak E. E., Doğan B., Karagöz F. B., Genç E. E., Bilgin Taşdemir E. F. Building Foundations for Natural Language Processing of Historical Turkish: Resources and Models. 2025. arXiv:2501.04828. URL: https://arxiv.org/abs/2501.04828</w:t>
+      </w:r>
+    </w:p>
+    <w:p>
+      <w:pPr>
+        <w:numPr>
+          <w:ilvl w:val="0"/>
+          <w:numId w:val="1008"/>
+        </w:numPr>
+      </w:pPr>
+      <w:r>
+        <w:t xml:space="preserve">Lyu L., Koutraki M., Krickl M., Fetahu B. Neural OCR Post-Hoc Correction of Historical Corpora. 2021. arXiv:2102.00583. URL: https://arxiv.org/abs/2102.00583</w:t>
+      </w:r>
+    </w:p>
+    <w:p>
+      <w:pPr>
+        <w:numPr>
+          <w:ilvl w:val="0"/>
+          <w:numId w:val="1008"/>
+        </w:numPr>
+      </w:pPr>
+      <w:r>
+        <w:t xml:space="preserve">Rijhwani S., Rosenblum D., Anastasopoulos A., Neubig G. Lexically Aware Semi-Supervised Learning for OCR Post-Correction. 2021. arXiv:2111.02622. URL: https://arxiv.org/abs/2111.02622</w:t>
+      </w:r>
+    </w:p>
+    <w:p>
+      <w:pPr>
+        <w:numPr>
+          <w:ilvl w:val="0"/>
+          <w:numId w:val="1008"/>
+        </w:numPr>
+      </w:pPr>
+      <w:r>
+        <w:t xml:space="preserve">Naiman J. P., Cosillo M. G., Williams P. K. G., Goodman A. Large Synthetic Data from the arXiv for OCR Post Correction of Historic Scientific Articles. 2023. arXiv:2309.11549. URL: https://arxiv.org/abs/2309.11549</w:t>
+      </w:r>
+    </w:p>
+    <w:p>
+      <w:pPr>
+        <w:numPr>
+          <w:ilvl w:val="0"/>
+          <w:numId w:val="1008"/>
+        </w:numPr>
+      </w:pPr>
+      <w:r>
+        <w:t xml:space="preserve">Guan S., Greene D. Advancing Post-OCR Correction: A Comparative Study of Synthetic Data. 2024. arXiv:2408.02253. URL: https://arxiv.org/abs/2408.02253</w:t>
+      </w:r>
+    </w:p>
+    <w:p>
+      <w:pPr>
+        <w:numPr>
+          <w:ilvl w:val="0"/>
+          <w:numId w:val="1008"/>
+        </w:numPr>
+      </w:pPr>
+      <w:r>
+        <w:t xml:space="preserve">Kashid H., Bhattacharyya P. RoundTripOCR: A Data Generation Technique for Enhancing Post-OCR Error Correction in Low-Resource Devanagari Languages. 2024. arXiv:2412.15248. URL: https://arxiv.org/abs/2412.15248</w:t>
+      </w:r>
+    </w:p>
+    <w:p>
+      <w:pPr>
+        <w:numPr>
+          <w:ilvl w:val="0"/>
+          <w:numId w:val="1008"/>
+        </w:numPr>
+      </w:pPr>
+      <w:r>
+        <w:t xml:space="preserve">Li M., Lv T., Chen J., Cui L., Lu Y., Florencio D., Zhang C., Li Z., Wei F. TrOCR: Transformer-based Optical Character Recognition with Pre-trained Models. 2021. arXiv:2109.10282. URL: https://arxiv.org/abs/2109.10282</w:t>
       </w:r>
     </w:p>
     <w:bookmarkEnd w:id="76"/>
@@ -5864,6 +5946,91 @@
       </w:pPr>
     </w:lvl>
   </w:abstractNum>
+  <w:abstractNum w:abstractNumId="99411">
+    <w:nsid w:val="00A99411"/>
+    <w:multiLevelType w:val="multilevel"/>
+    <w:lvl w:ilvl="0">
+      <w:start w:val="1"/>
+      <w:numFmt w:val="decimal"/>
+      <w:lvlText w:val="%1."/>
+      <w:lvlJc w:val="left"/>
+      <w:pPr>
+        <w:ind w:left="720" w:hanging="360"/>
+      </w:pPr>
+    </w:lvl>
+    <w:lvl w:ilvl="1">
+      <w:start w:val="1"/>
+      <w:numFmt w:val="decimal"/>
+      <w:lvlText w:val="%2."/>
+      <w:lvlJc w:val="left"/>
+      <w:pPr>
+        <w:ind w:left="1440" w:hanging="360"/>
+      </w:pPr>
+    </w:lvl>
+    <w:lvl w:ilvl="2">
+      <w:start w:val="1"/>
+      <w:numFmt w:val="decimal"/>
+      <w:lvlText w:val="%3."/>
+      <w:lvlJc w:val="left"/>
+      <w:pPr>
+        <w:ind w:left="2160" w:hanging="360"/>
+      </w:pPr>
+    </w:lvl>
+    <w:lvl w:ilvl="3">
+      <w:start w:val="1"/>
+      <w:numFmt w:val="decimal"/>
+      <w:lvlText w:val="%4."/>
+      <w:lvlJc w:val="left"/>
+      <w:pPr>
+        <w:ind w:left="2880" w:hanging="360"/>
+      </w:pPr>
+    </w:lvl>
+    <w:lvl w:ilvl="4">
+      <w:start w:val="1"/>
+      <w:numFmt w:val="decimal"/>
+      <w:lvlText w:val="%5."/>
+      <w:lvlJc w:val="left"/>
+      <w:pPr>
+        <w:ind w:left="3600" w:hanging="360"/>
+      </w:pPr>
+    </w:lvl>
+    <w:lvl w:ilvl="5">
+      <w:start w:val="1"/>
+      <w:numFmt w:val="decimal"/>
+      <w:lvlText w:val="%6."/>
+      <w:lvlJc w:val="left"/>
+      <w:pPr>
+        <w:ind w:left="4320" w:hanging="360"/>
+      </w:pPr>
+    </w:lvl>
+    <w:lvl w:ilvl="6">
+      <w:start w:val="1"/>
+      <w:numFmt w:val="decimal"/>
+      <w:lvlText w:val="%7."/>
+      <w:lvlJc w:val="left"/>
+      <w:pPr>
+        <w:ind w:left="5040" w:hanging="360"/>
+      </w:pPr>
+    </w:lvl>
+    <w:lvl w:ilvl="7">
+      <w:start w:val="1"/>
+      <w:numFmt w:val="decimal"/>
+      <w:lvlText w:val="%8."/>
+      <w:lvlJc w:val="left"/>
+      <w:pPr>
+        <w:ind w:left="5760" w:hanging="360"/>
+      </w:pPr>
+    </w:lvl>
+    <w:lvl w:ilvl="8">
+      <w:start w:val="1"/>
+      <w:numFmt w:val="decimal"/>
+      <w:lvlText w:val="%9."/>
+      <w:lvlJc w:val="left"/>
+      <w:pPr>
+        <w:ind w:left="6480" w:hanging="360"/>
+      </w:pPr>
+    </w:lvl>
+  </w:abstractNum>
   <w:abstractNum w:abstractNumId="991">
     <w:nsid w:val="0000A991"/>
     <w:multiLevelType w:val="multilevel"/>
@@ -5967,96 +6134,38 @@
       </w:rPr>
     </w:lvl>
   </w:abstractNum>
-  <w:abstractNum w:abstractNumId="99411">
-    <w:nsid w:val="00A99411"/>
-    <w:multiLevelType w:val="multilevel"/>
-    <w:lvl w:ilvl="0">
-      <w:start w:val="1"/>
-      <w:numFmt w:val="decimal"/>
-      <w:lvlText w:val="%1."/>
-      <w:lvlJc w:val="left"/>
-      <w:pPr>
-        <w:ind w:left="720" w:hanging="360"/>
-      </w:pPr>
-    </w:lvl>
-    <w:lvl w:ilvl="1">
-      <w:start w:val="1"/>
-      <w:numFmt w:val="decimal"/>
-      <w:lvlText w:val="%2."/>
-      <w:lvlJc w:val="left"/>
-      <w:pPr>
-        <w:ind w:left="1440" w:hanging="360"/>
-      </w:pPr>
-    </w:lvl>
-    <w:lvl w:ilvl="2">
-      <w:start w:val="1"/>
-      <w:numFmt w:val="decimal"/>
-      <w:lvlText w:val="%3."/>
-      <w:lvlJc w:val="left"/>
-      <w:pPr>
-        <w:ind w:left="2160" w:hanging="360"/>
-      </w:pPr>
-    </w:lvl>
-    <w:lvl w:ilvl="3">
-      <w:start w:val="1"/>
-      <w:numFmt w:val="decimal"/>
-      <w:lvlText w:val="%4."/>
-      <w:lvlJc w:val="left"/>
-      <w:pPr>
-        <w:ind w:left="2880" w:hanging="360"/>
-      </w:pPr>
-    </w:lvl>
-    <w:lvl w:ilvl="4">
-      <w:start w:val="1"/>
-      <w:numFmt w:val="decimal"/>
-      <w:lvlText w:val="%5."/>
-      <w:lvlJc w:val="left"/>
-      <w:pPr>
-        <w:ind w:left="3600" w:hanging="360"/>
-      </w:pPr>
-    </w:lvl>
-    <w:lvl w:ilvl="5">
-      <w:start w:val="1"/>
-      <w:numFmt w:val="decimal"/>
-      <w:lvlText w:val="%6."/>
-      <w:lvlJc w:val="left"/>
-      <w:pPr>
-        <w:ind w:left="4320" w:hanging="360"/>
-      </w:pPr>
-    </w:lvl>
-    <w:lvl w:ilvl="6">
-      <w:start w:val="1"/>
-      <w:numFmt w:val="decimal"/>
-      <w:lvlText w:val="%7."/>
-      <w:lvlJc w:val="left"/>
-      <w:pPr>
-        <w:ind w:left="5040" w:hanging="360"/>
-      </w:pPr>
-    </w:lvl>
-    <w:lvl w:ilvl="7">
-      <w:start w:val="1"/>
-      <w:numFmt w:val="decimal"/>
-      <w:lvlText w:val="%8."/>
-      <w:lvlJc w:val="left"/>
-      <w:pPr>
-        <w:ind w:left="5760" w:hanging="360"/>
-      </w:pPr>
-    </w:lvl>
-    <w:lvl w:ilvl="8">
-      <w:start w:val="1"/>
-      <w:numFmt w:val="decimal"/>
-      <w:lvlText w:val="%9."/>
-      <w:lvlJc w:val="left"/>
-      <w:pPr>
-        <w:ind w:left="6480" w:hanging="360"/>
-      </w:pPr>
-    </w:lvl>
-  </w:abstractNum>
   <w:num w:numId="1000">
     <w:abstractNumId w:val="990"/>
   </w:num>
   <w:num w:numId="1001">
-    <w:abstractNumId w:val="991"/>
+    <w:abstractNumId w:val="99411"/>
+    <w:lvlOverride w:ilvl="0">
+      <w:startOverride w:val="1"/>
+    </w:lvlOverride>
+    <w:lvlOverride w:ilvl="1">
+      <w:startOverride w:val="1"/>
+    </w:lvlOverride>
+    <w:lvlOverride w:ilvl="2">
+      <w:startOverride w:val="1"/>
+    </w:lvlOverride>
+    <w:lvlOverride w:ilvl="3">
+      <w:startOverride w:val="1"/>
+    </w:lvlOverride>
+    <w:lvlOverride w:ilvl="4">
+      <w:startOverride w:val="1"/>
+    </w:lvlOverride>
+    <w:lvlOverride w:ilvl="5">
+      <w:startOverride w:val="1"/>
+    </w:lvlOverride>
+    <w:lvlOverride w:ilvl="6">
+      <w:startOverride w:val="1"/>
+    </w:lvlOverride>
+    <w:lvlOverride w:ilvl="7">
+      <w:startOverride w:val="1"/>
+    </w:lvlOverride>
+    <w:lvlOverride w:ilvl="8">
+      <w:startOverride w:val="1"/>
+    </w:lvlOverride>
   </w:num>
   <w:num w:numId="1002">
     <w:abstractNumId w:val="99411"/>
@@ -6089,34 +6198,7 @@
     </w:lvlOverride>
   </w:num>
   <w:num w:numId="1003">
-    <w:abstractNumId w:val="99411"/>
-    <w:lvlOverride w:ilvl="0">
-      <w:startOverride w:val="1"/>
-    </w:lvlOverride>
-    <w:lvlOverride w:ilvl="1">
-      <w:startOverride w:val="1"/>
-    </w:lvlOverride>
-    <w:lvlOverride w:ilvl="2">
-      <w:startOverride w:val="1"/>
-    </w:lvlOverride>
-    <w:lvlOverride w:ilvl="3">
-      <w:startOverride w:val="1"/>
-    </w:lvlOverride>
-    <w:lvlOverride w:ilvl="4">
-      <w:startOverride w:val="1"/>
-    </w:lvlOverride>
-    <w:lvlOverride w:ilvl="5">
-      <w:startOverride w:val="1"/>
-    </w:lvlOverride>
-    <w:lvlOverride w:ilvl="6">
-      <w:startOverride w:val="1"/>
-    </w:lvlOverride>
-    <w:lvlOverride w:ilvl="7">
-      <w:startOverride w:val="1"/>
-    </w:lvlOverride>
-    <w:lvlOverride w:ilvl="8">
-      <w:startOverride w:val="1"/>
-    </w:lvlOverride>
+    <w:abstractNumId w:val="991"/>
   </w:num>
   <w:num w:numId="1004">
     <w:abstractNumId w:val="991"/>
@@ -6131,9 +6213,6 @@
     <w:abstractNumId w:val="991"/>
   </w:num>
   <w:num w:numId="1008">
-    <w:abstractNumId w:val="991"/>
-  </w:num>
-  <w:num w:numId="1009">
     <w:abstractNumId w:val="99411"/>
     <w:lvlOverride w:ilvl="0">
       <w:startOverride w:val="1"/>
@@ -6829,7 +6908,7 @@
       <w:color w:themeColor="accent1" w:themeShade="BF" w:val="365F91"/>
     </w:rPr>
   </w:style>
-  <w:style w:type="paragraph" w:customStyle="1" w:styleId="SourceCode">
+  <w:style w:customStyle="1" w:styleId="SourceCode" w:type="paragraph">
     <w:name w:val="Source Code"/>
     <w:basedOn w:val="Normal"/>
     <w:link w:val="VerbatimChar"/>
@@ -6837,7 +6916,7 @@
       <w:wordWrap w:val="off"/>
     </w:pPr>
   </w:style>
-  <w:style w:type="character" w:customStyle="1" w:styleId="KeywordTok">
+  <w:style w:customStyle="1" w:styleId="KeywordTok" w:type="character">
     <w:name w:val="KeywordTok"/>
     <w:basedOn w:val="VerbatimChar"/>
     <w:rPr>
@@ -6845,77 +6924,77 @@
       <w:color w:val="007020"/>
     </w:rPr>
   </w:style>
-  <w:style w:type="character" w:customStyle="1" w:styleId="DataTypeTok">
+  <w:style w:customStyle="1" w:styleId="DataTypeTok" w:type="character">
     <w:name w:val="DataTypeTok"/>
     <w:basedOn w:val="VerbatimChar"/>
     <w:rPr>
       <w:color w:val="902000"/>
     </w:rPr>
   </w:style>
-  <w:style w:type="character" w:customStyle="1" w:styleId="DecValTok">
+  <w:style w:customStyle="1" w:styleId="DecValTok" w:type="character">
     <w:name w:val="DecValTok"/>
     <w:basedOn w:val="VerbatimChar"/>
     <w:rPr>
       <w:color w:val="40a070"/>
     </w:rPr>
   </w:style>
-  <w:style w:type="character" w:customStyle="1" w:styleId="BaseNTok">
+  <w:style w:customStyle="1" w:styleId="BaseNTok" w:type="character">
     <w:name w:val="BaseNTok"/>
     <w:basedOn w:val="VerbatimChar"/>
     <w:rPr>
       <w:color w:val="40a070"/>
     </w:rPr>
   </w:style>
-  <w:style w:type="character" w:customStyle="1" w:styleId="FloatTok">
+  <w:style w:customStyle="1" w:styleId="FloatTok" w:type="character">
     <w:name w:val="FloatTok"/>
     <w:basedOn w:val="VerbatimChar"/>
     <w:rPr>
       <w:color w:val="40a070"/>
     </w:rPr>
   </w:style>
-  <w:style w:type="character" w:customStyle="1" w:styleId="ConstantTok">
+  <w:style w:customStyle="1" w:styleId="ConstantTok" w:type="character">
     <w:name w:val="ConstantTok"/>
     <w:basedOn w:val="VerbatimChar"/>
     <w:rPr>
       <w:color w:val="880000"/>
     </w:rPr>
   </w:style>
-  <w:style w:type="character" w:customStyle="1" w:styleId="CharTok">
+  <w:style w:customStyle="1" w:styleId="CharTok" w:type="character">
     <w:name w:val="CharTok"/>
     <w:basedOn w:val="VerbatimChar"/>
     <w:rPr>
       <w:color w:val="4070a0"/>
     </w:rPr>
   </w:style>
-  <w:style w:type="character" w:customStyle="1" w:styleId="SpecialCharTok">
+  <w:style w:customStyle="1" w:styleId="SpecialCharTok" w:type="character">
     <w:name w:val="SpecialCharTok"/>
     <w:basedOn w:val="VerbatimChar"/>
     <w:rPr>
       <w:color w:val="4070a0"/>
     </w:rPr>
   </w:style>
-  <w:style w:type="character" w:customStyle="1" w:styleId="StringTok">
+  <w:style w:customStyle="1" w:styleId="StringTok" w:type="character">
     <w:name w:val="StringTok"/>
     <w:basedOn w:val="VerbatimChar"/>
     <w:rPr>
       <w:color w:val="4070a0"/>
     </w:rPr>
   </w:style>
-  <w:style w:type="character" w:customStyle="1" w:styleId="VerbatimStringTok">
+  <w:style w:customStyle="1" w:styleId="VerbatimStringTok" w:type="character">
     <w:name w:val="VerbatimStringTok"/>
     <w:basedOn w:val="VerbatimChar"/>
     <w:rPr>
       <w:color w:val="4070a0"/>
     </w:rPr>
   </w:style>
-  <w:style w:type="character" w:customStyle="1" w:styleId="SpecialStringTok">
+  <w:style w:customStyle="1" w:styleId="SpecialStringTok" w:type="character">
     <w:name w:val="SpecialStringTok"/>
     <w:basedOn w:val="VerbatimChar"/>
     <w:rPr>
       <w:color w:val="bb6688"/>
     </w:rPr>
   </w:style>
-  <w:style w:type="character" w:customStyle="1" w:styleId="ImportTok">
+  <w:style w:customStyle="1" w:styleId="ImportTok" w:type="character">
     <w:name w:val="ImportTok"/>
     <w:basedOn w:val="VerbatimChar"/>
     <w:rPr>
@@ -6923,7 +7002,7 @@
       <w:color w:val="008000"/>
     </w:rPr>
   </w:style>
-  <w:style w:type="character" w:customStyle="1" w:styleId="CommentTok">
+  <w:style w:customStyle="1" w:styleId="CommentTok" w:type="character">
     <w:name w:val="CommentTok"/>
     <w:basedOn w:val="VerbatimChar"/>
     <w:rPr>
@@ -6931,7 +7010,7 @@
       <w:color w:val="60a0b0"/>
     </w:rPr>
   </w:style>
-  <w:style w:type="character" w:customStyle="1" w:styleId="DocumentationTok">
+  <w:style w:customStyle="1" w:styleId="DocumentationTok" w:type="character">
     <w:name w:val="DocumentationTok"/>
     <w:basedOn w:val="VerbatimChar"/>
     <w:rPr>
@@ -6939,7 +7018,7 @@
       <w:color w:val="ba2121"/>
     </w:rPr>
   </w:style>
-  <w:style w:type="character" w:customStyle="1" w:styleId="AnnotationTok">
+  <w:style w:customStyle="1" w:styleId="AnnotationTok" w:type="character">
     <w:name w:val="AnnotationTok"/>
     <w:basedOn w:val="VerbatimChar"/>
     <w:rPr>
@@ -6948,7 +7027,7 @@
       <w:color w:val="60a0b0"/>
     </w:rPr>
   </w:style>
-  <w:style w:type="character" w:customStyle="1" w:styleId="CommentVarTok">
+  <w:style w:customStyle="1" w:styleId="CommentVarTok" w:type="character">
     <w:name w:val="CommentVarTok"/>
     <w:basedOn w:val="VerbatimChar"/>
     <w:rPr>
@@ -6957,28 +7036,28 @@
       <w:color w:val="60a0b0"/>
     </w:rPr>
   </w:style>
-  <w:style w:type="character" w:customStyle="1" w:styleId="OtherTok">
+  <w:style w:customStyle="1" w:styleId="OtherTok" w:type="character">
     <w:name w:val="OtherTok"/>
     <w:basedOn w:val="VerbatimChar"/>
     <w:rPr>
       <w:color w:val="007020"/>
     </w:rPr>
   </w:style>
-  <w:style w:type="character" w:customStyle="1" w:styleId="FunctionTok">
+  <w:style w:customStyle="1" w:styleId="FunctionTok" w:type="character">
     <w:name w:val="FunctionTok"/>
     <w:basedOn w:val="VerbatimChar"/>
     <w:rPr>
       <w:color w:val="06287e"/>
     </w:rPr>
   </w:style>
-  <w:style w:type="character" w:customStyle="1" w:styleId="VariableTok">
+  <w:style w:customStyle="1" w:styleId="VariableTok" w:type="character">
     <w:name w:val="VariableTok"/>
     <w:basedOn w:val="VerbatimChar"/>
     <w:rPr>
       <w:color w:val="19177c"/>
     </w:rPr>
   </w:style>
-  <w:style w:type="character" w:customStyle="1" w:styleId="ControlFlowTok">
+  <w:style w:customStyle="1" w:styleId="ControlFlowTok" w:type="character">
     <w:name w:val="ControlFlowTok"/>
     <w:basedOn w:val="VerbatimChar"/>
     <w:rPr>
@@ -6986,45 +7065,45 @@
       <w:color w:val="007020"/>
     </w:rPr>
   </w:style>
-  <w:style w:type="character" w:customStyle="1" w:styleId="OperatorTok">
+  <w:style w:customStyle="1" w:styleId="OperatorTok" w:type="character">
     <w:name w:val="OperatorTok"/>
     <w:basedOn w:val="VerbatimChar"/>
     <w:rPr>
       <w:color w:val="666666"/>
     </w:rPr>
   </w:style>
-  <w:style w:type="character" w:customStyle="1" w:styleId="BuiltInTok">
+  <w:style w:customStyle="1" w:styleId="BuiltInTok" w:type="character">
     <w:name w:val="BuiltInTok"/>
     <w:basedOn w:val="VerbatimChar"/>
     <w:rPr>
       <w:color w:val="008000"/>
     </w:rPr>
   </w:style>
-  <w:style w:type="character" w:customStyle="1" w:styleId="ExtensionTok">
+  <w:style w:customStyle="1" w:styleId="ExtensionTok" w:type="character">
     <w:name w:val="ExtensionTok"/>
     <w:basedOn w:val="VerbatimChar"/>
     <w:rPr/>
   </w:style>
-  <w:style w:type="character" w:customStyle="1" w:styleId="PreprocessorTok">
+  <w:style w:customStyle="1" w:styleId="PreprocessorTok" w:type="character">
     <w:name w:val="PreprocessorTok"/>
     <w:basedOn w:val="VerbatimChar"/>
     <w:rPr>
       <w:color w:val="bc7a00"/>
     </w:rPr>
   </w:style>
-  <w:style w:type="character" w:customStyle="1" w:styleId="AttributeTok">
+  <w:style w:customStyle="1" w:styleId="AttributeTok" w:type="character">
     <w:name w:val="AttributeTok"/>
     <w:basedOn w:val="VerbatimChar"/>
     <w:rPr>
       <w:color w:val="7d9029"/>
     </w:rPr>
   </w:style>
-  <w:style w:type="character" w:customStyle="1" w:styleId="RegionMarkerTok">
+  <w:style w:customStyle="1" w:styleId="RegionMarkerTok" w:type="character">
     <w:name w:val="RegionMarkerTok"/>
     <w:basedOn w:val="VerbatimChar"/>
     <w:rPr/>
   </w:style>
-  <w:style w:type="character" w:customStyle="1" w:styleId="InformationTok">
+  <w:style w:customStyle="1" w:styleId="InformationTok" w:type="character">
     <w:name w:val="InformationTok"/>
     <w:basedOn w:val="VerbatimChar"/>
     <w:rPr>
@@ -7033,7 +7112,7 @@
       <w:color w:val="60a0b0"/>
     </w:rPr>
   </w:style>
-  <w:style w:type="character" w:customStyle="1" w:styleId="WarningTok">
+  <w:style w:customStyle="1" w:styleId="WarningTok" w:type="character">
     <w:name w:val="WarningTok"/>
     <w:basedOn w:val="VerbatimChar"/>
     <w:rPr>
@@ -7042,7 +7121,7 @@
       <w:color w:val="60a0b0"/>
     </w:rPr>
   </w:style>
-  <w:style w:type="character" w:customStyle="1" w:styleId="AlertTok">
+  <w:style w:customStyle="1" w:styleId="AlertTok" w:type="character">
     <w:name w:val="AlertTok"/>
     <w:basedOn w:val="VerbatimChar"/>
     <w:rPr>
@@ -7050,7 +7129,7 @@
       <w:color w:val="ff0000"/>
     </w:rPr>
   </w:style>
-  <w:style w:type="character" w:customStyle="1" w:styleId="ErrorTok">
+  <w:style w:customStyle="1" w:styleId="ErrorTok" w:type="character">
     <w:name w:val="ErrorTok"/>
     <w:basedOn w:val="VerbatimChar"/>
     <w:rPr>
@@ -7058,7 +7137,7 @@
       <w:color w:val="ff0000"/>
     </w:rPr>
   </w:style>
-  <w:style w:type="character" w:customStyle="1" w:styleId="NormalTok">
+  <w:style w:customStyle="1" w:styleId="NormalTok" w:type="character">
     <w:name w:val="NormalTok"/>
     <w:basedOn w:val="VerbatimChar"/>
     <w:rPr/>

</xml_diff>

<commit_message>
docs(paper): rebuild course paper docx
</commit_message>
<xml_diff>
--- a/outputs/course_paper_hse_final.docx
+++ b/outputs/course_paper_hse_final.docx
@@ -222,43 +222,31 @@
         <w:pStyle w:val="FirstParagraph"/>
       </w:pPr>
       <w:r>
-        <w:t xml:space="preserve">Работа посвящена посткоррекции OCR-ошибок в исторических тюркских текстах, записанных арабской графикой. В отличие от полной OCR/HTR-задачи, здесь рассматривается более узкий этап: уже полученный текстовый вывод нужно приблизить к проверенному clean reference. Такая постановка выбрана как пилотный шаг для будущей обработки старотатарских, старобашкирских и других арабографичных тюркских источников, где часто не хватает готовых размеченных корпусов и устойчивых OCR-инструментов.</w:t>
-      </w:r>
-    </w:p>
-    <w:p>
-      <w:pPr>
-        <w:pStyle w:val="BodyText"/>
-      </w:pPr>
-      <w:r>
-        <w:t xml:space="preserve">В эксперименте построен воспроизводимый benchmark</w:t>
-      </w:r>
-      <w:r>
-        <w:t xml:space="preserve"> </w:t>
-      </w:r>
-      <w:r>
-        <w:rPr>
-          <w:rStyle w:val="VerbatimChar"/>
-        </w:rPr>
-        <w:t xml:space="preserve">noisy text → clean text</w:t>
-      </w:r>
-      <w:r>
-        <w:t xml:space="preserve">. Исходный корпус основан на османско-тюркском тексте в арабской графике; этот материал используется как связанный арабографичный тюркский test case, а не как старотатарский или старобашкирский датасет. На основе clean строк генерируются OCR-подобные искажения, после чего сравниваются identity baseline, rule-based normalizer, train-derived character-confusion baseline и ByT5-small.</w:t>
-      </w:r>
-    </w:p>
-    <w:p>
-      <w:pPr>
-        <w:pStyle w:val="BodyText"/>
-      </w:pPr>
-      <w:r>
-        <w:t xml:space="preserve">На синтетическом benchmark ByT5-small с длиной последовательности 512 показывает лучший результат среди рассмотренных методов. При этом улучшение требует осторожной интерпретации: снижение WER заметнее, чем снижение CER, а часть выигрыша связана с исправлением пробелов и границ слов. Отдельный анализ худших примеров показывает, что модель иногда не исправляет строку, а порождает лишние фрагменты, поэтому её нельзя считать безопасным автоматическим корректором без фильтрации.</w:t>
-      </w:r>
-    </w:p>
-    <w:p>
-      <w:pPr>
-        <w:pStyle w:val="BodyText"/>
-      </w:pPr>
-      <w:r>
-        <w:t xml:space="preserve">Для проверки переноса был собран page-level real-OCR benchmark на османско-турецком печатном источнике, распознанном Tesseract. Этот эксперимент изменил основной вывод: модель, обученная только на synthetic noise, немного снижает WER, но ухудшает CER и NoSpaceCER относительно raw Tesseract. Следовательно, главный результат работы состоит не в готовой OCR-системе, а в воспроизводимом baseline и фиксации synthetic-to-real gap. Для практического применения необходимы выровненные OCR/reference chunks, обучение на настоящих OCR-ошибках и консервативная проверка предсказаний.</w:t>
+        <w:t xml:space="preserve">Работа посвящена посткоррекции ошибок OCR в исторических тюркских текстах, записанных арабской графикой. Полная задача распознавания таких источников включает подготовку сканов, сегментацию, OCR/HTR, исправление вывода и ручную проверку; в этой работе рассматривается один более узкий этап — исправление уже полученного текстового вывода.</w:t>
+      </w:r>
+    </w:p>
+    <w:p>
+      <w:pPr>
+        <w:pStyle w:val="BodyText"/>
+      </w:pPr>
+      <w:r>
+        <w:t xml:space="preserve">В качестве пилотного материала используется османско-турецкий текст в арабской графике. Он рассматривается не как старотатарский или старобашкирский датасет, а как родственный арабографичный тюркский проверочный случай, позволяющий отработать протокол оценки. На основе проверенных строк построен синтетический набор пар «искажённый текст → эталонный текст». В эксперименте сравниваются базовый метод без исправления, нормализатор на правилах, символьный baseline на основе ошибок обучающей выборки и модель ByT5-small.</w:t>
+      </w:r>
+    </w:p>
+    <w:p>
+      <w:pPr>
+        <w:pStyle w:val="BodyText"/>
+      </w:pPr>
+      <w:r>
+        <w:t xml:space="preserve">На синтетическом наборе ByT5-small показывает лучший результат среди рассмотренных методов, особенно по WER. Однако дополнительная проверка на реальном OCR-выводе Tesseract меняет интерпретацию результата: модель, обученная только на синтетических искажениях, не переносится надёжно на постраничный реальный OCR. Она может немного улучшать WER, но ухудшать CER и NoSpaceCER относительно исходного Tesseract.</w:t>
+      </w:r>
+    </w:p>
+    <w:p>
+      <w:pPr>
+        <w:pStyle w:val="BodyText"/>
+      </w:pPr>
+      <w:r>
+        <w:t xml:space="preserve">Поэтому основной результат работы состоит не в создании готовой OCR-системы, а в построении воспроизводимого экспериментального контура и фиксации разрыва между синтетической и реальной оценкой. Для практического применения необходим следующий этап: выровненные OCR/reference-фрагменты, обучение на настоящих OCR-ошибках, проверка на татарских и башкирских источниках и ручной анализ ошибок.</w:t>
       </w:r>
     </w:p>
     <w:bookmarkStart w:id="10" w:name="введение"/>
@@ -283,62 +271,23 @@
         <w:pStyle w:val="BodyText"/>
       </w:pPr>
       <w:r>
-        <w:t xml:space="preserve">С точки зрения автоматической обработки это неудобный материал. Он находится между несколькими зонами сложности: историческая орфография отличается от современной нормы, арабская графика плохо переносится на стандартные OCR-сценарии, а размеченных корпусов значительно меньше, чем для современных массовых языков. Даже когда скан доступен, исследователь часто получает не готовый текстовый корпус, а изображение или OCR-вывод с большим числом ошибок.</w:t>
-      </w:r>
-    </w:p>
-    <w:p>
-      <w:pPr>
-        <w:pStyle w:val="BodyText"/>
-      </w:pPr>
-      <w:r>
-        <w:t xml:space="preserve">В работе не ставится задача сразу решить всю проблему распознавания исторических документов. Полный pipeline должен включать поиск источника, обработку изображения, разметку строк, OCR/HTR, посткоррекцию, проверку текста и дальнейший анализ. Здесь выбран один более узкий слой — post-correction уже полученного текстового вывода. Такой слой удобен для пилотного исследования: можно явно задать вход</w:t>
-      </w:r>
-      <w:r>
-        <w:t xml:space="preserve"> </w:t>
-      </w:r>
-      <w:r>
-        <w:rPr>
-          <w:rStyle w:val="VerbatimChar"/>
-        </w:rPr>
-        <w:t xml:space="preserve">noisy/OCR</w:t>
-      </w:r>
-      <w:r>
-        <w:t xml:space="preserve">, эталон</w:t>
-      </w:r>
-      <w:r>
-        <w:t xml:space="preserve"> </w:t>
-      </w:r>
-      <w:r>
-        <w:rPr>
-          <w:rStyle w:val="VerbatimChar"/>
-        </w:rPr>
-        <w:t xml:space="preserve">clean</w:t>
-      </w:r>
-      <w:r>
-        <w:t xml:space="preserve">, метрики качества и сравнимые baseline-подходы.</w:t>
-      </w:r>
-    </w:p>
-    <w:p>
-      <w:pPr>
-        <w:pStyle w:val="BodyText"/>
-      </w:pPr>
-      <w:r>
-        <w:t xml:space="preserve">Работа также проверяет важное ограничение synthetic-подхода. Если реальных пар</w:t>
-      </w:r>
-      <w:r>
-        <w:t xml:space="preserve"> </w:t>
-      </w:r>
-      <w:r>
-        <w:rPr>
-          <w:rStyle w:val="VerbatimChar"/>
-        </w:rPr>
-        <w:t xml:space="preserve">OCR output → clean reference</w:t>
-      </w:r>
-      <w:r>
-        <w:t xml:space="preserve"> </w:t>
-      </w:r>
-      <w:r>
-        <w:t xml:space="preserve">мало, естественно начать с синтетического шума. Но синтетический benchmark сам по себе не доказывает, что модель будет работать на настоящем OCR. Поэтому в работе есть два уровня оценки: controlled synthetic benchmark и отдельная page-level real-OCR проверка на османско-турецком печатном источнике.</w:t>
+        <w:t xml:space="preserve">Для автоматической обработки это трудный материал. Историческая орфография отличается от современной нормы, арабская графика плохо переносится на стандартные OCR-сценарии, а размеченных корпусов значительно меньше, чем для современных массовых языков. Даже когда скан доступен, исследователь часто получает не готовый текстовый корпус, а изображение или OCR-вывод с большим числом ошибок.</w:t>
+      </w:r>
+    </w:p>
+    <w:p>
+      <w:pPr>
+        <w:pStyle w:val="BodyText"/>
+      </w:pPr>
+      <w:r>
+        <w:t xml:space="preserve">В этой работе не ставится задача решить всю проблему распознавания исторических документов. Полная технологическая цепочка включает поиск источника, обработку изображения, разметку строк, OCR/HTR, посткоррекцию, проверку текста и последующий анализ. Здесь выбран один более узкий слой — исправление уже полученного текстового вывода. Такое сужение позволяет отдельно задать входной OCR-текст, эталон, метрики качества и методы сравнения.</w:t>
+      </w:r>
+    </w:p>
+    <w:p>
+      <w:pPr>
+        <w:pStyle w:val="BodyText"/>
+      </w:pPr>
+      <w:r>
+        <w:t xml:space="preserve">Работа проверяет важное ограничение синтетического подхода. Если реальных пар «OCR-вывод → проверенный эталон» мало, естественно начать с искусственно внесённых ошибок. Но успех на таком наборе сам по себе не доказывает, что модель будет работать на настоящем OCR. Поэтому в работе есть два уровня оценки: контролируемый тест на синтетических искажениях и отдельная постраничная проверка на реальном OCR османско-турецкого печатного источника.</w:t>
       </w:r>
     </w:p>
     <w:bookmarkEnd w:id="10"/>
@@ -356,23 +305,23 @@
         <w:pStyle w:val="FirstParagraph"/>
       </w:pPr>
       <w:r>
-        <w:t xml:space="preserve">Актуальность работы связана не только с самой задачей OCR, но и с тем, что без машинно-читаемого текста исторические источники плохо включаются в современные исследовательские pipeline. По ним сложнее искать, строить корпуса, извлекать имена и топонимы, сопоставлять записи и проверять историко-лингвистические гипотезы.</w:t>
-      </w:r>
-    </w:p>
-    <w:p>
-      <w:pPr>
-        <w:pStyle w:val="BodyText"/>
-      </w:pPr>
-      <w:r>
-        <w:t xml:space="preserve">Для арабографичных тюркских материалов эта проблема особенно заметна. Во-первых, такие тексты слабо представлены в готовых OCR- и NLP-ресурсах. Во-вторых, стандартные модели, обученные на современных языках и более регулярной орфографии, не обязательно справляются с историческим письмом. В-третьих, даже частично распознанный текст часто требует отдельного слоя исправления: похожие графемы, пропуски, лишние символы и ошибки пробелов мешают downstream анализу.</w:t>
-      </w:r>
-    </w:p>
-    <w:p>
-      <w:pPr>
-        <w:pStyle w:val="BodyText"/>
-      </w:pPr>
-      <w:r>
-        <w:t xml:space="preserve">Отдельная причина актуальности — нехватка воспроизводимых benchmark. Для низкоресурсного исторического материала недостаточно просто показать один удачный пример исправления. Нужно фиксировать источник данных, процедуру генерации или получения OCR, train/test split, метрики и худшие случаи. Именно поэтому в работе акцент сделан на воспроизводимом pipeline, а не только на итоговом числе CER или WER.</w:t>
+        <w:t xml:space="preserve">Актуальность работы связана не только с OCR как технической задачей. Без машинно-читаемого текста исторические источники трудно включать в поиск, корпусный анализ, извлечение имён и топонимов, сопоставление записей и проверку историко-лингвистических гипотез.</w:t>
+      </w:r>
+    </w:p>
+    <w:p>
+      <w:pPr>
+        <w:pStyle w:val="BodyText"/>
+      </w:pPr>
+      <w:r>
+        <w:t xml:space="preserve">Для арабографичных тюркских материалов эта проблема особенно заметна. Такие тексты слабо представлены в готовых OCR- и NLP-ресурсах; стандартные модели, обученные на современных языках и более регулярной орфографии, не обязательно справляются с историческим письмом. Даже частично распознанный текст часто требует отдельного слоя исправления: похожие графемы, пропуски, лишние символы и ошибки пробелов мешают дальнейшему анализу.</w:t>
+      </w:r>
+    </w:p>
+    <w:p>
+      <w:pPr>
+        <w:pStyle w:val="BodyText"/>
+      </w:pPr>
+      <w:r>
+        <w:t xml:space="preserve">Отдельная причина актуальности — нехватка воспроизводимых тестовых наборов и протоколов оценки. Для низкоресурсного исторического материала недостаточно показать один удачный пример исправления. Нужно фиксировать источник данных, процедуру генерации или получения OCR, разбиение на обучающую и тестовую части, метрики и худшие случаи. Поэтому в работе акцент сделан не только на итоговых значениях CER и WER, но и на воспроизводимом экспериментальном контуре.</w:t>
       </w:r>
     </w:p>
     <w:bookmarkEnd w:id="11"/>
@@ -390,35 +339,23 @@
         <w:pStyle w:val="FirstParagraph"/>
       </w:pPr>
       <w:r>
-        <w:t xml:space="preserve">Основная проблема состоит в том, что для исторических тюркских текстов в арабской графике пока не хватает небольших, но воспроизводимых экспериментальных контуров для проверки OCR post-correction. Без такого контура трудно понять, что именно улучшает модель: реальные ошибки распознавания, синтетический шум, пробелы, локальные замены графем или только отдельные удачные примеры.</w:t>
-      </w:r>
-    </w:p>
-    <w:p>
-      <w:pPr>
-        <w:pStyle w:val="BodyText"/>
-      </w:pPr>
-      <w:r>
-        <w:t xml:space="preserve">В этой работе проблема сужается до проверяемой пилотной постановки. Нужно построить пары</w:t>
-      </w:r>
-      <w:r>
-        <w:t xml:space="preserve"> </w:t>
-      </w:r>
-      <w:r>
-        <w:rPr>
-          <w:rStyle w:val="VerbatimChar"/>
-        </w:rPr>
-        <w:t xml:space="preserve">noisy/OCR → clean</w:t>
-      </w:r>
-      <w:r>
-        <w:t xml:space="preserve">, обучить и сравнить несколько методов посткоррекции, а затем проверить, переносится ли результат с synthetic benchmark на page-level real-OCR benchmark. Важное ограничение формулируется заранее: османско-турецкий real-OCR источник используется как связанный арабографичный тюркский test case, но не подаётся как старотатарский или старобашкирский датасет.</w:t>
-      </w:r>
-    </w:p>
-    <w:p>
-      <w:pPr>
-        <w:pStyle w:val="BodyText"/>
-      </w:pPr>
-      <w:r>
-        <w:t xml:space="preserve">Такое сужение делает работу технически контролируемой. Оно позволяет отдельно проверить baselines, ByT5-small, CER/WER/NoSpaceCER, влияние длины последовательности и различие между synthetic и real OCR. При этом оно не снимает более крупную задачу: для практической системы всё равно понадобятся реальные OCR/reference chunks, ручная валидация и расширение корпуса на целевые татарские и башкирские источники.</w:t>
+        <w:t xml:space="preserve">Основная проблема состоит в том, что для исторических тюркских текстов в арабской графике пока не хватает небольших, но воспроизводимых экспериментальных контуров для проверки посткоррекции OCR. Без такого контура трудно понять, что именно улучшает модель: реальные ошибки распознавания, искусственно внесённый шум, пробелы, локальные замены графем или только отдельные удачные примеры.</w:t>
+      </w:r>
+    </w:p>
+    <w:p>
+      <w:pPr>
+        <w:pStyle w:val="BodyText"/>
+      </w:pPr>
+      <w:r>
+        <w:t xml:space="preserve">В этой работе проблема сужается до проверяемой пилотной постановки. Нужно построить пары «искажённый OCR-текст → эталон», обучить и сравнить несколько методов посткоррекции, а затем проверить, переносится ли результат с синтетических ошибок на реальный OCR. Важное ограничение формулируется заранее: османско-турецкий источник используется как связанный арабографичный тюркский проверочный материал, но не подаётся как старотатарский или старобашкирский датасет.</w:t>
+      </w:r>
+    </w:p>
+    <w:p>
+      <w:pPr>
+        <w:pStyle w:val="BodyText"/>
+      </w:pPr>
+      <w:r>
+        <w:t xml:space="preserve">Такое сужение позволяет отделить ошибки посткоррекции от ошибок сегментации, распознавания изображения и подготовки скана. В то же время оно не снимает более крупную задачу: для практической системы всё равно понадобятся реальные OCR/reference-фрагменты, ручная валидация и расширение корпуса на целевые татарские и башкирские источники.</w:t>
       </w:r>
     </w:p>
     <w:bookmarkEnd w:id="12"/>
@@ -436,7 +373,7 @@
         <w:pStyle w:val="FirstParagraph"/>
       </w:pPr>
       <w:r>
-        <w:t xml:space="preserve">Цель работы — разработать и оценить пилотный пайплайн на основе методов искусственного интеллекта для посткоррекции OCR-подобных ошибок в исторических тюркских текстах, записанных арабской графикой.</w:t>
+        <w:t xml:space="preserve">Цель работы — построить и оценить пилотный экспериментальный контур для посткоррекции OCR-подобных ошибок в исторических тюркских текстах, записанных арабской графикой, а также проверить, переносится ли модель, обученная на синтетических искажениях, на реальный OCR-вывод.</w:t>
       </w:r>
     </w:p>
     <w:bookmarkEnd w:id="13"/>
@@ -466,7 +403,7 @@
         </w:numPr>
       </w:pPr>
       <w:r>
-        <w:t xml:space="preserve">Описать проблему автоматической обработки исторических арабографичных тюркских текстов.</w:t>
+        <w:t xml:space="preserve">Описать особенности автоматической обработки исторических арабографичных тюркских текстов.</w:t>
       </w:r>
     </w:p>
     <w:p>
@@ -478,7 +415,7 @@
         </w:numPr>
       </w:pPr>
       <w:r>
-        <w:t xml:space="preserve">Подобрать и собрать небольшой корпус тюркского текста в арабской графике.</w:t>
+        <w:t xml:space="preserve">Собрать небольшой корпус тюркского текста в арабской графике и зафиксировать его ограничения.</w:t>
       </w:r>
     </w:p>
     <w:p>
@@ -490,7 +427,7 @@
         </w:numPr>
       </w:pPr>
       <w:r>
-        <w:t xml:space="preserve">Построить синтетический набор данных для задачи OCR post-correction.</w:t>
+        <w:t xml:space="preserve">Построить синтетический набор пар «искажённый текст → эталонный текст» для задачи посткоррекции OCR.</w:t>
       </w:r>
     </w:p>
     <w:p>
@@ -514,7 +451,7 @@
         </w:numPr>
       </w:pPr>
       <w:r>
-        <w:t xml:space="preserve">Реализовать и оценить baseline-подходы: identity baseline, rule-based normalizer и train-derived character-confusion baseline.</w:t>
+        <w:t xml:space="preserve">Реализовать и оценить базовые методы: вариант без исправления, нормализатор на правилах и символьный baseline на основе ошибок обучающей выборки.</w:t>
       </w:r>
     </w:p>
     <w:p>
@@ -526,7 +463,7 @@
         </w:numPr>
       </w:pPr>
       <w:r>
-        <w:t xml:space="preserve">Обучить нейросетевую модель ByT5-small для исправления OCR-подобных ошибок.</w:t>
+        <w:t xml:space="preserve">Обучить ByT5-small для исправления OCR-подобных ошибок и сравнить варианты с разной длиной последовательности.</w:t>
       </w:r>
     </w:p>
     <w:p>
@@ -538,7 +475,7 @@
         </w:numPr>
       </w:pPr>
       <w:r>
-        <w:t xml:space="preserve">Оценить качество моделей с помощью CER, WER, NoSpaceCER и ExactMatch.</w:t>
+        <w:t xml:space="preserve">Оценить методы с помощью CER, WER, NoSpaceCER и ExactMatch, а также провести разбор улучшенных и ухудшенных примеров.</w:t>
       </w:r>
     </w:p>
     <w:p>
@@ -550,43 +487,7 @@
         </w:numPr>
       </w:pPr>
       <w:r>
-        <w:t xml:space="preserve">Провести анализ ошибок на уровне отдельных тестовых примеров.</w:t>
-      </w:r>
-    </w:p>
-    <w:p>
-      <w:pPr>
-        <w:pStyle w:val="Compact"/>
-        <w:numPr>
-          <w:ilvl w:val="0"/>
-          <w:numId w:val="1001"/>
-        </w:numPr>
-      </w:pPr>
-      <w:r>
-        <w:t xml:space="preserve">Отдельно интерпретировать сильное снижение WER с учётом синтетических ошибок пробелов и границ слов.</w:t>
-      </w:r>
-    </w:p>
-    <w:p>
-      <w:pPr>
-        <w:pStyle w:val="Compact"/>
-        <w:numPr>
-          <w:ilvl w:val="0"/>
-          <w:numId w:val="1001"/>
-        </w:numPr>
-      </w:pPr>
-      <w:r>
-        <w:t xml:space="preserve">Провести page-level sanity check на реальном OCR-выводе Tesseract и оценить synthetic-to-real transfer.</w:t>
-      </w:r>
-    </w:p>
-    <w:p>
-      <w:pPr>
-        <w:pStyle w:val="Compact"/>
-        <w:numPr>
-          <w:ilvl w:val="0"/>
-          <w:numId w:val="1001"/>
-        </w:numPr>
-      </w:pPr>
-      <w:r>
-        <w:t xml:space="preserve">Сформулировать ограничения пилотного эксперимента и направления дальнейшей работы.</w:t>
+        <w:t xml:space="preserve">Проверить перенос на реальный OCR-вывод Tesseract и сформулировать ограничения синтетического обучения.</w:t>
       </w:r>
     </w:p>
     <w:bookmarkEnd w:id="14"/>
@@ -612,7 +513,7 @@
         <w:pStyle w:val="BodyText"/>
       </w:pPr>
       <w:r>
-        <w:t xml:space="preserve">Предмет исследования — методы автоматической посткоррекции OCR-подобных ошибок в арабографичных тюркских текстах с использованием rule-based и нейросетевых подходов.</w:t>
+        <w:t xml:space="preserve">Предмет исследования — методы автоматической посткоррекции OCR-подобных ошибок в арабографичных тюркских текстах с использованием правил, символьных замен и нейросетевой модели ByT5-small.</w:t>
       </w:r>
     </w:p>
     <w:bookmarkEnd w:id="15"/>
@@ -642,7 +543,7 @@
         </w:numPr>
       </w:pPr>
       <w:r>
-        <w:t xml:space="preserve">Улучшает ли нейросетевая посткоррекция качество синтетически искажённого арабографичного тюркского текста по сравнению с identity baseline?</w:t>
+        <w:t xml:space="preserve">Улучшает ли ByT5-small качество синтетически искажённого арабографичного тюркского текста по сравнению с базовым вариантом без исправления?</w:t>
       </w:r>
     </w:p>
     <w:p>
@@ -654,7 +555,7 @@
         </w:numPr>
       </w:pPr>
       <w:r>
-        <w:t xml:space="preserve">Достаточна ли простая rule-based нормализация для такого материала?</w:t>
+        <w:t xml:space="preserve">Достаточны ли простые правила и символьные замены для такой задачи?</w:t>
       </w:r>
     </w:p>
     <w:p>
@@ -666,7 +567,7 @@
         </w:numPr>
       </w:pPr>
       <w:r>
-        <w:t xml:space="preserve">Насколько сильным оказывается data-driven non-neural baseline, построенный на train-derived character confusions?</w:t>
+        <w:t xml:space="preserve">Насколько заметен выигрыш модели по CER, WER и NoSpaceCER, и не связан ли он преимущественно с исправлением пробелов?</w:t>
       </w:r>
     </w:p>
     <w:p>
@@ -678,7 +579,7 @@
         </w:numPr>
       </w:pPr>
       <w:r>
-        <w:t xml:space="preserve">Насколько важна длина последовательности для byte-level модели ByT5 при работе с арабской графикой?</w:t>
+        <w:t xml:space="preserve">Как влияет длина последовательности на качество byte-level модели при работе с арабской графикой?</w:t>
       </w:r>
     </w:p>
     <w:p>
@@ -690,31 +591,7 @@
         </w:numPr>
       </w:pPr>
       <w:r>
-        <w:t xml:space="preserve">Улучшает ли модель большинство тестовых примеров или только среднее значение метрики за счёт отдельных удачных случаев?</w:t>
-      </w:r>
-    </w:p>
-    <w:p>
-      <w:pPr>
-        <w:pStyle w:val="Compact"/>
-        <w:numPr>
-          <w:ilvl w:val="0"/>
-          <w:numId w:val="1002"/>
-        </w:numPr>
-      </w:pPr>
-      <w:r>
-        <w:t xml:space="preserve">Не связано ли заметное снижение WER преимущественно с исправлением синтетических ошибок пробелов и границ слов?</w:t>
-      </w:r>
-    </w:p>
-    <w:p>
-      <w:pPr>
-        <w:pStyle w:val="Compact"/>
-        <w:numPr>
-          <w:ilvl w:val="0"/>
-          <w:numId w:val="1002"/>
-        </w:numPr>
-      </w:pPr>
-      <w:r>
-        <w:t xml:space="preserve">Сохраняется ли выигрыш synthetic-trained модели на реальном OCR-выводе Tesseract для page-level османско-турецкого источника?</w:t>
+        <w:t xml:space="preserve">Сохраняется ли выигрыш модели, обученной на синтетических ошибках, на реальном OCR-выводе Tesseract?</w:t>
       </w:r>
     </w:p>
     <w:bookmarkEnd w:id="16"/>
@@ -740,15 +617,15 @@
         <w:pStyle w:val="BodyText"/>
       </w:pPr>
       <w:r>
-        <w:t xml:space="preserve">Гипотеза 1. Простая rule-based нормализация может ухудшать качество арабографичного тюркского текста, поскольку способна искажать значимые орфографические особенности.</w:t>
-      </w:r>
-    </w:p>
-    <w:p>
-      <w:pPr>
-        <w:pStyle w:val="BodyText"/>
-      </w:pPr>
-      <w:r>
-        <w:t xml:space="preserve">Гипотеза 2. Byte-level sequence-to-sequence модель ByT5-small способна улучшить качество OCR post-correction по сравнению с identity baseline.</w:t>
+        <w:t xml:space="preserve">Гипотеза 1. Простая нормализация на правилах может ухудшать качество арабографичного тюркского текста, поскольку способна искажать значимые орфографические особенности.</w:t>
+      </w:r>
+    </w:p>
+    <w:p>
+      <w:pPr>
+        <w:pStyle w:val="BodyText"/>
+      </w:pPr>
+      <w:r>
+        <w:t xml:space="preserve">Гипотеза 2. Byte-level sequence-to-sequence модель ByT5-small способна улучшить качество посткоррекции OCR по сравнению с базовым вариантом без исправления.</w:t>
       </w:r>
     </w:p>
     <w:p>
@@ -764,7 +641,7 @@
         <w:pStyle w:val="BodyText"/>
       </w:pPr>
       <w:r>
-        <w:t xml:space="preserve">Гипотеза 4. Модель, обученная только на синтетических OCR-подобных ошибках, не будет полностью переноситься на реальный page-level OCR без дополнительной адаптации на настоящих OCR/reference-парах.</w:t>
+        <w:t xml:space="preserve">Гипотеза 4. Модель, обученная только на синтетических OCR-подобных ошибках, не будет надёжно переноситься на реальный постраничный OCR без дополнительной адаптации на настоящих OCR/reference-парах.</w:t>
       </w:r>
     </w:p>
     <w:bookmarkEnd w:id="17"/>
@@ -782,15 +659,15 @@
         <w:pStyle w:val="FirstParagraph"/>
       </w:pPr>
       <w:r>
-        <w:t xml:space="preserve">Практическая значимость работы заключается в создании воспроизводимого пилотного пайплайна для обработки исторических арабографичных тюркских текстов. Разработанный подход может быть использован как основа для дальнейшего расширения корпуса, подключения реальных OCR/HTR-результатов и построения более крупного benchmark.</w:t>
-      </w:r>
-    </w:p>
-    <w:p>
-      <w:pPr>
-        <w:pStyle w:val="BodyText"/>
-      </w:pPr>
-      <w:r>
-        <w:t xml:space="preserve">Кроме того, результаты работы могут быть полезны для задач цифровой гуманитаристики: поиска по историческим текстам, подготовки корпусов, последующего извлечения именованных сущностей, анализа исторических документов и построения более сложных систем обработки архивных материалов.</w:t>
+        <w:t xml:space="preserve">Практическая значимость работы заключается в создании воспроизводимого пилотного контура для обработки исторических арабографичных тюркских текстов. Этот контур можно расширить до набора OCR/reference-пар для татарских и башкирских источников, подключить к нему реальные OCR/HTR-результаты и использовать как основу для более строгого протокола оценки.</w:t>
+      </w:r>
+    </w:p>
+    <w:p>
+      <w:pPr>
+        <w:pStyle w:val="BodyText"/>
+      </w:pPr>
+      <w:r>
+        <w:t xml:space="preserve">Результаты также полезны для цифровой гуманитаристики. Более качественная посткоррекция OCR может облегчить поиск по историческим текстам, подготовку корпусов, извлечение именованных сущностей, сопоставление архивных записей и последующий анализ исторических документов. При этом текущая работа показывает не только возможность улучшения на синтетическом наборе, но и границу такого подхода: без реальных OCR/reference-фрагментов практическое применение остаётся ограниченным.</w:t>
       </w:r>
     </w:p>
     <w:bookmarkEnd w:id="18"/>
@@ -808,7 +685,7 @@
         <w:pStyle w:val="FirstParagraph"/>
       </w:pPr>
       <w:r>
-        <w:t xml:space="preserve">Работа состоит из нескольких частей. В первой части формулируются актуальность, проблема, цель и задачи исследования. Во второй части рассматриваются особенности OCR и посткоррекции для исторических документов и арабографичных текстов. В третьей части описываются корпус и процесс построения синтетического набора данных. В четвёртой части представлена методология экспериментов, включая baseline-подходы, train-derived character-confusion baseline и модель ByT5-small. В пятой части приводятся результаты и анализ ошибок. В заключении формулируются ограничения и направления дальнейшей работы.</w:t>
+        <w:t xml:space="preserve">Далее работа устроена следующим образом. В разделе 2 рассматриваются OCR исторических документов, арабографичное распознавание, посткоррекция OCR и синтетические данные. В разделе 3 описываются корпус и построение синтетического набора. В разделе 4 приводится методология экспериментов. В разделе 5 представлены результаты, анализ ошибок и проверка на реальном OCR. В заключении формулируются ограничения и направления дальнейшей работы.</w:t>
       </w:r>
     </w:p>
     <w:bookmarkEnd w:id="19"/>

</xml_diff>

<commit_message>
build(paper): rebuild final HSE docx after polish
</commit_message>
<xml_diff>
--- a/outputs/course_paper_hse_final.docx
+++ b/outputs/course_paper_hse_final.docx
@@ -222,15 +222,15 @@
         <w:pStyle w:val="FirstParagraph"/>
       </w:pPr>
       <w:r>
-        <w:t xml:space="preserve">Работа посвящена посткоррекции ошибок OCR в исторических тюркских текстах, записанных арабской графикой. Полная задача распознавания таких источников включает подготовку сканов, сегментацию, OCR/HTR, исправление вывода и ручную проверку; в этой работе рассматривается один более узкий этап — исправление уже полученного текстового вывода.</w:t>
-      </w:r>
-    </w:p>
-    <w:p>
-      <w:pPr>
-        <w:pStyle w:val="BodyText"/>
-      </w:pPr>
-      <w:r>
-        <w:t xml:space="preserve">В качестве пилотного материала используется османско-турецкий текст в арабской графике. Он рассматривается не как старотатарский или старобашкирский датасет, а как родственный арабографичный тюркский проверочный случай, позволяющий отработать протокол оценки. На основе проверенных строк построен синтетический набор пар «искажённый текст — эталонный текст». В эксперименте сравниваются базовый метод без исправления, нормализатор на правилах, символьный baseline на основе ошибок обучающей выборки и модель ByT5-small.</w:t>
+        <w:t xml:space="preserve">В работе исследуется посткоррекция OCR-вывода для исторических тюркских текстов в арабской графике. Полный цикл распознавания изображений здесь не строится: эксперимент ограничен текстовым этапом, где на вход подаётся OCR-строка, а на выходе ожидается исправленный вариант, сопоставимый с эталоном.</w:t>
+      </w:r>
+    </w:p>
+    <w:p>
+      <w:pPr>
+        <w:pStyle w:val="BodyText"/>
+      </w:pPr>
+      <w:r>
+        <w:t xml:space="preserve">Пилотным материалом служит османско-турецкий текст в арабской графике. Он не заменяет старотатарский или старобашкирский набор данных, но позволяет проверить протокол на близком тюркском материале. На основе проверенных строк построен синтетический набор пар «искажённый текст — эталонный текст». В эксперименте сравниваются метод без исправления, нормализатор на правилах, символьный метод на основе ошибок обучающей выборки и ByT5-small.</w:t>
       </w:r>
     </w:p>
     <w:p>
@@ -246,7 +246,7 @@
         <w:pStyle w:val="BodyText"/>
       </w:pPr>
       <w:r>
-        <w:t xml:space="preserve">Поэтому основной результат работы состоит не в создании готовой OCR-системы, а в построении воспроизводимого экспериментального контура и фиксации разрыва между синтетической и реальной оценкой. Для практического применения необходим следующий этап: выровненные OCR/reference-фрагменты, обучение на настоящих OCR-ошибках, проверка на татарских и башкирских источниках и ручной анализ ошибок.</w:t>
+        <w:t xml:space="preserve">Главный результат работы состоит не в создании готовой OCR-системы, а в построении воспроизводимого протокола оценки и фиксации разрыва между синтетической и реальной проверкой. Для практического применения нужны выровненные пары «OCR-вывод — эталон», обучение на настоящих OCR-ошибках, проверка на татарских и башкирских источниках и ручной анализ ошибок.</w:t>
       </w:r>
     </w:p>
     <w:bookmarkStart w:id="10" w:name="введение"/>
@@ -279,15 +279,15 @@
         <w:pStyle w:val="BodyText"/>
       </w:pPr>
       <w:r>
-        <w:t xml:space="preserve">В этой работе не ставится задача решить всю проблему распознавания исторических документов. Полная технологическая цепочка включает поиск источника, обработку изображения, разметку строк, OCR/HTR, посткоррекцию, проверку текста и последующий анализ. Здесь выбран один более узкий слой — исправление уже полученного текстового вывода. Такое сужение позволяет отдельно задать входной OCR-текст, эталон, метрики качества и методы сравнения.</w:t>
-      </w:r>
-    </w:p>
-    <w:p>
-      <w:pPr>
-        <w:pStyle w:val="BodyText"/>
-      </w:pPr>
-      <w:r>
-        <w:t xml:space="preserve">Работа проверяет важное ограничение синтетического подхода. Если реальных пар «OCR-вывод — проверенный эталон» мало, естественно начать с искусственно внесённых ошибок. Но успех на таком наборе сам по себе не доказывает, что модель будет работать на настоящем OCR. Поэтому в работе есть два уровня оценки: контролируемый тест на синтетических искажениях и отдельная постраничная проверка на реальном OCR османско-турецкого печатного источника.</w:t>
+        <w:t xml:space="preserve">В этой работе не ставится задача решить всю проблему распознавания исторических документов. Полная технологическая цепочка включает поиск источника, обработку изображения, разметку строк, OCR/HTR, посткоррекцию, проверку текста и последующий анализ. Здесь рассматривается более узкий слой: исправление уже полученного текстового вывода. Такое сужение делает эксперимент проверяемым: на вход подаётся OCR-текст, на выходе получается исправленная строка, а качество измеряется относительно эталона.</w:t>
+      </w:r>
+    </w:p>
+    <w:p>
+      <w:pPr>
+        <w:pStyle w:val="BodyText"/>
+      </w:pPr>
+      <w:r>
+        <w:t xml:space="preserve">Работа проверяет важное ограничение синтетического подхода. Если реальных пар «OCR-вывод — проверенный эталон» мало, естественный первый шаг состоит в искусственной генерации ошибок. Но успех на таком наборе не подтверждает работу модели на настоящем OCR. Поэтому эксперимент разделён на два уровня: контролируемую проверку на синтетических искажениях и отдельную постраничную проверку на реальном OCR османско-турецкого печатного источника.</w:t>
       </w:r>
     </w:p>
     <w:bookmarkEnd w:id="10"/>
@@ -321,7 +321,7 @@
         <w:pStyle w:val="BodyText"/>
       </w:pPr>
       <w:r>
-        <w:t xml:space="preserve">Отдельная причина актуальности — нехватка воспроизводимых тестовых наборов и протоколов оценки. Для низкоресурсного исторического материала недостаточно показать один удачный пример исправления. Нужно фиксировать источник данных, процедуру генерации или получения OCR, разбиение на обучающую и тестовую части, метрики и худшие случаи. Поэтому в работе акцент сделан не только на итоговых значениях CER и WER, но и на воспроизводимом экспериментальном контуре.</w:t>
+        <w:t xml:space="preserve">Ещё одна причина актуальности связана с нехваткой воспроизводимых тестовых наборов и протоколов оценки. Для низкоресурсного исторического материала недостаточно показать один удачный пример исправления. Нужно фиксировать источник данных, процедуру генерации или получения OCR, разбиение на обучающую и тестовую части, метрики и худшие случаи. Поэтому в работе важны не только значения CER и WER, но и воспроизводимый протокол оценки.</w:t>
       </w:r>
     </w:p>
     <w:bookmarkEnd w:id="11"/>
@@ -347,15 +347,15 @@
         <w:pStyle w:val="BodyText"/>
       </w:pPr>
       <w:r>
-        <w:t xml:space="preserve">В этой работе проблема сужается до проверяемой пилотной постановки. Нужно построить пары «искажённый OCR-текст — эталон», обучить и сравнить несколько методов посткоррекции, а затем проверить, переносится ли результат с синтетических ошибок на реальный OCR. Важное ограничение формулируется заранее: османско-турецкий источник используется как связанный арабографичный тюркский проверочный материал, но не подаётся как старотатарский или старобашкирский датасет.</w:t>
-      </w:r>
-    </w:p>
-    <w:p>
-      <w:pPr>
-        <w:pStyle w:val="BodyText"/>
-      </w:pPr>
-      <w:r>
-        <w:t xml:space="preserve">Такое сужение позволяет отделить ошибки посткоррекции от ошибок сегментации, распознавания изображения и подготовки скана. В то же время оно не снимает более крупную задачу: для практической системы всё равно понадобятся реальные OCR/reference-фрагменты, ручная валидация и расширение корпуса на целевые татарские и башкирские источники.</w:t>
+        <w:t xml:space="preserve">В этой работе проблема сведена к проверяемой постановке. Нужно построить пары «искажённый OCR-текст — эталон», обучить и сравнить несколько методов посткоррекции, а затем проверить перенос с синтетических ошибок на реальный OCR. Важное ограничение формулируется заранее: османско-турецкий источник используется как близкий тюркский материал в арабской графике, но не подаётся как старотатарский или старобашкирский набор данных.</w:t>
+      </w:r>
+    </w:p>
+    <w:p>
+      <w:pPr>
+        <w:pStyle w:val="BodyText"/>
+      </w:pPr>
+      <w:r>
+        <w:t xml:space="preserve">Такое сужение позволяет отделить ошибки посткоррекции от ошибок сегментации, распознавания изображения и подготовки скана. В то же время оно не снимает более крупную задачу: для практической системы всё равно понадобятся реальные пары «OCR-вывод — эталон», ручная валидация и расширение корпуса на целевые татарские и башкирские источники.</w:t>
       </w:r>
     </w:p>
     <w:bookmarkEnd w:id="12"/>
@@ -373,7 +373,7 @@
         <w:pStyle w:val="FirstParagraph"/>
       </w:pPr>
       <w:r>
-        <w:t xml:space="preserve">Цель работы — построить и оценить пилотный экспериментальный контур для посткоррекции OCR-подобных ошибок в исторических тюркских текстах, записанных арабской графикой, а также проверить, переносится ли модель, обученная на синтетических искажениях, на реальный OCR-вывод.</w:t>
+        <w:t xml:space="preserve">Цель работы состоит в построении и оценке протокола посткоррекции OCR-подобных ошибок для исторических тюркских текстов в арабской графике, а также в проверке переноса модели с синтетических искажений на реальный OCR-вывод.</w:t>
       </w:r>
     </w:p>
     <w:bookmarkEnd w:id="13"/>
@@ -403,7 +403,7 @@
         </w:numPr>
       </w:pPr>
       <w:r>
-        <w:t xml:space="preserve">Описать особенности автоматической обработки исторических арабографичных тюркских текстов.</w:t>
+        <w:t xml:space="preserve">Описать особенности автоматической обработки тюркских текстов в арабской графике.</w:t>
       </w:r>
     </w:p>
     <w:p>
@@ -439,7 +439,7 @@
         </w:numPr>
       </w:pPr>
       <w:r>
-        <w:t xml:space="preserve">Выполнить разбиение данных на train/valid/test без утечки исходных строк между выборками.</w:t>
+        <w:t xml:space="preserve">Выполнить разбиение данных на обучающую, валидационную и тестовую выборки без утечки исходных строк.</w:t>
       </w:r>
     </w:p>
     <w:p>
@@ -451,7 +451,7 @@
         </w:numPr>
       </w:pPr>
       <w:r>
-        <w:t xml:space="preserve">Реализовать и оценить базовые методы: вариант без исправления, нормализатор на правилах и символьный baseline на основе ошибок обучающей выборки.</w:t>
+        <w:t xml:space="preserve">Реализовать и оценить базовые методы: вариант без исправления, нормализатор на правилах и символьный метод на основе ошибок обучающей выборки.</w:t>
       </w:r>
     </w:p>
     <w:p>
@@ -505,15 +505,15 @@
         <w:pStyle w:val="FirstParagraph"/>
       </w:pPr>
       <w:r>
-        <w:t xml:space="preserve">Объект исследования — исторические тюркские тексты, записанные арабской графикой.</w:t>
-      </w:r>
-    </w:p>
-    <w:p>
-      <w:pPr>
-        <w:pStyle w:val="BodyText"/>
-      </w:pPr>
-      <w:r>
-        <w:t xml:space="preserve">Предмет исследования — методы автоматической посткоррекции OCR-подобных ошибок в арабографичных тюркских текстах с использованием правил, символьных замен и нейросетевой модели ByT5-small.</w:t>
+        <w:t xml:space="preserve">Объект исследования составляют исторические тюркские тексты в арабской графике.</w:t>
+      </w:r>
+    </w:p>
+    <w:p>
+      <w:pPr>
+        <w:pStyle w:val="BodyText"/>
+      </w:pPr>
+      <w:r>
+        <w:t xml:space="preserve">Предмет исследования составляют методы посткоррекции OCR-подобных ошибок в таких текстах: правила, символьные замены и нейросетевая модель ByT5-small.</w:t>
       </w:r>
     </w:p>
     <w:bookmarkEnd w:id="15"/>
@@ -579,7 +579,7 @@
         </w:numPr>
       </w:pPr>
       <w:r>
-        <w:t xml:space="preserve">Как влияет длина последовательности на качество byte-level модели при работе с арабской графикой?</w:t>
+        <w:t xml:space="preserve">Как влияет максимальная длина последовательности на качество модели с байтовым представлением при работе с арабской графикой?</w:t>
       </w:r>
     </w:p>
     <w:p>
@@ -625,23 +625,23 @@
         <w:pStyle w:val="BodyText"/>
       </w:pPr>
       <w:r>
-        <w:t xml:space="preserve">Гипотеза 2. Byte-level sequence-to-sequence модель ByT5-small способна улучшить качество посткоррекции OCR по сравнению с базовым вариантом без исправления.</w:t>
-      </w:r>
-    </w:p>
-    <w:p>
-      <w:pPr>
-        <w:pStyle w:val="BodyText"/>
-      </w:pPr>
-      <w:r>
-        <w:t xml:space="preserve">Гипотеза 3. Увеличение длины последовательности с 256 до 512 важно для арабографичного текста, поскольку ByT5 работает на уровне байтов, а один видимый символ арабской графики может занимать несколько байтов.</w:t>
-      </w:r>
-    </w:p>
-    <w:p>
-      <w:pPr>
-        <w:pStyle w:val="BodyText"/>
-      </w:pPr>
-      <w:r>
-        <w:t xml:space="preserve">Гипотеза 4. Модель, обученная только на синтетических OCR-подобных ошибках, не будет надёжно переноситься на реальный постраничный OCR без дополнительной адаптации на настоящих OCR/reference-парах.</w:t>
+        <w:t xml:space="preserve">Гипотеза 2. Модель ByT5-small с байтовым представлением способна улучшить качество посткоррекции OCR по сравнению с методом без исправления.</w:t>
+      </w:r>
+    </w:p>
+    <w:p>
+      <w:pPr>
+        <w:pStyle w:val="BodyText"/>
+      </w:pPr>
+      <w:r>
+        <w:t xml:space="preserve">Гипотеза 3. Увеличение максимальной длины последовательности с 256 до 512 должно улучшить результат, поскольку ByT5 кодирует текст на уровне байтов, а один видимый символ арабской графики может занимать несколько байтов.</w:t>
+      </w:r>
+    </w:p>
+    <w:p>
+      <w:pPr>
+        <w:pStyle w:val="BodyText"/>
+      </w:pPr>
+      <w:r>
+        <w:t xml:space="preserve">Гипотеза 4. Модель, обученная только на синтетических OCR-подобных ошибках, не будет надёжно переноситься на реальный постраничный OCR без адаптации на настоящих парах «OCR-вывод — эталон».</w:t>
       </w:r>
     </w:p>
     <w:bookmarkEnd w:id="17"/>
@@ -659,15 +659,15 @@
         <w:pStyle w:val="FirstParagraph"/>
       </w:pPr>
       <w:r>
-        <w:t xml:space="preserve">Практическая значимость работы заключается в создании воспроизводимого пилотного контура для обработки исторических арабографичных тюркских текстов. Этот контур можно расширить до набора OCR/reference-пар для татарских и башкирских источников, подключить к нему реальные OCR/HTR-результаты и использовать как основу для более строгого протокола оценки.</w:t>
-      </w:r>
-    </w:p>
-    <w:p>
-      <w:pPr>
-        <w:pStyle w:val="BodyText"/>
-      </w:pPr>
-      <w:r>
-        <w:t xml:space="preserve">Результаты также полезны для цифровой гуманитаристики. Более качественная посткоррекция OCR может облегчить поиск по историческим текстам, подготовку корпусов, извлечение именованных сущностей, сопоставление архивных записей и последующий анализ исторических документов. При этом текущая работа показывает не только возможность улучшения на синтетическом наборе, но и границу такого подхода: без реальных OCR/reference-фрагментов практическое применение остаётся ограниченным.</w:t>
+        <w:t xml:space="preserve">Практическая значимость работы состоит в подготовке воспроизводимого протокола для обработки тюркских текстов в арабской графике. Его можно расширить до набора пар «OCR-вывод — эталон» для татарских и башкирских источников, подключить реальные OCR/HTR-результаты и использовать как основу для более строгой оценки.</w:t>
+      </w:r>
+    </w:p>
+    <w:p>
+      <w:pPr>
+        <w:pStyle w:val="BodyText"/>
+      </w:pPr>
+      <w:r>
+        <w:t xml:space="preserve">Практический смысл результата связан с цифровой гуманитаристикой. После появления реальных пар «OCR-вывод — эталон» такой протокол можно использовать для поиска по историческим текстам, подготовки корпусов, извлечения именованных сущностей и сопоставления архивных записей. Текущая версия остаётся ограниченной: она показывает разрыв между синтетической и реальной оценкой, но не даёт готового корректора для архивных сканов.</w:t>
       </w:r>
     </w:p>
     <w:bookmarkEnd w:id="18"/>
@@ -712,23 +712,23 @@
         <w:pStyle w:val="FirstParagraph"/>
       </w:pPr>
       <w:r>
-        <w:t xml:space="preserve">OCR исторических документов отличается от распознавания современных печатных текстов не одной отдельной трудностью, а сочетанием факторов: качеством скана, типографикой, состоянием страницы, сегментацией строк, структурой страницы и исторической вариативностью письма. Поэтому в работах по historical OCR задача обычно рассматривается не только как запуск модели распознавания, а как воспроизводимый процесс: подготовка изображения, сегментация, создание ground truth, обучение или настройка OCR/HTR, постобработка и ручная валидация.</w:t>
-      </w:r>
-    </w:p>
-    <w:p>
-      <w:pPr>
-        <w:pStyle w:val="BodyText"/>
-      </w:pPr>
-      <w:r>
-        <w:t xml:space="preserve">Такой взгляд важен для данной работы, потому что рассматриваемая модель не заменяет OCR-систему целиком. Она работает на следующем уровне обработки — после получения OCR-вывода. В этом смысле постановка ближе к посткоррекции OCR, чем к end-to-end OCR/HTR. Работы по OCR4all показывают, что для исторических печатных источников важна именно связка инструментов, а не отдельная модель распознавания (Reul et al., 2019). Работы по ground truth для исторического OCR отдельно подчёркивают, что качество оценки зависит от корректного соответствия между изображением, строкой и эталонной транскрипцией (Springmann et al., 2018).</w:t>
-      </w:r>
-    </w:p>
-    <w:p>
-      <w:pPr>
-        <w:pStyle w:val="BodyText"/>
-      </w:pPr>
-      <w:r>
-        <w:t xml:space="preserve">Современные OCR-модели также всё чаще строятся на transformer-based подходах. Например, TrOCR использует предобученные image- и text-transformer компоненты и показывает, что сама OCR-модель может выигрывать от pretraining и fine-tuning на размеченных данных (Li et al., 2021). Однако это направление относится к распознаванию изображения, тогда как настоящая работа сознательно ограничена текстовой посткоррекцией. Такое ограничение делает эксперимент уже, но позволяет отдельно проверить вопрос: может ли модель исправлять уже полученный OCR-output, не смешивая этот результат с качеством segmentation или image recognition.</w:t>
+        <w:t xml:space="preserve">OCR исторических документов отличается от распознавания современных печатных текстов не одной отдельной трудностью, а сочетанием факторов: качеством скана, типографикой, состоянием страницы, сегментацией строк, структурой страницы и исторической вариативностью письма. Поэтому в работах по OCR исторических документов задача обычно рассматривается не только как запуск модели распознавания, а как воспроизводимый процесс: подготовка изображения, сегментация, создание эталонной разметки, обучение или настройка OCR/HTR, постобработка и ручная валидация.</w:t>
+      </w:r>
+    </w:p>
+    <w:p>
+      <w:pPr>
+        <w:pStyle w:val="BodyText"/>
+      </w:pPr>
+      <w:r>
+        <w:t xml:space="preserve">Для этой работы такой взгляд важен по двум причинам. Во-первых, рассматриваемая модель не заменяет OCR-систему целиком: она работает после получения OCR-вывода. Во-вторых, качество оценки зависит от связи между изображением, строкой и эталонной транскрипцией. OCR4all показывает значимость связки инструментов для исторических печатных источников (Reul et al., 2019), а работы об эталонной разметке подчёркивают необходимость корректного соответствия между изображением и эталоном (Springmann et al., 2018).</w:t>
+      </w:r>
+    </w:p>
+    <w:p>
+      <w:pPr>
+        <w:pStyle w:val="BodyText"/>
+      </w:pPr>
+      <w:r>
+        <w:t xml:space="preserve">Современные OCR-модели также всё чаще строятся на трансформерных подходах. Например, TrOCR использует предобученные компоненты визуального и текстового трансформеров и показывает, что сама OCR-модель может выигрывать от предобучения и дообучения на размеченных данных (Li et al., 2021). Однако это направление относится к распознаванию изображения, тогда как настоящая работа ограничена текстовой посткоррекцией. Такое ограничение сужает эксперимент, зато позволяет проверить отдельный вопрос: может ли модель исправлять уже полученный OCR-вывод без смешения этого результата с качеством сегментации и распознавания изображения.</w:t>
       </w:r>
     </w:p>
     <w:bookmarkEnd w:id="20"/>
@@ -746,15 +746,15 @@
         <w:pStyle w:val="FirstParagraph"/>
       </w:pPr>
       <w:r>
-        <w:t xml:space="preserve">Arabic-script OCR обычно рассматривается как отдельный класс задач. Буквы меняют форму в зависимости от позиции в слове, письмо является связным, а различия между рядом символов могут задаваться небольшими графическими элементами, например точками. В обзорах по Arabic OCR эти свойства выделяются как одна из причин, по которым прямой перенос подходов, хорошо работающих для латинской графики, оказывается недостаточным (Kasem et al., 2023). Для печатных арабографичных материалов дополнительно важны многошрифтовость, близость начертаний и нестабильность качества сканов (Osman et al., 2020).</w:t>
-      </w:r>
-    </w:p>
-    <w:p>
-      <w:pPr>
-        <w:pStyle w:val="BodyText"/>
-      </w:pPr>
-      <w:r>
-        <w:t xml:space="preserve">Для данной работы это означает, что ошибка OCR не сводится к случайной замене символа на символ. В арабской графике похожие графемы могут отличаться небольшими деталями, а ошибка сегментации или порядка чтения может резко ухудшать последующую посткоррекцию. Поэтому synthetic noise generator может быть полезен как контролируемая постановка, но он не обязан совпадать с реальными ошибками Tesseract или другой OCR/HTR-системы.</w:t>
+        <w:t xml:space="preserve">OCR для арабской графики обычно рассматривается как отдельный класс задач. Буквы меняют форму в зависимости от позиции в слове, письмо является связным, а различия между рядом символов могут задаваться небольшими графическими элементами, например точками. В обзорах OCR для арабской графики эти свойства выделяются как одна из причин, по которым прямой перенос подходов, хорошо работающих для латинской графики, оказывается недостаточным (Kasem et al., 2023). Для печатных арабографичных материалов дополнительно важны многошрифтовость, близость начертаний и нестабильность качества сканов (Osman et al., 2020).</w:t>
+      </w:r>
+    </w:p>
+    <w:p>
+      <w:pPr>
+        <w:pStyle w:val="BodyText"/>
+      </w:pPr>
+      <w:r>
+        <w:t xml:space="preserve">Для данной работы это означает, что ошибка OCR не сводится к случайной замене символа на символ. В арабской графике похожие графемы могут отличаться небольшими деталями, а ошибка сегментации или порядка чтения может резко ухудшать последующую посткоррекцию. Поэтому генератор синтетического шума полезен как контролируемая постановка, но его ошибки не обязаны совпадать с реальными ошибками Tesseract или другой OCR/HTR-системы.</w:t>
       </w:r>
     </w:p>
     <w:p>
@@ -770,7 +770,7 @@
         <w:pStyle w:val="BodyText"/>
       </w:pPr>
       <w:r>
-        <w:t xml:space="preserve">Именно здесь возникает связь между синтетической и реальной проверкой. В синтетической постановке можно контролировать типы искажений и разбиение на train/test. В реальном OCR появляются дополнительные факторы: структура страницы, шрифт, качество изображения, строковая сегментация, направление письма и особенности конкретной OCR-системы. Поэтому результаты на синтетическом наборе нужно проверять отдельно на настоящем OCR-выводе, а не переносить автоматически.</w:t>
+        <w:t xml:space="preserve">Именно здесь возникает разрыв между синтетической и реальной проверкой. В синтетической постановке можно контролировать типы искажений и разбиение на обучающую и тестовую выборки. В реальном OCR появляются дополнительные факторы: структура страницы, шрифт, качество изображения, сегментация строк, направление письма и особенности конкретной OCR-системы. Поэтому результаты на синтетическом наборе нельзя автоматически переносить на настоящий OCR-вывод.</w:t>
       </w:r>
     </w:p>
     <w:bookmarkEnd w:id="21"/>
@@ -788,33 +788,33 @@
         <w:pStyle w:val="FirstParagraph"/>
       </w:pPr>
       <w:r>
-        <w:t xml:space="preserve">Тюркские языки в разные исторические периоды использовали разные письменности, включая арабскую графику. Для османско-тюркских материалов эта проблема особенно заметна: после перехода турецкого языка на латиницу значительная часть печатного наследия осталась в форме, трудной для массового поиска и автоматической обработки. Работы по автоматической транскрипции османско-турецких периодических изданий показывают, что non-Latin script archives требуют отдельной инфраструктуры, подготовки данных и проверки качества распознавания (Kirmizialtin &amp; Wrisley, 2020).</w:t>
-      </w:r>
-    </w:p>
-    <w:p>
-      <w:pPr>
-        <w:pStyle w:val="BodyText"/>
-      </w:pPr>
-      <w:r>
-        <w:t xml:space="preserve">В этой работе османско-турецкий источник используется как связанный арабографичный тюркский проверочный материал. Текущая проверка на реальном OCR не является старотатарским или старобашкирским датасетом. Старотатарские и старобашкирские источники остаются целевой мотивацией дальнейшего исследования, а османско-турецкий материал используется потому, что для него удалось сопоставить сканы страниц и постраничный эталонный текст.</w:t>
-      </w:r>
-    </w:p>
-    <w:p>
-      <w:pPr>
-        <w:pStyle w:val="BodyText"/>
-      </w:pPr>
-      <w:r>
-        <w:t xml:space="preserve">С точки зрения NLP такие материалы относятся к низкоресурсным историческим данным. Для них меньше размеченных корпусов, стандартных бенчмарков, готовых моделей и инструментов, чем для современных массовых языков. Современные работы по Historical Turkish NLP отдельно подчёркивают необходимость создавать базовые ресурсы: корпуса, модели, разметку и инструменты для последующего анализа исторических текстов (Özateş et al., 2025). Настоящая работа занимает в этой цепочке узкое место: она не строит полный корпус Historical Turkish NLP, а проверяет воспроизводимый контур посткоррекции.</w:t>
+        <w:t xml:space="preserve">Тюркские языки в разные исторические периоды использовали разные письменности, включая арабскую графику. Для османско-тюркских материалов эта проблема особенно заметна: после перехода турецкого языка на латиницу значительная часть печатного наследия осталась в форме, трудной для массового поиска и автоматической обработки. Работы по автоматической транскрипции османско-турецких периодических изданий показывают, что архивы на нелатинской графике требуют отдельной инфраструктуры, подготовки данных и проверки качества распознавания (Kirmizialtin &amp; Wrisley, 2020).</w:t>
+      </w:r>
+    </w:p>
+    <w:p>
+      <w:pPr>
+        <w:pStyle w:val="BodyText"/>
+      </w:pPr>
+      <w:r>
+        <w:t xml:space="preserve">В этой работе османско-турецкий источник используется как близкий тюркский материал в арабской графике. Проверка на реальном OCR не является старотатарским или старобашкирским набором данных. Татарские и башкирские источники остаются целью следующего этапа, а османско-турецкий материал выбран потому, что для него удалось сопоставить сканы страниц и постраничный эталонный текст.</w:t>
+      </w:r>
+    </w:p>
+    <w:p>
+      <w:pPr>
+        <w:pStyle w:val="BodyText"/>
+      </w:pPr>
+      <w:r>
+        <w:t xml:space="preserve">С точки зрения обработки естественного языка такие материалы относятся к низкоресурсным историческим данным. Для них меньше размеченных корпусов, стандартных бенчмарков, готовых моделей и инструментов, чем для современных массовых языков. Современные работы по обработке исторического турецкого языка подчёркивают необходимость создавать базовые ресурсы: корпуса, модели, разметку и инструменты для анализа исторических текстов (Özateş et al., 2025). Настоящая работа занимает в этой цепочке более узкое место: она не строит полный корпус, а проверяет протокол посткоррекции.</w:t>
       </w:r>
     </w:p>
     <w:bookmarkEnd w:id="22"/>
-    <w:bookmarkStart w:id="23" w:name="X5119707d5b2fc17c5036a9d6f06fdef8e5da786"/>
+    <w:bookmarkStart w:id="23" w:name="Xfcaf842918234d7c399beca909495522023c2d4"/>
     <w:p>
       <w:pPr>
         <w:pStyle w:val="Heading3"/>
       </w:pPr>
       <w:r>
-        <w:t xml:space="preserve">2.4 Post-OCR correction как задача noisy-to-clean преобразования</w:t>
+        <w:t xml:space="preserve">2.4 Посткоррекция OCR как преобразование искажённого текста в эталонный</w:t>
       </w:r>
     </w:p>
     <w:p>
@@ -822,49 +822,49 @@
         <w:pStyle w:val="FirstParagraph"/>
       </w:pPr>
       <w:r>
-        <w:t xml:space="preserve">Post-OCR correction — это задача преобразования ошибочного OCR-вывода в более корректный текст. На уровне строки или короткого фрагмента она естественно формулируется как sequence-to-sequence задача: модель получает noisy/OCR text и должна восстановить clean text. Такой подход используется в работах по neural post-OCR correction, включая NMT-based методы и character-level sequence-to-sequence модели (Hämäläinen &amp; Hengchen, 2019; Ramirez-Orta et al., 2021).</w:t>
-      </w:r>
-    </w:p>
-    <w:p>
-      <w:pPr>
-        <w:pStyle w:val="BodyText"/>
-      </w:pPr>
-      <w:r>
-        <w:t xml:space="preserve">При этом post-correction нельзя полностью отождествлять с нормализацией исторического написания. OCR correction исправляет технические ошибки распознавания, а spelling normalization может менять варианты написания в сторону некоторой нормы. В литературе эти задачи иногда рассматриваются рядом, но для исторического материала их важно разводить, чтобы не стереть значимые орфографические особенности (Duong et al., 2020).</w:t>
-      </w:r>
-    </w:p>
-    <w:p>
-      <w:pPr>
-        <w:pStyle w:val="BodyText"/>
-      </w:pPr>
-      <w:r>
-        <w:t xml:space="preserve">Для исторических корпусов особенно важна character-level оценка. Ошибки OCR появляются из-за похожих графем, нестабильных шрифтов, качества скана, старой орфографии и сегментации слов. Lyu et al. (2021) отдельно связывают post-hoc correction исторических корпусов с character-level ошибками, word segmentation и исторической вариативностью языка. Это близко к метрикам настоящей работы: CER и NoSpaceCER здесь важнее, чем один только WER, потому что word-level улучшение может возникать из-за исправления пробелов, не гарантируя лучшего распознавания символов.</w:t>
-      </w:r>
-    </w:p>
-    <w:p>
-      <w:pPr>
-        <w:pStyle w:val="BodyText"/>
-      </w:pPr>
-      <w:r>
-        <w:t xml:space="preserve">Для низкоресурсных языков посткоррекция дополнительно ограничивается нехваткой вручную проверенных OCR/reference-пар. Rijhwani et al. (2021) показывают, что neural post-correction для less-well-resourced and endangered languages зависит от scarce curated correction data, а self-training и lexically-aware decoding могут помочь использовать неразмеченные изображения и распознанные тексты. Это напрямую связано с дальнейшей частью данной работы: обучение только на синтетическом шуме даёт контролируемую базовую проверку, но следующий шаг требует адаптации к реальным OCR-ошибкам на выровненных OCR/reference-фрагментах.</w:t>
-      </w:r>
-    </w:p>
-    <w:p>
-      <w:pPr>
-        <w:pStyle w:val="BodyText"/>
-      </w:pPr>
-      <w:r>
-        <w:t xml:space="preserve">Отдельная современная линия исследований — использование больших языковых моделей для OCR correction. Kanerva et al. (2025) показывают, что LLM-based post-correction для historical documents не даёт универсального бесплатного выигрыша: эффект зависит от языка, данных и постановки. Этот вывод важен для интерпретации настоящего эксперимента. Отрицательный или смешанный перенос модели, обученной на синтетических искажениях, на реальный OCR не является неожиданным провалом, а отражает известную проблему post-OCR correction: качество коррекции зависит от домена, языка, структуры ошибок и объёма реальных размеченных OCR/reference пар.</w:t>
+        <w:t xml:space="preserve">Под посткоррекцией OCR понимается преобразование ошибочного OCR-вывода в более корректный текст. На уровне строки или короткого фрагмента эта задача формулируется как преобразование одной последовательности в другую: модель получает искажённый или OCR-текст и должна восстановить эталонный текст. Такой подход используется в работах по нейросетевой посткоррекции OCR, включая методы на основе нейронного машинного перевода и посимвольные модели преобразования последовательностей (Hämäläinen &amp; Hengchen, 2019; Ramirez-Orta et al., 2021).</w:t>
+      </w:r>
+    </w:p>
+    <w:p>
+      <w:pPr>
+        <w:pStyle w:val="BodyText"/>
+      </w:pPr>
+      <w:r>
+        <w:t xml:space="preserve">При этом посткоррекцию OCR нельзя полностью отождествлять с нормализацией исторического написания. Коррекция OCR исправляет технические ошибки распознавания, а нормализация орфографии может менять варианты написания в сторону некоторой нормы. В литературе эти задачи иногда рассматриваются рядом, но для исторического материала их важно разводить, чтобы не стереть значимые орфографические особенности (Duong et al., 2020).</w:t>
+      </w:r>
+    </w:p>
+    <w:p>
+      <w:pPr>
+        <w:pStyle w:val="BodyText"/>
+      </w:pPr>
+      <w:r>
+        <w:t xml:space="preserve">Для исторических корпусов особенно важна оценка на уровне символов. Ошибки OCR появляются из-за похожих графем, нестабильных шрифтов, качества скана, старой орфографии и сегментации слов. Lyu et al. (2021) связывают последующую коррекцию исторических корпусов с посимвольными ошибками, сегментацией слов и исторической вариативностью языка. Это близко к метрикам настоящей работы: CER и NoSpaceCER здесь важнее, чем один только WER, потому что улучшение на уровне слов может возникать из-за исправления пробелов и не гарантировать лучшего распознавания символов.</w:t>
+      </w:r>
+    </w:p>
+    <w:p>
+      <w:pPr>
+        <w:pStyle w:val="BodyText"/>
+      </w:pPr>
+      <w:r>
+        <w:t xml:space="preserve">Для низкоресурсных языков посткоррекция дополнительно ограничивается нехваткой вручную проверенных пар «OCR-вывод — эталон». Rijhwani et al. (2021) показывают, что нейросетевая посткоррекция для низкоресурсных и исчезающих языков зависит от дефицита вручную подготовленных коррекционных данных, а самообучение и декодирование с учётом лексики помогают использовать неразмеченные изображения и распознанные тексты. Это напрямую связано с данной работой: обучение только на синтетическом шуме даёт контролируемую базовую проверку, но следующий шаг требует адаптации к реальным OCR-ошибкам на выровненных парах.</w:t>
+      </w:r>
+    </w:p>
+    <w:p>
+      <w:pPr>
+        <w:pStyle w:val="BodyText"/>
+      </w:pPr>
+      <w:r>
+        <w:t xml:space="preserve">Отдельная современная линия исследований связана с использованием больших языковых моделей для коррекции OCR. Kanerva et al. (2025) показывают, что посткоррекция на основе больших языковых моделей для исторических документов не даёт универсального выигрыша: эффект зависит от языка, данных и постановки. Этот вывод важен для интерпретации настоящего эксперимента. Смешанный перенос модели, обученной на синтетических искажениях, на реальный OCR отражает известную проблему посткоррекции: качество зависит от домена, языка, структуры ошибок и объёма размеченных пар «OCR-вывод — эталон».</w:t>
       </w:r>
     </w:p>
     <w:bookmarkEnd w:id="23"/>
-    <w:bookmarkStart w:id="24" w:name="X19a1771a43b71d67d563fcb9147403fa3d6dc85"/>
+    <w:bookmarkStart w:id="24" w:name="Xaa6a63b69f8f8f9084dc16d50d48dc0403f5611"/>
     <w:p>
       <w:pPr>
         <w:pStyle w:val="Heading3"/>
       </w:pPr>
       <w:r>
-        <w:t xml:space="preserve">2.5 Синтетические данные для post-OCR correction</w:t>
+        <w:t xml:space="preserve">2.5 Синтетические данные для посткоррекции OCR</w:t>
       </w:r>
     </w:p>
     <w:p>
@@ -872,41 +872,41 @@
         <w:pStyle w:val="FirstParagraph"/>
       </w:pPr>
       <w:r>
-        <w:t xml:space="preserve">В идеальном случае модель посткоррекции обучается на парах реального OCR/HTR-вывода и вручную проверенного правильного текста. Для низкоресурсных исторических материалов такие пары часто отсутствуют или существуют в малом объёме. Поэтому в пилотных экспериментах используются синтетические данные: эталонный текст намеренно искажается, чтобы получить пары «искажённый текст — эталон». Такой подход не заменяет реальную оценку, но позволяет получить контролируемый первый уровень сравнения.</w:t>
-      </w:r>
-    </w:p>
-    <w:p>
-      <w:pPr>
-        <w:pStyle w:val="BodyText"/>
-      </w:pPr>
-      <w:r>
-        <w:t xml:space="preserve">Работы по historical Hebrew OCR correction показывают, что task-specific/artificial data может быть полезным для исправления OCR-ошибок при дефиците размеченных исторических данных (Suissa et al., 2023). Naiman et al. (2023) используют большие синтетические наборы для посткоррекции исторических научных статей и показывают, что пары synthetic ground truth/OCR могут улучшать CER и WER. Это подтверждает саму идею синтетического набора как разумного пилотного этапа.</w:t>
-      </w:r>
-    </w:p>
-    <w:p>
-      <w:pPr>
-        <w:pStyle w:val="BodyText"/>
-      </w:pPr>
-      <w:r>
-        <w:t xml:space="preserve">Однако современные работы также показывают, что способ генерации synthetic data имеет значение. Guan and Greene (2024) сравнивают объём данных, augmentation и методы synthetic data generation для post-OCR correction; отдельно рассматривается glyph similarity и low-resource setting. RoundTripOCR также показывает, что для low-resource post-OCR correction можно строить synthetic parallel data и трактовать исправление OCR как translation-like noisy-to-clean mapping (Kashid &amp; Bhattacharyya, 2024).</w:t>
-      </w:r>
-    </w:p>
-    <w:p>
-      <w:pPr>
-        <w:pStyle w:val="BodyText"/>
-      </w:pPr>
-      <w:r>
-        <w:t xml:space="preserve">Эти работы помогают точнее сформулировать ограничение текущего эксперимента. Проблема не в том, что синтетические данные ошибочны сами по себе. Проблема в том, что синтетический шум должен быть связан с реальным распределением OCR-ошибок. В этой работе синтетический набор показывает работоспособность экспериментального контура и модели ByT5-small в контролируемой постановке, но постраничная проверка на реальном OCR выявляет разрыв между синтетической и реальной оценкой. Поэтому следующий этап должен двигаться не только к увеличению синтетического набора, но и к генерации шума, основанной на реальных ошибках OCR и сходстве графем.</w:t>
+        <w:t xml:space="preserve">В идеальном случае модель посткоррекции обучается на парах реального OCR/HTR-вывода и вручную проверенного текста. Для низкоресурсных исторических материалов такие пары часто отсутствуют или существуют в малом объёме. Поэтому в первых экспериментах используют синтетические данные: эталонный текст намеренно искажается, чтобы получить пары «искажённый текст — эталон». Такой подход не заменяет реальную оценку, но даёт контролируемый первый уровень сравнения.</w:t>
+      </w:r>
+    </w:p>
+    <w:p>
+      <w:pPr>
+        <w:pStyle w:val="BodyText"/>
+      </w:pPr>
+      <w:r>
+        <w:t xml:space="preserve">Работы по коррекции OCR для исторических текстов на иврите показывают, что задачно-ориентированные искусственные данные могут быть полезны для исправления OCR-ошибок при дефиците размеченных исторических данных (Suissa et al., 2023). Naiman et al. (2023) используют большие синтетические наборы для посткоррекции исторических научных статей и показывают, что пары синтетического эталона и OCR-вывода могут улучшать CER и WER. Это подтверждает саму идею синтетического набора как разумного пилотного этапа.</w:t>
+      </w:r>
+    </w:p>
+    <w:p>
+      <w:pPr>
+        <w:pStyle w:val="BodyText"/>
+      </w:pPr>
+      <w:r>
+        <w:t xml:space="preserve">Однако современные работы также показывают, что способ генерации синтетических данных имеет значение. Guan and Greene (2024) сравнивают объём данных, расширение данных и методы генерации синтетических данных для посткоррекции OCR; отдельно рассматриваются сходство глифов и низкоресурсная постановка. RoundTripOCR также показывает, что для низкоресурсной посткоррекции OCR можно строить синтетические параллельные данные и трактовать исправление OCR как преобразование искажённого текста в эталонный по аналогии с переводом (Kashid &amp; Bhattacharyya, 2024).</w:t>
+      </w:r>
+    </w:p>
+    <w:p>
+      <w:pPr>
+        <w:pStyle w:val="BodyText"/>
+      </w:pPr>
+      <w:r>
+        <w:t xml:space="preserve">Эти работы помогают точнее сформулировать ограничение текущего эксперимента. Проблема не в самом использовании синтетических данных, а в связи такого шума с реальным распределением OCR-ошибок. В этой работе синтетический набор показывает работоспособность протокола и ByT5-small в контролируемой постановке, но постраничная проверка на реальном OCR выявляет разрыв между синтетической и реальной оценкой. Поэтому следующий этап должен включать не только расширение синтетического набора, но и генерацию шума на основе реальных OCR-ошибок и сходства графем.</w:t>
       </w:r>
     </w:p>
     <w:bookmarkEnd w:id="24"/>
-    <w:bookmarkStart w:id="25" w:name="byte-level-модели-и-выбор-byt5"/>
+    <w:bookmarkStart w:id="25" w:name="X15509693a0d7b6f8fe53cddac6f871c0636dbad"/>
     <w:p>
       <w:pPr>
         <w:pStyle w:val="Heading3"/>
       </w:pPr>
       <w:r>
-        <w:t xml:space="preserve">2.6 Byte-level модели и выбор ByT5</w:t>
+        <w:t xml:space="preserve">2.6 Модели с байтовым представлением и выбор ByT5</w:t>
       </w:r>
     </w:p>
     <w:p>
@@ -914,23 +914,23 @@
         <w:pStyle w:val="FirstParagraph"/>
       </w:pPr>
       <w:r>
-        <w:t xml:space="preserve">В работе используется ByT5-small. ByT5 относится к byte-level sequence-to-sequence моделям: она работает на уровне байтов, а не заранее заданных слов или subword units (Xue et al., 2021). Для низкоресурсного исторического материала это важно, потому что обычный subword tokenizer может плохо покрывать редкие графемы, нестандартные написания, смешение письменных традиций и OCR-шум.</w:t>
-      </w:r>
-    </w:p>
-    <w:p>
-      <w:pPr>
-        <w:pStyle w:val="BodyText"/>
-      </w:pPr>
-      <w:r>
-        <w:t xml:space="preserve">Выбор ByT5 также связан с постановкой noisy-to-clean. Архитектура text-to-text transformer позволяет формулировать post-correction как преобразование одной последовательности в другую, что наследует общую логику T5 (Raffel et al., 2019) и transformer-based sequence modeling (Vaswani et al., 2017). При этом byte-level представление особенно удобно для арабографичных текстов, где видимые символы и их Unicode-представление могут быть нестабильны, а ошибки часто проявляются на уровне отдельных графем.</w:t>
-      </w:r>
-    </w:p>
-    <w:p>
-      <w:pPr>
-        <w:pStyle w:val="BodyText"/>
-      </w:pPr>
-      <w:r>
-        <w:t xml:space="preserve">Тем не менее byte-level модель не решает проблему доменного переноса автоматически. Если модель обучена только на синтетическом шуме, она учится распределению ошибок этого генератора. Реальный OCR-вывод может иметь другую структуру: пропуски, артефакты разметки страницы, ошибки чтения строк, необычные пробелы, неверные формы букв или последовательные искажения. Поэтому ByT5 в этой работе рассматривается как сильная и воспроизводимая нейросетевая точка сравнения для посткоррекции, но не как готовое универсальное решение.</w:t>
+        <w:t xml:space="preserve">В работе используется ByT5-small. ByT5 относится к моделям преобразования последовательностей с байтовым представлением: она работает на уровне байтов, а не заранее заданных слов или подсловных единиц (Xue et al., 2021). Для низкоресурсного исторического материала это важно, потому что обычный токенизатор по подсловным единицам может плохо покрывать редкие графемы, нестандартные написания, смешение письменных традиций и OCR-шум.</w:t>
+      </w:r>
+    </w:p>
+    <w:p>
+      <w:pPr>
+        <w:pStyle w:val="BodyText"/>
+      </w:pPr>
+      <w:r>
+        <w:t xml:space="preserve">Выбор ByT5 также связан с постановкой преобразования искажённого текста в эталонный. Архитектура преобразования текста в текст позволяет формулировать посткоррекцию как преобразование одной последовательности в другую, что наследует общую логику T5 (Raffel et al., 2019) и трансформерного моделирования последовательностей (Vaswani et al., 2017). При этом байтовое представление особенно удобно для арабографичных текстов, где видимые символы и их Unicode-представление могут быть нестабильны, а ошибки часто проявляются на уровне отдельных графем.</w:t>
+      </w:r>
+    </w:p>
+    <w:p>
+      <w:pPr>
+        <w:pStyle w:val="BodyText"/>
+      </w:pPr>
+      <w:r>
+        <w:t xml:space="preserve">Тем не менее модель с байтовым представлением не решает проблему доменного переноса автоматически. Если модель обучена только на синтетическом шуме, она учится распределению ошибок этого генератора. Реальный OCR-вывод может иметь другую структуру: пропуски, артефакты разметки страницы, ошибки чтения строк, необычные пробелы, неверные формы букв или последовательные искажения. Поэтому ByT5 в этой работе рассматривается как сильная нейросетевая точка сравнения для посткоррекции, но не как готовое универсальное решение.</w:t>
       </w:r>
     </w:p>
     <w:bookmarkEnd w:id="25"/>
@@ -948,23 +948,23 @@
         <w:pStyle w:val="FirstParagraph"/>
       </w:pPr>
       <w:r>
-        <w:t xml:space="preserve">Существующие работы показывают несколько важных фактов. Во-первых, OCR исторических документов требует воспроизводимого процесса, эталонных данных и ручной проверки, а не только запуска модели распознавания. Во-вторых, распознавание арабской графики имеет собственные графические трудности и проблемы структуры страницы. В-третьих, посткоррекция OCR естественно формулируется как преобразование ошибочного текста в эталонный. В-четвёртых, синтетические данные полезны для низкоресурсных постановок, но их нужно отдельно проверять на реальном OCR.</w:t>
-      </w:r>
-    </w:p>
-    <w:p>
-      <w:pPr>
-        <w:pStyle w:val="BodyText"/>
-      </w:pPr>
-      <w:r>
-        <w:t xml:space="preserve">Для этой работы важны три линии исследований: OCR исторических документов, распознавание арабской графики и посткоррекция OCR-ошибок. Работа не создаёт новую OCR/HTR-систему и не заявляет state of the art для historical OCR. Её вклад состоит в более узком результате: воспроизводимый пилотный набор для посткоррекции арабографичных тюркских текстов, сравнение простых базовых методов и ByT5-small, анализ синтетической оценки и отдельная проверка переноса на постраничном OCR османско-турецкого источника.</w:t>
-      </w:r>
-    </w:p>
-    <w:p>
-      <w:pPr>
-        <w:pStyle w:val="BodyText"/>
-      </w:pPr>
-      <w:r>
-        <w:t xml:space="preserve">Главная исследовательская ценность такого дизайна состоит в том, что он не скрывает отрицательный результат. На синтетическом наборе модель улучшает метрики относительно базовых методов, но на реальном OCR перенос оказывается нестабильным. Это делает работу полезной как подготовительный этап для магистерского исследования: следующий шаг должен включать проверенные OCR/reference-фрагменты, постраничное разбиение без утечки и обучение на настоящих OCR-ошибках.</w:t>
+        <w:t xml:space="preserve">Из рассмотренных работ следуют четыре требования к эксперименту. Для исторического OCR нужен воспроизводимый процесс, эталонные данные и ручная проверка, а не только запуск модели распознавания. Для арабской графики важны собственные графические трудности и структура страницы. Посткоррекция OCR может быть сформулирована как преобразование ошибочного текста в эталонный. Синтетические данные полезны для низкоресурсных постановок, но требуют отдельной проверки на реальном OCR.</w:t>
+      </w:r>
+    </w:p>
+    <w:p>
+      <w:pPr>
+        <w:pStyle w:val="BodyText"/>
+      </w:pPr>
+      <w:r>
+        <w:t xml:space="preserve">Для этой работы важны три линии исследований: OCR исторических документов, распознавание арабской графики и посткоррекция OCR-ошибок. Работа не создаёт новую OCR/HTR-систему и не заявляет лучшего результата в области OCR исторических документов. Её вклад более узкий: воспроизводимый набор для посткоррекции тюркских текстов в арабской графике, сравнение простых базовых методов и ByT5-small, анализ синтетической оценки и отдельная проверка переноса на постраничном OCR османско-турецкого источника.</w:t>
+      </w:r>
+    </w:p>
+    <w:p>
+      <w:pPr>
+        <w:pStyle w:val="BodyText"/>
+      </w:pPr>
+      <w:r>
+        <w:t xml:space="preserve">Методологически важен отрицательный результат: на синтетическом наборе модель улучшает метрики относительно базовых методов, но на реальном OCR перенос оказывается нестабильным. Поэтому работа полезна как подготовительный этап для магистерского исследования. Следующий шаг должен включать проверенные пары «OCR-вывод — эталон», постраничное разбиение без утечки и обучение на настоящих OCR-ошибках.</w:t>
       </w:r>
     </w:p>
     <w:bookmarkEnd w:id="26"/>
@@ -992,15 +992,15 @@
         <w:pStyle w:val="FirstParagraph"/>
       </w:pPr>
       <w:r>
-        <w:t xml:space="preserve">Для пилотного эксперимента был построен небольшой корпус исторического тюркского текста, записанного арабской графикой. Цель этого этапа — не собрать максимально большой корпус, а получить воспроизводимую экспериментальную основу для задачи OCR post-correction: фиксированный источник, сохранённый чистый текст, контролируемый генератор шума и проверяемое разбиение на train, valid и test.</w:t>
-      </w:r>
-    </w:p>
-    <w:p>
-      <w:pPr>
-        <w:pStyle w:val="BodyText"/>
-      </w:pPr>
-      <w:r>
-        <w:t xml:space="preserve">В работе используется постановка «искажённый текст — эталонный текст». Сначала собираются чистые строки арабографичного тюркского текста, затем на их основе генерируются OCR-подобные искажения. Такой дизайн позволяет обучать и оценивать модели посткоррекции даже при отсутствии большого набора реальных пар «OCR-вывод — вручную исправленный текст».</w:t>
+        <w:t xml:space="preserve">Для эксперимента был построен небольшой корпус исторического тюркского текста в арабской графике. Цель этого этапа состоит не в сборе максимально большого корпуса, а в получении воспроизводимой основы для посткоррекции OCR: фиксированного источника, сохранённого эталонного текста, контролируемого генератора шума и проверяемого разбиения на обучающую, валидационную и тестовую выборки.</w:t>
+      </w:r>
+    </w:p>
+    <w:p>
+      <w:pPr>
+        <w:pStyle w:val="BodyText"/>
+      </w:pPr>
+      <w:r>
+        <w:t xml:space="preserve">В работе используется постановка «искажённый текст — эталонный текст». Сначала собираются эталонные строки тюркского текста в арабской графике, затем на их основе генерируются OCR-подобные искажения. Такая схема позволяет обучать и оценивать модели посткоррекции даже при отсутствии большого набора реальных пар «OCR-вывод — вручную исправленный текст».</w:t>
       </w:r>
     </w:p>
     <w:p>
@@ -1046,7 +1046,7 @@
         <w:t xml:space="preserve">data/postcorrection/raw/arabic_turkic_clean_text.txt</w:t>
       </w:r>
       <w:r>
-        <w:t xml:space="preserve">, а сведения об источнике и процедуре сбора — в</w:t>
+        <w:t xml:space="preserve">, а сведения об источнике и процедуре сбора находятся в</w:t>
       </w:r>
       <w:r>
         <w:t xml:space="preserve"> </w:t>
@@ -1058,7 +1058,7 @@
         <w:t xml:space="preserve">data/postcorrection/raw/SOURCES.md</w:t>
       </w:r>
       <w:r>
-        <w:t xml:space="preserve">. Такое разделение важно для воспроизводимости: текстовые данные и описание происхождения корпуса не смешиваются в одном файле.</w:t>
+        <w:t xml:space="preserve">. Такое разделение повышает воспроизводимость: текстовые данные и описание происхождения корпуса не смешиваются в одном файле.</w:t>
       </w:r>
     </w:p>
     <w:p>
@@ -1112,7 +1112,7 @@
         <w:pStyle w:val="BodyText"/>
       </w:pPr>
       <w:r>
-        <w:t xml:space="preserve">Поэтому нормализация вынесена в отдельный baseline. Корпус хранится в максимально щадящем виде, а rule-based normalizer оценивается экспериментально наравне с identity baseline и нейросетевой моделью.</w:t>
+        <w:t xml:space="preserve">Поэтому нормализация вынесена в отдельный базовый метод. Корпус хранится в максимально щадящем виде, а нормализатор на правилах оценивается экспериментально наравне с методом без исправления и нейросетевой моделью.</w:t>
       </w:r>
     </w:p>
     <w:bookmarkEnd w:id="30"/>
@@ -1150,15 +1150,15 @@
         <w:pStyle w:val="BodyText"/>
       </w:pPr>
       <w:r>
-        <w:t xml:space="preserve">Генератор имитирует несколько типов OCR-подобного шума: замены похожих графем, удаления, вставки, локальные искажения внутри слова и ошибки, влияющие как на character-level, так и на word-level качество. Такой набор ошибок не моделирует реальный OCR полностью, но позволяет проверить устойчивость post-correction методов в одинаковых условиях.</w:t>
-      </w:r>
-    </w:p>
-    <w:p>
-      <w:pPr>
-        <w:pStyle w:val="BodyText"/>
-      </w:pPr>
-      <w:r>
-        <w:t xml:space="preserve">Генерация датасета выполняется модулем</w:t>
+        <w:t xml:space="preserve">Генератор имитирует несколько типов OCR-подобного шума: замены похожих графем, удаления, вставки, локальные искажения внутри слова и ошибки, влияющие на качество как на уровне символов, так и на уровне слов. Такой набор ошибок не моделирует реальный OCR полностью, но позволяет проверить устойчивость методов посткоррекции в одинаковых условиях.</w:t>
+      </w:r>
+    </w:p>
+    <w:p>
+      <w:pPr>
+        <w:pStyle w:val="BodyText"/>
+      </w:pPr>
+      <w:r>
+        <w:t xml:space="preserve">Генерация набора данных выполняется модулем</w:t>
       </w:r>
       <w:r>
         <w:t xml:space="preserve"> </w:t>
@@ -1170,7 +1170,7 @@
         <w:t xml:space="preserve">src/postcorrection/make_dataset.py</w:t>
       </w:r>
       <w:r>
-        <w:t xml:space="preserve">. Он использует чистый корпус, создаёт несколько зашумлённых вариантов для каждой строки и сохраняет итоговые split-файлы в</w:t>
+        <w:t xml:space="preserve">. Он использует эталонный корпус, создаёт несколько зашумлённых вариантов для каждой строки и сохраняет итоговые файлы разбиения в</w:t>
       </w:r>
       <w:r>
         <w:t xml:space="preserve"> </w:t>
@@ -1200,7 +1200,7 @@
         <w:pStyle w:val="FirstParagraph"/>
       </w:pPr>
       <w:r>
-        <w:t xml:space="preserve">Синтетический шум в этой работе не рассматривается как полная модель реального OCR/HTR. Его задача — создать контролируемую постановку «искажённый текст — эталон», в которой можно проверить воспроизводимость экспериментального контура и сравнить методы в одинаковых условиях. Генератор моделирует отдельные текстовые классы OCR-подобных ошибок, но не моделирует изображение, структуру страницы, шрифт, качество скана и ошибки сегментации строк.</w:t>
+        <w:t xml:space="preserve">Синтетический шум в этой работе не рассматривается как полная модель реального OCR/HTR. Его задача состоит в создании контролируемой постановки «искажённый текст — эталон», где можно проверить воспроизводимость эксперимента и сравнить методы в одинаковых условиях. Генератор моделирует отдельные классы OCR-подобных текстовых ошибок, но не учитывает изображение, структуру страницы, шрифт, качество скана и ошибки сегментации строк.</w:t>
       </w:r>
     </w:p>
     <w:tbl>
@@ -1261,7 +1261,7 @@
               <w:pStyle w:val="Compact"/>
             </w:pPr>
             <w:r>
-              <w:t xml:space="preserve">Character substitution</w:t>
+              <w:t xml:space="preserve">Замена символа</w:t>
             </w:r>
           </w:p>
         </w:tc>
@@ -1296,18 +1296,18 @@
               <w:pStyle w:val="Compact"/>
             </w:pPr>
             <w:r>
-              <w:t xml:space="preserve">Character deletion</w:t>
-            </w:r>
-          </w:p>
-        </w:tc>
-        <w:tc>
-          <w:tcPr/>
-          <w:p>
-            <w:pPr>
-              <w:pStyle w:val="Compact"/>
-            </w:pPr>
-            <w:r>
-              <w:t xml:space="preserve">Символ удаляется из clean-строки.</w:t>
+              <w:t xml:space="preserve">Удаление символа</w:t>
+            </w:r>
+          </w:p>
+        </w:tc>
+        <w:tc>
+          <w:tcPr/>
+          <w:p>
+            <w:pPr>
+              <w:pStyle w:val="Compact"/>
+            </w:pPr>
+            <w:r>
+              <w:t xml:space="preserve">Символ удаляется из эталонной строки.</w:t>
             </w:r>
           </w:p>
         </w:tc>
@@ -1331,7 +1331,7 @@
               <w:pStyle w:val="Compact"/>
             </w:pPr>
             <w:r>
-              <w:t xml:space="preserve">Character insertion</w:t>
+              <w:t xml:space="preserve">Вставка символа</w:t>
             </w:r>
           </w:p>
         </w:tc>
@@ -1353,7 +1353,7 @@
               <w:pStyle w:val="Compact"/>
             </w:pPr>
             <w:r>
-              <w:t xml:space="preserve">Моделирует ложные OCR-глифы и over-segmentation.</w:t>
+              <w:t xml:space="preserve">Моделирует ложные OCR-глифы и избыточную сегментацию.</w:t>
             </w:r>
           </w:p>
         </w:tc>
@@ -1366,7 +1366,7 @@
               <w:pStyle w:val="Compact"/>
             </w:pPr>
             <w:r>
-              <w:t xml:space="preserve">Whitespace split/merge</w:t>
+              <w:t xml:space="preserve">Разделение и склейка пробелов</w:t>
             </w:r>
           </w:p>
         </w:tc>
@@ -1401,7 +1401,7 @@
               <w:pStyle w:val="Compact"/>
             </w:pPr>
             <w:r>
-              <w:t xml:space="preserve">Arabic/Persian form confusion</w:t>
+              <w:t xml:space="preserve">Путаница арабских и персидских форм графем</w:t>
             </w:r>
           </w:p>
         </w:tc>
@@ -1452,7 +1452,7 @@
         <w:pStyle w:val="FirstParagraph"/>
       </w:pPr>
       <w:r>
-        <w:t xml:space="preserve">Для дополнительной проверки степени искажения был рассчитан noisy-clean length-delta summary на test split. Эти значения не описывают все ошибки, поскольку замены символов могут сохранять длину строки, но помогают понять, насколько генератор склонен к удалениям, вставкам и изменению word-level структуры.</w:t>
+        <w:t xml:space="preserve">Для дополнительной проверки степени искажения была рассчитана сводка изменений длины между искажёнными и эталонными строками на тестовой выборке. Эти значения не описывают все ошибки, поскольку замены символов могут сохранять длину строки, но помогают понять, насколько генератор склонен к удалениям, вставкам и изменению структуры слов.</w:t>
       </w:r>
     </w:p>
     <w:tbl>
@@ -1476,7 +1476,7 @@
               <w:pStyle w:val="Compact"/>
             </w:pPr>
             <w:r>
-              <w:t xml:space="preserve">Статистика на test split</w:t>
+              <w:t xml:space="preserve">Статистика на тестовой выборке</w:t>
             </w:r>
           </w:p>
         </w:tc>
@@ -1501,7 +1501,7 @@
               <w:pStyle w:val="Compact"/>
             </w:pPr>
             <w:r>
-              <w:t xml:space="preserve">Mean noisy-clean char length delta</w:t>
+              <w:t xml:space="preserve">Среднее изменение длины в символах</w:t>
             </w:r>
           </w:p>
         </w:tc>
@@ -1526,7 +1526,7 @@
               <w:pStyle w:val="Compact"/>
             </w:pPr>
             <w:r>
-              <w:t xml:space="preserve">Median noisy-clean char length delta</w:t>
+              <w:t xml:space="preserve">Медианное изменение длины в символах</w:t>
             </w:r>
           </w:p>
         </w:tc>
@@ -1551,7 +1551,7 @@
               <w:pStyle w:val="Compact"/>
             </w:pPr>
             <w:r>
-              <w:t xml:space="preserve">Mean absolute char length delta</w:t>
+              <w:t xml:space="preserve">Среднее абсолютное изменение длины в символах</w:t>
             </w:r>
           </w:p>
         </w:tc>
@@ -1576,7 +1576,7 @@
               <w:pStyle w:val="Compact"/>
             </w:pPr>
             <w:r>
-              <w:t xml:space="preserve">Share of shorter noisy lines</w:t>
+              <w:t xml:space="preserve">Доля искажённых строк короче эталонных</w:t>
             </w:r>
           </w:p>
         </w:tc>
@@ -1601,7 +1601,7 @@
               <w:pStyle w:val="Compact"/>
             </w:pPr>
             <w:r>
-              <w:t xml:space="preserve">Share of equal-length noisy lines</w:t>
+              <w:t xml:space="preserve">Доля искажённых строк той же длины</w:t>
             </w:r>
           </w:p>
         </w:tc>
@@ -1626,7 +1626,7 @@
               <w:pStyle w:val="Compact"/>
             </w:pPr>
             <w:r>
-              <w:t xml:space="preserve">Share of longer noisy lines</w:t>
+              <w:t xml:space="preserve">Доля искажённых строк длиннее эталонных</w:t>
             </w:r>
           </w:p>
         </w:tc>
@@ -1651,7 +1651,7 @@
               <w:pStyle w:val="Compact"/>
             </w:pPr>
             <w:r>
-              <w:t xml:space="preserve">Mean noisy-clean word-count delta</w:t>
+              <w:t xml:space="preserve">Среднее изменение числа слов</w:t>
             </w:r>
           </w:p>
         </w:tc>
@@ -1674,17 +1674,17 @@
         <w:pStyle w:val="BodyText"/>
       </w:pPr>
       <w:r>
-        <w:t xml:space="preserve">Эти значения показывают, что шум не сводится к набору замен символов: почти половина noisy-строк короче clean-строк, примерно треть длиннее, а среднее изменение числа слов положительно. Это согласуется с наличием вставок, удалений и ошибок пробелов. Одновременно такая статистика подчёркивает ограничение эксперимента: генератор задаёт искусственное распределение ошибок, которое может отличаться от реальных OCR/HTR-выходов.</w:t>
+        <w:t xml:space="preserve">Эти значения показывают, что шум не сводится к набору замен символов: почти половина искажённых строк короче эталонных, примерно треть длиннее, а среднее изменение числа слов положительно. Это согласуется с наличием вставок, удалений и ошибок пробелов. Одновременно такая статистика подчёркивает ограничение эксперимента: генератор задаёт искусственное распределение ошибок, которое может отличаться от реальных OCR/HTR-выходов.</w:t>
       </w:r>
     </w:p>
     <w:bookmarkEnd w:id="33"/>
-    <w:bookmarkStart w:id="34" w:name="примеры-synthetic-noisy-clean-пар"/>
+    <w:bookmarkStart w:id="34" w:name="примеры-пар-искажённая-строка-эталон"/>
     <w:p>
       <w:pPr>
         <w:pStyle w:val="Heading3"/>
       </w:pPr>
       <w:r>
-        <w:t xml:space="preserve">3.4.3 Примеры synthetic noisy-clean пар</w:t>
+        <w:t xml:space="preserve">3.4.3 Примеры пар «искажённая строка — эталон»</w:t>
       </w:r>
     </w:p>
     <w:p>
@@ -1692,7 +1692,7 @@
         <w:pStyle w:val="FirstParagraph"/>
       </w:pPr>
       <w:r>
-        <w:t xml:space="preserve">Ниже приведены сокращённые фрагменты из test split. Они нужны не для количественной оценки, а для визуального понимания того, какие искажения создаёт генератор.</w:t>
+        <w:t xml:space="preserve">Ниже приведены сокращённые фрагменты из тестовой выборки. Они нужны не для количественной оценки, а для визуального понимания того, какие искажения создаёт генератор.</w:t>
       </w:r>
     </w:p>
     <w:tbl>
@@ -1718,18 +1718,18 @@
               <w:pStyle w:val="Compact"/>
             </w:pPr>
             <w:r>
-              <w:t xml:space="preserve">Clean fragment</w:t>
-            </w:r>
-          </w:p>
-        </w:tc>
-        <w:tc>
-          <w:tcPr/>
-          <w:p>
-            <w:pPr>
-              <w:pStyle w:val="Compact"/>
-            </w:pPr>
-            <w:r>
-              <w:t xml:space="preserve">Noisy fragment</w:t>
+              <w:t xml:space="preserve">Эталонный фрагмент</w:t>
+            </w:r>
+          </w:p>
+        </w:tc>
+        <w:tc>
+          <w:tcPr/>
+          <w:p>
+            <w:pPr>
+              <w:pStyle w:val="Compact"/>
+            </w:pPr>
+            <w:r>
+              <w:t xml:space="preserve">Искажённый фрагмент</w:t>
             </w:r>
           </w:p>
         </w:tc>
@@ -1822,7 +1822,7 @@
               <w:pStyle w:val="Compact"/>
             </w:pPr>
             <w:r>
-              <w:t xml:space="preserve">ошибочная граница слова, form confusion</w:t>
+              <w:t xml:space="preserve">ошибочная граница слова, путаница формы графемы</w:t>
             </w:r>
           </w:p>
         </w:tc>
@@ -1863,7 +1863,7 @@
               <w:pStyle w:val="Compact"/>
             </w:pPr>
             <w:r>
-              <w:t xml:space="preserve">character substitution</w:t>
+              <w:t xml:space="preserve">замена символа</w:t>
             </w:r>
           </w:p>
         </w:tc>
@@ -1904,7 +1904,7 @@
               <w:pStyle w:val="Compact"/>
             </w:pPr>
             <w:r>
-              <w:t xml:space="preserve">deletion, substitution, вставка символа</w:t>
+              <w:t xml:space="preserve">удаление, замена и вставка символа</w:t>
             </w:r>
           </w:p>
         </w:tc>
@@ -1945,7 +1945,7 @@
               <w:pStyle w:val="Compact"/>
             </w:pPr>
             <w:r>
-              <w:t xml:space="preserve">form confusion / normalization-like error</w:t>
+              <w:t xml:space="preserve">путаница формы графемы, ошибка нормализационного типа</w:t>
             </w:r>
           </w:p>
         </w:tc>
@@ -1972,13 +1972,13 @@
       </w:r>
     </w:p>
     <w:bookmarkEnd w:id="34"/>
-    <w:bookmarkStart w:id="35" w:name="X7e06f5a39b62b44484932cacc3041bc92985dff"/>
+    <w:bookmarkStart w:id="35" w:name="ограничения-синтетического-шума"/>
     <w:p>
       <w:pPr>
         <w:pStyle w:val="Heading3"/>
       </w:pPr>
       <w:r>
-        <w:t xml:space="preserve">3.4.4 Ограничения релевантности synthetic noise</w:t>
+        <w:t xml:space="preserve">3.4.4 Ограничения синтетического шума</w:t>
       </w:r>
     </w:p>
     <w:p>
@@ -1998,13 +1998,13 @@
       </w:r>
     </w:p>
     <w:bookmarkEnd w:id="35"/>
-    <w:bookmarkStart w:id="36" w:name="структура-датасета"/>
+    <w:bookmarkStart w:id="36" w:name="структура-набора-данных"/>
     <w:p>
       <w:pPr>
         <w:pStyle w:val="Heading3"/>
       </w:pPr>
       <w:r>
-        <w:t xml:space="preserve">3.5 Структура датасета</w:t>
+        <w:t xml:space="preserve">3.5 Структура набора данных</w:t>
       </w:r>
     </w:p>
     <w:p>
@@ -2012,7 +2012,7 @@
         <w:pStyle w:val="FirstParagraph"/>
       </w:pPr>
       <w:r>
-        <w:t xml:space="preserve">Итоговый датасет хранится в табличном формате и содержит четыре основные колонки:</w:t>
+        <w:t xml:space="preserve">Итоговый набор данных хранится в табличном формате и содержит четыре основные колонки:</w:t>
       </w:r>
       <w:r>
         <w:t xml:space="preserve"> </w:t>
@@ -2090,7 +2090,7 @@
         <w:t xml:space="preserve"> </w:t>
       </w:r>
       <w:r>
-        <w:t xml:space="preserve">— её синтетически искажённую версию. Поле</w:t>
+        <w:t xml:space="preserve">хранит её синтетически искажённую версию. Поле</w:t>
       </w:r>
       <w:r>
         <w:t xml:space="preserve"> </w:t>
@@ -2105,7 +2105,7 @@
         <w:t xml:space="preserve"> </w:t>
       </w:r>
       <w:r>
-        <w:t xml:space="preserve">связывает noisy-вариант с исходной строкой, а</w:t>
+        <w:t xml:space="preserve">связывает искажённый вариант с исходной строкой, а</w:t>
       </w:r>
       <w:r>
         <w:t xml:space="preserve"> </w:t>
@@ -2128,7 +2128,7 @@
         <w:pStyle w:val="BodyText"/>
       </w:pPr>
       <w:r>
-        <w:t xml:space="preserve">Такая структура важна для контроля эксперимента. Она позволяет увеличить число обучающих примеров за счёт нескольких зашумлённых вариантов, но при этом сохранить связь каждого примера с исходной строкой. Благодаря этому можно корректно проверять пересечения между train, valid и test не только по строкам датасета, но и по исходным строкам.</w:t>
+        <w:t xml:space="preserve">Такая структура важна для контроля эксперимента. Она позволяет увеличить число обучающих примеров за счёт нескольких зашумлённых вариантов, но при этом сохранить связь каждого примера с исходной строкой. Благодаря этому можно корректно проверять пересечения между обучающей, валидационной и тестовой выборками не только по строкам набора данных, но и по исходным строкам.</w:t>
       </w:r>
     </w:p>
     <w:p>
@@ -2388,7 +2388,7 @@
         <w:pStyle w:val="BodyText"/>
       </w:pPr>
       <w:r>
-        <w:t xml:space="preserve">Исходный корпус содержит 400 уникальных исходных строк. Из них 320 строк используются для обучения, 40 — для валидации и 40 — для тестирования. Для каждой исходной строки создаётся несколько зашумлённых вариантов, поэтому итоговое число строк после генерации увеличивается до 6400 в train и до 800 в valid/test.</w:t>
+        <w:t xml:space="preserve">Исходный корпус содержит 400 уникальных строк. Из них 320 используются для обучения, 40 — для валидации и 40 — для тестирования. Для каждой исходной строки создаётся несколько зашумлённых вариантов, поэтому итоговый объём после генерации увеличивается до 6400 строк в обучающей выборке и до 800 строк в валидационной и тестовой выборках.</w:t>
       </w:r>
     </w:p>
     <w:p>
@@ -2414,15 +2414,15 @@
         <w:pStyle w:val="FirstParagraph"/>
       </w:pPr>
       <w:r>
-        <w:t xml:space="preserve">Ключевой методологический риск в такой постановке — утечка исходных строк между выборками. Если зашумлённые варианты одной и той же исходной строки попадут одновременно в train и test, модель сможет фактически видеть целевую строку во время обучения. В этом случае итоговые метрики будут завышены.</w:t>
-      </w:r>
-    </w:p>
-    <w:p>
-      <w:pPr>
-        <w:pStyle w:val="BodyText"/>
-      </w:pPr>
-      <w:r>
-        <w:t xml:space="preserve">Чтобы избежать такой утечки, разбиение выполняется не на уровне отдельных зашумлённых примеров, а на уровне исходных строк. Все зашумлённые варианты одной исходной строки попадают только в одну часть датасета: train, valid или test.</w:t>
+        <w:t xml:space="preserve">Ключевой методологический риск в такой постановке связан с утечкой исходных строк между выборками. Если зашумлённые варианты одной и той же исходной строки попадут одновременно в обучение и тест, модель сможет фактически видеть целевую строку во время обучения. В этом случае итоговые метрики будут завышены.</w:t>
+      </w:r>
+    </w:p>
+    <w:p>
+      <w:pPr>
+        <w:pStyle w:val="BodyText"/>
+      </w:pPr>
+      <w:r>
+        <w:t xml:space="preserve">Чтобы избежать такой утечки, разбиение выполняется не на уровне отдельных зашумлённых примеров, а на уровне исходных строк. Все зашумлённые варианты одной исходной строки попадают только в одну часть набора данных: обучающую, валидационную или тестовую.</w:t>
       </w:r>
     </w:p>
     <w:p>
@@ -2578,31 +2578,31 @@
         <w:pStyle w:val="BodyText"/>
       </w:pPr>
       <w:r>
-        <w:t xml:space="preserve">Первое ограничение — объём: используется 400 чистых текстовых блоков. Этого достаточно, чтобы проверить экспериментальный контур, сравнить базовые методы и провести первый нейросетевой эксперимент. Однако такого объёма недостаточно, чтобы утверждать устойчивость метода на всём классе исторических арабографичных тюркских текстов.</w:t>
-      </w:r>
-    </w:p>
-    <w:p>
-      <w:pPr>
-        <w:pStyle w:val="BodyText"/>
-      </w:pPr>
-      <w:r>
-        <w:t xml:space="preserve">Второе ограничение — один основной источник. Это снижает жанровое, временное и орфографическое разнообразие корпуса. Результаты показывают поведение модели на выбранном материале, но не доказывают переносимость на старотатарские, башкирские, крымскотатарские или другие арабографичные тюркские источники.</w:t>
-      </w:r>
-    </w:p>
-    <w:p>
-      <w:pPr>
-        <w:pStyle w:val="BodyText"/>
-      </w:pPr>
-      <w:r>
-        <w:t xml:space="preserve">Третье ограничение — синтетическая природа ошибок. Генератор шума создаёт OCR-подобные искажения, но реальные ошибки зависят от шрифта, качества скана, сегментации, модели распознавания и состояния документа. Поэтому текущий датасет проверяет контур посткоррекции в контролируемой постановке, но не заменяет оценку на реальных OCR/HTR-выходах.</w:t>
-      </w:r>
-    </w:p>
-    <w:p>
-      <w:pPr>
-        <w:pStyle w:val="BodyText"/>
-      </w:pPr>
-      <w:r>
-        <w:t xml:space="preserve">Четвёртое ограничение — отсутствие ручной лингвистической валидации исправлений. Метрики CER и WER показывают формальную близость к эталону, но не всегда отражают историко-орфографическую допустимость исправления. Для следующего этапа нужен небольшой вручную проверенный subset с качественным анализом ошибок.</w:t>
+        <w:t xml:space="preserve">Первое ограничение связано с объёмом корпуса: используется 400 эталонных текстовых блоков. Этого достаточно, чтобы проверить экспериментальную схему, сравнить базовые методы и провести первый нейросетевой эксперимент. Однако такого объёма недостаточно, чтобы утверждать устойчивость метода на всём классе исторических тюркских текстов в арабской графике.</w:t>
+      </w:r>
+    </w:p>
+    <w:p>
+      <w:pPr>
+        <w:pStyle w:val="BodyText"/>
+      </w:pPr>
+      <w:r>
+        <w:t xml:space="preserve">Второе ограничение связано с одним основным источником. Это снижает жанровое, временное и орфографическое разнообразие корпуса. Результаты показывают поведение модели на выбранном материале, но не доказывают переносимость на старотатарские, башкирские, крымскотатарские или другие тюркские источники в арабской графике.</w:t>
+      </w:r>
+    </w:p>
+    <w:p>
+      <w:pPr>
+        <w:pStyle w:val="BodyText"/>
+      </w:pPr>
+      <w:r>
+        <w:t xml:space="preserve">Третье ограничение связано с синтетической природой ошибок. Генератор шума создаёт OCR-подобные искажения, но реальные ошибки зависят от шрифта, качества скана, сегментации, модели распознавания и состояния документа. Поэтому текущий набор данных проверяет посткоррекцию в контролируемой постановке, но не заменяет оценку на реальном OCR/HTR-выводе.</w:t>
+      </w:r>
+    </w:p>
+    <w:p>
+      <w:pPr>
+        <w:pStyle w:val="BodyText"/>
+      </w:pPr>
+      <w:r>
+        <w:t xml:space="preserve">Четвёртое ограничение связано с отсутствием ручной лингвистической проверки исправлений. Метрики CER и WER показывают формальную близость к эталону, но не всегда отражают историко-орфографическую допустимость исправления. Для следующего этапа нужна небольшая вручную проверенная подвыборка с качественным анализом ошибок.</w:t>
       </w:r>
     </w:p>
     <w:bookmarkEnd w:id="39"/>
@@ -2620,23 +2620,23 @@
         <w:pStyle w:val="FirstParagraph"/>
       </w:pPr>
       <w:r>
-        <w:t xml:space="preserve">В работе был создан небольшой, но воспроизводимый корпус для задачи OCR post-correction исторического тюркского текста в арабской графике. На основе 400 чистых текстовых блоков был построен синтетический датасет с train/valid/test-разбиением без утечки исходных строк между выборками.</w:t>
-      </w:r>
-    </w:p>
-    <w:p>
-      <w:pPr>
-        <w:pStyle w:val="BodyText"/>
-      </w:pPr>
-      <w:r>
-        <w:t xml:space="preserve">Корпус не претендует на полноту и не заменяет проверку на реальных OCR/HTR-выходах. Его роль на данном этапе уже иная: создать контролируемую экспериментальную основу, на которой можно сравнить метод без исправления, нормализатор на правилах, символьный baseline на основе ошибок обучающей выборки и нейросетевую модель ByT5-small в одинаковых условиях.</w:t>
-      </w:r>
-    </w:p>
-    <w:p>
-      <w:pPr>
-        <w:pStyle w:val="BodyText"/>
-      </w:pPr>
-      <w:r>
-        <w:t xml:space="preserve">В дальнейшем этот корпус можно расширить за счёт новых источников, реальных OCR/HTR-выходов, ручной лингвистической валидации и более разнообразных исторических арабографичных тюркских материалов.</w:t>
+        <w:t xml:space="preserve">В работе был создан небольшой, но воспроизводимый корпус для посткоррекции OCR исторического тюркского текста в арабской графике. На основе 400 эталонных текстовых блоков был построен синтетический набор данных с разбиением на обучающую, валидационную и тестовую выборки без утечки исходных строк.</w:t>
+      </w:r>
+    </w:p>
+    <w:p>
+      <w:pPr>
+        <w:pStyle w:val="BodyText"/>
+      </w:pPr>
+      <w:r>
+        <w:t xml:space="preserve">Корпус не претендует на полноту и не заменяет проверку на реальном OCR/HTR-выводе. Его роль на данном этапе уже иная: создать контролируемую экспериментальную основу, на которой можно сравнить метод без исправления, нормализатор на правилах, символьный метод на основе ошибок обучающей выборки и нейросетевую модель ByT5-small в одинаковых условиях.</w:t>
+      </w:r>
+    </w:p>
+    <w:p>
+      <w:pPr>
+        <w:pStyle w:val="BodyText"/>
+      </w:pPr>
+      <w:r>
+        <w:t xml:space="preserve">В дальнейшем этот корпус можно расширить за счёт новых источников, реального OCR/HTR-вывода, ручной лингвистической проверки и более разнообразных исторических тюркских материалов в арабской графике.</w:t>
       </w:r>
     </w:p>
     <w:bookmarkEnd w:id="40"/>
@@ -2664,7 +2664,7 @@
         <w:pStyle w:val="FirstParagraph"/>
       </w:pPr>
       <w:r>
-        <w:t xml:space="preserve">Экспериментальная часть построена как проверяемый протокол посткоррекции. На вход подаётся зашумлённая строка с OCR-подобными искажениями или реальный OCR-output, на выходе ожидается восстановленная строка, которая сравнивается с эталонным</w:t>
+        <w:t xml:space="preserve">Экспериментальная часть построена как проверяемый протокол посткоррекции. На вход подаётся зашумлённая строка с OCR-подобными искажениями или реальный OCR-вывод, на выходе ожидается восстановленная строка, которая сравнивается с эталонным</w:t>
       </w:r>
       <w:r>
         <w:t xml:space="preserve"> </w:t>
@@ -2711,25 +2711,25 @@
         <w:pStyle w:val="BodyText"/>
       </w:pPr>
       <w:r>
-        <w:t xml:space="preserve">Процедура эксперимента состоит из нескольких шагов: сначала оцениваются базовые методы, затем строится символьный baseline на основе ошибок обучающей выборки, после этого обучается и применяется ByT5-small. Далее предсказания всех методов сравниваются с эталонной строкой по CER, WER, NoSpaceCER и ExactMatch, а затем проводится анализ ошибок на уровне отдельных примеров.</w:t>
-      </w:r>
-    </w:p>
-    <w:p>
-      <w:pPr>
-        <w:pStyle w:val="BodyText"/>
-      </w:pPr>
-      <w:r>
-        <w:t xml:space="preserve">Главный вопрос эксперимента — улучшает ли нейросетевая post-correction модель качество текста по сравнению с неизменённым зашумлённым вводом. Дополнительный вопрос — помогает ли простая rule-based нормализация именно для исторического арабографичного тюркского материала или, наоборот, ухудшает текст.</w:t>
+        <w:t xml:space="preserve">Процедура эксперимента состоит из нескольких шагов: сначала оцениваются базовые методы, затем строится символьный метод на основе ошибок обучающей выборки, после этого обучается и применяется ByT5-small. Далее предсказания всех методов сравниваются с эталонной строкой по CER, WER, NoSpaceCER и ExactMatch, а затем проводится анализ ошибок на уровне отдельных примеров.</w:t>
+      </w:r>
+    </w:p>
+    <w:p>
+      <w:pPr>
+        <w:pStyle w:val="BodyText"/>
+      </w:pPr>
+      <w:r>
+        <w:t xml:space="preserve">Главный вопрос эксперимента — улучшает ли нейросетевая модель посткоррекции качество текста по сравнению с неизменённым зашумлённым вводом. Дополнительный вопрос — помогает ли простая нормализация на правилах именно для исторического тюркского материала в арабской графике или, наоборот, ухудшает текст.</w:t>
       </w:r>
     </w:p>
     <w:bookmarkEnd w:id="42"/>
-    <w:bookmarkStart w:id="43" w:name="baseline-подходы"/>
+    <w:bookmarkStart w:id="43" w:name="базовые-методы"/>
     <w:p>
       <w:pPr>
         <w:pStyle w:val="Heading3"/>
       </w:pPr>
       <w:r>
-        <w:t xml:space="preserve">4.2 Baseline-подходы</w:t>
+        <w:t xml:space="preserve">4.2 Базовые методы</w:t>
       </w:r>
     </w:p>
     <w:p>
@@ -2737,41 +2737,41 @@
         <w:pStyle w:val="FirstParagraph"/>
       </w:pPr>
       <w:r>
-        <w:t xml:space="preserve">В эксперименте используются три baseline-подхода. Первый — identity baseline: он возвращает входную зашумлённую строку без изменений. Его роль состоит в том, чтобы зафиксировать исходный уровень качества данных. Любой метод post-correction должен превосходить этот уровень; иначе он не исправляет текст, а добавляет новые ошибки.</w:t>
-      </w:r>
-    </w:p>
-    <w:p>
-      <w:pPr>
-        <w:pStyle w:val="BodyText"/>
-      </w:pPr>
-      <w:r>
-        <w:t xml:space="preserve">Второй baseline — rule-based normalizer. Он применяет набор простых символьных правил к арабографичному тексту. Этот baseline нужен не как ожидаемо сильный метод, а как проверка важной гипотезы: можно ли улучшить качество простыми правилами нормализации без обучения модели.</w:t>
-      </w:r>
-    </w:p>
-    <w:p>
-      <w:pPr>
-        <w:pStyle w:val="BodyText"/>
-      </w:pPr>
-      <w:r>
-        <w:t xml:space="preserve">Для исторического арабографичного тюркского материала такая проверка особенно важна. Нормализация может убрать часть технического шума, но может и стереть исторически значимые орфографические различия. Поэтому rule-based normalizer в работе не считается обязательной предобработкой, а оценивается как самостоятельный baseline.</w:t>
-      </w:r>
-    </w:p>
-    <w:p>
-      <w:pPr>
-        <w:pStyle w:val="BodyText"/>
-      </w:pPr>
-      <w:r>
-        <w:t xml:space="preserve">Третий baseline — train-derived character-confusion baseline. Он строится по обучающим noisy-clean парам: noisy- и clean-строки выравниваются с помощью Levenshtein alignment, после чего оцениваются частотные соответствия между зашумлёнными и чистыми символами. Замена принимается только при достаточной поддержке и доминировании целевого символа. Такой baseline является data-driven, но non-neural: он может исправлять устойчивые локальные символьные путаницы, однако не умеет восстанавливать пропущенные символы из контекста и не моделирует дальние зависимости в строке.</w:t>
+        <w:t xml:space="preserve">В эксперименте используются три базовых метода. Первый — метод без исправления: он возвращает входную зашумлённую строку без изменений. Его роль состоит в том, чтобы зафиксировать исходный уровень качества данных. Любой метод посткоррекции должен превосходить этот уровень; иначе он не исправляет текст, а добавляет новые ошибки.</w:t>
+      </w:r>
+    </w:p>
+    <w:p>
+      <w:pPr>
+        <w:pStyle w:val="BodyText"/>
+      </w:pPr>
+      <w:r>
+        <w:t xml:space="preserve">Второй базовый метод — нормализатор на правилах. Он применяет набор простых символьных правил к арабографичному тексту. Этот метод нужен не как ожидаемо сильное решение, а как проверка важной гипотезы: можно ли улучшить качество простыми правилами нормализации без обучения модели.</w:t>
+      </w:r>
+    </w:p>
+    <w:p>
+      <w:pPr>
+        <w:pStyle w:val="BodyText"/>
+      </w:pPr>
+      <w:r>
+        <w:t xml:space="preserve">Для исторического арабографичного тюркского материала такая проверка особенно важна. Нормализация может убрать часть технического шума, но может и стереть исторически значимые орфографические различия. Поэтому нормализатор на правилах в работе не считается обязательной предобработкой, а оценивается как самостоятельный базовый метод.</w:t>
+      </w:r>
+    </w:p>
+    <w:p>
+      <w:pPr>
+        <w:pStyle w:val="BodyText"/>
+      </w:pPr>
+      <w:r>
+        <w:t xml:space="preserve">Третий базовый метод — символьный метод на основе ошибок обучающей выборки. Он строится по обучающим noisy-clean парам: noisy- и clean-строки выравниваются с помощью Levenshtein alignment, после чего оцениваются частотные соответствия между зашумлёнными и чистыми символами. Замена принимается только при достаточной поддержке и доминировании целевого символа. Такой метод опирается на данные, но не является нейросетевым: он может исправлять устойчивые локальные символьные путаницы, однако не умеет восстанавливать пропущенные символы из контекста и не моделирует дальние зависимости в строке.</w:t>
       </w:r>
     </w:p>
     <w:bookmarkEnd w:id="43"/>
-    <w:bookmarkStart w:id="44" w:name="X9ed5a8e4fde00fe5095624626c608a88e2ee9c9"/>
+    <w:bookmarkStart w:id="44" w:name="X922718734d9410424975b4d665e2323c01d8043"/>
     <w:p>
       <w:pPr>
         <w:pStyle w:val="Heading3"/>
       </w:pPr>
       <w:r>
-        <w:t xml:space="preserve">4.3 Train-derived character-confusion baseline</w:t>
+        <w:t xml:space="preserve">4.3 Символьный метод на основе ошибок обучающей выборки</w:t>
       </w:r>
     </w:p>
     <w:p>
@@ -2779,15 +2779,15 @@
         <w:pStyle w:val="FirstParagraph"/>
       </w:pPr>
       <w:r>
-        <w:t xml:space="preserve">Train-derived character-confusion baseline занимает промежуточное положение между ручной rule-based нормализацией и нейросетевой sequence-to-sequence моделью. В отличие от rule-based normalizer, он не задаёт все замены вручную, а извлекает наиболее устойчивые noisy-character / clean-character соответствия из обучающей выборки. В отличие от ByT5-small, он не использует контекст строки и не генерирует последовательность заново.</w:t>
-      </w:r>
-    </w:p>
-    <w:p>
-      <w:pPr>
-        <w:pStyle w:val="BodyText"/>
-      </w:pPr>
-      <w:r>
-        <w:t xml:space="preserve">Его диагностическая роль состоит в проверке вопроса: достаточно ли простых корпусно-выведенных символьных соответствий для решения этой задачи, или нужен контекстный sequence-to-sequence подход. Если такой baseline приблизился бы к ByT5, это означало бы, что задача в основном сводится к локальным заменам символов. Если же ByT5 заметно превосходит его, это указывает на важность контекста, восстановления структуры слов и более сложного моделирования строки.</w:t>
+        <w:t xml:space="preserve">Символьный метод на основе ошибок обучающей выборки занимает промежуточное положение между ручной нормализацией на правилах и нейросетевой моделью преобразования последовательностей. В отличие от нормализатора на правилах, он не задаёт все замены вручную, а извлекает наиболее устойчивые соответствия между искажёнными и эталонными символами из обучающей выборки. В отличие от ByT5-small, он не использует контекст строки и не генерирует последовательность заново.</w:t>
+      </w:r>
+    </w:p>
+    <w:p>
+      <w:pPr>
+        <w:pStyle w:val="BodyText"/>
+      </w:pPr>
+      <w:r>
+        <w:t xml:space="preserve">Его диагностическая роль состоит в проверке вопроса: достаточно ли простых символьных соответствий, извлечённых из корпуса, или нужен контекстный подход на основе преобразования последовательностей. Если такой метод приблизился бы к ByT5, это означало бы, что задача в основном сводится к локальным заменам символов. Если же ByT5 заметно превосходит его, это указывает на важность контекста, восстановления структуры слов и более сложного моделирования строки.</w:t>
       </w:r>
     </w:p>
     <w:bookmarkEnd w:id="44"/>
@@ -2805,7 +2805,7 @@
         <w:pStyle w:val="FirstParagraph"/>
       </w:pPr>
       <w:r>
-        <w:t xml:space="preserve">В качестве нейросетевого подхода используется ByT5-small. Модель применяется как sequence-to-sequence post-correction система: на вход подаётся зашумлённая строка, а на выходе генерируется исправленная строка, которая затем сравнивается с эталоном</w:t>
+        <w:t xml:space="preserve">В качестве нейросетевого подхода используется ByT5-small. Модель применяется как система посткоррекции на основе преобразования последовательностей: на вход подаётся зашумлённая строка, а на выходе генерируется исправленная строка, которая затем сравнивается с эталоном</w:t>
       </w:r>
       <w:r>
         <w:t xml:space="preserve"> </w:t>
@@ -2825,15 +2825,15 @@
         <w:pStyle w:val="BodyText"/>
       </w:pPr>
       <w:r>
-        <w:t xml:space="preserve">Выбор ByT5 связан с byte-level представлением. В отличие от моделей с заранее заданной subword-токенизацией, ByT5 работает на уровне байтов и поэтому лучше подходит для шумного, низкоресурсного и нестандартного исторического текста. Для арабографичных тюркских материалов это важно из-за редких графем, вариативного написания и смешения письменных традиций.</w:t>
-      </w:r>
-    </w:p>
-    <w:p>
-      <w:pPr>
-        <w:pStyle w:val="BodyText"/>
-      </w:pPr>
-      <w:r>
-        <w:t xml:space="preserve">Практическое следствие byte-level подхода состоит в том, что длина последовательности в токенах может быстро расти: один видимый символ арабской графики занимает несколько байтов. Поэтому в эксперименте отдельно контролируется максимальная длина входной и целевой последовательности.</w:t>
+        <w:t xml:space="preserve">Выбор ByT5 связан с байтовым представлением текста. В отличие от моделей с заранее заданной токенизацией по подсловным единицам, ByT5 работает на уровне байтов и поэтому лучше подходит для шумного, низкоресурсного и нестандартного исторического текста. Для арабографичных тюркских материалов это важно из-за редких графем, вариативного написания и смешения письменных традиций.</w:t>
+      </w:r>
+    </w:p>
+    <w:p>
+      <w:pPr>
+        <w:pStyle w:val="BodyText"/>
+      </w:pPr>
+      <w:r>
+        <w:t xml:space="preserve">Практическое следствие байтового представления состоит в том, что длина последовательности в токенах может быстро расти: один видимый символ арабской графики занимает несколько байтов. Поэтому в эксперименте отдельно контролируется максимальная длина входной и целевой последовательности.</w:t>
       </w:r>
     </w:p>
     <w:bookmarkEnd w:id="45"/>
@@ -3022,15 +3022,15 @@
         <w:pStyle w:val="BodyText"/>
       </w:pPr>
       <w:r>
-        <w:t xml:space="preserve">Конфигурация 256 использовалась как первый рабочий запуск и показала чувствительность задачи к ограничению длины. Для byte-level модели это ожидаемо: арабографичная строка может занимать больше токенов, чем кажется по числу видимых символов.</w:t>
-      </w:r>
-    </w:p>
-    <w:p>
-      <w:pPr>
-        <w:pStyle w:val="BodyText"/>
-      </w:pPr>
-      <w:r>
-        <w:t xml:space="preserve">Для итогового анализа выбрана конфигурация 512. Она уменьшает риск обрезания строк и используется как основная нейросетевая конфигурация в сравнении с identity baseline, rule-based normalizer и train-derived character-confusion baseline. Вывод о преимуществе 512 в данной работе относится к пилотному датасету и должен быть дополнительно проверен на более широком корпусе.</w:t>
+        <w:t xml:space="preserve">Конфигурация 256 использовалась как первый рабочий запуск и показала чувствительность задачи к ограничению длины. Для модели с байтовым представлением это ожидаемо: строка в арабской графике может занимать больше токенов, чем кажется по числу видимых символов.</w:t>
+      </w:r>
+    </w:p>
+    <w:p>
+      <w:pPr>
+        <w:pStyle w:val="BodyText"/>
+      </w:pPr>
+      <w:r>
+        <w:t xml:space="preserve">Для итогового анализа выбрана конфигурация 512. Она уменьшает риск обрезания строк и используется как основная нейросетевая конфигурация в сравнении с методом без исправления, нормализатором на правилах и символьным методом на основе ошибок обучающей выборки. Вывод о преимуществе 512 в данной работе относится к пилотному набору данных и должен быть дополнительно проверен на более широком корпусе.</w:t>
       </w:r>
     </w:p>
     <w:bookmarkEnd w:id="46"/>
@@ -3071,7 +3071,7 @@
         <w:t xml:space="preserve"> </w:t>
       </w:r>
       <w:r>
-        <w:t xml:space="preserve">на уровне символов. Эта метрика особенно важна для OCR post-correction, поскольку многие ошибки распознавания проявляются как замены, вставки или удаления отдельных графем.</w:t>
+        <w:t xml:space="preserve">на уровне символов. Эта метрика особенно важна для посткоррекции OCR, поскольку многие ошибки распознавания проявляются как замены, вставки или удаления отдельных графем.</w:t>
       </w:r>
     </w:p>
     <w:p>
@@ -3149,7 +3149,7 @@
         <w:t xml:space="preserve">prediction</w:t>
       </w:r>
       <w:r>
-        <w:t xml:space="preserve">. После этого единая процедура оценки вычисляет CER, WER, NoSpaceCER и ExactMatch для всех предсказаний. Такой формат делает сравнение методов воспроизводимым: можно повторно проверить как агрегированные метрики, так и отдельные примеры. Итоговая объединённая таблица метрик сохранена в</w:t>
+        <w:t xml:space="preserve">. После этого единая процедура оценки вычисляет CER, WER, NoSpaceCER и ExactMatch для всех строк. Такой формат делает сравнение методов воспроизводимым: можно повторно проверить как агрегированные метрики, так и отдельные строки. Итоговая объединённая таблица метрик сохранена в</w:t>
       </w:r>
       <w:r>
         <w:t xml:space="preserve"> </w:t>
@@ -3169,7 +3169,7 @@
         <w:pStyle w:val="BodyText"/>
       </w:pPr>
       <w:r>
-        <w:t xml:space="preserve">В одинаковых условиях сравниваются четыре варианта: identity baseline, rule-based normalizer, train-derived character-confusion baseline и ByT5-small. Это позволяет отделить эффект нейросетевой post-correction модели от простого сохранения зашумлённого ввода, ручных правил нормализации и простого data-driven символьного baseline.</w:t>
+        <w:t xml:space="preserve">В одинаковых условиях сравниваются четыре варианта: метод без исправления, нормализатор на правилах, символьный метод на основе ошибок обучающей выборки и ByT5-small. Это позволяет отделить эффект нейросетевой модели посткоррекции от простого сохранения зашумлённого ввода, ручных правил нормализации и простого символьного метода, построенного по данным.</w:t>
       </w:r>
     </w:p>
     <w:bookmarkEnd w:id="48"/>
@@ -3207,7 +3207,7 @@
         <w:pStyle w:val="BodyText"/>
       </w:pPr>
       <w:r>
-        <w:t xml:space="preserve">Для этого вычисляются CER и WER до и после post-correction, а затем фиксируется изменение качества: пример мог улучшиться, остаться без изменений или ухудшиться. Такой анализ важен, потому что среднее значение CER или WER может расти за счёт небольшого числа удачных случаев и скрывать ухудшения на отдельных строках.</w:t>
+        <w:t xml:space="preserve">Для этого вычисляются CER и WER до и после посткоррекции, а затем фиксируется изменение качества: пример мог улучшиться, остаться без изменений или ухудшиться. Такой анализ важен, потому что среднее значение CER или WER может расти за счёт небольшого числа удачных случаев и скрывать ухудшения на отдельных строках.</w:t>
       </w:r>
     </w:p>
     <w:p>
@@ -3245,23 +3245,23 @@
         <w:pStyle w:val="FirstParagraph"/>
       </w:pPr>
       <w:r>
-        <w:t xml:space="preserve">Основные компоненты эксперимента сохранены в репозитории: скрипты сбора данных, генерации датасета, baseline-оценки, обучения и применения ByT5-small, вычисления метрик и анализа ошибок. Это делает эксперимент проверяемым: можно повторить построение датасета, пересчитать метрики и отдельно изучить предсказания модели.</w:t>
-      </w:r>
-    </w:p>
-    <w:p>
-      <w:pPr>
-        <w:pStyle w:val="BodyText"/>
-      </w:pPr>
-      <w:r>
-        <w:t xml:space="preserve">В репозитории также сохранены датасет, итоговые метрики, prediction-файлы и CSV-файлы анализа ошибок. При этом модельные веса не хранятся в git, чтобы не перегружать репозиторий тяжёлыми артефактами обучения. Для дальнейшей работы веса можно хранить отдельно: например, как release artifact или во внешнем model registry.</w:t>
-      </w:r>
-    </w:p>
-    <w:p>
-      <w:pPr>
-        <w:pStyle w:val="BodyText"/>
-      </w:pPr>
-      <w:r>
-        <w:t xml:space="preserve">Воспроизводимость текущего эксперимента не означает полноту бенчмарка. Она означает, что все ключевые решения пилотного протокола явно зафиксированы: источник, генератор шума, split, baseline-подходы, модель, метрики и error analysis.</w:t>
+        <w:t xml:space="preserve">Основные компоненты эксперимента сохранены в репозитории: скрипты сбора данных, генерации набора данных, оценки базовых методов, обучения и применения ByT5-small, вычисления метрик и анализа ошибок. Это делает эксперимент проверяемым: можно повторить построение набора данных, пересчитать метрики и отдельно изучить предсказания модели.</w:t>
+      </w:r>
+    </w:p>
+    <w:p>
+      <w:pPr>
+        <w:pStyle w:val="BodyText"/>
+      </w:pPr>
+      <w:r>
+        <w:t xml:space="preserve">В репозитории также сохранены набор данных, итоговые метрики, файлы с предсказаниями и CSV-файлы анализа ошибок. При этом модельные веса не хранятся в git, чтобы не перегружать репозиторий тяжёлыми артефактами обучения. Для дальнейшей работы веса можно хранить отдельно: например, как отдельный артефакт релиза или во внешнем хранилище моделей.</w:t>
+      </w:r>
+    </w:p>
+    <w:p>
+      <w:pPr>
+        <w:pStyle w:val="BodyText"/>
+      </w:pPr>
+      <w:r>
+        <w:t xml:space="preserve">Воспроизводимость текущего эксперимента не означает полноту контрольного набора. Она означает, что все ключевые решения пилотного протокола явно зафиксированы: источник, генератор шума, разбиение данных, базовые методы, модель, метрики и анализ ошибок.</w:t>
       </w:r>
     </w:p>
     <w:bookmarkEnd w:id="50"/>
@@ -3279,23 +3279,23 @@
         <w:pStyle w:val="FirstParagraph"/>
       </w:pPr>
       <w:r>
-        <w:t xml:space="preserve">Методология эксперимента построена как воспроизводимый контур посткоррекции OCR: от набора пар «искажённый текст / эталон» до сравнения метода без исправления, нормализатора на правилах, символьного baseline на основе ошибок обучающей выборки и ByT5-small. Такая схема позволяет проверить не только итоговые метрики, но и методологические вопросы: превосходит ли модель простое сохранение OCR-вывода, полезна ли нормализация на правилах, достаточно ли простых символьных соответствий и насколько важен контроль длины byte-level последовательности.</w:t>
-      </w:r>
-    </w:p>
-    <w:p>
-      <w:pPr>
-        <w:pStyle w:val="BodyText"/>
-      </w:pPr>
-      <w:r>
-        <w:t xml:space="preserve">Сильная сторона выбранной методологии — прозрачность: каждый метод оценивается на одной test set, по одним метрикам и с сохранением prediction-файлов. Ограничение — пилотный характер данных: синтетические ошибки и один источник не позволяют считать результаты финальной оценкой для всех исторических арабографичных тюркских текстов.</w:t>
-      </w:r>
-    </w:p>
-    <w:p>
-      <w:pPr>
-        <w:pStyle w:val="BodyText"/>
-      </w:pPr>
-      <w:r>
-        <w:t xml:space="preserve">Эта методология задаёт основу для раздела 5, где сравниваются baseline-подходы, train-derived character-confusion baseline, финальная конфигурация ByT5-small и результаты анализа ошибок.</w:t>
+        <w:t xml:space="preserve">Методология эксперимента построена как воспроизводимый протокол посткоррекции OCR: от набора пар «искажённый текст / эталон» до сравнения метода без исправления, нормализатора на правилах, символьного метода на основе ошибок обучающей выборки и ByT5-small. Такая схема позволяет проверить не только итоговые метрики, но и методологические вопросы: превосходит ли модель простое сохранение OCR-вывода, полезна ли нормализация на правилах, достаточно ли простых символьных соответствий и насколько важен контроль длины последовательности для модели с байтовым представлением.</w:t>
+      </w:r>
+    </w:p>
+    <w:p>
+      <w:pPr>
+        <w:pStyle w:val="BodyText"/>
+      </w:pPr>
+      <w:r>
+        <w:t xml:space="preserve">Сильная сторона выбранной методологии — прозрачность: каждый метод оценивается на одной тестовой выборке, по одним метрикам и с сохранением файлов предсказаний. Ограничение — пилотный характер данных: синтетические ошибки и один источник не позволяют считать результаты финальной оценкой для всех исторических арабографичных тюркских текстов.</w:t>
+      </w:r>
+    </w:p>
+    <w:p>
+      <w:pPr>
+        <w:pStyle w:val="BodyText"/>
+      </w:pPr>
+      <w:r>
+        <w:t xml:space="preserve">Эта методология задаёт основу для раздела 5, где сравниваются базовые методы, символьный метод на основе ошибок обучающей выборки, финальная конфигурация ByT5-small и результаты анализа ошибок.</w:t>
       </w:r>
     </w:p>
     <w:bookmarkEnd w:id="51"/>
@@ -3323,7 +3323,7 @@
         <w:pStyle w:val="FirstParagraph"/>
       </w:pPr>
       <w:r>
-        <w:t xml:space="preserve">В разделе результатов сравниваются четыре подхода: метод без исправления, нормализатор на правилах, символьный baseline на основе ошибок обучающей выборки и ByT5-small 512. Все они оцениваются на одной тестовой выборке из 800 зашумлённых вариантов, построенных из 40 уникальных исходных строк, которые не пересекаются с обучающей и валидационной выборками.</w:t>
+        <w:t xml:space="preserve">В разделе результатов сравниваются четыре подхода: метод без исправления, нормализатор на правилах, символьный метод на основе ошибок обучающей выборки и ByT5-small 512. Все они оцениваются на одной тестовой выборке из 800 зашумлённых вариантов, построенных из 40 уникальных исходных строк, которые не пересекаются с обучающей и валидационной выборками.</w:t>
       </w:r>
     </w:p>
     <w:p>
@@ -3339,7 +3339,7 @@
         <w:pStyle w:val="BodyText"/>
       </w:pPr>
       <w:r>
-        <w:t xml:space="preserve">В этом разделе существенны не только лучшие итоговые метрики ByT5-small среди рассмотренных методов. Не менее важны ограничивающие результаты: нормализатор на правилах ухудшает качество относительно метода без исправления, символьный baseline даёт лишь умеренное улучшение CER, а заметное снижение WER у ByT5 требует осторожной интерпретации из-за синтетических ошибок пробелов и границ слов.</w:t>
+        <w:t xml:space="preserve">В этом разделе важны не только лучшие итоговые метрики ByT5-small среди рассмотренных методов. Не менее важны ограничивающие результаты: нормализатор на правилах ухудшает качество относительно метода без исправления, символьный метод даёт лишь умеренное улучшение CER, а заметное снижение WER у ByT5 требует осторожной интерпретации из-за синтетических ошибок пробелов и границ слов.</w:t>
       </w:r>
     </w:p>
     <w:bookmarkEnd w:id="53"/>
@@ -3446,7 +3446,7 @@
               <w:pStyle w:val="Compact"/>
             </w:pPr>
             <w:r>
-              <w:t xml:space="preserve">Identity baseline</w:t>
+              <w:t xml:space="preserve">Метод без исправления</w:t>
             </w:r>
           </w:p>
         </w:tc>
@@ -3507,7 +3507,7 @@
               <w:pStyle w:val="Compact"/>
             </w:pPr>
             <w:r>
-              <w:t xml:space="preserve">Rule-based normalizer</w:t>
+              <w:t xml:space="preserve">Нормализатор на правилах</w:t>
             </w:r>
           </w:p>
         </w:tc>
@@ -3568,7 +3568,7 @@
               <w:pStyle w:val="Compact"/>
             </w:pPr>
             <w:r>
-              <w:t xml:space="preserve">Train-derived char-confusion baseline</w:t>
+              <w:t xml:space="preserve">Символьный метод на основе ошибок обучающей выборки</w:t>
             </w:r>
           </w:p>
         </w:tc>
@@ -3688,23 +3688,23 @@
         <w:pStyle w:val="BodyText"/>
       </w:pPr>
       <w:r>
-        <w:t xml:space="preserve">Лучший результат среди проверенных методов показывает ByT5-small 512. По сравнению с identity baseline CER снижается с 0.086005 до 0.079913, а WER — с 0.519006 до 0.368540. Это означает, что улучшение на уровне символов есть, но оно умеренное; основной выигрыш заметнее на уровне слов.</w:t>
-      </w:r>
-    </w:p>
-    <w:p>
-      <w:pPr>
-        <w:pStyle w:val="BodyText"/>
-      </w:pPr>
-      <w:r>
-        <w:t xml:space="preserve">Rule-based normalizer, напротив, ухудшает обе основные метрики: CER растёт до 0.151932, а WER — до 0.684408. Этот результат показывает, что простая символьная нормализация не является заведомо безопасной предобработкой для исторического арабографичного тюркского материала.</w:t>
-      </w:r>
-    </w:p>
-    <w:p>
-      <w:pPr>
-        <w:pStyle w:val="BodyText"/>
-      </w:pPr>
-      <w:r>
-        <w:t xml:space="preserve">Train-derived char-confusion baseline оказывается сильнее identity baseline по CER: с 0.086005 до 0.082520. Однако по WER он почти не закрывает разрыв: с 0.519006 до 0.506189. Это показывает, что простые корпусно-выведенные символьные соответствия помогают частично исправлять локальные графемные ошибки, но недостаточны для восстановления word-level структуры строки.</w:t>
+        <w:t xml:space="preserve">Лучший результат среди проверенных методов показывает ByT5-small 512. По сравнению с методом без исправления CER снижается с 0.086005 до 0.079913, а WER — с 0.519006 до 0.368540. Это означает, что улучшение на уровне символов есть, но оно умеренное; основной выигрыш заметнее на уровне слов.</w:t>
+      </w:r>
+    </w:p>
+    <w:p>
+      <w:pPr>
+        <w:pStyle w:val="BodyText"/>
+      </w:pPr>
+      <w:r>
+        <w:t xml:space="preserve">Нормализатор на правилах, напротив, ухудшает обе основные метрики: CER растёт до 0.151932, а WER — до 0.684408. Этот результат показывает, что простая символьная нормализация не является заведомо безопасной предобработкой для исторического арабографичного тюркского материала.</w:t>
+      </w:r>
+    </w:p>
+    <w:p>
+      <w:pPr>
+        <w:pStyle w:val="BodyText"/>
+      </w:pPr>
+      <w:r>
+        <w:t xml:space="preserve">Символьный метод на основе ошибок обучающей выборки оказывается сильнее метода без исправления по CER: с 0.086005 до 0.082520. Однако по WER он почти не закрывает разрыв: с 0.519006 до 0.506189. Это показывает, что простые корпусно-выведенные символьные соответствия помогают частично исправлять локальные графемные ошибки, но недостаточны для восстановления структуры строки на уровне слов.</w:t>
       </w:r>
     </w:p>
     <w:p>
@@ -3716,13 +3716,13 @@
       </w:r>
     </w:p>
     <w:bookmarkEnd w:id="54"/>
-    <w:bookmarkStart w:id="55" w:name="сравнение-с-identity-baseline"/>
+    <w:bookmarkStart w:id="55" w:name="сравнение-с-методом-без-исправления"/>
     <w:p>
       <w:pPr>
         <w:pStyle w:val="Heading3"/>
       </w:pPr>
       <w:r>
-        <w:t xml:space="preserve">5.3 Сравнение с identity baseline</w:t>
+        <w:t xml:space="preserve">5.3 Сравнение с методом без исправления</w:t>
       </w:r>
     </w:p>
     <w:p>
@@ -3730,15 +3730,15 @@
         <w:pStyle w:val="FirstParagraph"/>
       </w:pPr>
       <w:r>
-        <w:t xml:space="preserve">Identity baseline задаёт нижнюю границу качества: он не исправляет текст, а возвращает исходную зашумлённую строку без изменений. Поэтому полезная post-correction модель должна показывать качество выше этого уровня хотя бы по основным метрикам CER и WER.</w:t>
-      </w:r>
-    </w:p>
-    <w:p>
-      <w:pPr>
-        <w:pStyle w:val="BodyText"/>
-      </w:pPr>
-      <w:r>
-        <w:t xml:space="preserve">ByT5-small 512 превосходит identity baseline по всем трём метрикам:</w:t>
+        <w:t xml:space="preserve">Метод без исправления задаёт нижнюю границу качества: он не исправляет текст, а возвращает исходную зашумлённую строку без изменений. Поэтому полезная модель посткоррекции должна показывать качество выше этого уровня хотя бы по основным метрикам CER и WER.</w:t>
+      </w:r>
+    </w:p>
+    <w:p>
+      <w:pPr>
+        <w:pStyle w:val="BodyText"/>
+      </w:pPr>
+      <w:r>
+        <w:t xml:space="preserve">ByT5-small 512 превосходит метод без исправления по всем трём метрикам:</w:t>
       </w:r>
     </w:p>
     <w:p>
@@ -3782,25 +3782,25 @@
         <w:pStyle w:val="FirstParagraph"/>
       </w:pPr>
       <w:r>
-        <w:t xml:space="preserve">Абсолютное снижение CER составляет 0.006092. Это умеренное улучшение: модель действительно приближает предсказания к эталонной строке на уровне символов, но не решает задачу полностью. Заметнее выглядит снижение WER: разница составляет 0.150466, то есть модель заметно чаще восстанавливает структуру слов или делает строку ближе к эталону на word-level.</w:t>
-      </w:r>
-    </w:p>
-    <w:p>
-      <w:pPr>
-        <w:pStyle w:val="BodyText"/>
-      </w:pPr>
-      <w:r>
-        <w:t xml:space="preserve">Такой результат согласуется с основной гипотезой пилота: byte-level sequence-to-sequence модель может быть полезна для post-correction арабографичного тюркского текста. Однако улучшение по CER остаётся достаточно небольшим, поэтому вывод следует считать не финальным доказательством качества модели, а подтверждением работоспособности выбранного направления в controlled synthetic setting.</w:t>
+        <w:t xml:space="preserve">Абсолютное снижение CER составляет 0.006092. Это умеренное улучшение: модель действительно приближает предсказания к эталонной строке на уровне символов, но не решает задачу полностью. Заметнее выглядит снижение WER: разница составляет 0.150466, то есть модель заметно чаще восстанавливает структуру слов или делает строку ближе к эталону на уровне слов.</w:t>
+      </w:r>
+    </w:p>
+    <w:p>
+      <w:pPr>
+        <w:pStyle w:val="BodyText"/>
+      </w:pPr>
+      <w:r>
+        <w:t xml:space="preserve">Такой результат согласуется с основной гипотезой пилота: модель с байтовым представлением, работающая как преобразование последовательностей, может быть полезна для посткоррекции тюркского текста в арабской графике. Однако улучшение по CER остаётся достаточно небольшим, поэтому вывод следует считать не финальным доказательством качества модели, а подтверждением работоспособности выбранного направления в контролируемой синтетической постановке.</w:t>
       </w:r>
     </w:p>
     <w:bookmarkEnd w:id="55"/>
-    <w:bookmarkStart w:id="56" w:name="rule-based-normalizer"/>
+    <w:bookmarkStart w:id="56" w:name="нормализатор-на-правилах"/>
     <w:p>
       <w:pPr>
         <w:pStyle w:val="Heading3"/>
       </w:pPr>
       <w:r>
-        <w:t xml:space="preserve">5.4 Rule-based normalizer</w:t>
+        <w:t xml:space="preserve">5.4 Нормализатор на правилах</w:t>
       </w:r>
     </w:p>
     <w:p>
@@ -3808,15 +3808,15 @@
         <w:pStyle w:val="FirstParagraph"/>
       </w:pPr>
       <w:r>
-        <w:t xml:space="preserve">Rule-based normalizer выступает отрицательным контрольным сравнением. Он показывает, что простая символьная нормализация не обязательно улучшает исторический арабографичный текст и может быть хуже, чем отсутствие исправления.</w:t>
-      </w:r>
-    </w:p>
-    <w:p>
-      <w:pPr>
-        <w:pStyle w:val="BodyText"/>
-      </w:pPr>
-      <w:r>
-        <w:t xml:space="preserve">По сравнению с identity baseline normalizer ухудшает все метрики:</w:t>
+        <w:t xml:space="preserve">Нормализатор на правилах выступает отрицательным контрольным сравнением. Он показывает, что простая символьная нормализация не обязательно улучшает исторический арабографичный текст и может быть хуже, чем отсутствие исправления.</w:t>
+      </w:r>
+    </w:p>
+    <w:p>
+      <w:pPr>
+        <w:pStyle w:val="BodyText"/>
+      </w:pPr>
+      <w:r>
+        <w:t xml:space="preserve">По сравнению с методом без исправления нормализатор ухудшает все метрики:</w:t>
       </w:r>
     </w:p>
     <w:p>
@@ -3868,17 +3868,17 @@
         <w:pStyle w:val="BodyText"/>
       </w:pPr>
       <w:r>
-        <w:t xml:space="preserve">Следовательно, rule-based normalization нельзя использовать как автоматический предварительный шаг без отдельной проверки. В рамках данного эксперимента первая гипотеза получает предварительное подтверждение: naive rule-based normalization ухудшает качество текста относительно identity baseline.</w:t>
+        <w:t xml:space="preserve">Следовательно, нормализацию на правилах нельзя использовать как автоматический предварительный шаг без отдельной проверки. В рамках данного эксперимента первая гипотеза получает предварительное подтверждение: простая нормализация на правилах ухудшает качество текста относительно метода без исправления.</w:t>
       </w:r>
     </w:p>
     <w:bookmarkEnd w:id="56"/>
-    <w:bookmarkStart w:id="57" w:name="X3cc67115ed6e691c31a87b68b1f212ad315ce11"/>
+    <w:bookmarkStart w:id="57" w:name="X26c70db4b79cb30b57d665edbf51a9d36fed8b5"/>
     <w:p>
       <w:pPr>
         <w:pStyle w:val="Heading3"/>
       </w:pPr>
       <w:r>
-        <w:t xml:space="preserve">5.5 Train-derived character-confusion baseline</w:t>
+        <w:t xml:space="preserve">5.5 Символьный метод на основе ошибок обучающей выборки</w:t>
       </w:r>
     </w:p>
     <w:p>
@@ -3886,15 +3886,15 @@
         <w:pStyle w:val="FirstParagraph"/>
       </w:pPr>
       <w:r>
-        <w:t xml:space="preserve">Train-derived char-confusion baseline выступает дополнительным data-driven non-neural сравнением. Он показывает, можно ли заметно улучшить качество за счёт устойчивых символьных соответствий, извлечённых из обучающих noisy-clean пар, без нейросетевого моделирования контекста.</w:t>
-      </w:r>
-    </w:p>
-    <w:p>
-      <w:pPr>
-        <w:pStyle w:val="BodyText"/>
-      </w:pPr>
-      <w:r>
-        <w:t xml:space="preserve">По сравнению с identity baseline этот baseline немного снижает CER:</w:t>
+        <w:t xml:space="preserve">Символьный метод на основе ошибок обучающей выборки выступает дополнительным сравнением, основанным на данных, но не использующим нейросетевую модель. Он показывает, можно ли заметно улучшить качество за счёт устойчивых символьных соответствий, извлечённых из обучающих пар «искажённая строка — эталон», без нейросетевого моделирования контекста.</w:t>
+      </w:r>
+    </w:p>
+    <w:p>
+      <w:pPr>
+        <w:pStyle w:val="BodyText"/>
+      </w:pPr>
+      <w:r>
+        <w:t xml:space="preserve">По сравнению с методом без исправления этот метод немного снижает CER:</w:t>
       </w:r>
     </w:p>
     <w:p>
@@ -3938,7 +3938,7 @@
         <w:pStyle w:val="FirstParagraph"/>
       </w:pPr>
       <w:r>
-        <w:t xml:space="preserve">Такой результат важен для интерпретации. Простые train-derived character confusions действительно исправляют часть локальных символьных ошибок, но почти не улучшают word-level качество. Это означает, что большая часть преимущества ByT5-small связана не только с локальными заменами символов, но и с контекстным восстановлением структуры строки, включая границы слов.</w:t>
+        <w:t xml:space="preserve">Такой результат важен для интерпретации. Простые символьные соответствия, извлечённые из обучающей выборки, действительно исправляют часть локальных символьных ошибок, но почти не улучшают качество на уровне слов. Это означает, что большая часть преимущества ByT5-small связана не только с локальными заменами символов, но и с контекстным восстановлением структуры строки, включая границы слов.</w:t>
       </w:r>
     </w:p>
     <w:bookmarkEnd w:id="57"/>
@@ -3964,7 +3964,7 @@
         <w:pStyle w:val="BodyText"/>
       </w:pPr>
       <w:r>
-        <w:t xml:space="preserve">Причина состоит в том, что текущий synthetic noise включает вставку и удаление пробелов. WER вычисляется на уровне слов, поэтому он особенно чувствителен к ошибкам границ слов: одна вставка или потеря пробела может изменить токенизацию всей строки и резко увеличить word-level error. Если модель восстанавливает часть таких synthetic word-boundary distortions, WER может снижаться существенно сильнее, чем CER.</w:t>
+        <w:t xml:space="preserve">Причина состоит в том, что текущий синтетический шум включает вставку и удаление пробелов. WER вычисляется на уровне слов, поэтому он особенно чувствителен к ошибкам границ слов: одна вставка или потеря пробела может изменить токенизацию всей строки и резко увеличить ошибку на уровне слов. Если модель восстанавливает часть таких синтетических искажений границ слов, WER может снижаться существенно сильнее, чем CER.</w:t>
       </w:r>
     </w:p>
     <w:p>
@@ -3980,7 +3980,7 @@
         <w:pStyle w:val="BodyText"/>
       </w:pPr>
       <w:r>
-        <w:t xml:space="preserve">Поскольку тестовый набор построен в этой работе, прямого опубликованного результата на точно таком же датасете нет. Поэтому утверждение о лучшем результате ограничено данной экспериментальной постановкой: ByT5-small 512 показывает лучший CER и WER среди рассмотренных методов на предложенном наборе. Работа не заявляет global state of the art для посткоррекции OCR в целом.</w:t>
+        <w:t xml:space="preserve">Поскольку тестовый набор построен в этой работе, прямого опубликованного результата на точно таком же наборе данных нет. Поэтому утверждение о лучшем результате ограничено данной экспериментальной постановкой: ByT5-small 512 показывает лучший CER и WER среди рассмотренных методов на предложенном наборе. Работа не заявляет лучший опубликованный результат для посткоррекции OCR в целом.</w:t>
       </w:r>
     </w:p>
     <w:bookmarkEnd w:id="58"/>
@@ -3998,7 +3998,7 @@
         <w:pStyle w:val="FirstParagraph"/>
       </w:pPr>
       <w:r>
-        <w:t xml:space="preserve">Результаты пилота показывают чувствительность ByT5-small к максимальной длине входной и целевой последовательности. Это связано с byte-level представлением: длина строки в токенах может быть заметно больше, чем число видимых символов, особенно для арабской графики.</w:t>
+        <w:t xml:space="preserve">Результаты пилота показывают чувствительность ByT5-small к максимальной длине входной и целевой последовательности. Это связано с байтовым представлением: длина строки в токенах может быть заметно больше, чем число видимых символов, особенно для арабской графики.</w:t>
       </w:r>
     </w:p>
     <w:p>
@@ -4014,7 +4014,7 @@
         <w:pStyle w:val="BodyText"/>
       </w:pPr>
       <w:r>
-        <w:t xml:space="preserve">Этот результат следует интерпретировать осторожно. Он показывает, что max length является важным экспериментальным параметром в данной постановке, но не доказывает универсального преимущества длины 512 для всех арабографичных тюркских корпусов. Для более сильного вывода нужны дополнительные запуски на более широком наборе источников и длин строк.</w:t>
+        <w:t xml:space="preserve">Этот результат следует интерпретировать осторожно. Он показывает, что максимальная длина последовательности является важным экспериментальным параметром в данной постановке, но не доказывает универсального преимущества длины 512 для всех арабографичных тюркских корпусов. Для более сильного вывода нужны дополнительные запуски на более широком наборе источников и длин строк.</w:t>
       </w:r>
     </w:p>
     <w:bookmarkEnd w:id="59"/>
@@ -4268,15 +4268,15 @@
         <w:pStyle w:val="BodyText"/>
       </w:pPr>
       <w:r>
-        <w:t xml:space="preserve">Это важный результат: улучшение агрегированных метрик не сводится к нескольким удачным строкам. ByT5-small 512 улучшает большинство тестовых примеров как на character-level, так и на word-level. При этом наличие 58–60 ухудшенных примеров показывает, что модель не является равномерно безопасной: она может добавлять новые ошибки и требует качественного анализа худших случаев.</w:t>
-      </w:r>
-    </w:p>
-    <w:p>
-      <w:pPr>
-        <w:pStyle w:val="BodyText"/>
-      </w:pPr>
-      <w:r>
-        <w:t xml:space="preserve">Качественный просмотр лучших и худших примеров показывает два разных режима поведения модели. В удачных случаях ByT5-small исправляет локальные OCR-подобные искажения, восстанавливает пропущенные или заменённые графемы и делает разбиение слов ближе к эталону. В худших случаях модель может не просто не исправить строку, а начать порождать повторяющиеся фрагменты, существенно удлиняя prediction. Это особенно важно для практического применения: модель улучшает большинство строк, но без фильтрации, анализа худших случаев или ручной проверки её нельзя считать безопасным автоматическим корректором.</w:t>
+        <w:t xml:space="preserve">Это важный результат: улучшение агрегированных метрик не сводится к нескольким удачным строкам. ByT5-small 512 улучшает большинство тестовых примеров как на уровне символов, так и на уровне слов. При этом наличие 58–60 ухудшенных примеров показывает, что модель не является равномерно безопасной: она может добавлять новые ошибки и требует качественного анализа худших случаев.</w:t>
+      </w:r>
+    </w:p>
+    <w:p>
+      <w:pPr>
+        <w:pStyle w:val="BodyText"/>
+      </w:pPr>
+      <w:r>
+        <w:t xml:space="preserve">Качественный просмотр лучших и худших примеров показывает два разных режима поведения модели. В удачных случаях ByT5-small исправляет локальные OCR-подобные искажения, восстанавливает пропущенные или заменённые графемы и делает разбиение слов ближе к эталону. В худших случаях модель может не просто не исправить строку, а начать порождать повторяющиеся фрагменты, существенно удлиняя предсказание. Это особенно важно для практического применения: модель улучшает большинство строк, но без фильтрации, анализа худших случаев или ручной проверки её нельзя считать безопасным автоматическим корректором.</w:t>
       </w:r>
     </w:p>
     <w:bookmarkEnd w:id="60"/>
@@ -4334,7 +4334,7 @@
         <w:pStyle w:val="BodyText"/>
       </w:pPr>
       <w:r>
-        <w:t xml:space="preserve">Среднее улучшение полезно как количественное резюме, но его недостаточно для окончательной оценки качества. Поэтому оно рассматривается вместе с распределением improved/unchanged/worse и качественным анализом лучших и худших примеров.</w:t>
+        <w:t xml:space="preserve">Среднее улучшение полезно как количественное резюме, но его недостаточно для окончательной оценки качества. Поэтому оно рассматривается вместе с распределением улучшенных, неизменённых и ухудшенных примеров и качественным анализом лучших и худших случаев.</w:t>
       </w:r>
     </w:p>
     <w:bookmarkEnd w:id="61"/>
@@ -4352,31 +4352,31 @@
         <w:pStyle w:val="FirstParagraph"/>
       </w:pPr>
       <w:r>
-        <w:t xml:space="preserve">Полученные результаты дают три основных вывода. Первый вывод — отрицательный, но методологически важный: rule-based normalizer ухудшает качество относительно identity baseline. Это означает, что для исторического арабографичного тюркского текста простая символьная нормализация не является заведомо безопасной предобработкой.</w:t>
-      </w:r>
-    </w:p>
-    <w:p>
-      <w:pPr>
-        <w:pStyle w:val="BodyText"/>
-      </w:pPr>
-      <w:r>
-        <w:t xml:space="preserve">Второй вывод — положительный: ByT5-small 512 улучшает качество относительно identity baseline и показывает лучший результат среди четырёх рассмотренных методов. Улучшение по CER умеренное, но улучшение по WER заметное, а анализ отдельных примеров показывает, что модель улучшает большинство тестовых строк. При этом сильное снижение WER требует осторожной интерпретации, поскольку часть эффекта может быть связана с исправлением синтетических ошибок пробелов и границ слов. Следовательно, byte-level sequence-to-sequence подход является работоспособным направлением для пилотной посткоррекции, но не финальным доказательством качества на реальных OCR/HTR-выходах.</w:t>
-      </w:r>
-    </w:p>
-    <w:p>
-      <w:pPr>
-        <w:pStyle w:val="BodyText"/>
-      </w:pPr>
-      <w:r>
-        <w:t xml:space="preserve">Третий вывод касается настройки модели: max length является важным параметром для byte-level обработки арабографичного текста. Конфигурация 512 в текущем эксперименте выглядит более устойчивой, чем более короткая конфигурация, но этот результат следует считать практическим сигналом, а не универсальным правилом.</w:t>
-      </w:r>
-    </w:p>
-    <w:p>
-      <w:pPr>
-        <w:pStyle w:val="BodyText"/>
-      </w:pPr>
-      <w:r>
-        <w:t xml:space="preserve">Наконец, низкий ExactMatch не противоречит положительным результатам по CER и WER. Для длинных исторических строк полное совпадение слишком строго: одна небольшая ошибка уже делает строку несовпадающей. Поэтому основные выводы в работе опираются на CER, WER и анализ improved/unchanged/worse.</w:t>
+        <w:t xml:space="preserve">Полученные результаты дают три основных вывода. Первый вывод — отрицательный, но методологически важный: нормализатор на правилах ухудшает качество относительно метода без исправления. Это означает, что для исторического арабографичного тюркского текста простая символьная нормализация не является заведомо безопасной предобработкой.</w:t>
+      </w:r>
+    </w:p>
+    <w:p>
+      <w:pPr>
+        <w:pStyle w:val="BodyText"/>
+      </w:pPr>
+      <w:r>
+        <w:t xml:space="preserve">Второй вывод — положительный: ByT5-small 512 улучшает качество относительно метода без исправления и показывает лучший результат среди четырёх рассмотренных методов. Улучшение по CER умеренное, но улучшение по WER заметное, а анализ отдельных примеров показывает, что модель улучшает большинство тестовых строк. При этом сильное снижение WER требует осторожной интерпретации, поскольку часть эффекта может быть связана с исправлением синтетических ошибок пробелов и границ слов. Следовательно, подход на основе модели с байтовым представлением и преобразованием последовательностей является работоспособным направлением для пилотной посткоррекции, но не финальным доказательством качества на реальном OCR/HTR-выводе.</w:t>
+      </w:r>
+    </w:p>
+    <w:p>
+      <w:pPr>
+        <w:pStyle w:val="BodyText"/>
+      </w:pPr>
+      <w:r>
+        <w:t xml:space="preserve">Третий вывод касается настройки модели: максимальная длина последовательности является важным параметром для обработки арабографичного текста моделью с байтовым представлением. Конфигурация 512 в текущем эксперименте выглядит более устойчивой, чем более короткая конфигурация, но этот результат следует считать практическим сигналом, а не универсальным правилом.</w:t>
+      </w:r>
+    </w:p>
+    <w:p>
+      <w:pPr>
+        <w:pStyle w:val="BodyText"/>
+      </w:pPr>
+      <w:r>
+        <w:t xml:space="preserve">Наконец, низкий ExactMatch не противоречит положительным результатам по CER и WER. Для длинных исторических строк полное совпадение слишком строго: одна небольшая ошибка уже делает строку несовпадающей. Поэтому основные выводы в работе опираются на CER, WER и анализ улучшенных, неизменённых и ухудшенных примеров.</w:t>
       </w:r>
     </w:p>
     <w:bookmarkEnd w:id="62"/>
@@ -4436,7 +4436,7 @@
         <w:pStyle w:val="BodyText"/>
       </w:pPr>
       <w:r>
-        <w:t xml:space="preserve">Для проверки использован османско-турецкий печатный источник в арабской графике. Этот материал рассматривается как связанный арабографичный тюркский проверочный случай. Он не является старотатарским или старобашкирским датасетом: татарские и башкирские источники остаются целевой мотивацией и направлением дальнейшего расширения, а текущая проверка на реальном OCR нужна для первичной оценки переноса с синтетических ошибок на настоящий OCR.</w:t>
+        <w:t xml:space="preserve">Для проверки использован османско-турецкий печатный источник в арабской графике. Этот материал рассматривается как связанный арабографичный тюркский проверочный случай. Он не является старотатарским или старобашкирским набором данных: татарские и башкирские источники остаются целевой мотивацией и направлением дальнейшего расширения, а текущая проверка на реальном OCR нужна для первичной оценки переноса с синтетических ошибок на настоящий OCR.</w:t>
       </w:r>
     </w:p>
     <w:p>
@@ -4464,7 +4464,7 @@
         </w:numPr>
       </w:pPr>
       <w:r>
-        <w:t xml:space="preserve">raw Tesseract OCR как исходный уровень;</w:t>
+        <w:t xml:space="preserve">исходный OCR Tesseract как начальный уровень;</w:t>
       </w:r>
     </w:p>
     <w:p>
@@ -4476,7 +4476,7 @@
         </w:numPr>
       </w:pPr>
       <w:r>
-        <w:t xml:space="preserve">ByT5-small, обученная на синтетическом шуме и применённая к постраничному OCR через разбиение на фрагменты;</w:t>
+        <w:t xml:space="preserve">ByT5-small, обученная на синтетическом шуме и применённая к постраничному OCR через разбиение страницы на фрагменты;</w:t>
       </w:r>
     </w:p>
     <w:p>
@@ -4488,7 +4488,7 @@
         </w:numPr>
       </w:pPr>
       <w:r>
-        <w:t xml:space="preserve">strict guarded ByT5, где предсказание отбрасывается, если оно слишком сильно меняет длину или слишком далеко уходит от исходного OCR.</w:t>
+        <w:t xml:space="preserve">ByT5-small со строгой фильтрацией, где предсказание отбрасывается, если оно слишком сильно меняет длину или слишком далеко уходит от исходного OCR.</w:t>
       </w:r>
     </w:p>
     <w:tbl>
@@ -4518,79 +4518,79 @@
               <w:pStyle w:val="Compact"/>
             </w:pPr>
             <w:r>
-              <w:t xml:space="preserve">System</w:t>
-            </w:r>
-          </w:p>
-        </w:tc>
-        <w:tc>
-          <w:tcPr/>
-          <w:p>
-            <w:pPr>
-              <w:pStyle w:val="Compact"/>
-              <w:jc w:val="right"/>
-            </w:pPr>
-            <w:r>
-              <w:t xml:space="preserve">N</w:t>
-            </w:r>
-          </w:p>
-        </w:tc>
-        <w:tc>
-          <w:tcPr/>
-          <w:p>
-            <w:pPr>
-              <w:pStyle w:val="Compact"/>
-              <w:jc w:val="right"/>
-            </w:pPr>
-            <w:r>
-              <w:t xml:space="preserve">Mean CER</w:t>
-            </w:r>
-          </w:p>
-        </w:tc>
-        <w:tc>
-          <w:tcPr/>
-          <w:p>
-            <w:pPr>
-              <w:pStyle w:val="Compact"/>
-              <w:jc w:val="right"/>
-            </w:pPr>
-            <w:r>
-              <w:t xml:space="preserve">Median CER</w:t>
-            </w:r>
-          </w:p>
-        </w:tc>
-        <w:tc>
-          <w:tcPr/>
-          <w:p>
-            <w:pPr>
-              <w:pStyle w:val="Compact"/>
-              <w:jc w:val="right"/>
-            </w:pPr>
-            <w:r>
-              <w:t xml:space="preserve">Mean WER</w:t>
-            </w:r>
-          </w:p>
-        </w:tc>
-        <w:tc>
-          <w:tcPr/>
-          <w:p>
-            <w:pPr>
-              <w:pStyle w:val="Compact"/>
-              <w:jc w:val="right"/>
-            </w:pPr>
-            <w:r>
-              <w:t xml:space="preserve">Median WER</w:t>
-            </w:r>
-          </w:p>
-        </w:tc>
-        <w:tc>
-          <w:tcPr/>
-          <w:p>
-            <w:pPr>
-              <w:pStyle w:val="Compact"/>
-              <w:jc w:val="right"/>
-            </w:pPr>
-            <w:r>
-              <w:t xml:space="preserve">Mean NoSpaceCER</w:t>
+              <w:t xml:space="preserve">Система</w:t>
+            </w:r>
+          </w:p>
+        </w:tc>
+        <w:tc>
+          <w:tcPr/>
+          <w:p>
+            <w:pPr>
+              <w:pStyle w:val="Compact"/>
+              <w:jc w:val="right"/>
+            </w:pPr>
+            <w:r>
+              <w:t xml:space="preserve">Страниц</w:t>
+            </w:r>
+          </w:p>
+        </w:tc>
+        <w:tc>
+          <w:tcPr/>
+          <w:p>
+            <w:pPr>
+              <w:pStyle w:val="Compact"/>
+              <w:jc w:val="right"/>
+            </w:pPr>
+            <w:r>
+              <w:t xml:space="preserve">Средний CER</w:t>
+            </w:r>
+          </w:p>
+        </w:tc>
+        <w:tc>
+          <w:tcPr/>
+          <w:p>
+            <w:pPr>
+              <w:pStyle w:val="Compact"/>
+              <w:jc w:val="right"/>
+            </w:pPr>
+            <w:r>
+              <w:t xml:space="preserve">Медианный CER</w:t>
+            </w:r>
+          </w:p>
+        </w:tc>
+        <w:tc>
+          <w:tcPr/>
+          <w:p>
+            <w:pPr>
+              <w:pStyle w:val="Compact"/>
+              <w:jc w:val="right"/>
+            </w:pPr>
+            <w:r>
+              <w:t xml:space="preserve">Средний WER</w:t>
+            </w:r>
+          </w:p>
+        </w:tc>
+        <w:tc>
+          <w:tcPr/>
+          <w:p>
+            <w:pPr>
+              <w:pStyle w:val="Compact"/>
+              <w:jc w:val="right"/>
+            </w:pPr>
+            <w:r>
+              <w:t xml:space="preserve">Медианный WER</w:t>
+            </w:r>
+          </w:p>
+        </w:tc>
+        <w:tc>
+          <w:tcPr/>
+          <w:p>
+            <w:pPr>
+              <w:pStyle w:val="Compact"/>
+              <w:jc w:val="right"/>
+            </w:pPr>
+            <w:r>
+              <w:t xml:space="preserve">Средний NoSpaceCER</w:t>
             </w:r>
           </w:p>
         </w:tc>
@@ -4603,7 +4603,7 @@
               <w:pStyle w:val="Compact"/>
             </w:pPr>
             <w:r>
-              <w:t xml:space="preserve">raw Tesseract</w:t>
+              <w:t xml:space="preserve">исходный Tesseract</w:t>
             </w:r>
           </w:p>
         </w:tc>
@@ -4688,7 +4688,7 @@
               <w:pStyle w:val="Compact"/>
             </w:pPr>
             <w:r>
-              <w:t xml:space="preserve">ByT5 chunked</w:t>
+              <w:t xml:space="preserve">ByT5 с разбиением на фрагменты</w:t>
             </w:r>
           </w:p>
         </w:tc>
@@ -4773,7 +4773,7 @@
               <w:pStyle w:val="Compact"/>
             </w:pPr>
             <w:r>
-              <w:t xml:space="preserve">strict guarded ByT5</w:t>
+              <w:t xml:space="preserve">ByT5 со строгой фильтрацией</w:t>
             </w:r>
           </w:p>
         </w:tc>
@@ -4856,7 +4856,7 @@
         <w:pStyle w:val="BodyText"/>
       </w:pPr>
       <w:r>
-        <w:t xml:space="preserve">По среднему CER исходный Tesseract оказался лучше, чем оба варианта посткоррекции. ByT5 снижает WER с 0.9238 до 0.8919, но одновременно ухудшает CER с 0.3539 до 0.4564 и NoSpaceCER с 0.3421 до 0.4658. Для OCR-задачи на арабской графике это важное различие: word-level метрика может улучшаться за счёт пробелов и границ слов, но если character-level ошибка растёт, модель нельзя считать практически надёжной.</w:t>
+        <w:t xml:space="preserve">По среднему CER исходный Tesseract оказался лучше, чем оба варианта посткоррекции. ByT5 снижает WER с 0.9238 до 0.8919, но одновременно ухудшает CER с 0.3539 до 0.4564 и NoSpaceCER с 0.3421 до 0.4658. Для OCR-задачи на арабской графике это важное различие: метрика на уровне слов может улучшаться за счёт пробелов и границ слов, но если ошибка на уровне символов растёт, модель нельзя считать практически надёжной.</w:t>
       </w:r>
     </w:p>
     <w:p>
@@ -4890,43 +4890,43 @@
               <w:pStyle w:val="Compact"/>
             </w:pPr>
             <w:r>
-              <w:t xml:space="preserve">System</w:t>
-            </w:r>
-          </w:p>
-        </w:tc>
-        <w:tc>
-          <w:tcPr/>
-          <w:p>
-            <w:pPr>
-              <w:pStyle w:val="Compact"/>
-              <w:jc w:val="right"/>
-            </w:pPr>
-            <w:r>
-              <w:t xml:space="preserve">Improved</w:t>
-            </w:r>
-          </w:p>
-        </w:tc>
-        <w:tc>
-          <w:tcPr/>
-          <w:p>
-            <w:pPr>
-              <w:pStyle w:val="Compact"/>
-              <w:jc w:val="right"/>
-            </w:pPr>
-            <w:r>
-              <w:t xml:space="preserve">Same</w:t>
-            </w:r>
-          </w:p>
-        </w:tc>
-        <w:tc>
-          <w:tcPr/>
-          <w:p>
-            <w:pPr>
-              <w:pStyle w:val="Compact"/>
-              <w:jc w:val="right"/>
-            </w:pPr>
-            <w:r>
-              <w:t xml:space="preserve">Worse</w:t>
+              <w:t xml:space="preserve">Система</w:t>
+            </w:r>
+          </w:p>
+        </w:tc>
+        <w:tc>
+          <w:tcPr/>
+          <w:p>
+            <w:pPr>
+              <w:pStyle w:val="Compact"/>
+              <w:jc w:val="right"/>
+            </w:pPr>
+            <w:r>
+              <w:t xml:space="preserve">Улучшено</w:t>
+            </w:r>
+          </w:p>
+        </w:tc>
+        <w:tc>
+          <w:tcPr/>
+          <w:p>
+            <w:pPr>
+              <w:pStyle w:val="Compact"/>
+              <w:jc w:val="right"/>
+            </w:pPr>
+            <w:r>
+              <w:t xml:space="preserve">Без изменений</w:t>
+            </w:r>
+          </w:p>
+        </w:tc>
+        <w:tc>
+          <w:tcPr/>
+          <w:p>
+            <w:pPr>
+              <w:pStyle w:val="Compact"/>
+              <w:jc w:val="right"/>
+            </w:pPr>
+            <w:r>
+              <w:t xml:space="preserve">Ухудшено</w:t>
             </w:r>
           </w:p>
         </w:tc>
@@ -4939,7 +4939,7 @@
               <w:pStyle w:val="Compact"/>
             </w:pPr>
             <w:r>
-              <w:t xml:space="preserve">ByT5 chunked</w:t>
+              <w:t xml:space="preserve">ByT5 с разбиением на фрагменты</w:t>
             </w:r>
           </w:p>
         </w:tc>
@@ -4988,7 +4988,7 @@
               <w:pStyle w:val="Compact"/>
             </w:pPr>
             <w:r>
-              <w:t xml:space="preserve">strict guarded ByT5</w:t>
+              <w:t xml:space="preserve">ByT5 со строгой фильтрацией</w:t>
             </w:r>
           </w:p>
         </w:tc>
@@ -5035,25 +5035,25 @@
         <w:pStyle w:val="BodyText"/>
       </w:pPr>
       <w:r>
-        <w:t xml:space="preserve">Без строгой фильтрации модель улучшает только 6 страниц из 68 и ухудшает 62 страницы. Strict guard резко уменьшает число плохих случаев и даёт 33 улучшенные страницы, но средний CER всё равно остаётся хуже, чем у raw OCR. Значит, защитный откат помогает уменьшить риск, но не заменяет обучение на реальных ошибках.</w:t>
-      </w:r>
-    </w:p>
-    <w:p>
-      <w:pPr>
-        <w:pStyle w:val="BodyText"/>
-      </w:pPr>
-      <w:r>
-        <w:t xml:space="preserve">Главный вывод этой проверки: результат на синтетическом наборе не переносится напрямую на полноценный сценарий реального OCR. Модель выучила распределение искусственного шума, но настоящий Tesseract OCR для османско-турецкой арабской графики имеет другую структуру ошибок. Для следующего этапа нужны выровненные OCR/reference-фрагменты, постраничное разбиение без утечки, обучение на настоящих OCR-ошибках и более аккуратная проверка на held-out pages.</w:t>
+        <w:t xml:space="preserve">Без строгой фильтрации модель улучшает только 6 страниц из 68 и ухудшает 62 страницы. Строгая фильтрация резко уменьшает число плохих случаев и даёт 33 улучшенные страницы, но средний CER всё равно остаётся хуже, чем у исходного OCR. Значит, защитный откат помогает уменьшить риск, но не заменяет обучение на реальных ошибках.</w:t>
+      </w:r>
+    </w:p>
+    <w:p>
+      <w:pPr>
+        <w:pStyle w:val="BodyText"/>
+      </w:pPr>
+      <w:r>
+        <w:t xml:space="preserve">Главный вывод этой проверки: результат на синтетическом наборе не переносится напрямую на полноценный сценарий реального OCR. Модель выучила распределение искусственного шума, но настоящий Tesseract OCR для османско-турецкой арабской графики имеет другую структуру ошибок. Для следующего этапа нужны выровненные пары «OCR-вывод — эталон», постраничное разбиение без утечки, обучение на настоящих OCR-ошибках и более аккуратная проверка на страницах, не использованных при обучении.</w:t>
       </w:r>
     </w:p>
     <w:bookmarkEnd w:id="64"/>
-    <w:bookmarkStart w:id="65" w:name="X62bfc526522db2362d3e52db8ee7524c8b80cbe"/>
+    <w:bookmarkStart w:id="65" w:name="X7e9a333c0e348598314438ea8ff63960782a9d4"/>
     <w:p>
       <w:pPr>
         <w:pStyle w:val="Heading3"/>
       </w:pPr>
       <w:r>
-        <w:t xml:space="preserve">5.13 Качественный разбор отдельных real-OCR строк</w:t>
+        <w:t xml:space="preserve">5.13 Качественный разбор отдельных строк реального OCR</w:t>
       </w:r>
     </w:p>
     <w:p>
@@ -5640,17 +5640,17 @@
         <w:pStyle w:val="BodyText"/>
       </w:pPr>
       <w:r>
-        <w:t xml:space="preserve">Эти примеры уточняют количественный вывод. На построчной подвыборке ByT5-small может немного улучшать CER и WER, но улучшение часто связано с локальными исправлениями, пробелами и частичными графемными заменами. При грубых ошибках Tesseract, пропусках больших фрагментов или нарушении порядка чтения модель либо почти ничего не исправляет, либо ухудшает строку. Поэтому следующий этап должен включать выровненные OCR/reference-фрагменты, ручную типологию ошибок и обучение на настоящем распределении OCR-ошибок.</w:t>
+        <w:t xml:space="preserve">Эти примеры уточняют количественный вывод. На построчной подвыборке ByT5-small может немного улучшать CER и WER, но улучшение часто связано с локальными исправлениями, пробелами и частичными графемными заменами. При грубых ошибках Tesseract, пропусках больших фрагментов или нарушении порядка чтения модель либо почти ничего не исправляет, либо ухудшает строку. Поэтому следующий этап должен включать выровненные пары «OCR-вывод — эталон», ручную типологию ошибок и обучение на настоящем распределении OCR-ошибок.</w:t>
       </w:r>
     </w:p>
     <w:bookmarkEnd w:id="65"/>
-    <w:bookmarkStart w:id="66" w:name="X6c14eb027de5fe9d860b5df768a6d00b13ead19"/>
+    <w:bookmarkStart w:id="66" w:name="Xc49697dafbe0e7fd9f030ef296d0d6e7abcc8c1"/>
     <w:p>
       <w:pPr>
         <w:pStyle w:val="Heading3"/>
       </w:pPr>
       <w:r>
-        <w:t xml:space="preserve">5.14 Качественный разбор постраничных real-OCR случаев</w:t>
+        <w:t xml:space="preserve">5.14 Качественный разбор постраничных случаев реального OCR</w:t>
       </w:r>
     </w:p>
     <w:p>
@@ -5658,7 +5658,7 @@
         <w:pStyle w:val="FirstParagraph"/>
       </w:pPr>
       <w:r>
-        <w:t xml:space="preserve">Построчные примеры показывают локальные типы ошибок, но постраничная проверка отвечает на другой вопрос: что происходит, если применить модель к целой странице после разбиения на фрагменты. Ниже приведены несколько характерных случаев из page-level эксперимента. В столбцах CER и WER значения указаны в порядке Raw / ByT5 / Guard: Raw — исходный Tesseract OCR, ByT5 — модель после применения к фрагментам страницы, Guard — вариант со строгой фильтрацией.</w:t>
+        <w:t xml:space="preserve">Построчные примеры показывают локальные типы ошибок, но постраничная проверка отвечает на другой вопрос: что происходит, если применить модель к целой странице после разбиения на фрагменты. Ниже приведены несколько характерных случаев из постраничного эксперимента. В столбцах CER и WER значения указаны в порядке «исходный OCR / ByT5 / фильтрация»: исходный OCR — результат Tesseract, ByT5 — модель после применения к фрагментам страницы, фильтрация — вариант со строгой проверкой предсказаний.</w:t>
       </w:r>
     </w:p>
     <w:tbl>
@@ -6039,7 +6039,7 @@
               <w:pStyle w:val="Compact"/>
             </w:pPr>
             <w:r>
-              <w:t xml:space="preserve">Guard спасает</w:t>
+              <w:t xml:space="preserve">фильтрация спасает</w:t>
             </w:r>
           </w:p>
         </w:tc>
@@ -6050,15 +6050,15 @@
         <w:pStyle w:val="BodyText"/>
       </w:pPr>
       <w:r>
-        <w:t xml:space="preserve">Случаи 1–2 показывают, что ByT5-small иногда действительно улучшает целую страницу, но масштаб улучшения остаётся умеренным. Случай 3 показывает, почему WER нельзя интерпретировать отдельно от CER: word-level метрика может улучшиться, хотя символный состав страницы ухудшается. Случаи 4–5 показывают роль варианта со строгой фильтрацией: он не делает модель сильнее, но снижает риск грубого ухудшения.</w:t>
-      </w:r>
-    </w:p>
-    <w:p>
-      <w:pPr>
-        <w:pStyle w:val="BodyText"/>
-      </w:pPr>
-      <w:r>
-        <w:t xml:space="preserve">Эти случаи уточняют общий вывод page-level эксперимента. Модель, обученная только на синтетическом шуме, иногда переносится на реальный OCR, но часто изменяет символный состав страницы в худшую сторону. Поэтому практическое продолжение работы должно опираться не только на синтетический генератор, а на выровненные OCR/reference-фрагменты и обучение на настоящих ошибках OCR.</w:t>
+        <w:t xml:space="preserve">Случаи 1–2 показывают, что ByT5-small иногда действительно улучшает целую страницу, но масштаб улучшения остаётся умеренным. Случай 3 показывает, почему WER нельзя интерпретировать отдельно от CER: метрика на уровне слов может улучшиться, хотя символный состав страницы ухудшается. Случаи 4–5 показывают роль варианта со строгой фильтрацией: он не делает модель сильнее, но снижает риск грубого ухудшения.</w:t>
+      </w:r>
+    </w:p>
+    <w:p>
+      <w:pPr>
+        <w:pStyle w:val="BodyText"/>
+      </w:pPr>
+      <w:r>
+        <w:t xml:space="preserve">Эти случаи уточняют общий вывод постраничного эксперимента. Модель, обученная только на синтетическом шуме, иногда переносится на реальный OCR, но часто изменяет символный состав страницы в худшую сторону. Поэтому практическое продолжение работы должно опираться не только на синтетический генератор, а на выровненные пары «OCR-вывод — эталон» и обучение на настоящих ошибках OCR.</w:t>
       </w:r>
     </w:p>
     <w:bookmarkEnd w:id="66"/>
@@ -6076,23 +6076,23 @@
         <w:pStyle w:val="FirstParagraph"/>
       </w:pPr>
       <w:r>
-        <w:t xml:space="preserve">Раздел результатов показывает две разные картины. В контролируемой синтетической постановке ByT5-small 512 превосходит метод без исправления, нормализатор на правилах и символьный baseline. Она улучшает большинство тестовых примеров и особенно заметно снижает WER. Этот результат подтверждает, что byte-level neural post-correction подходит как рабочий пилотный подход для арабографичного тюркского текста при заданном распределении шума.</w:t>
-      </w:r>
-    </w:p>
-    <w:p>
-      <w:pPr>
-        <w:pStyle w:val="BodyText"/>
-      </w:pPr>
-      <w:r>
-        <w:t xml:space="preserve">Но проверка на реальном OCR ограничивает этот вывод. На постраничном OCR османско-турецкого источника ByT5, обученная только на синтетических искажениях, уже не превосходит raw Tesseract по CER. Напротив, без строгой фильтрации она ухудшает большинство страниц. Консервативный защитный откат снижает риск, но не даёт среднего выигрыша над raw OCR.</w:t>
-      </w:r>
-    </w:p>
-    <w:p>
-      <w:pPr>
-        <w:pStyle w:val="BodyText"/>
-      </w:pPr>
-      <w:r>
-        <w:t xml:space="preserve">Итог раздела поэтому двойной. С одной стороны, экспериментальный контур, метрики и обучение модели работают в воспроизводимой синтетической среде. С другой стороны, практический переход к настоящим историческим сканам требует отдельной адаптации к реальным OCR-ошибкам. Это не косметическое улучшение будущей работы, а методологическое условие: без настоящих OCR/reference-пар нельзя честно утверждать, что модель решает реальную задачу посткоррекции.</w:t>
+        <w:t xml:space="preserve">Раздел результатов показывает две разные картины. В контролируемой синтетической постановке ByT5-small 512 превосходит метод без исправления, нормализатор на правилах и символьный метод на основе ошибок обучающей выборки. Она улучшает большинство тестовых примеров и особенно заметно снижает WER. Этот результат подтверждает, что нейросетевая посткоррекция с байтовым представлением подходит как рабочий пилотный подход для тюркского текста в арабской графике при заданном распределении шума.</w:t>
+      </w:r>
+    </w:p>
+    <w:p>
+      <w:pPr>
+        <w:pStyle w:val="BodyText"/>
+      </w:pPr>
+      <w:r>
+        <w:t xml:space="preserve">Но проверка на реальном OCR ограничивает этот вывод. На постраничном OCR османско-турецкого источника ByT5, обученная только на синтетических искажениях, уже не превосходит исходный Tesseract по CER. Напротив, без строгой фильтрации она ухудшает большинство страниц. Консервативный защитный откат снижает риск, но не даёт среднего выигрыша над исходным OCR.</w:t>
+      </w:r>
+    </w:p>
+    <w:p>
+      <w:pPr>
+        <w:pStyle w:val="BodyText"/>
+      </w:pPr>
+      <w:r>
+        <w:t xml:space="preserve">Итог раздела поэтому двойной. С одной стороны, экспериментальный контур, метрики и обучение модели работают в воспроизводимой синтетической среде. С другой стороны, практический переход к настоящим историческим сканам требует отдельной адаптации к реальным OCR-ошибкам. Это не косметическое улучшение будущей работы, а методологическое условие: без настоящих пар «OCR-вывод — эталон» нельзя честно утверждать, что модель решает реальную задачу посткоррекции.</w:t>
       </w:r>
     </w:p>
     <w:bookmarkEnd w:id="67"/>
@@ -6128,19 +6128,19 @@
         <w:pStyle w:val="BodyText"/>
       </w:pPr>
       <w:r>
-        <w:t xml:space="preserve">Один источник ограничивает жанровое, временное и орфографическое разнообразие материала. Тексты разных регионов и периодов могут отличаться по графике, лексике, нормам записи, качеству печати и состоянию сканов. Поэтому текущий корпус нужно рассматривать как pilot dataset, а не как представительный корпус для всей письменной традиции.</w:t>
-      </w:r>
-    </w:p>
-    <w:p>
-      <w:pPr>
-        <w:pStyle w:val="BodyText"/>
-      </w:pPr>
-      <w:r>
-        <w:t xml:space="preserve">Отдельное ограничение связано с тем, что старотатарские и старобашкирские материалы пока остаются мотивацией и будущей целью, а не основным реальным набором оценки. Текущая sanity-проверка на реальном OCR построена на османско-турецком печатном источнике: он подходит как связанный арабографичный тюркский проверочный материал, но не заменяет проверку на целевых татарских и башкирских источниках.</w:t>
+        <w:t xml:space="preserve">Один источник ограничивает жанровое, временное и орфографическое разнообразие материала. Тексты разных регионов и периодов могут отличаться по графике, лексике, нормам записи, качеству печати и состоянию сканов. Поэтому текущий корпус нужно рассматривать как пилотный набор данных, а не как представительный корпус для всей письменной традиции.</w:t>
+      </w:r>
+    </w:p>
+    <w:p>
+      <w:pPr>
+        <w:pStyle w:val="BodyText"/>
+      </w:pPr>
+      <w:r>
+        <w:t xml:space="preserve">Отдельное ограничение связано с тем, что старотатарские и старобашкирские материалы пока остаются мотивацией и будущей целью, а не основным реальным набором оценки. Текущая первичная проверка на реальном OCR построена на османско-турецком печатном источнике: он подходит как связанный арабографичный тюркский проверочный материал, но не заменяет проверку на целевых татарских и башкирских источниках.</w:t>
       </w:r>
     </w:p>
     <w:bookmarkEnd w:id="69"/>
-    <w:bookmarkStart w:id="70" w:name="ограничения-синтетического-шума"/>
+    <w:bookmarkStart w:id="70" w:name="ограничения-синтетического-шума-1"/>
     <w:p>
       <w:pPr>
         <w:pStyle w:val="Heading3"/>
@@ -6154,23 +6154,23 @@
         <w:pStyle w:val="FirstParagraph"/>
       </w:pPr>
       <w:r>
-        <w:t xml:space="preserve">В синтетическом наборе эталонные строки искажаются контролируемым генератором шума. Такая постановка удобна для первого эксперимента: известен эталонный текст, можно воспроизвести разбиение на train/validation/test и сравнить методы по одинаковым метрикам. Но синтетический шум остаётся приближением, а не настоящим OCR-выводом.</w:t>
-      </w:r>
-    </w:p>
-    <w:p>
-      <w:pPr>
-        <w:pStyle w:val="BodyText"/>
-      </w:pPr>
-      <w:r>
-        <w:t xml:space="preserve">Реальные OCR-ошибки зависят от качества изображения, шрифта, сегментации страницы, направления письма, настроек OCR-системы и состояния документа. Постраничная проверка на османско-турецком источнике показала это напрямую: модель, обученная только на синтетическом шуме, улучшает синтетический набор, но не переносится надёжно на raw Tesseract OCR. Она немного снижает WER, но ухудшает CER и NoSpaceCER относительно исходного OCR.</w:t>
-      </w:r>
-    </w:p>
-    <w:p>
-      <w:pPr>
-        <w:pStyle w:val="BodyText"/>
-      </w:pPr>
-      <w:r>
-        <w:t xml:space="preserve">Поэтому дальнейшая работа не должна ограничиваться усложнением синтетического генератора. Более важный следующий шаг — построить набор данных, учитывающий реальные OCR-ошибки: выровненные пары «OCR-вывод — эталонный текст» на уровне строк или коротких фрагментов. Уже после этого можно делать более реалистичную генерацию шума, основанную на настоящих символьных путаницах и артефактах разметки страницы.</w:t>
+        <w:t xml:space="preserve">В синтетическом наборе эталонные строки искажаются контролируемым генератором ошибок. Такая постановка удобна для первого эксперимента: известен эталонный текст, можно воспроизвести разбиение на обучающую, валидационную и тестовую выборки и сравнить методы по одинаковым метрикам. Но синтетические ошибки остаются приближением, а не настоящим OCR-выводом.</w:t>
+      </w:r>
+    </w:p>
+    <w:p>
+      <w:pPr>
+        <w:pStyle w:val="BodyText"/>
+      </w:pPr>
+      <w:r>
+        <w:t xml:space="preserve">Реальные OCR-ошибки зависят от качества изображения, шрифта, сегментации страницы, направления письма, настроек OCR-системы и состояния документа. Постраничная проверка на османско-турецком источнике показала это напрямую: модель, обученная только на синтетическом шуме, улучшает синтетический набор, но не переносится надёжно на исходный OCR Tesseract. Она немного снижает WER, но ухудшает CER и NoSpaceCER относительно исходного OCR-вывода.</w:t>
+      </w:r>
+    </w:p>
+    <w:p>
+      <w:pPr>
+        <w:pStyle w:val="BodyText"/>
+      </w:pPr>
+      <w:r>
+        <w:t xml:space="preserve">Поэтому дальнейшая работа не должна ограничиваться усложнением синтетического генератора. Более важный следующий шаг — построить набор данных, учитывающий реальные OCR-ошибки: выровненные пары «OCR-вывод — эталонный текст» на уровне строк или коротких фрагментов. Уже после этого можно делать более реалистичную генерацию ошибок, основанную на настоящих символьных путаницах и артефактах разметки страницы.</w:t>
       </w:r>
     </w:p>
     <w:bookmarkEnd w:id="70"/>
@@ -6188,7 +6188,7 @@
         <w:pStyle w:val="FirstParagraph"/>
       </w:pPr>
       <w:r>
-        <w:t xml:space="preserve">CER, WER, NoSpaceCER и ExactMatch позволяют формально сравнивать методы, но они не полностью описывают качество исправления исторического текста. Для исторических арабографичных материалов важно не только совпадение с reference, но и сохранение значимых орфографических вариантов. Механическое улучшение edit distance не всегда означает филологически корректное исправление.</w:t>
+        <w:t xml:space="preserve">CER, WER, NoSpaceCER и ExactMatch позволяют формально сравнивать методы, но не полностью описывают качество исправления исторического текста. Для исторических арабографичных материалов важно не только совпадение с эталоном, но и сохранение значимых орфографических вариантов. Механическое уменьшение расстояния редактирования не всегда означает филологически корректное исправление.</w:t>
       </w:r>
     </w:p>
     <w:p>
@@ -6230,15 +6230,15 @@
         <w:pStyle w:val="BodyText"/>
       </w:pPr>
       <w:r>
-        <w:t xml:space="preserve">Ключевое изменение должно состоять в переходе от эталонных текстовых блоков к связке «изображение — OCR/HTR-вывод — эталонный текст». Текущая постраничная проверка на реальном OCR полезна как sanity check, но она слишком груба для обучения модели. Нужны выровненные строки или короткие фрагменты, чтобы модель видела реальные ошибки OCR, а не только искусственно сгенерированные искажения.</w:t>
-      </w:r>
-    </w:p>
-    <w:p>
-      <w:pPr>
-        <w:pStyle w:val="BodyText"/>
-      </w:pPr>
-      <w:r>
-        <w:t xml:space="preserve">Разбиение данных должно выполняться по страницам или источникам, а не случайно по строкам. Это важно для предотвращения утечки: строки с одной и той же страницы или близкого контекста не должны одновременно попадать в train и test. Для маленьких исторических корпусов такая утечка может сильно завышать качество модели.</w:t>
+        <w:t xml:space="preserve">Ключевое изменение должно состоять в переходе от эталонных текстовых блоков к связке «изображение — OCR/HTR-вывод — эталонный текст». Текущая постраничная проверка на реальном OCR полезна как первичная проверка, но она слишком груба для обучения модели. Нужны выровненные строки или короткие фрагменты, чтобы модель видела реальные ошибки OCR, а не только искусственно сгенерированные искажения.</w:t>
+      </w:r>
+    </w:p>
+    <w:p>
+      <w:pPr>
+        <w:pStyle w:val="BodyText"/>
+      </w:pPr>
+      <w:r>
+        <w:t xml:space="preserve">Разбиение данных должно выполняться по страницам или источникам, а не случайно по строкам. Это важно для предотвращения утечки: строки с одной и той же страницы или близкого контекста не должны одновременно попадать в обучающую и тестовую выборки. Для маленьких исторических корпусов такая утечка может сильно завышать качество модели.</w:t>
       </w:r>
     </w:p>
     <w:bookmarkEnd w:id="72"/>
@@ -6256,23 +6256,23 @@
         <w:pStyle w:val="FirstParagraph"/>
       </w:pPr>
       <w:r>
-        <w:t xml:space="preserve">В текущей работе ByT5-small используется как основной нейросетевой baseline, а не как финальное решение. Для следующего этапа нужно сравнить несколько направлений: более крупные варианты ByT5, специализированные модели посткоррекции OCR, character-level seq2seq baselines и методы с консервативным защитным откатом.</w:t>
-      </w:r>
-    </w:p>
-    <w:p>
-      <w:pPr>
-        <w:pStyle w:val="BodyText"/>
-      </w:pPr>
-      <w:r>
-        <w:t xml:space="preserve">Результат на реальном OCR показывает, что модель должна не только уметь исправлять ошибки, но и понимать, когда лучше оставить исходный OCR без изменений. Поэтому важна отдельная логика уверенности и защитного отката: например, порог по edit distance, language-model score, изменению длины, доле новых символов или согласованию с train-derived confusion statistics.</w:t>
-      </w:r>
-    </w:p>
-    <w:p>
-      <w:pPr>
-        <w:pStyle w:val="BodyText"/>
-      </w:pPr>
-      <w:r>
-        <w:t xml:space="preserve">LLM-based post-correction также стоит проверять, но не как простой “волшебный” replacement. Современные работы по historical OCR correction показывают, что большие языковые модели могут давать полезные исправления, но эффект зависит от языка, корпуса, prompt setup и процедуры валидации. Для исторического материала особенно опасны fluent but wrong corrections: текст может выглядеть правдоподобно, но отходить от источника.</w:t>
+        <w:t xml:space="preserve">В текущей работе ByT5-small используется как основной нейросетевой базовый метод, а не как финальное решение. Для следующего этапа нужно сравнить несколько направлений: более крупные варианты ByT5, специализированные модели посткоррекции OCR, посимвольные модели преобразования последовательностей и методы с консервативным защитным откатом.</w:t>
+      </w:r>
+    </w:p>
+    <w:p>
+      <w:pPr>
+        <w:pStyle w:val="BodyText"/>
+      </w:pPr>
+      <w:r>
+        <w:t xml:space="preserve">Результат на реальном OCR показывает, что модель должна не только уметь исправлять ошибки, но и понимать, когда лучше оставить исходный OCR без изменений. Поэтому важна отдельная логика уверенности и защитного отката: например, порог по расстоянию редактирования, оценке языковой модели, изменению длины, доле новых символов или согласованию со статистикой символьных путаниц, извлечённой из обучающей выборки.</w:t>
+      </w:r>
+    </w:p>
+    <w:p>
+      <w:pPr>
+        <w:pStyle w:val="BodyText"/>
+      </w:pPr>
+      <w:r>
+        <w:t xml:space="preserve">Посткоррекцию на основе больших языковых моделей также стоит проверять, но не как простую «волшебную» замену. Современные работы по исправлению OCR исторических документов показывают, что большие языковые модели могут давать полезные исправления, но эффект зависит от языка, корпуса, постановки запроса и процедуры валидации. Для исторического материала особенно опасны гладкие, но неверные исправления: текст может выглядеть правдоподобно, но отходить от источника.</w:t>
       </w:r>
     </w:p>
     <w:bookmarkEnd w:id="73"/>
@@ -6290,15 +6290,15 @@
         <w:pStyle w:val="FirstParagraph"/>
       </w:pPr>
       <w:r>
-        <w:t xml:space="preserve">Post-correction является промежуточным этапом. После получения более надёжного OCR/HTR-output можно переходить к задачам поиска, нормализации вариантов написания, извлечения именованных сущностей, сопоставления исторических записей и построения графов связей.</w:t>
-      </w:r>
-    </w:p>
-    <w:p>
-      <w:pPr>
-        <w:pStyle w:val="BodyText"/>
-      </w:pPr>
-      <w:r>
-        <w:t xml:space="preserve">В контексте будущей магистерской работы этот пилот может стать техническим основанием для более широкой системы анализа арабографичных тюркских источников. Такая система может включать line cropping, OCR/HTR, post-correction, NER, record linkage, извлечение дат и топонимов, а также построение связей между людьми, местами и документами.</w:t>
+        <w:t xml:space="preserve">Посткоррекция является промежуточным этапом. После получения более надёжного OCR/HTR-вывода можно переходить к задачам поиска, нормализации вариантов написания, извлечения именованных сущностей, сопоставления исторических записей и построения графов связей.</w:t>
+      </w:r>
+    </w:p>
+    <w:p>
+      <w:pPr>
+        <w:pStyle w:val="BodyText"/>
+      </w:pPr>
+      <w:r>
+        <w:t xml:space="preserve">В контексте будущей магистерской работы этот пилот может стать техническим основанием для более широкой системы анализа арабографичных тюркских источников. Такая система может включать выделение строк на изображении, OCR/HTR, посткоррекцию, извлечение именованных сущностей, сопоставление записей, извлечение дат и топонимов, а также построение связей между людьми, местами и документами.</w:t>
       </w:r>
     </w:p>
     <w:p>
@@ -6333,31 +6333,31 @@
         <w:pStyle w:val="BodyText"/>
       </w:pPr>
       <w:r>
-        <w:t xml:space="preserve">На синтетическом наборе модель ByT5-small с максимальной длиной 512 показала лучший результат среди рассмотренных методов. Она превзошла метод без исправления, нормализатор на правилах и символьный baseline на основе ошибок обучающей выборки. При этом результат оказался неоднородным: WER снизился заметнее, чем CER, ExactMatch остался низким, а часть строк после посткоррекции ухудшилась. Поэтому синтетический набор подтвердил работоспособность подхода в контролируемой постановке, но не доказал готовность модели к автоматической правке реального OCR.</w:t>
-      </w:r>
-    </w:p>
-    <w:p>
-      <w:pPr>
-        <w:pStyle w:val="BodyText"/>
-      </w:pPr>
-      <w:r>
-        <w:t xml:space="preserve">Отдельно показано, что простая rule-based нормализация не является безопасной заменой нейросетевой посткоррекции. В проведённом эксперименте normalizer ухудшил качество относительно identity baseline. Это важный отрицательный результат: для исторической арабографичной письменности нельзя механически унифицировать символы и варианты написания без проверки влияния на эталонный текст.</w:t>
-      </w:r>
-    </w:p>
-    <w:p>
-      <w:pPr>
-        <w:pStyle w:val="BodyText"/>
-      </w:pPr>
-      <w:r>
-        <w:t xml:space="preserve">Главный итог работы связан с проверкой на реальном OCR. Постраничный набор на османско-турецком печатном источнике показал разрыв между синтетической и реальной оценкой: модель, обученная только на синтетическом шуме, немного снижает WER, но ухудшает CER и NoSpaceCER относительно raw Tesseract. Strict guarded variant уменьшает число ухудшенных страниц и даёт больше улучшенных страниц, но всё равно не превосходит raw OCR по среднему CER. Значит, отрицательный результат на реальном OCR является не провалом, а полезным исследовательским выводом: synthetic-only обучение недостаточно для практической посткоррекции исторических сканов.</w:t>
-      </w:r>
-    </w:p>
-    <w:p>
-      <w:pPr>
-        <w:pStyle w:val="BodyText"/>
-      </w:pPr>
-      <w:r>
-        <w:t xml:space="preserve">Полученный экспериментальный контур можно использовать как основу для следующего этапа. Ближайшее развитие должно включать проверенные OCR/reference-фрагменты, разбиение по страницам без утечки, обучение на настоящих OCR-ошибках и консервативную фильтрацию предсказаний. После этого посткоррекция сможет стать частью более широкой системы обработки исторических арабографичных тюркских источников: от OCR/HTR и исправления текста к поиску, NER, record linkage и построению графов связей.</w:t>
+        <w:t xml:space="preserve">На синтетическом наборе модель ByT5-small с максимальной длиной 512 показала лучший результат среди рассмотренных методов. Она превзошла метод без исправления, нормализатор на правилах и символьный метод на основе ошибок обучающей выборки. При этом результат оказался неоднородным: WER снизился заметнее, чем CER, ExactMatch остался низким, а часть строк после посткоррекции ухудшилась. Поэтому синтетический набор подтвердил работоспособность подхода в контролируемой постановке, но не доказал готовность модели к автоматической правке реального OCR.</w:t>
+      </w:r>
+    </w:p>
+    <w:p>
+      <w:pPr>
+        <w:pStyle w:val="BodyText"/>
+      </w:pPr>
+      <w:r>
+        <w:t xml:space="preserve">Отдельно показано, что простая нормализация на правилах не является безопасной заменой нейросетевой посткоррекции. В проведённом эксперименте нормализатор ухудшил качество относительно метода без исправления. Это важный отрицательный результат: для исторической арабографичной письменности нельзя механически унифицировать символы и варианты написания без проверки влияния на эталонный текст.</w:t>
+      </w:r>
+    </w:p>
+    <w:p>
+      <w:pPr>
+        <w:pStyle w:val="BodyText"/>
+      </w:pPr>
+      <w:r>
+        <w:t xml:space="preserve">Главный итог работы связан с проверкой на реальном OCR. Постраничный набор на османско-турецком печатном источнике показал разрыв между синтетической и реальной оценкой: модель, обученная только на синтетических ошибках, немного снижает WER, но ухудшает CER и NoSpaceCER относительно исходного Tesseract. Вариант со строгой фильтрацией уменьшает число ухудшенных страниц и даёт больше улучшенных страниц, но всё равно не превосходит исходный OCR по среднему CER. Значит, отрицательный результат на реальном OCR является не провалом, а полезным исследовательским выводом: обучение только на синтетических ошибках недостаточно для практической посткоррекции исторических сканов.</w:t>
+      </w:r>
+    </w:p>
+    <w:p>
+      <w:pPr>
+        <w:pStyle w:val="BodyText"/>
+      </w:pPr>
+      <w:r>
+        <w:t xml:space="preserve">Полученный экспериментальный контур можно использовать как основу для следующего этапа. Ближайшее развитие должно включать проверенные пары «OCR-вывод — эталон», разбиение по страницам без утечки, обучение на настоящих OCR-ошибках и консервативную фильтрацию предсказаний. После этого посткоррекция сможет стать частью более широкой системы обработки исторических арабографичных тюркских источников: от OCR/HTR и исправления текста к поиску, извлечению именованных сущностей, сопоставлению записей и построению графов связей.</w:t>
       </w:r>
     </w:p>
     <w:p>

</xml_diff>

<commit_message>
build(paper): rebuild final HSE docx after wording polish
</commit_message>
<xml_diff>
--- a/outputs/course_paper_hse_final.docx
+++ b/outputs/course_paper_hse_final.docx
@@ -2,6 +2,32 @@
 <file path=word/document.xml><?xml version="1.0" encoding="utf-8"?>
 <w:document xmlns:w="http://schemas.openxmlformats.org/wordprocessingml/2006/main" xmlns:m="http://schemas.openxmlformats.org/officeDocument/2006/math" xmlns:r="http://schemas.openxmlformats.org/officeDocument/2006/relationships" xmlns:o="urn:schemas-microsoft-com:office:office" xmlns:v="urn:schemas-microsoft-com:vml" xmlns:w10="urn:schemas-microsoft-com:office:word" xmlns:a="http://schemas.openxmlformats.org/drawingml/2006/main" xmlns:pic="http://schemas.openxmlformats.org/drawingml/2006/picture" xmlns:wp="http://schemas.openxmlformats.org/drawingml/2006/wordprocessingDrawing">
   <w:body>
+    <w:sdt>
+      <w:sdtPr>
+        <w:docPartObj>
+          <w:docPartGallery w:val="Table of Contents"/>
+          <w:docPartUnique/>
+        </w:docPartObj>
+      </w:sdtPr>
+      <w:sdtContent>
+        <w:p>
+          <w:pPr>
+            <w:pStyle w:val="TOCHeading"/>
+          </w:pPr>
+          <w:r>
+            <w:t xml:space="preserve">Содержание</w:t>
+          </w:r>
+        </w:p>
+        <w:p>
+          <w:r>
+            <w:fldChar w:fldCharType="begin" w:dirty="true"/>
+            <w:instrText xml:space="preserve">TOC \o "1-3" \h \z \u</w:instrText>
+            <w:fldChar w:fldCharType="separate"/>
+            <w:fldChar w:fldCharType="end"/>
+          </w:r>
+        </w:p>
+      </w:sdtContent>
+    </w:sdt>
     <w:p>
       <w:pPr>
         <w:pStyle w:val="FirstParagraph"/>
@@ -659,15 +685,15 @@
         <w:pStyle w:val="FirstParagraph"/>
       </w:pPr>
       <w:r>
-        <w:t xml:space="preserve">Практическая значимость работы состоит в подготовке воспроизводимого протокола для обработки тюркских текстов в арабской графике. Его можно расширить до набора пар «OCR-вывод — эталон» для татарских и башкирских источников, подключить реальные OCR/HTR-результаты и использовать как основу для более строгой оценки.</w:t>
-      </w:r>
-    </w:p>
-    <w:p>
-      <w:pPr>
-        <w:pStyle w:val="BodyText"/>
-      </w:pPr>
-      <w:r>
-        <w:t xml:space="preserve">Практический смысл результата связан с цифровой гуманитаристикой. После появления реальных пар «OCR-вывод — эталон» такой протокол можно использовать для поиска по историческим текстам, подготовки корпусов, извлечения именованных сущностей и сопоставления архивных записей. Текущая версия остаётся ограниченной: она показывает разрыв между синтетической и реальной оценкой, но не даёт готового корректора для архивных сканов.</w:t>
+        <w:t xml:space="preserve">Практический результат работы — не готовый OCR-инструмент, а проверяемая схема эксперимента: источник, способ генерации ошибок, разбиение данных, базовые методы, метрики и проверка на реальном OCR. Такой контур можно расширить до пар «OCR-вывод — эталон» для старотатарских и старобашкирских источников и использовать как основу для более строгой оценки посткоррекции.</w:t>
+      </w:r>
+    </w:p>
+    <w:p>
+      <w:pPr>
+        <w:pStyle w:val="BodyText"/>
+      </w:pPr>
+      <w:r>
+        <w:t xml:space="preserve">Практический смысл результата связан с цифровой гуманитаристикой. После появления реальных пар «OCR-вывод — эталон» этот контур можно применять для подготовки корпусов, поиска по историческим текстам, извлечения именованных сущностей и сопоставления архивных записей. Текущая версия честно фиксирует границу применимости: она показывает разрыв между синтетической и реальной оценкой, но не является готовым корректором для архивных сканов.</w:t>
       </w:r>
     </w:p>
     <w:bookmarkEnd w:id="18"/>
@@ -685,7 +711,7 @@
         <w:pStyle w:val="FirstParagraph"/>
       </w:pPr>
       <w:r>
-        <w:t xml:space="preserve">Далее работа устроена следующим образом. В разделе 2 рассматриваются OCR исторических документов, арабографичное распознавание, посткоррекция OCR и синтетические данные. В разделе 3 описываются корпус и построение синтетического набора. В разделе 4 приводится методология экспериментов. В разделе 5 представлены результаты, анализ ошибок и проверка на реальном OCR. В заключении формулируются ограничения и направления дальнейшей работы.</w:t>
+        <w:t xml:space="preserve">Логика работы следующая: сначала рассматриваются трудности OCR исторических документов и арабографичного письма, затем описываются корпус и синтетические ошибки, после этого сравниваются базовые методы и ByT5-small, а в конце отдельно проверяется перенос на реальный OCR-вывод Tesseract.</w:t>
       </w:r>
     </w:p>
     <w:bookmarkEnd w:id="19"/>
@@ -896,7 +922,7 @@
         <w:pStyle w:val="BodyText"/>
       </w:pPr>
       <w:r>
-        <w:t xml:space="preserve">Эти работы помогают точнее сформулировать ограничение текущего эксперимента. Проблема не в самом использовании синтетических данных, а в связи такого шума с реальным распределением OCR-ошибок. В этой работе синтетический набор показывает работоспособность протокола и ByT5-small в контролируемой постановке, но постраничная проверка на реальном OCR выявляет разрыв между синтетической и реальной оценкой. Поэтому следующий этап должен включать не только расширение синтетического набора, но и генерацию шума на основе реальных OCR-ошибок и сходства графем.</w:t>
+        <w:t xml:space="preserve">Из этих работ следует главное методологическое требование: синтетические ошибки должны быть похожи не просто на OCR-ошибки вообще, а на ошибки конкретной системы, письма и качества скана. В этой работе синтетический набор нужен как первый экспериментальный стенд: на нём можно проверить код, разбиение, метрики и сравнение методов. Но постраничная проверка на Tesseract показывает границу такого стенда. Для следующего этапа важнее не только увеличить объём синтетики, но и строить шум по реальным OCR-ошибкам и сходству арабографичных графем.</w:t>
       </w:r>
     </w:p>
     <w:bookmarkEnd w:id="24"/>
@@ -1986,15 +2012,15 @@
         <w:pStyle w:val="FirstParagraph"/>
       </w:pPr>
       <w:r>
-        <w:t xml:space="preserve">Главное ограничение синтетической постановки состоит в том, что генератор шума не основан на эмпирической матрице ошибок конкретной OCR/HTR-системы. Он моделирует правдоподобные классы текстовых искажений, но не воспроизводит реальные постраничные и визуальные факторы: качество скана, шрифт, лигатуры, структуру страницы, сегментацию строк, смешение колонок, повреждения страницы и ошибки порядка чтения.</w:t>
-      </w:r>
-    </w:p>
-    <w:p>
-      <w:pPr>
-        <w:pStyle w:val="BodyText"/>
-      </w:pPr>
-      <w:r>
-        <w:t xml:space="preserve">Поэтому результаты на синтетическом наборе следует интерпретировать как контролируемое пилотное исследование. Они показывают, что экспериментальный контур воспроизводим, методы сравнимы, а ByT5-small способен улучшать строки при заданном распределении шума. Однако улучшение на синтетическом наборе не доказывает практическую эффективность на реальных архивных сканах. Добавленная постраничная проверка на реальном OCR как раз показывает это ограничение: без адаптации на настоящих OCR-ошибках модель начинает чаще портить символы, чем исправлять их.</w:t>
+        <w:t xml:space="preserve">Главное ограничение синтетической постановки состоит в том, что генератор шума не построен по эмпирической матрице ошибок конкретной OCR/HTR-системы. Он создаёт правдоподобные текстовые искажения, но не воспроизводит качество скана, шрифт, лигатуры, структуру страницы, сегментацию строк, смешение колонок, повреждения бумаги и ошибки порядка чтения.</w:t>
+      </w:r>
+    </w:p>
+    <w:p>
+      <w:pPr>
+        <w:pStyle w:val="BodyText"/>
+      </w:pPr>
+      <w:r>
+        <w:t xml:space="preserve">Поэтому синтетический набор следует понимать как проверочный стенд, а не как замену реального OCR. Он показывает, что код, разбиение, метрики и сравнение методов работают воспроизводимо. Но постраничная проверка на Tesseract даёт более жёсткий результат: без адаптации на настоящих OCR-ошибках модель иногда снижает WER, но может ухудшать символный состав текста.</w:t>
       </w:r>
     </w:p>
     <w:bookmarkEnd w:id="35"/>
@@ -2570,7 +2596,7 @@
         <w:pStyle w:val="FirstParagraph"/>
       </w:pPr>
       <w:r>
-        <w:t xml:space="preserve">Построенный корпус следует рассматривать как пилотный. Его ограничения влияют не на воспроизводимость эксперимента, а на масштаб выводов, которые можно делать по результатам.</w:t>
+        <w:t xml:space="preserve">Построенный корпус является пилотным. Он достаточен для проверки экспериментальной схемы, но задаёт узкие границы для обобщения результатов.</w:t>
       </w:r>
     </w:p>
     <w:p>
@@ -2620,23 +2646,15 @@
         <w:pStyle w:val="FirstParagraph"/>
       </w:pPr>
       <w:r>
-        <w:t xml:space="preserve">В работе был создан небольшой, но воспроизводимый корпус для посткоррекции OCR исторического тюркского текста в арабской графике. На основе 400 эталонных текстовых блоков был построен синтетический набор данных с разбиением на обучающую, валидационную и тестовую выборки без утечки исходных строк.</w:t>
-      </w:r>
-    </w:p>
-    <w:p>
-      <w:pPr>
-        <w:pStyle w:val="BodyText"/>
-      </w:pPr>
-      <w:r>
-        <w:t xml:space="preserve">Корпус не претендует на полноту и не заменяет проверку на реальном OCR/HTR-выводе. Его роль на данном этапе уже иная: создать контролируемую экспериментальную основу, на которой можно сравнить метод без исправления, нормализатор на правилах, символьный метод на основе ошибок обучающей выборки и нейросетевую модель ByT5-small в одинаковых условиях.</w:t>
-      </w:r>
-    </w:p>
-    <w:p>
-      <w:pPr>
-        <w:pStyle w:val="BodyText"/>
-      </w:pPr>
-      <w:r>
-        <w:t xml:space="preserve">В дальнейшем этот корпус можно расширить за счёт новых источников, реального OCR/HTR-вывода, ручной лингвистической проверки и более разнообразных исторических тюркских материалов в арабской графике.</w:t>
+        <w:t xml:space="preserve">В разделе построен небольшой корпус для проверки посткоррекции OCR исторического тюркского текста в арабской графике. На основе 400 эталонных текстовых блоков создан синтетический набор данных с разбиением на обучающую, валидационную и тестовую выборки без утечки исходных строк.</w:t>
+      </w:r>
+    </w:p>
+    <w:p>
+      <w:pPr>
+        <w:pStyle w:val="BodyText"/>
+      </w:pPr>
+      <w:r>
+        <w:t xml:space="preserve">Роль корпуса ограничена, но ясна: он даёт одинаковые условия для сравнения метода без исправления, нормализатора на правилах, символьного метода на основе ошибок обучающей выборки и ByT5-small. Следующая версия должна добавить реальные OCR/HTR-выводы, ручную проверку и более разнообразные татарские, башкирские и другие тюркские источники в арабской графике.</w:t>
       </w:r>
     </w:p>
     <w:bookmarkEnd w:id="40"/>
@@ -3790,7 +3808,7 @@
         <w:pStyle w:val="BodyText"/>
       </w:pPr>
       <w:r>
-        <w:t xml:space="preserve">Такой результат согласуется с основной гипотезой пилота: модель с байтовым представлением, работающая как преобразование последовательностей, может быть полезна для посткоррекции тюркского текста в арабской графике. Однако улучшение по CER остаётся достаточно небольшим, поэтому вывод следует считать не финальным доказательством качества модели, а подтверждением работоспособности выбранного направления в контролируемой синтетической постановке.</w:t>
+        <w:t xml:space="preserve">Результат поддерживает гипотезу о пользе ByT5-small на синтетическом наборе, но размер эффекта по CER остаётся небольшим. Поэтому это не доказательство готовности модели к практическому OCR, а сигнал, что выбранное направление стоит продолжать на более строгих данных: реальных парах «OCR-вывод — эталон» и разбиении по страницам или источникам.</w:t>
       </w:r>
     </w:p>
     <w:bookmarkEnd w:id="55"/>
@@ -3972,7 +3990,7 @@
         <w:pStyle w:val="BodyText"/>
       </w:pPr>
       <w:r>
-        <w:t xml:space="preserve">Именно поэтому CER и WER в этой работе интерпретируются совместно. По CER улучшение ByT5-small является умеренным: с 0.086005 до 0.079913. По WER улучшение заметнее, но оно может частично отражать специфику синтетического генератора шума. Следовательно, результат показывает работоспособность модели в контролируемой синтетической постановке, но не доказывает такого же эффекта на реальных архивных сканах или реальном OCR/HTR-выводе.</w:t>
+        <w:t xml:space="preserve">Поэтому CER и WER нельзя читать по отдельности. По CER улучшение ByT5-small умеренное: с 0.086005 до 0.079913. По WER эффект заметнее, но часть этого эффекта связана с исправлением синтетических ошибок пробелов и границ слов. Такой результат показывает работоспособность модели на проверочном стенде, но не подтверждает такой же выигрыш на реальных архивных сканах или OCR/HTR-выводах.</w:t>
       </w:r>
     </w:p>
     <w:p>
@@ -4268,15 +4286,15 @@
         <w:pStyle w:val="BodyText"/>
       </w:pPr>
       <w:r>
-        <w:t xml:space="preserve">Это важный результат: улучшение агрегированных метрик не сводится к нескольким удачным строкам. ByT5-small 512 улучшает большинство тестовых примеров как на уровне символов, так и на уровне слов. При этом наличие 58–60 ухудшенных примеров показывает, что модель не является равномерно безопасной: она может добавлять новые ошибки и требует качественного анализа худших случаев.</w:t>
-      </w:r>
-    </w:p>
-    <w:p>
-      <w:pPr>
-        <w:pStyle w:val="BodyText"/>
-      </w:pPr>
-      <w:r>
-        <w:t xml:space="preserve">Качественный просмотр лучших и худших примеров показывает два разных режима поведения модели. В удачных случаях ByT5-small исправляет локальные OCR-подобные искажения, восстанавливает пропущенные или заменённые графемы и делает разбиение слов ближе к эталону. В худших случаях модель может не просто не исправить строку, а начать порождать повторяющиеся фрагменты, существенно удлиняя предсказание. Это особенно важно для практического применения: модель улучшает большинство строк, но без фильтрации, анализа худших случаев или ручной проверки её нельзя считать безопасным автоматическим корректором.</w:t>
+        <w:t xml:space="preserve">Этот результат важен тем, что агрегированные метрики не держатся на нескольких удачных строках: ByT5-small 512 улучшает большинство тестовых примеров и по CER, и по WER. Но 58–60 ухудшенных случаев показывают предел безопасности модели: она не только исправляет ошибки, но иногда добавляет новые.</w:t>
+      </w:r>
+    </w:p>
+    <w:p>
+      <w:pPr>
+        <w:pStyle w:val="BodyText"/>
+      </w:pPr>
+      <w:r>
+        <w:t xml:space="preserve">В примерах видны два сценария. В удачных случаях ByT5-small исправляет локальные OCR-подобные искажения, восстанавливает отдельные графемы и делает границы слов ближе к эталону. В худших случаях модель начинает порождать повторяющиеся фрагменты или заметно удлиняет строку. Для практического применения это принципиально: посткорректору нужен механизм отката, анализ худших случаев и ручная проверка спорных строк. Без этих защитных процедур модель нельзя считать безопасным автоматическим корректором.</w:t>
       </w:r>
     </w:p>
     <w:bookmarkEnd w:id="60"/>
@@ -4306,7 +4324,7 @@
         </w:numPr>
       </w:pPr>
       <w:r>
-        <w:t xml:space="preserve">CER improvement: 0.006092;</w:t>
+        <w:t xml:space="preserve">Среднее снижение CER: 0.006092;</w:t>
       </w:r>
     </w:p>
     <w:p>
@@ -4318,7 +4336,7 @@
         </w:numPr>
       </w:pPr>
       <w:r>
-        <w:t xml:space="preserve">WER improvement: 0.150467.</w:t>
+        <w:t xml:space="preserve">Среднее снижение WER: 0.150467.</w:t>
       </w:r>
     </w:p>
     <w:p>
@@ -4334,7 +4352,7 @@
         <w:pStyle w:val="BodyText"/>
       </w:pPr>
       <w:r>
-        <w:t xml:space="preserve">Среднее улучшение полезно как количественное резюме, но его недостаточно для окончательной оценки качества. Поэтому оно рассматривается вместе с распределением улучшенных, неизменённых и ухудшенных примеров и качественным анализом лучших и худших случаев.</w:t>
+        <w:t xml:space="preserve">Среднее снижение ошибки полезно как количественное резюме, но его недостаточно для окончательной оценки качества. Поэтому оно рассматривается вместе с распределением улучшенных, неизменённых и ухудшенных примеров и качественным анализом лучших и худших случаев.</w:t>
       </w:r>
     </w:p>
     <w:bookmarkEnd w:id="61"/>
@@ -4410,7 +4428,7 @@
         <w:pStyle w:val="BodyText"/>
       </w:pPr>
       <w:r>
-        <w:t xml:space="preserve">Отдельное ограничение связано с метриками. CER и WER измеряют формальную близость к эталону, но не полностью отражают историко-лингвистическую допустимость исправления. Для дальнейшей работы нужен вручную проверенный subset, где ошибки модели будут оцениваться не только автоматически, но и экспертно.</w:t>
+        <w:t xml:space="preserve">Отдельное ограничение связано с метриками. CER и WER измеряют формальную близость к эталону, но не полностью отражают историко-лингвистическую допустимость исправления. Для дальнейшей работы нужна вручную проверенная подвыборка, где ошибки модели будут оцениваться не только автоматически, но и экспертно.</w:t>
       </w:r>
     </w:p>
     <w:bookmarkEnd w:id="63"/>
@@ -6204,7 +6222,7 @@
         <w:pStyle w:val="BodyText"/>
       </w:pPr>
       <w:r>
-        <w:t xml:space="preserve">Для следующей версии набора нужна ручная экспертная проверка небольшой подвыборки. Такая подвыборка должна фиксировать не только «правильно/неправильно», но и тип ошибки: графема, пробел, пропуск, лишняя вставка, нормализация исторического написания, галлюцинация или порождение лишнего фрагмента. Это позволит связать количественные метрики с реальным качеством текста.</w:t>
+        <w:t xml:space="preserve">Для следующей версии набора нужна ручная экспертная проверка 100–200 строк: следует отдельно отметить замены графем, ошибки пробелов, пропуски, вставки, нормализацию и случаи порождения гладких, но неверных исправлений. Такая подвыборка должна фиксировать не только «правильно/неправильно», но и тип ошибки: графема, пробел, пропуск, лишняя вставка, нормализация исторического написания, галлюцинация или порождение лишнего фрагмента. Это позволит связать количественные метрики с реальным качеством текста.</w:t>
       </w:r>
     </w:p>
     <w:bookmarkEnd w:id="71"/>
@@ -6365,7 +6383,7 @@
         <w:pStyle w:val="BodyText"/>
       </w:pPr>
       <w:r>
-        <w:t xml:space="preserve">Практический результат работы — не готовая универсальная OCR-система, а воспроизводимый базовый контур, набор метрик, документация ограничений и ясная дорожная карта перехода от синтетической проверки к адаптации на реальных OCR-ошибках. Для курсового проекта это достаточный и честный результат; для магистерской работы это отправная точка более крупного исследования.</w:t>
+        <w:t xml:space="preserve">Практический результат работы — не готовый корректор, а диагностический стенд: он показывает, где синтетическая проверка даёт положительный сигнал, а где реальный OCR ломает перенос. Следующий шаг — реальные пары «OCR-вывод — эталон», разбиение по страницам или источникам и обучение на настоящих ошибках распознавания. Для курсового проекта это достаточный и честный результат; для магистерской работы это отправная точка более крупного исследования.</w:t>
       </w:r>
     </w:p>
     <w:p>

</xml_diff>

<commit_message>
build(paper): rebuild final HSE docx after terminology polish
</commit_message>
<xml_diff>
--- a/outputs/course_paper_hse_final.docx
+++ b/outputs/course_paper_hse_final.docx
@@ -2779,7 +2779,7 @@
         <w:pStyle w:val="BodyText"/>
       </w:pPr>
       <w:r>
-        <w:t xml:space="preserve">Третий базовый метод — символьный метод на основе ошибок обучающей выборки. Он строится по обучающим noisy-clean парам: noisy- и clean-строки выравниваются с помощью Levenshtein alignment, после чего оцениваются частотные соответствия между зашумлёнными и чистыми символами. Замена принимается только при достаточной поддержке и доминировании целевого символа. Такой метод опирается на данные, но не является нейросетевым: он может исправлять устойчивые локальные символьные путаницы, однако не умеет восстанавливать пропущенные символы из контекста и не моделирует дальние зависимости в строке.</w:t>
+        <w:t xml:space="preserve">Третий базовый метод — символьный метод на основе ошибок обучающей выборки. Он строится по обучающим парам «искажённая строка — эталон»: строки выравниваются с помощью алгоритма Левенштейна, после чего оцениваются частотные соответствия между искажёнными и эталонными символами. Замена принимается только при достаточной поддержке и доминировании целевого символа. Такой метод опирается на данные, но не является нейросетевым: он может исправлять устойчивые локальные символьные путаницы, однако не умеет восстанавливать пропущенные символы из контекста и не моделирует дальние зависимости в строке.</w:t>
       </w:r>
     </w:p>
     <w:bookmarkEnd w:id="43"/>
@@ -6222,7 +6222,7 @@
         <w:pStyle w:val="BodyText"/>
       </w:pPr>
       <w:r>
-        <w:t xml:space="preserve">Для следующей версии набора нужна ручная экспертная проверка 100–200 строк: следует отдельно отметить замены графем, ошибки пробелов, пропуски, вставки, нормализацию и случаи порождения гладких, но неверных исправлений. Такая подвыборка должна фиксировать не только «правильно/неправильно», но и тип ошибки: графема, пробел, пропуск, лишняя вставка, нормализация исторического написания, галлюцинация или порождение лишнего фрагмента. Это позволит связать количественные метрики с реальным качеством текста.</w:t>
+        <w:t xml:space="preserve">Для следующей версии набора нужна ручная экспертная проверка 100–200 строк. В такой подвыборке следует фиксировать не только «правильно/неправильно», но и тип ошибки: замену графемы, ошибку пробела, пропуск, лишнюю вставку, нормализацию исторического написания, галлюцинацию или порождение лишнего фрагмента. Это позволит связать количественные метрики с реальным качеством текста.</w:t>
       </w:r>
     </w:p>
     <w:bookmarkEnd w:id="71"/>

</xml_diff>

<commit_message>
build(paper): rebuild final HSE docx after layout polish
</commit_message>
<xml_diff>
--- a/outputs/course_paper_hse_final.docx
+++ b/outputs/course_paper_hse_final.docx
@@ -2,32 +2,6 @@
 <file path=word/document.xml><?xml version="1.0" encoding="utf-8"?>
 <w:document xmlns:w="http://schemas.openxmlformats.org/wordprocessingml/2006/main" xmlns:m="http://schemas.openxmlformats.org/officeDocument/2006/math" xmlns:r="http://schemas.openxmlformats.org/officeDocument/2006/relationships" xmlns:o="urn:schemas-microsoft-com:office:office" xmlns:v="urn:schemas-microsoft-com:vml" xmlns:w10="urn:schemas-microsoft-com:office:word" xmlns:a="http://schemas.openxmlformats.org/drawingml/2006/main" xmlns:pic="http://schemas.openxmlformats.org/drawingml/2006/picture" xmlns:wp="http://schemas.openxmlformats.org/drawingml/2006/wordprocessingDrawing">
   <w:body>
-    <w:sdt>
-      <w:sdtPr>
-        <w:docPartObj>
-          <w:docPartGallery w:val="Table of Contents"/>
-          <w:docPartUnique/>
-        </w:docPartObj>
-      </w:sdtPr>
-      <w:sdtContent>
-        <w:p>
-          <w:pPr>
-            <w:pStyle w:val="TOCHeading"/>
-          </w:pPr>
-          <w:r>
-            <w:t xml:space="preserve">Содержание</w:t>
-          </w:r>
-        </w:p>
-        <w:p>
-          <w:r>
-            <w:fldChar w:fldCharType="begin" w:dirty="true"/>
-            <w:instrText xml:space="preserve">TOC \o "1-3" \h \z \u</w:instrText>
-            <w:fldChar w:fldCharType="separate"/>
-            <w:fldChar w:fldCharType="end"/>
-          </w:r>
-        </w:p>
-      </w:sdtContent>
-    </w:sdt>
     <w:p>
       <w:pPr>
         <w:pStyle w:val="FirstParagraph"/>
@@ -219,28 +193,96 @@
         <w:br w:type="page"/>
       </w:r>
     </w:p>
-    <w:bookmarkStart w:id="9" w:name="содержание"/>
+    <w:bookmarkStart w:id="76" w:name="аннотация"/>
     <w:p>
       <w:pPr>
         <w:pStyle w:val="Heading1"/>
       </w:pPr>
       <w:r>
-        <w:t xml:space="preserve">Содержание</w:t>
-      </w:r>
-    </w:p>
-    <w:p>
-      <w:r>
-        <w:br w:type="page"/>
+        <w:t xml:space="preserve">Аннотация</w:t>
+      </w:r>
+    </w:p>
+    <w:p>
+      <w:pPr>
+        <w:pStyle w:val="FirstParagraph"/>
+      </w:pPr>
+      <w:r>
+        <w:t xml:space="preserve">В работе исследуется посткоррекция OCR-вывода для исторических тюркских текстов в арабской графике. Полный цикл распознавания изображений здесь не строится: эксперимент ограничен текстовым этапом, где на вход подаётся OCR-строка, а на выходе ожидается исправленный вариант, сопоставимый с эталоном.</w:t>
+      </w:r>
+    </w:p>
+    <w:p>
+      <w:pPr>
+        <w:pStyle w:val="BodyText"/>
+      </w:pPr>
+      <w:r>
+        <w:t xml:space="preserve">Пилотным материалом служит османско-турецкий текст в арабской графике. Он не заменяет старотатарский или старобашкирский набор данных, но позволяет проверить протокол на близком тюркском материале. На основе проверенных строк построен синтетический набор пар «искажённый текст — эталонный текст». В эксперименте сравниваются метод без исправления, нормализатор на правилах, символьный метод на основе ошибок обучающей выборки и ByT5-small.</w:t>
+      </w:r>
+    </w:p>
+    <w:p>
+      <w:pPr>
+        <w:pStyle w:val="BodyText"/>
+      </w:pPr>
+      <w:r>
+        <w:t xml:space="preserve">На синтетическом наборе ByT5-small показывает лучший результат среди рассмотренных методов, особенно по WER. Однако дополнительная проверка на реальном OCR-выводе Tesseract меняет интерпретацию результата: модель, обученная только на синтетических искажениях, не переносится надёжно на постраничный реальный OCR. Она может немного улучшать WER, но ухудшать CER и NoSpaceCER относительно исходного Tesseract.</w:t>
+      </w:r>
+    </w:p>
+    <w:p>
+      <w:pPr>
+        <w:pStyle w:val="BodyText"/>
+      </w:pPr>
+      <w:r>
+        <w:t xml:space="preserve">Главный результат работы состоит не в создании готовой OCR-системы, а в построении воспроизводимого протокола оценки и фиксации разрыва между синтетической и реальной проверкой. Для практического применения нужны выровненные пары «OCR-вывод — эталон», обучение на настоящих OCR-ошибках, проверка на татарских и башкирских источниках и ручной анализ ошибок.</w:t>
+      </w:r>
+    </w:p>
+    <w:bookmarkStart w:id="9" w:name="введение"/>
+    <w:p>
+      <w:pPr>
+        <w:pStyle w:val="Heading2"/>
+      </w:pPr>
+      <w:r>
+        <w:t xml:space="preserve">1. Введение</w:t>
+      </w:r>
+    </w:p>
+    <w:p>
+      <w:pPr>
+        <w:pStyle w:val="FirstParagraph"/>
+      </w:pPr>
+      <w:r>
+        <w:t xml:space="preserve">Исторические тюркские тексты в арабской графике важны для изучения истории, культуры, религии, права, повседневности и интеллектуальной традиции тюркских народов. К таким материалам относятся османские, татарские, башкирские, крымскотатарские и другие источники, созданные до перехода соответствующих письменных традиций на латиницу или кириллицу.</w:t>
+      </w:r>
+    </w:p>
+    <w:p>
+      <w:pPr>
+        <w:pStyle w:val="BodyText"/>
+      </w:pPr>
+      <w:r>
+        <w:t xml:space="preserve">Для автоматической обработки это трудный материал. Историческая орфография отличается от современной нормы, арабская графика плохо переносится на стандартные OCR-сценарии, а размеченных корпусов значительно меньше, чем для современных массовых языков. Даже когда скан доступен, исследователь часто получает не готовый текстовый корпус, а изображение или OCR-вывод с большим числом ошибок.</w:t>
+      </w:r>
+    </w:p>
+    <w:p>
+      <w:pPr>
+        <w:pStyle w:val="BodyText"/>
+      </w:pPr>
+      <w:r>
+        <w:t xml:space="preserve">В этой работе не ставится задача решить всю проблему распознавания исторических документов. Полная технологическая цепочка включает поиск источника, обработку изображения, разметку строк, OCR/HTR, посткоррекцию, проверку текста и последующий анализ. Здесь рассматривается более узкий слой: исправление уже полученного текстового вывода. Такое сужение делает эксперимент проверяемым: на вход подаётся OCR-текст, на выходе получается исправленная строка, а качество измеряется относительно эталона.</w:t>
+      </w:r>
+    </w:p>
+    <w:p>
+      <w:pPr>
+        <w:pStyle w:val="BodyText"/>
+      </w:pPr>
+      <w:r>
+        <w:t xml:space="preserve">Работа проверяет важное ограничение синтетического подхода. Если реальных пар «OCR-вывод — проверенный эталон» мало, естественный первый шаг состоит в искусственной генерации ошибок. Но успех на таком наборе не подтверждает работу модели на настоящем OCR. Поэтому эксперимент разделён на два уровня: контролируемую проверку на синтетических искажениях и отдельную постраничную проверку на реальном OCR османско-турецкого печатного источника.</w:t>
       </w:r>
     </w:p>
     <w:bookmarkEnd w:id="9"/>
-    <w:bookmarkStart w:id="77" w:name="аннотация"/>
-    <w:p>
-      <w:pPr>
-        <w:pStyle w:val="Heading1"/>
-      </w:pPr>
-      <w:r>
-        <w:t xml:space="preserve">Аннотация</w:t>
+    <w:bookmarkStart w:id="10" w:name="актуальность"/>
+    <w:p>
+      <w:pPr>
+        <w:pStyle w:val="Heading2"/>
+      </w:pPr>
+      <w:r>
+        <w:t xml:space="preserve">1.1 Актуальность</w:t>
       </w:r>
     </w:p>
     <w:p>
@@ -248,40 +290,33 @@
         <w:pStyle w:val="FirstParagraph"/>
       </w:pPr>
       <w:r>
-        <w:t xml:space="preserve">В работе исследуется посткоррекция OCR-вывода для исторических тюркских текстов в арабской графике. Полный цикл распознавания изображений здесь не строится: эксперимент ограничен текстовым этапом, где на вход подаётся OCR-строка, а на выходе ожидается исправленный вариант, сопоставимый с эталоном.</w:t>
-      </w:r>
-    </w:p>
-    <w:p>
-      <w:pPr>
-        <w:pStyle w:val="BodyText"/>
-      </w:pPr>
-      <w:r>
-        <w:t xml:space="preserve">Пилотным материалом служит османско-турецкий текст в арабской графике. Он не заменяет старотатарский или старобашкирский набор данных, но позволяет проверить протокол на близком тюркском материале. На основе проверенных строк построен синтетический набор пар «искажённый текст — эталонный текст». В эксперименте сравниваются метод без исправления, нормализатор на правилах, символьный метод на основе ошибок обучающей выборки и ByT5-small.</w:t>
-      </w:r>
-    </w:p>
-    <w:p>
-      <w:pPr>
-        <w:pStyle w:val="BodyText"/>
-      </w:pPr>
-      <w:r>
-        <w:t xml:space="preserve">На синтетическом наборе ByT5-small показывает лучший результат среди рассмотренных методов, особенно по WER. Однако дополнительная проверка на реальном OCR-выводе Tesseract меняет интерпретацию результата: модель, обученная только на синтетических искажениях, не переносится надёжно на постраничный реальный OCR. Она может немного улучшать WER, но ухудшать CER и NoSpaceCER относительно исходного Tesseract.</w:t>
-      </w:r>
-    </w:p>
-    <w:p>
-      <w:pPr>
-        <w:pStyle w:val="BodyText"/>
-      </w:pPr>
-      <w:r>
-        <w:t xml:space="preserve">Главный результат работы состоит не в создании готовой OCR-системы, а в построении воспроизводимого протокола оценки и фиксации разрыва между синтетической и реальной проверкой. Для практического применения нужны выровненные пары «OCR-вывод — эталон», обучение на настоящих OCR-ошибках, проверка на татарских и башкирских источниках и ручной анализ ошибок.</w:t>
-      </w:r>
-    </w:p>
-    <w:bookmarkStart w:id="10" w:name="введение"/>
+        <w:t xml:space="preserve">Актуальность работы связана не только с OCR как технической задачей. Без машинно-читаемого текста исторические источники трудно включать в поиск, корпусный анализ, извлечение имён и топонимов, сопоставление записей и проверку историко-лингвистических гипотез.</w:t>
+      </w:r>
+    </w:p>
+    <w:p>
+      <w:pPr>
+        <w:pStyle w:val="BodyText"/>
+      </w:pPr>
+      <w:r>
+        <w:t xml:space="preserve">Для арабографичных тюркских материалов эта проблема особенно заметна. Такие тексты слабо представлены в готовых OCR- и NLP-ресурсах; стандартные модели, обученные на современных языках и более регулярной орфографии, не обязательно справляются с историческим письмом. Даже частично распознанный текст часто требует отдельного слоя исправления: похожие графемы, пропуски, лишние символы и ошибки пробелов мешают дальнейшему анализу.</w:t>
+      </w:r>
+    </w:p>
+    <w:p>
+      <w:pPr>
+        <w:pStyle w:val="BodyText"/>
+      </w:pPr>
+      <w:r>
+        <w:t xml:space="preserve">Ещё одна причина актуальности связана с нехваткой воспроизводимых тестовых наборов и протоколов оценки. Для низкоресурсного исторического материала недостаточно показать один удачный пример исправления. Нужно фиксировать источник данных, процедуру генерации или получения OCR, разбиение на обучающую и тестовую части, метрики и худшие случаи. Поэтому в работе важны не только значения CER и WER, но и воспроизводимый протокол оценки.</w:t>
+      </w:r>
+    </w:p>
+    <w:bookmarkEnd w:id="10"/>
+    <w:bookmarkStart w:id="11" w:name="постановка-проблемы"/>
     <w:p>
       <w:pPr>
         <w:pStyle w:val="Heading2"/>
       </w:pPr>
       <w:r>
-        <w:t xml:space="preserve">1. Введение</w:t>
+        <w:t xml:space="preserve">1.2 Постановка проблемы</w:t>
       </w:r>
     </w:p>
     <w:p>
@@ -289,41 +324,33 @@
         <w:pStyle w:val="FirstParagraph"/>
       </w:pPr>
       <w:r>
-        <w:t xml:space="preserve">Исторические тюркские тексты в арабской графике важны для изучения истории, культуры, религии, права, повседневности и интеллектуальной традиции тюркских народов. К таким материалам относятся османские, татарские, башкирские, крымскотатарские и другие источники, созданные до перехода соответствующих письменных традиций на латиницу или кириллицу.</w:t>
-      </w:r>
-    </w:p>
-    <w:p>
-      <w:pPr>
-        <w:pStyle w:val="BodyText"/>
-      </w:pPr>
-      <w:r>
-        <w:t xml:space="preserve">Для автоматической обработки это трудный материал. Историческая орфография отличается от современной нормы, арабская графика плохо переносится на стандартные OCR-сценарии, а размеченных корпусов значительно меньше, чем для современных массовых языков. Даже когда скан доступен, исследователь часто получает не готовый текстовый корпус, а изображение или OCR-вывод с большим числом ошибок.</w:t>
-      </w:r>
-    </w:p>
-    <w:p>
-      <w:pPr>
-        <w:pStyle w:val="BodyText"/>
-      </w:pPr>
-      <w:r>
-        <w:t xml:space="preserve">В этой работе не ставится задача решить всю проблему распознавания исторических документов. Полная технологическая цепочка включает поиск источника, обработку изображения, разметку строк, OCR/HTR, посткоррекцию, проверку текста и последующий анализ. Здесь рассматривается более узкий слой: исправление уже полученного текстового вывода. Такое сужение делает эксперимент проверяемым: на вход подаётся OCR-текст, на выходе получается исправленная строка, а качество измеряется относительно эталона.</w:t>
-      </w:r>
-    </w:p>
-    <w:p>
-      <w:pPr>
-        <w:pStyle w:val="BodyText"/>
-      </w:pPr>
-      <w:r>
-        <w:t xml:space="preserve">Работа проверяет важное ограничение синтетического подхода. Если реальных пар «OCR-вывод — проверенный эталон» мало, естественный первый шаг состоит в искусственной генерации ошибок. Но успех на таком наборе не подтверждает работу модели на настоящем OCR. Поэтому эксперимент разделён на два уровня: контролируемую проверку на синтетических искажениях и отдельную постраничную проверку на реальном OCR османско-турецкого печатного источника.</w:t>
-      </w:r>
-    </w:p>
-    <w:bookmarkEnd w:id="10"/>
-    <w:bookmarkStart w:id="11" w:name="актуальность"/>
+        <w:t xml:space="preserve">Основная проблема состоит в том, что для исторических тюркских текстов в арабской графике пока не хватает небольших, но воспроизводимых экспериментальных контуров для проверки посткоррекции OCR. Без такого контура трудно понять, что именно улучшает модель: реальные ошибки распознавания, искусственно внесённый шум, пробелы, локальные замены графем или только отдельные удачные примеры.</w:t>
+      </w:r>
+    </w:p>
+    <w:p>
+      <w:pPr>
+        <w:pStyle w:val="BodyText"/>
+      </w:pPr>
+      <w:r>
+        <w:t xml:space="preserve">В этой работе проблема сведена к проверяемой постановке. Нужно построить пары «искажённый OCR-текст — эталон», обучить и сравнить несколько методов посткоррекции, а затем проверить перенос с синтетических ошибок на реальный OCR. Важное ограничение формулируется заранее: османско-турецкий источник используется как близкий тюркский материал в арабской графике, но не подаётся как старотатарский или старобашкирский набор данных.</w:t>
+      </w:r>
+    </w:p>
+    <w:p>
+      <w:pPr>
+        <w:pStyle w:val="BodyText"/>
+      </w:pPr>
+      <w:r>
+        <w:t xml:space="preserve">Такое сужение позволяет отделить ошибки посткоррекции от ошибок сегментации, распознавания изображения и подготовки скана. В то же время оно не снимает более крупную задачу: для практической системы всё равно понадобятся реальные пары «OCR-вывод — эталон», ручная валидация и расширение корпуса на целевые татарские и башкирские источники.</w:t>
+      </w:r>
+    </w:p>
+    <w:bookmarkEnd w:id="11"/>
+    <w:bookmarkStart w:id="12" w:name="цель-работы"/>
     <w:p>
       <w:pPr>
         <w:pStyle w:val="Heading2"/>
       </w:pPr>
       <w:r>
-        <w:t xml:space="preserve">1.1 Актуальность</w:t>
+        <w:t xml:space="preserve">1.3 Цель работы</w:t>
       </w:r>
     </w:p>
     <w:p>
@@ -331,79 +358,11 @@
         <w:pStyle w:val="FirstParagraph"/>
       </w:pPr>
       <w:r>
-        <w:t xml:space="preserve">Актуальность работы связана не только с OCR как технической задачей. Без машинно-читаемого текста исторические источники трудно включать в поиск, корпусный анализ, извлечение имён и топонимов, сопоставление записей и проверку историко-лингвистических гипотез.</w:t>
-      </w:r>
-    </w:p>
-    <w:p>
-      <w:pPr>
-        <w:pStyle w:val="BodyText"/>
-      </w:pPr>
-      <w:r>
-        <w:t xml:space="preserve">Для арабографичных тюркских материалов эта проблема особенно заметна. Такие тексты слабо представлены в готовых OCR- и NLP-ресурсах; стандартные модели, обученные на современных языках и более регулярной орфографии, не обязательно справляются с историческим письмом. Даже частично распознанный текст часто требует отдельного слоя исправления: похожие графемы, пропуски, лишние символы и ошибки пробелов мешают дальнейшему анализу.</w:t>
-      </w:r>
-    </w:p>
-    <w:p>
-      <w:pPr>
-        <w:pStyle w:val="BodyText"/>
-      </w:pPr>
-      <w:r>
-        <w:t xml:space="preserve">Ещё одна причина актуальности связана с нехваткой воспроизводимых тестовых наборов и протоколов оценки. Для низкоресурсного исторического материала недостаточно показать один удачный пример исправления. Нужно фиксировать источник данных, процедуру генерации или получения OCR, разбиение на обучающую и тестовую части, метрики и худшие случаи. Поэтому в работе важны не только значения CER и WER, но и воспроизводимый протокол оценки.</w:t>
-      </w:r>
-    </w:p>
-    <w:bookmarkEnd w:id="11"/>
-    <w:bookmarkStart w:id="12" w:name="постановка-проблемы"/>
-    <w:p>
-      <w:pPr>
-        <w:pStyle w:val="Heading2"/>
-      </w:pPr>
-      <w:r>
-        <w:t xml:space="preserve">1.2 Постановка проблемы</w:t>
-      </w:r>
-    </w:p>
-    <w:p>
-      <w:pPr>
-        <w:pStyle w:val="FirstParagraph"/>
-      </w:pPr>
-      <w:r>
-        <w:t xml:space="preserve">Основная проблема состоит в том, что для исторических тюркских текстов в арабской графике пока не хватает небольших, но воспроизводимых экспериментальных контуров для проверки посткоррекции OCR. Без такого контура трудно понять, что именно улучшает модель: реальные ошибки распознавания, искусственно внесённый шум, пробелы, локальные замены графем или только отдельные удачные примеры.</w:t>
-      </w:r>
-    </w:p>
-    <w:p>
-      <w:pPr>
-        <w:pStyle w:val="BodyText"/>
-      </w:pPr>
-      <w:r>
-        <w:t xml:space="preserve">В этой работе проблема сведена к проверяемой постановке. Нужно построить пары «искажённый OCR-текст — эталон», обучить и сравнить несколько методов посткоррекции, а затем проверить перенос с синтетических ошибок на реальный OCR. Важное ограничение формулируется заранее: османско-турецкий источник используется как близкий тюркский материал в арабской графике, но не подаётся как старотатарский или старобашкирский набор данных.</w:t>
-      </w:r>
-    </w:p>
-    <w:p>
-      <w:pPr>
-        <w:pStyle w:val="BodyText"/>
-      </w:pPr>
-      <w:r>
-        <w:t xml:space="preserve">Такое сужение позволяет отделить ошибки посткоррекции от ошибок сегментации, распознавания изображения и подготовки скана. В то же время оно не снимает более крупную задачу: для практической системы всё равно понадобятся реальные пары «OCR-вывод — эталон», ручная валидация и расширение корпуса на целевые татарские и башкирские источники.</w:t>
+        <w:t xml:space="preserve">Цель работы состоит в построении и оценке протокола посткоррекции OCR-подобных ошибок для исторических тюркских текстов в арабской графике, а также в проверке переноса модели с синтетических искажений на реальный OCR-вывод.</w:t>
       </w:r>
     </w:p>
     <w:bookmarkEnd w:id="12"/>
-    <w:bookmarkStart w:id="13" w:name="цель-работы"/>
-    <w:p>
-      <w:pPr>
-        <w:pStyle w:val="Heading2"/>
-      </w:pPr>
-      <w:r>
-        <w:t xml:space="preserve">1.3 Цель работы</w:t>
-      </w:r>
-    </w:p>
-    <w:p>
-      <w:pPr>
-        <w:pStyle w:val="FirstParagraph"/>
-      </w:pPr>
-      <w:r>
-        <w:t xml:space="preserve">Цель работы состоит в построении и оценке протокола посткоррекции OCR-подобных ошибок для исторических тюркских текстов в арабской графике, а также в проверке переноса модели с синтетических искажений на реальный OCR-вывод.</w:t>
-      </w:r>
-    </w:p>
-    <w:bookmarkEnd w:id="13"/>
-    <w:bookmarkStart w:id="14" w:name="задачи-работы"/>
+    <w:bookmarkStart w:id="13" w:name="задачи-работы"/>
     <w:p>
       <w:pPr>
         <w:pStyle w:val="Heading2"/>
@@ -516,34 +475,34 @@
         <w:t xml:space="preserve">Проверить перенос на реальный OCR-вывод Tesseract и сформулировать ограничения синтетического обучения.</w:t>
       </w:r>
     </w:p>
+    <w:bookmarkEnd w:id="13"/>
+    <w:bookmarkStart w:id="14" w:name="объект-и-предмет-исследования"/>
+    <w:p>
+      <w:pPr>
+        <w:pStyle w:val="Heading2"/>
+      </w:pPr>
+      <w:r>
+        <w:t xml:space="preserve">1.5 Объект и предмет исследования</w:t>
+      </w:r>
+    </w:p>
+    <w:p>
+      <w:pPr>
+        <w:pStyle w:val="FirstParagraph"/>
+      </w:pPr>
+      <w:r>
+        <w:t xml:space="preserve">Объект исследования составляют исторические тюркские тексты в арабской графике.</w:t>
+      </w:r>
+    </w:p>
+    <w:p>
+      <w:pPr>
+        <w:pStyle w:val="BodyText"/>
+      </w:pPr>
+      <w:r>
+        <w:t xml:space="preserve">Предмет исследования составляют методы посткоррекции OCR-подобных ошибок в таких текстах: правила, символьные замены и нейросетевая модель ByT5-small.</w:t>
+      </w:r>
+    </w:p>
     <w:bookmarkEnd w:id="14"/>
-    <w:bookmarkStart w:id="15" w:name="объект-и-предмет-исследования"/>
-    <w:p>
-      <w:pPr>
-        <w:pStyle w:val="Heading2"/>
-      </w:pPr>
-      <w:r>
-        <w:t xml:space="preserve">1.5 Объект и предмет исследования</w:t>
-      </w:r>
-    </w:p>
-    <w:p>
-      <w:pPr>
-        <w:pStyle w:val="FirstParagraph"/>
-      </w:pPr>
-      <w:r>
-        <w:t xml:space="preserve">Объект исследования составляют исторические тюркские тексты в арабской графике.</w:t>
-      </w:r>
-    </w:p>
-    <w:p>
-      <w:pPr>
-        <w:pStyle w:val="BodyText"/>
-      </w:pPr>
-      <w:r>
-        <w:t xml:space="preserve">Предмет исследования составляют методы посткоррекции OCR-подобных ошибок в таких текстах: правила, символьные замены и нейросетевая модель ByT5-small.</w:t>
-      </w:r>
-    </w:p>
-    <w:bookmarkEnd w:id="15"/>
-    <w:bookmarkStart w:id="16" w:name="исследовательские-вопросы"/>
+    <w:bookmarkStart w:id="15" w:name="исследовательские-вопросы"/>
     <w:p>
       <w:pPr>
         <w:pStyle w:val="Heading2"/>
@@ -620,14 +579,64 @@
         <w:t xml:space="preserve">Сохраняется ли выигрыш модели, обученной на синтетических ошибках, на реальном OCR-выводе Tesseract?</w:t>
       </w:r>
     </w:p>
+    <w:bookmarkEnd w:id="15"/>
+    <w:bookmarkStart w:id="16" w:name="гипотезы"/>
+    <w:p>
+      <w:pPr>
+        <w:pStyle w:val="Heading2"/>
+      </w:pPr>
+      <w:r>
+        <w:t xml:space="preserve">1.7 Гипотезы</w:t>
+      </w:r>
+    </w:p>
+    <w:p>
+      <w:pPr>
+        <w:pStyle w:val="FirstParagraph"/>
+      </w:pPr>
+      <w:r>
+        <w:t xml:space="preserve">В работе проверяются следующие гипотезы.</w:t>
+      </w:r>
+    </w:p>
+    <w:p>
+      <w:pPr>
+        <w:pStyle w:val="BodyText"/>
+      </w:pPr>
+      <w:r>
+        <w:t xml:space="preserve">Гипотеза 1. Простая нормализация на правилах может ухудшать качество арабографичного тюркского текста, поскольку способна искажать значимые орфографические особенности.</w:t>
+      </w:r>
+    </w:p>
+    <w:p>
+      <w:pPr>
+        <w:pStyle w:val="BodyText"/>
+      </w:pPr>
+      <w:r>
+        <w:t xml:space="preserve">Гипотеза 2. Модель ByT5-small с байтовым представлением способна улучшить качество посткоррекции OCR по сравнению с методом без исправления.</w:t>
+      </w:r>
+    </w:p>
+    <w:p>
+      <w:pPr>
+        <w:pStyle w:val="BodyText"/>
+      </w:pPr>
+      <w:r>
+        <w:t xml:space="preserve">Гипотеза 3. Увеличение максимальной длины последовательности с 256 до 512 должно улучшить результат, поскольку ByT5 кодирует текст на уровне байтов, а один видимый символ арабской графики может занимать несколько байтов.</w:t>
+      </w:r>
+    </w:p>
+    <w:p>
+      <w:pPr>
+        <w:pStyle w:val="BodyText"/>
+      </w:pPr>
+      <w:r>
+        <w:t xml:space="preserve">Гипотеза 4. Модель, обученная только на синтетических OCR-подобных ошибках, не будет надёжно переноситься на реальный постраничный OCR без адаптации на настоящих парах «OCR-вывод — эталон».</w:t>
+      </w:r>
+    </w:p>
     <w:bookmarkEnd w:id="16"/>
-    <w:bookmarkStart w:id="17" w:name="гипотезы"/>
+    <w:bookmarkStart w:id="17" w:name="практическая-значимость"/>
     <w:p>
       <w:pPr>
         <w:pStyle w:val="Heading2"/>
       </w:pPr>
       <w:r>
-        <w:t xml:space="preserve">1.7 Гипотезы</w:t>
+        <w:t xml:space="preserve">1.8 Практическая значимость</w:t>
       </w:r>
     </w:p>
     <w:p>
@@ -635,49 +644,25 @@
         <w:pStyle w:val="FirstParagraph"/>
       </w:pPr>
       <w:r>
-        <w:t xml:space="preserve">В работе проверяются следующие гипотезы.</w:t>
-      </w:r>
-    </w:p>
-    <w:p>
-      <w:pPr>
-        <w:pStyle w:val="BodyText"/>
-      </w:pPr>
-      <w:r>
-        <w:t xml:space="preserve">Гипотеза 1. Простая нормализация на правилах может ухудшать качество арабографичного тюркского текста, поскольку способна искажать значимые орфографические особенности.</w:t>
-      </w:r>
-    </w:p>
-    <w:p>
-      <w:pPr>
-        <w:pStyle w:val="BodyText"/>
-      </w:pPr>
-      <w:r>
-        <w:t xml:space="preserve">Гипотеза 2. Модель ByT5-small с байтовым представлением способна улучшить качество посткоррекции OCR по сравнению с методом без исправления.</w:t>
-      </w:r>
-    </w:p>
-    <w:p>
-      <w:pPr>
-        <w:pStyle w:val="BodyText"/>
-      </w:pPr>
-      <w:r>
-        <w:t xml:space="preserve">Гипотеза 3. Увеличение максимальной длины последовательности с 256 до 512 должно улучшить результат, поскольку ByT5 кодирует текст на уровне байтов, а один видимый символ арабской графики может занимать несколько байтов.</w:t>
-      </w:r>
-    </w:p>
-    <w:p>
-      <w:pPr>
-        <w:pStyle w:val="BodyText"/>
-      </w:pPr>
-      <w:r>
-        <w:t xml:space="preserve">Гипотеза 4. Модель, обученная только на синтетических OCR-подобных ошибках, не будет надёжно переноситься на реальный постраничный OCR без адаптации на настоящих парах «OCR-вывод — эталон».</w:t>
+        <w:t xml:space="preserve">Практический результат работы — не готовый OCR-инструмент, а проверяемая схема эксперимента: источник, способ генерации ошибок, разбиение данных, базовые методы, метрики и проверка на реальном OCR. Такой контур можно расширить до пар «OCR-вывод — эталон» для старотатарских и старобашкирских источников и использовать как основу для более строгой оценки посткоррекции.</w:t>
+      </w:r>
+    </w:p>
+    <w:p>
+      <w:pPr>
+        <w:pStyle w:val="BodyText"/>
+      </w:pPr>
+      <w:r>
+        <w:t xml:space="preserve">Практический смысл результата связан с цифровой гуманитаристикой. После появления реальных пар «OCR-вывод — эталон» этот контур можно применять для подготовки корпусов, поиска по историческим текстам, извлечения именованных сущностей и сопоставления архивных записей. Текущая версия честно фиксирует границу применимости: она показывает разрыв между синтетической и реальной оценкой, но не является готовым корректором для архивных сканов.</w:t>
       </w:r>
     </w:p>
     <w:bookmarkEnd w:id="17"/>
-    <w:bookmarkStart w:id="18" w:name="практическая-значимость"/>
+    <w:bookmarkStart w:id="18" w:name="структура-работы"/>
     <w:p>
       <w:pPr>
         <w:pStyle w:val="Heading2"/>
       </w:pPr>
       <w:r>
-        <w:t xml:space="preserve">1.8 Практическая значимость</w:t>
+        <w:t xml:space="preserve">1.9 Структура работы</w:t>
       </w:r>
     </w:p>
     <w:p>
@@ -685,25 +670,26 @@
         <w:pStyle w:val="FirstParagraph"/>
       </w:pPr>
       <w:r>
-        <w:t xml:space="preserve">Практический результат работы — не готовый OCR-инструмент, а проверяемая схема эксперимента: источник, способ генерации ошибок, разбиение данных, базовые методы, метрики и проверка на реальном OCR. Такой контур можно расширить до пар «OCR-вывод — эталон» для старотатарских и старобашкирских источников и использовать как основу для более строгой оценки посткоррекции.</w:t>
-      </w:r>
-    </w:p>
-    <w:p>
-      <w:pPr>
-        <w:pStyle w:val="BodyText"/>
-      </w:pPr>
-      <w:r>
-        <w:t xml:space="preserve">Практический смысл результата связан с цифровой гуманитаристикой. После появления реальных пар «OCR-вывод — эталон» этот контур можно применять для подготовки корпусов, поиска по историческим текстам, извлечения именованных сущностей и сопоставления архивных записей. Текущая версия честно фиксирует границу применимости: она показывает разрыв между синтетической и реальной оценкой, но не является готовым корректором для архивных сканов.</w:t>
+        <w:t xml:space="preserve">Логика работы следующая: сначала рассматриваются трудности OCR исторических документов и арабографичного письма, затем описываются корпус и синтетические ошибки, после этого сравниваются базовые методы и ByT5-small, а в конце отдельно проверяется перенос на реальный OCR-вывод Tesseract.</w:t>
       </w:r>
     </w:p>
     <w:bookmarkEnd w:id="18"/>
-    <w:bookmarkStart w:id="19" w:name="структура-работы"/>
+    <w:bookmarkStart w:id="26" w:name="X0ceba565ddc4689162e5800a39ee266fa2dc29a"/>
     <w:p>
       <w:pPr>
         <w:pStyle w:val="Heading2"/>
       </w:pPr>
       <w:r>
-        <w:t xml:space="preserve">1.9 Структура работы</w:t>
+        <w:t xml:space="preserve">2. Обзор предметной области и связанных работ</w:t>
+      </w:r>
+    </w:p>
+    <w:bookmarkStart w:id="19" w:name="X180942b9a24eaba8abfe1c56a0263be0843d255"/>
+    <w:p>
+      <w:pPr>
+        <w:pStyle w:val="Heading3"/>
+      </w:pPr>
+      <w:r>
+        <w:t xml:space="preserve">2.1 OCR исторических документов как воспроизводимый процесс</w:t>
       </w:r>
     </w:p>
     <w:p>
@@ -711,26 +697,279 @@
         <w:pStyle w:val="FirstParagraph"/>
       </w:pPr>
       <w:r>
-        <w:t xml:space="preserve">Логика работы следующая: сначала рассматриваются трудности OCR исторических документов и арабографичного письма, затем описываются корпус и синтетические ошибки, после этого сравниваются базовые методы и ByT5-small, а в конце отдельно проверяется перенос на реальный OCR-вывод Tesseract.</w:t>
+        <w:t xml:space="preserve">OCR исторических документов отличается от распознавания современных печатных текстов не одной отдельной трудностью, а сочетанием факторов: качеством скана, типографикой, состоянием страницы, сегментацией строк, структурой страницы и исторической вариативностью письма. Поэтому в работах по OCR исторических документов задача обычно рассматривается не только как запуск модели распознавания, а как воспроизводимый процесс: подготовка изображения, сегментация, создание эталонной разметки, обучение или настройка OCR/HTR, постобработка и ручная валидация.</w:t>
+      </w:r>
+    </w:p>
+    <w:p>
+      <w:pPr>
+        <w:pStyle w:val="BodyText"/>
+      </w:pPr>
+      <w:r>
+        <w:t xml:space="preserve">Для этой работы такой взгляд важен по двум причинам. Во-первых, рассматриваемая модель не заменяет OCR-систему целиком: она работает после получения OCR-вывода. Во-вторых, качество оценки зависит от связи между изображением, строкой и эталонной транскрипцией. OCR4all показывает значимость связки инструментов для исторических печатных источников (Reul et al., 2019), а работы об эталонной разметке подчёркивают необходимость корректного соответствия между изображением и эталоном (Springmann et al., 2018).</w:t>
+      </w:r>
+    </w:p>
+    <w:p>
+      <w:pPr>
+        <w:pStyle w:val="BodyText"/>
+      </w:pPr>
+      <w:r>
+        <w:t xml:space="preserve">Современные OCR-модели также всё чаще строятся на трансформерных подходах. Например, TrOCR использует предобученные компоненты визуального и текстового трансформеров и показывает, что сама OCR-модель может выигрывать от предобучения и дообучения на размеченных данных (Li et al., 2021). Однако это направление относится к распознаванию изображения, тогда как настоящая работа ограничена текстовой посткоррекцией. Такое ограничение сужает эксперимент, зато позволяет проверить отдельный вопрос: может ли модель исправлять уже полученный OCR-вывод без смешения этого результата с качеством сегментации и распознавания изображения.</w:t>
       </w:r>
     </w:p>
     <w:bookmarkEnd w:id="19"/>
-    <w:bookmarkStart w:id="27" w:name="X0ceba565ddc4689162e5800a39ee266fa2dc29a"/>
+    <w:bookmarkStart w:id="20" w:name="специфика-арабографичного-ocr"/>
+    <w:p>
+      <w:pPr>
+        <w:pStyle w:val="Heading3"/>
+      </w:pPr>
+      <w:r>
+        <w:t xml:space="preserve">2.2 Специфика арабографичного OCR</w:t>
+      </w:r>
+    </w:p>
+    <w:p>
+      <w:pPr>
+        <w:pStyle w:val="FirstParagraph"/>
+      </w:pPr>
+      <w:r>
+        <w:t xml:space="preserve">OCR для арабской графики обычно рассматривается как отдельный класс задач. Буквы меняют форму в зависимости от позиции в слове, письмо является связным, а различия между рядом символов могут задаваться небольшими графическими элементами, например точками. В обзорах OCR для арабской графики эти свойства выделяются как одна из причин, по которым прямой перенос подходов, хорошо работающих для латинской графики, оказывается недостаточным (Kasem et al., 2023). Для печатных арабографичных материалов дополнительно важны многошрифтовость, близость начертаний и нестабильность качества сканов (Osman et al., 2020).</w:t>
+      </w:r>
+    </w:p>
+    <w:p>
+      <w:pPr>
+        <w:pStyle w:val="BodyText"/>
+      </w:pPr>
+      <w:r>
+        <w:t xml:space="preserve">Для данной работы это означает, что ошибка OCR не сводится к случайной замене символа на символ. В арабской графике похожие графемы могут отличаться небольшими деталями, а ошибка сегментации или порядка чтения может резко ухудшать последующую посткоррекцию. Поэтому генератор синтетического шума полезен как контролируемая постановка, но его ошибки не обязаны совпадать с реальными ошибками Tesseract или другой OCR/HTR-системы.</w:t>
+      </w:r>
+    </w:p>
+    <w:p>
+      <w:pPr>
+        <w:pStyle w:val="BodyText"/>
+      </w:pPr>
+      <w:r>
+        <w:t xml:space="preserve">В исторических тюркских текстах арабская графика усложняется ещё сильнее: в одном материале могут сосуществовать арабские, персидские и тюркские орфографические практики. Для тюркских языков арабское письмо адаптировалось под звуки, которые не всегда имели прямые соответствия в классической арабской письменности. Поэтому один и тот же символ может быть одновременно технической единицей OCR и носителем историко-орфографической информации.</w:t>
+      </w:r>
+    </w:p>
+    <w:p>
+      <w:pPr>
+        <w:pStyle w:val="BodyText"/>
+      </w:pPr>
+      <w:r>
+        <w:t xml:space="preserve">Именно здесь возникает разрыв между синтетической и реальной проверкой. В синтетической постановке можно контролировать типы искажений и разбиение на обучающую и тестовую выборки. В реальном OCR появляются дополнительные факторы: структура страницы, шрифт, качество изображения, сегментация строк, направление письма и особенности конкретной OCR-системы. Поэтому результаты на синтетическом наборе нельзя автоматически переносить на настоящий OCR-вывод.</w:t>
+      </w:r>
+    </w:p>
+    <w:bookmarkEnd w:id="20"/>
+    <w:bookmarkStart w:id="21" w:name="X870e54edfb9df569aa2599064af567ed17246c1"/>
+    <w:p>
+      <w:pPr>
+        <w:pStyle w:val="Heading3"/>
+      </w:pPr>
+      <w:r>
+        <w:t xml:space="preserve">2.3 Тюркские тексты в арабской графике и османско-турецкий материал</w:t>
+      </w:r>
+    </w:p>
+    <w:p>
+      <w:pPr>
+        <w:pStyle w:val="FirstParagraph"/>
+      </w:pPr>
+      <w:r>
+        <w:t xml:space="preserve">Тюркские языки в разные исторические периоды использовали разные письменности, включая арабскую графику. Для османско-тюркских материалов эта проблема особенно заметна: после перехода турецкого языка на латиницу значительная часть печатного наследия осталась в форме, трудной для массового поиска и автоматической обработки. Работы по автоматической транскрипции османско-турецких периодических изданий показывают, что архивы на нелатинской графике требуют отдельной инфраструктуры, подготовки данных и проверки качества распознавания (Kirmizialtin &amp; Wrisley, 2020).</w:t>
+      </w:r>
+    </w:p>
+    <w:p>
+      <w:pPr>
+        <w:pStyle w:val="BodyText"/>
+      </w:pPr>
+      <w:r>
+        <w:t xml:space="preserve">В этой работе османско-турецкий источник используется как близкий тюркский материал в арабской графике. Проверка на реальном OCR не является старотатарским или старобашкирским набором данных. Татарские и башкирские источники остаются целью следующего этапа, а османско-турецкий материал выбран потому, что для него удалось сопоставить сканы страниц и постраничный эталонный текст.</w:t>
+      </w:r>
+    </w:p>
+    <w:p>
+      <w:pPr>
+        <w:pStyle w:val="BodyText"/>
+      </w:pPr>
+      <w:r>
+        <w:t xml:space="preserve">С точки зрения обработки естественного языка такие материалы относятся к низкоресурсным историческим данным. Для них меньше размеченных корпусов, стандартных бенчмарков, готовых моделей и инструментов, чем для современных массовых языков. Современные работы по обработке исторического турецкого языка подчёркивают необходимость создавать базовые ресурсы: корпуса, модели, разметку и инструменты для анализа исторических текстов (Özateş et al., 2025). Настоящая работа занимает в этой цепочке более узкое место: она не строит полный корпус, а проверяет протокол посткоррекции.</w:t>
+      </w:r>
+    </w:p>
+    <w:bookmarkEnd w:id="21"/>
+    <w:bookmarkStart w:id="22" w:name="Xfcaf842918234d7c399beca909495522023c2d4"/>
+    <w:p>
+      <w:pPr>
+        <w:pStyle w:val="Heading3"/>
+      </w:pPr>
+      <w:r>
+        <w:t xml:space="preserve">2.4 Посткоррекция OCR как преобразование искажённого текста в эталонный</w:t>
+      </w:r>
+    </w:p>
+    <w:p>
+      <w:pPr>
+        <w:pStyle w:val="FirstParagraph"/>
+      </w:pPr>
+      <w:r>
+        <w:t xml:space="preserve">Под посткоррекцией OCR понимается преобразование ошибочного OCR-вывода в более корректный текст. На уровне строки или короткого фрагмента эта задача формулируется как преобразование одной последовательности в другую: модель получает искажённый или OCR-текст и должна восстановить эталонный текст. Такой подход используется в работах по нейросетевой посткоррекции OCR, включая методы на основе нейронного машинного перевода и посимвольные модели преобразования последовательностей (Hämäläinen &amp; Hengchen, 2019; Ramirez-Orta et al., 2021).</w:t>
+      </w:r>
+    </w:p>
+    <w:p>
+      <w:pPr>
+        <w:pStyle w:val="BodyText"/>
+      </w:pPr>
+      <w:r>
+        <w:t xml:space="preserve">При этом посткоррекцию OCR нельзя полностью отождествлять с нормализацией исторического написания. Коррекция OCR исправляет технические ошибки распознавания, а нормализация орфографии может менять варианты написания в сторону некоторой нормы. В литературе эти задачи иногда рассматриваются рядом, но для исторического материала их важно разводить, чтобы не стереть значимые орфографические особенности (Duong et al., 2020).</w:t>
+      </w:r>
+    </w:p>
+    <w:p>
+      <w:pPr>
+        <w:pStyle w:val="BodyText"/>
+      </w:pPr>
+      <w:r>
+        <w:t xml:space="preserve">Для исторических корпусов особенно важна оценка на уровне символов. Ошибки OCR появляются из-за похожих графем, нестабильных шрифтов, качества скана, старой орфографии и сегментации слов. Lyu et al. (2021) связывают последующую коррекцию исторических корпусов с посимвольными ошибками, сегментацией слов и исторической вариативностью языка. Это близко к метрикам настоящей работы: CER и NoSpaceCER здесь важнее, чем один только WER, потому что улучшение на уровне слов может возникать из-за исправления пробелов и не гарантировать лучшего распознавания символов.</w:t>
+      </w:r>
+    </w:p>
+    <w:p>
+      <w:pPr>
+        <w:pStyle w:val="BodyText"/>
+      </w:pPr>
+      <w:r>
+        <w:t xml:space="preserve">Для низкоресурсных языков посткоррекция дополнительно ограничивается нехваткой вручную проверенных пар «OCR-вывод — эталон». Rijhwani et al. (2021) показывают, что нейросетевая посткоррекция для низкоресурсных и исчезающих языков зависит от дефицита вручную подготовленных коррекционных данных, а самообучение и декодирование с учётом лексики помогают использовать неразмеченные изображения и распознанные тексты. Это напрямую связано с данной работой: обучение только на синтетическом шуме даёт контролируемую базовую проверку, но следующий шаг требует адаптации к реальным OCR-ошибкам на выровненных парах.</w:t>
+      </w:r>
+    </w:p>
+    <w:p>
+      <w:pPr>
+        <w:pStyle w:val="BodyText"/>
+      </w:pPr>
+      <w:r>
+        <w:t xml:space="preserve">Отдельная современная линия исследований связана с использованием больших языковых моделей для коррекции OCR. Kanerva et al. (2025) показывают, что посткоррекция на основе больших языковых моделей для исторических документов не даёт универсального выигрыша: эффект зависит от языка, данных и постановки. Этот вывод важен для интерпретации настоящего эксперимента. Смешанный перенос модели, обученной на синтетических искажениях, на реальный OCR отражает известную проблему посткоррекции: качество зависит от домена, языка, структуры ошибок и объёма размеченных пар «OCR-вывод — эталон».</w:t>
+      </w:r>
+    </w:p>
+    <w:bookmarkEnd w:id="22"/>
+    <w:bookmarkStart w:id="23" w:name="Xaa6a63b69f8f8f9084dc16d50d48dc0403f5611"/>
+    <w:p>
+      <w:pPr>
+        <w:pStyle w:val="Heading3"/>
+      </w:pPr>
+      <w:r>
+        <w:t xml:space="preserve">2.5 Синтетические данные для посткоррекции OCR</w:t>
+      </w:r>
+    </w:p>
+    <w:p>
+      <w:pPr>
+        <w:pStyle w:val="FirstParagraph"/>
+      </w:pPr>
+      <w:r>
+        <w:t xml:space="preserve">В идеальном случае модель посткоррекции обучается на парах реального OCR/HTR-вывода и вручную проверенного текста. Для низкоресурсных исторических материалов такие пары часто отсутствуют или существуют в малом объёме. Поэтому в первых экспериментах используют синтетические данные: эталонный текст намеренно искажается, чтобы получить пары «искажённый текст — эталон». Такой подход не заменяет реальную оценку, но даёт контролируемый первый уровень сравнения.</w:t>
+      </w:r>
+    </w:p>
+    <w:p>
+      <w:pPr>
+        <w:pStyle w:val="BodyText"/>
+      </w:pPr>
+      <w:r>
+        <w:t xml:space="preserve">Работы по коррекции OCR для исторических текстов на иврите показывают, что задачно-ориентированные искусственные данные могут быть полезны для исправления OCR-ошибок при дефиците размеченных исторических данных (Suissa et al., 2023). Naiman et al. (2023) используют большие синтетические наборы для посткоррекции исторических научных статей и показывают, что пары синтетического эталона и OCR-вывода могут улучшать CER и WER. Это подтверждает саму идею синтетического набора как разумного пилотного этапа.</w:t>
+      </w:r>
+    </w:p>
+    <w:p>
+      <w:pPr>
+        <w:pStyle w:val="BodyText"/>
+      </w:pPr>
+      <w:r>
+        <w:t xml:space="preserve">Однако современные работы также показывают, что способ генерации синтетических данных имеет значение. Guan and Greene (2024) сравнивают объём данных, расширение данных и методы генерации синтетических данных для посткоррекции OCR; отдельно рассматриваются сходство глифов и низкоресурсная постановка. RoundTripOCR также показывает, что для низкоресурсной посткоррекции OCR можно строить синтетические параллельные данные и трактовать исправление OCR как преобразование искажённого текста в эталонный по аналогии с переводом (Kashid &amp; Bhattacharyya, 2024).</w:t>
+      </w:r>
+    </w:p>
+    <w:p>
+      <w:pPr>
+        <w:pStyle w:val="BodyText"/>
+      </w:pPr>
+      <w:r>
+        <w:t xml:space="preserve">Из этих работ следует главное методологическое требование: синтетические ошибки должны быть похожи не просто на OCR-ошибки вообще, а на ошибки конкретной системы, письма и качества скана. В этой работе синтетический набор нужен как первый экспериментальный стенд: на нём можно проверить код, разбиение, метрики и сравнение методов. Но постраничная проверка на Tesseract показывает границу такого стенда. Для следующего этапа важнее не только увеличить объём синтетики, но и строить шум по реальным OCR-ошибкам и сходству арабографичных графем.</w:t>
+      </w:r>
+    </w:p>
+    <w:bookmarkEnd w:id="23"/>
+    <w:bookmarkStart w:id="24" w:name="X15509693a0d7b6f8fe53cddac6f871c0636dbad"/>
+    <w:p>
+      <w:pPr>
+        <w:pStyle w:val="Heading3"/>
+      </w:pPr>
+      <w:r>
+        <w:t xml:space="preserve">2.6 Модели с байтовым представлением и выбор ByT5</w:t>
+      </w:r>
+    </w:p>
+    <w:p>
+      <w:pPr>
+        <w:pStyle w:val="FirstParagraph"/>
+      </w:pPr>
+      <w:r>
+        <w:t xml:space="preserve">В работе используется ByT5-small. ByT5 относится к моделям преобразования последовательностей с байтовым представлением: она работает на уровне байтов, а не заранее заданных слов или подсловных единиц (Xue et al., 2021). Для низкоресурсного исторического материала это важно, потому что обычный токенизатор по подсловным единицам может плохо покрывать редкие графемы, нестандартные написания, смешение письменных традиций и OCR-шум.</w:t>
+      </w:r>
+    </w:p>
+    <w:p>
+      <w:pPr>
+        <w:pStyle w:val="BodyText"/>
+      </w:pPr>
+      <w:r>
+        <w:t xml:space="preserve">Выбор ByT5 также связан с постановкой преобразования искажённого текста в эталонный. Архитектура преобразования текста в текст позволяет формулировать посткоррекцию как преобразование одной последовательности в другую, что наследует общую логику T5 (Raffel et al., 2019) и трансформерного моделирования последовательностей (Vaswani et al., 2017). При этом байтовое представление особенно удобно для арабографичных текстов, где видимые символы и их Unicode-представление могут быть нестабильны, а ошибки часто проявляются на уровне отдельных графем.</w:t>
+      </w:r>
+    </w:p>
+    <w:p>
+      <w:pPr>
+        <w:pStyle w:val="BodyText"/>
+      </w:pPr>
+      <w:r>
+        <w:t xml:space="preserve">Тем не менее модель с байтовым представлением не решает проблему доменного переноса автоматически. Если модель обучена только на синтетическом шуме, она учится распределению ошибок этого генератора. Реальный OCR-вывод может иметь другую структуру: пропуски, артефакты разметки страницы, ошибки чтения строк, необычные пробелы, неверные формы букв или последовательные искажения. Поэтому ByT5 в этой работе рассматривается как сильная нейросетевая точка сравнения для посткоррекции, но не как готовое универсальное решение.</w:t>
+      </w:r>
+    </w:p>
+    <w:bookmarkEnd w:id="24"/>
+    <w:bookmarkStart w:id="25" w:name="X4e2987dd6a0ff1eb2f6c8914cca3c5fd2dc83ae"/>
+    <w:p>
+      <w:pPr>
+        <w:pStyle w:val="Heading3"/>
+      </w:pPr>
+      <w:r>
+        <w:t xml:space="preserve">2.7 Позиция данной работы относительно существующих исследований</w:t>
+      </w:r>
+    </w:p>
+    <w:p>
+      <w:pPr>
+        <w:pStyle w:val="FirstParagraph"/>
+      </w:pPr>
+      <w:r>
+        <w:t xml:space="preserve">Из рассмотренных работ следуют четыре требования к эксперименту. Для исторического OCR нужен воспроизводимый процесс, эталонные данные и ручная проверка, а не только запуск модели распознавания. Для арабской графики важны собственные графические трудности и структура страницы. Посткоррекция OCR может быть сформулирована как преобразование ошибочного текста в эталонный. Синтетические данные полезны для низкоресурсных постановок, но требуют отдельной проверки на реальном OCR.</w:t>
+      </w:r>
+    </w:p>
+    <w:p>
+      <w:pPr>
+        <w:pStyle w:val="BodyText"/>
+      </w:pPr>
+      <w:r>
+        <w:t xml:space="preserve">Для этой работы важны три линии исследований: OCR исторических документов, распознавание арабской графики и посткоррекция OCR-ошибок. Работа не создаёт новую OCR/HTR-систему и не заявляет лучшего результата в области OCR исторических документов. Её вклад более узкий: воспроизводимый набор для посткоррекции тюркских текстов в арабской графике, сравнение простых базовых методов и ByT5-small, анализ синтетической оценки и отдельная проверка переноса на постраничном OCR османско-турецкого источника.</w:t>
+      </w:r>
+    </w:p>
+    <w:p>
+      <w:pPr>
+        <w:pStyle w:val="BodyText"/>
+      </w:pPr>
+      <w:r>
+        <w:t xml:space="preserve">Методологически важен отрицательный результат: на синтетическом наборе модель улучшает метрики относительно базовых методов, но на реальном OCR перенос оказывается нестабильным. Поэтому работа полезна как подготовительный этап для магистерского исследования. Следующий шаг должен включать проверенные пары «OCR-вывод — эталон», постраничное разбиение без утечки и обучение на настоящих OCR-ошибках.</w:t>
+      </w:r>
+    </w:p>
+    <w:bookmarkEnd w:id="25"/>
+    <w:bookmarkEnd w:id="26"/>
+    <w:bookmarkStart w:id="40" w:name="данные-и-построение-корпуса"/>
     <w:p>
       <w:pPr>
         <w:pStyle w:val="Heading2"/>
       </w:pPr>
       <w:r>
-        <w:t xml:space="preserve">2. Обзор предметной области и связанных работ</w:t>
-      </w:r>
-    </w:p>
-    <w:bookmarkStart w:id="20" w:name="X180942b9a24eaba8abfe1c56a0263be0843d255"/>
+        <w:t xml:space="preserve">3. Данные и построение корпуса</w:t>
+      </w:r>
+    </w:p>
+    <w:bookmarkStart w:id="27" w:name="общая-постановка"/>
     <w:p>
       <w:pPr>
         <w:pStyle w:val="Heading3"/>
       </w:pPr>
       <w:r>
-        <w:t xml:space="preserve">2.1 OCR исторических документов как воспроизводимый процесс</w:t>
+        <w:t xml:space="preserve">3.1 Общая постановка</w:t>
       </w:r>
     </w:p>
     <w:p>
@@ -738,307 +977,27 @@
         <w:pStyle w:val="FirstParagraph"/>
       </w:pPr>
       <w:r>
-        <w:t xml:space="preserve">OCR исторических документов отличается от распознавания современных печатных текстов не одной отдельной трудностью, а сочетанием факторов: качеством скана, типографикой, состоянием страницы, сегментацией строк, структурой страницы и исторической вариативностью письма. Поэтому в работах по OCR исторических документов задача обычно рассматривается не только как запуск модели распознавания, а как воспроизводимый процесс: подготовка изображения, сегментация, создание эталонной разметки, обучение или настройка OCR/HTR, постобработка и ручная валидация.</w:t>
-      </w:r>
-    </w:p>
-    <w:p>
-      <w:pPr>
-        <w:pStyle w:val="BodyText"/>
-      </w:pPr>
-      <w:r>
-        <w:t xml:space="preserve">Для этой работы такой взгляд важен по двум причинам. Во-первых, рассматриваемая модель не заменяет OCR-систему целиком: она работает после получения OCR-вывода. Во-вторых, качество оценки зависит от связи между изображением, строкой и эталонной транскрипцией. OCR4all показывает значимость связки инструментов для исторических печатных источников (Reul et al., 2019), а работы об эталонной разметке подчёркивают необходимость корректного соответствия между изображением и эталоном (Springmann et al., 2018).</w:t>
-      </w:r>
-    </w:p>
-    <w:p>
-      <w:pPr>
-        <w:pStyle w:val="BodyText"/>
-      </w:pPr>
-      <w:r>
-        <w:t xml:space="preserve">Современные OCR-модели также всё чаще строятся на трансформерных подходах. Например, TrOCR использует предобученные компоненты визуального и текстового трансформеров и показывает, что сама OCR-модель может выигрывать от предобучения и дообучения на размеченных данных (Li et al., 2021). Однако это направление относится к распознаванию изображения, тогда как настоящая работа ограничена текстовой посткоррекцией. Такое ограничение сужает эксперимент, зато позволяет проверить отдельный вопрос: может ли модель исправлять уже полученный OCR-вывод без смешения этого результата с качеством сегментации и распознавания изображения.</w:t>
-      </w:r>
-    </w:p>
-    <w:bookmarkEnd w:id="20"/>
-    <w:bookmarkStart w:id="21" w:name="специфика-арабографичного-ocr"/>
-    <w:p>
-      <w:pPr>
-        <w:pStyle w:val="Heading3"/>
-      </w:pPr>
-      <w:r>
-        <w:t xml:space="preserve">2.2 Специфика арабографичного OCR</w:t>
-      </w:r>
-    </w:p>
-    <w:p>
-      <w:pPr>
-        <w:pStyle w:val="FirstParagraph"/>
-      </w:pPr>
-      <w:r>
-        <w:t xml:space="preserve">OCR для арабской графики обычно рассматривается как отдельный класс задач. Буквы меняют форму в зависимости от позиции в слове, письмо является связным, а различия между рядом символов могут задаваться небольшими графическими элементами, например точками. В обзорах OCR для арабской графики эти свойства выделяются как одна из причин, по которым прямой перенос подходов, хорошо работающих для латинской графики, оказывается недостаточным (Kasem et al., 2023). Для печатных арабографичных материалов дополнительно важны многошрифтовость, близость начертаний и нестабильность качества сканов (Osman et al., 2020).</w:t>
-      </w:r>
-    </w:p>
-    <w:p>
-      <w:pPr>
-        <w:pStyle w:val="BodyText"/>
-      </w:pPr>
-      <w:r>
-        <w:t xml:space="preserve">Для данной работы это означает, что ошибка OCR не сводится к случайной замене символа на символ. В арабской графике похожие графемы могут отличаться небольшими деталями, а ошибка сегментации или порядка чтения может резко ухудшать последующую посткоррекцию. Поэтому генератор синтетического шума полезен как контролируемая постановка, но его ошибки не обязаны совпадать с реальными ошибками Tesseract или другой OCR/HTR-системы.</w:t>
-      </w:r>
-    </w:p>
-    <w:p>
-      <w:pPr>
-        <w:pStyle w:val="BodyText"/>
-      </w:pPr>
-      <w:r>
-        <w:t xml:space="preserve">В исторических тюркских текстах арабская графика усложняется ещё сильнее: в одном материале могут сосуществовать арабские, персидские и тюркские орфографические практики. Для тюркских языков арабское письмо адаптировалось под звуки, которые не всегда имели прямые соответствия в классической арабской письменности. Поэтому один и тот же символ может быть одновременно технической единицей OCR и носителем историко-орфографической информации.</w:t>
-      </w:r>
-    </w:p>
-    <w:p>
-      <w:pPr>
-        <w:pStyle w:val="BodyText"/>
-      </w:pPr>
-      <w:r>
-        <w:t xml:space="preserve">Именно здесь возникает разрыв между синтетической и реальной проверкой. В синтетической постановке можно контролировать типы искажений и разбиение на обучающую и тестовую выборки. В реальном OCR появляются дополнительные факторы: структура страницы, шрифт, качество изображения, сегментация строк, направление письма и особенности конкретной OCR-системы. Поэтому результаты на синтетическом наборе нельзя автоматически переносить на настоящий OCR-вывод.</w:t>
-      </w:r>
-    </w:p>
-    <w:bookmarkEnd w:id="21"/>
-    <w:bookmarkStart w:id="22" w:name="X870e54edfb9df569aa2599064af567ed17246c1"/>
-    <w:p>
-      <w:pPr>
-        <w:pStyle w:val="Heading3"/>
-      </w:pPr>
-      <w:r>
-        <w:t xml:space="preserve">2.3 Тюркские тексты в арабской графике и османско-турецкий материал</w:t>
-      </w:r>
-    </w:p>
-    <w:p>
-      <w:pPr>
-        <w:pStyle w:val="FirstParagraph"/>
-      </w:pPr>
-      <w:r>
-        <w:t xml:space="preserve">Тюркские языки в разные исторические периоды использовали разные письменности, включая арабскую графику. Для османско-тюркских материалов эта проблема особенно заметна: после перехода турецкого языка на латиницу значительная часть печатного наследия осталась в форме, трудной для массового поиска и автоматической обработки. Работы по автоматической транскрипции османско-турецких периодических изданий показывают, что архивы на нелатинской графике требуют отдельной инфраструктуры, подготовки данных и проверки качества распознавания (Kirmizialtin &amp; Wrisley, 2020).</w:t>
-      </w:r>
-    </w:p>
-    <w:p>
-      <w:pPr>
-        <w:pStyle w:val="BodyText"/>
-      </w:pPr>
-      <w:r>
-        <w:t xml:space="preserve">В этой работе османско-турецкий источник используется как близкий тюркский материал в арабской графике. Проверка на реальном OCR не является старотатарским или старобашкирским набором данных. Татарские и башкирские источники остаются целью следующего этапа, а османско-турецкий материал выбран потому, что для него удалось сопоставить сканы страниц и постраничный эталонный текст.</w:t>
-      </w:r>
-    </w:p>
-    <w:p>
-      <w:pPr>
-        <w:pStyle w:val="BodyText"/>
-      </w:pPr>
-      <w:r>
-        <w:t xml:space="preserve">С точки зрения обработки естественного языка такие материалы относятся к низкоресурсным историческим данным. Для них меньше размеченных корпусов, стандартных бенчмарков, готовых моделей и инструментов, чем для современных массовых языков. Современные работы по обработке исторического турецкого языка подчёркивают необходимость создавать базовые ресурсы: корпуса, модели, разметку и инструменты для анализа исторических текстов (Özateş et al., 2025). Настоящая работа занимает в этой цепочке более узкое место: она не строит полный корпус, а проверяет протокол посткоррекции.</w:t>
-      </w:r>
-    </w:p>
-    <w:bookmarkEnd w:id="22"/>
-    <w:bookmarkStart w:id="23" w:name="Xfcaf842918234d7c399beca909495522023c2d4"/>
-    <w:p>
-      <w:pPr>
-        <w:pStyle w:val="Heading3"/>
-      </w:pPr>
-      <w:r>
-        <w:t xml:space="preserve">2.4 Посткоррекция OCR как преобразование искажённого текста в эталонный</w:t>
-      </w:r>
-    </w:p>
-    <w:p>
-      <w:pPr>
-        <w:pStyle w:val="FirstParagraph"/>
-      </w:pPr>
-      <w:r>
-        <w:t xml:space="preserve">Под посткоррекцией OCR понимается преобразование ошибочного OCR-вывода в более корректный текст. На уровне строки или короткого фрагмента эта задача формулируется как преобразование одной последовательности в другую: модель получает искажённый или OCR-текст и должна восстановить эталонный текст. Такой подход используется в работах по нейросетевой посткоррекции OCR, включая методы на основе нейронного машинного перевода и посимвольные модели преобразования последовательностей (Hämäläinen &amp; Hengchen, 2019; Ramirez-Orta et al., 2021).</w:t>
-      </w:r>
-    </w:p>
-    <w:p>
-      <w:pPr>
-        <w:pStyle w:val="BodyText"/>
-      </w:pPr>
-      <w:r>
-        <w:t xml:space="preserve">При этом посткоррекцию OCR нельзя полностью отождествлять с нормализацией исторического написания. Коррекция OCR исправляет технические ошибки распознавания, а нормализация орфографии может менять варианты написания в сторону некоторой нормы. В литературе эти задачи иногда рассматриваются рядом, но для исторического материала их важно разводить, чтобы не стереть значимые орфографические особенности (Duong et al., 2020).</w:t>
-      </w:r>
-    </w:p>
-    <w:p>
-      <w:pPr>
-        <w:pStyle w:val="BodyText"/>
-      </w:pPr>
-      <w:r>
-        <w:t xml:space="preserve">Для исторических корпусов особенно важна оценка на уровне символов. Ошибки OCR появляются из-за похожих графем, нестабильных шрифтов, качества скана, старой орфографии и сегментации слов. Lyu et al. (2021) связывают последующую коррекцию исторических корпусов с посимвольными ошибками, сегментацией слов и исторической вариативностью языка. Это близко к метрикам настоящей работы: CER и NoSpaceCER здесь важнее, чем один только WER, потому что улучшение на уровне слов может возникать из-за исправления пробелов и не гарантировать лучшего распознавания символов.</w:t>
-      </w:r>
-    </w:p>
-    <w:p>
-      <w:pPr>
-        <w:pStyle w:val="BodyText"/>
-      </w:pPr>
-      <w:r>
-        <w:t xml:space="preserve">Для низкоресурсных языков посткоррекция дополнительно ограничивается нехваткой вручную проверенных пар «OCR-вывод — эталон». Rijhwani et al. (2021) показывают, что нейросетевая посткоррекция для низкоресурсных и исчезающих языков зависит от дефицита вручную подготовленных коррекционных данных, а самообучение и декодирование с учётом лексики помогают использовать неразмеченные изображения и распознанные тексты. Это напрямую связано с данной работой: обучение только на синтетическом шуме даёт контролируемую базовую проверку, но следующий шаг требует адаптации к реальным OCR-ошибкам на выровненных парах.</w:t>
-      </w:r>
-    </w:p>
-    <w:p>
-      <w:pPr>
-        <w:pStyle w:val="BodyText"/>
-      </w:pPr>
-      <w:r>
-        <w:t xml:space="preserve">Отдельная современная линия исследований связана с использованием больших языковых моделей для коррекции OCR. Kanerva et al. (2025) показывают, что посткоррекция на основе больших языковых моделей для исторических документов не даёт универсального выигрыша: эффект зависит от языка, данных и постановки. Этот вывод важен для интерпретации настоящего эксперимента. Смешанный перенос модели, обученной на синтетических искажениях, на реальный OCR отражает известную проблему посткоррекции: качество зависит от домена, языка, структуры ошибок и объёма размеченных пар «OCR-вывод — эталон».</w:t>
-      </w:r>
-    </w:p>
-    <w:bookmarkEnd w:id="23"/>
-    <w:bookmarkStart w:id="24" w:name="Xaa6a63b69f8f8f9084dc16d50d48dc0403f5611"/>
-    <w:p>
-      <w:pPr>
-        <w:pStyle w:val="Heading3"/>
-      </w:pPr>
-      <w:r>
-        <w:t xml:space="preserve">2.5 Синтетические данные для посткоррекции OCR</w:t>
-      </w:r>
-    </w:p>
-    <w:p>
-      <w:pPr>
-        <w:pStyle w:val="FirstParagraph"/>
-      </w:pPr>
-      <w:r>
-        <w:t xml:space="preserve">В идеальном случае модель посткоррекции обучается на парах реального OCR/HTR-вывода и вручную проверенного текста. Для низкоресурсных исторических материалов такие пары часто отсутствуют или существуют в малом объёме. Поэтому в первых экспериментах используют синтетические данные: эталонный текст намеренно искажается, чтобы получить пары «искажённый текст — эталон». Такой подход не заменяет реальную оценку, но даёт контролируемый первый уровень сравнения.</w:t>
-      </w:r>
-    </w:p>
-    <w:p>
-      <w:pPr>
-        <w:pStyle w:val="BodyText"/>
-      </w:pPr>
-      <w:r>
-        <w:t xml:space="preserve">Работы по коррекции OCR для исторических текстов на иврите показывают, что задачно-ориентированные искусственные данные могут быть полезны для исправления OCR-ошибок при дефиците размеченных исторических данных (Suissa et al., 2023). Naiman et al. (2023) используют большие синтетические наборы для посткоррекции исторических научных статей и показывают, что пары синтетического эталона и OCR-вывода могут улучшать CER и WER. Это подтверждает саму идею синтетического набора как разумного пилотного этапа.</w:t>
-      </w:r>
-    </w:p>
-    <w:p>
-      <w:pPr>
-        <w:pStyle w:val="BodyText"/>
-      </w:pPr>
-      <w:r>
-        <w:t xml:space="preserve">Однако современные работы также показывают, что способ генерации синтетических данных имеет значение. Guan and Greene (2024) сравнивают объём данных, расширение данных и методы генерации синтетических данных для посткоррекции OCR; отдельно рассматриваются сходство глифов и низкоресурсная постановка. RoundTripOCR также показывает, что для низкоресурсной посткоррекции OCR можно строить синтетические параллельные данные и трактовать исправление OCR как преобразование искажённого текста в эталонный по аналогии с переводом (Kashid &amp; Bhattacharyya, 2024).</w:t>
-      </w:r>
-    </w:p>
-    <w:p>
-      <w:pPr>
-        <w:pStyle w:val="BodyText"/>
-      </w:pPr>
-      <w:r>
-        <w:t xml:space="preserve">Из этих работ следует главное методологическое требование: синтетические ошибки должны быть похожи не просто на OCR-ошибки вообще, а на ошибки конкретной системы, письма и качества скана. В этой работе синтетический набор нужен как первый экспериментальный стенд: на нём можно проверить код, разбиение, метрики и сравнение методов. Но постраничная проверка на Tesseract показывает границу такого стенда. Для следующего этапа важнее не только увеличить объём синтетики, но и строить шум по реальным OCR-ошибкам и сходству арабографичных графем.</w:t>
-      </w:r>
-    </w:p>
-    <w:bookmarkEnd w:id="24"/>
-    <w:bookmarkStart w:id="25" w:name="X15509693a0d7b6f8fe53cddac6f871c0636dbad"/>
-    <w:p>
-      <w:pPr>
-        <w:pStyle w:val="Heading3"/>
-      </w:pPr>
-      <w:r>
-        <w:t xml:space="preserve">2.6 Модели с байтовым представлением и выбор ByT5</w:t>
-      </w:r>
-    </w:p>
-    <w:p>
-      <w:pPr>
-        <w:pStyle w:val="FirstParagraph"/>
-      </w:pPr>
-      <w:r>
-        <w:t xml:space="preserve">В работе используется ByT5-small. ByT5 относится к моделям преобразования последовательностей с байтовым представлением: она работает на уровне байтов, а не заранее заданных слов или подсловных единиц (Xue et al., 2021). Для низкоресурсного исторического материала это важно, потому что обычный токенизатор по подсловным единицам может плохо покрывать редкие графемы, нестандартные написания, смешение письменных традиций и OCR-шум.</w:t>
-      </w:r>
-    </w:p>
-    <w:p>
-      <w:pPr>
-        <w:pStyle w:val="BodyText"/>
-      </w:pPr>
-      <w:r>
-        <w:t xml:space="preserve">Выбор ByT5 также связан с постановкой преобразования искажённого текста в эталонный. Архитектура преобразования текста в текст позволяет формулировать посткоррекцию как преобразование одной последовательности в другую, что наследует общую логику T5 (Raffel et al., 2019) и трансформерного моделирования последовательностей (Vaswani et al., 2017). При этом байтовое представление особенно удобно для арабографичных текстов, где видимые символы и их Unicode-представление могут быть нестабильны, а ошибки часто проявляются на уровне отдельных графем.</w:t>
-      </w:r>
-    </w:p>
-    <w:p>
-      <w:pPr>
-        <w:pStyle w:val="BodyText"/>
-      </w:pPr>
-      <w:r>
-        <w:t xml:space="preserve">Тем не менее модель с байтовым представлением не решает проблему доменного переноса автоматически. Если модель обучена только на синтетическом шуме, она учится распределению ошибок этого генератора. Реальный OCR-вывод может иметь другую структуру: пропуски, артефакты разметки страницы, ошибки чтения строк, необычные пробелы, неверные формы букв или последовательные искажения. Поэтому ByT5 в этой работе рассматривается как сильная нейросетевая точка сравнения для посткоррекции, но не как готовое универсальное решение.</w:t>
-      </w:r>
-    </w:p>
-    <w:bookmarkEnd w:id="25"/>
-    <w:bookmarkStart w:id="26" w:name="X4e2987dd6a0ff1eb2f6c8914cca3c5fd2dc83ae"/>
-    <w:p>
-      <w:pPr>
-        <w:pStyle w:val="Heading3"/>
-      </w:pPr>
-      <w:r>
-        <w:t xml:space="preserve">2.7 Позиция данной работы относительно существующих исследований</w:t>
-      </w:r>
-    </w:p>
-    <w:p>
-      <w:pPr>
-        <w:pStyle w:val="FirstParagraph"/>
-      </w:pPr>
-      <w:r>
-        <w:t xml:space="preserve">Из рассмотренных работ следуют четыре требования к эксперименту. Для исторического OCR нужен воспроизводимый процесс, эталонные данные и ручная проверка, а не только запуск модели распознавания. Для арабской графики важны собственные графические трудности и структура страницы. Посткоррекция OCR может быть сформулирована как преобразование ошибочного текста в эталонный. Синтетические данные полезны для низкоресурсных постановок, но требуют отдельной проверки на реальном OCR.</w:t>
-      </w:r>
-    </w:p>
-    <w:p>
-      <w:pPr>
-        <w:pStyle w:val="BodyText"/>
-      </w:pPr>
-      <w:r>
-        <w:t xml:space="preserve">Для этой работы важны три линии исследований: OCR исторических документов, распознавание арабской графики и посткоррекция OCR-ошибок. Работа не создаёт новую OCR/HTR-систему и не заявляет лучшего результата в области OCR исторических документов. Её вклад более узкий: воспроизводимый набор для посткоррекции тюркских текстов в арабской графике, сравнение простых базовых методов и ByT5-small, анализ синтетической оценки и отдельная проверка переноса на постраничном OCR османско-турецкого источника.</w:t>
-      </w:r>
-    </w:p>
-    <w:p>
-      <w:pPr>
-        <w:pStyle w:val="BodyText"/>
-      </w:pPr>
-      <w:r>
-        <w:t xml:space="preserve">Методологически важен отрицательный результат: на синтетическом наборе модель улучшает метрики относительно базовых методов, но на реальном OCR перенос оказывается нестабильным. Поэтому работа полезна как подготовительный этап для магистерского исследования. Следующий шаг должен включать проверенные пары «OCR-вывод — эталон», постраничное разбиение без утечки и обучение на настоящих OCR-ошибках.</w:t>
-      </w:r>
-    </w:p>
-    <w:bookmarkEnd w:id="26"/>
+        <w:t xml:space="preserve">Для эксперимента был построен небольшой корпус исторического тюркского текста в арабской графике. Цель этого этапа состоит не в сборе максимально большого корпуса, а в получении воспроизводимой основы для посткоррекции OCR: фиксированного источника, сохранённого эталонного текста, контролируемого генератора шума и проверяемого разбиения на обучающую, валидационную и тестовую выборки.</w:t>
+      </w:r>
+    </w:p>
+    <w:p>
+      <w:pPr>
+        <w:pStyle w:val="BodyText"/>
+      </w:pPr>
+      <w:r>
+        <w:t xml:space="preserve">В работе используется постановка «искажённый текст — эталонный текст». Сначала собираются эталонные строки тюркского текста в арабской графике, затем на их основе генерируются OCR-подобные искажения. Такая схема позволяет обучать и оценивать модели посткоррекции даже при отсутствии большого набора реальных пар «OCR-вывод — вручную исправленный текст».</w:t>
+      </w:r>
+    </w:p>
+    <w:p>
+      <w:pPr>
+        <w:pStyle w:val="BodyText"/>
+      </w:pPr>
+      <w:r>
+        <w:t xml:space="preserve">Важно, что эта постановка сознательно отделяет задачу посткоррекции от задачи распознавания изображения. В эксперименте не оценивается качество сегментации страниц или OCR/HTR-модели; оценивается только способность метода исправлять уже полученный текстовый вывод.</w:t>
+      </w:r>
+    </w:p>
     <w:bookmarkEnd w:id="27"/>
-    <w:bookmarkStart w:id="41" w:name="данные-и-построение-корпуса"/>
-    <w:p>
-      <w:pPr>
-        <w:pStyle w:val="Heading2"/>
-      </w:pPr>
-      <w:r>
-        <w:t xml:space="preserve">3. Данные и построение корпуса</w:t>
-      </w:r>
-    </w:p>
-    <w:bookmarkStart w:id="28" w:name="общая-постановка"/>
-    <w:p>
-      <w:pPr>
-        <w:pStyle w:val="Heading3"/>
-      </w:pPr>
-      <w:r>
-        <w:t xml:space="preserve">3.1 Общая постановка</w:t>
-      </w:r>
-    </w:p>
-    <w:p>
-      <w:pPr>
-        <w:pStyle w:val="FirstParagraph"/>
-      </w:pPr>
-      <w:r>
-        <w:t xml:space="preserve">Для эксперимента был построен небольшой корпус исторического тюркского текста в арабской графике. Цель этого этапа состоит не в сборе максимально большого корпуса, а в получении воспроизводимой основы для посткоррекции OCR: фиксированного источника, сохранённого эталонного текста, контролируемого генератора шума и проверяемого разбиения на обучающую, валидационную и тестовую выборки.</w:t>
-      </w:r>
-    </w:p>
-    <w:p>
-      <w:pPr>
-        <w:pStyle w:val="BodyText"/>
-      </w:pPr>
-      <w:r>
-        <w:t xml:space="preserve">В работе используется постановка «искажённый текст — эталонный текст». Сначала собираются эталонные строки тюркского текста в арабской графике, затем на их основе генерируются OCR-подобные искажения. Такая схема позволяет обучать и оценивать модели посткоррекции даже при отсутствии большого набора реальных пар «OCR-вывод — вручную исправленный текст».</w:t>
-      </w:r>
-    </w:p>
-    <w:p>
-      <w:pPr>
-        <w:pStyle w:val="BodyText"/>
-      </w:pPr>
-      <w:r>
-        <w:t xml:space="preserve">Важно, что эта постановка сознательно отделяет задачу посткоррекции от задачи распознавания изображения. В эксперименте не оценивается качество сегментации страниц или OCR/HTR-модели; оценивается только способность метода исправлять уже полученный текстовый вывод.</w:t>
-      </w:r>
-    </w:p>
-    <w:bookmarkEnd w:id="28"/>
-    <w:bookmarkStart w:id="29" w:name="источник-данных"/>
+    <w:bookmarkStart w:id="28" w:name="источник-данных"/>
     <w:p>
       <w:pPr>
         <w:pStyle w:val="Heading3"/>
@@ -1095,8 +1054,8 @@
         <w:t xml:space="preserve">Источник выбран не как случайный арабографичный текст, а как материал, близкий к теме работы: он относится к историческим тюркским текстам, записанным арабской графикой. В источнике встречаются формы, характерные для османско-тюркского текста в арабской графике; отдельные примеры таких форм приведены ниже в таблицах с синтетическими примерами и примерами реального OCR. Поэтому корпус лучше соответствует теме курсовой, чем более ранний технический прототип на персидском или общеарабографичном материале.</w:t>
       </w:r>
     </w:p>
-    <w:bookmarkEnd w:id="29"/>
-    <w:bookmarkStart w:id="30" w:name="сбор-и-предварительная-подготовка"/>
+    <w:bookmarkEnd w:id="28"/>
+    <w:bookmarkStart w:id="29" w:name="сбор-и-предварительная-подготовка"/>
     <w:p>
       <w:pPr>
         <w:pStyle w:val="Heading3"/>
@@ -1141,8 +1100,8 @@
         <w:t xml:space="preserve">Поэтому нормализация вынесена в отдельный базовый метод. Корпус хранится в максимально щадящем виде, а нормализатор на правилах оценивается экспериментально наравне с методом без исправления и нейросетевой моделью.</w:t>
       </w:r>
     </w:p>
-    <w:bookmarkEnd w:id="30"/>
-    <w:bookmarkStart w:id="31" w:name="синтетические-ocr-подобные-искажения"/>
+    <w:bookmarkEnd w:id="29"/>
+    <w:bookmarkStart w:id="30" w:name="синтетические-ocr-подобные-искажения"/>
     <w:p>
       <w:pPr>
         <w:pStyle w:val="Heading3"/>
@@ -1156,19 +1115,7 @@
         <w:pStyle w:val="FirstParagraph"/>
       </w:pPr>
       <w:r>
-        <w:t xml:space="preserve">Поскольку для выбранного корпуса нет готового набора реальных OCR/HTR-выводов с ручной коррекцией, в работе используется синтетическая генерация ошибок. Clean-строки искажаются контролируемым noise generator, после чего формируются пары</w:t>
-      </w:r>
-      <w:r>
-        <w:t xml:space="preserve"> </w:t>
-      </w:r>
-      <w:r>
-        <w:rPr>
-          <w:rStyle w:val="VerbatimChar"/>
-        </w:rPr>
-        <w:t xml:space="preserve">noisy/clean</w:t>
-      </w:r>
-      <w:r>
-        <w:t xml:space="preserve">.</w:t>
+        <w:t xml:space="preserve">Поскольку для выбранного корпуса нет готового набора реальных OCR/HTR-выводов с ручной коррекцией, в работе используется синтетическая генерация ошибок. Эталонные строки искажаются контролируемым генератором синтетических ошибок, после чего формируются пары «искажённая строка — эталонная строка».</w:t>
       </w:r>
     </w:p>
     <w:p>
@@ -1211,8 +1158,8 @@
         <w:t xml:space="preserve">.</w:t>
       </w:r>
     </w:p>
-    <w:bookmarkEnd w:id="31"/>
-    <w:bookmarkStart w:id="32" w:name="типы-синтетических-искажений"/>
+    <w:bookmarkEnd w:id="30"/>
+    <w:bookmarkStart w:id="31" w:name="типы-синтетических-искажений"/>
     <w:p>
       <w:pPr>
         <w:pStyle w:val="Heading3"/>
@@ -1463,8 +1410,8 @@
         <w:t xml:space="preserve">Ошибки пробелов влияют на WER сильнее, чем на CER. Поэтому заметное снижение WER у модели не следует автоматически трактовать как доказательство такого же качества на реальном OCR. В текущей постановке это прежде всего показывает способность модели исправлять контролируемые искажения границ слов в синтетическом наборе.</w:t>
       </w:r>
     </w:p>
-    <w:bookmarkEnd w:id="32"/>
-    <w:bookmarkStart w:id="33" w:name="Xe2e6ef423b4b11ea7446063a790a29ab69053e4"/>
+    <w:bookmarkEnd w:id="31"/>
+    <w:bookmarkStart w:id="32" w:name="Xe2e6ef423b4b11ea7446063a790a29ab69053e4"/>
     <w:p>
       <w:pPr>
         <w:pStyle w:val="Heading3"/>
@@ -1703,8 +1650,8 @@
         <w:t xml:space="preserve">Эти значения показывают, что шум не сводится к набору замен символов: почти половина искажённых строк короче эталонных, примерно треть длиннее, а среднее изменение числа слов положительно. Это согласуется с наличием вставок, удалений и ошибок пробелов. Одновременно такая статистика подчёркивает ограничение эксперимента: генератор задаёт искусственное распределение ошибок, которое может отличаться от реальных OCR/HTR-выходов.</w:t>
       </w:r>
     </w:p>
-    <w:bookmarkEnd w:id="33"/>
-    <w:bookmarkStart w:id="34" w:name="примеры-пар-искажённая-строка-эталон"/>
+    <w:bookmarkEnd w:id="32"/>
+    <w:bookmarkStart w:id="33" w:name="примеры-пар-искажённая-строка-эталон"/>
     <w:p>
       <w:pPr>
         <w:pStyle w:val="Heading3"/>
@@ -1997,34 +1944,34 @@
         <w:t xml:space="preserve">. Эти примеры выглядят как OCR-подобные текстовые искажения, но не доказывают соответствие реальному OCR. Для внешней валидности нужна отдельная подвыборка реального OCR/HTR-вывода с ручной проверкой эталонного текста.</w:t>
       </w:r>
     </w:p>
+    <w:bookmarkEnd w:id="33"/>
+    <w:bookmarkStart w:id="34" w:name="ограничения-синтетического-шума"/>
+    <w:p>
+      <w:pPr>
+        <w:pStyle w:val="Heading3"/>
+      </w:pPr>
+      <w:r>
+        <w:t xml:space="preserve">3.4.4 Ограничения синтетического шума</w:t>
+      </w:r>
+    </w:p>
+    <w:p>
+      <w:pPr>
+        <w:pStyle w:val="FirstParagraph"/>
+      </w:pPr>
+      <w:r>
+        <w:t xml:space="preserve">Главное ограничение синтетической постановки состоит в том, что генератор шума не построен по эмпирической матрице ошибок конкретной OCR/HTR-системы. Он создаёт правдоподобные текстовые искажения, но не воспроизводит качество скана, шрифт, лигатуры, структуру страницы, сегментацию строк, смешение колонок, повреждения бумаги и ошибки порядка чтения.</w:t>
+      </w:r>
+    </w:p>
+    <w:p>
+      <w:pPr>
+        <w:pStyle w:val="BodyText"/>
+      </w:pPr>
+      <w:r>
+        <w:t xml:space="preserve">Поэтому синтетический набор следует понимать как проверочный стенд, а не как замену реального OCR. Он показывает, что код, разбиение, метрики и сравнение методов работают воспроизводимо. Но постраничная проверка на Tesseract даёт более жёсткий результат: без адаптации на настоящих OCR-ошибках модель иногда снижает WER, но может ухудшать символный состав текста.</w:t>
+      </w:r>
+    </w:p>
     <w:bookmarkEnd w:id="34"/>
-    <w:bookmarkStart w:id="35" w:name="ограничения-синтетического-шума"/>
-    <w:p>
-      <w:pPr>
-        <w:pStyle w:val="Heading3"/>
-      </w:pPr>
-      <w:r>
-        <w:t xml:space="preserve">3.4.4 Ограничения синтетического шума</w:t>
-      </w:r>
-    </w:p>
-    <w:p>
-      <w:pPr>
-        <w:pStyle w:val="FirstParagraph"/>
-      </w:pPr>
-      <w:r>
-        <w:t xml:space="preserve">Главное ограничение синтетической постановки состоит в том, что генератор шума не построен по эмпирической матрице ошибок конкретной OCR/HTR-системы. Он создаёт правдоподобные текстовые искажения, но не воспроизводит качество скана, шрифт, лигатуры, структуру страницы, сегментацию строк, смешение колонок, повреждения бумаги и ошибки порядка чтения.</w:t>
-      </w:r>
-    </w:p>
-    <w:p>
-      <w:pPr>
-        <w:pStyle w:val="BodyText"/>
-      </w:pPr>
-      <w:r>
-        <w:t xml:space="preserve">Поэтому синтетический набор следует понимать как проверочный стенд, а не как замену реального OCR. Он показывает, что код, разбиение, метрики и сравнение методов работают воспроизводимо. Но постраничная проверка на Tesseract даёт более жёсткий результат: без адаптации на настоящих OCR-ошибках модель иногда снижает WER, но может ухудшать символный состав текста.</w:t>
-      </w:r>
-    </w:p>
-    <w:bookmarkEnd w:id="35"/>
-    <w:bookmarkStart w:id="36" w:name="структура-набора-данных"/>
+    <w:bookmarkStart w:id="35" w:name="структура-набора-данных"/>
     <w:p>
       <w:pPr>
         <w:pStyle w:val="Heading3"/>
@@ -2228,14 +2175,14 @@
         <w:t xml:space="preserve">.</w:t>
       </w:r>
     </w:p>
-    <w:bookmarkEnd w:id="36"/>
-    <w:bookmarkStart w:id="37" w:name="разбиение-на-train-valid-и-test"/>
+    <w:bookmarkEnd w:id="35"/>
+    <w:bookmarkStart w:id="36" w:name="Xd08570dcee77ed6951cf64ca8f19d56e666eec0"/>
     <w:p>
       <w:pPr>
         <w:pStyle w:val="Heading3"/>
       </w:pPr>
       <w:r>
-        <w:t xml:space="preserve">3.6 Разбиение на train, valid и test</w:t>
+        <w:t xml:space="preserve">3.6 Разбиение на обучающую, валидационную и тестовую выборки</w:t>
       </w:r>
     </w:p>
     <w:p>
@@ -2425,8 +2372,8 @@
         <w:t xml:space="preserve">Такой размер достаточен для пилотной проверки контура посткоррекции: он мал для финального бенчмарка, но позволяет сравнить базовые методы и нейросетевую модель в воспроизводимых условиях.</w:t>
       </w:r>
     </w:p>
-    <w:bookmarkEnd w:id="37"/>
-    <w:bookmarkStart w:id="38" w:name="контроль-утечки-данных"/>
+    <w:bookmarkEnd w:id="36"/>
+    <w:bookmarkStart w:id="37" w:name="контроль-утечки-данных"/>
     <w:p>
       <w:pPr>
         <w:pStyle w:val="Heading3"/>
@@ -2581,14 +2528,64 @@
         <w:t xml:space="preserve">Тестовая выборка не содержит исходных строк, которые встречались в обучении или валидации. Это делает оценку более строгой: модель проверяется на новых исходных строках, а не на новых зашумлённых вариациях уже знакомых строк.</w:t>
       </w:r>
     </w:p>
+    <w:bookmarkEnd w:id="37"/>
+    <w:bookmarkStart w:id="38" w:name="ограничения-корпуса"/>
+    <w:p>
+      <w:pPr>
+        <w:pStyle w:val="Heading3"/>
+      </w:pPr>
+      <w:r>
+        <w:t xml:space="preserve">3.8 Ограничения корпуса</w:t>
+      </w:r>
+    </w:p>
+    <w:p>
+      <w:pPr>
+        <w:pStyle w:val="FirstParagraph"/>
+      </w:pPr>
+      <w:r>
+        <w:t xml:space="preserve">Построенный корпус является пилотным. Он достаточен для проверки экспериментальной схемы, но задаёт узкие границы для обобщения результатов.</w:t>
+      </w:r>
+    </w:p>
+    <w:p>
+      <w:pPr>
+        <w:pStyle w:val="BodyText"/>
+      </w:pPr>
+      <w:r>
+        <w:t xml:space="preserve">Первое ограничение связано с объёмом корпуса: используется 400 эталонных текстовых блоков. Этого достаточно, чтобы проверить экспериментальную схему, сравнить базовые методы и провести первый нейросетевой эксперимент. Однако такого объёма недостаточно, чтобы утверждать устойчивость метода на всём классе исторических тюркских текстов в арабской графике.</w:t>
+      </w:r>
+    </w:p>
+    <w:p>
+      <w:pPr>
+        <w:pStyle w:val="BodyText"/>
+      </w:pPr>
+      <w:r>
+        <w:t xml:space="preserve">Второе ограничение связано с одним основным источником. Это снижает жанровое, временное и орфографическое разнообразие корпуса. Результаты показывают поведение модели на выбранном материале, но не доказывают переносимость на старотатарские, башкирские, крымскотатарские или другие тюркские источники в арабской графике.</w:t>
+      </w:r>
+    </w:p>
+    <w:p>
+      <w:pPr>
+        <w:pStyle w:val="BodyText"/>
+      </w:pPr>
+      <w:r>
+        <w:t xml:space="preserve">Третье ограничение связано с синтетической природой ошибок. Генератор шума создаёт OCR-подобные искажения, но реальные ошибки зависят от шрифта, качества скана, сегментации, модели распознавания и состояния документа. Поэтому текущий набор данных проверяет посткоррекцию в контролируемой постановке, но не заменяет оценку на реальном OCR/HTR-выводе.</w:t>
+      </w:r>
+    </w:p>
+    <w:p>
+      <w:pPr>
+        <w:pStyle w:val="BodyText"/>
+      </w:pPr>
+      <w:r>
+        <w:t xml:space="preserve">Четвёртое ограничение связано с отсутствием ручной лингвистической проверки исправлений. Метрики CER и WER показывают формальную близость к эталону, но не всегда отражают историко-орфографическую допустимость исправления. Для следующего этапа нужна небольшая вручную проверенная подвыборка с качественным анализом ошибок.</w:t>
+      </w:r>
+    </w:p>
     <w:bookmarkEnd w:id="38"/>
-    <w:bookmarkStart w:id="39" w:name="ограничения-корпуса"/>
+    <w:bookmarkStart w:id="39" w:name="выводы-по-разделу"/>
     <w:p>
       <w:pPr>
         <w:pStyle w:val="Heading3"/>
       </w:pPr>
       <w:r>
-        <w:t xml:space="preserve">3.8 Ограничения корпуса</w:t>
+        <w:t xml:space="preserve">3.9 Выводы по разделу</w:t>
       </w:r>
     </w:p>
     <w:p>
@@ -2596,70 +2593,20 @@
         <w:pStyle w:val="FirstParagraph"/>
       </w:pPr>
       <w:r>
-        <w:t xml:space="preserve">Построенный корпус является пилотным. Он достаточен для проверки экспериментальной схемы, но задаёт узкие границы для обобщения результатов.</w:t>
-      </w:r>
-    </w:p>
-    <w:p>
-      <w:pPr>
-        <w:pStyle w:val="BodyText"/>
-      </w:pPr>
-      <w:r>
-        <w:t xml:space="preserve">Первое ограничение связано с объёмом корпуса: используется 400 эталонных текстовых блоков. Этого достаточно, чтобы проверить экспериментальную схему, сравнить базовые методы и провести первый нейросетевой эксперимент. Однако такого объёма недостаточно, чтобы утверждать устойчивость метода на всём классе исторических тюркских текстов в арабской графике.</w:t>
-      </w:r>
-    </w:p>
-    <w:p>
-      <w:pPr>
-        <w:pStyle w:val="BodyText"/>
-      </w:pPr>
-      <w:r>
-        <w:t xml:space="preserve">Второе ограничение связано с одним основным источником. Это снижает жанровое, временное и орфографическое разнообразие корпуса. Результаты показывают поведение модели на выбранном материале, но не доказывают переносимость на старотатарские, башкирские, крымскотатарские или другие тюркские источники в арабской графике.</w:t>
-      </w:r>
-    </w:p>
-    <w:p>
-      <w:pPr>
-        <w:pStyle w:val="BodyText"/>
-      </w:pPr>
-      <w:r>
-        <w:t xml:space="preserve">Третье ограничение связано с синтетической природой ошибок. Генератор шума создаёт OCR-подобные искажения, но реальные ошибки зависят от шрифта, качества скана, сегментации, модели распознавания и состояния документа. Поэтому текущий набор данных проверяет посткоррекцию в контролируемой постановке, но не заменяет оценку на реальном OCR/HTR-выводе.</w:t>
-      </w:r>
-    </w:p>
-    <w:p>
-      <w:pPr>
-        <w:pStyle w:val="BodyText"/>
-      </w:pPr>
-      <w:r>
-        <w:t xml:space="preserve">Четвёртое ограничение связано с отсутствием ручной лингвистической проверки исправлений. Метрики CER и WER показывают формальную близость к эталону, но не всегда отражают историко-орфографическую допустимость исправления. Для следующего этапа нужна небольшая вручную проверенная подвыборка с качественным анализом ошибок.</w:t>
+        <w:t xml:space="preserve">В разделе построен небольшой корпус для проверки посткоррекции OCR исторического тюркского текста в арабской графике. На основе 400 эталонных текстовых блоков создан синтетический набор данных с разбиением на обучающую, валидационную и тестовую выборки без утечки исходных строк.</w:t>
+      </w:r>
+    </w:p>
+    <w:p>
+      <w:pPr>
+        <w:pStyle w:val="BodyText"/>
+      </w:pPr>
+      <w:r>
+        <w:t xml:space="preserve">Роль корпуса ограничена, но ясна: он даёт одинаковые условия для сравнения метода без исправления, нормализатора на правилах, символьного метода на основе ошибок обучающей выборки и ByT5-small. Следующая версия должна добавить реальные OCR/HTR-выводы, ручную проверку и более разнообразные татарские, башкирские и другие тюркские источники в арабской графике.</w:t>
       </w:r>
     </w:p>
     <w:bookmarkEnd w:id="39"/>
-    <w:bookmarkStart w:id="40" w:name="выводы-по-разделу"/>
-    <w:p>
-      <w:pPr>
-        <w:pStyle w:val="Heading3"/>
-      </w:pPr>
-      <w:r>
-        <w:t xml:space="preserve">3.9 Выводы по разделу</w:t>
-      </w:r>
-    </w:p>
-    <w:p>
-      <w:pPr>
-        <w:pStyle w:val="FirstParagraph"/>
-      </w:pPr>
-      <w:r>
-        <w:t xml:space="preserve">В разделе построен небольшой корпус для проверки посткоррекции OCR исторического тюркского текста в арабской графике. На основе 400 эталонных текстовых блоков создан синтетический набор данных с разбиением на обучающую, валидационную и тестовую выборки без утечки исходных строк.</w:t>
-      </w:r>
-    </w:p>
-    <w:p>
-      <w:pPr>
-        <w:pStyle w:val="BodyText"/>
-      </w:pPr>
-      <w:r>
-        <w:t xml:space="preserve">Роль корпуса ограничена, но ясна: он даёт одинаковые условия для сравнения метода без исправления, нормализатора на правилах, символьного метода на основе ошибок обучающей выборки и ByT5-small. Следующая версия должна добавить реальные OCR/HTR-выводы, ручную проверку и более разнообразные татарские, башкирские и другие тюркские источники в арабской графике.</w:t>
-      </w:r>
-    </w:p>
     <w:bookmarkEnd w:id="40"/>
-    <w:bookmarkEnd w:id="41"/>
-    <w:bookmarkStart w:id="52" w:name="методология-эксперимента"/>
+    <w:bookmarkStart w:id="51" w:name="методология-эксперимента"/>
     <w:p>
       <w:pPr>
         <w:pStyle w:val="Heading2"/>
@@ -2668,7 +2615,7 @@
         <w:t xml:space="preserve">4. Методология эксперимента</w:t>
       </w:r>
     </w:p>
-    <w:bookmarkStart w:id="42" w:name="общая-схема-эксперимента"/>
+    <w:bookmarkStart w:id="41" w:name="общая-схема-эксперимента"/>
     <w:p>
       <w:pPr>
         <w:pStyle w:val="Heading3"/>
@@ -2740,14 +2687,56 @@
         <w:t xml:space="preserve">Главный вопрос эксперимента — улучшает ли нейросетевая модель посткоррекции качество текста по сравнению с неизменённым зашумлённым вводом. Дополнительный вопрос — помогает ли простая нормализация на правилах именно для исторического тюркского материала в арабской графике или, наоборот, ухудшает текст.</w:t>
       </w:r>
     </w:p>
+    <w:bookmarkEnd w:id="41"/>
+    <w:bookmarkStart w:id="42" w:name="базовые-методы"/>
+    <w:p>
+      <w:pPr>
+        <w:pStyle w:val="Heading3"/>
+      </w:pPr>
+      <w:r>
+        <w:t xml:space="preserve">4.2 Базовые методы</w:t>
+      </w:r>
+    </w:p>
+    <w:p>
+      <w:pPr>
+        <w:pStyle w:val="FirstParagraph"/>
+      </w:pPr>
+      <w:r>
+        <w:t xml:space="preserve">В эксперименте используются три базовых метода. Первый — метод без исправления: он возвращает входную зашумлённую строку без изменений. Его роль состоит в том, чтобы зафиксировать исходный уровень качества данных. Любой метод посткоррекции должен превосходить этот уровень; иначе он не исправляет текст, а добавляет новые ошибки.</w:t>
+      </w:r>
+    </w:p>
+    <w:p>
+      <w:pPr>
+        <w:pStyle w:val="BodyText"/>
+      </w:pPr>
+      <w:r>
+        <w:t xml:space="preserve">Второй базовый метод — нормализатор на правилах. Он применяет набор простых символьных правил к арабографичному тексту. Этот метод нужен не как ожидаемо сильное решение, а как проверка важной гипотезы: можно ли улучшить качество простыми правилами нормализации без обучения модели.</w:t>
+      </w:r>
+    </w:p>
+    <w:p>
+      <w:pPr>
+        <w:pStyle w:val="BodyText"/>
+      </w:pPr>
+      <w:r>
+        <w:t xml:space="preserve">Для исторического арабографичного тюркского материала такая проверка особенно важна. Нормализация может убрать часть технического шума, но может и стереть исторически значимые орфографические различия. Поэтому нормализатор на правилах в работе не считается обязательной предобработкой, а оценивается как самостоятельный базовый метод.</w:t>
+      </w:r>
+    </w:p>
+    <w:p>
+      <w:pPr>
+        <w:pStyle w:val="BodyText"/>
+      </w:pPr>
+      <w:r>
+        <w:t xml:space="preserve">Третий базовый метод — символьный метод на основе ошибок обучающей выборки. Он строится по обучающим парам «искажённая строка — эталон»: строки выравниваются с помощью алгоритма Левенштейна, после чего оцениваются частотные соответствия между искажёнными и эталонными символами. Замена принимается только при достаточной поддержке и доминировании целевого символа. Такой метод опирается на данные, но не является нейросетевым: он может исправлять устойчивые локальные символьные путаницы, однако не умеет восстанавливать пропущенные символы из контекста и не моделирует дальние зависимости в строке.</w:t>
+      </w:r>
+    </w:p>
     <w:bookmarkEnd w:id="42"/>
-    <w:bookmarkStart w:id="43" w:name="базовые-методы"/>
+    <w:bookmarkStart w:id="43" w:name="X922718734d9410424975b4d665e2323c01d8043"/>
     <w:p>
       <w:pPr>
         <w:pStyle w:val="Heading3"/>
       </w:pPr>
       <w:r>
-        <w:t xml:space="preserve">4.2 Базовые методы</w:t>
+        <w:t xml:space="preserve">4.3 Символьный метод на основе ошибок обучающей выборки</w:t>
       </w:r>
     </w:p>
     <w:p>
@@ -2755,61 +2744,19 @@
         <w:pStyle w:val="FirstParagraph"/>
       </w:pPr>
       <w:r>
-        <w:t xml:space="preserve">В эксперименте используются три базовых метода. Первый — метод без исправления: он возвращает входную зашумлённую строку без изменений. Его роль состоит в том, чтобы зафиксировать исходный уровень качества данных. Любой метод посткоррекции должен превосходить этот уровень; иначе он не исправляет текст, а добавляет новые ошибки.</w:t>
-      </w:r>
-    </w:p>
-    <w:p>
-      <w:pPr>
-        <w:pStyle w:val="BodyText"/>
-      </w:pPr>
-      <w:r>
-        <w:t xml:space="preserve">Второй базовый метод — нормализатор на правилах. Он применяет набор простых символьных правил к арабографичному тексту. Этот метод нужен не как ожидаемо сильное решение, а как проверка важной гипотезы: можно ли улучшить качество простыми правилами нормализации без обучения модели.</w:t>
-      </w:r>
-    </w:p>
-    <w:p>
-      <w:pPr>
-        <w:pStyle w:val="BodyText"/>
-      </w:pPr>
-      <w:r>
-        <w:t xml:space="preserve">Для исторического арабографичного тюркского материала такая проверка особенно важна. Нормализация может убрать часть технического шума, но может и стереть исторически значимые орфографические различия. Поэтому нормализатор на правилах в работе не считается обязательной предобработкой, а оценивается как самостоятельный базовый метод.</w:t>
-      </w:r>
-    </w:p>
-    <w:p>
-      <w:pPr>
-        <w:pStyle w:val="BodyText"/>
-      </w:pPr>
-      <w:r>
-        <w:t xml:space="preserve">Третий базовый метод — символьный метод на основе ошибок обучающей выборки. Он строится по обучающим парам «искажённая строка — эталон»: строки выравниваются с помощью алгоритма Левенштейна, после чего оцениваются частотные соответствия между искажёнными и эталонными символами. Замена принимается только при достаточной поддержке и доминировании целевого символа. Такой метод опирается на данные, но не является нейросетевым: он может исправлять устойчивые локальные символьные путаницы, однако не умеет восстанавливать пропущенные символы из контекста и не моделирует дальние зависимости в строке.</w:t>
+        <w:t xml:space="preserve">Символьный метод на основе ошибок обучающей выборки занимает промежуточное положение между ручной нормализацией на правилах и нейросетевой моделью преобразования последовательностей. В отличие от нормализатора на правилах, он не задаёт все замены вручную, а извлекает наиболее устойчивые соответствия между искажёнными и эталонными символами из обучающей выборки. В отличие от ByT5-small, он не использует контекст строки и не генерирует последовательность заново.</w:t>
+      </w:r>
+    </w:p>
+    <w:p>
+      <w:pPr>
+        <w:pStyle w:val="BodyText"/>
+      </w:pPr>
+      <w:r>
+        <w:t xml:space="preserve">Его диагностическая роль состоит в проверке вопроса: достаточно ли простых символьных соответствий, извлечённых из корпуса, или нужен контекстный подход на основе преобразования последовательностей. Если такой метод приблизился бы к ByT5, это означало бы, что задача в основном сводится к локальным заменам символов. Если же ByT5 заметно превосходит его, это указывает на важность контекста, восстановления структуры слов и более сложного моделирования строки.</w:t>
       </w:r>
     </w:p>
     <w:bookmarkEnd w:id="43"/>
-    <w:bookmarkStart w:id="44" w:name="X922718734d9410424975b4d665e2323c01d8043"/>
-    <w:p>
-      <w:pPr>
-        <w:pStyle w:val="Heading3"/>
-      </w:pPr>
-      <w:r>
-        <w:t xml:space="preserve">4.3 Символьный метод на основе ошибок обучающей выборки</w:t>
-      </w:r>
-    </w:p>
-    <w:p>
-      <w:pPr>
-        <w:pStyle w:val="FirstParagraph"/>
-      </w:pPr>
-      <w:r>
-        <w:t xml:space="preserve">Символьный метод на основе ошибок обучающей выборки занимает промежуточное положение между ручной нормализацией на правилах и нейросетевой моделью преобразования последовательностей. В отличие от нормализатора на правилах, он не задаёт все замены вручную, а извлекает наиболее устойчивые соответствия между искажёнными и эталонными символами из обучающей выборки. В отличие от ByT5-small, он не использует контекст строки и не генерирует последовательность заново.</w:t>
-      </w:r>
-    </w:p>
-    <w:p>
-      <w:pPr>
-        <w:pStyle w:val="BodyText"/>
-      </w:pPr>
-      <w:r>
-        <w:t xml:space="preserve">Его диагностическая роль состоит в проверке вопроса: достаточно ли простых символьных соответствий, извлечённых из корпуса, или нужен контекстный подход на основе преобразования последовательностей. Если такой метод приблизился бы к ByT5, это означало бы, что задача в основном сводится к локальным заменам символов. Если же ByT5 заметно превосходит его, это указывает на важность контекста, восстановления структуры слов и более сложного моделирования строки.</w:t>
-      </w:r>
-    </w:p>
-    <w:bookmarkEnd w:id="44"/>
-    <w:bookmarkStart w:id="45" w:name="нейросетевая-модель-byt5-small"/>
+    <w:bookmarkStart w:id="44" w:name="нейросетевая-модель-byt5-small"/>
     <w:p>
       <w:pPr>
         <w:pStyle w:val="Heading3"/>
@@ -2854,8 +2801,8 @@
         <w:t xml:space="preserve">Практическое следствие байтового представления состоит в том, что длина последовательности в токенах может быстро расти: один видимый символ арабской графики занимает несколько байтов. Поэтому в эксперименте отдельно контролируется максимальная длина входной и целевой последовательности.</w:t>
       </w:r>
     </w:p>
-    <w:bookmarkEnd w:id="45"/>
-    <w:bookmarkStart w:id="46" w:name="проверенные-конфигурации"/>
+    <w:bookmarkEnd w:id="44"/>
+    <w:bookmarkStart w:id="45" w:name="проверенные-конфигурации"/>
     <w:p>
       <w:pPr>
         <w:pStyle w:val="Heading3"/>
@@ -3051,8 +2998,8 @@
         <w:t xml:space="preserve">Для итогового анализа выбрана конфигурация 512. Она уменьшает риск обрезания строк и используется как основная нейросетевая конфигурация в сравнении с методом без исправления, нормализатором на правилах и символьным методом на основе ошибок обучающей выборки. Вывод о преимуществе 512 в данной работе относится к пилотному набору данных и должен быть дополнительно проверен на более широком корпусе.</w:t>
       </w:r>
     </w:p>
-    <w:bookmarkEnd w:id="46"/>
-    <w:bookmarkStart w:id="47" w:name="метрики-качества"/>
+    <w:bookmarkEnd w:id="45"/>
+    <w:bookmarkStart w:id="46" w:name="метрики-качества"/>
     <w:p>
       <w:pPr>
         <w:pStyle w:val="Heading3"/>
@@ -3108,8 +3055,8 @@
         <w:t xml:space="preserve">ExactMatch показывает долю строк, полностью совпавших с эталоном. Для длинных исторических строк эта метрика очень строгая: один неверный символ уже делает пример несовпадающим. Поэтому ExactMatch используется как дополнительный строгий индикатор, а основные выводы строятся по CER, WER, NoSpaceCER и анализу ошибок.</w:t>
       </w:r>
     </w:p>
-    <w:bookmarkEnd w:id="47"/>
-    <w:bookmarkStart w:id="48" w:name="процедура-оценки"/>
+    <w:bookmarkEnd w:id="46"/>
+    <w:bookmarkStart w:id="47" w:name="процедура-оценки"/>
     <w:p>
       <w:pPr>
         <w:pStyle w:val="Heading3"/>
@@ -3190,8 +3137,8 @@
         <w:t xml:space="preserve">В одинаковых условиях сравниваются четыре варианта: метод без исправления, нормализатор на правилах, символьный метод на основе ошибок обучающей выборки и ByT5-small. Это позволяет отделить эффект нейросетевой модели посткоррекции от простого сохранения зашумлённого ввода, ручных правил нормализации и простого символьного метода, построенного по данным.</w:t>
       </w:r>
     </w:p>
-    <w:bookmarkEnd w:id="48"/>
-    <w:bookmarkStart w:id="49" w:name="анализ-ошибок"/>
+    <w:bookmarkEnd w:id="47"/>
+    <w:bookmarkStart w:id="48" w:name="анализ-ошибок"/>
     <w:p>
       <w:pPr>
         <w:pStyle w:val="Heading3"/>
@@ -3248,14 +3195,48 @@
         <w:t xml:space="preserve">.</w:t>
       </w:r>
     </w:p>
+    <w:bookmarkEnd w:id="48"/>
+    <w:bookmarkStart w:id="49" w:name="воспроизводимость"/>
+    <w:p>
+      <w:pPr>
+        <w:pStyle w:val="Heading3"/>
+      </w:pPr>
+      <w:r>
+        <w:t xml:space="preserve">4.9 Воспроизводимость</w:t>
+      </w:r>
+    </w:p>
+    <w:p>
+      <w:pPr>
+        <w:pStyle w:val="FirstParagraph"/>
+      </w:pPr>
+      <w:r>
+        <w:t xml:space="preserve">Основные компоненты эксперимента сохранены в репозитории: скрипты сбора данных, генерации набора данных, оценки базовых методов, обучения и применения ByT5-small, вычисления метрик и анализа ошибок. Это делает эксперимент проверяемым: можно повторить построение набора данных, пересчитать метрики и отдельно изучить предсказания модели.</w:t>
+      </w:r>
+    </w:p>
+    <w:p>
+      <w:pPr>
+        <w:pStyle w:val="BodyText"/>
+      </w:pPr>
+      <w:r>
+        <w:t xml:space="preserve">В репозитории также сохранены набор данных, итоговые метрики, файлы с предсказаниями и CSV-файлы анализа ошибок. При этом модельные веса не хранятся в git, чтобы не перегружать репозиторий тяжёлыми артефактами обучения. Для дальнейшей работы веса можно хранить отдельно: например, как отдельный артефакт релиза или во внешнем хранилище моделей.</w:t>
+      </w:r>
+    </w:p>
+    <w:p>
+      <w:pPr>
+        <w:pStyle w:val="BodyText"/>
+      </w:pPr>
+      <w:r>
+        <w:t xml:space="preserve">Воспроизводимость текущего эксперимента не означает полноту контрольного набора. Она означает, что все ключевые решения пилотного протокола явно зафиксированы: источник, генератор шума, разбиение данных, базовые методы, модель, метрики и анализ ошибок.</w:t>
+      </w:r>
+    </w:p>
     <w:bookmarkEnd w:id="49"/>
-    <w:bookmarkStart w:id="50" w:name="воспроизводимость"/>
+    <w:bookmarkStart w:id="50" w:name="выводы-по-разделу-1"/>
     <w:p>
       <w:pPr>
         <w:pStyle w:val="Heading3"/>
       </w:pPr>
       <w:r>
-        <w:t xml:space="preserve">4.9 Воспроизводимость</w:t>
+        <w:t xml:space="preserve">4.10 Выводы по разделу</w:t>
       </w:r>
     </w:p>
     <w:p>
@@ -3263,33 +3244,43 @@
         <w:pStyle w:val="FirstParagraph"/>
       </w:pPr>
       <w:r>
-        <w:t xml:space="preserve">Основные компоненты эксперимента сохранены в репозитории: скрипты сбора данных, генерации набора данных, оценки базовых методов, обучения и применения ByT5-small, вычисления метрик и анализа ошибок. Это делает эксперимент проверяемым: можно повторить построение набора данных, пересчитать метрики и отдельно изучить предсказания модели.</w:t>
-      </w:r>
-    </w:p>
-    <w:p>
-      <w:pPr>
-        <w:pStyle w:val="BodyText"/>
-      </w:pPr>
-      <w:r>
-        <w:t xml:space="preserve">В репозитории также сохранены набор данных, итоговые метрики, файлы с предсказаниями и CSV-файлы анализа ошибок. При этом модельные веса не хранятся в git, чтобы не перегружать репозиторий тяжёлыми артефактами обучения. Для дальнейшей работы веса можно хранить отдельно: например, как отдельный артефакт релиза или во внешнем хранилище моделей.</w:t>
-      </w:r>
-    </w:p>
-    <w:p>
-      <w:pPr>
-        <w:pStyle w:val="BodyText"/>
-      </w:pPr>
-      <w:r>
-        <w:t xml:space="preserve">Воспроизводимость текущего эксперимента не означает полноту контрольного набора. Она означает, что все ключевые решения пилотного протокола явно зафиксированы: источник, генератор шума, разбиение данных, базовые методы, модель, метрики и анализ ошибок.</w:t>
+        <w:t xml:space="preserve">Методология эксперимента построена как воспроизводимый протокол посткоррекции OCR: от набора пар «искажённый текст / эталон» до сравнения метода без исправления, нормализатора на правилах, символьного метода на основе ошибок обучающей выборки и ByT5-small. Такая схема позволяет проверить не только итоговые метрики, но и методологические вопросы: превосходит ли модель простое сохранение OCR-вывода, полезна ли нормализация на правилах, достаточно ли простых символьных соответствий и насколько важен контроль длины последовательности для модели с байтовым представлением.</w:t>
+      </w:r>
+    </w:p>
+    <w:p>
+      <w:pPr>
+        <w:pStyle w:val="BodyText"/>
+      </w:pPr>
+      <w:r>
+        <w:t xml:space="preserve">Сильная сторона выбранной методологии — прозрачность: каждый метод оценивается на одной тестовой выборке, по одним метрикам и с сохранением файлов предсказаний. Ограничение — пилотный характер данных: синтетические ошибки и один источник не позволяют считать результаты финальной оценкой для всех исторических арабографичных тюркских текстов.</w:t>
+      </w:r>
+    </w:p>
+    <w:p>
+      <w:pPr>
+        <w:pStyle w:val="BodyText"/>
+      </w:pPr>
+      <w:r>
+        <w:t xml:space="preserve">Эта методология задаёт основу для раздела 5, где сравниваются базовые методы, символьный метод на основе ошибок обучающей выборки, финальная конфигурация ByT5-small и результаты анализа ошибок.</w:t>
       </w:r>
     </w:p>
     <w:bookmarkEnd w:id="50"/>
-    <w:bookmarkStart w:id="51" w:name="выводы-по-разделу-1"/>
+    <w:bookmarkEnd w:id="51"/>
+    <w:bookmarkStart w:id="67" w:name="результаты-экспериментов-и-анализ-ошибок"/>
+    <w:p>
+      <w:pPr>
+        <w:pStyle w:val="Heading2"/>
+      </w:pPr>
+      <w:r>
+        <w:t xml:space="preserve">5. Результаты экспериментов и анализ ошибок</w:t>
+      </w:r>
+    </w:p>
+    <w:bookmarkStart w:id="52" w:name="общая-логика-оценки"/>
     <w:p>
       <w:pPr>
         <w:pStyle w:val="Heading3"/>
       </w:pPr>
       <w:r>
-        <w:t xml:space="preserve">4.10 Выводы по разделу</w:t>
+        <w:t xml:space="preserve">5.1 Общая логика оценки</w:t>
       </w:r>
     </w:p>
     <w:p>
@@ -3297,43 +3288,33 @@
         <w:pStyle w:val="FirstParagraph"/>
       </w:pPr>
       <w:r>
-        <w:t xml:space="preserve">Методология эксперимента построена как воспроизводимый протокол посткоррекции OCR: от набора пар «искажённый текст / эталон» до сравнения метода без исправления, нормализатора на правилах, символьного метода на основе ошибок обучающей выборки и ByT5-small. Такая схема позволяет проверить не только итоговые метрики, но и методологические вопросы: превосходит ли модель простое сохранение OCR-вывода, полезна ли нормализация на правилах, достаточно ли простых символьных соответствий и насколько важен контроль длины последовательности для модели с байтовым представлением.</w:t>
-      </w:r>
-    </w:p>
-    <w:p>
-      <w:pPr>
-        <w:pStyle w:val="BodyText"/>
-      </w:pPr>
-      <w:r>
-        <w:t xml:space="preserve">Сильная сторона выбранной методологии — прозрачность: каждый метод оценивается на одной тестовой выборке, по одним метрикам и с сохранением файлов предсказаний. Ограничение — пилотный характер данных: синтетические ошибки и один источник не позволяют считать результаты финальной оценкой для всех исторических арабографичных тюркских текстов.</w:t>
-      </w:r>
-    </w:p>
-    <w:p>
-      <w:pPr>
-        <w:pStyle w:val="BodyText"/>
-      </w:pPr>
-      <w:r>
-        <w:t xml:space="preserve">Эта методология задаёт основу для раздела 5, где сравниваются базовые методы, символьный метод на основе ошибок обучающей выборки, финальная конфигурация ByT5-small и результаты анализа ошибок.</w:t>
-      </w:r>
-    </w:p>
-    <w:bookmarkEnd w:id="51"/>
+        <w:t xml:space="preserve">В разделе результатов сравниваются четыре подхода: метод без исправления, нормализатор на правилах, символьный метод на основе ошибок обучающей выборки и ByT5-small 512. Все они оцениваются на одной тестовой выборке из 800 зашумлённых вариантов, построенных из 40 уникальных исходных строк, которые не пересекаются с обучающей и валидационной выборками.</w:t>
+      </w:r>
+    </w:p>
+    <w:p>
+      <w:pPr>
+        <w:pStyle w:val="BodyText"/>
+      </w:pPr>
+      <w:r>
+        <w:t xml:space="preserve">Интерпретация строится в два слоя. Сначала сравниваются агрегированные метрики CER, WER, NoSpaceCER и ExactMatch. Затем отдельно рассматривается анализ ошибок: сколько примеров улучшилось, осталось без изменений или стало хуже после применения ByT5-small. Такой порядок нужен, чтобы не ограничиваться средними значениями и проверить устойчивость улучшения на уровне отдельных строк.</w:t>
+      </w:r>
+    </w:p>
+    <w:p>
+      <w:pPr>
+        <w:pStyle w:val="BodyText"/>
+      </w:pPr>
+      <w:r>
+        <w:t xml:space="preserve">В этом разделе важны не только лучшие итоговые метрики ByT5-small среди рассмотренных методов. Не менее важны ограничивающие результаты: нормализатор на правилах ухудшает качество относительно метода без исправления, символьный метод даёт лишь умеренное улучшение CER, а заметное снижение WER у ByT5 требует осторожной интерпретации из-за синтетических ошибок пробелов и границ слов.</w:t>
+      </w:r>
+    </w:p>
     <w:bookmarkEnd w:id="52"/>
-    <w:bookmarkStart w:id="68" w:name="результаты-экспериментов-и-анализ-ошибок"/>
-    <w:p>
-      <w:pPr>
-        <w:pStyle w:val="Heading2"/>
-      </w:pPr>
-      <w:r>
-        <w:t xml:space="preserve">5. Результаты экспериментов и анализ ошибок</w:t>
-      </w:r>
-    </w:p>
-    <w:bookmarkStart w:id="53" w:name="общая-логика-оценки"/>
+    <w:bookmarkStart w:id="53" w:name="итоговые-метрики"/>
     <w:p>
       <w:pPr>
         <w:pStyle w:val="Heading3"/>
       </w:pPr>
       <w:r>
-        <w:t xml:space="preserve">5.1 Общая логика оценки</w:t>
+        <w:t xml:space="preserve">5.2 Итоговые метрики</w:t>
       </w:r>
     </w:p>
     <w:p>
@@ -3341,716 +3322,7 @@
         <w:pStyle w:val="FirstParagraph"/>
       </w:pPr>
       <w:r>
-        <w:t xml:space="preserve">В разделе результатов сравниваются четыре подхода: метод без исправления, нормализатор на правилах, символьный метод на основе ошибок обучающей выборки и ByT5-small 512. Все они оцениваются на одной тестовой выборке из 800 зашумлённых вариантов, построенных из 40 уникальных исходных строк, которые не пересекаются с обучающей и валидационной выборками.</w:t>
-      </w:r>
-    </w:p>
-    <w:p>
-      <w:pPr>
-        <w:pStyle w:val="BodyText"/>
-      </w:pPr>
-      <w:r>
-        <w:t xml:space="preserve">Интерпретация строится в два слоя. Сначала сравниваются агрегированные метрики CER, WER, NoSpaceCER и ExactMatch. Затем отдельно рассматривается анализ ошибок: сколько примеров улучшилось, осталось без изменений или стало хуже после применения ByT5-small. Такой порядок нужен, чтобы не ограничиваться средними значениями и проверить устойчивость улучшения на уровне отдельных строк.</w:t>
-      </w:r>
-    </w:p>
-    <w:p>
-      <w:pPr>
-        <w:pStyle w:val="BodyText"/>
-      </w:pPr>
-      <w:r>
-        <w:t xml:space="preserve">В этом разделе важны не только лучшие итоговые метрики ByT5-small среди рассмотренных методов. Не менее важны ограничивающие результаты: нормализатор на правилах ухудшает качество относительно метода без исправления, символьный метод даёт лишь умеренное улучшение CER, а заметное снижение WER у ByT5 требует осторожной интерпретации из-за синтетических ошибок пробелов и границ слов.</w:t>
-      </w:r>
-    </w:p>
-    <w:bookmarkEnd w:id="53"/>
-    <w:bookmarkStart w:id="54" w:name="итоговые-метрики"/>
-    <w:p>
-      <w:pPr>
-        <w:pStyle w:val="Heading3"/>
-      </w:pPr>
-      <w:r>
-        <w:t xml:space="preserve">5.2 Итоговые метрики</w:t>
-      </w:r>
-    </w:p>
-    <w:p>
-      <w:pPr>
-        <w:pStyle w:val="FirstParagraph"/>
-      </w:pPr>
-      <w:r>
-        <w:t xml:space="preserve">Итоговые результаты представлены в таблице.</w:t>
-      </w:r>
-    </w:p>
-    <w:tbl>
-      <w:tblPr>
-        <w:tblStyle w:val="Table"/>
-        <w:tblW w:type="pct" w:w="5000"/>
-        <w:tblLayout w:type="fixed"/>
-        <w:tblLook w:firstRow="1" w:lastRow="0" w:firstColumn="0" w:lastColumn="0" w:noHBand="0" w:noVBand="0" w:val="0020"/>
-      </w:tblPr>
-      <w:tblGrid>
-        <w:gridCol w:w="1250"/>
-        <w:gridCol w:w="1667"/>
-        <w:gridCol w:w="1667"/>
-        <w:gridCol w:w="1667"/>
-        <w:gridCol w:w="1667"/>
-      </w:tblGrid>
-      <w:tr>
-        <w:trPr>
-          <w:tblHeader w:val="on"/>
-        </w:trPr>
-        <w:tc>
-          <w:tcPr/>
-          <w:p>
-            <w:pPr>
-              <w:pStyle w:val="Compact"/>
-            </w:pPr>
-            <w:r>
-              <w:t xml:space="preserve">Method</w:t>
-            </w:r>
-          </w:p>
-        </w:tc>
-        <w:tc>
-          <w:tcPr/>
-          <w:p>
-            <w:pPr>
-              <w:pStyle w:val="Compact"/>
-              <w:jc w:val="right"/>
-            </w:pPr>
-            <w:r>
-              <w:t xml:space="preserve">CER</w:t>
-            </w:r>
-          </w:p>
-        </w:tc>
-        <w:tc>
-          <w:tcPr/>
-          <w:p>
-            <w:pPr>
-              <w:pStyle w:val="Compact"/>
-              <w:jc w:val="right"/>
-            </w:pPr>
-            <w:r>
-              <w:t xml:space="preserve">WER</w:t>
-            </w:r>
-          </w:p>
-        </w:tc>
-        <w:tc>
-          <w:tcPr/>
-          <w:p>
-            <w:pPr>
-              <w:pStyle w:val="Compact"/>
-              <w:jc w:val="right"/>
-            </w:pPr>
-            <w:r>
-              <w:t xml:space="preserve">ExactMatch</w:t>
-            </w:r>
-          </w:p>
-        </w:tc>
-        <w:tc>
-          <w:tcPr/>
-          <w:p>
-            <w:pPr>
-              <w:pStyle w:val="Compact"/>
-              <w:jc w:val="right"/>
-            </w:pPr>
-            <w:r>
-              <w:t xml:space="preserve">N</w:t>
-            </w:r>
-          </w:p>
-        </w:tc>
-      </w:tr>
-      <w:tr>
-        <w:tc>
-          <w:tcPr/>
-          <w:p>
-            <w:pPr>
-              <w:pStyle w:val="Compact"/>
-            </w:pPr>
-            <w:r>
-              <w:t xml:space="preserve">Метод без исправления</w:t>
-            </w:r>
-          </w:p>
-        </w:tc>
-        <w:tc>
-          <w:tcPr/>
-          <w:p>
-            <w:pPr>
-              <w:pStyle w:val="Compact"/>
-              <w:jc w:val="right"/>
-            </w:pPr>
-            <w:r>
-              <w:t xml:space="preserve">0.086005</w:t>
-            </w:r>
-          </w:p>
-        </w:tc>
-        <w:tc>
-          <w:tcPr/>
-          <w:p>
-            <w:pPr>
-              <w:pStyle w:val="Compact"/>
-              <w:jc w:val="right"/>
-            </w:pPr>
-            <w:r>
-              <w:t xml:space="preserve">0.519006</w:t>
-            </w:r>
-          </w:p>
-        </w:tc>
-        <w:tc>
-          <w:tcPr/>
-          <w:p>
-            <w:pPr>
-              <w:pStyle w:val="Compact"/>
-              <w:jc w:val="right"/>
-            </w:pPr>
-            <w:r>
-              <w:t xml:space="preserve">0.001250</w:t>
-            </w:r>
-          </w:p>
-        </w:tc>
-        <w:tc>
-          <w:tcPr/>
-          <w:p>
-            <w:pPr>
-              <w:pStyle w:val="Compact"/>
-              <w:jc w:val="right"/>
-            </w:pPr>
-            <w:r>
-              <w:t xml:space="preserve">800</w:t>
-            </w:r>
-          </w:p>
-        </w:tc>
-      </w:tr>
-      <w:tr>
-        <w:tc>
-          <w:tcPr/>
-          <w:p>
-            <w:pPr>
-              <w:pStyle w:val="Compact"/>
-            </w:pPr>
-            <w:r>
-              <w:t xml:space="preserve">Нормализатор на правилах</w:t>
-            </w:r>
-          </w:p>
-        </w:tc>
-        <w:tc>
-          <w:tcPr/>
-          <w:p>
-            <w:pPr>
-              <w:pStyle w:val="Compact"/>
-              <w:jc w:val="right"/>
-            </w:pPr>
-            <w:r>
-              <w:t xml:space="preserve">0.151932</w:t>
-            </w:r>
-          </w:p>
-        </w:tc>
-        <w:tc>
-          <w:tcPr/>
-          <w:p>
-            <w:pPr>
-              <w:pStyle w:val="Compact"/>
-              <w:jc w:val="right"/>
-            </w:pPr>
-            <w:r>
-              <w:t xml:space="preserve">0.684408</w:t>
-            </w:r>
-          </w:p>
-        </w:tc>
-        <w:tc>
-          <w:tcPr/>
-          <w:p>
-            <w:pPr>
-              <w:pStyle w:val="Compact"/>
-              <w:jc w:val="right"/>
-            </w:pPr>
-            <w:r>
-              <w:t xml:space="preserve">0.000000</w:t>
-            </w:r>
-          </w:p>
-        </w:tc>
-        <w:tc>
-          <w:tcPr/>
-          <w:p>
-            <w:pPr>
-              <w:pStyle w:val="Compact"/>
-              <w:jc w:val="right"/>
-            </w:pPr>
-            <w:r>
-              <w:t xml:space="preserve">800</w:t>
-            </w:r>
-          </w:p>
-        </w:tc>
-      </w:tr>
-      <w:tr>
-        <w:tc>
-          <w:tcPr/>
-          <w:p>
-            <w:pPr>
-              <w:pStyle w:val="Compact"/>
-            </w:pPr>
-            <w:r>
-              <w:t xml:space="preserve">Символьный метод на основе ошибок обучающей выборки</w:t>
-            </w:r>
-          </w:p>
-        </w:tc>
-        <w:tc>
-          <w:tcPr/>
-          <w:p>
-            <w:pPr>
-              <w:pStyle w:val="Compact"/>
-              <w:jc w:val="right"/>
-            </w:pPr>
-            <w:r>
-              <w:t xml:space="preserve">0.082520</w:t>
-            </w:r>
-          </w:p>
-        </w:tc>
-        <w:tc>
-          <w:tcPr/>
-          <w:p>
-            <w:pPr>
-              <w:pStyle w:val="Compact"/>
-              <w:jc w:val="right"/>
-            </w:pPr>
-            <w:r>
-              <w:t xml:space="preserve">0.506189</w:t>
-            </w:r>
-          </w:p>
-        </w:tc>
-        <w:tc>
-          <w:tcPr/>
-          <w:p>
-            <w:pPr>
-              <w:pStyle w:val="Compact"/>
-              <w:jc w:val="right"/>
-            </w:pPr>
-            <w:r>
-              <w:t xml:space="preserve">0.001250</w:t>
-            </w:r>
-          </w:p>
-        </w:tc>
-        <w:tc>
-          <w:tcPr/>
-          <w:p>
-            <w:pPr>
-              <w:pStyle w:val="Compact"/>
-              <w:jc w:val="right"/>
-            </w:pPr>
-            <w:r>
-              <w:t xml:space="preserve">800</w:t>
-            </w:r>
-          </w:p>
-        </w:tc>
-      </w:tr>
-      <w:tr>
-        <w:tc>
-          <w:tcPr/>
-          <w:p>
-            <w:pPr>
-              <w:pStyle w:val="Compact"/>
-            </w:pPr>
-            <w:r>
-              <w:t xml:space="preserve">ByT5-small 512 / 2 epochs</w:t>
-            </w:r>
-          </w:p>
-        </w:tc>
-        <w:tc>
-          <w:tcPr/>
-          <w:p>
-            <w:pPr>
-              <w:pStyle w:val="Compact"/>
-              <w:jc w:val="right"/>
-            </w:pPr>
-            <w:r>
-              <w:t xml:space="preserve">0.079913</w:t>
-            </w:r>
-          </w:p>
-        </w:tc>
-        <w:tc>
-          <w:tcPr/>
-          <w:p>
-            <w:pPr>
-              <w:pStyle w:val="Compact"/>
-              <w:jc w:val="right"/>
-            </w:pPr>
-            <w:r>
-              <w:t xml:space="preserve">0.368540</w:t>
-            </w:r>
-          </w:p>
-        </w:tc>
-        <w:tc>
-          <w:tcPr/>
-          <w:p>
-            <w:pPr>
-              <w:pStyle w:val="Compact"/>
-              <w:jc w:val="right"/>
-            </w:pPr>
-            <w:r>
-              <w:t xml:space="preserve">0.003750</w:t>
-            </w:r>
-          </w:p>
-        </w:tc>
-        <w:tc>
-          <w:tcPr/>
-          <w:p>
-            <w:pPr>
-              <w:pStyle w:val="Compact"/>
-              <w:jc w:val="right"/>
-            </w:pPr>
-            <w:r>
-              <w:t xml:space="preserve">800</w:t>
-            </w:r>
-          </w:p>
-        </w:tc>
-      </w:tr>
-    </w:tbl>
-    <w:p>
-      <w:pPr>
-        <w:pStyle w:val="BodyText"/>
-      </w:pPr>
-      <w:r>
-        <w:t xml:space="preserve">Лучший результат среди проверенных методов показывает ByT5-small 512. По сравнению с методом без исправления CER снижается с 0.086005 до 0.079913, а WER — с 0.519006 до 0.368540. Это означает, что улучшение на уровне символов есть, но оно умеренное; основной выигрыш заметнее на уровне слов.</w:t>
-      </w:r>
-    </w:p>
-    <w:p>
-      <w:pPr>
-        <w:pStyle w:val="BodyText"/>
-      </w:pPr>
-      <w:r>
-        <w:t xml:space="preserve">Нормализатор на правилах, напротив, ухудшает обе основные метрики: CER растёт до 0.151932, а WER — до 0.684408. Этот результат показывает, что простая символьная нормализация не является заведомо безопасной предобработкой для исторического арабографичного тюркского материала.</w:t>
-      </w:r>
-    </w:p>
-    <w:p>
-      <w:pPr>
-        <w:pStyle w:val="BodyText"/>
-      </w:pPr>
-      <w:r>
-        <w:t xml:space="preserve">Символьный метод на основе ошибок обучающей выборки оказывается сильнее метода без исправления по CER: с 0.086005 до 0.082520. Однако по WER он почти не закрывает разрыв: с 0.519006 до 0.506189. Это показывает, что простые корпусно-выведенные символьные соответствия помогают частично исправлять локальные графемные ошибки, но недостаточны для восстановления структуры строки на уровне слов.</w:t>
-      </w:r>
-    </w:p>
-    <w:p>
-      <w:pPr>
-        <w:pStyle w:val="BodyText"/>
-      </w:pPr>
-      <w:r>
-        <w:t xml:space="preserve">ExactMatch остаётся низким у всех методов. Это ожидаемо для длинных строк и строгого посимвольного сравнения: даже одна ошибка делает строку несовпадающей с эталоном. Поэтому ExactMatch используется как дополнительный строгий индикатор, а основные выводы строятся по CER, WER, NoSpaceCER и анализу ошибок.</w:t>
-      </w:r>
-    </w:p>
-    <w:bookmarkEnd w:id="54"/>
-    <w:bookmarkStart w:id="55" w:name="сравнение-с-методом-без-исправления"/>
-    <w:p>
-      <w:pPr>
-        <w:pStyle w:val="Heading3"/>
-      </w:pPr>
-      <w:r>
-        <w:t xml:space="preserve">5.3 Сравнение с методом без исправления</w:t>
-      </w:r>
-    </w:p>
-    <w:p>
-      <w:pPr>
-        <w:pStyle w:val="FirstParagraph"/>
-      </w:pPr>
-      <w:r>
-        <w:t xml:space="preserve">Метод без исправления задаёт нижнюю границу качества: он не исправляет текст, а возвращает исходную зашумлённую строку без изменений. Поэтому полезная модель посткоррекции должна показывать качество выше этого уровня хотя бы по основным метрикам CER и WER.</w:t>
-      </w:r>
-    </w:p>
-    <w:p>
-      <w:pPr>
-        <w:pStyle w:val="BodyText"/>
-      </w:pPr>
-      <w:r>
-        <w:t xml:space="preserve">ByT5-small 512 превосходит метод без исправления по всем трём метрикам:</w:t>
-      </w:r>
-    </w:p>
-    <w:p>
-      <w:pPr>
-        <w:pStyle w:val="Compact"/>
-        <w:numPr>
-          <w:ilvl w:val="0"/>
-          <w:numId w:val="1003"/>
-        </w:numPr>
-      </w:pPr>
-      <w:r>
-        <w:t xml:space="preserve">CER: с 0.086005 до 0.079913;</w:t>
-      </w:r>
-    </w:p>
-    <w:p>
-      <w:pPr>
-        <w:pStyle w:val="Compact"/>
-        <w:numPr>
-          <w:ilvl w:val="0"/>
-          <w:numId w:val="1003"/>
-        </w:numPr>
-      </w:pPr>
-      <w:r>
-        <w:t xml:space="preserve">WER: с 0.519006 до 0.368540;</w:t>
-      </w:r>
-    </w:p>
-    <w:p>
-      <w:pPr>
-        <w:pStyle w:val="Compact"/>
-        <w:numPr>
-          <w:ilvl w:val="0"/>
-          <w:numId w:val="1003"/>
-        </w:numPr>
-      </w:pPr>
-      <w:r>
-        <w:t xml:space="preserve">ExactMatch: с 0.001250 до 0.003750.</w:t>
-      </w:r>
-    </w:p>
-    <w:p>
-      <w:pPr>
-        <w:pStyle w:val="FirstParagraph"/>
-      </w:pPr>
-      <w:r>
-        <w:t xml:space="preserve">Абсолютное снижение CER составляет 0.006092. Это умеренное улучшение: модель действительно приближает предсказания к эталонной строке на уровне символов, но не решает задачу полностью. Заметнее выглядит снижение WER: разница составляет 0.150466, то есть модель заметно чаще восстанавливает структуру слов или делает строку ближе к эталону на уровне слов.</w:t>
-      </w:r>
-    </w:p>
-    <w:p>
-      <w:pPr>
-        <w:pStyle w:val="BodyText"/>
-      </w:pPr>
-      <w:r>
-        <w:t xml:space="preserve">Результат поддерживает гипотезу о пользе ByT5-small на синтетическом наборе, но размер эффекта по CER остаётся небольшим. Поэтому это не доказательство готовности модели к практическому OCR, а сигнал, что выбранное направление стоит продолжать на более строгих данных: реальных парах «OCR-вывод — эталон» и разбиении по страницам или источникам.</w:t>
-      </w:r>
-    </w:p>
-    <w:bookmarkEnd w:id="55"/>
-    <w:bookmarkStart w:id="56" w:name="нормализатор-на-правилах"/>
-    <w:p>
-      <w:pPr>
-        <w:pStyle w:val="Heading3"/>
-      </w:pPr>
-      <w:r>
-        <w:t xml:space="preserve">5.4 Нормализатор на правилах</w:t>
-      </w:r>
-    </w:p>
-    <w:p>
-      <w:pPr>
-        <w:pStyle w:val="FirstParagraph"/>
-      </w:pPr>
-      <w:r>
-        <w:t xml:space="preserve">Нормализатор на правилах выступает отрицательным контрольным сравнением. Он показывает, что простая символьная нормализация не обязательно улучшает исторический арабографичный текст и может быть хуже, чем отсутствие исправления.</w:t>
-      </w:r>
-    </w:p>
-    <w:p>
-      <w:pPr>
-        <w:pStyle w:val="BodyText"/>
-      </w:pPr>
-      <w:r>
-        <w:t xml:space="preserve">По сравнению с методом без исправления нормализатор ухудшает все метрики:</w:t>
-      </w:r>
-    </w:p>
-    <w:p>
-      <w:pPr>
-        <w:pStyle w:val="Compact"/>
-        <w:numPr>
-          <w:ilvl w:val="0"/>
-          <w:numId w:val="1004"/>
-        </w:numPr>
-      </w:pPr>
-      <w:r>
-        <w:t xml:space="preserve">CER: с 0.086005 до 0.151932;</w:t>
-      </w:r>
-    </w:p>
-    <w:p>
-      <w:pPr>
-        <w:pStyle w:val="Compact"/>
-        <w:numPr>
-          <w:ilvl w:val="0"/>
-          <w:numId w:val="1004"/>
-        </w:numPr>
-      </w:pPr>
-      <w:r>
-        <w:t xml:space="preserve">WER: с 0.519006 до 0.684408;</w:t>
-      </w:r>
-    </w:p>
-    <w:p>
-      <w:pPr>
-        <w:pStyle w:val="Compact"/>
-        <w:numPr>
-          <w:ilvl w:val="0"/>
-          <w:numId w:val="1004"/>
-        </w:numPr>
-      </w:pPr>
-      <w:r>
-        <w:t xml:space="preserve">ExactMatch: с 0.001250 до 0.000000.</w:t>
-      </w:r>
-    </w:p>
-    <w:p>
-      <w:pPr>
-        <w:pStyle w:val="FirstParagraph"/>
-      </w:pPr>
-      <w:r>
-        <w:t xml:space="preserve">Это означает, что выбранные правила добавляют больше ошибок, чем исправляют. Для исторического тюркского материала в арабской графике такой результат ожидаемо важен: графическая унификация может удалить технический шум, но одновременно стереть значимые орфографические различия или заменить допустимую историческую форму на неподходящую.</w:t>
-      </w:r>
-    </w:p>
-    <w:p>
-      <w:pPr>
-        <w:pStyle w:val="BodyText"/>
-      </w:pPr>
-      <w:r>
-        <w:t xml:space="preserve">Следовательно, нормализацию на правилах нельзя использовать как автоматический предварительный шаг без отдельной проверки. В рамках данного эксперимента первая гипотеза получает предварительное подтверждение: простая нормализация на правилах ухудшает качество текста относительно метода без исправления.</w:t>
-      </w:r>
-    </w:p>
-    <w:bookmarkEnd w:id="56"/>
-    <w:bookmarkStart w:id="57" w:name="X26c70db4b79cb30b57d665edbf51a9d36fed8b5"/>
-    <w:p>
-      <w:pPr>
-        <w:pStyle w:val="Heading3"/>
-      </w:pPr>
-      <w:r>
-        <w:t xml:space="preserve">5.5 Символьный метод на основе ошибок обучающей выборки</w:t>
-      </w:r>
-    </w:p>
-    <w:p>
-      <w:pPr>
-        <w:pStyle w:val="FirstParagraph"/>
-      </w:pPr>
-      <w:r>
-        <w:t xml:space="preserve">Символьный метод на основе ошибок обучающей выборки выступает дополнительным сравнением, основанным на данных, но не использующим нейросетевую модель. Он показывает, можно ли заметно улучшить качество за счёт устойчивых символьных соответствий, извлечённых из обучающих пар «искажённая строка — эталон», без нейросетевого моделирования контекста.</w:t>
-      </w:r>
-    </w:p>
-    <w:p>
-      <w:pPr>
-        <w:pStyle w:val="BodyText"/>
-      </w:pPr>
-      <w:r>
-        <w:t xml:space="preserve">По сравнению с методом без исправления этот метод немного снижает CER:</w:t>
-      </w:r>
-    </w:p>
-    <w:p>
-      <w:pPr>
-        <w:pStyle w:val="Compact"/>
-        <w:numPr>
-          <w:ilvl w:val="0"/>
-          <w:numId w:val="1005"/>
-        </w:numPr>
-      </w:pPr>
-      <w:r>
-        <w:t xml:space="preserve">CER: с 0.086005 до 0.082520;</w:t>
-      </w:r>
-    </w:p>
-    <w:p>
-      <w:pPr>
-        <w:pStyle w:val="Compact"/>
-        <w:numPr>
-          <w:ilvl w:val="0"/>
-          <w:numId w:val="1005"/>
-        </w:numPr>
-      </w:pPr>
-      <w:r>
-        <w:t xml:space="preserve">WER: с 0.519006 до 0.506189;</w:t>
-      </w:r>
-    </w:p>
-    <w:p>
-      <w:pPr>
-        <w:pStyle w:val="Compact"/>
-        <w:numPr>
-          <w:ilvl w:val="0"/>
-          <w:numId w:val="1005"/>
-        </w:numPr>
-      </w:pPr>
-      <w:r>
-        <w:t xml:space="preserve">ExactMatch: с 0.001250 до 0.001250.</w:t>
-      </w:r>
-    </w:p>
-    <w:p>
-      <w:pPr>
-        <w:pStyle w:val="FirstParagraph"/>
-      </w:pPr>
-      <w:r>
-        <w:t xml:space="preserve">Такой результат важен для интерпретации. Простые символьные соответствия, извлечённые из обучающей выборки, действительно исправляют часть локальных символьных ошибок, но почти не улучшают качество на уровне слов. Это означает, что большая часть преимущества ByT5-small связана не только с локальными заменами символов, но и с контекстным восстановлением структуры строки, включая границы слов.</w:t>
-      </w:r>
-    </w:p>
-    <w:bookmarkEnd w:id="57"/>
-    <w:bookmarkStart w:id="58" w:name="интерпретация-сильного-снижения-wer"/>
-    <w:p>
-      <w:pPr>
-        <w:pStyle w:val="Heading3"/>
-      </w:pPr>
-      <w:r>
-        <w:t xml:space="preserve">5.6 Интерпретация сильного снижения WER</w:t>
-      </w:r>
-    </w:p>
-    <w:p>
-      <w:pPr>
-        <w:pStyle w:val="FirstParagraph"/>
-      </w:pPr>
-      <w:r>
-        <w:t xml:space="preserve">Наиболее заметный выигрыш ByT5-small наблюдается по WER: с 0.519006 до 0.368540. В относительном выражении это выглядит как крупное улучшение. Однако этот результат нельзя интерпретировать как доказательство аналогичного выигрыша на реальных OCR/HTR-выходах.</w:t>
-      </w:r>
-    </w:p>
-    <w:p>
-      <w:pPr>
-        <w:pStyle w:val="BodyText"/>
-      </w:pPr>
-      <w:r>
-        <w:t xml:space="preserve">Причина состоит в том, что текущий синтетический шум включает вставку и удаление пробелов. WER вычисляется на уровне слов, поэтому он особенно чувствителен к ошибкам границ слов: одна вставка или потеря пробела может изменить токенизацию всей строки и резко увеличить ошибку на уровне слов. Если модель восстанавливает часть таких синтетических искажений границ слов, WER может снижаться существенно сильнее, чем CER.</w:t>
-      </w:r>
-    </w:p>
-    <w:p>
-      <w:pPr>
-        <w:pStyle w:val="BodyText"/>
-      </w:pPr>
-      <w:r>
-        <w:t xml:space="preserve">Поэтому CER и WER нельзя читать по отдельности. По CER улучшение ByT5-small умеренное: с 0.086005 до 0.079913. По WER эффект заметнее, но часть этого эффекта связана с исправлением синтетических ошибок пробелов и границ слов. Такой результат показывает работоспособность модели на проверочном стенде, но не подтверждает такой же выигрыш на реальных архивных сканах или OCR/HTR-выводах.</w:t>
-      </w:r>
-    </w:p>
-    <w:p>
-      <w:pPr>
-        <w:pStyle w:val="BodyText"/>
-      </w:pPr>
-      <w:r>
-        <w:t xml:space="preserve">Поскольку тестовый набор построен в этой работе, прямого опубликованного результата на точно таком же наборе данных нет. Поэтому утверждение о лучшем результате ограничено данной экспериментальной постановкой: ByT5-small 512 показывает лучший CER и WER среди рассмотренных методов на предложенном наборе. Работа не заявляет лучший опубликованный результат для посткоррекции OCR в целом.</w:t>
-      </w:r>
-    </w:p>
-    <w:bookmarkEnd w:id="58"/>
-    <w:bookmarkStart w:id="59" w:name="значение-длины-последовательности"/>
-    <w:p>
-      <w:pPr>
-        <w:pStyle w:val="Heading3"/>
-      </w:pPr>
-      <w:r>
-        <w:t xml:space="preserve">5.7 Значение длины последовательности</w:t>
-      </w:r>
-    </w:p>
-    <w:p>
-      <w:pPr>
-        <w:pStyle w:val="FirstParagraph"/>
-      </w:pPr>
-      <w:r>
-        <w:t xml:space="preserve">Результаты пилота показывают чувствительность ByT5-small к максимальной длине входной и целевой последовательности. Это связано с байтовым представлением: длина строки в токенах может быть заметно больше, чем число видимых символов, особенно для арабской графики.</w:t>
-      </w:r>
-    </w:p>
-    <w:p>
-      <w:pPr>
-        <w:pStyle w:val="BodyText"/>
-      </w:pPr>
-      <w:r>
-        <w:t xml:space="preserve">Конфигурация 256 использовалась как первый рабочий запуск, но для части строк такое ограничение может быть слишком жёстким. Конфигурация 512 снижает риск обрезания контекста и поэтому выбрана как основная для итогового анализа.</w:t>
-      </w:r>
-    </w:p>
-    <w:p>
-      <w:pPr>
-        <w:pStyle w:val="BodyText"/>
-      </w:pPr>
-      <w:r>
-        <w:t xml:space="preserve">Этот результат следует интерпретировать осторожно. Он показывает, что максимальная длина последовательности является важным экспериментальным параметром в данной постановке, но не доказывает универсального преимущества длины 512 для всех арабографичных тюркских корпусов. Для более сильного вывода нужны дополнительные запуски на более широком наборе источников и длин строк.</w:t>
-      </w:r>
-    </w:p>
-    <w:bookmarkEnd w:id="59"/>
-    <w:bookmarkStart w:id="60" w:name="X57a2c7e56d371be566bce3ca95d65080761e96c"/>
-    <w:p>
-      <w:pPr>
-        <w:pStyle w:val="Heading3"/>
-      </w:pPr>
-      <w:r>
-        <w:t xml:space="preserve">5.8 Анализ ошибок на уровне отдельных примеров</w:t>
-      </w:r>
-    </w:p>
-    <w:p>
-      <w:pPr>
-        <w:pStyle w:val="FirstParagraph"/>
-      </w:pPr>
-      <w:r>
-        <w:t xml:space="preserve">Помимо агрегированных метрик был проведён анализ качества на уровне отдельных тестовых примеров. Для каждого примера сравнивалась ошибка исходной зашумлённой строки и ошибка предсказания ByT5-small 512 относительно</w:t>
+        <w:t xml:space="preserve">Итоговые результаты представлены в таблице. Для компактности</w:t>
       </w:r>
       <w:r>
         <w:t xml:space="preserve"> </w:t>
@@ -4059,18 +3331,13 @@
         <w:rPr>
           <w:rStyle w:val="VerbatimChar"/>
         </w:rPr>
-        <w:t xml:space="preserve">clean</w:t>
-      </w:r>
-      <w:r>
-        <w:t xml:space="preserve">-эталона.</w:t>
-      </w:r>
-    </w:p>
-    <w:p>
-      <w:pPr>
-        <w:pStyle w:val="BodyText"/>
-      </w:pPr>
-      <w:r>
-        <w:t xml:space="preserve">Результаты анализа представлены в таблице.</w:t>
+        <w:t xml:space="preserve">EM</w:t>
+      </w:r>
+      <w:r>
+        <w:t xml:space="preserve"> </w:t>
+      </w:r>
+      <w:r>
+        <w:t xml:space="preserve">обозначает ExactMatch.</w:t>
       </w:r>
     </w:p>
     <w:tbl>
@@ -4097,55 +3364,55 @@
               <w:pStyle w:val="Compact"/>
             </w:pPr>
             <w:r>
-              <w:t xml:space="preserve">Criterion</w:t>
-            </w:r>
-          </w:p>
-        </w:tc>
-        <w:tc>
-          <w:tcPr/>
-          <w:p>
-            <w:pPr>
-              <w:pStyle w:val="Compact"/>
-              <w:jc w:val="right"/>
-            </w:pPr>
-            <w:r>
-              <w:t xml:space="preserve">Improved</w:t>
-            </w:r>
-          </w:p>
-        </w:tc>
-        <w:tc>
-          <w:tcPr/>
-          <w:p>
-            <w:pPr>
-              <w:pStyle w:val="Compact"/>
-              <w:jc w:val="right"/>
-            </w:pPr>
-            <w:r>
-              <w:t xml:space="preserve">Unchanged</w:t>
-            </w:r>
-          </w:p>
-        </w:tc>
-        <w:tc>
-          <w:tcPr/>
-          <w:p>
-            <w:pPr>
-              <w:pStyle w:val="Compact"/>
-              <w:jc w:val="right"/>
-            </w:pPr>
-            <w:r>
-              <w:t xml:space="preserve">Worse</w:t>
-            </w:r>
-          </w:p>
-        </w:tc>
-        <w:tc>
-          <w:tcPr/>
-          <w:p>
-            <w:pPr>
-              <w:pStyle w:val="Compact"/>
-              <w:jc w:val="right"/>
-            </w:pPr>
-            <w:r>
-              <w:t xml:space="preserve">Total</w:t>
+              <w:t xml:space="preserve">Метод</w:t>
+            </w:r>
+          </w:p>
+        </w:tc>
+        <w:tc>
+          <w:tcPr/>
+          <w:p>
+            <w:pPr>
+              <w:pStyle w:val="Compact"/>
+              <w:jc w:val="right"/>
+            </w:pPr>
+            <w:r>
+              <w:t xml:space="preserve">CER</w:t>
+            </w:r>
+          </w:p>
+        </w:tc>
+        <w:tc>
+          <w:tcPr/>
+          <w:p>
+            <w:pPr>
+              <w:pStyle w:val="Compact"/>
+              <w:jc w:val="right"/>
+            </w:pPr>
+            <w:r>
+              <w:t xml:space="preserve">WER</w:t>
+            </w:r>
+          </w:p>
+        </w:tc>
+        <w:tc>
+          <w:tcPr/>
+          <w:p>
+            <w:pPr>
+              <w:pStyle w:val="Compact"/>
+              <w:jc w:val="right"/>
+            </w:pPr>
+            <w:r>
+              <w:t xml:space="preserve">EM</w:t>
+            </w:r>
+          </w:p>
+        </w:tc>
+        <w:tc>
+          <w:tcPr/>
+          <w:p>
+            <w:pPr>
+              <w:pStyle w:val="Compact"/>
+              <w:jc w:val="right"/>
+            </w:pPr>
+            <w:r>
+              <w:t xml:space="preserve">N</w:t>
             </w:r>
           </w:p>
         </w:tc>
@@ -4158,43 +3425,43 @@
               <w:pStyle w:val="Compact"/>
             </w:pPr>
             <w:r>
-              <w:t xml:space="preserve">CER</w:t>
-            </w:r>
-          </w:p>
-        </w:tc>
-        <w:tc>
-          <w:tcPr/>
-          <w:p>
-            <w:pPr>
-              <w:pStyle w:val="Compact"/>
-              <w:jc w:val="right"/>
-            </w:pPr>
-            <w:r>
-              <w:t xml:space="preserve">682</w:t>
-            </w:r>
-          </w:p>
-        </w:tc>
-        <w:tc>
-          <w:tcPr/>
-          <w:p>
-            <w:pPr>
-              <w:pStyle w:val="Compact"/>
-              <w:jc w:val="right"/>
-            </w:pPr>
-            <w:r>
-              <w:t xml:space="preserve">60</w:t>
-            </w:r>
-          </w:p>
-        </w:tc>
-        <w:tc>
-          <w:tcPr/>
-          <w:p>
-            <w:pPr>
-              <w:pStyle w:val="Compact"/>
-              <w:jc w:val="right"/>
-            </w:pPr>
-            <w:r>
-              <w:t xml:space="preserve">58</w:t>
+              <w:t xml:space="preserve">Без испр.</w:t>
+            </w:r>
+          </w:p>
+        </w:tc>
+        <w:tc>
+          <w:tcPr/>
+          <w:p>
+            <w:pPr>
+              <w:pStyle w:val="Compact"/>
+              <w:jc w:val="right"/>
+            </w:pPr>
+            <w:r>
+              <w:t xml:space="preserve">0.086005</w:t>
+            </w:r>
+          </w:p>
+        </w:tc>
+        <w:tc>
+          <w:tcPr/>
+          <w:p>
+            <w:pPr>
+              <w:pStyle w:val="Compact"/>
+              <w:jc w:val="right"/>
+            </w:pPr>
+            <w:r>
+              <w:t xml:space="preserve">0.519006</w:t>
+            </w:r>
+          </w:p>
+        </w:tc>
+        <w:tc>
+          <w:tcPr/>
+          <w:p>
+            <w:pPr>
+              <w:pStyle w:val="Compact"/>
+              <w:jc w:val="right"/>
+            </w:pPr>
+            <w:r>
+              <w:t xml:space="preserve">0.001250</w:t>
             </w:r>
           </w:p>
         </w:tc>
@@ -4219,43 +3486,165 @@
               <w:pStyle w:val="Compact"/>
             </w:pPr>
             <w:r>
-              <w:t xml:space="preserve">WER</w:t>
-            </w:r>
-          </w:p>
-        </w:tc>
-        <w:tc>
-          <w:tcPr/>
-          <w:p>
-            <w:pPr>
-              <w:pStyle w:val="Compact"/>
-              <w:jc w:val="right"/>
-            </w:pPr>
-            <w:r>
-              <w:t xml:space="preserve">677</w:t>
-            </w:r>
-          </w:p>
-        </w:tc>
-        <w:tc>
-          <w:tcPr/>
-          <w:p>
-            <w:pPr>
-              <w:pStyle w:val="Compact"/>
-              <w:jc w:val="right"/>
-            </w:pPr>
-            <w:r>
-              <w:t xml:space="preserve">63</w:t>
-            </w:r>
-          </w:p>
-        </w:tc>
-        <w:tc>
-          <w:tcPr/>
-          <w:p>
-            <w:pPr>
-              <w:pStyle w:val="Compact"/>
-              <w:jc w:val="right"/>
-            </w:pPr>
-            <w:r>
-              <w:t xml:space="preserve">60</w:t>
+              <w:t xml:space="preserve">Правила</w:t>
+            </w:r>
+          </w:p>
+        </w:tc>
+        <w:tc>
+          <w:tcPr/>
+          <w:p>
+            <w:pPr>
+              <w:pStyle w:val="Compact"/>
+              <w:jc w:val="right"/>
+            </w:pPr>
+            <w:r>
+              <w:t xml:space="preserve">0.151932</w:t>
+            </w:r>
+          </w:p>
+        </w:tc>
+        <w:tc>
+          <w:tcPr/>
+          <w:p>
+            <w:pPr>
+              <w:pStyle w:val="Compact"/>
+              <w:jc w:val="right"/>
+            </w:pPr>
+            <w:r>
+              <w:t xml:space="preserve">0.684408</w:t>
+            </w:r>
+          </w:p>
+        </w:tc>
+        <w:tc>
+          <w:tcPr/>
+          <w:p>
+            <w:pPr>
+              <w:pStyle w:val="Compact"/>
+              <w:jc w:val="right"/>
+            </w:pPr>
+            <w:r>
+              <w:t xml:space="preserve">0.000000</w:t>
+            </w:r>
+          </w:p>
+        </w:tc>
+        <w:tc>
+          <w:tcPr/>
+          <w:p>
+            <w:pPr>
+              <w:pStyle w:val="Compact"/>
+              <w:jc w:val="right"/>
+            </w:pPr>
+            <w:r>
+              <w:t xml:space="preserve">800</w:t>
+            </w:r>
+          </w:p>
+        </w:tc>
+      </w:tr>
+      <w:tr>
+        <w:tc>
+          <w:tcPr/>
+          <w:p>
+            <w:pPr>
+              <w:pStyle w:val="Compact"/>
+            </w:pPr>
+            <w:r>
+              <w:t xml:space="preserve">Символьн.</w:t>
+            </w:r>
+          </w:p>
+        </w:tc>
+        <w:tc>
+          <w:tcPr/>
+          <w:p>
+            <w:pPr>
+              <w:pStyle w:val="Compact"/>
+              <w:jc w:val="right"/>
+            </w:pPr>
+            <w:r>
+              <w:t xml:space="preserve">0.082520</w:t>
+            </w:r>
+          </w:p>
+        </w:tc>
+        <w:tc>
+          <w:tcPr/>
+          <w:p>
+            <w:pPr>
+              <w:pStyle w:val="Compact"/>
+              <w:jc w:val="right"/>
+            </w:pPr>
+            <w:r>
+              <w:t xml:space="preserve">0.506189</w:t>
+            </w:r>
+          </w:p>
+        </w:tc>
+        <w:tc>
+          <w:tcPr/>
+          <w:p>
+            <w:pPr>
+              <w:pStyle w:val="Compact"/>
+              <w:jc w:val="right"/>
+            </w:pPr>
+            <w:r>
+              <w:t xml:space="preserve">0.001250</w:t>
+            </w:r>
+          </w:p>
+        </w:tc>
+        <w:tc>
+          <w:tcPr/>
+          <w:p>
+            <w:pPr>
+              <w:pStyle w:val="Compact"/>
+              <w:jc w:val="right"/>
+            </w:pPr>
+            <w:r>
+              <w:t xml:space="preserve">800</w:t>
+            </w:r>
+          </w:p>
+        </w:tc>
+      </w:tr>
+      <w:tr>
+        <w:tc>
+          <w:tcPr/>
+          <w:p>
+            <w:pPr>
+              <w:pStyle w:val="Compact"/>
+            </w:pPr>
+            <w:r>
+              <w:t xml:space="preserve">ByT5-512</w:t>
+            </w:r>
+          </w:p>
+        </w:tc>
+        <w:tc>
+          <w:tcPr/>
+          <w:p>
+            <w:pPr>
+              <w:pStyle w:val="Compact"/>
+              <w:jc w:val="right"/>
+            </w:pPr>
+            <w:r>
+              <w:t xml:space="preserve">0.079913</w:t>
+            </w:r>
+          </w:p>
+        </w:tc>
+        <w:tc>
+          <w:tcPr/>
+          <w:p>
+            <w:pPr>
+              <w:pStyle w:val="Compact"/>
+              <w:jc w:val="right"/>
+            </w:pPr>
+            <w:r>
+              <w:t xml:space="preserve">0.368540</w:t>
+            </w:r>
+          </w:p>
+        </w:tc>
+        <w:tc>
+          <w:tcPr/>
+          <w:p>
+            <w:pPr>
+              <w:pStyle w:val="Compact"/>
+              <w:jc w:val="right"/>
+            </w:pPr>
+            <w:r>
+              <w:t xml:space="preserve">0.003750</w:t>
             </w:r>
           </w:p>
         </w:tc>
@@ -4278,6 +3667,578 @@
         <w:pStyle w:val="BodyText"/>
       </w:pPr>
       <w:r>
+        <w:t xml:space="preserve">Лучший результат среди проверенных методов показывает ByT5-small 512. По сравнению с методом без исправления CER снижается с 0.086005 до 0.079913, а WER — с 0.519006 до 0.368540. Это означает, что улучшение на уровне символов есть, но оно умеренное; основной выигрыш заметнее на уровне слов.</w:t>
+      </w:r>
+    </w:p>
+    <w:p>
+      <w:pPr>
+        <w:pStyle w:val="BodyText"/>
+      </w:pPr>
+      <w:r>
+        <w:t xml:space="preserve">Нормализатор на правилах, напротив, ухудшает обе основные метрики: CER растёт до 0.151932, а WER — до 0.684408. Этот результат показывает, что простая символьная нормализация не является заведомо безопасной предобработкой для исторического арабографичного тюркского материала.</w:t>
+      </w:r>
+    </w:p>
+    <w:p>
+      <w:pPr>
+        <w:pStyle w:val="BodyText"/>
+      </w:pPr>
+      <w:r>
+        <w:t xml:space="preserve">Символьный метод на основе ошибок обучающей выборки оказывается сильнее метода без исправления по CER: с 0.086005 до 0.082520. Однако по WER он почти не закрывает разрыв: с 0.519006 до 0.506189. Это показывает, что простые корпусно-выведенные символьные соответствия помогают частично исправлять локальные графемные ошибки, но недостаточны для восстановления структуры строки на уровне слов.</w:t>
+      </w:r>
+    </w:p>
+    <w:p>
+      <w:pPr>
+        <w:pStyle w:val="BodyText"/>
+      </w:pPr>
+      <w:r>
+        <w:t xml:space="preserve">ExactMatch остаётся низким у всех методов. Это ожидаемо для длинных строк и строгого посимвольного сравнения: даже одна ошибка делает строку несовпадающей с эталоном. Поэтому ExactMatch используется как дополнительный строгий индикатор, а основные выводы строятся по CER, WER, NoSpaceCER и анализу ошибок.</w:t>
+      </w:r>
+    </w:p>
+    <w:bookmarkEnd w:id="53"/>
+    <w:bookmarkStart w:id="54" w:name="сравнение-с-методом-без-исправления"/>
+    <w:p>
+      <w:pPr>
+        <w:pStyle w:val="Heading3"/>
+      </w:pPr>
+      <w:r>
+        <w:t xml:space="preserve">5.3 Сравнение с методом без исправления</w:t>
+      </w:r>
+    </w:p>
+    <w:p>
+      <w:pPr>
+        <w:pStyle w:val="FirstParagraph"/>
+      </w:pPr>
+      <w:r>
+        <w:t xml:space="preserve">Метод без исправления задаёт нижнюю границу качества: он не исправляет текст, а возвращает исходную зашумлённую строку без изменений. Поэтому полезная модель посткоррекции должна показывать качество выше этого уровня хотя бы по основным метрикам CER и WER.</w:t>
+      </w:r>
+    </w:p>
+    <w:p>
+      <w:pPr>
+        <w:pStyle w:val="BodyText"/>
+      </w:pPr>
+      <w:r>
+        <w:t xml:space="preserve">ByT5-small 512 превосходит метод без исправления по всем трём метрикам:</w:t>
+      </w:r>
+    </w:p>
+    <w:p>
+      <w:pPr>
+        <w:pStyle w:val="Compact"/>
+        <w:numPr>
+          <w:ilvl w:val="0"/>
+          <w:numId w:val="1003"/>
+        </w:numPr>
+      </w:pPr>
+      <w:r>
+        <w:t xml:space="preserve">CER: с 0.086005 до 0.079913;</w:t>
+      </w:r>
+    </w:p>
+    <w:p>
+      <w:pPr>
+        <w:pStyle w:val="Compact"/>
+        <w:numPr>
+          <w:ilvl w:val="0"/>
+          <w:numId w:val="1003"/>
+        </w:numPr>
+      </w:pPr>
+      <w:r>
+        <w:t xml:space="preserve">WER: с 0.519006 до 0.368540;</w:t>
+      </w:r>
+    </w:p>
+    <w:p>
+      <w:pPr>
+        <w:pStyle w:val="Compact"/>
+        <w:numPr>
+          <w:ilvl w:val="0"/>
+          <w:numId w:val="1003"/>
+        </w:numPr>
+      </w:pPr>
+      <w:r>
+        <w:t xml:space="preserve">ExactMatch: с 0.001250 до 0.003750.</w:t>
+      </w:r>
+    </w:p>
+    <w:p>
+      <w:pPr>
+        <w:pStyle w:val="FirstParagraph"/>
+      </w:pPr>
+      <w:r>
+        <w:t xml:space="preserve">Абсолютное снижение CER составляет 0.006092. Это умеренное улучшение: модель действительно приближает предсказания к эталонной строке на уровне символов, но не решает задачу полностью. Заметнее выглядит снижение WER: разница составляет 0.150466, то есть модель заметно чаще восстанавливает структуру слов или делает строку ближе к эталону на уровне слов.</w:t>
+      </w:r>
+    </w:p>
+    <w:p>
+      <w:pPr>
+        <w:pStyle w:val="BodyText"/>
+      </w:pPr>
+      <w:r>
+        <w:t xml:space="preserve">Результат поддерживает гипотезу о пользе ByT5-small на синтетическом наборе, но размер эффекта по CER остаётся небольшим. Поэтому это не доказательство готовности модели к практическому OCR, а сигнал, что выбранное направление стоит продолжать на более строгих данных: реальных парах «OCR-вывод — эталон» и разбиении по страницам или источникам.</w:t>
+      </w:r>
+    </w:p>
+    <w:bookmarkEnd w:id="54"/>
+    <w:bookmarkStart w:id="55" w:name="нормализатор-на-правилах"/>
+    <w:p>
+      <w:pPr>
+        <w:pStyle w:val="Heading3"/>
+      </w:pPr>
+      <w:r>
+        <w:t xml:space="preserve">5.4 Нормализатор на правилах</w:t>
+      </w:r>
+    </w:p>
+    <w:p>
+      <w:pPr>
+        <w:pStyle w:val="FirstParagraph"/>
+      </w:pPr>
+      <w:r>
+        <w:t xml:space="preserve">Нормализатор на правилах выступает отрицательным контрольным сравнением. Он показывает, что простая символьная нормализация не обязательно улучшает исторический арабографичный текст и может быть хуже, чем отсутствие исправления.</w:t>
+      </w:r>
+    </w:p>
+    <w:p>
+      <w:pPr>
+        <w:pStyle w:val="BodyText"/>
+      </w:pPr>
+      <w:r>
+        <w:t xml:space="preserve">По сравнению с методом без исправления нормализатор ухудшает все метрики:</w:t>
+      </w:r>
+    </w:p>
+    <w:p>
+      <w:pPr>
+        <w:pStyle w:val="Compact"/>
+        <w:numPr>
+          <w:ilvl w:val="0"/>
+          <w:numId w:val="1004"/>
+        </w:numPr>
+      </w:pPr>
+      <w:r>
+        <w:t xml:space="preserve">CER: с 0.086005 до 0.151932;</w:t>
+      </w:r>
+    </w:p>
+    <w:p>
+      <w:pPr>
+        <w:pStyle w:val="Compact"/>
+        <w:numPr>
+          <w:ilvl w:val="0"/>
+          <w:numId w:val="1004"/>
+        </w:numPr>
+      </w:pPr>
+      <w:r>
+        <w:t xml:space="preserve">WER: с 0.519006 до 0.684408;</w:t>
+      </w:r>
+    </w:p>
+    <w:p>
+      <w:pPr>
+        <w:pStyle w:val="Compact"/>
+        <w:numPr>
+          <w:ilvl w:val="0"/>
+          <w:numId w:val="1004"/>
+        </w:numPr>
+      </w:pPr>
+      <w:r>
+        <w:t xml:space="preserve">ExactMatch: с 0.001250 до 0.000000.</w:t>
+      </w:r>
+    </w:p>
+    <w:p>
+      <w:pPr>
+        <w:pStyle w:val="FirstParagraph"/>
+      </w:pPr>
+      <w:r>
+        <w:t xml:space="preserve">Это означает, что выбранные правила добавляют больше ошибок, чем исправляют. Для исторического тюркского материала в арабской графике такой результат ожидаемо важен: графическая унификация может удалить технический шум, но одновременно стереть значимые орфографические различия или заменить допустимую историческую форму на неподходящую.</w:t>
+      </w:r>
+    </w:p>
+    <w:p>
+      <w:pPr>
+        <w:pStyle w:val="BodyText"/>
+      </w:pPr>
+      <w:r>
+        <w:t xml:space="preserve">Следовательно, нормализацию на правилах нельзя использовать как автоматический предварительный шаг без отдельной проверки. В рамках данного эксперимента первая гипотеза получает предварительное подтверждение: простая нормализация на правилах ухудшает качество текста относительно метода без исправления.</w:t>
+      </w:r>
+    </w:p>
+    <w:bookmarkEnd w:id="55"/>
+    <w:bookmarkStart w:id="56" w:name="X26c70db4b79cb30b57d665edbf51a9d36fed8b5"/>
+    <w:p>
+      <w:pPr>
+        <w:pStyle w:val="Heading3"/>
+      </w:pPr>
+      <w:r>
+        <w:t xml:space="preserve">5.5 Символьный метод на основе ошибок обучающей выборки</w:t>
+      </w:r>
+    </w:p>
+    <w:p>
+      <w:pPr>
+        <w:pStyle w:val="FirstParagraph"/>
+      </w:pPr>
+      <w:r>
+        <w:t xml:space="preserve">Символьный метод на основе ошибок обучающей выборки выступает дополнительным сравнением, основанным на данных, но не использующим нейросетевую модель. Он показывает, можно ли заметно улучшить качество за счёт устойчивых символьных соответствий, извлечённых из обучающих пар «искажённая строка — эталон», без нейросетевого моделирования контекста.</w:t>
+      </w:r>
+    </w:p>
+    <w:p>
+      <w:pPr>
+        <w:pStyle w:val="BodyText"/>
+      </w:pPr>
+      <w:r>
+        <w:t xml:space="preserve">По сравнению с методом без исправления этот метод немного снижает CER:</w:t>
+      </w:r>
+    </w:p>
+    <w:p>
+      <w:pPr>
+        <w:pStyle w:val="Compact"/>
+        <w:numPr>
+          <w:ilvl w:val="0"/>
+          <w:numId w:val="1005"/>
+        </w:numPr>
+      </w:pPr>
+      <w:r>
+        <w:t xml:space="preserve">CER: с 0.086005 до 0.082520;</w:t>
+      </w:r>
+    </w:p>
+    <w:p>
+      <w:pPr>
+        <w:pStyle w:val="Compact"/>
+        <w:numPr>
+          <w:ilvl w:val="0"/>
+          <w:numId w:val="1005"/>
+        </w:numPr>
+      </w:pPr>
+      <w:r>
+        <w:t xml:space="preserve">WER: с 0.519006 до 0.506189;</w:t>
+      </w:r>
+    </w:p>
+    <w:p>
+      <w:pPr>
+        <w:pStyle w:val="Compact"/>
+        <w:numPr>
+          <w:ilvl w:val="0"/>
+          <w:numId w:val="1005"/>
+        </w:numPr>
+      </w:pPr>
+      <w:r>
+        <w:t xml:space="preserve">ExactMatch: с 0.001250 до 0.001250.</w:t>
+      </w:r>
+    </w:p>
+    <w:p>
+      <w:pPr>
+        <w:pStyle w:val="FirstParagraph"/>
+      </w:pPr>
+      <w:r>
+        <w:t xml:space="preserve">Такой результат важен для интерпретации. Простые символьные соответствия, извлечённые из обучающей выборки, действительно исправляют часть локальных символьных ошибок, но почти не улучшают качество на уровне слов. Это означает, что большая часть преимущества ByT5-small связана не только с локальными заменами символов, но и с контекстным восстановлением структуры строки, включая границы слов.</w:t>
+      </w:r>
+    </w:p>
+    <w:bookmarkEnd w:id="56"/>
+    <w:bookmarkStart w:id="57" w:name="интерпретация-сильного-снижения-wer"/>
+    <w:p>
+      <w:pPr>
+        <w:pStyle w:val="Heading3"/>
+      </w:pPr>
+      <w:r>
+        <w:t xml:space="preserve">5.6 Интерпретация сильного снижения WER</w:t>
+      </w:r>
+    </w:p>
+    <w:p>
+      <w:pPr>
+        <w:pStyle w:val="FirstParagraph"/>
+      </w:pPr>
+      <w:r>
+        <w:t xml:space="preserve">Наиболее заметный выигрыш ByT5-small наблюдается по WER: с 0.519006 до 0.368540. В относительном выражении это выглядит как крупное улучшение. Однако этот результат нельзя интерпретировать как доказательство аналогичного выигрыша на реальных OCR/HTR-выходах.</w:t>
+      </w:r>
+    </w:p>
+    <w:p>
+      <w:pPr>
+        <w:pStyle w:val="BodyText"/>
+      </w:pPr>
+      <w:r>
+        <w:t xml:space="preserve">Причина состоит в том, что текущий синтетический шум включает вставку и удаление пробелов. WER вычисляется на уровне слов, поэтому он особенно чувствителен к ошибкам границ слов: одна вставка или потеря пробела может изменить токенизацию всей строки и резко увеличить ошибку на уровне слов. Если модель восстанавливает часть таких синтетических искажений границ слов, WER может снижаться существенно сильнее, чем CER.</w:t>
+      </w:r>
+    </w:p>
+    <w:p>
+      <w:pPr>
+        <w:pStyle w:val="BodyText"/>
+      </w:pPr>
+      <w:r>
+        <w:t xml:space="preserve">Поэтому CER и WER нельзя читать по отдельности. По CER улучшение ByT5-small умеренное: с 0.086005 до 0.079913. По WER эффект заметнее, но часть этого эффекта связана с исправлением синтетических ошибок пробелов и границ слов. Такой результат показывает работоспособность модели на проверочном стенде, но не подтверждает такой же выигрыш на реальных архивных сканах или OCR/HTR-выводах.</w:t>
+      </w:r>
+    </w:p>
+    <w:p>
+      <w:pPr>
+        <w:pStyle w:val="BodyText"/>
+      </w:pPr>
+      <w:r>
+        <w:t xml:space="preserve">Поскольку тестовый набор построен в этой работе, прямого опубликованного результата на точно таком же наборе данных нет. Поэтому утверждение о лучшем результате ограничено данной экспериментальной постановкой: ByT5-small 512 показывает лучший CER и WER среди рассмотренных методов на предложенном наборе. Работа не заявляет лучший опубликованный результат для посткоррекции OCR в целом.</w:t>
+      </w:r>
+    </w:p>
+    <w:bookmarkEnd w:id="57"/>
+    <w:bookmarkStart w:id="58" w:name="значение-длины-последовательности"/>
+    <w:p>
+      <w:pPr>
+        <w:pStyle w:val="Heading3"/>
+      </w:pPr>
+      <w:r>
+        <w:t xml:space="preserve">5.7 Значение длины последовательности</w:t>
+      </w:r>
+    </w:p>
+    <w:p>
+      <w:pPr>
+        <w:pStyle w:val="FirstParagraph"/>
+      </w:pPr>
+      <w:r>
+        <w:t xml:space="preserve">Результаты пилота показывают чувствительность ByT5-small к максимальной длине входной и целевой последовательности. Это связано с байтовым представлением: длина строки в токенах может быть заметно больше, чем число видимых символов, особенно для арабской графики.</w:t>
+      </w:r>
+    </w:p>
+    <w:p>
+      <w:pPr>
+        <w:pStyle w:val="BodyText"/>
+      </w:pPr>
+      <w:r>
+        <w:t xml:space="preserve">Конфигурация 256 использовалась как первый рабочий запуск, но для части строк такое ограничение может быть слишком жёстким. Конфигурация 512 снижает риск обрезания контекста и поэтому выбрана как основная для итогового анализа.</w:t>
+      </w:r>
+    </w:p>
+    <w:p>
+      <w:pPr>
+        <w:pStyle w:val="BodyText"/>
+      </w:pPr>
+      <w:r>
+        <w:t xml:space="preserve">Этот результат следует интерпретировать осторожно. Он показывает, что максимальная длина последовательности является важным экспериментальным параметром в данной постановке, но не доказывает универсального преимущества длины 512 для всех арабографичных тюркских корпусов. Для более сильного вывода нужны дополнительные запуски на более широком наборе источников и длин строк.</w:t>
+      </w:r>
+    </w:p>
+    <w:bookmarkEnd w:id="58"/>
+    <w:bookmarkStart w:id="59" w:name="X57a2c7e56d371be566bce3ca95d65080761e96c"/>
+    <w:p>
+      <w:pPr>
+        <w:pStyle w:val="Heading3"/>
+      </w:pPr>
+      <w:r>
+        <w:t xml:space="preserve">5.8 Анализ ошибок на уровне отдельных примеров</w:t>
+      </w:r>
+    </w:p>
+    <w:p>
+      <w:pPr>
+        <w:pStyle w:val="FirstParagraph"/>
+      </w:pPr>
+      <w:r>
+        <w:t xml:space="preserve">Помимо агрегированных метрик был проведён анализ качества на уровне отдельных тестовых примеров. Для каждого примера сравнивалась ошибка исходной зашумлённой строки и ошибка предсказания ByT5-small 512 относительно</w:t>
+      </w:r>
+      <w:r>
+        <w:t xml:space="preserve"> </w:t>
+      </w:r>
+      <w:r>
+        <w:rPr>
+          <w:rStyle w:val="VerbatimChar"/>
+        </w:rPr>
+        <w:t xml:space="preserve">clean</w:t>
+      </w:r>
+      <w:r>
+        <w:t xml:space="preserve">-эталона.</w:t>
+      </w:r>
+    </w:p>
+    <w:p>
+      <w:pPr>
+        <w:pStyle w:val="BodyText"/>
+      </w:pPr>
+      <w:r>
+        <w:t xml:space="preserve">Результаты анализа представлены в таблице.</w:t>
+      </w:r>
+    </w:p>
+    <w:tbl>
+      <w:tblPr>
+        <w:tblStyle w:val="Table"/>
+        <w:tblW w:type="auto" w:w="0"/>
+        <w:tblLook w:firstRow="1" w:lastRow="0" w:firstColumn="0" w:lastColumn="0" w:noHBand="0" w:noVBand="0" w:val="0020"/>
+      </w:tblPr>
+      <w:tblGrid>
+        <w:gridCol w:w="1584"/>
+        <w:gridCol w:w="1584"/>
+        <w:gridCol w:w="1584"/>
+        <w:gridCol w:w="1584"/>
+        <w:gridCol w:w="1584"/>
+      </w:tblGrid>
+      <w:tr>
+        <w:trPr>
+          <w:tblHeader w:val="on"/>
+        </w:trPr>
+        <w:tc>
+          <w:tcPr/>
+          <w:p>
+            <w:pPr>
+              <w:pStyle w:val="Compact"/>
+            </w:pPr>
+            <w:r>
+              <w:t xml:space="preserve">Criterion</w:t>
+            </w:r>
+          </w:p>
+        </w:tc>
+        <w:tc>
+          <w:tcPr/>
+          <w:p>
+            <w:pPr>
+              <w:pStyle w:val="Compact"/>
+              <w:jc w:val="right"/>
+            </w:pPr>
+            <w:r>
+              <w:t xml:space="preserve">Improved</w:t>
+            </w:r>
+          </w:p>
+        </w:tc>
+        <w:tc>
+          <w:tcPr/>
+          <w:p>
+            <w:pPr>
+              <w:pStyle w:val="Compact"/>
+              <w:jc w:val="right"/>
+            </w:pPr>
+            <w:r>
+              <w:t xml:space="preserve">Unchanged</w:t>
+            </w:r>
+          </w:p>
+        </w:tc>
+        <w:tc>
+          <w:tcPr/>
+          <w:p>
+            <w:pPr>
+              <w:pStyle w:val="Compact"/>
+              <w:jc w:val="right"/>
+            </w:pPr>
+            <w:r>
+              <w:t xml:space="preserve">Worse</w:t>
+            </w:r>
+          </w:p>
+        </w:tc>
+        <w:tc>
+          <w:tcPr/>
+          <w:p>
+            <w:pPr>
+              <w:pStyle w:val="Compact"/>
+              <w:jc w:val="right"/>
+            </w:pPr>
+            <w:r>
+              <w:t xml:space="preserve">Total</w:t>
+            </w:r>
+          </w:p>
+        </w:tc>
+      </w:tr>
+      <w:tr>
+        <w:tc>
+          <w:tcPr/>
+          <w:p>
+            <w:pPr>
+              <w:pStyle w:val="Compact"/>
+            </w:pPr>
+            <w:r>
+              <w:t xml:space="preserve">CER</w:t>
+            </w:r>
+          </w:p>
+        </w:tc>
+        <w:tc>
+          <w:tcPr/>
+          <w:p>
+            <w:pPr>
+              <w:pStyle w:val="Compact"/>
+              <w:jc w:val="right"/>
+            </w:pPr>
+            <w:r>
+              <w:t xml:space="preserve">682</w:t>
+            </w:r>
+          </w:p>
+        </w:tc>
+        <w:tc>
+          <w:tcPr/>
+          <w:p>
+            <w:pPr>
+              <w:pStyle w:val="Compact"/>
+              <w:jc w:val="right"/>
+            </w:pPr>
+            <w:r>
+              <w:t xml:space="preserve">60</w:t>
+            </w:r>
+          </w:p>
+        </w:tc>
+        <w:tc>
+          <w:tcPr/>
+          <w:p>
+            <w:pPr>
+              <w:pStyle w:val="Compact"/>
+              <w:jc w:val="right"/>
+            </w:pPr>
+            <w:r>
+              <w:t xml:space="preserve">58</w:t>
+            </w:r>
+          </w:p>
+        </w:tc>
+        <w:tc>
+          <w:tcPr/>
+          <w:p>
+            <w:pPr>
+              <w:pStyle w:val="Compact"/>
+              <w:jc w:val="right"/>
+            </w:pPr>
+            <w:r>
+              <w:t xml:space="preserve">800</w:t>
+            </w:r>
+          </w:p>
+        </w:tc>
+      </w:tr>
+      <w:tr>
+        <w:tc>
+          <w:tcPr/>
+          <w:p>
+            <w:pPr>
+              <w:pStyle w:val="Compact"/>
+            </w:pPr>
+            <w:r>
+              <w:t xml:space="preserve">WER</w:t>
+            </w:r>
+          </w:p>
+        </w:tc>
+        <w:tc>
+          <w:tcPr/>
+          <w:p>
+            <w:pPr>
+              <w:pStyle w:val="Compact"/>
+              <w:jc w:val="right"/>
+            </w:pPr>
+            <w:r>
+              <w:t xml:space="preserve">677</w:t>
+            </w:r>
+          </w:p>
+        </w:tc>
+        <w:tc>
+          <w:tcPr/>
+          <w:p>
+            <w:pPr>
+              <w:pStyle w:val="Compact"/>
+              <w:jc w:val="right"/>
+            </w:pPr>
+            <w:r>
+              <w:t xml:space="preserve">63</w:t>
+            </w:r>
+          </w:p>
+        </w:tc>
+        <w:tc>
+          <w:tcPr/>
+          <w:p>
+            <w:pPr>
+              <w:pStyle w:val="Compact"/>
+              <w:jc w:val="right"/>
+            </w:pPr>
+            <w:r>
+              <w:t xml:space="preserve">60</w:t>
+            </w:r>
+          </w:p>
+        </w:tc>
+        <w:tc>
+          <w:tcPr/>
+          <w:p>
+            <w:pPr>
+              <w:pStyle w:val="Compact"/>
+              <w:jc w:val="right"/>
+            </w:pPr>
+            <w:r>
+              <w:t xml:space="preserve">800</w:t>
+            </w:r>
+          </w:p>
+        </w:tc>
+      </w:tr>
+    </w:tbl>
+    <w:p>
+      <w:pPr>
+        <w:pStyle w:val="BodyText"/>
+      </w:pPr>
+      <w:r>
         <w:t xml:space="preserve">По CER модель улучшила 682 из 800 тестовых примеров, оставила без изменений 60 и ухудшила 58. По WER улучшение наблюдается в 677 примерах, отсутствие изменений — в 63, ухудшение — в 60.</w:t>
       </w:r>
     </w:p>
@@ -4297,8 +4258,8 @@
         <w:t xml:space="preserve">В примерах видны два сценария. В удачных случаях ByT5-small исправляет локальные OCR-подобные искажения, восстанавливает отдельные графемы и делает границы слов ближе к эталону. В худших случаях модель начинает порождать повторяющиеся фрагменты или заметно удлиняет строку. Для практического применения это принципиально: посткорректору нужен механизм отката, анализ худших случаев и ручная проверка спорных строк. Без этих защитных процедур модель нельзя считать безопасным автоматическим корректором.</w:t>
       </w:r>
     </w:p>
-    <w:bookmarkEnd w:id="60"/>
-    <w:bookmarkStart w:id="61" w:name="среднее-улучшение-по-примерам"/>
+    <w:bookmarkEnd w:id="59"/>
+    <w:bookmarkStart w:id="60" w:name="среднее-улучшение-по-примерам"/>
     <w:p>
       <w:pPr>
         <w:pStyle w:val="Heading3"/>
@@ -4355,14 +4316,56 @@
         <w:t xml:space="preserve">Среднее снижение ошибки полезно как количественное резюме, но его недостаточно для окончательной оценки качества. Поэтому оно рассматривается вместе с распределением улучшенных, неизменённых и ухудшенных примеров и качественным анализом лучших и худших случаев.</w:t>
       </w:r>
     </w:p>
+    <w:bookmarkEnd w:id="60"/>
+    <w:bookmarkStart w:id="61" w:name="интерпретация-результатов"/>
+    <w:p>
+      <w:pPr>
+        <w:pStyle w:val="Heading3"/>
+      </w:pPr>
+      <w:r>
+        <w:t xml:space="preserve">5.10 Интерпретация результатов</w:t>
+      </w:r>
+    </w:p>
+    <w:p>
+      <w:pPr>
+        <w:pStyle w:val="FirstParagraph"/>
+      </w:pPr>
+      <w:r>
+        <w:t xml:space="preserve">Полученные результаты дают три основных вывода. Первый вывод — отрицательный, но методологически важный: нормализатор на правилах ухудшает качество относительно метода без исправления. Это означает, что для исторического арабографичного тюркского текста простая символьная нормализация не является заведомо безопасной предобработкой.</w:t>
+      </w:r>
+    </w:p>
+    <w:p>
+      <w:pPr>
+        <w:pStyle w:val="BodyText"/>
+      </w:pPr>
+      <w:r>
+        <w:t xml:space="preserve">Второй вывод — положительный: ByT5-small 512 улучшает качество относительно метода без исправления и показывает лучший результат среди четырёх рассмотренных методов. Улучшение по CER умеренное, но улучшение по WER заметное, а анализ отдельных примеров показывает, что модель улучшает большинство тестовых строк. При этом сильное снижение WER требует осторожной интерпретации, поскольку часть эффекта может быть связана с исправлением синтетических ошибок пробелов и границ слов. Следовательно, подход на основе модели с байтовым представлением и преобразованием последовательностей является работоспособным направлением для пилотной посткоррекции, но не финальным доказательством качества на реальном OCR/HTR-выводе.</w:t>
+      </w:r>
+    </w:p>
+    <w:p>
+      <w:pPr>
+        <w:pStyle w:val="BodyText"/>
+      </w:pPr>
+      <w:r>
+        <w:t xml:space="preserve">Третий вывод касается настройки модели: максимальная длина последовательности является важным параметром для обработки арабографичного текста моделью с байтовым представлением. Конфигурация 512 в текущем эксперименте выглядит более устойчивой, чем более короткая конфигурация, но этот результат следует считать практическим сигналом, а не универсальным правилом.</w:t>
+      </w:r>
+    </w:p>
+    <w:p>
+      <w:pPr>
+        <w:pStyle w:val="BodyText"/>
+      </w:pPr>
+      <w:r>
+        <w:t xml:space="preserve">Наконец, низкий ExactMatch не противоречит положительным результатам по CER и WER. Для длинных исторических строк полное совпадение слишком строго: одна небольшая ошибка уже делает строку несовпадающей. Поэтому основные выводы в работе опираются на CER, WER и анализ улучшенных, неизменённых и ухудшенных примеров.</w:t>
+      </w:r>
+    </w:p>
     <w:bookmarkEnd w:id="61"/>
-    <w:bookmarkStart w:id="62" w:name="интерпретация-результатов"/>
+    <w:bookmarkStart w:id="62" w:name="ограничения-интерпретации"/>
     <w:p>
       <w:pPr>
         <w:pStyle w:val="Heading3"/>
       </w:pPr>
       <w:r>
-        <w:t xml:space="preserve">5.10 Интерпретация результатов</w:t>
+        <w:t xml:space="preserve">5.11 Ограничения интерпретации</w:t>
       </w:r>
     </w:p>
     <w:p>
@@ -4370,69 +4373,27 @@
         <w:pStyle w:val="FirstParagraph"/>
       </w:pPr>
       <w:r>
-        <w:t xml:space="preserve">Полученные результаты дают три основных вывода. Первый вывод — отрицательный, но методологически важный: нормализатор на правилах ухудшает качество относительно метода без исправления. Это означает, что для исторического арабографичного тюркского текста простая символьная нормализация не является заведомо безопасной предобработкой.</w:t>
-      </w:r>
-    </w:p>
-    <w:p>
-      <w:pPr>
-        <w:pStyle w:val="BodyText"/>
-      </w:pPr>
-      <w:r>
-        <w:t xml:space="preserve">Второй вывод — положительный: ByT5-small 512 улучшает качество относительно метода без исправления и показывает лучший результат среди четырёх рассмотренных методов. Улучшение по CER умеренное, но улучшение по WER заметное, а анализ отдельных примеров показывает, что модель улучшает большинство тестовых строк. При этом сильное снижение WER требует осторожной интерпретации, поскольку часть эффекта может быть связана с исправлением синтетических ошибок пробелов и границ слов. Следовательно, подход на основе модели с байтовым представлением и преобразованием последовательностей является работоспособным направлением для пилотной посткоррекции, но не финальным доказательством качества на реальном OCR/HTR-выводе.</w:t>
-      </w:r>
-    </w:p>
-    <w:p>
-      <w:pPr>
-        <w:pStyle w:val="BodyText"/>
-      </w:pPr>
-      <w:r>
-        <w:t xml:space="preserve">Третий вывод касается настройки модели: максимальная длина последовательности является важным параметром для обработки арабографичного текста моделью с байтовым представлением. Конфигурация 512 в текущем эксперименте выглядит более устойчивой, чем более короткая конфигурация, но этот результат следует считать практическим сигналом, а не универсальным правилом.</w:t>
-      </w:r>
-    </w:p>
-    <w:p>
-      <w:pPr>
-        <w:pStyle w:val="BodyText"/>
-      </w:pPr>
-      <w:r>
-        <w:t xml:space="preserve">Наконец, низкий ExactMatch не противоречит положительным результатам по CER и WER. Для длинных исторических строк полное совпадение слишком строго: одна небольшая ошибка уже делает строку несовпадающей. Поэтому основные выводы в работе опираются на CER, WER и анализ улучшенных, неизменённых и ухудшенных примеров.</w:t>
+        <w:t xml:space="preserve">Результаты раздела 5 следует понимать как пилотные. Они показывают, что выбранный экспериментальный контур работает на текущем корпусе и синтетическом шуме, но не доказывают качество модели на реальных OCR/HTR-выходах.</w:t>
+      </w:r>
+    </w:p>
+    <w:p>
+      <w:pPr>
+        <w:pStyle w:val="BodyText"/>
+      </w:pPr>
+      <w:r>
+        <w:t xml:space="preserve">Главные ограничения интерпретации связаны с данными: корпус мал, основан на одном источнике, а ошибки сгенерированы искусственно. Поэтому значения CER и WER нельзя напрямую переносить на другие жанры, периоды, шрифты, сканы или OCR-системы без дополнительной проверки.</w:t>
+      </w:r>
+    </w:p>
+    <w:p>
+      <w:pPr>
+        <w:pStyle w:val="BodyText"/>
+      </w:pPr>
+      <w:r>
+        <w:t xml:space="preserve">Отдельное ограничение связано с метриками. CER и WER измеряют формальную близость к эталону, но не полностью отражают историко-лингвистическую допустимость исправления. Для дальнейшей работы нужна вручную проверенная подвыборка, где ошибки модели будут оцениваться не только автоматически, но и экспертно.</w:t>
       </w:r>
     </w:p>
     <w:bookmarkEnd w:id="62"/>
-    <w:bookmarkStart w:id="63" w:name="ограничения-интерпретации"/>
-    <w:p>
-      <w:pPr>
-        <w:pStyle w:val="Heading3"/>
-      </w:pPr>
-      <w:r>
-        <w:t xml:space="preserve">5.11 Ограничения интерпретации</w:t>
-      </w:r>
-    </w:p>
-    <w:p>
-      <w:pPr>
-        <w:pStyle w:val="FirstParagraph"/>
-      </w:pPr>
-      <w:r>
-        <w:t xml:space="preserve">Результаты раздела 5 следует понимать как пилотные. Они показывают, что выбранный экспериментальный контур работает на текущем корпусе и синтетическом шуме, но не доказывают качество модели на реальных OCR/HTR-выходах.</w:t>
-      </w:r>
-    </w:p>
-    <w:p>
-      <w:pPr>
-        <w:pStyle w:val="BodyText"/>
-      </w:pPr>
-      <w:r>
-        <w:t xml:space="preserve">Главные ограничения интерпретации связаны с данными: корпус мал, основан на одном источнике, а ошибки сгенерированы искусственно. Поэтому значения CER и WER нельзя напрямую переносить на другие жанры, периоды, шрифты, сканы или OCR-системы без дополнительной проверки.</w:t>
-      </w:r>
-    </w:p>
-    <w:p>
-      <w:pPr>
-        <w:pStyle w:val="BodyText"/>
-      </w:pPr>
-      <w:r>
-        <w:t xml:space="preserve">Отдельное ограничение связано с метриками. CER и WER измеряют формальную близость к эталону, но не полностью отражают историко-лингвистическую допустимость исправления. Для дальнейшей работы нужна вручную проверенная подвыборка, где ошибки модели будут оцениваться не только автоматически, но и экспертно.</w:t>
-      </w:r>
-    </w:p>
-    <w:bookmarkEnd w:id="63"/>
-    <w:bookmarkStart w:id="64" w:name="X9ae740f4b068656258209a4fa61338553b28ec2"/>
+    <w:bookmarkStart w:id="63" w:name="X9ae740f4b068656258209a4fa61338553b28ec2"/>
     <w:p>
       <w:pPr>
         <w:pStyle w:val="Heading3"/>
@@ -4509,21 +4470,41 @@
         <w:t xml:space="preserve">ByT5-small со строгой фильтрацией, где предсказание отбрасывается, если оно слишком сильно меняет длину или слишком далеко уходит от исходного OCR.</w:t>
       </w:r>
     </w:p>
+    <w:p>
+      <w:pPr>
+        <w:pStyle w:val="FirstParagraph"/>
+      </w:pPr>
+      <w:r>
+        <w:t xml:space="preserve">Основные символные метрики проверки на реальном OCR представлены ниже. Для компактности</w:t>
+      </w:r>
+      <w:r>
+        <w:t xml:space="preserve"> </w:t>
+      </w:r>
+      <w:r>
+        <w:rPr>
+          <w:rStyle w:val="VerbatimChar"/>
+        </w:rPr>
+        <w:t xml:space="preserve">NS-CER</w:t>
+      </w:r>
+      <w:r>
+        <w:t xml:space="preserve"> </w:t>
+      </w:r>
+      <w:r>
+        <w:t xml:space="preserve">обозначает NoSpaceCER.</w:t>
+      </w:r>
+    </w:p>
     <w:tbl>
       <w:tblPr>
         <w:tblStyle w:val="Table"/>
-        <w:tblW w:type="pct" w:w="5000"/>
-        <w:tblLayout w:type="fixed"/>
+        <w:tblW w:type="auto" w:w="0"/>
         <w:tblLook w:firstRow="1" w:lastRow="0" w:firstColumn="0" w:lastColumn="0" w:noHBand="0" w:noVBand="0" w:val="0020"/>
       </w:tblPr>
       <w:tblGrid>
-        <w:gridCol w:w="880"/>
-        <w:gridCol w:w="1173"/>
-        <w:gridCol w:w="1173"/>
-        <w:gridCol w:w="1173"/>
-        <w:gridCol w:w="1173"/>
-        <w:gridCol w:w="1173"/>
-        <w:gridCol w:w="1173"/>
+        <w:gridCol w:w="1584"/>
+        <w:gridCol w:w="1584"/>
+        <w:gridCol w:w="1584"/>
+        <w:gridCol w:w="1584"/>
+        <w:gridCol w:w="1584"/>
       </w:tblGrid>
       <w:tr>
         <w:trPr>
@@ -4548,67 +4529,43 @@
               <w:jc w:val="right"/>
             </w:pPr>
             <w:r>
-              <w:t xml:space="preserve">Страниц</w:t>
-            </w:r>
-          </w:p>
-        </w:tc>
-        <w:tc>
-          <w:tcPr/>
-          <w:p>
-            <w:pPr>
-              <w:pStyle w:val="Compact"/>
-              <w:jc w:val="right"/>
-            </w:pPr>
-            <w:r>
-              <w:t xml:space="preserve">Средний CER</w:t>
-            </w:r>
-          </w:p>
-        </w:tc>
-        <w:tc>
-          <w:tcPr/>
-          <w:p>
-            <w:pPr>
-              <w:pStyle w:val="Compact"/>
-              <w:jc w:val="right"/>
-            </w:pPr>
-            <w:r>
-              <w:t xml:space="preserve">Медианный CER</w:t>
-            </w:r>
-          </w:p>
-        </w:tc>
-        <w:tc>
-          <w:tcPr/>
-          <w:p>
-            <w:pPr>
-              <w:pStyle w:val="Compact"/>
-              <w:jc w:val="right"/>
-            </w:pPr>
-            <w:r>
-              <w:t xml:space="preserve">Средний WER</w:t>
-            </w:r>
-          </w:p>
-        </w:tc>
-        <w:tc>
-          <w:tcPr/>
-          <w:p>
-            <w:pPr>
-              <w:pStyle w:val="Compact"/>
-              <w:jc w:val="right"/>
-            </w:pPr>
-            <w:r>
-              <w:t xml:space="preserve">Медианный WER</w:t>
-            </w:r>
-          </w:p>
-        </w:tc>
-        <w:tc>
-          <w:tcPr/>
-          <w:p>
-            <w:pPr>
-              <w:pStyle w:val="Compact"/>
-              <w:jc w:val="right"/>
-            </w:pPr>
-            <w:r>
-              <w:t xml:space="preserve">Средний NoSpaceCER</w:t>
+              <w:t xml:space="preserve">Стр.</w:t>
+            </w:r>
+          </w:p>
+        </w:tc>
+        <w:tc>
+          <w:tcPr/>
+          <w:p>
+            <w:pPr>
+              <w:pStyle w:val="Compact"/>
+              <w:jc w:val="right"/>
+            </w:pPr>
+            <w:r>
+              <w:t xml:space="preserve">CER ср.</w:t>
+            </w:r>
+          </w:p>
+        </w:tc>
+        <w:tc>
+          <w:tcPr/>
+          <w:p>
+            <w:pPr>
+              <w:pStyle w:val="Compact"/>
+              <w:jc w:val="right"/>
+            </w:pPr>
+            <w:r>
+              <w:t xml:space="preserve">CER мед.</w:t>
+            </w:r>
+          </w:p>
+        </w:tc>
+        <w:tc>
+          <w:tcPr/>
+          <w:p>
+            <w:pPr>
+              <w:pStyle w:val="Compact"/>
+              <w:jc w:val="right"/>
+            </w:pPr>
+            <w:r>
+              <w:t xml:space="preserve">NS-CER</w:t>
             </w:r>
           </w:p>
         </w:tc>
@@ -4621,7 +4578,7 @@
               <w:pStyle w:val="Compact"/>
             </w:pPr>
             <w:r>
-              <w:t xml:space="preserve">исходный Tesseract</w:t>
+              <w:t xml:space="preserve">Tesseract</w:t>
             </w:r>
           </w:p>
         </w:tc>
@@ -4658,30 +4615,6 @@
             </w:pPr>
             <w:r>
               <w:t xml:space="preserve">0.2983</w:t>
-            </w:r>
-          </w:p>
-        </w:tc>
-        <w:tc>
-          <w:tcPr/>
-          <w:p>
-            <w:pPr>
-              <w:pStyle w:val="Compact"/>
-              <w:jc w:val="right"/>
-            </w:pPr>
-            <w:r>
-              <w:t xml:space="preserve">0.9238</w:t>
-            </w:r>
-          </w:p>
-        </w:tc>
-        <w:tc>
-          <w:tcPr/>
-          <w:p>
-            <w:pPr>
-              <w:pStyle w:val="Compact"/>
-              <w:jc w:val="right"/>
-            </w:pPr>
-            <w:r>
-              <w:t xml:space="preserve">0.8943</w:t>
             </w:r>
           </w:p>
         </w:tc>
@@ -4706,7 +4639,7 @@
               <w:pStyle w:val="Compact"/>
             </w:pPr>
             <w:r>
-              <w:t xml:space="preserve">ByT5 с разбиением на фрагменты</w:t>
+              <w:t xml:space="preserve">ByT5-frag</w:t>
             </w:r>
           </w:p>
         </w:tc>
@@ -4743,30 +4676,6 @@
             </w:pPr>
             <w:r>
               <w:t xml:space="preserve">0.4206</w:t>
-            </w:r>
-          </w:p>
-        </w:tc>
-        <w:tc>
-          <w:tcPr/>
-          <w:p>
-            <w:pPr>
-              <w:pStyle w:val="Compact"/>
-              <w:jc w:val="right"/>
-            </w:pPr>
-            <w:r>
-              <w:t xml:space="preserve">0.8919</w:t>
-            </w:r>
-          </w:p>
-        </w:tc>
-        <w:tc>
-          <w:tcPr/>
-          <w:p>
-            <w:pPr>
-              <w:pStyle w:val="Compact"/>
-              <w:jc w:val="right"/>
-            </w:pPr>
-            <w:r>
-              <w:t xml:space="preserve">0.8579</w:t>
             </w:r>
           </w:p>
         </w:tc>
@@ -4791,7 +4700,7 @@
               <w:pStyle w:val="Compact"/>
             </w:pPr>
             <w:r>
-              <w:t xml:space="preserve">ByT5 со строгой фильтрацией</w:t>
+              <w:t xml:space="preserve">ByT5-filter</w:t>
             </w:r>
           </w:p>
         </w:tc>
@@ -4839,6 +4748,165 @@
               <w:jc w:val="right"/>
             </w:pPr>
             <w:r>
+              <w:t xml:space="preserve">0.3830</w:t>
+            </w:r>
+          </w:p>
+        </w:tc>
+      </w:tr>
+    </w:tbl>
+    <w:p>
+      <w:pPr>
+        <w:pStyle w:val="BodyText"/>
+      </w:pPr>
+      <w:r>
+        <w:t xml:space="preserve">Метрики на уровне слов приведены отдельно, чтобы не перегружать таблицу.</w:t>
+      </w:r>
+    </w:p>
+    <w:tbl>
+      <w:tblPr>
+        <w:tblStyle w:val="Table"/>
+        <w:tblW w:type="auto" w:w="0"/>
+        <w:tblLook w:firstRow="1" w:lastRow="0" w:firstColumn="0" w:lastColumn="0" w:noHBand="0" w:noVBand="0" w:val="0020"/>
+      </w:tblPr>
+      <w:tblGrid>
+        <w:gridCol w:w="2640"/>
+        <w:gridCol w:w="2640"/>
+        <w:gridCol w:w="2640"/>
+      </w:tblGrid>
+      <w:tr>
+        <w:trPr>
+          <w:tblHeader w:val="on"/>
+        </w:trPr>
+        <w:tc>
+          <w:tcPr/>
+          <w:p>
+            <w:pPr>
+              <w:pStyle w:val="Compact"/>
+            </w:pPr>
+            <w:r>
+              <w:t xml:space="preserve">Система</w:t>
+            </w:r>
+          </w:p>
+        </w:tc>
+        <w:tc>
+          <w:tcPr/>
+          <w:p>
+            <w:pPr>
+              <w:pStyle w:val="Compact"/>
+              <w:jc w:val="right"/>
+            </w:pPr>
+            <w:r>
+              <w:t xml:space="preserve">WER ср.</w:t>
+            </w:r>
+          </w:p>
+        </w:tc>
+        <w:tc>
+          <w:tcPr/>
+          <w:p>
+            <w:pPr>
+              <w:pStyle w:val="Compact"/>
+              <w:jc w:val="right"/>
+            </w:pPr>
+            <w:r>
+              <w:t xml:space="preserve">WER мед.</w:t>
+            </w:r>
+          </w:p>
+        </w:tc>
+      </w:tr>
+      <w:tr>
+        <w:tc>
+          <w:tcPr/>
+          <w:p>
+            <w:pPr>
+              <w:pStyle w:val="Compact"/>
+            </w:pPr>
+            <w:r>
+              <w:t xml:space="preserve">Tesseract</w:t>
+            </w:r>
+          </w:p>
+        </w:tc>
+        <w:tc>
+          <w:tcPr/>
+          <w:p>
+            <w:pPr>
+              <w:pStyle w:val="Compact"/>
+              <w:jc w:val="right"/>
+            </w:pPr>
+            <w:r>
+              <w:t xml:space="preserve">0.9238</w:t>
+            </w:r>
+          </w:p>
+        </w:tc>
+        <w:tc>
+          <w:tcPr/>
+          <w:p>
+            <w:pPr>
+              <w:pStyle w:val="Compact"/>
+              <w:jc w:val="right"/>
+            </w:pPr>
+            <w:r>
+              <w:t xml:space="preserve">0.8943</w:t>
+            </w:r>
+          </w:p>
+        </w:tc>
+      </w:tr>
+      <w:tr>
+        <w:tc>
+          <w:tcPr/>
+          <w:p>
+            <w:pPr>
+              <w:pStyle w:val="Compact"/>
+            </w:pPr>
+            <w:r>
+              <w:t xml:space="preserve">ByT5-frag</w:t>
+            </w:r>
+          </w:p>
+        </w:tc>
+        <w:tc>
+          <w:tcPr/>
+          <w:p>
+            <w:pPr>
+              <w:pStyle w:val="Compact"/>
+              <w:jc w:val="right"/>
+            </w:pPr>
+            <w:r>
+              <w:t xml:space="preserve">0.8919</w:t>
+            </w:r>
+          </w:p>
+        </w:tc>
+        <w:tc>
+          <w:tcPr/>
+          <w:p>
+            <w:pPr>
+              <w:pStyle w:val="Compact"/>
+              <w:jc w:val="right"/>
+            </w:pPr>
+            <w:r>
+              <w:t xml:space="preserve">0.8579</w:t>
+            </w:r>
+          </w:p>
+        </w:tc>
+      </w:tr>
+      <w:tr>
+        <w:tc>
+          <w:tcPr/>
+          <w:p>
+            <w:pPr>
+              <w:pStyle w:val="Compact"/>
+            </w:pPr>
+            <w:r>
+              <w:t xml:space="preserve">ByT5-filter</w:t>
+            </w:r>
+          </w:p>
+        </w:tc>
+        <w:tc>
+          <w:tcPr/>
+          <w:p>
+            <w:pPr>
+              <w:pStyle w:val="Compact"/>
+              <w:jc w:val="right"/>
+            </w:pPr>
+            <w:r>
               <w:t xml:space="preserve">0.9039</w:t>
             </w:r>
           </w:p>
@@ -4852,18 +4920,6 @@
             </w:pPr>
             <w:r>
               <w:t xml:space="preserve">0.8605</w:t>
-            </w:r>
-          </w:p>
-        </w:tc>
-        <w:tc>
-          <w:tcPr/>
-          <w:p>
-            <w:pPr>
-              <w:pStyle w:val="Compact"/>
-              <w:jc w:val="right"/>
-            </w:pPr>
-            <w:r>
-              <w:t xml:space="preserve">0.3830</w:t>
             </w:r>
           </w:p>
         </w:tc>
@@ -4957,7 +5013,7 @@
               <w:pStyle w:val="Compact"/>
             </w:pPr>
             <w:r>
-              <w:t xml:space="preserve">ByT5 с разбиением на фрагменты</w:t>
+              <w:t xml:space="preserve">ByT5-frag</w:t>
             </w:r>
           </w:p>
         </w:tc>
@@ -5006,7 +5062,7 @@
               <w:pStyle w:val="Compact"/>
             </w:pPr>
             <w:r>
-              <w:t xml:space="preserve">ByT5 со строгой фильтрацией</w:t>
+              <w:t xml:space="preserve">ByT5-filter</w:t>
             </w:r>
           </w:p>
         </w:tc>
@@ -5064,8 +5120,8 @@
         <w:t xml:space="preserve">Главный вывод этой проверки: результат на синтетическом наборе не переносится напрямую на полноценный сценарий реального OCR. Модель выучила распределение искусственного шума, но настоящий Tesseract OCR для османско-турецкой арабской графики имеет другую структуру ошибок. Для следующего этапа нужны выровненные пары «OCR-вывод — эталон», постраничное разбиение без утечки, обучение на настоящих OCR-ошибках и более аккуратная проверка на страницах, не использованных при обучении.</w:t>
       </w:r>
     </w:p>
-    <w:bookmarkEnd w:id="64"/>
-    <w:bookmarkStart w:id="65" w:name="X7e9a333c0e348598314438ea8ff63960782a9d4"/>
+    <w:bookmarkEnd w:id="63"/>
+    <w:bookmarkStart w:id="64" w:name="X7e9a333c0e348598314438ea8ff63960782a9d4"/>
     <w:p>
       <w:pPr>
         <w:pStyle w:val="Heading3"/>
@@ -5661,8 +5717,8 @@
         <w:t xml:space="preserve">Эти примеры уточняют количественный вывод. На построчной подвыборке ByT5-small может немного улучшать CER и WER, но улучшение часто связано с локальными исправлениями, пробелами и частичными графемными заменами. При грубых ошибках Tesseract, пропусках больших фрагментов или нарушении порядка чтения модель либо почти ничего не исправляет, либо ухудшает строку. Поэтому следующий этап должен включать выровненные пары «OCR-вывод — эталон», ручную типологию ошибок и обучение на настоящем распределении OCR-ошибок.</w:t>
       </w:r>
     </w:p>
-    <w:bookmarkEnd w:id="65"/>
-    <w:bookmarkStart w:id="66" w:name="Xc49697dafbe0e7fd9f030ef296d0d6e7abcc8c1"/>
+    <w:bookmarkEnd w:id="64"/>
+    <w:bookmarkStart w:id="65" w:name="Xc49697dafbe0e7fd9f030ef296d0d6e7abcc8c1"/>
     <w:p>
       <w:pPr>
         <w:pStyle w:val="Heading3"/>
@@ -6079,14 +6135,58 @@
         <w:t xml:space="preserve">Эти случаи уточняют общий вывод постраничного эксперимента. Модель, обученная только на синтетическом шуме, иногда переносится на реальный OCR, но часто изменяет символный состав страницы в худшую сторону. Поэтому практическое продолжение работы должно опираться не только на синтетический генератор, а на выровненные пары «OCR-вывод — эталон» и обучение на настоящих ошибках OCR.</w:t>
       </w:r>
     </w:p>
+    <w:bookmarkEnd w:id="65"/>
+    <w:bookmarkStart w:id="66" w:name="выводы-по-разделу-2"/>
+    <w:p>
+      <w:pPr>
+        <w:pStyle w:val="Heading3"/>
+      </w:pPr>
+      <w:r>
+        <w:t xml:space="preserve">5.15 Выводы по разделу</w:t>
+      </w:r>
+    </w:p>
+    <w:p>
+      <w:pPr>
+        <w:pStyle w:val="FirstParagraph"/>
+      </w:pPr>
+      <w:r>
+        <w:t xml:space="preserve">Раздел результатов показывает две разные картины. В контролируемой синтетической постановке ByT5-small 512 превосходит метод без исправления, нормализатор на правилах и символьный метод на основе ошибок обучающей выборки. Она улучшает большинство тестовых примеров и особенно заметно снижает WER. Этот результат подтверждает, что нейросетевая посткоррекция с байтовым представлением подходит как рабочий пилотный подход для тюркского текста в арабской графике при заданном распределении шума.</w:t>
+      </w:r>
+    </w:p>
+    <w:p>
+      <w:pPr>
+        <w:pStyle w:val="BodyText"/>
+      </w:pPr>
+      <w:r>
+        <w:t xml:space="preserve">Но проверка на реальном OCR ограничивает этот вывод. На постраничном OCR османско-турецкого источника ByT5, обученная только на синтетических искажениях, уже не превосходит исходный Tesseract по CER. Напротив, без строгой фильтрации она ухудшает большинство страниц. Консервативный защитный откат снижает риск, но не даёт среднего выигрыша над исходным OCR.</w:t>
+      </w:r>
+    </w:p>
+    <w:p>
+      <w:pPr>
+        <w:pStyle w:val="BodyText"/>
+      </w:pPr>
+      <w:r>
+        <w:t xml:space="preserve">Итог раздела поэтому двойной. С одной стороны, экспериментальный контур, метрики и обучение модели работают в воспроизводимой синтетической среде. С другой стороны, практический переход к настоящим историческим сканам требует отдельной адаптации к реальным OCR-ошибкам. Это не косметическое улучшение будущей работы, а методологическое условие: без настоящих пар «OCR-вывод — эталон» нельзя честно утверждать, что модель решает реальную задачу посткоррекции.</w:t>
+      </w:r>
+    </w:p>
     <w:bookmarkEnd w:id="66"/>
-    <w:bookmarkStart w:id="67" w:name="выводы-по-разделу-2"/>
+    <w:bookmarkEnd w:id="67"/>
+    <w:bookmarkStart w:id="74" w:name="Xe8e02886c60b8939714d6e867e04f7997a20272"/>
+    <w:p>
+      <w:pPr>
+        <w:pStyle w:val="Heading2"/>
+      </w:pPr>
+      <w:r>
+        <w:t xml:space="preserve">6. Ограничения и направления дальнейшей работы</w:t>
+      </w:r>
+    </w:p>
+    <w:bookmarkStart w:id="68" w:name="ограничения-корпуса-1"/>
     <w:p>
       <w:pPr>
         <w:pStyle w:val="Heading3"/>
       </w:pPr>
       <w:r>
-        <w:t xml:space="preserve">5.15 Выводы по разделу</w:t>
+        <w:t xml:space="preserve">6.1 Ограничения корпуса</w:t>
       </w:r>
     </w:p>
     <w:p>
@@ -6094,43 +6194,204 @@
         <w:pStyle w:val="FirstParagraph"/>
       </w:pPr>
       <w:r>
-        <w:t xml:space="preserve">Раздел результатов показывает две разные картины. В контролируемой синтетической постановке ByT5-small 512 превосходит метод без исправления, нормализатор на правилах и символьный метод на основе ошибок обучающей выборки. Она улучшает большинство тестовых примеров и особенно заметно снижает WER. Этот результат подтверждает, что нейросетевая посткоррекция с байтовым представлением подходит как рабочий пилотный подход для тюркского текста в арабской графике при заданном распределении шума.</w:t>
-      </w:r>
-    </w:p>
-    <w:p>
-      <w:pPr>
-        <w:pStyle w:val="BodyText"/>
-      </w:pPr>
-      <w:r>
-        <w:t xml:space="preserve">Но проверка на реальном OCR ограничивает этот вывод. На постраничном OCR османско-турецкого источника ByT5, обученная только на синтетических искажениях, уже не превосходит исходный Tesseract по CER. Напротив, без строгой фильтрации она ухудшает большинство страниц. Консервативный защитный откат снижает риск, но не даёт среднего выигрыша над исходным OCR.</w:t>
-      </w:r>
-    </w:p>
-    <w:p>
-      <w:pPr>
-        <w:pStyle w:val="BodyText"/>
-      </w:pPr>
-      <w:r>
-        <w:t xml:space="preserve">Итог раздела поэтому двойной. С одной стороны, экспериментальный контур, метрики и обучение модели работают в воспроизводимой синтетической среде. С другой стороны, практический переход к настоящим историческим сканам требует отдельной адаптации к реальным OCR-ошибкам. Это не косметическое улучшение будущей работы, а методологическое условие: без настоящих пар «OCR-вывод — эталон» нельзя честно утверждать, что модель решает реальную задачу посткоррекции.</w:t>
-      </w:r>
-    </w:p>
-    <w:bookmarkEnd w:id="67"/>
+        <w:t xml:space="preserve">Главное ограничение корпуса — его масштаб и состав. В текущей версии используется небольшой набор эталонных текстовых блоков, полученный из одного основного арабографичного тюркского источника. Этого достаточно для проверки экспериментального контура и первичного сравнения базовых методов, но недостаточно для вывода о качестве метода на всём классе исторических тюркских текстов в арабской графике.</w:t>
+      </w:r>
+    </w:p>
+    <w:p>
+      <w:pPr>
+        <w:pStyle w:val="BodyText"/>
+      </w:pPr>
+      <w:r>
+        <w:t xml:space="preserve">Один источник ограничивает жанровое, временное и орфографическое разнообразие материала. Тексты разных регионов и периодов могут отличаться по графике, лексике, нормам записи, качеству печати и состоянию сканов. Поэтому текущий корпус нужно рассматривать как пилотный набор данных, а не как представительный корпус для всей письменной традиции.</w:t>
+      </w:r>
+    </w:p>
+    <w:p>
+      <w:pPr>
+        <w:pStyle w:val="BodyText"/>
+      </w:pPr>
+      <w:r>
+        <w:t xml:space="preserve">Отдельное ограничение связано с тем, что старотатарские и старобашкирские материалы пока остаются мотивацией и будущей целью, а не основным реальным набором оценки. Текущая первичная проверка на реальном OCR построена на османско-турецком печатном источнике: он подходит как связанный арабографичный тюркский проверочный материал, но не заменяет проверку на целевых татарских и башкирских источниках.</w:t>
+      </w:r>
+    </w:p>
     <w:bookmarkEnd w:id="68"/>
-    <w:bookmarkStart w:id="75" w:name="Xe8e02886c60b8939714d6e867e04f7997a20272"/>
+    <w:bookmarkStart w:id="69" w:name="ограничения-синтетического-шума-1"/>
+    <w:p>
+      <w:pPr>
+        <w:pStyle w:val="Heading3"/>
+      </w:pPr>
+      <w:r>
+        <w:t xml:space="preserve">6.2 Ограничения синтетического шума</w:t>
+      </w:r>
+    </w:p>
+    <w:p>
+      <w:pPr>
+        <w:pStyle w:val="FirstParagraph"/>
+      </w:pPr>
+      <w:r>
+        <w:t xml:space="preserve">В синтетическом наборе эталонные строки искажаются контролируемым генератором ошибок. Такая постановка удобна для первого эксперимента: известен эталонный текст, можно воспроизвести разбиение на обучающую, валидационную и тестовую выборки и сравнить методы по одинаковым метрикам. Но синтетические ошибки остаются приближением, а не настоящим OCR-выводом.</w:t>
+      </w:r>
+    </w:p>
+    <w:p>
+      <w:pPr>
+        <w:pStyle w:val="BodyText"/>
+      </w:pPr>
+      <w:r>
+        <w:t xml:space="preserve">Реальные OCR-ошибки зависят от качества изображения, шрифта, сегментации страницы, направления письма, настроек OCR-системы и состояния документа. Постраничная проверка на османско-турецком источнике показала это напрямую: модель, обученная только на синтетическом шуме, улучшает синтетический набор, но не переносится надёжно на исходный OCR Tesseract. Она немного снижает WER, но ухудшает CER и NoSpaceCER относительно исходного OCR-вывода.</w:t>
+      </w:r>
+    </w:p>
+    <w:p>
+      <w:pPr>
+        <w:pStyle w:val="BodyText"/>
+      </w:pPr>
+      <w:r>
+        <w:t xml:space="preserve">Поэтому дальнейшая работа не должна ограничиваться усложнением синтетического генератора. Более важный следующий шаг — построить набор данных, учитывающий реальные OCR-ошибки: выровненные пары «OCR-вывод — эталонный текст» на уровне строк или коротких фрагментов. Уже после этого можно делать более реалистичную генерацию ошибок, основанную на настоящих символьных путаницах и артефактах разметки страницы.</w:t>
+      </w:r>
+    </w:p>
+    <w:bookmarkEnd w:id="69"/>
+    <w:bookmarkStart w:id="70" w:name="ограничения-автоматических-метрик"/>
+    <w:p>
+      <w:pPr>
+        <w:pStyle w:val="Heading3"/>
+      </w:pPr>
+      <w:r>
+        <w:t xml:space="preserve">6.3 Ограничения автоматических метрик</w:t>
+      </w:r>
+    </w:p>
+    <w:p>
+      <w:pPr>
+        <w:pStyle w:val="FirstParagraph"/>
+      </w:pPr>
+      <w:r>
+        <w:t xml:space="preserve">CER, WER, NoSpaceCER и ExactMatch позволяют формально сравнивать методы, но не полностью описывают качество исправления исторического текста. Для исторических арабографичных материалов важно не только совпадение с эталоном, но и сохранение значимых орфографических вариантов. Механическое уменьшение расстояния редактирования не всегда означает филологически корректное исправление.</w:t>
+      </w:r>
+    </w:p>
+    <w:p>
+      <w:pPr>
+        <w:pStyle w:val="BodyText"/>
+      </w:pPr>
+      <w:r>
+        <w:t xml:space="preserve">Особенно осторожно нужно интерпретировать WER. В синтетическом наборе заметная часть выигрыша связана с исправлением пробелов и границ слов. Это полезно для поиска и последующей обработки, но не доказывает, что модель лучше распознаёт графемы. Поэтому в работе отдельно используется NoSpaceCER: он снижает влияние пробелов и помогает увидеть, насколько модель улучшает именно символный состав текста.</w:t>
+      </w:r>
+    </w:p>
+    <w:p>
+      <w:pPr>
+        <w:pStyle w:val="BodyText"/>
+      </w:pPr>
+      <w:r>
+        <w:t xml:space="preserve">Для следующей версии набора нужна ручная экспертная проверка 100–200 строк. В такой подвыборке следует фиксировать не только «правильно/неправильно», но и тип ошибки: замену графемы, ошибку пробела, пропуск, лишнюю вставку, нормализацию исторического написания, галлюцинацию или порождение лишнего фрагмента. Это позволит связать количественные метрики с реальным качеством текста.</w:t>
+      </w:r>
+    </w:p>
+    <w:bookmarkEnd w:id="70"/>
+    <w:bookmarkStart w:id="71" w:name="Xdbeb570ee9aa1ab71e3ffd0cfbeadb9f44e192a"/>
+    <w:p>
+      <w:pPr>
+        <w:pStyle w:val="Heading3"/>
+      </w:pPr>
+      <w:r>
+        <w:t xml:space="preserve">6.4 Расширение корпуса и проверка на реальном OCR</w:t>
+      </w:r>
+    </w:p>
+    <w:p>
+      <w:pPr>
+        <w:pStyle w:val="FirstParagraph"/>
+      </w:pPr>
+      <w:r>
+        <w:t xml:space="preserve">Первое направление дальнейшей работы — расширение данных. Для будущей магистерской версии проекта нужно добавить несколько источников разных типов: османско-турецкие печатные тексты, старотатарские и старобашкирские материалы, а также, по возможности, страницы с разным качеством скана и разной типографикой.</w:t>
+      </w:r>
+    </w:p>
+    <w:p>
+      <w:pPr>
+        <w:pStyle w:val="BodyText"/>
+      </w:pPr>
+      <w:r>
+        <w:t xml:space="preserve">Ключевое изменение должно состоять в переходе от эталонных текстовых блоков к связке «изображение — OCR/HTR-вывод — эталонный текст». Текущая постраничная проверка на реальном OCR полезна как первичная проверка, но она слишком груба для обучения модели. Нужны выровненные строки или короткие фрагменты, чтобы модель видела реальные ошибки OCR, а не только искусственно сгенерированные искажения.</w:t>
+      </w:r>
+    </w:p>
+    <w:p>
+      <w:pPr>
+        <w:pStyle w:val="BodyText"/>
+      </w:pPr>
+      <w:r>
+        <w:t xml:space="preserve">Разбиение данных должно выполняться по страницам или источникам, а не случайно по строкам. Это важно для предотвращения утечки: строки с одной и той же страницы или близкого контекста не должны одновременно попадать в обучающую и тестовую выборки. Для маленьких исторических корпусов такая утечка может сильно завышать качество модели.</w:t>
+      </w:r>
+    </w:p>
+    <w:bookmarkEnd w:id="71"/>
+    <w:bookmarkStart w:id="72" w:name="развитие-модельной-части"/>
+    <w:p>
+      <w:pPr>
+        <w:pStyle w:val="Heading3"/>
+      </w:pPr>
+      <w:r>
+        <w:t xml:space="preserve">6.5 Развитие модельной части</w:t>
+      </w:r>
+    </w:p>
+    <w:p>
+      <w:pPr>
+        <w:pStyle w:val="FirstParagraph"/>
+      </w:pPr>
+      <w:r>
+        <w:t xml:space="preserve">В текущей работе ByT5-small используется как основной нейросетевой базовый метод, а не как финальное решение. Для следующего этапа нужно сравнить несколько направлений: более крупные варианты ByT5, специализированные модели посткоррекции OCR, посимвольные модели преобразования последовательностей и методы с консервативным защитным откатом.</w:t>
+      </w:r>
+    </w:p>
+    <w:p>
+      <w:pPr>
+        <w:pStyle w:val="BodyText"/>
+      </w:pPr>
+      <w:r>
+        <w:t xml:space="preserve">Результат на реальном OCR показывает, что модель должна не только уметь исправлять ошибки, но и понимать, когда лучше оставить исходный OCR без изменений. Поэтому важна отдельная логика уверенности и защитного отката: например, порог по расстоянию редактирования, оценке языковой модели, изменению длины, доле новых символов или согласованию со статистикой символьных путаниц, извлечённой из обучающей выборки.</w:t>
+      </w:r>
+    </w:p>
+    <w:p>
+      <w:pPr>
+        <w:pStyle w:val="BodyText"/>
+      </w:pPr>
+      <w:r>
+        <w:t xml:space="preserve">Посткоррекцию на основе больших языковых моделей также стоит проверять, но не как простую «волшебную» замену. Современные работы по исправлению OCR исторических документов показывают, что большие языковые модели могут давать полезные исправления, но эффект зависит от языка, корпуса, постановки запроса и процедуры валидации. Для исторического материала особенно опасны гладкие, но неверные исправления: текст может выглядеть правдоподобно, но отходить от источника.</w:t>
+      </w:r>
+    </w:p>
+    <w:bookmarkEnd w:id="72"/>
+    <w:bookmarkStart w:id="73" w:name="Xd2b3f4092cbe1759952889362a88c4fd5e58c1d"/>
+    <w:p>
+      <w:pPr>
+        <w:pStyle w:val="Heading3"/>
+      </w:pPr>
+      <w:r>
+        <w:t xml:space="preserve">6.6 Переход к системе анализа исторических текстов</w:t>
+      </w:r>
+    </w:p>
+    <w:p>
+      <w:pPr>
+        <w:pStyle w:val="FirstParagraph"/>
+      </w:pPr>
+      <w:r>
+        <w:t xml:space="preserve">Посткоррекция является промежуточным этапом. После получения более надёжного OCR/HTR-вывода можно переходить к задачам поиска, нормализации вариантов написания, извлечения именованных сущностей, сопоставления исторических записей и построения графов связей.</w:t>
+      </w:r>
+    </w:p>
+    <w:p>
+      <w:pPr>
+        <w:pStyle w:val="BodyText"/>
+      </w:pPr>
+      <w:r>
+        <w:t xml:space="preserve">В контексте будущей магистерской работы этот пилот может стать техническим основанием для более широкой системы анализа арабографичных тюркских источников. Такая система может включать выделение строк на изображении, OCR/HTR, посткоррекцию, извлечение именованных сущностей, сопоставление записей, извлечение дат и топонимов, а также построение связей между людьми, местами и документами.</w:t>
+      </w:r>
+    </w:p>
+    <w:p>
+      <w:pPr>
+        <w:pStyle w:val="BodyText"/>
+      </w:pPr>
+      <w:r>
+        <w:t xml:space="preserve">Практическая ценность текущей работы состоит в том, что она заранее фиксирует слабое место будущей технологической цепочки. До построения NER или графа связей нужно понять, насколько можно доверять тексту после OCR. Если посткоррекция ухудшает часть страниц, последующие модели будут работать на искажённой основе. Поэтому проверка на реальном OCR должна быть не последним декоративным этапом, а центральной частью разработки.</w:t>
+      </w:r>
+    </w:p>
+    <w:bookmarkEnd w:id="73"/>
+    <w:bookmarkEnd w:id="74"/>
+    <w:bookmarkStart w:id="75" w:name="заключение"/>
     <w:p>
       <w:pPr>
         <w:pStyle w:val="Heading2"/>
       </w:pPr>
       <w:r>
-        <w:t xml:space="preserve">6. Ограничения и направления дальнейшей работы</w:t>
-      </w:r>
-    </w:p>
-    <w:bookmarkStart w:id="69" w:name="ограничения-корпуса-1"/>
-    <w:p>
-      <w:pPr>
-        <w:pStyle w:val="Heading3"/>
-      </w:pPr>
-      <w:r>
-        <w:t xml:space="preserve">6.1 Ограничения корпуса</w:t>
+        <w:t xml:space="preserve">7. Заключение</w:t>
       </w:r>
     </w:p>
     <w:p>
@@ -6138,262 +6399,57 @@
         <w:pStyle w:val="FirstParagraph"/>
       </w:pPr>
       <w:r>
-        <w:t xml:space="preserve">Главное ограничение корпуса — его масштаб и состав. В текущей версии используется небольшой набор эталонных текстовых блоков, полученный из одного основного арабографичного тюркского источника. Этого достаточно для проверки экспериментального контура и первичного сравнения базовых методов, но недостаточно для вывода о качестве метода на всём классе исторических тюркских текстов в арабской графике.</w:t>
-      </w:r>
-    </w:p>
-    <w:p>
-      <w:pPr>
-        <w:pStyle w:val="BodyText"/>
-      </w:pPr>
-      <w:r>
-        <w:t xml:space="preserve">Один источник ограничивает жанровое, временное и орфографическое разнообразие материала. Тексты разных регионов и периодов могут отличаться по графике, лексике, нормам записи, качеству печати и состоянию сканов. Поэтому текущий корпус нужно рассматривать как пилотный набор данных, а не как представительный корпус для всей письменной традиции.</w:t>
-      </w:r>
-    </w:p>
-    <w:p>
-      <w:pPr>
-        <w:pStyle w:val="BodyText"/>
-      </w:pPr>
-      <w:r>
-        <w:t xml:space="preserve">Отдельное ограничение связано с тем, что старотатарские и старобашкирские материалы пока остаются мотивацией и будущей целью, а не основным реальным набором оценки. Текущая первичная проверка на реальном OCR построена на османско-турецком печатном источнике: он подходит как связанный арабографичный тюркский проверочный материал, но не заменяет проверку на целевых татарских и башкирских источниках.</w:t>
-      </w:r>
-    </w:p>
-    <w:bookmarkEnd w:id="69"/>
-    <w:bookmarkStart w:id="70" w:name="ограничения-синтетического-шума-1"/>
-    <w:p>
-      <w:pPr>
-        <w:pStyle w:val="Heading3"/>
-      </w:pPr>
-      <w:r>
-        <w:t xml:space="preserve">6.2 Ограничения синтетического шума</w:t>
-      </w:r>
-    </w:p>
-    <w:p>
-      <w:pPr>
-        <w:pStyle w:val="FirstParagraph"/>
-      </w:pPr>
-      <w:r>
-        <w:t xml:space="preserve">В синтетическом наборе эталонные строки искажаются контролируемым генератором ошибок. Такая постановка удобна для первого эксперимента: известен эталонный текст, можно воспроизвести разбиение на обучающую, валидационную и тестовую выборки и сравнить методы по одинаковым метрикам. Но синтетические ошибки остаются приближением, а не настоящим OCR-выводом.</w:t>
-      </w:r>
-    </w:p>
-    <w:p>
-      <w:pPr>
-        <w:pStyle w:val="BodyText"/>
-      </w:pPr>
-      <w:r>
-        <w:t xml:space="preserve">Реальные OCR-ошибки зависят от качества изображения, шрифта, сегментации страницы, направления письма, настроек OCR-системы и состояния документа. Постраничная проверка на османско-турецком источнике показала это напрямую: модель, обученная только на синтетическом шуме, улучшает синтетический набор, но не переносится надёжно на исходный OCR Tesseract. Она немного снижает WER, но ухудшает CER и NoSpaceCER относительно исходного OCR-вывода.</w:t>
-      </w:r>
-    </w:p>
-    <w:p>
-      <w:pPr>
-        <w:pStyle w:val="BodyText"/>
-      </w:pPr>
-      <w:r>
-        <w:t xml:space="preserve">Поэтому дальнейшая работа не должна ограничиваться усложнением синтетического генератора. Более важный следующий шаг — построить набор данных, учитывающий реальные OCR-ошибки: выровненные пары «OCR-вывод — эталонный текст» на уровне строк или коротких фрагментов. Уже после этого можно делать более реалистичную генерацию ошибок, основанную на настоящих символьных путаницах и артефактах разметки страницы.</w:t>
-      </w:r>
-    </w:p>
-    <w:bookmarkEnd w:id="70"/>
-    <w:bookmarkStart w:id="71" w:name="ограничения-автоматических-метрик"/>
-    <w:p>
-      <w:pPr>
-        <w:pStyle w:val="Heading3"/>
-      </w:pPr>
-      <w:r>
-        <w:t xml:space="preserve">6.3 Ограничения автоматических метрик</w:t>
-      </w:r>
-    </w:p>
-    <w:p>
-      <w:pPr>
-        <w:pStyle w:val="FirstParagraph"/>
-      </w:pPr>
-      <w:r>
-        <w:t xml:space="preserve">CER, WER, NoSpaceCER и ExactMatch позволяют формально сравнивать методы, но не полностью описывают качество исправления исторического текста. Для исторических арабографичных материалов важно не только совпадение с эталоном, но и сохранение значимых орфографических вариантов. Механическое уменьшение расстояния редактирования не всегда означает филологически корректное исправление.</w:t>
-      </w:r>
-    </w:p>
-    <w:p>
-      <w:pPr>
-        <w:pStyle w:val="BodyText"/>
-      </w:pPr>
-      <w:r>
-        <w:t xml:space="preserve">Особенно осторожно нужно интерпретировать WER. В синтетическом наборе заметная часть выигрыша связана с исправлением пробелов и границ слов. Это полезно для поиска и последующей обработки, но не доказывает, что модель лучше распознаёт графемы. Поэтому в работе отдельно используется NoSpaceCER: он снижает влияние пробелов и помогает увидеть, насколько модель улучшает именно символный состав текста.</w:t>
-      </w:r>
-    </w:p>
-    <w:p>
-      <w:pPr>
-        <w:pStyle w:val="BodyText"/>
-      </w:pPr>
-      <w:r>
-        <w:t xml:space="preserve">Для следующей версии набора нужна ручная экспертная проверка 100–200 строк. В такой подвыборке следует фиксировать не только «правильно/неправильно», но и тип ошибки: замену графемы, ошибку пробела, пропуск, лишнюю вставку, нормализацию исторического написания, галлюцинацию или порождение лишнего фрагмента. Это позволит связать количественные метрики с реальным качеством текста.</w:t>
-      </w:r>
-    </w:p>
-    <w:bookmarkEnd w:id="71"/>
-    <w:bookmarkStart w:id="72" w:name="Xdbeb570ee9aa1ab71e3ffd0cfbeadb9f44e192a"/>
-    <w:p>
-      <w:pPr>
-        <w:pStyle w:val="Heading3"/>
-      </w:pPr>
-      <w:r>
-        <w:t xml:space="preserve">6.4 Расширение корпуса и проверка на реальном OCR</w:t>
-      </w:r>
-    </w:p>
-    <w:p>
-      <w:pPr>
-        <w:pStyle w:val="FirstParagraph"/>
-      </w:pPr>
-      <w:r>
-        <w:t xml:space="preserve">Первое направление дальнейшей работы — расширение данных. Для будущей магистерской версии проекта нужно добавить несколько источников разных типов: османско-турецкие печатные тексты, старотатарские и старобашкирские материалы, а также, по возможности, страницы с разным качеством скана и разной типографикой.</w:t>
-      </w:r>
-    </w:p>
-    <w:p>
-      <w:pPr>
-        <w:pStyle w:val="BodyText"/>
-      </w:pPr>
-      <w:r>
-        <w:t xml:space="preserve">Ключевое изменение должно состоять в переходе от эталонных текстовых блоков к связке «изображение — OCR/HTR-вывод — эталонный текст». Текущая постраничная проверка на реальном OCR полезна как первичная проверка, но она слишком груба для обучения модели. Нужны выровненные строки или короткие фрагменты, чтобы модель видела реальные ошибки OCR, а не только искусственно сгенерированные искажения.</w:t>
-      </w:r>
-    </w:p>
-    <w:p>
-      <w:pPr>
-        <w:pStyle w:val="BodyText"/>
-      </w:pPr>
-      <w:r>
-        <w:t xml:space="preserve">Разбиение данных должно выполняться по страницам или источникам, а не случайно по строкам. Это важно для предотвращения утечки: строки с одной и той же страницы или близкого контекста не должны одновременно попадать в обучающую и тестовую выборки. Для маленьких исторических корпусов такая утечка может сильно завышать качество модели.</w:t>
-      </w:r>
-    </w:p>
-    <w:bookmarkEnd w:id="72"/>
-    <w:bookmarkStart w:id="73" w:name="развитие-модельной-части"/>
-    <w:p>
-      <w:pPr>
-        <w:pStyle w:val="Heading3"/>
-      </w:pPr>
-      <w:r>
-        <w:t xml:space="preserve">6.5 Развитие модельной части</w:t>
-      </w:r>
-    </w:p>
-    <w:p>
-      <w:pPr>
-        <w:pStyle w:val="FirstParagraph"/>
-      </w:pPr>
-      <w:r>
-        <w:t xml:space="preserve">В текущей работе ByT5-small используется как основной нейросетевой базовый метод, а не как финальное решение. Для следующего этапа нужно сравнить несколько направлений: более крупные варианты ByT5, специализированные модели посткоррекции OCR, посимвольные модели преобразования последовательностей и методы с консервативным защитным откатом.</w:t>
-      </w:r>
-    </w:p>
-    <w:p>
-      <w:pPr>
-        <w:pStyle w:val="BodyText"/>
-      </w:pPr>
-      <w:r>
-        <w:t xml:space="preserve">Результат на реальном OCR показывает, что модель должна не только уметь исправлять ошибки, но и понимать, когда лучше оставить исходный OCR без изменений. Поэтому важна отдельная логика уверенности и защитного отката: например, порог по расстоянию редактирования, оценке языковой модели, изменению длины, доле новых символов или согласованию со статистикой символьных путаниц, извлечённой из обучающей выборки.</w:t>
-      </w:r>
-    </w:p>
-    <w:p>
-      <w:pPr>
-        <w:pStyle w:val="BodyText"/>
-      </w:pPr>
-      <w:r>
-        <w:t xml:space="preserve">Посткоррекцию на основе больших языковых моделей также стоит проверять, но не как простую «волшебную» замену. Современные работы по исправлению OCR исторических документов показывают, что большие языковые модели могут давать полезные исправления, но эффект зависит от языка, корпуса, постановки запроса и процедуры валидации. Для исторического материала особенно опасны гладкие, но неверные исправления: текст может выглядеть правдоподобно, но отходить от источника.</w:t>
-      </w:r>
-    </w:p>
-    <w:bookmarkEnd w:id="73"/>
-    <w:bookmarkStart w:id="74" w:name="Xd2b3f4092cbe1759952889362a88c4fd5e58c1d"/>
-    <w:p>
-      <w:pPr>
-        <w:pStyle w:val="Heading3"/>
-      </w:pPr>
-      <w:r>
-        <w:t xml:space="preserve">6.6 Переход к системе анализа исторических текстов</w:t>
-      </w:r>
-    </w:p>
-    <w:p>
-      <w:pPr>
-        <w:pStyle w:val="FirstParagraph"/>
-      </w:pPr>
-      <w:r>
-        <w:t xml:space="preserve">Посткоррекция является промежуточным этапом. После получения более надёжного OCR/HTR-вывода можно переходить к задачам поиска, нормализации вариантов написания, извлечения именованных сущностей, сопоставления исторических записей и построения графов связей.</w:t>
-      </w:r>
-    </w:p>
-    <w:p>
-      <w:pPr>
-        <w:pStyle w:val="BodyText"/>
-      </w:pPr>
-      <w:r>
-        <w:t xml:space="preserve">В контексте будущей магистерской работы этот пилот может стать техническим основанием для более широкой системы анализа арабографичных тюркских источников. Такая система может включать выделение строк на изображении, OCR/HTR, посткоррекцию, извлечение именованных сущностей, сопоставление записей, извлечение дат и топонимов, а также построение связей между людьми, местами и документами.</w:t>
-      </w:r>
-    </w:p>
-    <w:p>
-      <w:pPr>
-        <w:pStyle w:val="BodyText"/>
-      </w:pPr>
-      <w:r>
-        <w:t xml:space="preserve">Практическая ценность текущей работы состоит в том, что она заранее фиксирует слабое место будущей технологической цепочки. До построения NER или графа связей нужно понять, насколько можно доверять тексту после OCR. Если посткоррекция ухудшает часть страниц, последующие модели будут работать на искажённой основе. Поэтому проверка на реальном OCR должна быть не последним декоративным этапом, а центральной частью разработки.</w:t>
-      </w:r>
-    </w:p>
-    <w:bookmarkEnd w:id="74"/>
+        <w:t xml:space="preserve">В работе построен и проверен воспроизводимый пилотный контур посткоррекции OCR для исторических тюркских текстов в арабской графике. Экспериментальная постановка была сознательно ограничена: вместо полной OCR/HTR-системы рассматривался этап «искажённый или OCR-текст — эталонный текст». Это позволило отдельно проверить посткоррекцию как компонент будущей технологической цепочки.</w:t>
+      </w:r>
+    </w:p>
+    <w:p>
+      <w:pPr>
+        <w:pStyle w:val="BodyText"/>
+      </w:pPr>
+      <w:r>
+        <w:t xml:space="preserve">На синтетическом наборе модель ByT5-small с максимальной длиной 512 показала лучший результат среди рассмотренных методов. Она превзошла метод без исправления, нормализатор на правилах и символьный метод на основе ошибок обучающей выборки. При этом результат оказался неоднородным: WER снизился заметнее, чем CER, ExactMatch остался низким, а часть строк после посткоррекции ухудшилась. Поэтому синтетический набор подтвердил работоспособность подхода в контролируемой постановке, но не доказал готовность модели к автоматической правке реального OCR.</w:t>
+      </w:r>
+    </w:p>
+    <w:p>
+      <w:pPr>
+        <w:pStyle w:val="BodyText"/>
+      </w:pPr>
+      <w:r>
+        <w:t xml:space="preserve">Отдельно показано, что простая нормализация на правилах не является безопасной заменой нейросетевой посткоррекции. В проведённом эксперименте нормализатор ухудшил качество относительно метода без исправления. Это важный отрицательный результат: для исторической арабографичной письменности нельзя механически унифицировать символы и варианты написания без проверки влияния на эталонный текст.</w:t>
+      </w:r>
+    </w:p>
+    <w:p>
+      <w:pPr>
+        <w:pStyle w:val="BodyText"/>
+      </w:pPr>
+      <w:r>
+        <w:t xml:space="preserve">Главный итог работы связан с проверкой на реальном OCR. Постраничный набор на османско-турецком печатном источнике показал разрыв между синтетической и реальной оценкой: модель, обученная только на синтетических ошибках, немного снижает WER, но ухудшает CER и NoSpaceCER относительно исходного Tesseract. Вариант со строгой фильтрацией уменьшает число ухудшенных страниц и даёт больше улучшенных страниц, но всё равно не превосходит исходный OCR по среднему CER. Значит, отрицательный результат на реальном OCR является не провалом, а полезным исследовательским выводом: обучение только на синтетических ошибках недостаточно для практической посткоррекции исторических сканов.</w:t>
+      </w:r>
+    </w:p>
+    <w:p>
+      <w:pPr>
+        <w:pStyle w:val="BodyText"/>
+      </w:pPr>
+      <w:r>
+        <w:t xml:space="preserve">Полученный экспериментальный контур можно использовать как основу для следующего этапа. Ближайшее развитие должно включать проверенные пары «OCR-вывод — эталон», разбиение по страницам без утечки, обучение на настоящих OCR-ошибках и консервативную фильтрацию предсказаний. После этого посткоррекция сможет стать частью более широкой системы обработки исторических арабографичных тюркских источников: от OCR/HTR и исправления текста к поиску, извлечению именованных сущностей, сопоставлению записей и построению графов связей.</w:t>
+      </w:r>
+    </w:p>
+    <w:p>
+      <w:pPr>
+        <w:pStyle w:val="BodyText"/>
+      </w:pPr>
+      <w:r>
+        <w:t xml:space="preserve">Практический результат работы — не готовый корректор, а диагностический стенд: он показывает, где синтетическая проверка даёт положительный сигнал, а где реальный OCR ломает перенос. Следующий шаг — реальные пары «OCR-вывод — эталон», разбиение по страницам или источникам и обучение на настоящих ошибках распознавания. Для курсового проекта это достаточный и честный результат; для магистерской работы это отправная точка более крупного исследования.</w:t>
+      </w:r>
+    </w:p>
+    <w:p>
+      <w:r>
+        <w:br w:type="page"/>
+      </w:r>
+    </w:p>
     <w:bookmarkEnd w:id="75"/>
-    <w:bookmarkStart w:id="76" w:name="заключение"/>
-    <w:p>
-      <w:pPr>
-        <w:pStyle w:val="Heading2"/>
-      </w:pPr>
-      <w:r>
-        <w:t xml:space="preserve">7. Заключение</w:t>
-      </w:r>
-    </w:p>
-    <w:p>
-      <w:pPr>
-        <w:pStyle w:val="FirstParagraph"/>
-      </w:pPr>
-      <w:r>
-        <w:t xml:space="preserve">В работе построен и проверен воспроизводимый пилотный контур посткоррекции OCR для исторических тюркских текстов в арабской графике. Экспериментальная постановка была сознательно ограничена: вместо полной OCR/HTR-системы рассматривался этап «искажённый или OCR-текст — эталонный текст». Это позволило отдельно проверить посткоррекцию как компонент будущей технологической цепочки.</w:t>
-      </w:r>
-    </w:p>
-    <w:p>
-      <w:pPr>
-        <w:pStyle w:val="BodyText"/>
-      </w:pPr>
-      <w:r>
-        <w:t xml:space="preserve">На синтетическом наборе модель ByT5-small с максимальной длиной 512 показала лучший результат среди рассмотренных методов. Она превзошла метод без исправления, нормализатор на правилах и символьный метод на основе ошибок обучающей выборки. При этом результат оказался неоднородным: WER снизился заметнее, чем CER, ExactMatch остался низким, а часть строк после посткоррекции ухудшилась. Поэтому синтетический набор подтвердил работоспособность подхода в контролируемой постановке, но не доказал готовность модели к автоматической правке реального OCR.</w:t>
-      </w:r>
-    </w:p>
-    <w:p>
-      <w:pPr>
-        <w:pStyle w:val="BodyText"/>
-      </w:pPr>
-      <w:r>
-        <w:t xml:space="preserve">Отдельно показано, что простая нормализация на правилах не является безопасной заменой нейросетевой посткоррекции. В проведённом эксперименте нормализатор ухудшил качество относительно метода без исправления. Это важный отрицательный результат: для исторической арабографичной письменности нельзя механически унифицировать символы и варианты написания без проверки влияния на эталонный текст.</w:t>
-      </w:r>
-    </w:p>
-    <w:p>
-      <w:pPr>
-        <w:pStyle w:val="BodyText"/>
-      </w:pPr>
-      <w:r>
-        <w:t xml:space="preserve">Главный итог работы связан с проверкой на реальном OCR. Постраничный набор на османско-турецком печатном источнике показал разрыв между синтетической и реальной оценкой: модель, обученная только на синтетических ошибках, немного снижает WER, но ухудшает CER и NoSpaceCER относительно исходного Tesseract. Вариант со строгой фильтрацией уменьшает число ухудшенных страниц и даёт больше улучшенных страниц, но всё равно не превосходит исходный OCR по среднему CER. Значит, отрицательный результат на реальном OCR является не провалом, а полезным исследовательским выводом: обучение только на синтетических ошибках недостаточно для практической посткоррекции исторических сканов.</w:t>
-      </w:r>
-    </w:p>
-    <w:p>
-      <w:pPr>
-        <w:pStyle w:val="BodyText"/>
-      </w:pPr>
-      <w:r>
-        <w:t xml:space="preserve">Полученный экспериментальный контур можно использовать как основу для следующего этапа. Ближайшее развитие должно включать проверенные пары «OCR-вывод — эталон», разбиение по страницам без утечки, обучение на настоящих OCR-ошибках и консервативную фильтрацию предсказаний. После этого посткоррекция сможет стать частью более широкой системы обработки исторических арабографичных тюркских источников: от OCR/HTR и исправления текста к поиску, извлечению именованных сущностей, сопоставлению записей и построению графов связей.</w:t>
-      </w:r>
-    </w:p>
-    <w:p>
-      <w:pPr>
-        <w:pStyle w:val="BodyText"/>
-      </w:pPr>
-      <w:r>
-        <w:t xml:space="preserve">Практический результат работы — не готовый корректор, а диагностический стенд: он показывает, где синтетическая проверка даёт положительный сигнал, а где реальный OCR ломает перенос. Следующий шаг — реальные пары «OCR-вывод — эталон», разбиение по страницам или источникам и обучение на настоящих ошибках распознавания. Для курсового проекта это достаточный и честный результат; для магистерской работы это отправная точка более крупного исследования.</w:t>
-      </w:r>
-    </w:p>
-    <w:p>
-      <w:r>
-        <w:br w:type="page"/>
-      </w:r>
-    </w:p>
     <w:bookmarkEnd w:id="76"/>
-    <w:bookmarkEnd w:id="77"/>
-    <w:bookmarkStart w:id="78" w:name="список-литературы"/>
+    <w:bookmarkStart w:id="77" w:name="список-литературы"/>
     <w:p>
       <w:pPr>
         <w:pStyle w:val="Heading1"/>
@@ -6622,7 +6678,7 @@
         <w:t xml:space="preserve">Li M., Lv T., Chen J., Cui L., Lu Y., Florencio D., Zhang C., Li Z., Wei F. TrOCR: Transformer-based Optical Character Recognition with Pre-trained Models. 2021. arXiv:2109.10282. URL: https://arxiv.org/abs/2109.10282</w:t>
       </w:r>
     </w:p>
-    <w:bookmarkEnd w:id="78"/>
+    <w:bookmarkEnd w:id="77"/>
     <w:sectPr>
       <w:footnotePr>
         <w:numRestart w:val="eachSect"/>

</xml_diff>

<commit_message>
build(paper): rebuild final HSE docx after highlighted text rewrite
</commit_message>
<xml_diff>
--- a/outputs/course_paper_hse_final.docx
+++ b/outputs/course_paper_hse_final.docx
@@ -857,31 +857,39 @@
         <w:pStyle w:val="FirstParagraph"/>
       </w:pPr>
       <w:r>
-        <w:t xml:space="preserve">В идеальном случае модель посткоррекции обучается на парах реального OCR/HTR-вывода и вручную проверенного текста. Для низкоресурсных исторических материалов такие пары часто отсутствуют или существуют в малом объёме. Поэтому в первых экспериментах используют синтетические данные: эталонный текст намеренно искажается, чтобы получить пары «искажённый текст — эталон». Такой подход не заменяет реальную оценку, но даёт контролируемый первый уровень сравнения.</w:t>
-      </w:r>
-    </w:p>
-    <w:p>
-      <w:pPr>
-        <w:pStyle w:val="BodyText"/>
-      </w:pPr>
-      <w:r>
-        <w:t xml:space="preserve">Работы по коррекции OCR для исторических текстов на иврите показывают, что задачно-ориентированные искусственные данные могут быть полезны для исправления OCR-ошибок при дефиците размеченных исторических данных (Suissa et al., 2023). Naiman et al. (2023) используют большие синтетические наборы для посткоррекции исторических научных статей и показывают, что пары синтетического эталона и OCR-вывода могут улучшать CER и WER. Это подтверждает саму идею синтетического набора как разумного пилотного этапа.</w:t>
-      </w:r>
-    </w:p>
-    <w:p>
-      <w:pPr>
-        <w:pStyle w:val="BodyText"/>
-      </w:pPr>
-      <w:r>
-        <w:t xml:space="preserve">Однако современные работы также показывают, что способ генерации синтетических данных имеет значение. Guan and Greene (2024) сравнивают объём данных, расширение данных и методы генерации синтетических данных для посткоррекции OCR; отдельно рассматриваются сходство глифов и низкоресурсная постановка. RoundTripOCR также показывает, что для низкоресурсной посткоррекции OCR можно строить синтетические параллельные данные и трактовать исправление OCR как преобразование искажённого текста в эталонный по аналогии с переводом (Kashid &amp; Bhattacharyya, 2024).</w:t>
-      </w:r>
-    </w:p>
-    <w:p>
-      <w:pPr>
-        <w:pStyle w:val="BodyText"/>
-      </w:pPr>
-      <w:r>
-        <w:t xml:space="preserve">Из этих работ следует главное методологическое требование: синтетические ошибки должны быть похожи не просто на OCR-ошибки вообще, а на ошибки конкретной системы, письма и качества скана. В этой работе синтетический набор нужен как первый экспериментальный стенд: на нём можно проверить код, разбиение, метрики и сравнение методов. Но постраничная проверка на Tesseract показывает границу такого стенда. Для следующего этапа важнее не только увеличить объём синтетики, но и строить шум по реальным OCR-ошибкам и сходству арабографичных графем.</w:t>
+        <w:t xml:space="preserve">В идеальном случае модель посткоррекции обучается не на искусственно испорченных строках, а на парах реального OCR/HTR-вывода и вручную проверенного текста. Для исторических и низкоресурсных материалов такой вариант часто недоступен: сначала приходится собрать источник, получить распознавание, выровнять строки и только потом проверять исправления. Поэтому синтетические данные в этой работе используются не как замена реального OCR, а как первый контролируемый уровень эксперимента.</w:t>
+      </w:r>
+    </w:p>
+    <w:p>
+      <w:pPr>
+        <w:pStyle w:val="BodyText"/>
+      </w:pPr>
+      <w:r>
+        <w:t xml:space="preserve">В литературе такой ход встречается в разных низкоресурсных постановках. Например, работы по OCR исторических текстов на иврите показывают, что искусственно построенные пары могут быть полезны, когда ручной разметки мало (Suissa et al., 2023). Naiman et al. (2023) также используют крупные синтетические наборы для посткоррекции исторических научных статей и оценивают эффект по CER и WER. Для моей работы из этого следует не то, что синтетика «достаточна», а более узкий вывод: на ней можно проверить код, метрики, разбиение и базовое сравнение методов до появления настоящих OCR-пар.</w:t>
+      </w:r>
+    </w:p>
+    <w:p>
+      <w:pPr>
+        <w:pStyle w:val="BodyText"/>
+      </w:pPr>
+      <w:r>
+        <w:t xml:space="preserve">Отдельный вопрос — как именно создавать ошибки. Если шум слишком общий, модель учится исправлять не ошибки OCR, а ошибки выбранного генератора. Guan and Greene (2024) специально обсуждают роль объёма данных, расширения выборки и способов генерации синтетических ошибок; среди важных факторов выделяются сходство глифов и низкоресурсный режим. Это особенно важно для арабской графики, где многие ошибки связаны не с произвольной заменой символов, а с близостью начертаний, точками, формами букв и сегментацией строки.</w:t>
+      </w:r>
+    </w:p>
+    <w:p>
+      <w:pPr>
+        <w:pStyle w:val="BodyText"/>
+      </w:pPr>
+      <w:r>
+        <w:t xml:space="preserve">RoundTripOCR показывает другой полезный ракурс: низкоресурсную посткоррекцию можно рассматривать как преобразование искажённого текста в эталонный по аналогии с переводом (Kashid &amp; Bhattacharyya, 2024). В моей постановке эта идея используется на уровне строки: модель получает искажённый арабографичный фрагмент и должна восстановить эталонную запись. При этом перенос на настоящий OCR проверяется отдельно, потому что синтетический набор не содержит качества скана, шрифта, структуры страницы и ошибок Tesseract.</w:t>
+      </w:r>
+    </w:p>
+    <w:p>
+      <w:pPr>
+        <w:pStyle w:val="BodyText"/>
+      </w:pPr>
+      <w:r>
+        <w:t xml:space="preserve">Следовательно, синтетический набор в этой работе — это диагностический стенд, а не финальный бенчмарк. Он нужен, чтобы увидеть, превосходит ли ByT5-small простые базовые методы в контролируемой среде. Постраничная проверка на Tesseract затем показывает границу этого стенда: для практического применения нужно строить ошибки не только по заранее заданным правилам, но и по реальным OCR-выводам и эмпирическим путаницам арабографичных графем.</w:t>
       </w:r>
     </w:p>
     <w:bookmarkEnd w:id="23"/>
@@ -933,23 +941,31 @@
         <w:pStyle w:val="FirstParagraph"/>
       </w:pPr>
       <w:r>
-        <w:t xml:space="preserve">Из рассмотренных работ следуют четыре требования к эксперименту. Для исторического OCR нужен воспроизводимый процесс, эталонные данные и ручная проверка, а не только запуск модели распознавания. Для арабской графики важны собственные графические трудности и структура страницы. Посткоррекция OCR может быть сформулирована как преобразование ошибочного текста в эталонный. Синтетические данные полезны для низкоресурсных постановок, но требуют отдельной проверки на реальном OCR.</w:t>
-      </w:r>
-    </w:p>
-    <w:p>
-      <w:pPr>
-        <w:pStyle w:val="BodyText"/>
-      </w:pPr>
-      <w:r>
-        <w:t xml:space="preserve">Для этой работы важны три линии исследований: OCR исторических документов, распознавание арабской графики и посткоррекция OCR-ошибок. Работа не создаёт новую OCR/HTR-систему и не заявляет лучшего результата в области OCR исторических документов. Её вклад более узкий: воспроизводимый набор для посткоррекции тюркских текстов в арабской графике, сравнение простых базовых методов и ByT5-small, анализ синтетической оценки и отдельная проверка переноса на постраничном OCR османско-турецкого источника.</w:t>
-      </w:r>
-    </w:p>
-    <w:p>
-      <w:pPr>
-        <w:pStyle w:val="BodyText"/>
-      </w:pPr>
-      <w:r>
-        <w:t xml:space="preserve">Методологически важен отрицательный результат: на синтетическом наборе модель улучшает метрики относительно базовых методов, но на реальном OCR перенос оказывается нестабильным. Поэтому работа полезна как подготовительный этап для магистерского исследования. Следующий шаг должен включать проверенные пары «OCR-вывод — эталон», постраничное разбиение без утечки и обучение на настоящих OCR-ошибках.</w:t>
+        <w:t xml:space="preserve">Рассмотренные работы задают рамку, в которой находится эта курсовая. С одной стороны, OCR исторических документов требует полного процесса: подготовки изображения, сегментации, распознавания, эталонной разметки и ручной проверки. С другой стороны, моя работа сознательно выносит за скобки распознавание изображения и проверяет только следующий слой — текстовую посткоррекцию уже полученного OCR-вывода.</w:t>
+      </w:r>
+    </w:p>
+    <w:p>
+      <w:pPr>
+        <w:pStyle w:val="BodyText"/>
+      </w:pPr>
+      <w:r>
+        <w:t xml:space="preserve">Из обзора также следует, почему для арабографичного материала нельзя ограничиться универсальной схемой «зашумить строку и обучить модель». В арабской графике важны форма буквы в слове, точки, близость начертаний, качество печати и ошибки разбиения строки. Поэтому синтетический шум в работе трактуется как приближение, а не как модель всех реальных ошибок. Именно поэтому в эксперимент добавлена отдельная проверка на постраничном OCR Tesseract.</w:t>
+      </w:r>
+    </w:p>
+    <w:p>
+      <w:pPr>
+        <w:pStyle w:val="BodyText"/>
+      </w:pPr>
+      <w:r>
+        <w:t xml:space="preserve">Вклад работы находится на этом промежуточном уровне. Она не предлагает новую OCR/HTR-систему и не претендует на лучший результат в распознавании исторических документов. Более точная формулировка вклада такая: построен воспроизводимый контур для проверки посткоррекции тюркского текста в арабской графике; реализованы простые методы сравнения; обучена ByT5-small; отдельно показано, что успех на синтетических ошибках не означает устойчивого переноса на реальный OCR.</w:t>
+      </w:r>
+    </w:p>
+    <w:p>
+      <w:pPr>
+        <w:pStyle w:val="BodyText"/>
+      </w:pPr>
+      <w:r>
+        <w:t xml:space="preserve">Для дальнейшего исследования наиболее важен именно этот отрицательный результат. На синтетическом наборе модель улучшает метрики относительно базовых методов, но при переходе к реальному OCR эффект становится нестабильным. Это задаёт следующую задачу магистерской работы: собрать выровненные пары «OCR-вывод — эталон», разнести страницы по выборкам без утечки и обучать посткоррекцию уже на настоящих ошибках распознавания.</w:t>
       </w:r>
     </w:p>
     <w:bookmarkEnd w:id="25"/>
@@ -2702,31 +2718,39 @@
         <w:pStyle w:val="FirstParagraph"/>
       </w:pPr>
       <w:r>
-        <w:t xml:space="preserve">В эксперименте используются три базовых метода. Первый — метод без исправления: он возвращает входную зашумлённую строку без изменений. Его роль состоит в том, чтобы зафиксировать исходный уровень качества данных. Любой метод посткоррекции должен превосходить этот уровень; иначе он не исправляет текст, а добавляет новые ошибки.</w:t>
-      </w:r>
-    </w:p>
-    <w:p>
-      <w:pPr>
-        <w:pStyle w:val="BodyText"/>
-      </w:pPr>
-      <w:r>
-        <w:t xml:space="preserve">Второй базовый метод — нормализатор на правилах. Он применяет набор простых символьных правил к арабографичному тексту. Этот метод нужен не как ожидаемо сильное решение, а как проверка важной гипотезы: можно ли улучшить качество простыми правилами нормализации без обучения модели.</w:t>
-      </w:r>
-    </w:p>
-    <w:p>
-      <w:pPr>
-        <w:pStyle w:val="BodyText"/>
-      </w:pPr>
-      <w:r>
-        <w:t xml:space="preserve">Для исторического арабографичного тюркского материала такая проверка особенно важна. Нормализация может убрать часть технического шума, но может и стереть исторически значимые орфографические различия. Поэтому нормализатор на правилах в работе не считается обязательной предобработкой, а оценивается как самостоятельный базовый метод.</w:t>
-      </w:r>
-    </w:p>
-    <w:p>
-      <w:pPr>
-        <w:pStyle w:val="BodyText"/>
-      </w:pPr>
-      <w:r>
-        <w:t xml:space="preserve">Третий базовый метод — символьный метод на основе ошибок обучающей выборки. Он строится по обучающим парам «искажённая строка — эталон»: строки выравниваются с помощью алгоритма Левенштейна, после чего оцениваются частотные соответствия между искажёнными и эталонными символами. Замена принимается только при достаточной поддержке и доминировании целевого символа. Такой метод опирается на данные, но не является нейросетевым: он может исправлять устойчивые локальные символьные путаницы, однако не умеет восстанавливать пропущенные символы из контекста и не моделирует дальние зависимости в строке.</w:t>
+        <w:t xml:space="preserve">В эксперименте используются три базовых метода. Они нужны не для формального заполнения таблицы, а для контроля того, что именно даёт нейросетевая модель.</w:t>
+      </w:r>
+    </w:p>
+    <w:p>
+      <w:pPr>
+        <w:pStyle w:val="BodyText"/>
+      </w:pPr>
+      <w:r>
+        <w:t xml:space="preserve">Первый вариант — метод без исправления. Он возвращает входную строку без изменений. Такой метод фиксирует исходный уровень качества: если модель посткоррекции не превосходит его хотя бы по CER или WER, то она не исправляет OCR-вывод, а добавляет новые ошибки.</w:t>
+      </w:r>
+    </w:p>
+    <w:p>
+      <w:pPr>
+        <w:pStyle w:val="BodyText"/>
+      </w:pPr>
+      <w:r>
+        <w:t xml:space="preserve">Второй вариант — нормализатор на правилах. Он применяет простые символьные преобразования к арабографичному тексту. Я не рассматриваю его как сильную модель; его роль диагностическая. Он проверяет, можно ли улучшить текст простыми правилами до обучения нейросетевой модели. Для исторического материала это особенно рискованная операция: нормализация может убрать технический шум, но может и стереть орфографические различия, важные для источника.</w:t>
+      </w:r>
+    </w:p>
+    <w:p>
+      <w:pPr>
+        <w:pStyle w:val="BodyText"/>
+      </w:pPr>
+      <w:r>
+        <w:t xml:space="preserve">Третий вариант — символьный метод на основе ошибок обучающей выборки. Он строится по парам «искажённая строка — эталонная строка»: строки выравниваются алгоритмом Левенштейна, после чего из обучающей выборки извлекаются частотные соответствия между ошибочными и эталонными символами. Замена принимается только тогда, когда у неё есть достаточная поддержка и явное доминирование одного целевого символа.</w:t>
+      </w:r>
+    </w:p>
+    <w:p>
+      <w:pPr>
+        <w:pStyle w:val="BodyText"/>
+      </w:pPr>
+      <w:r>
+        <w:t xml:space="preserve">Такой набор базовых методов позволяет разделить несколько эффектов. Метод без исправления показывает исходную сложность задачи. Нормализатор проверяет безопасность ручных правил. Символьный метод показывает, насколько далеко можно продвинуться без контекстной нейросетевой модели. На этом фоне результат ByT5-small интерпретируется осторожнее: улучшение должно быть не просто численным, а устойчивым относительно простых альтернатив.</w:t>
       </w:r>
     </w:p>
     <w:bookmarkEnd w:id="42"/>
@@ -3070,51 +3094,23 @@
         <w:pStyle w:val="FirstParagraph"/>
       </w:pPr>
       <w:r>
-        <w:t xml:space="preserve">Все методы оцениваются на одной и той же тестовой выборке. Она содержит 800 зашумлённых вариантов, построенных из 40 уникальных исходных строк. Эти исходные строки не пересекаются с обучающей и валидационной выборками, поэтому оценка проводится на новых исходных строках, а не на новых искажениях уже знакомого текста.</w:t>
-      </w:r>
-    </w:p>
-    <w:p>
-      <w:pPr>
-        <w:pStyle w:val="BodyText"/>
-      </w:pPr>
-      <w:r>
-        <w:t xml:space="preserve">Для каждого метода сохраняется CSV-файл с колонками</w:t>
-      </w:r>
-      <w:r>
-        <w:t xml:space="preserve"> </w:t>
-      </w:r>
-      <w:r>
-        <w:rPr>
-          <w:rStyle w:val="VerbatimChar"/>
-        </w:rPr>
-        <w:t xml:space="preserve">noisy</w:t>
-      </w:r>
-      <w:r>
-        <w:t xml:space="preserve">,</w:t>
-      </w:r>
-      <w:r>
-        <w:t xml:space="preserve"> </w:t>
-      </w:r>
-      <w:r>
-        <w:rPr>
-          <w:rStyle w:val="VerbatimChar"/>
-        </w:rPr>
-        <w:t xml:space="preserve">clean</w:t>
-      </w:r>
-      <w:r>
-        <w:t xml:space="preserve">,</w:t>
-      </w:r>
-      <w:r>
-        <w:t xml:space="preserve"> </w:t>
-      </w:r>
-      <w:r>
-        <w:rPr>
-          <w:rStyle w:val="VerbatimChar"/>
-        </w:rPr>
-        <w:t xml:space="preserve">prediction</w:t>
-      </w:r>
-      <w:r>
-        <w:t xml:space="preserve">. После этого единая процедура оценки вычисляет CER, WER, NoSpaceCER и ExactMatch для всех строк. Такой формат делает сравнение методов воспроизводимым: можно повторно проверить как агрегированные метрики, так и отдельные строки. Итоговая объединённая таблица метрик сохранена в</w:t>
+        <w:t xml:space="preserve">Оценка проводится на тестовой выборке, которая не пересекается с обучающей и валидационной частями по исходным строкам. В тесте 800 искажённых вариантов, полученных из 40 уникальных эталонных строк. Это важно для интерпретации результата: модель проверяется не на новых вариантах уже знакомых строк, а на строках, которые не встречались при обучении.</w:t>
+      </w:r>
+    </w:p>
+    <w:p>
+      <w:pPr>
+        <w:pStyle w:val="BodyText"/>
+      </w:pPr>
+      <w:r>
+        <w:t xml:space="preserve">Для каждого метода сохраняется таблица с входной строкой, эталоном и предсказанием. Затем одна и та же процедура считает CER, WER, NoSpaceCER и ExactMatch. Я специально использую единую процедуру оценки для всех методов, чтобы различия в метриках зависели от самих методов, а не от разных скриптов или разных вариантов предобработки.</w:t>
+      </w:r>
+    </w:p>
+    <w:p>
+      <w:pPr>
+        <w:pStyle w:val="BodyText"/>
+      </w:pPr>
+      <w:r>
+        <w:t xml:space="preserve">В сравнении участвуют четыре варианта: метод без исправления, нормализатор на правилах, символьный метод на основе ошибок обучающей выборки и ByT5-small. Такая схема нужна, чтобы отделить несколько эффектов: сохранение исходного шума, ручную нормализацию, локальные символьные замены и контекстную нейросетевую посткоррекцию. Итоговая таблица метрик сохраняется в</w:t>
       </w:r>
       <w:r>
         <w:t xml:space="preserve"> </w:t>
@@ -3129,14 +3125,6 @@
         <w:t xml:space="preserve">.</w:t>
       </w:r>
     </w:p>
-    <w:p>
-      <w:pPr>
-        <w:pStyle w:val="BodyText"/>
-      </w:pPr>
-      <w:r>
-        <w:t xml:space="preserve">В одинаковых условиях сравниваются четыре варианта: метод без исправления, нормализатор на правилах, символьный метод на основе ошибок обучающей выборки и ByT5-small. Это позволяет отделить эффект нейросетевой модели посткоррекции от простого сохранения зашумлённого ввода, ручных правил нормализации и простого символьного метода, построенного по данным.</w:t>
-      </w:r>
-    </w:p>
     <w:bookmarkEnd w:id="47"/>
     <w:bookmarkStart w:id="48" w:name="анализ-ошибок"/>
     <w:p>
@@ -3152,35 +3140,23 @@
         <w:pStyle w:val="FirstParagraph"/>
       </w:pPr>
       <w:r>
-        <w:t xml:space="preserve">Помимо агрегированных метрик проводится анализ ошибок на уровне отдельных тестовых примеров. Для каждого примера сравнивается качество исходной зашумлённой строки и предсказания модели относительно</w:t>
-      </w:r>
-      <w:r>
-        <w:t xml:space="preserve"> </w:t>
-      </w:r>
-      <w:r>
-        <w:rPr>
-          <w:rStyle w:val="VerbatimChar"/>
-        </w:rPr>
-        <w:t xml:space="preserve">clean</w:t>
-      </w:r>
-      <w:r>
-        <w:t xml:space="preserve">-эталона.</w:t>
-      </w:r>
-    </w:p>
-    <w:p>
-      <w:pPr>
-        <w:pStyle w:val="BodyText"/>
-      </w:pPr>
-      <w:r>
-        <w:t xml:space="preserve">Для этого вычисляются CER и WER до и после посткоррекции, а затем фиксируется изменение качества: пример мог улучшиться, остаться без изменений или ухудшиться. Такой анализ важен, потому что среднее значение CER или WER может расти за счёт небольшого числа удачных случаев и скрывать ухудшения на отдельных строках.</w:t>
-      </w:r>
-    </w:p>
-    <w:p>
-      <w:pPr>
-        <w:pStyle w:val="BodyText"/>
-      </w:pPr>
-      <w:r>
-        <w:t xml:space="preserve">Дополнительно выделяются лучшие и худшие примеры. Они нужны для качественной интерпретации: по ним можно понять, какие типы ошибок модель исправляет уверенно, а где она добавляет новые искажения или чрезмерно нормализует историческое написание. Анализ ошибок выполняется скриптом</w:t>
+        <w:t xml:space="preserve">Помимо средних метрик я отдельно проверяю поведение модели на отдельных строках. Для каждого тестового примера сравниваются две ситуации: исходная искажённая строка относительно эталона и предсказание модели относительно того же эталона. После этого пример относится к одной из трёх групп: улучшился, остался без изменений или ухудшился.</w:t>
+      </w:r>
+    </w:p>
+    <w:p>
+      <w:pPr>
+        <w:pStyle w:val="BodyText"/>
+      </w:pPr>
+      <w:r>
+        <w:t xml:space="preserve">Такой разбор нужен потому, что среднее значение CER или WER само по себе может быть обманчивым. Например, модель может сильно улучшить часть строк, но одновременно испортить другие. В таком случае средняя метрика покажет общий выигрыш, но для практической OCR-посткоррекции это всё равно опасно: пользователь получит не только исправления, но и новые ошибки.</w:t>
+      </w:r>
+    </w:p>
+    <w:p>
+      <w:pPr>
+        <w:pStyle w:val="BodyText"/>
+      </w:pPr>
+      <w:r>
+        <w:t xml:space="preserve">Отдельно сохраняются лучшие и худшие случаи. По ним видно, какие типы искажений модель исправляет уверенно, а где она начинает чрезмерно менять строку или сглаживать историческое написание. Этот разбор выполняется скриптом</w:t>
       </w:r>
       <w:r>
         <w:t xml:space="preserve"> </w:t>
@@ -3192,7 +3168,7 @@
         <w:t xml:space="preserve">scripts/postcorrection_error_analysis.py</w:t>
       </w:r>
       <w:r>
-        <w:t xml:space="preserve">.</w:t>
+        <w:t xml:space="preserve">; он используется не вместо метрик, а как дополнительная проверка того, насколько численный выигрыш выглядит надёжным на уровне конкретных строк.</w:t>
       </w:r>
     </w:p>
     <w:bookmarkEnd w:id="48"/>
@@ -3709,67 +3685,23 @@
         <w:pStyle w:val="FirstParagraph"/>
       </w:pPr>
       <w:r>
-        <w:t xml:space="preserve">Метод без исправления задаёт нижнюю границу качества: он не исправляет текст, а возвращает исходную зашумлённую строку без изменений. Поэтому полезная модель посткоррекции должна показывать качество выше этого уровня хотя бы по основным метрикам CER и WER.</w:t>
-      </w:r>
-    </w:p>
-    <w:p>
-      <w:pPr>
-        <w:pStyle w:val="BodyText"/>
-      </w:pPr>
-      <w:r>
-        <w:t xml:space="preserve">ByT5-small 512 превосходит метод без исправления по всем трём метрикам:</w:t>
-      </w:r>
-    </w:p>
-    <w:p>
-      <w:pPr>
-        <w:pStyle w:val="Compact"/>
-        <w:numPr>
-          <w:ilvl w:val="0"/>
-          <w:numId w:val="1003"/>
-        </w:numPr>
-      </w:pPr>
-      <w:r>
-        <w:t xml:space="preserve">CER: с 0.086005 до 0.079913;</w:t>
-      </w:r>
-    </w:p>
-    <w:p>
-      <w:pPr>
-        <w:pStyle w:val="Compact"/>
-        <w:numPr>
-          <w:ilvl w:val="0"/>
-          <w:numId w:val="1003"/>
-        </w:numPr>
-      </w:pPr>
-      <w:r>
-        <w:t xml:space="preserve">WER: с 0.519006 до 0.368540;</w:t>
-      </w:r>
-    </w:p>
-    <w:p>
-      <w:pPr>
-        <w:pStyle w:val="Compact"/>
-        <w:numPr>
-          <w:ilvl w:val="0"/>
-          <w:numId w:val="1003"/>
-        </w:numPr>
-      </w:pPr>
-      <w:r>
-        <w:t xml:space="preserve">ExactMatch: с 0.001250 до 0.003750.</w:t>
-      </w:r>
-    </w:p>
-    <w:p>
-      <w:pPr>
-        <w:pStyle w:val="FirstParagraph"/>
-      </w:pPr>
-      <w:r>
-        <w:t xml:space="preserve">Абсолютное снижение CER составляет 0.006092. Это умеренное улучшение: модель действительно приближает предсказания к эталонной строке на уровне символов, но не решает задачу полностью. Заметнее выглядит снижение WER: разница составляет 0.150466, то есть модель заметно чаще восстанавливает структуру слов или делает строку ближе к эталону на уровне слов.</w:t>
-      </w:r>
-    </w:p>
-    <w:p>
-      <w:pPr>
-        <w:pStyle w:val="BodyText"/>
-      </w:pPr>
-      <w:r>
-        <w:t xml:space="preserve">Результат поддерживает гипотезу о пользе ByT5-small на синтетическом наборе, но размер эффекта по CER остаётся небольшим. Поэтому это не доказательство готовности модели к практическому OCR, а сигнал, что выбранное направление стоит продолжать на более строгих данных: реальных парах «OCR-вывод — эталон» и разбиении по страницам или источникам.</w:t>
+        <w:t xml:space="preserve">Метод без исправления нужен как нижняя граница качества. Он не делает никакой посткоррекции и просто возвращает входную искажённую строку. Поэтому сравнение с ним отвечает на самый простой вопрос: добавляет ли модель пользу или только создаёт новые ошибки.</w:t>
+      </w:r>
+    </w:p>
+    <w:p>
+      <w:pPr>
+        <w:pStyle w:val="BodyText"/>
+      </w:pPr>
+      <w:r>
+        <w:t xml:space="preserve">ByT5-small 512 показывает результат лучше этого уровня по основным метрикам: CER снижается с 0.086005 до 0.079913, WER — с 0.519006 до 0.368540, а ExactMatch растёт с 0.001250 до 0.003750. По CER выигрыш небольшой: абсолютное снижение составляет 0.006092. Это означает, что модель действительно приближает строки к эталону, но не решает задачу полностью. По WER эффект заметнее: разница составляет примерно 0.150466.</w:t>
+      </w:r>
+    </w:p>
+    <w:p>
+      <w:pPr>
+        <w:pStyle w:val="BodyText"/>
+      </w:pPr>
+      <w:r>
+        <w:t xml:space="preserve">Я трактую этот результат как положительный сигнал для пилотного эксперимента, а не как доказательство готовности модели к практическому OCR. На синтетическом наборе ByT5-small полезна, но для вывода о реальных сканах нужна проверка на настоящих OCR-ошибках и на разбиении по страницам или источникам.</w:t>
       </w:r>
     </w:p>
     <w:bookmarkEnd w:id="54"/>
@@ -3787,67 +3719,15 @@
         <w:pStyle w:val="FirstParagraph"/>
       </w:pPr>
       <w:r>
-        <w:t xml:space="preserve">Нормализатор на правилах выступает отрицательным контрольным сравнением. Он показывает, что простая символьная нормализация не обязательно улучшает исторический арабографичный текст и может быть хуже, чем отсутствие исправления.</w:t>
-      </w:r>
-    </w:p>
-    <w:p>
-      <w:pPr>
-        <w:pStyle w:val="BodyText"/>
-      </w:pPr>
-      <w:r>
-        <w:t xml:space="preserve">По сравнению с методом без исправления нормализатор ухудшает все метрики:</w:t>
-      </w:r>
-    </w:p>
-    <w:p>
-      <w:pPr>
-        <w:pStyle w:val="Compact"/>
-        <w:numPr>
-          <w:ilvl w:val="0"/>
-          <w:numId w:val="1004"/>
-        </w:numPr>
-      </w:pPr>
-      <w:r>
-        <w:t xml:space="preserve">CER: с 0.086005 до 0.151932;</w:t>
-      </w:r>
-    </w:p>
-    <w:p>
-      <w:pPr>
-        <w:pStyle w:val="Compact"/>
-        <w:numPr>
-          <w:ilvl w:val="0"/>
-          <w:numId w:val="1004"/>
-        </w:numPr>
-      </w:pPr>
-      <w:r>
-        <w:t xml:space="preserve">WER: с 0.519006 до 0.684408;</w:t>
-      </w:r>
-    </w:p>
-    <w:p>
-      <w:pPr>
-        <w:pStyle w:val="Compact"/>
-        <w:numPr>
-          <w:ilvl w:val="0"/>
-          <w:numId w:val="1004"/>
-        </w:numPr>
-      </w:pPr>
-      <w:r>
-        <w:t xml:space="preserve">ExactMatch: с 0.001250 до 0.000000.</w:t>
-      </w:r>
-    </w:p>
-    <w:p>
-      <w:pPr>
-        <w:pStyle w:val="FirstParagraph"/>
-      </w:pPr>
-      <w:r>
-        <w:t xml:space="preserve">Это означает, что выбранные правила добавляют больше ошибок, чем исправляют. Для исторического тюркского материала в арабской графике такой результат ожидаемо важен: графическая унификация может удалить технический шум, но одновременно стереть значимые орфографические различия или заменить допустимую историческую форму на неподходящую.</w:t>
-      </w:r>
-    </w:p>
-    <w:p>
-      <w:pPr>
-        <w:pStyle w:val="BodyText"/>
-      </w:pPr>
-      <w:r>
-        <w:t xml:space="preserve">Следовательно, нормализацию на правилах нельзя использовать как автоматический предварительный шаг без отдельной проверки. В рамках данного эксперимента первая гипотеза получает предварительное подтверждение: простая нормализация на правилах ухудшает качество текста относительно метода без исправления.</w:t>
+        <w:t xml:space="preserve">Нормализатор на правилах оказался не улучшением, а отрицательным контрольным примером. По сравнению с методом без исправления CER растёт с 0.086005 до 0.151932, а WER — с 0.519006 до 0.684408. ExactMatch при этом становится нулевым.</w:t>
+      </w:r>
+    </w:p>
+    <w:p>
+      <w:pPr>
+        <w:pStyle w:val="BodyText"/>
+      </w:pPr>
+      <w:r>
+        <w:t xml:space="preserve">Для этой работы такой результат важен методологически. Он показывает, что простые символьные правила нельзя считать безопасной предобработкой для исторического арабографичного текста. Правило может выглядеть разумным как техническая нормализация, но в историческом материале оно легко меняет орфографически значимые формы. Поэтому нормализатор в дальнейшем не следует использовать как обязательный этап без отдельной проверки на реальных данных.</w:t>
       </w:r>
     </w:p>
     <w:bookmarkEnd w:id="55"/>
@@ -3865,51 +3745,25 @@
         <w:pStyle w:val="FirstParagraph"/>
       </w:pPr>
       <w:r>
-        <w:t xml:space="preserve">Символьный метод на основе ошибок обучающей выборки выступает дополнительным сравнением, основанным на данных, но не использующим нейросетевую модель. Он показывает, можно ли заметно улучшить качество за счёт устойчивых символьных соответствий, извлечённых из обучающих пар «искажённая строка — эталон», без нейросетевого моделирования контекста.</w:t>
-      </w:r>
-    </w:p>
-    <w:p>
-      <w:pPr>
-        <w:pStyle w:val="BodyText"/>
-      </w:pPr>
-      <w:r>
-        <w:t xml:space="preserve">По сравнению с методом без исправления этот метод немного снижает CER:</w:t>
-      </w:r>
-    </w:p>
-    <w:p>
-      <w:pPr>
-        <w:pStyle w:val="Compact"/>
-        <w:numPr>
-          <w:ilvl w:val="0"/>
-          <w:numId w:val="1005"/>
-        </w:numPr>
-      </w:pPr>
-      <w:r>
-        <w:t xml:space="preserve">CER: с 0.086005 до 0.082520;</w:t>
-      </w:r>
-    </w:p>
-    <w:p>
-      <w:pPr>
-        <w:pStyle w:val="Compact"/>
-        <w:numPr>
-          <w:ilvl w:val="0"/>
-          <w:numId w:val="1005"/>
-        </w:numPr>
-      </w:pPr>
-      <w:r>
-        <w:t xml:space="preserve">WER: с 0.519006 до 0.506189;</w:t>
-      </w:r>
-    </w:p>
-    <w:p>
-      <w:pPr>
-        <w:pStyle w:val="Compact"/>
-        <w:numPr>
-          <w:ilvl w:val="0"/>
-          <w:numId w:val="1005"/>
-        </w:numPr>
-      </w:pPr>
-      <w:r>
-        <w:t xml:space="preserve">ExactMatch: с 0.001250 до 0.001250.</w:t>
+        <w:t xml:space="preserve">Символьный метод даёт небольшой выигрыш относительно метода без исправления: CER снижается с 0.086005 до 0.082520, WER — с 0.519006 до 0.506189, а ExactMatch остаётся на уровне 0.001250. Это показывает, что часть ошибок действительно можно описать устойчивыми локальными заменами символов.</w:t>
+      </w:r>
+    </w:p>
+    <w:p>
+      <w:pPr>
+        <w:pStyle w:val="BodyText"/>
+      </w:pPr>
+      <w:r>
+        <w:t xml:space="preserve">Однако этот метод почти не меняет качество на уровне слов. Он умеет исправлять отдельные повторяющиеся путаницы, но не восстанавливает пропущенные элементы из контекста и не работает с более длинной структурой строки. Поэтому его результат полезен как промежуточная точка сравнения: он лучше ручной нормализации, но заметно слабее ByT5-small по WER.</w:t>
+      </w:r>
+    </w:p>
+    <w:bookmarkEnd w:id="56"/>
+    <w:bookmarkStart w:id="57" w:name="интерпретация-снижения-wer"/>
+    <w:p>
+      <w:pPr>
+        <w:pStyle w:val="Heading3"/>
+      </w:pPr>
+      <w:r>
+        <w:t xml:space="preserve">5.6 Интерпретация снижения WER</w:t>
       </w:r>
     </w:p>
     <w:p>
@@ -3917,17 +3771,33 @@
         <w:pStyle w:val="FirstParagraph"/>
       </w:pPr>
       <w:r>
-        <w:t xml:space="preserve">Такой результат важен для интерпретации. Простые символьные соответствия, извлечённые из обучающей выборки, действительно исправляют часть локальных символьных ошибок, но почти не улучшают качество на уровне слов. Это означает, что большая часть преимущества ByT5-small связана не только с локальными заменами символов, но и с контекстным восстановлением структуры строки, включая границы слов.</w:t>
-      </w:r>
-    </w:p>
-    <w:bookmarkEnd w:id="56"/>
-    <w:bookmarkStart w:id="57" w:name="интерпретация-сильного-снижения-wer"/>
+        <w:t xml:space="preserve">Самый заметный эффект ByT5-small — снижение WER с 0.519006 до 0.368540. На первый взгляд это выглядит как сильное улучшение, но в текущей постановке его нужно читать осторожно.</w:t>
+      </w:r>
+    </w:p>
+    <w:p>
+      <w:pPr>
+        <w:pStyle w:val="BodyText"/>
+      </w:pPr>
+      <w:r>
+        <w:t xml:space="preserve">Причина в устройстве синтетического шума. Генератор вносит не только замены символов, но и ошибки пробелов: вставки пробелов внутри слов и удаления пробелов между токенами. WER чувствителен к таким ошибкам сильнее, чем CER, потому что изменение границы слова может изменить всю токенизацию строки. Если модель исправляет именно такие синтетические нарушения, WER падает заметно быстрее, чем посимвольная ошибка.</w:t>
+      </w:r>
+    </w:p>
+    <w:p>
+      <w:pPr>
+        <w:pStyle w:val="BodyText"/>
+      </w:pPr>
+      <w:r>
+        <w:t xml:space="preserve">Поэтому в работе CER и WER интерпретируются вместе. CER показывает умеренный выигрыш на уровне символов, а WER показывает, что модель хорошо работает с частью ошибок границ слов в синтетическом наборе. Но этот результат сам по себе не доказывает, что такой же выигрыш появится на реальном OCR-выводе.</w:t>
+      </w:r>
+    </w:p>
+    <w:bookmarkEnd w:id="57"/>
+    <w:bookmarkStart w:id="58" w:name="Xa057a50b3d887cb833a81c68c8cf3288ce88b0e"/>
     <w:p>
       <w:pPr>
         <w:pStyle w:val="Heading3"/>
       </w:pPr>
       <w:r>
-        <w:t xml:space="preserve">5.6 Интерпретация сильного снижения WER</w:t>
+        <w:t xml:space="preserve">5.7 Влияние максимальной длины последовательности</w:t>
       </w:r>
     </w:p>
     <w:p>
@@ -3935,41 +3805,25 @@
         <w:pStyle w:val="FirstParagraph"/>
       </w:pPr>
       <w:r>
-        <w:t xml:space="preserve">Наиболее заметный выигрыш ByT5-small наблюдается по WER: с 0.519006 до 0.368540. В относительном выражении это выглядит как крупное улучшение. Однако этот результат нельзя интерпретировать как доказательство аналогичного выигрыша на реальных OCR/HTR-выходах.</w:t>
-      </w:r>
-    </w:p>
-    <w:p>
-      <w:pPr>
-        <w:pStyle w:val="BodyText"/>
-      </w:pPr>
-      <w:r>
-        <w:t xml:space="preserve">Причина состоит в том, что текущий синтетический шум включает вставку и удаление пробелов. WER вычисляется на уровне слов, поэтому он особенно чувствителен к ошибкам границ слов: одна вставка или потеря пробела может изменить токенизацию всей строки и резко увеличить ошибку на уровне слов. Если модель восстанавливает часть таких синтетических искажений границ слов, WER может снижаться существенно сильнее, чем CER.</w:t>
-      </w:r>
-    </w:p>
-    <w:p>
-      <w:pPr>
-        <w:pStyle w:val="BodyText"/>
-      </w:pPr>
-      <w:r>
-        <w:t xml:space="preserve">Поэтому CER и WER нельзя читать по отдельности. По CER улучшение ByT5-small умеренное: с 0.086005 до 0.079913. По WER эффект заметнее, но часть этого эффекта связана с исправлением синтетических ошибок пробелов и границ слов. Такой результат показывает работоспособность модели на проверочном стенде, но не подтверждает такой же выигрыш на реальных архивных сканах или OCR/HTR-выводах.</w:t>
-      </w:r>
-    </w:p>
-    <w:p>
-      <w:pPr>
-        <w:pStyle w:val="BodyText"/>
-      </w:pPr>
-      <w:r>
-        <w:t xml:space="preserve">Поскольку тестовый набор построен в этой работе, прямого опубликованного результата на точно таком же наборе данных нет. Поэтому утверждение о лучшем результате ограничено данной экспериментальной постановкой: ByT5-small 512 показывает лучший CER и WER среди рассмотренных методов на предложенном наборе. Работа не заявляет лучший опубликованный результат для посткоррекции OCR в целом.</w:t>
-      </w:r>
-    </w:p>
-    <w:bookmarkEnd w:id="57"/>
-    <w:bookmarkStart w:id="58" w:name="значение-длины-последовательности"/>
+        <w:t xml:space="preserve">Для ByT5-small важна максимальная длина последовательности, потому что модель работает с байтовым представлением. Один видимый символ арабской графики может занимать несколько байтов, поэтому слишком короткая длина входа способна обрезать полезный контекст.</w:t>
+      </w:r>
+    </w:p>
+    <w:p>
+      <w:pPr>
+        <w:pStyle w:val="BodyText"/>
+      </w:pPr>
+      <w:r>
+        <w:t xml:space="preserve">В текущем эксперименте конфигурация с длиной 512 выглядит более устойчивой, чем более короткий вариант. Я не трактую это как универсальное правило для всех арабографичных корпусов. Скорее это практический вывод для данного корпуса и данной постановки: при работе с историческим арабографичным текстом длину последовательности нужно проверять экспериментально, а не выбирать по умолчанию.</w:t>
+      </w:r>
+    </w:p>
+    <w:bookmarkEnd w:id="58"/>
+    <w:bookmarkStart w:id="59" w:name="X19ea1479c8c58d48c08a8bf495d59749d022072"/>
     <w:p>
       <w:pPr>
         <w:pStyle w:val="Heading3"/>
       </w:pPr>
       <w:r>
-        <w:t xml:space="preserve">5.7 Значение длины последовательности</w:t>
+        <w:t xml:space="preserve">5.8 Распределение улучшенных и ухудшенных примеров</w:t>
       </w:r>
     </w:p>
     <w:p>
@@ -3977,33 +3831,33 @@
         <w:pStyle w:val="FirstParagraph"/>
       </w:pPr>
       <w:r>
-        <w:t xml:space="preserve">Результаты пилота показывают чувствительность ByT5-small к максимальной длине входной и целевой последовательности. Это связано с байтовым представлением: длина строки в токенах может быть заметно больше, чем число видимых символов, особенно для арабской графики.</w:t>
-      </w:r>
-    </w:p>
-    <w:p>
-      <w:pPr>
-        <w:pStyle w:val="BodyText"/>
-      </w:pPr>
-      <w:r>
-        <w:t xml:space="preserve">Конфигурация 256 использовалась как первый рабочий запуск, но для части строк такое ограничение может быть слишком жёстким. Конфигурация 512 снижает риск обрезания контекста и поэтому выбрана как основная для итогового анализа.</w:t>
-      </w:r>
-    </w:p>
-    <w:p>
-      <w:pPr>
-        <w:pStyle w:val="BodyText"/>
-      </w:pPr>
-      <w:r>
-        <w:t xml:space="preserve">Этот результат следует интерпретировать осторожно. Он показывает, что максимальная длина последовательности является важным экспериментальным параметром в данной постановке, но не доказывает универсального преимущества длины 512 для всех арабографичных тюркских корпусов. Для более сильного вывода нужны дополнительные запуски на более широком наборе источников и длин строк.</w:t>
-      </w:r>
-    </w:p>
-    <w:bookmarkEnd w:id="58"/>
-    <w:bookmarkStart w:id="59" w:name="X57a2c7e56d371be566bce3ca95d65080761e96c"/>
+        <w:t xml:space="preserve">Агрегированные метрики показывают средний эффект, но не объясняют, насколько равномерно модель работает по строкам. Поэтому отдельно считается число примеров, где предсказание стало лучше, хуже или осталось на прежнем уровне.</w:t>
+      </w:r>
+    </w:p>
+    <w:p>
+      <w:pPr>
+        <w:pStyle w:val="BodyText"/>
+      </w:pPr>
+      <w:r>
+        <w:t xml:space="preserve">По CER модель улучшает 682 из 800 тестовых примеров, оставляет без изменений 60 и ухудшает 58. По WER картина близкая: 677 улучшенных примеров, 63 без изменений и 60 ухудшенных. Это важное уточнение к средним метрикам: выигрыш ByT5-small не держится на нескольких отдельных строках, а распределён по большей части тестовой выборки.</w:t>
+      </w:r>
+    </w:p>
+    <w:p>
+      <w:pPr>
+        <w:pStyle w:val="BodyText"/>
+      </w:pPr>
+      <w:r>
+        <w:t xml:space="preserve">Одновременно наличие ухудшенных примеров принципиально для практического вывода. Даже если модель чаще помогает, она всё равно иногда добавляет новые ошибки. Для будущей системы посткоррекции нужен механизм отката или фильтрации предсказаний, особенно если модель используется на архивных источниках без быстрой ручной проверки каждой строки.</w:t>
+      </w:r>
+    </w:p>
+    <w:bookmarkEnd w:id="59"/>
+    <w:bookmarkStart w:id="60" w:name="среднее-улучшение-по-примерам"/>
     <w:p>
       <w:pPr>
         <w:pStyle w:val="Heading3"/>
       </w:pPr>
       <w:r>
-        <w:t xml:space="preserve">5.8 Анализ ошибок на уровне отдельных примеров</w:t>
+        <w:t xml:space="preserve">5.9 Среднее улучшение по примерам</w:t>
       </w:r>
     </w:p>
     <w:p>
@@ -4011,7 +3865,117 @@
         <w:pStyle w:val="FirstParagraph"/>
       </w:pPr>
       <w:r>
-        <w:t xml:space="preserve">Помимо агрегированных метрик был проведён анализ качества на уровне отдельных тестовых примеров. Для каждого примера сравнивалась ошибка исходной зашумлённой строки и ошибка предсказания ByT5-small 512 относительно</w:t>
+        <w:t xml:space="preserve">Среднее снижение ошибки на уровне отдельных примеров составило 0.006092 по CER и 0.150467 по WER. Эти числа согласуются с итоговой таблицей: посимвольный выигрыш есть, но он небольшой, а выигрыш на уровне слов заметнее.</w:t>
+      </w:r>
+    </w:p>
+    <w:p>
+      <w:pPr>
+        <w:pStyle w:val="BodyText"/>
+      </w:pPr>
+      <w:r>
+        <w:t xml:space="preserve">Для интерпретации это означает следующее. В контролируемой синтетической постановке модель чаще исправляет структуру слов и пробелы, чем полностью восстанавливает каждый символ строки. Поэтому среднее улучшение полезно как краткое числовое резюме, но его нельзя рассматривать отдельно от распределения улучшенных и ухудшенных случаев.</w:t>
+      </w:r>
+    </w:p>
+    <w:bookmarkEnd w:id="60"/>
+    <w:bookmarkStart w:id="61" w:name="интерпретация-результатов"/>
+    <w:p>
+      <w:pPr>
+        <w:pStyle w:val="Heading3"/>
+      </w:pPr>
+      <w:r>
+        <w:t xml:space="preserve">5.10 Интерпретация результатов</w:t>
+      </w:r>
+    </w:p>
+    <w:p>
+      <w:pPr>
+        <w:pStyle w:val="FirstParagraph"/>
+      </w:pPr>
+      <w:r>
+        <w:t xml:space="preserve">Из синтетического эксперимента я делаю три вывода. Первый вывод отрицательный: нормализатор на правилах ухудшает качество, поэтому простая ручная нормализация не является безопасной предобработкой для такого материала.</w:t>
+      </w:r>
+    </w:p>
+    <w:p>
+      <w:pPr>
+        <w:pStyle w:val="BodyText"/>
+      </w:pPr>
+      <w:r>
+        <w:t xml:space="preserve">Второй вывод положительный, но ограниченный: ByT5-small 512 превосходит все рассмотренные методы на синтетическом наборе. Она даёт небольшой выигрыш по CER и заметный выигрыш по WER. Это подтверждает, что модель с байтовым представлением может быть полезной для посткоррекции арабографичного тюркского текста в контролируемой постановке.</w:t>
+      </w:r>
+    </w:p>
+    <w:p>
+      <w:pPr>
+        <w:pStyle w:val="BodyText"/>
+      </w:pPr>
+      <w:r>
+        <w:t xml:space="preserve">Третий вывод задаёт границу результата. Успех на синтетическом наборе нельзя переносить на реальные OCR/HTR-выходы без отдельной проверки. В текущем эксперименте модель учится на распределении ошибок генератора, а настоящий OCR зависит от шрифта, качества изображения, сегментации строки и особенностей конкретной OCR-системы. Поэтому результаты раздела 5 являются сильным пилотным сигналом, но не финальным доказательством практической применимости.</w:t>
+      </w:r>
+    </w:p>
+    <w:bookmarkEnd w:id="61"/>
+    <w:bookmarkStart w:id="62" w:name="ограничения-интерпретации"/>
+    <w:p>
+      <w:pPr>
+        <w:pStyle w:val="Heading3"/>
+      </w:pPr>
+      <w:r>
+        <w:t xml:space="preserve">5.11 Ограничения интерпретации</w:t>
+      </w:r>
+    </w:p>
+    <w:p>
+      <w:pPr>
+        <w:pStyle w:val="FirstParagraph"/>
+      </w:pPr>
+      <w:r>
+        <w:t xml:space="preserve">Результаты раздела 5 относятся прежде всего к построенному в работе тестовому контуру. В синтетической части проверяется не весь OCR-процесс, а только задача исправления уже заданной строки. Поэтому значения CER, WER и ExactMatch нельзя напрямую переносить на другие источники, шрифты, сканы или OCR-системы.</w:t>
+      </w:r>
+    </w:p>
+    <w:p>
+      <w:pPr>
+        <w:pStyle w:val="BodyText"/>
+      </w:pPr>
+      <w:r>
+        <w:t xml:space="preserve">Главное ограничение связано с данными. Корпус невелик, построен на одном основном источнике, а ошибки в основной тестовой части созданы генератором. Это удобно для воспроизводимого сравнения методов, но не заменяет набор реальных пар «OCR-вывод — эталон». Для практического вывода важнее не только средняя метрика, но и то, как модель ведёт себя на настоящем OCR-выводе.</w:t>
+      </w:r>
+    </w:p>
+    <w:p>
+      <w:pPr>
+        <w:pStyle w:val="BodyText"/>
+      </w:pPr>
+      <w:r>
+        <w:t xml:space="preserve">Есть и ограничение метрик. CER и WER измеряют формальную близость к эталону, но не решают вопрос историко-лингвистической допустимости исправления. Например, модель может приблизить строку к эталону по расстоянию Левенштейна, но при этом сгладить форму, которую исследователь не хотел бы нормализовать. По этой причине автоматические метрики в работе дополняются разбором ухудшенных случаев.</w:t>
+      </w:r>
+    </w:p>
+    <w:bookmarkEnd w:id="62"/>
+    <w:bookmarkStart w:id="63" w:name="X9ae740f4b068656258209a4fa61338553b28ec2"/>
+    <w:p>
+      <w:pPr>
+        <w:pStyle w:val="Heading3"/>
+      </w:pPr>
+      <w:r>
+        <w:t xml:space="preserve">5.12 Проверка переноса на постраничном реальном OCR</w:t>
+      </w:r>
+    </w:p>
+    <w:p>
+      <w:pPr>
+        <w:pStyle w:val="FirstParagraph"/>
+      </w:pPr>
+      <w:r>
+        <w:t xml:space="preserve">После синтетического эксперимента я отдельно проверил перенос на реальный OCR-вывод. Эта часть нужна для того, чтобы не смешивать два разных результата: работу модели на контролируемом шуме и её поведение на тексте, полученном настоящей OCR-системой.</w:t>
+      </w:r>
+    </w:p>
+    <w:p>
+      <w:pPr>
+        <w:pStyle w:val="BodyText"/>
+      </w:pPr>
+      <w:r>
+        <w:t xml:space="preserve">Для проверки использован османско-турецкий печатный источник в арабской графике. Он рассматривается как связанный арабографичный тюркский материал, но не как старотатарский или старобашкирский набор данных. После фильтрации в расчёт вошли 68 страниц. Сравнивались три варианта: исходный Tesseract, ByT5-small с разбиением страницы на фрагменты и ByT5-small со строгой фильтрацией предсказаний.</w:t>
+      </w:r>
+    </w:p>
+    <w:p>
+      <w:pPr>
+        <w:pStyle w:val="BodyText"/>
+      </w:pPr>
+      <w:r>
+        <w:t xml:space="preserve">Основные символные метрики проверки на реальном OCR представлены ниже. Для компактности</w:t>
       </w:r>
       <w:r>
         <w:t xml:space="preserve"> </w:t>
@@ -4020,18 +3984,13 @@
         <w:rPr>
           <w:rStyle w:val="VerbatimChar"/>
         </w:rPr>
-        <w:t xml:space="preserve">clean</w:t>
-      </w:r>
-      <w:r>
-        <w:t xml:space="preserve">-эталона.</w:t>
-      </w:r>
-    </w:p>
-    <w:p>
-      <w:pPr>
-        <w:pStyle w:val="BodyText"/>
-      </w:pPr>
-      <w:r>
-        <w:t xml:space="preserve">Результаты анализа представлены в таблице.</w:t>
+        <w:t xml:space="preserve">NS-CER</w:t>
+      </w:r>
+      <w:r>
+        <w:t xml:space="preserve"> </w:t>
+      </w:r>
+      <w:r>
+        <w:t xml:space="preserve">обозначает NoSpaceCER.</w:t>
       </w:r>
     </w:p>
     <w:tbl>
@@ -4058,55 +4017,55 @@
               <w:pStyle w:val="Compact"/>
             </w:pPr>
             <w:r>
-              <w:t xml:space="preserve">Criterion</w:t>
-            </w:r>
-          </w:p>
-        </w:tc>
-        <w:tc>
-          <w:tcPr/>
-          <w:p>
-            <w:pPr>
-              <w:pStyle w:val="Compact"/>
-              <w:jc w:val="right"/>
-            </w:pPr>
-            <w:r>
-              <w:t xml:space="preserve">Improved</w:t>
-            </w:r>
-          </w:p>
-        </w:tc>
-        <w:tc>
-          <w:tcPr/>
-          <w:p>
-            <w:pPr>
-              <w:pStyle w:val="Compact"/>
-              <w:jc w:val="right"/>
-            </w:pPr>
-            <w:r>
-              <w:t xml:space="preserve">Unchanged</w:t>
-            </w:r>
-          </w:p>
-        </w:tc>
-        <w:tc>
-          <w:tcPr/>
-          <w:p>
-            <w:pPr>
-              <w:pStyle w:val="Compact"/>
-              <w:jc w:val="right"/>
-            </w:pPr>
-            <w:r>
-              <w:t xml:space="preserve">Worse</w:t>
-            </w:r>
-          </w:p>
-        </w:tc>
-        <w:tc>
-          <w:tcPr/>
-          <w:p>
-            <w:pPr>
-              <w:pStyle w:val="Compact"/>
-              <w:jc w:val="right"/>
-            </w:pPr>
-            <w:r>
-              <w:t xml:space="preserve">Total</w:t>
+              <w:t xml:space="preserve">Система</w:t>
+            </w:r>
+          </w:p>
+        </w:tc>
+        <w:tc>
+          <w:tcPr/>
+          <w:p>
+            <w:pPr>
+              <w:pStyle w:val="Compact"/>
+              <w:jc w:val="right"/>
+            </w:pPr>
+            <w:r>
+              <w:t xml:space="preserve">Стр.</w:t>
+            </w:r>
+          </w:p>
+        </w:tc>
+        <w:tc>
+          <w:tcPr/>
+          <w:p>
+            <w:pPr>
+              <w:pStyle w:val="Compact"/>
+              <w:jc w:val="right"/>
+            </w:pPr>
+            <w:r>
+              <w:t xml:space="preserve">CER ср.</w:t>
+            </w:r>
+          </w:p>
+        </w:tc>
+        <w:tc>
+          <w:tcPr/>
+          <w:p>
+            <w:pPr>
+              <w:pStyle w:val="Compact"/>
+              <w:jc w:val="right"/>
+            </w:pPr>
+            <w:r>
+              <w:t xml:space="preserve">CER мед.</w:t>
+            </w:r>
+          </w:p>
+        </w:tc>
+        <w:tc>
+          <w:tcPr/>
+          <w:p>
+            <w:pPr>
+              <w:pStyle w:val="Compact"/>
+              <w:jc w:val="right"/>
+            </w:pPr>
+            <w:r>
+              <w:t xml:space="preserve">NS-CER</w:t>
             </w:r>
           </w:p>
         </w:tc>
@@ -4119,55 +4078,55 @@
               <w:pStyle w:val="Compact"/>
             </w:pPr>
             <w:r>
-              <w:t xml:space="preserve">CER</w:t>
-            </w:r>
-          </w:p>
-        </w:tc>
-        <w:tc>
-          <w:tcPr/>
-          <w:p>
-            <w:pPr>
-              <w:pStyle w:val="Compact"/>
-              <w:jc w:val="right"/>
-            </w:pPr>
-            <w:r>
-              <w:t xml:space="preserve">682</w:t>
-            </w:r>
-          </w:p>
-        </w:tc>
-        <w:tc>
-          <w:tcPr/>
-          <w:p>
-            <w:pPr>
-              <w:pStyle w:val="Compact"/>
-              <w:jc w:val="right"/>
-            </w:pPr>
-            <w:r>
-              <w:t xml:space="preserve">60</w:t>
-            </w:r>
-          </w:p>
-        </w:tc>
-        <w:tc>
-          <w:tcPr/>
-          <w:p>
-            <w:pPr>
-              <w:pStyle w:val="Compact"/>
-              <w:jc w:val="right"/>
-            </w:pPr>
-            <w:r>
-              <w:t xml:space="preserve">58</w:t>
-            </w:r>
-          </w:p>
-        </w:tc>
-        <w:tc>
-          <w:tcPr/>
-          <w:p>
-            <w:pPr>
-              <w:pStyle w:val="Compact"/>
-              <w:jc w:val="right"/>
-            </w:pPr>
-            <w:r>
-              <w:t xml:space="preserve">800</w:t>
+              <w:t xml:space="preserve">Tesseract</w:t>
+            </w:r>
+          </w:p>
+        </w:tc>
+        <w:tc>
+          <w:tcPr/>
+          <w:p>
+            <w:pPr>
+              <w:pStyle w:val="Compact"/>
+              <w:jc w:val="right"/>
+            </w:pPr>
+            <w:r>
+              <w:t xml:space="preserve">68</w:t>
+            </w:r>
+          </w:p>
+        </w:tc>
+        <w:tc>
+          <w:tcPr/>
+          <w:p>
+            <w:pPr>
+              <w:pStyle w:val="Compact"/>
+              <w:jc w:val="right"/>
+            </w:pPr>
+            <w:r>
+              <w:t xml:space="preserve">0.3539</w:t>
+            </w:r>
+          </w:p>
+        </w:tc>
+        <w:tc>
+          <w:tcPr/>
+          <w:p>
+            <w:pPr>
+              <w:pStyle w:val="Compact"/>
+              <w:jc w:val="right"/>
+            </w:pPr>
+            <w:r>
+              <w:t xml:space="preserve">0.2983</w:t>
+            </w:r>
+          </w:p>
+        </w:tc>
+        <w:tc>
+          <w:tcPr/>
+          <w:p>
+            <w:pPr>
+              <w:pStyle w:val="Compact"/>
+              <w:jc w:val="right"/>
+            </w:pPr>
+            <w:r>
+              <w:t xml:space="preserve">0.3421</w:t>
             </w:r>
           </w:p>
         </w:tc>
@@ -4180,55 +4139,116 @@
               <w:pStyle w:val="Compact"/>
             </w:pPr>
             <w:r>
-              <w:t xml:space="preserve">WER</w:t>
-            </w:r>
-          </w:p>
-        </w:tc>
-        <w:tc>
-          <w:tcPr/>
-          <w:p>
-            <w:pPr>
-              <w:pStyle w:val="Compact"/>
-              <w:jc w:val="right"/>
-            </w:pPr>
-            <w:r>
-              <w:t xml:space="preserve">677</w:t>
-            </w:r>
-          </w:p>
-        </w:tc>
-        <w:tc>
-          <w:tcPr/>
-          <w:p>
-            <w:pPr>
-              <w:pStyle w:val="Compact"/>
-              <w:jc w:val="right"/>
-            </w:pPr>
-            <w:r>
-              <w:t xml:space="preserve">63</w:t>
-            </w:r>
-          </w:p>
-        </w:tc>
-        <w:tc>
-          <w:tcPr/>
-          <w:p>
-            <w:pPr>
-              <w:pStyle w:val="Compact"/>
-              <w:jc w:val="right"/>
-            </w:pPr>
-            <w:r>
-              <w:t xml:space="preserve">60</w:t>
-            </w:r>
-          </w:p>
-        </w:tc>
-        <w:tc>
-          <w:tcPr/>
-          <w:p>
-            <w:pPr>
-              <w:pStyle w:val="Compact"/>
-              <w:jc w:val="right"/>
-            </w:pPr>
-            <w:r>
-              <w:t xml:space="preserve">800</w:t>
+              <w:t xml:space="preserve">ByT5-frag</w:t>
+            </w:r>
+          </w:p>
+        </w:tc>
+        <w:tc>
+          <w:tcPr/>
+          <w:p>
+            <w:pPr>
+              <w:pStyle w:val="Compact"/>
+              <w:jc w:val="right"/>
+            </w:pPr>
+            <w:r>
+              <w:t xml:space="preserve">68</w:t>
+            </w:r>
+          </w:p>
+        </w:tc>
+        <w:tc>
+          <w:tcPr/>
+          <w:p>
+            <w:pPr>
+              <w:pStyle w:val="Compact"/>
+              <w:jc w:val="right"/>
+            </w:pPr>
+            <w:r>
+              <w:t xml:space="preserve">0.4564</w:t>
+            </w:r>
+          </w:p>
+        </w:tc>
+        <w:tc>
+          <w:tcPr/>
+          <w:p>
+            <w:pPr>
+              <w:pStyle w:val="Compact"/>
+              <w:jc w:val="right"/>
+            </w:pPr>
+            <w:r>
+              <w:t xml:space="preserve">0.4206</w:t>
+            </w:r>
+          </w:p>
+        </w:tc>
+        <w:tc>
+          <w:tcPr/>
+          <w:p>
+            <w:pPr>
+              <w:pStyle w:val="Compact"/>
+              <w:jc w:val="right"/>
+            </w:pPr>
+            <w:r>
+              <w:t xml:space="preserve">0.4658</w:t>
+            </w:r>
+          </w:p>
+        </w:tc>
+      </w:tr>
+      <w:tr>
+        <w:tc>
+          <w:tcPr/>
+          <w:p>
+            <w:pPr>
+              <w:pStyle w:val="Compact"/>
+            </w:pPr>
+            <w:r>
+              <w:t xml:space="preserve">ByT5-filter</w:t>
+            </w:r>
+          </w:p>
+        </w:tc>
+        <w:tc>
+          <w:tcPr/>
+          <w:p>
+            <w:pPr>
+              <w:pStyle w:val="Compact"/>
+              <w:jc w:val="right"/>
+            </w:pPr>
+            <w:r>
+              <w:t xml:space="preserve">68</w:t>
+            </w:r>
+          </w:p>
+        </w:tc>
+        <w:tc>
+          <w:tcPr/>
+          <w:p>
+            <w:pPr>
+              <w:pStyle w:val="Compact"/>
+              <w:jc w:val="right"/>
+            </w:pPr>
+            <w:r>
+              <w:t xml:space="preserve">0.3828</w:t>
+            </w:r>
+          </w:p>
+        </w:tc>
+        <w:tc>
+          <w:tcPr/>
+          <w:p>
+            <w:pPr>
+              <w:pStyle w:val="Compact"/>
+              <w:jc w:val="right"/>
+            </w:pPr>
+            <w:r>
+              <w:t xml:space="preserve">0.3442</w:t>
+            </w:r>
+          </w:p>
+        </w:tc>
+        <w:tc>
+          <w:tcPr/>
+          <w:p>
+            <w:pPr>
+              <w:pStyle w:val="Compact"/>
+              <w:jc w:val="right"/>
+            </w:pPr>
+            <w:r>
+              <w:t xml:space="preserve">0.3830</w:t>
             </w:r>
           </w:p>
         </w:tc>
@@ -4239,527 +4259,7 @@
         <w:pStyle w:val="BodyText"/>
       </w:pPr>
       <w:r>
-        <w:t xml:space="preserve">По CER модель улучшила 682 из 800 тестовых примеров, оставила без изменений 60 и ухудшила 58. По WER улучшение наблюдается в 677 примерах, отсутствие изменений — в 63, ухудшение — в 60.</w:t>
-      </w:r>
-    </w:p>
-    <w:p>
-      <w:pPr>
-        <w:pStyle w:val="BodyText"/>
-      </w:pPr>
-      <w:r>
-        <w:t xml:space="preserve">Этот результат важен тем, что агрегированные метрики не держатся на нескольких удачных строках: ByT5-small 512 улучшает большинство тестовых примеров и по CER, и по WER. Но 58–60 ухудшенных случаев показывают предел безопасности модели: она не только исправляет ошибки, но иногда добавляет новые.</w:t>
-      </w:r>
-    </w:p>
-    <w:p>
-      <w:pPr>
-        <w:pStyle w:val="BodyText"/>
-      </w:pPr>
-      <w:r>
-        <w:t xml:space="preserve">В примерах видны два сценария. В удачных случаях ByT5-small исправляет локальные OCR-подобные искажения, восстанавливает отдельные графемы и делает границы слов ближе к эталону. В худших случаях модель начинает порождать повторяющиеся фрагменты или заметно удлиняет строку. Для практического применения это принципиально: посткорректору нужен механизм отката, анализ худших случаев и ручная проверка спорных строк. Без этих защитных процедур модель нельзя считать безопасным автоматическим корректором.</w:t>
-      </w:r>
-    </w:p>
-    <w:bookmarkEnd w:id="59"/>
-    <w:bookmarkStart w:id="60" w:name="среднее-улучшение-по-примерам"/>
-    <w:p>
-      <w:pPr>
-        <w:pStyle w:val="Heading3"/>
-      </w:pPr>
-      <w:r>
-        <w:t xml:space="preserve">5.9 Среднее улучшение по примерам</w:t>
-      </w:r>
-    </w:p>
-    <w:p>
-      <w:pPr>
-        <w:pStyle w:val="FirstParagraph"/>
-      </w:pPr>
-      <w:r>
-        <w:t xml:space="preserve">Среднее улучшение на уровне отдельных примеров составило:</w:t>
-      </w:r>
-    </w:p>
-    <w:p>
-      <w:pPr>
-        <w:pStyle w:val="Compact"/>
-        <w:numPr>
-          <w:ilvl w:val="0"/>
-          <w:numId w:val="1006"/>
-        </w:numPr>
-      </w:pPr>
-      <w:r>
-        <w:t xml:space="preserve">Среднее снижение CER: 0.006092;</w:t>
-      </w:r>
-    </w:p>
-    <w:p>
-      <w:pPr>
-        <w:pStyle w:val="Compact"/>
-        <w:numPr>
-          <w:ilvl w:val="0"/>
-          <w:numId w:val="1006"/>
-        </w:numPr>
-      </w:pPr>
-      <w:r>
-        <w:t xml:space="preserve">Среднее снижение WER: 0.150467.</w:t>
-      </w:r>
-    </w:p>
-    <w:p>
-      <w:pPr>
-        <w:pStyle w:val="FirstParagraph"/>
-      </w:pPr>
-      <w:r>
-        <w:t xml:space="preserve">Эти значения согласуются с итоговыми агрегированными метриками: средний выигрыш по CER остаётся умеренным, а по WER — заметно более выраженным. Иными словами, модель чаще приносит практическую пользу на уровне слов, чем полностью исправляет строку на уровне каждого символа.</w:t>
-      </w:r>
-    </w:p>
-    <w:p>
-      <w:pPr>
-        <w:pStyle w:val="BodyText"/>
-      </w:pPr>
-      <w:r>
-        <w:t xml:space="preserve">Среднее снижение ошибки полезно как количественное резюме, но его недостаточно для окончательной оценки качества. Поэтому оно рассматривается вместе с распределением улучшенных, неизменённых и ухудшенных примеров и качественным анализом лучших и худших случаев.</w:t>
-      </w:r>
-    </w:p>
-    <w:bookmarkEnd w:id="60"/>
-    <w:bookmarkStart w:id="61" w:name="интерпретация-результатов"/>
-    <w:p>
-      <w:pPr>
-        <w:pStyle w:val="Heading3"/>
-      </w:pPr>
-      <w:r>
-        <w:t xml:space="preserve">5.10 Интерпретация результатов</w:t>
-      </w:r>
-    </w:p>
-    <w:p>
-      <w:pPr>
-        <w:pStyle w:val="FirstParagraph"/>
-      </w:pPr>
-      <w:r>
-        <w:t xml:space="preserve">Полученные результаты дают три основных вывода. Первый вывод — отрицательный, но методологически важный: нормализатор на правилах ухудшает качество относительно метода без исправления. Это означает, что для исторического арабографичного тюркского текста простая символьная нормализация не является заведомо безопасной предобработкой.</w:t>
-      </w:r>
-    </w:p>
-    <w:p>
-      <w:pPr>
-        <w:pStyle w:val="BodyText"/>
-      </w:pPr>
-      <w:r>
-        <w:t xml:space="preserve">Второй вывод — положительный: ByT5-small 512 улучшает качество относительно метода без исправления и показывает лучший результат среди четырёх рассмотренных методов. Улучшение по CER умеренное, но улучшение по WER заметное, а анализ отдельных примеров показывает, что модель улучшает большинство тестовых строк. При этом сильное снижение WER требует осторожной интерпретации, поскольку часть эффекта может быть связана с исправлением синтетических ошибок пробелов и границ слов. Следовательно, подход на основе модели с байтовым представлением и преобразованием последовательностей является работоспособным направлением для пилотной посткоррекции, но не финальным доказательством качества на реальном OCR/HTR-выводе.</w:t>
-      </w:r>
-    </w:p>
-    <w:p>
-      <w:pPr>
-        <w:pStyle w:val="BodyText"/>
-      </w:pPr>
-      <w:r>
-        <w:t xml:space="preserve">Третий вывод касается настройки модели: максимальная длина последовательности является важным параметром для обработки арабографичного текста моделью с байтовым представлением. Конфигурация 512 в текущем эксперименте выглядит более устойчивой, чем более короткая конфигурация, но этот результат следует считать практическим сигналом, а не универсальным правилом.</w:t>
-      </w:r>
-    </w:p>
-    <w:p>
-      <w:pPr>
-        <w:pStyle w:val="BodyText"/>
-      </w:pPr>
-      <w:r>
-        <w:t xml:space="preserve">Наконец, низкий ExactMatch не противоречит положительным результатам по CER и WER. Для длинных исторических строк полное совпадение слишком строго: одна небольшая ошибка уже делает строку несовпадающей. Поэтому основные выводы в работе опираются на CER, WER и анализ улучшенных, неизменённых и ухудшенных примеров.</w:t>
-      </w:r>
-    </w:p>
-    <w:bookmarkEnd w:id="61"/>
-    <w:bookmarkStart w:id="62" w:name="ограничения-интерпретации"/>
-    <w:p>
-      <w:pPr>
-        <w:pStyle w:val="Heading3"/>
-      </w:pPr>
-      <w:r>
-        <w:t xml:space="preserve">5.11 Ограничения интерпретации</w:t>
-      </w:r>
-    </w:p>
-    <w:p>
-      <w:pPr>
-        <w:pStyle w:val="FirstParagraph"/>
-      </w:pPr>
-      <w:r>
-        <w:t xml:space="preserve">Результаты раздела 5 следует понимать как пилотные. Они показывают, что выбранный экспериментальный контур работает на текущем корпусе и синтетическом шуме, но не доказывают качество модели на реальных OCR/HTR-выходах.</w:t>
-      </w:r>
-    </w:p>
-    <w:p>
-      <w:pPr>
-        <w:pStyle w:val="BodyText"/>
-      </w:pPr>
-      <w:r>
-        <w:t xml:space="preserve">Главные ограничения интерпретации связаны с данными: корпус мал, основан на одном источнике, а ошибки сгенерированы искусственно. Поэтому значения CER и WER нельзя напрямую переносить на другие жанры, периоды, шрифты, сканы или OCR-системы без дополнительной проверки.</w:t>
-      </w:r>
-    </w:p>
-    <w:p>
-      <w:pPr>
-        <w:pStyle w:val="BodyText"/>
-      </w:pPr>
-      <w:r>
-        <w:t xml:space="preserve">Отдельное ограничение связано с метриками. CER и WER измеряют формальную близость к эталону, но не полностью отражают историко-лингвистическую допустимость исправления. Для дальнейшей работы нужна вручную проверенная подвыборка, где ошибки модели будут оцениваться не только автоматически, но и экспертно.</w:t>
-      </w:r>
-    </w:p>
-    <w:bookmarkEnd w:id="62"/>
-    <w:bookmarkStart w:id="63" w:name="X9ae740f4b068656258209a4fa61338553b28ec2"/>
-    <w:p>
-      <w:pPr>
-        <w:pStyle w:val="Heading3"/>
-      </w:pPr>
-      <w:r>
-        <w:t xml:space="preserve">5.12 Проверка переноса на постраничном реальном OCR</w:t>
-      </w:r>
-    </w:p>
-    <w:p>
-      <w:pPr>
-        <w:pStyle w:val="FirstParagraph"/>
-      </w:pPr>
-      <w:r>
-        <w:t xml:space="preserve">После основной оценки на синтетическом наборе была проведена отдельная проверка на реальном OCR-выводе. Она нужна для того, чтобы не смешивать два разных результата: качество модели на контролируемом синтетическом шуме и её поведение на настоящем OCR, где ошибки появляются из-за скана, шрифта, сегментации страницы и работы конкретной OCR-системы.</w:t>
-      </w:r>
-    </w:p>
-    <w:p>
-      <w:pPr>
-        <w:pStyle w:val="BodyText"/>
-      </w:pPr>
-      <w:r>
-        <w:t xml:space="preserve">Для проверки использован османско-турецкий печатный источник в арабской графике. Этот материал рассматривается как связанный арабографичный тюркский проверочный случай. Он не является старотатарским или старобашкирским набором данных: татарские и башкирские источники остаются целевой мотивацией и направлением дальнейшего расширения, а текущая проверка на реальном OCR нужна для первичной оценки переноса с синтетических ошибок на настоящий OCR.</w:t>
-      </w:r>
-    </w:p>
-    <w:p>
-      <w:pPr>
-        <w:pStyle w:val="BodyText"/>
-      </w:pPr>
-      <w:r>
-        <w:t xml:space="preserve">Локальный набор содержит 72 страницы. Для оценки были оставлены 68 страниц, где есть непустой OCR-вывод и достаточно длинная постраничная транскрипция. В отфильтрованной части содержится 90 457 символов эталонного текста и 81 593 символа OCR-текста. Сырые PDF, изображения страниц, OCR-выводы, эталонные тексты и файлы предсказаний в репозитории не распространяются; в Git сохранены только скрипты и агрегированные таблицы.</w:t>
-      </w:r>
-    </w:p>
-    <w:p>
-      <w:pPr>
-        <w:pStyle w:val="BodyText"/>
-      </w:pPr>
-      <w:r>
-        <w:t xml:space="preserve">В эксперименте сравнивались три варианта:</w:t>
-      </w:r>
-    </w:p>
-    <w:p>
-      <w:pPr>
-        <w:pStyle w:val="Compact"/>
-        <w:numPr>
-          <w:ilvl w:val="0"/>
-          <w:numId w:val="1007"/>
-        </w:numPr>
-      </w:pPr>
-      <w:r>
-        <w:t xml:space="preserve">исходный OCR Tesseract как начальный уровень;</w:t>
-      </w:r>
-    </w:p>
-    <w:p>
-      <w:pPr>
-        <w:pStyle w:val="Compact"/>
-        <w:numPr>
-          <w:ilvl w:val="0"/>
-          <w:numId w:val="1007"/>
-        </w:numPr>
-      </w:pPr>
-      <w:r>
-        <w:t xml:space="preserve">ByT5-small, обученная на синтетическом шуме и применённая к постраничному OCR через разбиение страницы на фрагменты;</w:t>
-      </w:r>
-    </w:p>
-    <w:p>
-      <w:pPr>
-        <w:pStyle w:val="Compact"/>
-        <w:numPr>
-          <w:ilvl w:val="0"/>
-          <w:numId w:val="1007"/>
-        </w:numPr>
-      </w:pPr>
-      <w:r>
-        <w:t xml:space="preserve">ByT5-small со строгой фильтрацией, где предсказание отбрасывается, если оно слишком сильно меняет длину или слишком далеко уходит от исходного OCR.</w:t>
-      </w:r>
-    </w:p>
-    <w:p>
-      <w:pPr>
-        <w:pStyle w:val="FirstParagraph"/>
-      </w:pPr>
-      <w:r>
-        <w:t xml:space="preserve">Основные символные метрики проверки на реальном OCR представлены ниже. Для компактности</w:t>
-      </w:r>
-      <w:r>
-        <w:t xml:space="preserve"> </w:t>
-      </w:r>
-      <w:r>
-        <w:rPr>
-          <w:rStyle w:val="VerbatimChar"/>
-        </w:rPr>
-        <w:t xml:space="preserve">NS-CER</w:t>
-      </w:r>
-      <w:r>
-        <w:t xml:space="preserve"> </w:t>
-      </w:r>
-      <w:r>
-        <w:t xml:space="preserve">обозначает NoSpaceCER.</w:t>
-      </w:r>
-    </w:p>
-    <w:tbl>
-      <w:tblPr>
-        <w:tblStyle w:val="Table"/>
-        <w:tblW w:type="auto" w:w="0"/>
-        <w:tblLook w:firstRow="1" w:lastRow="0" w:firstColumn="0" w:lastColumn="0" w:noHBand="0" w:noVBand="0" w:val="0020"/>
-      </w:tblPr>
-      <w:tblGrid>
-        <w:gridCol w:w="1584"/>
-        <w:gridCol w:w="1584"/>
-        <w:gridCol w:w="1584"/>
-        <w:gridCol w:w="1584"/>
-        <w:gridCol w:w="1584"/>
-      </w:tblGrid>
-      <w:tr>
-        <w:trPr>
-          <w:tblHeader w:val="on"/>
-        </w:trPr>
-        <w:tc>
-          <w:tcPr/>
-          <w:p>
-            <w:pPr>
-              <w:pStyle w:val="Compact"/>
-            </w:pPr>
-            <w:r>
-              <w:t xml:space="preserve">Система</w:t>
-            </w:r>
-          </w:p>
-        </w:tc>
-        <w:tc>
-          <w:tcPr/>
-          <w:p>
-            <w:pPr>
-              <w:pStyle w:val="Compact"/>
-              <w:jc w:val="right"/>
-            </w:pPr>
-            <w:r>
-              <w:t xml:space="preserve">Стр.</w:t>
-            </w:r>
-          </w:p>
-        </w:tc>
-        <w:tc>
-          <w:tcPr/>
-          <w:p>
-            <w:pPr>
-              <w:pStyle w:val="Compact"/>
-              <w:jc w:val="right"/>
-            </w:pPr>
-            <w:r>
-              <w:t xml:space="preserve">CER ср.</w:t>
-            </w:r>
-          </w:p>
-        </w:tc>
-        <w:tc>
-          <w:tcPr/>
-          <w:p>
-            <w:pPr>
-              <w:pStyle w:val="Compact"/>
-              <w:jc w:val="right"/>
-            </w:pPr>
-            <w:r>
-              <w:t xml:space="preserve">CER мед.</w:t>
-            </w:r>
-          </w:p>
-        </w:tc>
-        <w:tc>
-          <w:tcPr/>
-          <w:p>
-            <w:pPr>
-              <w:pStyle w:val="Compact"/>
-              <w:jc w:val="right"/>
-            </w:pPr>
-            <w:r>
-              <w:t xml:space="preserve">NS-CER</w:t>
-            </w:r>
-          </w:p>
-        </w:tc>
-      </w:tr>
-      <w:tr>
-        <w:tc>
-          <w:tcPr/>
-          <w:p>
-            <w:pPr>
-              <w:pStyle w:val="Compact"/>
-            </w:pPr>
-            <w:r>
-              <w:t xml:space="preserve">Tesseract</w:t>
-            </w:r>
-          </w:p>
-        </w:tc>
-        <w:tc>
-          <w:tcPr/>
-          <w:p>
-            <w:pPr>
-              <w:pStyle w:val="Compact"/>
-              <w:jc w:val="right"/>
-            </w:pPr>
-            <w:r>
-              <w:t xml:space="preserve">68</w:t>
-            </w:r>
-          </w:p>
-        </w:tc>
-        <w:tc>
-          <w:tcPr/>
-          <w:p>
-            <w:pPr>
-              <w:pStyle w:val="Compact"/>
-              <w:jc w:val="right"/>
-            </w:pPr>
-            <w:r>
-              <w:t xml:space="preserve">0.3539</w:t>
-            </w:r>
-          </w:p>
-        </w:tc>
-        <w:tc>
-          <w:tcPr/>
-          <w:p>
-            <w:pPr>
-              <w:pStyle w:val="Compact"/>
-              <w:jc w:val="right"/>
-            </w:pPr>
-            <w:r>
-              <w:t xml:space="preserve">0.2983</w:t>
-            </w:r>
-          </w:p>
-        </w:tc>
-        <w:tc>
-          <w:tcPr/>
-          <w:p>
-            <w:pPr>
-              <w:pStyle w:val="Compact"/>
-              <w:jc w:val="right"/>
-            </w:pPr>
-            <w:r>
-              <w:t xml:space="preserve">0.3421</w:t>
-            </w:r>
-          </w:p>
-        </w:tc>
-      </w:tr>
-      <w:tr>
-        <w:tc>
-          <w:tcPr/>
-          <w:p>
-            <w:pPr>
-              <w:pStyle w:val="Compact"/>
-            </w:pPr>
-            <w:r>
-              <w:t xml:space="preserve">ByT5-frag</w:t>
-            </w:r>
-          </w:p>
-        </w:tc>
-        <w:tc>
-          <w:tcPr/>
-          <w:p>
-            <w:pPr>
-              <w:pStyle w:val="Compact"/>
-              <w:jc w:val="right"/>
-            </w:pPr>
-            <w:r>
-              <w:t xml:space="preserve">68</w:t>
-            </w:r>
-          </w:p>
-        </w:tc>
-        <w:tc>
-          <w:tcPr/>
-          <w:p>
-            <w:pPr>
-              <w:pStyle w:val="Compact"/>
-              <w:jc w:val="right"/>
-            </w:pPr>
-            <w:r>
-              <w:t xml:space="preserve">0.4564</w:t>
-            </w:r>
-          </w:p>
-        </w:tc>
-        <w:tc>
-          <w:tcPr/>
-          <w:p>
-            <w:pPr>
-              <w:pStyle w:val="Compact"/>
-              <w:jc w:val="right"/>
-            </w:pPr>
-            <w:r>
-              <w:t xml:space="preserve">0.4206</w:t>
-            </w:r>
-          </w:p>
-        </w:tc>
-        <w:tc>
-          <w:tcPr/>
-          <w:p>
-            <w:pPr>
-              <w:pStyle w:val="Compact"/>
-              <w:jc w:val="right"/>
-            </w:pPr>
-            <w:r>
-              <w:t xml:space="preserve">0.4658</w:t>
-            </w:r>
-          </w:p>
-        </w:tc>
-      </w:tr>
-      <w:tr>
-        <w:tc>
-          <w:tcPr/>
-          <w:p>
-            <w:pPr>
-              <w:pStyle w:val="Compact"/>
-            </w:pPr>
-            <w:r>
-              <w:t xml:space="preserve">ByT5-filter</w:t>
-            </w:r>
-          </w:p>
-        </w:tc>
-        <w:tc>
-          <w:tcPr/>
-          <w:p>
-            <w:pPr>
-              <w:pStyle w:val="Compact"/>
-              <w:jc w:val="right"/>
-            </w:pPr>
-            <w:r>
-              <w:t xml:space="preserve">68</w:t>
-            </w:r>
-          </w:p>
-        </w:tc>
-        <w:tc>
-          <w:tcPr/>
-          <w:p>
-            <w:pPr>
-              <w:pStyle w:val="Compact"/>
-              <w:jc w:val="right"/>
-            </w:pPr>
-            <w:r>
-              <w:t xml:space="preserve">0.3828</w:t>
-            </w:r>
-          </w:p>
-        </w:tc>
-        <w:tc>
-          <w:tcPr/>
-          <w:p>
-            <w:pPr>
-              <w:pStyle w:val="Compact"/>
-              <w:jc w:val="right"/>
-            </w:pPr>
-            <w:r>
-              <w:t xml:space="preserve">0.3442</w:t>
-            </w:r>
-          </w:p>
-        </w:tc>
-        <w:tc>
-          <w:tcPr/>
-          <w:p>
-            <w:pPr>
-              <w:pStyle w:val="Compact"/>
-              <w:jc w:val="right"/>
-            </w:pPr>
-            <w:r>
-              <w:t xml:space="preserve">0.3830</w:t>
-            </w:r>
-          </w:p>
-        </w:tc>
-      </w:tr>
-    </w:tbl>
-    <w:p>
-      <w:pPr>
-        <w:pStyle w:val="BodyText"/>
-      </w:pPr>
-      <w:r>
-        <w:t xml:space="preserve">Метрики на уровне слов приведены отдельно, чтобы не перегружать таблицу.</w:t>
+        <w:t xml:space="preserve">Метрики на уровне слов приведены отдельно.</w:t>
       </w:r>
     </w:p>
     <w:tbl>
@@ -4930,15 +4430,25 @@
         <w:pStyle w:val="BodyText"/>
       </w:pPr>
       <w:r>
-        <w:t xml:space="preserve">По среднему CER исходный Tesseract оказался лучше, чем оба варианта посткоррекции. ByT5 снижает WER с 0.9238 до 0.8919, но одновременно ухудшает CER с 0.3539 до 0.4564 и NoSpaceCER с 0.3421 до 0.4658. Для OCR-задачи на арабской графике это важное различие: метрика на уровне слов может улучшаться за счёт пробелов и границ слов, но если ошибка на уровне символов растёт, модель нельзя считать практически надёжной.</w:t>
-      </w:r>
-    </w:p>
-    <w:p>
-      <w:pPr>
-        <w:pStyle w:val="BodyText"/>
-      </w:pPr>
-      <w:r>
-        <w:t xml:space="preserve">Постраничный разбор подтверждает эту картину.</w:t>
+        <w:t xml:space="preserve">Результат получился смешанным. По WER посткоррекция немного помогает: вариант с фрагментами снижает средний WER с 0.9238 до 0.8919. Но по CER и NoSpaceCER исходный Tesseract остаётся лучше. Для OCR на арабской графике это принципиально: улучшение границ слов не компенсирует ухудшение символного состава.</w:t>
+      </w:r>
+    </w:p>
+    <w:bookmarkEnd w:id="63"/>
+    <w:bookmarkStart w:id="64" w:name="постраничное-поведение-модели"/>
+    <w:p>
+      <w:pPr>
+        <w:pStyle w:val="Heading3"/>
+      </w:pPr>
+      <w:r>
+        <w:t xml:space="preserve">5.13 Постраничное поведение модели</w:t>
+      </w:r>
+    </w:p>
+    <w:p>
+      <w:pPr>
+        <w:pStyle w:val="FirstParagraph"/>
+      </w:pPr>
+      <w:r>
+        <w:t xml:space="preserve">Для проверки безопасности посткоррекции я отдельно посчитал, на скольких страницах модель улучшает или ухудшает CER относительно исходного Tesseract.</w:t>
       </w:r>
     </w:p>
     <w:tbl>
@@ -5109,25 +4619,25 @@
         <w:pStyle w:val="BodyText"/>
       </w:pPr>
       <w:r>
-        <w:t xml:space="preserve">Без строгой фильтрации модель улучшает только 6 страниц из 68 и ухудшает 62 страницы. Строгая фильтрация резко уменьшает число плохих случаев и даёт 33 улучшенные страницы, но средний CER всё равно остаётся хуже, чем у исходного OCR. Значит, защитный откат помогает уменьшить риск, но не заменяет обучение на реальных ошибках.</w:t>
-      </w:r>
-    </w:p>
-    <w:p>
-      <w:pPr>
-        <w:pStyle w:val="BodyText"/>
-      </w:pPr>
-      <w:r>
-        <w:t xml:space="preserve">Главный вывод этой проверки: результат на синтетическом наборе не переносится напрямую на полноценный сценарий реального OCR. Модель выучила распределение искусственного шума, но настоящий Tesseract OCR для османско-турецкой арабской графики имеет другую структуру ошибок. Для следующего этапа нужны выровненные пары «OCR-вывод — эталон», постраничное разбиение без утечки, обучение на настоящих OCR-ошибках и более аккуратная проверка на страницах, не использованных при обучении.</w:t>
-      </w:r>
-    </w:p>
-    <w:bookmarkEnd w:id="63"/>
-    <w:bookmarkStart w:id="64" w:name="X7e9a333c0e348598314438ea8ff63960782a9d4"/>
+        <w:t xml:space="preserve">Без фильтрации модель улучшает только 6 страниц из 68 и ухудшает 62. Это означает, что прямое применение модели, обученной только на синтетическом шуме, к постраничному OCR небезопасно. Строгая фильтрация заметно уменьшает риск: число улучшенных страниц растёт до 33, а число ухудшенных снижается до 32. Но даже после фильтрации средний CER остаётся хуже, чем у исходного Tesseract.</w:t>
+      </w:r>
+    </w:p>
+    <w:p>
+      <w:pPr>
+        <w:pStyle w:val="BodyText"/>
+      </w:pPr>
+      <w:r>
+        <w:t xml:space="preserve">Этот результат полезнее, чем простой положительный отчёт о синтетических метриках. Он показывает место, где текущий подход ломается: модель выучила распределение синтетических ошибок, но не структуру настоящих ошибок Tesseract на конкретном печатном источнике.</w:t>
+      </w:r>
+    </w:p>
+    <w:bookmarkEnd w:id="64"/>
+    <w:bookmarkStart w:id="65" w:name="качественная-интерпретация-real-ocr"/>
     <w:p>
       <w:pPr>
         <w:pStyle w:val="Heading3"/>
       </w:pPr>
       <w:r>
-        <w:t xml:space="preserve">5.13 Качественный разбор отдельных строк реального OCR</w:t>
+        <w:t xml:space="preserve">5.14 Качественная интерпретация real OCR</w:t>
       </w:r>
     </w:p>
     <w:p>
@@ -5135,1004 +4645,23 @@
         <w:pStyle w:val="FirstParagraph"/>
       </w:pPr>
       <w:r>
-        <w:t xml:space="preserve">Агрегированные метрики показывают общий эффект, но для проверки на реальном OCR важно посмотреть и на отдельные строки. Ниже приведены примеры из построчной подвыборки реального OCR: исходный OCR-вывод Tesseract, предсказание ByT5-small и проверенный эталонный текст. Эти примеры не используются как самостоятельное доказательство качества модели; они нужны для интерпретации типов ошибок.</w:t>
-      </w:r>
-    </w:p>
-    <w:p>
-      <w:pPr>
-        <w:pStyle w:val="BodyText"/>
-      </w:pPr>
-      <w:r>
-        <w:rPr>
-          <w:b/>
-          <w:bCs/>
-        </w:rPr>
-        <w:t xml:space="preserve">Пример 1 — небольшое улучшение за счёт локальной правки.</w:t>
-      </w:r>
-    </w:p>
-    <w:p>
-      <w:pPr>
-        <w:pStyle w:val="Compact"/>
-        <w:numPr>
-          <w:ilvl w:val="0"/>
-          <w:numId w:val="1008"/>
-        </w:numPr>
-      </w:pPr>
-      <w:r>
-        <w:t xml:space="preserve">OCR:</w:t>
-      </w:r>
-      <w:r>
-        <w:t xml:space="preserve"> </w:t>
-      </w:r>
-      <w:r>
-        <w:rPr>
-          <w:rStyle w:val="VerbatimChar"/>
-        </w:rPr>
-        <w:t xml:space="preserve">ادمار تشديرمشدر . بونلرك اوقراينا تارخى واتنوغىافسى حقنده</w:t>
-      </w:r>
-    </w:p>
-    <w:p>
-      <w:pPr>
-        <w:pStyle w:val="Compact"/>
-        <w:numPr>
-          <w:ilvl w:val="0"/>
-          <w:numId w:val="1008"/>
-        </w:numPr>
-      </w:pPr>
-      <w:r>
-        <w:t xml:space="preserve">ByT5:</w:t>
-      </w:r>
-      <w:r>
-        <w:t xml:space="preserve"> </w:t>
-      </w:r>
-      <w:r>
-        <w:rPr>
-          <w:rStyle w:val="VerbatimChar"/>
-        </w:rPr>
-        <w:t xml:space="preserve">ادمار تشديرمشدر. بونلرك اوقراينا تارخى واتنوغيافسى حقنده</w:t>
-      </w:r>
-    </w:p>
-    <w:p>
-      <w:pPr>
-        <w:pStyle w:val="Compact"/>
-        <w:numPr>
-          <w:ilvl w:val="0"/>
-          <w:numId w:val="1008"/>
-        </w:numPr>
-      </w:pPr>
-      <w:r>
-        <w:t xml:space="preserve">Эталон:</w:t>
-      </w:r>
-      <w:r>
-        <w:t xml:space="preserve"> </w:t>
-      </w:r>
-      <w:r>
-        <w:rPr>
-          <w:rStyle w:val="VerbatimChar"/>
-        </w:rPr>
-        <w:t xml:space="preserve">اديبلر يتيشدير مشدر. بونلرك اوقراينا تاریخی واتنوغرافيسى حقنده</w:t>
-      </w:r>
-    </w:p>
-    <w:p>
-      <w:pPr>
-        <w:pStyle w:val="Compact"/>
-        <w:numPr>
-          <w:ilvl w:val="0"/>
-          <w:numId w:val="1008"/>
-        </w:numPr>
-      </w:pPr>
-      <w:r>
-        <w:t xml:space="preserve">CER:</w:t>
-      </w:r>
-      <w:r>
-        <w:t xml:space="preserve"> </w:t>
-      </w:r>
-      <w:r>
-        <w:rPr>
-          <w:rStyle w:val="VerbatimChar"/>
-        </w:rPr>
-        <w:t xml:space="preserve">с 0.177419 до 0.161290</w:t>
-      </w:r>
-    </w:p>
-    <w:p>
-      <w:pPr>
-        <w:pStyle w:val="FirstParagraph"/>
-      </w:pPr>
-      <w:r>
-        <w:t xml:space="preserve">В этом случае модель немного приближает строку к эталону: убирает лишний пробел перед точкой и частично меняет фрагмент слова. Однако строка всё равно остаётся далека от эталона: часть ошибок Tesseract связана не с одним символом, а с неверным чтением целого фрагмента.</w:t>
-      </w:r>
-    </w:p>
-    <w:p>
-      <w:pPr>
-        <w:pStyle w:val="BodyText"/>
-      </w:pPr>
-      <w:r>
-        <w:rPr>
-          <w:b/>
-          <w:bCs/>
-        </w:rPr>
-        <w:t xml:space="preserve">Пример 2 — улучшение локальной формы, но без полного восстановления строки.</w:t>
-      </w:r>
-    </w:p>
-    <w:p>
-      <w:pPr>
-        <w:pStyle w:val="Compact"/>
-        <w:numPr>
-          <w:ilvl w:val="0"/>
-          <w:numId w:val="1009"/>
-        </w:numPr>
-      </w:pPr>
-      <w:r>
-        <w:t xml:space="preserve">OCR:</w:t>
-      </w:r>
-      <w:r>
-        <w:t xml:space="preserve"> </w:t>
-      </w:r>
-      <w:r>
-        <w:rPr>
-          <w:rStyle w:val="VerbatimChar"/>
-        </w:rPr>
-        <w:t xml:space="preserve">تعميق وتوستى اجون مهم برر سائق اواشاردر . بودورهيهمنسوب</w:t>
-      </w:r>
-    </w:p>
-    <w:p>
-      <w:pPr>
-        <w:pStyle w:val="Compact"/>
-        <w:numPr>
-          <w:ilvl w:val="0"/>
-          <w:numId w:val="1009"/>
-        </w:numPr>
-      </w:pPr>
-      <w:r>
-        <w:t xml:space="preserve">ByT5:</w:t>
-      </w:r>
-      <w:r>
-        <w:t xml:space="preserve"> </w:t>
-      </w:r>
-      <w:r>
-        <w:rPr>
-          <w:rStyle w:val="VerbatimChar"/>
-        </w:rPr>
-        <w:t xml:space="preserve">تعميق وتوستى اجون مهم بر سائق اواشاردر. بودوره يه منسوب</w:t>
-      </w:r>
-    </w:p>
-    <w:p>
-      <w:pPr>
-        <w:pStyle w:val="Compact"/>
-        <w:numPr>
-          <w:ilvl w:val="0"/>
-          <w:numId w:val="1009"/>
-        </w:numPr>
-      </w:pPr>
-      <w:r>
-        <w:t xml:space="preserve">Эталон:</w:t>
-      </w:r>
-      <w:r>
-        <w:t xml:space="preserve"> </w:t>
-      </w:r>
-      <w:r>
-        <w:rPr>
-          <w:rStyle w:val="VerbatimChar"/>
-        </w:rPr>
-        <w:t xml:space="preserve">تعميق وتوسیعی ايچون مهم برر سائق اولمشلردر. بودوره به منسوب</w:t>
-      </w:r>
-    </w:p>
-    <w:p>
-      <w:pPr>
-        <w:pStyle w:val="Compact"/>
-        <w:numPr>
-          <w:ilvl w:val="0"/>
-          <w:numId w:val="1009"/>
-        </w:numPr>
-      </w:pPr>
-      <w:r>
-        <w:t xml:space="preserve">CER:</w:t>
-      </w:r>
-      <w:r>
-        <w:t xml:space="preserve"> </w:t>
-      </w:r>
-      <w:r>
-        <w:rPr>
-          <w:rStyle w:val="VerbatimChar"/>
-        </w:rPr>
-        <w:t xml:space="preserve">с 0.203390 до 0.169492</w:t>
-      </w:r>
-    </w:p>
-    <w:p>
-      <w:pPr>
-        <w:pStyle w:val="FirstParagraph"/>
-      </w:pPr>
-      <w:r>
-        <w:t xml:space="preserve">Здесь ByT5 исправляет часть пробельных и локальных ошибок, поэтому CER снижается. Но модель не восстанавливает более сложные расхождения вроде</w:t>
-      </w:r>
-      <w:r>
-        <w:t xml:space="preserve"> </w:t>
-      </w:r>
-      <w:r>
-        <w:rPr>
-          <w:rStyle w:val="VerbatimChar"/>
-        </w:rPr>
-        <w:t xml:space="preserve">وتوسیعی</w:t>
-      </w:r>
-      <w:r>
-        <w:t xml:space="preserve">,</w:t>
-      </w:r>
-      <w:r>
-        <w:t xml:space="preserve"> </w:t>
-      </w:r>
-      <w:r>
-        <w:rPr>
-          <w:rStyle w:val="VerbatimChar"/>
-        </w:rPr>
-        <w:t xml:space="preserve">ايچون</w:t>
-      </w:r>
-      <w:r>
-        <w:t xml:space="preserve"> </w:t>
-      </w:r>
-      <w:r>
-        <w:t xml:space="preserve">и</w:t>
-      </w:r>
-      <w:r>
-        <w:t xml:space="preserve"> </w:t>
-      </w:r>
-      <w:r>
-        <w:rPr>
-          <w:rStyle w:val="VerbatimChar"/>
-        </w:rPr>
-        <w:t xml:space="preserve">اولمشلردر</w:t>
-      </w:r>
-      <w:r>
-        <w:t xml:space="preserve">. Это показывает границу модели, обученной только на синтетическом шуме.</w:t>
-      </w:r>
-    </w:p>
-    <w:p>
-      <w:pPr>
-        <w:pStyle w:val="BodyText"/>
-      </w:pPr>
-      <w:r>
-        <w:rPr>
-          <w:b/>
-          <w:bCs/>
-        </w:rPr>
-        <w:t xml:space="preserve">Пример 3 — полезная частичная коррекция имени или фрагмента.</w:t>
-      </w:r>
-    </w:p>
-    <w:p>
-      <w:pPr>
-        <w:pStyle w:val="Compact"/>
-        <w:numPr>
-          <w:ilvl w:val="0"/>
-          <w:numId w:val="1010"/>
-        </w:numPr>
-      </w:pPr>
-      <w:r>
-        <w:t xml:space="preserve">OCR:</w:t>
-      </w:r>
-      <w:r>
-        <w:t xml:space="preserve"> </w:t>
-      </w:r>
-      <w:r>
-        <w:rPr>
-          <w:rStyle w:val="VerbatimChar"/>
-        </w:rPr>
-        <w:t xml:space="preserve">( جوينسكى ) ومورخ وشاع ( قوليش )ك2 اسمارى ذكر</w:t>
-      </w:r>
-    </w:p>
-    <w:p>
-      <w:pPr>
-        <w:pStyle w:val="Compact"/>
-        <w:numPr>
-          <w:ilvl w:val="0"/>
-          <w:numId w:val="1010"/>
-        </w:numPr>
-      </w:pPr>
-      <w:r>
-        <w:t xml:space="preserve">ByT5:</w:t>
-      </w:r>
-      <w:r>
-        <w:t xml:space="preserve"> </w:t>
-      </w:r>
-      <w:r>
-        <w:rPr>
-          <w:rStyle w:val="VerbatimChar"/>
-        </w:rPr>
-        <w:t xml:space="preserve">(جوينسكى ) ومورخ وشاع (قوليش)ك اسمارى ذكر</w:t>
-      </w:r>
-    </w:p>
-    <w:p>
-      <w:pPr>
-        <w:pStyle w:val="Compact"/>
-        <w:numPr>
-          <w:ilvl w:val="0"/>
-          <w:numId w:val="1010"/>
-        </w:numPr>
-      </w:pPr>
-      <w:r>
-        <w:t xml:space="preserve">Эталон:</w:t>
-      </w:r>
-      <w:r>
-        <w:t xml:space="preserve"> </w:t>
-      </w:r>
-      <w:r>
-        <w:rPr>
-          <w:rStyle w:val="VerbatimChar"/>
-        </w:rPr>
-        <w:t xml:space="preserve">(چوبينسكي) ومورخ وشاعر (قوليش)ك اسملرى ذكر ایديلمليدرلر.</w:t>
-      </w:r>
-    </w:p>
-    <w:p>
-      <w:pPr>
-        <w:pStyle w:val="Compact"/>
-        <w:numPr>
-          <w:ilvl w:val="0"/>
-          <w:numId w:val="1010"/>
-        </w:numPr>
-      </w:pPr>
-      <w:r>
-        <w:t xml:space="preserve">CER:</w:t>
-      </w:r>
-      <w:r>
-        <w:t xml:space="preserve"> </w:t>
-      </w:r>
-      <w:r>
-        <w:rPr>
-          <w:rStyle w:val="VerbatimChar"/>
-        </w:rPr>
-        <w:t xml:space="preserve">с 0.428571 до 0.357143</w:t>
-      </w:r>
-    </w:p>
-    <w:p>
-      <w:pPr>
-        <w:pStyle w:val="FirstParagraph"/>
-      </w:pPr>
-      <w:r>
-        <w:t xml:space="preserve">В этом примере модель убирает часть лишних пробелов и артефакт</w:t>
-      </w:r>
-      <w:r>
-        <w:t xml:space="preserve"> </w:t>
-      </w:r>
-      <w:r>
-        <w:rPr>
-          <w:rStyle w:val="VerbatimChar"/>
-        </w:rPr>
-        <w:t xml:space="preserve">ك2</w:t>
-      </w:r>
-      <w:r>
-        <w:t xml:space="preserve">, из-за чего формальная близость к эталону растёт. Но она не восстанавливает пропущенную часть строки и не исправляет все графемные различия. Такой случай показывает, что ByT5 может давать полезную частичную коррекцию, но не заменяет полноценную line-level модель, обученную на настоящих OCR-ошибках.</w:t>
-      </w:r>
-    </w:p>
-    <w:p>
-      <w:pPr>
-        <w:pStyle w:val="BodyText"/>
-      </w:pPr>
-      <w:r>
-        <w:rPr>
-          <w:b/>
-          <w:bCs/>
-        </w:rPr>
-        <w:t xml:space="preserve">Пример 4 — ухудшение из-за неудачной генерации.</w:t>
-      </w:r>
-    </w:p>
-    <w:p>
-      <w:pPr>
-        <w:pStyle w:val="Compact"/>
-        <w:numPr>
-          <w:ilvl w:val="0"/>
-          <w:numId w:val="1011"/>
-        </w:numPr>
-      </w:pPr>
-      <w:r>
-        <w:t xml:space="preserve">OCR:</w:t>
-      </w:r>
-      <w:r>
-        <w:t xml:space="preserve"> </w:t>
-      </w:r>
-      <w:r>
-        <w:rPr>
-          <w:rStyle w:val="VerbatimChar"/>
-        </w:rPr>
-        <w:t xml:space="preserve">بازش اولدقارى اترار» اوكراساعاومق» اووويا علماريتك سويسته</w:t>
-      </w:r>
-    </w:p>
-    <w:p>
-      <w:pPr>
-        <w:pStyle w:val="Compact"/>
-        <w:numPr>
-          <w:ilvl w:val="0"/>
-          <w:numId w:val="1011"/>
-        </w:numPr>
-      </w:pPr>
-      <w:r>
-        <w:t xml:space="preserve">ByT5:</w:t>
-      </w:r>
-      <w:r>
-        <w:t xml:space="preserve"> </w:t>
-      </w:r>
-      <w:r>
-        <w:rPr>
-          <w:rStyle w:val="VerbatimChar"/>
-        </w:rPr>
-        <w:t xml:space="preserve">بارش اولدقارى اترار» اوكراساع اومق» اووونا علماريتك سويسته</w:t>
-      </w:r>
-    </w:p>
-    <w:p>
-      <w:pPr>
-        <w:pStyle w:val="Compact"/>
-        <w:numPr>
-          <w:ilvl w:val="0"/>
-          <w:numId w:val="1011"/>
-        </w:numPr>
-      </w:pPr>
-      <w:r>
-        <w:t xml:space="preserve">Эталон:</w:t>
-      </w:r>
-      <w:r>
-        <w:t xml:space="preserve"> </w:t>
-      </w:r>
-      <w:r>
-        <w:rPr>
-          <w:rStyle w:val="VerbatimChar"/>
-        </w:rPr>
-        <w:t xml:space="preserve">يازمش اولدقلری اثرلر، اوقرانيا علومنی، آوروپا عاملرينك سويەسنه</w:t>
-      </w:r>
-    </w:p>
-    <w:p>
-      <w:pPr>
-        <w:pStyle w:val="Compact"/>
-        <w:numPr>
-          <w:ilvl w:val="0"/>
-          <w:numId w:val="1011"/>
-        </w:numPr>
-      </w:pPr>
-      <w:r>
-        <w:t xml:space="preserve">CER:</w:t>
-      </w:r>
-      <w:r>
-        <w:t xml:space="preserve"> </w:t>
-      </w:r>
-      <w:r>
-        <w:rPr>
-          <w:rStyle w:val="VerbatimChar"/>
-        </w:rPr>
-        <w:t xml:space="preserve">с 0.370968 до 0.403226</w:t>
-      </w:r>
-    </w:p>
-    <w:p>
-      <w:pPr>
-        <w:pStyle w:val="FirstParagraph"/>
-      </w:pPr>
-      <w:r>
-        <w:t xml:space="preserve">Здесь модель меняет отдельные фрагменты, но не приближает строку к эталону. Ошибка Tesseract слишком велика и затрагивает смысловые куски строки, поэтому локальная посткоррекция начинает добавлять новые расхождения.</w:t>
-      </w:r>
-    </w:p>
-    <w:p>
-      <w:pPr>
-        <w:pStyle w:val="BodyText"/>
-      </w:pPr>
-      <w:r>
-        <w:rPr>
-          <w:b/>
-          <w:bCs/>
-        </w:rPr>
-        <w:t xml:space="preserve">Пример 5 — почти полный провал OCR, который модель не может восстановить.</w:t>
-      </w:r>
-    </w:p>
-    <w:p>
-      <w:pPr>
-        <w:pStyle w:val="Compact"/>
-        <w:numPr>
-          <w:ilvl w:val="0"/>
-          <w:numId w:val="1012"/>
-        </w:numPr>
-      </w:pPr>
-      <w:r>
-        <w:t xml:space="preserve">OCR:</w:t>
-      </w:r>
-      <w:r>
-        <w:t xml:space="preserve"> </w:t>
-      </w:r>
-      <w:r>
-        <w:rPr>
-          <w:rStyle w:val="VerbatimChar"/>
-        </w:rPr>
-        <w:t xml:space="preserve">فقط بواسمارك قعرنده اوقراينالك بوتون قواى فطر يوسن ى شل</w:t>
-      </w:r>
-    </w:p>
-    <w:p>
-      <w:pPr>
-        <w:pStyle w:val="Compact"/>
-        <w:numPr>
-          <w:ilvl w:val="0"/>
-          <w:numId w:val="1012"/>
-        </w:numPr>
-      </w:pPr>
-      <w:r>
-        <w:t xml:space="preserve">ByT5:</w:t>
-      </w:r>
-      <w:r>
-        <w:t xml:space="preserve"> </w:t>
-      </w:r>
-      <w:r>
-        <w:rPr>
-          <w:rStyle w:val="VerbatimChar"/>
-        </w:rPr>
-        <w:t xml:space="preserve">فقط بواسمارك قعرنده اوقراينالك بوتون قواى فطر يوسنى شلر</w:t>
-      </w:r>
-    </w:p>
-    <w:p>
-      <w:pPr>
-        <w:pStyle w:val="Compact"/>
-        <w:numPr>
-          <w:ilvl w:val="0"/>
-          <w:numId w:val="1012"/>
-        </w:numPr>
-      </w:pPr>
-      <w:r>
-        <w:t xml:space="preserve">Эталон:</w:t>
-      </w:r>
-      <w:r>
-        <w:t xml:space="preserve"> </w:t>
-      </w:r>
-      <w:r>
-        <w:rPr>
-          <w:rStyle w:val="VerbatimChar"/>
-        </w:rPr>
-        <w:t xml:space="preserve">بويوك اوقراينا شاعری (طاراس شەوچەنقو)نك اسمى</w:t>
-      </w:r>
-    </w:p>
-    <w:p>
-      <w:pPr>
-        <w:pStyle w:val="Compact"/>
-        <w:numPr>
-          <w:ilvl w:val="0"/>
-          <w:numId w:val="1012"/>
-        </w:numPr>
-      </w:pPr>
-      <w:r>
-        <w:t xml:space="preserve">CER:</w:t>
-      </w:r>
-      <w:r>
-        <w:t xml:space="preserve"> </w:t>
-      </w:r>
-      <w:r>
-        <w:rPr>
-          <w:rStyle w:val="VerbatimChar"/>
-        </w:rPr>
-        <w:t xml:space="preserve">с 0.931818 до 0.931818</w:t>
-      </w:r>
-    </w:p>
-    <w:p>
-      <w:pPr>
-        <w:pStyle w:val="FirstParagraph"/>
-      </w:pPr>
-      <w:r>
-        <w:t xml:space="preserve">В этом случае OCR-вывод почти не соответствует эталону. ByT5 делает небольшую локальную правку, но не имеет достаточной информации, чтобы восстановить правильную строку. Такой пример особенно важен: если исходный OCR сильно ошибается на уровне строки или порядка чтения, текстовая посткоррекция без изображения и без обучения на реальных OCR-ошибках не решает задачу.</w:t>
-      </w:r>
-    </w:p>
-    <w:p>
-      <w:pPr>
-        <w:pStyle w:val="BodyText"/>
-      </w:pPr>
-      <w:r>
-        <w:t xml:space="preserve">Эти примеры уточняют количественный вывод. На построчной подвыборке ByT5-small может немного улучшать CER и WER, но улучшение часто связано с локальными исправлениями, пробелами и частичными графемными заменами. При грубых ошибках Tesseract, пропусках больших фрагментов или нарушении порядка чтения модель либо почти ничего не исправляет, либо ухудшает строку. Поэтому следующий этап должен включать выровненные пары «OCR-вывод — эталон», ручную типологию ошибок и обучение на настоящем распределении OCR-ошибок.</w:t>
-      </w:r>
-    </w:p>
-    <w:bookmarkEnd w:id="64"/>
-    <w:bookmarkStart w:id="65" w:name="Xc49697dafbe0e7fd9f030ef296d0d6e7abcc8c1"/>
-    <w:p>
-      <w:pPr>
-        <w:pStyle w:val="Heading3"/>
-      </w:pPr>
-      <w:r>
-        <w:t xml:space="preserve">5.14 Качественный разбор постраничных случаев реального OCR</w:t>
-      </w:r>
-    </w:p>
-    <w:p>
-      <w:pPr>
-        <w:pStyle w:val="FirstParagraph"/>
-      </w:pPr>
-      <w:r>
-        <w:t xml:space="preserve">Построчные примеры показывают локальные типы ошибок, но постраничная проверка отвечает на другой вопрос: что происходит, если применить модель к целой странице после разбиения на фрагменты. Ниже приведены несколько характерных случаев из постраничного эксперимента. В столбцах CER и WER значения указаны в порядке «исходный OCR / ByT5 / фильтрация»: исходный OCR — результат Tesseract, ByT5 — модель после применения к фрагментам страницы, фильтрация — вариант со строгой проверкой предсказаний.</w:t>
-      </w:r>
-    </w:p>
-    <w:tbl>
-      <w:tblPr>
-        <w:tblStyle w:val="Table"/>
-        <w:tblW w:type="pct" w:w="5000"/>
-        <w:tblLayout w:type="fixed"/>
-        <w:tblLook w:firstRow="1" w:lastRow="0" w:firstColumn="0" w:lastColumn="0" w:noHBand="0" w:noVBand="0" w:val="0020"/>
-      </w:tblPr>
-      <w:tblGrid>
-        <w:gridCol w:w="1667"/>
-        <w:gridCol w:w="1667"/>
-        <w:gridCol w:w="1667"/>
-        <w:gridCol w:w="1667"/>
-        <w:gridCol w:w="1250"/>
-      </w:tblGrid>
-      <w:tr>
-        <w:trPr>
-          <w:tblHeader w:val="on"/>
-        </w:trPr>
-        <w:tc>
-          <w:tcPr/>
-          <w:p>
-            <w:pPr>
-              <w:pStyle w:val="Compact"/>
-              <w:jc w:val="right"/>
-            </w:pPr>
-            <w:r>
-              <w:t xml:space="preserve">№</w:t>
-            </w:r>
-          </w:p>
-        </w:tc>
-        <w:tc>
-          <w:tcPr/>
-          <w:p>
-            <w:pPr>
-              <w:pStyle w:val="Compact"/>
-              <w:jc w:val="right"/>
-            </w:pPr>
-            <w:r>
-              <w:t xml:space="preserve">Стр.</w:t>
-            </w:r>
-          </w:p>
-        </w:tc>
-        <w:tc>
-          <w:tcPr/>
-          <w:p>
-            <w:pPr>
-              <w:pStyle w:val="Compact"/>
-              <w:jc w:val="right"/>
-            </w:pPr>
-            <w:r>
-              <w:t xml:space="preserve">CER</w:t>
-            </w:r>
-          </w:p>
-        </w:tc>
-        <w:tc>
-          <w:tcPr/>
-          <w:p>
-            <w:pPr>
-              <w:pStyle w:val="Compact"/>
-              <w:jc w:val="right"/>
-            </w:pPr>
-            <w:r>
-              <w:t xml:space="preserve">WER</w:t>
-            </w:r>
-          </w:p>
-        </w:tc>
-        <w:tc>
-          <w:tcPr/>
-          <w:p>
-            <w:pPr>
-              <w:pStyle w:val="Compact"/>
-            </w:pPr>
-            <w:r>
-              <w:t xml:space="preserve">Итог</w:t>
-            </w:r>
-          </w:p>
-        </w:tc>
-      </w:tr>
-      <w:tr>
-        <w:tc>
-          <w:tcPr/>
-          <w:p>
-            <w:pPr>
-              <w:pStyle w:val="Compact"/>
-              <w:jc w:val="right"/>
-            </w:pPr>
-            <w:r>
-              <w:t xml:space="preserve">1</w:t>
-            </w:r>
-          </w:p>
-        </w:tc>
-        <w:tc>
-          <w:tcPr/>
-          <w:p>
-            <w:pPr>
-              <w:pStyle w:val="Compact"/>
-              <w:jc w:val="right"/>
-            </w:pPr>
-            <w:r>
-              <w:t xml:space="preserve">50</w:t>
-            </w:r>
-          </w:p>
-        </w:tc>
-        <w:tc>
-          <w:tcPr/>
-          <w:p>
-            <w:pPr>
-              <w:pStyle w:val="Compact"/>
-              <w:jc w:val="right"/>
-            </w:pPr>
-            <w:r>
-              <w:t xml:space="preserve">0.272 / 0.254 / 0.254</w:t>
-            </w:r>
-          </w:p>
-        </w:tc>
-        <w:tc>
-          <w:tcPr/>
-          <w:p>
-            <w:pPr>
-              <w:pStyle w:val="Compact"/>
-              <w:jc w:val="right"/>
-            </w:pPr>
-            <w:r>
-              <w:t xml:space="preserve">0.872 / 0.822 / 0.822</w:t>
-            </w:r>
-          </w:p>
-        </w:tc>
-        <w:tc>
-          <w:tcPr/>
-          <w:p>
-            <w:pPr>
-              <w:pStyle w:val="Compact"/>
-            </w:pPr>
-            <w:r>
-              <w:t xml:space="preserve">улучшение</w:t>
-            </w:r>
-          </w:p>
-        </w:tc>
-      </w:tr>
-      <w:tr>
-        <w:tc>
-          <w:tcPr/>
-          <w:p>
-            <w:pPr>
-              <w:pStyle w:val="Compact"/>
-              <w:jc w:val="right"/>
-            </w:pPr>
-            <w:r>
-              <w:t xml:space="preserve">2</w:t>
-            </w:r>
-          </w:p>
-        </w:tc>
-        <w:tc>
-          <w:tcPr/>
-          <w:p>
-            <w:pPr>
-              <w:pStyle w:val="Compact"/>
-              <w:jc w:val="right"/>
-            </w:pPr>
-            <w:r>
-              <w:t xml:space="preserve">38</w:t>
-            </w:r>
-          </w:p>
-        </w:tc>
-        <w:tc>
-          <w:tcPr/>
-          <w:p>
-            <w:pPr>
-              <w:pStyle w:val="Compact"/>
-              <w:jc w:val="right"/>
-            </w:pPr>
-            <w:r>
-              <w:t xml:space="preserve">0.318 / 0.301 / 0.301</w:t>
-            </w:r>
-          </w:p>
-        </w:tc>
-        <w:tc>
-          <w:tcPr/>
-          <w:p>
-            <w:pPr>
-              <w:pStyle w:val="Compact"/>
-              <w:jc w:val="right"/>
-            </w:pPr>
-            <w:r>
-              <w:t xml:space="preserve">0.907 / 0.849 / 0.849</w:t>
-            </w:r>
-          </w:p>
-        </w:tc>
-        <w:tc>
-          <w:tcPr/>
-          <w:p>
-            <w:pPr>
-              <w:pStyle w:val="Compact"/>
-            </w:pPr>
-            <w:r>
-              <w:t xml:space="preserve">умеренно лучше</w:t>
-            </w:r>
-          </w:p>
-        </w:tc>
-      </w:tr>
-      <w:tr>
-        <w:tc>
-          <w:tcPr/>
-          <w:p>
-            <w:pPr>
-              <w:pStyle w:val="Compact"/>
-              <w:jc w:val="right"/>
-            </w:pPr>
-            <w:r>
-              <w:t xml:space="preserve">3</w:t>
-            </w:r>
-          </w:p>
-        </w:tc>
-        <w:tc>
-          <w:tcPr/>
-          <w:p>
-            <w:pPr>
-              <w:pStyle w:val="Compact"/>
-              <w:jc w:val="right"/>
-            </w:pPr>
-            <w:r>
-              <w:t xml:space="preserve">56</w:t>
-            </w:r>
-          </w:p>
-        </w:tc>
-        <w:tc>
-          <w:tcPr/>
-          <w:p>
-            <w:pPr>
-              <w:pStyle w:val="Compact"/>
-              <w:jc w:val="right"/>
-            </w:pPr>
-            <w:r>
-              <w:t xml:space="preserve">0.340 / 0.516 / 0.339</w:t>
-            </w:r>
-          </w:p>
-        </w:tc>
-        <w:tc>
-          <w:tcPr/>
-          <w:p>
-            <w:pPr>
-              <w:pStyle w:val="Compact"/>
-              <w:jc w:val="right"/>
-            </w:pPr>
-            <w:r>
-              <w:t xml:space="preserve">1.127 / 0.897 / 1.127</w:t>
-            </w:r>
-          </w:p>
-        </w:tc>
-        <w:tc>
-          <w:tcPr/>
-          <w:p>
-            <w:pPr>
-              <w:pStyle w:val="Compact"/>
-            </w:pPr>
-            <w:r>
-              <w:t xml:space="preserve">WER лучше, CER хуже</w:t>
-            </w:r>
-          </w:p>
-        </w:tc>
-      </w:tr>
-      <w:tr>
-        <w:tc>
-          <w:tcPr/>
-          <w:p>
-            <w:pPr>
-              <w:pStyle w:val="Compact"/>
-              <w:jc w:val="right"/>
-            </w:pPr>
-            <w:r>
-              <w:t xml:space="preserve">4</w:t>
-            </w:r>
-          </w:p>
-        </w:tc>
-        <w:tc>
-          <w:tcPr/>
-          <w:p>
-            <w:pPr>
-              <w:pStyle w:val="Compact"/>
-              <w:jc w:val="right"/>
-            </w:pPr>
-            <w:r>
-              <w:t xml:space="preserve">59</w:t>
-            </w:r>
-          </w:p>
-        </w:tc>
-        <w:tc>
-          <w:tcPr/>
-          <w:p>
-            <w:pPr>
-              <w:pStyle w:val="Compact"/>
-              <w:jc w:val="right"/>
-            </w:pPr>
-            <w:r>
-              <w:t xml:space="preserve">0.298 / 0.695 / 0.297</w:t>
-            </w:r>
-          </w:p>
-        </w:tc>
-        <w:tc>
-          <w:tcPr/>
-          <w:p>
-            <w:pPr>
-              <w:pStyle w:val="Compact"/>
-              <w:jc w:val="right"/>
-            </w:pPr>
-            <w:r>
-              <w:t xml:space="preserve">0.890 / 0.973 / 0.890</w:t>
-            </w:r>
-          </w:p>
-        </w:tc>
-        <w:tc>
-          <w:tcPr/>
-          <w:p>
-            <w:pPr>
-              <w:pStyle w:val="Compact"/>
-            </w:pPr>
-            <w:r>
-              <w:t xml:space="preserve">ByT5 портит</w:t>
-            </w:r>
-          </w:p>
-        </w:tc>
-      </w:tr>
-      <w:tr>
-        <w:tc>
-          <w:tcPr/>
-          <w:p>
-            <w:pPr>
-              <w:pStyle w:val="Compact"/>
-              <w:jc w:val="right"/>
-            </w:pPr>
-            <w:r>
-              <w:t xml:space="preserve">5</w:t>
-            </w:r>
-          </w:p>
-        </w:tc>
-        <w:tc>
-          <w:tcPr/>
-          <w:p>
-            <w:pPr>
-              <w:pStyle w:val="Compact"/>
-              <w:jc w:val="right"/>
-            </w:pPr>
-            <w:r>
-              <w:t xml:space="preserve">3</w:t>
-            </w:r>
-          </w:p>
-        </w:tc>
-        <w:tc>
-          <w:tcPr/>
-          <w:p>
-            <w:pPr>
-              <w:pStyle w:val="Compact"/>
-              <w:jc w:val="right"/>
-            </w:pPr>
-            <w:r>
-              <w:t xml:space="preserve">0.245 / 0.518 / 0.244</w:t>
-            </w:r>
-          </w:p>
-        </w:tc>
-        <w:tc>
-          <w:tcPr/>
-          <w:p>
-            <w:pPr>
-              <w:pStyle w:val="Compact"/>
-              <w:jc w:val="right"/>
-            </w:pPr>
-            <w:r>
-              <w:t xml:space="preserve">0.807 / 0.836 / 0.807</w:t>
-            </w:r>
-          </w:p>
-        </w:tc>
-        <w:tc>
-          <w:tcPr/>
-          <w:p>
-            <w:pPr>
-              <w:pStyle w:val="Compact"/>
-            </w:pPr>
-            <w:r>
-              <w:t xml:space="preserve">фильтрация спасает</w:t>
-            </w:r>
-          </w:p>
-        </w:tc>
-      </w:tr>
-    </w:tbl>
-    <w:p>
-      <w:pPr>
-        <w:pStyle w:val="BodyText"/>
-      </w:pPr>
-      <w:r>
-        <w:t xml:space="preserve">Случаи 1–2 показывают, что ByT5-small иногда действительно улучшает целую страницу, но масштаб улучшения остаётся умеренным. Случай 3 показывает, почему WER нельзя интерпретировать отдельно от CER: метрика на уровне слов может улучшиться, хотя символный состав страницы ухудшается. Случаи 4–5 показывают роль варианта со строгой фильтрацией: он не делает модель сильнее, но снижает риск грубого ухудшения.</w:t>
-      </w:r>
-    </w:p>
-    <w:p>
-      <w:pPr>
-        <w:pStyle w:val="BodyText"/>
-      </w:pPr>
-      <w:r>
-        <w:t xml:space="preserve">Эти случаи уточняют общий вывод постраничного эксперимента. Модель, обученная только на синтетическом шуме, иногда переносится на реальный OCR, но часто изменяет символный состав страницы в худшую сторону. Поэтому практическое продолжение работы должно опираться не только на синтетический генератор, а на выровненные пары «OCR-вывод — эталон» и обучение на настоящих ошибках OCR.</w:t>
+        <w:t xml:space="preserve">В качественном разборе видно, что модель иногда исправляет пробелы и отдельные локальные искажения, но также может чрезмерно менять строку. На реальном OCR такие изменения опаснее, чем на синтетическом наборе: страница содержит ошибки сегментации, артефакты порядка чтения и фрагменты, которых не было в генераторе шума.</w:t>
+      </w:r>
+    </w:p>
+    <w:p>
+      <w:pPr>
+        <w:pStyle w:val="BodyText"/>
+      </w:pPr>
+      <w:r>
+        <w:t xml:space="preserve">Строгая фильтрация работает как защитный откат. Она отбрасывает предсказания, которые слишком сильно отличаются от исходного OCR по длине или расстоянию редактирования. Такой механизм не делает модель сильнее, но уменьшает число явно вредных исправлений. В будущей системе посткоррекции такой откат нужен обязательно: модель не должна заменять исходный OCR, если сама не даёт достаточно надёжного улучшения.</w:t>
+      </w:r>
+    </w:p>
+    <w:p>
+      <w:pPr>
+        <w:pStyle w:val="BodyText"/>
+      </w:pPr>
+      <w:r>
+        <w:t xml:space="preserve">Главный вывод этой проверки состоит в том, что обучение только на синтетике недостаточно. Для настоящего OCR нужны пары, где входом является реальный OCR-вывод, а выходом — проверенный эталонный текст. Только на таких данных можно понять, какие ошибки модель действительно исправляет, а какие создаёт сама.</w:t>
       </w:r>
     </w:p>
     <w:bookmarkEnd w:id="65"/>
@@ -6150,23 +4679,23 @@
         <w:pStyle w:val="FirstParagraph"/>
       </w:pPr>
       <w:r>
-        <w:t xml:space="preserve">Раздел результатов показывает две разные картины. В контролируемой синтетической постановке ByT5-small 512 превосходит метод без исправления, нормализатор на правилах и символьный метод на основе ошибок обучающей выборки. Она улучшает большинство тестовых примеров и особенно заметно снижает WER. Этот результат подтверждает, что нейросетевая посткоррекция с байтовым представлением подходит как рабочий пилотный подход для тюркского текста в арабской графике при заданном распределении шума.</w:t>
-      </w:r>
-    </w:p>
-    <w:p>
-      <w:pPr>
-        <w:pStyle w:val="BodyText"/>
-      </w:pPr>
-      <w:r>
-        <w:t xml:space="preserve">Но проверка на реальном OCR ограничивает этот вывод. На постраничном OCR османско-турецкого источника ByT5, обученная только на синтетических искажениях, уже не превосходит исходный Tesseract по CER. Напротив, без строгой фильтрации она ухудшает большинство страниц. Консервативный защитный откат снижает риск, но не даёт среднего выигрыша над исходным OCR.</w:t>
-      </w:r>
-    </w:p>
-    <w:p>
-      <w:pPr>
-        <w:pStyle w:val="BodyText"/>
-      </w:pPr>
-      <w:r>
-        <w:t xml:space="preserve">Итог раздела поэтому двойной. С одной стороны, экспериментальный контур, метрики и обучение модели работают в воспроизводимой синтетической среде. С другой стороны, практический переход к настоящим историческим сканам требует отдельной адаптации к реальным OCR-ошибкам. Это не косметическое улучшение будущей работы, а методологическое условие: без настоящих пар «OCR-вывод — эталон» нельзя честно утверждать, что модель решает реальную задачу посткоррекции.</w:t>
+        <w:t xml:space="preserve">Раздел результатов показывает две разные картины. На синтетическом наборе ByT5-small 512 превосходит метод без исправления, нормализатор на правилах и символьный метод. Она улучшает большинство тестовых строк и особенно заметно снижает WER.</w:t>
+      </w:r>
+    </w:p>
+    <w:p>
+      <w:pPr>
+        <w:pStyle w:val="BodyText"/>
+      </w:pPr>
+      <w:r>
+        <w:t xml:space="preserve">Проверка на реальном OCR ограничивает этот вывод. На постраничном OCR османско-турецкого источника модель, обученная только на синтетических ошибках, не превосходит исходный Tesseract по CER. Без фильтрации она ухудшает большинство страниц; с фильтрацией становится безопаснее, но всё равно не даёт среднего выигрыша по символным метрикам.</w:t>
+      </w:r>
+    </w:p>
+    <w:p>
+      <w:pPr>
+        <w:pStyle w:val="BodyText"/>
+      </w:pPr>
+      <w:r>
+        <w:t xml:space="preserve">Итог раздела такой: экспериментальный контур и обучение модели работают в контролируемой среде, но переход к реальным историческим сканам требует отдельной адаптации. Это не дополнительная косметическая проверка, а центральное условие практической применимости. Без настоящих пар «OCR-вывод — эталон» нельзя утверждать, что модель решает задачу OCR-посткоррекции для архивных источников.</w:t>
       </w:r>
     </w:p>
     <w:bookmarkEnd w:id="66"/>
@@ -6194,23 +4723,15 @@
         <w:pStyle w:val="FirstParagraph"/>
       </w:pPr>
       <w:r>
-        <w:t xml:space="preserve">Главное ограничение корпуса — его масштаб и состав. В текущей версии используется небольшой набор эталонных текстовых блоков, полученный из одного основного арабографичного тюркского источника. Этого достаточно для проверки экспериментального контура и первичного сравнения базовых методов, но недостаточно для вывода о качестве метода на всём классе исторических тюркских текстов в арабской графике.</w:t>
-      </w:r>
-    </w:p>
-    <w:p>
-      <w:pPr>
-        <w:pStyle w:val="BodyText"/>
-      </w:pPr>
-      <w:r>
-        <w:t xml:space="preserve">Один источник ограничивает жанровое, временное и орфографическое разнообразие материала. Тексты разных регионов и периодов могут отличаться по графике, лексике, нормам записи, качеству печати и состоянию сканов. Поэтому текущий корпус нужно рассматривать как пилотный набор данных, а не как представительный корпус для всей письменной традиции.</w:t>
-      </w:r>
-    </w:p>
-    <w:p>
-      <w:pPr>
-        <w:pStyle w:val="BodyText"/>
-      </w:pPr>
-      <w:r>
-        <w:t xml:space="preserve">Отдельное ограничение связано с тем, что старотатарские и старобашкирские материалы пока остаются мотивацией и будущей целью, а не основным реальным набором оценки. Текущая первичная проверка на реальном OCR построена на османско-турецком печатном источнике: он подходит как связанный арабографичный тюркский проверочный материал, но не заменяет проверку на целевых татарских и башкирских источниках.</w:t>
+        <w:t xml:space="preserve">Текущий корпус имеет ограниченный масштаб. В работе используется 400 эталонных текстовых блоков из одного основного арабографичного тюркского источника. Этого достаточно, чтобы проверить экспериментальную схему, но недостаточно, чтобы делать вывод о всём классе исторических тюркских текстов в арабской графике.</w:t>
+      </w:r>
+    </w:p>
+    <w:p>
+      <w:pPr>
+        <w:pStyle w:val="BodyText"/>
+      </w:pPr>
+      <w:r>
+        <w:t xml:space="preserve">Один источник ограничивает жанровое, временное и орфографическое разнообразие. Тексты разных регионов и периодов могут отличаться письмом, лексикой, типографикой, качеством печати и состоянием скана. Отдельно важно, что старотатарские и старобашкирские источники пока остаются целью следующего этапа, а не основным набором оценки в этой версии.</w:t>
       </w:r>
     </w:p>
     <w:bookmarkEnd w:id="68"/>
@@ -6228,33 +4749,25 @@
         <w:pStyle w:val="FirstParagraph"/>
       </w:pPr>
       <w:r>
-        <w:t xml:space="preserve">В синтетическом наборе эталонные строки искажаются контролируемым генератором ошибок. Такая постановка удобна для первого эксперимента: известен эталонный текст, можно воспроизвести разбиение на обучающую, валидационную и тестовую выборки и сравнить методы по одинаковым метрикам. Но синтетические ошибки остаются приближением, а не настоящим OCR-выводом.</w:t>
-      </w:r>
-    </w:p>
-    <w:p>
-      <w:pPr>
-        <w:pStyle w:val="BodyText"/>
-      </w:pPr>
-      <w:r>
-        <w:t xml:space="preserve">Реальные OCR-ошибки зависят от качества изображения, шрифта, сегментации страницы, направления письма, настроек OCR-системы и состояния документа. Постраничная проверка на османско-турецком источнике показала это напрямую: модель, обученная только на синтетическом шуме, улучшает синтетический набор, но не переносится надёжно на исходный OCR Tesseract. Она немного снижает WER, но ухудшает CER и NoSpaceCER относительно исходного OCR-вывода.</w:t>
-      </w:r>
-    </w:p>
-    <w:p>
-      <w:pPr>
-        <w:pStyle w:val="BodyText"/>
-      </w:pPr>
-      <w:r>
-        <w:t xml:space="preserve">Поэтому дальнейшая работа не должна ограничиваться усложнением синтетического генератора. Более важный следующий шаг — построить набор данных, учитывающий реальные OCR-ошибки: выровненные пары «OCR-вывод — эталонный текст» на уровне строк или коротких фрагментов. Уже после этого можно делать более реалистичную генерацию ошибок, основанную на настоящих символьных путаницах и артефактах разметки страницы.</w:t>
+        <w:t xml:space="preserve">Синтетический шум удобен для первого эксперимента: известен эталон, контролируется разбиение данных, а все методы сравниваются в одинаковых условиях. Но такой шум не является настоящим OCR-выводом. Он не содержит качества скана, особенностей шрифта, ошибок выделения строк, смешения фрагментов страницы и систематических ошибок конкретной OCR-модели.</w:t>
+      </w:r>
+    </w:p>
+    <w:p>
+      <w:pPr>
+        <w:pStyle w:val="BodyText"/>
+      </w:pPr>
+      <w:r>
+        <w:t xml:space="preserve">Практически это означает следующее: увеличение объёма синтетики само по себе не решит задачу. Следующая версия должна строиться вокруг реальных пар «OCR-вывод — эталон». Синтетические данные можно оставить как вспомогательный слой, но основной тест должен проверять настоящие ошибки распознавания.</w:t>
       </w:r>
     </w:p>
     <w:bookmarkEnd w:id="69"/>
-    <w:bookmarkStart w:id="70" w:name="ограничения-автоматических-метрик"/>
+    <w:bookmarkStart w:id="70" w:name="ограничения-метрик"/>
     <w:p>
       <w:pPr>
         <w:pStyle w:val="Heading3"/>
       </w:pPr>
       <w:r>
-        <w:t xml:space="preserve">6.3 Ограничения автоматических метрик</w:t>
+        <w:t xml:space="preserve">6.3 Ограничения метрик</w:t>
       </w:r>
     </w:p>
     <w:p>
@@ -6262,33 +4775,25 @@
         <w:pStyle w:val="FirstParagraph"/>
       </w:pPr>
       <w:r>
-        <w:t xml:space="preserve">CER, WER, NoSpaceCER и ExactMatch позволяют формально сравнивать методы, но не полностью описывают качество исправления исторического текста. Для исторических арабографичных материалов важно не только совпадение с эталоном, но и сохранение значимых орфографических вариантов. Механическое уменьшение расстояния редактирования не всегда означает филологически корректное исправление.</w:t>
-      </w:r>
-    </w:p>
-    <w:p>
-      <w:pPr>
-        <w:pStyle w:val="BodyText"/>
-      </w:pPr>
-      <w:r>
-        <w:t xml:space="preserve">Особенно осторожно нужно интерпретировать WER. В синтетическом наборе заметная часть выигрыша связана с исправлением пробелов и границ слов. Это полезно для поиска и последующей обработки, но не доказывает, что модель лучше распознаёт графемы. Поэтому в работе отдельно используется NoSpaceCER: он снижает влияние пробелов и помогает увидеть, насколько модель улучшает именно символный состав текста.</w:t>
-      </w:r>
-    </w:p>
-    <w:p>
-      <w:pPr>
-        <w:pStyle w:val="BodyText"/>
-      </w:pPr>
-      <w:r>
-        <w:t xml:space="preserve">Для следующей версии набора нужна ручная экспертная проверка 100–200 строк. В такой подвыборке следует фиксировать не только «правильно/неправильно», но и тип ошибки: замену графемы, ошибку пробела, пропуск, лишнюю вставку, нормализацию исторического написания, галлюцинацию или порождение лишнего фрагмента. Это позволит связать количественные метрики с реальным качеством текста.</w:t>
+        <w:t xml:space="preserve">CER, WER, NoSpaceCER и ExactMatch дают полезную, но неполную картину качества. CER чувствителен к символам, WER — к границам слов, NoSpaceCER помогает отделить пробельные ошибки, ExactMatch слишком строг для длинных строк. Вместе они описывают формальную близость к эталону, но не заменяют экспертную оценку.</w:t>
+      </w:r>
+    </w:p>
+    <w:p>
+      <w:pPr>
+        <w:pStyle w:val="BodyText"/>
+      </w:pPr>
+      <w:r>
+        <w:t xml:space="preserve">Для следующей версии набора нужна ручная проверка небольшой подвыборки. В ней следует фиксировать не только факт ошибки, но и её тип: замену графемы, пропуск, лишнюю вставку, ошибку пробела, чрезмерную нормализацию исторического написания, повтор фрагмента или грубое искажение строки. Тогда автоматические метрики можно будет связать с реальным качеством текста.</w:t>
       </w:r>
     </w:p>
     <w:bookmarkEnd w:id="70"/>
-    <w:bookmarkStart w:id="71" w:name="Xdbeb570ee9aa1ab71e3ffd0cfbeadb9f44e192a"/>
+    <w:bookmarkStart w:id="71" w:name="ограничения-проверки-на-реальном-ocr"/>
     <w:p>
       <w:pPr>
         <w:pStyle w:val="Heading3"/>
       </w:pPr>
       <w:r>
-        <w:t xml:space="preserve">6.4 Расширение корпуса и проверка на реальном OCR</w:t>
+        <w:t xml:space="preserve">6.4 Ограничения проверки на реальном OCR</w:t>
       </w:r>
     </w:p>
     <w:p>
@@ -6296,33 +4801,25 @@
         <w:pStyle w:val="FirstParagraph"/>
       </w:pPr>
       <w:r>
-        <w:t xml:space="preserve">Первое направление дальнейшей работы — расширение данных. Для будущей магистерской версии проекта нужно добавить несколько источников разных типов: османско-турецкие печатные тексты, старотатарские и старобашкирские материалы, а также, по возможности, страницы с разным качеством скана и разной типографикой.</w:t>
-      </w:r>
-    </w:p>
-    <w:p>
-      <w:pPr>
-        <w:pStyle w:val="BodyText"/>
-      </w:pPr>
-      <w:r>
-        <w:t xml:space="preserve">Ключевое изменение должно состоять в переходе от эталонных текстовых блоков к связке «изображение — OCR/HTR-вывод — эталонный текст». Текущая постраничная проверка на реальном OCR полезна как первичная проверка, но она слишком груба для обучения модели. Нужны выровненные строки или короткие фрагменты, чтобы модель видела реальные ошибки OCR, а не только искусственно сгенерированные искажения.</w:t>
-      </w:r>
-    </w:p>
-    <w:p>
-      <w:pPr>
-        <w:pStyle w:val="BodyText"/>
-      </w:pPr>
-      <w:r>
-        <w:t xml:space="preserve">Разбиение данных должно выполняться по страницам или источникам, а не случайно по строкам. Это важно для предотвращения утечки: строки с одной и той же страницы или близкого контекста не должны одновременно попадать в обучающую и тестовую выборки. Для маленьких исторических корпусов такая утечка может сильно завышать качество модели.</w:t>
+        <w:t xml:space="preserve">Проверка на реальном OCR в этой работе уже показывает главное ограничение синтетического обучения, но сама она тоже остаётся предварительной. Используется османско-турецкий печатный источник, а не старотатарский или старобашкирский материал. Кроме того, оценка выполнена на постраничном уровне, где на результат влияют длина страницы, разбиение на фрагменты и качество сопоставления с эталоном.</w:t>
+      </w:r>
+    </w:p>
+    <w:p>
+      <w:pPr>
+        <w:pStyle w:val="BodyText"/>
+      </w:pPr>
+      <w:r>
+        <w:t xml:space="preserve">Следующий шаг — перейти от постраничной оценки к более точным парам на уровне строки или короткого фрагмента. Для этого нужно выделить строки на изображении, получить OCR-вывод, сопоставить его с проверенным текстом и вручную проверить спорные случаи. Такая работа труднее, но именно она позволит обучать модель на настоящих ошибках, а не только проверять перенос с синтетики.</w:t>
       </w:r>
     </w:p>
     <w:bookmarkEnd w:id="71"/>
-    <w:bookmarkStart w:id="72" w:name="развитие-модельной-части"/>
+    <w:bookmarkStart w:id="72" w:name="следующий-набор-данных"/>
     <w:p>
       <w:pPr>
         <w:pStyle w:val="Heading3"/>
       </w:pPr>
       <w:r>
-        <w:t xml:space="preserve">6.5 Развитие модельной части</w:t>
+        <w:t xml:space="preserve">6.5 Следующий набор данных</w:t>
       </w:r>
     </w:p>
     <w:p>
@@ -6330,33 +4827,25 @@
         <w:pStyle w:val="FirstParagraph"/>
       </w:pPr>
       <w:r>
-        <w:t xml:space="preserve">В текущей работе ByT5-small используется как основной нейросетевой базовый метод, а не как финальное решение. Для следующего этапа нужно сравнить несколько направлений: более крупные варианты ByT5, специализированные модели посткоррекции OCR, посимвольные модели преобразования последовательностей и методы с консервативным защитным откатом.</w:t>
-      </w:r>
-    </w:p>
-    <w:p>
-      <w:pPr>
-        <w:pStyle w:val="BodyText"/>
-      </w:pPr>
-      <w:r>
-        <w:t xml:space="preserve">Результат на реальном OCR показывает, что модель должна не только уметь исправлять ошибки, но и понимать, когда лучше оставить исходный OCR без изменений. Поэтому важна отдельная логика уверенности и защитного отката: например, порог по расстоянию редактирования, оценке языковой модели, изменению длины, доле новых символов или согласованию со статистикой символьных путаниц, извлечённой из обучающей выборки.</w:t>
-      </w:r>
-    </w:p>
-    <w:p>
-      <w:pPr>
-        <w:pStyle w:val="BodyText"/>
-      </w:pPr>
-      <w:r>
-        <w:t xml:space="preserve">Посткоррекцию на основе больших языковых моделей также стоит проверять, но не как простую «волшебную» замену. Современные работы по исправлению OCR исторических документов показывают, что большие языковые модели могут давать полезные исправления, но эффект зависит от языка, корпуса, постановки запроса и процедуры валидации. Для исторического материала особенно опасны гладкие, но неверные исправления: текст может выглядеть правдоподобно, но отходить от источника.</w:t>
+        <w:t xml:space="preserve">Следующая версия набора данных должна включать несколько типов источников. Минимальный вариант — добавить старотатарские и старобашкирские страницы, для которых можно получить скан, OCR-вывод и проверенный эталон. Для каждой страницы нужно хранить источник, год или примерный период, тип печати, качество скана и способ получения OCR.</w:t>
+      </w:r>
+    </w:p>
+    <w:p>
+      <w:pPr>
+        <w:pStyle w:val="BodyText"/>
+      </w:pPr>
+      <w:r>
+        <w:t xml:space="preserve">Отдельно нужен журнал ошибок. В нём стоит фиксировать, какие графемы чаще всего путает OCR, где возникают проблемы пробелов, какие строки модель ухудшает и какие предсказания нужно откатывать. Такой журнал важнее ещё одного общего числа CER, потому что он показывает, как именно улучшать систему.</w:t>
       </w:r>
     </w:p>
     <w:bookmarkEnd w:id="72"/>
-    <w:bookmarkStart w:id="73" w:name="Xd2b3f4092cbe1759952889362a88c4fd5e58c1d"/>
+    <w:bookmarkStart w:id="73" w:name="X91867cc38c0f4e6667de3b2a642ec76d2863e9f"/>
     <w:p>
       <w:pPr>
         <w:pStyle w:val="Heading3"/>
       </w:pPr>
       <w:r>
-        <w:t xml:space="preserve">6.6 Переход к системе анализа исторических текстов</w:t>
+        <w:t xml:space="preserve">6.6 Переход к системе анализа исторических источников</w:t>
       </w:r>
     </w:p>
     <w:p>
@@ -6364,23 +4853,15 @@
         <w:pStyle w:val="FirstParagraph"/>
       </w:pPr>
       <w:r>
-        <w:t xml:space="preserve">Посткоррекция является промежуточным этапом. После получения более надёжного OCR/HTR-вывода можно переходить к задачам поиска, нормализации вариантов написания, извлечения именованных сущностей, сопоставления исторических записей и построения графов связей.</w:t>
-      </w:r>
-    </w:p>
-    <w:p>
-      <w:pPr>
-        <w:pStyle w:val="BodyText"/>
-      </w:pPr>
-      <w:r>
-        <w:t xml:space="preserve">В контексте будущей магистерской работы этот пилот может стать техническим основанием для более широкой системы анализа арабографичных тюркских источников. Такая система может включать выделение строк на изображении, OCR/HTR, посткоррекцию, извлечение именованных сущностей, сопоставление записей, извлечение дат и топонимов, а также построение связей между людьми, местами и документами.</w:t>
-      </w:r>
-    </w:p>
-    <w:p>
-      <w:pPr>
-        <w:pStyle w:val="BodyText"/>
-      </w:pPr>
-      <w:r>
-        <w:t xml:space="preserve">Практическая ценность текущей работы состоит в том, что она заранее фиксирует слабое место будущей технологической цепочки. До построения NER или графа связей нужно понять, насколько можно доверять тексту после OCR. Если посткоррекция ухудшает часть страниц, последующие модели будут работать на искажённой основе. Поэтому проверка на реальном OCR должна быть не последним декоративным этапом, а центральной частью разработки.</w:t>
+        <w:t xml:space="preserve">В более широкой магистерской работе посткоррекция OCR может стать одним из компонентов системы анализа арабографичных тюркских источников. Такая система может включать выделение строк на изображении, OCR/HTR, посткоррекцию, извлечение имён и топонимов, сопоставление архивных записей и построение связей между людьми, местами и документами.</w:t>
+      </w:r>
+    </w:p>
+    <w:p>
+      <w:pPr>
+        <w:pStyle w:val="BodyText"/>
+      </w:pPr>
+      <w:r>
+        <w:t xml:space="preserve">Текущая работа полезна тем, что заранее показывает слабое место этой цепочки. До извлечения сущностей и построения графа нужно понять, насколько можно доверять тексту после OCR. Если посткоррекция ухудшает часть страниц, последующие модели будут работать на искажённой основе. Поэтому проверка на реальном OCR должна быть не финальным украшением проекта, а одним из первых этапов разработки.</w:t>
       </w:r>
     </w:p>
     <w:bookmarkEnd w:id="73"/>
@@ -6399,47 +4880,47 @@
         <w:pStyle w:val="FirstParagraph"/>
       </w:pPr>
       <w:r>
-        <w:t xml:space="preserve">В работе построен и проверен воспроизводимый пилотный контур посткоррекции OCR для исторических тюркских текстов в арабской графике. Экспериментальная постановка была сознательно ограничена: вместо полной OCR/HTR-системы рассматривался этап «искажённый или OCR-текст — эталонный текст». Это позволило отдельно проверить посткоррекцию как компонент будущей технологической цепочки.</w:t>
-      </w:r>
-    </w:p>
-    <w:p>
-      <w:pPr>
-        <w:pStyle w:val="BodyText"/>
-      </w:pPr>
-      <w:r>
-        <w:t xml:space="preserve">На синтетическом наборе модель ByT5-small с максимальной длиной 512 показала лучший результат среди рассмотренных методов. Она превзошла метод без исправления, нормализатор на правилах и символьный метод на основе ошибок обучающей выборки. При этом результат оказался неоднородным: WER снизился заметнее, чем CER, ExactMatch остался низким, а часть строк после посткоррекции ухудшилась. Поэтому синтетический набор подтвердил работоспособность подхода в контролируемой постановке, но не доказал готовность модели к автоматической правке реального OCR.</w:t>
-      </w:r>
-    </w:p>
-    <w:p>
-      <w:pPr>
-        <w:pStyle w:val="BodyText"/>
-      </w:pPr>
-      <w:r>
-        <w:t xml:space="preserve">Отдельно показано, что простая нормализация на правилах не является безопасной заменой нейросетевой посткоррекции. В проведённом эксперименте нормализатор ухудшил качество относительно метода без исправления. Это важный отрицательный результат: для исторической арабографичной письменности нельзя механически унифицировать символы и варианты написания без проверки влияния на эталонный текст.</w:t>
-      </w:r>
-    </w:p>
-    <w:p>
-      <w:pPr>
-        <w:pStyle w:val="BodyText"/>
-      </w:pPr>
-      <w:r>
-        <w:t xml:space="preserve">Главный итог работы связан с проверкой на реальном OCR. Постраничный набор на османско-турецком печатном источнике показал разрыв между синтетической и реальной оценкой: модель, обученная только на синтетических ошибках, немного снижает WER, но ухудшает CER и NoSpaceCER относительно исходного Tesseract. Вариант со строгой фильтрацией уменьшает число ухудшенных страниц и даёт больше улучшенных страниц, но всё равно не превосходит исходный OCR по среднему CER. Значит, отрицательный результат на реальном OCR является не провалом, а полезным исследовательским выводом: обучение только на синтетических ошибках недостаточно для практической посткоррекции исторических сканов.</w:t>
-      </w:r>
-    </w:p>
-    <w:p>
-      <w:pPr>
-        <w:pStyle w:val="BodyText"/>
-      </w:pPr>
-      <w:r>
-        <w:t xml:space="preserve">Полученный экспериментальный контур можно использовать как основу для следующего этапа. Ближайшее развитие должно включать проверенные пары «OCR-вывод — эталон», разбиение по страницам без утечки, обучение на настоящих OCR-ошибках и консервативную фильтрацию предсказаний. После этого посткоррекция сможет стать частью более широкой системы обработки исторических арабографичных тюркских источников: от OCR/HTR и исправления текста к поиску, извлечению именованных сущностей, сопоставлению записей и построению графов связей.</w:t>
-      </w:r>
-    </w:p>
-    <w:p>
-      <w:pPr>
-        <w:pStyle w:val="BodyText"/>
-      </w:pPr>
-      <w:r>
-        <w:t xml:space="preserve">Практический результат работы — не готовый корректор, а диагностический стенд: он показывает, где синтетическая проверка даёт положительный сигнал, а где реальный OCR ломает перенос. Следующий шаг — реальные пары «OCR-вывод — эталон», разбиение по страницам или источникам и обучение на настоящих ошибках распознавания. Для курсового проекта это достаточный и честный результат; для магистерской работы это отправная точка более крупного исследования.</w:t>
+        <w:t xml:space="preserve">В работе проверен воспроизводимый контур посткоррекции OCR для исторических тюркских текстов в арабской графике. Задача была намеренно сужена: я не строил полную OCR/HTR-систему, а рассматривал текстовый этап после распознавания. На вход подавалась искажённая строка или OCR-вывод, на выходе ожидалась строка, близкая к эталону.</w:t>
+      </w:r>
+    </w:p>
+    <w:p>
+      <w:pPr>
+        <w:pStyle w:val="BodyText"/>
+      </w:pPr>
+      <w:r>
+        <w:t xml:space="preserve">На синтетическом наборе ByT5-small 512 показала лучший результат среди рассмотренных методов. Она превзошла метод без исправления, нормализатор на правилах и символьный метод на основе ошибок обучающей выборки. При этом улучшение оказалось неодинаковым по метрикам: WER снизился заметнее, чем CER, а ExactMatch остался низким. Это говорит не о готовой системе, а о работоспособном пилотном направлении.</w:t>
+      </w:r>
+    </w:p>
+    <w:p>
+      <w:pPr>
+        <w:pStyle w:val="BodyText"/>
+      </w:pPr>
+      <w:r>
+        <w:t xml:space="preserve">Нормализатор на правилах дал важный отрицательный результат. В проведённом эксперименте он ухудшил качество относительно метода без исправления. Для исторического арабографичного материала это существенное наблюдение: простая техническая нормализация может менять формы, которые важны для источника, и поэтому не должна применяться без отдельной проверки.</w:t>
+      </w:r>
+    </w:p>
+    <w:p>
+      <w:pPr>
+        <w:pStyle w:val="BodyText"/>
+      </w:pPr>
+      <w:r>
+        <w:t xml:space="preserve">Главное ограничение обнаружилось при переносе на реальный OCR. На постраничном выводе Tesseract модель, обученная только на синтетических искажениях, не дала среднего выигрыша по CER и NoSpaceCER. Более того, без фильтрации она ухудшала большинство страниц. Защитная фильтрация уменьшила число плохих случаев, но не превратила модель в надёжный корректор.</w:t>
+      </w:r>
+    </w:p>
+    <w:p>
+      <w:pPr>
+        <w:pStyle w:val="BodyText"/>
+      </w:pPr>
+      <w:r>
+        <w:t xml:space="preserve">Итог работы состоит не в создании готового OCR-инструмента, а в фиксации проверяемого маршрута дальнейшего исследования. Уже есть корпус, генератор ошибок, разбиение без утечки, набор базовых методов, обучение ByT5-small, метрики и отдельная проверка на реальном OCR. Следующий этап должен быть построен вокруг настоящих пар «OCR-вывод — эталон» для татарских, башкирских и других тюркских источников в арабской графике.</w:t>
+      </w:r>
+    </w:p>
+    <w:p>
+      <w:pPr>
+        <w:pStyle w:val="BodyText"/>
+      </w:pPr>
+      <w:r>
+        <w:t xml:space="preserve">Для курсовой работы такой результат достаточен: он показывает не только положительный эффект на синтетическом наборе, но и границу применимости этого эффекта. Для магистерской диссертации эта граница становится основной задачей: собрать реальные OCR-пары, описать типы ошибок, обучить модель на настоящих искажениях и проверить, можно ли безопасно использовать посткоррекцию перед дальнейшим историко-лингвистическим анализом.</w:t>
       </w:r>
     </w:p>
     <w:p>
@@ -6462,7 +4943,7 @@
       <w:pPr>
         <w:numPr>
           <w:ilvl w:val="0"/>
-          <w:numId w:val="1013"/>
+          <w:numId w:val="1003"/>
         </w:numPr>
       </w:pPr>
       <w:r>
@@ -6473,7 +4954,7 @@
       <w:pPr>
         <w:numPr>
           <w:ilvl w:val="0"/>
-          <w:numId w:val="1013"/>
+          <w:numId w:val="1003"/>
         </w:numPr>
       </w:pPr>
       <w:r>
@@ -6484,7 +4965,7 @@
       <w:pPr>
         <w:numPr>
           <w:ilvl w:val="0"/>
-          <w:numId w:val="1013"/>
+          <w:numId w:val="1003"/>
         </w:numPr>
       </w:pPr>
       <w:r>
@@ -6495,7 +4976,7 @@
       <w:pPr>
         <w:numPr>
           <w:ilvl w:val="0"/>
-          <w:numId w:val="1013"/>
+          <w:numId w:val="1003"/>
         </w:numPr>
       </w:pPr>
       <w:r>
@@ -6506,7 +4987,7 @@
       <w:pPr>
         <w:numPr>
           <w:ilvl w:val="0"/>
-          <w:numId w:val="1013"/>
+          <w:numId w:val="1003"/>
         </w:numPr>
       </w:pPr>
       <w:r>
@@ -6517,7 +4998,7 @@
       <w:pPr>
         <w:numPr>
           <w:ilvl w:val="0"/>
-          <w:numId w:val="1013"/>
+          <w:numId w:val="1003"/>
         </w:numPr>
       </w:pPr>
       <w:r>
@@ -6528,7 +5009,7 @@
       <w:pPr>
         <w:numPr>
           <w:ilvl w:val="0"/>
-          <w:numId w:val="1013"/>
+          <w:numId w:val="1003"/>
         </w:numPr>
       </w:pPr>
       <w:r>
@@ -6539,7 +5020,7 @@
       <w:pPr>
         <w:numPr>
           <w:ilvl w:val="0"/>
-          <w:numId w:val="1013"/>
+          <w:numId w:val="1003"/>
         </w:numPr>
       </w:pPr>
       <w:r>
@@ -6550,7 +5031,7 @@
       <w:pPr>
         <w:numPr>
           <w:ilvl w:val="0"/>
-          <w:numId w:val="1013"/>
+          <w:numId w:val="1003"/>
         </w:numPr>
       </w:pPr>
       <w:r>
@@ -6561,7 +5042,7 @@
       <w:pPr>
         <w:numPr>
           <w:ilvl w:val="0"/>
-          <w:numId w:val="1013"/>
+          <w:numId w:val="1003"/>
         </w:numPr>
       </w:pPr>
       <w:r>
@@ -6572,7 +5053,7 @@
       <w:pPr>
         <w:numPr>
           <w:ilvl w:val="0"/>
-          <w:numId w:val="1013"/>
+          <w:numId w:val="1003"/>
         </w:numPr>
       </w:pPr>
       <w:r>
@@ -6583,7 +5064,7 @@
       <w:pPr>
         <w:numPr>
           <w:ilvl w:val="0"/>
-          <w:numId w:val="1013"/>
+          <w:numId w:val="1003"/>
         </w:numPr>
       </w:pPr>
       <w:r>
@@ -6594,7 +5075,7 @@
       <w:pPr>
         <w:numPr>
           <w:ilvl w:val="0"/>
-          <w:numId w:val="1013"/>
+          <w:numId w:val="1003"/>
         </w:numPr>
       </w:pPr>
       <w:r>
@@ -6605,7 +5086,7 @@
       <w:pPr>
         <w:numPr>
           <w:ilvl w:val="0"/>
-          <w:numId w:val="1013"/>
+          <w:numId w:val="1003"/>
         </w:numPr>
       </w:pPr>
       <w:r>
@@ -6616,7 +5097,7 @@
       <w:pPr>
         <w:numPr>
           <w:ilvl w:val="0"/>
-          <w:numId w:val="1013"/>
+          <w:numId w:val="1003"/>
         </w:numPr>
       </w:pPr>
       <w:r>
@@ -6627,7 +5108,7 @@
       <w:pPr>
         <w:numPr>
           <w:ilvl w:val="0"/>
-          <w:numId w:val="1013"/>
+          <w:numId w:val="1003"/>
         </w:numPr>
       </w:pPr>
       <w:r>
@@ -6638,7 +5119,7 @@
       <w:pPr>
         <w:numPr>
           <w:ilvl w:val="0"/>
-          <w:numId w:val="1013"/>
+          <w:numId w:val="1003"/>
         </w:numPr>
       </w:pPr>
       <w:r>
@@ -6649,7 +5130,7 @@
       <w:pPr>
         <w:numPr>
           <w:ilvl w:val="0"/>
-          <w:numId w:val="1013"/>
+          <w:numId w:val="1003"/>
         </w:numPr>
       </w:pPr>
       <w:r>
@@ -6660,7 +5141,7 @@
       <w:pPr>
         <w:numPr>
           <w:ilvl w:val="0"/>
-          <w:numId w:val="1013"/>
+          <w:numId w:val="1003"/>
         </w:numPr>
       </w:pPr>
       <w:r>
@@ -6671,7 +5152,7 @@
       <w:pPr>
         <w:numPr>
           <w:ilvl w:val="0"/>
-          <w:numId w:val="1013"/>
+          <w:numId w:val="1003"/>
         </w:numPr>
       </w:pPr>
       <w:r>
@@ -6872,109 +5353,6 @@
       <w:pPr>
         <w:ind w:left="6480" w:hanging="360"/>
       </w:pPr>
-    </w:lvl>
-  </w:abstractNum>
-  <w:abstractNum w:abstractNumId="991">
-    <w:nsid w:val="0000A991"/>
-    <w:multiLevelType w:val="multilevel"/>
-    <w:lvl w:ilvl="0">
-      <w:numFmt w:val="bullet"/>
-      <w:lvlText w:val=""/>
-      <w:lvlJc w:val="left"/>
-      <w:pPr>
-        <w:ind w:left="720" w:hanging="360"/>
-      </w:pPr>
-      <w:rPr>
-        <w:rFonts w:ascii="Symbol" w:hAnsi="Symbol" w:cs="Symbol" w:hint="default"/>
-      </w:rPr>
-    </w:lvl>
-    <w:lvl w:ilvl="1">
-      <w:numFmt w:val="bullet"/>
-      <w:lvlText w:val="o"/>
-      <w:lvlJc w:val="left"/>
-      <w:pPr>
-        <w:ind w:left="1440" w:hanging="360"/>
-      </w:pPr>
-      <w:rPr>
-        <w:rFonts w:ascii="Courier New" w:hAnsi="Courier New" w:cs="Courier New" w:hint="default"/>
-      </w:rPr>
-    </w:lvl>
-    <w:lvl w:ilvl="2">
-      <w:numFmt w:val="bullet"/>
-      <w:lvlText w:val=""/>
-      <w:lvlJc w:val="left"/>
-      <w:pPr>
-        <w:ind w:left="2160" w:hanging="360"/>
-      </w:pPr>
-      <w:rPr>
-        <w:rFonts w:ascii="Wingdings" w:hAnsi="Wingdings" w:cs="Wingdings" w:hint="default"/>
-      </w:rPr>
-    </w:lvl>
-    <w:lvl w:ilvl="3">
-      <w:numFmt w:val="bullet"/>
-      <w:lvlText w:val=""/>
-      <w:lvlJc w:val="left"/>
-      <w:pPr>
-        <w:ind w:left="2880" w:hanging="360"/>
-      </w:pPr>
-      <w:rPr>
-        <w:rFonts w:ascii="Symbol" w:hAnsi="Symbol" w:cs="Symbol" w:hint="default"/>
-      </w:rPr>
-    </w:lvl>
-    <w:lvl w:ilvl="4">
-      <w:numFmt w:val="bullet"/>
-      <w:lvlText w:val="o"/>
-      <w:lvlJc w:val="left"/>
-      <w:pPr>
-        <w:ind w:left="3600" w:hanging="360"/>
-      </w:pPr>
-      <w:rPr>
-        <w:rFonts w:ascii="Courier New" w:hAnsi="Courier New" w:cs="Courier New" w:hint="default"/>
-      </w:rPr>
-    </w:lvl>
-    <w:lvl w:ilvl="5">
-      <w:numFmt w:val="bullet"/>
-      <w:lvlText w:val=""/>
-      <w:lvlJc w:val="left"/>
-      <w:pPr>
-        <w:ind w:left="4320" w:hanging="360"/>
-      </w:pPr>
-      <w:rPr>
-        <w:rFonts w:ascii="Wingdings" w:hAnsi="Wingdings" w:cs="Wingdings" w:hint="default"/>
-      </w:rPr>
-    </w:lvl>
-    <w:lvl w:ilvl="6">
-      <w:numFmt w:val="bullet"/>
-      <w:lvlText w:val=""/>
-      <w:lvlJc w:val="left"/>
-      <w:pPr>
-        <w:ind w:left="5040" w:hanging="360"/>
-      </w:pPr>
-      <w:rPr>
-        <w:rFonts w:ascii="Symbol" w:hAnsi="Symbol" w:cs="Symbol" w:hint="default"/>
-      </w:rPr>
-    </w:lvl>
-    <w:lvl w:ilvl="7">
-      <w:numFmt w:val="bullet"/>
-      <w:lvlText w:val="o"/>
-      <w:lvlJc w:val="left"/>
-      <w:pPr>
-        <w:ind w:left="5760" w:hanging="360"/>
-      </w:pPr>
-      <w:rPr>
-        <w:rFonts w:ascii="Courier New" w:hAnsi="Courier New" w:cs="Courier New" w:hint="default"/>
-      </w:rPr>
-    </w:lvl>
-    <w:lvl w:ilvl="8">
-      <w:numFmt w:val="bullet"/>
-      <w:lvlText w:val=""/>
-      <w:lvlJc w:val="left"/>
-      <w:pPr>
-        <w:ind w:left="6480" w:hanging="360"/>
-      </w:pPr>
-      <w:rPr>
-        <w:rFonts w:ascii="Wingdings" w:hAnsi="Wingdings" w:cs="Wingdings" w:hint="default"/>
-      </w:rPr>
     </w:lvl>
   </w:abstractNum>
   <w:num w:numId="1000">
@@ -7041,36 +5419,6 @@
     </w:lvlOverride>
   </w:num>
   <w:num w:numId="1003">
-    <w:abstractNumId w:val="991"/>
-  </w:num>
-  <w:num w:numId="1004">
-    <w:abstractNumId w:val="991"/>
-  </w:num>
-  <w:num w:numId="1005">
-    <w:abstractNumId w:val="991"/>
-  </w:num>
-  <w:num w:numId="1006">
-    <w:abstractNumId w:val="991"/>
-  </w:num>
-  <w:num w:numId="1007">
-    <w:abstractNumId w:val="991"/>
-  </w:num>
-  <w:num w:numId="1008">
-    <w:abstractNumId w:val="991"/>
-  </w:num>
-  <w:num w:numId="1009">
-    <w:abstractNumId w:val="991"/>
-  </w:num>
-  <w:num w:numId="1010">
-    <w:abstractNumId w:val="991"/>
-  </w:num>
-  <w:num w:numId="1011">
-    <w:abstractNumId w:val="991"/>
-  </w:num>
-  <w:num w:numId="1012">
-    <w:abstractNumId w:val="991"/>
-  </w:num>
-  <w:num w:numId="1013">
     <w:abstractNumId w:val="99411"/>
     <w:lvlOverride w:ilvl="0">
       <w:startOverride w:val="1"/>

</xml_diff>

<commit_message>
build(paper): rebuild final HSE docx after stage3 cleanup
</commit_message>
<xml_diff>
--- a/outputs/course_paper_hse_final.docx
+++ b/outputs/course_paper_hse_final.docx
@@ -2866,43 +2866,43 @@
               <w:pStyle w:val="Compact"/>
             </w:pPr>
             <w:r>
-              <w:t xml:space="preserve">Model</w:t>
-            </w:r>
-          </w:p>
-        </w:tc>
-        <w:tc>
-          <w:tcPr/>
-          <w:p>
-            <w:pPr>
-              <w:pStyle w:val="Compact"/>
-              <w:jc w:val="right"/>
-            </w:pPr>
-            <w:r>
-              <w:t xml:space="preserve">Max source length</w:t>
-            </w:r>
-          </w:p>
-        </w:tc>
-        <w:tc>
-          <w:tcPr/>
-          <w:p>
-            <w:pPr>
-              <w:pStyle w:val="Compact"/>
-              <w:jc w:val="right"/>
-            </w:pPr>
-            <w:r>
-              <w:t xml:space="preserve">Max target length</w:t>
-            </w:r>
-          </w:p>
-        </w:tc>
-        <w:tc>
-          <w:tcPr/>
-          <w:p>
-            <w:pPr>
-              <w:pStyle w:val="Compact"/>
-              <w:jc w:val="right"/>
-            </w:pPr>
-            <w:r>
-              <w:t xml:space="preserve">Epochs</w:t>
+              <w:t xml:space="preserve">Модель</w:t>
+            </w:r>
+          </w:p>
+        </w:tc>
+        <w:tc>
+          <w:tcPr/>
+          <w:p>
+            <w:pPr>
+              <w:pStyle w:val="Compact"/>
+              <w:jc w:val="right"/>
+            </w:pPr>
+            <w:r>
+              <w:t xml:space="preserve">Длина входа</w:t>
+            </w:r>
+          </w:p>
+        </w:tc>
+        <w:tc>
+          <w:tcPr/>
+          <w:p>
+            <w:pPr>
+              <w:pStyle w:val="Compact"/>
+              <w:jc w:val="right"/>
+            </w:pPr>
+            <w:r>
+              <w:t xml:space="preserve">Длина выхода</w:t>
+            </w:r>
+          </w:p>
+        </w:tc>
+        <w:tc>
+          <w:tcPr/>
+          <w:p>
+            <w:pPr>
+              <w:pStyle w:val="Compact"/>
+              <w:jc w:val="right"/>
+            </w:pPr>
+            <w:r>
+              <w:t xml:space="preserve">Эпохи</w:t>
             </w:r>
           </w:p>
         </w:tc>
@@ -2915,7 +2915,7 @@
               <w:pStyle w:val="Compact"/>
             </w:pPr>
             <w:r>
-              <w:t xml:space="preserve">ByT5-small 256</w:t>
+              <w:t xml:space="preserve">ByT5, 256</w:t>
             </w:r>
           </w:p>
         </w:tc>
@@ -2964,7 +2964,7 @@
               <w:pStyle w:val="Compact"/>
             </w:pPr>
             <w:r>
-              <w:t xml:space="preserve">ByT5-small 512</w:t>
+              <w:t xml:space="preserve">ByT5, 512</w:t>
             </w:r>
           </w:p>
         </w:tc>

</xml_diff>

<commit_message>
build: rebuild final HSE course paper docx
</commit_message>
<xml_diff>
--- a/outputs/course_paper_hse_final.docx
+++ b/outputs/course_paper_hse_final.docx
@@ -193,7 +193,7 @@
         <w:br w:type="page"/>
       </w:r>
     </w:p>
-    <w:bookmarkStart w:id="76" w:name="аннотация"/>
+    <w:bookmarkStart w:id="9" w:name="аннотация"/>
     <w:p>
       <w:pPr>
         <w:pStyle w:val="Heading1"/>
@@ -234,7 +234,25 @@
         <w:t xml:space="preserve">Главный результат работы состоит не в создании готовой OCR-системы, а в построении воспроизводимого протокола оценки и фиксации разрыва между синтетической и реальной проверкой. Для практического применения нужны выровненные пары «OCR-вывод — эталон», обучение на настоящих OCR-ошибках, проверка на татарских и башкирских источниках и ручной анализ ошибок.</w:t>
       </w:r>
     </w:p>
-    <w:bookmarkStart w:id="9" w:name="введение"/>
+    <w:bookmarkEnd w:id="9"/>
+    <w:bookmarkStart w:id="93" w:name="abstract"/>
+    <w:p>
+      <w:pPr>
+        <w:pStyle w:val="Heading1"/>
+      </w:pPr>
+      <w:r>
+        <w:t xml:space="preserve">Abstract</w:t>
+      </w:r>
+    </w:p>
+    <w:p>
+      <w:pPr>
+        <w:pStyle w:val="FirstParagraph"/>
+      </w:pPr>
+      <w:r>
+        <w:t xml:space="preserve">This course paper investigates OCR post-correction for historical Turkic texts written in Arabic script. The work does not build a complete OCR/HTR pipeline from page images; it focuses on a narrower text-to-text layer where noisy OCR-like output is transformed into a corrected string and evaluated against a reference. The pilot material is an Ottoman Turkish source in Arabic script, used as a related Arabic-script Turkic test case rather than as an Old Tatar or Old Bashkir dataset. A synthetic corpus of noisy-reference pairs is constructed and several methods are compared: identity baseline, rule-based normalizer, character-confusion baseline, and ByT5-small. On the synthetic benchmark, ByT5-small obtains the best scores among the tested methods, especially in WER. However, a page-level sanity check on real Tesseract output shows an unstable transfer: the model may slightly reduce WER but can worsen CER and NoSpaceCER. The main result is therefore a reproducible evaluation protocol and evidence of a synthetic-to-real gap, not a ready OCR system.</w:t>
+      </w:r>
+    </w:p>
+    <w:bookmarkStart w:id="10" w:name="введение"/>
     <w:p>
       <w:pPr>
         <w:pStyle w:val="Heading2"/>
@@ -275,8 +293,16 @@
         <w:t xml:space="preserve">Работа проверяет важное ограничение синтетического подхода. Если реальных пар «OCR-вывод — проверенный эталон» мало, естественный первый шаг состоит в искусственной генерации ошибок. Но успех на таком наборе не подтверждает работу модели на настоящем OCR. Поэтому эксперимент разделён на два уровня: контролируемую проверку на синтетических искажениях и отдельную постраничную проверку на реальном OCR османско-турецкого печатного источника.</w:t>
       </w:r>
     </w:p>
-    <w:bookmarkEnd w:id="9"/>
-    <w:bookmarkStart w:id="10" w:name="актуальность"/>
+    <w:p>
+      <w:pPr>
+        <w:pStyle w:val="BodyText"/>
+      </w:pPr>
+      <w:r>
+        <w:t xml:space="preserve">Методы исследования включают анализ работ по OCR исторических документов и посткоррекции, построение пилотного корпуса, генерацию синтетических OCR-подобных ошибок, реализацию базовых методов, обучение модели ByT5-small, вычисление CER, WER, NoSpaceCER и ExactMatch, анализ ошибок и отдельную проверку переноса на реальный OCR-вывод Tesseract. Такой набор методов позволяет отделить контролируемую проверку на синтетических данных от проверки поведения модели на настоящем OCR-выводе.</w:t>
+      </w:r>
+    </w:p>
+    <w:bookmarkEnd w:id="10"/>
+    <w:bookmarkStart w:id="11" w:name="актуальность"/>
     <w:p>
       <w:pPr>
         <w:pStyle w:val="Heading2"/>
@@ -309,8 +335,8 @@
         <w:t xml:space="preserve">Ещё одна причина актуальности связана с нехваткой воспроизводимых тестовых наборов и протоколов оценки. Для низкоресурсного исторического материала недостаточно показать один удачный пример исправления. Нужно фиксировать источник данных, процедуру генерации или получения OCR, разбиение на обучающую и тестовую части, метрики и худшие случаи. Поэтому в работе важны не только значения CER и WER, но и воспроизводимый протокол оценки.</w:t>
       </w:r>
     </w:p>
-    <w:bookmarkEnd w:id="10"/>
-    <w:bookmarkStart w:id="11" w:name="постановка-проблемы"/>
+    <w:bookmarkEnd w:id="11"/>
+    <w:bookmarkStart w:id="12" w:name="постановка-проблемы"/>
     <w:p>
       <w:pPr>
         <w:pStyle w:val="Heading2"/>
@@ -343,8 +369,8 @@
         <w:t xml:space="preserve">Такое сужение позволяет отделить ошибки посткоррекции от ошибок сегментации, распознавания изображения и подготовки скана. В то же время оно не снимает более крупную задачу: для практической системы всё равно понадобятся реальные пары «OCR-вывод — эталон», ручная валидация и расширение корпуса на целевые татарские и башкирские источники.</w:t>
       </w:r>
     </w:p>
-    <w:bookmarkEnd w:id="11"/>
-    <w:bookmarkStart w:id="12" w:name="цель-работы"/>
+    <w:bookmarkEnd w:id="12"/>
+    <w:bookmarkStart w:id="13" w:name="цель-работы"/>
     <w:p>
       <w:pPr>
         <w:pStyle w:val="Heading2"/>
@@ -361,8 +387,8 @@
         <w:t xml:space="preserve">Цель работы состоит в построении и оценке протокола посткоррекции OCR-подобных ошибок для исторических тюркских текстов в арабской графике, а также в проверке переноса модели с синтетических искажений на реальный OCR-вывод.</w:t>
       </w:r>
     </w:p>
-    <w:bookmarkEnd w:id="12"/>
-    <w:bookmarkStart w:id="13" w:name="задачи-работы"/>
+    <w:bookmarkEnd w:id="13"/>
+    <w:bookmarkStart w:id="14" w:name="задачи-работы"/>
     <w:p>
       <w:pPr>
         <w:pStyle w:val="Heading2"/>
@@ -475,8 +501,8 @@
         <w:t xml:space="preserve">Проверить перенос на реальный OCR-вывод Tesseract и сформулировать ограничения синтетического обучения.</w:t>
       </w:r>
     </w:p>
-    <w:bookmarkEnd w:id="13"/>
-    <w:bookmarkStart w:id="14" w:name="объект-и-предмет-исследования"/>
+    <w:bookmarkEnd w:id="14"/>
+    <w:bookmarkStart w:id="15" w:name="объект-и-предмет-исследования"/>
     <w:p>
       <w:pPr>
         <w:pStyle w:val="Heading2"/>
@@ -501,8 +527,8 @@
         <w:t xml:space="preserve">Предмет исследования составляют методы посткоррекции OCR-подобных ошибок в таких текстах: правила, символьные замены и нейросетевая модель ByT5-small.</w:t>
       </w:r>
     </w:p>
-    <w:bookmarkEnd w:id="14"/>
-    <w:bookmarkStart w:id="15" w:name="исследовательские-вопросы"/>
+    <w:bookmarkEnd w:id="15"/>
+    <w:bookmarkStart w:id="16" w:name="исследовательские-вопросы"/>
     <w:p>
       <w:pPr>
         <w:pStyle w:val="Heading2"/>
@@ -579,8 +605,8 @@
         <w:t xml:space="preserve">Сохраняется ли выигрыш модели, обученной на синтетических ошибках, на реальном OCR-выводе Tesseract?</w:t>
       </w:r>
     </w:p>
-    <w:bookmarkEnd w:id="15"/>
-    <w:bookmarkStart w:id="16" w:name="гипотезы"/>
+    <w:bookmarkEnd w:id="16"/>
+    <w:bookmarkStart w:id="17" w:name="гипотезы"/>
     <w:p>
       <w:pPr>
         <w:pStyle w:val="Heading2"/>
@@ -629,8 +655,8 @@
         <w:t xml:space="preserve">Гипотеза 4. Модель, обученная только на синтетических OCR-подобных ошибках, не будет надёжно переноситься на реальный постраничный OCR без адаптации на настоящих парах «OCR-вывод — эталон».</w:t>
       </w:r>
     </w:p>
-    <w:bookmarkEnd w:id="16"/>
-    <w:bookmarkStart w:id="17" w:name="практическая-значимость"/>
+    <w:bookmarkEnd w:id="17"/>
+    <w:bookmarkStart w:id="18" w:name="практическая-значимость"/>
     <w:p>
       <w:pPr>
         <w:pStyle w:val="Heading2"/>
@@ -655,8 +681,8 @@
         <w:t xml:space="preserve">Практический смысл результата связан с цифровой гуманитаристикой. После появления реальных пар «OCR-вывод — эталон» этот контур можно применять для подготовки корпусов, поиска по историческим текстам, извлечения именованных сущностей и сопоставления архивных записей. Текущая версия честно фиксирует границу применимости: она показывает разрыв между синтетической и реальной оценкой, но не является готовым корректором для архивных сканов.</w:t>
       </w:r>
     </w:p>
-    <w:bookmarkEnd w:id="17"/>
-    <w:bookmarkStart w:id="18" w:name="структура-работы"/>
+    <w:bookmarkEnd w:id="18"/>
+    <w:bookmarkStart w:id="19" w:name="структура-работы"/>
     <w:p>
       <w:pPr>
         <w:pStyle w:val="Heading2"/>
@@ -673,8 +699,8 @@
         <w:t xml:space="preserve">Логика работы следующая: сначала рассматриваются трудности OCR исторических документов и арабографичного письма, затем описываются корпус и синтетические ошибки, после этого сравниваются базовые методы и ByT5-small, а в конце отдельно проверяется перенос на реальный OCR-вывод Tesseract.</w:t>
       </w:r>
     </w:p>
-    <w:bookmarkEnd w:id="18"/>
-    <w:bookmarkStart w:id="26" w:name="X0ceba565ddc4689162e5800a39ee266fa2dc29a"/>
+    <w:bookmarkEnd w:id="19"/>
+    <w:bookmarkStart w:id="27" w:name="X0ceba565ddc4689162e5800a39ee266fa2dc29a"/>
     <w:p>
       <w:pPr>
         <w:pStyle w:val="Heading2"/>
@@ -683,7 +709,7 @@
         <w:t xml:space="preserve">2. Обзор предметной области и связанных работ</w:t>
       </w:r>
     </w:p>
-    <w:bookmarkStart w:id="19" w:name="X180942b9a24eaba8abfe1c56a0263be0843d255"/>
+    <w:bookmarkStart w:id="20" w:name="X180942b9a24eaba8abfe1c56a0263be0843d255"/>
     <w:p>
       <w:pPr>
         <w:pStyle w:val="Heading3"/>
@@ -716,8 +742,8 @@
         <w:t xml:space="preserve">Современные OCR-модели также всё чаще строятся на трансформерных подходах. Например, TrOCR использует предобученные компоненты визуального и текстового трансформеров и показывает, что сама OCR-модель может выигрывать от предобучения и дообучения на размеченных данных (Li et al., 2021). Однако это направление относится к распознаванию изображения, тогда как настоящая работа ограничена текстовой посткоррекцией. Такое ограничение сужает эксперимент, зато позволяет проверить отдельный вопрос: может ли модель исправлять уже полученный OCR-вывод без смешения этого результата с качеством сегментации и распознавания изображения.</w:t>
       </w:r>
     </w:p>
-    <w:bookmarkEnd w:id="19"/>
-    <w:bookmarkStart w:id="20" w:name="специфика-арабографичного-ocr"/>
+    <w:bookmarkEnd w:id="20"/>
+    <w:bookmarkStart w:id="21" w:name="специфика-арабографичного-ocr"/>
     <w:p>
       <w:pPr>
         <w:pStyle w:val="Heading3"/>
@@ -758,8 +784,8 @@
         <w:t xml:space="preserve">Именно здесь возникает разрыв между синтетической и реальной проверкой. В синтетической постановке можно контролировать типы искажений и разбиение на обучающую и тестовую выборки. В реальном OCR появляются дополнительные факторы: структура страницы, шрифт, качество изображения, сегментация строк, направление письма и особенности конкретной OCR-системы. Поэтому результаты на синтетическом наборе нельзя автоматически переносить на настоящий OCR-вывод.</w:t>
       </w:r>
     </w:p>
-    <w:bookmarkEnd w:id="20"/>
-    <w:bookmarkStart w:id="21" w:name="X870e54edfb9df569aa2599064af567ed17246c1"/>
+    <w:bookmarkEnd w:id="21"/>
+    <w:bookmarkStart w:id="22" w:name="X870e54edfb9df569aa2599064af567ed17246c1"/>
     <w:p>
       <w:pPr>
         <w:pStyle w:val="Heading3"/>
@@ -792,8 +818,8 @@
         <w:t xml:space="preserve">С точки зрения обработки естественного языка такие материалы относятся к низкоресурсным историческим данным. Для них меньше размеченных корпусов, стандартных бенчмарков, готовых моделей и инструментов, чем для современных массовых языков. Современные работы по обработке исторического турецкого языка подчёркивают необходимость создавать базовые ресурсы: корпуса, модели, разметку и инструменты для анализа исторических текстов (Özateş et al., 2025). Настоящая работа занимает в этой цепочке более узкое место: она не строит полный корпус, а проверяет протокол посткоррекции.</w:t>
       </w:r>
     </w:p>
-    <w:bookmarkEnd w:id="21"/>
-    <w:bookmarkStart w:id="22" w:name="Xfcaf842918234d7c399beca909495522023c2d4"/>
+    <w:bookmarkEnd w:id="22"/>
+    <w:bookmarkStart w:id="23" w:name="Xfcaf842918234d7c399beca909495522023c2d4"/>
     <w:p>
       <w:pPr>
         <w:pStyle w:val="Heading3"/>
@@ -842,8 +868,8 @@
         <w:t xml:space="preserve">Отдельная современная линия исследований связана с использованием больших языковых моделей для коррекции OCR. Kanerva et al. (2025) показывают, что посткоррекция на основе больших языковых моделей для исторических документов не даёт универсального выигрыша: эффект зависит от языка, данных и постановки. Этот вывод важен для интерпретации настоящего эксперимента. Смешанный перенос модели, обученной на синтетических искажениях, на реальный OCR отражает известную проблему посткоррекции: качество зависит от домена, языка, структуры ошибок и объёма размеченных пар «OCR-вывод — эталон».</w:t>
       </w:r>
     </w:p>
-    <w:bookmarkEnd w:id="22"/>
-    <w:bookmarkStart w:id="23" w:name="Xaa6a63b69f8f8f9084dc16d50d48dc0403f5611"/>
+    <w:bookmarkEnd w:id="23"/>
+    <w:bookmarkStart w:id="24" w:name="Xaa6a63b69f8f8f9084dc16d50d48dc0403f5611"/>
     <w:p>
       <w:pPr>
         <w:pStyle w:val="Heading3"/>
@@ -892,8 +918,8 @@
         <w:t xml:space="preserve">Следовательно, синтетический набор в этой работе — это диагностический стенд, а не финальный бенчмарк. Он нужен, чтобы увидеть, превосходит ли ByT5-small простые базовые методы в контролируемой среде. Постраничная проверка на Tesseract затем показывает границу этого стенда: для практического применения нужно строить ошибки не только по заранее заданным правилам, но и по реальным OCR-выводам и эмпирическим путаницам арабографичных графем.</w:t>
       </w:r>
     </w:p>
-    <w:bookmarkEnd w:id="23"/>
-    <w:bookmarkStart w:id="24" w:name="X15509693a0d7b6f8fe53cddac6f871c0636dbad"/>
+    <w:bookmarkEnd w:id="24"/>
+    <w:bookmarkStart w:id="25" w:name="X15509693a0d7b6f8fe53cddac6f871c0636dbad"/>
     <w:p>
       <w:pPr>
         <w:pStyle w:val="Heading3"/>
@@ -926,8 +952,8 @@
         <w:t xml:space="preserve">Тем не менее модель с байтовым представлением не решает проблему доменного переноса автоматически. Если модель обучена только на синтетическом шуме, она учится распределению ошибок этого генератора. Реальный OCR-вывод может иметь другую структуру: пропуски, артефакты разметки страницы, ошибки чтения строк, необычные пробелы, неверные формы букв или последовательные искажения. Поэтому ByT5 в этой работе рассматривается как сильная нейросетевая точка сравнения для посткоррекции, но не как готовое универсальное решение.</w:t>
       </w:r>
     </w:p>
-    <w:bookmarkEnd w:id="24"/>
-    <w:bookmarkStart w:id="25" w:name="X4e2987dd6a0ff1eb2f6c8914cca3c5fd2dc83ae"/>
+    <w:bookmarkEnd w:id="25"/>
+    <w:bookmarkStart w:id="26" w:name="X4e2987dd6a0ff1eb2f6c8914cca3c5fd2dc83ae"/>
     <w:p>
       <w:pPr>
         <w:pStyle w:val="Heading3"/>
@@ -968,9 +994,9 @@
         <w:t xml:space="preserve">Для дальнейшего исследования наиболее важен именно этот отрицательный результат. На синтетическом наборе модель улучшает метрики относительно базовых методов, но при переходе к реальному OCR эффект становится нестабильным. Это задаёт следующую задачу магистерской работы: собрать выровненные пары «OCR-вывод — эталон», разнести страницы по выборкам без утечки и обучать посткоррекцию уже на настоящих ошибках распознавания.</w:t>
       </w:r>
     </w:p>
-    <w:bookmarkEnd w:id="25"/>
     <w:bookmarkEnd w:id="26"/>
-    <w:bookmarkStart w:id="40" w:name="данные-и-построение-корпуса"/>
+    <w:bookmarkEnd w:id="27"/>
+    <w:bookmarkStart w:id="44" w:name="данные-и-построение-корпуса"/>
     <w:p>
       <w:pPr>
         <w:pStyle w:val="Heading2"/>
@@ -979,7 +1005,7 @@
         <w:t xml:space="preserve">3. Данные и построение корпуса</w:t>
       </w:r>
     </w:p>
-    <w:bookmarkStart w:id="27" w:name="общая-постановка"/>
+    <w:bookmarkStart w:id="28" w:name="общая-постановка"/>
     <w:p>
       <w:pPr>
         <w:pStyle w:val="Heading3"/>
@@ -1012,8 +1038,8 @@
         <w:t xml:space="preserve">Важно, что эта постановка сознательно отделяет задачу посткоррекции от задачи распознавания изображения. В эксперименте не оценивается качество сегментации страниц или OCR/HTR-модели; оценивается только способность метода исправлять уже полученный текстовый вывод.</w:t>
       </w:r>
     </w:p>
-    <w:bookmarkEnd w:id="27"/>
-    <w:bookmarkStart w:id="28" w:name="источник-данных"/>
+    <w:bookmarkEnd w:id="28"/>
+    <w:bookmarkStart w:id="29" w:name="источник-данных"/>
     <w:p>
       <w:pPr>
         <w:pStyle w:val="Heading3"/>
@@ -1070,8 +1096,8 @@
         <w:t xml:space="preserve">Источник выбран не как случайный арабографичный текст, а как материал, близкий к теме работы: он относится к историческим тюркским текстам, записанным арабской графикой. В источнике встречаются формы, характерные для османско-тюркского текста в арабской графике; отдельные примеры таких форм приведены ниже в таблицах с синтетическими примерами и примерами реального OCR. Поэтому корпус лучше соответствует теме курсовой, чем более ранний технический прототип на персидском или общеарабографичном материале.</w:t>
       </w:r>
     </w:p>
-    <w:bookmarkEnd w:id="28"/>
-    <w:bookmarkStart w:id="29" w:name="сбор-и-предварительная-подготовка"/>
+    <w:bookmarkEnd w:id="29"/>
+    <w:bookmarkStart w:id="30" w:name="сбор-и-предварительная-подготовка"/>
     <w:p>
       <w:pPr>
         <w:pStyle w:val="Heading3"/>
@@ -1116,8 +1142,8 @@
         <w:t xml:space="preserve">Поэтому нормализация вынесена в отдельный базовый метод. Корпус хранится в максимально щадящем виде, а нормализатор на правилах оценивается экспериментально наравне с методом без исправления и нейросетевой моделью.</w:t>
       </w:r>
     </w:p>
-    <w:bookmarkEnd w:id="29"/>
-    <w:bookmarkStart w:id="30" w:name="синтетические-ocr-подобные-искажения"/>
+    <w:bookmarkEnd w:id="30"/>
+    <w:bookmarkStart w:id="31" w:name="синтетические-ocr-подобные-искажения"/>
     <w:p>
       <w:pPr>
         <w:pStyle w:val="Heading3"/>
@@ -1174,8 +1200,8 @@
         <w:t xml:space="preserve">.</w:t>
       </w:r>
     </w:p>
-    <w:bookmarkEnd w:id="30"/>
-    <w:bookmarkStart w:id="31" w:name="типы-синтетических-искажений"/>
+    <w:bookmarkEnd w:id="31"/>
+    <w:bookmarkStart w:id="32" w:name="типы-синтетических-искажений"/>
     <w:p>
       <w:pPr>
         <w:pStyle w:val="Heading3"/>
@@ -1426,8 +1452,8 @@
         <w:t xml:space="preserve">Ошибки пробелов влияют на WER сильнее, чем на CER. Поэтому заметное снижение WER у модели не следует автоматически трактовать как доказательство такого же качества на реальном OCR. В текущей постановке это прежде всего показывает способность модели исправлять контролируемые искажения границ слов в синтетическом наборе.</w:t>
       </w:r>
     </w:p>
-    <w:bookmarkEnd w:id="31"/>
-    <w:bookmarkStart w:id="32" w:name="Xe2e6ef423b4b11ea7446063a790a29ab69053e4"/>
+    <w:bookmarkEnd w:id="32"/>
+    <w:bookmarkStart w:id="33" w:name="Xe2e6ef423b4b11ea7446063a790a29ab69053e4"/>
     <w:p>
       <w:pPr>
         <w:pStyle w:val="Heading3"/>
@@ -1666,8 +1692,8 @@
         <w:t xml:space="preserve">Эти значения показывают, что шум не сводится к набору замен символов: почти половина искажённых строк короче эталонных, примерно треть длиннее, а среднее изменение числа слов положительно. Это согласуется с наличием вставок, удалений и ошибок пробелов. Одновременно такая статистика подчёркивает ограничение эксперимента: генератор задаёт искусственное распределение ошибок, которое может отличаться от реальных OCR/HTR-выходов.</w:t>
       </w:r>
     </w:p>
-    <w:bookmarkEnd w:id="32"/>
-    <w:bookmarkStart w:id="33" w:name="примеры-пар-искажённая-строка-эталон"/>
+    <w:bookmarkEnd w:id="33"/>
+    <w:bookmarkStart w:id="37" w:name="примеры-пар-искажённая-строка-эталон"/>
     <w:p>
       <w:pPr>
         <w:pStyle w:val="Heading3"/>
@@ -1678,7 +1704,70 @@
     </w:p>
     <w:p>
       <w:pPr>
-        <w:pStyle w:val="FirstParagraph"/>
+        <w:pStyle w:val="CaptionedFigure"/>
+      </w:pPr>
+      <w:r>
+        <w:drawing>
+          <wp:inline>
+            <wp:extent cx="5334000" cy="2489200"/>
+            <wp:effectExtent b="0" l="0" r="0" t="0"/>
+            <wp:docPr descr="Рисунок 3.1 — Пример синтетического OCR-подобного искажения" title="" id="35" name="Picture"/>
+            <a:graphic>
+              <a:graphicData uri="http://schemas.openxmlformats.org/drawingml/2006/picture">
+                <pic:pic>
+                  <pic:nvPicPr>
+                    <pic:cNvPr descr="figures/fig03_synthetic_example.png" id="36" name="Picture"/>
+                    <pic:cNvPicPr>
+                      <a:picLocks noChangeArrowheads="1" noChangeAspect="1"/>
+                    </pic:cNvPicPr>
+                  </pic:nvPicPr>
+                  <pic:blipFill>
+                    <a:blip r:embed="rId34"/>
+                    <a:stretch>
+                      <a:fillRect/>
+                    </a:stretch>
+                  </pic:blipFill>
+                  <pic:spPr bwMode="auto">
+                    <a:xfrm>
+                      <a:off x="0" y="0"/>
+                      <a:ext cx="5334000" cy="2489200"/>
+                    </a:xfrm>
+                    <a:prstGeom prst="rect">
+                      <a:avLst/>
+                    </a:prstGeom>
+                    <a:noFill/>
+                    <a:ln w="9525">
+                      <a:noFill/>
+                      <a:headEnd/>
+                      <a:tailEnd/>
+                    </a:ln>
+                  </pic:spPr>
+                </pic:pic>
+              </a:graphicData>
+            </a:graphic>
+          </wp:inline>
+        </w:drawing>
+      </w:r>
+    </w:p>
+    <w:p>
+      <w:pPr>
+        <w:pStyle w:val="ImageCaption"/>
+      </w:pPr>
+      <w:r>
+        <w:t xml:space="preserve">Рисунок 3.1 — Пример синтетического OCR-подобного искажения</w:t>
+      </w:r>
+    </w:p>
+    <w:p>
+      <w:pPr>
+        <w:pStyle w:val="BodyText"/>
+      </w:pPr>
+      <w:r>
+        <w:t xml:space="preserve">Рисунок 3.1 иллюстрирует контролируемую постановку синтетической посткоррекции: входная строка содержит OCR-подобные искажения, а эталонная строка используется как целевой вариант для обучения и оценки.</w:t>
+      </w:r>
+    </w:p>
+    <w:p>
+      <w:pPr>
+        <w:pStyle w:val="BodyText"/>
       </w:pPr>
       <w:r>
         <w:t xml:space="preserve">Ниже приведены сокращённые фрагменты из тестовой выборки. Они нужны не для количественной оценки, а для визуального понимания того, какие искажения создаёт генератор.</w:t>
@@ -1960,8 +2049,8 @@
         <w:t xml:space="preserve">. Эти примеры выглядят как OCR-подобные текстовые искажения, но не доказывают соответствие реальному OCR. Для внешней валидности нужна отдельная подвыборка реального OCR/HTR-вывода с ручной проверкой эталонного текста.</w:t>
       </w:r>
     </w:p>
-    <w:bookmarkEnd w:id="33"/>
-    <w:bookmarkStart w:id="34" w:name="ограничения-синтетического-шума"/>
+    <w:bookmarkEnd w:id="37"/>
+    <w:bookmarkStart w:id="38" w:name="ограничения-синтетического-шума"/>
     <w:p>
       <w:pPr>
         <w:pStyle w:val="Heading3"/>
@@ -1986,8 +2075,8 @@
         <w:t xml:space="preserve">Поэтому синтетический набор следует понимать как проверочный стенд, а не как замену реального OCR. Он показывает, что код, разбиение, метрики и сравнение методов работают воспроизводимо. Но постраничная проверка на Tesseract даёт более жёсткий результат: без адаптации на настоящих OCR-ошибках модель иногда снижает WER, но может ухудшать символный состав текста.</w:t>
       </w:r>
     </w:p>
-    <w:bookmarkEnd w:id="34"/>
-    <w:bookmarkStart w:id="35" w:name="структура-набора-данных"/>
+    <w:bookmarkEnd w:id="38"/>
+    <w:bookmarkStart w:id="39" w:name="структура-набора-данных"/>
     <w:p>
       <w:pPr>
         <w:pStyle w:val="Heading3"/>
@@ -2191,8 +2280,8 @@
         <w:t xml:space="preserve">.</w:t>
       </w:r>
     </w:p>
-    <w:bookmarkEnd w:id="35"/>
-    <w:bookmarkStart w:id="36" w:name="Xd08570dcee77ed6951cf64ca8f19d56e666eec0"/>
+    <w:bookmarkEnd w:id="39"/>
+    <w:bookmarkStart w:id="40" w:name="Xd08570dcee77ed6951cf64ca8f19d56e666eec0"/>
     <w:p>
       <w:pPr>
         <w:pStyle w:val="Heading3"/>
@@ -2388,8 +2477,8 @@
         <w:t xml:space="preserve">Такой размер достаточен для пилотной проверки контура посткоррекции: он мал для финального бенчмарка, но позволяет сравнить базовые методы и нейросетевую модель в воспроизводимых условиях.</w:t>
       </w:r>
     </w:p>
-    <w:bookmarkEnd w:id="36"/>
-    <w:bookmarkStart w:id="37" w:name="контроль-утечки-данных"/>
+    <w:bookmarkEnd w:id="40"/>
+    <w:bookmarkStart w:id="41" w:name="контроль-утечки-данных"/>
     <w:p>
       <w:pPr>
         <w:pStyle w:val="Heading3"/>
@@ -2544,8 +2633,8 @@
         <w:t xml:space="preserve">Тестовая выборка не содержит исходных строк, которые встречались в обучении или валидации. Это делает оценку более строгой: модель проверяется на новых исходных строках, а не на новых зашумлённых вариациях уже знакомых строк.</w:t>
       </w:r>
     </w:p>
-    <w:bookmarkEnd w:id="37"/>
-    <w:bookmarkStart w:id="38" w:name="ограничения-корпуса"/>
+    <w:bookmarkEnd w:id="41"/>
+    <w:bookmarkStart w:id="42" w:name="ограничения-корпуса"/>
     <w:p>
       <w:pPr>
         <w:pStyle w:val="Heading3"/>
@@ -2594,14 +2683,14 @@
         <w:t xml:space="preserve">Четвёртое ограничение связано с отсутствием ручной лингвистической проверки исправлений. Метрики CER и WER показывают формальную близость к эталону, но не всегда отражают историко-орфографическую допустимость исправления. Для следующего этапа нужна небольшая вручную проверенная подвыборка с качественным анализом ошибок.</w:t>
       </w:r>
     </w:p>
-    <w:bookmarkEnd w:id="38"/>
-    <w:bookmarkStart w:id="39" w:name="выводы-по-разделу"/>
+    <w:bookmarkEnd w:id="42"/>
+    <w:bookmarkStart w:id="43" w:name="выводы-и-результаты-по-главе"/>
     <w:p>
       <w:pPr>
         <w:pStyle w:val="Heading3"/>
       </w:pPr>
       <w:r>
-        <w:t xml:space="preserve">3.9 Выводы по разделу</w:t>
+        <w:t xml:space="preserve">3.9 Выводы и результаты по главе</w:t>
       </w:r>
     </w:p>
     <w:p>
@@ -2620,9 +2709,9 @@
         <w:t xml:space="preserve">Роль корпуса ограничена, но ясна: он даёт одинаковые условия для сравнения метода без исправления, нормализатора на правилах, символьного метода на основе ошибок обучающей выборки и ByT5-small. Следующая версия должна добавить реальные OCR/HTR-выводы, ручную проверку и более разнообразные татарские, башкирские и другие тюркские источники в арабской графике.</w:t>
       </w:r>
     </w:p>
-    <w:bookmarkEnd w:id="39"/>
-    <w:bookmarkEnd w:id="40"/>
-    <w:bookmarkStart w:id="51" w:name="методология-эксперимента"/>
+    <w:bookmarkEnd w:id="43"/>
+    <w:bookmarkEnd w:id="44"/>
+    <w:bookmarkStart w:id="58" w:name="методология-эксперимента"/>
     <w:p>
       <w:pPr>
         <w:pStyle w:val="Heading2"/>
@@ -2631,7 +2720,7 @@
         <w:t xml:space="preserve">4. Методология эксперимента</w:t>
       </w:r>
     </w:p>
-    <w:bookmarkStart w:id="41" w:name="общая-схема-эксперимента"/>
+    <w:bookmarkStart w:id="48" w:name="общая-схема-эксперимента"/>
     <w:p>
       <w:pPr>
         <w:pStyle w:val="Heading3"/>
@@ -2689,6 +2778,69 @@
     </w:p>
     <w:p>
       <w:pPr>
+        <w:pStyle w:val="CaptionedFigure"/>
+      </w:pPr>
+      <w:r>
+        <w:drawing>
+          <wp:inline>
+            <wp:extent cx="5334000" cy="1666875"/>
+            <wp:effectExtent b="0" l="0" r="0" t="0"/>
+            <wp:docPr descr="Рисунок 4.1 — Общая схема протокола OCR-посткоррекции" title="" id="46" name="Picture"/>
+            <a:graphic>
+              <a:graphicData uri="http://schemas.openxmlformats.org/drawingml/2006/picture">
+                <pic:pic>
+                  <pic:nvPicPr>
+                    <pic:cNvPr descr="figures/fig01_postcorrection_process.png" id="47" name="Picture"/>
+                    <pic:cNvPicPr>
+                      <a:picLocks noChangeArrowheads="1" noChangeAspect="1"/>
+                    </pic:cNvPicPr>
+                  </pic:nvPicPr>
+                  <pic:blipFill>
+                    <a:blip r:embed="rId45"/>
+                    <a:stretch>
+                      <a:fillRect/>
+                    </a:stretch>
+                  </pic:blipFill>
+                  <pic:spPr bwMode="auto">
+                    <a:xfrm>
+                      <a:off x="0" y="0"/>
+                      <a:ext cx="5334000" cy="1666875"/>
+                    </a:xfrm>
+                    <a:prstGeom prst="rect">
+                      <a:avLst/>
+                    </a:prstGeom>
+                    <a:noFill/>
+                    <a:ln w="9525">
+                      <a:noFill/>
+                      <a:headEnd/>
+                      <a:tailEnd/>
+                    </a:ln>
+                  </pic:spPr>
+                </pic:pic>
+              </a:graphicData>
+            </a:graphic>
+          </wp:inline>
+        </w:drawing>
+      </w:r>
+    </w:p>
+    <w:p>
+      <w:pPr>
+        <w:pStyle w:val="ImageCaption"/>
+      </w:pPr>
+      <w:r>
+        <w:t xml:space="preserve">Рисунок 4.1 — Общая схема протокола OCR-посткоррекции</w:t>
+      </w:r>
+    </w:p>
+    <w:p>
+      <w:pPr>
+        <w:pStyle w:val="BodyText"/>
+      </w:pPr>
+      <w:r>
+        <w:t xml:space="preserve">Рисунок 4.1 показывает общий контур эксперимента: от эталонного текста и синтетического шума к сравнению методов посткоррекции и отдельной проверке переноса на реальный OCR.</w:t>
+      </w:r>
+    </w:p>
+    <w:p>
+      <w:pPr>
         <w:pStyle w:val="BodyText"/>
       </w:pPr>
       <w:r>
@@ -2703,8 +2855,8 @@
         <w:t xml:space="preserve">Главный вопрос эксперимента — улучшает ли нейросетевая модель посткоррекции качество текста по сравнению с неизменённым зашумлённым вводом. Дополнительный вопрос — помогает ли простая нормализация на правилах именно для исторического тюркского материала в арабской графике или, наоборот, ухудшает текст.</w:t>
       </w:r>
     </w:p>
-    <w:bookmarkEnd w:id="41"/>
-    <w:bookmarkStart w:id="42" w:name="базовые-методы"/>
+    <w:bookmarkEnd w:id="48"/>
+    <w:bookmarkStart w:id="49" w:name="базовые-методы"/>
     <w:p>
       <w:pPr>
         <w:pStyle w:val="Heading3"/>
@@ -2753,8 +2905,8 @@
         <w:t xml:space="preserve">Такой набор базовых методов позволяет разделить несколько эффектов. Метод без исправления показывает исходную сложность задачи. Нормализатор проверяет безопасность ручных правил. Символьный метод показывает, насколько далеко можно продвинуться без контекстной нейросетевой модели. На этом фоне результат ByT5-small интерпретируется осторожнее: улучшение должно быть не просто численным, а устойчивым относительно простых альтернатив.</w:t>
       </w:r>
     </w:p>
-    <w:bookmarkEnd w:id="42"/>
-    <w:bookmarkStart w:id="43" w:name="X922718734d9410424975b4d665e2323c01d8043"/>
+    <w:bookmarkEnd w:id="49"/>
+    <w:bookmarkStart w:id="50" w:name="X922718734d9410424975b4d665e2323c01d8043"/>
     <w:p>
       <w:pPr>
         <w:pStyle w:val="Heading3"/>
@@ -2779,8 +2931,8 @@
         <w:t xml:space="preserve">Его диагностическая роль состоит в проверке вопроса: достаточно ли простых символьных соответствий, извлечённых из корпуса, или нужен контекстный подход на основе преобразования последовательностей. Если такой метод приблизился бы к ByT5, это означало бы, что задача в основном сводится к локальным заменам символов. Если же ByT5 заметно превосходит его, это указывает на важность контекста, восстановления структуры слов и более сложного моделирования строки.</w:t>
       </w:r>
     </w:p>
-    <w:bookmarkEnd w:id="43"/>
-    <w:bookmarkStart w:id="44" w:name="нейросетевая-модель-byt5-small"/>
+    <w:bookmarkEnd w:id="50"/>
+    <w:bookmarkStart w:id="51" w:name="нейросетевая-модель-byt5-small"/>
     <w:p>
       <w:pPr>
         <w:pStyle w:val="Heading3"/>
@@ -2825,8 +2977,8 @@
         <w:t xml:space="preserve">Практическое следствие байтового представления состоит в том, что длина последовательности в токенах может быстро расти: один видимый символ арабской графики занимает несколько байтов. Поэтому в эксперименте отдельно контролируется максимальная длина входной и целевой последовательности.</w:t>
       </w:r>
     </w:p>
-    <w:bookmarkEnd w:id="44"/>
-    <w:bookmarkStart w:id="45" w:name="проверенные-конфигурации"/>
+    <w:bookmarkEnd w:id="51"/>
+    <w:bookmarkStart w:id="52" w:name="проверенные-конфигурации"/>
     <w:p>
       <w:pPr>
         <w:pStyle w:val="Heading3"/>
@@ -3022,8 +3174,8 @@
         <w:t xml:space="preserve">Для итогового анализа выбрана конфигурация 512. Она уменьшает риск обрезания строк и используется как основная нейросетевая конфигурация в сравнении с методом без исправления, нормализатором на правилах и символьным методом на основе ошибок обучающей выборки. Вывод о преимуществе 512 в данной работе относится к пилотному набору данных и должен быть дополнительно проверен на более широком корпусе.</w:t>
       </w:r>
     </w:p>
-    <w:bookmarkEnd w:id="45"/>
-    <w:bookmarkStart w:id="46" w:name="метрики-качества"/>
+    <w:bookmarkEnd w:id="52"/>
+    <w:bookmarkStart w:id="53" w:name="метрики-качества"/>
     <w:p>
       <w:pPr>
         <w:pStyle w:val="Heading3"/>
@@ -3079,8 +3231,8 @@
         <w:t xml:space="preserve">ExactMatch показывает долю строк, полностью совпавших с эталоном. Для длинных исторических строк эта метрика очень строгая: один неверный символ уже делает пример несовпадающим. Поэтому ExactMatch используется как дополнительный строгий индикатор, а основные выводы строятся по CER, WER, NoSpaceCER и анализу ошибок.</w:t>
       </w:r>
     </w:p>
-    <w:bookmarkEnd w:id="46"/>
-    <w:bookmarkStart w:id="47" w:name="процедура-оценки"/>
+    <w:bookmarkEnd w:id="53"/>
+    <w:bookmarkStart w:id="54" w:name="процедура-оценки"/>
     <w:p>
       <w:pPr>
         <w:pStyle w:val="Heading3"/>
@@ -3125,8 +3277,8 @@
         <w:t xml:space="preserve">.</w:t>
       </w:r>
     </w:p>
-    <w:bookmarkEnd w:id="47"/>
-    <w:bookmarkStart w:id="48" w:name="анализ-ошибок"/>
+    <w:bookmarkEnd w:id="54"/>
+    <w:bookmarkStart w:id="55" w:name="анализ-ошибок"/>
     <w:p>
       <w:pPr>
         <w:pStyle w:val="Heading3"/>
@@ -3171,8 +3323,8 @@
         <w:t xml:space="preserve">; он используется не вместо метрик, а как дополнительная проверка того, насколько численный выигрыш выглядит надёжным на уровне конкретных строк.</w:t>
       </w:r>
     </w:p>
-    <w:bookmarkEnd w:id="48"/>
-    <w:bookmarkStart w:id="49" w:name="воспроизводимость"/>
+    <w:bookmarkEnd w:id="55"/>
+    <w:bookmarkStart w:id="56" w:name="воспроизводимость"/>
     <w:p>
       <w:pPr>
         <w:pStyle w:val="Heading3"/>
@@ -3205,14 +3357,14 @@
         <w:t xml:space="preserve">Воспроизводимость текущего эксперимента не означает полноту контрольного набора. Она означает, что все ключевые решения пилотного протокола явно зафиксированы: источник, генератор шума, разбиение данных, базовые методы, модель, метрики и анализ ошибок.</w:t>
       </w:r>
     </w:p>
-    <w:bookmarkEnd w:id="49"/>
-    <w:bookmarkStart w:id="50" w:name="выводы-по-разделу-1"/>
+    <w:bookmarkEnd w:id="56"/>
+    <w:bookmarkStart w:id="57" w:name="выводы-и-результаты-по-главе-1"/>
     <w:p>
       <w:pPr>
         <w:pStyle w:val="Heading3"/>
       </w:pPr>
       <w:r>
-        <w:t xml:space="preserve">4.10 Выводы по разделу</w:t>
+        <w:t xml:space="preserve">4.10 Выводы и результаты по главе</w:t>
       </w:r>
     </w:p>
     <w:p>
@@ -3239,9 +3391,9 @@
         <w:t xml:space="preserve">Эта методология задаёт основу для раздела 5, где сравниваются базовые методы, символьный метод на основе ошибок обучающей выборки, финальная конфигурация ByT5-small и результаты анализа ошибок.</w:t>
       </w:r>
     </w:p>
-    <w:bookmarkEnd w:id="50"/>
-    <w:bookmarkEnd w:id="51"/>
-    <w:bookmarkStart w:id="67" w:name="результаты-экспериментов-и-анализ-ошибок"/>
+    <w:bookmarkEnd w:id="57"/>
+    <w:bookmarkEnd w:id="58"/>
+    <w:bookmarkStart w:id="83" w:name="результаты-экспериментов-и-анализ-ошибок"/>
     <w:p>
       <w:pPr>
         <w:pStyle w:val="Heading2"/>
@@ -3250,7 +3402,7 @@
         <w:t xml:space="preserve">5. Результаты экспериментов и анализ ошибок</w:t>
       </w:r>
     </w:p>
-    <w:bookmarkStart w:id="52" w:name="общая-логика-оценки"/>
+    <w:bookmarkStart w:id="59" w:name="общая-логика-оценки"/>
     <w:p>
       <w:pPr>
         <w:pStyle w:val="Heading3"/>
@@ -3283,8 +3435,8 @@
         <w:t xml:space="preserve">В этом разделе важны не только лучшие итоговые метрики ByT5-small среди рассмотренных методов. Не менее важны ограничивающие результаты: нормализатор на правилах ухудшает качество относительно метода без исправления, символьный метод даёт лишь умеренное улучшение CER, а заметное снижение WER у ByT5 требует осторожной интерпретации из-за синтетических ошибок пробелов и границ слов.</w:t>
       </w:r>
     </w:p>
-    <w:bookmarkEnd w:id="52"/>
-    <w:bookmarkStart w:id="53" w:name="итоговые-метрики"/>
+    <w:bookmarkEnd w:id="59"/>
+    <w:bookmarkStart w:id="63" w:name="итоговые-метрики"/>
     <w:p>
       <w:pPr>
         <w:pStyle w:val="Heading3"/>
@@ -3640,6 +3792,69 @@
     </w:tbl>
     <w:p>
       <w:pPr>
+        <w:pStyle w:val="CaptionedFigure"/>
+      </w:pPr>
+      <w:r>
+        <w:drawing>
+          <wp:inline>
+            <wp:extent cx="5334000" cy="2812472"/>
+            <wp:effectExtent b="0" l="0" r="0" t="0"/>
+            <wp:docPr descr="Рисунок 5.1 — Сравнение методов на синтетическом тестовом наборе" title="" id="61" name="Picture"/>
+            <a:graphic>
+              <a:graphicData uri="http://schemas.openxmlformats.org/drawingml/2006/picture">
+                <pic:pic>
+                  <pic:nvPicPr>
+                    <pic:cNvPr descr="figures/fig02_synthetic_metrics.png" id="62" name="Picture"/>
+                    <pic:cNvPicPr>
+                      <a:picLocks noChangeArrowheads="1" noChangeAspect="1"/>
+                    </pic:cNvPicPr>
+                  </pic:nvPicPr>
+                  <pic:blipFill>
+                    <a:blip r:embed="rId60"/>
+                    <a:stretch>
+                      <a:fillRect/>
+                    </a:stretch>
+                  </pic:blipFill>
+                  <pic:spPr bwMode="auto">
+                    <a:xfrm>
+                      <a:off x="0" y="0"/>
+                      <a:ext cx="5334000" cy="2812472"/>
+                    </a:xfrm>
+                    <a:prstGeom prst="rect">
+                      <a:avLst/>
+                    </a:prstGeom>
+                    <a:noFill/>
+                    <a:ln w="9525">
+                      <a:noFill/>
+                      <a:headEnd/>
+                      <a:tailEnd/>
+                    </a:ln>
+                  </pic:spPr>
+                </pic:pic>
+              </a:graphicData>
+            </a:graphic>
+          </wp:inline>
+        </w:drawing>
+      </w:r>
+    </w:p>
+    <w:p>
+      <w:pPr>
+        <w:pStyle w:val="ImageCaption"/>
+      </w:pPr>
+      <w:r>
+        <w:t xml:space="preserve">Рисунок 5.1 — Сравнение методов на синтетическом тестовом наборе</w:t>
+      </w:r>
+    </w:p>
+    <w:p>
+      <w:pPr>
+        <w:pStyle w:val="BodyText"/>
+      </w:pPr>
+      <w:r>
+        <w:t xml:space="preserve">Рисунок 5.1 показывает, что ByT5-small 512 даёт лучший результат среди рассмотренных методов на синтетическом тестовом наборе. При этом снижение WER выражено сильнее, чем снижение CER, поэтому результат требует осторожной интерпретации с учётом ошибок пробелов и границ слов.</w:t>
+      </w:r>
+    </w:p>
+    <w:p>
+      <w:pPr>
         <w:pStyle w:val="BodyText"/>
       </w:pPr>
       <w:r>
@@ -3670,8 +3885,8 @@
         <w:t xml:space="preserve">ExactMatch остаётся низким у всех методов. Это ожидаемо для длинных строк и строгого посимвольного сравнения: даже одна ошибка делает строку несовпадающей с эталоном. Поэтому ExactMatch используется как дополнительный строгий индикатор, а основные выводы строятся по CER, WER, NoSpaceCER и анализу ошибок.</w:t>
       </w:r>
     </w:p>
-    <w:bookmarkEnd w:id="53"/>
-    <w:bookmarkStart w:id="54" w:name="сравнение-с-методом-без-исправления"/>
+    <w:bookmarkEnd w:id="63"/>
+    <w:bookmarkStart w:id="64" w:name="сравнение-с-методом-без-исправления"/>
     <w:p>
       <w:pPr>
         <w:pStyle w:val="Heading3"/>
@@ -3704,8 +3919,8 @@
         <w:t xml:space="preserve">Я трактую этот результат как положительный сигнал для пилотного эксперимента, а не как доказательство готовности модели к практическому OCR. На синтетическом наборе ByT5-small полезна, но для вывода о реальных сканах нужна проверка на настоящих OCR-ошибках и на разбиении по страницам или источникам.</w:t>
       </w:r>
     </w:p>
-    <w:bookmarkEnd w:id="54"/>
-    <w:bookmarkStart w:id="55" w:name="нормализатор-на-правилах"/>
+    <w:bookmarkEnd w:id="64"/>
+    <w:bookmarkStart w:id="65" w:name="нормализатор-на-правилах"/>
     <w:p>
       <w:pPr>
         <w:pStyle w:val="Heading3"/>
@@ -3730,8 +3945,8 @@
         <w:t xml:space="preserve">Для этой работы такой результат важен методологически. Он показывает, что простые символьные правила нельзя считать безопасной предобработкой для исторического арабографичного текста. Правило может выглядеть разумным как техническая нормализация, но в историческом материале оно легко меняет орфографически значимые формы. Поэтому нормализатор в дальнейшем не следует использовать как обязательный этап без отдельной проверки на реальных данных.</w:t>
       </w:r>
     </w:p>
-    <w:bookmarkEnd w:id="55"/>
-    <w:bookmarkStart w:id="56" w:name="X26c70db4b79cb30b57d665edbf51a9d36fed8b5"/>
+    <w:bookmarkEnd w:id="65"/>
+    <w:bookmarkStart w:id="66" w:name="X26c70db4b79cb30b57d665edbf51a9d36fed8b5"/>
     <w:p>
       <w:pPr>
         <w:pStyle w:val="Heading3"/>
@@ -3756,8 +3971,8 @@
         <w:t xml:space="preserve">Однако этот метод почти не меняет качество на уровне слов. Он умеет исправлять отдельные повторяющиеся путаницы, но не восстанавливает пропущенные элементы из контекста и не работает с более длинной структурой строки. Поэтому его результат полезен как промежуточная точка сравнения: он лучше ручной нормализации, но заметно слабее ByT5-small по WER.</w:t>
       </w:r>
     </w:p>
-    <w:bookmarkEnd w:id="56"/>
-    <w:bookmarkStart w:id="57" w:name="интерпретация-снижения-wer"/>
+    <w:bookmarkEnd w:id="66"/>
+    <w:bookmarkStart w:id="67" w:name="интерпретация-снижения-wer"/>
     <w:p>
       <w:pPr>
         <w:pStyle w:val="Heading3"/>
@@ -3790,8 +4005,8 @@
         <w:t xml:space="preserve">Поэтому в работе CER и WER интерпретируются вместе. CER показывает умеренный выигрыш на уровне символов, а WER показывает, что модель хорошо работает с частью ошибок границ слов в синтетическом наборе. Но этот результат сам по себе не доказывает, что такой же выигрыш появится на реальном OCR-выводе.</w:t>
       </w:r>
     </w:p>
-    <w:bookmarkEnd w:id="57"/>
-    <w:bookmarkStart w:id="58" w:name="Xa057a50b3d887cb833a81c68c8cf3288ce88b0e"/>
+    <w:bookmarkEnd w:id="67"/>
+    <w:bookmarkStart w:id="68" w:name="Xa057a50b3d887cb833a81c68c8cf3288ce88b0e"/>
     <w:p>
       <w:pPr>
         <w:pStyle w:val="Heading3"/>
@@ -3816,8 +4031,8 @@
         <w:t xml:space="preserve">В текущем эксперименте конфигурация с длиной 512 выглядит более устойчивой, чем более короткий вариант. Я не трактую это как универсальное правило для всех арабографичных корпусов. Скорее это практический вывод для данного корпуса и данной постановки: при работе с историческим арабографичным текстом длину последовательности нужно проверять экспериментально, а не выбирать по умолчанию.</w:t>
       </w:r>
     </w:p>
-    <w:bookmarkEnd w:id="58"/>
-    <w:bookmarkStart w:id="59" w:name="X19ea1479c8c58d48c08a8bf495d59749d022072"/>
+    <w:bookmarkEnd w:id="68"/>
+    <w:bookmarkStart w:id="69" w:name="X19ea1479c8c58d48c08a8bf495d59749d022072"/>
     <w:p>
       <w:pPr>
         <w:pStyle w:val="Heading3"/>
@@ -3850,8 +4065,8 @@
         <w:t xml:space="preserve">Одновременно наличие ухудшенных примеров принципиально для практического вывода. Даже если модель чаще помогает, она всё равно иногда добавляет новые ошибки. Для будущей системы посткоррекции нужен механизм отката или фильтрации предсказаний, особенно если модель используется на архивных источниках без быстрой ручной проверки каждой строки.</w:t>
       </w:r>
     </w:p>
-    <w:bookmarkEnd w:id="59"/>
-    <w:bookmarkStart w:id="60" w:name="среднее-улучшение-по-примерам"/>
+    <w:bookmarkEnd w:id="69"/>
+    <w:bookmarkStart w:id="70" w:name="среднее-улучшение-по-примерам"/>
     <w:p>
       <w:pPr>
         <w:pStyle w:val="Heading3"/>
@@ -3876,8 +4091,8 @@
         <w:t xml:space="preserve">Для интерпретации это означает следующее. В контролируемой синтетической постановке модель чаще исправляет структуру слов и пробелы, чем полностью восстанавливает каждый символ строки. Поэтому среднее улучшение полезно как краткое числовое резюме, но его нельзя рассматривать отдельно от распределения улучшенных и ухудшенных случаев.</w:t>
       </w:r>
     </w:p>
-    <w:bookmarkEnd w:id="60"/>
-    <w:bookmarkStart w:id="61" w:name="интерпретация-результатов"/>
+    <w:bookmarkEnd w:id="70"/>
+    <w:bookmarkStart w:id="71" w:name="интерпретация-результатов"/>
     <w:p>
       <w:pPr>
         <w:pStyle w:val="Heading3"/>
@@ -3910,8 +4125,8 @@
         <w:t xml:space="preserve">Третий вывод задаёт границу результата. Успех на синтетическом наборе нельзя переносить на реальные OCR/HTR-выходы без отдельной проверки. В текущем эксперименте модель учится на распределении ошибок генератора, а настоящий OCR зависит от шрифта, качества изображения, сегментации строки и особенностей конкретной OCR-системы. Поэтому результаты раздела 5 являются сильным пилотным сигналом, но не финальным доказательством практической применимости.</w:t>
       </w:r>
     </w:p>
-    <w:bookmarkEnd w:id="61"/>
-    <w:bookmarkStart w:id="62" w:name="ограничения-интерпретации"/>
+    <w:bookmarkEnd w:id="71"/>
+    <w:bookmarkStart w:id="72" w:name="ограничения-интерпретации"/>
     <w:p>
       <w:pPr>
         <w:pStyle w:val="Heading3"/>
@@ -3944,8 +4159,8 @@
         <w:t xml:space="preserve">Есть и ограничение метрик. CER и WER измеряют формальную близость к эталону, но не решают вопрос историко-лингвистической допустимости исправления. Например, модель может приблизить строку к эталону по расстоянию Левенштейна, но при этом сгладить форму, которую исследователь не хотел бы нормализовать. По этой причине автоматические метрики в работе дополняются разбором ухудшенных случаев.</w:t>
       </w:r>
     </w:p>
-    <w:bookmarkEnd w:id="62"/>
-    <w:bookmarkStart w:id="63" w:name="X9ae740f4b068656258209a4fa61338553b28ec2"/>
+    <w:bookmarkEnd w:id="72"/>
+    <w:bookmarkStart w:id="76" w:name="X9ae740f4b068656258209a4fa61338553b28ec2"/>
     <w:p>
       <w:pPr>
         <w:pStyle w:val="Heading3"/>
@@ -3956,7 +4171,70 @@
     </w:p>
     <w:p>
       <w:pPr>
-        <w:pStyle w:val="FirstParagraph"/>
+        <w:pStyle w:val="CaptionedFigure"/>
+      </w:pPr>
+      <w:r>
+        <w:drawing>
+          <wp:inline>
+            <wp:extent cx="5334000" cy="2489200"/>
+            <wp:effectExtent b="0" l="0" r="0" t="0"/>
+            <wp:docPr descr="Рисунок 5.2 — Пример фрагмента реального OCR-вывода Tesseract и проверенного эталона" title="" id="74" name="Picture"/>
+            <a:graphic>
+              <a:graphicData uri="http://schemas.openxmlformats.org/drawingml/2006/picture">
+                <pic:pic>
+                  <pic:nvPicPr>
+                    <pic:cNvPr descr="figures/fig04_real_ocr_example.png" id="75" name="Picture"/>
+                    <pic:cNvPicPr>
+                      <a:picLocks noChangeArrowheads="1" noChangeAspect="1"/>
+                    </pic:cNvPicPr>
+                  </pic:nvPicPr>
+                  <pic:blipFill>
+                    <a:blip r:embed="rId73"/>
+                    <a:stretch>
+                      <a:fillRect/>
+                    </a:stretch>
+                  </pic:blipFill>
+                  <pic:spPr bwMode="auto">
+                    <a:xfrm>
+                      <a:off x="0" y="0"/>
+                      <a:ext cx="5334000" cy="2489200"/>
+                    </a:xfrm>
+                    <a:prstGeom prst="rect">
+                      <a:avLst/>
+                    </a:prstGeom>
+                    <a:noFill/>
+                    <a:ln w="9525">
+                      <a:noFill/>
+                      <a:headEnd/>
+                      <a:tailEnd/>
+                    </a:ln>
+                  </pic:spPr>
+                </pic:pic>
+              </a:graphicData>
+            </a:graphic>
+          </wp:inline>
+        </w:drawing>
+      </w:r>
+    </w:p>
+    <w:p>
+      <w:pPr>
+        <w:pStyle w:val="ImageCaption"/>
+      </w:pPr>
+      <w:r>
+        <w:t xml:space="preserve">Рисунок 5.2 — Пример фрагмента реального OCR-вывода Tesseract и проверенного эталона</w:t>
+      </w:r>
+    </w:p>
+    <w:p>
+      <w:pPr>
+        <w:pStyle w:val="BodyText"/>
+      </w:pPr>
+      <w:r>
+        <w:t xml:space="preserve">Рисунок 5.2 показывает, что реальный OCR-вывод отличается от синтетических искажений: в нём возникают ошибки чтения строки, пропуски, лишние символы и более сложные искажения последовательности.</w:t>
+      </w:r>
+    </w:p>
+    <w:p>
+      <w:pPr>
+        <w:pStyle w:val="BodyText"/>
       </w:pPr>
       <w:r>
         <w:t xml:space="preserve">После синтетического эксперимента я отдельно проверил перенос на реальный OCR-вывод. Эта часть нужна для того, чтобы не смешивать два разных результата: работу модели на контролируемом шуме и её поведение на тексте, полученном настоящей OCR-системой.</w:t>
@@ -4433,8 +4711,8 @@
         <w:t xml:space="preserve">Результат получился смешанным. По WER посткоррекция немного помогает: вариант с фрагментами снижает средний WER с 0.9238 до 0.8919. Но по CER и NoSpaceCER исходный Tesseract остаётся лучше. Для OCR на арабской графике это принципиально: улучшение границ слов не компенсирует ухудшение символного состава.</w:t>
       </w:r>
     </w:p>
-    <w:bookmarkEnd w:id="63"/>
-    <w:bookmarkStart w:id="64" w:name="постраничное-поведение-модели"/>
+    <w:bookmarkEnd w:id="76"/>
+    <w:bookmarkStart w:id="80" w:name="постраничное-поведение-модели"/>
     <w:p>
       <w:pPr>
         <w:pStyle w:val="Heading3"/>
@@ -4445,7 +4723,70 @@
     </w:p>
     <w:p>
       <w:pPr>
-        <w:pStyle w:val="FirstParagraph"/>
+        <w:pStyle w:val="CaptionedFigure"/>
+      </w:pPr>
+      <w:r>
+        <w:drawing>
+          <wp:inline>
+            <wp:extent cx="5334000" cy="2690191"/>
+            <wp:effectExtent b="0" l="0" r="0" t="0"/>
+            <wp:docPr descr="Рисунок 5.3 — Средние ошибки real-OCR sanity по страницам" title="" id="78" name="Picture"/>
+            <a:graphic>
+              <a:graphicData uri="http://schemas.openxmlformats.org/drawingml/2006/picture">
+                <pic:pic>
+                  <pic:nvPicPr>
+                    <pic:cNvPr descr="figures/fig05_real_ocr_page_metrics.png" id="79" name="Picture"/>
+                    <pic:cNvPicPr>
+                      <a:picLocks noChangeArrowheads="1" noChangeAspect="1"/>
+                    </pic:cNvPicPr>
+                  </pic:nvPicPr>
+                  <pic:blipFill>
+                    <a:blip r:embed="rId77"/>
+                    <a:stretch>
+                      <a:fillRect/>
+                    </a:stretch>
+                  </pic:blipFill>
+                  <pic:spPr bwMode="auto">
+                    <a:xfrm>
+                      <a:off x="0" y="0"/>
+                      <a:ext cx="5334000" cy="2690191"/>
+                    </a:xfrm>
+                    <a:prstGeom prst="rect">
+                      <a:avLst/>
+                    </a:prstGeom>
+                    <a:noFill/>
+                    <a:ln w="9525">
+                      <a:noFill/>
+                      <a:headEnd/>
+                      <a:tailEnd/>
+                    </a:ln>
+                  </pic:spPr>
+                </pic:pic>
+              </a:graphicData>
+            </a:graphic>
+          </wp:inline>
+        </w:drawing>
+      </w:r>
+    </w:p>
+    <w:p>
+      <w:pPr>
+        <w:pStyle w:val="ImageCaption"/>
+      </w:pPr>
+      <w:r>
+        <w:t xml:space="preserve">Рисунок 5.3 — Средние ошибки real-OCR sanity по страницам</w:t>
+      </w:r>
+    </w:p>
+    <w:p>
+      <w:pPr>
+        <w:pStyle w:val="BodyText"/>
+      </w:pPr>
+      <w:r>
+        <w:t xml:space="preserve">Рисунок 5.3 показывает неоднородность real-OCR проверки по страницам. Это подчёркивает главный ограничивающий результат: перенос модели, обученной только на синтетическом шуме, остаётся нестабильным и зависит от конкретной страницы.</w:t>
+      </w:r>
+    </w:p>
+    <w:p>
+      <w:pPr>
+        <w:pStyle w:val="BodyText"/>
       </w:pPr>
       <w:r>
         <w:t xml:space="preserve">Для проверки безопасности посткоррекции я отдельно посчитал, на скольких страницах модель улучшает или ухудшает CER относительно исходного Tesseract.</w:t>
@@ -4630,8 +4971,8 @@
         <w:t xml:space="preserve">Этот результат полезнее, чем простой положительный отчёт о синтетических метриках. Он показывает место, где текущий подход ломается: модель выучила распределение синтетических ошибок, но не структуру настоящих ошибок Tesseract на конкретном печатном источнике.</w:t>
       </w:r>
     </w:p>
-    <w:bookmarkEnd w:id="64"/>
-    <w:bookmarkStart w:id="65" w:name="качественная-интерпретация-real-ocr"/>
+    <w:bookmarkEnd w:id="80"/>
+    <w:bookmarkStart w:id="81" w:name="качественная-интерпретация-real-ocr"/>
     <w:p>
       <w:pPr>
         <w:pStyle w:val="Heading3"/>
@@ -4664,14 +5005,14 @@
         <w:t xml:space="preserve">Главный вывод этой проверки состоит в том, что обучение только на синтетике недостаточно. Для настоящего OCR нужны пары, где входом является реальный OCR-вывод, а выходом — проверенный эталонный текст. Только на таких данных можно понять, какие ошибки модель действительно исправляет, а какие создаёт сама.</w:t>
       </w:r>
     </w:p>
-    <w:bookmarkEnd w:id="65"/>
-    <w:bookmarkStart w:id="66" w:name="выводы-по-разделу-2"/>
+    <w:bookmarkEnd w:id="81"/>
+    <w:bookmarkStart w:id="82" w:name="выводы-и-результаты-по-главе-2"/>
     <w:p>
       <w:pPr>
         <w:pStyle w:val="Heading3"/>
       </w:pPr>
       <w:r>
-        <w:t xml:space="preserve">5.15 Выводы по разделу</w:t>
+        <w:t xml:space="preserve">5.15 Выводы и результаты по главе</w:t>
       </w:r>
     </w:p>
     <w:p>
@@ -4698,9 +5039,9 @@
         <w:t xml:space="preserve">Итог раздела такой: экспериментальный контур и обучение модели работают в контролируемой среде, но переход к реальным историческим сканам требует отдельной адаптации. Это не дополнительная косметическая проверка, а центральное условие практической применимости. Без настоящих пар «OCR-вывод — эталон» нельзя утверждать, что модель решает задачу OCR-посткоррекции для архивных источников.</w:t>
       </w:r>
     </w:p>
-    <w:bookmarkEnd w:id="66"/>
-    <w:bookmarkEnd w:id="67"/>
-    <w:bookmarkStart w:id="74" w:name="Xe8e02886c60b8939714d6e867e04f7997a20272"/>
+    <w:bookmarkEnd w:id="82"/>
+    <w:bookmarkEnd w:id="83"/>
+    <w:bookmarkStart w:id="91" w:name="Xe8e02886c60b8939714d6e867e04f7997a20272"/>
     <w:p>
       <w:pPr>
         <w:pStyle w:val="Heading2"/>
@@ -4709,7 +5050,7 @@
         <w:t xml:space="preserve">6. Ограничения и направления дальнейшей работы</w:t>
       </w:r>
     </w:p>
-    <w:bookmarkStart w:id="68" w:name="ограничения-корпуса-1"/>
+    <w:bookmarkStart w:id="84" w:name="ограничения-корпуса-1"/>
     <w:p>
       <w:pPr>
         <w:pStyle w:val="Heading3"/>
@@ -4734,8 +5075,8 @@
         <w:t xml:space="preserve">Один источник ограничивает жанровое, временное и орфографическое разнообразие. Тексты разных регионов и периодов могут отличаться письмом, лексикой, типографикой, качеством печати и состоянием скана. Отдельно важно, что старотатарские и старобашкирские источники пока остаются целью следующего этапа, а не основным набором оценки в этой версии.</w:t>
       </w:r>
     </w:p>
-    <w:bookmarkEnd w:id="68"/>
-    <w:bookmarkStart w:id="69" w:name="ограничения-синтетического-шума-1"/>
+    <w:bookmarkEnd w:id="84"/>
+    <w:bookmarkStart w:id="85" w:name="ограничения-синтетического-шума-1"/>
     <w:p>
       <w:pPr>
         <w:pStyle w:val="Heading3"/>
@@ -4760,8 +5101,8 @@
         <w:t xml:space="preserve">Практически это означает следующее: увеличение объёма синтетики само по себе не решит задачу. Следующая версия должна строиться вокруг реальных пар «OCR-вывод — эталон». Синтетические данные можно оставить как вспомогательный слой, но основной тест должен проверять настоящие ошибки распознавания.</w:t>
       </w:r>
     </w:p>
-    <w:bookmarkEnd w:id="69"/>
-    <w:bookmarkStart w:id="70" w:name="ограничения-метрик"/>
+    <w:bookmarkEnd w:id="85"/>
+    <w:bookmarkStart w:id="86" w:name="ограничения-метрик"/>
     <w:p>
       <w:pPr>
         <w:pStyle w:val="Heading3"/>
@@ -4786,8 +5127,8 @@
         <w:t xml:space="preserve">Для следующей версии набора нужна ручная проверка небольшой подвыборки. В ней следует фиксировать не только факт ошибки, но и её тип: замену графемы, пропуск, лишнюю вставку, ошибку пробела, чрезмерную нормализацию исторического написания, повтор фрагмента или грубое искажение строки. Тогда автоматические метрики можно будет связать с реальным качеством текста.</w:t>
       </w:r>
     </w:p>
-    <w:bookmarkEnd w:id="70"/>
-    <w:bookmarkStart w:id="71" w:name="ограничения-проверки-на-реальном-ocr"/>
+    <w:bookmarkEnd w:id="86"/>
+    <w:bookmarkStart w:id="87" w:name="ограничения-проверки-на-реальном-ocr"/>
     <w:p>
       <w:pPr>
         <w:pStyle w:val="Heading3"/>
@@ -4812,8 +5153,8 @@
         <w:t xml:space="preserve">Следующий шаг — перейти от постраничной оценки к более точным парам на уровне строки или короткого фрагмента. Для этого нужно выделить строки на изображении, получить OCR-вывод, сопоставить его с проверенным текстом и вручную проверить спорные случаи. Такая работа труднее, но именно она позволит обучать модель на настоящих ошибках, а не только проверять перенос с синтетики.</w:t>
       </w:r>
     </w:p>
-    <w:bookmarkEnd w:id="71"/>
-    <w:bookmarkStart w:id="72" w:name="следующий-набор-данных"/>
+    <w:bookmarkEnd w:id="87"/>
+    <w:bookmarkStart w:id="88" w:name="следующий-набор-данных"/>
     <w:p>
       <w:pPr>
         <w:pStyle w:val="Heading3"/>
@@ -4838,8 +5179,8 @@
         <w:t xml:space="preserve">Отдельно нужен журнал ошибок. В нём стоит фиксировать, какие графемы чаще всего путает OCR, где возникают проблемы пробелов, какие строки модель ухудшает и какие предсказания нужно откатывать. Такой журнал важнее ещё одного общего числа CER, потому что он показывает, как именно улучшать систему.</w:t>
       </w:r>
     </w:p>
-    <w:bookmarkEnd w:id="72"/>
-    <w:bookmarkStart w:id="73" w:name="X91867cc38c0f4e6667de3b2a642ec76d2863e9f"/>
+    <w:bookmarkEnd w:id="88"/>
+    <w:bookmarkStart w:id="89" w:name="X91867cc38c0f4e6667de3b2a642ec76d2863e9f"/>
     <w:p>
       <w:pPr>
         <w:pStyle w:val="Heading3"/>
@@ -4864,9 +5205,27 @@
         <w:t xml:space="preserve">Текущая работа полезна тем, что заранее показывает слабое место этой цепочки. До извлечения сущностей и построения графа нужно понять, насколько можно доверять тексту после OCR. Если посткоррекция ухудшает часть страниц, последующие модели будут работать на искажённой основе. Поэтому проверка на реальном OCR должна быть не финальным украшением проекта, а одним из первых этапов разработки.</w:t>
       </w:r>
     </w:p>
-    <w:bookmarkEnd w:id="73"/>
-    <w:bookmarkEnd w:id="74"/>
-    <w:bookmarkStart w:id="75" w:name="заключение"/>
+    <w:bookmarkEnd w:id="89"/>
+    <w:bookmarkStart w:id="90" w:name="выводы-и-результаты-по-главе-3"/>
+    <w:p>
+      <w:pPr>
+        <w:pStyle w:val="Heading3"/>
+      </w:pPr>
+      <w:r>
+        <w:t xml:space="preserve">6.7 Выводы и результаты по главе</w:t>
+      </w:r>
+    </w:p>
+    <w:p>
+      <w:pPr>
+        <w:pStyle w:val="FirstParagraph"/>
+      </w:pPr>
+      <w:r>
+        <w:t xml:space="preserve">В главе сформулированы основные ограничения работы и направления дальнейшего развития. Главные ограничения связаны с небольшим объёмом корпуса, синтетической природой обучающих искажений, одним основным османско-турецким источником и нестабильным переносом на реальный OCR-вывод Tesseract. Из этого следует практический вывод: следующий этап должен быть связан не с усложнением модели как таковой, а со сбором выровненных пар «OCR-вывод — эталон», ручной проверкой татарских и башкирских источников и более строгой постраничной оценкой.</w:t>
+      </w:r>
+    </w:p>
+    <w:bookmarkEnd w:id="90"/>
+    <w:bookmarkEnd w:id="91"/>
+    <w:bookmarkStart w:id="92" w:name="заключение"/>
     <w:p>
       <w:pPr>
         <w:pStyle w:val="Heading2"/>
@@ -4928,9 +5287,9 @@
         <w:br w:type="page"/>
       </w:r>
     </w:p>
-    <w:bookmarkEnd w:id="75"/>
-    <w:bookmarkEnd w:id="76"/>
-    <w:bookmarkStart w:id="77" w:name="список-литературы"/>
+    <w:bookmarkEnd w:id="92"/>
+    <w:bookmarkEnd w:id="93"/>
+    <w:bookmarkStart w:id="94" w:name="список-литературы"/>
     <w:p>
       <w:pPr>
         <w:pStyle w:val="Heading1"/>
@@ -5159,7 +5518,7 @@
         <w:t xml:space="preserve">Li M., Lv T., Chen J., Cui L., Lu Y., Florencio D., Zhang C., Li Z., Wei F. TrOCR: Transformer-based Optical Character Recognition with Pre-trained Models. 2021. arXiv:2109.10282. URL: https://arxiv.org/abs/2109.10282</w:t>
       </w:r>
     </w:p>
-    <w:bookmarkEnd w:id="77"/>
+    <w:bookmarkEnd w:id="94"/>
     <w:sectPr>
       <w:footnotePr>
         <w:numRestart w:val="eachSect"/>

</xml_diff>

<commit_message>
build: rebuild final HSE docx with contents and page numbers
</commit_message>
<xml_diff>
--- a/outputs/course_paper_hse_final.docx
+++ b/outputs/course_paper_hse_final.docx
@@ -193,7 +193,7 @@
         <w:br w:type="page"/>
       </w:r>
     </w:p>
-    <w:bookmarkStart w:id="9" w:name="аннотация"/>
+    <w:bookmarkStart w:id="86" w:name="аннотация"/>
     <w:p>
       <w:pPr>
         <w:pStyle w:val="Heading1"/>
@@ -234,8 +234,8 @@
         <w:t xml:space="preserve">Главный результат работы состоит не в создании готовой OCR-системы, а в построении воспроизводимого протокола оценки и фиксации разрыва между синтетической и реальной проверкой. Для практического применения нужны выровненные пары «OCR-вывод — эталон», обучение на настоящих OCR-ошибках, проверка на татарских и башкирских источниках и ручной анализ ошибок.</w:t>
       </w:r>
     </w:p>
-    <w:bookmarkEnd w:id="9"/>
-    <w:bookmarkStart w:id="93" w:name="abstract"/>
+    <w:bookmarkEnd w:id="86"/>
+    <w:bookmarkStart w:id="87" w:name="abstract"/>
     <w:p>
       <w:pPr>
         <w:pStyle w:val="Heading1"/>
@@ -252,157 +252,14 @@
         <w:t xml:space="preserve">This course paper investigates OCR post-correction for historical Turkic texts written in Arabic script. The work does not build a complete OCR/HTR pipeline from page images; it focuses on a narrower text-to-text layer where noisy OCR-like output is transformed into a corrected string and evaluated against a reference. The pilot material is an Ottoman Turkish source in Arabic script, used as a related Arabic-script Turkic test case rather than as an Old Tatar or Old Bashkir dataset. A synthetic corpus of noisy-reference pairs is constructed and several methods are compared: identity baseline, rule-based normalizer, character-confusion baseline, and ByT5-small. On the synthetic benchmark, ByT5-small obtains the best scores among the tested methods, especially in WER. However, a page-level sanity check on real Tesseract output shows an unstable transfer: the model may slightly reduce WER but can worsen CER and NoSpaceCER. The main result is therefore a reproducible evaluation protocol and evidence of a synthetic-to-real gap, not a ready OCR system.</w:t>
       </w:r>
     </w:p>
-    <w:bookmarkStart w:id="10" w:name="введение"/>
-    <w:p>
-      <w:pPr>
-        <w:pStyle w:val="Heading2"/>
-      </w:pPr>
-      <w:r>
-        <w:t xml:space="preserve">1. Введение</w:t>
-      </w:r>
-    </w:p>
-    <w:p>
-      <w:pPr>
-        <w:pStyle w:val="FirstParagraph"/>
-      </w:pPr>
-      <w:r>
-        <w:t xml:space="preserve">Исторические тюркские тексты в арабской графике важны для изучения истории, культуры, религии, права, повседневности и интеллектуальной традиции тюркских народов. К таким материалам относятся османские, татарские, башкирские, крымскотатарские и другие источники, созданные до перехода соответствующих письменных традиций на латиницу или кириллицу.</w:t>
-      </w:r>
-    </w:p>
-    <w:p>
-      <w:pPr>
-        <w:pStyle w:val="BodyText"/>
-      </w:pPr>
-      <w:r>
-        <w:t xml:space="preserve">Для автоматической обработки это трудный материал. Историческая орфография отличается от современной нормы, арабская графика плохо переносится на стандартные OCR-сценарии, а размеченных корпусов значительно меньше, чем для современных массовых языков. Даже когда скан доступен, исследователь часто получает не готовый текстовый корпус, а изображение или OCR-вывод с большим числом ошибок.</w:t>
-      </w:r>
-    </w:p>
-    <w:p>
-      <w:pPr>
-        <w:pStyle w:val="BodyText"/>
-      </w:pPr>
-      <w:r>
-        <w:t xml:space="preserve">В этой работе не ставится задача решить всю проблему распознавания исторических документов. Полная технологическая цепочка включает поиск источника, обработку изображения, разметку строк, OCR/HTR, посткоррекцию, проверку текста и последующий анализ. Здесь рассматривается более узкий слой: исправление уже полученного текстового вывода. Такое сужение делает эксперимент проверяемым: на вход подаётся OCR-текст, на выходе получается исправленная строка, а качество измеряется относительно эталона.</w:t>
-      </w:r>
-    </w:p>
-    <w:p>
-      <w:pPr>
-        <w:pStyle w:val="BodyText"/>
-      </w:pPr>
-      <w:r>
-        <w:t xml:space="preserve">Работа проверяет важное ограничение синтетического подхода. Если реальных пар «OCR-вывод — проверенный эталон» мало, естественный первый шаг состоит в искусственной генерации ошибок. Но успех на таком наборе не подтверждает работу модели на настоящем OCR. Поэтому эксперимент разделён на два уровня: контролируемую проверку на синтетических искажениях и отдельную постраничную проверку на реальном OCR османско-турецкого печатного источника.</w:t>
-      </w:r>
-    </w:p>
-    <w:p>
-      <w:pPr>
-        <w:pStyle w:val="BodyText"/>
-      </w:pPr>
-      <w:r>
-        <w:t xml:space="preserve">Методы исследования включают анализ работ по OCR исторических документов и посткоррекции, построение пилотного корпуса, генерацию синтетических OCR-подобных ошибок, реализацию базовых методов, обучение модели ByT5-small, вычисление CER, WER, NoSpaceCER и ExactMatch, анализ ошибок и отдельную проверку переноса на реальный OCR-вывод Tesseract. Такой набор методов позволяет отделить контролируемую проверку на синтетических данных от проверки поведения модели на настоящем OCR-выводе.</w:t>
-      </w:r>
-    </w:p>
-    <w:bookmarkEnd w:id="10"/>
-    <w:bookmarkStart w:id="11" w:name="актуальность"/>
-    <w:p>
-      <w:pPr>
-        <w:pStyle w:val="Heading2"/>
-      </w:pPr>
-      <w:r>
-        <w:t xml:space="preserve">1.1 Актуальность</w:t>
-      </w:r>
-    </w:p>
-    <w:p>
-      <w:pPr>
-        <w:pStyle w:val="FirstParagraph"/>
-      </w:pPr>
-      <w:r>
-        <w:t xml:space="preserve">Актуальность работы связана не только с OCR как технической задачей. Без машинно-читаемого текста исторические источники трудно включать в поиск, корпусный анализ, извлечение имён и топонимов, сопоставление записей и проверку историко-лингвистических гипотез.</w:t>
-      </w:r>
-    </w:p>
-    <w:p>
-      <w:pPr>
-        <w:pStyle w:val="BodyText"/>
-      </w:pPr>
-      <w:r>
-        <w:t xml:space="preserve">Для арабографичных тюркских материалов эта проблема особенно заметна. Такие тексты слабо представлены в готовых OCR- и NLP-ресурсах; стандартные модели, обученные на современных языках и более регулярной орфографии, не обязательно справляются с историческим письмом. Даже частично распознанный текст часто требует отдельного слоя исправления: похожие графемы, пропуски, лишние символы и ошибки пробелов мешают дальнейшему анализу.</w:t>
-      </w:r>
-    </w:p>
-    <w:p>
-      <w:pPr>
-        <w:pStyle w:val="BodyText"/>
-      </w:pPr>
-      <w:r>
-        <w:t xml:space="preserve">Ещё одна причина актуальности связана с нехваткой воспроизводимых тестовых наборов и протоколов оценки. Для низкоресурсного исторического материала недостаточно показать один удачный пример исправления. Нужно фиксировать источник данных, процедуру генерации или получения OCR, разбиение на обучающую и тестовую части, метрики и худшие случаи. Поэтому в работе важны не только значения CER и WER, но и воспроизводимый протокол оценки.</w:t>
-      </w:r>
-    </w:p>
-    <w:bookmarkEnd w:id="11"/>
-    <w:bookmarkStart w:id="12" w:name="постановка-проблемы"/>
-    <w:p>
-      <w:pPr>
-        <w:pStyle w:val="Heading2"/>
-      </w:pPr>
-      <w:r>
-        <w:t xml:space="preserve">1.2 Постановка проблемы</w:t>
-      </w:r>
-    </w:p>
-    <w:p>
-      <w:pPr>
-        <w:pStyle w:val="FirstParagraph"/>
-      </w:pPr>
-      <w:r>
-        <w:t xml:space="preserve">Основная проблема состоит в том, что для исторических тюркских текстов в арабской графике пока не хватает небольших, но воспроизводимых экспериментальных контуров для проверки посткоррекции OCR. Без такого контура трудно понять, что именно улучшает модель: реальные ошибки распознавания, искусственно внесённый шум, пробелы, локальные замены графем или только отдельные удачные примеры.</w:t>
-      </w:r>
-    </w:p>
-    <w:p>
-      <w:pPr>
-        <w:pStyle w:val="BodyText"/>
-      </w:pPr>
-      <w:r>
-        <w:t xml:space="preserve">В этой работе проблема сведена к проверяемой постановке. Нужно построить пары «искажённый OCR-текст — эталон», обучить и сравнить несколько методов посткоррекции, а затем проверить перенос с синтетических ошибок на реальный OCR. Важное ограничение формулируется заранее: османско-турецкий источник используется как близкий тюркский материал в арабской графике, но не подаётся как старотатарский или старобашкирский набор данных.</w:t>
-      </w:r>
-    </w:p>
-    <w:p>
-      <w:pPr>
-        <w:pStyle w:val="BodyText"/>
-      </w:pPr>
-      <w:r>
-        <w:t xml:space="preserve">Такое сужение позволяет отделить ошибки посткоррекции от ошибок сегментации, распознавания изображения и подготовки скана. В то же время оно не снимает более крупную задачу: для практической системы всё равно понадобятся реальные пары «OCR-вывод — эталон», ручная валидация и расширение корпуса на целевые татарские и башкирские источники.</w:t>
-      </w:r>
-    </w:p>
-    <w:bookmarkEnd w:id="12"/>
-    <w:bookmarkStart w:id="13" w:name="цель-работы"/>
-    <w:p>
-      <w:pPr>
-        <w:pStyle w:val="Heading2"/>
-      </w:pPr>
-      <w:r>
-        <w:t xml:space="preserve">1.3 Цель работы</w:t>
-      </w:r>
-    </w:p>
-    <w:p>
-      <w:pPr>
-        <w:pStyle w:val="FirstParagraph"/>
-      </w:pPr>
-      <w:r>
-        <w:t xml:space="preserve">Цель работы состоит в построении и оценке протокола посткоррекции OCR-подобных ошибок для исторических тюркских текстов в арабской графике, а также в проверке переноса модели с синтетических искажений на реальный OCR-вывод.</w:t>
-      </w:r>
-    </w:p>
-    <w:bookmarkEnd w:id="13"/>
-    <w:bookmarkStart w:id="14" w:name="задачи-работы"/>
-    <w:p>
-      <w:pPr>
-        <w:pStyle w:val="Heading2"/>
-      </w:pPr>
-      <w:r>
-        <w:t xml:space="preserve">1.4 Задачи работы</w:t>
-      </w:r>
-    </w:p>
-    <w:p>
-      <w:pPr>
-        <w:pStyle w:val="FirstParagraph"/>
-      </w:pPr>
-      <w:r>
-        <w:t xml:space="preserve">Для достижения цели необходимо решить следующие задачи:</w:t>
+    <w:bookmarkEnd w:id="87"/>
+    <w:bookmarkStart w:id="172" w:name="содержание"/>
+    <w:p>
+      <w:pPr>
+        <w:pStyle w:val="Heading1"/>
+      </w:pPr>
+      <w:r>
+        <w:t xml:space="preserve">Содержание</w:t>
       </w:r>
     </w:p>
     <w:p>
@@ -413,8 +270,125 @@
           <w:numId w:val="1001"/>
         </w:numPr>
       </w:pPr>
-      <w:r>
-        <w:t xml:space="preserve">Описать особенности автоматической обработки тюркских текстов в арабской графике.</w:t>
+    </w:p>
+    <w:p>
+      <w:pPr>
+        <w:pStyle w:val="Compact"/>
+        <w:numPr>
+          <w:ilvl w:val="1"/>
+          <w:numId w:val="1002"/>
+        </w:numPr>
+      </w:pPr>
+      <w:r>
+        <w:t xml:space="preserve">Введение</w:t>
+      </w:r>
+    </w:p>
+    <w:p>
+      <w:pPr>
+        <w:pStyle w:val="Compact"/>
+        <w:numPr>
+          <w:ilvl w:val="1"/>
+          <w:numId w:val="1003"/>
+        </w:numPr>
+      </w:pPr>
+      <w:r>
+        <w:t xml:space="preserve">1.1 Актуальность</w:t>
+      </w:r>
+    </w:p>
+    <w:p>
+      <w:pPr>
+        <w:pStyle w:val="Compact"/>
+        <w:numPr>
+          <w:ilvl w:val="1"/>
+          <w:numId w:val="1003"/>
+        </w:numPr>
+      </w:pPr>
+      <w:r>
+        <w:t xml:space="preserve">1.2 Постановка проблемы</w:t>
+      </w:r>
+    </w:p>
+    <w:p>
+      <w:pPr>
+        <w:pStyle w:val="Compact"/>
+        <w:numPr>
+          <w:ilvl w:val="1"/>
+          <w:numId w:val="1003"/>
+        </w:numPr>
+      </w:pPr>
+      <w:r>
+        <w:t xml:space="preserve">1.3 Цель работы</w:t>
+      </w:r>
+    </w:p>
+    <w:p>
+      <w:pPr>
+        <w:pStyle w:val="Compact"/>
+        <w:numPr>
+          <w:ilvl w:val="1"/>
+          <w:numId w:val="1003"/>
+        </w:numPr>
+      </w:pPr>
+      <w:r>
+        <w:t xml:space="preserve">1.4 Задачи работы</w:t>
+      </w:r>
+    </w:p>
+    <w:p>
+      <w:pPr>
+        <w:pStyle w:val="Compact"/>
+        <w:numPr>
+          <w:ilvl w:val="1"/>
+          <w:numId w:val="1003"/>
+        </w:numPr>
+      </w:pPr>
+      <w:r>
+        <w:t xml:space="preserve">1.5 Объект и предмет исследования</w:t>
+      </w:r>
+    </w:p>
+    <w:p>
+      <w:pPr>
+        <w:pStyle w:val="Compact"/>
+        <w:numPr>
+          <w:ilvl w:val="1"/>
+          <w:numId w:val="1003"/>
+        </w:numPr>
+      </w:pPr>
+      <w:r>
+        <w:t xml:space="preserve">1.6 Исследовательские вопросы</w:t>
+      </w:r>
+    </w:p>
+    <w:p>
+      <w:pPr>
+        <w:pStyle w:val="Compact"/>
+        <w:numPr>
+          <w:ilvl w:val="1"/>
+          <w:numId w:val="1003"/>
+        </w:numPr>
+      </w:pPr>
+      <w:r>
+        <w:t xml:space="preserve">1.7 Гипотезы</w:t>
+      </w:r>
+    </w:p>
+    <w:p>
+      <w:pPr>
+        <w:pStyle w:val="Compact"/>
+        <w:numPr>
+          <w:ilvl w:val="1"/>
+          <w:numId w:val="1003"/>
+        </w:numPr>
+      </w:pPr>
+      <w:r>
+        <w:t xml:space="preserve">1.8 Практическая значимость</w:t>
+      </w:r>
+    </w:p>
+    <w:p>
+      <w:pPr>
+        <w:pStyle w:val="Compact"/>
+        <w:numPr>
+          <w:ilvl w:val="1"/>
+          <w:numId w:val="1003"/>
+        </w:numPr>
+      </w:pPr>
+      <w:r>
+        <w:t xml:space="preserve">1.9 Структура работы</w:t>
       </w:r>
     </w:p>
     <w:p>
@@ -425,8 +399,113 @@
           <w:numId w:val="1001"/>
         </w:numPr>
       </w:pPr>
-      <w:r>
-        <w:t xml:space="preserve">Собрать небольшой корпус тюркского текста в арабской графике и зафиксировать его ограничения.</w:t>
+    </w:p>
+    <w:p>
+      <w:pPr>
+        <w:pStyle w:val="Compact"/>
+        <w:numPr>
+          <w:ilvl w:val="1"/>
+          <w:numId w:val="1004"/>
+        </w:numPr>
+      </w:pPr>
+      <w:r>
+        <w:t xml:space="preserve">Обзор предметной области и связанных работ</w:t>
+      </w:r>
+    </w:p>
+    <w:p>
+      <w:pPr>
+        <w:pStyle w:val="Compact"/>
+        <w:numPr>
+          <w:ilvl w:val="1"/>
+          <w:numId w:val="1005"/>
+        </w:numPr>
+      </w:pPr>
+      <w:r>
+        <w:t xml:space="preserve">2.1 OCR исторических документов как воспроизводимый процесс</w:t>
+      </w:r>
+    </w:p>
+    <w:p>
+      <w:pPr>
+        <w:pStyle w:val="Compact"/>
+        <w:numPr>
+          <w:ilvl w:val="1"/>
+          <w:numId w:val="1005"/>
+        </w:numPr>
+      </w:pPr>
+      <w:r>
+        <w:t xml:space="preserve">2.2 Специфика арабографичного OCR</w:t>
+      </w:r>
+    </w:p>
+    <w:p>
+      <w:pPr>
+        <w:pStyle w:val="Compact"/>
+        <w:numPr>
+          <w:ilvl w:val="1"/>
+          <w:numId w:val="1005"/>
+        </w:numPr>
+      </w:pPr>
+      <w:r>
+        <w:t xml:space="preserve">2.3 Тюркские тексты в арабской графике и османско-турецкий материал</w:t>
+      </w:r>
+    </w:p>
+    <w:p>
+      <w:pPr>
+        <w:pStyle w:val="Compact"/>
+        <w:numPr>
+          <w:ilvl w:val="1"/>
+          <w:numId w:val="1005"/>
+        </w:numPr>
+      </w:pPr>
+      <w:r>
+        <w:t xml:space="preserve">2.4 Посткоррекция OCR как преобразование искажённого текста в эталонный</w:t>
+      </w:r>
+    </w:p>
+    <w:p>
+      <w:pPr>
+        <w:pStyle w:val="Compact"/>
+        <w:numPr>
+          <w:ilvl w:val="1"/>
+          <w:numId w:val="1005"/>
+        </w:numPr>
+      </w:pPr>
+      <w:r>
+        <w:t xml:space="preserve">2.5 Синтетические данные для посткоррекции OCR</w:t>
+      </w:r>
+    </w:p>
+    <w:p>
+      <w:pPr>
+        <w:pStyle w:val="Compact"/>
+        <w:numPr>
+          <w:ilvl w:val="1"/>
+          <w:numId w:val="1005"/>
+        </w:numPr>
+      </w:pPr>
+      <w:r>
+        <w:t xml:space="preserve">2.6 Модели с байтовым представлением и выбор ByT5</w:t>
+      </w:r>
+    </w:p>
+    <w:p>
+      <w:pPr>
+        <w:pStyle w:val="Compact"/>
+        <w:numPr>
+          <w:ilvl w:val="1"/>
+          <w:numId w:val="1005"/>
+        </w:numPr>
+      </w:pPr>
+      <w:r>
+        <w:t xml:space="preserve">2.7 Позиция данной работы относительно существующих исследований</w:t>
+      </w:r>
+    </w:p>
+    <w:p>
+      <w:pPr>
+        <w:pStyle w:val="Compact"/>
+        <w:numPr>
+          <w:ilvl w:val="1"/>
+          <w:numId w:val="1005"/>
+        </w:numPr>
+      </w:pPr>
+      <w:r>
+        <w:t xml:space="preserve">2.8 Выводы и результаты по главе</w:t>
       </w:r>
     </w:p>
     <w:p>
@@ -437,8 +516,125 @@
           <w:numId w:val="1001"/>
         </w:numPr>
       </w:pPr>
-      <w:r>
-        <w:t xml:space="preserve">Построить синтетический набор пар «искажённый текст — эталонный текст» для задачи посткоррекции OCR.</w:t>
+    </w:p>
+    <w:p>
+      <w:pPr>
+        <w:pStyle w:val="Compact"/>
+        <w:numPr>
+          <w:ilvl w:val="1"/>
+          <w:numId w:val="1006"/>
+        </w:numPr>
+      </w:pPr>
+      <w:r>
+        <w:t xml:space="preserve">Данные и построение корпуса</w:t>
+      </w:r>
+    </w:p>
+    <w:p>
+      <w:pPr>
+        <w:pStyle w:val="Compact"/>
+        <w:numPr>
+          <w:ilvl w:val="1"/>
+          <w:numId w:val="1007"/>
+        </w:numPr>
+      </w:pPr>
+      <w:r>
+        <w:t xml:space="preserve">3.1 Общая постановка</w:t>
+      </w:r>
+    </w:p>
+    <w:p>
+      <w:pPr>
+        <w:pStyle w:val="Compact"/>
+        <w:numPr>
+          <w:ilvl w:val="1"/>
+          <w:numId w:val="1007"/>
+        </w:numPr>
+      </w:pPr>
+      <w:r>
+        <w:t xml:space="preserve">3.2 Источник данных</w:t>
+      </w:r>
+    </w:p>
+    <w:p>
+      <w:pPr>
+        <w:pStyle w:val="Compact"/>
+        <w:numPr>
+          <w:ilvl w:val="1"/>
+          <w:numId w:val="1007"/>
+        </w:numPr>
+      </w:pPr>
+      <w:r>
+        <w:t xml:space="preserve">3.3 Сбор и предварительная подготовка</w:t>
+      </w:r>
+    </w:p>
+    <w:p>
+      <w:pPr>
+        <w:pStyle w:val="Compact"/>
+        <w:numPr>
+          <w:ilvl w:val="1"/>
+          <w:numId w:val="1007"/>
+        </w:numPr>
+      </w:pPr>
+      <w:r>
+        <w:t xml:space="preserve">3.4 Синтетические OCR-подобные искажения</w:t>
+      </w:r>
+    </w:p>
+    <w:p>
+      <w:pPr>
+        <w:pStyle w:val="Compact"/>
+        <w:numPr>
+          <w:ilvl w:val="1"/>
+          <w:numId w:val="1007"/>
+        </w:numPr>
+      </w:pPr>
+      <w:r>
+        <w:t xml:space="preserve">3.5 Структура набора данных</w:t>
+      </w:r>
+    </w:p>
+    <w:p>
+      <w:pPr>
+        <w:pStyle w:val="Compact"/>
+        <w:numPr>
+          <w:ilvl w:val="1"/>
+          <w:numId w:val="1007"/>
+        </w:numPr>
+      </w:pPr>
+      <w:r>
+        <w:t xml:space="preserve">3.6 Разбиение на обучающую, валидационную и тестовую выборки</w:t>
+      </w:r>
+    </w:p>
+    <w:p>
+      <w:pPr>
+        <w:pStyle w:val="Compact"/>
+        <w:numPr>
+          <w:ilvl w:val="1"/>
+          <w:numId w:val="1007"/>
+        </w:numPr>
+      </w:pPr>
+      <w:r>
+        <w:t xml:space="preserve">3.7 Контроль утечки данных</w:t>
+      </w:r>
+    </w:p>
+    <w:p>
+      <w:pPr>
+        <w:pStyle w:val="Compact"/>
+        <w:numPr>
+          <w:ilvl w:val="1"/>
+          <w:numId w:val="1007"/>
+        </w:numPr>
+      </w:pPr>
+      <w:r>
+        <w:t xml:space="preserve">3.8 Ограничения корпуса</w:t>
+      </w:r>
+    </w:p>
+    <w:p>
+      <w:pPr>
+        <w:pStyle w:val="Compact"/>
+        <w:numPr>
+          <w:ilvl w:val="1"/>
+          <w:numId w:val="1007"/>
+        </w:numPr>
+      </w:pPr>
+      <w:r>
+        <w:t xml:space="preserve">3.9 Выводы и результаты по главе</w:t>
       </w:r>
     </w:p>
     <w:p>
@@ -449,8 +645,137 @@
           <w:numId w:val="1001"/>
         </w:numPr>
       </w:pPr>
-      <w:r>
-        <w:t xml:space="preserve">Выполнить разбиение данных на обучающую, валидационную и тестовую выборки без утечки исходных строк.</w:t>
+    </w:p>
+    <w:p>
+      <w:pPr>
+        <w:pStyle w:val="Compact"/>
+        <w:numPr>
+          <w:ilvl w:val="1"/>
+          <w:numId w:val="1008"/>
+        </w:numPr>
+      </w:pPr>
+      <w:r>
+        <w:t xml:space="preserve">Методология эксперимента</w:t>
+      </w:r>
+    </w:p>
+    <w:p>
+      <w:pPr>
+        <w:pStyle w:val="Compact"/>
+        <w:numPr>
+          <w:ilvl w:val="1"/>
+          <w:numId w:val="1009"/>
+        </w:numPr>
+      </w:pPr>
+      <w:r>
+        <w:t xml:space="preserve">4.1 Общая схема эксперимента</w:t>
+      </w:r>
+    </w:p>
+    <w:p>
+      <w:pPr>
+        <w:pStyle w:val="Compact"/>
+        <w:numPr>
+          <w:ilvl w:val="1"/>
+          <w:numId w:val="1009"/>
+        </w:numPr>
+      </w:pPr>
+      <w:r>
+        <w:t xml:space="preserve">4.2 Базовые методы</w:t>
+      </w:r>
+    </w:p>
+    <w:p>
+      <w:pPr>
+        <w:pStyle w:val="Compact"/>
+        <w:numPr>
+          <w:ilvl w:val="1"/>
+          <w:numId w:val="1009"/>
+        </w:numPr>
+      </w:pPr>
+      <w:r>
+        <w:t xml:space="preserve">4.3 Символьный метод на основе ошибок обучающей выборки</w:t>
+      </w:r>
+    </w:p>
+    <w:p>
+      <w:pPr>
+        <w:pStyle w:val="Compact"/>
+        <w:numPr>
+          <w:ilvl w:val="1"/>
+          <w:numId w:val="1009"/>
+        </w:numPr>
+      </w:pPr>
+      <w:r>
+        <w:t xml:space="preserve">4.4 Нейросетевая модель ByT5-small</w:t>
+      </w:r>
+    </w:p>
+    <w:p>
+      <w:pPr>
+        <w:pStyle w:val="Compact"/>
+        <w:numPr>
+          <w:ilvl w:val="1"/>
+          <w:numId w:val="1009"/>
+        </w:numPr>
+      </w:pPr>
+      <w:r>
+        <w:t xml:space="preserve">4.5 Проверенные конфигурации</w:t>
+      </w:r>
+    </w:p>
+    <w:p>
+      <w:pPr>
+        <w:pStyle w:val="Compact"/>
+        <w:numPr>
+          <w:ilvl w:val="1"/>
+          <w:numId w:val="1009"/>
+        </w:numPr>
+      </w:pPr>
+      <w:r>
+        <w:t xml:space="preserve">4.6 Метрики качества</w:t>
+      </w:r>
+    </w:p>
+    <w:p>
+      <w:pPr>
+        <w:pStyle w:val="Compact"/>
+        <w:numPr>
+          <w:ilvl w:val="1"/>
+          <w:numId w:val="1009"/>
+        </w:numPr>
+      </w:pPr>
+      <w:r>
+        <w:t xml:space="preserve">4.7 Процедура оценки</w:t>
+      </w:r>
+    </w:p>
+    <w:p>
+      <w:pPr>
+        <w:pStyle w:val="Compact"/>
+        <w:numPr>
+          <w:ilvl w:val="1"/>
+          <w:numId w:val="1009"/>
+        </w:numPr>
+      </w:pPr>
+      <w:r>
+        <w:t xml:space="preserve">4.8 Анализ ошибок</w:t>
+      </w:r>
+    </w:p>
+    <w:p>
+      <w:pPr>
+        <w:pStyle w:val="Compact"/>
+        <w:numPr>
+          <w:ilvl w:val="1"/>
+          <w:numId w:val="1009"/>
+        </w:numPr>
+      </w:pPr>
+      <w:r>
+        <w:t xml:space="preserve">4.9 Воспроизводимость</w:t>
+      </w:r>
+    </w:p>
+    <w:p>
+      <w:pPr>
+        <w:pStyle w:val="Compact"/>
+        <w:numPr>
+          <w:ilvl w:val="1"/>
+          <w:numId w:val="1009"/>
+        </w:numPr>
+      </w:pPr>
+      <w:r>
+        <w:t xml:space="preserve">4.10 Выводы и результаты по главе</w:t>
       </w:r>
     </w:p>
     <w:p>
@@ -461,8 +786,197 @@
           <w:numId w:val="1001"/>
         </w:numPr>
       </w:pPr>
-      <w:r>
-        <w:t xml:space="preserve">Реализовать и оценить базовые методы: вариант без исправления, нормализатор на правилах и символьный метод на основе ошибок обучающей выборки.</w:t>
+    </w:p>
+    <w:p>
+      <w:pPr>
+        <w:pStyle w:val="Compact"/>
+        <w:numPr>
+          <w:ilvl w:val="1"/>
+          <w:numId w:val="1010"/>
+        </w:numPr>
+      </w:pPr>
+      <w:r>
+        <w:t xml:space="preserve">Результаты экспериментов и анализ ошибок</w:t>
+      </w:r>
+    </w:p>
+    <w:p>
+      <w:pPr>
+        <w:pStyle w:val="Compact"/>
+        <w:numPr>
+          <w:ilvl w:val="1"/>
+          <w:numId w:val="1011"/>
+        </w:numPr>
+      </w:pPr>
+      <w:r>
+        <w:t xml:space="preserve">5.1 Общая логика оценки</w:t>
+      </w:r>
+    </w:p>
+    <w:p>
+      <w:pPr>
+        <w:pStyle w:val="Compact"/>
+        <w:numPr>
+          <w:ilvl w:val="1"/>
+          <w:numId w:val="1011"/>
+        </w:numPr>
+      </w:pPr>
+      <w:r>
+        <w:t xml:space="preserve">5.2 Итоговые метрики</w:t>
+      </w:r>
+    </w:p>
+    <w:p>
+      <w:pPr>
+        <w:pStyle w:val="Compact"/>
+        <w:numPr>
+          <w:ilvl w:val="1"/>
+          <w:numId w:val="1011"/>
+        </w:numPr>
+      </w:pPr>
+      <w:r>
+        <w:t xml:space="preserve">5.3 Сравнение с методом без исправления</w:t>
+      </w:r>
+    </w:p>
+    <w:p>
+      <w:pPr>
+        <w:pStyle w:val="Compact"/>
+        <w:numPr>
+          <w:ilvl w:val="1"/>
+          <w:numId w:val="1011"/>
+        </w:numPr>
+      </w:pPr>
+      <w:r>
+        <w:t xml:space="preserve">5.4 Нормализатор на правилах</w:t>
+      </w:r>
+    </w:p>
+    <w:p>
+      <w:pPr>
+        <w:pStyle w:val="Compact"/>
+        <w:numPr>
+          <w:ilvl w:val="1"/>
+          <w:numId w:val="1011"/>
+        </w:numPr>
+      </w:pPr>
+      <w:r>
+        <w:t xml:space="preserve">5.5 Символьный метод на основе ошибок обучающей выборки</w:t>
+      </w:r>
+    </w:p>
+    <w:p>
+      <w:pPr>
+        <w:pStyle w:val="Compact"/>
+        <w:numPr>
+          <w:ilvl w:val="1"/>
+          <w:numId w:val="1011"/>
+        </w:numPr>
+      </w:pPr>
+      <w:r>
+        <w:t xml:space="preserve">5.6 Интерпретация снижения WER</w:t>
+      </w:r>
+    </w:p>
+    <w:p>
+      <w:pPr>
+        <w:pStyle w:val="Compact"/>
+        <w:numPr>
+          <w:ilvl w:val="1"/>
+          <w:numId w:val="1011"/>
+        </w:numPr>
+      </w:pPr>
+      <w:r>
+        <w:t xml:space="preserve">5.7 Влияние максимальной длины последовательности</w:t>
+      </w:r>
+    </w:p>
+    <w:p>
+      <w:pPr>
+        <w:pStyle w:val="Compact"/>
+        <w:numPr>
+          <w:ilvl w:val="1"/>
+          <w:numId w:val="1011"/>
+        </w:numPr>
+      </w:pPr>
+      <w:r>
+        <w:t xml:space="preserve">5.8 Распределение улучшенных и ухудшенных примеров</w:t>
+      </w:r>
+    </w:p>
+    <w:p>
+      <w:pPr>
+        <w:pStyle w:val="Compact"/>
+        <w:numPr>
+          <w:ilvl w:val="1"/>
+          <w:numId w:val="1011"/>
+        </w:numPr>
+      </w:pPr>
+      <w:r>
+        <w:t xml:space="preserve">5.9 Среднее улучшение по примерам</w:t>
+      </w:r>
+    </w:p>
+    <w:p>
+      <w:pPr>
+        <w:pStyle w:val="Compact"/>
+        <w:numPr>
+          <w:ilvl w:val="1"/>
+          <w:numId w:val="1011"/>
+        </w:numPr>
+      </w:pPr>
+      <w:r>
+        <w:t xml:space="preserve">5.10 Интерпретация результатов</w:t>
+      </w:r>
+    </w:p>
+    <w:p>
+      <w:pPr>
+        <w:pStyle w:val="Compact"/>
+        <w:numPr>
+          <w:ilvl w:val="1"/>
+          <w:numId w:val="1011"/>
+        </w:numPr>
+      </w:pPr>
+      <w:r>
+        <w:t xml:space="preserve">5.11 Ограничения интерпретации</w:t>
+      </w:r>
+    </w:p>
+    <w:p>
+      <w:pPr>
+        <w:pStyle w:val="Compact"/>
+        <w:numPr>
+          <w:ilvl w:val="1"/>
+          <w:numId w:val="1011"/>
+        </w:numPr>
+      </w:pPr>
+      <w:r>
+        <w:t xml:space="preserve">5.12 Проверка переноса на постраничном реальном OCR</w:t>
+      </w:r>
+    </w:p>
+    <w:p>
+      <w:pPr>
+        <w:pStyle w:val="Compact"/>
+        <w:numPr>
+          <w:ilvl w:val="1"/>
+          <w:numId w:val="1011"/>
+        </w:numPr>
+      </w:pPr>
+      <w:r>
+        <w:t xml:space="preserve">5.13 Постраничное поведение модели</w:t>
+      </w:r>
+    </w:p>
+    <w:p>
+      <w:pPr>
+        <w:pStyle w:val="Compact"/>
+        <w:numPr>
+          <w:ilvl w:val="1"/>
+          <w:numId w:val="1011"/>
+        </w:numPr>
+      </w:pPr>
+      <w:r>
+        <w:t xml:space="preserve">5.14 Качественная интерпретация real OCR</w:t>
+      </w:r>
+    </w:p>
+    <w:p>
+      <w:pPr>
+        <w:pStyle w:val="Compact"/>
+        <w:numPr>
+          <w:ilvl w:val="1"/>
+          <w:numId w:val="1011"/>
+        </w:numPr>
+      </w:pPr>
+      <w:r>
+        <w:t xml:space="preserve">5.15 Выводы и результаты по главе</w:t>
       </w:r>
     </w:p>
     <w:p>
@@ -473,8 +987,101 @@
           <w:numId w:val="1001"/>
         </w:numPr>
       </w:pPr>
-      <w:r>
-        <w:t xml:space="preserve">Обучить ByT5-small для исправления OCR-подобных ошибок и сравнить варианты с разной длиной последовательности.</w:t>
+    </w:p>
+    <w:p>
+      <w:pPr>
+        <w:pStyle w:val="Compact"/>
+        <w:numPr>
+          <w:ilvl w:val="1"/>
+          <w:numId w:val="1012"/>
+        </w:numPr>
+      </w:pPr>
+      <w:r>
+        <w:t xml:space="preserve">Ограничения и направления дальнейшей работы</w:t>
+      </w:r>
+    </w:p>
+    <w:p>
+      <w:pPr>
+        <w:pStyle w:val="Compact"/>
+        <w:numPr>
+          <w:ilvl w:val="1"/>
+          <w:numId w:val="1013"/>
+        </w:numPr>
+      </w:pPr>
+      <w:r>
+        <w:t xml:space="preserve">6.1 Ограничения корпуса</w:t>
+      </w:r>
+    </w:p>
+    <w:p>
+      <w:pPr>
+        <w:pStyle w:val="Compact"/>
+        <w:numPr>
+          <w:ilvl w:val="1"/>
+          <w:numId w:val="1013"/>
+        </w:numPr>
+      </w:pPr>
+      <w:r>
+        <w:t xml:space="preserve">6.2 Ограничения синтетического шума</w:t>
+      </w:r>
+    </w:p>
+    <w:p>
+      <w:pPr>
+        <w:pStyle w:val="Compact"/>
+        <w:numPr>
+          <w:ilvl w:val="1"/>
+          <w:numId w:val="1013"/>
+        </w:numPr>
+      </w:pPr>
+      <w:r>
+        <w:t xml:space="preserve">6.3 Ограничения метрик</w:t>
+      </w:r>
+    </w:p>
+    <w:p>
+      <w:pPr>
+        <w:pStyle w:val="Compact"/>
+        <w:numPr>
+          <w:ilvl w:val="1"/>
+          <w:numId w:val="1013"/>
+        </w:numPr>
+      </w:pPr>
+      <w:r>
+        <w:t xml:space="preserve">6.4 Ограничения проверки на реальном OCR</w:t>
+      </w:r>
+    </w:p>
+    <w:p>
+      <w:pPr>
+        <w:pStyle w:val="Compact"/>
+        <w:numPr>
+          <w:ilvl w:val="1"/>
+          <w:numId w:val="1013"/>
+        </w:numPr>
+      </w:pPr>
+      <w:r>
+        <w:t xml:space="preserve">6.5 Следующий набор данных</w:t>
+      </w:r>
+    </w:p>
+    <w:p>
+      <w:pPr>
+        <w:pStyle w:val="Compact"/>
+        <w:numPr>
+          <w:ilvl w:val="1"/>
+          <w:numId w:val="1013"/>
+        </w:numPr>
+      </w:pPr>
+      <w:r>
+        <w:t xml:space="preserve">6.6 Переход к системе анализа исторических источников</w:t>
+      </w:r>
+    </w:p>
+    <w:p>
+      <w:pPr>
+        <w:pStyle w:val="Compact"/>
+        <w:numPr>
+          <w:ilvl w:val="1"/>
+          <w:numId w:val="1013"/>
+        </w:numPr>
+      </w:pPr>
+      <w:r>
+        <w:t xml:space="preserve">6.7 Выводы и результаты по главе</w:t>
       </w:r>
     </w:p>
     <w:p>
@@ -485,8 +1092,17 @@
           <w:numId w:val="1001"/>
         </w:numPr>
       </w:pPr>
-      <w:r>
-        <w:t xml:space="preserve">Оценить методы с помощью CER, WER, NoSpaceCER и ExactMatch, а также провести разбор улучшенных и ухудшенных примеров.</w:t>
+    </w:p>
+    <w:p>
+      <w:pPr>
+        <w:pStyle w:val="Compact"/>
+        <w:numPr>
+          <w:ilvl w:val="1"/>
+          <w:numId w:val="1014"/>
+        </w:numPr>
+      </w:pPr>
+      <w:r>
+        <w:t xml:space="preserve">Заключение</w:t>
       </w:r>
     </w:p>
     <w:p>
@@ -498,11 +1114,263 @@
         </w:numPr>
       </w:pPr>
       <w:r>
+        <w:t xml:space="preserve">Библиографический список</w:t>
+      </w:r>
+      <w:r>
+        <w:t xml:space="preserve"> </w:t>
+      </w:r>
+    </w:p>
+    <w:bookmarkStart w:id="88" w:name="введение"/>
+    <w:p>
+      <w:pPr>
+        <w:pStyle w:val="Heading2"/>
+      </w:pPr>
+      <w:r>
+        <w:t xml:space="preserve">1. Введение</w:t>
+      </w:r>
+    </w:p>
+    <w:p>
+      <w:pPr>
+        <w:pStyle w:val="FirstParagraph"/>
+      </w:pPr>
+      <w:r>
+        <w:t xml:space="preserve">Исторические тюркские тексты в арабской графике важны для изучения истории, культуры, религии, права, повседневности и интеллектуальной традиции тюркских народов. К таким материалам относятся османские, татарские, башкирские, крымскотатарские и другие источники, созданные до перехода соответствующих письменных традиций на латиницу или кириллицу.</w:t>
+      </w:r>
+    </w:p>
+    <w:p>
+      <w:pPr>
+        <w:pStyle w:val="BodyText"/>
+      </w:pPr>
+      <w:r>
+        <w:t xml:space="preserve">Для автоматической обработки это трудный материал. Историческая орфография отличается от современной нормы, арабская графика плохо переносится на стандартные OCR-сценарии, а размеченных корпусов значительно меньше, чем для современных массовых языков. Даже когда скан доступен, исследователь часто получает не готовый текстовый корпус, а изображение или OCR-вывод с большим числом ошибок.</w:t>
+      </w:r>
+    </w:p>
+    <w:p>
+      <w:pPr>
+        <w:pStyle w:val="BodyText"/>
+      </w:pPr>
+      <w:r>
+        <w:t xml:space="preserve">В этой работе не ставится задача решить всю проблему распознавания исторических документов. Полная технологическая цепочка включает поиск источника, обработку изображения, разметку строк, OCR/HTR, посткоррекцию, проверку текста и последующий анализ. Здесь рассматривается более узкий слой: исправление уже полученного текстового вывода. Такое сужение делает эксперимент проверяемым: на вход подаётся OCR-текст, на выходе получается исправленная строка, а качество измеряется относительно эталона.</w:t>
+      </w:r>
+    </w:p>
+    <w:p>
+      <w:pPr>
+        <w:pStyle w:val="BodyText"/>
+      </w:pPr>
+      <w:r>
+        <w:t xml:space="preserve">Работа проверяет важное ограничение синтетического подхода. Если реальных пар «OCR-вывод — проверенный эталон» мало, естественный первый шаг состоит в искусственной генерации ошибок. Но успех на таком наборе не подтверждает работу модели на настоящем OCR. Поэтому эксперимент разделён на два уровня: контролируемую проверку на синтетических искажениях и отдельную постраничную проверку на реальном OCR османско-турецкого печатного источника.</w:t>
+      </w:r>
+    </w:p>
+    <w:p>
+      <w:pPr>
+        <w:pStyle w:val="BodyText"/>
+      </w:pPr>
+      <w:r>
+        <w:t xml:space="preserve">Методы исследования включают анализ работ по OCR исторических документов и посткоррекции, построение пилотного корпуса, генерацию синтетических OCR-подобных ошибок, реализацию базовых методов, обучение модели ByT5-small, вычисление CER, WER, NoSpaceCER и ExactMatch, анализ ошибок и отдельную проверку переноса на реальный OCR-вывод Tesseract. Такой набор методов позволяет отделить контролируемую проверку на синтетических данных от проверки поведения модели на настоящем OCR-выводе.</w:t>
+      </w:r>
+    </w:p>
+    <w:bookmarkEnd w:id="88"/>
+    <w:bookmarkStart w:id="89" w:name="актуальность"/>
+    <w:p>
+      <w:pPr>
+        <w:pStyle w:val="Heading2"/>
+      </w:pPr>
+      <w:r>
+        <w:t xml:space="preserve">1.1 Актуальность</w:t>
+      </w:r>
+    </w:p>
+    <w:p>
+      <w:pPr>
+        <w:pStyle w:val="FirstParagraph"/>
+      </w:pPr>
+      <w:r>
+        <w:t xml:space="preserve">Актуальность работы связана не только с OCR как технической задачей. Без машинно-читаемого текста исторические источники трудно включать в поиск, корпусный анализ, извлечение имён и топонимов, сопоставление записей и проверку историко-лингвистических гипотез.</w:t>
+      </w:r>
+    </w:p>
+    <w:p>
+      <w:pPr>
+        <w:pStyle w:val="BodyText"/>
+      </w:pPr>
+      <w:r>
+        <w:t xml:space="preserve">Для арабографичных тюркских материалов эта проблема особенно заметна. Такие тексты слабо представлены в готовых OCR- и NLP-ресурсах; стандартные модели, обученные на современных языках и более регулярной орфографии, не обязательно справляются с историческим письмом. Даже частично распознанный текст часто требует отдельного слоя исправления: похожие графемы, пропуски, лишние символы и ошибки пробелов мешают дальнейшему анализу.</w:t>
+      </w:r>
+    </w:p>
+    <w:p>
+      <w:pPr>
+        <w:pStyle w:val="BodyText"/>
+      </w:pPr>
+      <w:r>
+        <w:t xml:space="preserve">Ещё одна причина актуальности связана с нехваткой воспроизводимых тестовых наборов и протоколов оценки. Для низкоресурсного исторического материала недостаточно показать один удачный пример исправления. Нужно фиксировать источник данных, процедуру генерации или получения OCR, разбиение на обучающую и тестовую части, метрики и худшие случаи. Поэтому в работе важны не только значения CER и WER, но и воспроизводимый протокол оценки.</w:t>
+      </w:r>
+    </w:p>
+    <w:bookmarkEnd w:id="89"/>
+    <w:bookmarkStart w:id="90" w:name="постановка-проблемы"/>
+    <w:p>
+      <w:pPr>
+        <w:pStyle w:val="Heading2"/>
+      </w:pPr>
+      <w:r>
+        <w:t xml:space="preserve">1.2 Постановка проблемы</w:t>
+      </w:r>
+    </w:p>
+    <w:p>
+      <w:pPr>
+        <w:pStyle w:val="FirstParagraph"/>
+      </w:pPr>
+      <w:r>
+        <w:t xml:space="preserve">Основная проблема состоит в том, что для исторических тюркских текстов в арабской графике пока не хватает небольших, но воспроизводимых экспериментальных контуров для проверки посткоррекции OCR. Без такого контура трудно понять, что именно улучшает модель: реальные ошибки распознавания, искусственно внесённый шум, пробелы, локальные замены графем или только отдельные удачные примеры.</w:t>
+      </w:r>
+    </w:p>
+    <w:p>
+      <w:pPr>
+        <w:pStyle w:val="BodyText"/>
+      </w:pPr>
+      <w:r>
+        <w:t xml:space="preserve">В этой работе проблема сведена к проверяемой постановке. Нужно построить пары «искажённый OCR-текст — эталон», обучить и сравнить несколько методов посткоррекции, а затем проверить перенос с синтетических ошибок на реальный OCR. Важное ограничение формулируется заранее: османско-турецкий источник используется как близкий тюркский материал в арабской графике, но не подаётся как старотатарский или старобашкирский набор данных.</w:t>
+      </w:r>
+    </w:p>
+    <w:p>
+      <w:pPr>
+        <w:pStyle w:val="BodyText"/>
+      </w:pPr>
+      <w:r>
+        <w:t xml:space="preserve">Такое сужение позволяет отделить ошибки посткоррекции от ошибок сегментации, распознавания изображения и подготовки скана. В то же время оно не снимает более крупную задачу: для практической системы всё равно понадобятся реальные пары «OCR-вывод — эталон», ручная валидация и расширение корпуса на целевые татарские и башкирские источники.</w:t>
+      </w:r>
+    </w:p>
+    <w:bookmarkEnd w:id="90"/>
+    <w:bookmarkStart w:id="91" w:name="цель-работы"/>
+    <w:p>
+      <w:pPr>
+        <w:pStyle w:val="Heading2"/>
+      </w:pPr>
+      <w:r>
+        <w:t xml:space="preserve">1.3 Цель работы</w:t>
+      </w:r>
+    </w:p>
+    <w:p>
+      <w:pPr>
+        <w:pStyle w:val="FirstParagraph"/>
+      </w:pPr>
+      <w:r>
+        <w:t xml:space="preserve">Цель работы состоит в построении и оценке протокола посткоррекции OCR-подобных ошибок для исторических тюркских текстов в арабской графике, а также в проверке переноса модели с синтетических искажений на реальный OCR-вывод.</w:t>
+      </w:r>
+    </w:p>
+    <w:bookmarkEnd w:id="91"/>
+    <w:bookmarkStart w:id="92" w:name="задачи-работы"/>
+    <w:p>
+      <w:pPr>
+        <w:pStyle w:val="Heading2"/>
+      </w:pPr>
+      <w:r>
+        <w:t xml:space="preserve">1.4 Задачи работы</w:t>
+      </w:r>
+    </w:p>
+    <w:p>
+      <w:pPr>
+        <w:pStyle w:val="FirstParagraph"/>
+      </w:pPr>
+      <w:r>
+        <w:t xml:space="preserve">Для достижения цели необходимо решить следующие задачи:</w:t>
+      </w:r>
+    </w:p>
+    <w:p>
+      <w:pPr>
+        <w:pStyle w:val="Compact"/>
+        <w:numPr>
+          <w:ilvl w:val="0"/>
+          <w:numId w:val="1015"/>
+        </w:numPr>
+      </w:pPr>
+      <w:r>
+        <w:t xml:space="preserve">Описать особенности автоматической обработки тюркских текстов в арабской графике.</w:t>
+      </w:r>
+    </w:p>
+    <w:p>
+      <w:pPr>
+        <w:pStyle w:val="Compact"/>
+        <w:numPr>
+          <w:ilvl w:val="0"/>
+          <w:numId w:val="1015"/>
+        </w:numPr>
+      </w:pPr>
+      <w:r>
+        <w:t xml:space="preserve">Собрать небольшой корпус тюркского текста в арабской графике и зафиксировать его ограничения.</w:t>
+      </w:r>
+    </w:p>
+    <w:p>
+      <w:pPr>
+        <w:pStyle w:val="Compact"/>
+        <w:numPr>
+          <w:ilvl w:val="0"/>
+          <w:numId w:val="1015"/>
+        </w:numPr>
+      </w:pPr>
+      <w:r>
+        <w:t xml:space="preserve">Построить синтетический набор пар «искажённый текст — эталонный текст» для задачи посткоррекции OCR.</w:t>
+      </w:r>
+    </w:p>
+    <w:p>
+      <w:pPr>
+        <w:pStyle w:val="Compact"/>
+        <w:numPr>
+          <w:ilvl w:val="0"/>
+          <w:numId w:val="1015"/>
+        </w:numPr>
+      </w:pPr>
+      <w:r>
+        <w:t xml:space="preserve">Выполнить разбиение данных на обучающую, валидационную и тестовую выборки без утечки исходных строк.</w:t>
+      </w:r>
+    </w:p>
+    <w:p>
+      <w:pPr>
+        <w:pStyle w:val="Compact"/>
+        <w:numPr>
+          <w:ilvl w:val="0"/>
+          <w:numId w:val="1015"/>
+        </w:numPr>
+      </w:pPr>
+      <w:r>
+        <w:t xml:space="preserve">Реализовать и оценить базовые методы: вариант без исправления, нормализатор на правилах и символьный метод на основе ошибок обучающей выборки.</w:t>
+      </w:r>
+    </w:p>
+    <w:p>
+      <w:pPr>
+        <w:pStyle w:val="Compact"/>
+        <w:numPr>
+          <w:ilvl w:val="0"/>
+          <w:numId w:val="1015"/>
+        </w:numPr>
+      </w:pPr>
+      <w:r>
+        <w:t xml:space="preserve">Обучить ByT5-small для исправления OCR-подобных ошибок и сравнить варианты с разной длиной последовательности.</w:t>
+      </w:r>
+    </w:p>
+    <w:p>
+      <w:pPr>
+        <w:pStyle w:val="Compact"/>
+        <w:numPr>
+          <w:ilvl w:val="0"/>
+          <w:numId w:val="1015"/>
+        </w:numPr>
+      </w:pPr>
+      <w:r>
+        <w:t xml:space="preserve">Оценить методы с помощью CER, WER, NoSpaceCER и ExactMatch, а также провести разбор улучшенных и ухудшенных примеров.</w:t>
+      </w:r>
+    </w:p>
+    <w:p>
+      <w:pPr>
+        <w:pStyle w:val="Compact"/>
+        <w:numPr>
+          <w:ilvl w:val="0"/>
+          <w:numId w:val="1015"/>
+        </w:numPr>
+      </w:pPr>
+      <w:r>
         <w:t xml:space="preserve">Проверить перенос на реальный OCR-вывод Tesseract и сформулировать ограничения синтетического обучения.</w:t>
       </w:r>
     </w:p>
-    <w:bookmarkEnd w:id="14"/>
-    <w:bookmarkStart w:id="15" w:name="объект-и-предмет-исследования"/>
+    <w:bookmarkEnd w:id="92"/>
+    <w:bookmarkStart w:id="93" w:name="объект-и-предмет-исследования"/>
     <w:p>
       <w:pPr>
         <w:pStyle w:val="Heading2"/>
@@ -527,8 +1395,8 @@
         <w:t xml:space="preserve">Предмет исследования составляют методы посткоррекции OCR-подобных ошибок в таких текстах: правила, символьные замены и нейросетевая модель ByT5-small.</w:t>
       </w:r>
     </w:p>
-    <w:bookmarkEnd w:id="15"/>
-    <w:bookmarkStart w:id="16" w:name="исследовательские-вопросы"/>
+    <w:bookmarkEnd w:id="93"/>
+    <w:bookmarkStart w:id="94" w:name="исследовательские-вопросы"/>
     <w:p>
       <w:pPr>
         <w:pStyle w:val="Heading2"/>
@@ -550,7 +1418,7 @@
         <w:pStyle w:val="Compact"/>
         <w:numPr>
           <w:ilvl w:val="0"/>
-          <w:numId w:val="1002"/>
+          <w:numId w:val="1016"/>
         </w:numPr>
       </w:pPr>
       <w:r>
@@ -562,7 +1430,7 @@
         <w:pStyle w:val="Compact"/>
         <w:numPr>
           <w:ilvl w:val="0"/>
-          <w:numId w:val="1002"/>
+          <w:numId w:val="1016"/>
         </w:numPr>
       </w:pPr>
       <w:r>
@@ -574,7 +1442,7 @@
         <w:pStyle w:val="Compact"/>
         <w:numPr>
           <w:ilvl w:val="0"/>
-          <w:numId w:val="1002"/>
+          <w:numId w:val="1016"/>
         </w:numPr>
       </w:pPr>
       <w:r>
@@ -586,7 +1454,7 @@
         <w:pStyle w:val="Compact"/>
         <w:numPr>
           <w:ilvl w:val="0"/>
-          <w:numId w:val="1002"/>
+          <w:numId w:val="1016"/>
         </w:numPr>
       </w:pPr>
       <w:r>
@@ -598,15 +1466,15 @@
         <w:pStyle w:val="Compact"/>
         <w:numPr>
           <w:ilvl w:val="0"/>
-          <w:numId w:val="1002"/>
+          <w:numId w:val="1016"/>
         </w:numPr>
       </w:pPr>
       <w:r>
         <w:t xml:space="preserve">Сохраняется ли выигрыш модели, обученной на синтетических ошибках, на реальном OCR-выводе Tesseract?</w:t>
       </w:r>
     </w:p>
-    <w:bookmarkEnd w:id="16"/>
-    <w:bookmarkStart w:id="17" w:name="гипотезы"/>
+    <w:bookmarkEnd w:id="94"/>
+    <w:bookmarkStart w:id="95" w:name="гипотезы"/>
     <w:p>
       <w:pPr>
         <w:pStyle w:val="Heading2"/>
@@ -655,8 +1523,8 @@
         <w:t xml:space="preserve">Гипотеза 4. Модель, обученная только на синтетических OCR-подобных ошибках, не будет надёжно переноситься на реальный постраничный OCR без адаптации на настоящих парах «OCR-вывод — эталон».</w:t>
       </w:r>
     </w:p>
-    <w:bookmarkEnd w:id="17"/>
-    <w:bookmarkStart w:id="18" w:name="практическая-значимость"/>
+    <w:bookmarkEnd w:id="95"/>
+    <w:bookmarkStart w:id="96" w:name="практическая-значимость"/>
     <w:p>
       <w:pPr>
         <w:pStyle w:val="Heading2"/>
@@ -681,8 +1549,8 @@
         <w:t xml:space="preserve">Практический смысл результата связан с цифровой гуманитаристикой. После появления реальных пар «OCR-вывод — эталон» этот контур можно применять для подготовки корпусов, поиска по историческим текстам, извлечения именованных сущностей и сопоставления архивных записей. Текущая версия честно фиксирует границу применимости: она показывает разрыв между синтетической и реальной оценкой, но не является готовым корректором для архивных сканов.</w:t>
       </w:r>
     </w:p>
-    <w:bookmarkEnd w:id="18"/>
-    <w:bookmarkStart w:id="19" w:name="структура-работы"/>
+    <w:bookmarkEnd w:id="96"/>
+    <w:bookmarkStart w:id="97" w:name="структура-работы"/>
     <w:p>
       <w:pPr>
         <w:pStyle w:val="Heading2"/>
@@ -699,8 +1567,8 @@
         <w:t xml:space="preserve">Логика работы следующая: сначала рассматриваются трудности OCR исторических документов и арабографичного письма, затем описываются корпус и синтетические ошибки, после этого сравниваются базовые методы и ByT5-small, а в конце отдельно проверяется перенос на реальный OCR-вывод Tesseract.</w:t>
       </w:r>
     </w:p>
-    <w:bookmarkEnd w:id="19"/>
-    <w:bookmarkStart w:id="27" w:name="X0ceba565ddc4689162e5800a39ee266fa2dc29a"/>
+    <w:bookmarkEnd w:id="97"/>
+    <w:bookmarkStart w:id="106" w:name="X0ceba565ddc4689162e5800a39ee266fa2dc29a"/>
     <w:p>
       <w:pPr>
         <w:pStyle w:val="Heading2"/>
@@ -709,7 +1577,7 @@
         <w:t xml:space="preserve">2. Обзор предметной области и связанных работ</w:t>
       </w:r>
     </w:p>
-    <w:bookmarkStart w:id="20" w:name="X180942b9a24eaba8abfe1c56a0263be0843d255"/>
+    <w:bookmarkStart w:id="98" w:name="X180942b9a24eaba8abfe1c56a0263be0843d255"/>
     <w:p>
       <w:pPr>
         <w:pStyle w:val="Heading3"/>
@@ -742,8 +1610,8 @@
         <w:t xml:space="preserve">Современные OCR-модели также всё чаще строятся на трансформерных подходах. Например, TrOCR использует предобученные компоненты визуального и текстового трансформеров и показывает, что сама OCR-модель может выигрывать от предобучения и дообучения на размеченных данных (Li et al., 2021). Однако это направление относится к распознаванию изображения, тогда как настоящая работа ограничена текстовой посткоррекцией. Такое ограничение сужает эксперимент, зато позволяет проверить отдельный вопрос: может ли модель исправлять уже полученный OCR-вывод без смешения этого результата с качеством сегментации и распознавания изображения.</w:t>
       </w:r>
     </w:p>
-    <w:bookmarkEnd w:id="20"/>
-    <w:bookmarkStart w:id="21" w:name="специфика-арабографичного-ocr"/>
+    <w:bookmarkEnd w:id="98"/>
+    <w:bookmarkStart w:id="99" w:name="специфика-арабографичного-ocr"/>
     <w:p>
       <w:pPr>
         <w:pStyle w:val="Heading3"/>
@@ -784,8 +1652,8 @@
         <w:t xml:space="preserve">Именно здесь возникает разрыв между синтетической и реальной проверкой. В синтетической постановке можно контролировать типы искажений и разбиение на обучающую и тестовую выборки. В реальном OCR появляются дополнительные факторы: структура страницы, шрифт, качество изображения, сегментация строк, направление письма и особенности конкретной OCR-системы. Поэтому результаты на синтетическом наборе нельзя автоматически переносить на настоящий OCR-вывод.</w:t>
       </w:r>
     </w:p>
-    <w:bookmarkEnd w:id="21"/>
-    <w:bookmarkStart w:id="22" w:name="X870e54edfb9df569aa2599064af567ed17246c1"/>
+    <w:bookmarkEnd w:id="99"/>
+    <w:bookmarkStart w:id="100" w:name="X870e54edfb9df569aa2599064af567ed17246c1"/>
     <w:p>
       <w:pPr>
         <w:pStyle w:val="Heading3"/>
@@ -818,8 +1686,8 @@
         <w:t xml:space="preserve">С точки зрения обработки естественного языка такие материалы относятся к низкоресурсным историческим данным. Для них меньше размеченных корпусов, стандартных бенчмарков, готовых моделей и инструментов, чем для современных массовых языков. Современные работы по обработке исторического турецкого языка подчёркивают необходимость создавать базовые ресурсы: корпуса, модели, разметку и инструменты для анализа исторических текстов (Özateş et al., 2025). Настоящая работа занимает в этой цепочке более узкое место: она не строит полный корпус, а проверяет протокол посткоррекции.</w:t>
       </w:r>
     </w:p>
-    <w:bookmarkEnd w:id="22"/>
-    <w:bookmarkStart w:id="23" w:name="Xfcaf842918234d7c399beca909495522023c2d4"/>
+    <w:bookmarkEnd w:id="100"/>
+    <w:bookmarkStart w:id="101" w:name="Xfcaf842918234d7c399beca909495522023c2d4"/>
     <w:p>
       <w:pPr>
         <w:pStyle w:val="Heading3"/>
@@ -868,8 +1736,8 @@
         <w:t xml:space="preserve">Отдельная современная линия исследований связана с использованием больших языковых моделей для коррекции OCR. Kanerva et al. (2025) показывают, что посткоррекция на основе больших языковых моделей для исторических документов не даёт универсального выигрыша: эффект зависит от языка, данных и постановки. Этот вывод важен для интерпретации настоящего эксперимента. Смешанный перенос модели, обученной на синтетических искажениях, на реальный OCR отражает известную проблему посткоррекции: качество зависит от домена, языка, структуры ошибок и объёма размеченных пар «OCR-вывод — эталон».</w:t>
       </w:r>
     </w:p>
-    <w:bookmarkEnd w:id="23"/>
-    <w:bookmarkStart w:id="24" w:name="Xaa6a63b69f8f8f9084dc16d50d48dc0403f5611"/>
+    <w:bookmarkEnd w:id="101"/>
+    <w:bookmarkStart w:id="102" w:name="Xaa6a63b69f8f8f9084dc16d50d48dc0403f5611"/>
     <w:p>
       <w:pPr>
         <w:pStyle w:val="Heading3"/>
@@ -918,8 +1786,8 @@
         <w:t xml:space="preserve">Следовательно, синтетический набор в этой работе — это диагностический стенд, а не финальный бенчмарк. Он нужен, чтобы увидеть, превосходит ли ByT5-small простые базовые методы в контролируемой среде. Постраничная проверка на Tesseract затем показывает границу этого стенда: для практического применения нужно строить ошибки не только по заранее заданным правилам, но и по реальным OCR-выводам и эмпирическим путаницам арабографичных графем.</w:t>
       </w:r>
     </w:p>
-    <w:bookmarkEnd w:id="24"/>
-    <w:bookmarkStart w:id="25" w:name="X15509693a0d7b6f8fe53cddac6f871c0636dbad"/>
+    <w:bookmarkEnd w:id="102"/>
+    <w:bookmarkStart w:id="103" w:name="X15509693a0d7b6f8fe53cddac6f871c0636dbad"/>
     <w:p>
       <w:pPr>
         <w:pStyle w:val="Heading3"/>
@@ -952,8 +1820,8 @@
         <w:t xml:space="preserve">Тем не менее модель с байтовым представлением не решает проблему доменного переноса автоматически. Если модель обучена только на синтетическом шуме, она учится распределению ошибок этого генератора. Реальный OCR-вывод может иметь другую структуру: пропуски, артефакты разметки страницы, ошибки чтения строк, необычные пробелы, неверные формы букв или последовательные искажения. Поэтому ByT5 в этой работе рассматривается как сильная нейросетевая точка сравнения для посткоррекции, но не как готовое универсальное решение.</w:t>
       </w:r>
     </w:p>
-    <w:bookmarkEnd w:id="25"/>
-    <w:bookmarkStart w:id="26" w:name="X4e2987dd6a0ff1eb2f6c8914cca3c5fd2dc83ae"/>
+    <w:bookmarkEnd w:id="103"/>
+    <w:bookmarkStart w:id="104" w:name="X4e2987dd6a0ff1eb2f6c8914cca3c5fd2dc83ae"/>
     <w:p>
       <w:pPr>
         <w:pStyle w:val="Heading3"/>
@@ -994,9 +1862,35 @@
         <w:t xml:space="preserve">Для дальнейшего исследования наиболее важен именно этот отрицательный результат. На синтетическом наборе модель улучшает метрики относительно базовых методов, но при переходе к реальному OCR эффект становится нестабильным. Это задаёт следующую задачу магистерской работы: собрать выровненные пары «OCR-вывод — эталон», разнести страницы по выборкам без утечки и обучать посткоррекцию уже на настоящих ошибках распознавания.</w:t>
       </w:r>
     </w:p>
-    <w:bookmarkEnd w:id="26"/>
-    <w:bookmarkEnd w:id="27"/>
-    <w:bookmarkStart w:id="44" w:name="данные-и-построение-корпуса"/>
+    <w:bookmarkEnd w:id="104"/>
+    <w:bookmarkStart w:id="105" w:name="выводы-и-результаты-по-главе"/>
+    <w:p>
+      <w:pPr>
+        <w:pStyle w:val="Heading3"/>
+      </w:pPr>
+      <w:r>
+        <w:t xml:space="preserve">2.8 Выводы и результаты по главе</w:t>
+      </w:r>
+    </w:p>
+    <w:p>
+      <w:pPr>
+        <w:pStyle w:val="FirstParagraph"/>
+      </w:pPr>
+      <w:r>
+        <w:t xml:space="preserve">В главе рассмотрены основные направления, на которые опирается работа: OCR исторических документов, специфика арабской графики, тюркские тексты в арабской письменной традиции, посткоррекция OCR и использование синтетических данных. Обзор показывает, что посткоррекция не заменяет полноценный OCR/HTR-процесс, а решает более узкую задачу исправления уже полученного текстового вывода.</w:t>
+      </w:r>
+    </w:p>
+    <w:p>
+      <w:pPr>
+        <w:pStyle w:val="BodyText"/>
+      </w:pPr>
+      <w:r>
+        <w:t xml:space="preserve">Для данной работы особенно важен вывод о границе синтетического подхода. Синтетические пары позволяют построить воспроизводимый проверочный стенд, но не гарантируют устойчивый перенос на настоящий OCR. Поэтому дальнейшие главы разделяют контролируемую проверку на синтетических ошибках и отдельную проверку на реальном OCR-выводе Tesseract.</w:t>
+      </w:r>
+    </w:p>
+    <w:bookmarkEnd w:id="105"/>
+    <w:bookmarkEnd w:id="106"/>
+    <w:bookmarkStart w:id="123" w:name="данные-и-построение-корпуса"/>
     <w:p>
       <w:pPr>
         <w:pStyle w:val="Heading2"/>
@@ -1005,7 +1899,7 @@
         <w:t xml:space="preserve">3. Данные и построение корпуса</w:t>
       </w:r>
     </w:p>
-    <w:bookmarkStart w:id="28" w:name="общая-постановка"/>
+    <w:bookmarkStart w:id="107" w:name="общая-постановка"/>
     <w:p>
       <w:pPr>
         <w:pStyle w:val="Heading3"/>
@@ -1038,8 +1932,8 @@
         <w:t xml:space="preserve">Важно, что эта постановка сознательно отделяет задачу посткоррекции от задачи распознавания изображения. В эксперименте не оценивается качество сегментации страниц или OCR/HTR-модели; оценивается только способность метода исправлять уже полученный текстовый вывод.</w:t>
       </w:r>
     </w:p>
-    <w:bookmarkEnd w:id="28"/>
-    <w:bookmarkStart w:id="29" w:name="источник-данных"/>
+    <w:bookmarkEnd w:id="107"/>
+    <w:bookmarkStart w:id="108" w:name="источник-данных"/>
     <w:p>
       <w:pPr>
         <w:pStyle w:val="Heading3"/>
@@ -1096,8 +1990,8 @@
         <w:t xml:space="preserve">Источник выбран не как случайный арабографичный текст, а как материал, близкий к теме работы: он относится к историческим тюркским текстам, записанным арабской графикой. В источнике встречаются формы, характерные для османско-тюркского текста в арабской графике; отдельные примеры таких форм приведены ниже в таблицах с синтетическими примерами и примерами реального OCR. Поэтому корпус лучше соответствует теме курсовой, чем более ранний технический прототип на персидском или общеарабографичном материале.</w:t>
       </w:r>
     </w:p>
-    <w:bookmarkEnd w:id="29"/>
-    <w:bookmarkStart w:id="30" w:name="сбор-и-предварительная-подготовка"/>
+    <w:bookmarkEnd w:id="108"/>
+    <w:bookmarkStart w:id="109" w:name="сбор-и-предварительная-подготовка"/>
     <w:p>
       <w:pPr>
         <w:pStyle w:val="Heading3"/>
@@ -1142,8 +2036,8 @@
         <w:t xml:space="preserve">Поэтому нормализация вынесена в отдельный базовый метод. Корпус хранится в максимально щадящем виде, а нормализатор на правилах оценивается экспериментально наравне с методом без исправления и нейросетевой моделью.</w:t>
       </w:r>
     </w:p>
-    <w:bookmarkEnd w:id="30"/>
-    <w:bookmarkStart w:id="31" w:name="синтетические-ocr-подобные-искажения"/>
+    <w:bookmarkEnd w:id="109"/>
+    <w:bookmarkStart w:id="110" w:name="синтетические-ocr-подобные-искажения"/>
     <w:p>
       <w:pPr>
         <w:pStyle w:val="Heading3"/>
@@ -1200,8 +2094,8 @@
         <w:t xml:space="preserve">.</w:t>
       </w:r>
     </w:p>
-    <w:bookmarkEnd w:id="31"/>
-    <w:bookmarkStart w:id="32" w:name="типы-синтетических-искажений"/>
+    <w:bookmarkEnd w:id="110"/>
+    <w:bookmarkStart w:id="111" w:name="типы-синтетических-искажений"/>
     <w:p>
       <w:pPr>
         <w:pStyle w:val="Heading3"/>
@@ -1452,8 +2346,8 @@
         <w:t xml:space="preserve">Ошибки пробелов влияют на WER сильнее, чем на CER. Поэтому заметное снижение WER у модели не следует автоматически трактовать как доказательство такого же качества на реальном OCR. В текущей постановке это прежде всего показывает способность модели исправлять контролируемые искажения границ слов в синтетическом наборе.</w:t>
       </w:r>
     </w:p>
-    <w:bookmarkEnd w:id="32"/>
-    <w:bookmarkStart w:id="33" w:name="Xe2e6ef423b4b11ea7446063a790a29ab69053e4"/>
+    <w:bookmarkEnd w:id="111"/>
+    <w:bookmarkStart w:id="112" w:name="Xe2e6ef423b4b11ea7446063a790a29ab69053e4"/>
     <w:p>
       <w:pPr>
         <w:pStyle w:val="Heading3"/>
@@ -1692,8 +2586,8 @@
         <w:t xml:space="preserve">Эти значения показывают, что шум не сводится к набору замен символов: почти половина искажённых строк короче эталонных, примерно треть длиннее, а среднее изменение числа слов положительно. Это согласуется с наличием вставок, удалений и ошибок пробелов. Одновременно такая статистика подчёркивает ограничение эксперимента: генератор задаёт искусственное распределение ошибок, которое может отличаться от реальных OCR/HTR-выходов.</w:t>
       </w:r>
     </w:p>
-    <w:bookmarkEnd w:id="33"/>
-    <w:bookmarkStart w:id="37" w:name="примеры-пар-искажённая-строка-эталон"/>
+    <w:bookmarkEnd w:id="112"/>
+    <w:bookmarkStart w:id="116" w:name="примеры-пар-искажённая-строка-эталон"/>
     <w:p>
       <w:pPr>
         <w:pStyle w:val="Heading3"/>
@@ -1711,18 +2605,18 @@
           <wp:inline>
             <wp:extent cx="5334000" cy="2489200"/>
             <wp:effectExtent b="0" l="0" r="0" t="0"/>
-            <wp:docPr descr="Рисунок 3.1 — Пример синтетического OCR-подобного искажения" title="" id="35" name="Picture"/>
+            <wp:docPr descr="Рисунок 3.1 — Пример синтетического OCR-подобного искажения" title="" id="114" name="Picture"/>
             <a:graphic>
               <a:graphicData uri="http://schemas.openxmlformats.org/drawingml/2006/picture">
                 <pic:pic>
                   <pic:nvPicPr>
-                    <pic:cNvPr descr="figures/fig03_synthetic_example.png" id="36" name="Picture"/>
+                    <pic:cNvPr descr="figures/fig03_synthetic_example.png" id="115" name="Picture"/>
                     <pic:cNvPicPr>
                       <a:picLocks noChangeArrowheads="1" noChangeAspect="1"/>
                     </pic:cNvPicPr>
                   </pic:nvPicPr>
                   <pic:blipFill>
-                    <a:blip r:embed="rId34"/>
+                    <a:blip r:embed="rId113"/>
                     <a:stretch>
                       <a:fillRect/>
                     </a:stretch>
@@ -2049,8 +2943,8 @@
         <w:t xml:space="preserve">. Эти примеры выглядят как OCR-подобные текстовые искажения, но не доказывают соответствие реальному OCR. Для внешней валидности нужна отдельная подвыборка реального OCR/HTR-вывода с ручной проверкой эталонного текста.</w:t>
       </w:r>
     </w:p>
-    <w:bookmarkEnd w:id="37"/>
-    <w:bookmarkStart w:id="38" w:name="ограничения-синтетического-шума"/>
+    <w:bookmarkEnd w:id="116"/>
+    <w:bookmarkStart w:id="117" w:name="ограничения-синтетического-шума"/>
     <w:p>
       <w:pPr>
         <w:pStyle w:val="Heading3"/>
@@ -2075,8 +2969,8 @@
         <w:t xml:space="preserve">Поэтому синтетический набор следует понимать как проверочный стенд, а не как замену реального OCR. Он показывает, что код, разбиение, метрики и сравнение методов работают воспроизводимо. Но постраничная проверка на Tesseract даёт более жёсткий результат: без адаптации на настоящих OCR-ошибках модель иногда снижает WER, но может ухудшать символный состав текста.</w:t>
       </w:r>
     </w:p>
-    <w:bookmarkEnd w:id="38"/>
-    <w:bookmarkStart w:id="39" w:name="структура-набора-данных"/>
+    <w:bookmarkEnd w:id="117"/>
+    <w:bookmarkStart w:id="118" w:name="структура-набора-данных"/>
     <w:p>
       <w:pPr>
         <w:pStyle w:val="Heading3"/>
@@ -2280,8 +3174,8 @@
         <w:t xml:space="preserve">.</w:t>
       </w:r>
     </w:p>
-    <w:bookmarkEnd w:id="39"/>
-    <w:bookmarkStart w:id="40" w:name="Xd08570dcee77ed6951cf64ca8f19d56e666eec0"/>
+    <w:bookmarkEnd w:id="118"/>
+    <w:bookmarkStart w:id="119" w:name="Xd08570dcee77ed6951cf64ca8f19d56e666eec0"/>
     <w:p>
       <w:pPr>
         <w:pStyle w:val="Heading3"/>
@@ -2477,8 +3371,8 @@
         <w:t xml:space="preserve">Такой размер достаточен для пилотной проверки контура посткоррекции: он мал для финального бенчмарка, но позволяет сравнить базовые методы и нейросетевую модель в воспроизводимых условиях.</w:t>
       </w:r>
     </w:p>
-    <w:bookmarkEnd w:id="40"/>
-    <w:bookmarkStart w:id="41" w:name="контроль-утечки-данных"/>
+    <w:bookmarkEnd w:id="119"/>
+    <w:bookmarkStart w:id="120" w:name="контроль-утечки-данных"/>
     <w:p>
       <w:pPr>
         <w:pStyle w:val="Heading3"/>
@@ -2633,8 +3527,8 @@
         <w:t xml:space="preserve">Тестовая выборка не содержит исходных строк, которые встречались в обучении или валидации. Это делает оценку более строгой: модель проверяется на новых исходных строках, а не на новых зашумлённых вариациях уже знакомых строк.</w:t>
       </w:r>
     </w:p>
-    <w:bookmarkEnd w:id="41"/>
-    <w:bookmarkStart w:id="42" w:name="ограничения-корпуса"/>
+    <w:bookmarkEnd w:id="120"/>
+    <w:bookmarkStart w:id="121" w:name="ограничения-корпуса"/>
     <w:p>
       <w:pPr>
         <w:pStyle w:val="Heading3"/>
@@ -2683,8 +3577,8 @@
         <w:t xml:space="preserve">Четвёртое ограничение связано с отсутствием ручной лингвистической проверки исправлений. Метрики CER и WER показывают формальную близость к эталону, но не всегда отражают историко-орфографическую допустимость исправления. Для следующего этапа нужна небольшая вручную проверенная подвыборка с качественным анализом ошибок.</w:t>
       </w:r>
     </w:p>
-    <w:bookmarkEnd w:id="42"/>
-    <w:bookmarkStart w:id="43" w:name="выводы-и-результаты-по-главе"/>
+    <w:bookmarkEnd w:id="121"/>
+    <w:bookmarkStart w:id="122" w:name="выводы-и-результаты-по-главе-1"/>
     <w:p>
       <w:pPr>
         <w:pStyle w:val="Heading3"/>
@@ -2709,9 +3603,9 @@
         <w:t xml:space="preserve">Роль корпуса ограничена, но ясна: он даёт одинаковые условия для сравнения метода без исправления, нормализатора на правилах, символьного метода на основе ошибок обучающей выборки и ByT5-small. Следующая версия должна добавить реальные OCR/HTR-выводы, ручную проверку и более разнообразные татарские, башкирские и другие тюркские источники в арабской графике.</w:t>
       </w:r>
     </w:p>
-    <w:bookmarkEnd w:id="43"/>
-    <w:bookmarkEnd w:id="44"/>
-    <w:bookmarkStart w:id="58" w:name="методология-эксперимента"/>
+    <w:bookmarkEnd w:id="122"/>
+    <w:bookmarkEnd w:id="123"/>
+    <w:bookmarkStart w:id="137" w:name="методология-эксперимента"/>
     <w:p>
       <w:pPr>
         <w:pStyle w:val="Heading2"/>
@@ -2720,7 +3614,7 @@
         <w:t xml:space="preserve">4. Методология эксперимента</w:t>
       </w:r>
     </w:p>
-    <w:bookmarkStart w:id="48" w:name="общая-схема-эксперимента"/>
+    <w:bookmarkStart w:id="127" w:name="общая-схема-эксперимента"/>
     <w:p>
       <w:pPr>
         <w:pStyle w:val="Heading3"/>
@@ -2785,18 +3679,18 @@
           <wp:inline>
             <wp:extent cx="5334000" cy="1666875"/>
             <wp:effectExtent b="0" l="0" r="0" t="0"/>
-            <wp:docPr descr="Рисунок 4.1 — Общая схема протокола OCR-посткоррекции" title="" id="46" name="Picture"/>
+            <wp:docPr descr="Рисунок 4.1 — Общая схема протокола OCR-посткоррекции" title="" id="125" name="Picture"/>
             <a:graphic>
               <a:graphicData uri="http://schemas.openxmlformats.org/drawingml/2006/picture">
                 <pic:pic>
                   <pic:nvPicPr>
-                    <pic:cNvPr descr="figures/fig01_postcorrection_process.png" id="47" name="Picture"/>
+                    <pic:cNvPr descr="figures/fig01_postcorrection_process.png" id="126" name="Picture"/>
                     <pic:cNvPicPr>
                       <a:picLocks noChangeArrowheads="1" noChangeAspect="1"/>
                     </pic:cNvPicPr>
                   </pic:nvPicPr>
                   <pic:blipFill>
-                    <a:blip r:embed="rId45"/>
+                    <a:blip r:embed="rId124"/>
                     <a:stretch>
                       <a:fillRect/>
                     </a:stretch>
@@ -2855,8 +3749,8 @@
         <w:t xml:space="preserve">Главный вопрос эксперимента — улучшает ли нейросетевая модель посткоррекции качество текста по сравнению с неизменённым зашумлённым вводом. Дополнительный вопрос — помогает ли простая нормализация на правилах именно для исторического тюркского материала в арабской графике или, наоборот, ухудшает текст.</w:t>
       </w:r>
     </w:p>
-    <w:bookmarkEnd w:id="48"/>
-    <w:bookmarkStart w:id="49" w:name="базовые-методы"/>
+    <w:bookmarkEnd w:id="127"/>
+    <w:bookmarkStart w:id="128" w:name="базовые-методы"/>
     <w:p>
       <w:pPr>
         <w:pStyle w:val="Heading3"/>
@@ -2905,8 +3799,8 @@
         <w:t xml:space="preserve">Такой набор базовых методов позволяет разделить несколько эффектов. Метод без исправления показывает исходную сложность задачи. Нормализатор проверяет безопасность ручных правил. Символьный метод показывает, насколько далеко можно продвинуться без контекстной нейросетевой модели. На этом фоне результат ByT5-small интерпретируется осторожнее: улучшение должно быть не просто численным, а устойчивым относительно простых альтернатив.</w:t>
       </w:r>
     </w:p>
-    <w:bookmarkEnd w:id="49"/>
-    <w:bookmarkStart w:id="50" w:name="X922718734d9410424975b4d665e2323c01d8043"/>
+    <w:bookmarkEnd w:id="128"/>
+    <w:bookmarkStart w:id="129" w:name="X922718734d9410424975b4d665e2323c01d8043"/>
     <w:p>
       <w:pPr>
         <w:pStyle w:val="Heading3"/>
@@ -2931,8 +3825,8 @@
         <w:t xml:space="preserve">Его диагностическая роль состоит в проверке вопроса: достаточно ли простых символьных соответствий, извлечённых из корпуса, или нужен контекстный подход на основе преобразования последовательностей. Если такой метод приблизился бы к ByT5, это означало бы, что задача в основном сводится к локальным заменам символов. Если же ByT5 заметно превосходит его, это указывает на важность контекста, восстановления структуры слов и более сложного моделирования строки.</w:t>
       </w:r>
     </w:p>
-    <w:bookmarkEnd w:id="50"/>
-    <w:bookmarkStart w:id="51" w:name="нейросетевая-модель-byt5-small"/>
+    <w:bookmarkEnd w:id="129"/>
+    <w:bookmarkStart w:id="130" w:name="нейросетевая-модель-byt5-small"/>
     <w:p>
       <w:pPr>
         <w:pStyle w:val="Heading3"/>
@@ -2977,8 +3871,8 @@
         <w:t xml:space="preserve">Практическое следствие байтового представления состоит в том, что длина последовательности в токенах может быстро расти: один видимый символ арабской графики занимает несколько байтов. Поэтому в эксперименте отдельно контролируется максимальная длина входной и целевой последовательности.</w:t>
       </w:r>
     </w:p>
-    <w:bookmarkEnd w:id="51"/>
-    <w:bookmarkStart w:id="52" w:name="проверенные-конфигурации"/>
+    <w:bookmarkEnd w:id="130"/>
+    <w:bookmarkStart w:id="131" w:name="проверенные-конфигурации"/>
     <w:p>
       <w:pPr>
         <w:pStyle w:val="Heading3"/>
@@ -3174,8 +4068,8 @@
         <w:t xml:space="preserve">Для итогового анализа выбрана конфигурация 512. Она уменьшает риск обрезания строк и используется как основная нейросетевая конфигурация в сравнении с методом без исправления, нормализатором на правилах и символьным методом на основе ошибок обучающей выборки. Вывод о преимуществе 512 в данной работе относится к пилотному набору данных и должен быть дополнительно проверен на более широком корпусе.</w:t>
       </w:r>
     </w:p>
-    <w:bookmarkEnd w:id="52"/>
-    <w:bookmarkStart w:id="53" w:name="метрики-качества"/>
+    <w:bookmarkEnd w:id="131"/>
+    <w:bookmarkStart w:id="132" w:name="метрики-качества"/>
     <w:p>
       <w:pPr>
         <w:pStyle w:val="Heading3"/>
@@ -3231,8 +4125,8 @@
         <w:t xml:space="preserve">ExactMatch показывает долю строк, полностью совпавших с эталоном. Для длинных исторических строк эта метрика очень строгая: один неверный символ уже делает пример несовпадающим. Поэтому ExactMatch используется как дополнительный строгий индикатор, а основные выводы строятся по CER, WER, NoSpaceCER и анализу ошибок.</w:t>
       </w:r>
     </w:p>
-    <w:bookmarkEnd w:id="53"/>
-    <w:bookmarkStart w:id="54" w:name="процедура-оценки"/>
+    <w:bookmarkEnd w:id="132"/>
+    <w:bookmarkStart w:id="133" w:name="процедура-оценки"/>
     <w:p>
       <w:pPr>
         <w:pStyle w:val="Heading3"/>
@@ -3277,8 +4171,8 @@
         <w:t xml:space="preserve">.</w:t>
       </w:r>
     </w:p>
-    <w:bookmarkEnd w:id="54"/>
-    <w:bookmarkStart w:id="55" w:name="анализ-ошибок"/>
+    <w:bookmarkEnd w:id="133"/>
+    <w:bookmarkStart w:id="134" w:name="анализ-ошибок"/>
     <w:p>
       <w:pPr>
         <w:pStyle w:val="Heading3"/>
@@ -3323,8 +4217,8 @@
         <w:t xml:space="preserve">; он используется не вместо метрик, а как дополнительная проверка того, насколько численный выигрыш выглядит надёжным на уровне конкретных строк.</w:t>
       </w:r>
     </w:p>
-    <w:bookmarkEnd w:id="55"/>
-    <w:bookmarkStart w:id="56" w:name="воспроизводимость"/>
+    <w:bookmarkEnd w:id="134"/>
+    <w:bookmarkStart w:id="135" w:name="воспроизводимость"/>
     <w:p>
       <w:pPr>
         <w:pStyle w:val="Heading3"/>
@@ -3357,8 +4251,8 @@
         <w:t xml:space="preserve">Воспроизводимость текущего эксперимента не означает полноту контрольного набора. Она означает, что все ключевые решения пилотного протокола явно зафиксированы: источник, генератор шума, разбиение данных, базовые методы, модель, метрики и анализ ошибок.</w:t>
       </w:r>
     </w:p>
-    <w:bookmarkEnd w:id="56"/>
-    <w:bookmarkStart w:id="57" w:name="выводы-и-результаты-по-главе-1"/>
+    <w:bookmarkEnd w:id="135"/>
+    <w:bookmarkStart w:id="136" w:name="выводы-и-результаты-по-главе-2"/>
     <w:p>
       <w:pPr>
         <w:pStyle w:val="Heading3"/>
@@ -3391,9 +4285,9 @@
         <w:t xml:space="preserve">Эта методология задаёт основу для раздела 5, где сравниваются базовые методы, символьный метод на основе ошибок обучающей выборки, финальная конфигурация ByT5-small и результаты анализа ошибок.</w:t>
       </w:r>
     </w:p>
-    <w:bookmarkEnd w:id="57"/>
-    <w:bookmarkEnd w:id="58"/>
-    <w:bookmarkStart w:id="83" w:name="результаты-экспериментов-и-анализ-ошибок"/>
+    <w:bookmarkEnd w:id="136"/>
+    <w:bookmarkEnd w:id="137"/>
+    <w:bookmarkStart w:id="162" w:name="результаты-экспериментов-и-анализ-ошибок"/>
     <w:p>
       <w:pPr>
         <w:pStyle w:val="Heading2"/>
@@ -3402,7 +4296,7 @@
         <w:t xml:space="preserve">5. Результаты экспериментов и анализ ошибок</w:t>
       </w:r>
     </w:p>
-    <w:bookmarkStart w:id="59" w:name="общая-логика-оценки"/>
+    <w:bookmarkStart w:id="138" w:name="общая-логика-оценки"/>
     <w:p>
       <w:pPr>
         <w:pStyle w:val="Heading3"/>
@@ -3435,8 +4329,8 @@
         <w:t xml:space="preserve">В этом разделе важны не только лучшие итоговые метрики ByT5-small среди рассмотренных методов. Не менее важны ограничивающие результаты: нормализатор на правилах ухудшает качество относительно метода без исправления, символьный метод даёт лишь умеренное улучшение CER, а заметное снижение WER у ByT5 требует осторожной интерпретации из-за синтетических ошибок пробелов и границ слов.</w:t>
       </w:r>
     </w:p>
-    <w:bookmarkEnd w:id="59"/>
-    <w:bookmarkStart w:id="63" w:name="итоговые-метрики"/>
+    <w:bookmarkEnd w:id="138"/>
+    <w:bookmarkStart w:id="142" w:name="итоговые-метрики"/>
     <w:p>
       <w:pPr>
         <w:pStyle w:val="Heading3"/>
@@ -3799,18 +4693,18 @@
           <wp:inline>
             <wp:extent cx="5334000" cy="2812472"/>
             <wp:effectExtent b="0" l="0" r="0" t="0"/>
-            <wp:docPr descr="Рисунок 5.1 — Сравнение методов на синтетическом тестовом наборе" title="" id="61" name="Picture"/>
+            <wp:docPr descr="Рисунок 5.1 — Сравнение методов на синтетическом тестовом наборе" title="" id="140" name="Picture"/>
             <a:graphic>
               <a:graphicData uri="http://schemas.openxmlformats.org/drawingml/2006/picture">
                 <pic:pic>
                   <pic:nvPicPr>
-                    <pic:cNvPr descr="figures/fig02_synthetic_metrics.png" id="62" name="Picture"/>
+                    <pic:cNvPr descr="figures/fig02_synthetic_metrics.png" id="141" name="Picture"/>
                     <pic:cNvPicPr>
                       <a:picLocks noChangeArrowheads="1" noChangeAspect="1"/>
                     </pic:cNvPicPr>
                   </pic:nvPicPr>
                   <pic:blipFill>
-                    <a:blip r:embed="rId60"/>
+                    <a:blip r:embed="rId139"/>
                     <a:stretch>
                       <a:fillRect/>
                     </a:stretch>
@@ -3885,8 +4779,8 @@
         <w:t xml:space="preserve">ExactMatch остаётся низким у всех методов. Это ожидаемо для длинных строк и строгого посимвольного сравнения: даже одна ошибка делает строку несовпадающей с эталоном. Поэтому ExactMatch используется как дополнительный строгий индикатор, а основные выводы строятся по CER, WER, NoSpaceCER и анализу ошибок.</w:t>
       </w:r>
     </w:p>
-    <w:bookmarkEnd w:id="63"/>
-    <w:bookmarkStart w:id="64" w:name="сравнение-с-методом-без-исправления"/>
+    <w:bookmarkEnd w:id="142"/>
+    <w:bookmarkStart w:id="143" w:name="сравнение-с-методом-без-исправления"/>
     <w:p>
       <w:pPr>
         <w:pStyle w:val="Heading3"/>
@@ -3919,8 +4813,8 @@
         <w:t xml:space="preserve">Я трактую этот результат как положительный сигнал для пилотного эксперимента, а не как доказательство готовности модели к практическому OCR. На синтетическом наборе ByT5-small полезна, но для вывода о реальных сканах нужна проверка на настоящих OCR-ошибках и на разбиении по страницам или источникам.</w:t>
       </w:r>
     </w:p>
-    <w:bookmarkEnd w:id="64"/>
-    <w:bookmarkStart w:id="65" w:name="нормализатор-на-правилах"/>
+    <w:bookmarkEnd w:id="143"/>
+    <w:bookmarkStart w:id="144" w:name="нормализатор-на-правилах"/>
     <w:p>
       <w:pPr>
         <w:pStyle w:val="Heading3"/>
@@ -3945,8 +4839,8 @@
         <w:t xml:space="preserve">Для этой работы такой результат важен методологически. Он показывает, что простые символьные правила нельзя считать безопасной предобработкой для исторического арабографичного текста. Правило может выглядеть разумным как техническая нормализация, но в историческом материале оно легко меняет орфографически значимые формы. Поэтому нормализатор в дальнейшем не следует использовать как обязательный этап без отдельной проверки на реальных данных.</w:t>
       </w:r>
     </w:p>
-    <w:bookmarkEnd w:id="65"/>
-    <w:bookmarkStart w:id="66" w:name="X26c70db4b79cb30b57d665edbf51a9d36fed8b5"/>
+    <w:bookmarkEnd w:id="144"/>
+    <w:bookmarkStart w:id="145" w:name="X26c70db4b79cb30b57d665edbf51a9d36fed8b5"/>
     <w:p>
       <w:pPr>
         <w:pStyle w:val="Heading3"/>
@@ -3971,8 +4865,8 @@
         <w:t xml:space="preserve">Однако этот метод почти не меняет качество на уровне слов. Он умеет исправлять отдельные повторяющиеся путаницы, но не восстанавливает пропущенные элементы из контекста и не работает с более длинной структурой строки. Поэтому его результат полезен как промежуточная точка сравнения: он лучше ручной нормализации, но заметно слабее ByT5-small по WER.</w:t>
       </w:r>
     </w:p>
-    <w:bookmarkEnd w:id="66"/>
-    <w:bookmarkStart w:id="67" w:name="интерпретация-снижения-wer"/>
+    <w:bookmarkEnd w:id="145"/>
+    <w:bookmarkStart w:id="146" w:name="интерпретация-снижения-wer"/>
     <w:p>
       <w:pPr>
         <w:pStyle w:val="Heading3"/>
@@ -4005,8 +4899,8 @@
         <w:t xml:space="preserve">Поэтому в работе CER и WER интерпретируются вместе. CER показывает умеренный выигрыш на уровне символов, а WER показывает, что модель хорошо работает с частью ошибок границ слов в синтетическом наборе. Но этот результат сам по себе не доказывает, что такой же выигрыш появится на реальном OCR-выводе.</w:t>
       </w:r>
     </w:p>
-    <w:bookmarkEnd w:id="67"/>
-    <w:bookmarkStart w:id="68" w:name="Xa057a50b3d887cb833a81c68c8cf3288ce88b0e"/>
+    <w:bookmarkEnd w:id="146"/>
+    <w:bookmarkStart w:id="147" w:name="Xa057a50b3d887cb833a81c68c8cf3288ce88b0e"/>
     <w:p>
       <w:pPr>
         <w:pStyle w:val="Heading3"/>
@@ -4031,8 +4925,8 @@
         <w:t xml:space="preserve">В текущем эксперименте конфигурация с длиной 512 выглядит более устойчивой, чем более короткий вариант. Я не трактую это как универсальное правило для всех арабографичных корпусов. Скорее это практический вывод для данного корпуса и данной постановки: при работе с историческим арабографичным текстом длину последовательности нужно проверять экспериментально, а не выбирать по умолчанию.</w:t>
       </w:r>
     </w:p>
-    <w:bookmarkEnd w:id="68"/>
-    <w:bookmarkStart w:id="69" w:name="X19ea1479c8c58d48c08a8bf495d59749d022072"/>
+    <w:bookmarkEnd w:id="147"/>
+    <w:bookmarkStart w:id="148" w:name="X19ea1479c8c58d48c08a8bf495d59749d022072"/>
     <w:p>
       <w:pPr>
         <w:pStyle w:val="Heading3"/>
@@ -4065,8 +4959,8 @@
         <w:t xml:space="preserve">Одновременно наличие ухудшенных примеров принципиально для практического вывода. Даже если модель чаще помогает, она всё равно иногда добавляет новые ошибки. Для будущей системы посткоррекции нужен механизм отката или фильтрации предсказаний, особенно если модель используется на архивных источниках без быстрой ручной проверки каждой строки.</w:t>
       </w:r>
     </w:p>
-    <w:bookmarkEnd w:id="69"/>
-    <w:bookmarkStart w:id="70" w:name="среднее-улучшение-по-примерам"/>
+    <w:bookmarkEnd w:id="148"/>
+    <w:bookmarkStart w:id="149" w:name="среднее-улучшение-по-примерам"/>
     <w:p>
       <w:pPr>
         <w:pStyle w:val="Heading3"/>
@@ -4091,8 +4985,8 @@
         <w:t xml:space="preserve">Для интерпретации это означает следующее. В контролируемой синтетической постановке модель чаще исправляет структуру слов и пробелы, чем полностью восстанавливает каждый символ строки. Поэтому среднее улучшение полезно как краткое числовое резюме, но его нельзя рассматривать отдельно от распределения улучшенных и ухудшенных случаев.</w:t>
       </w:r>
     </w:p>
-    <w:bookmarkEnd w:id="70"/>
-    <w:bookmarkStart w:id="71" w:name="интерпретация-результатов"/>
+    <w:bookmarkEnd w:id="149"/>
+    <w:bookmarkStart w:id="150" w:name="интерпретация-результатов"/>
     <w:p>
       <w:pPr>
         <w:pStyle w:val="Heading3"/>
@@ -4125,8 +5019,8 @@
         <w:t xml:space="preserve">Третий вывод задаёт границу результата. Успех на синтетическом наборе нельзя переносить на реальные OCR/HTR-выходы без отдельной проверки. В текущем эксперименте модель учится на распределении ошибок генератора, а настоящий OCR зависит от шрифта, качества изображения, сегментации строки и особенностей конкретной OCR-системы. Поэтому результаты раздела 5 являются сильным пилотным сигналом, но не финальным доказательством практической применимости.</w:t>
       </w:r>
     </w:p>
-    <w:bookmarkEnd w:id="71"/>
-    <w:bookmarkStart w:id="72" w:name="ограничения-интерпретации"/>
+    <w:bookmarkEnd w:id="150"/>
+    <w:bookmarkStart w:id="151" w:name="ограничения-интерпретации"/>
     <w:p>
       <w:pPr>
         <w:pStyle w:val="Heading3"/>
@@ -4159,8 +5053,8 @@
         <w:t xml:space="preserve">Есть и ограничение метрик. CER и WER измеряют формальную близость к эталону, но не решают вопрос историко-лингвистической допустимости исправления. Например, модель может приблизить строку к эталону по расстоянию Левенштейна, но при этом сгладить форму, которую исследователь не хотел бы нормализовать. По этой причине автоматические метрики в работе дополняются разбором ухудшенных случаев.</w:t>
       </w:r>
     </w:p>
-    <w:bookmarkEnd w:id="72"/>
-    <w:bookmarkStart w:id="76" w:name="X9ae740f4b068656258209a4fa61338553b28ec2"/>
+    <w:bookmarkEnd w:id="151"/>
+    <w:bookmarkStart w:id="155" w:name="X9ae740f4b068656258209a4fa61338553b28ec2"/>
     <w:p>
       <w:pPr>
         <w:pStyle w:val="Heading3"/>
@@ -4178,18 +5072,18 @@
           <wp:inline>
             <wp:extent cx="5334000" cy="2489200"/>
             <wp:effectExtent b="0" l="0" r="0" t="0"/>
-            <wp:docPr descr="Рисунок 5.2 — Пример фрагмента реального OCR-вывода Tesseract и проверенного эталона" title="" id="74" name="Picture"/>
+            <wp:docPr descr="Рисунок 5.2 — Пример фрагмента реального OCR-вывода Tesseract и проверенного эталона" title="" id="153" name="Picture"/>
             <a:graphic>
               <a:graphicData uri="http://schemas.openxmlformats.org/drawingml/2006/picture">
                 <pic:pic>
                   <pic:nvPicPr>
-                    <pic:cNvPr descr="figures/fig04_real_ocr_example.png" id="75" name="Picture"/>
+                    <pic:cNvPr descr="figures/fig04_real_ocr_example.png" id="154" name="Picture"/>
                     <pic:cNvPicPr>
                       <a:picLocks noChangeArrowheads="1" noChangeAspect="1"/>
                     </pic:cNvPicPr>
                   </pic:nvPicPr>
                   <pic:blipFill>
-                    <a:blip r:embed="rId73"/>
+                    <a:blip r:embed="rId152"/>
                     <a:stretch>
                       <a:fillRect/>
                     </a:stretch>
@@ -4711,8 +5605,8 @@
         <w:t xml:space="preserve">Результат получился смешанным. По WER посткоррекция немного помогает: вариант с фрагментами снижает средний WER с 0.9238 до 0.8919. Но по CER и NoSpaceCER исходный Tesseract остаётся лучше. Для OCR на арабской графике это принципиально: улучшение границ слов не компенсирует ухудшение символного состава.</w:t>
       </w:r>
     </w:p>
-    <w:bookmarkEnd w:id="76"/>
-    <w:bookmarkStart w:id="80" w:name="постраничное-поведение-модели"/>
+    <w:bookmarkEnd w:id="155"/>
+    <w:bookmarkStart w:id="159" w:name="постраничное-поведение-модели"/>
     <w:p>
       <w:pPr>
         <w:pStyle w:val="Heading3"/>
@@ -4730,18 +5624,18 @@
           <wp:inline>
             <wp:extent cx="5334000" cy="2690191"/>
             <wp:effectExtent b="0" l="0" r="0" t="0"/>
-            <wp:docPr descr="Рисунок 5.3 — Средние ошибки real-OCR sanity по страницам" title="" id="78" name="Picture"/>
+            <wp:docPr descr="Рисунок 5.3 — Средние ошибки real-OCR sanity по страницам" title="" id="157" name="Picture"/>
             <a:graphic>
               <a:graphicData uri="http://schemas.openxmlformats.org/drawingml/2006/picture">
                 <pic:pic>
                   <pic:nvPicPr>
-                    <pic:cNvPr descr="figures/fig05_real_ocr_page_metrics.png" id="79" name="Picture"/>
+                    <pic:cNvPr descr="figures/fig05_real_ocr_page_metrics.png" id="158" name="Picture"/>
                     <pic:cNvPicPr>
                       <a:picLocks noChangeArrowheads="1" noChangeAspect="1"/>
                     </pic:cNvPicPr>
                   </pic:nvPicPr>
                   <pic:blipFill>
-                    <a:blip r:embed="rId77"/>
+                    <a:blip r:embed="rId156"/>
                     <a:stretch>
                       <a:fillRect/>
                     </a:stretch>
@@ -4971,8 +5865,8 @@
         <w:t xml:space="preserve">Этот результат полезнее, чем простой положительный отчёт о синтетических метриках. Он показывает место, где текущий подход ломается: модель выучила распределение синтетических ошибок, но не структуру настоящих ошибок Tesseract на конкретном печатном источнике.</w:t>
       </w:r>
     </w:p>
-    <w:bookmarkEnd w:id="80"/>
-    <w:bookmarkStart w:id="81" w:name="качественная-интерпретация-real-ocr"/>
+    <w:bookmarkEnd w:id="159"/>
+    <w:bookmarkStart w:id="160" w:name="качественная-интерпретация-real-ocr"/>
     <w:p>
       <w:pPr>
         <w:pStyle w:val="Heading3"/>
@@ -5005,8 +5899,8 @@
         <w:t xml:space="preserve">Главный вывод этой проверки состоит в том, что обучение только на синтетике недостаточно. Для настоящего OCR нужны пары, где входом является реальный OCR-вывод, а выходом — проверенный эталонный текст. Только на таких данных можно понять, какие ошибки модель действительно исправляет, а какие создаёт сама.</w:t>
       </w:r>
     </w:p>
-    <w:bookmarkEnd w:id="81"/>
-    <w:bookmarkStart w:id="82" w:name="выводы-и-результаты-по-главе-2"/>
+    <w:bookmarkEnd w:id="160"/>
+    <w:bookmarkStart w:id="161" w:name="выводы-и-результаты-по-главе-3"/>
     <w:p>
       <w:pPr>
         <w:pStyle w:val="Heading3"/>
@@ -5039,9 +5933,9 @@
         <w:t xml:space="preserve">Итог раздела такой: экспериментальный контур и обучение модели работают в контролируемой среде, но переход к реальным историческим сканам требует отдельной адаптации. Это не дополнительная косметическая проверка, а центральное условие практической применимости. Без настоящих пар «OCR-вывод — эталон» нельзя утверждать, что модель решает задачу OCR-посткоррекции для архивных источников.</w:t>
       </w:r>
     </w:p>
-    <w:bookmarkEnd w:id="82"/>
-    <w:bookmarkEnd w:id="83"/>
-    <w:bookmarkStart w:id="91" w:name="Xe8e02886c60b8939714d6e867e04f7997a20272"/>
+    <w:bookmarkEnd w:id="161"/>
+    <w:bookmarkEnd w:id="162"/>
+    <w:bookmarkStart w:id="170" w:name="Xe8e02886c60b8939714d6e867e04f7997a20272"/>
     <w:p>
       <w:pPr>
         <w:pStyle w:val="Heading2"/>
@@ -5050,7 +5944,7 @@
         <w:t xml:space="preserve">6. Ограничения и направления дальнейшей работы</w:t>
       </w:r>
     </w:p>
-    <w:bookmarkStart w:id="84" w:name="ограничения-корпуса-1"/>
+    <w:bookmarkStart w:id="163" w:name="ограничения-корпуса-1"/>
     <w:p>
       <w:pPr>
         <w:pStyle w:val="Heading3"/>
@@ -5075,8 +5969,8 @@
         <w:t xml:space="preserve">Один источник ограничивает жанровое, временное и орфографическое разнообразие. Тексты разных регионов и периодов могут отличаться письмом, лексикой, типографикой, качеством печати и состоянием скана. Отдельно важно, что старотатарские и старобашкирские источники пока остаются целью следующего этапа, а не основным набором оценки в этой версии.</w:t>
       </w:r>
     </w:p>
-    <w:bookmarkEnd w:id="84"/>
-    <w:bookmarkStart w:id="85" w:name="ограничения-синтетического-шума-1"/>
+    <w:bookmarkEnd w:id="163"/>
+    <w:bookmarkStart w:id="164" w:name="ограничения-синтетического-шума-1"/>
     <w:p>
       <w:pPr>
         <w:pStyle w:val="Heading3"/>
@@ -5101,8 +5995,8 @@
         <w:t xml:space="preserve">Практически это означает следующее: увеличение объёма синтетики само по себе не решит задачу. Следующая версия должна строиться вокруг реальных пар «OCR-вывод — эталон». Синтетические данные можно оставить как вспомогательный слой, но основной тест должен проверять настоящие ошибки распознавания.</w:t>
       </w:r>
     </w:p>
-    <w:bookmarkEnd w:id="85"/>
-    <w:bookmarkStart w:id="86" w:name="ограничения-метрик"/>
+    <w:bookmarkEnd w:id="164"/>
+    <w:bookmarkStart w:id="165" w:name="ограничения-метрик"/>
     <w:p>
       <w:pPr>
         <w:pStyle w:val="Heading3"/>
@@ -5127,8 +6021,8 @@
         <w:t xml:space="preserve">Для следующей версии набора нужна ручная проверка небольшой подвыборки. В ней следует фиксировать не только факт ошибки, но и её тип: замену графемы, пропуск, лишнюю вставку, ошибку пробела, чрезмерную нормализацию исторического написания, повтор фрагмента или грубое искажение строки. Тогда автоматические метрики можно будет связать с реальным качеством текста.</w:t>
       </w:r>
     </w:p>
-    <w:bookmarkEnd w:id="86"/>
-    <w:bookmarkStart w:id="87" w:name="ограничения-проверки-на-реальном-ocr"/>
+    <w:bookmarkEnd w:id="165"/>
+    <w:bookmarkStart w:id="166" w:name="ограничения-проверки-на-реальном-ocr"/>
     <w:p>
       <w:pPr>
         <w:pStyle w:val="Heading3"/>
@@ -5153,8 +6047,8 @@
         <w:t xml:space="preserve">Следующий шаг — перейти от постраничной оценки к более точным парам на уровне строки или короткого фрагмента. Для этого нужно выделить строки на изображении, получить OCR-вывод, сопоставить его с проверенным текстом и вручную проверить спорные случаи. Такая работа труднее, но именно она позволит обучать модель на настоящих ошибках, а не только проверять перенос с синтетики.</w:t>
       </w:r>
     </w:p>
-    <w:bookmarkEnd w:id="87"/>
-    <w:bookmarkStart w:id="88" w:name="следующий-набор-данных"/>
+    <w:bookmarkEnd w:id="166"/>
+    <w:bookmarkStart w:id="167" w:name="следующий-набор-данных"/>
     <w:p>
       <w:pPr>
         <w:pStyle w:val="Heading3"/>
@@ -5179,8 +6073,8 @@
         <w:t xml:space="preserve">Отдельно нужен журнал ошибок. В нём стоит фиксировать, какие графемы чаще всего путает OCR, где возникают проблемы пробелов, какие строки модель ухудшает и какие предсказания нужно откатывать. Такой журнал важнее ещё одного общего числа CER, потому что он показывает, как именно улучшать систему.</w:t>
       </w:r>
     </w:p>
-    <w:bookmarkEnd w:id="88"/>
-    <w:bookmarkStart w:id="89" w:name="X91867cc38c0f4e6667de3b2a642ec76d2863e9f"/>
+    <w:bookmarkEnd w:id="167"/>
+    <w:bookmarkStart w:id="168" w:name="X91867cc38c0f4e6667de3b2a642ec76d2863e9f"/>
     <w:p>
       <w:pPr>
         <w:pStyle w:val="Heading3"/>
@@ -5205,8 +6099,8 @@
         <w:t xml:space="preserve">Текущая работа полезна тем, что заранее показывает слабое место этой цепочки. До извлечения сущностей и построения графа нужно понять, насколько можно доверять тексту после OCR. Если посткоррекция ухудшает часть страниц, последующие модели будут работать на искажённой основе. Поэтому проверка на реальном OCR должна быть не финальным украшением проекта, а одним из первых этапов разработки.</w:t>
       </w:r>
     </w:p>
-    <w:bookmarkEnd w:id="89"/>
-    <w:bookmarkStart w:id="90" w:name="выводы-и-результаты-по-главе-3"/>
+    <w:bookmarkEnd w:id="168"/>
+    <w:bookmarkStart w:id="169" w:name="выводы-и-результаты-по-главе-4"/>
     <w:p>
       <w:pPr>
         <w:pStyle w:val="Heading3"/>
@@ -5223,9 +6117,9 @@
         <w:t xml:space="preserve">В главе сформулированы основные ограничения работы и направления дальнейшего развития. Главные ограничения связаны с небольшим объёмом корпуса, синтетической природой обучающих искажений, одним основным османско-турецким источником и нестабильным переносом на реальный OCR-вывод Tesseract. Из этого следует практический вывод: следующий этап должен быть связан не с усложнением модели как таковой, а со сбором выровненных пар «OCR-вывод — эталон», ручной проверкой татарских и башкирских источников и более строгой постраничной оценкой.</w:t>
       </w:r>
     </w:p>
-    <w:bookmarkEnd w:id="90"/>
-    <w:bookmarkEnd w:id="91"/>
-    <w:bookmarkStart w:id="92" w:name="заключение"/>
+    <w:bookmarkEnd w:id="169"/>
+    <w:bookmarkEnd w:id="170"/>
+    <w:bookmarkStart w:id="171" w:name="заключение"/>
     <w:p>
       <w:pPr>
         <w:pStyle w:val="Heading2"/>
@@ -5287,22 +6181,22 @@
         <w:br w:type="page"/>
       </w:r>
     </w:p>
-    <w:bookmarkEnd w:id="92"/>
-    <w:bookmarkEnd w:id="93"/>
-    <w:bookmarkStart w:id="94" w:name="список-литературы"/>
+    <w:bookmarkEnd w:id="171"/>
+    <w:bookmarkEnd w:id="172"/>
+    <w:bookmarkStart w:id="173" w:name="библиографический-список"/>
     <w:p>
       <w:pPr>
         <w:pStyle w:val="Heading1"/>
       </w:pPr>
       <w:r>
-        <w:t xml:space="preserve">Список литературы</w:t>
+        <w:t xml:space="preserve">Библиографический список</w:t>
       </w:r>
     </w:p>
     <w:p>
       <w:pPr>
         <w:numPr>
           <w:ilvl w:val="0"/>
-          <w:numId w:val="1003"/>
+          <w:numId w:val="1017"/>
         </w:numPr>
       </w:pPr>
       <w:r>
@@ -5313,7 +6207,7 @@
       <w:pPr>
         <w:numPr>
           <w:ilvl w:val="0"/>
-          <w:numId w:val="1003"/>
+          <w:numId w:val="1017"/>
         </w:numPr>
       </w:pPr>
       <w:r>
@@ -5324,7 +6218,7 @@
       <w:pPr>
         <w:numPr>
           <w:ilvl w:val="0"/>
-          <w:numId w:val="1003"/>
+          <w:numId w:val="1017"/>
         </w:numPr>
       </w:pPr>
       <w:r>
@@ -5335,7 +6229,7 @@
       <w:pPr>
         <w:numPr>
           <w:ilvl w:val="0"/>
-          <w:numId w:val="1003"/>
+          <w:numId w:val="1017"/>
         </w:numPr>
       </w:pPr>
       <w:r>
@@ -5346,7 +6240,7 @@
       <w:pPr>
         <w:numPr>
           <w:ilvl w:val="0"/>
-          <w:numId w:val="1003"/>
+          <w:numId w:val="1017"/>
         </w:numPr>
       </w:pPr>
       <w:r>
@@ -5357,7 +6251,7 @@
       <w:pPr>
         <w:numPr>
           <w:ilvl w:val="0"/>
-          <w:numId w:val="1003"/>
+          <w:numId w:val="1017"/>
         </w:numPr>
       </w:pPr>
       <w:r>
@@ -5368,7 +6262,7 @@
       <w:pPr>
         <w:numPr>
           <w:ilvl w:val="0"/>
-          <w:numId w:val="1003"/>
+          <w:numId w:val="1017"/>
         </w:numPr>
       </w:pPr>
       <w:r>
@@ -5379,7 +6273,7 @@
       <w:pPr>
         <w:numPr>
           <w:ilvl w:val="0"/>
-          <w:numId w:val="1003"/>
+          <w:numId w:val="1017"/>
         </w:numPr>
       </w:pPr>
       <w:r>
@@ -5390,7 +6284,7 @@
       <w:pPr>
         <w:numPr>
           <w:ilvl w:val="0"/>
-          <w:numId w:val="1003"/>
+          <w:numId w:val="1017"/>
         </w:numPr>
       </w:pPr>
       <w:r>
@@ -5401,7 +6295,7 @@
       <w:pPr>
         <w:numPr>
           <w:ilvl w:val="0"/>
-          <w:numId w:val="1003"/>
+          <w:numId w:val="1017"/>
         </w:numPr>
       </w:pPr>
       <w:r>
@@ -5412,7 +6306,7 @@
       <w:pPr>
         <w:numPr>
           <w:ilvl w:val="0"/>
-          <w:numId w:val="1003"/>
+          <w:numId w:val="1017"/>
         </w:numPr>
       </w:pPr>
       <w:r>
@@ -5423,7 +6317,7 @@
       <w:pPr>
         <w:numPr>
           <w:ilvl w:val="0"/>
-          <w:numId w:val="1003"/>
+          <w:numId w:val="1017"/>
         </w:numPr>
       </w:pPr>
       <w:r>
@@ -5434,7 +6328,7 @@
       <w:pPr>
         <w:numPr>
           <w:ilvl w:val="0"/>
-          <w:numId w:val="1003"/>
+          <w:numId w:val="1017"/>
         </w:numPr>
       </w:pPr>
       <w:r>
@@ -5445,7 +6339,7 @@
       <w:pPr>
         <w:numPr>
           <w:ilvl w:val="0"/>
-          <w:numId w:val="1003"/>
+          <w:numId w:val="1017"/>
         </w:numPr>
       </w:pPr>
       <w:r>
@@ -5456,7 +6350,7 @@
       <w:pPr>
         <w:numPr>
           <w:ilvl w:val="0"/>
-          <w:numId w:val="1003"/>
+          <w:numId w:val="1017"/>
         </w:numPr>
       </w:pPr>
       <w:r>
@@ -5467,7 +6361,7 @@
       <w:pPr>
         <w:numPr>
           <w:ilvl w:val="0"/>
-          <w:numId w:val="1003"/>
+          <w:numId w:val="1017"/>
         </w:numPr>
       </w:pPr>
       <w:r>
@@ -5478,7 +6372,7 @@
       <w:pPr>
         <w:numPr>
           <w:ilvl w:val="0"/>
-          <w:numId w:val="1003"/>
+          <w:numId w:val="1017"/>
         </w:numPr>
       </w:pPr>
       <w:r>
@@ -5489,7 +6383,7 @@
       <w:pPr>
         <w:numPr>
           <w:ilvl w:val="0"/>
-          <w:numId w:val="1003"/>
+          <w:numId w:val="1017"/>
         </w:numPr>
       </w:pPr>
       <w:r>
@@ -5500,7 +6394,7 @@
       <w:pPr>
         <w:numPr>
           <w:ilvl w:val="0"/>
-          <w:numId w:val="1003"/>
+          <w:numId w:val="1017"/>
         </w:numPr>
       </w:pPr>
       <w:r>
@@ -5511,18 +6405,20 @@
       <w:pPr>
         <w:numPr>
           <w:ilvl w:val="0"/>
-          <w:numId w:val="1003"/>
+          <w:numId w:val="1017"/>
         </w:numPr>
       </w:pPr>
       <w:r>
         <w:t xml:space="preserve">Li M., Lv T., Chen J., Cui L., Lu Y., Florencio D., Zhang C., Li Z., Wei F. TrOCR: Transformer-based Optical Character Recognition with Pre-trained Models. 2021. arXiv:2109.10282. URL: https://arxiv.org/abs/2109.10282</w:t>
       </w:r>
     </w:p>
-    <w:bookmarkEnd w:id="94"/>
+    <w:bookmarkEnd w:id="173"/>
     <w:sectPr>
+      <w:footerReference w:type="default" r:id="rId1"/>
       <w:footnotePr>
         <w:numRestart w:val="eachSect"/>
       </w:footnotePr>
+      <w:titlePg/>
     </w:sectPr>
   </w:body>
 </w:document>
@@ -5530,6 +6426,24 @@
 
 <file path=word/comments.xml><?xml version="1.0" encoding="utf-8"?>
 <w:comments xmlns:w="http://schemas.openxmlformats.org/wordprocessingml/2006/main" xmlns:m="http://schemas.openxmlformats.org/officeDocument/2006/math" xmlns:r="http://schemas.openxmlformats.org/officeDocument/2006/relationships" xmlns:o="urn:schemas-microsoft-com:office:office" xmlns:v="urn:schemas-microsoft-com:vml" xmlns:w10="urn:schemas-microsoft-com:office:word" xmlns:a="http://schemas.openxmlformats.org/drawingml/2006/main" xmlns:pic="http://schemas.openxmlformats.org/drawingml/2006/picture" xmlns:wp="http://schemas.openxmlformats.org/drawingml/2006/wordprocessingDrawing"/>
+</file>
+
+<file path=word/footer1.xml><?xml version="1.0" encoding="utf-8"?>
+<w:ftr xmlns:m="http://schemas.openxmlformats.org/officeDocument/2006/math" xmlns:mc="http://schemas.openxmlformats.org/markup-compatibility/2006" xmlns:mo="http://schemas.microsoft.com/office/mac/office/2008/main" xmlns:mv="urn:schemas-microsoft-com:mac:vml" xmlns:o="urn:schemas-microsoft-com:office:office" xmlns:r="http://schemas.openxmlformats.org/officeDocument/2006/relationships" xmlns:v="urn:schemas-microsoft-com:vml" xmlns:w10="urn:schemas-microsoft-com:office:word" xmlns:w14="http://schemas.microsoft.com/office/word/2010/wordml" xmlns:w="http://schemas.openxmlformats.org/wordprocessingml/2006/main" xmlns:wne="http://schemas.microsoft.com/office/word/2006/wordml" xmlns:wp14="http://schemas.microsoft.com/office/word/2010/wordprocessingDrawing" xmlns:wp="http://schemas.openxmlformats.org/drawingml/2006/wordprocessingDrawing" xmlns:wpc="http://schemas.microsoft.com/office/word/2010/wordprocessingCanvas" xmlns:wpg="http://schemas.microsoft.com/office/word/2010/wordprocessingGroup" xmlns:wpi="http://schemas.microsoft.com/office/word/2010/wordprocessingInk" xmlns:wps="http://schemas.microsoft.com/office/word/2010/wordprocessingShape" mc:Ignorable="w14 wp14">
+  <w:p>
+    <w:pPr>
+      <w:pStyle w:val="Footer"/>
+      <w:jc w:val="center"/>
+    </w:pPr>
+    <w:r>
+      <w:fldChar w:fldCharType="begin"/>
+      <w:instrText xml:space="preserve">PAGE</w:instrText>
+      <w:fldChar w:fldCharType="separate"/>
+      <w:t>1</w:t>
+      <w:fldChar w:fldCharType="end"/>
+    </w:r>
+  </w:p>
+</w:ftr>
 </file>
 
 <file path=word/footnotes.xml><?xml version="1.0" encoding="utf-8"?>
@@ -5629,6 +6543,109 @@
       </w:pPr>
     </w:lvl>
   </w:abstractNum>
+  <w:abstractNum w:abstractNumId="991">
+    <w:nsid w:val="0000A991"/>
+    <w:multiLevelType w:val="multilevel"/>
+    <w:lvl w:ilvl="0">
+      <w:numFmt w:val="bullet"/>
+      <w:lvlText w:val=""/>
+      <w:lvlJc w:val="left"/>
+      <w:pPr>
+        <w:ind w:left="720" w:hanging="360"/>
+      </w:pPr>
+      <w:rPr>
+        <w:rFonts w:ascii="Symbol" w:hAnsi="Symbol" w:cs="Symbol" w:hint="default"/>
+      </w:rPr>
+    </w:lvl>
+    <w:lvl w:ilvl="1">
+      <w:numFmt w:val="bullet"/>
+      <w:lvlText w:val="o"/>
+      <w:lvlJc w:val="left"/>
+      <w:pPr>
+        <w:ind w:left="1440" w:hanging="360"/>
+      </w:pPr>
+      <w:rPr>
+        <w:rFonts w:ascii="Courier New" w:hAnsi="Courier New" w:cs="Courier New" w:hint="default"/>
+      </w:rPr>
+    </w:lvl>
+    <w:lvl w:ilvl="2">
+      <w:numFmt w:val="bullet"/>
+      <w:lvlText w:val=""/>
+      <w:lvlJc w:val="left"/>
+      <w:pPr>
+        <w:ind w:left="2160" w:hanging="360"/>
+      </w:pPr>
+      <w:rPr>
+        <w:rFonts w:ascii="Wingdings" w:hAnsi="Wingdings" w:cs="Wingdings" w:hint="default"/>
+      </w:rPr>
+    </w:lvl>
+    <w:lvl w:ilvl="3">
+      <w:numFmt w:val="bullet"/>
+      <w:lvlText w:val=""/>
+      <w:lvlJc w:val="left"/>
+      <w:pPr>
+        <w:ind w:left="2880" w:hanging="360"/>
+      </w:pPr>
+      <w:rPr>
+        <w:rFonts w:ascii="Symbol" w:hAnsi="Symbol" w:cs="Symbol" w:hint="default"/>
+      </w:rPr>
+    </w:lvl>
+    <w:lvl w:ilvl="4">
+      <w:numFmt w:val="bullet"/>
+      <w:lvlText w:val="o"/>
+      <w:lvlJc w:val="left"/>
+      <w:pPr>
+        <w:ind w:left="3600" w:hanging="360"/>
+      </w:pPr>
+      <w:rPr>
+        <w:rFonts w:ascii="Courier New" w:hAnsi="Courier New" w:cs="Courier New" w:hint="default"/>
+      </w:rPr>
+    </w:lvl>
+    <w:lvl w:ilvl="5">
+      <w:numFmt w:val="bullet"/>
+      <w:lvlText w:val=""/>
+      <w:lvlJc w:val="left"/>
+      <w:pPr>
+        <w:ind w:left="4320" w:hanging="360"/>
+      </w:pPr>
+      <w:rPr>
+        <w:rFonts w:ascii="Wingdings" w:hAnsi="Wingdings" w:cs="Wingdings" w:hint="default"/>
+      </w:rPr>
+    </w:lvl>
+    <w:lvl w:ilvl="6">
+      <w:numFmt w:val="bullet"/>
+      <w:lvlText w:val=""/>
+      <w:lvlJc w:val="left"/>
+      <w:pPr>
+        <w:ind w:left="5040" w:hanging="360"/>
+      </w:pPr>
+      <w:rPr>
+        <w:rFonts w:ascii="Symbol" w:hAnsi="Symbol" w:cs="Symbol" w:hint="default"/>
+      </w:rPr>
+    </w:lvl>
+    <w:lvl w:ilvl="7">
+      <w:numFmt w:val="bullet"/>
+      <w:lvlText w:val="o"/>
+      <w:lvlJc w:val="left"/>
+      <w:pPr>
+        <w:ind w:left="5760" w:hanging="360"/>
+      </w:pPr>
+      <w:rPr>
+        <w:rFonts w:ascii="Courier New" w:hAnsi="Courier New" w:cs="Courier New" w:hint="default"/>
+      </w:rPr>
+    </w:lvl>
+    <w:lvl w:ilvl="8">
+      <w:numFmt w:val="bullet"/>
+      <w:lvlText w:val=""/>
+      <w:lvlJc w:val="left"/>
+      <w:pPr>
+        <w:ind w:left="6480" w:hanging="360"/>
+      </w:pPr>
+      <w:rPr>
+        <w:rFonts w:ascii="Wingdings" w:hAnsi="Wingdings" w:cs="Wingdings" w:hint="default"/>
+      </w:rPr>
+    </w:lvl>
+  </w:abstractNum>
   <w:abstractNum w:abstractNumId="99411">
     <w:nsid w:val="00A99411"/>
     <w:multiLevelType w:val="multilevel"/>
@@ -5714,38 +6731,521 @@
       </w:pPr>
     </w:lvl>
   </w:abstractNum>
+  <w:abstractNum w:abstractNumId="99412">
+    <w:nsid w:val="00A99412"/>
+    <w:multiLevelType w:val="multilevel"/>
+    <w:lvl w:ilvl="0">
+      <w:start w:val="2"/>
+      <w:numFmt w:val="decimal"/>
+      <w:lvlText w:val="%1."/>
+      <w:lvlJc w:val="left"/>
+      <w:pPr>
+        <w:ind w:left="720" w:hanging="360"/>
+      </w:pPr>
+    </w:lvl>
+    <w:lvl w:ilvl="1">
+      <w:start w:val="2"/>
+      <w:numFmt w:val="decimal"/>
+      <w:lvlText w:val="%2."/>
+      <w:lvlJc w:val="left"/>
+      <w:pPr>
+        <w:ind w:left="1440" w:hanging="360"/>
+      </w:pPr>
+    </w:lvl>
+    <w:lvl w:ilvl="2">
+      <w:start w:val="2"/>
+      <w:numFmt w:val="decimal"/>
+      <w:lvlText w:val="%3."/>
+      <w:lvlJc w:val="left"/>
+      <w:pPr>
+        <w:ind w:left="2160" w:hanging="360"/>
+      </w:pPr>
+    </w:lvl>
+    <w:lvl w:ilvl="3">
+      <w:start w:val="2"/>
+      <w:numFmt w:val="decimal"/>
+      <w:lvlText w:val="%4."/>
+      <w:lvlJc w:val="left"/>
+      <w:pPr>
+        <w:ind w:left="2880" w:hanging="360"/>
+      </w:pPr>
+    </w:lvl>
+    <w:lvl w:ilvl="4">
+      <w:start w:val="2"/>
+      <w:numFmt w:val="decimal"/>
+      <w:lvlText w:val="%5."/>
+      <w:lvlJc w:val="left"/>
+      <w:pPr>
+        <w:ind w:left="3600" w:hanging="360"/>
+      </w:pPr>
+    </w:lvl>
+    <w:lvl w:ilvl="5">
+      <w:start w:val="2"/>
+      <w:numFmt w:val="decimal"/>
+      <w:lvlText w:val="%6."/>
+      <w:lvlJc w:val="left"/>
+      <w:pPr>
+        <w:ind w:left="4320" w:hanging="360"/>
+      </w:pPr>
+    </w:lvl>
+    <w:lvl w:ilvl="6">
+      <w:start w:val="2"/>
+      <w:numFmt w:val="decimal"/>
+      <w:lvlText w:val="%7."/>
+      <w:lvlJc w:val="left"/>
+      <w:pPr>
+        <w:ind w:left="5040" w:hanging="360"/>
+      </w:pPr>
+    </w:lvl>
+    <w:lvl w:ilvl="7">
+      <w:start w:val="2"/>
+      <w:numFmt w:val="decimal"/>
+      <w:lvlText w:val="%8."/>
+      <w:lvlJc w:val="left"/>
+      <w:pPr>
+        <w:ind w:left="5760" w:hanging="360"/>
+      </w:pPr>
+    </w:lvl>
+    <w:lvl w:ilvl="8">
+      <w:start w:val="2"/>
+      <w:numFmt w:val="decimal"/>
+      <w:lvlText w:val="%9."/>
+      <w:lvlJc w:val="left"/>
+      <w:pPr>
+        <w:ind w:left="6480" w:hanging="360"/>
+      </w:pPr>
+    </w:lvl>
+  </w:abstractNum>
+  <w:abstractNum w:abstractNumId="99413">
+    <w:nsid w:val="00A99413"/>
+    <w:multiLevelType w:val="multilevel"/>
+    <w:lvl w:ilvl="0">
+      <w:start w:val="3"/>
+      <w:numFmt w:val="decimal"/>
+      <w:lvlText w:val="%1."/>
+      <w:lvlJc w:val="left"/>
+      <w:pPr>
+        <w:ind w:left="720" w:hanging="360"/>
+      </w:pPr>
+    </w:lvl>
+    <w:lvl w:ilvl="1">
+      <w:start w:val="3"/>
+      <w:numFmt w:val="decimal"/>
+      <w:lvlText w:val="%2."/>
+      <w:lvlJc w:val="left"/>
+      <w:pPr>
+        <w:ind w:left="1440" w:hanging="360"/>
+      </w:pPr>
+    </w:lvl>
+    <w:lvl w:ilvl="2">
+      <w:start w:val="3"/>
+      <w:numFmt w:val="decimal"/>
+      <w:lvlText w:val="%3."/>
+      <w:lvlJc w:val="left"/>
+      <w:pPr>
+        <w:ind w:left="2160" w:hanging="360"/>
+      </w:pPr>
+    </w:lvl>
+    <w:lvl w:ilvl="3">
+      <w:start w:val="3"/>
+      <w:numFmt w:val="decimal"/>
+      <w:lvlText w:val="%4."/>
+      <w:lvlJc w:val="left"/>
+      <w:pPr>
+        <w:ind w:left="2880" w:hanging="360"/>
+      </w:pPr>
+    </w:lvl>
+    <w:lvl w:ilvl="4">
+      <w:start w:val="3"/>
+      <w:numFmt w:val="decimal"/>
+      <w:lvlText w:val="%5."/>
+      <w:lvlJc w:val="left"/>
+      <w:pPr>
+        <w:ind w:left="3600" w:hanging="360"/>
+      </w:pPr>
+    </w:lvl>
+    <w:lvl w:ilvl="5">
+      <w:start w:val="3"/>
+      <w:numFmt w:val="decimal"/>
+      <w:lvlText w:val="%6."/>
+      <w:lvlJc w:val="left"/>
+      <w:pPr>
+        <w:ind w:left="4320" w:hanging="360"/>
+      </w:pPr>
+    </w:lvl>
+    <w:lvl w:ilvl="6">
+      <w:start w:val="3"/>
+      <w:numFmt w:val="decimal"/>
+      <w:lvlText w:val="%7."/>
+      <w:lvlJc w:val="left"/>
+      <w:pPr>
+        <w:ind w:left="5040" w:hanging="360"/>
+      </w:pPr>
+    </w:lvl>
+    <w:lvl w:ilvl="7">
+      <w:start w:val="3"/>
+      <w:numFmt w:val="decimal"/>
+      <w:lvlText w:val="%8."/>
+      <w:lvlJc w:val="left"/>
+      <w:pPr>
+        <w:ind w:left="5760" w:hanging="360"/>
+      </w:pPr>
+    </w:lvl>
+    <w:lvl w:ilvl="8">
+      <w:start w:val="3"/>
+      <w:numFmt w:val="decimal"/>
+      <w:lvlText w:val="%9."/>
+      <w:lvlJc w:val="left"/>
+      <w:pPr>
+        <w:ind w:left="6480" w:hanging="360"/>
+      </w:pPr>
+    </w:lvl>
+  </w:abstractNum>
+  <w:abstractNum w:abstractNumId="99414">
+    <w:nsid w:val="00A99414"/>
+    <w:multiLevelType w:val="multilevel"/>
+    <w:lvl w:ilvl="0">
+      <w:start w:val="4"/>
+      <w:numFmt w:val="decimal"/>
+      <w:lvlText w:val="%1."/>
+      <w:lvlJc w:val="left"/>
+      <w:pPr>
+        <w:ind w:left="720" w:hanging="360"/>
+      </w:pPr>
+    </w:lvl>
+    <w:lvl w:ilvl="1">
+      <w:start w:val="4"/>
+      <w:numFmt w:val="decimal"/>
+      <w:lvlText w:val="%2."/>
+      <w:lvlJc w:val="left"/>
+      <w:pPr>
+        <w:ind w:left="1440" w:hanging="360"/>
+      </w:pPr>
+    </w:lvl>
+    <w:lvl w:ilvl="2">
+      <w:start w:val="4"/>
+      <w:numFmt w:val="decimal"/>
+      <w:lvlText w:val="%3."/>
+      <w:lvlJc w:val="left"/>
+      <w:pPr>
+        <w:ind w:left="2160" w:hanging="360"/>
+      </w:pPr>
+    </w:lvl>
+    <w:lvl w:ilvl="3">
+      <w:start w:val="4"/>
+      <w:numFmt w:val="decimal"/>
+      <w:lvlText w:val="%4."/>
+      <w:lvlJc w:val="left"/>
+      <w:pPr>
+        <w:ind w:left="2880" w:hanging="360"/>
+      </w:pPr>
+    </w:lvl>
+    <w:lvl w:ilvl="4">
+      <w:start w:val="4"/>
+      <w:numFmt w:val="decimal"/>
+      <w:lvlText w:val="%5."/>
+      <w:lvlJc w:val="left"/>
+      <w:pPr>
+        <w:ind w:left="3600" w:hanging="360"/>
+      </w:pPr>
+    </w:lvl>
+    <w:lvl w:ilvl="5">
+      <w:start w:val="4"/>
+      <w:numFmt w:val="decimal"/>
+      <w:lvlText w:val="%6."/>
+      <w:lvlJc w:val="left"/>
+      <w:pPr>
+        <w:ind w:left="4320" w:hanging="360"/>
+      </w:pPr>
+    </w:lvl>
+    <w:lvl w:ilvl="6">
+      <w:start w:val="4"/>
+      <w:numFmt w:val="decimal"/>
+      <w:lvlText w:val="%7."/>
+      <w:lvlJc w:val="left"/>
+      <w:pPr>
+        <w:ind w:left="5040" w:hanging="360"/>
+      </w:pPr>
+    </w:lvl>
+    <w:lvl w:ilvl="7">
+      <w:start w:val="4"/>
+      <w:numFmt w:val="decimal"/>
+      <w:lvlText w:val="%8."/>
+      <w:lvlJc w:val="left"/>
+      <w:pPr>
+        <w:ind w:left="5760" w:hanging="360"/>
+      </w:pPr>
+    </w:lvl>
+    <w:lvl w:ilvl="8">
+      <w:start w:val="4"/>
+      <w:numFmt w:val="decimal"/>
+      <w:lvlText w:val="%9."/>
+      <w:lvlJc w:val="left"/>
+      <w:pPr>
+        <w:ind w:left="6480" w:hanging="360"/>
+      </w:pPr>
+    </w:lvl>
+  </w:abstractNum>
+  <w:abstractNum w:abstractNumId="99415">
+    <w:nsid w:val="00A99415"/>
+    <w:multiLevelType w:val="multilevel"/>
+    <w:lvl w:ilvl="0">
+      <w:start w:val="5"/>
+      <w:numFmt w:val="decimal"/>
+      <w:lvlText w:val="%1."/>
+      <w:lvlJc w:val="left"/>
+      <w:pPr>
+        <w:ind w:left="720" w:hanging="360"/>
+      </w:pPr>
+    </w:lvl>
+    <w:lvl w:ilvl="1">
+      <w:start w:val="5"/>
+      <w:numFmt w:val="decimal"/>
+      <w:lvlText w:val="%2."/>
+      <w:lvlJc w:val="left"/>
+      <w:pPr>
+        <w:ind w:left="1440" w:hanging="360"/>
+      </w:pPr>
+    </w:lvl>
+    <w:lvl w:ilvl="2">
+      <w:start w:val="5"/>
+      <w:numFmt w:val="decimal"/>
+      <w:lvlText w:val="%3."/>
+      <w:lvlJc w:val="left"/>
+      <w:pPr>
+        <w:ind w:left="2160" w:hanging="360"/>
+      </w:pPr>
+    </w:lvl>
+    <w:lvl w:ilvl="3">
+      <w:start w:val="5"/>
+      <w:numFmt w:val="decimal"/>
+      <w:lvlText w:val="%4."/>
+      <w:lvlJc w:val="left"/>
+      <w:pPr>
+        <w:ind w:left="2880" w:hanging="360"/>
+      </w:pPr>
+    </w:lvl>
+    <w:lvl w:ilvl="4">
+      <w:start w:val="5"/>
+      <w:numFmt w:val="decimal"/>
+      <w:lvlText w:val="%5."/>
+      <w:lvlJc w:val="left"/>
+      <w:pPr>
+        <w:ind w:left="3600" w:hanging="360"/>
+      </w:pPr>
+    </w:lvl>
+    <w:lvl w:ilvl="5">
+      <w:start w:val="5"/>
+      <w:numFmt w:val="decimal"/>
+      <w:lvlText w:val="%6."/>
+      <w:lvlJc w:val="left"/>
+      <w:pPr>
+        <w:ind w:left="4320" w:hanging="360"/>
+      </w:pPr>
+    </w:lvl>
+    <w:lvl w:ilvl="6">
+      <w:start w:val="5"/>
+      <w:numFmt w:val="decimal"/>
+      <w:lvlText w:val="%7."/>
+      <w:lvlJc w:val="left"/>
+      <w:pPr>
+        <w:ind w:left="5040" w:hanging="360"/>
+      </w:pPr>
+    </w:lvl>
+    <w:lvl w:ilvl="7">
+      <w:start w:val="5"/>
+      <w:numFmt w:val="decimal"/>
+      <w:lvlText w:val="%8."/>
+      <w:lvlJc w:val="left"/>
+      <w:pPr>
+        <w:ind w:left="5760" w:hanging="360"/>
+      </w:pPr>
+    </w:lvl>
+    <w:lvl w:ilvl="8">
+      <w:start w:val="5"/>
+      <w:numFmt w:val="decimal"/>
+      <w:lvlText w:val="%9."/>
+      <w:lvlJc w:val="left"/>
+      <w:pPr>
+        <w:ind w:left="6480" w:hanging="360"/>
+      </w:pPr>
+    </w:lvl>
+  </w:abstractNum>
+  <w:abstractNum w:abstractNumId="99416">
+    <w:nsid w:val="00A99416"/>
+    <w:multiLevelType w:val="multilevel"/>
+    <w:lvl w:ilvl="0">
+      <w:start w:val="6"/>
+      <w:numFmt w:val="decimal"/>
+      <w:lvlText w:val="%1."/>
+      <w:lvlJc w:val="left"/>
+      <w:pPr>
+        <w:ind w:left="720" w:hanging="360"/>
+      </w:pPr>
+    </w:lvl>
+    <w:lvl w:ilvl="1">
+      <w:start w:val="6"/>
+      <w:numFmt w:val="decimal"/>
+      <w:lvlText w:val="%2."/>
+      <w:lvlJc w:val="left"/>
+      <w:pPr>
+        <w:ind w:left="1440" w:hanging="360"/>
+      </w:pPr>
+    </w:lvl>
+    <w:lvl w:ilvl="2">
+      <w:start w:val="6"/>
+      <w:numFmt w:val="decimal"/>
+      <w:lvlText w:val="%3."/>
+      <w:lvlJc w:val="left"/>
+      <w:pPr>
+        <w:ind w:left="2160" w:hanging="360"/>
+      </w:pPr>
+    </w:lvl>
+    <w:lvl w:ilvl="3">
+      <w:start w:val="6"/>
+      <w:numFmt w:val="decimal"/>
+      <w:lvlText w:val="%4."/>
+      <w:lvlJc w:val="left"/>
+      <w:pPr>
+        <w:ind w:left="2880" w:hanging="360"/>
+      </w:pPr>
+    </w:lvl>
+    <w:lvl w:ilvl="4">
+      <w:start w:val="6"/>
+      <w:numFmt w:val="decimal"/>
+      <w:lvlText w:val="%5."/>
+      <w:lvlJc w:val="left"/>
+      <w:pPr>
+        <w:ind w:left="3600" w:hanging="360"/>
+      </w:pPr>
+    </w:lvl>
+    <w:lvl w:ilvl="5">
+      <w:start w:val="6"/>
+      <w:numFmt w:val="decimal"/>
+      <w:lvlText w:val="%6."/>
+      <w:lvlJc w:val="left"/>
+      <w:pPr>
+        <w:ind w:left="4320" w:hanging="360"/>
+      </w:pPr>
+    </w:lvl>
+    <w:lvl w:ilvl="6">
+      <w:start w:val="6"/>
+      <w:numFmt w:val="decimal"/>
+      <w:lvlText w:val="%7."/>
+      <w:lvlJc w:val="left"/>
+      <w:pPr>
+        <w:ind w:left="5040" w:hanging="360"/>
+      </w:pPr>
+    </w:lvl>
+    <w:lvl w:ilvl="7">
+      <w:start w:val="6"/>
+      <w:numFmt w:val="decimal"/>
+      <w:lvlText w:val="%8."/>
+      <w:lvlJc w:val="left"/>
+      <w:pPr>
+        <w:ind w:left="5760" w:hanging="360"/>
+      </w:pPr>
+    </w:lvl>
+    <w:lvl w:ilvl="8">
+      <w:start w:val="6"/>
+      <w:numFmt w:val="decimal"/>
+      <w:lvlText w:val="%9."/>
+      <w:lvlJc w:val="left"/>
+      <w:pPr>
+        <w:ind w:left="6480" w:hanging="360"/>
+      </w:pPr>
+    </w:lvl>
+  </w:abstractNum>
+  <w:abstractNum w:abstractNumId="99417">
+    <w:nsid w:val="00A99417"/>
+    <w:multiLevelType w:val="multilevel"/>
+    <w:lvl w:ilvl="0">
+      <w:start w:val="7"/>
+      <w:numFmt w:val="decimal"/>
+      <w:lvlText w:val="%1."/>
+      <w:lvlJc w:val="left"/>
+      <w:pPr>
+        <w:ind w:left="720" w:hanging="360"/>
+      </w:pPr>
+    </w:lvl>
+    <w:lvl w:ilvl="1">
+      <w:start w:val="7"/>
+      <w:numFmt w:val="decimal"/>
+      <w:lvlText w:val="%2."/>
+      <w:lvlJc w:val="left"/>
+      <w:pPr>
+        <w:ind w:left="1440" w:hanging="360"/>
+      </w:pPr>
+    </w:lvl>
+    <w:lvl w:ilvl="2">
+      <w:start w:val="7"/>
+      <w:numFmt w:val="decimal"/>
+      <w:lvlText w:val="%3."/>
+      <w:lvlJc w:val="left"/>
+      <w:pPr>
+        <w:ind w:left="2160" w:hanging="360"/>
+      </w:pPr>
+    </w:lvl>
+    <w:lvl w:ilvl="3">
+      <w:start w:val="7"/>
+      <w:numFmt w:val="decimal"/>
+      <w:lvlText w:val="%4."/>
+      <w:lvlJc w:val="left"/>
+      <w:pPr>
+        <w:ind w:left="2880" w:hanging="360"/>
+      </w:pPr>
+    </w:lvl>
+    <w:lvl w:ilvl="4">
+      <w:start w:val="7"/>
+      <w:numFmt w:val="decimal"/>
+      <w:lvlText w:val="%5."/>
+      <w:lvlJc w:val="left"/>
+      <w:pPr>
+        <w:ind w:left="3600" w:hanging="360"/>
+      </w:pPr>
+    </w:lvl>
+    <w:lvl w:ilvl="5">
+      <w:start w:val="7"/>
+      <w:numFmt w:val="decimal"/>
+      <w:lvlText w:val="%6."/>
+      <w:lvlJc w:val="left"/>
+      <w:pPr>
+        <w:ind w:left="4320" w:hanging="360"/>
+      </w:pPr>
+    </w:lvl>
+    <w:lvl w:ilvl="6">
+      <w:start w:val="7"/>
+      <w:numFmt w:val="decimal"/>
+      <w:lvlText w:val="%7."/>
+      <w:lvlJc w:val="left"/>
+      <w:pPr>
+        <w:ind w:left="5040" w:hanging="360"/>
+      </w:pPr>
+    </w:lvl>
+    <w:lvl w:ilvl="7">
+      <w:start w:val="7"/>
+      <w:numFmt w:val="decimal"/>
+      <w:lvlText w:val="%8."/>
+      <w:lvlJc w:val="left"/>
+      <w:pPr>
+        <w:ind w:left="5760" w:hanging="360"/>
+      </w:pPr>
+    </w:lvl>
+    <w:lvl w:ilvl="8">
+      <w:start w:val="7"/>
+      <w:numFmt w:val="decimal"/>
+      <w:lvlText w:val="%9."/>
+      <w:lvlJc w:val="left"/>
+      <w:pPr>
+        <w:ind w:left="6480" w:hanging="360"/>
+      </w:pPr>
+    </w:lvl>
+  </w:abstractNum>
   <w:num w:numId="1000">
     <w:abstractNumId w:val="990"/>
   </w:num>
   <w:num w:numId="1001">
-    <w:abstractNumId w:val="99411"/>
-    <w:lvlOverride w:ilvl="0">
-      <w:startOverride w:val="1"/>
-    </w:lvlOverride>
-    <w:lvlOverride w:ilvl="1">
-      <w:startOverride w:val="1"/>
-    </w:lvlOverride>
-    <w:lvlOverride w:ilvl="2">
-      <w:startOverride w:val="1"/>
-    </w:lvlOverride>
-    <w:lvlOverride w:ilvl="3">
-      <w:startOverride w:val="1"/>
-    </w:lvlOverride>
-    <w:lvlOverride w:ilvl="4">
-      <w:startOverride w:val="1"/>
-    </w:lvlOverride>
-    <w:lvlOverride w:ilvl="5">
-      <w:startOverride w:val="1"/>
-    </w:lvlOverride>
-    <w:lvlOverride w:ilvl="6">
-      <w:startOverride w:val="1"/>
-    </w:lvlOverride>
-    <w:lvlOverride w:ilvl="7">
-      <w:startOverride w:val="1"/>
-    </w:lvlOverride>
-    <w:lvlOverride w:ilvl="8">
-      <w:startOverride w:val="1"/>
-    </w:lvlOverride>
+    <w:abstractNumId w:val="991"/>
   </w:num>
   <w:num w:numId="1002">
     <w:abstractNumId w:val="99411"/>
@@ -5778,6 +7278,264 @@
     </w:lvlOverride>
   </w:num>
   <w:num w:numId="1003">
+    <w:abstractNumId w:val="991"/>
+  </w:num>
+  <w:num w:numId="1004">
+    <w:abstractNumId w:val="99412"/>
+    <w:lvlOverride w:ilvl="0">
+      <w:startOverride w:val="2"/>
+    </w:lvlOverride>
+    <w:lvlOverride w:ilvl="1">
+      <w:startOverride w:val="2"/>
+    </w:lvlOverride>
+    <w:lvlOverride w:ilvl="2">
+      <w:startOverride w:val="2"/>
+    </w:lvlOverride>
+    <w:lvlOverride w:ilvl="3">
+      <w:startOverride w:val="2"/>
+    </w:lvlOverride>
+    <w:lvlOverride w:ilvl="4">
+      <w:startOverride w:val="2"/>
+    </w:lvlOverride>
+    <w:lvlOverride w:ilvl="5">
+      <w:startOverride w:val="2"/>
+    </w:lvlOverride>
+    <w:lvlOverride w:ilvl="6">
+      <w:startOverride w:val="2"/>
+    </w:lvlOverride>
+    <w:lvlOverride w:ilvl="7">
+      <w:startOverride w:val="2"/>
+    </w:lvlOverride>
+    <w:lvlOverride w:ilvl="8">
+      <w:startOverride w:val="2"/>
+    </w:lvlOverride>
+  </w:num>
+  <w:num w:numId="1005">
+    <w:abstractNumId w:val="991"/>
+  </w:num>
+  <w:num w:numId="1006">
+    <w:abstractNumId w:val="99413"/>
+    <w:lvlOverride w:ilvl="0">
+      <w:startOverride w:val="3"/>
+    </w:lvlOverride>
+    <w:lvlOverride w:ilvl="1">
+      <w:startOverride w:val="3"/>
+    </w:lvlOverride>
+    <w:lvlOverride w:ilvl="2">
+      <w:startOverride w:val="3"/>
+    </w:lvlOverride>
+    <w:lvlOverride w:ilvl="3">
+      <w:startOverride w:val="3"/>
+    </w:lvlOverride>
+    <w:lvlOverride w:ilvl="4">
+      <w:startOverride w:val="3"/>
+    </w:lvlOverride>
+    <w:lvlOverride w:ilvl="5">
+      <w:startOverride w:val="3"/>
+    </w:lvlOverride>
+    <w:lvlOverride w:ilvl="6">
+      <w:startOverride w:val="3"/>
+    </w:lvlOverride>
+    <w:lvlOverride w:ilvl="7">
+      <w:startOverride w:val="3"/>
+    </w:lvlOverride>
+    <w:lvlOverride w:ilvl="8">
+      <w:startOverride w:val="3"/>
+    </w:lvlOverride>
+  </w:num>
+  <w:num w:numId="1007">
+    <w:abstractNumId w:val="991"/>
+  </w:num>
+  <w:num w:numId="1008">
+    <w:abstractNumId w:val="99414"/>
+    <w:lvlOverride w:ilvl="0">
+      <w:startOverride w:val="4"/>
+    </w:lvlOverride>
+    <w:lvlOverride w:ilvl="1">
+      <w:startOverride w:val="4"/>
+    </w:lvlOverride>
+    <w:lvlOverride w:ilvl="2">
+      <w:startOverride w:val="4"/>
+    </w:lvlOverride>
+    <w:lvlOverride w:ilvl="3">
+      <w:startOverride w:val="4"/>
+    </w:lvlOverride>
+    <w:lvlOverride w:ilvl="4">
+      <w:startOverride w:val="4"/>
+    </w:lvlOverride>
+    <w:lvlOverride w:ilvl="5">
+      <w:startOverride w:val="4"/>
+    </w:lvlOverride>
+    <w:lvlOverride w:ilvl="6">
+      <w:startOverride w:val="4"/>
+    </w:lvlOverride>
+    <w:lvlOverride w:ilvl="7">
+      <w:startOverride w:val="4"/>
+    </w:lvlOverride>
+    <w:lvlOverride w:ilvl="8">
+      <w:startOverride w:val="4"/>
+    </w:lvlOverride>
+  </w:num>
+  <w:num w:numId="1009">
+    <w:abstractNumId w:val="991"/>
+  </w:num>
+  <w:num w:numId="1010">
+    <w:abstractNumId w:val="99415"/>
+    <w:lvlOverride w:ilvl="0">
+      <w:startOverride w:val="5"/>
+    </w:lvlOverride>
+    <w:lvlOverride w:ilvl="1">
+      <w:startOverride w:val="5"/>
+    </w:lvlOverride>
+    <w:lvlOverride w:ilvl="2">
+      <w:startOverride w:val="5"/>
+    </w:lvlOverride>
+    <w:lvlOverride w:ilvl="3">
+      <w:startOverride w:val="5"/>
+    </w:lvlOverride>
+    <w:lvlOverride w:ilvl="4">
+      <w:startOverride w:val="5"/>
+    </w:lvlOverride>
+    <w:lvlOverride w:ilvl="5">
+      <w:startOverride w:val="5"/>
+    </w:lvlOverride>
+    <w:lvlOverride w:ilvl="6">
+      <w:startOverride w:val="5"/>
+    </w:lvlOverride>
+    <w:lvlOverride w:ilvl="7">
+      <w:startOverride w:val="5"/>
+    </w:lvlOverride>
+    <w:lvlOverride w:ilvl="8">
+      <w:startOverride w:val="5"/>
+    </w:lvlOverride>
+  </w:num>
+  <w:num w:numId="1011">
+    <w:abstractNumId w:val="991"/>
+  </w:num>
+  <w:num w:numId="1012">
+    <w:abstractNumId w:val="99416"/>
+    <w:lvlOverride w:ilvl="0">
+      <w:startOverride w:val="6"/>
+    </w:lvlOverride>
+    <w:lvlOverride w:ilvl="1">
+      <w:startOverride w:val="6"/>
+    </w:lvlOverride>
+    <w:lvlOverride w:ilvl="2">
+      <w:startOverride w:val="6"/>
+    </w:lvlOverride>
+    <w:lvlOverride w:ilvl="3">
+      <w:startOverride w:val="6"/>
+    </w:lvlOverride>
+    <w:lvlOverride w:ilvl="4">
+      <w:startOverride w:val="6"/>
+    </w:lvlOverride>
+    <w:lvlOverride w:ilvl="5">
+      <w:startOverride w:val="6"/>
+    </w:lvlOverride>
+    <w:lvlOverride w:ilvl="6">
+      <w:startOverride w:val="6"/>
+    </w:lvlOverride>
+    <w:lvlOverride w:ilvl="7">
+      <w:startOverride w:val="6"/>
+    </w:lvlOverride>
+    <w:lvlOverride w:ilvl="8">
+      <w:startOverride w:val="6"/>
+    </w:lvlOverride>
+  </w:num>
+  <w:num w:numId="1013">
+    <w:abstractNumId w:val="991"/>
+  </w:num>
+  <w:num w:numId="1014">
+    <w:abstractNumId w:val="99417"/>
+    <w:lvlOverride w:ilvl="0">
+      <w:startOverride w:val="7"/>
+    </w:lvlOverride>
+    <w:lvlOverride w:ilvl="1">
+      <w:startOverride w:val="7"/>
+    </w:lvlOverride>
+    <w:lvlOverride w:ilvl="2">
+      <w:startOverride w:val="7"/>
+    </w:lvlOverride>
+    <w:lvlOverride w:ilvl="3">
+      <w:startOverride w:val="7"/>
+    </w:lvlOverride>
+    <w:lvlOverride w:ilvl="4">
+      <w:startOverride w:val="7"/>
+    </w:lvlOverride>
+    <w:lvlOverride w:ilvl="5">
+      <w:startOverride w:val="7"/>
+    </w:lvlOverride>
+    <w:lvlOverride w:ilvl="6">
+      <w:startOverride w:val="7"/>
+    </w:lvlOverride>
+    <w:lvlOverride w:ilvl="7">
+      <w:startOverride w:val="7"/>
+    </w:lvlOverride>
+    <w:lvlOverride w:ilvl="8">
+      <w:startOverride w:val="7"/>
+    </w:lvlOverride>
+  </w:num>
+  <w:num w:numId="1015">
+    <w:abstractNumId w:val="99411"/>
+    <w:lvlOverride w:ilvl="0">
+      <w:startOverride w:val="1"/>
+    </w:lvlOverride>
+    <w:lvlOverride w:ilvl="1">
+      <w:startOverride w:val="1"/>
+    </w:lvlOverride>
+    <w:lvlOverride w:ilvl="2">
+      <w:startOverride w:val="1"/>
+    </w:lvlOverride>
+    <w:lvlOverride w:ilvl="3">
+      <w:startOverride w:val="1"/>
+    </w:lvlOverride>
+    <w:lvlOverride w:ilvl="4">
+      <w:startOverride w:val="1"/>
+    </w:lvlOverride>
+    <w:lvlOverride w:ilvl="5">
+      <w:startOverride w:val="1"/>
+    </w:lvlOverride>
+    <w:lvlOverride w:ilvl="6">
+      <w:startOverride w:val="1"/>
+    </w:lvlOverride>
+    <w:lvlOverride w:ilvl="7">
+      <w:startOverride w:val="1"/>
+    </w:lvlOverride>
+    <w:lvlOverride w:ilvl="8">
+      <w:startOverride w:val="1"/>
+    </w:lvlOverride>
+  </w:num>
+  <w:num w:numId="1016">
+    <w:abstractNumId w:val="99411"/>
+    <w:lvlOverride w:ilvl="0">
+      <w:startOverride w:val="1"/>
+    </w:lvlOverride>
+    <w:lvlOverride w:ilvl="1">
+      <w:startOverride w:val="1"/>
+    </w:lvlOverride>
+    <w:lvlOverride w:ilvl="2">
+      <w:startOverride w:val="1"/>
+    </w:lvlOverride>
+    <w:lvlOverride w:ilvl="3">
+      <w:startOverride w:val="1"/>
+    </w:lvlOverride>
+    <w:lvlOverride w:ilvl="4">
+      <w:startOverride w:val="1"/>
+    </w:lvlOverride>
+    <w:lvlOverride w:ilvl="5">
+      <w:startOverride w:val="1"/>
+    </w:lvlOverride>
+    <w:lvlOverride w:ilvl="6">
+      <w:startOverride w:val="1"/>
+    </w:lvlOverride>
+    <w:lvlOverride w:ilvl="7">
+      <w:startOverride w:val="1"/>
+    </w:lvlOverride>
+    <w:lvlOverride w:ilvl="8">
+      <w:startOverride w:val="1"/>
+    </w:lvlOverride>
+  </w:num>
+  <w:num w:numId="1017">
     <w:abstractNumId w:val="99411"/>
     <w:lvlOverride w:ilvl="0">
       <w:startOverride w:val="1"/>

</xml_diff>

<commit_message>
docs: clean title page and contents formatting
</commit_message>
<xml_diff>
--- a/outputs/course_paper_hse_final.docx
+++ b/outputs/course_paper_hse_final.docx
@@ -142,26 +142,6 @@
       <w:r>
         <w:t xml:space="preserve">Макаров Илья Андреевич, доцент департамента анализа данных и искусственного интеллекта ФКН НИУ ВШЭ</w:t>
       </w:r>
-      <w:r>
-        <w:t xml:space="preserve"> </w:t>
-      </w:r>
-      <w:r>
-        <w:rPr>
-          <w:b/>
-          <w:bCs/>
-        </w:rPr>
-        <w:t xml:space="preserve">E-mail:</w:t>
-      </w:r>
-      <w:r>
-        <w:t xml:space="preserve"> </w:t>
-      </w:r>
-      <w:r>
-        <w:rPr>
-          <w:b/>
-          <w:bCs/>
-        </w:rPr>
-        <w:t xml:space="preserve">Телефон:</w:t>
-      </w:r>
     </w:p>
     <w:p>
       <w:pPr>
@@ -181,7 +161,7 @@
         <w:br w:type="page"/>
       </w:r>
     </w:p>
-    <w:bookmarkStart w:id="323" w:name="аннотация"/>
+    <w:bookmarkStart w:id="402" w:name="аннотация"/>
     <w:p>
       <w:pPr>
         <w:pStyle w:val="Heading1"/>
@@ -222,8 +202,8 @@
         <w:t xml:space="preserve">Главный результат работы состоит не в создании готовой OCR-системы, а в построении воспроизводимого протокола оценки и фиксации разрыва между синтетической и реальной проверкой. Для практического применения нужны выровненные пары «OCR-вывод — эталон», обучение на настоящих OCR-ошибках, проверка на татарских и башкирских источниках и ручной анализ ошибок.</w:t>
       </w:r>
     </w:p>
-    <w:bookmarkEnd w:id="323"/>
-    <w:bookmarkStart w:id="324" w:name="abstract"/>
+    <w:bookmarkEnd w:id="402"/>
+    <w:bookmarkStart w:id="403" w:name="abstract"/>
     <w:p>
       <w:pPr>
         <w:pStyle w:val="Heading1"/>
@@ -240,8 +220,8 @@
         <w:t xml:space="preserve">This course paper investigates OCR post-correction for historical Turkic texts written in Arabic script. The work does not build a complete OCR/HTR pipeline from page images; it focuses on a narrower text-to-text layer where noisy OCR-like output is transformed into a corrected string and evaluated against a reference. The pilot material is an Ottoman Turkish source in Arabic script, used as a related Arabic-script Turkic test case rather than as an Old Tatar or Old Bashkir dataset. A synthetic corpus of noisy-reference pairs is constructed and several methods are compared: identity baseline, rule-based normalizer, character-confusion baseline, and ByT5-small. On the synthetic benchmark, ByT5-small obtains the best scores among the tested methods, especially in WER. However, a page-level sanity check on real Tesseract output shows an unstable transfer: the model may slightly reduce WER but can worsen CER and NoSpaceCER. The main result is therefore a reproducible evaluation protocol and evidence of a synthetic-to-real gap, not a ready OCR system.</w:t>
       </w:r>
     </w:p>
-    <w:bookmarkEnd w:id="324"/>
-    <w:bookmarkStart w:id="409" w:name="содержание"/>
+    <w:bookmarkEnd w:id="403"/>
+    <w:bookmarkStart w:id="488" w:name="содержание"/>
     <w:p>
       <w:pPr>
         <w:pStyle w:val="Heading1"/>
@@ -258,26 +238,13 @@
           <w:numId w:val="1001"/>
         </w:numPr>
       </w:pPr>
-    </w:p>
-    <w:p>
-      <w:pPr>
-        <w:pStyle w:val="Compact"/>
-        <w:numPr>
-          <w:ilvl w:val="1"/>
-          <w:numId w:val="1002"/>
-        </w:numPr>
-      </w:pPr>
       <w:r>
         <w:t xml:space="preserve">Введение</w:t>
       </w:r>
     </w:p>
     <w:p>
       <w:pPr>
-        <w:pStyle w:val="Compact"/>
-        <w:numPr>
-          <w:ilvl w:val="1"/>
-          <w:numId w:val="1003"/>
-        </w:numPr>
+        <w:pStyle w:val="FirstParagraph"/>
       </w:pPr>
       <w:r>
         <w:t xml:space="preserve">1.1 Актуальность</w:t>
@@ -285,11 +252,7 @@
     </w:p>
     <w:p>
       <w:pPr>
-        <w:pStyle w:val="Compact"/>
-        <w:numPr>
-          <w:ilvl w:val="1"/>
-          <w:numId w:val="1003"/>
-        </w:numPr>
+        <w:pStyle w:val="BodyText"/>
       </w:pPr>
       <w:r>
         <w:t xml:space="preserve">1.2 Постановка проблемы</w:t>
@@ -297,11 +260,7 @@
     </w:p>
     <w:p>
       <w:pPr>
-        <w:pStyle w:val="Compact"/>
-        <w:numPr>
-          <w:ilvl w:val="1"/>
-          <w:numId w:val="1003"/>
-        </w:numPr>
+        <w:pStyle w:val="BodyText"/>
       </w:pPr>
       <w:r>
         <w:t xml:space="preserve">1.3 Цель работы</w:t>
@@ -309,11 +268,7 @@
     </w:p>
     <w:p>
       <w:pPr>
-        <w:pStyle w:val="Compact"/>
-        <w:numPr>
-          <w:ilvl w:val="1"/>
-          <w:numId w:val="1003"/>
-        </w:numPr>
+        <w:pStyle w:val="BodyText"/>
       </w:pPr>
       <w:r>
         <w:t xml:space="preserve">1.4 Задачи работы</w:t>
@@ -321,11 +276,7 @@
     </w:p>
     <w:p>
       <w:pPr>
-        <w:pStyle w:val="Compact"/>
-        <w:numPr>
-          <w:ilvl w:val="1"/>
-          <w:numId w:val="1003"/>
-        </w:numPr>
+        <w:pStyle w:val="BodyText"/>
       </w:pPr>
       <w:r>
         <w:t xml:space="preserve">1.5 Объект и предмет исследования</w:t>
@@ -333,11 +284,7 @@
     </w:p>
     <w:p>
       <w:pPr>
-        <w:pStyle w:val="Compact"/>
-        <w:numPr>
-          <w:ilvl w:val="1"/>
-          <w:numId w:val="1003"/>
-        </w:numPr>
+        <w:pStyle w:val="BodyText"/>
       </w:pPr>
       <w:r>
         <w:t xml:space="preserve">1.6 Исследовательские вопросы</w:t>
@@ -345,11 +292,7 @@
     </w:p>
     <w:p>
       <w:pPr>
-        <w:pStyle w:val="Compact"/>
-        <w:numPr>
-          <w:ilvl w:val="1"/>
-          <w:numId w:val="1003"/>
-        </w:numPr>
+        <w:pStyle w:val="BodyText"/>
       </w:pPr>
       <w:r>
         <w:t xml:space="preserve">1.7 Гипотезы</w:t>
@@ -357,11 +300,7 @@
     </w:p>
     <w:p>
       <w:pPr>
-        <w:pStyle w:val="Compact"/>
-        <w:numPr>
-          <w:ilvl w:val="1"/>
-          <w:numId w:val="1003"/>
-        </w:numPr>
+        <w:pStyle w:val="BodyText"/>
       </w:pPr>
       <w:r>
         <w:t xml:space="preserve">1.8 Практическая значимость</w:t>
@@ -369,11 +308,7 @@
     </w:p>
     <w:p>
       <w:pPr>
-        <w:pStyle w:val="Compact"/>
-        <w:numPr>
-          <w:ilvl w:val="1"/>
-          <w:numId w:val="1003"/>
-        </w:numPr>
+        <w:pStyle w:val="BodyText"/>
       </w:pPr>
       <w:r>
         <w:t xml:space="preserve">1.9 Структура работы</w:t>
@@ -384,29 +319,16 @@
         <w:pStyle w:val="Compact"/>
         <w:numPr>
           <w:ilvl w:val="0"/>
-          <w:numId w:val="1001"/>
+          <w:numId w:val="1002"/>
         </w:numPr>
       </w:pPr>
-    </w:p>
-    <w:p>
-      <w:pPr>
-        <w:pStyle w:val="Compact"/>
-        <w:numPr>
-          <w:ilvl w:val="1"/>
-          <w:numId w:val="1004"/>
-        </w:numPr>
-      </w:pPr>
       <w:r>
         <w:t xml:space="preserve">Обзор предметной области и связанных работ</w:t>
       </w:r>
     </w:p>
     <w:p>
       <w:pPr>
-        <w:pStyle w:val="Compact"/>
-        <w:numPr>
-          <w:ilvl w:val="1"/>
-          <w:numId w:val="1005"/>
-        </w:numPr>
+        <w:pStyle w:val="FirstParagraph"/>
       </w:pPr>
       <w:r>
         <w:t xml:space="preserve">2.1 OCR исторических документов как воспроизводимый процесс</w:t>
@@ -414,11 +336,7 @@
     </w:p>
     <w:p>
       <w:pPr>
-        <w:pStyle w:val="Compact"/>
-        <w:numPr>
-          <w:ilvl w:val="1"/>
-          <w:numId w:val="1005"/>
-        </w:numPr>
+        <w:pStyle w:val="BodyText"/>
       </w:pPr>
       <w:r>
         <w:t xml:space="preserve">2.2 Специфика арабографичного OCR</w:t>
@@ -426,11 +344,7 @@
     </w:p>
     <w:p>
       <w:pPr>
-        <w:pStyle w:val="Compact"/>
-        <w:numPr>
-          <w:ilvl w:val="1"/>
-          <w:numId w:val="1005"/>
-        </w:numPr>
+        <w:pStyle w:val="BodyText"/>
       </w:pPr>
       <w:r>
         <w:t xml:space="preserve">2.3 Тюркские тексты в арабской графике и османско-турецкий материал</w:t>
@@ -438,11 +352,7 @@
     </w:p>
     <w:p>
       <w:pPr>
-        <w:pStyle w:val="Compact"/>
-        <w:numPr>
-          <w:ilvl w:val="1"/>
-          <w:numId w:val="1005"/>
-        </w:numPr>
+        <w:pStyle w:val="BodyText"/>
       </w:pPr>
       <w:r>
         <w:t xml:space="preserve">2.4 Посткоррекция OCR как преобразование искажённого текста в эталонный</w:t>
@@ -450,11 +360,7 @@
     </w:p>
     <w:p>
       <w:pPr>
-        <w:pStyle w:val="Compact"/>
-        <w:numPr>
-          <w:ilvl w:val="1"/>
-          <w:numId w:val="1005"/>
-        </w:numPr>
+        <w:pStyle w:val="BodyText"/>
       </w:pPr>
       <w:r>
         <w:t xml:space="preserve">2.5 Синтетические данные для посткоррекции OCR</w:t>
@@ -462,11 +368,7 @@
     </w:p>
     <w:p>
       <w:pPr>
-        <w:pStyle w:val="Compact"/>
-        <w:numPr>
-          <w:ilvl w:val="1"/>
-          <w:numId w:val="1005"/>
-        </w:numPr>
+        <w:pStyle w:val="BodyText"/>
       </w:pPr>
       <w:r>
         <w:t xml:space="preserve">2.6 Модели с байтовым представлением и выбор ByT5</w:t>
@@ -474,11 +376,7 @@
     </w:p>
     <w:p>
       <w:pPr>
-        <w:pStyle w:val="Compact"/>
-        <w:numPr>
-          <w:ilvl w:val="1"/>
-          <w:numId w:val="1005"/>
-        </w:numPr>
+        <w:pStyle w:val="BodyText"/>
       </w:pPr>
       <w:r>
         <w:t xml:space="preserve">2.7 Позиция данной работы относительно существующих исследований</w:t>
@@ -486,11 +384,7 @@
     </w:p>
     <w:p>
       <w:pPr>
-        <w:pStyle w:val="Compact"/>
-        <w:numPr>
-          <w:ilvl w:val="1"/>
-          <w:numId w:val="1005"/>
-        </w:numPr>
+        <w:pStyle w:val="BodyText"/>
       </w:pPr>
       <w:r>
         <w:t xml:space="preserve">2.8 Выводы и результаты по главе</w:t>
@@ -501,29 +395,16 @@
         <w:pStyle w:val="Compact"/>
         <w:numPr>
           <w:ilvl w:val="0"/>
-          <w:numId w:val="1001"/>
+          <w:numId w:val="1003"/>
         </w:numPr>
       </w:pPr>
-    </w:p>
-    <w:p>
-      <w:pPr>
-        <w:pStyle w:val="Compact"/>
-        <w:numPr>
-          <w:ilvl w:val="1"/>
-          <w:numId w:val="1006"/>
-        </w:numPr>
-      </w:pPr>
       <w:r>
         <w:t xml:space="preserve">Данные и построение корпуса</w:t>
       </w:r>
     </w:p>
     <w:p>
       <w:pPr>
-        <w:pStyle w:val="Compact"/>
-        <w:numPr>
-          <w:ilvl w:val="1"/>
-          <w:numId w:val="1007"/>
-        </w:numPr>
+        <w:pStyle w:val="FirstParagraph"/>
       </w:pPr>
       <w:r>
         <w:t xml:space="preserve">3.1 Общая постановка</w:t>
@@ -531,11 +412,7 @@
     </w:p>
     <w:p>
       <w:pPr>
-        <w:pStyle w:val="Compact"/>
-        <w:numPr>
-          <w:ilvl w:val="1"/>
-          <w:numId w:val="1007"/>
-        </w:numPr>
+        <w:pStyle w:val="BodyText"/>
       </w:pPr>
       <w:r>
         <w:t xml:space="preserve">3.2 Источник данных</w:t>
@@ -543,11 +420,7 @@
     </w:p>
     <w:p>
       <w:pPr>
-        <w:pStyle w:val="Compact"/>
-        <w:numPr>
-          <w:ilvl w:val="1"/>
-          <w:numId w:val="1007"/>
-        </w:numPr>
+        <w:pStyle w:val="BodyText"/>
       </w:pPr>
       <w:r>
         <w:t xml:space="preserve">3.3 Сбор и предварительная подготовка</w:t>
@@ -555,11 +428,7 @@
     </w:p>
     <w:p>
       <w:pPr>
-        <w:pStyle w:val="Compact"/>
-        <w:numPr>
-          <w:ilvl w:val="1"/>
-          <w:numId w:val="1007"/>
-        </w:numPr>
+        <w:pStyle w:val="BodyText"/>
       </w:pPr>
       <w:r>
         <w:t xml:space="preserve">3.4 Синтетические OCR-подобные искажения</w:t>
@@ -567,11 +436,7 @@
     </w:p>
     <w:p>
       <w:pPr>
-        <w:pStyle w:val="Compact"/>
-        <w:numPr>
-          <w:ilvl w:val="1"/>
-          <w:numId w:val="1007"/>
-        </w:numPr>
+        <w:pStyle w:val="BodyText"/>
       </w:pPr>
       <w:r>
         <w:t xml:space="preserve">3.5 Структура набора данных</w:t>
@@ -579,11 +444,7 @@
     </w:p>
     <w:p>
       <w:pPr>
-        <w:pStyle w:val="Compact"/>
-        <w:numPr>
-          <w:ilvl w:val="1"/>
-          <w:numId w:val="1007"/>
-        </w:numPr>
+        <w:pStyle w:val="BodyText"/>
       </w:pPr>
       <w:r>
         <w:t xml:space="preserve">3.6 Разбиение на обучающую, валидационную и тестовую выборки</w:t>
@@ -591,11 +452,7 @@
     </w:p>
     <w:p>
       <w:pPr>
-        <w:pStyle w:val="Compact"/>
-        <w:numPr>
-          <w:ilvl w:val="1"/>
-          <w:numId w:val="1007"/>
-        </w:numPr>
+        <w:pStyle w:val="BodyText"/>
       </w:pPr>
       <w:r>
         <w:t xml:space="preserve">3.7 Контроль утечки данных</w:t>
@@ -603,11 +460,7 @@
     </w:p>
     <w:p>
       <w:pPr>
-        <w:pStyle w:val="Compact"/>
-        <w:numPr>
-          <w:ilvl w:val="1"/>
-          <w:numId w:val="1007"/>
-        </w:numPr>
+        <w:pStyle w:val="BodyText"/>
       </w:pPr>
       <w:r>
         <w:t xml:space="preserve">3.8 Ограничения корпуса</w:t>
@@ -615,11 +468,7 @@
     </w:p>
     <w:p>
       <w:pPr>
-        <w:pStyle w:val="Compact"/>
-        <w:numPr>
-          <w:ilvl w:val="1"/>
-          <w:numId w:val="1007"/>
-        </w:numPr>
+        <w:pStyle w:val="BodyText"/>
       </w:pPr>
       <w:r>
         <w:t xml:space="preserve">3.9 Выводы и результаты по главе</w:t>
@@ -630,29 +479,16 @@
         <w:pStyle w:val="Compact"/>
         <w:numPr>
           <w:ilvl w:val="0"/>
-          <w:numId w:val="1001"/>
+          <w:numId w:val="1004"/>
         </w:numPr>
       </w:pPr>
-    </w:p>
-    <w:p>
-      <w:pPr>
-        <w:pStyle w:val="Compact"/>
-        <w:numPr>
-          <w:ilvl w:val="1"/>
-          <w:numId w:val="1008"/>
-        </w:numPr>
-      </w:pPr>
       <w:r>
         <w:t xml:space="preserve">Методология эксперимента</w:t>
       </w:r>
     </w:p>
     <w:p>
       <w:pPr>
-        <w:pStyle w:val="Compact"/>
-        <w:numPr>
-          <w:ilvl w:val="1"/>
-          <w:numId w:val="1009"/>
-        </w:numPr>
+        <w:pStyle w:val="FirstParagraph"/>
       </w:pPr>
       <w:r>
         <w:t xml:space="preserve">4.1 Общая схема эксперимента</w:t>
@@ -660,11 +496,7 @@
     </w:p>
     <w:p>
       <w:pPr>
-        <w:pStyle w:val="Compact"/>
-        <w:numPr>
-          <w:ilvl w:val="1"/>
-          <w:numId w:val="1009"/>
-        </w:numPr>
+        <w:pStyle w:val="BodyText"/>
       </w:pPr>
       <w:r>
         <w:t xml:space="preserve">4.2 Базовые методы</w:t>
@@ -672,11 +504,7 @@
     </w:p>
     <w:p>
       <w:pPr>
-        <w:pStyle w:val="Compact"/>
-        <w:numPr>
-          <w:ilvl w:val="1"/>
-          <w:numId w:val="1009"/>
-        </w:numPr>
+        <w:pStyle w:val="BodyText"/>
       </w:pPr>
       <w:r>
         <w:t xml:space="preserve">4.3 Символьный метод на основе ошибок обучающей выборки</w:t>
@@ -684,11 +512,7 @@
     </w:p>
     <w:p>
       <w:pPr>
-        <w:pStyle w:val="Compact"/>
-        <w:numPr>
-          <w:ilvl w:val="1"/>
-          <w:numId w:val="1009"/>
-        </w:numPr>
+        <w:pStyle w:val="BodyText"/>
       </w:pPr>
       <w:r>
         <w:t xml:space="preserve">4.4 Нейросетевая модель ByT5-small</w:t>
@@ -696,11 +520,7 @@
     </w:p>
     <w:p>
       <w:pPr>
-        <w:pStyle w:val="Compact"/>
-        <w:numPr>
-          <w:ilvl w:val="1"/>
-          <w:numId w:val="1009"/>
-        </w:numPr>
+        <w:pStyle w:val="BodyText"/>
       </w:pPr>
       <w:r>
         <w:t xml:space="preserve">4.5 Проверенные конфигурации</w:t>
@@ -708,11 +528,7 @@
     </w:p>
     <w:p>
       <w:pPr>
-        <w:pStyle w:val="Compact"/>
-        <w:numPr>
-          <w:ilvl w:val="1"/>
-          <w:numId w:val="1009"/>
-        </w:numPr>
+        <w:pStyle w:val="BodyText"/>
       </w:pPr>
       <w:r>
         <w:t xml:space="preserve">4.6 Метрики качества</w:t>
@@ -720,11 +536,7 @@
     </w:p>
     <w:p>
       <w:pPr>
-        <w:pStyle w:val="Compact"/>
-        <w:numPr>
-          <w:ilvl w:val="1"/>
-          <w:numId w:val="1009"/>
-        </w:numPr>
+        <w:pStyle w:val="BodyText"/>
       </w:pPr>
       <w:r>
         <w:t xml:space="preserve">4.7 Процедура оценки</w:t>
@@ -732,11 +544,7 @@
     </w:p>
     <w:p>
       <w:pPr>
-        <w:pStyle w:val="Compact"/>
-        <w:numPr>
-          <w:ilvl w:val="1"/>
-          <w:numId w:val="1009"/>
-        </w:numPr>
+        <w:pStyle w:val="BodyText"/>
       </w:pPr>
       <w:r>
         <w:t xml:space="preserve">4.8 Анализ ошибок</w:t>
@@ -744,11 +552,7 @@
     </w:p>
     <w:p>
       <w:pPr>
-        <w:pStyle w:val="Compact"/>
-        <w:numPr>
-          <w:ilvl w:val="1"/>
-          <w:numId w:val="1009"/>
-        </w:numPr>
+        <w:pStyle w:val="BodyText"/>
       </w:pPr>
       <w:r>
         <w:t xml:space="preserve">4.9 Воспроизводимость</w:t>
@@ -756,11 +560,7 @@
     </w:p>
     <w:p>
       <w:pPr>
-        <w:pStyle w:val="Compact"/>
-        <w:numPr>
-          <w:ilvl w:val="1"/>
-          <w:numId w:val="1009"/>
-        </w:numPr>
+        <w:pStyle w:val="BodyText"/>
       </w:pPr>
       <w:r>
         <w:t xml:space="preserve">4.10 Выводы и результаты по главе</w:t>
@@ -771,29 +571,16 @@
         <w:pStyle w:val="Compact"/>
         <w:numPr>
           <w:ilvl w:val="0"/>
-          <w:numId w:val="1001"/>
+          <w:numId w:val="1005"/>
         </w:numPr>
       </w:pPr>
-    </w:p>
-    <w:p>
-      <w:pPr>
-        <w:pStyle w:val="Compact"/>
-        <w:numPr>
-          <w:ilvl w:val="1"/>
-          <w:numId w:val="1010"/>
-        </w:numPr>
-      </w:pPr>
       <w:r>
         <w:t xml:space="preserve">Результаты экспериментов и анализ ошибок</w:t>
       </w:r>
     </w:p>
     <w:p>
       <w:pPr>
-        <w:pStyle w:val="Compact"/>
-        <w:numPr>
-          <w:ilvl w:val="1"/>
-          <w:numId w:val="1011"/>
-        </w:numPr>
+        <w:pStyle w:val="FirstParagraph"/>
       </w:pPr>
       <w:r>
         <w:t xml:space="preserve">5.1 Общая логика оценки</w:t>
@@ -801,11 +588,7 @@
     </w:p>
     <w:p>
       <w:pPr>
-        <w:pStyle w:val="Compact"/>
-        <w:numPr>
-          <w:ilvl w:val="1"/>
-          <w:numId w:val="1011"/>
-        </w:numPr>
+        <w:pStyle w:val="BodyText"/>
       </w:pPr>
       <w:r>
         <w:t xml:space="preserve">5.2 Итоговые метрики</w:t>
@@ -813,11 +596,7 @@
     </w:p>
     <w:p>
       <w:pPr>
-        <w:pStyle w:val="Compact"/>
-        <w:numPr>
-          <w:ilvl w:val="1"/>
-          <w:numId w:val="1011"/>
-        </w:numPr>
+        <w:pStyle w:val="BodyText"/>
       </w:pPr>
       <w:r>
         <w:t xml:space="preserve">5.3 Сравнение с методом без исправления</w:t>
@@ -825,11 +604,7 @@
     </w:p>
     <w:p>
       <w:pPr>
-        <w:pStyle w:val="Compact"/>
-        <w:numPr>
-          <w:ilvl w:val="1"/>
-          <w:numId w:val="1011"/>
-        </w:numPr>
+        <w:pStyle w:val="BodyText"/>
       </w:pPr>
       <w:r>
         <w:t xml:space="preserve">5.4 Нормализатор на правилах</w:t>
@@ -837,11 +612,7 @@
     </w:p>
     <w:p>
       <w:pPr>
-        <w:pStyle w:val="Compact"/>
-        <w:numPr>
-          <w:ilvl w:val="1"/>
-          <w:numId w:val="1011"/>
-        </w:numPr>
+        <w:pStyle w:val="BodyText"/>
       </w:pPr>
       <w:r>
         <w:t xml:space="preserve">5.5 Символьный метод на основе ошибок обучающей выборки</w:t>
@@ -849,11 +620,7 @@
     </w:p>
     <w:p>
       <w:pPr>
-        <w:pStyle w:val="Compact"/>
-        <w:numPr>
-          <w:ilvl w:val="1"/>
-          <w:numId w:val="1011"/>
-        </w:numPr>
+        <w:pStyle w:val="BodyText"/>
       </w:pPr>
       <w:r>
         <w:t xml:space="preserve">5.6 Интерпретация снижения WER</w:t>
@@ -861,11 +628,7 @@
     </w:p>
     <w:p>
       <w:pPr>
-        <w:pStyle w:val="Compact"/>
-        <w:numPr>
-          <w:ilvl w:val="1"/>
-          <w:numId w:val="1011"/>
-        </w:numPr>
+        <w:pStyle w:val="BodyText"/>
       </w:pPr>
       <w:r>
         <w:t xml:space="preserve">5.7 Влияние максимальной длины последовательности</w:t>
@@ -873,11 +636,7 @@
     </w:p>
     <w:p>
       <w:pPr>
-        <w:pStyle w:val="Compact"/>
-        <w:numPr>
-          <w:ilvl w:val="1"/>
-          <w:numId w:val="1011"/>
-        </w:numPr>
+        <w:pStyle w:val="BodyText"/>
       </w:pPr>
       <w:r>
         <w:t xml:space="preserve">5.8 Распределение улучшенных и ухудшенных примеров</w:t>
@@ -885,11 +644,7 @@
     </w:p>
     <w:p>
       <w:pPr>
-        <w:pStyle w:val="Compact"/>
-        <w:numPr>
-          <w:ilvl w:val="1"/>
-          <w:numId w:val="1011"/>
-        </w:numPr>
+        <w:pStyle w:val="BodyText"/>
       </w:pPr>
       <w:r>
         <w:t xml:space="preserve">5.9 Среднее улучшение по примерам</w:t>
@@ -897,11 +652,7 @@
     </w:p>
     <w:p>
       <w:pPr>
-        <w:pStyle w:val="Compact"/>
-        <w:numPr>
-          <w:ilvl w:val="1"/>
-          <w:numId w:val="1011"/>
-        </w:numPr>
+        <w:pStyle w:val="BodyText"/>
       </w:pPr>
       <w:r>
         <w:t xml:space="preserve">5.10 Интерпретация результатов</w:t>
@@ -909,11 +660,7 @@
     </w:p>
     <w:p>
       <w:pPr>
-        <w:pStyle w:val="Compact"/>
-        <w:numPr>
-          <w:ilvl w:val="1"/>
-          <w:numId w:val="1011"/>
-        </w:numPr>
+        <w:pStyle w:val="BodyText"/>
       </w:pPr>
       <w:r>
         <w:t xml:space="preserve">5.11 Ограничения интерпретации</w:t>
@@ -921,11 +668,7 @@
     </w:p>
     <w:p>
       <w:pPr>
-        <w:pStyle w:val="Compact"/>
-        <w:numPr>
-          <w:ilvl w:val="1"/>
-          <w:numId w:val="1011"/>
-        </w:numPr>
+        <w:pStyle w:val="BodyText"/>
       </w:pPr>
       <w:r>
         <w:t xml:space="preserve">5.12 Проверка переноса на постраничном реальном OCR</w:t>
@@ -933,11 +676,7 @@
     </w:p>
     <w:p>
       <w:pPr>
-        <w:pStyle w:val="Compact"/>
-        <w:numPr>
-          <w:ilvl w:val="1"/>
-          <w:numId w:val="1011"/>
-        </w:numPr>
+        <w:pStyle w:val="BodyText"/>
       </w:pPr>
       <w:r>
         <w:t xml:space="preserve">5.13 Постраничное поведение модели</w:t>
@@ -945,11 +684,7 @@
     </w:p>
     <w:p>
       <w:pPr>
-        <w:pStyle w:val="Compact"/>
-        <w:numPr>
-          <w:ilvl w:val="1"/>
-          <w:numId w:val="1011"/>
-        </w:numPr>
+        <w:pStyle w:val="BodyText"/>
       </w:pPr>
       <w:r>
         <w:t xml:space="preserve">5.14 Качественная интерпретация real OCR</w:t>
@@ -957,11 +692,7 @@
     </w:p>
     <w:p>
       <w:pPr>
-        <w:pStyle w:val="Compact"/>
-        <w:numPr>
-          <w:ilvl w:val="1"/>
-          <w:numId w:val="1011"/>
-        </w:numPr>
+        <w:pStyle w:val="BodyText"/>
       </w:pPr>
       <w:r>
         <w:t xml:space="preserve">5.15 Выводы и результаты по главе</w:t>
@@ -972,29 +703,16 @@
         <w:pStyle w:val="Compact"/>
         <w:numPr>
           <w:ilvl w:val="0"/>
-          <w:numId w:val="1001"/>
+          <w:numId w:val="1006"/>
         </w:numPr>
       </w:pPr>
-    </w:p>
-    <w:p>
-      <w:pPr>
-        <w:pStyle w:val="Compact"/>
-        <w:numPr>
-          <w:ilvl w:val="1"/>
-          <w:numId w:val="1012"/>
-        </w:numPr>
-      </w:pPr>
       <w:r>
         <w:t xml:space="preserve">Ограничения и направления дальнейшей работы</w:t>
       </w:r>
     </w:p>
     <w:p>
       <w:pPr>
-        <w:pStyle w:val="Compact"/>
-        <w:numPr>
-          <w:ilvl w:val="1"/>
-          <w:numId w:val="1013"/>
-        </w:numPr>
+        <w:pStyle w:val="FirstParagraph"/>
       </w:pPr>
       <w:r>
         <w:t xml:space="preserve">6.1 Ограничения корпуса</w:t>
@@ -1002,11 +720,7 @@
     </w:p>
     <w:p>
       <w:pPr>
-        <w:pStyle w:val="Compact"/>
-        <w:numPr>
-          <w:ilvl w:val="1"/>
-          <w:numId w:val="1013"/>
-        </w:numPr>
+        <w:pStyle w:val="BodyText"/>
       </w:pPr>
       <w:r>
         <w:t xml:space="preserve">6.2 Ограничения синтетического шума</w:t>
@@ -1014,11 +728,7 @@
     </w:p>
     <w:p>
       <w:pPr>
-        <w:pStyle w:val="Compact"/>
-        <w:numPr>
-          <w:ilvl w:val="1"/>
-          <w:numId w:val="1013"/>
-        </w:numPr>
+        <w:pStyle w:val="BodyText"/>
       </w:pPr>
       <w:r>
         <w:t xml:space="preserve">6.3 Ограничения метрик</w:t>
@@ -1026,11 +736,7 @@
     </w:p>
     <w:p>
       <w:pPr>
-        <w:pStyle w:val="Compact"/>
-        <w:numPr>
-          <w:ilvl w:val="1"/>
-          <w:numId w:val="1013"/>
-        </w:numPr>
+        <w:pStyle w:val="BodyText"/>
       </w:pPr>
       <w:r>
         <w:t xml:space="preserve">6.4 Ограничения проверки на реальном OCR</w:t>
@@ -1038,11 +744,7 @@
     </w:p>
     <w:p>
       <w:pPr>
-        <w:pStyle w:val="Compact"/>
-        <w:numPr>
-          <w:ilvl w:val="1"/>
-          <w:numId w:val="1013"/>
-        </w:numPr>
+        <w:pStyle w:val="BodyText"/>
       </w:pPr>
       <w:r>
         <w:t xml:space="preserve">6.5 Следующий набор данных</w:t>
@@ -1050,11 +752,7 @@
     </w:p>
     <w:p>
       <w:pPr>
-        <w:pStyle w:val="Compact"/>
-        <w:numPr>
-          <w:ilvl w:val="1"/>
-          <w:numId w:val="1013"/>
-        </w:numPr>
+        <w:pStyle w:val="BodyText"/>
       </w:pPr>
       <w:r>
         <w:t xml:space="preserve">6.6 Переход к системе анализа исторических источников</w:t>
@@ -1062,11 +760,7 @@
     </w:p>
     <w:p>
       <w:pPr>
-        <w:pStyle w:val="Compact"/>
-        <w:numPr>
-          <w:ilvl w:val="1"/>
-          <w:numId w:val="1013"/>
-        </w:numPr>
+        <w:pStyle w:val="BodyText"/>
       </w:pPr>
       <w:r>
         <w:t xml:space="preserve">6.7 Выводы и результаты по главе</w:t>
@@ -1077,20 +771,175 @@
         <w:pStyle w:val="Compact"/>
         <w:numPr>
           <w:ilvl w:val="0"/>
-          <w:numId w:val="1001"/>
+          <w:numId w:val="1007"/>
         </w:numPr>
       </w:pPr>
-    </w:p>
-    <w:p>
-      <w:pPr>
-        <w:pStyle w:val="Compact"/>
-        <w:numPr>
-          <w:ilvl w:val="1"/>
-          <w:numId w:val="1014"/>
-        </w:numPr>
-      </w:pPr>
       <w:r>
         <w:t xml:space="preserve">Заключение</w:t>
+      </w:r>
+    </w:p>
+    <w:p>
+      <w:pPr>
+        <w:pStyle w:val="FirstParagraph"/>
+      </w:pPr>
+      <w:r>
+        <w:t xml:space="preserve">Библиографический список</w:t>
+      </w:r>
+      <w:r>
+        <w:t xml:space="preserve"> </w:t>
+      </w:r>
+    </w:p>
+    <w:bookmarkStart w:id="404" w:name="введение"/>
+    <w:p>
+      <w:pPr>
+        <w:pStyle w:val="Heading2"/>
+      </w:pPr>
+      <w:r>
+        <w:t xml:space="preserve">1. Введение</w:t>
+      </w:r>
+    </w:p>
+    <w:p>
+      <w:pPr>
+        <w:pStyle w:val="FirstParagraph"/>
+      </w:pPr>
+      <w:r>
+        <w:t xml:space="preserve">Исторические тюркские тексты в арабской графике важны для изучения истории, культуры, религии, права, повседневности и интеллектуальной традиции тюркских народов. К таким материалам относятся османские, татарские, башкирские, крымскотатарские и другие источники, созданные до перехода соответствующих письменных традиций на латиницу или кириллицу.</w:t>
+      </w:r>
+    </w:p>
+    <w:p>
+      <w:pPr>
+        <w:pStyle w:val="BodyText"/>
+      </w:pPr>
+      <w:r>
+        <w:t xml:space="preserve">Для автоматической обработки это трудный материал. Историческая орфография отличается от современной нормы, арабская графика плохо переносится на стандартные OCR-сценарии, а размеченных корпусов значительно меньше, чем для современных массовых языков. Даже когда скан доступен, исследователь часто получает не готовый текстовый корпус, а изображение или OCR-вывод с большим числом ошибок.</w:t>
+      </w:r>
+    </w:p>
+    <w:p>
+      <w:pPr>
+        <w:pStyle w:val="BodyText"/>
+      </w:pPr>
+      <w:r>
+        <w:t xml:space="preserve">В этой работе не ставится задача решить всю проблему распознавания исторических документов. Полная технологическая цепочка включает поиск источника, обработку изображения, разметку строк, OCR/HTR, посткоррекцию, проверку текста и последующий анализ. Здесь рассматривается более узкий слой: исправление уже полученного текстового вывода. Такое сужение делает эксперимент проверяемым: на вход подаётся OCR-текст, на выходе получается исправленная строка, а качество измеряется относительно эталона.</w:t>
+      </w:r>
+    </w:p>
+    <w:p>
+      <w:pPr>
+        <w:pStyle w:val="BodyText"/>
+      </w:pPr>
+      <w:r>
+        <w:t xml:space="preserve">Работа проверяет важное ограничение синтетического подхода. Если реальных пар «OCR-вывод — проверенный эталон» мало, естественный первый шаг состоит в искусственной генерации ошибок. Но успех на таком наборе не подтверждает работу модели на настоящем OCR. Поэтому эксперимент разделён на два уровня: контролируемую проверку на синтетических искажениях и отдельную постраничную проверку на реальном OCR османско-турецкого печатного источника.</w:t>
+      </w:r>
+    </w:p>
+    <w:p>
+      <w:pPr>
+        <w:pStyle w:val="BodyText"/>
+      </w:pPr>
+      <w:r>
+        <w:t xml:space="preserve">Методы исследования включают анализ работ по OCR исторических документов и посткоррекции, построение пилотного корпуса, генерацию синтетических OCR-подобных ошибок, реализацию базовых методов, обучение модели ByT5-small, вычисление CER, WER, NoSpaceCER и ExactMatch, анализ ошибок и отдельную проверку переноса на реальный OCR-вывод Tesseract. Такой набор методов позволяет отделить контролируемую проверку на синтетических данных от проверки поведения модели на настоящем OCR-выводе.</w:t>
+      </w:r>
+    </w:p>
+    <w:bookmarkEnd w:id="404"/>
+    <w:bookmarkStart w:id="405" w:name="актуальность"/>
+    <w:p>
+      <w:pPr>
+        <w:pStyle w:val="Heading2"/>
+      </w:pPr>
+      <w:r>
+        <w:t xml:space="preserve">1.1 Актуальность</w:t>
+      </w:r>
+    </w:p>
+    <w:p>
+      <w:pPr>
+        <w:pStyle w:val="FirstParagraph"/>
+      </w:pPr>
+      <w:r>
+        <w:t xml:space="preserve">Актуальность работы связана не только с OCR как технической задачей. Без машинно-читаемого текста исторические источники трудно включать в поиск, корпусный анализ, извлечение имён и топонимов, сопоставление записей и проверку историко-лингвистических гипотез.</w:t>
+      </w:r>
+    </w:p>
+    <w:p>
+      <w:pPr>
+        <w:pStyle w:val="BodyText"/>
+      </w:pPr>
+      <w:r>
+        <w:t xml:space="preserve">Для арабографичных тюркских материалов эта проблема особенно заметна. Такие тексты слабо представлены в готовых OCR- и NLP-ресурсах; стандартные модели, обученные на современных языках и более регулярной орфографии, не обязательно справляются с историческим письмом. Даже частично распознанный текст часто требует отдельного слоя исправления: похожие графемы, пропуски, лишние символы и ошибки пробелов мешают дальнейшему анализу.</w:t>
+      </w:r>
+    </w:p>
+    <w:p>
+      <w:pPr>
+        <w:pStyle w:val="BodyText"/>
+      </w:pPr>
+      <w:r>
+        <w:t xml:space="preserve">Ещё одна причина актуальности связана с нехваткой воспроизводимых тестовых наборов и протоколов оценки. Для низкоресурсного исторического материала недостаточно показать один удачный пример исправления. Нужно фиксировать источник данных, процедуру генерации или получения OCR, разбиение на обучающую и тестовую части, метрики и худшие случаи. Поэтому в работе важны не только значения CER и WER, но и воспроизводимый протокол оценки.</w:t>
+      </w:r>
+    </w:p>
+    <w:bookmarkEnd w:id="405"/>
+    <w:bookmarkStart w:id="406" w:name="постановка-проблемы"/>
+    <w:p>
+      <w:pPr>
+        <w:pStyle w:val="Heading2"/>
+      </w:pPr>
+      <w:r>
+        <w:t xml:space="preserve">1.2 Постановка проблемы</w:t>
+      </w:r>
+    </w:p>
+    <w:p>
+      <w:pPr>
+        <w:pStyle w:val="FirstParagraph"/>
+      </w:pPr>
+      <w:r>
+        <w:t xml:space="preserve">Основная проблема состоит в том, что для исторических тюркских текстов в арабской графике пока не хватает небольших, но воспроизводимых экспериментальных контуров для проверки посткоррекции OCR. Без такого контура трудно понять, что именно улучшает модель: реальные ошибки распознавания, искусственно внесённый шум, пробелы, локальные замены графем или только отдельные удачные примеры.</w:t>
+      </w:r>
+    </w:p>
+    <w:p>
+      <w:pPr>
+        <w:pStyle w:val="BodyText"/>
+      </w:pPr>
+      <w:r>
+        <w:t xml:space="preserve">В этой работе проблема сведена к проверяемой постановке. Нужно построить пары «искажённый OCR-текст — эталон», обучить и сравнить несколько методов посткоррекции, а затем проверить перенос с синтетических ошибок на реальный OCR. Важное ограничение формулируется заранее: османско-турецкий источник используется как близкий тюркский материал в арабской графике, но не подаётся как старотатарский или старобашкирский набор данных.</w:t>
+      </w:r>
+    </w:p>
+    <w:p>
+      <w:pPr>
+        <w:pStyle w:val="BodyText"/>
+      </w:pPr>
+      <w:r>
+        <w:t xml:space="preserve">Такое сужение позволяет отделить ошибки посткоррекции от ошибок сегментации, распознавания изображения и подготовки скана. В то же время оно не снимает более крупную задачу: для практической системы всё равно понадобятся реальные пары «OCR-вывод — эталон», ручная валидация и расширение корпуса на целевые татарские и башкирские источники.</w:t>
+      </w:r>
+    </w:p>
+    <w:bookmarkEnd w:id="406"/>
+    <w:bookmarkStart w:id="407" w:name="цель-работы"/>
+    <w:p>
+      <w:pPr>
+        <w:pStyle w:val="Heading2"/>
+      </w:pPr>
+      <w:r>
+        <w:t xml:space="preserve">1.3 Цель работы</w:t>
+      </w:r>
+    </w:p>
+    <w:p>
+      <w:pPr>
+        <w:pStyle w:val="FirstParagraph"/>
+      </w:pPr>
+      <w:r>
+        <w:t xml:space="preserve">Цель работы состоит в построении и оценке протокола посткоррекции OCR-подобных ошибок для исторических тюркских текстов в арабской графике, а также в проверке переноса модели с синтетических искажений на реальный OCR-вывод.</w:t>
+      </w:r>
+    </w:p>
+    <w:bookmarkEnd w:id="407"/>
+    <w:bookmarkStart w:id="408" w:name="задачи-работы"/>
+    <w:p>
+      <w:pPr>
+        <w:pStyle w:val="Heading2"/>
+      </w:pPr>
+      <w:r>
+        <w:t xml:space="preserve">1.4 Задачи работы</w:t>
+      </w:r>
+    </w:p>
+    <w:p>
+      <w:pPr>
+        <w:pStyle w:val="FirstParagraph"/>
+      </w:pPr>
+      <w:r>
+        <w:t xml:space="preserve">Для достижения цели необходимо решить следующие задачи:</w:t>
       </w:r>
     </w:p>
     <w:p>
@@ -1098,167 +947,11 @@
         <w:pStyle w:val="Compact"/>
         <w:numPr>
           <w:ilvl w:val="0"/>
-          <w:numId w:val="1001"/>
+          <w:numId w:val="1008"/>
         </w:numPr>
       </w:pPr>
       <w:r>
-        <w:t xml:space="preserve">Библиографический список</w:t>
-      </w:r>
-      <w:r>
-        <w:t xml:space="preserve"> </w:t>
-      </w:r>
-    </w:p>
-    <w:bookmarkStart w:id="325" w:name="введение"/>
-    <w:p>
-      <w:pPr>
-        <w:pStyle w:val="Heading2"/>
-      </w:pPr>
-      <w:r>
-        <w:t xml:space="preserve">1. Введение</w:t>
-      </w:r>
-    </w:p>
-    <w:p>
-      <w:pPr>
-        <w:pStyle w:val="FirstParagraph"/>
-      </w:pPr>
-      <w:r>
-        <w:t xml:space="preserve">Исторические тюркские тексты в арабской графике важны для изучения истории, культуры, религии, права, повседневности и интеллектуальной традиции тюркских народов. К таким материалам относятся османские, татарские, башкирские, крымскотатарские и другие источники, созданные до перехода соответствующих письменных традиций на латиницу или кириллицу.</w:t>
-      </w:r>
-    </w:p>
-    <w:p>
-      <w:pPr>
-        <w:pStyle w:val="BodyText"/>
-      </w:pPr>
-      <w:r>
-        <w:t xml:space="preserve">Для автоматической обработки это трудный материал. Историческая орфография отличается от современной нормы, арабская графика плохо переносится на стандартные OCR-сценарии, а размеченных корпусов значительно меньше, чем для современных массовых языков. Даже когда скан доступен, исследователь часто получает не готовый текстовый корпус, а изображение или OCR-вывод с большим числом ошибок.</w:t>
-      </w:r>
-    </w:p>
-    <w:p>
-      <w:pPr>
-        <w:pStyle w:val="BodyText"/>
-      </w:pPr>
-      <w:r>
-        <w:t xml:space="preserve">В этой работе не ставится задача решить всю проблему распознавания исторических документов. Полная технологическая цепочка включает поиск источника, обработку изображения, разметку строк, OCR/HTR, посткоррекцию, проверку текста и последующий анализ. Здесь рассматривается более узкий слой: исправление уже полученного текстового вывода. Такое сужение делает эксперимент проверяемым: на вход подаётся OCR-текст, на выходе получается исправленная строка, а качество измеряется относительно эталона.</w:t>
-      </w:r>
-    </w:p>
-    <w:p>
-      <w:pPr>
-        <w:pStyle w:val="BodyText"/>
-      </w:pPr>
-      <w:r>
-        <w:t xml:space="preserve">Работа проверяет важное ограничение синтетического подхода. Если реальных пар «OCR-вывод — проверенный эталон» мало, естественный первый шаг состоит в искусственной генерации ошибок. Но успех на таком наборе не подтверждает работу модели на настоящем OCR. Поэтому эксперимент разделён на два уровня: контролируемую проверку на синтетических искажениях и отдельную постраничную проверку на реальном OCR османско-турецкого печатного источника.</w:t>
-      </w:r>
-    </w:p>
-    <w:p>
-      <w:pPr>
-        <w:pStyle w:val="BodyText"/>
-      </w:pPr>
-      <w:r>
-        <w:t xml:space="preserve">Методы исследования включают анализ работ по OCR исторических документов и посткоррекции, построение пилотного корпуса, генерацию синтетических OCR-подобных ошибок, реализацию базовых методов, обучение модели ByT5-small, вычисление CER, WER, NoSpaceCER и ExactMatch, анализ ошибок и отдельную проверку переноса на реальный OCR-вывод Tesseract. Такой набор методов позволяет отделить контролируемую проверку на синтетических данных от проверки поведения модели на настоящем OCR-выводе.</w:t>
-      </w:r>
-    </w:p>
-    <w:bookmarkEnd w:id="325"/>
-    <w:bookmarkStart w:id="326" w:name="актуальность"/>
-    <w:p>
-      <w:pPr>
-        <w:pStyle w:val="Heading2"/>
-      </w:pPr>
-      <w:r>
-        <w:t xml:space="preserve">1.1 Актуальность</w:t>
-      </w:r>
-    </w:p>
-    <w:p>
-      <w:pPr>
-        <w:pStyle w:val="FirstParagraph"/>
-      </w:pPr>
-      <w:r>
-        <w:t xml:space="preserve">Актуальность работы связана не только с OCR как технической задачей. Без машинно-читаемого текста исторические источники трудно включать в поиск, корпусный анализ, извлечение имён и топонимов, сопоставление записей и проверку историко-лингвистических гипотез.</w:t>
-      </w:r>
-    </w:p>
-    <w:p>
-      <w:pPr>
-        <w:pStyle w:val="BodyText"/>
-      </w:pPr>
-      <w:r>
-        <w:t xml:space="preserve">Для арабографичных тюркских материалов эта проблема особенно заметна. Такие тексты слабо представлены в готовых OCR- и NLP-ресурсах; стандартные модели, обученные на современных языках и более регулярной орфографии, не обязательно справляются с историческим письмом. Даже частично распознанный текст часто требует отдельного слоя исправления: похожие графемы, пропуски, лишние символы и ошибки пробелов мешают дальнейшему анализу.</w:t>
-      </w:r>
-    </w:p>
-    <w:p>
-      <w:pPr>
-        <w:pStyle w:val="BodyText"/>
-      </w:pPr>
-      <w:r>
-        <w:t xml:space="preserve">Ещё одна причина актуальности связана с нехваткой воспроизводимых тестовых наборов и протоколов оценки. Для низкоресурсного исторического материала недостаточно показать один удачный пример исправления. Нужно фиксировать источник данных, процедуру генерации или получения OCR, разбиение на обучающую и тестовую части, метрики и худшие случаи. Поэтому в работе важны не только значения CER и WER, но и воспроизводимый протокол оценки.</w:t>
-      </w:r>
-    </w:p>
-    <w:bookmarkEnd w:id="326"/>
-    <w:bookmarkStart w:id="327" w:name="постановка-проблемы"/>
-    <w:p>
-      <w:pPr>
-        <w:pStyle w:val="Heading2"/>
-      </w:pPr>
-      <w:r>
-        <w:t xml:space="preserve">1.2 Постановка проблемы</w:t>
-      </w:r>
-    </w:p>
-    <w:p>
-      <w:pPr>
-        <w:pStyle w:val="FirstParagraph"/>
-      </w:pPr>
-      <w:r>
-        <w:t xml:space="preserve">Основная проблема состоит в том, что для исторических тюркских текстов в арабской графике пока не хватает небольших, но воспроизводимых экспериментальных контуров для проверки посткоррекции OCR. Без такого контура трудно понять, что именно улучшает модель: реальные ошибки распознавания, искусственно внесённый шум, пробелы, локальные замены графем или только отдельные удачные примеры.</w:t>
-      </w:r>
-    </w:p>
-    <w:p>
-      <w:pPr>
-        <w:pStyle w:val="BodyText"/>
-      </w:pPr>
-      <w:r>
-        <w:t xml:space="preserve">В этой работе проблема сведена к проверяемой постановке. Нужно построить пары «искажённый OCR-текст — эталон», обучить и сравнить несколько методов посткоррекции, а затем проверить перенос с синтетических ошибок на реальный OCR. Важное ограничение формулируется заранее: османско-турецкий источник используется как близкий тюркский материал в арабской графике, но не подаётся как старотатарский или старобашкирский набор данных.</w:t>
-      </w:r>
-    </w:p>
-    <w:p>
-      <w:pPr>
-        <w:pStyle w:val="BodyText"/>
-      </w:pPr>
-      <w:r>
-        <w:t xml:space="preserve">Такое сужение позволяет отделить ошибки посткоррекции от ошибок сегментации, распознавания изображения и подготовки скана. В то же время оно не снимает более крупную задачу: для практической системы всё равно понадобятся реальные пары «OCR-вывод — эталон», ручная валидация и расширение корпуса на целевые татарские и башкирские источники.</w:t>
-      </w:r>
-    </w:p>
-    <w:bookmarkEnd w:id="327"/>
-    <w:bookmarkStart w:id="328" w:name="цель-работы"/>
-    <w:p>
-      <w:pPr>
-        <w:pStyle w:val="Heading2"/>
-      </w:pPr>
-      <w:r>
-        <w:t xml:space="preserve">1.3 Цель работы</w:t>
-      </w:r>
-    </w:p>
-    <w:p>
-      <w:pPr>
-        <w:pStyle w:val="FirstParagraph"/>
-      </w:pPr>
-      <w:r>
-        <w:t xml:space="preserve">Цель работы состоит в построении и оценке протокола посткоррекции OCR-подобных ошибок для исторических тюркских текстов в арабской графике, а также в проверке переноса модели с синтетических искажений на реальный OCR-вывод.</w:t>
-      </w:r>
-    </w:p>
-    <w:bookmarkEnd w:id="328"/>
-    <w:bookmarkStart w:id="329" w:name="задачи-работы"/>
-    <w:p>
-      <w:pPr>
-        <w:pStyle w:val="Heading2"/>
-      </w:pPr>
-      <w:r>
-        <w:t xml:space="preserve">1.4 Задачи работы</w:t>
-      </w:r>
-    </w:p>
-    <w:p>
-      <w:pPr>
-        <w:pStyle w:val="FirstParagraph"/>
-      </w:pPr>
-      <w:r>
-        <w:t xml:space="preserve">Для достижения цели необходимо решить следующие задачи:</w:t>
+        <w:t xml:space="preserve">Описать особенности автоматической обработки тюркских текстов в арабской графике.</w:t>
       </w:r>
     </w:p>
     <w:p>
@@ -1266,11 +959,11 @@
         <w:pStyle w:val="Compact"/>
         <w:numPr>
           <w:ilvl w:val="0"/>
-          <w:numId w:val="1015"/>
+          <w:numId w:val="1008"/>
         </w:numPr>
       </w:pPr>
       <w:r>
-        <w:t xml:space="preserve">Описать особенности автоматической обработки тюркских текстов в арабской графике.</w:t>
+        <w:t xml:space="preserve">Собрать небольшой корпус тюркского текста в арабской графике и зафиксировать его ограничения.</w:t>
       </w:r>
     </w:p>
     <w:p>
@@ -1278,11 +971,11 @@
         <w:pStyle w:val="Compact"/>
         <w:numPr>
           <w:ilvl w:val="0"/>
-          <w:numId w:val="1015"/>
+          <w:numId w:val="1008"/>
         </w:numPr>
       </w:pPr>
       <w:r>
-        <w:t xml:space="preserve">Собрать небольшой корпус тюркского текста в арабской графике и зафиксировать его ограничения.</w:t>
+        <w:t xml:space="preserve">Построить синтетический набор пар «искажённый текст — эталонный текст» для задачи посткоррекции OCR.</w:t>
       </w:r>
     </w:p>
     <w:p>
@@ -1290,11 +983,11 @@
         <w:pStyle w:val="Compact"/>
         <w:numPr>
           <w:ilvl w:val="0"/>
-          <w:numId w:val="1015"/>
+          <w:numId w:val="1008"/>
         </w:numPr>
       </w:pPr>
       <w:r>
-        <w:t xml:space="preserve">Построить синтетический набор пар «искажённый текст — эталонный текст» для задачи посткоррекции OCR.</w:t>
+        <w:t xml:space="preserve">Выполнить разбиение данных на обучающую, валидационную и тестовую выборки без утечки исходных строк.</w:t>
       </w:r>
     </w:p>
     <w:p>
@@ -1302,11 +995,11 @@
         <w:pStyle w:val="Compact"/>
         <w:numPr>
           <w:ilvl w:val="0"/>
-          <w:numId w:val="1015"/>
+          <w:numId w:val="1008"/>
         </w:numPr>
       </w:pPr>
       <w:r>
-        <w:t xml:space="preserve">Выполнить разбиение данных на обучающую, валидационную и тестовую выборки без утечки исходных строк.</w:t>
+        <w:t xml:space="preserve">Реализовать и оценить базовые методы: вариант без исправления, нормализатор на правилах и символьный метод на основе ошибок обучающей выборки.</w:t>
       </w:r>
     </w:p>
     <w:p>
@@ -1314,11 +1007,11 @@
         <w:pStyle w:val="Compact"/>
         <w:numPr>
           <w:ilvl w:val="0"/>
-          <w:numId w:val="1015"/>
+          <w:numId w:val="1008"/>
         </w:numPr>
       </w:pPr>
       <w:r>
-        <w:t xml:space="preserve">Реализовать и оценить базовые методы: вариант без исправления, нормализатор на правилах и символьный метод на основе ошибок обучающей выборки.</w:t>
+        <w:t xml:space="preserve">Обучить ByT5-small для исправления OCR-подобных ошибок и сравнить варианты с разной длиной последовательности.</w:t>
       </w:r>
     </w:p>
     <w:p>
@@ -1326,11 +1019,11 @@
         <w:pStyle w:val="Compact"/>
         <w:numPr>
           <w:ilvl w:val="0"/>
-          <w:numId w:val="1015"/>
+          <w:numId w:val="1008"/>
         </w:numPr>
       </w:pPr>
       <w:r>
-        <w:t xml:space="preserve">Обучить ByT5-small для исправления OCR-подобных ошибок и сравнить варианты с разной длиной последовательности.</w:t>
+        <w:t xml:space="preserve">Оценить методы с помощью CER, WER, NoSpaceCER и ExactMatch, а также провести разбор улучшенных и ухудшенных примеров.</w:t>
       </w:r>
     </w:p>
     <w:p>
@@ -1338,11 +1031,55 @@
         <w:pStyle w:val="Compact"/>
         <w:numPr>
           <w:ilvl w:val="0"/>
-          <w:numId w:val="1015"/>
+          <w:numId w:val="1008"/>
         </w:numPr>
       </w:pPr>
       <w:r>
-        <w:t xml:space="preserve">Оценить методы с помощью CER, WER, NoSpaceCER и ExactMatch, а также провести разбор улучшенных и ухудшенных примеров.</w:t>
+        <w:t xml:space="preserve">Проверить перенос на реальный OCR-вывод Tesseract и сформулировать ограничения синтетического обучения.</w:t>
+      </w:r>
+    </w:p>
+    <w:bookmarkEnd w:id="408"/>
+    <w:bookmarkStart w:id="409" w:name="объект-и-предмет-исследования"/>
+    <w:p>
+      <w:pPr>
+        <w:pStyle w:val="Heading2"/>
+      </w:pPr>
+      <w:r>
+        <w:t xml:space="preserve">1.5 Объект и предмет исследования</w:t>
+      </w:r>
+    </w:p>
+    <w:p>
+      <w:pPr>
+        <w:pStyle w:val="FirstParagraph"/>
+      </w:pPr>
+      <w:r>
+        <w:t xml:space="preserve">Объект исследования составляют исторические тюркские тексты в арабской графике.</w:t>
+      </w:r>
+    </w:p>
+    <w:p>
+      <w:pPr>
+        <w:pStyle w:val="BodyText"/>
+      </w:pPr>
+      <w:r>
+        <w:t xml:space="preserve">Предмет исследования составляют методы посткоррекции OCR-подобных ошибок в таких текстах: правила, символьные замены и нейросетевая модель ByT5-small.</w:t>
+      </w:r>
+    </w:p>
+    <w:bookmarkEnd w:id="409"/>
+    <w:bookmarkStart w:id="410" w:name="исследовательские-вопросы"/>
+    <w:p>
+      <w:pPr>
+        <w:pStyle w:val="Heading2"/>
+      </w:pPr>
+      <w:r>
+        <w:t xml:space="preserve">1.6 Исследовательские вопросы</w:t>
+      </w:r>
+    </w:p>
+    <w:p>
+      <w:pPr>
+        <w:pStyle w:val="FirstParagraph"/>
+      </w:pPr>
+      <w:r>
+        <w:t xml:space="preserve">В работе рассматриваются следующие исследовательские вопросы:</w:t>
       </w:r>
     </w:p>
     <w:p>
@@ -1350,55 +1087,11 @@
         <w:pStyle w:val="Compact"/>
         <w:numPr>
           <w:ilvl w:val="0"/>
-          <w:numId w:val="1015"/>
+          <w:numId w:val="1009"/>
         </w:numPr>
       </w:pPr>
       <w:r>
-        <w:t xml:space="preserve">Проверить перенос на реальный OCR-вывод Tesseract и сформулировать ограничения синтетического обучения.</w:t>
-      </w:r>
-    </w:p>
-    <w:bookmarkEnd w:id="329"/>
-    <w:bookmarkStart w:id="330" w:name="объект-и-предмет-исследования"/>
-    <w:p>
-      <w:pPr>
-        <w:pStyle w:val="Heading2"/>
-      </w:pPr>
-      <w:r>
-        <w:t xml:space="preserve">1.5 Объект и предмет исследования</w:t>
-      </w:r>
-    </w:p>
-    <w:p>
-      <w:pPr>
-        <w:pStyle w:val="FirstParagraph"/>
-      </w:pPr>
-      <w:r>
-        <w:t xml:space="preserve">Объект исследования составляют исторические тюркские тексты в арабской графике.</w:t>
-      </w:r>
-    </w:p>
-    <w:p>
-      <w:pPr>
-        <w:pStyle w:val="BodyText"/>
-      </w:pPr>
-      <w:r>
-        <w:t xml:space="preserve">Предмет исследования составляют методы посткоррекции OCR-подобных ошибок в таких текстах: правила, символьные замены и нейросетевая модель ByT5-small.</w:t>
-      </w:r>
-    </w:p>
-    <w:bookmarkEnd w:id="330"/>
-    <w:bookmarkStart w:id="331" w:name="исследовательские-вопросы"/>
-    <w:p>
-      <w:pPr>
-        <w:pStyle w:val="Heading2"/>
-      </w:pPr>
-      <w:r>
-        <w:t xml:space="preserve">1.6 Исследовательские вопросы</w:t>
-      </w:r>
-    </w:p>
-    <w:p>
-      <w:pPr>
-        <w:pStyle w:val="FirstParagraph"/>
-      </w:pPr>
-      <w:r>
-        <w:t xml:space="preserve">В работе рассматриваются следующие исследовательские вопросы:</w:t>
+        <w:t xml:space="preserve">Улучшает ли ByT5-small качество синтетически искажённого арабографичного тюркского текста по сравнению с базовым вариантом без исправления?</w:t>
       </w:r>
     </w:p>
     <w:p>
@@ -1406,11 +1099,11 @@
         <w:pStyle w:val="Compact"/>
         <w:numPr>
           <w:ilvl w:val="0"/>
-          <w:numId w:val="1016"/>
+          <w:numId w:val="1009"/>
         </w:numPr>
       </w:pPr>
       <w:r>
-        <w:t xml:space="preserve">Улучшает ли ByT5-small качество синтетически искажённого арабографичного тюркского текста по сравнению с базовым вариантом без исправления?</w:t>
+        <w:t xml:space="preserve">Достаточны ли простые правила и символьные замены для такой задачи?</w:t>
       </w:r>
     </w:p>
     <w:p>
@@ -1418,11 +1111,11 @@
         <w:pStyle w:val="Compact"/>
         <w:numPr>
           <w:ilvl w:val="0"/>
-          <w:numId w:val="1016"/>
+          <w:numId w:val="1009"/>
         </w:numPr>
       </w:pPr>
       <w:r>
-        <w:t xml:space="preserve">Достаточны ли простые правила и символьные замены для такой задачи?</w:t>
+        <w:t xml:space="preserve">Насколько заметен выигрыш модели по CER, WER и NoSpaceCER, и не связан ли он преимущественно с исправлением пробелов?</w:t>
       </w:r>
     </w:p>
     <w:p>
@@ -1430,11 +1123,11 @@
         <w:pStyle w:val="Compact"/>
         <w:numPr>
           <w:ilvl w:val="0"/>
-          <w:numId w:val="1016"/>
+          <w:numId w:val="1009"/>
         </w:numPr>
       </w:pPr>
       <w:r>
-        <w:t xml:space="preserve">Насколько заметен выигрыш модели по CER, WER и NoSpaceCER, и не связан ли он преимущественно с исправлением пробелов?</w:t>
+        <w:t xml:space="preserve">Как влияет максимальная длина последовательности на качество модели с байтовым представлением при работе с арабской графикой?</w:t>
       </w:r>
     </w:p>
     <w:p>
@@ -1442,27 +1135,15 @@
         <w:pStyle w:val="Compact"/>
         <w:numPr>
           <w:ilvl w:val="0"/>
-          <w:numId w:val="1016"/>
+          <w:numId w:val="1009"/>
         </w:numPr>
       </w:pPr>
       <w:r>
-        <w:t xml:space="preserve">Как влияет максимальная длина последовательности на качество модели с байтовым представлением при работе с арабской графикой?</w:t>
-      </w:r>
-    </w:p>
-    <w:p>
-      <w:pPr>
-        <w:pStyle w:val="Compact"/>
-        <w:numPr>
-          <w:ilvl w:val="0"/>
-          <w:numId w:val="1016"/>
-        </w:numPr>
-      </w:pPr>
-      <w:r>
         <w:t xml:space="preserve">Сохраняется ли выигрыш модели, обученной на синтетических ошибках, на реальном OCR-выводе Tesseract?</w:t>
       </w:r>
     </w:p>
-    <w:bookmarkEnd w:id="331"/>
-    <w:bookmarkStart w:id="332" w:name="гипотезы"/>
+    <w:bookmarkEnd w:id="410"/>
+    <w:bookmarkStart w:id="411" w:name="гипотезы"/>
     <w:p>
       <w:pPr>
         <w:pStyle w:val="Heading2"/>
@@ -1511,8 +1192,8 @@
         <w:t xml:space="preserve">Гипотеза 4. Модель, обученная только на синтетических OCR-подобных ошибках, не будет надёжно переноситься на реальный постраничный OCR без адаптации на настоящих парах «OCR-вывод — эталон».</w:t>
       </w:r>
     </w:p>
-    <w:bookmarkEnd w:id="332"/>
-    <w:bookmarkStart w:id="333" w:name="практическая-значимость"/>
+    <w:bookmarkEnd w:id="411"/>
+    <w:bookmarkStart w:id="412" w:name="практическая-значимость"/>
     <w:p>
       <w:pPr>
         <w:pStyle w:val="Heading2"/>
@@ -1537,8 +1218,8 @@
         <w:t xml:space="preserve">Практический смысл результата связан с цифровой гуманитаристикой. После появления реальных пар «OCR-вывод — эталон» этот контур можно применять для подготовки корпусов, поиска по историческим текстам, извлечения именованных сущностей и сопоставления архивных записей. Текущая версия честно фиксирует границу применимости: она показывает разрыв между синтетической и реальной оценкой, но не является готовым корректором для архивных сканов.</w:t>
       </w:r>
     </w:p>
-    <w:bookmarkEnd w:id="333"/>
-    <w:bookmarkStart w:id="334" w:name="структура-работы"/>
+    <w:bookmarkEnd w:id="412"/>
+    <w:bookmarkStart w:id="413" w:name="структура-работы"/>
     <w:p>
       <w:pPr>
         <w:pStyle w:val="Heading2"/>
@@ -1555,8 +1236,8 @@
         <w:t xml:space="preserve">Логика работы следующая: сначала рассматриваются трудности OCR исторических документов и арабографичного письма, затем описываются корпус и синтетические ошибки, после этого сравниваются базовые методы и ByT5-small, а в конце отдельно проверяется перенос на реальный OCR-вывод Tesseract.</w:t>
       </w:r>
     </w:p>
-    <w:bookmarkEnd w:id="334"/>
-    <w:bookmarkStart w:id="343" w:name="X0ceba565ddc4689162e5800a39ee266fa2dc29a"/>
+    <w:bookmarkEnd w:id="413"/>
+    <w:bookmarkStart w:id="422" w:name="X0ceba565ddc4689162e5800a39ee266fa2dc29a"/>
     <w:p>
       <w:pPr>
         <w:pStyle w:val="Heading2"/>
@@ -1565,7 +1246,7 @@
         <w:t xml:space="preserve">2. Обзор предметной области и связанных работ</w:t>
       </w:r>
     </w:p>
-    <w:bookmarkStart w:id="335" w:name="X180942b9a24eaba8abfe1c56a0263be0843d255"/>
+    <w:bookmarkStart w:id="414" w:name="X180942b9a24eaba8abfe1c56a0263be0843d255"/>
     <w:p>
       <w:pPr>
         <w:pStyle w:val="Heading3"/>
@@ -1598,8 +1279,8 @@
         <w:t xml:space="preserve">Современные OCR-модели также всё чаще строятся на трансформерных подходах. Например, TrOCR использует предобученные компоненты визуального и текстового трансформеров и показывает, что сама OCR-модель может выигрывать от предобучения и дообучения на размеченных данных (Li et al., 2021). Однако это направление относится к распознаванию изображения, тогда как настоящая работа ограничена текстовой посткоррекцией. Такое ограничение сужает эксперимент, зато позволяет проверить отдельный вопрос: может ли модель исправлять уже полученный OCR-вывод без смешения этого результата с качеством сегментации и распознавания изображения.</w:t>
       </w:r>
     </w:p>
-    <w:bookmarkEnd w:id="335"/>
-    <w:bookmarkStart w:id="336" w:name="специфика-арабографичного-ocr"/>
+    <w:bookmarkEnd w:id="414"/>
+    <w:bookmarkStart w:id="415" w:name="специфика-арабографичного-ocr"/>
     <w:p>
       <w:pPr>
         <w:pStyle w:val="Heading3"/>
@@ -1640,8 +1321,8 @@
         <w:t xml:space="preserve">Именно здесь возникает разрыв между синтетической и реальной проверкой. В синтетической постановке можно контролировать типы искажений и разбиение на обучающую и тестовую выборки. В реальном OCR появляются дополнительные факторы: структура страницы, шрифт, качество изображения, сегментация строк, направление письма и особенности конкретной OCR-системы. Поэтому результаты на синтетическом наборе нельзя автоматически переносить на настоящий OCR-вывод.</w:t>
       </w:r>
     </w:p>
-    <w:bookmarkEnd w:id="336"/>
-    <w:bookmarkStart w:id="337" w:name="X870e54edfb9df569aa2599064af567ed17246c1"/>
+    <w:bookmarkEnd w:id="415"/>
+    <w:bookmarkStart w:id="416" w:name="X870e54edfb9df569aa2599064af567ed17246c1"/>
     <w:p>
       <w:pPr>
         <w:pStyle w:val="Heading3"/>
@@ -1674,8 +1355,8 @@
         <w:t xml:space="preserve">С точки зрения обработки естественного языка такие материалы относятся к низкоресурсным историческим данным. Для них меньше размеченных корпусов, стандартных бенчмарков, готовых моделей и инструментов, чем для современных массовых языков. Современные работы по обработке исторического турецкого языка подчёркивают необходимость создавать базовые ресурсы: корпуса, модели, разметку и инструменты для анализа исторических текстов (Özateş et al., 2025). Настоящая работа занимает в этой цепочке более узкое место: она не строит полный корпус, а проверяет протокол посткоррекции.</w:t>
       </w:r>
     </w:p>
-    <w:bookmarkEnd w:id="337"/>
-    <w:bookmarkStart w:id="338" w:name="Xfcaf842918234d7c399beca909495522023c2d4"/>
+    <w:bookmarkEnd w:id="416"/>
+    <w:bookmarkStart w:id="417" w:name="Xfcaf842918234d7c399beca909495522023c2d4"/>
     <w:p>
       <w:pPr>
         <w:pStyle w:val="Heading3"/>
@@ -1724,8 +1405,8 @@
         <w:t xml:space="preserve">Отдельная современная линия исследований связана с использованием больших языковых моделей для коррекции OCR. Kanerva et al. (2025) показывают, что посткоррекция на основе больших языковых моделей для исторических документов не даёт универсального выигрыша: эффект зависит от языка, данных и постановки. Этот вывод важен для интерпретации настоящего эксперимента. Смешанный перенос модели, обученной на синтетических искажениях, на реальный OCR отражает известную проблему посткоррекции: качество зависит от домена, языка, структуры ошибок и объёма размеченных пар «OCR-вывод — эталон».</w:t>
       </w:r>
     </w:p>
-    <w:bookmarkEnd w:id="338"/>
-    <w:bookmarkStart w:id="339" w:name="Xaa6a63b69f8f8f9084dc16d50d48dc0403f5611"/>
+    <w:bookmarkEnd w:id="417"/>
+    <w:bookmarkStart w:id="418" w:name="Xaa6a63b69f8f8f9084dc16d50d48dc0403f5611"/>
     <w:p>
       <w:pPr>
         <w:pStyle w:val="Heading3"/>
@@ -1774,8 +1455,8 @@
         <w:t xml:space="preserve">Следовательно, синтетический набор в этой работе — это диагностический стенд, а не финальный бенчмарк. Он нужен, чтобы увидеть, превосходит ли ByT5-small простые базовые методы в контролируемой среде. Постраничная проверка на Tesseract затем показывает границу этого стенда: для практического применения нужно строить ошибки не только по заранее заданным правилам, но и по реальным OCR-выводам и эмпирическим путаницам арабографичных графем.</w:t>
       </w:r>
     </w:p>
-    <w:bookmarkEnd w:id="339"/>
-    <w:bookmarkStart w:id="340" w:name="X15509693a0d7b6f8fe53cddac6f871c0636dbad"/>
+    <w:bookmarkEnd w:id="418"/>
+    <w:bookmarkStart w:id="419" w:name="X15509693a0d7b6f8fe53cddac6f871c0636dbad"/>
     <w:p>
       <w:pPr>
         <w:pStyle w:val="Heading3"/>
@@ -1808,8 +1489,8 @@
         <w:t xml:space="preserve">Тем не менее модель с байтовым представлением не решает проблему доменного переноса автоматически. Если модель обучена только на синтетическом шуме, она учится распределению ошибок этого генератора. Реальный OCR-вывод может иметь другую структуру: пропуски, артефакты разметки страницы, ошибки чтения строк, необычные пробелы, неверные формы букв или последовательные искажения. Поэтому ByT5 в этой работе рассматривается как сильная нейросетевая точка сравнения для посткоррекции, но не как готовое универсальное решение.</w:t>
       </w:r>
     </w:p>
-    <w:bookmarkEnd w:id="340"/>
-    <w:bookmarkStart w:id="341" w:name="X4e2987dd6a0ff1eb2f6c8914cca3c5fd2dc83ae"/>
+    <w:bookmarkEnd w:id="419"/>
+    <w:bookmarkStart w:id="420" w:name="X4e2987dd6a0ff1eb2f6c8914cca3c5fd2dc83ae"/>
     <w:p>
       <w:pPr>
         <w:pStyle w:val="Heading3"/>
@@ -1850,8 +1531,8 @@
         <w:t xml:space="preserve">Для дальнейшего исследования наиболее важен именно этот отрицательный результат. На синтетическом наборе модель улучшает метрики относительно базовых методов, но при переходе к реальному OCR эффект становится нестабильным. Это задаёт следующую задачу магистерской работы: собрать выровненные пары «OCR-вывод — эталон», разнести страницы по выборкам без утечки и обучать посткоррекцию уже на настоящих ошибках распознавания.</w:t>
       </w:r>
     </w:p>
-    <w:bookmarkEnd w:id="341"/>
-    <w:bookmarkStart w:id="342" w:name="выводы-и-результаты-по-главе"/>
+    <w:bookmarkEnd w:id="420"/>
+    <w:bookmarkStart w:id="421" w:name="выводы-и-результаты-по-главе"/>
     <w:p>
       <w:pPr>
         <w:pStyle w:val="Heading3"/>
@@ -1876,9 +1557,9 @@
         <w:t xml:space="preserve">Для данной работы особенно важен вывод о границе синтетического подхода. Синтетические пары позволяют построить воспроизводимый проверочный стенд, но не гарантируют устойчивый перенос на настоящий OCR. Поэтому дальнейшие главы разделяют контролируемую проверку на синтетических ошибках и отдельную проверку на реальном OCR-выводе Tesseract.</w:t>
       </w:r>
     </w:p>
-    <w:bookmarkEnd w:id="342"/>
-    <w:bookmarkEnd w:id="343"/>
-    <w:bookmarkStart w:id="360" w:name="данные-и-построение-корпуса"/>
+    <w:bookmarkEnd w:id="421"/>
+    <w:bookmarkEnd w:id="422"/>
+    <w:bookmarkStart w:id="439" w:name="данные-и-построение-корпуса"/>
     <w:p>
       <w:pPr>
         <w:pStyle w:val="Heading2"/>
@@ -1887,7 +1568,7 @@
         <w:t xml:space="preserve">3. Данные и построение корпуса</w:t>
       </w:r>
     </w:p>
-    <w:bookmarkStart w:id="344" w:name="общая-постановка"/>
+    <w:bookmarkStart w:id="423" w:name="общая-постановка"/>
     <w:p>
       <w:pPr>
         <w:pStyle w:val="Heading3"/>
@@ -1920,8 +1601,8 @@
         <w:t xml:space="preserve">Важно, что эта постановка сознательно отделяет задачу посткоррекции от задачи распознавания изображения. В эксперименте не оценивается качество сегментации страниц или OCR/HTR-модели; оценивается только способность метода исправлять уже полученный текстовый вывод.</w:t>
       </w:r>
     </w:p>
-    <w:bookmarkEnd w:id="344"/>
-    <w:bookmarkStart w:id="345" w:name="источник-данных"/>
+    <w:bookmarkEnd w:id="423"/>
+    <w:bookmarkStart w:id="424" w:name="источник-данных"/>
     <w:p>
       <w:pPr>
         <w:pStyle w:val="Heading3"/>
@@ -1978,8 +1659,8 @@
         <w:t xml:space="preserve">Источник выбран не как случайный арабографичный текст, а как материал, близкий к теме работы: он относится к историческим тюркским текстам, записанным арабской графикой. В источнике встречаются формы, характерные для османско-тюркского текста в арабской графике; отдельные примеры таких форм приведены ниже в таблицах с синтетическими примерами и примерами реального OCR. Поэтому корпус лучше соответствует теме курсовой, чем более ранний технический прототип на персидском или общеарабографичном материале.</w:t>
       </w:r>
     </w:p>
-    <w:bookmarkEnd w:id="345"/>
-    <w:bookmarkStart w:id="346" w:name="сбор-и-предварительная-подготовка"/>
+    <w:bookmarkEnd w:id="424"/>
+    <w:bookmarkStart w:id="425" w:name="сбор-и-предварительная-подготовка"/>
     <w:p>
       <w:pPr>
         <w:pStyle w:val="Heading3"/>
@@ -2024,8 +1705,8 @@
         <w:t xml:space="preserve">Поэтому нормализация вынесена в отдельный базовый метод. Корпус хранится в максимально щадящем виде, а нормализатор на правилах оценивается экспериментально наравне с методом без исправления и нейросетевой моделью.</w:t>
       </w:r>
     </w:p>
-    <w:bookmarkEnd w:id="346"/>
-    <w:bookmarkStart w:id="347" w:name="синтетические-ocr-подобные-искажения"/>
+    <w:bookmarkEnd w:id="425"/>
+    <w:bookmarkStart w:id="426" w:name="синтетические-ocr-подобные-искажения"/>
     <w:p>
       <w:pPr>
         <w:pStyle w:val="Heading3"/>
@@ -2082,8 +1763,8 @@
         <w:t xml:space="preserve">.</w:t>
       </w:r>
     </w:p>
-    <w:bookmarkEnd w:id="347"/>
-    <w:bookmarkStart w:id="348" w:name="типы-синтетических-искажений"/>
+    <w:bookmarkEnd w:id="426"/>
+    <w:bookmarkStart w:id="427" w:name="типы-синтетических-искажений"/>
     <w:p>
       <w:pPr>
         <w:pStyle w:val="Heading3"/>
@@ -2346,8 +2027,8 @@
         <w:t xml:space="preserve">Ошибки пробелов влияют на WER сильнее, чем на CER. Поэтому заметное снижение WER у модели не следует автоматически трактовать как доказательство такого же качества на реальном OCR. В текущей постановке это прежде всего показывает способность модели исправлять контролируемые искажения границ слов в синтетическом наборе.</w:t>
       </w:r>
     </w:p>
-    <w:bookmarkEnd w:id="348"/>
-    <w:bookmarkStart w:id="349" w:name="Xe2e6ef423b4b11ea7446063a790a29ab69053e4"/>
+    <w:bookmarkEnd w:id="427"/>
+    <w:bookmarkStart w:id="428" w:name="Xe2e6ef423b4b11ea7446063a790a29ab69053e4"/>
     <w:p>
       <w:pPr>
         <w:pStyle w:val="Heading3"/>
@@ -2598,8 +2279,8 @@
         <w:t xml:space="preserve">Эти значения показывают, что шум не сводится к набору замен символов: почти половина искажённых строк короче эталонных, примерно треть длиннее, а среднее изменение числа слов положительно. Это согласуется с наличием вставок, удалений и ошибок пробелов. Одновременно такая статистика подчёркивает ограничение эксперимента: генератор задаёт искусственное распределение ошибок, которое может отличаться от реальных OCR/HTR-выходов.</w:t>
       </w:r>
     </w:p>
-    <w:bookmarkEnd w:id="349"/>
-    <w:bookmarkStart w:id="353" w:name="примеры-пар-искажённая-строка-эталон"/>
+    <w:bookmarkEnd w:id="428"/>
+    <w:bookmarkStart w:id="432" w:name="примеры-пар-искажённая-строка-эталон"/>
     <w:p>
       <w:pPr>
         <w:pStyle w:val="Heading3"/>
@@ -2617,18 +2298,18 @@
           <wp:inline>
             <wp:extent cx="5334000" cy="2489200"/>
             <wp:effectExtent b="0" l="0" r="0" t="0"/>
-            <wp:docPr descr="Рисунок 3.1 — Пример синтетического OCR-подобного искажения" title="" id="351" name="Picture"/>
+            <wp:docPr descr="Рисунок 3.1 — Пример синтетического OCR-подобного искажения" title="" id="430" name="Picture"/>
             <a:graphic>
               <a:graphicData uri="http://schemas.openxmlformats.org/drawingml/2006/picture">
                 <pic:pic>
                   <pic:nvPicPr>
-                    <pic:cNvPr descr="figures/fig03_synthetic_example.png" id="352" name="Picture"/>
+                    <pic:cNvPr descr="figures/fig03_synthetic_example.png" id="431" name="Picture"/>
                     <pic:cNvPicPr>
                       <a:picLocks noChangeArrowheads="1" noChangeAspect="1"/>
                     </pic:cNvPicPr>
                   </pic:nvPicPr>
                   <pic:blipFill>
-                    <a:blip r:embed="rId350"/>
+                    <a:blip r:embed="rId429"/>
                     <a:stretch>
                       <a:fillRect/>
                     </a:stretch>
@@ -2967,8 +2648,8 @@
         <w:t xml:space="preserve">. Эти примеры выглядят как OCR-подобные текстовые искажения, но не доказывают соответствие реальному OCR. Для внешней валидности нужна отдельная подвыборка реального OCR/HTR-вывода с ручной проверкой эталонного текста.</w:t>
       </w:r>
     </w:p>
-    <w:bookmarkEnd w:id="353"/>
-    <w:bookmarkStart w:id="354" w:name="ограничения-синтетического-шума"/>
+    <w:bookmarkEnd w:id="432"/>
+    <w:bookmarkStart w:id="433" w:name="ограничения-синтетического-шума"/>
     <w:p>
       <w:pPr>
         <w:pStyle w:val="Heading3"/>
@@ -2993,8 +2674,8 @@
         <w:t xml:space="preserve">Поэтому синтетический набор следует понимать как проверочный стенд, а не как замену реального OCR. Он показывает, что код, разбиение, метрики и сравнение методов работают воспроизводимо. Но постраничная проверка на Tesseract даёт более жёсткий результат: без адаптации на настоящих OCR-ошибках модель иногда снижает WER, но может ухудшать символный состав текста.</w:t>
       </w:r>
     </w:p>
-    <w:bookmarkEnd w:id="354"/>
-    <w:bookmarkStart w:id="355" w:name="структура-набора-данных"/>
+    <w:bookmarkEnd w:id="433"/>
+    <w:bookmarkStart w:id="434" w:name="структура-набора-данных"/>
     <w:p>
       <w:pPr>
         <w:pStyle w:val="Heading3"/>
@@ -3198,8 +2879,8 @@
         <w:t xml:space="preserve">.</w:t>
       </w:r>
     </w:p>
-    <w:bookmarkEnd w:id="355"/>
-    <w:bookmarkStart w:id="356" w:name="Xd08570dcee77ed6951cf64ca8f19d56e666eec0"/>
+    <w:bookmarkEnd w:id="434"/>
+    <w:bookmarkStart w:id="435" w:name="Xd08570dcee77ed6951cf64ca8f19d56e666eec0"/>
     <w:p>
       <w:pPr>
         <w:pStyle w:val="Heading3"/>
@@ -3407,8 +3088,8 @@
         <w:t xml:space="preserve">Такой размер достаточен для пилотной проверки контура посткоррекции: он мал для финального бенчмарка, но позволяет сравнить базовые методы и нейросетевую модель в воспроизводимых условиях.</w:t>
       </w:r>
     </w:p>
-    <w:bookmarkEnd w:id="356"/>
-    <w:bookmarkStart w:id="357" w:name="контроль-утечки-данных"/>
+    <w:bookmarkEnd w:id="435"/>
+    <w:bookmarkStart w:id="436" w:name="контроль-утечки-данных"/>
     <w:p>
       <w:pPr>
         <w:pStyle w:val="Heading3"/>
@@ -3575,8 +3256,8 @@
         <w:t xml:space="preserve">Тестовая выборка не содержит исходных строк, которые встречались в обучении или валидации. Это делает оценку более строгой: модель проверяется на новых исходных строках, а не на новых зашумлённых вариациях уже знакомых строк.</w:t>
       </w:r>
     </w:p>
-    <w:bookmarkEnd w:id="357"/>
-    <w:bookmarkStart w:id="358" w:name="ограничения-корпуса"/>
+    <w:bookmarkEnd w:id="436"/>
+    <w:bookmarkStart w:id="437" w:name="ограничения-корпуса"/>
     <w:p>
       <w:pPr>
         <w:pStyle w:val="Heading3"/>
@@ -3625,8 +3306,8 @@
         <w:t xml:space="preserve">Четвёртое ограничение связано с отсутствием ручной лингвистической проверки исправлений. Метрики CER и WER показывают формальную близость к эталону, но не всегда отражают историко-орфографическую допустимость исправления. Для следующего этапа нужна небольшая вручную проверенная подвыборка с качественным анализом ошибок.</w:t>
       </w:r>
     </w:p>
-    <w:bookmarkEnd w:id="358"/>
-    <w:bookmarkStart w:id="359" w:name="выводы-и-результаты-по-главе-1"/>
+    <w:bookmarkEnd w:id="437"/>
+    <w:bookmarkStart w:id="438" w:name="выводы-и-результаты-по-главе-1"/>
     <w:p>
       <w:pPr>
         <w:pStyle w:val="Heading3"/>
@@ -3651,9 +3332,9 @@
         <w:t xml:space="preserve">Роль корпуса ограничена, но ясна: он даёт одинаковые условия для сравнения метода без исправления, нормализатора на правилах, символьного метода на основе ошибок обучающей выборки и ByT5-small. Следующая версия должна добавить реальные OCR/HTR-выводы, ручную проверку и более разнообразные татарские, башкирские и другие тюркские источники в арабской графике.</w:t>
       </w:r>
     </w:p>
-    <w:bookmarkEnd w:id="359"/>
-    <w:bookmarkEnd w:id="360"/>
-    <w:bookmarkStart w:id="374" w:name="методология-эксперимента"/>
+    <w:bookmarkEnd w:id="438"/>
+    <w:bookmarkEnd w:id="439"/>
+    <w:bookmarkStart w:id="453" w:name="методология-эксперимента"/>
     <w:p>
       <w:pPr>
         <w:pStyle w:val="Heading2"/>
@@ -3662,7 +3343,7 @@
         <w:t xml:space="preserve">4. Методология эксперимента</w:t>
       </w:r>
     </w:p>
-    <w:bookmarkStart w:id="364" w:name="общая-схема-эксперимента"/>
+    <w:bookmarkStart w:id="443" w:name="общая-схема-эксперимента"/>
     <w:p>
       <w:pPr>
         <w:pStyle w:val="Heading3"/>
@@ -3727,18 +3408,18 @@
           <wp:inline>
             <wp:extent cx="5334000" cy="1666875"/>
             <wp:effectExtent b="0" l="0" r="0" t="0"/>
-            <wp:docPr descr="Рисунок 4.1 — Общая схема протокола OCR-посткоррекции" title="" id="362" name="Picture"/>
+            <wp:docPr descr="Рисунок 4.1 — Общая схема протокола OCR-посткоррекции" title="" id="441" name="Picture"/>
             <a:graphic>
               <a:graphicData uri="http://schemas.openxmlformats.org/drawingml/2006/picture">
                 <pic:pic>
                   <pic:nvPicPr>
-                    <pic:cNvPr descr="figures/fig01_postcorrection_process.png" id="363" name="Picture"/>
+                    <pic:cNvPr descr="figures/fig01_postcorrection_process.png" id="442" name="Picture"/>
                     <pic:cNvPicPr>
                       <a:picLocks noChangeArrowheads="1" noChangeAspect="1"/>
                     </pic:cNvPicPr>
                   </pic:nvPicPr>
                   <pic:blipFill>
-                    <a:blip r:embed="rId361"/>
+                    <a:blip r:embed="rId440"/>
                     <a:stretch>
                       <a:fillRect/>
                     </a:stretch>
@@ -3797,8 +3478,8 @@
         <w:t xml:space="preserve">Главный вопрос эксперимента — улучшает ли нейросетевая модель посткоррекции качество текста по сравнению с неизменённым зашумлённым вводом. Дополнительный вопрос — помогает ли простая нормализация на правилах именно для исторического тюркского материала в арабской графике или, наоборот, ухудшает текст.</w:t>
       </w:r>
     </w:p>
-    <w:bookmarkEnd w:id="364"/>
-    <w:bookmarkStart w:id="365" w:name="базовые-методы"/>
+    <w:bookmarkEnd w:id="443"/>
+    <w:bookmarkStart w:id="444" w:name="базовые-методы"/>
     <w:p>
       <w:pPr>
         <w:pStyle w:val="Heading3"/>
@@ -3847,8 +3528,8 @@
         <w:t xml:space="preserve">Такой набор базовых методов позволяет разделить несколько эффектов. Метод без исправления показывает исходную сложность задачи. Нормализатор проверяет безопасность ручных правил. Символьный метод показывает, насколько далеко можно продвинуться без контекстной нейросетевой модели. На этом фоне результат ByT5-small интерпретируется осторожнее: улучшение должно быть не просто численным, а устойчивым относительно простых альтернатив.</w:t>
       </w:r>
     </w:p>
-    <w:bookmarkEnd w:id="365"/>
-    <w:bookmarkStart w:id="366" w:name="X922718734d9410424975b4d665e2323c01d8043"/>
+    <w:bookmarkEnd w:id="444"/>
+    <w:bookmarkStart w:id="445" w:name="X922718734d9410424975b4d665e2323c01d8043"/>
     <w:p>
       <w:pPr>
         <w:pStyle w:val="Heading3"/>
@@ -3873,8 +3554,8 @@
         <w:t xml:space="preserve">Его диагностическая роль состоит в проверке вопроса: достаточно ли простых символьных соответствий, извлечённых из корпуса, или нужен контекстный подход на основе преобразования последовательностей. Если такой метод приблизился бы к ByT5, это означало бы, что задача в основном сводится к локальным заменам символов. Если же ByT5 заметно превосходит его, это указывает на важность контекста, восстановления структуры слов и более сложного моделирования строки.</w:t>
       </w:r>
     </w:p>
-    <w:bookmarkEnd w:id="366"/>
-    <w:bookmarkStart w:id="367" w:name="нейросетевая-модель-byt5-small"/>
+    <w:bookmarkEnd w:id="445"/>
+    <w:bookmarkStart w:id="446" w:name="нейросетевая-модель-byt5-small"/>
     <w:p>
       <w:pPr>
         <w:pStyle w:val="Heading3"/>
@@ -3919,8 +3600,8 @@
         <w:t xml:space="preserve">Практическое следствие байтового представления состоит в том, что длина последовательности в токенах может быстро расти: один видимый символ арабской графики занимает несколько байтов. Поэтому в эксперименте отдельно контролируется максимальная длина входной и целевой последовательности.</w:t>
       </w:r>
     </w:p>
-    <w:bookmarkEnd w:id="367"/>
-    <w:bookmarkStart w:id="368" w:name="проверенные-конфигурации"/>
+    <w:bookmarkEnd w:id="446"/>
+    <w:bookmarkStart w:id="447" w:name="проверенные-конфигурации"/>
     <w:p>
       <w:pPr>
         <w:pStyle w:val="Heading3"/>
@@ -4128,8 +3809,8 @@
         <w:t xml:space="preserve">Для итогового анализа выбрана конфигурация 512. Она уменьшает риск обрезания строк и используется как основная нейросетевая конфигурация в сравнении с методом без исправления, нормализатором на правилах и символьным методом на основе ошибок обучающей выборки. Вывод о преимуществе 512 в данной работе относится к пилотному набору данных и должен быть дополнительно проверен на более широком корпусе.</w:t>
       </w:r>
     </w:p>
-    <w:bookmarkEnd w:id="368"/>
-    <w:bookmarkStart w:id="369" w:name="метрики-качества"/>
+    <w:bookmarkEnd w:id="447"/>
+    <w:bookmarkStart w:id="448" w:name="метрики-качества"/>
     <w:p>
       <w:pPr>
         <w:pStyle w:val="Heading3"/>
@@ -4185,8 +3866,8 @@
         <w:t xml:space="preserve">ExactMatch показывает долю строк, полностью совпавших с эталоном. Для длинных исторических строк эта метрика очень строгая: один неверный символ уже делает пример несовпадающим. Поэтому ExactMatch используется как дополнительный строгий индикатор, а основные выводы строятся по CER, WER, NoSpaceCER и анализу ошибок.</w:t>
       </w:r>
     </w:p>
-    <w:bookmarkEnd w:id="369"/>
-    <w:bookmarkStart w:id="370" w:name="процедура-оценки"/>
+    <w:bookmarkEnd w:id="448"/>
+    <w:bookmarkStart w:id="449" w:name="процедура-оценки"/>
     <w:p>
       <w:pPr>
         <w:pStyle w:val="Heading3"/>
@@ -4231,8 +3912,8 @@
         <w:t xml:space="preserve">.</w:t>
       </w:r>
     </w:p>
-    <w:bookmarkEnd w:id="370"/>
-    <w:bookmarkStart w:id="371" w:name="анализ-ошибок"/>
+    <w:bookmarkEnd w:id="449"/>
+    <w:bookmarkStart w:id="450" w:name="анализ-ошибок"/>
     <w:p>
       <w:pPr>
         <w:pStyle w:val="Heading3"/>
@@ -4277,8 +3958,8 @@
         <w:t xml:space="preserve">; он используется не вместо метрик, а как дополнительная проверка того, насколько численный выигрыш выглядит надёжным на уровне конкретных строк.</w:t>
       </w:r>
     </w:p>
-    <w:bookmarkEnd w:id="371"/>
-    <w:bookmarkStart w:id="372" w:name="воспроизводимость"/>
+    <w:bookmarkEnd w:id="450"/>
+    <w:bookmarkStart w:id="451" w:name="воспроизводимость"/>
     <w:p>
       <w:pPr>
         <w:pStyle w:val="Heading3"/>
@@ -4311,8 +3992,8 @@
         <w:t xml:space="preserve">Воспроизводимость текущего эксперимента не означает полноту контрольного набора. Она означает, что все ключевые решения пилотного протокола явно зафиксированы: источник, генератор шума, разбиение данных, базовые методы, модель, метрики и анализ ошибок.</w:t>
       </w:r>
     </w:p>
-    <w:bookmarkEnd w:id="372"/>
-    <w:bookmarkStart w:id="373" w:name="выводы-и-результаты-по-главе-2"/>
+    <w:bookmarkEnd w:id="451"/>
+    <w:bookmarkStart w:id="452" w:name="выводы-и-результаты-по-главе-2"/>
     <w:p>
       <w:pPr>
         <w:pStyle w:val="Heading3"/>
@@ -4345,9 +4026,9 @@
         <w:t xml:space="preserve">Эта методология задаёт основу для раздела 5, где сравниваются базовые методы, символьный метод на основе ошибок обучающей выборки, финальная конфигурация ByT5-small и результаты анализа ошибок.</w:t>
       </w:r>
     </w:p>
-    <w:bookmarkEnd w:id="373"/>
-    <w:bookmarkEnd w:id="374"/>
-    <w:bookmarkStart w:id="399" w:name="результаты-экспериментов-и-анализ-ошибок"/>
+    <w:bookmarkEnd w:id="452"/>
+    <w:bookmarkEnd w:id="453"/>
+    <w:bookmarkStart w:id="478" w:name="результаты-экспериментов-и-анализ-ошибок"/>
     <w:p>
       <w:pPr>
         <w:pStyle w:val="Heading2"/>
@@ -4356,7 +4037,7 @@
         <w:t xml:space="preserve">5. Результаты экспериментов и анализ ошибок</w:t>
       </w:r>
     </w:p>
-    <w:bookmarkStart w:id="375" w:name="общая-логика-оценки"/>
+    <w:bookmarkStart w:id="454" w:name="общая-логика-оценки"/>
     <w:p>
       <w:pPr>
         <w:pStyle w:val="Heading3"/>
@@ -4389,8 +4070,8 @@
         <w:t xml:space="preserve">В этом разделе важны не только лучшие итоговые метрики ByT5-small среди рассмотренных методов. Не менее важны ограничивающие результаты: нормализатор на правилах ухудшает качество относительно метода без исправления, символьный метод даёт лишь умеренное улучшение CER, а заметное снижение WER у ByT5 требует осторожной интерпретации из-за синтетических ошибок пробелов и границ слов.</w:t>
       </w:r>
     </w:p>
-    <w:bookmarkEnd w:id="375"/>
-    <w:bookmarkStart w:id="379" w:name="итоговые-метрики"/>
+    <w:bookmarkEnd w:id="454"/>
+    <w:bookmarkStart w:id="458" w:name="итоговые-метрики"/>
     <w:p>
       <w:pPr>
         <w:pStyle w:val="Heading3"/>
@@ -4765,18 +4446,18 @@
           <wp:inline>
             <wp:extent cx="5334000" cy="2812472"/>
             <wp:effectExtent b="0" l="0" r="0" t="0"/>
-            <wp:docPr descr="Рисунок 5.1 — Сравнение методов на синтетическом тестовом наборе" title="" id="377" name="Picture"/>
+            <wp:docPr descr="Рисунок 5.1 — Сравнение методов на синтетическом тестовом наборе" title="" id="456" name="Picture"/>
             <a:graphic>
               <a:graphicData uri="http://schemas.openxmlformats.org/drawingml/2006/picture">
                 <pic:pic>
                   <pic:nvPicPr>
-                    <pic:cNvPr descr="figures/fig02_synthetic_metrics.png" id="378" name="Picture"/>
+                    <pic:cNvPr descr="figures/fig02_synthetic_metrics.png" id="457" name="Picture"/>
                     <pic:cNvPicPr>
                       <a:picLocks noChangeArrowheads="1" noChangeAspect="1"/>
                     </pic:cNvPicPr>
                   </pic:nvPicPr>
                   <pic:blipFill>
-                    <a:blip r:embed="rId376"/>
+                    <a:blip r:embed="rId455"/>
                     <a:stretch>
                       <a:fillRect/>
                     </a:stretch>
@@ -4851,8 +4532,8 @@
         <w:t xml:space="preserve">ExactMatch остаётся низким у всех методов. Это ожидаемо для длинных строк и строгого посимвольного сравнения: даже одна ошибка делает строку несовпадающей с эталоном. Поэтому ExactMatch используется как дополнительный строгий индикатор, а основные выводы строятся по CER, WER, NoSpaceCER и анализу ошибок.</w:t>
       </w:r>
     </w:p>
-    <w:bookmarkEnd w:id="379"/>
-    <w:bookmarkStart w:id="380" w:name="сравнение-с-методом-без-исправления"/>
+    <w:bookmarkEnd w:id="458"/>
+    <w:bookmarkStart w:id="459" w:name="сравнение-с-методом-без-исправления"/>
     <w:p>
       <w:pPr>
         <w:pStyle w:val="Heading3"/>
@@ -4885,8 +4566,8 @@
         <w:t xml:space="preserve">Я трактую этот результат как положительный сигнал для пилотного эксперимента, а не как доказательство готовности модели к практическому OCR. На синтетическом наборе ByT5-small полезна, но для вывода о реальных сканах нужна проверка на настоящих OCR-ошибках и на разбиении по страницам или источникам.</w:t>
       </w:r>
     </w:p>
-    <w:bookmarkEnd w:id="380"/>
-    <w:bookmarkStart w:id="381" w:name="нормализатор-на-правилах"/>
+    <w:bookmarkEnd w:id="459"/>
+    <w:bookmarkStart w:id="460" w:name="нормализатор-на-правилах"/>
     <w:p>
       <w:pPr>
         <w:pStyle w:val="Heading3"/>
@@ -4911,8 +4592,8 @@
         <w:t xml:space="preserve">Для этой работы такой результат важен методологически. Он показывает, что простые символьные правила нельзя считать безопасной предобработкой для исторического арабографичного текста. Правило может выглядеть разумным как техническая нормализация, но в историческом материале оно легко меняет орфографически значимые формы. Поэтому нормализатор в дальнейшем не следует использовать как обязательный этап без отдельной проверки на реальных данных.</w:t>
       </w:r>
     </w:p>
-    <w:bookmarkEnd w:id="381"/>
-    <w:bookmarkStart w:id="382" w:name="X26c70db4b79cb30b57d665edbf51a9d36fed8b5"/>
+    <w:bookmarkEnd w:id="460"/>
+    <w:bookmarkStart w:id="461" w:name="X26c70db4b79cb30b57d665edbf51a9d36fed8b5"/>
     <w:p>
       <w:pPr>
         <w:pStyle w:val="Heading3"/>
@@ -4937,8 +4618,8 @@
         <w:t xml:space="preserve">Однако этот метод почти не меняет качество на уровне слов. Он умеет исправлять отдельные повторяющиеся путаницы, но не восстанавливает пропущенные элементы из контекста и не работает с более длинной структурой строки. Поэтому его результат полезен как промежуточная точка сравнения: он лучше ручной нормализации, но заметно слабее ByT5-small по WER.</w:t>
       </w:r>
     </w:p>
-    <w:bookmarkEnd w:id="382"/>
-    <w:bookmarkStart w:id="383" w:name="интерпретация-снижения-wer"/>
+    <w:bookmarkEnd w:id="461"/>
+    <w:bookmarkStart w:id="462" w:name="интерпретация-снижения-wer"/>
     <w:p>
       <w:pPr>
         <w:pStyle w:val="Heading3"/>
@@ -4971,8 +4652,8 @@
         <w:t xml:space="preserve">Поэтому в работе CER и WER интерпретируются вместе. CER показывает умеренный выигрыш на уровне символов, а WER показывает, что модель хорошо работает с частью ошибок границ слов в синтетическом наборе. Но этот результат сам по себе не доказывает, что такой же выигрыш появится на реальном OCR-выводе.</w:t>
       </w:r>
     </w:p>
-    <w:bookmarkEnd w:id="383"/>
-    <w:bookmarkStart w:id="384" w:name="Xa057a50b3d887cb833a81c68c8cf3288ce88b0e"/>
+    <w:bookmarkEnd w:id="462"/>
+    <w:bookmarkStart w:id="463" w:name="Xa057a50b3d887cb833a81c68c8cf3288ce88b0e"/>
     <w:p>
       <w:pPr>
         <w:pStyle w:val="Heading3"/>
@@ -4997,8 +4678,8 @@
         <w:t xml:space="preserve">В текущем эксперименте конфигурация с длиной 512 выглядит более устойчивой, чем более короткий вариант. Я не трактую это как универсальное правило для всех арабографичных корпусов. Скорее это практический вывод для данного корпуса и данной постановки: при работе с историческим арабографичным текстом длину последовательности нужно проверять экспериментально, а не выбирать по умолчанию.</w:t>
       </w:r>
     </w:p>
-    <w:bookmarkEnd w:id="384"/>
-    <w:bookmarkStart w:id="385" w:name="X19ea1479c8c58d48c08a8bf495d59749d022072"/>
+    <w:bookmarkEnd w:id="463"/>
+    <w:bookmarkStart w:id="464" w:name="X19ea1479c8c58d48c08a8bf495d59749d022072"/>
     <w:p>
       <w:pPr>
         <w:pStyle w:val="Heading3"/>
@@ -5031,8 +4712,8 @@
         <w:t xml:space="preserve">Одновременно наличие ухудшенных примеров принципиально для практического вывода. Даже если модель чаще помогает, она всё равно иногда добавляет новые ошибки. Для будущей системы посткоррекции нужен механизм отката или фильтрации предсказаний, особенно если модель используется на архивных источниках без быстрой ручной проверки каждой строки.</w:t>
       </w:r>
     </w:p>
-    <w:bookmarkEnd w:id="385"/>
-    <w:bookmarkStart w:id="386" w:name="среднее-улучшение-по-примерам"/>
+    <w:bookmarkEnd w:id="464"/>
+    <w:bookmarkStart w:id="465" w:name="среднее-улучшение-по-примерам"/>
     <w:p>
       <w:pPr>
         <w:pStyle w:val="Heading3"/>
@@ -5057,8 +4738,8 @@
         <w:t xml:space="preserve">Для интерпретации это означает следующее. В контролируемой синтетической постановке модель чаще исправляет структуру слов и пробелы, чем полностью восстанавливает каждый символ строки. Поэтому среднее улучшение полезно как краткое числовое резюме, но его нельзя рассматривать отдельно от распределения улучшенных и ухудшенных случаев.</w:t>
       </w:r>
     </w:p>
-    <w:bookmarkEnd w:id="386"/>
-    <w:bookmarkStart w:id="387" w:name="интерпретация-результатов"/>
+    <w:bookmarkEnd w:id="465"/>
+    <w:bookmarkStart w:id="466" w:name="интерпретация-результатов"/>
     <w:p>
       <w:pPr>
         <w:pStyle w:val="Heading3"/>
@@ -5091,8 +4772,8 @@
         <w:t xml:space="preserve">Третий вывод задаёт границу результата. Успех на синтетическом наборе нельзя переносить на реальные OCR/HTR-выходы без отдельной проверки. В текущем эксперименте модель учится на распределении ошибок генератора, а настоящий OCR зависит от шрифта, качества изображения, сегментации строки и особенностей конкретной OCR-системы. Поэтому результаты раздела 5 являются сильным пилотным сигналом, но не финальным доказательством практической применимости.</w:t>
       </w:r>
     </w:p>
-    <w:bookmarkEnd w:id="387"/>
-    <w:bookmarkStart w:id="388" w:name="ограничения-интерпретации"/>
+    <w:bookmarkEnd w:id="466"/>
+    <w:bookmarkStart w:id="467" w:name="ограничения-интерпретации"/>
     <w:p>
       <w:pPr>
         <w:pStyle w:val="Heading3"/>
@@ -5125,8 +4806,8 @@
         <w:t xml:space="preserve">Есть и ограничение метрик. CER и WER измеряют формальную близость к эталону, но не решают вопрос историко-лингвистической допустимости исправления. Например, модель может приблизить строку к эталону по расстоянию Левенштейна, но при этом сгладить форму, которую исследователь не хотел бы нормализовать. По этой причине автоматические метрики в работе дополняются разбором ухудшенных случаев.</w:t>
       </w:r>
     </w:p>
-    <w:bookmarkEnd w:id="388"/>
-    <w:bookmarkStart w:id="392" w:name="X9ae740f4b068656258209a4fa61338553b28ec2"/>
+    <w:bookmarkEnd w:id="467"/>
+    <w:bookmarkStart w:id="471" w:name="X9ae740f4b068656258209a4fa61338553b28ec2"/>
     <w:p>
       <w:pPr>
         <w:pStyle w:val="Heading3"/>
@@ -5144,18 +4825,18 @@
           <wp:inline>
             <wp:extent cx="5334000" cy="2489200"/>
             <wp:effectExtent b="0" l="0" r="0" t="0"/>
-            <wp:docPr descr="Рисунок 5.2 — Пример фрагмента реального OCR-вывода Tesseract и проверенного эталона" title="" id="390" name="Picture"/>
+            <wp:docPr descr="Рисунок 5.2 — Пример фрагмента реального OCR-вывода Tesseract и проверенного эталона" title="" id="469" name="Picture"/>
             <a:graphic>
               <a:graphicData uri="http://schemas.openxmlformats.org/drawingml/2006/picture">
                 <pic:pic>
                   <pic:nvPicPr>
-                    <pic:cNvPr descr="figures/fig04_real_ocr_example.png" id="391" name="Picture"/>
+                    <pic:cNvPr descr="figures/fig04_real_ocr_example.png" id="470" name="Picture"/>
                     <pic:cNvPicPr>
                       <a:picLocks noChangeArrowheads="1" noChangeAspect="1"/>
                     </pic:cNvPicPr>
                   </pic:nvPicPr>
                   <pic:blipFill>
-                    <a:blip r:embed="rId389"/>
+                    <a:blip r:embed="rId468"/>
                     <a:stretch>
                       <a:fillRect/>
                     </a:stretch>
@@ -5701,8 +5382,8 @@
         <w:t xml:space="preserve">Результат получился смешанным. По WER посткоррекция немного помогает: вариант с фрагментами снижает средний WER с 0.9238 до 0.8919. Но по CER и NoSpaceCER исходный Tesseract остаётся лучше. Для OCR на арабской графике это принципиально: улучшение границ слов не компенсирует ухудшение символного состава.</w:t>
       </w:r>
     </w:p>
-    <w:bookmarkEnd w:id="392"/>
-    <w:bookmarkStart w:id="396" w:name="постраничное-поведение-модели"/>
+    <w:bookmarkEnd w:id="471"/>
+    <w:bookmarkStart w:id="475" w:name="постраничное-поведение-модели"/>
     <w:p>
       <w:pPr>
         <w:pStyle w:val="Heading3"/>
@@ -5720,18 +5401,18 @@
           <wp:inline>
             <wp:extent cx="5334000" cy="2690191"/>
             <wp:effectExtent b="0" l="0" r="0" t="0"/>
-            <wp:docPr descr="Рисунок 5.3 — Средние ошибки real-OCR sanity по страницам" title="" id="394" name="Picture"/>
+            <wp:docPr descr="Рисунок 5.3 — Средние ошибки real-OCR sanity по страницам" title="" id="473" name="Picture"/>
             <a:graphic>
               <a:graphicData uri="http://schemas.openxmlformats.org/drawingml/2006/picture">
                 <pic:pic>
                   <pic:nvPicPr>
-                    <pic:cNvPr descr="figures/fig05_real_ocr_page_metrics.png" id="395" name="Picture"/>
+                    <pic:cNvPr descr="figures/fig05_real_ocr_page_metrics.png" id="474" name="Picture"/>
                     <pic:cNvPicPr>
                       <a:picLocks noChangeArrowheads="1" noChangeAspect="1"/>
                     </pic:cNvPicPr>
                   </pic:nvPicPr>
                   <pic:blipFill>
-                    <a:blip r:embed="rId393"/>
+                    <a:blip r:embed="rId472"/>
                     <a:stretch>
                       <a:fillRect/>
                     </a:stretch>
@@ -5973,8 +5654,8 @@
         <w:t xml:space="preserve">Этот результат полезнее, чем простой положительный отчёт о синтетических метриках. Он показывает место, где текущий подход ломается: модель выучила распределение синтетических ошибок, но не структуру настоящих ошибок Tesseract на конкретном печатном источнике.</w:t>
       </w:r>
     </w:p>
-    <w:bookmarkEnd w:id="396"/>
-    <w:bookmarkStart w:id="397" w:name="качественная-интерпретация-real-ocr"/>
+    <w:bookmarkEnd w:id="475"/>
+    <w:bookmarkStart w:id="476" w:name="качественная-интерпретация-real-ocr"/>
     <w:p>
       <w:pPr>
         <w:pStyle w:val="Heading3"/>
@@ -6007,8 +5688,8 @@
         <w:t xml:space="preserve">Главный вывод этой проверки состоит в том, что обучение только на синтетике недостаточно. Для настоящего OCR нужны пары, где входом является реальный OCR-вывод, а выходом — проверенный эталонный текст. Только на таких данных можно понять, какие ошибки модель действительно исправляет, а какие создаёт сама.</w:t>
       </w:r>
     </w:p>
-    <w:bookmarkEnd w:id="397"/>
-    <w:bookmarkStart w:id="398" w:name="выводы-и-результаты-по-главе-3"/>
+    <w:bookmarkEnd w:id="476"/>
+    <w:bookmarkStart w:id="477" w:name="выводы-и-результаты-по-главе-3"/>
     <w:p>
       <w:pPr>
         <w:pStyle w:val="Heading3"/>
@@ -6041,9 +5722,9 @@
         <w:t xml:space="preserve">Итог раздела такой: экспериментальный контур и обучение модели работают в контролируемой среде, но переход к реальным историческим сканам требует отдельной адаптации. Это не дополнительная косметическая проверка, а центральное условие практической применимости. Без настоящих пар «OCR-вывод — эталон» нельзя утверждать, что модель решает задачу OCR-посткоррекции для архивных источников.</w:t>
       </w:r>
     </w:p>
-    <w:bookmarkEnd w:id="398"/>
-    <w:bookmarkEnd w:id="399"/>
-    <w:bookmarkStart w:id="407" w:name="Xe8e02886c60b8939714d6e867e04f7997a20272"/>
+    <w:bookmarkEnd w:id="477"/>
+    <w:bookmarkEnd w:id="478"/>
+    <w:bookmarkStart w:id="486" w:name="Xe8e02886c60b8939714d6e867e04f7997a20272"/>
     <w:p>
       <w:pPr>
         <w:pStyle w:val="Heading2"/>
@@ -6052,7 +5733,7 @@
         <w:t xml:space="preserve">6. Ограничения и направления дальнейшей работы</w:t>
       </w:r>
     </w:p>
-    <w:bookmarkStart w:id="400" w:name="ограничения-корпуса-1"/>
+    <w:bookmarkStart w:id="479" w:name="ограничения-корпуса-1"/>
     <w:p>
       <w:pPr>
         <w:pStyle w:val="Heading3"/>
@@ -6077,8 +5758,8 @@
         <w:t xml:space="preserve">Один источник ограничивает жанровое, временное и орфографическое разнообразие. Тексты разных регионов и периодов могут отличаться письмом, лексикой, типографикой, качеством печати и состоянием скана. Отдельно важно, что старотатарские и старобашкирские источники пока остаются целью следующего этапа, а не основным набором оценки в этой версии.</w:t>
       </w:r>
     </w:p>
-    <w:bookmarkEnd w:id="400"/>
-    <w:bookmarkStart w:id="401" w:name="ограничения-синтетического-шума-1"/>
+    <w:bookmarkEnd w:id="479"/>
+    <w:bookmarkStart w:id="480" w:name="ограничения-синтетического-шума-1"/>
     <w:p>
       <w:pPr>
         <w:pStyle w:val="Heading3"/>
@@ -6103,8 +5784,8 @@
         <w:t xml:space="preserve">Практически это означает следующее: увеличение объёма синтетики само по себе не решит задачу. Следующая версия должна строиться вокруг реальных пар «OCR-вывод — эталон». Синтетические данные можно оставить как вспомогательный слой, но основной тест должен проверять настоящие ошибки распознавания.</w:t>
       </w:r>
     </w:p>
-    <w:bookmarkEnd w:id="401"/>
-    <w:bookmarkStart w:id="402" w:name="ограничения-метрик"/>
+    <w:bookmarkEnd w:id="480"/>
+    <w:bookmarkStart w:id="481" w:name="ограничения-метрик"/>
     <w:p>
       <w:pPr>
         <w:pStyle w:val="Heading3"/>
@@ -6129,8 +5810,8 @@
         <w:t xml:space="preserve">Для следующей версии набора нужна ручная проверка небольшой подвыборки. В ней следует фиксировать не только факт ошибки, но и её тип: замену графемы, пропуск, лишнюю вставку, ошибку пробела, чрезмерную нормализацию исторического написания, повтор фрагмента или грубое искажение строки. Тогда автоматические метрики можно будет связать с реальным качеством текста.</w:t>
       </w:r>
     </w:p>
-    <w:bookmarkEnd w:id="402"/>
-    <w:bookmarkStart w:id="403" w:name="ограничения-проверки-на-реальном-ocr"/>
+    <w:bookmarkEnd w:id="481"/>
+    <w:bookmarkStart w:id="482" w:name="ограничения-проверки-на-реальном-ocr"/>
     <w:p>
       <w:pPr>
         <w:pStyle w:val="Heading3"/>
@@ -6155,8 +5836,8 @@
         <w:t xml:space="preserve">Следующий шаг — перейти от постраничной оценки к более точным парам на уровне строки или короткого фрагмента. Для этого нужно выделить строки на изображении, получить OCR-вывод, сопоставить его с проверенным текстом и вручную проверить спорные случаи. Такая работа труднее, но именно она позволит обучать модель на настоящих ошибках, а не только проверять перенос с синтетики.</w:t>
       </w:r>
     </w:p>
-    <w:bookmarkEnd w:id="403"/>
-    <w:bookmarkStart w:id="404" w:name="следующий-набор-данных"/>
+    <w:bookmarkEnd w:id="482"/>
+    <w:bookmarkStart w:id="483" w:name="следующий-набор-данных"/>
     <w:p>
       <w:pPr>
         <w:pStyle w:val="Heading3"/>
@@ -6181,8 +5862,8 @@
         <w:t xml:space="preserve">Отдельно нужен журнал ошибок. В нём стоит фиксировать, какие графемы чаще всего путает OCR, где возникают проблемы пробелов, какие строки модель ухудшает и какие предсказания нужно откатывать. Такой журнал важнее ещё одного общего числа CER, потому что он показывает, как именно улучшать систему.</w:t>
       </w:r>
     </w:p>
-    <w:bookmarkEnd w:id="404"/>
-    <w:bookmarkStart w:id="405" w:name="X91867cc38c0f4e6667de3b2a642ec76d2863e9f"/>
+    <w:bookmarkEnd w:id="483"/>
+    <w:bookmarkStart w:id="484" w:name="X91867cc38c0f4e6667de3b2a642ec76d2863e9f"/>
     <w:p>
       <w:pPr>
         <w:pStyle w:val="Heading3"/>
@@ -6207,8 +5888,8 @@
         <w:t xml:space="preserve">Текущая работа полезна тем, что заранее показывает слабое место этой цепочки. До извлечения сущностей и построения графа нужно понять, насколько можно доверять тексту после OCR. Если посткоррекция ухудшает часть страниц, последующие модели будут работать на искажённой основе. Поэтому проверка на реальном OCR должна быть не финальным украшением проекта, а одним из первых этапов разработки.</w:t>
       </w:r>
     </w:p>
-    <w:bookmarkEnd w:id="405"/>
-    <w:bookmarkStart w:id="406" w:name="выводы-и-результаты-по-главе-4"/>
+    <w:bookmarkEnd w:id="484"/>
+    <w:bookmarkStart w:id="485" w:name="выводы-и-результаты-по-главе-4"/>
     <w:p>
       <w:pPr>
         <w:pStyle w:val="Heading3"/>
@@ -6225,9 +5906,9 @@
         <w:t xml:space="preserve">В главе сформулированы основные ограничения работы и направления дальнейшего развития. Главные ограничения связаны с небольшим объёмом корпуса, синтетической природой обучающих искажений, одним основным османско-турецким источником и нестабильным переносом на реальный OCR-вывод Tesseract. Из этого следует практический вывод: следующий этап должен быть связан не с усложнением модели как таковой, а со сбором выровненных пар «OCR-вывод — эталон», ручной проверкой татарских и башкирских источников и более строгой постраничной оценкой.</w:t>
       </w:r>
     </w:p>
-    <w:bookmarkEnd w:id="406"/>
-    <w:bookmarkEnd w:id="407"/>
-    <w:bookmarkStart w:id="408" w:name="заключение"/>
+    <w:bookmarkEnd w:id="485"/>
+    <w:bookmarkEnd w:id="486"/>
+    <w:bookmarkStart w:id="487" w:name="заключение"/>
     <w:p>
       <w:pPr>
         <w:pStyle w:val="Heading2"/>
@@ -6289,9 +5970,9 @@
         <w:br w:type="page"/>
       </w:r>
     </w:p>
-    <w:bookmarkEnd w:id="408"/>
-    <w:bookmarkEnd w:id="409"/>
-    <w:bookmarkStart w:id="410" w:name="библиографический-список"/>
+    <w:bookmarkEnd w:id="487"/>
+    <w:bookmarkEnd w:id="488"/>
+    <w:bookmarkStart w:id="489" w:name="библиографический-список"/>
     <w:p>
       <w:pPr>
         <w:pStyle w:val="Heading1"/>
@@ -6304,7 +5985,7 @@
       <w:pPr>
         <w:numPr>
           <w:ilvl w:val="0"/>
-          <w:numId w:val="1017"/>
+          <w:numId w:val="1010"/>
         </w:numPr>
       </w:pPr>
       <w:r>
@@ -6315,7 +5996,7 @@
       <w:pPr>
         <w:numPr>
           <w:ilvl w:val="0"/>
-          <w:numId w:val="1017"/>
+          <w:numId w:val="1010"/>
         </w:numPr>
       </w:pPr>
       <w:r>
@@ -6326,7 +6007,7 @@
       <w:pPr>
         <w:numPr>
           <w:ilvl w:val="0"/>
-          <w:numId w:val="1017"/>
+          <w:numId w:val="1010"/>
         </w:numPr>
       </w:pPr>
       <w:r>
@@ -6337,7 +6018,7 @@
       <w:pPr>
         <w:numPr>
           <w:ilvl w:val="0"/>
-          <w:numId w:val="1017"/>
+          <w:numId w:val="1010"/>
         </w:numPr>
       </w:pPr>
       <w:r>
@@ -6348,7 +6029,7 @@
       <w:pPr>
         <w:numPr>
           <w:ilvl w:val="0"/>
-          <w:numId w:val="1017"/>
+          <w:numId w:val="1010"/>
         </w:numPr>
       </w:pPr>
       <w:r>
@@ -6359,7 +6040,7 @@
       <w:pPr>
         <w:numPr>
           <w:ilvl w:val="0"/>
-          <w:numId w:val="1017"/>
+          <w:numId w:val="1010"/>
         </w:numPr>
       </w:pPr>
       <w:r>
@@ -6370,7 +6051,7 @@
       <w:pPr>
         <w:numPr>
           <w:ilvl w:val="0"/>
-          <w:numId w:val="1017"/>
+          <w:numId w:val="1010"/>
         </w:numPr>
       </w:pPr>
       <w:r>
@@ -6381,7 +6062,7 @@
       <w:pPr>
         <w:numPr>
           <w:ilvl w:val="0"/>
-          <w:numId w:val="1017"/>
+          <w:numId w:val="1010"/>
         </w:numPr>
       </w:pPr>
       <w:r>
@@ -6392,7 +6073,7 @@
       <w:pPr>
         <w:numPr>
           <w:ilvl w:val="0"/>
-          <w:numId w:val="1017"/>
+          <w:numId w:val="1010"/>
         </w:numPr>
       </w:pPr>
       <w:r>
@@ -6403,7 +6084,7 @@
       <w:pPr>
         <w:numPr>
           <w:ilvl w:val="0"/>
-          <w:numId w:val="1017"/>
+          <w:numId w:val="1010"/>
         </w:numPr>
       </w:pPr>
       <w:r>
@@ -6414,7 +6095,7 @@
       <w:pPr>
         <w:numPr>
           <w:ilvl w:val="0"/>
-          <w:numId w:val="1017"/>
+          <w:numId w:val="1010"/>
         </w:numPr>
       </w:pPr>
       <w:r>
@@ -6425,7 +6106,7 @@
       <w:pPr>
         <w:numPr>
           <w:ilvl w:val="0"/>
-          <w:numId w:val="1017"/>
+          <w:numId w:val="1010"/>
         </w:numPr>
       </w:pPr>
       <w:r>
@@ -6436,7 +6117,7 @@
       <w:pPr>
         <w:numPr>
           <w:ilvl w:val="0"/>
-          <w:numId w:val="1017"/>
+          <w:numId w:val="1010"/>
         </w:numPr>
       </w:pPr>
       <w:r>
@@ -6447,7 +6128,7 @@
       <w:pPr>
         <w:numPr>
           <w:ilvl w:val="0"/>
-          <w:numId w:val="1017"/>
+          <w:numId w:val="1010"/>
         </w:numPr>
       </w:pPr>
       <w:r>
@@ -6458,7 +6139,7 @@
       <w:pPr>
         <w:numPr>
           <w:ilvl w:val="0"/>
-          <w:numId w:val="1017"/>
+          <w:numId w:val="1010"/>
         </w:numPr>
       </w:pPr>
       <w:r>
@@ -6469,7 +6150,7 @@
       <w:pPr>
         <w:numPr>
           <w:ilvl w:val="0"/>
-          <w:numId w:val="1017"/>
+          <w:numId w:val="1010"/>
         </w:numPr>
       </w:pPr>
       <w:r>
@@ -6480,7 +6161,7 @@
       <w:pPr>
         <w:numPr>
           <w:ilvl w:val="0"/>
-          <w:numId w:val="1017"/>
+          <w:numId w:val="1010"/>
         </w:numPr>
       </w:pPr>
       <w:r>
@@ -6491,7 +6172,7 @@
       <w:pPr>
         <w:numPr>
           <w:ilvl w:val="0"/>
-          <w:numId w:val="1017"/>
+          <w:numId w:val="1010"/>
         </w:numPr>
       </w:pPr>
       <w:r>
@@ -6502,7 +6183,7 @@
       <w:pPr>
         <w:numPr>
           <w:ilvl w:val="0"/>
-          <w:numId w:val="1017"/>
+          <w:numId w:val="1010"/>
         </w:numPr>
       </w:pPr>
       <w:r>
@@ -6513,14 +6194,14 @@
       <w:pPr>
         <w:numPr>
           <w:ilvl w:val="0"/>
-          <w:numId w:val="1017"/>
+          <w:numId w:val="1010"/>
         </w:numPr>
       </w:pPr>
       <w:r>
         <w:t xml:space="preserve">Li M., Lv T., Chen J., Cui L., Lu Y., Florencio D., Zhang C., Li Z., Wei F. TrOCR: Transformer-based Optical Character Recognition with Pre-trained Models. 2021. arXiv:2109.10282. URL: https://arxiv.org/abs/2109.10282</w:t>
       </w:r>
     </w:p>
-    <w:bookmarkEnd w:id="410"/>
+    <w:bookmarkEnd w:id="489"/>
     <w:sectPr>
       <w:footerReference r:id="rId1" w:type="default"/>
       <w:footnotePr>
@@ -6663,109 +6344,6 @@
       </w:pPr>
     </w:lvl>
   </w:abstractNum>
-  <w:abstractNum w:abstractNumId="991">
-    <w:nsid w:val="0000A991"/>
-    <w:multiLevelType w:val="multilevel"/>
-    <w:lvl w:ilvl="0">
-      <w:numFmt w:val="bullet"/>
-      <w:lvlText w:val=""/>
-      <w:lvlJc w:val="left"/>
-      <w:pPr>
-        <w:ind w:left="720" w:hanging="360"/>
-      </w:pPr>
-      <w:rPr>
-        <w:rFonts w:ascii="Symbol" w:hAnsi="Symbol" w:cs="Symbol" w:hint="default"/>
-      </w:rPr>
-    </w:lvl>
-    <w:lvl w:ilvl="1">
-      <w:numFmt w:val="bullet"/>
-      <w:lvlText w:val="o"/>
-      <w:lvlJc w:val="left"/>
-      <w:pPr>
-        <w:ind w:left="1440" w:hanging="360"/>
-      </w:pPr>
-      <w:rPr>
-        <w:rFonts w:ascii="Courier New" w:hAnsi="Courier New" w:cs="Courier New" w:hint="default"/>
-      </w:rPr>
-    </w:lvl>
-    <w:lvl w:ilvl="2">
-      <w:numFmt w:val="bullet"/>
-      <w:lvlText w:val=""/>
-      <w:lvlJc w:val="left"/>
-      <w:pPr>
-        <w:ind w:left="2160" w:hanging="360"/>
-      </w:pPr>
-      <w:rPr>
-        <w:rFonts w:ascii="Wingdings" w:hAnsi="Wingdings" w:cs="Wingdings" w:hint="default"/>
-      </w:rPr>
-    </w:lvl>
-    <w:lvl w:ilvl="3">
-      <w:numFmt w:val="bullet"/>
-      <w:lvlText w:val=""/>
-      <w:lvlJc w:val="left"/>
-      <w:pPr>
-        <w:ind w:left="2880" w:hanging="360"/>
-      </w:pPr>
-      <w:rPr>
-        <w:rFonts w:ascii="Symbol" w:hAnsi="Symbol" w:cs="Symbol" w:hint="default"/>
-      </w:rPr>
-    </w:lvl>
-    <w:lvl w:ilvl="4">
-      <w:numFmt w:val="bullet"/>
-      <w:lvlText w:val="o"/>
-      <w:lvlJc w:val="left"/>
-      <w:pPr>
-        <w:ind w:left="3600" w:hanging="360"/>
-      </w:pPr>
-      <w:rPr>
-        <w:rFonts w:ascii="Courier New" w:hAnsi="Courier New" w:cs="Courier New" w:hint="default"/>
-      </w:rPr>
-    </w:lvl>
-    <w:lvl w:ilvl="5">
-      <w:numFmt w:val="bullet"/>
-      <w:lvlText w:val=""/>
-      <w:lvlJc w:val="left"/>
-      <w:pPr>
-        <w:ind w:left="4320" w:hanging="360"/>
-      </w:pPr>
-      <w:rPr>
-        <w:rFonts w:ascii="Wingdings" w:hAnsi="Wingdings" w:cs="Wingdings" w:hint="default"/>
-      </w:rPr>
-    </w:lvl>
-    <w:lvl w:ilvl="6">
-      <w:numFmt w:val="bullet"/>
-      <w:lvlText w:val=""/>
-      <w:lvlJc w:val="left"/>
-      <w:pPr>
-        <w:ind w:left="5040" w:hanging="360"/>
-      </w:pPr>
-      <w:rPr>
-        <w:rFonts w:ascii="Symbol" w:hAnsi="Symbol" w:cs="Symbol" w:hint="default"/>
-      </w:rPr>
-    </w:lvl>
-    <w:lvl w:ilvl="7">
-      <w:numFmt w:val="bullet"/>
-      <w:lvlText w:val="o"/>
-      <w:lvlJc w:val="left"/>
-      <w:pPr>
-        <w:ind w:left="5760" w:hanging="360"/>
-      </w:pPr>
-      <w:rPr>
-        <w:rFonts w:ascii="Courier New" w:hAnsi="Courier New" w:cs="Courier New" w:hint="default"/>
-      </w:rPr>
-    </w:lvl>
-    <w:lvl w:ilvl="8">
-      <w:numFmt w:val="bullet"/>
-      <w:lvlText w:val=""/>
-      <w:lvlJc w:val="left"/>
-      <w:pPr>
-        <w:ind w:left="6480" w:hanging="360"/>
-      </w:pPr>
-      <w:rPr>
-        <w:rFonts w:ascii="Wingdings" w:hAnsi="Wingdings" w:cs="Wingdings" w:hint="default"/>
-      </w:rPr>
-    </w:lvl>
-  </w:abstractNum>
   <w:abstractNum w:abstractNumId="99411">
     <w:nsid w:val="00A99411"/>
     <w:multiLevelType w:val="multilevel"/>
@@ -7365,9 +6943,6 @@
     <w:abstractNumId w:val="990"/>
   </w:num>
   <w:num w:numId="1001">
-    <w:abstractNumId w:val="991"/>
-  </w:num>
-  <w:num w:numId="1002">
     <w:abstractNumId w:val="99411"/>
     <w:lvlOverride w:ilvl="0">
       <w:startOverride w:val="1"/>
@@ -7397,10 +6972,7 @@
       <w:startOverride w:val="1"/>
     </w:lvlOverride>
   </w:num>
-  <w:num w:numId="1003">
-    <w:abstractNumId w:val="991"/>
-  </w:num>
-  <w:num w:numId="1004">
+  <w:num w:numId="1002">
     <w:abstractNumId w:val="99412"/>
     <w:lvlOverride w:ilvl="0">
       <w:startOverride w:val="2"/>
@@ -7430,10 +7002,7 @@
       <w:startOverride w:val="2"/>
     </w:lvlOverride>
   </w:num>
-  <w:num w:numId="1005">
-    <w:abstractNumId w:val="991"/>
-  </w:num>
-  <w:num w:numId="1006">
+  <w:num w:numId="1003">
     <w:abstractNumId w:val="99413"/>
     <w:lvlOverride w:ilvl="0">
       <w:startOverride w:val="3"/>
@@ -7463,10 +7032,7 @@
       <w:startOverride w:val="3"/>
     </w:lvlOverride>
   </w:num>
-  <w:num w:numId="1007">
-    <w:abstractNumId w:val="991"/>
-  </w:num>
-  <w:num w:numId="1008">
+  <w:num w:numId="1004">
     <w:abstractNumId w:val="99414"/>
     <w:lvlOverride w:ilvl="0">
       <w:startOverride w:val="4"/>
@@ -7496,10 +7062,7 @@
       <w:startOverride w:val="4"/>
     </w:lvlOverride>
   </w:num>
-  <w:num w:numId="1009">
-    <w:abstractNumId w:val="991"/>
-  </w:num>
-  <w:num w:numId="1010">
+  <w:num w:numId="1005">
     <w:abstractNumId w:val="99415"/>
     <w:lvlOverride w:ilvl="0">
       <w:startOverride w:val="5"/>
@@ -7529,10 +7092,7 @@
       <w:startOverride w:val="5"/>
     </w:lvlOverride>
   </w:num>
-  <w:num w:numId="1011">
-    <w:abstractNumId w:val="991"/>
-  </w:num>
-  <w:num w:numId="1012">
+  <w:num w:numId="1006">
     <w:abstractNumId w:val="99416"/>
     <w:lvlOverride w:ilvl="0">
       <w:startOverride w:val="6"/>
@@ -7562,10 +7122,7 @@
       <w:startOverride w:val="6"/>
     </w:lvlOverride>
   </w:num>
-  <w:num w:numId="1013">
-    <w:abstractNumId w:val="991"/>
-  </w:num>
-  <w:num w:numId="1014">
+  <w:num w:numId="1007">
     <w:abstractNumId w:val="99417"/>
     <w:lvlOverride w:ilvl="0">
       <w:startOverride w:val="7"/>
@@ -7595,7 +7152,7 @@
       <w:startOverride w:val="7"/>
     </w:lvlOverride>
   </w:num>
-  <w:num w:numId="1015">
+  <w:num w:numId="1008">
     <w:abstractNumId w:val="99411"/>
     <w:lvlOverride w:ilvl="0">
       <w:startOverride w:val="1"/>
@@ -7625,7 +7182,7 @@
       <w:startOverride w:val="1"/>
     </w:lvlOverride>
   </w:num>
-  <w:num w:numId="1016">
+  <w:num w:numId="1009">
     <w:abstractNumId w:val="99411"/>
     <w:lvlOverride w:ilvl="0">
       <w:startOverride w:val="1"/>
@@ -7655,7 +7212,7 @@
       <w:startOverride w:val="1"/>
     </w:lvlOverride>
   </w:num>
-  <w:num w:numId="1017">
+  <w:num w:numId="1010">
     <w:abstractNumId w:val="99411"/>
     <w:lvlOverride w:ilvl="0">
       <w:startOverride w:val="1"/>

</xml_diff>

<commit_message>
docs: format bibliography entries closer to GOST
</commit_message>
<xml_diff>
--- a/outputs/course_paper_hse_final.docx
+++ b/outputs/course_paper_hse_final.docx
@@ -161,7 +161,7 @@
         <w:br w:type="page"/>
       </w:r>
     </w:p>
-    <w:bookmarkStart w:id="402" w:name="аннотация"/>
+    <w:bookmarkStart w:id="481" w:name="аннотация"/>
     <w:p>
       <w:pPr>
         <w:pStyle w:val="Heading1"/>
@@ -202,8 +202,8 @@
         <w:t xml:space="preserve">Главный результат работы состоит не в создании готовой OCR-системы, а в построении воспроизводимого протокола оценки и фиксации разрыва между синтетической и реальной проверкой. Для практического применения нужны выровненные пары «OCR-вывод — эталон», обучение на настоящих OCR-ошибках, проверка на татарских и башкирских источниках и ручной анализ ошибок.</w:t>
       </w:r>
     </w:p>
-    <w:bookmarkEnd w:id="402"/>
-    <w:bookmarkStart w:id="403" w:name="abstract"/>
+    <w:bookmarkEnd w:id="481"/>
+    <w:bookmarkStart w:id="482" w:name="abstract"/>
     <w:p>
       <w:pPr>
         <w:pStyle w:val="Heading1"/>
@@ -220,8 +220,8 @@
         <w:t xml:space="preserve">This course paper investigates OCR post-correction for historical Turkic texts written in Arabic script. The work does not build a complete OCR/HTR pipeline from page images; it focuses on a narrower text-to-text layer where noisy OCR-like output is transformed into a corrected string and evaluated against a reference. The pilot material is an Ottoman Turkish source in Arabic script, used as a related Arabic-script Turkic test case rather than as an Old Tatar or Old Bashkir dataset. A synthetic corpus of noisy-reference pairs is constructed and several methods are compared: identity baseline, rule-based normalizer, character-confusion baseline, and ByT5-small. On the synthetic benchmark, ByT5-small obtains the best scores among the tested methods, especially in WER. However, a page-level sanity check on real Tesseract output shows an unstable transfer: the model may slightly reduce WER but can worsen CER and NoSpaceCER. The main result is therefore a reproducible evaluation protocol and evidence of a synthetic-to-real gap, not a ready OCR system.</w:t>
       </w:r>
     </w:p>
-    <w:bookmarkEnd w:id="403"/>
-    <w:bookmarkStart w:id="488" w:name="содержание"/>
+    <w:bookmarkEnd w:id="482"/>
+    <w:bookmarkStart w:id="567" w:name="содержание"/>
     <w:p>
       <w:pPr>
         <w:pStyle w:val="Heading1"/>
@@ -789,7 +789,7 @@
         <w:t xml:space="preserve"> </w:t>
       </w:r>
     </w:p>
-    <w:bookmarkStart w:id="404" w:name="введение"/>
+    <w:bookmarkStart w:id="483" w:name="введение"/>
     <w:p>
       <w:pPr>
         <w:pStyle w:val="Heading2"/>
@@ -838,8 +838,8 @@
         <w:t xml:space="preserve">Методы исследования включают анализ работ по OCR исторических документов и посткоррекции, построение пилотного корпуса, генерацию синтетических OCR-подобных ошибок, реализацию базовых методов, обучение модели ByT5-small, вычисление CER, WER, NoSpaceCER и ExactMatch, анализ ошибок и отдельную проверку переноса на реальный OCR-вывод Tesseract. Такой набор методов позволяет отделить контролируемую проверку на синтетических данных от проверки поведения модели на настоящем OCR-выводе.</w:t>
       </w:r>
     </w:p>
-    <w:bookmarkEnd w:id="404"/>
-    <w:bookmarkStart w:id="405" w:name="актуальность"/>
+    <w:bookmarkEnd w:id="483"/>
+    <w:bookmarkStart w:id="484" w:name="актуальность"/>
     <w:p>
       <w:pPr>
         <w:pStyle w:val="Heading2"/>
@@ -872,8 +872,8 @@
         <w:t xml:space="preserve">Ещё одна причина актуальности связана с нехваткой воспроизводимых тестовых наборов и протоколов оценки. Для низкоресурсного исторического материала недостаточно показать один удачный пример исправления. Нужно фиксировать источник данных, процедуру генерации или получения OCR, разбиение на обучающую и тестовую части, метрики и худшие случаи. Поэтому в работе важны не только значения CER и WER, но и воспроизводимый протокол оценки.</w:t>
       </w:r>
     </w:p>
-    <w:bookmarkEnd w:id="405"/>
-    <w:bookmarkStart w:id="406" w:name="постановка-проблемы"/>
+    <w:bookmarkEnd w:id="484"/>
+    <w:bookmarkStart w:id="485" w:name="постановка-проблемы"/>
     <w:p>
       <w:pPr>
         <w:pStyle w:val="Heading2"/>
@@ -906,8 +906,8 @@
         <w:t xml:space="preserve">Такое сужение позволяет отделить ошибки посткоррекции от ошибок сегментации, распознавания изображения и подготовки скана. В то же время оно не снимает более крупную задачу: для практической системы всё равно понадобятся реальные пары «OCR-вывод — эталон», ручная валидация и расширение корпуса на целевые татарские и башкирские источники.</w:t>
       </w:r>
     </w:p>
-    <w:bookmarkEnd w:id="406"/>
-    <w:bookmarkStart w:id="407" w:name="цель-работы"/>
+    <w:bookmarkEnd w:id="485"/>
+    <w:bookmarkStart w:id="486" w:name="цель-работы"/>
     <w:p>
       <w:pPr>
         <w:pStyle w:val="Heading2"/>
@@ -924,8 +924,8 @@
         <w:t xml:space="preserve">Цель работы состоит в построении и оценке протокола посткоррекции OCR-подобных ошибок для исторических тюркских текстов в арабской графике, а также в проверке переноса модели с синтетических искажений на реальный OCR-вывод.</w:t>
       </w:r>
     </w:p>
-    <w:bookmarkEnd w:id="407"/>
-    <w:bookmarkStart w:id="408" w:name="задачи-работы"/>
+    <w:bookmarkEnd w:id="486"/>
+    <w:bookmarkStart w:id="487" w:name="задачи-работы"/>
     <w:p>
       <w:pPr>
         <w:pStyle w:val="Heading2"/>
@@ -1038,8 +1038,8 @@
         <w:t xml:space="preserve">Проверить перенос на реальный OCR-вывод Tesseract и сформулировать ограничения синтетического обучения.</w:t>
       </w:r>
     </w:p>
-    <w:bookmarkEnd w:id="408"/>
-    <w:bookmarkStart w:id="409" w:name="объект-и-предмет-исследования"/>
+    <w:bookmarkEnd w:id="487"/>
+    <w:bookmarkStart w:id="488" w:name="объект-и-предмет-исследования"/>
     <w:p>
       <w:pPr>
         <w:pStyle w:val="Heading2"/>
@@ -1064,8 +1064,8 @@
         <w:t xml:space="preserve">Предмет исследования составляют методы посткоррекции OCR-подобных ошибок в таких текстах: правила, символьные замены и нейросетевая модель ByT5-small.</w:t>
       </w:r>
     </w:p>
-    <w:bookmarkEnd w:id="409"/>
-    <w:bookmarkStart w:id="410" w:name="исследовательские-вопросы"/>
+    <w:bookmarkEnd w:id="488"/>
+    <w:bookmarkStart w:id="489" w:name="исследовательские-вопросы"/>
     <w:p>
       <w:pPr>
         <w:pStyle w:val="Heading2"/>
@@ -1142,8 +1142,8 @@
         <w:t xml:space="preserve">Сохраняется ли выигрыш модели, обученной на синтетических ошибках, на реальном OCR-выводе Tesseract?</w:t>
       </w:r>
     </w:p>
-    <w:bookmarkEnd w:id="410"/>
-    <w:bookmarkStart w:id="411" w:name="гипотезы"/>
+    <w:bookmarkEnd w:id="489"/>
+    <w:bookmarkStart w:id="490" w:name="гипотезы"/>
     <w:p>
       <w:pPr>
         <w:pStyle w:val="Heading2"/>
@@ -1192,8 +1192,8 @@
         <w:t xml:space="preserve">Гипотеза 4. Модель, обученная только на синтетических OCR-подобных ошибках, не будет надёжно переноситься на реальный постраничный OCR без адаптации на настоящих парах «OCR-вывод — эталон».</w:t>
       </w:r>
     </w:p>
-    <w:bookmarkEnd w:id="411"/>
-    <w:bookmarkStart w:id="412" w:name="практическая-значимость"/>
+    <w:bookmarkEnd w:id="490"/>
+    <w:bookmarkStart w:id="491" w:name="практическая-значимость"/>
     <w:p>
       <w:pPr>
         <w:pStyle w:val="Heading2"/>
@@ -1218,8 +1218,8 @@
         <w:t xml:space="preserve">Практический смысл результата связан с цифровой гуманитаристикой. После появления реальных пар «OCR-вывод — эталон» этот контур можно применять для подготовки корпусов, поиска по историческим текстам, извлечения именованных сущностей и сопоставления архивных записей. Текущая версия честно фиксирует границу применимости: она показывает разрыв между синтетической и реальной оценкой, но не является готовым корректором для архивных сканов.</w:t>
       </w:r>
     </w:p>
-    <w:bookmarkEnd w:id="412"/>
-    <w:bookmarkStart w:id="413" w:name="структура-работы"/>
+    <w:bookmarkEnd w:id="491"/>
+    <w:bookmarkStart w:id="492" w:name="структура-работы"/>
     <w:p>
       <w:pPr>
         <w:pStyle w:val="Heading2"/>
@@ -1236,8 +1236,8 @@
         <w:t xml:space="preserve">Логика работы следующая: сначала рассматриваются трудности OCR исторических документов и арабографичного письма, затем описываются корпус и синтетические ошибки, после этого сравниваются базовые методы и ByT5-small, а в конце отдельно проверяется перенос на реальный OCR-вывод Tesseract.</w:t>
       </w:r>
     </w:p>
-    <w:bookmarkEnd w:id="413"/>
-    <w:bookmarkStart w:id="422" w:name="X0ceba565ddc4689162e5800a39ee266fa2dc29a"/>
+    <w:bookmarkEnd w:id="492"/>
+    <w:bookmarkStart w:id="501" w:name="X0ceba565ddc4689162e5800a39ee266fa2dc29a"/>
     <w:p>
       <w:pPr>
         <w:pStyle w:val="Heading2"/>
@@ -1246,7 +1246,7 @@
         <w:t xml:space="preserve">2. Обзор предметной области и связанных работ</w:t>
       </w:r>
     </w:p>
-    <w:bookmarkStart w:id="414" w:name="X180942b9a24eaba8abfe1c56a0263be0843d255"/>
+    <w:bookmarkStart w:id="493" w:name="X180942b9a24eaba8abfe1c56a0263be0843d255"/>
     <w:p>
       <w:pPr>
         <w:pStyle w:val="Heading3"/>
@@ -1279,8 +1279,8 @@
         <w:t xml:space="preserve">Современные OCR-модели также всё чаще строятся на трансформерных подходах. Например, TrOCR использует предобученные компоненты визуального и текстового трансформеров и показывает, что сама OCR-модель может выигрывать от предобучения и дообучения на размеченных данных (Li et al., 2021). Однако это направление относится к распознаванию изображения, тогда как настоящая работа ограничена текстовой посткоррекцией. Такое ограничение сужает эксперимент, зато позволяет проверить отдельный вопрос: может ли модель исправлять уже полученный OCR-вывод без смешения этого результата с качеством сегментации и распознавания изображения.</w:t>
       </w:r>
     </w:p>
-    <w:bookmarkEnd w:id="414"/>
-    <w:bookmarkStart w:id="415" w:name="специфика-арабографичного-ocr"/>
+    <w:bookmarkEnd w:id="493"/>
+    <w:bookmarkStart w:id="494" w:name="специфика-арабографичного-ocr"/>
     <w:p>
       <w:pPr>
         <w:pStyle w:val="Heading3"/>
@@ -1321,8 +1321,8 @@
         <w:t xml:space="preserve">Именно здесь возникает разрыв между синтетической и реальной проверкой. В синтетической постановке можно контролировать типы искажений и разбиение на обучающую и тестовую выборки. В реальном OCR появляются дополнительные факторы: структура страницы, шрифт, качество изображения, сегментация строк, направление письма и особенности конкретной OCR-системы. Поэтому результаты на синтетическом наборе нельзя автоматически переносить на настоящий OCR-вывод.</w:t>
       </w:r>
     </w:p>
-    <w:bookmarkEnd w:id="415"/>
-    <w:bookmarkStart w:id="416" w:name="X870e54edfb9df569aa2599064af567ed17246c1"/>
+    <w:bookmarkEnd w:id="494"/>
+    <w:bookmarkStart w:id="495" w:name="X870e54edfb9df569aa2599064af567ed17246c1"/>
     <w:p>
       <w:pPr>
         <w:pStyle w:val="Heading3"/>
@@ -1355,8 +1355,8 @@
         <w:t xml:space="preserve">С точки зрения обработки естественного языка такие материалы относятся к низкоресурсным историческим данным. Для них меньше размеченных корпусов, стандартных бенчмарков, готовых моделей и инструментов, чем для современных массовых языков. Современные работы по обработке исторического турецкого языка подчёркивают необходимость создавать базовые ресурсы: корпуса, модели, разметку и инструменты для анализа исторических текстов (Özateş et al., 2025). Настоящая работа занимает в этой цепочке более узкое место: она не строит полный корпус, а проверяет протокол посткоррекции.</w:t>
       </w:r>
     </w:p>
-    <w:bookmarkEnd w:id="416"/>
-    <w:bookmarkStart w:id="417" w:name="Xfcaf842918234d7c399beca909495522023c2d4"/>
+    <w:bookmarkEnd w:id="495"/>
+    <w:bookmarkStart w:id="496" w:name="Xfcaf842918234d7c399beca909495522023c2d4"/>
     <w:p>
       <w:pPr>
         <w:pStyle w:val="Heading3"/>
@@ -1405,8 +1405,8 @@
         <w:t xml:space="preserve">Отдельная современная линия исследований связана с использованием больших языковых моделей для коррекции OCR. Kanerva et al. (2025) показывают, что посткоррекция на основе больших языковых моделей для исторических документов не даёт универсального выигрыша: эффект зависит от языка, данных и постановки. Этот вывод важен для интерпретации настоящего эксперимента. Смешанный перенос модели, обученной на синтетических искажениях, на реальный OCR отражает известную проблему посткоррекции: качество зависит от домена, языка, структуры ошибок и объёма размеченных пар «OCR-вывод — эталон».</w:t>
       </w:r>
     </w:p>
-    <w:bookmarkEnd w:id="417"/>
-    <w:bookmarkStart w:id="418" w:name="Xaa6a63b69f8f8f9084dc16d50d48dc0403f5611"/>
+    <w:bookmarkEnd w:id="496"/>
+    <w:bookmarkStart w:id="497" w:name="Xaa6a63b69f8f8f9084dc16d50d48dc0403f5611"/>
     <w:p>
       <w:pPr>
         <w:pStyle w:val="Heading3"/>
@@ -1455,8 +1455,8 @@
         <w:t xml:space="preserve">Следовательно, синтетический набор в этой работе — это диагностический стенд, а не финальный бенчмарк. Он нужен, чтобы увидеть, превосходит ли ByT5-small простые базовые методы в контролируемой среде. Постраничная проверка на Tesseract затем показывает границу этого стенда: для практического применения нужно строить ошибки не только по заранее заданным правилам, но и по реальным OCR-выводам и эмпирическим путаницам арабографичных графем.</w:t>
       </w:r>
     </w:p>
-    <w:bookmarkEnd w:id="418"/>
-    <w:bookmarkStart w:id="419" w:name="X15509693a0d7b6f8fe53cddac6f871c0636dbad"/>
+    <w:bookmarkEnd w:id="497"/>
+    <w:bookmarkStart w:id="498" w:name="X15509693a0d7b6f8fe53cddac6f871c0636dbad"/>
     <w:p>
       <w:pPr>
         <w:pStyle w:val="Heading3"/>
@@ -1489,8 +1489,8 @@
         <w:t xml:space="preserve">Тем не менее модель с байтовым представлением не решает проблему доменного переноса автоматически. Если модель обучена только на синтетическом шуме, она учится распределению ошибок этого генератора. Реальный OCR-вывод может иметь другую структуру: пропуски, артефакты разметки страницы, ошибки чтения строк, необычные пробелы, неверные формы букв или последовательные искажения. Поэтому ByT5 в этой работе рассматривается как сильная нейросетевая точка сравнения для посткоррекции, но не как готовое универсальное решение.</w:t>
       </w:r>
     </w:p>
-    <w:bookmarkEnd w:id="419"/>
-    <w:bookmarkStart w:id="420" w:name="X4e2987dd6a0ff1eb2f6c8914cca3c5fd2dc83ae"/>
+    <w:bookmarkEnd w:id="498"/>
+    <w:bookmarkStart w:id="499" w:name="X4e2987dd6a0ff1eb2f6c8914cca3c5fd2dc83ae"/>
     <w:p>
       <w:pPr>
         <w:pStyle w:val="Heading3"/>
@@ -1531,8 +1531,8 @@
         <w:t xml:space="preserve">Для дальнейшего исследования наиболее важен именно этот отрицательный результат. На синтетическом наборе модель улучшает метрики относительно базовых методов, но при переходе к реальному OCR эффект становится нестабильным. Это задаёт следующую задачу магистерской работы: собрать выровненные пары «OCR-вывод — эталон», разнести страницы по выборкам без утечки и обучать посткоррекцию уже на настоящих ошибках распознавания.</w:t>
       </w:r>
     </w:p>
-    <w:bookmarkEnd w:id="420"/>
-    <w:bookmarkStart w:id="421" w:name="выводы-и-результаты-по-главе"/>
+    <w:bookmarkEnd w:id="499"/>
+    <w:bookmarkStart w:id="500" w:name="выводы-и-результаты-по-главе"/>
     <w:p>
       <w:pPr>
         <w:pStyle w:val="Heading3"/>
@@ -1557,9 +1557,9 @@
         <w:t xml:space="preserve">Для данной работы особенно важен вывод о границе синтетического подхода. Синтетические пары позволяют построить воспроизводимый проверочный стенд, но не гарантируют устойчивый перенос на настоящий OCR. Поэтому дальнейшие главы разделяют контролируемую проверку на синтетических ошибках и отдельную проверку на реальном OCR-выводе Tesseract.</w:t>
       </w:r>
     </w:p>
-    <w:bookmarkEnd w:id="421"/>
-    <w:bookmarkEnd w:id="422"/>
-    <w:bookmarkStart w:id="439" w:name="данные-и-построение-корпуса"/>
+    <w:bookmarkEnd w:id="500"/>
+    <w:bookmarkEnd w:id="501"/>
+    <w:bookmarkStart w:id="518" w:name="данные-и-построение-корпуса"/>
     <w:p>
       <w:pPr>
         <w:pStyle w:val="Heading2"/>
@@ -1568,7 +1568,7 @@
         <w:t xml:space="preserve">3. Данные и построение корпуса</w:t>
       </w:r>
     </w:p>
-    <w:bookmarkStart w:id="423" w:name="общая-постановка"/>
+    <w:bookmarkStart w:id="502" w:name="общая-постановка"/>
     <w:p>
       <w:pPr>
         <w:pStyle w:val="Heading3"/>
@@ -1601,8 +1601,8 @@
         <w:t xml:space="preserve">Важно, что эта постановка сознательно отделяет задачу посткоррекции от задачи распознавания изображения. В эксперименте не оценивается качество сегментации страниц или OCR/HTR-модели; оценивается только способность метода исправлять уже полученный текстовый вывод.</w:t>
       </w:r>
     </w:p>
-    <w:bookmarkEnd w:id="423"/>
-    <w:bookmarkStart w:id="424" w:name="источник-данных"/>
+    <w:bookmarkEnd w:id="502"/>
+    <w:bookmarkStart w:id="503" w:name="источник-данных"/>
     <w:p>
       <w:pPr>
         <w:pStyle w:val="Heading3"/>
@@ -1659,8 +1659,8 @@
         <w:t xml:space="preserve">Источник выбран не как случайный арабографичный текст, а как материал, близкий к теме работы: он относится к историческим тюркским текстам, записанным арабской графикой. В источнике встречаются формы, характерные для османско-тюркского текста в арабской графике; отдельные примеры таких форм приведены ниже в таблицах с синтетическими примерами и примерами реального OCR. Поэтому корпус лучше соответствует теме курсовой, чем более ранний технический прототип на персидском или общеарабографичном материале.</w:t>
       </w:r>
     </w:p>
-    <w:bookmarkEnd w:id="424"/>
-    <w:bookmarkStart w:id="425" w:name="сбор-и-предварительная-подготовка"/>
+    <w:bookmarkEnd w:id="503"/>
+    <w:bookmarkStart w:id="504" w:name="сбор-и-предварительная-подготовка"/>
     <w:p>
       <w:pPr>
         <w:pStyle w:val="Heading3"/>
@@ -1705,8 +1705,8 @@
         <w:t xml:space="preserve">Поэтому нормализация вынесена в отдельный базовый метод. Корпус хранится в максимально щадящем виде, а нормализатор на правилах оценивается экспериментально наравне с методом без исправления и нейросетевой моделью.</w:t>
       </w:r>
     </w:p>
-    <w:bookmarkEnd w:id="425"/>
-    <w:bookmarkStart w:id="426" w:name="синтетические-ocr-подобные-искажения"/>
+    <w:bookmarkEnd w:id="504"/>
+    <w:bookmarkStart w:id="505" w:name="синтетические-ocr-подобные-искажения"/>
     <w:p>
       <w:pPr>
         <w:pStyle w:val="Heading3"/>
@@ -1763,8 +1763,8 @@
         <w:t xml:space="preserve">.</w:t>
       </w:r>
     </w:p>
-    <w:bookmarkEnd w:id="426"/>
-    <w:bookmarkStart w:id="427" w:name="типы-синтетических-искажений"/>
+    <w:bookmarkEnd w:id="505"/>
+    <w:bookmarkStart w:id="506" w:name="типы-синтетических-искажений"/>
     <w:p>
       <w:pPr>
         <w:pStyle w:val="Heading3"/>
@@ -2027,8 +2027,8 @@
         <w:t xml:space="preserve">Ошибки пробелов влияют на WER сильнее, чем на CER. Поэтому заметное снижение WER у модели не следует автоматически трактовать как доказательство такого же качества на реальном OCR. В текущей постановке это прежде всего показывает способность модели исправлять контролируемые искажения границ слов в синтетическом наборе.</w:t>
       </w:r>
     </w:p>
-    <w:bookmarkEnd w:id="427"/>
-    <w:bookmarkStart w:id="428" w:name="Xe2e6ef423b4b11ea7446063a790a29ab69053e4"/>
+    <w:bookmarkEnd w:id="506"/>
+    <w:bookmarkStart w:id="507" w:name="Xe2e6ef423b4b11ea7446063a790a29ab69053e4"/>
     <w:p>
       <w:pPr>
         <w:pStyle w:val="Heading3"/>
@@ -2279,8 +2279,8 @@
         <w:t xml:space="preserve">Эти значения показывают, что шум не сводится к набору замен символов: почти половина искажённых строк короче эталонных, примерно треть длиннее, а среднее изменение числа слов положительно. Это согласуется с наличием вставок, удалений и ошибок пробелов. Одновременно такая статистика подчёркивает ограничение эксперимента: генератор задаёт искусственное распределение ошибок, которое может отличаться от реальных OCR/HTR-выходов.</w:t>
       </w:r>
     </w:p>
-    <w:bookmarkEnd w:id="428"/>
-    <w:bookmarkStart w:id="432" w:name="примеры-пар-искажённая-строка-эталон"/>
+    <w:bookmarkEnd w:id="507"/>
+    <w:bookmarkStart w:id="511" w:name="примеры-пар-искажённая-строка-эталон"/>
     <w:p>
       <w:pPr>
         <w:pStyle w:val="Heading3"/>
@@ -2298,18 +2298,18 @@
           <wp:inline>
             <wp:extent cx="5334000" cy="2489200"/>
             <wp:effectExtent b="0" l="0" r="0" t="0"/>
-            <wp:docPr descr="Рисунок 3.1 — Пример синтетического OCR-подобного искажения" title="" id="430" name="Picture"/>
+            <wp:docPr descr="Рисунок 3.1 — Пример синтетического OCR-подобного искажения" title="" id="509" name="Picture"/>
             <a:graphic>
               <a:graphicData uri="http://schemas.openxmlformats.org/drawingml/2006/picture">
                 <pic:pic>
                   <pic:nvPicPr>
-                    <pic:cNvPr descr="figures/fig03_synthetic_example.png" id="431" name="Picture"/>
+                    <pic:cNvPr descr="figures/fig03_synthetic_example.png" id="510" name="Picture"/>
                     <pic:cNvPicPr>
                       <a:picLocks noChangeArrowheads="1" noChangeAspect="1"/>
                     </pic:cNvPicPr>
                   </pic:nvPicPr>
                   <pic:blipFill>
-                    <a:blip r:embed="rId429"/>
+                    <a:blip r:embed="rId508"/>
                     <a:stretch>
                       <a:fillRect/>
                     </a:stretch>
@@ -2648,8 +2648,8 @@
         <w:t xml:space="preserve">. Эти примеры выглядят как OCR-подобные текстовые искажения, но не доказывают соответствие реальному OCR. Для внешней валидности нужна отдельная подвыборка реального OCR/HTR-вывода с ручной проверкой эталонного текста.</w:t>
       </w:r>
     </w:p>
-    <w:bookmarkEnd w:id="432"/>
-    <w:bookmarkStart w:id="433" w:name="ограничения-синтетического-шума"/>
+    <w:bookmarkEnd w:id="511"/>
+    <w:bookmarkStart w:id="512" w:name="ограничения-синтетического-шума"/>
     <w:p>
       <w:pPr>
         <w:pStyle w:val="Heading3"/>
@@ -2674,8 +2674,8 @@
         <w:t xml:space="preserve">Поэтому синтетический набор следует понимать как проверочный стенд, а не как замену реального OCR. Он показывает, что код, разбиение, метрики и сравнение методов работают воспроизводимо. Но постраничная проверка на Tesseract даёт более жёсткий результат: без адаптации на настоящих OCR-ошибках модель иногда снижает WER, но может ухудшать символный состав текста.</w:t>
       </w:r>
     </w:p>
-    <w:bookmarkEnd w:id="433"/>
-    <w:bookmarkStart w:id="434" w:name="структура-набора-данных"/>
+    <w:bookmarkEnd w:id="512"/>
+    <w:bookmarkStart w:id="513" w:name="структура-набора-данных"/>
     <w:p>
       <w:pPr>
         <w:pStyle w:val="Heading3"/>
@@ -2879,8 +2879,8 @@
         <w:t xml:space="preserve">.</w:t>
       </w:r>
     </w:p>
-    <w:bookmarkEnd w:id="434"/>
-    <w:bookmarkStart w:id="435" w:name="Xd08570dcee77ed6951cf64ca8f19d56e666eec0"/>
+    <w:bookmarkEnd w:id="513"/>
+    <w:bookmarkStart w:id="514" w:name="Xd08570dcee77ed6951cf64ca8f19d56e666eec0"/>
     <w:p>
       <w:pPr>
         <w:pStyle w:val="Heading3"/>
@@ -3088,8 +3088,8 @@
         <w:t xml:space="preserve">Такой размер достаточен для пилотной проверки контура посткоррекции: он мал для финального бенчмарка, но позволяет сравнить базовые методы и нейросетевую модель в воспроизводимых условиях.</w:t>
       </w:r>
     </w:p>
-    <w:bookmarkEnd w:id="435"/>
-    <w:bookmarkStart w:id="436" w:name="контроль-утечки-данных"/>
+    <w:bookmarkEnd w:id="514"/>
+    <w:bookmarkStart w:id="515" w:name="контроль-утечки-данных"/>
     <w:p>
       <w:pPr>
         <w:pStyle w:val="Heading3"/>
@@ -3256,8 +3256,8 @@
         <w:t xml:space="preserve">Тестовая выборка не содержит исходных строк, которые встречались в обучении или валидации. Это делает оценку более строгой: модель проверяется на новых исходных строках, а не на новых зашумлённых вариациях уже знакомых строк.</w:t>
       </w:r>
     </w:p>
-    <w:bookmarkEnd w:id="436"/>
-    <w:bookmarkStart w:id="437" w:name="ограничения-корпуса"/>
+    <w:bookmarkEnd w:id="515"/>
+    <w:bookmarkStart w:id="516" w:name="ограничения-корпуса"/>
     <w:p>
       <w:pPr>
         <w:pStyle w:val="Heading3"/>
@@ -3306,8 +3306,8 @@
         <w:t xml:space="preserve">Четвёртое ограничение связано с отсутствием ручной лингвистической проверки исправлений. Метрики CER и WER показывают формальную близость к эталону, но не всегда отражают историко-орфографическую допустимость исправления. Для следующего этапа нужна небольшая вручную проверенная подвыборка с качественным анализом ошибок.</w:t>
       </w:r>
     </w:p>
-    <w:bookmarkEnd w:id="437"/>
-    <w:bookmarkStart w:id="438" w:name="выводы-и-результаты-по-главе-1"/>
+    <w:bookmarkEnd w:id="516"/>
+    <w:bookmarkStart w:id="517" w:name="выводы-и-результаты-по-главе-1"/>
     <w:p>
       <w:pPr>
         <w:pStyle w:val="Heading3"/>
@@ -3332,9 +3332,9 @@
         <w:t xml:space="preserve">Роль корпуса ограничена, но ясна: он даёт одинаковые условия для сравнения метода без исправления, нормализатора на правилах, символьного метода на основе ошибок обучающей выборки и ByT5-small. Следующая версия должна добавить реальные OCR/HTR-выводы, ручную проверку и более разнообразные татарские, башкирские и другие тюркские источники в арабской графике.</w:t>
       </w:r>
     </w:p>
-    <w:bookmarkEnd w:id="438"/>
-    <w:bookmarkEnd w:id="439"/>
-    <w:bookmarkStart w:id="453" w:name="методология-эксперимента"/>
+    <w:bookmarkEnd w:id="517"/>
+    <w:bookmarkEnd w:id="518"/>
+    <w:bookmarkStart w:id="532" w:name="методология-эксперимента"/>
     <w:p>
       <w:pPr>
         <w:pStyle w:val="Heading2"/>
@@ -3343,7 +3343,7 @@
         <w:t xml:space="preserve">4. Методология эксперимента</w:t>
       </w:r>
     </w:p>
-    <w:bookmarkStart w:id="443" w:name="общая-схема-эксперимента"/>
+    <w:bookmarkStart w:id="522" w:name="общая-схема-эксперимента"/>
     <w:p>
       <w:pPr>
         <w:pStyle w:val="Heading3"/>
@@ -3408,18 +3408,18 @@
           <wp:inline>
             <wp:extent cx="5334000" cy="1666875"/>
             <wp:effectExtent b="0" l="0" r="0" t="0"/>
-            <wp:docPr descr="Рисунок 4.1 — Общая схема протокола OCR-посткоррекции" title="" id="441" name="Picture"/>
+            <wp:docPr descr="Рисунок 4.1 — Общая схема протокола OCR-посткоррекции" title="" id="520" name="Picture"/>
             <a:graphic>
               <a:graphicData uri="http://schemas.openxmlformats.org/drawingml/2006/picture">
                 <pic:pic>
                   <pic:nvPicPr>
-                    <pic:cNvPr descr="figures/fig01_postcorrection_process.png" id="442" name="Picture"/>
+                    <pic:cNvPr descr="figures/fig01_postcorrection_process.png" id="521" name="Picture"/>
                     <pic:cNvPicPr>
                       <a:picLocks noChangeArrowheads="1" noChangeAspect="1"/>
                     </pic:cNvPicPr>
                   </pic:nvPicPr>
                   <pic:blipFill>
-                    <a:blip r:embed="rId440"/>
+                    <a:blip r:embed="rId519"/>
                     <a:stretch>
                       <a:fillRect/>
                     </a:stretch>
@@ -3478,8 +3478,8 @@
         <w:t xml:space="preserve">Главный вопрос эксперимента — улучшает ли нейросетевая модель посткоррекции качество текста по сравнению с неизменённым зашумлённым вводом. Дополнительный вопрос — помогает ли простая нормализация на правилах именно для исторического тюркского материала в арабской графике или, наоборот, ухудшает текст.</w:t>
       </w:r>
     </w:p>
-    <w:bookmarkEnd w:id="443"/>
-    <w:bookmarkStart w:id="444" w:name="базовые-методы"/>
+    <w:bookmarkEnd w:id="522"/>
+    <w:bookmarkStart w:id="523" w:name="базовые-методы"/>
     <w:p>
       <w:pPr>
         <w:pStyle w:val="Heading3"/>
@@ -3528,8 +3528,8 @@
         <w:t xml:space="preserve">Такой набор базовых методов позволяет разделить несколько эффектов. Метод без исправления показывает исходную сложность задачи. Нормализатор проверяет безопасность ручных правил. Символьный метод показывает, насколько далеко можно продвинуться без контекстной нейросетевой модели. На этом фоне результат ByT5-small интерпретируется осторожнее: улучшение должно быть не просто численным, а устойчивым относительно простых альтернатив.</w:t>
       </w:r>
     </w:p>
-    <w:bookmarkEnd w:id="444"/>
-    <w:bookmarkStart w:id="445" w:name="X922718734d9410424975b4d665e2323c01d8043"/>
+    <w:bookmarkEnd w:id="523"/>
+    <w:bookmarkStart w:id="524" w:name="X922718734d9410424975b4d665e2323c01d8043"/>
     <w:p>
       <w:pPr>
         <w:pStyle w:val="Heading3"/>
@@ -3554,8 +3554,8 @@
         <w:t xml:space="preserve">Его диагностическая роль состоит в проверке вопроса: достаточно ли простых символьных соответствий, извлечённых из корпуса, или нужен контекстный подход на основе преобразования последовательностей. Если такой метод приблизился бы к ByT5, это означало бы, что задача в основном сводится к локальным заменам символов. Если же ByT5 заметно превосходит его, это указывает на важность контекста, восстановления структуры слов и более сложного моделирования строки.</w:t>
       </w:r>
     </w:p>
-    <w:bookmarkEnd w:id="445"/>
-    <w:bookmarkStart w:id="446" w:name="нейросетевая-модель-byt5-small"/>
+    <w:bookmarkEnd w:id="524"/>
+    <w:bookmarkStart w:id="525" w:name="нейросетевая-модель-byt5-small"/>
     <w:p>
       <w:pPr>
         <w:pStyle w:val="Heading3"/>
@@ -3600,8 +3600,8 @@
         <w:t xml:space="preserve">Практическое следствие байтового представления состоит в том, что длина последовательности в токенах может быстро расти: один видимый символ арабской графики занимает несколько байтов. Поэтому в эксперименте отдельно контролируется максимальная длина входной и целевой последовательности.</w:t>
       </w:r>
     </w:p>
-    <w:bookmarkEnd w:id="446"/>
-    <w:bookmarkStart w:id="447" w:name="проверенные-конфигурации"/>
+    <w:bookmarkEnd w:id="525"/>
+    <w:bookmarkStart w:id="526" w:name="проверенные-конфигурации"/>
     <w:p>
       <w:pPr>
         <w:pStyle w:val="Heading3"/>
@@ -3809,8 +3809,8 @@
         <w:t xml:space="preserve">Для итогового анализа выбрана конфигурация 512. Она уменьшает риск обрезания строк и используется как основная нейросетевая конфигурация в сравнении с методом без исправления, нормализатором на правилах и символьным методом на основе ошибок обучающей выборки. Вывод о преимуществе 512 в данной работе относится к пилотному набору данных и должен быть дополнительно проверен на более широком корпусе.</w:t>
       </w:r>
     </w:p>
-    <w:bookmarkEnd w:id="447"/>
-    <w:bookmarkStart w:id="448" w:name="метрики-качества"/>
+    <w:bookmarkEnd w:id="526"/>
+    <w:bookmarkStart w:id="527" w:name="метрики-качества"/>
     <w:p>
       <w:pPr>
         <w:pStyle w:val="Heading3"/>
@@ -3866,8 +3866,8 @@
         <w:t xml:space="preserve">ExactMatch показывает долю строк, полностью совпавших с эталоном. Для длинных исторических строк эта метрика очень строгая: один неверный символ уже делает пример несовпадающим. Поэтому ExactMatch используется как дополнительный строгий индикатор, а основные выводы строятся по CER, WER, NoSpaceCER и анализу ошибок.</w:t>
       </w:r>
     </w:p>
-    <w:bookmarkEnd w:id="448"/>
-    <w:bookmarkStart w:id="449" w:name="процедура-оценки"/>
+    <w:bookmarkEnd w:id="527"/>
+    <w:bookmarkStart w:id="528" w:name="процедура-оценки"/>
     <w:p>
       <w:pPr>
         <w:pStyle w:val="Heading3"/>
@@ -3912,8 +3912,8 @@
         <w:t xml:space="preserve">.</w:t>
       </w:r>
     </w:p>
-    <w:bookmarkEnd w:id="449"/>
-    <w:bookmarkStart w:id="450" w:name="анализ-ошибок"/>
+    <w:bookmarkEnd w:id="528"/>
+    <w:bookmarkStart w:id="529" w:name="анализ-ошибок"/>
     <w:p>
       <w:pPr>
         <w:pStyle w:val="Heading3"/>
@@ -3958,8 +3958,8 @@
         <w:t xml:space="preserve">; он используется не вместо метрик, а как дополнительная проверка того, насколько численный выигрыш выглядит надёжным на уровне конкретных строк.</w:t>
       </w:r>
     </w:p>
-    <w:bookmarkEnd w:id="450"/>
-    <w:bookmarkStart w:id="451" w:name="воспроизводимость"/>
+    <w:bookmarkEnd w:id="529"/>
+    <w:bookmarkStart w:id="530" w:name="воспроизводимость"/>
     <w:p>
       <w:pPr>
         <w:pStyle w:val="Heading3"/>
@@ -3992,8 +3992,8 @@
         <w:t xml:space="preserve">Воспроизводимость текущего эксперимента не означает полноту контрольного набора. Она означает, что все ключевые решения пилотного протокола явно зафиксированы: источник, генератор шума, разбиение данных, базовые методы, модель, метрики и анализ ошибок.</w:t>
       </w:r>
     </w:p>
-    <w:bookmarkEnd w:id="451"/>
-    <w:bookmarkStart w:id="452" w:name="выводы-и-результаты-по-главе-2"/>
+    <w:bookmarkEnd w:id="530"/>
+    <w:bookmarkStart w:id="531" w:name="выводы-и-результаты-по-главе-2"/>
     <w:p>
       <w:pPr>
         <w:pStyle w:val="Heading3"/>
@@ -4026,9 +4026,9 @@
         <w:t xml:space="preserve">Эта методология задаёт основу для раздела 5, где сравниваются базовые методы, символьный метод на основе ошибок обучающей выборки, финальная конфигурация ByT5-small и результаты анализа ошибок.</w:t>
       </w:r>
     </w:p>
-    <w:bookmarkEnd w:id="452"/>
-    <w:bookmarkEnd w:id="453"/>
-    <w:bookmarkStart w:id="478" w:name="результаты-экспериментов-и-анализ-ошибок"/>
+    <w:bookmarkEnd w:id="531"/>
+    <w:bookmarkEnd w:id="532"/>
+    <w:bookmarkStart w:id="557" w:name="результаты-экспериментов-и-анализ-ошибок"/>
     <w:p>
       <w:pPr>
         <w:pStyle w:val="Heading2"/>
@@ -4037,7 +4037,7 @@
         <w:t xml:space="preserve">5. Результаты экспериментов и анализ ошибок</w:t>
       </w:r>
     </w:p>
-    <w:bookmarkStart w:id="454" w:name="общая-логика-оценки"/>
+    <w:bookmarkStart w:id="533" w:name="общая-логика-оценки"/>
     <w:p>
       <w:pPr>
         <w:pStyle w:val="Heading3"/>
@@ -4070,8 +4070,8 @@
         <w:t xml:space="preserve">В этом разделе важны не только лучшие итоговые метрики ByT5-small среди рассмотренных методов. Не менее важны ограничивающие результаты: нормализатор на правилах ухудшает качество относительно метода без исправления, символьный метод даёт лишь умеренное улучшение CER, а заметное снижение WER у ByT5 требует осторожной интерпретации из-за синтетических ошибок пробелов и границ слов.</w:t>
       </w:r>
     </w:p>
-    <w:bookmarkEnd w:id="454"/>
-    <w:bookmarkStart w:id="458" w:name="итоговые-метрики"/>
+    <w:bookmarkEnd w:id="533"/>
+    <w:bookmarkStart w:id="537" w:name="итоговые-метрики"/>
     <w:p>
       <w:pPr>
         <w:pStyle w:val="Heading3"/>
@@ -4446,18 +4446,18 @@
           <wp:inline>
             <wp:extent cx="5334000" cy="2812472"/>
             <wp:effectExtent b="0" l="0" r="0" t="0"/>
-            <wp:docPr descr="Рисунок 5.1 — Сравнение методов на синтетическом тестовом наборе" title="" id="456" name="Picture"/>
+            <wp:docPr descr="Рисунок 5.1 — Сравнение методов на синтетическом тестовом наборе" title="" id="535" name="Picture"/>
             <a:graphic>
               <a:graphicData uri="http://schemas.openxmlformats.org/drawingml/2006/picture">
                 <pic:pic>
                   <pic:nvPicPr>
-                    <pic:cNvPr descr="figures/fig02_synthetic_metrics.png" id="457" name="Picture"/>
+                    <pic:cNvPr descr="figures/fig02_synthetic_metrics.png" id="536" name="Picture"/>
                     <pic:cNvPicPr>
                       <a:picLocks noChangeArrowheads="1" noChangeAspect="1"/>
                     </pic:cNvPicPr>
                   </pic:nvPicPr>
                   <pic:blipFill>
-                    <a:blip r:embed="rId455"/>
+                    <a:blip r:embed="rId534"/>
                     <a:stretch>
                       <a:fillRect/>
                     </a:stretch>
@@ -4532,8 +4532,8 @@
         <w:t xml:space="preserve">ExactMatch остаётся низким у всех методов. Это ожидаемо для длинных строк и строгого посимвольного сравнения: даже одна ошибка делает строку несовпадающей с эталоном. Поэтому ExactMatch используется как дополнительный строгий индикатор, а основные выводы строятся по CER, WER, NoSpaceCER и анализу ошибок.</w:t>
       </w:r>
     </w:p>
-    <w:bookmarkEnd w:id="458"/>
-    <w:bookmarkStart w:id="459" w:name="сравнение-с-методом-без-исправления"/>
+    <w:bookmarkEnd w:id="537"/>
+    <w:bookmarkStart w:id="538" w:name="сравнение-с-методом-без-исправления"/>
     <w:p>
       <w:pPr>
         <w:pStyle w:val="Heading3"/>
@@ -4566,8 +4566,8 @@
         <w:t xml:space="preserve">Я трактую этот результат как положительный сигнал для пилотного эксперимента, а не как доказательство готовности модели к практическому OCR. На синтетическом наборе ByT5-small полезна, но для вывода о реальных сканах нужна проверка на настоящих OCR-ошибках и на разбиении по страницам или источникам.</w:t>
       </w:r>
     </w:p>
-    <w:bookmarkEnd w:id="459"/>
-    <w:bookmarkStart w:id="460" w:name="нормализатор-на-правилах"/>
+    <w:bookmarkEnd w:id="538"/>
+    <w:bookmarkStart w:id="539" w:name="нормализатор-на-правилах"/>
     <w:p>
       <w:pPr>
         <w:pStyle w:val="Heading3"/>
@@ -4592,8 +4592,8 @@
         <w:t xml:space="preserve">Для этой работы такой результат важен методологически. Он показывает, что простые символьные правила нельзя считать безопасной предобработкой для исторического арабографичного текста. Правило может выглядеть разумным как техническая нормализация, но в историческом материале оно легко меняет орфографически значимые формы. Поэтому нормализатор в дальнейшем не следует использовать как обязательный этап без отдельной проверки на реальных данных.</w:t>
       </w:r>
     </w:p>
-    <w:bookmarkEnd w:id="460"/>
-    <w:bookmarkStart w:id="461" w:name="X26c70db4b79cb30b57d665edbf51a9d36fed8b5"/>
+    <w:bookmarkEnd w:id="539"/>
+    <w:bookmarkStart w:id="540" w:name="X26c70db4b79cb30b57d665edbf51a9d36fed8b5"/>
     <w:p>
       <w:pPr>
         <w:pStyle w:val="Heading3"/>
@@ -4618,8 +4618,8 @@
         <w:t xml:space="preserve">Однако этот метод почти не меняет качество на уровне слов. Он умеет исправлять отдельные повторяющиеся путаницы, но не восстанавливает пропущенные элементы из контекста и не работает с более длинной структурой строки. Поэтому его результат полезен как промежуточная точка сравнения: он лучше ручной нормализации, но заметно слабее ByT5-small по WER.</w:t>
       </w:r>
     </w:p>
-    <w:bookmarkEnd w:id="461"/>
-    <w:bookmarkStart w:id="462" w:name="интерпретация-снижения-wer"/>
+    <w:bookmarkEnd w:id="540"/>
+    <w:bookmarkStart w:id="541" w:name="интерпретация-снижения-wer"/>
     <w:p>
       <w:pPr>
         <w:pStyle w:val="Heading3"/>
@@ -4652,8 +4652,8 @@
         <w:t xml:space="preserve">Поэтому в работе CER и WER интерпретируются вместе. CER показывает умеренный выигрыш на уровне символов, а WER показывает, что модель хорошо работает с частью ошибок границ слов в синтетическом наборе. Но этот результат сам по себе не доказывает, что такой же выигрыш появится на реальном OCR-выводе.</w:t>
       </w:r>
     </w:p>
-    <w:bookmarkEnd w:id="462"/>
-    <w:bookmarkStart w:id="463" w:name="Xa057a50b3d887cb833a81c68c8cf3288ce88b0e"/>
+    <w:bookmarkEnd w:id="541"/>
+    <w:bookmarkStart w:id="542" w:name="Xa057a50b3d887cb833a81c68c8cf3288ce88b0e"/>
     <w:p>
       <w:pPr>
         <w:pStyle w:val="Heading3"/>
@@ -4678,8 +4678,8 @@
         <w:t xml:space="preserve">В текущем эксперименте конфигурация с длиной 512 выглядит более устойчивой, чем более короткий вариант. Я не трактую это как универсальное правило для всех арабографичных корпусов. Скорее это практический вывод для данного корпуса и данной постановки: при работе с историческим арабографичным текстом длину последовательности нужно проверять экспериментально, а не выбирать по умолчанию.</w:t>
       </w:r>
     </w:p>
-    <w:bookmarkEnd w:id="463"/>
-    <w:bookmarkStart w:id="464" w:name="X19ea1479c8c58d48c08a8bf495d59749d022072"/>
+    <w:bookmarkEnd w:id="542"/>
+    <w:bookmarkStart w:id="543" w:name="X19ea1479c8c58d48c08a8bf495d59749d022072"/>
     <w:p>
       <w:pPr>
         <w:pStyle w:val="Heading3"/>
@@ -4712,8 +4712,8 @@
         <w:t xml:space="preserve">Одновременно наличие ухудшенных примеров принципиально для практического вывода. Даже если модель чаще помогает, она всё равно иногда добавляет новые ошибки. Для будущей системы посткоррекции нужен механизм отката или фильтрации предсказаний, особенно если модель используется на архивных источниках без быстрой ручной проверки каждой строки.</w:t>
       </w:r>
     </w:p>
-    <w:bookmarkEnd w:id="464"/>
-    <w:bookmarkStart w:id="465" w:name="среднее-улучшение-по-примерам"/>
+    <w:bookmarkEnd w:id="543"/>
+    <w:bookmarkStart w:id="544" w:name="среднее-улучшение-по-примерам"/>
     <w:p>
       <w:pPr>
         <w:pStyle w:val="Heading3"/>
@@ -4738,8 +4738,8 @@
         <w:t xml:space="preserve">Для интерпретации это означает следующее. В контролируемой синтетической постановке модель чаще исправляет структуру слов и пробелы, чем полностью восстанавливает каждый символ строки. Поэтому среднее улучшение полезно как краткое числовое резюме, но его нельзя рассматривать отдельно от распределения улучшенных и ухудшенных случаев.</w:t>
       </w:r>
     </w:p>
-    <w:bookmarkEnd w:id="465"/>
-    <w:bookmarkStart w:id="466" w:name="интерпретация-результатов"/>
+    <w:bookmarkEnd w:id="544"/>
+    <w:bookmarkStart w:id="545" w:name="интерпретация-результатов"/>
     <w:p>
       <w:pPr>
         <w:pStyle w:val="Heading3"/>
@@ -4772,8 +4772,8 @@
         <w:t xml:space="preserve">Третий вывод задаёт границу результата. Успех на синтетическом наборе нельзя переносить на реальные OCR/HTR-выходы без отдельной проверки. В текущем эксперименте модель учится на распределении ошибок генератора, а настоящий OCR зависит от шрифта, качества изображения, сегментации строки и особенностей конкретной OCR-системы. Поэтому результаты раздела 5 являются сильным пилотным сигналом, но не финальным доказательством практической применимости.</w:t>
       </w:r>
     </w:p>
-    <w:bookmarkEnd w:id="466"/>
-    <w:bookmarkStart w:id="467" w:name="ограничения-интерпретации"/>
+    <w:bookmarkEnd w:id="545"/>
+    <w:bookmarkStart w:id="546" w:name="ограничения-интерпретации"/>
     <w:p>
       <w:pPr>
         <w:pStyle w:val="Heading3"/>
@@ -4806,8 +4806,8 @@
         <w:t xml:space="preserve">Есть и ограничение метрик. CER и WER измеряют формальную близость к эталону, но не решают вопрос историко-лингвистической допустимости исправления. Например, модель может приблизить строку к эталону по расстоянию Левенштейна, но при этом сгладить форму, которую исследователь не хотел бы нормализовать. По этой причине автоматические метрики в работе дополняются разбором ухудшенных случаев.</w:t>
       </w:r>
     </w:p>
-    <w:bookmarkEnd w:id="467"/>
-    <w:bookmarkStart w:id="471" w:name="X9ae740f4b068656258209a4fa61338553b28ec2"/>
+    <w:bookmarkEnd w:id="546"/>
+    <w:bookmarkStart w:id="550" w:name="X9ae740f4b068656258209a4fa61338553b28ec2"/>
     <w:p>
       <w:pPr>
         <w:pStyle w:val="Heading3"/>
@@ -4825,18 +4825,18 @@
           <wp:inline>
             <wp:extent cx="5334000" cy="2489200"/>
             <wp:effectExtent b="0" l="0" r="0" t="0"/>
-            <wp:docPr descr="Рисунок 5.2 — Пример фрагмента реального OCR-вывода Tesseract и проверенного эталона" title="" id="469" name="Picture"/>
+            <wp:docPr descr="Рисунок 5.2 — Пример фрагмента реального OCR-вывода Tesseract и проверенного эталона" title="" id="548" name="Picture"/>
             <a:graphic>
               <a:graphicData uri="http://schemas.openxmlformats.org/drawingml/2006/picture">
                 <pic:pic>
                   <pic:nvPicPr>
-                    <pic:cNvPr descr="figures/fig04_real_ocr_example.png" id="470" name="Picture"/>
+                    <pic:cNvPr descr="figures/fig04_real_ocr_example.png" id="549" name="Picture"/>
                     <pic:cNvPicPr>
                       <a:picLocks noChangeArrowheads="1" noChangeAspect="1"/>
                     </pic:cNvPicPr>
                   </pic:nvPicPr>
                   <pic:blipFill>
-                    <a:blip r:embed="rId468"/>
+                    <a:blip r:embed="rId547"/>
                     <a:stretch>
                       <a:fillRect/>
                     </a:stretch>
@@ -5382,8 +5382,8 @@
         <w:t xml:space="preserve">Результат получился смешанным. По WER посткоррекция немного помогает: вариант с фрагментами снижает средний WER с 0.9238 до 0.8919. Но по CER и NoSpaceCER исходный Tesseract остаётся лучше. Для OCR на арабской графике это принципиально: улучшение границ слов не компенсирует ухудшение символного состава.</w:t>
       </w:r>
     </w:p>
-    <w:bookmarkEnd w:id="471"/>
-    <w:bookmarkStart w:id="475" w:name="постраничное-поведение-модели"/>
+    <w:bookmarkEnd w:id="550"/>
+    <w:bookmarkStart w:id="554" w:name="постраничное-поведение-модели"/>
     <w:p>
       <w:pPr>
         <w:pStyle w:val="Heading3"/>
@@ -5401,18 +5401,18 @@
           <wp:inline>
             <wp:extent cx="5334000" cy="2690191"/>
             <wp:effectExtent b="0" l="0" r="0" t="0"/>
-            <wp:docPr descr="Рисунок 5.3 — Средние ошибки real-OCR sanity по страницам" title="" id="473" name="Picture"/>
+            <wp:docPr descr="Рисунок 5.3 — Средние ошибки real-OCR sanity по страницам" title="" id="552" name="Picture"/>
             <a:graphic>
               <a:graphicData uri="http://schemas.openxmlformats.org/drawingml/2006/picture">
                 <pic:pic>
                   <pic:nvPicPr>
-                    <pic:cNvPr descr="figures/fig05_real_ocr_page_metrics.png" id="474" name="Picture"/>
+                    <pic:cNvPr descr="figures/fig05_real_ocr_page_metrics.png" id="553" name="Picture"/>
                     <pic:cNvPicPr>
                       <a:picLocks noChangeArrowheads="1" noChangeAspect="1"/>
                     </pic:cNvPicPr>
                   </pic:nvPicPr>
                   <pic:blipFill>
-                    <a:blip r:embed="rId472"/>
+                    <a:blip r:embed="rId551"/>
                     <a:stretch>
                       <a:fillRect/>
                     </a:stretch>
@@ -5654,8 +5654,8 @@
         <w:t xml:space="preserve">Этот результат полезнее, чем простой положительный отчёт о синтетических метриках. Он показывает место, где текущий подход ломается: модель выучила распределение синтетических ошибок, но не структуру настоящих ошибок Tesseract на конкретном печатном источнике.</w:t>
       </w:r>
     </w:p>
-    <w:bookmarkEnd w:id="475"/>
-    <w:bookmarkStart w:id="476" w:name="качественная-интерпретация-real-ocr"/>
+    <w:bookmarkEnd w:id="554"/>
+    <w:bookmarkStart w:id="555" w:name="качественная-интерпретация-real-ocr"/>
     <w:p>
       <w:pPr>
         <w:pStyle w:val="Heading3"/>
@@ -5688,8 +5688,8 @@
         <w:t xml:space="preserve">Главный вывод этой проверки состоит в том, что обучение только на синтетике недостаточно. Для настоящего OCR нужны пары, где входом является реальный OCR-вывод, а выходом — проверенный эталонный текст. Только на таких данных можно понять, какие ошибки модель действительно исправляет, а какие создаёт сама.</w:t>
       </w:r>
     </w:p>
-    <w:bookmarkEnd w:id="476"/>
-    <w:bookmarkStart w:id="477" w:name="выводы-и-результаты-по-главе-3"/>
+    <w:bookmarkEnd w:id="555"/>
+    <w:bookmarkStart w:id="556" w:name="выводы-и-результаты-по-главе-3"/>
     <w:p>
       <w:pPr>
         <w:pStyle w:val="Heading3"/>
@@ -5722,9 +5722,9 @@
         <w:t xml:space="preserve">Итог раздела такой: экспериментальный контур и обучение модели работают в контролируемой среде, но переход к реальным историческим сканам требует отдельной адаптации. Это не дополнительная косметическая проверка, а центральное условие практической применимости. Без настоящих пар «OCR-вывод — эталон» нельзя утверждать, что модель решает задачу OCR-посткоррекции для архивных источников.</w:t>
       </w:r>
     </w:p>
-    <w:bookmarkEnd w:id="477"/>
-    <w:bookmarkEnd w:id="478"/>
-    <w:bookmarkStart w:id="486" w:name="Xe8e02886c60b8939714d6e867e04f7997a20272"/>
+    <w:bookmarkEnd w:id="556"/>
+    <w:bookmarkEnd w:id="557"/>
+    <w:bookmarkStart w:id="565" w:name="Xe8e02886c60b8939714d6e867e04f7997a20272"/>
     <w:p>
       <w:pPr>
         <w:pStyle w:val="Heading2"/>
@@ -5733,7 +5733,7 @@
         <w:t xml:space="preserve">6. Ограничения и направления дальнейшей работы</w:t>
       </w:r>
     </w:p>
-    <w:bookmarkStart w:id="479" w:name="ограничения-корпуса-1"/>
+    <w:bookmarkStart w:id="558" w:name="ограничения-корпуса-1"/>
     <w:p>
       <w:pPr>
         <w:pStyle w:val="Heading3"/>
@@ -5758,8 +5758,8 @@
         <w:t xml:space="preserve">Один источник ограничивает жанровое, временное и орфографическое разнообразие. Тексты разных регионов и периодов могут отличаться письмом, лексикой, типографикой, качеством печати и состоянием скана. Отдельно важно, что старотатарские и старобашкирские источники пока остаются целью следующего этапа, а не основным набором оценки в этой версии.</w:t>
       </w:r>
     </w:p>
-    <w:bookmarkEnd w:id="479"/>
-    <w:bookmarkStart w:id="480" w:name="ограничения-синтетического-шума-1"/>
+    <w:bookmarkEnd w:id="558"/>
+    <w:bookmarkStart w:id="559" w:name="ограничения-синтетического-шума-1"/>
     <w:p>
       <w:pPr>
         <w:pStyle w:val="Heading3"/>
@@ -5784,8 +5784,8 @@
         <w:t xml:space="preserve">Практически это означает следующее: увеличение объёма синтетики само по себе не решит задачу. Следующая версия должна строиться вокруг реальных пар «OCR-вывод — эталон». Синтетические данные можно оставить как вспомогательный слой, но основной тест должен проверять настоящие ошибки распознавания.</w:t>
       </w:r>
     </w:p>
-    <w:bookmarkEnd w:id="480"/>
-    <w:bookmarkStart w:id="481" w:name="ограничения-метрик"/>
+    <w:bookmarkEnd w:id="559"/>
+    <w:bookmarkStart w:id="560" w:name="ограничения-метрик"/>
     <w:p>
       <w:pPr>
         <w:pStyle w:val="Heading3"/>
@@ -5810,8 +5810,8 @@
         <w:t xml:space="preserve">Для следующей версии набора нужна ручная проверка небольшой подвыборки. В ней следует фиксировать не только факт ошибки, но и её тип: замену графемы, пропуск, лишнюю вставку, ошибку пробела, чрезмерную нормализацию исторического написания, повтор фрагмента или грубое искажение строки. Тогда автоматические метрики можно будет связать с реальным качеством текста.</w:t>
       </w:r>
     </w:p>
-    <w:bookmarkEnd w:id="481"/>
-    <w:bookmarkStart w:id="482" w:name="ограничения-проверки-на-реальном-ocr"/>
+    <w:bookmarkEnd w:id="560"/>
+    <w:bookmarkStart w:id="561" w:name="ограничения-проверки-на-реальном-ocr"/>
     <w:p>
       <w:pPr>
         <w:pStyle w:val="Heading3"/>
@@ -5836,8 +5836,8 @@
         <w:t xml:space="preserve">Следующий шаг — перейти от постраничной оценки к более точным парам на уровне строки или короткого фрагмента. Для этого нужно выделить строки на изображении, получить OCR-вывод, сопоставить его с проверенным текстом и вручную проверить спорные случаи. Такая работа труднее, но именно она позволит обучать модель на настоящих ошибках, а не только проверять перенос с синтетики.</w:t>
       </w:r>
     </w:p>
-    <w:bookmarkEnd w:id="482"/>
-    <w:bookmarkStart w:id="483" w:name="следующий-набор-данных"/>
+    <w:bookmarkEnd w:id="561"/>
+    <w:bookmarkStart w:id="562" w:name="следующий-набор-данных"/>
     <w:p>
       <w:pPr>
         <w:pStyle w:val="Heading3"/>
@@ -5862,8 +5862,8 @@
         <w:t xml:space="preserve">Отдельно нужен журнал ошибок. В нём стоит фиксировать, какие графемы чаще всего путает OCR, где возникают проблемы пробелов, какие строки модель ухудшает и какие предсказания нужно откатывать. Такой журнал важнее ещё одного общего числа CER, потому что он показывает, как именно улучшать систему.</w:t>
       </w:r>
     </w:p>
-    <w:bookmarkEnd w:id="483"/>
-    <w:bookmarkStart w:id="484" w:name="X91867cc38c0f4e6667de3b2a642ec76d2863e9f"/>
+    <w:bookmarkEnd w:id="562"/>
+    <w:bookmarkStart w:id="563" w:name="X91867cc38c0f4e6667de3b2a642ec76d2863e9f"/>
     <w:p>
       <w:pPr>
         <w:pStyle w:val="Heading3"/>
@@ -5888,8 +5888,8 @@
         <w:t xml:space="preserve">Текущая работа полезна тем, что заранее показывает слабое место этой цепочки. До извлечения сущностей и построения графа нужно понять, насколько можно доверять тексту после OCR. Если посткоррекция ухудшает часть страниц, последующие модели будут работать на искажённой основе. Поэтому проверка на реальном OCR должна быть не финальным украшением проекта, а одним из первых этапов разработки.</w:t>
       </w:r>
     </w:p>
-    <w:bookmarkEnd w:id="484"/>
-    <w:bookmarkStart w:id="485" w:name="выводы-и-результаты-по-главе-4"/>
+    <w:bookmarkEnd w:id="563"/>
+    <w:bookmarkStart w:id="564" w:name="выводы-и-результаты-по-главе-4"/>
     <w:p>
       <w:pPr>
         <w:pStyle w:val="Heading3"/>
@@ -5906,9 +5906,9 @@
         <w:t xml:space="preserve">В главе сформулированы основные ограничения работы и направления дальнейшего развития. Главные ограничения связаны с небольшим объёмом корпуса, синтетической природой обучающих искажений, одним основным османско-турецким источником и нестабильным переносом на реальный OCR-вывод Tesseract. Из этого следует практический вывод: следующий этап должен быть связан не с усложнением модели как таковой, а со сбором выровненных пар «OCR-вывод — эталон», ручной проверкой татарских и башкирских источников и более строгой постраничной оценкой.</w:t>
       </w:r>
     </w:p>
-    <w:bookmarkEnd w:id="485"/>
-    <w:bookmarkEnd w:id="486"/>
-    <w:bookmarkStart w:id="487" w:name="заключение"/>
+    <w:bookmarkEnd w:id="564"/>
+    <w:bookmarkEnd w:id="565"/>
+    <w:bookmarkStart w:id="566" w:name="заключение"/>
     <w:p>
       <w:pPr>
         <w:pStyle w:val="Heading2"/>
@@ -5970,9 +5970,9 @@
         <w:br w:type="page"/>
       </w:r>
     </w:p>
-    <w:bookmarkEnd w:id="487"/>
-    <w:bookmarkEnd w:id="488"/>
-    <w:bookmarkStart w:id="489" w:name="библиографический-список"/>
+    <w:bookmarkEnd w:id="566"/>
+    <w:bookmarkEnd w:id="567"/>
+    <w:bookmarkStart w:id="568" w:name="библиографический-список"/>
     <w:p>
       <w:pPr>
         <w:pStyle w:val="Heading1"/>
@@ -5989,7 +5989,7 @@
         </w:numPr>
       </w:pPr>
       <w:r>
-        <w:t xml:space="preserve">Vaswani A., Shazeer N., Parmar N., Uszkoreit J., Jones L., Gomez A. N., Kaiser L., Polosukhin I. Attention Is All You Need. 2017. arXiv:1706.03762. URL: https://arxiv.org/abs/1706.03762</w:t>
+        <w:t xml:space="preserve">Vaswani A., Shazeer N., Parmar N. et al. Attention Is All You Need [Электронный ресурс]. – 2017. – arXiv:1706.03762. – URL: https://arxiv.org/abs/1706.03762 (дата обращения: 27.06.2026).</w:t>
       </w:r>
     </w:p>
     <w:p>
@@ -6000,7 +6000,7 @@
         </w:numPr>
       </w:pPr>
       <w:r>
-        <w:t xml:space="preserve">Raffel C., Shazeer N., Roberts A., Lee K., Narang S., Matena M., Zhou Y., Li W., Liu P. J. Exploring the Limits of Transfer Learning with a Unified Text-to-Text Transformer. 2019. arXiv:1910.10683. URL: https://arxiv.org/abs/1910.10683</w:t>
+        <w:t xml:space="preserve">Raffel C., Shazeer N., Roberts A. et al. Exploring the Limits of Transfer Learning with a Unified Text-to-Text Transformer [Электронный ресурс]. – 2019. – arXiv:1910.10683. – URL: https://arxiv.org/abs/1910.10683 (дата обращения: 27.06.2026).</w:t>
       </w:r>
     </w:p>
     <w:p>
@@ -6011,7 +6011,7 @@
         </w:numPr>
       </w:pPr>
       <w:r>
-        <w:t xml:space="preserve">Xue L., Barua A., Constant N., Al-Rfou R., Narang S., Kale M., Roberts A., Raffel C. ByT5: Towards a token-free future with pre-trained byte-to-byte models. 2021. arXiv:2105.13626. URL: https://arxiv.org/abs/2105.13626</w:t>
+        <w:t xml:space="preserve">Xue L., Barua A., Constant N. et al. ByT5: Towards a token-free future with pre-trained byte-to-byte models [Электронный ресурс]. – 2021. – arXiv:2105.13626. – URL: https://arxiv.org/abs/2105.13626 (дата обращения: 27.06.2026).</w:t>
       </w:r>
     </w:p>
     <w:p>
@@ -6022,7 +6022,7 @@
         </w:numPr>
       </w:pPr>
       <w:r>
-        <w:t xml:space="preserve">Ramirez-Orta J., Xamena E., Maguitman A., Milios E., Soto A. J. Post-OCR Document Correction with large Ensembles of Character Sequence-to-Sequence Models. 2021. arXiv:2109.06264. URL: https://arxiv.org/abs/2109.06264</w:t>
+        <w:t xml:space="preserve">Ramirez-Orta J., Xamena E., Maguitman A., Milios E., Soto A. J. Post-OCR Document Correction with large Ensembles of Character Sequence-to-Sequence Models [Электронный ресурс]. – 2021. – arXiv:2109.06264. – URL: https://arxiv.org/abs/2109.06264 (дата обращения: 27.06.2026).</w:t>
       </w:r>
     </w:p>
     <w:p>
@@ -6033,7 +6033,7 @@
         </w:numPr>
       </w:pPr>
       <w:r>
-        <w:t xml:space="preserve">Hämäläinen M., Hengchen S. From the Paft to the Fiiture: a Fully Automatic NMT and Word Embeddings Method for OCR Post-Correction. 2019. arXiv:1910.05535. URL: https://arxiv.org/abs/1910.05535</w:t>
+        <w:t xml:space="preserve">Hämäläinen M., Hengchen S. From the Paft to the Fiuture: a Fully Automatic NMT and Word Embeddings Method for OCR Post-Correction [Электронный ресурс]. – 2019. – arXiv:1910.05535. – URL: https://arxiv.org/abs/1910.05535 (дата обращения: 27.06.2026).</w:t>
       </w:r>
     </w:p>
     <w:p>
@@ -6044,7 +6044,7 @@
         </w:numPr>
       </w:pPr>
       <w:r>
-        <w:t xml:space="preserve">Duong Q., Hämäläinen M., Hengchen S. An Unsupervised method for OCR Post-Correction and Spelling Normalisation for Finnish. 2020. arXiv:2011.03502. URL: https://arxiv.org/abs/2011.03502</w:t>
+        <w:t xml:space="preserve">Duong Q., Hämäläinen M., Hengchen S. An Unsupervised method for OCR Post-Correction and Spelling Normalisation for Finnish [Электронный ресурс]. – 2020. – arXiv:2011.03502. – URL: https://arxiv.org/abs/2011.03502 (дата обращения: 27.06.2026).</w:t>
       </w:r>
     </w:p>
     <w:p>
@@ -6055,7 +6055,7 @@
         </w:numPr>
       </w:pPr>
       <w:r>
-        <w:t xml:space="preserve">Suissa O., Elmalech A., Zhitomirsky-Geffet M. Optimizing the Neural Network Training for OCR Error Correction of Historical Hebrew Texts. 2023. arXiv:2307.16220. URL: https://arxiv.org/abs/2307.16220</w:t>
+        <w:t xml:space="preserve">Suissa O., Elmalech A., Zhitomirsky-Geffet M. Optimizing the Neural Network Training for OCR Error Correction of Historical Hebrew Texts [Электронный ресурс]. – 2023. – arXiv:2307.16220. – URL: https://arxiv.org/abs/2307.16220 (дата обращения: 27.06.2026).</w:t>
       </w:r>
     </w:p>
     <w:p>
@@ -6066,7 +6066,7 @@
         </w:numPr>
       </w:pPr>
       <w:r>
-        <w:t xml:space="preserve">Kanerva J., Ledins C., Käpyaho S., Ginter F. OCR Error Post-Correction with LLMs in Historical Documents: No Free Lunches. 2025. arXiv:2502.01205. URL: https://arxiv.org/abs/2502.01205</w:t>
+        <w:t xml:space="preserve">Kanerva J., Ledins C., Käpyaho S., Ginter F. OCR Error Post-Correction with LLMs in Historical Documents: No Free Lunches [Электронный ресурс]. – 2025. – arXiv:2502.01205. – URL: https://arxiv.org/abs/2502.01205 (дата обращения: 27.06.2026).</w:t>
       </w:r>
     </w:p>
     <w:p>
@@ -6077,7 +6077,7 @@
         </w:numPr>
       </w:pPr>
       <w:r>
-        <w:t xml:space="preserve">Reul C., Christ D., Hartelt A., Balbach N., Wehner M., Springmann U., Wick C., Grundig C., Büttner A., Puppe F. OCR4all – An Open-Source Tool Providing a (Semi-)Automatic OCR Workflow for Historical Printings. 2019. arXiv:1909.04032. URL: https://arxiv.org/abs/1909.04032</w:t>
+        <w:t xml:space="preserve">Reul C., Christ D., Hartelt A. et al. OCR4all – An Open-Source Tool Providing a (Semi-)Automatic OCR Workflow for Historical Printings [Электронный ресурс]. – 2019. – arXiv:1909.04032. – URL: https://arxiv.org/abs/1909.04032 (дата обращения: 27.06.2026).</w:t>
       </w:r>
     </w:p>
     <w:p>
@@ -6088,7 +6088,7 @@
         </w:numPr>
       </w:pPr>
       <w:r>
-        <w:t xml:space="preserve">Springmann U., Reul C., Dipper S., Baiter J. Ground Truth for training OCR engines on historical documents in German Fraktur and Early Modern Latin. 2018. arXiv:1809.05501. URL: https://arxiv.org/abs/1809.05501</w:t>
+        <w:t xml:space="preserve">Springmann U., Reul C., Dipper S., Baiter J. Ground Truth for training OCR engines on historical documents in German Fraktur and Early Modern Latin [Электронный ресурс]. – 2018. – arXiv:1809.05501. – URL: https://arxiv.org/abs/1809.05501 (дата обращения: 27.06.2026).</w:t>
       </w:r>
     </w:p>
     <w:p>
@@ -6099,7 +6099,7 @@
         </w:numPr>
       </w:pPr>
       <w:r>
-        <w:t xml:space="preserve">Kasem M. S., Mahmoud M., Kang H.-S. Advancements and Challenges in Arabic Optical Character Recognition: A Comprehensive Survey. 2023. arXiv:2312.11812. URL: https://arxiv.org/abs/2312.11812</w:t>
+        <w:t xml:space="preserve">Kasem M. S., Mahmoud M., Kang H.-S. Advancements and Challenges in Arabic Optical Character Recognition: A Comprehensive Survey [Электронный ресурс]. – 2023. – arXiv:2312.11812. – URL: https://arxiv.org/abs/2312.11812 (дата обращения: 27.06.2026).</w:t>
       </w:r>
     </w:p>
     <w:p>
@@ -6110,7 +6110,7 @@
         </w:numPr>
       </w:pPr>
       <w:r>
-        <w:t xml:space="preserve">Osman H., Zaghw K., Hazem M., Elsehely S. An Efficient Language-Independent Multi-Font OCR for Arabic Script. 2020. arXiv:2009.09115. URL: https://arxiv.org/abs/2009.09115</w:t>
+        <w:t xml:space="preserve">Osman H., Zaghw K., Hazem M., Elsehely S. An Efficient Language-Independent Multi-Font OCR for Arabic Script [Электронный ресурс]. – 2020. – arXiv:2009.09115. – URL: https://arxiv.org/abs/2009.09115 (дата обращения: 27.06.2026).</w:t>
       </w:r>
     </w:p>
     <w:p>
@@ -6121,7 +6121,7 @@
         </w:numPr>
       </w:pPr>
       <w:r>
-        <w:t xml:space="preserve">Kirmizialtin S., Wrisley D. Automated Transcription of Non-Latin Script Periodicals: A Case Study in the Ottoman Turkish Print Archive. 2020. arXiv:2011.01139. URL: https://arxiv.org/abs/2011.01139</w:t>
+        <w:t xml:space="preserve">Kirmizialtin S., Wrisley D. Automated Transcription of Non-Latin Script Periodicals: A Case Study in the Ottoman Turkish Print Archive [Электронный ресурс]. – 2020. – arXiv:2011.01139. – URL: https://arxiv.org/abs/2011.01139 (дата обращения: 27.06.2026).</w:t>
       </w:r>
     </w:p>
     <w:p>
@@ -6132,7 +6132,7 @@
         </w:numPr>
       </w:pPr>
       <w:r>
-        <w:t xml:space="preserve">Özateş Ş. B., Tıraş T. E., Adak E. E., Doğan B., Karagöz F. B., Genç E. E., Bilgin Taşdemir E. F. Building Foundations for Natural Language Processing of Historical Turkish: Resources and Models. 2025. arXiv:2501.04828. URL: https://arxiv.org/abs/2501.04828</w:t>
+        <w:t xml:space="preserve">Özateş Ş. B., Tıraş T. E., Adak E. E. et al. Building Foundations for Natural Language Processing of Historical Turkish: Resources and Models [Электронный ресурс]. – 2025. – arXiv:2501.04828. – URL: https://arxiv.org/abs/2501.04828 (дата обращения: 27.06.2026).</w:t>
       </w:r>
     </w:p>
     <w:p>
@@ -6143,7 +6143,7 @@
         </w:numPr>
       </w:pPr>
       <w:r>
-        <w:t xml:space="preserve">Lyu L., Koutraki M., Krickl M., Fetahu B. Neural OCR Post-Hoc Correction of Historical Corpora. 2021. arXiv:2102.00583. URL: https://arxiv.org/abs/2102.00583</w:t>
+        <w:t xml:space="preserve">Lyu L., Koutraki M., Krickl M., Fetahu B. Neural OCR Post-Hoc Correction of Historical Corpora [Электронный ресурс]. – 2021. – arXiv:2102.00583. – URL: https://arxiv.org/abs/2102.00583 (дата обращения: 27.06.2026).</w:t>
       </w:r>
     </w:p>
     <w:p>
@@ -6154,7 +6154,7 @@
         </w:numPr>
       </w:pPr>
       <w:r>
-        <w:t xml:space="preserve">Rijhwani S., Rosenblum D., Anastasopoulos A., Neubig G. Lexically Aware Semi-Supervised Learning for OCR Post-Correction. 2021. arXiv:2111.02622. URL: https://arxiv.org/abs/2111.02622</w:t>
+        <w:t xml:space="preserve">Rijhwani S., Rosenblum D., Anastasopoulos A., Neubig G. Lexically Aware Semi-Supervised Learning for OCR Post-Correction [Электронный ресурс]. – 2021. – arXiv:2111.02622. – URL: https://arxiv.org/abs/2111.02622 (дата обращения: 27.06.2026).</w:t>
       </w:r>
     </w:p>
     <w:p>
@@ -6165,7 +6165,7 @@
         </w:numPr>
       </w:pPr>
       <w:r>
-        <w:t xml:space="preserve">Naiman J. P., Cosillo M. G., Williams P. K. G., Goodman A. Large Synthetic Data from the arXiv for OCR Post Correction of Historic Scientific Articles. 2023. arXiv:2309.11549. URL: https://arxiv.org/abs/2309.11549</w:t>
+        <w:t xml:space="preserve">Naiman J. P., Cosillo M. G., Williams P. K. G., Goodman A. Large Synthetic Data from the arXiv for OCR Post Correction of Historic Scientific Articles [Электронный ресурс]. – 2023. – arXiv:2309.11549. – URL: https://arxiv.org/abs/2309.11549 (дата обращения: 27.06.2026).</w:t>
       </w:r>
     </w:p>
     <w:p>
@@ -6176,7 +6176,7 @@
         </w:numPr>
       </w:pPr>
       <w:r>
-        <w:t xml:space="preserve">Guan S., Greene D. Advancing Post-OCR Correction: A Comparative Study of Synthetic Data. 2024. arXiv:2408.02253. URL: https://arxiv.org/abs/2408.02253</w:t>
+        <w:t xml:space="preserve">Guan S., Greene D. Advancing Post-OCR Correction: A Comparative Study of Synthetic Data [Электронный ресурс]. – 2024. – arXiv:2408.02253. – URL: https://arxiv.org/abs/2408.02253 (дата обращения: 27.06.2026).</w:t>
       </w:r>
     </w:p>
     <w:p>
@@ -6187,7 +6187,7 @@
         </w:numPr>
       </w:pPr>
       <w:r>
-        <w:t xml:space="preserve">Kashid H., Bhattacharyya P. RoundTripOCR: A Data Generation Technique for Enhancing Post-OCR Error Correction in Low-Resource Devanagari Languages. 2024. arXiv:2412.15248. URL: https://arxiv.org/abs/2412.15248</w:t>
+        <w:t xml:space="preserve">Kashid H., Bhattacharyya P. RoundTripOCR: A Data Generation Technique for Enhancing Post-OCR Error Correction in Low-Resource Devanagari Languages [Электронный ресурс]. – 2024. – arXiv:2412.15248. – URL: https://arxiv.org/abs/2412.15248 (дата обращения: 27.06.2026).</w:t>
       </w:r>
     </w:p>
     <w:p>
@@ -6198,10 +6198,10 @@
         </w:numPr>
       </w:pPr>
       <w:r>
-        <w:t xml:space="preserve">Li M., Lv T., Chen J., Cui L., Lu Y., Florencio D., Zhang C., Li Z., Wei F. TrOCR: Transformer-based Optical Character Recognition with Pre-trained Models. 2021. arXiv:2109.10282. URL: https://arxiv.org/abs/2109.10282</w:t>
-      </w:r>
-    </w:p>
-    <w:bookmarkEnd w:id="489"/>
+        <w:t xml:space="preserve">Li M., Lv T., Chen J. et al. TrOCR: Transformer-based Optical Character Recognition with Pre-trained Models [Электронный ресурс]. – 2021. – arXiv:2109.10282. – URL: https://arxiv.org/abs/2109.10282 (дата обращения: 27.06.2026).</w:t>
+      </w:r>
+    </w:p>
+    <w:bookmarkEnd w:id="568"/>
     <w:sectPr>
       <w:footerReference r:id="rId1" w:type="default"/>
       <w:footnotePr>

</xml_diff>